<commit_message>
Added in data from armis on procedures, to identify patients with Cushing's disease.
</commit_message>
<xml_diff>
--- a/manuscript/Cushings-Obesity/manuscript.docx
+++ b/manuscript/Cushings-Obesity/manuscript.docx
@@ -7,10 +7,82 @@
         <w:pStyle w:val="Heading1"/>
       </w:pPr>
       <w:r>
-        <w:t>Results</w:t>
-      </w:r>
-    </w:p>
-    <w:p/>
+        <w:t>Methods</w:t>
+      </w:r>
+    </w:p>
+    <w:p>
+      <w:pPr>
+        <w:rPr>
+          <w:b/>
+          <w:bCs/>
+        </w:rPr>
+      </w:pPr>
+      <w:r>
+        <w:rPr>
+          <w:b/>
+          <w:bCs/>
+        </w:rPr>
+        <w:t>Study Participants</w:t>
+      </w:r>
+      <w:r>
+        <w:rPr>
+          <w:b/>
+          <w:bCs/>
+        </w:rPr>
+        <w:t xml:space="preserve">. </w:t>
+      </w:r>
+      <w:r>
+        <w:t xml:space="preserve">This study was reviewed by the University of Michigan </w:t>
+      </w:r>
+      <w:proofErr w:type="spellStart"/>
+      <w:r>
+        <w:t>Istitutional</w:t>
+      </w:r>
+      <w:proofErr w:type="spellEnd"/>
+      <w:r>
+        <w:t xml:space="preserve"> Review Board (HUM###) and noted as exempt.</w:t>
+      </w:r>
+    </w:p>
+    <w:p>
+      <w:r>
+        <w:t>To identify patients with Cushing’s disease, we evaluated electronic health records at Michigan Medicine dating back to January 1, 2000, searching for diagnoses of Cushing’s disease including ICD Codes (</w:t>
+      </w:r>
+      <w:commentRangeStart w:id="0"/>
+      <w:r>
+        <w:t>XXXX</w:t>
+      </w:r>
+      <w:commentRangeEnd w:id="0"/>
+      <w:r>
+        <w:rPr>
+          <w:rStyle w:val="CommentReference"/>
+        </w:rPr>
+        <w:commentReference w:id="0"/>
+      </w:r>
+      <w:r>
+        <w:t>)</w:t>
+      </w:r>
+      <w:r>
+        <w:t>.  To identify when patients were treated we included procedure codes YYY.</w:t>
+      </w:r>
+    </w:p>
+    <w:p>
+      <w:pPr>
+        <w:pStyle w:val="Heading1"/>
+      </w:pPr>
+      <w:proofErr w:type="spellStart"/>
+      <w:r>
+        <w:t>Re</w:t>
+      </w:r>
+      <w:proofErr w:type="spellEnd"/>
+      <w:r>
+        <w:t>sults</w:t>
+      </w:r>
+    </w:p>
+    <w:p>
+      <w:r>
+        <w:t>As shown in Figure 1, we identified YYYY participants with diagnoses of Cushing’s disease.  Their average age at diagnosis was XXX (+/- XXX).  They</w:t>
+      </w:r>
+    </w:p>
     <w:p>
       <w:pPr>
         <w:pStyle w:val="Heading2"/>
@@ -42,6 +114,11 @@
     </w:p>
     <w:p>
       <w:pPr>
+        <w:pStyle w:val="NormalWeb"/>
+      </w:pPr>
+    </w:p>
+    <w:p>
+      <w:pPr>
         <w:pStyle w:val="Heading2"/>
         <w:rPr>
           <w:b/>
@@ -1828,6 +1905,7 @@
           <w:szCs w:val="18"/>
           <w14:ligatures w14:val="none"/>
         </w:rPr>
+        <w:lastRenderedPageBreak/>
         <w:t>-</w:t>
       </w:r>
       <w:r>
@@ -2120,6 +2198,46 @@
     </w:sectPr>
   </w:body>
 </w:document>
+</file>
+
+<file path=word/comments.xml><?xml version="1.0" encoding="utf-8"?>
+<w:comments xmlns:wpc="http://schemas.microsoft.com/office/word/2010/wordprocessingCanvas" xmlns:cx="http://schemas.microsoft.com/office/drawing/2014/chartex" xmlns:cx1="http://schemas.microsoft.com/office/drawing/2015/9/8/chartex" xmlns:cx2="http://schemas.microsoft.com/office/drawing/2015/10/21/chartex" xmlns:cx3="http://schemas.microsoft.com/office/drawing/2016/5/9/chartex" xmlns:cx4="http://schemas.microsoft.com/office/drawing/2016/5/10/chartex" xmlns:cx5="http://schemas.microsoft.com/office/drawing/2016/5/11/chartex" xmlns:cx6="http://schemas.microsoft.com/office/drawing/2016/5/12/chartex" xmlns:cx7="http://schemas.microsoft.com/office/drawing/2016/5/13/chartex" xmlns:cx8="http://schemas.microsoft.com/office/drawing/2016/5/14/chartex" xmlns:mc="http://schemas.openxmlformats.org/markup-compatibility/2006" xmlns:aink="http://schemas.microsoft.com/office/drawing/2016/ink" xmlns:am3d="http://schemas.microsoft.com/office/drawing/2017/model3d" xmlns:o="urn:schemas-microsoft-com:office:office" xmlns:oel="http://schemas.microsoft.com/office/2019/extlst" xmlns:r="http://schemas.openxmlformats.org/officeDocument/2006/relationships" xmlns:m="http://schemas.openxmlformats.org/officeDocument/2006/math" xmlns:v="urn:schemas-microsoft-com:vml" xmlns:wp14="http://schemas.microsoft.com/office/word/2010/wordprocessingDrawing" xmlns:wp="http://schemas.openxmlformats.org/drawingml/2006/wordprocessingDrawing" xmlns:w10="urn:schemas-microsoft-com:office:word" xmlns:w="http://schemas.openxmlformats.org/wordprocessingml/2006/main" xmlns:w14="http://schemas.microsoft.com/office/word/2010/wordml" xmlns:w15="http://schemas.microsoft.com/office/word/2012/wordml" xmlns:w16cex="http://schemas.microsoft.com/office/word/2018/wordml/cex" xmlns:w16cid="http://schemas.microsoft.com/office/word/2016/wordml/cid" xmlns:w16="http://schemas.microsoft.com/office/word/2018/wordml" xmlns:w16du="http://schemas.microsoft.com/office/word/2023/wordml/word16du" xmlns:w16sdtdh="http://schemas.microsoft.com/office/word/2020/wordml/sdtdatahash" xmlns:w16sdtfl="http://schemas.microsoft.com/office/word/2024/wordml/sdtformatlock" xmlns:w16se="http://schemas.microsoft.com/office/word/2015/wordml/symex" xmlns:wpg="http://schemas.microsoft.com/office/word/2010/wordprocessingGroup" xmlns:wpi="http://schemas.microsoft.com/office/word/2010/wordprocessingInk" xmlns:wne="http://schemas.microsoft.com/office/word/2006/wordml" xmlns:wps="http://schemas.microsoft.com/office/word/2010/wordprocessingShape" mc:Ignorable="w14 w15 w16se w16cid w16 w16cex w16sdtdh w16sdtfl w16du wp14">
+  <w:comment w:id="0" w:author="Dave Bridges" w:date="2025-09-05T11:11:00Z" w:initials="DB">
+    <w:p>
+      <w:r>
+        <w:rPr>
+          <w:rStyle w:val="CommentReference"/>
+        </w:rPr>
+        <w:annotationRef/>
+      </w:r>
+      <w:r>
+        <w:rPr>
+          <w:sz w:val="20"/>
+          <w:szCs w:val="20"/>
+        </w:rPr>
+        <w:t>@trey can you fill this in</w:t>
+      </w:r>
+    </w:p>
+  </w:comment>
+</w:comments>
+</file>
+
+<file path=word/commentsExtended.xml><?xml version="1.0" encoding="utf-8"?>
+<w15:commentsEx xmlns:wpc="http://schemas.microsoft.com/office/word/2010/wordprocessingCanvas" xmlns:cx="http://schemas.microsoft.com/office/drawing/2014/chartex" xmlns:cx1="http://schemas.microsoft.com/office/drawing/2015/9/8/chartex" xmlns:cx2="http://schemas.microsoft.com/office/drawing/2015/10/21/chartex" xmlns:cx3="http://schemas.microsoft.com/office/drawing/2016/5/9/chartex" xmlns:cx4="http://schemas.microsoft.com/office/drawing/2016/5/10/chartex" xmlns:cx5="http://schemas.microsoft.com/office/drawing/2016/5/11/chartex" xmlns:cx6="http://schemas.microsoft.com/office/drawing/2016/5/12/chartex" xmlns:cx7="http://schemas.microsoft.com/office/drawing/2016/5/13/chartex" xmlns:cx8="http://schemas.microsoft.com/office/drawing/2016/5/14/chartex" xmlns:mc="http://schemas.openxmlformats.org/markup-compatibility/2006" xmlns:aink="http://schemas.microsoft.com/office/drawing/2016/ink" xmlns:am3d="http://schemas.microsoft.com/office/drawing/2017/model3d" xmlns:o="urn:schemas-microsoft-com:office:office" xmlns:oel="http://schemas.microsoft.com/office/2019/extlst" xmlns:r="http://schemas.openxmlformats.org/officeDocument/2006/relationships" xmlns:m="http://schemas.openxmlformats.org/officeDocument/2006/math" xmlns:v="urn:schemas-microsoft-com:vml" xmlns:wp14="http://schemas.microsoft.com/office/word/2010/wordprocessingDrawing" xmlns:wp="http://schemas.openxmlformats.org/drawingml/2006/wordprocessingDrawing" xmlns:w10="urn:schemas-microsoft-com:office:word" xmlns:w="http://schemas.openxmlformats.org/wordprocessingml/2006/main" xmlns:w14="http://schemas.microsoft.com/office/word/2010/wordml" xmlns:w15="http://schemas.microsoft.com/office/word/2012/wordml" xmlns:w16cex="http://schemas.microsoft.com/office/word/2018/wordml/cex" xmlns:w16cid="http://schemas.microsoft.com/office/word/2016/wordml/cid" xmlns:w16="http://schemas.microsoft.com/office/word/2018/wordml" xmlns:w16du="http://schemas.microsoft.com/office/word/2023/wordml/word16du" xmlns:w16sdtdh="http://schemas.microsoft.com/office/word/2020/wordml/sdtdatahash" xmlns:w16sdtfl="http://schemas.microsoft.com/office/word/2024/wordml/sdtformatlock" xmlns:w16se="http://schemas.microsoft.com/office/word/2015/wordml/symex" xmlns:wpg="http://schemas.microsoft.com/office/word/2010/wordprocessingGroup" xmlns:wpi="http://schemas.microsoft.com/office/word/2010/wordprocessingInk" xmlns:wne="http://schemas.microsoft.com/office/word/2006/wordml" xmlns:wps="http://schemas.microsoft.com/office/word/2010/wordprocessingShape" mc:Ignorable="w14 w15 w16se w16cid w16 w16cex w16sdtdh w16sdtfl w16du wp14">
+  <w15:commentEx w15:paraId="4DBE4D40" w15:done="0"/>
+</w15:commentsEx>
+</file>
+
+<file path=word/commentsExtensible.xml><?xml version="1.0" encoding="utf-8"?>
+<w16cex:commentsExtensible xmlns:wpc="http://schemas.microsoft.com/office/word/2010/wordprocessingCanvas" xmlns:cx="http://schemas.microsoft.com/office/drawing/2014/chartex" xmlns:cx1="http://schemas.microsoft.com/office/drawing/2015/9/8/chartex" xmlns:cx2="http://schemas.microsoft.com/office/drawing/2015/10/21/chartex" xmlns:cx3="http://schemas.microsoft.com/office/drawing/2016/5/9/chartex" xmlns:cx4="http://schemas.microsoft.com/office/drawing/2016/5/10/chartex" xmlns:cx5="http://schemas.microsoft.com/office/drawing/2016/5/11/chartex" xmlns:cx6="http://schemas.microsoft.com/office/drawing/2016/5/12/chartex" xmlns:cx7="http://schemas.microsoft.com/office/drawing/2016/5/13/chartex" xmlns:cx8="http://schemas.microsoft.com/office/drawing/2016/5/14/chartex" xmlns:cr="http://schemas.microsoft.com/office/comments/2020/reactions" xmlns:mc="http://schemas.openxmlformats.org/markup-compatibility/2006" xmlns:aink="http://schemas.microsoft.com/office/drawing/2016/ink" xmlns:am3d="http://schemas.microsoft.com/office/drawing/2017/model3d" xmlns:o="urn:schemas-microsoft-com:office:office" xmlns:oel="http://schemas.microsoft.com/office/2019/extlst" xmlns:r="http://schemas.openxmlformats.org/officeDocument/2006/relationships" xmlns:m="http://schemas.openxmlformats.org/officeDocument/2006/math" xmlns:v="urn:schemas-microsoft-com:vml" xmlns:wp14="http://schemas.microsoft.com/office/word/2010/wordprocessingDrawing" xmlns:wp="http://schemas.openxmlformats.org/drawingml/2006/wordprocessingDrawing" xmlns:w10="urn:schemas-microsoft-com:office:word" xmlns:w="http://schemas.openxmlformats.org/wordprocessingml/2006/main" xmlns:w14="http://schemas.microsoft.com/office/word/2010/wordml" xmlns:w15="http://schemas.microsoft.com/office/word/2012/wordml" xmlns:w16cex="http://schemas.microsoft.com/office/word/2018/wordml/cex" xmlns:w16cid="http://schemas.microsoft.com/office/word/2016/wordml/cid" xmlns:w16="http://schemas.microsoft.com/office/word/2018/wordml" xmlns:w16du="http://schemas.microsoft.com/office/word/2023/wordml/word16du" xmlns:w16sdtdh="http://schemas.microsoft.com/office/word/2020/wordml/sdtdatahash" xmlns:w16sdtfl="http://schemas.microsoft.com/office/word/2024/wordml/sdtformatlock" xmlns:w16se="http://schemas.microsoft.com/office/word/2015/wordml/symex" xmlns:wpg="http://schemas.microsoft.com/office/word/2010/wordprocessingGroup" xmlns:wpi="http://schemas.microsoft.com/office/word/2010/wordprocessingInk" xmlns:wne="http://schemas.microsoft.com/office/word/2006/wordml" xmlns:wps="http://schemas.microsoft.com/office/word/2010/wordprocessingShape" mc:Ignorable="w14 w15 w16se w16cid w16 w16cex w16sdtdh w16sdtfl cr w16du wp14">
+  <w16cex:commentExtensible w16cex:durableId="68EF662C" w16cex:dateUtc="2025-09-05T15:11:00Z"/>
+</w16cex:commentsExtensible>
+</file>
+
+<file path=word/commentsIds.xml><?xml version="1.0" encoding="utf-8"?>
+<w16cid:commentsIds xmlns:wpc="http://schemas.microsoft.com/office/word/2010/wordprocessingCanvas" xmlns:cx="http://schemas.microsoft.com/office/drawing/2014/chartex" xmlns:cx1="http://schemas.microsoft.com/office/drawing/2015/9/8/chartex" xmlns:cx2="http://schemas.microsoft.com/office/drawing/2015/10/21/chartex" xmlns:cx3="http://schemas.microsoft.com/office/drawing/2016/5/9/chartex" xmlns:cx4="http://schemas.microsoft.com/office/drawing/2016/5/10/chartex" xmlns:cx5="http://schemas.microsoft.com/office/drawing/2016/5/11/chartex" xmlns:cx6="http://schemas.microsoft.com/office/drawing/2016/5/12/chartex" xmlns:cx7="http://schemas.microsoft.com/office/drawing/2016/5/13/chartex" xmlns:cx8="http://schemas.microsoft.com/office/drawing/2016/5/14/chartex" xmlns:mc="http://schemas.openxmlformats.org/markup-compatibility/2006" xmlns:aink="http://schemas.microsoft.com/office/drawing/2016/ink" xmlns:am3d="http://schemas.microsoft.com/office/drawing/2017/model3d" xmlns:o="urn:schemas-microsoft-com:office:office" xmlns:oel="http://schemas.microsoft.com/office/2019/extlst" xmlns:r="http://schemas.openxmlformats.org/officeDocument/2006/relationships" xmlns:m="http://schemas.openxmlformats.org/officeDocument/2006/math" xmlns:v="urn:schemas-microsoft-com:vml" xmlns:wp14="http://schemas.microsoft.com/office/word/2010/wordprocessingDrawing" xmlns:wp="http://schemas.openxmlformats.org/drawingml/2006/wordprocessingDrawing" xmlns:w10="urn:schemas-microsoft-com:office:word" xmlns:w="http://schemas.openxmlformats.org/wordprocessingml/2006/main" xmlns:w14="http://schemas.microsoft.com/office/word/2010/wordml" xmlns:w15="http://schemas.microsoft.com/office/word/2012/wordml" xmlns:w16cex="http://schemas.microsoft.com/office/word/2018/wordml/cex" xmlns:w16cid="http://schemas.microsoft.com/office/word/2016/wordml/cid" xmlns:w16="http://schemas.microsoft.com/office/word/2018/wordml" xmlns:w16du="http://schemas.microsoft.com/office/word/2023/wordml/word16du" xmlns:w16sdtdh="http://schemas.microsoft.com/office/word/2020/wordml/sdtdatahash" xmlns:w16sdtfl="http://schemas.microsoft.com/office/word/2024/wordml/sdtformatlock" xmlns:w16se="http://schemas.microsoft.com/office/word/2015/wordml/symex" xmlns:wpg="http://schemas.microsoft.com/office/word/2010/wordprocessingGroup" xmlns:wpi="http://schemas.microsoft.com/office/word/2010/wordprocessingInk" xmlns:wne="http://schemas.microsoft.com/office/word/2006/wordml" xmlns:wps="http://schemas.microsoft.com/office/word/2010/wordprocessingShape" mc:Ignorable="w14 w15 w16se w16cid w16 w16cex w16sdtdh w16sdtfl w16du wp14">
+  <w16cid:commentId w16cid:paraId="4DBE4D40" w16cid:durableId="68EF662C"/>
+</w16cid:commentsIds>
 </file>
 
 <file path=word/numbering.xml><?xml version="1.0" encoding="utf-8"?>
@@ -2885,6 +3003,14 @@
     <w:abstractNumId w:val="1"/>
   </w:num>
 </w:numbering>
+</file>
+
+<file path=word/people.xml><?xml version="1.0" encoding="utf-8"?>
+<w15:people xmlns:wpc="http://schemas.microsoft.com/office/word/2010/wordprocessingCanvas" xmlns:cx="http://schemas.microsoft.com/office/drawing/2014/chartex" xmlns:cx1="http://schemas.microsoft.com/office/drawing/2015/9/8/chartex" xmlns:cx2="http://schemas.microsoft.com/office/drawing/2015/10/21/chartex" xmlns:cx3="http://schemas.microsoft.com/office/drawing/2016/5/9/chartex" xmlns:cx4="http://schemas.microsoft.com/office/drawing/2016/5/10/chartex" xmlns:cx5="http://schemas.microsoft.com/office/drawing/2016/5/11/chartex" xmlns:cx6="http://schemas.microsoft.com/office/drawing/2016/5/12/chartex" xmlns:cx7="http://schemas.microsoft.com/office/drawing/2016/5/13/chartex" xmlns:cx8="http://schemas.microsoft.com/office/drawing/2016/5/14/chartex" xmlns:mc="http://schemas.openxmlformats.org/markup-compatibility/2006" xmlns:aink="http://schemas.microsoft.com/office/drawing/2016/ink" xmlns:am3d="http://schemas.microsoft.com/office/drawing/2017/model3d" xmlns:o="urn:schemas-microsoft-com:office:office" xmlns:oel="http://schemas.microsoft.com/office/2019/extlst" xmlns:r="http://schemas.openxmlformats.org/officeDocument/2006/relationships" xmlns:m="http://schemas.openxmlformats.org/officeDocument/2006/math" xmlns:v="urn:schemas-microsoft-com:vml" xmlns:wp14="http://schemas.microsoft.com/office/word/2010/wordprocessingDrawing" xmlns:wp="http://schemas.openxmlformats.org/drawingml/2006/wordprocessingDrawing" xmlns:w10="urn:schemas-microsoft-com:office:word" xmlns:w="http://schemas.openxmlformats.org/wordprocessingml/2006/main" xmlns:w14="http://schemas.microsoft.com/office/word/2010/wordml" xmlns:w15="http://schemas.microsoft.com/office/word/2012/wordml" xmlns:w16cex="http://schemas.microsoft.com/office/word/2018/wordml/cex" xmlns:w16cid="http://schemas.microsoft.com/office/word/2016/wordml/cid" xmlns:w16="http://schemas.microsoft.com/office/word/2018/wordml" xmlns:w16du="http://schemas.microsoft.com/office/word/2023/wordml/word16du" xmlns:w16sdtdh="http://schemas.microsoft.com/office/word/2020/wordml/sdtdatahash" xmlns:w16sdtfl="http://schemas.microsoft.com/office/word/2024/wordml/sdtformatlock" xmlns:w16se="http://schemas.microsoft.com/office/word/2015/wordml/symex" xmlns:wpg="http://schemas.microsoft.com/office/word/2010/wordprocessingGroup" xmlns:wpi="http://schemas.microsoft.com/office/word/2010/wordprocessingInk" xmlns:wne="http://schemas.microsoft.com/office/word/2006/wordml" xmlns:wps="http://schemas.microsoft.com/office/word/2010/wordprocessingShape" mc:Ignorable="w14 w15 w16se w16cid w16 w16cex w16sdtdh w16sdtfl w16du wp14">
+  <w15:person w15:author="Dave Bridges">
+    <w15:presenceInfo w15:providerId="None" w15:userId="Dave Bridges"/>
+  </w15:person>
+</w15:people>
 </file>
 
 <file path=word/styles.xml><?xml version="1.0" encoding="utf-8"?>
@@ -3829,6 +3955,74 @@
       <w:bCs/>
     </w:rPr>
   </w:style>
+  <w:style w:type="character" w:styleId="CommentReference">
+    <w:name w:val="annotation reference"/>
+    <w:basedOn w:val="DefaultParagraphFont"/>
+    <w:uiPriority w:val="99"/>
+    <w:semiHidden/>
+    <w:unhideWhenUsed/>
+    <w:rsid w:val="00B859CD"/>
+    <w:rPr>
+      <w:sz w:val="16"/>
+      <w:szCs w:val="16"/>
+    </w:rPr>
+  </w:style>
+  <w:style w:type="paragraph" w:styleId="CommentText">
+    <w:name w:val="annotation text"/>
+    <w:basedOn w:val="Normal"/>
+    <w:link w:val="CommentTextChar"/>
+    <w:uiPriority w:val="99"/>
+    <w:semiHidden/>
+    <w:unhideWhenUsed/>
+    <w:rsid w:val="00B859CD"/>
+    <w:pPr>
+      <w:spacing w:line="240" w:lineRule="auto"/>
+    </w:pPr>
+    <w:rPr>
+      <w:sz w:val="20"/>
+      <w:szCs w:val="20"/>
+    </w:rPr>
+  </w:style>
+  <w:style w:type="character" w:customStyle="1" w:styleId="CommentTextChar">
+    <w:name w:val="Comment Text Char"/>
+    <w:basedOn w:val="DefaultParagraphFont"/>
+    <w:link w:val="CommentText"/>
+    <w:uiPriority w:val="99"/>
+    <w:semiHidden/>
+    <w:rsid w:val="00B859CD"/>
+    <w:rPr>
+      <w:sz w:val="20"/>
+      <w:szCs w:val="20"/>
+    </w:rPr>
+  </w:style>
+  <w:style w:type="paragraph" w:styleId="CommentSubject">
+    <w:name w:val="annotation subject"/>
+    <w:basedOn w:val="CommentText"/>
+    <w:next w:val="CommentText"/>
+    <w:link w:val="CommentSubjectChar"/>
+    <w:uiPriority w:val="99"/>
+    <w:semiHidden/>
+    <w:unhideWhenUsed/>
+    <w:rsid w:val="00B859CD"/>
+    <w:rPr>
+      <w:b/>
+      <w:bCs/>
+    </w:rPr>
+  </w:style>
+  <w:style w:type="character" w:customStyle="1" w:styleId="CommentSubjectChar">
+    <w:name w:val="Comment Subject Char"/>
+    <w:basedOn w:val="CommentTextChar"/>
+    <w:link w:val="CommentSubject"/>
+    <w:uiPriority w:val="99"/>
+    <w:semiHidden/>
+    <w:rsid w:val="00B859CD"/>
+    <w:rPr>
+      <w:b/>
+      <w:bCs/>
+      <w:sz w:val="20"/>
+      <w:szCs w:val="20"/>
+    </w:rPr>
+  </w:style>
 </w:styles>
 </file>
 

</xml_diff>

<commit_message>
Updated manuscript with details about covariate matching
</commit_message>
<xml_diff>
--- a/manuscript/Cushings-Obesity/manuscript.docx
+++ b/manuscript/Cushings-Obesity/manuscript.docx
@@ -34,53 +34,273 @@
       <w:r>
         <w:t xml:space="preserve">This study was reviewed by the University of Michigan </w:t>
       </w:r>
+      <w:r>
+        <w:t>Institutional</w:t>
+      </w:r>
+      <w:r>
+        <w:t xml:space="preserve"> Review Board (</w:t>
+      </w:r>
+      <w:r>
+        <w:t>HUM00247814</w:t>
+      </w:r>
+      <w:r>
+        <w:t xml:space="preserve">) </w:t>
+      </w:r>
+      <w:r>
+        <w:t xml:space="preserve">and </w:t>
+      </w:r>
+      <w:r>
+        <w:t>adjudicated as not regulated.</w:t>
+      </w:r>
+    </w:p>
+    <w:p>
+      <w:r>
+        <w:t>To identify patients with Cushing’s disease, we evaluated electronic health records at Michigan Medicine dating back to January 1, 2000, searching for diagnoses of Cushing’s disease including ICD Codes (</w:t>
+      </w:r>
+      <w:commentRangeStart w:id="0"/>
+      <w:r>
+        <w:t>XXXX</w:t>
+      </w:r>
+      <w:commentRangeEnd w:id="0"/>
+      <w:r>
+        <w:rPr>
+          <w:rStyle w:val="CommentReference"/>
+        </w:rPr>
+        <w:commentReference w:id="0"/>
+      </w:r>
+      <w:r>
+        <w:t>)</w:t>
+      </w:r>
+      <w:r>
+        <w:t xml:space="preserve">.  </w:t>
+      </w:r>
+      <w:r>
+        <w:t xml:space="preserve"> </w:t>
+      </w:r>
+      <w:r>
+        <w:t xml:space="preserve">To identify when patients were </w:t>
+      </w:r>
+      <w:proofErr w:type="gramStart"/>
+      <w:r>
+        <w:t>treated</w:t>
+      </w:r>
+      <w:proofErr w:type="gramEnd"/>
+      <w:r>
+        <w:t xml:space="preserve"> we included procedure codes YYY.</w:t>
+      </w:r>
+      <w:r>
+        <w:t xml:space="preserve">  We excluded participants if they YYY.</w:t>
+      </w:r>
+    </w:p>
+    <w:p>
+      <w:r>
+        <w:t xml:space="preserve">To identify controls, </w:t>
+      </w:r>
+      <w:r>
+        <w:t>we used</w:t>
+      </w:r>
+      <w:r>
+        <w:t xml:space="preserve"> the </w:t>
+      </w:r>
+      <w:r>
+        <w:t xml:space="preserve"> </w:t>
+      </w:r>
       <w:proofErr w:type="spellStart"/>
       <w:r>
-        <w:t>Istitutional</w:t>
+        <w:t>MatchIt</w:t>
       </w:r>
       <w:proofErr w:type="spellEnd"/>
       <w:r>
-        <w:t xml:space="preserve"> Review Board (HUM###) and noted as exempt.</w:t>
-      </w:r>
-    </w:p>
-    <w:p>
-      <w:r>
-        <w:t>To identify patients with Cushing’s disease, we evaluated electronic health records at Michigan Medicine dating back to January 1, 2000, searching for diagnoses of Cushing’s disease including ICD Codes (</w:t>
-      </w:r>
-      <w:commentRangeStart w:id="0"/>
-      <w:r>
-        <w:t>XXXX</w:t>
-      </w:r>
-      <w:commentRangeEnd w:id="0"/>
-      <w:r>
-        <w:rPr>
-          <w:rStyle w:val="CommentReference"/>
-        </w:rPr>
-        <w:commentReference w:id="0"/>
+        <w:t xml:space="preserve"> </w:t>
+      </w:r>
+      <w:r>
+        <w:t xml:space="preserve">package </w:t>
+      </w:r>
+      <w:r>
+        <w:t xml:space="preserve">(version </w:t>
+      </w:r>
+      <w:r>
+        <w:t xml:space="preserve">4.7.1; </w:t>
+      </w:r>
+      <w:r>
+        <w:fldChar w:fldCharType="begin"/>
+      </w:r>
+      <w:r>
+        <w:instrText xml:space="preserve"> ADDIN ZOTERO_ITEM CSL_CITATION {"citationID":"Pl5Gc3F1","properties":{"formattedCitation":"(Ho et al., 2011)","plainCitation":"(Ho et al., 2011)","noteIndex":0},"citationItems":[{"id":12196,"uris":["http://zotero.org/users/7317906/items/H5CAAL6F"],"itemData":{"id":12196,"type":"article-journal","abstract":"MatchIt implements the suggestions of Ho, Imai, King, and Stuart (2007) for improving parametric statistical models by preprocessing data with nonparametric matching methods. MatchIt implements a wide range of sophisticated matching methods, making it possible to greatly reduce the dependence of causal inferences on hard-to-justify, but commonly made, statistical modeling assumptions. The software also easily fits into existing research practices since, after preprocessing data with MatchIt, researchers can use whatever parametric model they would have used without MatchIt, but produce inferences with substantially more robustness and less sensitivity to modeling assumptions. MatchIt is an R program, and also works seamlessly with Zelig.","container-title":"Journal of Statistical Software","DOI":"10.18637/jss.v042.i08","ISSN":"1548-7660","language":"en","license":"Copyright (c) 2006 Daniel Ho, Kosuke Imai, Gary King, Elizabeth A. Stuart","page":"1-28","source":"www.jstatsoft.org","title":"MatchIt: Nonparametric Preprocessing for Parametric Causal Inference","title-short":"MatchIt","volume":"42","author":[{"family":"Ho","given":"Daniel"},{"family":"Imai","given":"Kosuke"},{"family":"King","given":"Gary"},{"family":"Stuart","given":"Elizabeth A."}],"issued":{"date-parts":[["2011",6,14]]},"citation-key":"hoMatchItNonparametricPreprocessing2011"}}],"schema":"https://github.com/citation-style-language/schema/raw/master/csl-citation.json"} </w:instrText>
+      </w:r>
+      <w:r>
+        <w:fldChar w:fldCharType="separate"/>
+      </w:r>
+      <w:r>
+        <w:rPr>
+          <w:noProof/>
+        </w:rPr>
+        <w:t>(Ho et al., 2011)</w:t>
+      </w:r>
+      <w:r>
+        <w:fldChar w:fldCharType="end"/>
       </w:r>
       <w:r>
         <w:t>)</w:t>
       </w:r>
       <w:r>
-        <w:t>.  To identify when patients were treated we included procedure codes YYY.</w:t>
+        <w:t>. F</w:t>
+      </w:r>
+      <w:r>
+        <w:t>or</w:t>
+      </w:r>
+      <w:r>
+        <w:t xml:space="preserve"> </w:t>
+      </w:r>
+      <w:r>
+        <w:t xml:space="preserve">each outcome we identified all Cushing’s cases </w:t>
+      </w:r>
+      <w:r>
+        <w:t xml:space="preserve">with that measurement </w:t>
+      </w:r>
+      <w:r>
+        <w:t xml:space="preserve">and potential controls with that measurement available. </w:t>
+      </w:r>
+      <w:r>
+        <w:t xml:space="preserve">For Cushing’s cases to be included they had to have had the laboratory measure within 30 </w:t>
+      </w:r>
+      <w:proofErr w:type="gramStart"/>
+      <w:r>
+        <w:t>days, and</w:t>
+      </w:r>
+      <w:proofErr w:type="gramEnd"/>
+      <w:r>
+        <w:t xml:space="preserve"> had to be prior to surgical treatment.  </w:t>
+      </w:r>
+      <w:r>
+        <w:t>We performed nearest</w:t>
+      </w:r>
+      <w:r>
+        <w:rPr>
+          <w:rFonts w:ascii="Cambria Math" w:hAnsi="Cambria Math" w:cs="Cambria Math"/>
+        </w:rPr>
+        <w:t>‐</w:t>
+      </w:r>
+      <w:r>
+        <w:t xml:space="preserve">neighbor propensity score matching (ratio = </w:t>
+      </w:r>
+      <w:r>
+        <w:t>10:1</w:t>
+      </w:r>
+      <w:r>
+        <w:t xml:space="preserve">) with age in the </w:t>
+      </w:r>
+      <w:r>
+        <w:t>propensity score</w:t>
+      </w:r>
+      <w:r>
+        <w:t xml:space="preserve"> model and exact matching on gender and race/ethnicity. This procedure was repeated separately for each outcome </w:t>
+      </w:r>
+      <w:r>
+        <w:t xml:space="preserve">as our </w:t>
+      </w:r>
+      <w:r>
+        <w:t>primary analys</w:t>
+      </w:r>
+      <w:r>
+        <w:t>e</w:t>
+      </w:r>
+      <w:r>
+        <w:t xml:space="preserve">s. </w:t>
+      </w:r>
+      <w:r>
+        <w:t xml:space="preserve"> The post-matching standardized mean difference for Age was &lt;0.1 for all outcomes, indicating adequate balance.</w:t>
+      </w:r>
+      <w:r>
+        <w:t xml:space="preserve">  </w:t>
+      </w:r>
+      <w:r>
+        <w:t xml:space="preserve">As a sensitivity analysis we also created a single matched cohort using participants with </w:t>
+      </w:r>
+      <w:r>
+        <w:rPr>
+          <w:highlight w:val="yellow"/>
+        </w:rPr>
+        <w:t>[criteria]</w:t>
+      </w:r>
+      <w:r>
+        <w:t xml:space="preserve"> and repeated all outcome models </w:t>
+      </w:r>
+      <w:r>
+        <w:t>with that dataset</w:t>
+      </w:r>
+      <w:r>
+        <w:t>.</w:t>
+      </w:r>
+    </w:p>
+    <w:p>
+      <w:r>
+        <w:t>BMI was not included in the propensity score because we aimed to evaluate obesity as a moderator of the effects of Cushing’s disease</w:t>
+      </w:r>
+      <w:r>
+        <w:t>. Subsequent</w:t>
+      </w:r>
+      <w:r>
+        <w:t xml:space="preserve"> analyses were stratified by obesity (BMI ≥30 kg/m²). Within each obesity stratum, BMI was evaluated </w:t>
+      </w:r>
+      <w:proofErr w:type="gramStart"/>
+      <w:r>
+        <w:t>descriptively</w:t>
+      </w:r>
+      <w:r>
+        <w:t>,</w:t>
+      </w:r>
+      <w:r>
+        <w:t xml:space="preserve"> and</w:t>
+      </w:r>
+      <w:proofErr w:type="gramEnd"/>
+      <w:r>
+        <w:t xml:space="preserve"> </w:t>
+      </w:r>
+      <w:r>
+        <w:t xml:space="preserve">also </w:t>
+      </w:r>
+      <w:r>
+        <w:t>included as a covariate in sensitivity models.</w:t>
+      </w:r>
+    </w:p>
+    <w:p/>
+    <w:p>
+      <w:r>
+        <w:rPr>
+          <w:b/>
+          <w:bCs/>
+        </w:rPr>
+        <w:t>Statistical Analyses.</w:t>
+      </w:r>
+      <w:r>
+        <w:t xml:space="preserve">  Statistical significance was set at p&lt;0.05.  All analyses were performed using R version 4.4.0 </w:t>
+      </w:r>
+      <w:r>
+        <w:fldChar w:fldCharType="begin"/>
+      </w:r>
+      <w:r>
+        <w:instrText xml:space="preserve"> ADDIN ZOTERO_ITEM CSL_CITATION {"citationID":"UlCX6dpA","properties":{"formattedCitation":"(R Core Team, 2019)","plainCitation":"(R Core Team, 2019)","noteIndex":0},"citationItems":[{"id":8230,"uris":["http://zotero.org/users/7317906/items/3HZT7KXK"],"itemData":{"id":8230,"type":"document","note":"Citation Key: base\npublisher-place: Vienna, Austria","publisher":"R Foundation for Statistical Computing","title":"R: A Language and Environment for Statistical Computing","URL":"http://www.r-project.org/","author":[{"literal":"R Core Team"}],"accessed":{"date-parts":[["2010",10,22]]},"issued":{"date-parts":[["2019"]]},"citation-key":"base"}}],"schema":"https://github.com/citation-style-language/schema/raw/master/csl-citation.json"} </w:instrText>
+      </w:r>
+      <w:r>
+        <w:fldChar w:fldCharType="separate"/>
+      </w:r>
+      <w:r>
+        <w:rPr>
+          <w:noProof/>
+        </w:rPr>
+        <w:t>(R Core Team, 2019)</w:t>
+      </w:r>
+      <w:r>
+        <w:fldChar w:fldCharType="end"/>
       </w:r>
     </w:p>
     <w:p>
       <w:pPr>
         <w:pStyle w:val="Heading1"/>
       </w:pPr>
-      <w:proofErr w:type="spellStart"/>
-      <w:r>
-        <w:t>Re</w:t>
-      </w:r>
-      <w:proofErr w:type="spellEnd"/>
-      <w:r>
-        <w:t>sults</w:t>
-      </w:r>
-    </w:p>
-    <w:p>
-      <w:r>
-        <w:t>As shown in Figure 1, we identified YYYY participants with diagnoses of Cushing’s disease.  Their average age at diagnosis was XXX (+/- XXX).  They</w:t>
+      <w:r>
+        <w:t>Results</w:t>
       </w:r>
     </w:p>
     <w:p>
@@ -101,39 +321,48 @@
       </w:r>
     </w:p>
     <w:p>
-      <w:pPr>
-        <w:pStyle w:val="NormalWeb"/>
-        <w:numPr>
-          <w:ilvl w:val="0"/>
-          <w:numId w:val="1"/>
-        </w:numPr>
-      </w:pPr>
-      <w:r>
-        <w:t>Refer to Figure 1 and Table 1.</w:t>
-      </w:r>
-    </w:p>
-    <w:p>
-      <w:pPr>
-        <w:pStyle w:val="NormalWeb"/>
-      </w:pPr>
-    </w:p>
+      <w:r>
+        <w:t xml:space="preserve">As shown in Figure 1, we identified YYYY participants with diagnoses of Cushing’s disease.  </w:t>
+      </w:r>
+      <w:r>
+        <w:t xml:space="preserve">This included YYYY adrenal tumors and ZZZ pituitary tumors.  </w:t>
+      </w:r>
+      <w:r>
+        <w:t>Their average age at diagnosis was XXX (+/- XXX).  They</w:t>
+      </w:r>
+    </w:p>
+    <w:p/>
     <w:p>
       <w:pPr>
         <w:pStyle w:val="Heading2"/>
-        <w:rPr>
-          <w:b/>
-          <w:bCs/>
-        </w:rPr>
-      </w:pPr>
-      <w:r>
         <w:rPr>
           <w:rStyle w:val="Strong"/>
           <w:b w:val="0"/>
           <w:bCs w:val="0"/>
         </w:rPr>
+      </w:pPr>
+      <w:r>
+        <w:rPr>
+          <w:rStyle w:val="Strong"/>
+          <w:b w:val="0"/>
+          <w:bCs w:val="0"/>
+        </w:rPr>
+        <w:lastRenderedPageBreak/>
         <w:t>Baseline characteristics by obesity/Cushing’s status</w:t>
       </w:r>
     </w:p>
+    <w:p>
+      <w:r>
+        <w:t xml:space="preserve">We performed outcome-specific propensity matching to identify </w:t>
+      </w:r>
+      <w:r>
+        <w:t>appropriate controls</w:t>
+      </w:r>
+      <w:r>
+        <w:t>, starting from those with generating exact matches for gender, race and ethnicity.  We then algorithmically matched for age, generating 10 controls for each case.  Matching was very strong with a SMD for age of &lt;0.05 for each outcome (see Figure 2 and Supplementary Table S1).</w:t>
+      </w:r>
+    </w:p>
+    <w:p/>
     <w:p>
       <w:pPr>
         <w:pStyle w:val="NormalWeb"/>
@@ -223,14 +452,131 @@
     </w:p>
     <w:p>
       <w:pPr>
+        <w:pStyle w:val="NormalWeb"/>
+        <w:numPr>
+          <w:ilvl w:val="0"/>
+          <w:numId w:val="5"/>
+        </w:numPr>
+      </w:pPr>
+      <w:r>
+        <w:t>Full model propensity mapping</w:t>
+      </w:r>
+    </w:p>
+    <w:p>
+      <w:pPr>
         <w:pStyle w:val="Heading1"/>
       </w:pPr>
+      <w:r>
+        <w:t>References</w:t>
+      </w:r>
+    </w:p>
+    <w:p>
+      <w:pPr>
+        <w:pStyle w:val="Bibliography"/>
+        <w:rPr>
+          <w:rFonts w:ascii="Aptos"/>
+        </w:rPr>
+      </w:pPr>
+      <w:r>
+        <w:fldChar w:fldCharType="begin"/>
+      </w:r>
+      <w:r>
+        <w:instrText xml:space="preserve"> ADDIN ZOTERO_BIBL {"uncited":[],"omitted":[],"custom":[]} CSL_BIBLIOGRAPHY </w:instrText>
+      </w:r>
+      <w:r>
+        <w:fldChar w:fldCharType="separate"/>
+      </w:r>
+      <w:r>
+        <w:rPr>
+          <w:rFonts w:ascii="Aptos"/>
+        </w:rPr>
+        <w:t xml:space="preserve">Ho, D., Imai, K., King, G., &amp; Stuart, E. A. (2011). </w:t>
+      </w:r>
+      <w:proofErr w:type="spellStart"/>
+      <w:r>
+        <w:rPr>
+          <w:rFonts w:ascii="Aptos"/>
+        </w:rPr>
+        <w:t>MatchIt</w:t>
+      </w:r>
+      <w:proofErr w:type="spellEnd"/>
+      <w:r>
+        <w:rPr>
+          <w:rFonts w:ascii="Aptos"/>
+        </w:rPr>
+        <w:t xml:space="preserve">: Nonparametric Preprocessing for Parametric Causal Inference. </w:t>
+      </w:r>
+      <w:r>
+        <w:rPr>
+          <w:rFonts w:ascii="Aptos"/>
+          <w:i/>
+          <w:iCs/>
+        </w:rPr>
+        <w:t>Journal of Statistical Software</w:t>
+      </w:r>
+      <w:r>
+        <w:rPr>
+          <w:rFonts w:ascii="Aptos"/>
+        </w:rPr>
+        <w:t xml:space="preserve">, </w:t>
+      </w:r>
+      <w:r>
+        <w:rPr>
+          <w:rFonts w:ascii="Aptos"/>
+          <w:i/>
+          <w:iCs/>
+        </w:rPr>
+        <w:t>42</w:t>
+      </w:r>
+      <w:r>
+        <w:rPr>
+          <w:rFonts w:ascii="Aptos"/>
+        </w:rPr>
+        <w:t>, 1–28. https://doi.org/10.18637/jss.v042.i08</w:t>
+      </w:r>
+    </w:p>
+    <w:p>
+      <w:pPr>
+        <w:pStyle w:val="Bibliography"/>
+        <w:rPr>
+          <w:rFonts w:ascii="Aptos"/>
+        </w:rPr>
+      </w:pPr>
+      <w:r>
+        <w:rPr>
+          <w:rFonts w:ascii="Aptos"/>
+        </w:rPr>
+        <w:t xml:space="preserve">R Core Team. (2019). </w:t>
+      </w:r>
+      <w:r>
+        <w:rPr>
+          <w:rFonts w:ascii="Aptos"/>
+          <w:i/>
+          <w:iCs/>
+        </w:rPr>
+        <w:t>R: A Language and Environment for Statistical Computing</w:t>
+      </w:r>
+      <w:r>
+        <w:rPr>
+          <w:rFonts w:ascii="Aptos"/>
+        </w:rPr>
+        <w:t>. R Foundation for Statistical Computing. http://www.r-project.org/</w:t>
+      </w:r>
+    </w:p>
+    <w:p>
+      <w:pPr>
+        <w:pStyle w:val="Bibliography"/>
+      </w:pPr>
+      <w:r>
+        <w:fldChar w:fldCharType="end"/>
+      </w:r>
     </w:p>
     <w:p>
       <w:pPr>
         <w:pStyle w:val="Heading1"/>
       </w:pPr>
       <w:r>
+        <w:lastRenderedPageBreak/>
         <w:t>Figure Legends</w:t>
       </w:r>
     </w:p>
@@ -238,6 +584,100 @@
       <w:pPr>
         <w:pStyle w:val="NormalWeb"/>
       </w:pPr>
+      <w:r>
+        <w:rPr>
+          <w:b/>
+          <w:bCs/>
+        </w:rPr>
+        <w:t>Figure 2: Love plot</w:t>
+      </w:r>
+      <w:r>
+        <w:rPr>
+          <w:b/>
+          <w:bCs/>
+        </w:rPr>
+        <w:t>s</w:t>
+      </w:r>
+      <w:r>
+        <w:rPr>
+          <w:b/>
+          <w:bCs/>
+        </w:rPr>
+        <w:t xml:space="preserve"> </w:t>
+      </w:r>
+      <w:r>
+        <w:rPr>
+          <w:b/>
+          <w:bCs/>
+        </w:rPr>
+        <w:t>showing</w:t>
+      </w:r>
+      <w:r>
+        <w:rPr>
+          <w:b/>
+          <w:bCs/>
+        </w:rPr>
+        <w:t xml:space="preserve"> </w:t>
+      </w:r>
+      <w:r>
+        <w:rPr>
+          <w:b/>
+          <w:bCs/>
+        </w:rPr>
+        <w:t>covariate balance</w:t>
+      </w:r>
+      <w:r>
+        <w:rPr>
+          <w:b/>
+          <w:bCs/>
+        </w:rPr>
+        <w:t xml:space="preserve"> each outcome.</w:t>
+      </w:r>
+      <w:r>
+        <w:t xml:space="preserve">  Plots describe the </w:t>
+      </w:r>
+      <w:r>
+        <w:t>standardized mean difference</w:t>
+      </w:r>
+      <w:r>
+        <w:t xml:space="preserve"> for each variable prior to- and after propensity mapping.  </w:t>
+      </w:r>
+      <w:r>
+        <w:t xml:space="preserve">Dashed line indicates the </w:t>
+      </w:r>
+      <w:r>
+        <w:t>standardized mean cutoff</w:t>
+      </w:r>
+      <w:r>
+        <w:t xml:space="preserve"> of </w:t>
+      </w:r>
+      <w:r>
+        <w:t xml:space="preserve">0.1.  </w:t>
+      </w:r>
+      <w:r>
+        <w:t xml:space="preserve">Note </w:t>
+      </w:r>
+      <w:r>
+        <w:t xml:space="preserve">that </w:t>
+      </w:r>
+      <w:r>
+        <w:t>age, ethnicity and gender were all exactly matched.</w:t>
+      </w:r>
+    </w:p>
+    <w:p>
+      <w:pPr>
+        <w:pStyle w:val="NormalWeb"/>
+      </w:pPr>
+      <w:r>
+        <w:rPr>
+          <w:b/>
+          <w:bCs/>
+        </w:rPr>
+        <w:t>Supplementary Table S1:</w:t>
+      </w:r>
+      <w:r>
+        <w:t xml:space="preserve"> Matching diagnostics for age.  Averages, standard deviations and standardized mean difference for age are shown for each outcome before and after propensity matching.  Matching was exact for race and ethnicity.</w:t>
+      </w:r>
     </w:p>
     <w:p>
       <w:pPr>
@@ -1665,6 +2105,7 @@
           <w:szCs w:val="18"/>
           <w14:ligatures w14:val="none"/>
         </w:rPr>
+        <w:lastRenderedPageBreak/>
         <w:t>-</w:t>
       </w:r>
       <w:r>
@@ -1905,7 +2346,6 @@
           <w:szCs w:val="18"/>
           <w14:ligatures w14:val="none"/>
         </w:rPr>
-        <w:lastRenderedPageBreak/>
         <w:t>-</w:t>
       </w:r>
       <w:r>
@@ -3615,7 +4055,6 @@
   <w:style w:type="character" w:default="1" w:styleId="DefaultParagraphFont">
     <w:name w:val="Default Paragraph Font"/>
     <w:uiPriority w:val="1"/>
-    <w:semiHidden/>
     <w:unhideWhenUsed/>
   </w:style>
   <w:style w:type="table" w:default="1" w:styleId="TableNormal">
@@ -4023,6 +4462,18 @@
       <w:szCs w:val="20"/>
     </w:rPr>
   </w:style>
+  <w:style w:type="paragraph" w:styleId="Bibliography">
+    <w:name w:val="Bibliography"/>
+    <w:basedOn w:val="Normal"/>
+    <w:next w:val="Normal"/>
+    <w:uiPriority w:val="37"/>
+    <w:unhideWhenUsed/>
+    <w:rsid w:val="00AB7571"/>
+    <w:pPr>
+      <w:spacing w:after="0" w:line="480" w:lineRule="auto"/>
+      <w:ind w:left="720" w:hanging="720"/>
+    </w:pPr>
+  </w:style>
 </w:styles>
 </file>
 

</xml_diff>

<commit_message>
Added demographic analysis of the entire sample, and updated the manuscript.
</commit_message>
<xml_diff>
--- a/manuscript/Cushings-Obesity/manuscript.docx
+++ b/manuscript/Cushings-Obesity/manuscript.docx
@@ -194,7 +194,28 @@
         <w:t>propensity score</w:t>
       </w:r>
       <w:r>
-        <w:t xml:space="preserve"> model and exact matching on gender and race/ethnicity. This procedure was repeated separately for each outcome </w:t>
+        <w:t xml:space="preserve"> model and exact matching on gender and race/ethnicity</w:t>
+      </w:r>
+      <w:r>
+        <w:t xml:space="preserve"> from a pool of </w:t>
+      </w:r>
+      <w:r>
+        <w:t>70</w:t>
+      </w:r>
+      <w:r>
+        <w:t>,</w:t>
+      </w:r>
+      <w:r>
+        <w:t>327</w:t>
+      </w:r>
+      <w:r>
+        <w:t xml:space="preserve"> </w:t>
+      </w:r>
+      <w:r>
+        <w:t>Michigan Medicine patients</w:t>
+      </w:r>
+      <w:r>
+        <w:t xml:space="preserve">. This procedure was repeated separately for each outcome </w:t>
       </w:r>
       <w:r>
         <w:t xml:space="preserve">as our </w:t>
@@ -347,8 +368,47 @@
           <w:b w:val="0"/>
           <w:bCs w:val="0"/>
         </w:rPr>
-        <w:lastRenderedPageBreak/>
-        <w:t>Baseline characteristics by obesity/Cushing’s status</w:t>
+        <w:t>Baseline characteristics</w:t>
+      </w:r>
+      <w:r>
+        <w:rPr>
+          <w:rStyle w:val="Strong"/>
+          <w:b w:val="0"/>
+          <w:bCs w:val="0"/>
+        </w:rPr>
+        <w:t xml:space="preserve"> </w:t>
+      </w:r>
+      <w:r>
+        <w:rPr>
+          <w:rStyle w:val="Strong"/>
+          <w:b w:val="0"/>
+          <w:bCs w:val="0"/>
+        </w:rPr>
+        <w:t xml:space="preserve">associated with </w:t>
+      </w:r>
+      <w:r>
+        <w:rPr>
+          <w:rStyle w:val="Strong"/>
+          <w:b w:val="0"/>
+          <w:bCs w:val="0"/>
+        </w:rPr>
+        <w:t xml:space="preserve">Cushing’s </w:t>
+      </w:r>
+      <w:r>
+        <w:rPr>
+          <w:rStyle w:val="Strong"/>
+          <w:b w:val="0"/>
+          <w:bCs w:val="0"/>
+        </w:rPr>
+        <w:t xml:space="preserve">disease and obesity </w:t>
+      </w:r>
+      <w:r>
+        <w:rPr>
+          <w:rStyle w:val="Strong"/>
+          <w:b w:val="0"/>
+          <w:bCs w:val="0"/>
+        </w:rPr>
+        <w:t>status</w:t>
       </w:r>
     </w:p>
     <w:p>
@@ -359,7 +419,111 @@
         <w:t>appropriate controls</w:t>
       </w:r>
       <w:r>
-        <w:t>, starting from those with generating exact matches for gender, race and ethnicity.  We then algorithmically matched for age, generating 10 controls for each case.  Matching was very strong with a SMD for age of &lt;0.05 for each outcome (see Figure 2 and Supplementary Table S1).</w:t>
+        <w:t xml:space="preserve">, starting from those with generating exact matches for gender, race and ethnicity.  We then algorithmically matched for age, generating 10 controls for each case.  Matching was </w:t>
+      </w:r>
+      <w:proofErr w:type="gramStart"/>
+      <w:r>
+        <w:t xml:space="preserve">effective </w:t>
+      </w:r>
+      <w:r>
+        <w:t xml:space="preserve"> with</w:t>
+      </w:r>
+      <w:proofErr w:type="gramEnd"/>
+      <w:r>
+        <w:t xml:space="preserve"> a </w:t>
+      </w:r>
+      <w:r>
+        <w:t>standardized mean difference</w:t>
+      </w:r>
+      <w:r>
+        <w:t xml:space="preserve"> for age of &lt;0.05 for each outcome (see </w:t>
+      </w:r>
+      <w:r>
+        <w:t xml:space="preserve">Table 1, </w:t>
+      </w:r>
+      <w:r>
+        <w:t>Figure 2 and Supplementary Table S1).</w:t>
+      </w:r>
+    </w:p>
+    <w:p>
+      <w:r>
+        <w:t xml:space="preserve">Primary descriptive characteristics are </w:t>
+      </w:r>
+      <w:r>
+        <w:t>provided</w:t>
+      </w:r>
+      <w:r>
+        <w:t xml:space="preserve"> for all participants with any available laboratory measurement</w:t>
+      </w:r>
+      <w:r>
+        <w:t xml:space="preserve"> </w:t>
+      </w:r>
+      <w:r>
+        <w:t>(Table 1)</w:t>
+      </w:r>
+      <w:r>
+        <w:t xml:space="preserve">. </w:t>
+      </w:r>
+      <w:r>
+        <w:t>O</w:t>
+      </w:r>
+      <w:r>
+        <w:t>utcome-specific matched sets are described in Supplementary Tables S</w:t>
+      </w:r>
+      <w:r>
+        <w:t>2</w:t>
+      </w:r>
+      <w:r>
+        <w:t>A-E</w:t>
+      </w:r>
+      <w:r>
+        <w:t>.</w:t>
+      </w:r>
+      <w:r>
+        <w:t xml:space="preserve">   Here we reproduce several notable characteristics, including a higher prevalence of Cushing’s disease in females </w:t>
+      </w:r>
+      <w:commentRangeStart w:id="1"/>
+      <w:r>
+        <w:t xml:space="preserve">(284 vs 72) </w:t>
+      </w:r>
+      <w:commentRangeEnd w:id="1"/>
+      <w:r>
+        <w:rPr>
+          <w:rStyle w:val="CommentReference"/>
+        </w:rPr>
+        <w:commentReference w:id="1"/>
+      </w:r>
+      <w:r>
+        <w:t>and a higher body mass index for patients with Cushing’s disease (both p&lt;0.001).</w:t>
+      </w:r>
+    </w:p>
+    <w:p>
+      <w:r>
+        <w:t xml:space="preserve">We next further stratified our participants </w:t>
+      </w:r>
+      <w:r>
+        <w:t>with a BMI above or below 30 kg/m</w:t>
+      </w:r>
+      <w:r>
+        <w:rPr>
+          <w:vertAlign w:val="superscript"/>
+        </w:rPr>
+        <w:t>2</w:t>
+      </w:r>
+      <w:r>
+        <w:t xml:space="preserve">, </w:t>
+      </w:r>
+      <w:r>
+        <w:t>within</w:t>
+      </w:r>
+      <w:r>
+        <w:t xml:space="preserve"> both cases and controls</w:t>
+      </w:r>
+      <w:r>
+        <w:t xml:space="preserve"> (Table 2)</w:t>
+      </w:r>
+      <w:r>
+        <w:t>.</w:t>
       </w:r>
     </w:p>
     <w:p/>
@@ -467,6 +631,7 @@
         <w:pStyle w:val="Heading1"/>
       </w:pPr>
       <w:r>
+        <w:lastRenderedPageBreak/>
         <w:t>References</w:t>
       </w:r>
     </w:p>
@@ -576,7 +741,6 @@
         <w:pStyle w:val="Heading1"/>
       </w:pPr>
       <w:r>
-        <w:lastRenderedPageBreak/>
         <w:t>Figure Legends</w:t>
       </w:r>
     </w:p>
@@ -2105,7 +2269,6 @@
           <w:szCs w:val="18"/>
           <w14:ligatures w14:val="none"/>
         </w:rPr>
-        <w:lastRenderedPageBreak/>
         <w:t>-</w:t>
       </w:r>
       <w:r>
@@ -2659,24 +2822,44 @@
       </w:r>
     </w:p>
   </w:comment>
+  <w:comment w:id="1" w:author="Dave Bridges" w:date="2025-09-05T18:06:00Z" w:initials="DB">
+    <w:p>
+      <w:r>
+        <w:rPr>
+          <w:rStyle w:val="CommentReference"/>
+        </w:rPr>
+        <w:annotationRef/>
+      </w:r>
+      <w:r>
+        <w:rPr>
+          <w:sz w:val="20"/>
+          <w:szCs w:val="20"/>
+        </w:rPr>
+        <w:t>@trey are there other papers that describe this?</w:t>
+      </w:r>
+    </w:p>
+  </w:comment>
 </w:comments>
 </file>
 
 <file path=word/commentsExtended.xml><?xml version="1.0" encoding="utf-8"?>
 <w15:commentsEx xmlns:wpc="http://schemas.microsoft.com/office/word/2010/wordprocessingCanvas" xmlns:cx="http://schemas.microsoft.com/office/drawing/2014/chartex" xmlns:cx1="http://schemas.microsoft.com/office/drawing/2015/9/8/chartex" xmlns:cx2="http://schemas.microsoft.com/office/drawing/2015/10/21/chartex" xmlns:cx3="http://schemas.microsoft.com/office/drawing/2016/5/9/chartex" xmlns:cx4="http://schemas.microsoft.com/office/drawing/2016/5/10/chartex" xmlns:cx5="http://schemas.microsoft.com/office/drawing/2016/5/11/chartex" xmlns:cx6="http://schemas.microsoft.com/office/drawing/2016/5/12/chartex" xmlns:cx7="http://schemas.microsoft.com/office/drawing/2016/5/13/chartex" xmlns:cx8="http://schemas.microsoft.com/office/drawing/2016/5/14/chartex" xmlns:mc="http://schemas.openxmlformats.org/markup-compatibility/2006" xmlns:aink="http://schemas.microsoft.com/office/drawing/2016/ink" xmlns:am3d="http://schemas.microsoft.com/office/drawing/2017/model3d" xmlns:o="urn:schemas-microsoft-com:office:office" xmlns:oel="http://schemas.microsoft.com/office/2019/extlst" xmlns:r="http://schemas.openxmlformats.org/officeDocument/2006/relationships" xmlns:m="http://schemas.openxmlformats.org/officeDocument/2006/math" xmlns:v="urn:schemas-microsoft-com:vml" xmlns:wp14="http://schemas.microsoft.com/office/word/2010/wordprocessingDrawing" xmlns:wp="http://schemas.openxmlformats.org/drawingml/2006/wordprocessingDrawing" xmlns:w10="urn:schemas-microsoft-com:office:word" xmlns:w="http://schemas.openxmlformats.org/wordprocessingml/2006/main" xmlns:w14="http://schemas.microsoft.com/office/word/2010/wordml" xmlns:w15="http://schemas.microsoft.com/office/word/2012/wordml" xmlns:w16cex="http://schemas.microsoft.com/office/word/2018/wordml/cex" xmlns:w16cid="http://schemas.microsoft.com/office/word/2016/wordml/cid" xmlns:w16="http://schemas.microsoft.com/office/word/2018/wordml" xmlns:w16du="http://schemas.microsoft.com/office/word/2023/wordml/word16du" xmlns:w16sdtdh="http://schemas.microsoft.com/office/word/2020/wordml/sdtdatahash" xmlns:w16sdtfl="http://schemas.microsoft.com/office/word/2024/wordml/sdtformatlock" xmlns:w16se="http://schemas.microsoft.com/office/word/2015/wordml/symex" xmlns:wpg="http://schemas.microsoft.com/office/word/2010/wordprocessingGroup" xmlns:wpi="http://schemas.microsoft.com/office/word/2010/wordprocessingInk" xmlns:wne="http://schemas.microsoft.com/office/word/2006/wordml" xmlns:wps="http://schemas.microsoft.com/office/word/2010/wordprocessingShape" mc:Ignorable="w14 w15 w16se w16cid w16 w16cex w16sdtdh w16sdtfl w16du wp14">
   <w15:commentEx w15:paraId="4DBE4D40" w15:done="0"/>
+  <w15:commentEx w15:paraId="3F27DAC3" w15:done="0"/>
 </w15:commentsEx>
 </file>
 
 <file path=word/commentsExtensible.xml><?xml version="1.0" encoding="utf-8"?>
 <w16cex:commentsExtensible xmlns:wpc="http://schemas.microsoft.com/office/word/2010/wordprocessingCanvas" xmlns:cx="http://schemas.microsoft.com/office/drawing/2014/chartex" xmlns:cx1="http://schemas.microsoft.com/office/drawing/2015/9/8/chartex" xmlns:cx2="http://schemas.microsoft.com/office/drawing/2015/10/21/chartex" xmlns:cx3="http://schemas.microsoft.com/office/drawing/2016/5/9/chartex" xmlns:cx4="http://schemas.microsoft.com/office/drawing/2016/5/10/chartex" xmlns:cx5="http://schemas.microsoft.com/office/drawing/2016/5/11/chartex" xmlns:cx6="http://schemas.microsoft.com/office/drawing/2016/5/12/chartex" xmlns:cx7="http://schemas.microsoft.com/office/drawing/2016/5/13/chartex" xmlns:cx8="http://schemas.microsoft.com/office/drawing/2016/5/14/chartex" xmlns:cr="http://schemas.microsoft.com/office/comments/2020/reactions" xmlns:mc="http://schemas.openxmlformats.org/markup-compatibility/2006" xmlns:aink="http://schemas.microsoft.com/office/drawing/2016/ink" xmlns:am3d="http://schemas.microsoft.com/office/drawing/2017/model3d" xmlns:o="urn:schemas-microsoft-com:office:office" xmlns:oel="http://schemas.microsoft.com/office/2019/extlst" xmlns:r="http://schemas.openxmlformats.org/officeDocument/2006/relationships" xmlns:m="http://schemas.openxmlformats.org/officeDocument/2006/math" xmlns:v="urn:schemas-microsoft-com:vml" xmlns:wp14="http://schemas.microsoft.com/office/word/2010/wordprocessingDrawing" xmlns:wp="http://schemas.openxmlformats.org/drawingml/2006/wordprocessingDrawing" xmlns:w10="urn:schemas-microsoft-com:office:word" xmlns:w="http://schemas.openxmlformats.org/wordprocessingml/2006/main" xmlns:w14="http://schemas.microsoft.com/office/word/2010/wordml" xmlns:w15="http://schemas.microsoft.com/office/word/2012/wordml" xmlns:w16cex="http://schemas.microsoft.com/office/word/2018/wordml/cex" xmlns:w16cid="http://schemas.microsoft.com/office/word/2016/wordml/cid" xmlns:w16="http://schemas.microsoft.com/office/word/2018/wordml" xmlns:w16du="http://schemas.microsoft.com/office/word/2023/wordml/word16du" xmlns:w16sdtdh="http://schemas.microsoft.com/office/word/2020/wordml/sdtdatahash" xmlns:w16sdtfl="http://schemas.microsoft.com/office/word/2024/wordml/sdtformatlock" xmlns:w16se="http://schemas.microsoft.com/office/word/2015/wordml/symex" xmlns:wpg="http://schemas.microsoft.com/office/word/2010/wordprocessingGroup" xmlns:wpi="http://schemas.microsoft.com/office/word/2010/wordprocessingInk" xmlns:wne="http://schemas.microsoft.com/office/word/2006/wordml" xmlns:wps="http://schemas.microsoft.com/office/word/2010/wordprocessingShape" mc:Ignorable="w14 w15 w16se w16cid w16 w16cex w16sdtdh w16sdtfl cr w16du wp14">
   <w16cex:commentExtensible w16cex:durableId="68EF662C" w16cex:dateUtc="2025-09-05T15:11:00Z"/>
+  <w16cex:commentExtensible w16cex:durableId="10479658" w16cex:dateUtc="2025-09-05T22:06:00Z"/>
 </w16cex:commentsExtensible>
 </file>
 
 <file path=word/commentsIds.xml><?xml version="1.0" encoding="utf-8"?>
 <w16cid:commentsIds xmlns:wpc="http://schemas.microsoft.com/office/word/2010/wordprocessingCanvas" xmlns:cx="http://schemas.microsoft.com/office/drawing/2014/chartex" xmlns:cx1="http://schemas.microsoft.com/office/drawing/2015/9/8/chartex" xmlns:cx2="http://schemas.microsoft.com/office/drawing/2015/10/21/chartex" xmlns:cx3="http://schemas.microsoft.com/office/drawing/2016/5/9/chartex" xmlns:cx4="http://schemas.microsoft.com/office/drawing/2016/5/10/chartex" xmlns:cx5="http://schemas.microsoft.com/office/drawing/2016/5/11/chartex" xmlns:cx6="http://schemas.microsoft.com/office/drawing/2016/5/12/chartex" xmlns:cx7="http://schemas.microsoft.com/office/drawing/2016/5/13/chartex" xmlns:cx8="http://schemas.microsoft.com/office/drawing/2016/5/14/chartex" xmlns:mc="http://schemas.openxmlformats.org/markup-compatibility/2006" xmlns:aink="http://schemas.microsoft.com/office/drawing/2016/ink" xmlns:am3d="http://schemas.microsoft.com/office/drawing/2017/model3d" xmlns:o="urn:schemas-microsoft-com:office:office" xmlns:oel="http://schemas.microsoft.com/office/2019/extlst" xmlns:r="http://schemas.openxmlformats.org/officeDocument/2006/relationships" xmlns:m="http://schemas.openxmlformats.org/officeDocument/2006/math" xmlns:v="urn:schemas-microsoft-com:vml" xmlns:wp14="http://schemas.microsoft.com/office/word/2010/wordprocessingDrawing" xmlns:wp="http://schemas.openxmlformats.org/drawingml/2006/wordprocessingDrawing" xmlns:w10="urn:schemas-microsoft-com:office:word" xmlns:w="http://schemas.openxmlformats.org/wordprocessingml/2006/main" xmlns:w14="http://schemas.microsoft.com/office/word/2010/wordml" xmlns:w15="http://schemas.microsoft.com/office/word/2012/wordml" xmlns:w16cex="http://schemas.microsoft.com/office/word/2018/wordml/cex" xmlns:w16cid="http://schemas.microsoft.com/office/word/2016/wordml/cid" xmlns:w16="http://schemas.microsoft.com/office/word/2018/wordml" xmlns:w16du="http://schemas.microsoft.com/office/word/2023/wordml/word16du" xmlns:w16sdtdh="http://schemas.microsoft.com/office/word/2020/wordml/sdtdatahash" xmlns:w16sdtfl="http://schemas.microsoft.com/office/word/2024/wordml/sdtformatlock" xmlns:w16se="http://schemas.microsoft.com/office/word/2015/wordml/symex" xmlns:wpg="http://schemas.microsoft.com/office/word/2010/wordprocessingGroup" xmlns:wpi="http://schemas.microsoft.com/office/word/2010/wordprocessingInk" xmlns:wne="http://schemas.microsoft.com/office/word/2006/wordml" xmlns:wps="http://schemas.microsoft.com/office/word/2010/wordprocessingShape" mc:Ignorable="w14 w15 w16se w16cid w16 w16cex w16sdtdh w16sdtfl w16du wp14">
   <w16cid:commentId w16cid:paraId="4DBE4D40" w16cid:durableId="68EF662C"/>
+  <w16cid:commentId w16cid:paraId="3F27DAC3" w16cid:durableId="10479658"/>
 </w16cid:commentsIds>
 </file>
 

</xml_diff>

<commit_message>
Generated particpant descriptions for each outcome, copied in as supplementary tables
</commit_message>
<xml_diff>
--- a/manuscript/Cushings-Obesity/manuscript.docx
+++ b/manuscript/Cushings-Obesity/manuscript.docx
@@ -368,7 +368,7 @@
           <w:b w:val="0"/>
           <w:bCs w:val="0"/>
         </w:rPr>
-        <w:t>Baseline characteristics</w:t>
+        <w:t>Participant characteristics</w:t>
       </w:r>
       <w:r>
         <w:rPr>
@@ -400,15 +400,7 @@
           <w:b w:val="0"/>
           <w:bCs w:val="0"/>
         </w:rPr>
-        <w:t xml:space="preserve">disease and obesity </w:t>
-      </w:r>
-      <w:r>
-        <w:rPr>
-          <w:rStyle w:val="Strong"/>
-          <w:b w:val="0"/>
-          <w:bCs w:val="0"/>
-        </w:rPr>
-        <w:t>status</w:t>
+        <w:t xml:space="preserve">disease </w:t>
       </w:r>
     </w:p>
     <w:p>
@@ -442,7 +434,16 @@
         <w:t xml:space="preserve">Table 1, </w:t>
       </w:r>
       <w:r>
-        <w:t>Figure 2 and Supplementary Table S1).</w:t>
+        <w:t xml:space="preserve">Supplementary </w:t>
+      </w:r>
+      <w:r>
+        <w:t xml:space="preserve">Figure </w:t>
+      </w:r>
+      <w:r>
+        <w:t>1</w:t>
+      </w:r>
+      <w:r>
+        <w:t xml:space="preserve"> and Supplementary Table S1).</w:t>
       </w:r>
     </w:p>
     <w:p>
@@ -496,10 +497,48 @@
       <w:r>
         <w:t>and a higher body mass index for patients with Cushing’s disease (both p&lt;0.001).</w:t>
       </w:r>
-    </w:p>
-    <w:p>
-      <w:r>
-        <w:t xml:space="preserve">We next further stratified our participants </w:t>
+      <w:r>
+        <w:t xml:space="preserve">  </w:t>
+      </w:r>
+      <w:commentRangeStart w:id="2"/>
+      <w:r>
+        <w:t>Prior to matching for Race and Ethnicity, we noted that participants</w:t>
+      </w:r>
+      <w:r>
+        <w:t xml:space="preserve"> with Cushing’s disease were more likely to </w:t>
+      </w:r>
+      <w:r>
+        <w:t>identify as Non-Hispanic White (87%) than the overall Michigan Medicine participant population (75% Non-Hispanic White).</w:t>
+      </w:r>
+      <w:r>
+        <w:t xml:space="preserve">  Correspondingly participants with Cushing’s disease were less likely to identify as Asian or Black</w:t>
+      </w:r>
+      <w:commentRangeEnd w:id="2"/>
+      <w:r>
+        <w:rPr>
+          <w:rStyle w:val="CommentReference"/>
+        </w:rPr>
+        <w:commentReference w:id="2"/>
+      </w:r>
+      <w:r>
+        <w:t>.</w:t>
+      </w:r>
+    </w:p>
+    <w:p/>
+    <w:p>
+      <w:pPr>
+        <w:pStyle w:val="Heading2"/>
+      </w:pPr>
+      <w:r>
+        <w:t>Stratification by obesity and Cushing’s disease status</w:t>
+      </w:r>
+    </w:p>
+    <w:p>
+      <w:r>
+        <w:t>To understand the relationship between obesity and Cushing’s disease, we</w:t>
+      </w:r>
+      <w:r>
+        <w:t xml:space="preserve"> next stratified our participants </w:t>
       </w:r>
       <w:r>
         <w:t>with a BMI above or below 30 kg/m</w:t>
@@ -514,29 +553,22 @@
         <w:t xml:space="preserve">, </w:t>
       </w:r>
       <w:r>
-        <w:t>within</w:t>
+        <w:t>across</w:t>
       </w:r>
       <w:r>
         <w:t xml:space="preserve"> both cases and controls</w:t>
       </w:r>
       <w:r>
-        <w:t xml:space="preserve"> (Table 2)</w:t>
+        <w:t xml:space="preserve"> (</w:t>
+      </w:r>
+      <w:r>
+        <w:t xml:space="preserve">see </w:t>
+      </w:r>
+      <w:r>
+        <w:t>Table 2)</w:t>
       </w:r>
       <w:r>
         <w:t>.</w:t>
-      </w:r>
-    </w:p>
-    <w:p/>
-    <w:p>
-      <w:pPr>
-        <w:pStyle w:val="NormalWeb"/>
-        <w:numPr>
-          <w:ilvl w:val="0"/>
-          <w:numId w:val="2"/>
-        </w:numPr>
-      </w:pPr>
-      <w:r>
-        <w:t>Refer to Table 2 and Figure 2 (balance).</w:t>
       </w:r>
     </w:p>
     <w:p>
@@ -741,106 +773,244 @@
         <w:pStyle w:val="Heading1"/>
       </w:pPr>
       <w:r>
-        <w:t>Figure Legends</w:t>
+        <w:t xml:space="preserve">Figure </w:t>
+      </w:r>
+      <w:r>
+        <w:t xml:space="preserve">and Table </w:t>
+      </w:r>
+      <w:r>
+        <w:t>Legends</w:t>
       </w:r>
     </w:p>
     <w:p>
       <w:pPr>
         <w:pStyle w:val="NormalWeb"/>
-      </w:pPr>
-      <w:r>
         <w:rPr>
           <w:b/>
           <w:bCs/>
         </w:rPr>
-        <w:t>Figure 2: Love plot</w:t>
-      </w:r>
+      </w:pPr>
       <w:r>
         <w:rPr>
           <w:b/>
           <w:bCs/>
         </w:rPr>
-        <w:t>s</w:t>
-      </w:r>
+        <w:t>Figure 1: CONSORT Diagram of participant inclusion.</w:t>
+      </w:r>
+    </w:p>
+    <w:p>
+      <w:pPr>
+        <w:pStyle w:val="NormalWeb"/>
+      </w:pPr>
       <w:r>
         <w:rPr>
           <w:b/>
           <w:bCs/>
         </w:rPr>
-        <w:t xml:space="preserve"> </w:t>
+        <w:t>Table 1: Participant characteristics</w:t>
       </w:r>
       <w:r>
         <w:rPr>
           <w:b/>
           <w:bCs/>
         </w:rPr>
-        <w:t>showing</w:t>
+        <w:t xml:space="preserve"> after </w:t>
       </w:r>
       <w:r>
         <w:rPr>
           <w:b/>
           <w:bCs/>
         </w:rPr>
-        <w:t xml:space="preserve"> </w:t>
+        <w:t xml:space="preserve">covariate </w:t>
       </w:r>
       <w:r>
         <w:rPr>
           <w:b/>
           <w:bCs/>
         </w:rPr>
-        <w:t>covariate balance</w:t>
-      </w:r>
+        <w:t>matching.</w:t>
+      </w:r>
+      <w:r>
+        <w:t xml:space="preserve">  Participants were matched for age, gender and race/ethnicity but not BMI.  This table represents the matched set for </w:t>
+      </w:r>
+      <w:r>
+        <w:t xml:space="preserve">patients with </w:t>
+      </w:r>
+      <w:r>
+        <w:t xml:space="preserve">Cushing’s </w:t>
+      </w:r>
+      <w:r>
+        <w:t>disease</w:t>
+      </w:r>
+      <w:r>
+        <w:t xml:space="preserve"> with any laboratory value we considered.  Supplementary Tables S2A-E describe outcome-specific matched </w:t>
+      </w:r>
+      <w:r>
+        <w:t>characteristics</w:t>
+      </w:r>
+      <w:r>
+        <w:t>.</w:t>
+      </w:r>
+    </w:p>
+    <w:p>
+      <w:pPr>
+        <w:pStyle w:val="NormalWeb"/>
+      </w:pPr>
       <w:r>
         <w:rPr>
           <w:b/>
           <w:bCs/>
         </w:rPr>
-        <w:t xml:space="preserve"> each outcome.</w:t>
-      </w:r>
-      <w:r>
-        <w:t xml:space="preserve">  Plots describe the </w:t>
-      </w:r>
-      <w:r>
-        <w:t>standardized mean difference</w:t>
-      </w:r>
-      <w:r>
-        <w:t xml:space="preserve"> for each variable prior to- and after propensity mapping.  </w:t>
-      </w:r>
-      <w:r>
-        <w:t xml:space="preserve">Dashed line indicates the </w:t>
-      </w:r>
-      <w:r>
-        <w:t>standardized mean cutoff</w:t>
-      </w:r>
-      <w:r>
-        <w:t xml:space="preserve"> of </w:t>
-      </w:r>
-      <w:r>
-        <w:t xml:space="preserve">0.1.  </w:t>
-      </w:r>
-      <w:r>
-        <w:t xml:space="preserve">Note </w:t>
-      </w:r>
-      <w:r>
-        <w:t xml:space="preserve">that </w:t>
-      </w:r>
-      <w:r>
-        <w:t>age, ethnicity and gender were all exactly matched.</w:t>
-      </w:r>
-    </w:p>
-    <w:p>
-      <w:pPr>
-        <w:pStyle w:val="NormalWeb"/>
-      </w:pPr>
+        <w:t>Supplementary Figure</w:t>
+      </w:r>
       <w:r>
         <w:rPr>
           <w:b/>
           <w:bCs/>
         </w:rPr>
-        <w:t>Supplementary Table S1:</w:t>
-      </w:r>
-      <w:r>
-        <w:t xml:space="preserve"> Matching diagnostics for age.  Averages, standard deviations and standardized mean difference for age are shown for each outcome before and after propensity matching.  Matching was exact for race and ethnicity.</w:t>
+        <w:t xml:space="preserve"> </w:t>
+      </w:r>
+      <w:r>
+        <w:rPr>
+          <w:b/>
+          <w:bCs/>
+        </w:rPr>
+        <w:t>1</w:t>
+      </w:r>
+      <w:r>
+        <w:rPr>
+          <w:b/>
+          <w:bCs/>
+        </w:rPr>
+        <w:t>: Love plot</w:t>
+      </w:r>
+      <w:r>
+        <w:rPr>
+          <w:b/>
+          <w:bCs/>
+        </w:rPr>
+        <w:t>s</w:t>
+      </w:r>
+      <w:r>
+        <w:rPr>
+          <w:b/>
+          <w:bCs/>
+        </w:rPr>
+        <w:t xml:space="preserve"> </w:t>
+      </w:r>
+      <w:r>
+        <w:rPr>
+          <w:b/>
+          <w:bCs/>
+        </w:rPr>
+        <w:t>showing</w:t>
+      </w:r>
+      <w:r>
+        <w:rPr>
+          <w:b/>
+          <w:bCs/>
+        </w:rPr>
+        <w:t xml:space="preserve"> </w:t>
+      </w:r>
+      <w:r>
+        <w:rPr>
+          <w:b/>
+          <w:bCs/>
+        </w:rPr>
+        <w:t>covariate balance</w:t>
+      </w:r>
+      <w:r>
+        <w:rPr>
+          <w:b/>
+          <w:bCs/>
+        </w:rPr>
+        <w:t xml:space="preserve"> each outcome.</w:t>
+      </w:r>
+      <w:r>
+        <w:t xml:space="preserve">  Plots describe the </w:t>
+      </w:r>
+      <w:r>
+        <w:t>standardized mean difference</w:t>
+      </w:r>
+      <w:r>
+        <w:t xml:space="preserve"> for each variable prior to- and after propensity mapping.  </w:t>
+      </w:r>
+      <w:r>
+        <w:t xml:space="preserve">Dashed line indicates the </w:t>
+      </w:r>
+      <w:r>
+        <w:t xml:space="preserve">standardized mean </w:t>
+      </w:r>
+      <w:r>
+        <w:t xml:space="preserve">difference </w:t>
+      </w:r>
+      <w:r>
+        <w:t>cutoff</w:t>
+      </w:r>
+      <w:r>
+        <w:t xml:space="preserve"> of </w:t>
+      </w:r>
+      <w:r>
+        <w:t xml:space="preserve">0.1.  </w:t>
+      </w:r>
+      <w:r>
+        <w:t xml:space="preserve">Note </w:t>
+      </w:r>
+      <w:r>
+        <w:t xml:space="preserve">that </w:t>
+      </w:r>
+      <w:r>
+        <w:t xml:space="preserve">age, </w:t>
+      </w:r>
+      <w:r>
+        <w:t>race/</w:t>
+      </w:r>
+      <w:r>
+        <w:t>ethnicity and gender were all exactly matched.</w:t>
+      </w:r>
+    </w:p>
+    <w:p>
+      <w:pPr>
+        <w:pStyle w:val="NormalWeb"/>
+      </w:pPr>
+      <w:r>
+        <w:rPr>
+          <w:b/>
+          <w:bCs/>
+        </w:rPr>
+        <w:t xml:space="preserve">Supplementary Table S1: </w:t>
+      </w:r>
+      <w:r>
+        <w:rPr>
+          <w:b/>
+          <w:bCs/>
+        </w:rPr>
+        <w:t>Covariate m</w:t>
+      </w:r>
+      <w:r>
+        <w:rPr>
+          <w:b/>
+          <w:bCs/>
+        </w:rPr>
+        <w:t>atching diagnostics for age.</w:t>
+      </w:r>
+      <w:r>
+        <w:t xml:space="preserve">  Averages, standard deviations and standardized mean difference for age are shown for each outcome before and after propensity matching.  Matching was exact for race and ethnicity.</w:t>
+      </w:r>
+    </w:p>
+    <w:p>
+      <w:pPr>
+        <w:pStyle w:val="NormalWeb"/>
+      </w:pPr>
+      <w:r>
+        <w:rPr>
+          <w:b/>
+          <w:bCs/>
+        </w:rPr>
+        <w:t>Supplementary Tables S2A-E: Outcome-specific participant characteristics after matching</w:t>
+      </w:r>
+      <w:r>
+        <w:t>. A) Glucose, B) HbA1c, C) ALT, D) Blood Pressure and E) LDL-C</w:t>
       </w:r>
     </w:p>
     <w:p>
@@ -1298,6 +1468,7 @@
           <w:szCs w:val="18"/>
           <w14:ligatures w14:val="none"/>
         </w:rPr>
+        <w:lastRenderedPageBreak/>
         <w:t xml:space="preserve">   </w:t>
       </w:r>
       <w:r>
@@ -2839,6 +3010,23 @@
       </w:r>
     </w:p>
   </w:comment>
+  <w:comment w:id="2" w:author="Dave Bridges" w:date="2025-09-05T19:38:00Z" w:initials="DB">
+    <w:p>
+      <w:r>
+        <w:rPr>
+          <w:rStyle w:val="CommentReference"/>
+        </w:rPr>
+        <w:annotationRef/>
+      </w:r>
+      <w:r>
+        <w:rPr>
+          <w:sz w:val="20"/>
+          <w:szCs w:val="20"/>
+        </w:rPr>
+        <w:t>@trey also any data on demographic propensities towards Cushings we can cite?</w:t>
+      </w:r>
+    </w:p>
+  </w:comment>
 </w:comments>
 </file>
 
@@ -2846,6 +3034,7 @@
 <w15:commentsEx xmlns:wpc="http://schemas.microsoft.com/office/word/2010/wordprocessingCanvas" xmlns:cx="http://schemas.microsoft.com/office/drawing/2014/chartex" xmlns:cx1="http://schemas.microsoft.com/office/drawing/2015/9/8/chartex" xmlns:cx2="http://schemas.microsoft.com/office/drawing/2015/10/21/chartex" xmlns:cx3="http://schemas.microsoft.com/office/drawing/2016/5/9/chartex" xmlns:cx4="http://schemas.microsoft.com/office/drawing/2016/5/10/chartex" xmlns:cx5="http://schemas.microsoft.com/office/drawing/2016/5/11/chartex" xmlns:cx6="http://schemas.microsoft.com/office/drawing/2016/5/12/chartex" xmlns:cx7="http://schemas.microsoft.com/office/drawing/2016/5/13/chartex" xmlns:cx8="http://schemas.microsoft.com/office/drawing/2016/5/14/chartex" xmlns:mc="http://schemas.openxmlformats.org/markup-compatibility/2006" xmlns:aink="http://schemas.microsoft.com/office/drawing/2016/ink" xmlns:am3d="http://schemas.microsoft.com/office/drawing/2017/model3d" xmlns:o="urn:schemas-microsoft-com:office:office" xmlns:oel="http://schemas.microsoft.com/office/2019/extlst" xmlns:r="http://schemas.openxmlformats.org/officeDocument/2006/relationships" xmlns:m="http://schemas.openxmlformats.org/officeDocument/2006/math" xmlns:v="urn:schemas-microsoft-com:vml" xmlns:wp14="http://schemas.microsoft.com/office/word/2010/wordprocessingDrawing" xmlns:wp="http://schemas.openxmlformats.org/drawingml/2006/wordprocessingDrawing" xmlns:w10="urn:schemas-microsoft-com:office:word" xmlns:w="http://schemas.openxmlformats.org/wordprocessingml/2006/main" xmlns:w14="http://schemas.microsoft.com/office/word/2010/wordml" xmlns:w15="http://schemas.microsoft.com/office/word/2012/wordml" xmlns:w16cex="http://schemas.microsoft.com/office/word/2018/wordml/cex" xmlns:w16cid="http://schemas.microsoft.com/office/word/2016/wordml/cid" xmlns:w16="http://schemas.microsoft.com/office/word/2018/wordml" xmlns:w16du="http://schemas.microsoft.com/office/word/2023/wordml/word16du" xmlns:w16sdtdh="http://schemas.microsoft.com/office/word/2020/wordml/sdtdatahash" xmlns:w16sdtfl="http://schemas.microsoft.com/office/word/2024/wordml/sdtformatlock" xmlns:w16se="http://schemas.microsoft.com/office/word/2015/wordml/symex" xmlns:wpg="http://schemas.microsoft.com/office/word/2010/wordprocessingGroup" xmlns:wpi="http://schemas.microsoft.com/office/word/2010/wordprocessingInk" xmlns:wne="http://schemas.microsoft.com/office/word/2006/wordml" xmlns:wps="http://schemas.microsoft.com/office/word/2010/wordprocessingShape" mc:Ignorable="w14 w15 w16se w16cid w16 w16cex w16sdtdh w16sdtfl w16du wp14">
   <w15:commentEx w15:paraId="4DBE4D40" w15:done="0"/>
   <w15:commentEx w15:paraId="3F27DAC3" w15:done="0"/>
+  <w15:commentEx w15:paraId="392E4D0B" w15:done="0"/>
 </w15:commentsEx>
 </file>
 
@@ -2853,6 +3042,7 @@
 <w16cex:commentsExtensible xmlns:wpc="http://schemas.microsoft.com/office/word/2010/wordprocessingCanvas" xmlns:cx="http://schemas.microsoft.com/office/drawing/2014/chartex" xmlns:cx1="http://schemas.microsoft.com/office/drawing/2015/9/8/chartex" xmlns:cx2="http://schemas.microsoft.com/office/drawing/2015/10/21/chartex" xmlns:cx3="http://schemas.microsoft.com/office/drawing/2016/5/9/chartex" xmlns:cx4="http://schemas.microsoft.com/office/drawing/2016/5/10/chartex" xmlns:cx5="http://schemas.microsoft.com/office/drawing/2016/5/11/chartex" xmlns:cx6="http://schemas.microsoft.com/office/drawing/2016/5/12/chartex" xmlns:cx7="http://schemas.microsoft.com/office/drawing/2016/5/13/chartex" xmlns:cx8="http://schemas.microsoft.com/office/drawing/2016/5/14/chartex" xmlns:cr="http://schemas.microsoft.com/office/comments/2020/reactions" xmlns:mc="http://schemas.openxmlformats.org/markup-compatibility/2006" xmlns:aink="http://schemas.microsoft.com/office/drawing/2016/ink" xmlns:am3d="http://schemas.microsoft.com/office/drawing/2017/model3d" xmlns:o="urn:schemas-microsoft-com:office:office" xmlns:oel="http://schemas.microsoft.com/office/2019/extlst" xmlns:r="http://schemas.openxmlformats.org/officeDocument/2006/relationships" xmlns:m="http://schemas.openxmlformats.org/officeDocument/2006/math" xmlns:v="urn:schemas-microsoft-com:vml" xmlns:wp14="http://schemas.microsoft.com/office/word/2010/wordprocessingDrawing" xmlns:wp="http://schemas.openxmlformats.org/drawingml/2006/wordprocessingDrawing" xmlns:w10="urn:schemas-microsoft-com:office:word" xmlns:w="http://schemas.openxmlformats.org/wordprocessingml/2006/main" xmlns:w14="http://schemas.microsoft.com/office/word/2010/wordml" xmlns:w15="http://schemas.microsoft.com/office/word/2012/wordml" xmlns:w16cex="http://schemas.microsoft.com/office/word/2018/wordml/cex" xmlns:w16cid="http://schemas.microsoft.com/office/word/2016/wordml/cid" xmlns:w16="http://schemas.microsoft.com/office/word/2018/wordml" xmlns:w16du="http://schemas.microsoft.com/office/word/2023/wordml/word16du" xmlns:w16sdtdh="http://schemas.microsoft.com/office/word/2020/wordml/sdtdatahash" xmlns:w16sdtfl="http://schemas.microsoft.com/office/word/2024/wordml/sdtformatlock" xmlns:w16se="http://schemas.microsoft.com/office/word/2015/wordml/symex" xmlns:wpg="http://schemas.microsoft.com/office/word/2010/wordprocessingGroup" xmlns:wpi="http://schemas.microsoft.com/office/word/2010/wordprocessingInk" xmlns:wne="http://schemas.microsoft.com/office/word/2006/wordml" xmlns:wps="http://schemas.microsoft.com/office/word/2010/wordprocessingShape" mc:Ignorable="w14 w15 w16se w16cid w16 w16cex w16sdtdh w16sdtfl cr w16du wp14">
   <w16cex:commentExtensible w16cex:durableId="68EF662C" w16cex:dateUtc="2025-09-05T15:11:00Z"/>
   <w16cex:commentExtensible w16cex:durableId="10479658" w16cex:dateUtc="2025-09-05T22:06:00Z"/>
+  <w16cex:commentExtensible w16cex:durableId="4FC4BC49" w16cex:dateUtc="2025-09-05T23:38:00Z"/>
 </w16cex:commentsExtensible>
 </file>
 
@@ -2860,6 +3050,7 @@
 <w16cid:commentsIds xmlns:wpc="http://schemas.microsoft.com/office/word/2010/wordprocessingCanvas" xmlns:cx="http://schemas.microsoft.com/office/drawing/2014/chartex" xmlns:cx1="http://schemas.microsoft.com/office/drawing/2015/9/8/chartex" xmlns:cx2="http://schemas.microsoft.com/office/drawing/2015/10/21/chartex" xmlns:cx3="http://schemas.microsoft.com/office/drawing/2016/5/9/chartex" xmlns:cx4="http://schemas.microsoft.com/office/drawing/2016/5/10/chartex" xmlns:cx5="http://schemas.microsoft.com/office/drawing/2016/5/11/chartex" xmlns:cx6="http://schemas.microsoft.com/office/drawing/2016/5/12/chartex" xmlns:cx7="http://schemas.microsoft.com/office/drawing/2016/5/13/chartex" xmlns:cx8="http://schemas.microsoft.com/office/drawing/2016/5/14/chartex" xmlns:mc="http://schemas.openxmlformats.org/markup-compatibility/2006" xmlns:aink="http://schemas.microsoft.com/office/drawing/2016/ink" xmlns:am3d="http://schemas.microsoft.com/office/drawing/2017/model3d" xmlns:o="urn:schemas-microsoft-com:office:office" xmlns:oel="http://schemas.microsoft.com/office/2019/extlst" xmlns:r="http://schemas.openxmlformats.org/officeDocument/2006/relationships" xmlns:m="http://schemas.openxmlformats.org/officeDocument/2006/math" xmlns:v="urn:schemas-microsoft-com:vml" xmlns:wp14="http://schemas.microsoft.com/office/word/2010/wordprocessingDrawing" xmlns:wp="http://schemas.openxmlformats.org/drawingml/2006/wordprocessingDrawing" xmlns:w10="urn:schemas-microsoft-com:office:word" xmlns:w="http://schemas.openxmlformats.org/wordprocessingml/2006/main" xmlns:w14="http://schemas.microsoft.com/office/word/2010/wordml" xmlns:w15="http://schemas.microsoft.com/office/word/2012/wordml" xmlns:w16cex="http://schemas.microsoft.com/office/word/2018/wordml/cex" xmlns:w16cid="http://schemas.microsoft.com/office/word/2016/wordml/cid" xmlns:w16="http://schemas.microsoft.com/office/word/2018/wordml" xmlns:w16du="http://schemas.microsoft.com/office/word/2023/wordml/word16du" xmlns:w16sdtdh="http://schemas.microsoft.com/office/word/2020/wordml/sdtdatahash" xmlns:w16sdtfl="http://schemas.microsoft.com/office/word/2024/wordml/sdtformatlock" xmlns:w16se="http://schemas.microsoft.com/office/word/2015/wordml/symex" xmlns:wpg="http://schemas.microsoft.com/office/word/2010/wordprocessingGroup" xmlns:wpi="http://schemas.microsoft.com/office/word/2010/wordprocessingInk" xmlns:wne="http://schemas.microsoft.com/office/word/2006/wordml" xmlns:wps="http://schemas.microsoft.com/office/word/2010/wordprocessingShape" mc:Ignorable="w14 w15 w16se w16cid w16 w16cex w16sdtdh w16sdtfl w16du wp14">
   <w16cid:commentId w16cid:paraId="4DBE4D40" w16cid:durableId="68EF662C"/>
   <w16cid:commentId w16cid:paraId="3F27DAC3" w16cid:durableId="10479658"/>
+  <w16cid:commentId w16cid:paraId="392E4D0B" w16cid:durableId="4FC4BC49"/>
 </w16cid:commentsIds>
 </file>
 

</xml_diff>

<commit_message>
Updated propensity analyses to generate Table 2 comparing stratified groups.
</commit_message>
<xml_diff>
--- a/manuscript/Cushings-Obesity/manuscript.docx
+++ b/manuscript/Cushings-Obesity/manuscript.docx
@@ -55,7 +55,13 @@
     </w:p>
     <w:p>
       <w:r>
-        <w:t>To identify patients with Cushing’s disease, we evaluated electronic health records at Michigan Medicine dating back to January 1, 2000, searching for diagnoses of Cushing’s disease including ICD Codes (</w:t>
+        <w:t xml:space="preserve">To identify patients with Cushing’s disease, we evaluated electronic health records </w:t>
+      </w:r>
+      <w:r>
+        <w:t>for participants at</w:t>
+      </w:r>
+      <w:r>
+        <w:t xml:space="preserve"> Michigan Medicine dating back to January 1, 2000, searching for diagnoses of Cushing’s disease including ICD Codes (</w:t>
       </w:r>
       <w:commentRangeStart w:id="0"/>
       <w:r>
@@ -89,7 +95,13 @@
         <w:t xml:space="preserve"> we included procedure codes YYY.</w:t>
       </w:r>
       <w:r>
-        <w:t xml:space="preserve">  We excluded participants if they YYY.</w:t>
+        <w:t xml:space="preserve">  We excluded participants if they </w:t>
+      </w:r>
+      <w:r>
+        <w:t xml:space="preserve">were </w:t>
+      </w:r>
+      <w:r>
+        <w:t>YYY.</w:t>
       </w:r>
     </w:p>
     <w:p>
@@ -147,145 +159,185 @@
         <w:t>. F</w:t>
       </w:r>
       <w:r>
-        <w:t>or</w:t>
+        <w:t xml:space="preserve">or </w:t>
+      </w:r>
+      <w:r>
+        <w:t xml:space="preserve">each outcome we identified all Cushing’s cases </w:t>
+      </w:r>
+      <w:r>
+        <w:t xml:space="preserve">with that measurement </w:t>
+      </w:r>
+      <w:r>
+        <w:t xml:space="preserve">and potential controls with that measurement available. </w:t>
+      </w:r>
+      <w:r>
+        <w:t xml:space="preserve">For Cushing’s cases to be included they had to have had the laboratory </w:t>
+      </w:r>
+      <w:proofErr w:type="gramStart"/>
+      <w:r>
+        <w:t>measure</w:t>
       </w:r>
       <w:r>
         <w:t xml:space="preserve"> </w:t>
       </w:r>
       <w:r>
-        <w:t xml:space="preserve">each outcome we identified all Cushing’s cases </w:t>
-      </w:r>
-      <w:r>
-        <w:t xml:space="preserve">with that measurement </w:t>
-      </w:r>
-      <w:r>
-        <w:t xml:space="preserve">and potential controls with that measurement available. </w:t>
-      </w:r>
-      <w:r>
-        <w:t xml:space="preserve">For Cushing’s cases to be included they had to have had the laboratory measure within 30 </w:t>
+        <w:t xml:space="preserve"> </w:t>
+      </w:r>
+      <w:r>
+        <w:t>30</w:t>
+      </w:r>
+      <w:proofErr w:type="gramEnd"/>
+      <w:r>
+        <w:t xml:space="preserve"> days or fewer </w:t>
+      </w:r>
+      <w:r>
+        <w:t xml:space="preserve">prior to surgical treatment.  </w:t>
+      </w:r>
+      <w:r>
+        <w:t>We performed nearest</w:t>
+      </w:r>
+      <w:r>
+        <w:rPr>
+          <w:rFonts w:ascii="Cambria Math" w:hAnsi="Cambria Math" w:cs="Cambria Math"/>
+        </w:rPr>
+        <w:t>‐</w:t>
+      </w:r>
+      <w:r>
+        <w:t xml:space="preserve">neighbor propensity score matching (ratio = </w:t>
+      </w:r>
+      <w:r>
+        <w:t>10:1</w:t>
+      </w:r>
+      <w:r>
+        <w:t xml:space="preserve">) with age in the </w:t>
+      </w:r>
+      <w:r>
+        <w:t>propensity score</w:t>
+      </w:r>
+      <w:r>
+        <w:t xml:space="preserve"> model and exact matching on gender and race/ethnicity</w:t>
+      </w:r>
+      <w:r>
+        <w:t xml:space="preserve"> from a pool of </w:t>
+      </w:r>
+      <w:r>
+        <w:t>70</w:t>
+      </w:r>
+      <w:r>
+        <w:t>,</w:t>
+      </w:r>
+      <w:r>
+        <w:t>327</w:t>
+      </w:r>
+      <w:r>
+        <w:t xml:space="preserve"> </w:t>
+      </w:r>
+      <w:r>
+        <w:t>Michigan Medicine patients</w:t>
+      </w:r>
+      <w:r>
+        <w:t xml:space="preserve">. This procedure was repeated separately for each outcome </w:t>
+      </w:r>
+      <w:r>
+        <w:t xml:space="preserve">as our </w:t>
+      </w:r>
+      <w:r>
+        <w:t>primary analys</w:t>
+      </w:r>
+      <w:r>
+        <w:t>e</w:t>
+      </w:r>
+      <w:r>
+        <w:t xml:space="preserve">s. </w:t>
+      </w:r>
+      <w:r>
+        <w:t xml:space="preserve"> The</w:t>
+      </w:r>
+      <w:r>
+        <w:t xml:space="preserve"> maximal</w:t>
+      </w:r>
+      <w:r>
+        <w:t xml:space="preserve"> post-matching standardized mean difference for </w:t>
+      </w:r>
+      <w:r>
+        <w:t>a</w:t>
+      </w:r>
+      <w:r>
+        <w:t xml:space="preserve">ge </w:t>
+      </w:r>
+      <w:r>
+        <w:t>was</w:t>
+      </w:r>
+      <w:r>
+        <w:t xml:space="preserve"> &lt;0.</w:t>
+      </w:r>
+      <w:r>
+        <w:t>05</w:t>
+      </w:r>
+      <w:r>
+        <w:t xml:space="preserve"> for all outcomes, indicating adequate balance.</w:t>
+      </w:r>
+      <w:r>
+        <w:t xml:space="preserve">  </w:t>
+      </w:r>
+      <w:r>
+        <w:t xml:space="preserve">As a sensitivity analysis we also created a single matched cohort using participants with </w:t>
+      </w:r>
+      <w:r>
+        <w:t>any of the laboratory results we tested (glucose, HbA1c, ALT, blood pressure, or LDL-cholesterol)</w:t>
+      </w:r>
+      <w:r>
+        <w:t xml:space="preserve"> and </w:t>
+      </w:r>
+      <w:commentRangeStart w:id="1"/>
+      <w:r>
+        <w:t xml:space="preserve">repeated all outcome models </w:t>
+      </w:r>
+      <w:r>
+        <w:t>with that dataset</w:t>
+      </w:r>
+      <w:r>
+        <w:t>.</w:t>
+      </w:r>
+      <w:commentRangeEnd w:id="1"/>
+      <w:r>
+        <w:rPr>
+          <w:rStyle w:val="CommentReference"/>
+        </w:rPr>
+        <w:commentReference w:id="1"/>
+      </w:r>
+    </w:p>
+    <w:p>
+      <w:r>
+        <w:t>BMI was not included in the propensity score because we aimed to evaluate obesity as a moderator of the effects of Cushing’s disease</w:t>
+      </w:r>
+      <w:r>
+        <w:t>. Subsequent</w:t>
+      </w:r>
+      <w:r>
+        <w:t xml:space="preserve"> analyses were stratified by obesity (BMI ≥30 kg/m²). Within each obesity stratum, BMI was evaluated </w:t>
       </w:r>
       <w:proofErr w:type="gramStart"/>
       <w:r>
-        <w:t>days, and</w:t>
+        <w:t>descriptively</w:t>
+      </w:r>
+      <w:r>
+        <w:t>,</w:t>
+      </w:r>
+      <w:r>
+        <w:t xml:space="preserve"> and</w:t>
       </w:r>
       <w:proofErr w:type="gramEnd"/>
       <w:r>
-        <w:t xml:space="preserve"> had to be prior to surgical treatment.  </w:t>
-      </w:r>
-      <w:r>
-        <w:t>We performed nearest</w:t>
-      </w:r>
-      <w:r>
-        <w:rPr>
-          <w:rFonts w:ascii="Cambria Math" w:hAnsi="Cambria Math" w:cs="Cambria Math"/>
-        </w:rPr>
-        <w:t>‐</w:t>
-      </w:r>
-      <w:r>
-        <w:t xml:space="preserve">neighbor propensity score matching (ratio = </w:t>
-      </w:r>
-      <w:r>
-        <w:t>10:1</w:t>
-      </w:r>
-      <w:r>
-        <w:t xml:space="preserve">) with age in the </w:t>
-      </w:r>
-      <w:r>
-        <w:t>propensity score</w:t>
-      </w:r>
-      <w:r>
-        <w:t xml:space="preserve"> model and exact matching on gender and race/ethnicity</w:t>
-      </w:r>
-      <w:r>
-        <w:t xml:space="preserve"> from a pool of </w:t>
-      </w:r>
-      <w:r>
-        <w:t>70</w:t>
-      </w:r>
-      <w:r>
-        <w:t>,</w:t>
-      </w:r>
-      <w:r>
-        <w:t>327</w:t>
-      </w:r>
-      <w:r>
         <w:t xml:space="preserve"> </w:t>
       </w:r>
       <w:r>
-        <w:t>Michigan Medicine patients</w:t>
-      </w:r>
-      <w:r>
-        <w:t xml:space="preserve">. This procedure was repeated separately for each outcome </w:t>
-      </w:r>
-      <w:r>
-        <w:t xml:space="preserve">as our </w:t>
-      </w:r>
-      <w:r>
-        <w:t>primary analys</w:t>
-      </w:r>
-      <w:r>
-        <w:t>e</w:t>
-      </w:r>
-      <w:r>
-        <w:t xml:space="preserve">s. </w:t>
-      </w:r>
-      <w:r>
-        <w:t xml:space="preserve"> The post-matching standardized mean difference for Age was &lt;0.1 for all outcomes, indicating adequate balance.</w:t>
-      </w:r>
-      <w:r>
-        <w:t xml:space="preserve">  </w:t>
-      </w:r>
-      <w:r>
-        <w:t xml:space="preserve">As a sensitivity analysis we also created a single matched cohort using participants with </w:t>
-      </w:r>
-      <w:r>
-        <w:rPr>
-          <w:highlight w:val="yellow"/>
-        </w:rPr>
-        <w:t>[criteria]</w:t>
-      </w:r>
-      <w:r>
-        <w:t xml:space="preserve"> and repeated all outcome models </w:t>
-      </w:r>
-      <w:r>
-        <w:t>with that dataset</w:t>
-      </w:r>
-      <w:r>
-        <w:t>.</w:t>
-      </w:r>
-    </w:p>
-    <w:p>
-      <w:r>
-        <w:t>BMI was not included in the propensity score because we aimed to evaluate obesity as a moderator of the effects of Cushing’s disease</w:t>
-      </w:r>
-      <w:r>
-        <w:t>. Subsequent</w:t>
-      </w:r>
-      <w:r>
-        <w:t xml:space="preserve"> analyses were stratified by obesity (BMI ≥30 kg/m²). Within each obesity stratum, BMI was evaluated </w:t>
-      </w:r>
-      <w:proofErr w:type="gramStart"/>
-      <w:r>
-        <w:t>descriptively</w:t>
-      </w:r>
-      <w:r>
-        <w:t>,</w:t>
-      </w:r>
-      <w:r>
-        <w:t xml:space="preserve"> and</w:t>
-      </w:r>
-      <w:proofErr w:type="gramEnd"/>
-      <w:r>
-        <w:t xml:space="preserve"> </w:t>
-      </w:r>
-      <w:r>
         <w:t xml:space="preserve">also </w:t>
       </w:r>
       <w:r>
         <w:t>included as a covariate in sensitivity models.</w:t>
       </w:r>
     </w:p>
-    <w:p/>
     <w:p>
       <w:r>
         <w:rPr>
@@ -368,6 +420,7 @@
           <w:b w:val="0"/>
           <w:bCs w:val="0"/>
         </w:rPr>
+        <w:lastRenderedPageBreak/>
         <w:t>Participant characteristics</w:t>
       </w:r>
       <w:r>
@@ -405,13 +458,7 @@
     </w:p>
     <w:p>
       <w:r>
-        <w:t xml:space="preserve">We performed outcome-specific propensity matching to identify </w:t>
-      </w:r>
-      <w:r>
-        <w:t>appropriate controls</w:t>
-      </w:r>
-      <w:r>
-        <w:t xml:space="preserve">, starting from those with generating exact matches for gender, race and ethnicity.  We then algorithmically matched for age, generating 10 controls for each case.  Matching was </w:t>
+        <w:t xml:space="preserve">We performed outcome-specific propensity matching to identify appropriate controls, starting from those with generating exact matches for gender, race and ethnicity.  We then algorithmically matched for age, generating 10 controls for each case.  Matching was </w:t>
       </w:r>
       <w:proofErr w:type="gramStart"/>
       <w:r>
@@ -466,109 +513,190 @@
         <w:t xml:space="preserve">. </w:t>
       </w:r>
       <w:r>
-        <w:t>O</w:t>
-      </w:r>
-      <w:r>
-        <w:t>utcome-specific matched sets are described in Supplementary Tables S</w:t>
-      </w:r>
-      <w:r>
+        <w:t>Outcome-specific matched sets are described in Supplementary Tables S2</w:t>
+      </w:r>
+      <w:r>
+        <w:t>A-E</w:t>
+      </w:r>
+      <w:r>
+        <w:t>.</w:t>
+      </w:r>
+      <w:r>
+        <w:t xml:space="preserve">   Here we reproduce several notable characteristics, including a higher prevalence of Cushing’s disease in females </w:t>
+      </w:r>
+      <w:commentRangeStart w:id="2"/>
+      <w:r>
+        <w:t xml:space="preserve">(284 vs 72) </w:t>
+      </w:r>
+      <w:commentRangeEnd w:id="2"/>
+      <w:r>
+        <w:rPr>
+          <w:rStyle w:val="CommentReference"/>
+        </w:rPr>
+        <w:commentReference w:id="2"/>
+      </w:r>
+      <w:r>
+        <w:t>and a higher body mass index for patients with Cushing’s disease (both p&lt;0.001).</w:t>
+      </w:r>
+      <w:r>
+        <w:t xml:space="preserve">  </w:t>
+      </w:r>
+      <w:commentRangeStart w:id="3"/>
+      <w:r>
+        <w:t>Prior to matching for Race and Ethnicity, we noted that participants</w:t>
+      </w:r>
+      <w:r>
+        <w:t xml:space="preserve"> with Cushing’s disease were more likely to </w:t>
+      </w:r>
+      <w:r>
+        <w:t>identify as Non-Hispanic White (87%) than the overall Michigan Medicine participant population (75% Non-Hispanic White).</w:t>
+      </w:r>
+      <w:r>
+        <w:t xml:space="preserve">  Correspondingly</w:t>
+      </w:r>
+      <w:r>
+        <w:t>,</w:t>
+      </w:r>
+      <w:r>
+        <w:t xml:space="preserve"> participants with Cushing’s disease were less likely to identify as Asian or Black</w:t>
+      </w:r>
+      <w:commentRangeEnd w:id="3"/>
+      <w:r>
+        <w:rPr>
+          <w:rStyle w:val="CommentReference"/>
+        </w:rPr>
+        <w:commentReference w:id="3"/>
+      </w:r>
+      <w:r>
+        <w:t>.</w:t>
+      </w:r>
+    </w:p>
+    <w:p>
+      <w:r>
+        <w:t xml:space="preserve">As we expected, participants with Cushing’s disease had a higher BMI than the controls.  </w:t>
+      </w:r>
+      <w:r>
+        <w:t xml:space="preserve">To understand the </w:t>
+      </w:r>
+      <w:r>
+        <w:t xml:space="preserve">cross-sectional </w:t>
+      </w:r>
+      <w:r>
+        <w:t>relationship between obesity and Cushing’s disease, we</w:t>
+      </w:r>
+      <w:r>
+        <w:t xml:space="preserve"> next stratified our participants </w:t>
+      </w:r>
+      <w:r>
+        <w:t>with a BMI above or below 30 kg/m</w:t>
+      </w:r>
+      <w:r>
+        <w:rPr>
+          <w:vertAlign w:val="superscript"/>
+        </w:rPr>
         <w:t>2</w:t>
       </w:r>
       <w:r>
-        <w:t>A-E</w:t>
+        <w:t xml:space="preserve">, </w:t>
+      </w:r>
+      <w:r>
+        <w:t>across</w:t>
+      </w:r>
+      <w:r>
+        <w:t xml:space="preserve"> both cases and controls</w:t>
+      </w:r>
+      <w:r>
+        <w:t>.  As shown in Table 2, and a</w:t>
+      </w:r>
+      <w:r>
+        <w:t xml:space="preserve">s expected given our stratification, the four groups differed </w:t>
+      </w:r>
+      <w:r>
+        <w:t>in</w:t>
+      </w:r>
+      <w:r>
+        <w:t xml:space="preserve"> several characteristics</w:t>
+      </w:r>
+      <w:r>
+        <w:t xml:space="preserve">, </w:t>
+      </w:r>
+      <w:r>
+        <w:t>which</w:t>
+      </w:r>
+      <w:r>
+        <w:t xml:space="preserve"> will be adjusted for below in multivariable models below</w:t>
       </w:r>
       <w:r>
         <w:t>.</w:t>
       </w:r>
       <w:r>
-        <w:t xml:space="preserve">   Here we reproduce several notable characteristics, including a higher prevalence of Cushing’s disease in females </w:t>
-      </w:r>
-      <w:commentRangeStart w:id="1"/>
-      <w:r>
-        <w:t xml:space="preserve">(284 vs 72) </w:t>
-      </w:r>
-      <w:commentRangeEnd w:id="1"/>
+        <w:t xml:space="preserve">  For example, among participants with a BMI </w:t>
+      </w:r>
+      <w:proofErr w:type="spellStart"/>
+      <w:r>
+        <w:t xml:space="preserve">&gt; </w:t>
+      </w:r>
+      <w:proofErr w:type="spellEnd"/>
+      <w:r>
+        <w:t>30 mg/m</w:t>
+      </w:r>
+      <w:r>
+        <w:rPr>
+          <w:vertAlign w:val="superscript"/>
+        </w:rPr>
+        <w:t>2</w:t>
+      </w:r>
+      <w:r>
+        <w:t xml:space="preserve">, participants with Cushing’s disease had a </w:t>
+      </w:r>
+      <w:commentRangeStart w:id="4"/>
+      <w:r>
+        <w:t>higher BMI than controls</w:t>
+      </w:r>
+      <w:commentRangeEnd w:id="4"/>
       <w:r>
         <w:rPr>
           <w:rStyle w:val="CommentReference"/>
         </w:rPr>
-        <w:commentReference w:id="1"/>
-      </w:r>
-      <w:r>
-        <w:t>and a higher body mass index for patients with Cushing’s disease (both p&lt;0.001).</w:t>
-      </w:r>
-      <w:r>
-        <w:t xml:space="preserve">  </w:t>
-      </w:r>
-      <w:commentRangeStart w:id="2"/>
-      <w:r>
-        <w:t>Prior to matching for Race and Ethnicity, we noted that participants</w:t>
-      </w:r>
-      <w:r>
-        <w:t xml:space="preserve"> with Cushing’s disease were more likely to </w:t>
-      </w:r>
-      <w:r>
-        <w:t>identify as Non-Hispanic White (87%) than the overall Michigan Medicine participant population (75% Non-Hispanic White).</w:t>
-      </w:r>
-      <w:r>
-        <w:t xml:space="preserve">  Correspondingly participants with Cushing’s disease were less likely to identify as Asian or Black</w:t>
-      </w:r>
-      <w:commentRangeEnd w:id="2"/>
+        <w:commentReference w:id="4"/>
+      </w:r>
+      <w:r>
+        <w:t xml:space="preserve">.  </w:t>
+      </w:r>
+      <w:commentRangeStart w:id="5"/>
+      <w:r>
+        <w:t>Males with Cushing’s disease were more likely to have a BMI under 30 kg/m</w:t>
+      </w:r>
+      <w:r>
+        <w:rPr>
+          <w:vertAlign w:val="superscript"/>
+        </w:rPr>
+        <w:t>2</w:t>
+      </w:r>
+      <w:r>
+        <w:t xml:space="preserve"> (28% of that group) than over 30 kg/m</w:t>
+      </w:r>
+      <w:r>
+        <w:rPr>
+          <w:vertAlign w:val="superscript"/>
+        </w:rPr>
+        <w:t>2</w:t>
+      </w:r>
+      <w:r>
+        <w:t xml:space="preserve"> (26% of that group).</w:t>
+      </w:r>
+      <w:commentRangeEnd w:id="5"/>
+      <w:r>
+        <w:t xml:space="preserve">  The average age of Cushing’s participants with or without obesity</w:t>
+      </w:r>
       <w:r>
         <w:rPr>
           <w:rStyle w:val="CommentReference"/>
         </w:rPr>
-        <w:commentReference w:id="2"/>
-      </w:r>
-      <w:r>
-        <w:t>.</w:t>
-      </w:r>
-    </w:p>
-    <w:p/>
-    <w:p>
-      <w:pPr>
-        <w:pStyle w:val="Heading2"/>
-      </w:pPr>
-      <w:r>
-        <w:t>Stratification by obesity and Cushing’s disease status</w:t>
-      </w:r>
-    </w:p>
-    <w:p>
-      <w:r>
-        <w:t>To understand the relationship between obesity and Cushing’s disease, we</w:t>
-      </w:r>
-      <w:r>
-        <w:t xml:space="preserve"> next stratified our participants </w:t>
-      </w:r>
-      <w:r>
-        <w:t>with a BMI above or below 30 kg/m</w:t>
-      </w:r>
-      <w:r>
-        <w:rPr>
-          <w:vertAlign w:val="superscript"/>
-        </w:rPr>
-        <w:t>2</w:t>
-      </w:r>
-      <w:r>
-        <w:t xml:space="preserve">, </w:t>
-      </w:r>
-      <w:r>
-        <w:t>across</w:t>
-      </w:r>
-      <w:r>
-        <w:t xml:space="preserve"> both cases and controls</w:t>
-      </w:r>
-      <w:r>
-        <w:t xml:space="preserve"> (</w:t>
-      </w:r>
-      <w:r>
-        <w:t xml:space="preserve">see </w:t>
-      </w:r>
-      <w:r>
-        <w:t>Table 2)</w:t>
-      </w:r>
-      <w:r>
-        <w:t>.</w:t>
+        <w:commentReference w:id="5"/>
+      </w:r>
+      <w:r>
+        <w:t xml:space="preserve"> was similar.</w:t>
       </w:r>
     </w:p>
     <w:p>
@@ -687,21 +815,7 @@
         <w:rPr>
           <w:rFonts w:ascii="Aptos"/>
         </w:rPr>
-        <w:t xml:space="preserve">Ho, D., Imai, K., King, G., &amp; Stuart, E. A. (2011). </w:t>
-      </w:r>
-      <w:proofErr w:type="spellStart"/>
-      <w:r>
-        <w:rPr>
-          <w:rFonts w:ascii="Aptos"/>
-        </w:rPr>
-        <w:t>MatchIt</w:t>
-      </w:r>
-      <w:proofErr w:type="spellEnd"/>
-      <w:r>
-        <w:rPr>
-          <w:rFonts w:ascii="Aptos"/>
-        </w:rPr>
-        <w:t xml:space="preserve">: Nonparametric Preprocessing for Parametric Causal Inference. </w:t>
+        <w:t xml:space="preserve">Ho, D., Imai, K., King, G., &amp; Stuart, E. A. (2011). MatchIt: Nonparametric Preprocessing for Parametric Causal Inference. </w:t>
       </w:r>
       <w:r>
         <w:rPr>
@@ -861,6 +975,36 @@
           <w:b/>
           <w:bCs/>
         </w:rPr>
+        <w:t>Table 2: Participant characteristics after stratification by obesity</w:t>
+      </w:r>
+      <w:r>
+        <w:t xml:space="preserve">.  </w:t>
+      </w:r>
+      <w:r>
+        <w:t xml:space="preserve">Values are mean ± SD or n (%). Groups were stratified by Cushing’s status and obesity; no matching was performed across these strata. </w:t>
+      </w:r>
+      <w:r>
+        <w:t>Kruskal-Wallis</w:t>
+      </w:r>
+      <w:r>
+        <w:t xml:space="preserve"> or χ² compare across the four groups</w:t>
+      </w:r>
+      <w:r>
+        <w:t xml:space="preserve"> to generate p-values</w:t>
+      </w:r>
+      <w:r>
+        <w:t>.</w:t>
+      </w:r>
+    </w:p>
+    <w:p>
+      <w:pPr>
+        <w:pStyle w:val="NormalWeb"/>
+      </w:pPr>
+      <w:r>
+        <w:rPr>
+          <w:b/>
+          <w:bCs/>
+        </w:rPr>
         <w:t>Supplementary Figure</w:t>
       </w:r>
       <w:r>
@@ -1272,6 +1416,7 @@
           <w:szCs w:val="18"/>
           <w14:ligatures w14:val="none"/>
         </w:rPr>
+        <w:lastRenderedPageBreak/>
         <w:t xml:space="preserve">   </w:t>
       </w:r>
       <w:r>
@@ -1468,7 +1613,6 @@
           <w:szCs w:val="18"/>
           <w14:ligatures w14:val="none"/>
         </w:rPr>
-        <w:lastRenderedPageBreak/>
         <w:t xml:space="preserve">   </w:t>
       </w:r>
       <w:r>
@@ -2989,11 +3133,11 @@
           <w:sz w:val="20"/>
           <w:szCs w:val="20"/>
         </w:rPr>
-        <w:t>@trey can you fill this in</w:t>
+        <w:t>@trey can you fill in XXX and YYY in based on the participant flow diagram</w:t>
       </w:r>
     </w:p>
   </w:comment>
-  <w:comment w:id="1" w:author="Dave Bridges" w:date="2025-09-05T18:06:00Z" w:initials="DB">
+  <w:comment w:id="1" w:author="Dave Bridges" w:date="2025-09-05T19:50:00Z" w:initials="DB">
     <w:p>
       <w:r>
         <w:rPr>
@@ -3006,11 +3150,11 @@
           <w:sz w:val="20"/>
           <w:szCs w:val="20"/>
         </w:rPr>
-        <w:t>@trey are there other papers that describe this?</w:t>
+        <w:t>todo</w:t>
       </w:r>
     </w:p>
   </w:comment>
-  <w:comment w:id="2" w:author="Dave Bridges" w:date="2025-09-05T19:38:00Z" w:initials="DB">
+  <w:comment w:id="2" w:author="Dave Bridges" w:date="2025-09-05T18:06:00Z" w:initials="DB">
     <w:p>
       <w:r>
         <w:rPr>
@@ -3023,7 +3167,58 @@
           <w:sz w:val="20"/>
           <w:szCs w:val="20"/>
         </w:rPr>
+        <w:t>@trey are there other papers that describe this?</w:t>
+      </w:r>
+    </w:p>
+  </w:comment>
+  <w:comment w:id="3" w:author="Dave Bridges" w:date="2025-09-05T19:38:00Z" w:initials="DB">
+    <w:p>
+      <w:r>
+        <w:rPr>
+          <w:rStyle w:val="CommentReference"/>
+        </w:rPr>
+        <w:annotationRef/>
+      </w:r>
+      <w:r>
+        <w:rPr>
+          <w:sz w:val="20"/>
+          <w:szCs w:val="20"/>
+        </w:rPr>
         <w:t>@trey also any data on demographic propensities towards Cushings we can cite?</w:t>
+      </w:r>
+    </w:p>
+  </w:comment>
+  <w:comment w:id="4" w:author="Dave Bridges" w:date="2025-09-06T11:13:00Z" w:initials="DB">
+    <w:p>
+      <w:r>
+        <w:rPr>
+          <w:rStyle w:val="CommentReference"/>
+        </w:rPr>
+        <w:annotationRef/>
+      </w:r>
+      <w:r>
+        <w:rPr>
+          <w:sz w:val="20"/>
+          <w:szCs w:val="20"/>
+        </w:rPr>
+        <w:t>Need to calculate p-value</w:t>
+      </w:r>
+    </w:p>
+  </w:comment>
+  <w:comment w:id="5" w:author="Dave Bridges" w:date="2025-09-06T11:12:00Z" w:initials="DB">
+    <w:p>
+      <w:r>
+        <w:rPr>
+          <w:rStyle w:val="CommentReference"/>
+        </w:rPr>
+        <w:annotationRef/>
+      </w:r>
+      <w:r>
+        <w:rPr>
+          <w:sz w:val="20"/>
+          <w:szCs w:val="20"/>
+        </w:rPr>
+        <w:t>Need to calculate p-value</w:t>
       </w:r>
     </w:p>
   </w:comment>
@@ -3033,24 +3228,33 @@
 <file path=word/commentsExtended.xml><?xml version="1.0" encoding="utf-8"?>
 <w15:commentsEx xmlns:wpc="http://schemas.microsoft.com/office/word/2010/wordprocessingCanvas" xmlns:cx="http://schemas.microsoft.com/office/drawing/2014/chartex" xmlns:cx1="http://schemas.microsoft.com/office/drawing/2015/9/8/chartex" xmlns:cx2="http://schemas.microsoft.com/office/drawing/2015/10/21/chartex" xmlns:cx3="http://schemas.microsoft.com/office/drawing/2016/5/9/chartex" xmlns:cx4="http://schemas.microsoft.com/office/drawing/2016/5/10/chartex" xmlns:cx5="http://schemas.microsoft.com/office/drawing/2016/5/11/chartex" xmlns:cx6="http://schemas.microsoft.com/office/drawing/2016/5/12/chartex" xmlns:cx7="http://schemas.microsoft.com/office/drawing/2016/5/13/chartex" xmlns:cx8="http://schemas.microsoft.com/office/drawing/2016/5/14/chartex" xmlns:mc="http://schemas.openxmlformats.org/markup-compatibility/2006" xmlns:aink="http://schemas.microsoft.com/office/drawing/2016/ink" xmlns:am3d="http://schemas.microsoft.com/office/drawing/2017/model3d" xmlns:o="urn:schemas-microsoft-com:office:office" xmlns:oel="http://schemas.microsoft.com/office/2019/extlst" xmlns:r="http://schemas.openxmlformats.org/officeDocument/2006/relationships" xmlns:m="http://schemas.openxmlformats.org/officeDocument/2006/math" xmlns:v="urn:schemas-microsoft-com:vml" xmlns:wp14="http://schemas.microsoft.com/office/word/2010/wordprocessingDrawing" xmlns:wp="http://schemas.openxmlformats.org/drawingml/2006/wordprocessingDrawing" xmlns:w10="urn:schemas-microsoft-com:office:word" xmlns:w="http://schemas.openxmlformats.org/wordprocessingml/2006/main" xmlns:w14="http://schemas.microsoft.com/office/word/2010/wordml" xmlns:w15="http://schemas.microsoft.com/office/word/2012/wordml" xmlns:w16cex="http://schemas.microsoft.com/office/word/2018/wordml/cex" xmlns:w16cid="http://schemas.microsoft.com/office/word/2016/wordml/cid" xmlns:w16="http://schemas.microsoft.com/office/word/2018/wordml" xmlns:w16du="http://schemas.microsoft.com/office/word/2023/wordml/word16du" xmlns:w16sdtdh="http://schemas.microsoft.com/office/word/2020/wordml/sdtdatahash" xmlns:w16sdtfl="http://schemas.microsoft.com/office/word/2024/wordml/sdtformatlock" xmlns:w16se="http://schemas.microsoft.com/office/word/2015/wordml/symex" xmlns:wpg="http://schemas.microsoft.com/office/word/2010/wordprocessingGroup" xmlns:wpi="http://schemas.microsoft.com/office/word/2010/wordprocessingInk" xmlns:wne="http://schemas.microsoft.com/office/word/2006/wordml" xmlns:wps="http://schemas.microsoft.com/office/word/2010/wordprocessingShape" mc:Ignorable="w14 w15 w16se w16cid w16 w16cex w16sdtdh w16sdtfl w16du wp14">
   <w15:commentEx w15:paraId="4DBE4D40" w15:done="0"/>
+  <w15:commentEx w15:paraId="1DD21AA1" w15:done="0"/>
   <w15:commentEx w15:paraId="3F27DAC3" w15:done="0"/>
   <w15:commentEx w15:paraId="392E4D0B" w15:done="0"/>
+  <w15:commentEx w15:paraId="0A944B29" w15:done="0"/>
+  <w15:commentEx w15:paraId="65C3D76B" w15:done="0"/>
 </w15:commentsEx>
 </file>
 
 <file path=word/commentsExtensible.xml><?xml version="1.0" encoding="utf-8"?>
 <w16cex:commentsExtensible xmlns:wpc="http://schemas.microsoft.com/office/word/2010/wordprocessingCanvas" xmlns:cx="http://schemas.microsoft.com/office/drawing/2014/chartex" xmlns:cx1="http://schemas.microsoft.com/office/drawing/2015/9/8/chartex" xmlns:cx2="http://schemas.microsoft.com/office/drawing/2015/10/21/chartex" xmlns:cx3="http://schemas.microsoft.com/office/drawing/2016/5/9/chartex" xmlns:cx4="http://schemas.microsoft.com/office/drawing/2016/5/10/chartex" xmlns:cx5="http://schemas.microsoft.com/office/drawing/2016/5/11/chartex" xmlns:cx6="http://schemas.microsoft.com/office/drawing/2016/5/12/chartex" xmlns:cx7="http://schemas.microsoft.com/office/drawing/2016/5/13/chartex" xmlns:cx8="http://schemas.microsoft.com/office/drawing/2016/5/14/chartex" xmlns:cr="http://schemas.microsoft.com/office/comments/2020/reactions" xmlns:mc="http://schemas.openxmlformats.org/markup-compatibility/2006" xmlns:aink="http://schemas.microsoft.com/office/drawing/2016/ink" xmlns:am3d="http://schemas.microsoft.com/office/drawing/2017/model3d" xmlns:o="urn:schemas-microsoft-com:office:office" xmlns:oel="http://schemas.microsoft.com/office/2019/extlst" xmlns:r="http://schemas.openxmlformats.org/officeDocument/2006/relationships" xmlns:m="http://schemas.openxmlformats.org/officeDocument/2006/math" xmlns:v="urn:schemas-microsoft-com:vml" xmlns:wp14="http://schemas.microsoft.com/office/word/2010/wordprocessingDrawing" xmlns:wp="http://schemas.openxmlformats.org/drawingml/2006/wordprocessingDrawing" xmlns:w10="urn:schemas-microsoft-com:office:word" xmlns:w="http://schemas.openxmlformats.org/wordprocessingml/2006/main" xmlns:w14="http://schemas.microsoft.com/office/word/2010/wordml" xmlns:w15="http://schemas.microsoft.com/office/word/2012/wordml" xmlns:w16cex="http://schemas.microsoft.com/office/word/2018/wordml/cex" xmlns:w16cid="http://schemas.microsoft.com/office/word/2016/wordml/cid" xmlns:w16="http://schemas.microsoft.com/office/word/2018/wordml" xmlns:w16du="http://schemas.microsoft.com/office/word/2023/wordml/word16du" xmlns:w16sdtdh="http://schemas.microsoft.com/office/word/2020/wordml/sdtdatahash" xmlns:w16sdtfl="http://schemas.microsoft.com/office/word/2024/wordml/sdtformatlock" xmlns:w16se="http://schemas.microsoft.com/office/word/2015/wordml/symex" xmlns:wpg="http://schemas.microsoft.com/office/word/2010/wordprocessingGroup" xmlns:wpi="http://schemas.microsoft.com/office/word/2010/wordprocessingInk" xmlns:wne="http://schemas.microsoft.com/office/word/2006/wordml" xmlns:wps="http://schemas.microsoft.com/office/word/2010/wordprocessingShape" mc:Ignorable="w14 w15 w16se w16cid w16 w16cex w16sdtdh w16sdtfl cr w16du wp14">
   <w16cex:commentExtensible w16cex:durableId="68EF662C" w16cex:dateUtc="2025-09-05T15:11:00Z"/>
+  <w16cex:commentExtensible w16cex:durableId="1A95B88A" w16cex:dateUtc="2025-09-05T23:50:00Z"/>
   <w16cex:commentExtensible w16cex:durableId="10479658" w16cex:dateUtc="2025-09-05T22:06:00Z"/>
   <w16cex:commentExtensible w16cex:durableId="4FC4BC49" w16cex:dateUtc="2025-09-05T23:38:00Z"/>
+  <w16cex:commentExtensible w16cex:durableId="76FF026A" w16cex:dateUtc="2025-09-06T15:13:00Z"/>
+  <w16cex:commentExtensible w16cex:durableId="353E7A50" w16cex:dateUtc="2025-09-06T15:12:00Z"/>
 </w16cex:commentsExtensible>
 </file>
 
 <file path=word/commentsIds.xml><?xml version="1.0" encoding="utf-8"?>
 <w16cid:commentsIds xmlns:wpc="http://schemas.microsoft.com/office/word/2010/wordprocessingCanvas" xmlns:cx="http://schemas.microsoft.com/office/drawing/2014/chartex" xmlns:cx1="http://schemas.microsoft.com/office/drawing/2015/9/8/chartex" xmlns:cx2="http://schemas.microsoft.com/office/drawing/2015/10/21/chartex" xmlns:cx3="http://schemas.microsoft.com/office/drawing/2016/5/9/chartex" xmlns:cx4="http://schemas.microsoft.com/office/drawing/2016/5/10/chartex" xmlns:cx5="http://schemas.microsoft.com/office/drawing/2016/5/11/chartex" xmlns:cx6="http://schemas.microsoft.com/office/drawing/2016/5/12/chartex" xmlns:cx7="http://schemas.microsoft.com/office/drawing/2016/5/13/chartex" xmlns:cx8="http://schemas.microsoft.com/office/drawing/2016/5/14/chartex" xmlns:mc="http://schemas.openxmlformats.org/markup-compatibility/2006" xmlns:aink="http://schemas.microsoft.com/office/drawing/2016/ink" xmlns:am3d="http://schemas.microsoft.com/office/drawing/2017/model3d" xmlns:o="urn:schemas-microsoft-com:office:office" xmlns:oel="http://schemas.microsoft.com/office/2019/extlst" xmlns:r="http://schemas.openxmlformats.org/officeDocument/2006/relationships" xmlns:m="http://schemas.openxmlformats.org/officeDocument/2006/math" xmlns:v="urn:schemas-microsoft-com:vml" xmlns:wp14="http://schemas.microsoft.com/office/word/2010/wordprocessingDrawing" xmlns:wp="http://schemas.openxmlformats.org/drawingml/2006/wordprocessingDrawing" xmlns:w10="urn:schemas-microsoft-com:office:word" xmlns:w="http://schemas.openxmlformats.org/wordprocessingml/2006/main" xmlns:w14="http://schemas.microsoft.com/office/word/2010/wordml" xmlns:w15="http://schemas.microsoft.com/office/word/2012/wordml" xmlns:w16cex="http://schemas.microsoft.com/office/word/2018/wordml/cex" xmlns:w16cid="http://schemas.microsoft.com/office/word/2016/wordml/cid" xmlns:w16="http://schemas.microsoft.com/office/word/2018/wordml" xmlns:w16du="http://schemas.microsoft.com/office/word/2023/wordml/word16du" xmlns:w16sdtdh="http://schemas.microsoft.com/office/word/2020/wordml/sdtdatahash" xmlns:w16sdtfl="http://schemas.microsoft.com/office/word/2024/wordml/sdtformatlock" xmlns:w16se="http://schemas.microsoft.com/office/word/2015/wordml/symex" xmlns:wpg="http://schemas.microsoft.com/office/word/2010/wordprocessingGroup" xmlns:wpi="http://schemas.microsoft.com/office/word/2010/wordprocessingInk" xmlns:wne="http://schemas.microsoft.com/office/word/2006/wordml" xmlns:wps="http://schemas.microsoft.com/office/word/2010/wordprocessingShape" mc:Ignorable="w14 w15 w16se w16cid w16 w16cex w16sdtdh w16sdtfl w16du wp14">
   <w16cid:commentId w16cid:paraId="4DBE4D40" w16cid:durableId="68EF662C"/>
+  <w16cid:commentId w16cid:paraId="1DD21AA1" w16cid:durableId="1A95B88A"/>
   <w16cid:commentId w16cid:paraId="3F27DAC3" w16cid:durableId="10479658"/>
   <w16cid:commentId w16cid:paraId="392E4D0B" w16cid:durableId="4FC4BC49"/>
+  <w16cid:commentId w16cid:paraId="0A944B29" w16cid:durableId="76FF026A"/>
+  <w16cid:commentId w16cid:paraId="65C3D76B" w16cid:durableId="353E7A50"/>
 </w16cid:commentsIds>
 </file>
 
@@ -4429,6 +4633,7 @@
   <w:style w:type="character" w:default="1" w:styleId="DefaultParagraphFont">
     <w:name w:val="Default Paragraph Font"/>
     <w:uiPriority w:val="1"/>
+    <w:semiHidden/>
     <w:unhideWhenUsed/>
   </w:style>
   <w:style w:type="table" w:default="1" w:styleId="TableNormal">

</xml_diff>

<commit_message>
Wrote some interpretations around table 2
</commit_message>
<xml_diff>
--- a/manuscript/Cushings-Obesity/manuscript.docx
+++ b/manuscript/Cushings-Obesity/manuscript.docx
@@ -103,6 +103,9 @@
       <w:r>
         <w:t>YYY.</w:t>
       </w:r>
+      <w:r>
+        <w:t xml:space="preserve">  Race and ethnicity were self-reported, with groups of &lt;10 aggregated into the other category.</w:t>
+      </w:r>
     </w:p>
     <w:p>
       <w:r>
@@ -347,7 +350,13 @@
         <w:t>Statistical Analyses.</w:t>
       </w:r>
       <w:r>
-        <w:t xml:space="preserve">  Statistical significance was set at p&lt;0.05.  All analyses were performed using R version 4.4.0 </w:t>
+        <w:t xml:space="preserve">  Statistical significance</w:t>
+      </w:r>
+      <w:r>
+        <w:t xml:space="preserve"> for this stud</w:t>
+      </w:r>
+      <w:r>
+        <w:t xml:space="preserve"> was set at p&lt;0.05.  All analyses were performed using R version 4.4.0 </w:t>
       </w:r>
       <w:r>
         <w:fldChar w:fldCharType="begin"/>
@@ -367,12 +376,16 @@
       <w:r>
         <w:fldChar w:fldCharType="end"/>
       </w:r>
+      <w:r>
+        <w:t>.  For participant demographics, Kruskal-Wallis or Mann-Whitney tests were used as both BMI and participant Age were not normally distributed (p&lt;0.05 via Shapiro-Wilk tests).  Chi-squared tests were used to compare counts across groups.</w:t>
+      </w:r>
     </w:p>
     <w:p>
       <w:pPr>
         <w:pStyle w:val="Heading1"/>
       </w:pPr>
       <w:r>
+        <w:lastRenderedPageBreak/>
         <w:t>Results</w:t>
       </w:r>
     </w:p>
@@ -420,7 +433,6 @@
           <w:b w:val="0"/>
           <w:bCs w:val="0"/>
         </w:rPr>
-        <w:lastRenderedPageBreak/>
         <w:t>Participant characteristics</w:t>
       </w:r>
       <w:r>
@@ -573,7 +585,19 @@
     </w:p>
     <w:p>
       <w:r>
-        <w:t xml:space="preserve">As we expected, participants with Cushing’s disease had a higher BMI than the controls.  </w:t>
+        <w:t>As we expected, participants with Cushing’s disease had a higher BMI than the controls</w:t>
+      </w:r>
+      <w:r>
+        <w:t>, with 64% of participants with Cushing’s disease having a BMI above 30 kg/m</w:t>
+      </w:r>
+      <w:r>
+        <w:rPr>
+          <w:vertAlign w:val="superscript"/>
+        </w:rPr>
+        <w:t>2</w:t>
+      </w:r>
+      <w:r>
+        <w:t xml:space="preserve">.  </w:t>
       </w:r>
       <w:r>
         <w:t xml:space="preserve">To understand the </w:t>
@@ -630,15 +654,7 @@
         <w:t>.</w:t>
       </w:r>
       <w:r>
-        <w:t xml:space="preserve">  For example, among participants with a BMI </w:t>
-      </w:r>
-      <w:proofErr w:type="spellStart"/>
-      <w:r>
-        <w:t xml:space="preserve">&gt; </w:t>
-      </w:r>
-      <w:proofErr w:type="spellEnd"/>
-      <w:r>
-        <w:t>30 mg/m</w:t>
+        <w:t xml:space="preserve">  For example, among participants with a BMI &gt; 30 mg/m</w:t>
       </w:r>
       <w:r>
         <w:rPr>
@@ -687,12 +703,50 @@
       </w:r>
       <w:commentRangeEnd w:id="5"/>
       <w:r>
-        <w:t xml:space="preserve">  The average age of Cushing’s participants with or without obesity</w:t>
-      </w:r>
+        <w:t xml:space="preserve">  </w:t>
+      </w:r>
+      <w:r>
+        <w:t xml:space="preserve">People with Cushing’s disease and obesity were also moderately over-represented in </w:t>
+      </w:r>
+      <w:commentRangeStart w:id="6"/>
+      <w:r>
+        <w:t>Non-Hispanic White participants (90%) compared to Cushing’s patients with a BMI under 30 kg/m</w:t>
+      </w:r>
+      <w:r>
+        <w:rPr>
+          <w:vertAlign w:val="superscript"/>
+        </w:rPr>
+        <w:t>2</w:t>
+      </w:r>
+      <w:r>
+        <w:t xml:space="preserve"> (83% of that group). </w:t>
+      </w:r>
+      <w:commentRangeEnd w:id="6"/>
       <w:r>
         <w:rPr>
           <w:rStyle w:val="CommentReference"/>
         </w:rPr>
+        <w:commentReference w:id="6"/>
+      </w:r>
+      <w:r>
+        <w:t xml:space="preserve">The average age of </w:t>
+      </w:r>
+      <w:r>
+        <w:t xml:space="preserve">participants with </w:t>
+      </w:r>
+      <w:r>
+        <w:t>Cushing’s</w:t>
+      </w:r>
+      <w:r>
+        <w:t xml:space="preserve"> disease</w:t>
+      </w:r>
+      <w:r>
+        <w:t xml:space="preserve"> with or without obesity</w:t>
+      </w:r>
+      <w:r>
+        <w:rPr>
+          <w:rStyle w:val="CommentReference"/>
+        </w:rPr>
         <w:commentReference w:id="5"/>
       </w:r>
       <w:r>
@@ -707,6 +761,7 @@
         <w:rPr>
           <w:rStyle w:val="Heading2Char"/>
         </w:rPr>
+        <w:lastRenderedPageBreak/>
         <w:t>Primary outcomes and effect modification</w:t>
       </w:r>
     </w:p>
@@ -791,7 +846,6 @@
         <w:pStyle w:val="Heading1"/>
       </w:pPr>
       <w:r>
-        <w:lastRenderedPageBreak/>
         <w:t>References</w:t>
       </w:r>
     </w:p>
@@ -1005,6 +1059,7 @@
           <w:b/>
           <w:bCs/>
         </w:rPr>
+        <w:lastRenderedPageBreak/>
         <w:t>Supplementary Figure</w:t>
       </w:r>
       <w:r>
@@ -1416,7 +1471,6 @@
           <w:szCs w:val="18"/>
           <w14:ligatures w14:val="none"/>
         </w:rPr>
-        <w:lastRenderedPageBreak/>
         <w:t xml:space="preserve">   </w:t>
       </w:r>
       <w:r>
@@ -2584,6 +2638,7 @@
           <w:szCs w:val="18"/>
           <w14:ligatures w14:val="none"/>
         </w:rPr>
+        <w:lastRenderedPageBreak/>
         <w:t>-</w:t>
       </w:r>
       <w:r>
@@ -3205,6 +3260,23 @@
       </w:r>
     </w:p>
   </w:comment>
+  <w:comment w:id="6" w:author="Dave Bridges" w:date="2025-09-06T11:20:00Z" w:initials="DB">
+    <w:p>
+      <w:r>
+        <w:rPr>
+          <w:rStyle w:val="CommentReference"/>
+        </w:rPr>
+        <w:annotationRef/>
+      </w:r>
+      <w:r>
+        <w:rPr>
+          <w:sz w:val="20"/>
+          <w:szCs w:val="20"/>
+        </w:rPr>
+        <w:t>Calculate p-value for this</w:t>
+      </w:r>
+    </w:p>
+  </w:comment>
   <w:comment w:id="5" w:author="Dave Bridges" w:date="2025-09-06T11:12:00Z" w:initials="DB">
     <w:p>
       <w:r>
@@ -3232,6 +3304,7 @@
   <w15:commentEx w15:paraId="3F27DAC3" w15:done="0"/>
   <w15:commentEx w15:paraId="392E4D0B" w15:done="0"/>
   <w15:commentEx w15:paraId="0A944B29" w15:done="0"/>
+  <w15:commentEx w15:paraId="1A8BEA8B" w15:done="0"/>
   <w15:commentEx w15:paraId="65C3D76B" w15:done="0"/>
 </w15:commentsEx>
 </file>
@@ -3243,6 +3316,7 @@
   <w16cex:commentExtensible w16cex:durableId="10479658" w16cex:dateUtc="2025-09-05T22:06:00Z"/>
   <w16cex:commentExtensible w16cex:durableId="4FC4BC49" w16cex:dateUtc="2025-09-05T23:38:00Z"/>
   <w16cex:commentExtensible w16cex:durableId="76FF026A" w16cex:dateUtc="2025-09-06T15:13:00Z"/>
+  <w16cex:commentExtensible w16cex:durableId="278D1F38" w16cex:dateUtc="2025-09-06T15:20:00Z"/>
   <w16cex:commentExtensible w16cex:durableId="353E7A50" w16cex:dateUtc="2025-09-06T15:12:00Z"/>
 </w16cex:commentsExtensible>
 </file>
@@ -3254,6 +3328,7 @@
   <w16cid:commentId w16cid:paraId="3F27DAC3" w16cid:durableId="10479658"/>
   <w16cid:commentId w16cid:paraId="392E4D0B" w16cid:durableId="4FC4BC49"/>
   <w16cid:commentId w16cid:paraId="0A944B29" w16cid:durableId="76FF026A"/>
+  <w16cid:commentId w16cid:paraId="1A8BEA8B" w16cid:durableId="278D1F38"/>
   <w16cid:commentId w16cid:paraId="65C3D76B" w16cid:durableId="353E7A50"/>
 </w16cid:commentsIds>
 </file>

</xml_diff>

<commit_message>
Added more detailed analysis of table 2
</commit_message>
<xml_diff>
--- a/manuscript/Cushings-Obesity/manuscript.docx
+++ b/manuscript/Cushings-Obesity/manuscript.docx
@@ -377,7 +377,13 @@
         <w:fldChar w:fldCharType="end"/>
       </w:r>
       <w:r>
-        <w:t>.  For participant demographics, Kruskal-Wallis or Mann-Whitney tests were used as both BMI and participant Age were not normally distributed (p&lt;0.05 via Shapiro-Wilk tests).  Chi-squared tests were used to compare counts across groups.</w:t>
+        <w:t>.  For participant demographics, Kruskal-Wallis or Mann-Whitney tests were used as both BMI and participant Age were not normally distributed (p&lt;0.05 via Shapiro-Wilk tests).  Chi-squared tests were used to compare counts across groups</w:t>
+      </w:r>
+      <w:r>
+        <w:t xml:space="preserve"> unless counts were expected to be under five per group, in which case Fisher’s exact test was used</w:t>
+      </w:r>
+      <w:r>
+        <w:t>.</w:t>
       </w:r>
     </w:p>
     <w:p>
@@ -407,6 +413,7 @@
       </w:r>
     </w:p>
     <w:p>
+      <w:commentRangeStart w:id="2"/>
       <w:r>
         <w:t xml:space="preserve">As shown in Figure 1, we identified YYYY participants with diagnoses of Cushing’s disease.  </w:t>
       </w:r>
@@ -415,6 +422,13 @@
       </w:r>
       <w:r>
         <w:t>Their average age at diagnosis was XXX (+/- XXX).  They</w:t>
+      </w:r>
+      <w:commentRangeEnd w:id="2"/>
+      <w:r>
+        <w:rPr>
+          <w:rStyle w:val="CommentReference"/>
+        </w:rPr>
+        <w:commentReference w:id="2"/>
       </w:r>
     </w:p>
     <w:p/>
@@ -536,16 +550,16 @@
       <w:r>
         <w:t xml:space="preserve">   Here we reproduce several notable characteristics, including a higher prevalence of Cushing’s disease in females </w:t>
       </w:r>
-      <w:commentRangeStart w:id="2"/>
+      <w:commentRangeStart w:id="3"/>
       <w:r>
         <w:t xml:space="preserve">(284 vs 72) </w:t>
       </w:r>
-      <w:commentRangeEnd w:id="2"/>
+      <w:commentRangeEnd w:id="3"/>
       <w:r>
         <w:rPr>
           <w:rStyle w:val="CommentReference"/>
         </w:rPr>
-        <w:commentReference w:id="2"/>
+        <w:commentReference w:id="3"/>
       </w:r>
       <w:r>
         <w:t>and a higher body mass index for patients with Cushing’s disease (both p&lt;0.001).</w:t>
@@ -553,7 +567,7 @@
       <w:r>
         <w:t xml:space="preserve">  </w:t>
       </w:r>
-      <w:commentRangeStart w:id="3"/>
+      <w:commentRangeStart w:id="4"/>
       <w:r>
         <w:t>Prior to matching for Race and Ethnicity, we noted that participants</w:t>
       </w:r>
@@ -561,7 +575,16 @@
         <w:t xml:space="preserve"> with Cushing’s disease were more likely to </w:t>
       </w:r>
       <w:r>
-        <w:t>identify as Non-Hispanic White (87%) than the overall Michigan Medicine participant population (75% Non-Hispanic White).</w:t>
+        <w:t>identify as Non-Hispanic White (87%) than the overall Michigan Medicine participant population (75% Non-Hispanic White</w:t>
+      </w:r>
+      <w:r>
+        <w:t>, p</w:t>
+      </w:r>
+      <w:r>
+        <w:t>&lt;0.001</w:t>
+      </w:r>
+      <w:r>
+        <w:t>).</w:t>
       </w:r>
       <w:r>
         <w:t xml:space="preserve">  Correspondingly</w:t>
@@ -570,14 +593,29 @@
         <w:t>,</w:t>
       </w:r>
       <w:r>
-        <w:t xml:space="preserve"> participants with Cushing’s disease were less likely to identify as Asian or Black</w:t>
-      </w:r>
-      <w:commentRangeEnd w:id="3"/>
+        <w:t xml:space="preserve"> participants with Cushing’s disease were less likely to identify as Asian </w:t>
+      </w:r>
+      <w:r>
+        <w:t xml:space="preserve">(p&lt;0.001) </w:t>
+      </w:r>
+      <w:r>
+        <w:t>or Black</w:t>
+      </w:r>
+      <w:commentRangeEnd w:id="4"/>
       <w:r>
         <w:rPr>
           <w:rStyle w:val="CommentReference"/>
         </w:rPr>
-        <w:commentReference w:id="3"/>
+        <w:commentReference w:id="4"/>
+      </w:r>
+      <w:r>
+        <w:t xml:space="preserve"> (p=0.01</w:t>
+      </w:r>
+      <w:r>
+        <w:t>8</w:t>
+      </w:r>
+      <w:r>
+        <w:t>)</w:t>
       </w:r>
       <w:r>
         <w:t>.</w:t>
@@ -597,22 +635,97 @@
         <w:t>2</w:t>
       </w:r>
       <w:r>
+        <w:t xml:space="preserve">, compared to </w:t>
+      </w:r>
+      <w:r>
+        <w:t>40</w:t>
+      </w:r>
+      <w:r>
+        <w:t>% controls (p&lt;0.001).</w:t>
+      </w:r>
+      <w:r>
+        <w:t xml:space="preserve">  </w:t>
+      </w:r>
+      <w:r>
+        <w:t xml:space="preserve">To understand the </w:t>
+      </w:r>
+      <w:r>
+        <w:t xml:space="preserve">cross-sectional </w:t>
+      </w:r>
+      <w:r>
+        <w:t>relationship between obesity and Cushing’s disease, we</w:t>
+      </w:r>
+      <w:r>
+        <w:t xml:space="preserve"> stratified our participants </w:t>
+      </w:r>
+      <w:r>
+        <w:t>with a BMI above or below 30 kg/m</w:t>
+      </w:r>
+      <w:r>
+        <w:rPr>
+          <w:vertAlign w:val="superscript"/>
+        </w:rPr>
+        <w:t>2</w:t>
+      </w:r>
+      <w:r>
+        <w:t xml:space="preserve">, </w:t>
+      </w:r>
+      <w:r>
+        <w:t>across</w:t>
+      </w:r>
+      <w:r>
+        <w:t xml:space="preserve"> both cases and controls</w:t>
+      </w:r>
+      <w:r>
+        <w:t>.  As shown in Table 2, and a</w:t>
+      </w:r>
+      <w:r>
+        <w:t xml:space="preserve">s expected given our stratification, the four groups differed </w:t>
+      </w:r>
+      <w:r>
+        <w:t>in</w:t>
+      </w:r>
+      <w:r>
+        <w:t xml:space="preserve"> several characteristics</w:t>
+      </w:r>
+      <w:r>
+        <w:t xml:space="preserve">, </w:t>
+      </w:r>
+      <w:r>
+        <w:t>which</w:t>
+      </w:r>
+      <w:r>
+        <w:t xml:space="preserve"> will be adjusted for in multivariable models below</w:t>
+      </w:r>
+      <w:r>
+        <w:t>.</w:t>
+      </w:r>
+      <w:r>
+        <w:t xml:space="preserve">  For example, among</w:t>
+      </w:r>
+      <w:r>
+        <w:t xml:space="preserve"> the subgroup of</w:t>
+      </w:r>
+      <w:r>
+        <w:t xml:space="preserve"> participants with a BMI &gt; 30 mg/m</w:t>
+      </w:r>
+      <w:r>
+        <w:rPr>
+          <w:vertAlign w:val="superscript"/>
+        </w:rPr>
+        <w:t>2</w:t>
+      </w:r>
+      <w:r>
+        <w:t>, participants with Cushing’s disease had a higher BMI than controls</w:t>
+      </w:r>
+      <w:r>
+        <w:t xml:space="preserve"> (p=0.0024 by a Mann-Whitney test)</w:t>
+      </w:r>
+      <w:r>
         <w:t xml:space="preserve">.  </w:t>
       </w:r>
       <w:r>
-        <w:t xml:space="preserve">To understand the </w:t>
-      </w:r>
-      <w:r>
-        <w:t xml:space="preserve">cross-sectional </w:t>
-      </w:r>
-      <w:r>
-        <w:t>relationship between obesity and Cushing’s disease, we</w:t>
-      </w:r>
-      <w:r>
-        <w:t xml:space="preserve"> next stratified our participants </w:t>
-      </w:r>
-      <w:r>
-        <w:t>with a BMI above or below 30 kg/m</w:t>
+        <w:t>Females with Cushing’s disease were more likely to have a BMI over 30 kg/m</w:t>
       </w:r>
       <w:r>
         <w:rPr>
@@ -621,137 +734,96 @@
         <w:t>2</w:t>
       </w:r>
       <w:r>
-        <w:t xml:space="preserve">, </w:t>
-      </w:r>
-      <w:r>
-        <w:t>across</w:t>
-      </w:r>
-      <w:r>
-        <w:t xml:space="preserve"> both cases and controls</w:t>
-      </w:r>
-      <w:r>
-        <w:t>.  As shown in Table 2, and a</w:t>
-      </w:r>
-      <w:r>
-        <w:t xml:space="preserve">s expected given our stratification, the four groups differed </w:t>
-      </w:r>
-      <w:r>
-        <w:t>in</w:t>
-      </w:r>
-      <w:r>
-        <w:t xml:space="preserve"> several characteristics</w:t>
-      </w:r>
-      <w:r>
-        <w:t xml:space="preserve">, </w:t>
-      </w:r>
-      <w:r>
-        <w:t>which</w:t>
-      </w:r>
-      <w:r>
-        <w:t xml:space="preserve"> will be adjusted for below in multivariable models below</w:t>
+        <w:t xml:space="preserve"> (68% </w:t>
+      </w:r>
+      <w:r>
+        <w:t xml:space="preserve">of </w:t>
+      </w:r>
+      <w:r>
+        <w:t xml:space="preserve">females </w:t>
+      </w:r>
+      <w:r>
+        <w:t>compared to</w:t>
+      </w:r>
+      <w:r>
+        <w:t xml:space="preserve"> 51% of males with Cushing’s disease, p=0.015).  </w:t>
+      </w:r>
+      <w:r>
+        <w:t>Among participants with Cushing’s disease, Asian (6</w:t>
+      </w:r>
+      <w:r>
+        <w:t xml:space="preserve"> out of </w:t>
+      </w:r>
+      <w:r>
+        <w:t xml:space="preserve">10) and Hispanic or Latino </w:t>
+      </w:r>
+      <w:r>
+        <w:t>(6</w:t>
+      </w:r>
+      <w:r>
+        <w:t xml:space="preserve"> out of </w:t>
+      </w:r>
+      <w:r>
+        <w:t xml:space="preserve">8) </w:t>
+      </w:r>
+      <w:r>
+        <w:t>participants were more likely have a BMI under 30 kg/m</w:t>
+      </w:r>
+      <w:r>
+        <w:rPr>
+          <w:vertAlign w:val="superscript"/>
+        </w:rPr>
+        <w:t xml:space="preserve">2 </w:t>
+      </w:r>
+      <w:r>
+        <w:t xml:space="preserve">compared to </w:t>
+      </w:r>
+      <w:r>
+        <w:t xml:space="preserve">the overall average </w:t>
+      </w:r>
+      <w:r>
+        <w:t>(</w:t>
+      </w:r>
+      <w:r>
+        <w:t>36%</w:t>
+      </w:r>
+      <w:r>
+        <w:t xml:space="preserve">, p=0.027 and 0.176 respectively via Fisher’s exact </w:t>
+      </w:r>
+      <w:r>
+        <w:lastRenderedPageBreak/>
+        <w:t>test</w:t>
+      </w:r>
+      <w:r>
+        <w:t>s</w:t>
+      </w:r>
+      <w:r>
+        <w:t xml:space="preserve">).  </w:t>
+      </w:r>
+      <w:r>
+        <w:t>The</w:t>
+      </w:r>
+      <w:r>
+        <w:t xml:space="preserve"> average age of </w:t>
+      </w:r>
+      <w:r>
+        <w:t xml:space="preserve">participants with </w:t>
+      </w:r>
+      <w:r>
+        <w:t>Cushing’s</w:t>
+      </w:r>
+      <w:r>
+        <w:t xml:space="preserve"> disease</w:t>
+      </w:r>
+      <w:r>
+        <w:t xml:space="preserve"> with or without obesity was similar</w:t>
+      </w:r>
+      <w:r>
+        <w:t xml:space="preserve"> after stratification</w:t>
       </w:r>
       <w:r>
         <w:t>.</w:t>
       </w:r>
-      <w:r>
-        <w:t xml:space="preserve">  For example, among participants with a BMI &gt; 30 mg/m</w:t>
-      </w:r>
-      <w:r>
-        <w:rPr>
-          <w:vertAlign w:val="superscript"/>
-        </w:rPr>
-        <w:t>2</w:t>
-      </w:r>
-      <w:r>
-        <w:t xml:space="preserve">, participants with Cushing’s disease had a </w:t>
-      </w:r>
-      <w:commentRangeStart w:id="4"/>
-      <w:r>
-        <w:t>higher BMI than controls</w:t>
-      </w:r>
-      <w:commentRangeEnd w:id="4"/>
-      <w:r>
-        <w:rPr>
-          <w:rStyle w:val="CommentReference"/>
-        </w:rPr>
-        <w:commentReference w:id="4"/>
-      </w:r>
-      <w:r>
-        <w:t xml:space="preserve">.  </w:t>
-      </w:r>
-      <w:commentRangeStart w:id="5"/>
-      <w:r>
-        <w:t>Males with Cushing’s disease were more likely to have a BMI under 30 kg/m</w:t>
-      </w:r>
-      <w:r>
-        <w:rPr>
-          <w:vertAlign w:val="superscript"/>
-        </w:rPr>
-        <w:t>2</w:t>
-      </w:r>
-      <w:r>
-        <w:t xml:space="preserve"> (28% of that group) than over 30 kg/m</w:t>
-      </w:r>
-      <w:r>
-        <w:rPr>
-          <w:vertAlign w:val="superscript"/>
-        </w:rPr>
-        <w:t>2</w:t>
-      </w:r>
-      <w:r>
-        <w:t xml:space="preserve"> (26% of that group).</w:t>
-      </w:r>
-      <w:commentRangeEnd w:id="5"/>
-      <w:r>
-        <w:t xml:space="preserve">  </w:t>
-      </w:r>
-      <w:r>
-        <w:t xml:space="preserve">People with Cushing’s disease and obesity were also moderately over-represented in </w:t>
-      </w:r>
-      <w:commentRangeStart w:id="6"/>
-      <w:r>
-        <w:t>Non-Hispanic White participants (90%) compared to Cushing’s patients with a BMI under 30 kg/m</w:t>
-      </w:r>
-      <w:r>
-        <w:rPr>
-          <w:vertAlign w:val="superscript"/>
-        </w:rPr>
-        <w:t>2</w:t>
-      </w:r>
-      <w:r>
-        <w:t xml:space="preserve"> (83% of that group). </w:t>
-      </w:r>
-      <w:commentRangeEnd w:id="6"/>
-      <w:r>
-        <w:rPr>
-          <w:rStyle w:val="CommentReference"/>
-        </w:rPr>
-        <w:commentReference w:id="6"/>
-      </w:r>
-      <w:r>
-        <w:t xml:space="preserve">The average age of </w:t>
-      </w:r>
-      <w:r>
-        <w:t xml:space="preserve">participants with </w:t>
-      </w:r>
-      <w:r>
-        <w:t>Cushing’s</w:t>
-      </w:r>
-      <w:r>
-        <w:t xml:space="preserve"> disease</w:t>
-      </w:r>
-      <w:r>
-        <w:t xml:space="preserve"> with or without obesity</w:t>
-      </w:r>
-      <w:r>
-        <w:rPr>
-          <w:rStyle w:val="CommentReference"/>
-        </w:rPr>
-        <w:commentReference w:id="5"/>
-      </w:r>
-      <w:r>
-        <w:t xml:space="preserve"> was similar.</w:t>
-      </w:r>
     </w:p>
     <w:p>
       <w:pPr>
@@ -761,7 +833,6 @@
         <w:rPr>
           <w:rStyle w:val="Heading2Char"/>
         </w:rPr>
-        <w:lastRenderedPageBreak/>
         <w:t>Primary outcomes and effect modification</w:t>
       </w:r>
     </w:p>
@@ -1029,6 +1100,7 @@
           <w:b/>
           <w:bCs/>
         </w:rPr>
+        <w:lastRenderedPageBreak/>
         <w:t>Table 2: Participant characteristics after stratification by obesity</w:t>
       </w:r>
       <w:r>
@@ -1059,7 +1131,6 @@
           <w:b/>
           <w:bCs/>
         </w:rPr>
-        <w:lastRenderedPageBreak/>
         <w:t>Supplementary Figure</w:t>
       </w:r>
       <w:r>
@@ -2536,6 +2607,7 @@
           <w:szCs w:val="18"/>
           <w14:ligatures w14:val="none"/>
         </w:rPr>
+        <w:lastRenderedPageBreak/>
         <w:t xml:space="preserve">   </w:t>
       </w:r>
       <w:r>
@@ -2638,7 +2710,6 @@
           <w:szCs w:val="18"/>
           <w14:ligatures w14:val="none"/>
         </w:rPr>
-        <w:lastRenderedPageBreak/>
         <w:t>-</w:t>
       </w:r>
       <w:r>
@@ -3209,7 +3280,7 @@
       </w:r>
     </w:p>
   </w:comment>
-  <w:comment w:id="2" w:author="Dave Bridges" w:date="2025-09-05T18:06:00Z" w:initials="DB">
+  <w:comment w:id="2" w:author="Dave Bridges" w:date="2025-09-07T14:40:00Z" w:initials="DB">
     <w:p>
       <w:r>
         <w:rPr>
@@ -3222,11 +3293,11 @@
           <w:sz w:val="20"/>
           <w:szCs w:val="20"/>
         </w:rPr>
-        <w:t>@trey are there other papers that describe this?</w:t>
+        <w:t>@trey can you describe this part, and enter details in the methods of how this was done</w:t>
       </w:r>
     </w:p>
   </w:comment>
-  <w:comment w:id="3" w:author="Dave Bridges" w:date="2025-09-05T19:38:00Z" w:initials="DB">
+  <w:comment w:id="3" w:author="Dave Bridges" w:date="2025-09-05T18:06:00Z" w:initials="DB">
     <w:p>
       <w:r>
         <w:rPr>
@@ -3239,11 +3310,11 @@
           <w:sz w:val="20"/>
           <w:szCs w:val="20"/>
         </w:rPr>
-        <w:t>@trey also any data on demographic propensities towards Cushings we can cite?</w:t>
+        <w:t>@trey are there other papers that describe this?</w:t>
       </w:r>
     </w:p>
   </w:comment>
-  <w:comment w:id="4" w:author="Dave Bridges" w:date="2025-09-06T11:13:00Z" w:initials="DB">
+  <w:comment w:id="4" w:author="Dave Bridges" w:date="2025-09-05T19:38:00Z" w:initials="DB">
     <w:p>
       <w:r>
         <w:rPr>
@@ -3256,41 +3327,7 @@
           <w:sz w:val="20"/>
           <w:szCs w:val="20"/>
         </w:rPr>
-        <w:t>Need to calculate p-value</w:t>
-      </w:r>
-    </w:p>
-  </w:comment>
-  <w:comment w:id="6" w:author="Dave Bridges" w:date="2025-09-06T11:20:00Z" w:initials="DB">
-    <w:p>
-      <w:r>
-        <w:rPr>
-          <w:rStyle w:val="CommentReference"/>
-        </w:rPr>
-        <w:annotationRef/>
-      </w:r>
-      <w:r>
-        <w:rPr>
-          <w:sz w:val="20"/>
-          <w:szCs w:val="20"/>
-        </w:rPr>
-        <w:t>Calculate p-value for this</w:t>
-      </w:r>
-    </w:p>
-  </w:comment>
-  <w:comment w:id="5" w:author="Dave Bridges" w:date="2025-09-06T11:12:00Z" w:initials="DB">
-    <w:p>
-      <w:r>
-        <w:rPr>
-          <w:rStyle w:val="CommentReference"/>
-        </w:rPr>
-        <w:annotationRef/>
-      </w:r>
-      <w:r>
-        <w:rPr>
-          <w:sz w:val="20"/>
-          <w:szCs w:val="20"/>
-        </w:rPr>
-        <w:t>Need to calculate p-value</w:t>
+        <w:t>@trey also any data on demographic propensities towards Cushings we can cite?</w:t>
       </w:r>
     </w:p>
   </w:comment>
@@ -3301,11 +3338,9 @@
 <w15:commentsEx xmlns:wpc="http://schemas.microsoft.com/office/word/2010/wordprocessingCanvas" xmlns:cx="http://schemas.microsoft.com/office/drawing/2014/chartex" xmlns:cx1="http://schemas.microsoft.com/office/drawing/2015/9/8/chartex" xmlns:cx2="http://schemas.microsoft.com/office/drawing/2015/10/21/chartex" xmlns:cx3="http://schemas.microsoft.com/office/drawing/2016/5/9/chartex" xmlns:cx4="http://schemas.microsoft.com/office/drawing/2016/5/10/chartex" xmlns:cx5="http://schemas.microsoft.com/office/drawing/2016/5/11/chartex" xmlns:cx6="http://schemas.microsoft.com/office/drawing/2016/5/12/chartex" xmlns:cx7="http://schemas.microsoft.com/office/drawing/2016/5/13/chartex" xmlns:cx8="http://schemas.microsoft.com/office/drawing/2016/5/14/chartex" xmlns:mc="http://schemas.openxmlformats.org/markup-compatibility/2006" xmlns:aink="http://schemas.microsoft.com/office/drawing/2016/ink" xmlns:am3d="http://schemas.microsoft.com/office/drawing/2017/model3d" xmlns:o="urn:schemas-microsoft-com:office:office" xmlns:oel="http://schemas.microsoft.com/office/2019/extlst" xmlns:r="http://schemas.openxmlformats.org/officeDocument/2006/relationships" xmlns:m="http://schemas.openxmlformats.org/officeDocument/2006/math" xmlns:v="urn:schemas-microsoft-com:vml" xmlns:wp14="http://schemas.microsoft.com/office/word/2010/wordprocessingDrawing" xmlns:wp="http://schemas.openxmlformats.org/drawingml/2006/wordprocessingDrawing" xmlns:w10="urn:schemas-microsoft-com:office:word" xmlns:w="http://schemas.openxmlformats.org/wordprocessingml/2006/main" xmlns:w14="http://schemas.microsoft.com/office/word/2010/wordml" xmlns:w15="http://schemas.microsoft.com/office/word/2012/wordml" xmlns:w16cex="http://schemas.microsoft.com/office/word/2018/wordml/cex" xmlns:w16cid="http://schemas.microsoft.com/office/word/2016/wordml/cid" xmlns:w16="http://schemas.microsoft.com/office/word/2018/wordml" xmlns:w16du="http://schemas.microsoft.com/office/word/2023/wordml/word16du" xmlns:w16sdtdh="http://schemas.microsoft.com/office/word/2020/wordml/sdtdatahash" xmlns:w16sdtfl="http://schemas.microsoft.com/office/word/2024/wordml/sdtformatlock" xmlns:w16se="http://schemas.microsoft.com/office/word/2015/wordml/symex" xmlns:wpg="http://schemas.microsoft.com/office/word/2010/wordprocessingGroup" xmlns:wpi="http://schemas.microsoft.com/office/word/2010/wordprocessingInk" xmlns:wne="http://schemas.microsoft.com/office/word/2006/wordml" xmlns:wps="http://schemas.microsoft.com/office/word/2010/wordprocessingShape" mc:Ignorable="w14 w15 w16se w16cid w16 w16cex w16sdtdh w16sdtfl w16du wp14">
   <w15:commentEx w15:paraId="4DBE4D40" w15:done="0"/>
   <w15:commentEx w15:paraId="1DD21AA1" w15:done="0"/>
+  <w15:commentEx w15:paraId="2B4220B9" w15:done="0"/>
   <w15:commentEx w15:paraId="3F27DAC3" w15:done="0"/>
   <w15:commentEx w15:paraId="392E4D0B" w15:done="0"/>
-  <w15:commentEx w15:paraId="0A944B29" w15:done="0"/>
-  <w15:commentEx w15:paraId="1A8BEA8B" w15:done="0"/>
-  <w15:commentEx w15:paraId="65C3D76B" w15:done="0"/>
 </w15:commentsEx>
 </file>
 
@@ -3313,11 +3348,9 @@
 <w16cex:commentsExtensible xmlns:wpc="http://schemas.microsoft.com/office/word/2010/wordprocessingCanvas" xmlns:cx="http://schemas.microsoft.com/office/drawing/2014/chartex" xmlns:cx1="http://schemas.microsoft.com/office/drawing/2015/9/8/chartex" xmlns:cx2="http://schemas.microsoft.com/office/drawing/2015/10/21/chartex" xmlns:cx3="http://schemas.microsoft.com/office/drawing/2016/5/9/chartex" xmlns:cx4="http://schemas.microsoft.com/office/drawing/2016/5/10/chartex" xmlns:cx5="http://schemas.microsoft.com/office/drawing/2016/5/11/chartex" xmlns:cx6="http://schemas.microsoft.com/office/drawing/2016/5/12/chartex" xmlns:cx7="http://schemas.microsoft.com/office/drawing/2016/5/13/chartex" xmlns:cx8="http://schemas.microsoft.com/office/drawing/2016/5/14/chartex" xmlns:cr="http://schemas.microsoft.com/office/comments/2020/reactions" xmlns:mc="http://schemas.openxmlformats.org/markup-compatibility/2006" xmlns:aink="http://schemas.microsoft.com/office/drawing/2016/ink" xmlns:am3d="http://schemas.microsoft.com/office/drawing/2017/model3d" xmlns:o="urn:schemas-microsoft-com:office:office" xmlns:oel="http://schemas.microsoft.com/office/2019/extlst" xmlns:r="http://schemas.openxmlformats.org/officeDocument/2006/relationships" xmlns:m="http://schemas.openxmlformats.org/officeDocument/2006/math" xmlns:v="urn:schemas-microsoft-com:vml" xmlns:wp14="http://schemas.microsoft.com/office/word/2010/wordprocessingDrawing" xmlns:wp="http://schemas.openxmlformats.org/drawingml/2006/wordprocessingDrawing" xmlns:w10="urn:schemas-microsoft-com:office:word" xmlns:w="http://schemas.openxmlformats.org/wordprocessingml/2006/main" xmlns:w14="http://schemas.microsoft.com/office/word/2010/wordml" xmlns:w15="http://schemas.microsoft.com/office/word/2012/wordml" xmlns:w16cex="http://schemas.microsoft.com/office/word/2018/wordml/cex" xmlns:w16cid="http://schemas.microsoft.com/office/word/2016/wordml/cid" xmlns:w16="http://schemas.microsoft.com/office/word/2018/wordml" xmlns:w16du="http://schemas.microsoft.com/office/word/2023/wordml/word16du" xmlns:w16sdtdh="http://schemas.microsoft.com/office/word/2020/wordml/sdtdatahash" xmlns:w16sdtfl="http://schemas.microsoft.com/office/word/2024/wordml/sdtformatlock" xmlns:w16se="http://schemas.microsoft.com/office/word/2015/wordml/symex" xmlns:wpg="http://schemas.microsoft.com/office/word/2010/wordprocessingGroup" xmlns:wpi="http://schemas.microsoft.com/office/word/2010/wordprocessingInk" xmlns:wne="http://schemas.microsoft.com/office/word/2006/wordml" xmlns:wps="http://schemas.microsoft.com/office/word/2010/wordprocessingShape" mc:Ignorable="w14 w15 w16se w16cid w16 w16cex w16sdtdh w16sdtfl cr w16du wp14">
   <w16cex:commentExtensible w16cex:durableId="68EF662C" w16cex:dateUtc="2025-09-05T15:11:00Z"/>
   <w16cex:commentExtensible w16cex:durableId="1A95B88A" w16cex:dateUtc="2025-09-05T23:50:00Z"/>
+  <w16cex:commentExtensible w16cex:durableId="73524BEF" w16cex:dateUtc="2025-09-07T18:40:00Z"/>
   <w16cex:commentExtensible w16cex:durableId="10479658" w16cex:dateUtc="2025-09-05T22:06:00Z"/>
   <w16cex:commentExtensible w16cex:durableId="4FC4BC49" w16cex:dateUtc="2025-09-05T23:38:00Z"/>
-  <w16cex:commentExtensible w16cex:durableId="76FF026A" w16cex:dateUtc="2025-09-06T15:13:00Z"/>
-  <w16cex:commentExtensible w16cex:durableId="278D1F38" w16cex:dateUtc="2025-09-06T15:20:00Z"/>
-  <w16cex:commentExtensible w16cex:durableId="353E7A50" w16cex:dateUtc="2025-09-06T15:12:00Z"/>
 </w16cex:commentsExtensible>
 </file>
 
@@ -3325,11 +3358,9 @@
 <w16cid:commentsIds xmlns:wpc="http://schemas.microsoft.com/office/word/2010/wordprocessingCanvas" xmlns:cx="http://schemas.microsoft.com/office/drawing/2014/chartex" xmlns:cx1="http://schemas.microsoft.com/office/drawing/2015/9/8/chartex" xmlns:cx2="http://schemas.microsoft.com/office/drawing/2015/10/21/chartex" xmlns:cx3="http://schemas.microsoft.com/office/drawing/2016/5/9/chartex" xmlns:cx4="http://schemas.microsoft.com/office/drawing/2016/5/10/chartex" xmlns:cx5="http://schemas.microsoft.com/office/drawing/2016/5/11/chartex" xmlns:cx6="http://schemas.microsoft.com/office/drawing/2016/5/12/chartex" xmlns:cx7="http://schemas.microsoft.com/office/drawing/2016/5/13/chartex" xmlns:cx8="http://schemas.microsoft.com/office/drawing/2016/5/14/chartex" xmlns:mc="http://schemas.openxmlformats.org/markup-compatibility/2006" xmlns:aink="http://schemas.microsoft.com/office/drawing/2016/ink" xmlns:am3d="http://schemas.microsoft.com/office/drawing/2017/model3d" xmlns:o="urn:schemas-microsoft-com:office:office" xmlns:oel="http://schemas.microsoft.com/office/2019/extlst" xmlns:r="http://schemas.openxmlformats.org/officeDocument/2006/relationships" xmlns:m="http://schemas.openxmlformats.org/officeDocument/2006/math" xmlns:v="urn:schemas-microsoft-com:vml" xmlns:wp14="http://schemas.microsoft.com/office/word/2010/wordprocessingDrawing" xmlns:wp="http://schemas.openxmlformats.org/drawingml/2006/wordprocessingDrawing" xmlns:w10="urn:schemas-microsoft-com:office:word" xmlns:w="http://schemas.openxmlformats.org/wordprocessingml/2006/main" xmlns:w14="http://schemas.microsoft.com/office/word/2010/wordml" xmlns:w15="http://schemas.microsoft.com/office/word/2012/wordml" xmlns:w16cex="http://schemas.microsoft.com/office/word/2018/wordml/cex" xmlns:w16cid="http://schemas.microsoft.com/office/word/2016/wordml/cid" xmlns:w16="http://schemas.microsoft.com/office/word/2018/wordml" xmlns:w16du="http://schemas.microsoft.com/office/word/2023/wordml/word16du" xmlns:w16sdtdh="http://schemas.microsoft.com/office/word/2020/wordml/sdtdatahash" xmlns:w16sdtfl="http://schemas.microsoft.com/office/word/2024/wordml/sdtformatlock" xmlns:w16se="http://schemas.microsoft.com/office/word/2015/wordml/symex" xmlns:wpg="http://schemas.microsoft.com/office/word/2010/wordprocessingGroup" xmlns:wpi="http://schemas.microsoft.com/office/word/2010/wordprocessingInk" xmlns:wne="http://schemas.microsoft.com/office/word/2006/wordml" xmlns:wps="http://schemas.microsoft.com/office/word/2010/wordprocessingShape" mc:Ignorable="w14 w15 w16se w16cid w16 w16cex w16sdtdh w16sdtfl w16du wp14">
   <w16cid:commentId w16cid:paraId="4DBE4D40" w16cid:durableId="68EF662C"/>
   <w16cid:commentId w16cid:paraId="1DD21AA1" w16cid:durableId="1A95B88A"/>
+  <w16cid:commentId w16cid:paraId="2B4220B9" w16cid:durableId="73524BEF"/>
   <w16cid:commentId w16cid:paraId="3F27DAC3" w16cid:durableId="10479658"/>
   <w16cid:commentId w16cid:paraId="392E4D0B" w16cid:durableId="4FC4BC49"/>
-  <w16cid:commentId w16cid:paraId="0A944B29" w16cid:durableId="76FF026A"/>
-  <w16cid:commentId w16cid:paraId="1A8BEA8B" w16cid:durableId="278D1F38"/>
-  <w16cid:commentId w16cid:paraId="65C3D76B" w16cid:durableId="353E7A50"/>
 </w16cid:commentsIds>
 </file>
 

</xml_diff>

<commit_message>
Updated script generating interaction data, and updating barplots
</commit_message>
<xml_diff>
--- a/manuscript/Cushings-Obesity/manuscript.docx
+++ b/manuscript/Cushings-Obesity/manuscript.docx
@@ -84,15 +84,27 @@
         <w:t xml:space="preserve"> </w:t>
       </w:r>
       <w:r>
-        <w:t xml:space="preserve">To identify when patients were </w:t>
-      </w:r>
-      <w:proofErr w:type="gramStart"/>
-      <w:r>
-        <w:t>treated</w:t>
-      </w:r>
-      <w:proofErr w:type="gramEnd"/>
-      <w:r>
-        <w:t xml:space="preserve"> we included procedure codes YYY.</w:t>
+        <w:t>To identify when patients were treated</w:t>
+      </w:r>
+      <w:r>
+        <w:t xml:space="preserve"> via surgery,</w:t>
+      </w:r>
+      <w:r>
+        <w:t xml:space="preserve"> we included procedure codes </w:t>
+      </w:r>
+      <w:commentRangeStart w:id="1"/>
+      <w:r>
+        <w:t>YYY</w:t>
+      </w:r>
+      <w:commentRangeEnd w:id="1"/>
+      <w:r>
+        <w:rPr>
+          <w:rStyle w:val="CommentReference"/>
+        </w:rPr>
+        <w:commentReference w:id="1"/>
+      </w:r>
+      <w:r>
+        <w:t>.</w:t>
       </w:r>
       <w:r>
         <w:t xml:space="preserve">  We excluded participants if they </w:t>
@@ -100,8 +112,19 @@
       <w:r>
         <w:t xml:space="preserve">were </w:t>
       </w:r>
-      <w:r>
-        <w:t>YYY.</w:t>
+      <w:commentRangeStart w:id="2"/>
+      <w:r>
+        <w:t>YYY</w:t>
+      </w:r>
+      <w:commentRangeEnd w:id="2"/>
+      <w:r>
+        <w:rPr>
+          <w:rStyle w:val="CommentReference"/>
+        </w:rPr>
+        <w:commentReference w:id="2"/>
+      </w:r>
+      <w:r>
+        <w:t>.</w:t>
       </w:r>
       <w:r>
         <w:t xml:space="preserve">  Race and ethnicity were self-reported, with groups of &lt;10 aggregated into the other category.</w:t>
@@ -174,68 +197,60 @@
         <w:t xml:space="preserve">and potential controls with that measurement available. </w:t>
       </w:r>
       <w:r>
-        <w:t xml:space="preserve">For Cushing’s cases to be included they had to have had the laboratory </w:t>
-      </w:r>
-      <w:proofErr w:type="gramStart"/>
-      <w:r>
-        <w:t>measure</w:t>
+        <w:t>For Cushing’s cases to be included they had to have had the laboratory measure</w:t>
+      </w:r>
+      <w:r>
+        <w:t>d</w:t>
       </w:r>
       <w:r>
         <w:t xml:space="preserve"> </w:t>
       </w:r>
       <w:r>
+        <w:t xml:space="preserve">30 days or fewer </w:t>
+      </w:r>
+      <w:r>
+        <w:t xml:space="preserve">prior to surgical treatment.  </w:t>
+      </w:r>
+      <w:r>
+        <w:t>We performed nearest</w:t>
+      </w:r>
+      <w:r>
+        <w:rPr>
+          <w:rFonts w:ascii="Cambria Math" w:hAnsi="Cambria Math" w:cs="Cambria Math"/>
+        </w:rPr>
+        <w:t>‐</w:t>
+      </w:r>
+      <w:r>
+        <w:t xml:space="preserve">neighbor propensity score matching (ratio = </w:t>
+      </w:r>
+      <w:r>
+        <w:t>10:1</w:t>
+      </w:r>
+      <w:r>
+        <w:t xml:space="preserve">) with age in the </w:t>
+      </w:r>
+      <w:r>
+        <w:t>propensity score</w:t>
+      </w:r>
+      <w:r>
+        <w:t xml:space="preserve"> model and exact matching on gender and race/ethnicity</w:t>
+      </w:r>
+      <w:r>
+        <w:t xml:space="preserve"> from a pool of </w:t>
+      </w:r>
+      <w:r>
+        <w:t>70</w:t>
+      </w:r>
+      <w:r>
+        <w:t>,</w:t>
+      </w:r>
+      <w:r>
+        <w:t>327</w:t>
+      </w:r>
+      <w:r>
         <w:t xml:space="preserve"> </w:t>
       </w:r>
       <w:r>
-        <w:t>30</w:t>
-      </w:r>
-      <w:proofErr w:type="gramEnd"/>
-      <w:r>
-        <w:t xml:space="preserve"> days or fewer </w:t>
-      </w:r>
-      <w:r>
-        <w:t xml:space="preserve">prior to surgical treatment.  </w:t>
-      </w:r>
-      <w:r>
-        <w:t>We performed nearest</w:t>
-      </w:r>
-      <w:r>
-        <w:rPr>
-          <w:rFonts w:ascii="Cambria Math" w:hAnsi="Cambria Math" w:cs="Cambria Math"/>
-        </w:rPr>
-        <w:t>‐</w:t>
-      </w:r>
-      <w:r>
-        <w:t xml:space="preserve">neighbor propensity score matching (ratio = </w:t>
-      </w:r>
-      <w:r>
-        <w:t>10:1</w:t>
-      </w:r>
-      <w:r>
-        <w:t xml:space="preserve">) with age in the </w:t>
-      </w:r>
-      <w:r>
-        <w:t>propensity score</w:t>
-      </w:r>
-      <w:r>
-        <w:t xml:space="preserve"> model and exact matching on gender and race/ethnicity</w:t>
-      </w:r>
-      <w:r>
-        <w:t xml:space="preserve"> from a pool of </w:t>
-      </w:r>
-      <w:r>
-        <w:t>70</w:t>
-      </w:r>
-      <w:r>
-        <w:t>,</w:t>
-      </w:r>
-      <w:r>
-        <w:t>327</w:t>
-      </w:r>
-      <w:r>
-        <w:t xml:space="preserve"> </w:t>
-      </w:r>
-      <w:r>
         <w:t>Michigan Medicine patients</w:t>
       </w:r>
       <w:r>
@@ -287,12 +302,12 @@
         <w:t xml:space="preserve">As a sensitivity analysis we also created a single matched cohort using participants with </w:t>
       </w:r>
       <w:r>
-        <w:t>any of the laboratory results we tested (glucose, HbA1c, ALT, blood pressure, or LDL-cholesterol)</w:t>
+        <w:t>any of the laboratory results we tested (glucose, HbA1c, ALT, blood pressure, r LDL-cholesterol)</w:t>
       </w:r>
       <w:r>
         <w:t xml:space="preserve"> and </w:t>
       </w:r>
-      <w:commentRangeStart w:id="1"/>
+      <w:commentRangeStart w:id="3"/>
       <w:r>
         <w:t xml:space="preserve">repeated all outcome models </w:t>
       </w:r>
@@ -302,12 +317,12 @@
       <w:r>
         <w:t>.</w:t>
       </w:r>
-      <w:commentRangeEnd w:id="1"/>
+      <w:commentRangeEnd w:id="3"/>
       <w:r>
         <w:rPr>
           <w:rStyle w:val="CommentReference"/>
         </w:rPr>
-        <w:commentReference w:id="1"/>
+        <w:commentReference w:id="3"/>
       </w:r>
     </w:p>
     <w:p>
@@ -377,7 +392,19 @@
         <w:fldChar w:fldCharType="end"/>
       </w:r>
       <w:r>
-        <w:t>.  For participant demographics, Kruskal-Wallis or Mann-Whitney tests were used as both BMI and participant Age were not normally distributed (p&lt;0.05 via Shapiro-Wilk tests).  Chi-squared tests were used to compare counts across groups</w:t>
+        <w:t xml:space="preserve">.  For participant demographics, Kruskal-Wallis or Mann-Whitney tests were used as both BMI and participant Age were not normally distributed (p&lt;0.05 via Shapiro-Wilk tests).  </w:t>
+      </w:r>
+      <w:r>
+        <w:t>χ</w:t>
+      </w:r>
+      <w:r>
+        <w:rPr>
+          <w:vertAlign w:val="superscript"/>
+        </w:rPr>
+        <w:t>2</w:t>
+      </w:r>
+      <w:r>
+        <w:t xml:space="preserve"> tests were used to compare counts across groups</w:t>
       </w:r>
       <w:r>
         <w:t xml:space="preserve"> unless counts were expected to be under five per group, in which case Fisher’s exact test was used</w:t>
@@ -413,7 +440,7 @@
       </w:r>
     </w:p>
     <w:p>
-      <w:commentRangeStart w:id="2"/>
+      <w:commentRangeStart w:id="4"/>
       <w:r>
         <w:t xml:space="preserve">As shown in Figure 1, we identified YYYY participants with diagnoses of Cushing’s disease.  </w:t>
       </w:r>
@@ -423,12 +450,12 @@
       <w:r>
         <w:t>Their average age at diagnosis was XXX (+/- XXX).  They</w:t>
       </w:r>
-      <w:commentRangeEnd w:id="2"/>
+      <w:commentRangeEnd w:id="4"/>
       <w:r>
         <w:rPr>
           <w:rStyle w:val="CommentReference"/>
         </w:rPr>
-        <w:commentReference w:id="2"/>
+        <w:commentReference w:id="4"/>
       </w:r>
     </w:p>
     <w:p/>
@@ -550,16 +577,16 @@
       <w:r>
         <w:t xml:space="preserve">   Here we reproduce several notable characteristics, including a higher prevalence of Cushing’s disease in females </w:t>
       </w:r>
-      <w:commentRangeStart w:id="3"/>
+      <w:commentRangeStart w:id="5"/>
       <w:r>
         <w:t xml:space="preserve">(284 vs 72) </w:t>
       </w:r>
-      <w:commentRangeEnd w:id="3"/>
+      <w:commentRangeEnd w:id="5"/>
       <w:r>
         <w:rPr>
           <w:rStyle w:val="CommentReference"/>
         </w:rPr>
-        <w:commentReference w:id="3"/>
+        <w:commentReference w:id="5"/>
       </w:r>
       <w:r>
         <w:t>and a higher body mass index for patients with Cushing’s disease (both p&lt;0.001).</w:t>
@@ -567,7 +594,7 @@
       <w:r>
         <w:t xml:space="preserve">  </w:t>
       </w:r>
-      <w:commentRangeStart w:id="4"/>
+      <w:commentRangeStart w:id="6"/>
       <w:r>
         <w:t>Prior to matching for Race and Ethnicity, we noted that participants</w:t>
       </w:r>
@@ -601,12 +628,12 @@
       <w:r>
         <w:t>or Black</w:t>
       </w:r>
-      <w:commentRangeEnd w:id="4"/>
+      <w:commentRangeEnd w:id="6"/>
       <w:r>
         <w:rPr>
           <w:rStyle w:val="CommentReference"/>
         </w:rPr>
-        <w:commentReference w:id="4"/>
+        <w:commentReference w:id="6"/>
       </w:r>
       <w:r>
         <w:t xml:space="preserve"> (p=0.01</w:t>
@@ -914,6 +941,87 @@
     </w:p>
     <w:p>
       <w:pPr>
+        <w:pStyle w:val="NormalWeb"/>
+        <w:numPr>
+          <w:ilvl w:val="0"/>
+          <w:numId w:val="5"/>
+        </w:numPr>
+      </w:pPr>
+      <w:r>
+        <w:t>No covariates</w:t>
+      </w:r>
+    </w:p>
+    <w:p>
+      <w:pPr>
+        <w:pStyle w:val="NormalWeb"/>
+        <w:numPr>
+          <w:ilvl w:val="0"/>
+          <w:numId w:val="5"/>
+        </w:numPr>
+      </w:pPr>
+      <w:r>
+        <w:t xml:space="preserve">BMI instead of Obesity, </w:t>
+      </w:r>
+      <w:proofErr w:type="gramStart"/>
+      <w:r>
+        <w:t>ns(</w:t>
+      </w:r>
+      <w:proofErr w:type="gramEnd"/>
+      <w:r>
+        <w:t xml:space="preserve">BMI, </w:t>
+      </w:r>
+      <w:proofErr w:type="spellStart"/>
+      <w:r>
+        <w:t>df</w:t>
+      </w:r>
+      <w:proofErr w:type="spellEnd"/>
+      <w:r>
+        <w:t>=3) instead of Obesity</w:t>
+      </w:r>
+    </w:p>
+    <w:p>
+      <w:pPr>
+        <w:pStyle w:val="NormalWeb"/>
+        <w:numPr>
+          <w:ilvl w:val="0"/>
+          <w:numId w:val="5"/>
+        </w:numPr>
+      </w:pPr>
+      <w:proofErr w:type="spellStart"/>
+      <w:r>
+        <w:t>Cushings</w:t>
+      </w:r>
+      <w:proofErr w:type="spellEnd"/>
+      <w:r>
+        <w:t xml:space="preserve"> x Sex</w:t>
+      </w:r>
+    </w:p>
+    <w:p>
+      <w:pPr>
+        <w:pStyle w:val="NormalWeb"/>
+        <w:numPr>
+          <w:ilvl w:val="0"/>
+          <w:numId w:val="5"/>
+        </w:numPr>
+      </w:pPr>
+      <w:r>
+        <w:t>Different matching ratios</w:t>
+      </w:r>
+    </w:p>
+    <w:p>
+      <w:pPr>
+        <w:pStyle w:val="NormalWeb"/>
+        <w:numPr>
+          <w:ilvl w:val="0"/>
+          <w:numId w:val="5"/>
+        </w:numPr>
+      </w:pPr>
+      <w:r>
+        <w:t>IPTW</w:t>
+      </w:r>
+    </w:p>
+    <w:p>
+      <w:pPr>
         <w:pStyle w:val="Heading1"/>
       </w:pPr>
       <w:r>
@@ -1046,226 +1154,308 @@
           <w:b/>
           <w:bCs/>
         </w:rPr>
-        <w:t>Table 1: Participant characteristics</w:t>
+        <w:t xml:space="preserve">Figure 2: </w:t>
       </w:r>
       <w:r>
         <w:rPr>
           <w:b/>
           <w:bCs/>
         </w:rPr>
-        <w:t xml:space="preserve"> after </w:t>
-      </w:r>
+        <w:t xml:space="preserve">Effects of Cushing’s disease and Obesity on Laboratory Values.  </w:t>
+      </w:r>
+      <w:r>
+        <w:t xml:space="preserve">Laboratory values were within 30 days of Cushing’s disease surgery for cases.  Obesity was defined as a BMI </w:t>
+      </w:r>
+      <w:r>
+        <w:lastRenderedPageBreak/>
+        <w:t>above or below 30 kg/m</w:t>
+      </w:r>
+      <w:r>
+        <w:rPr>
+          <w:vertAlign w:val="superscript"/>
+        </w:rPr>
+        <w:t>2</w:t>
+      </w:r>
+      <w:r>
+        <w:t xml:space="preserve">.  </w:t>
+      </w:r>
+      <w:r>
+        <w:t>Data are presented as mean</w:t>
+      </w:r>
+      <w:r>
+        <w:t>s with a 95% confidence interval</w:t>
+      </w:r>
+      <w:r>
+        <w:t>, with ligh</w:t>
+      </w:r>
+      <w:r>
+        <w:t>t</w:t>
+      </w:r>
+      <w:r>
+        <w:t>er grey indicating data from participants with Cushing’s disease</w:t>
+      </w:r>
+      <w:r>
+        <w:t>.</w:t>
+      </w:r>
+      <w:r>
+        <w:t xml:space="preserve">   Table 3 reports adjusted p-values for effects of Cushing’s disease and the interaction between disease and obesity.</w:t>
+      </w:r>
+    </w:p>
+    <w:p>
+      <w:pPr>
+        <w:pStyle w:val="NormalWeb"/>
+      </w:pPr>
       <w:r>
         <w:rPr>
           <w:b/>
           <w:bCs/>
         </w:rPr>
-        <w:t xml:space="preserve">covariate </w:t>
+        <w:t>Table 1: Participant characteristics</w:t>
       </w:r>
       <w:r>
         <w:rPr>
           <w:b/>
           <w:bCs/>
         </w:rPr>
-        <w:t>matching.</w:t>
-      </w:r>
-      <w:r>
-        <w:t xml:space="preserve">  Participants were matched for age, gender and race/ethnicity but not BMI.  This table represents the matched set for </w:t>
-      </w:r>
-      <w:r>
-        <w:t xml:space="preserve">patients with </w:t>
-      </w:r>
-      <w:r>
-        <w:t xml:space="preserve">Cushing’s </w:t>
-      </w:r>
-      <w:r>
-        <w:t>disease</w:t>
-      </w:r>
-      <w:r>
-        <w:t xml:space="preserve"> with any laboratory value we considered.  Supplementary Tables S2A-E describe outcome-specific matched </w:t>
-      </w:r>
-      <w:r>
-        <w:t>characteristics</w:t>
-      </w:r>
-      <w:r>
-        <w:t>.</w:t>
-      </w:r>
-    </w:p>
-    <w:p>
-      <w:pPr>
-        <w:pStyle w:val="NormalWeb"/>
-      </w:pPr>
+        <w:t xml:space="preserve"> after </w:t>
+      </w:r>
       <w:r>
         <w:rPr>
           <w:b/>
           <w:bCs/>
         </w:rPr>
-        <w:lastRenderedPageBreak/>
-        <w:t>Table 2: Participant characteristics after stratification by obesity</w:t>
-      </w:r>
-      <w:r>
-        <w:t xml:space="preserve">.  </w:t>
-      </w:r>
-      <w:r>
-        <w:t xml:space="preserve">Values are mean ± SD or n (%). Groups were stratified by Cushing’s status and obesity; no matching was performed across these strata. </w:t>
-      </w:r>
-      <w:r>
-        <w:t>Kruskal-Wallis</w:t>
-      </w:r>
-      <w:r>
-        <w:t xml:space="preserve"> or χ² compare across the four groups</w:t>
-      </w:r>
-      <w:r>
-        <w:t xml:space="preserve"> to generate p-values</w:t>
-      </w:r>
-      <w:r>
-        <w:t>.</w:t>
-      </w:r>
-    </w:p>
-    <w:p>
-      <w:pPr>
-        <w:pStyle w:val="NormalWeb"/>
-      </w:pPr>
+        <w:t xml:space="preserve">covariate </w:t>
+      </w:r>
       <w:r>
         <w:rPr>
           <w:b/>
           <w:bCs/>
         </w:rPr>
-        <w:t>Supplementary Figure</w:t>
-      </w:r>
+        <w:t>matching.</w:t>
+      </w:r>
+      <w:r>
+        <w:t xml:space="preserve">  Participants were matched for age, gender and race/ethnicity but not BMI.  This table represents the matched set for </w:t>
+      </w:r>
+      <w:r>
+        <w:t xml:space="preserve">patients with </w:t>
+      </w:r>
+      <w:r>
+        <w:t xml:space="preserve">Cushing’s </w:t>
+      </w:r>
+      <w:r>
+        <w:t>disease</w:t>
+      </w:r>
+      <w:r>
+        <w:t xml:space="preserve"> with any laboratory value we considered.  Supplementary Tables S2A-E describe outcome-specific matched </w:t>
+      </w:r>
+      <w:r>
+        <w:t>characteristics</w:t>
+      </w:r>
+      <w:r>
+        <w:t>.</w:t>
+      </w:r>
+    </w:p>
+    <w:p>
+      <w:pPr>
+        <w:pStyle w:val="NormalWeb"/>
+      </w:pPr>
       <w:r>
         <w:rPr>
           <w:b/>
           <w:bCs/>
         </w:rPr>
-        <w:t xml:space="preserve"> </w:t>
-      </w:r>
+        <w:t>Table 2: Participant characteristics after stratification by obesity</w:t>
+      </w:r>
+      <w:r>
+        <w:t xml:space="preserve">.  </w:t>
+      </w:r>
+      <w:r>
+        <w:t xml:space="preserve">Values are mean ± SD or n (%). Groups were stratified by Cushing’s status and obesity; no matching was performed across these strata. </w:t>
+      </w:r>
+      <w:r>
+        <w:t>Kruskal-Wallis</w:t>
+      </w:r>
+      <w:r>
+        <w:t xml:space="preserve"> or χ² compare across the four groups</w:t>
+      </w:r>
+      <w:r>
+        <w:t xml:space="preserve"> to generate p-values</w:t>
+      </w:r>
+      <w:r>
+        <w:t>.</w:t>
+      </w:r>
+    </w:p>
+    <w:p>
+      <w:pPr>
+        <w:pStyle w:val="NormalWeb"/>
+      </w:pPr>
       <w:r>
         <w:rPr>
           <w:b/>
           <w:bCs/>
         </w:rPr>
-        <w:t>1</w:t>
-      </w:r>
+        <w:t xml:space="preserve">Table 3: Effect sizes and statistical significance for each outcome.  </w:t>
+      </w:r>
+      <w:r>
+        <w:t xml:space="preserve">A) Sub-group specific effects of Cushing’s disease after adjusting for age, gender and race/ethnicity for each outcome.  B) Summary of interactions between obesity and Cushing’s disease on each outcome, after adjusting for age, gender, and race/ethnicity.  For both </w:t>
+      </w:r>
+      <w:r>
+        <w:t>tables</w:t>
+      </w:r>
+      <w:r>
+        <w:t>, LDL-C was not adjusted for race/ethnicity due to small sample size.</w:t>
+      </w:r>
+    </w:p>
+    <w:p>
+      <w:pPr>
+        <w:pStyle w:val="NormalWeb"/>
+      </w:pPr>
       <w:r>
         <w:rPr>
           <w:b/>
           <w:bCs/>
         </w:rPr>
-        <w:t>: Love plot</w:t>
+        <w:t>Supplementary Figure</w:t>
       </w:r>
       <w:r>
         <w:rPr>
           <w:b/>
           <w:bCs/>
         </w:rPr>
-        <w:t>s</w:t>
+        <w:t xml:space="preserve"> </w:t>
       </w:r>
       <w:r>
         <w:rPr>
           <w:b/>
           <w:bCs/>
         </w:rPr>
-        <w:t xml:space="preserve"> </w:t>
+        <w:t>1</w:t>
       </w:r>
       <w:r>
         <w:rPr>
           <w:b/>
           <w:bCs/>
         </w:rPr>
-        <w:t>showing</w:t>
+        <w:t>: Love plot</w:t>
       </w:r>
       <w:r>
         <w:rPr>
           <w:b/>
           <w:bCs/>
         </w:rPr>
-        <w:t xml:space="preserve"> </w:t>
+        <w:t>s</w:t>
       </w:r>
       <w:r>
         <w:rPr>
           <w:b/>
           <w:bCs/>
         </w:rPr>
-        <w:t>covariate balance</w:t>
+        <w:t xml:space="preserve"> </w:t>
       </w:r>
       <w:r>
         <w:rPr>
           <w:b/>
           <w:bCs/>
         </w:rPr>
-        <w:t xml:space="preserve"> each outcome.</w:t>
-      </w:r>
-      <w:r>
-        <w:t xml:space="preserve">  Plots describe the </w:t>
-      </w:r>
-      <w:r>
-        <w:t>standardized mean difference</w:t>
-      </w:r>
-      <w:r>
-        <w:t xml:space="preserve"> for each variable prior to- and after propensity mapping.  </w:t>
-      </w:r>
-      <w:r>
-        <w:t xml:space="preserve">Dashed line indicates the </w:t>
-      </w:r>
-      <w:r>
-        <w:t xml:space="preserve">standardized mean </w:t>
-      </w:r>
-      <w:r>
-        <w:t xml:space="preserve">difference </w:t>
-      </w:r>
-      <w:r>
-        <w:t>cutoff</w:t>
-      </w:r>
-      <w:r>
-        <w:t xml:space="preserve"> of </w:t>
-      </w:r>
-      <w:r>
-        <w:t xml:space="preserve">0.1.  </w:t>
-      </w:r>
-      <w:r>
-        <w:t xml:space="preserve">Note </w:t>
-      </w:r>
-      <w:r>
-        <w:t xml:space="preserve">that </w:t>
-      </w:r>
-      <w:r>
-        <w:t xml:space="preserve">age, </w:t>
-      </w:r>
-      <w:r>
-        <w:t>race/</w:t>
-      </w:r>
-      <w:r>
-        <w:t>ethnicity and gender were all exactly matched.</w:t>
-      </w:r>
-    </w:p>
-    <w:p>
-      <w:pPr>
-        <w:pStyle w:val="NormalWeb"/>
-      </w:pPr>
+        <w:t>showing</w:t>
+      </w:r>
       <w:r>
         <w:rPr>
           <w:b/>
           <w:bCs/>
         </w:rPr>
-        <w:t xml:space="preserve">Supplementary Table S1: </w:t>
+        <w:t xml:space="preserve"> </w:t>
       </w:r>
       <w:r>
         <w:rPr>
           <w:b/>
           <w:bCs/>
         </w:rPr>
-        <w:t>Covariate m</w:t>
+        <w:t>covariate balance</w:t>
       </w:r>
       <w:r>
         <w:rPr>
           <w:b/>
           <w:bCs/>
         </w:rPr>
+        <w:t xml:space="preserve"> each outcome.</w:t>
+      </w:r>
+      <w:r>
+        <w:t xml:space="preserve">  Plots describe the </w:t>
+      </w:r>
+      <w:r>
+        <w:t>standardized mean difference</w:t>
+      </w:r>
+      <w:r>
+        <w:t xml:space="preserve"> for each variable prior to- and after propensity mapping.  </w:t>
+      </w:r>
+      <w:r>
+        <w:t xml:space="preserve">Dashed line indicates the </w:t>
+      </w:r>
+      <w:r>
+        <w:t xml:space="preserve">standardized mean </w:t>
+      </w:r>
+      <w:r>
+        <w:t xml:space="preserve">difference </w:t>
+      </w:r>
+      <w:r>
+        <w:t>cutoff</w:t>
+      </w:r>
+      <w:r>
+        <w:t xml:space="preserve"> of </w:t>
+      </w:r>
+      <w:r>
+        <w:t xml:space="preserve">0.1.  </w:t>
+      </w:r>
+      <w:r>
+        <w:t xml:space="preserve">Note </w:t>
+      </w:r>
+      <w:r>
+        <w:t xml:space="preserve">that </w:t>
+      </w:r>
+      <w:r>
+        <w:t xml:space="preserve">age, </w:t>
+      </w:r>
+      <w:r>
+        <w:t>race/</w:t>
+      </w:r>
+      <w:r>
+        <w:t>ethnicity and gender were all exactly matched.</w:t>
+      </w:r>
+    </w:p>
+    <w:p>
+      <w:pPr>
+        <w:pStyle w:val="NormalWeb"/>
+      </w:pPr>
+      <w:r>
+        <w:rPr>
+          <w:b/>
+          <w:bCs/>
+        </w:rPr>
+        <w:t xml:space="preserve">Supplementary Table S1: </w:t>
+      </w:r>
+      <w:r>
+        <w:rPr>
+          <w:b/>
+          <w:bCs/>
+        </w:rPr>
+        <w:t>Covariate m</w:t>
+      </w:r>
+      <w:r>
+        <w:rPr>
+          <w:b/>
+          <w:bCs/>
+        </w:rPr>
         <w:t>atching diagnostics for age.</w:t>
       </w:r>
       <w:r>
-        <w:t xml:space="preserve">  Averages, standard deviations and standardized mean difference for age are shown for each outcome before and after propensity matching.  Matching was exact for race and ethnicity.</w:t>
+        <w:t xml:space="preserve">  Averages, standard </w:t>
+      </w:r>
+      <w:r>
+        <w:t>errors</w:t>
+      </w:r>
+      <w:r>
+        <w:t xml:space="preserve"> and standardized mean difference for age are shown for each outcome before and after propensity matching.  Matching was exact for race and ethnicity.</w:t>
       </w:r>
     </w:p>
     <w:p>
@@ -2607,7 +2797,6 @@
           <w:szCs w:val="18"/>
           <w14:ligatures w14:val="none"/>
         </w:rPr>
-        <w:lastRenderedPageBreak/>
         <w:t xml:space="preserve">   </w:t>
       </w:r>
       <w:r>
@@ -3263,7 +3452,7 @@
       </w:r>
     </w:p>
   </w:comment>
-  <w:comment w:id="1" w:author="Dave Bridges" w:date="2025-09-05T19:50:00Z" w:initials="DB">
+  <w:comment w:id="1" w:author="Dave Bridges" w:date="2025-09-07T19:14:00Z" w:initials="DB">
     <w:p>
       <w:r>
         <w:rPr>
@@ -3276,11 +3465,11 @@
           <w:sz w:val="20"/>
           <w:szCs w:val="20"/>
         </w:rPr>
-        <w:t>todo</w:t>
+        <w:t>@trey can you add these</w:t>
       </w:r>
     </w:p>
   </w:comment>
-  <w:comment w:id="2" w:author="Dave Bridges" w:date="2025-09-07T14:40:00Z" w:initials="DB">
+  <w:comment w:id="2" w:author="Dave Bridges" w:date="2025-09-07T19:15:00Z" w:initials="DB">
     <w:p>
       <w:r>
         <w:rPr>
@@ -3293,11 +3482,11 @@
           <w:sz w:val="20"/>
           <w:szCs w:val="20"/>
         </w:rPr>
-        <w:t>@trey can you describe this part, and enter details in the methods of how this was done</w:t>
+        <w:t>@trey This should include people who you removed from the diagram, including those with NA</w:t>
       </w:r>
     </w:p>
   </w:comment>
-  <w:comment w:id="3" w:author="Dave Bridges" w:date="2025-09-05T18:06:00Z" w:initials="DB">
+  <w:comment w:id="3" w:author="Dave Bridges" w:date="2025-09-05T19:50:00Z" w:initials="DB">
     <w:p>
       <w:r>
         <w:rPr>
@@ -3310,11 +3499,45 @@
           <w:sz w:val="20"/>
           <w:szCs w:val="20"/>
         </w:rPr>
+        <w:t>todo</w:t>
+      </w:r>
+    </w:p>
+  </w:comment>
+  <w:comment w:id="4" w:author="Dave Bridges" w:date="2025-09-07T14:40:00Z" w:initials="DB">
+    <w:p>
+      <w:r>
+        <w:rPr>
+          <w:rStyle w:val="CommentReference"/>
+        </w:rPr>
+        <w:annotationRef/>
+      </w:r>
+      <w:r>
+        <w:rPr>
+          <w:sz w:val="20"/>
+          <w:szCs w:val="20"/>
+        </w:rPr>
+        <w:t>@trey can you describe this part, and enter details in the methods of how this was done</w:t>
+      </w:r>
+    </w:p>
+  </w:comment>
+  <w:comment w:id="5" w:author="Dave Bridges" w:date="2025-09-05T18:06:00Z" w:initials="DB">
+    <w:p>
+      <w:r>
+        <w:rPr>
+          <w:rStyle w:val="CommentReference"/>
+        </w:rPr>
+        <w:annotationRef/>
+      </w:r>
+      <w:r>
+        <w:rPr>
+          <w:sz w:val="20"/>
+          <w:szCs w:val="20"/>
+        </w:rPr>
         <w:t>@trey are there other papers that describe this?</w:t>
       </w:r>
     </w:p>
   </w:comment>
-  <w:comment w:id="4" w:author="Dave Bridges" w:date="2025-09-05T19:38:00Z" w:initials="DB">
+  <w:comment w:id="6" w:author="Dave Bridges" w:date="2025-09-05T19:38:00Z" w:initials="DB">
     <w:p>
       <w:r>
         <w:rPr>
@@ -3337,6 +3560,8 @@
 <file path=word/commentsExtended.xml><?xml version="1.0" encoding="utf-8"?>
 <w15:commentsEx xmlns:wpc="http://schemas.microsoft.com/office/word/2010/wordprocessingCanvas" xmlns:cx="http://schemas.microsoft.com/office/drawing/2014/chartex" xmlns:cx1="http://schemas.microsoft.com/office/drawing/2015/9/8/chartex" xmlns:cx2="http://schemas.microsoft.com/office/drawing/2015/10/21/chartex" xmlns:cx3="http://schemas.microsoft.com/office/drawing/2016/5/9/chartex" xmlns:cx4="http://schemas.microsoft.com/office/drawing/2016/5/10/chartex" xmlns:cx5="http://schemas.microsoft.com/office/drawing/2016/5/11/chartex" xmlns:cx6="http://schemas.microsoft.com/office/drawing/2016/5/12/chartex" xmlns:cx7="http://schemas.microsoft.com/office/drawing/2016/5/13/chartex" xmlns:cx8="http://schemas.microsoft.com/office/drawing/2016/5/14/chartex" xmlns:mc="http://schemas.openxmlformats.org/markup-compatibility/2006" xmlns:aink="http://schemas.microsoft.com/office/drawing/2016/ink" xmlns:am3d="http://schemas.microsoft.com/office/drawing/2017/model3d" xmlns:o="urn:schemas-microsoft-com:office:office" xmlns:oel="http://schemas.microsoft.com/office/2019/extlst" xmlns:r="http://schemas.openxmlformats.org/officeDocument/2006/relationships" xmlns:m="http://schemas.openxmlformats.org/officeDocument/2006/math" xmlns:v="urn:schemas-microsoft-com:vml" xmlns:wp14="http://schemas.microsoft.com/office/word/2010/wordprocessingDrawing" xmlns:wp="http://schemas.openxmlformats.org/drawingml/2006/wordprocessingDrawing" xmlns:w10="urn:schemas-microsoft-com:office:word" xmlns:w="http://schemas.openxmlformats.org/wordprocessingml/2006/main" xmlns:w14="http://schemas.microsoft.com/office/word/2010/wordml" xmlns:w15="http://schemas.microsoft.com/office/word/2012/wordml" xmlns:w16cex="http://schemas.microsoft.com/office/word/2018/wordml/cex" xmlns:w16cid="http://schemas.microsoft.com/office/word/2016/wordml/cid" xmlns:w16="http://schemas.microsoft.com/office/word/2018/wordml" xmlns:w16du="http://schemas.microsoft.com/office/word/2023/wordml/word16du" xmlns:w16sdtdh="http://schemas.microsoft.com/office/word/2020/wordml/sdtdatahash" xmlns:w16sdtfl="http://schemas.microsoft.com/office/word/2024/wordml/sdtformatlock" xmlns:w16se="http://schemas.microsoft.com/office/word/2015/wordml/symex" xmlns:wpg="http://schemas.microsoft.com/office/word/2010/wordprocessingGroup" xmlns:wpi="http://schemas.microsoft.com/office/word/2010/wordprocessingInk" xmlns:wne="http://schemas.microsoft.com/office/word/2006/wordml" xmlns:wps="http://schemas.microsoft.com/office/word/2010/wordprocessingShape" mc:Ignorable="w14 w15 w16se w16cid w16 w16cex w16sdtdh w16sdtfl w16du wp14">
   <w15:commentEx w15:paraId="4DBE4D40" w15:done="0"/>
+  <w15:commentEx w15:paraId="30EA8164" w15:done="0"/>
+  <w15:commentEx w15:paraId="69A0B22F" w15:done="0"/>
   <w15:commentEx w15:paraId="1DD21AA1" w15:done="0"/>
   <w15:commentEx w15:paraId="2B4220B9" w15:done="0"/>
   <w15:commentEx w15:paraId="3F27DAC3" w15:done="0"/>
@@ -3347,6 +3572,8 @@
 <file path=word/commentsExtensible.xml><?xml version="1.0" encoding="utf-8"?>
 <w16cex:commentsExtensible xmlns:wpc="http://schemas.microsoft.com/office/word/2010/wordprocessingCanvas" xmlns:cx="http://schemas.microsoft.com/office/drawing/2014/chartex" xmlns:cx1="http://schemas.microsoft.com/office/drawing/2015/9/8/chartex" xmlns:cx2="http://schemas.microsoft.com/office/drawing/2015/10/21/chartex" xmlns:cx3="http://schemas.microsoft.com/office/drawing/2016/5/9/chartex" xmlns:cx4="http://schemas.microsoft.com/office/drawing/2016/5/10/chartex" xmlns:cx5="http://schemas.microsoft.com/office/drawing/2016/5/11/chartex" xmlns:cx6="http://schemas.microsoft.com/office/drawing/2016/5/12/chartex" xmlns:cx7="http://schemas.microsoft.com/office/drawing/2016/5/13/chartex" xmlns:cx8="http://schemas.microsoft.com/office/drawing/2016/5/14/chartex" xmlns:cr="http://schemas.microsoft.com/office/comments/2020/reactions" xmlns:mc="http://schemas.openxmlformats.org/markup-compatibility/2006" xmlns:aink="http://schemas.microsoft.com/office/drawing/2016/ink" xmlns:am3d="http://schemas.microsoft.com/office/drawing/2017/model3d" xmlns:o="urn:schemas-microsoft-com:office:office" xmlns:oel="http://schemas.microsoft.com/office/2019/extlst" xmlns:r="http://schemas.openxmlformats.org/officeDocument/2006/relationships" xmlns:m="http://schemas.openxmlformats.org/officeDocument/2006/math" xmlns:v="urn:schemas-microsoft-com:vml" xmlns:wp14="http://schemas.microsoft.com/office/word/2010/wordprocessingDrawing" xmlns:wp="http://schemas.openxmlformats.org/drawingml/2006/wordprocessingDrawing" xmlns:w10="urn:schemas-microsoft-com:office:word" xmlns:w="http://schemas.openxmlformats.org/wordprocessingml/2006/main" xmlns:w14="http://schemas.microsoft.com/office/word/2010/wordml" xmlns:w15="http://schemas.microsoft.com/office/word/2012/wordml" xmlns:w16cex="http://schemas.microsoft.com/office/word/2018/wordml/cex" xmlns:w16cid="http://schemas.microsoft.com/office/word/2016/wordml/cid" xmlns:w16="http://schemas.microsoft.com/office/word/2018/wordml" xmlns:w16du="http://schemas.microsoft.com/office/word/2023/wordml/word16du" xmlns:w16sdtdh="http://schemas.microsoft.com/office/word/2020/wordml/sdtdatahash" xmlns:w16sdtfl="http://schemas.microsoft.com/office/word/2024/wordml/sdtformatlock" xmlns:w16se="http://schemas.microsoft.com/office/word/2015/wordml/symex" xmlns:wpg="http://schemas.microsoft.com/office/word/2010/wordprocessingGroup" xmlns:wpi="http://schemas.microsoft.com/office/word/2010/wordprocessingInk" xmlns:wne="http://schemas.microsoft.com/office/word/2006/wordml" xmlns:wps="http://schemas.microsoft.com/office/word/2010/wordprocessingShape" mc:Ignorable="w14 w15 w16se w16cid w16 w16cex w16sdtdh w16sdtfl cr w16du wp14">
   <w16cex:commentExtensible w16cex:durableId="68EF662C" w16cex:dateUtc="2025-09-05T15:11:00Z"/>
+  <w16cex:commentExtensible w16cex:durableId="7BBB9387" w16cex:dateUtc="2025-09-07T23:14:00Z"/>
+  <w16cex:commentExtensible w16cex:durableId="306CE51F" w16cex:dateUtc="2025-09-07T23:15:00Z"/>
   <w16cex:commentExtensible w16cex:durableId="1A95B88A" w16cex:dateUtc="2025-09-05T23:50:00Z"/>
   <w16cex:commentExtensible w16cex:durableId="73524BEF" w16cex:dateUtc="2025-09-07T18:40:00Z"/>
   <w16cex:commentExtensible w16cex:durableId="10479658" w16cex:dateUtc="2025-09-05T22:06:00Z"/>
@@ -3357,6 +3584,8 @@
 <file path=word/commentsIds.xml><?xml version="1.0" encoding="utf-8"?>
 <w16cid:commentsIds xmlns:wpc="http://schemas.microsoft.com/office/word/2010/wordprocessingCanvas" xmlns:cx="http://schemas.microsoft.com/office/drawing/2014/chartex" xmlns:cx1="http://schemas.microsoft.com/office/drawing/2015/9/8/chartex" xmlns:cx2="http://schemas.microsoft.com/office/drawing/2015/10/21/chartex" xmlns:cx3="http://schemas.microsoft.com/office/drawing/2016/5/9/chartex" xmlns:cx4="http://schemas.microsoft.com/office/drawing/2016/5/10/chartex" xmlns:cx5="http://schemas.microsoft.com/office/drawing/2016/5/11/chartex" xmlns:cx6="http://schemas.microsoft.com/office/drawing/2016/5/12/chartex" xmlns:cx7="http://schemas.microsoft.com/office/drawing/2016/5/13/chartex" xmlns:cx8="http://schemas.microsoft.com/office/drawing/2016/5/14/chartex" xmlns:mc="http://schemas.openxmlformats.org/markup-compatibility/2006" xmlns:aink="http://schemas.microsoft.com/office/drawing/2016/ink" xmlns:am3d="http://schemas.microsoft.com/office/drawing/2017/model3d" xmlns:o="urn:schemas-microsoft-com:office:office" xmlns:oel="http://schemas.microsoft.com/office/2019/extlst" xmlns:r="http://schemas.openxmlformats.org/officeDocument/2006/relationships" xmlns:m="http://schemas.openxmlformats.org/officeDocument/2006/math" xmlns:v="urn:schemas-microsoft-com:vml" xmlns:wp14="http://schemas.microsoft.com/office/word/2010/wordprocessingDrawing" xmlns:wp="http://schemas.openxmlformats.org/drawingml/2006/wordprocessingDrawing" xmlns:w10="urn:schemas-microsoft-com:office:word" xmlns:w="http://schemas.openxmlformats.org/wordprocessingml/2006/main" xmlns:w14="http://schemas.microsoft.com/office/word/2010/wordml" xmlns:w15="http://schemas.microsoft.com/office/word/2012/wordml" xmlns:w16cex="http://schemas.microsoft.com/office/word/2018/wordml/cex" xmlns:w16cid="http://schemas.microsoft.com/office/word/2016/wordml/cid" xmlns:w16="http://schemas.microsoft.com/office/word/2018/wordml" xmlns:w16du="http://schemas.microsoft.com/office/word/2023/wordml/word16du" xmlns:w16sdtdh="http://schemas.microsoft.com/office/word/2020/wordml/sdtdatahash" xmlns:w16sdtfl="http://schemas.microsoft.com/office/word/2024/wordml/sdtformatlock" xmlns:w16se="http://schemas.microsoft.com/office/word/2015/wordml/symex" xmlns:wpg="http://schemas.microsoft.com/office/word/2010/wordprocessingGroup" xmlns:wpi="http://schemas.microsoft.com/office/word/2010/wordprocessingInk" xmlns:wne="http://schemas.microsoft.com/office/word/2006/wordml" xmlns:wps="http://schemas.microsoft.com/office/word/2010/wordprocessingShape" mc:Ignorable="w14 w15 w16se w16cid w16 w16cex w16sdtdh w16sdtfl w16du wp14">
   <w16cid:commentId w16cid:paraId="4DBE4D40" w16cid:durableId="68EF662C"/>
+  <w16cid:commentId w16cid:paraId="30EA8164" w16cid:durableId="7BBB9387"/>
+  <w16cid:commentId w16cid:paraId="69A0B22F" w16cid:durableId="306CE51F"/>
   <w16cid:commentId w16cid:paraId="1DD21AA1" w16cid:durableId="1A95B88A"/>
   <w16cid:commentId w16cid:paraId="2B4220B9" w16cid:durableId="73524BEF"/>
   <w16cid:commentId w16cid:paraId="3F27DAC3" w16cid:durableId="10479658"/>

</xml_diff>

<commit_message>
Copied over first versions of Table 3A/B
</commit_message>
<xml_diff>
--- a/manuscript/Cushings-Obesity/manuscript.docx
+++ b/manuscript/Cushings-Obesity/manuscript.docx
@@ -855,12 +855,104 @@
     <w:p>
       <w:pPr>
         <w:pStyle w:val="NormalWeb"/>
-      </w:pPr>
-      <w:r>
         <w:rPr>
           <w:rStyle w:val="Heading2Char"/>
         </w:rPr>
-        <w:t>Primary outcomes and effect modification</w:t>
+      </w:pPr>
+      <w:r>
+        <w:rPr>
+          <w:rStyle w:val="Heading2Char"/>
+        </w:rPr>
+        <w:t>Modification of Cushing’s disease-related traits by obesity status</w:t>
+      </w:r>
+    </w:p>
+    <w:p>
+      <w:r>
+        <w:t xml:space="preserve">To identify how obesity alters metabolic outcomes related to Cushing’s disease, we evaluated the effects of Cushing’s disease on several key metabolic variables including </w:t>
+      </w:r>
+      <w:proofErr w:type="spellStart"/>
+      <w:r>
+        <w:t>glycemica</w:t>
+      </w:r>
+      <w:proofErr w:type="spellEnd"/>
+      <w:r>
+        <w:t xml:space="preserve"> (fasting glucose and HbA1c), liver enzymes, LDL-C and blood pressure (Figure 2 and Table 3A).  As described below we noted substantial effect modification by obesity status in these fully adjusted models for liver enzymes and blood pressure (Table 3B).</w:t>
+      </w:r>
+    </w:p>
+    <w:p>
+      <w:pPr>
+        <w:pStyle w:val="NormalWeb"/>
+        <w:rPr>
+          <w:b/>
+          <w:bCs/>
+        </w:rPr>
+      </w:pPr>
+      <w:commentRangeStart w:id="7"/>
+      <w:proofErr w:type="spellStart"/>
+      <w:r>
+        <w:rPr>
+          <w:b/>
+          <w:bCs/>
+        </w:rPr>
+        <w:t>Dysglycemia</w:t>
+      </w:r>
+      <w:proofErr w:type="spellEnd"/>
+    </w:p>
+    <w:p>
+      <w:pPr>
+        <w:pStyle w:val="NormalWeb"/>
+        <w:rPr>
+          <w:b/>
+          <w:bCs/>
+        </w:rPr>
+      </w:pPr>
+      <w:r>
+        <w:rPr>
+          <w:b/>
+          <w:bCs/>
+        </w:rPr>
+        <w:t>MASLD and liver enzymes</w:t>
+      </w:r>
+    </w:p>
+    <w:p>
+      <w:pPr>
+        <w:pStyle w:val="NormalWeb"/>
+      </w:pPr>
+      <w:r>
+        <w:rPr>
+          <w:b/>
+          <w:bCs/>
+        </w:rPr>
+        <w:t>LDL-Cholesterol levels</w:t>
+      </w:r>
+      <w:r>
+        <w:t>.  Only a small number of participants with Cushing’s disease had LDL-C records within 30 days prior to treatment.</w:t>
+      </w:r>
+    </w:p>
+    <w:p>
+      <w:pPr>
+        <w:pStyle w:val="NormalWeb"/>
+        <w:rPr>
+          <w:b/>
+          <w:bCs/>
+        </w:rPr>
+      </w:pPr>
+      <w:r>
+        <w:rPr>
+          <w:b/>
+          <w:bCs/>
+        </w:rPr>
+        <w:t>Blood Pressure</w:t>
+      </w:r>
+      <w:commentRangeEnd w:id="7"/>
+      <w:r>
+        <w:rPr>
+          <w:rStyle w:val="CommentReference"/>
+          <w:rFonts w:asciiTheme="minorHAnsi" w:eastAsiaTheme="minorHAnsi" w:hAnsiTheme="minorHAnsi" w:cstheme="minorBidi"/>
+          <w:kern w:val="2"/>
+          <w14:ligatures w14:val="standardContextual"/>
+        </w:rPr>
+        <w:commentReference w:id="7"/>
       </w:r>
     </w:p>
     <w:p>
@@ -872,36 +964,22 @@
         </w:numPr>
       </w:pPr>
       <w:r>
-        <w:t>Refer to Table 3 and Figure 3.</w:t>
-      </w:r>
-    </w:p>
-    <w:p>
-      <w:pPr>
-        <w:pStyle w:val="Heading2"/>
-        <w:rPr>
-          <w:b/>
-          <w:bCs/>
-        </w:rPr>
-      </w:pPr>
-      <w:r>
-        <w:rPr>
-          <w:rStyle w:val="Strong"/>
-          <w:b w:val="0"/>
-          <w:bCs w:val="0"/>
-        </w:rPr>
-        <w:t>Summary of interaction effects</w:t>
-      </w:r>
-    </w:p>
-    <w:p>
-      <w:pPr>
-        <w:pStyle w:val="NormalWeb"/>
-        <w:numPr>
-          <w:ilvl w:val="0"/>
-          <w:numId w:val="4"/>
-        </w:numPr>
-      </w:pPr>
-      <w:r>
-        <w:t>Refer to Figure 4.</w:t>
+        <w:t>Refer to Table 3</w:t>
+      </w:r>
+      <w:r>
+        <w:t>A/B</w:t>
+      </w:r>
+      <w:r>
+        <w:t xml:space="preserve"> and Figure </w:t>
+      </w:r>
+      <w:r>
+        <w:t>2</w:t>
+      </w:r>
+      <w:r>
+        <w:t xml:space="preserve"> and 3 (not done yet)</w:t>
+      </w:r>
+      <w:r>
+        <w:t>.</w:t>
       </w:r>
     </w:p>
     <w:p>
@@ -924,7 +1002,7 @@
         </w:numPr>
       </w:pPr>
       <w:r>
-        <w:t>Refer to Table 4 and supplemental figures/tables.</w:t>
+        <w:t>Not done yet</w:t>
       </w:r>
     </w:p>
     <w:p>
@@ -936,7 +1014,7 @@
         </w:numPr>
       </w:pPr>
       <w:r>
-        <w:t>Full model propensity mapping</w:t>
+        <w:t>Refer to Table 4 and supplemental figures/tables.</w:t>
       </w:r>
     </w:p>
     <w:p>
@@ -948,7 +1026,7 @@
         </w:numPr>
       </w:pPr>
       <w:r>
-        <w:t>No covariates</w:t>
+        <w:t>Full model propensity mapping</w:t>
       </w:r>
     </w:p>
     <w:p>
@@ -960,23 +1038,7 @@
         </w:numPr>
       </w:pPr>
       <w:r>
-        <w:t xml:space="preserve">BMI instead of Obesity, </w:t>
-      </w:r>
-      <w:proofErr w:type="gramStart"/>
-      <w:r>
-        <w:t>ns(</w:t>
-      </w:r>
-      <w:proofErr w:type="gramEnd"/>
-      <w:r>
-        <w:t xml:space="preserve">BMI, </w:t>
-      </w:r>
-      <w:proofErr w:type="spellStart"/>
-      <w:r>
-        <w:t>df</w:t>
-      </w:r>
-      <w:proofErr w:type="spellEnd"/>
-      <w:r>
-        <w:t>=3) instead of Obesity</w:t>
+        <w:t>No covariates</w:t>
       </w:r>
     </w:p>
     <w:p>
@@ -987,13 +1049,24 @@
           <w:numId w:val="5"/>
         </w:numPr>
       </w:pPr>
+      <w:r>
+        <w:t xml:space="preserve">BMI instead of Obesity, </w:t>
+      </w:r>
+      <w:proofErr w:type="gramStart"/>
+      <w:r>
+        <w:t>ns(</w:t>
+      </w:r>
+      <w:proofErr w:type="gramEnd"/>
+      <w:r>
+        <w:t xml:space="preserve">BMI, </w:t>
+      </w:r>
       <w:proofErr w:type="spellStart"/>
       <w:r>
-        <w:t>Cushings</w:t>
+        <w:t>df</w:t>
       </w:r>
       <w:proofErr w:type="spellEnd"/>
       <w:r>
-        <w:t xml:space="preserve"> x Sex</w:t>
+        <w:t>=3) instead of Obesity</w:t>
       </w:r>
     </w:p>
     <w:p>
@@ -1004,8 +1077,13 @@
           <w:numId w:val="5"/>
         </w:numPr>
       </w:pPr>
-      <w:r>
-        <w:t>Different matching ratios</w:t>
+      <w:proofErr w:type="spellStart"/>
+      <w:r>
+        <w:t>Cushings</w:t>
+      </w:r>
+      <w:proofErr w:type="spellEnd"/>
+      <w:r>
+        <w:t xml:space="preserve"> x Sex</w:t>
       </w:r>
     </w:p>
     <w:p>
@@ -1017,6 +1095,18 @@
         </w:numPr>
       </w:pPr>
       <w:r>
+        <w:t>Different matching ratios</w:t>
+      </w:r>
+    </w:p>
+    <w:p>
+      <w:pPr>
+        <w:pStyle w:val="NormalWeb"/>
+        <w:numPr>
+          <w:ilvl w:val="0"/>
+          <w:numId w:val="5"/>
+        </w:numPr>
+      </w:pPr>
+      <w:r>
         <w:t>IPTW</w:t>
       </w:r>
     </w:p>
@@ -1025,6 +1115,39 @@
         <w:pStyle w:val="Heading1"/>
       </w:pPr>
       <w:r>
+        <w:t>Discussion</w:t>
+      </w:r>
+    </w:p>
+    <w:p>
+      <w:pPr>
+        <w:pStyle w:val="ListParagraph"/>
+        <w:numPr>
+          <w:ilvl w:val="0"/>
+          <w:numId w:val="6"/>
+        </w:numPr>
+      </w:pPr>
+      <w:r>
+        <w:t>Consistency with prior studies on ALT/AST and blood glucose</w:t>
+      </w:r>
+    </w:p>
+    <w:p>
+      <w:pPr>
+        <w:pStyle w:val="ListParagraph"/>
+        <w:numPr>
+          <w:ilvl w:val="0"/>
+          <w:numId w:val="6"/>
+        </w:numPr>
+      </w:pPr>
+      <w:r>
+        <w:t>Why is blood pressure protective (is this true of general analyses)</w:t>
+      </w:r>
+    </w:p>
+    <w:p>
+      <w:pPr>
+        <w:pStyle w:val="Heading1"/>
+      </w:pPr>
+      <w:r>
+        <w:lastRenderedPageBreak/>
         <w:t>References</w:t>
       </w:r>
     </w:p>
@@ -1142,63 +1265,21 @@
           <w:b/>
           <w:bCs/>
         </w:rPr>
-        <w:t>Figure 1: CONSORT Diagram of participant inclusion.</w:t>
-      </w:r>
-    </w:p>
-    <w:p>
-      <w:pPr>
-        <w:pStyle w:val="NormalWeb"/>
-      </w:pPr>
+        <w:t xml:space="preserve">Figure 1: </w:t>
+      </w:r>
       <w:r>
         <w:rPr>
           <w:b/>
           <w:bCs/>
         </w:rPr>
-        <w:t xml:space="preserve">Figure 2: </w:t>
+        <w:t>Participant flow diagram</w:t>
       </w:r>
       <w:r>
         <w:rPr>
           <w:b/>
           <w:bCs/>
         </w:rPr>
-        <w:t xml:space="preserve">Effects of Cushing’s disease and Obesity on Laboratory Values.  </w:t>
-      </w:r>
-      <w:r>
-        <w:t xml:space="preserve">Laboratory values were within 30 days of Cushing’s disease surgery for cases.  Obesity was defined as a BMI </w:t>
-      </w:r>
-      <w:r>
-        <w:lastRenderedPageBreak/>
-        <w:t>above or below 30 kg/m</w:t>
-      </w:r>
-      <w:r>
-        <w:rPr>
-          <w:vertAlign w:val="superscript"/>
-        </w:rPr>
-        <w:t>2</w:t>
-      </w:r>
-      <w:r>
-        <w:t xml:space="preserve">.  </w:t>
-      </w:r>
-      <w:r>
-        <w:t>Data are presented as mean</w:t>
-      </w:r>
-      <w:r>
-        <w:t>s with a 95% confidence interval</w:t>
-      </w:r>
-      <w:r>
-        <w:t>, with ligh</w:t>
-      </w:r>
-      <w:r>
-        <w:t>t</w:t>
-      </w:r>
-      <w:r>
-        <w:t>er grey indicating data from participants with Cushing’s disease</w:t>
-      </w:r>
-      <w:r>
         <w:t>.</w:t>
-      </w:r>
-      <w:r>
-        <w:t xml:space="preserve">   Table 3 reports adjusted p-values for effects of Cushing’s disease and the interaction between disease and obesity.</w:t>
       </w:r>
     </w:p>
     <w:p>
@@ -1210,100 +1291,101 @@
           <w:b/>
           <w:bCs/>
         </w:rPr>
-        <w:t>Table 1: Participant characteristics</w:t>
+        <w:t xml:space="preserve">Figure 2: </w:t>
       </w:r>
       <w:r>
         <w:rPr>
           <w:b/>
           <w:bCs/>
         </w:rPr>
-        <w:t xml:space="preserve"> after </w:t>
-      </w:r>
+        <w:t xml:space="preserve">Effects of Cushing’s disease and Obesity on Laboratory Values.  </w:t>
+      </w:r>
+      <w:r>
+        <w:t>Laboratory values were within 30 days of Cushing’s disease surgery for cases.  Obesity was defined as a BMI above or below 30 kg/m</w:t>
+      </w:r>
+      <w:r>
+        <w:rPr>
+          <w:vertAlign w:val="superscript"/>
+        </w:rPr>
+        <w:t>2</w:t>
+      </w:r>
+      <w:r>
+        <w:t xml:space="preserve">.  </w:t>
+      </w:r>
+      <w:r>
+        <w:t>Data are presented as mean</w:t>
+      </w:r>
+      <w:r>
+        <w:t>s with a 95% confidence interval</w:t>
+      </w:r>
+      <w:r>
+        <w:t>, with ligh</w:t>
+      </w:r>
+      <w:r>
+        <w:t>t</w:t>
+      </w:r>
+      <w:r>
+        <w:t>er grey indicating data from participants with Cushing’s disease</w:t>
+      </w:r>
+      <w:r>
+        <w:t>.</w:t>
+      </w:r>
+      <w:r>
+        <w:t xml:space="preserve">   Table 3 reports adjusted p-values for effects of Cushing’s disease and the interaction between disease and obesity.</w:t>
+      </w:r>
+    </w:p>
+    <w:p>
+      <w:pPr>
+        <w:pStyle w:val="NormalWeb"/>
+      </w:pPr>
       <w:r>
         <w:rPr>
           <w:b/>
           <w:bCs/>
         </w:rPr>
-        <w:t xml:space="preserve">covariate </w:t>
+        <w:t>Table 1: Participant characteristics</w:t>
       </w:r>
       <w:r>
         <w:rPr>
           <w:b/>
           <w:bCs/>
         </w:rPr>
-        <w:t>matching.</w:t>
-      </w:r>
-      <w:r>
-        <w:t xml:space="preserve">  Participants were matched for age, gender and race/ethnicity but not BMI.  This table represents the matched set for </w:t>
-      </w:r>
-      <w:r>
-        <w:t xml:space="preserve">patients with </w:t>
-      </w:r>
-      <w:r>
-        <w:t xml:space="preserve">Cushing’s </w:t>
-      </w:r>
-      <w:r>
-        <w:t>disease</w:t>
-      </w:r>
-      <w:r>
-        <w:t xml:space="preserve"> with any laboratory value we considered.  Supplementary Tables S2A-E describe outcome-specific matched </w:t>
-      </w:r>
-      <w:r>
-        <w:t>characteristics</w:t>
-      </w:r>
-      <w:r>
-        <w:t>.</w:t>
-      </w:r>
-    </w:p>
-    <w:p>
-      <w:pPr>
-        <w:pStyle w:val="NormalWeb"/>
-      </w:pPr>
+        <w:t xml:space="preserve"> after </w:t>
+      </w:r>
       <w:r>
         <w:rPr>
           <w:b/>
           <w:bCs/>
         </w:rPr>
-        <w:t>Table 2: Participant characteristics after stratification by obesity</w:t>
-      </w:r>
-      <w:r>
-        <w:t xml:space="preserve">.  </w:t>
-      </w:r>
-      <w:r>
-        <w:t xml:space="preserve">Values are mean ± SD or n (%). Groups were stratified by Cushing’s status and obesity; no matching was performed across these strata. </w:t>
-      </w:r>
-      <w:r>
-        <w:t>Kruskal-Wallis</w:t>
-      </w:r>
-      <w:r>
-        <w:t xml:space="preserve"> or χ² compare across the four groups</w:t>
-      </w:r>
-      <w:r>
-        <w:t xml:space="preserve"> to generate p-values</w:t>
-      </w:r>
-      <w:r>
-        <w:t>.</w:t>
-      </w:r>
-    </w:p>
-    <w:p>
-      <w:pPr>
-        <w:pStyle w:val="NormalWeb"/>
-      </w:pPr>
+        <w:t xml:space="preserve">covariate </w:t>
+      </w:r>
       <w:r>
         <w:rPr>
           <w:b/>
           <w:bCs/>
         </w:rPr>
-        <w:t xml:space="preserve">Table 3: Effect sizes and statistical significance for each outcome.  </w:t>
-      </w:r>
-      <w:r>
-        <w:t xml:space="preserve">A) Sub-group specific effects of Cushing’s disease after adjusting for age, gender and race/ethnicity for each outcome.  B) Summary of interactions between obesity and Cushing’s disease on each outcome, after adjusting for age, gender, and race/ethnicity.  For both </w:t>
-      </w:r>
-      <w:r>
-        <w:t>tables</w:t>
-      </w:r>
-      <w:r>
-        <w:t>, LDL-C was not adjusted for race/ethnicity due to small sample size.</w:t>
+        <w:t>matching.</w:t>
+      </w:r>
+      <w:r>
+        <w:t xml:space="preserve">  Participants were matched for age, gender and race/ethnicity but not BMI.  This table represents the matched set for </w:t>
+      </w:r>
+      <w:r>
+        <w:t xml:space="preserve">patients with </w:t>
+      </w:r>
+      <w:r>
+        <w:t xml:space="preserve">Cushing’s </w:t>
+      </w:r>
+      <w:r>
+        <w:t>disease</w:t>
+      </w:r>
+      <w:r>
+        <w:t xml:space="preserve"> with any laboratory value we considered.  Supplementary Tables S2A-E describe outcome-specific matched </w:t>
+      </w:r>
+      <w:r>
+        <w:t>characteristics</w:t>
+      </w:r>
+      <w:r>
+        <w:t>.</w:t>
       </w:r>
     </w:p>
     <w:p>
@@ -1315,49 +1397,103 @@
           <w:b/>
           <w:bCs/>
         </w:rPr>
-        <w:t>Supplementary Figure</w:t>
-      </w:r>
+        <w:t>Table 2: Participant characteristics after stratification by obesity</w:t>
+      </w:r>
+      <w:r>
+        <w:t xml:space="preserve">.  </w:t>
+      </w:r>
+      <w:r>
+        <w:t xml:space="preserve">Values are mean ± SD or n (%). Groups were stratified by Cushing’s status and obesity; no matching was performed across these strata. </w:t>
+      </w:r>
+      <w:r>
+        <w:t>Kruskal-Wallis</w:t>
+      </w:r>
+      <w:r>
+        <w:t xml:space="preserve"> or χ² compare across the four groups</w:t>
+      </w:r>
+      <w:r>
+        <w:t xml:space="preserve"> to generate p-values</w:t>
+      </w:r>
+      <w:r>
+        <w:t>.</w:t>
+      </w:r>
+    </w:p>
+    <w:p>
+      <w:pPr>
+        <w:pStyle w:val="NormalWeb"/>
+      </w:pPr>
       <w:r>
         <w:rPr>
           <w:b/>
           <w:bCs/>
         </w:rPr>
+        <w:t xml:space="preserve">Table 3: Effect sizes and statistical significance for each outcome.  </w:t>
+      </w:r>
+      <w:r>
+        <w:t xml:space="preserve">A) Sub-group specific effects of Cushing’s disease after adjusting for age, gender and race/ethnicity for each outcome.  B) Summary of interactions between obesity and Cushing’s disease on each outcome, after adjusting for age, gender, and race/ethnicity.  </w:t>
+      </w:r>
+      <w:r>
+        <w:t xml:space="preserve">Data are presented as mean with 95% confidence intervals.  </w:t>
+      </w:r>
+      <w:r>
+        <w:t xml:space="preserve">For </w:t>
+      </w:r>
+      <w:proofErr w:type="gramStart"/>
+      <w:r>
+        <w:t xml:space="preserve">both </w:t>
+      </w:r>
+      <w:r>
+        <w:t>of these</w:t>
+      </w:r>
+      <w:proofErr w:type="gramEnd"/>
+      <w:r>
         <w:t xml:space="preserve"> </w:t>
       </w:r>
+      <w:r>
+        <w:t>tables</w:t>
+      </w:r>
+      <w:r>
+        <w:t>, LDL-C was not adjusted for race/ethnicity due to small sample size.</w:t>
+      </w:r>
+    </w:p>
+    <w:p>
+      <w:pPr>
+        <w:pStyle w:val="NormalWeb"/>
+      </w:pPr>
       <w:r>
         <w:rPr>
           <w:b/>
           <w:bCs/>
         </w:rPr>
-        <w:t>1</w:t>
+        <w:t>Supplementary Figure</w:t>
       </w:r>
       <w:r>
         <w:rPr>
           <w:b/>
           <w:bCs/>
         </w:rPr>
-        <w:t>: Love plot</w:t>
+        <w:t xml:space="preserve"> </w:t>
       </w:r>
       <w:r>
         <w:rPr>
           <w:b/>
           <w:bCs/>
         </w:rPr>
-        <w:t>s</w:t>
+        <w:t>1</w:t>
       </w:r>
       <w:r>
         <w:rPr>
           <w:b/>
           <w:bCs/>
         </w:rPr>
-        <w:t xml:space="preserve"> </w:t>
+        <w:t>: Love plot</w:t>
       </w:r>
       <w:r>
         <w:rPr>
           <w:b/>
           <w:bCs/>
         </w:rPr>
-        <w:t>showing</w:t>
+        <w:t>s</w:t>
       </w:r>
       <w:r>
         <w:rPr>
@@ -1371,13 +1507,27 @@
           <w:b/>
           <w:bCs/>
         </w:rPr>
-        <w:t>covariate balance</w:t>
+        <w:t>showing</w:t>
       </w:r>
       <w:r>
         <w:rPr>
           <w:b/>
           <w:bCs/>
         </w:rPr>
+        <w:t xml:space="preserve"> </w:t>
+      </w:r>
+      <w:r>
+        <w:rPr>
+          <w:b/>
+          <w:bCs/>
+        </w:rPr>
+        <w:t>covariate balance</w:t>
+      </w:r>
+      <w:r>
+        <w:rPr>
+          <w:b/>
+          <w:bCs/>
+        </w:rPr>
         <w:t xml:space="preserve"> each outcome.</w:t>
       </w:r>
       <w:r>
@@ -1387,7 +1537,11 @@
         <w:t>standardized mean difference</w:t>
       </w:r>
       <w:r>
-        <w:t xml:space="preserve"> for each variable prior to- and after propensity mapping.  </w:t>
+        <w:t xml:space="preserve"> for each variable prior to- and after propensity </w:t>
+      </w:r>
+      <w:r>
+        <w:lastRenderedPageBreak/>
+        <w:t xml:space="preserve">mapping.  </w:t>
       </w:r>
       <w:r>
         <w:t xml:space="preserve">Dashed line indicates the </w:t>
@@ -3019,6 +3173,7 @@
           <w:szCs w:val="18"/>
           <w14:ligatures w14:val="none"/>
         </w:rPr>
+        <w:lastRenderedPageBreak/>
         <w:t>-</w:t>
       </w:r>
       <w:r>
@@ -3554,6 +3709,23 @@
       </w:r>
     </w:p>
   </w:comment>
+  <w:comment w:id="7" w:author="Dave Bridges" w:date="2025-09-07T20:08:00Z" w:initials="DB">
+    <w:p>
+      <w:r>
+        <w:rPr>
+          <w:rStyle w:val="CommentReference"/>
+        </w:rPr>
+        <w:annotationRef/>
+      </w:r>
+      <w:r>
+        <w:rPr>
+          <w:sz w:val="20"/>
+          <w:szCs w:val="20"/>
+        </w:rPr>
+        <w:t>@trey why dont you give a try of explaining these, first talking about the effects of Cushings (see Table 3A) and then whether there is evidence of positive or negative effect modification (Table 3B)</w:t>
+      </w:r>
+    </w:p>
+  </w:comment>
 </w:comments>
 </file>
 
@@ -3566,6 +3738,7 @@
   <w15:commentEx w15:paraId="2B4220B9" w15:done="0"/>
   <w15:commentEx w15:paraId="3F27DAC3" w15:done="0"/>
   <w15:commentEx w15:paraId="392E4D0B" w15:done="0"/>
+  <w15:commentEx w15:paraId="57ADD46F" w15:done="0"/>
 </w15:commentsEx>
 </file>
 
@@ -3578,6 +3751,7 @@
   <w16cex:commentExtensible w16cex:durableId="73524BEF" w16cex:dateUtc="2025-09-07T18:40:00Z"/>
   <w16cex:commentExtensible w16cex:durableId="10479658" w16cex:dateUtc="2025-09-05T22:06:00Z"/>
   <w16cex:commentExtensible w16cex:durableId="4FC4BC49" w16cex:dateUtc="2025-09-05T23:38:00Z"/>
+  <w16cex:commentExtensible w16cex:durableId="4855A8FC" w16cex:dateUtc="2025-09-08T00:08:00Z"/>
 </w16cex:commentsExtensible>
 </file>
 
@@ -3590,12 +3764,126 @@
   <w16cid:commentId w16cid:paraId="2B4220B9" w16cid:durableId="73524BEF"/>
   <w16cid:commentId w16cid:paraId="3F27DAC3" w16cid:durableId="10479658"/>
   <w16cid:commentId w16cid:paraId="392E4D0B" w16cid:durableId="4FC4BC49"/>
+  <w16cid:commentId w16cid:paraId="57ADD46F" w16cid:durableId="4855A8FC"/>
 </w16cid:commentsIds>
 </file>
 
 <file path=word/numbering.xml><?xml version="1.0" encoding="utf-8"?>
 <w:numbering xmlns:wpc="http://schemas.microsoft.com/office/word/2010/wordprocessingCanvas" xmlns:cx="http://schemas.microsoft.com/office/drawing/2014/chartex" xmlns:cx1="http://schemas.microsoft.com/office/drawing/2015/9/8/chartex" xmlns:cx2="http://schemas.microsoft.com/office/drawing/2015/10/21/chartex" xmlns:cx3="http://schemas.microsoft.com/office/drawing/2016/5/9/chartex" xmlns:cx4="http://schemas.microsoft.com/office/drawing/2016/5/10/chartex" xmlns:cx5="http://schemas.microsoft.com/office/drawing/2016/5/11/chartex" xmlns:cx6="http://schemas.microsoft.com/office/drawing/2016/5/12/chartex" xmlns:cx7="http://schemas.microsoft.com/office/drawing/2016/5/13/chartex" xmlns:cx8="http://schemas.microsoft.com/office/drawing/2016/5/14/chartex" xmlns:mc="http://schemas.openxmlformats.org/markup-compatibility/2006" xmlns:aink="http://schemas.microsoft.com/office/drawing/2016/ink" xmlns:am3d="http://schemas.microsoft.com/office/drawing/2017/model3d" xmlns:o="urn:schemas-microsoft-com:office:office" xmlns:oel="http://schemas.microsoft.com/office/2019/extlst" xmlns:r="http://schemas.openxmlformats.org/officeDocument/2006/relationships" xmlns:m="http://schemas.openxmlformats.org/officeDocument/2006/math" xmlns:v="urn:schemas-microsoft-com:vml" xmlns:wp14="http://schemas.microsoft.com/office/word/2010/wordprocessingDrawing" xmlns:wp="http://schemas.openxmlformats.org/drawingml/2006/wordprocessingDrawing" xmlns:w10="urn:schemas-microsoft-com:office:word" xmlns:w="http://schemas.openxmlformats.org/wordprocessingml/2006/main" xmlns:w14="http://schemas.microsoft.com/office/word/2010/wordml" xmlns:w15="http://schemas.microsoft.com/office/word/2012/wordml" xmlns:w16cex="http://schemas.microsoft.com/office/word/2018/wordml/cex" xmlns:w16cid="http://schemas.microsoft.com/office/word/2016/wordml/cid" xmlns:w16="http://schemas.microsoft.com/office/word/2018/wordml" xmlns:w16du="http://schemas.microsoft.com/office/word/2023/wordml/word16du" xmlns:w16sdtdh="http://schemas.microsoft.com/office/word/2020/wordml/sdtdatahash" xmlns:w16sdtfl="http://schemas.microsoft.com/office/word/2024/wordml/sdtformatlock" xmlns:w16se="http://schemas.microsoft.com/office/word/2015/wordml/symex" xmlns:wpg="http://schemas.microsoft.com/office/word/2010/wordprocessingGroup" xmlns:wpi="http://schemas.microsoft.com/office/word/2010/wordprocessingInk" xmlns:wne="http://schemas.microsoft.com/office/word/2006/wordml" xmlns:wps="http://schemas.microsoft.com/office/word/2010/wordprocessingShape" mc:Ignorable="w14 w15 w16se w16cid w16 w16cex w16sdtdh w16sdtfl w16du wp14">
   <w:abstractNum w:abstractNumId="0" w15:restartNumberingAfterBreak="0">
+    <w:nsid w:val="0C2470A5"/>
+    <w:multiLevelType w:val="hybridMultilevel"/>
+    <w:tmpl w:val="935CBA88"/>
+    <w:lvl w:ilvl="0" w:tplc="04090001">
+      <w:start w:val="1"/>
+      <w:numFmt w:val="bullet"/>
+      <w:lvlText w:val=""/>
+      <w:lvlJc w:val="left"/>
+      <w:pPr>
+        <w:ind w:left="720" w:hanging="360"/>
+      </w:pPr>
+      <w:rPr>
+        <w:rFonts w:ascii="Symbol" w:hAnsi="Symbol" w:hint="default"/>
+      </w:rPr>
+    </w:lvl>
+    <w:lvl w:ilvl="1" w:tplc="04090003" w:tentative="1">
+      <w:start w:val="1"/>
+      <w:numFmt w:val="bullet"/>
+      <w:lvlText w:val="o"/>
+      <w:lvlJc w:val="left"/>
+      <w:pPr>
+        <w:ind w:left="1440" w:hanging="360"/>
+      </w:pPr>
+      <w:rPr>
+        <w:rFonts w:ascii="Courier New" w:hAnsi="Courier New" w:cs="Courier New" w:hint="default"/>
+      </w:rPr>
+    </w:lvl>
+    <w:lvl w:ilvl="2" w:tplc="04090005" w:tentative="1">
+      <w:start w:val="1"/>
+      <w:numFmt w:val="bullet"/>
+      <w:lvlText w:val=""/>
+      <w:lvlJc w:val="left"/>
+      <w:pPr>
+        <w:ind w:left="2160" w:hanging="360"/>
+      </w:pPr>
+      <w:rPr>
+        <w:rFonts w:ascii="Wingdings" w:hAnsi="Wingdings" w:hint="default"/>
+      </w:rPr>
+    </w:lvl>
+    <w:lvl w:ilvl="3" w:tplc="04090001" w:tentative="1">
+      <w:start w:val="1"/>
+      <w:numFmt w:val="bullet"/>
+      <w:lvlText w:val=""/>
+      <w:lvlJc w:val="left"/>
+      <w:pPr>
+        <w:ind w:left="2880" w:hanging="360"/>
+      </w:pPr>
+      <w:rPr>
+        <w:rFonts w:ascii="Symbol" w:hAnsi="Symbol" w:hint="default"/>
+      </w:rPr>
+    </w:lvl>
+    <w:lvl w:ilvl="4" w:tplc="04090003" w:tentative="1">
+      <w:start w:val="1"/>
+      <w:numFmt w:val="bullet"/>
+      <w:lvlText w:val="o"/>
+      <w:lvlJc w:val="left"/>
+      <w:pPr>
+        <w:ind w:left="3600" w:hanging="360"/>
+      </w:pPr>
+      <w:rPr>
+        <w:rFonts w:ascii="Courier New" w:hAnsi="Courier New" w:cs="Courier New" w:hint="default"/>
+      </w:rPr>
+    </w:lvl>
+    <w:lvl w:ilvl="5" w:tplc="04090005" w:tentative="1">
+      <w:start w:val="1"/>
+      <w:numFmt w:val="bullet"/>
+      <w:lvlText w:val=""/>
+      <w:lvlJc w:val="left"/>
+      <w:pPr>
+        <w:ind w:left="4320" w:hanging="360"/>
+      </w:pPr>
+      <w:rPr>
+        <w:rFonts w:ascii="Wingdings" w:hAnsi="Wingdings" w:hint="default"/>
+      </w:rPr>
+    </w:lvl>
+    <w:lvl w:ilvl="6" w:tplc="04090001" w:tentative="1">
+      <w:start w:val="1"/>
+      <w:numFmt w:val="bullet"/>
+      <w:lvlText w:val=""/>
+      <w:lvlJc w:val="left"/>
+      <w:pPr>
+        <w:ind w:left="5040" w:hanging="360"/>
+      </w:pPr>
+      <w:rPr>
+        <w:rFonts w:ascii="Symbol" w:hAnsi="Symbol" w:hint="default"/>
+      </w:rPr>
+    </w:lvl>
+    <w:lvl w:ilvl="7" w:tplc="04090003" w:tentative="1">
+      <w:start w:val="1"/>
+      <w:numFmt w:val="bullet"/>
+      <w:lvlText w:val="o"/>
+      <w:lvlJc w:val="left"/>
+      <w:pPr>
+        <w:ind w:left="5760" w:hanging="360"/>
+      </w:pPr>
+      <w:rPr>
+        <w:rFonts w:ascii="Courier New" w:hAnsi="Courier New" w:cs="Courier New" w:hint="default"/>
+      </w:rPr>
+    </w:lvl>
+    <w:lvl w:ilvl="8" w:tplc="04090005" w:tentative="1">
+      <w:start w:val="1"/>
+      <w:numFmt w:val="bullet"/>
+      <w:lvlText w:val=""/>
+      <w:lvlJc w:val="left"/>
+      <w:pPr>
+        <w:ind w:left="6480" w:hanging="360"/>
+      </w:pPr>
+      <w:rPr>
+        <w:rFonts w:ascii="Wingdings" w:hAnsi="Wingdings" w:hint="default"/>
+      </w:rPr>
+    </w:lvl>
+  </w:abstractNum>
+  <w:abstractNum w:abstractNumId="1" w15:restartNumberingAfterBreak="0">
     <w:nsid w:val="314E464B"/>
     <w:multiLevelType w:val="multilevel"/>
     <w:tmpl w:val="DF14C69E"/>
@@ -3744,7 +4032,7 @@
       </w:rPr>
     </w:lvl>
   </w:abstractNum>
-  <w:abstractNum w:abstractNumId="1" w15:restartNumberingAfterBreak="0">
+  <w:abstractNum w:abstractNumId="2" w15:restartNumberingAfterBreak="0">
     <w:nsid w:val="33697BBF"/>
     <w:multiLevelType w:val="multilevel"/>
     <w:tmpl w:val="5404B786"/>
@@ -3893,7 +4181,7 @@
       </w:rPr>
     </w:lvl>
   </w:abstractNum>
-  <w:abstractNum w:abstractNumId="2" w15:restartNumberingAfterBreak="0">
+  <w:abstractNum w:abstractNumId="3" w15:restartNumberingAfterBreak="0">
     <w:nsid w:val="439A3A3B"/>
     <w:multiLevelType w:val="multilevel"/>
     <w:tmpl w:val="31E0D27A"/>
@@ -4042,7 +4330,7 @@
       </w:rPr>
     </w:lvl>
   </w:abstractNum>
-  <w:abstractNum w:abstractNumId="3" w15:restartNumberingAfterBreak="0">
+  <w:abstractNum w:abstractNumId="4" w15:restartNumberingAfterBreak="0">
     <w:nsid w:val="451860B2"/>
     <w:multiLevelType w:val="multilevel"/>
     <w:tmpl w:val="D0247434"/>
@@ -4191,7 +4479,7 @@
       </w:rPr>
     </w:lvl>
   </w:abstractNum>
-  <w:abstractNum w:abstractNumId="4" w15:restartNumberingAfterBreak="0">
+  <w:abstractNum w:abstractNumId="5" w15:restartNumberingAfterBreak="0">
     <w:nsid w:val="75AB7E4B"/>
     <w:multiLevelType w:val="multilevel"/>
     <w:tmpl w:val="ABE024C0"/>
@@ -4341,19 +4629,22 @@
     </w:lvl>
   </w:abstractNum>
   <w:num w:numId="1" w16cid:durableId="125784557">
-    <w:abstractNumId w:val="0"/>
+    <w:abstractNumId w:val="1"/>
   </w:num>
   <w:num w:numId="2" w16cid:durableId="278075531">
+    <w:abstractNumId w:val="3"/>
+  </w:num>
+  <w:num w:numId="3" w16cid:durableId="759060415">
+    <w:abstractNumId w:val="4"/>
+  </w:num>
+  <w:num w:numId="4" w16cid:durableId="702511983">
+    <w:abstractNumId w:val="5"/>
+  </w:num>
+  <w:num w:numId="5" w16cid:durableId="178588088">
     <w:abstractNumId w:val="2"/>
   </w:num>
-  <w:num w:numId="3" w16cid:durableId="759060415">
-    <w:abstractNumId w:val="3"/>
-  </w:num>
-  <w:num w:numId="4" w16cid:durableId="702511983">
-    <w:abstractNumId w:val="4"/>
-  </w:num>
-  <w:num w:numId="5" w16cid:durableId="178588088">
-    <w:abstractNumId w:val="1"/>
+  <w:num w:numId="6" w16cid:durableId="142549117">
+    <w:abstractNumId w:val="0"/>
   </w:num>
 </w:numbering>
 </file>

</xml_diff>

<commit_message>
Added some articles we were looking for regarding lab tests and sex diff
</commit_message>
<xml_diff>
--- a/manuscript/Cushings-Obesity/manuscript.docx
+++ b/manuscript/Cushings-Obesity/manuscript.docx
@@ -473,6 +473,9 @@
         </w:rPr>
         <w:commentReference w:id="4"/>
       </w:r>
+      <w:r>
+        <w:t xml:space="preserve"> </w:t>
+      </w:r>
     </w:p>
     <w:p/>
     <w:p>
@@ -594,6 +597,9 @@
         <w:t xml:space="preserve">   Here we reproduce several notable characteristics, including a higher prevalence of Cushing’s disease in females </w:t>
       </w:r>
       <w:commentRangeStart w:id="5"/>
+      <w:commentRangeStart w:id="6"/>
+      <w:commentRangeStart w:id="7"/>
+      <w:commentRangeStart w:id="8"/>
       <w:r>
         <w:t xml:space="preserve">(284 vs 72) </w:t>
       </w:r>
@@ -604,13 +610,34 @@
         </w:rPr>
         <w:commentReference w:id="5"/>
       </w:r>
+      <w:commentRangeEnd w:id="6"/>
+      <w:r>
+        <w:rPr>
+          <w:rStyle w:val="CommentReference"/>
+        </w:rPr>
+        <w:commentReference w:id="6"/>
+      </w:r>
+      <w:commentRangeEnd w:id="7"/>
+      <w:r>
+        <w:rPr>
+          <w:rStyle w:val="CommentReference"/>
+        </w:rPr>
+        <w:commentReference w:id="7"/>
+      </w:r>
+      <w:commentRangeEnd w:id="8"/>
+      <w:r>
+        <w:rPr>
+          <w:rStyle w:val="CommentReference"/>
+        </w:rPr>
+        <w:commentReference w:id="8"/>
+      </w:r>
       <w:r>
         <w:t>and a higher body mass index for patients with Cushing’s disease (both p&lt;0.001).</w:t>
       </w:r>
       <w:r>
         <w:t xml:space="preserve">  </w:t>
       </w:r>
-      <w:commentRangeStart w:id="6"/>
+      <w:commentRangeStart w:id="9"/>
       <w:r>
         <w:t>Prior to matching for Race and Ethnicity, we noted that participants</w:t>
       </w:r>
@@ -644,12 +671,12 @@
       <w:r>
         <w:t>or Black</w:t>
       </w:r>
-      <w:commentRangeEnd w:id="6"/>
+      <w:commentRangeEnd w:id="9"/>
       <w:r>
         <w:rPr>
           <w:rStyle w:val="CommentReference"/>
         </w:rPr>
-        <w:commentReference w:id="6"/>
+        <w:commentReference w:id="9"/>
       </w:r>
       <w:r>
         <w:t xml:space="preserve"> (p=0.01</w:t>
@@ -894,7 +921,7 @@
           <w:bCs/>
         </w:rPr>
       </w:pPr>
-      <w:commentRangeStart w:id="7"/>
+      <w:commentRangeStart w:id="10"/>
       <w:proofErr w:type="spellStart"/>
       <w:r>
         <w:rPr>
@@ -951,7 +978,7 @@
         </w:rPr>
         <w:t>Blood Pressure</w:t>
       </w:r>
-      <w:commentRangeEnd w:id="7"/>
+      <w:commentRangeEnd w:id="10"/>
       <w:r>
         <w:rPr>
           <w:rStyle w:val="CommentReference"/>
@@ -959,7 +986,7 @@
           <w:kern w:val="2"/>
           <w14:ligatures w14:val="standardContextual"/>
         </w:rPr>
-        <w:commentReference w:id="7"/>
+        <w:commentReference w:id="10"/>
       </w:r>
     </w:p>
     <w:p>
@@ -1151,10 +1178,63 @@
     </w:p>
     <w:p>
       <w:pPr>
+        <w:pStyle w:val="ListParagraph"/>
+        <w:numPr>
+          <w:ilvl w:val="0"/>
+          <w:numId w:val="6"/>
+        </w:numPr>
+      </w:pPr>
+      <w:r>
+        <w:t>Gender difference is interesting – increasing fivefold (probably something biological and not a social aspect of doctor frequency)</w:t>
+      </w:r>
+    </w:p>
+    <w:p>
+      <w:pPr>
+        <w:pStyle w:val="ListParagraph"/>
+        <w:numPr>
+          <w:ilvl w:val="0"/>
+          <w:numId w:val="6"/>
+        </w:numPr>
+      </w:pPr>
+      <w:r>
+        <w:lastRenderedPageBreak/>
+        <w:t>Control population has more recent labs</w:t>
+      </w:r>
+    </w:p>
+    <w:p>
+      <w:pPr>
+        <w:pStyle w:val="ListParagraph"/>
+        <w:numPr>
+          <w:ilvl w:val="0"/>
+          <w:numId w:val="6"/>
+        </w:numPr>
+      </w:pPr>
+      <w:r>
+        <w:t xml:space="preserve">BMI Higher in </w:t>
+      </w:r>
+      <w:proofErr w:type="spellStart"/>
+      <w:r>
+        <w:t>cushings</w:t>
+      </w:r>
+      <w:proofErr w:type="spellEnd"/>
+      <w:r>
+        <w:t xml:space="preserve"> case</w:t>
+      </w:r>
+    </w:p>
+    <w:p>
+      <w:pPr>
+        <w:pStyle w:val="ListParagraph"/>
+        <w:numPr>
+          <w:ilvl w:val="0"/>
+          <w:numId w:val="6"/>
+        </w:numPr>
+      </w:pPr>
+    </w:p>
+    <w:p>
+      <w:pPr>
         <w:pStyle w:val="Heading1"/>
       </w:pPr>
       <w:r>
-        <w:lastRenderedPageBreak/>
         <w:t>References</w:t>
       </w:r>
     </w:p>
@@ -1425,7 +1505,11 @@
         <w:t xml:space="preserve">A) Sub-group specific effects of Cushing’s disease after adjusting for age, gender and race/ethnicity for each outcome.  B) Summary of interactions between obesity and Cushing’s disease on each outcome, after adjusting for age, gender, and race/ethnicity.  </w:t>
       </w:r>
       <w:r>
-        <w:t xml:space="preserve">Data are presented as mean with 95% confidence intervals.  </w:t>
+        <w:t xml:space="preserve">Data are presented as mean with 95% confidence </w:t>
+      </w:r>
+      <w:r>
+        <w:lastRenderedPageBreak/>
+        <w:t xml:space="preserve">intervals.  </w:t>
       </w:r>
       <w:r>
         <w:t xml:space="preserve">For </w:t>
@@ -1529,11 +1613,7 @@
         <w:t>standardized mean difference</w:t>
       </w:r>
       <w:r>
-        <w:t xml:space="preserve"> for each variable prior to- and after propensity </w:t>
-      </w:r>
-      <w:r>
-        <w:lastRenderedPageBreak/>
-        <w:t xml:space="preserve">mapping.  </w:t>
+        <w:t xml:space="preserve"> for each variable prior to- and after propensity mapping.  </w:t>
       </w:r>
       <w:r>
         <w:t xml:space="preserve">Dashed line indicates the </w:t>
@@ -3165,7 +3245,6 @@
           <w:szCs w:val="18"/>
           <w14:ligatures w14:val="none"/>
         </w:rPr>
-        <w:lastRenderedPageBreak/>
         <w:t>-</w:t>
       </w:r>
       <w:r>
@@ -3684,7 +3763,7 @@
       </w:r>
     </w:p>
   </w:comment>
-  <w:comment w:id="6" w:author="Dave Bridges" w:date="2025-09-05T19:38:00Z" w:initials="DB">
+  <w:comment w:id="6" w:author="Carr, Treyton" w:date="2025-09-08T12:19:00Z" w:initials="CT">
     <w:p>
       <w:r>
         <w:rPr>
@@ -3697,11 +3776,272 @@
           <w:sz w:val="20"/>
           <w:szCs w:val="20"/>
         </w:rPr>
+        <w:t>also look for which lab outcomes they looked at</w:t>
+      </w:r>
+    </w:p>
+  </w:comment>
+  <w:comment w:id="7" w:author="Carr, Treyton" w:date="2025-09-14T17:23:00Z" w:initials="CT">
+    <w:p>
+      <w:r>
+        <w:rPr>
+          <w:rStyle w:val="CommentReference"/>
+        </w:rPr>
+        <w:annotationRef/>
+      </w:r>
+      <w:r>
+        <w:rPr>
+          <w:sz w:val="20"/>
+          <w:szCs w:val="20"/>
+        </w:rPr>
+        <w:t>other papers that describe higher proportion of women with Cushings:</w:t>
+      </w:r>
+    </w:p>
+    <w:p>
+      <w:r>
+        <w:rPr>
+          <w:sz w:val="20"/>
+          <w:szCs w:val="20"/>
+        </w:rPr>
+        <w:t xml:space="preserve"> </w:t>
+      </w:r>
+      <w:hyperlink r:id="rId1" w:history="1">
+        <w:r>
+          <w:rPr>
+            <w:rStyle w:val="Hyperlink"/>
+            <w:sz w:val="20"/>
+            <w:szCs w:val="20"/>
+          </w:rPr>
+          <w:t>https://doi.org/10.1111/j.1365-2265.1994.tb02486.x</w:t>
+        </w:r>
+      </w:hyperlink>
+    </w:p>
+    <w:p/>
+    <w:p>
+      <w:r>
+        <w:rPr>
+          <w:sz w:val="20"/>
+          <w:szCs w:val="20"/>
+        </w:rPr>
+        <w:t>DOI:  10.1007/s11102-014-0569-6</w:t>
+      </w:r>
+    </w:p>
+    <w:p/>
+    <w:p>
+      <w:hyperlink r:id="rId2" w:history="1">
+        <w:r>
+          <w:rPr>
+            <w:rStyle w:val="Hyperlink"/>
+            <w:sz w:val="20"/>
+            <w:szCs w:val="20"/>
+          </w:rPr>
+          <w:t>https://doi.org/10.1159/000314297</w:t>
+        </w:r>
+      </w:hyperlink>
+    </w:p>
+    <w:p/>
+    <w:p>
+      <w:hyperlink r:id="rId3" w:history="1">
+        <w:r>
+          <w:rPr>
+            <w:rStyle w:val="Hyperlink"/>
+            <w:sz w:val="20"/>
+            <w:szCs w:val="20"/>
+          </w:rPr>
+          <w:t>https://doi.org/10.1186/s40478-025-01938-9</w:t>
+        </w:r>
+      </w:hyperlink>
+    </w:p>
+    <w:p/>
+    <w:p>
+      <w:hyperlink r:id="rId4" w:history="1">
+        <w:r>
+          <w:rPr>
+            <w:rStyle w:val="Hyperlink"/>
+            <w:sz w:val="20"/>
+            <w:szCs w:val="20"/>
+          </w:rPr>
+          <w:t>https://doi.org/10.1159/000540205</w:t>
+        </w:r>
+      </w:hyperlink>
+    </w:p>
+    <w:p/>
+    <w:p>
+      <w:r>
+        <w:rPr>
+          <w:sz w:val="20"/>
+          <w:szCs w:val="20"/>
+        </w:rPr>
+        <w:t>DOI: 10.3390/jcm14093000</w:t>
+      </w:r>
+    </w:p>
+    <w:p/>
+    <w:p>
+      <w:r>
+        <w:rPr>
+          <w:sz w:val="20"/>
+          <w:szCs w:val="20"/>
+        </w:rPr>
+        <w:t>There are many more articles that show this, this is a shotgun of articles over the last 20 years or so</w:t>
+      </w:r>
+    </w:p>
+  </w:comment>
+  <w:comment w:id="8" w:author="Carr, Treyton" w:date="2025-09-14T17:35:00Z" w:initials="CT">
+    <w:p>
+      <w:r>
+        <w:rPr>
+          <w:rStyle w:val="CommentReference"/>
+        </w:rPr>
+        <w:annotationRef/>
+      </w:r>
+      <w:r>
+        <w:rPr>
+          <w:sz w:val="20"/>
+          <w:szCs w:val="20"/>
+        </w:rPr>
+        <w:t>Lab outcomes looked at in those cushings studies</w:t>
+      </w:r>
+    </w:p>
+    <w:p>
+      <w:r>
+        <w:rPr>
+          <w:sz w:val="20"/>
+          <w:szCs w:val="20"/>
+        </w:rPr>
+        <w:t>in this one:</w:t>
+      </w:r>
+    </w:p>
+    <w:p>
+      <w:r>
+        <w:rPr>
+          <w:sz w:val="20"/>
+          <w:szCs w:val="20"/>
+        </w:rPr>
+        <w:t>10.1007/s11102-014-0567-8</w:t>
+      </w:r>
+    </w:p>
+    <w:p>
+      <w:r>
+        <w:rPr>
+          <w:sz w:val="20"/>
+          <w:szCs w:val="20"/>
+        </w:rPr>
+        <w:t>-mean basal serum cortisol, other cortisol measurements</w:t>
+      </w:r>
+    </w:p>
+    <w:p>
+      <w:r>
+        <w:rPr>
+          <w:sz w:val="20"/>
+          <w:szCs w:val="20"/>
+        </w:rPr>
+        <w:t>-plasma acth</w:t>
+      </w:r>
+    </w:p>
+    <w:p>
+      <w:r>
+        <w:rPr>
+          <w:sz w:val="20"/>
+          <w:szCs w:val="20"/>
+        </w:rPr>
+        <w:t>doi:10.1111/cen.12644.</w:t>
+      </w:r>
+    </w:p>
+    <w:p>
+      <w:r>
+        <w:rPr>
+          <w:sz w:val="20"/>
+          <w:szCs w:val="20"/>
+        </w:rPr>
+        <w:t>-Fasting glucose</w:t>
+      </w:r>
+    </w:p>
+    <w:p>
+      <w:r>
+        <w:rPr>
+          <w:sz w:val="20"/>
+          <w:szCs w:val="20"/>
+        </w:rPr>
+        <w:t>-LDL and HDL</w:t>
+      </w:r>
+    </w:p>
+    <w:p>
+      <w:r>
+        <w:rPr>
+          <w:sz w:val="20"/>
+          <w:szCs w:val="20"/>
+        </w:rPr>
+        <w:t>-total cholesterol</w:t>
+      </w:r>
+    </w:p>
+    <w:p>
+      <w:r>
+        <w:rPr>
+          <w:sz w:val="20"/>
+          <w:szCs w:val="20"/>
+        </w:rPr>
+        <w:t>-insulin</w:t>
+      </w:r>
+    </w:p>
+    <w:p/>
+    <w:p>
+      <w:hyperlink r:id="rId5" w:history="1">
+        <w:r>
+          <w:rPr>
+            <w:rStyle w:val="Hyperlink"/>
+            <w:sz w:val="20"/>
+            <w:szCs w:val="20"/>
+          </w:rPr>
+          <w:t>https://doi-org.proxy.lib.umich.edu/10.1210/clinem/dgae904</w:t>
+        </w:r>
+      </w:hyperlink>
+    </w:p>
+    <w:p>
+      <w:r>
+        <w:rPr>
+          <w:sz w:val="20"/>
+          <w:szCs w:val="20"/>
+        </w:rPr>
+        <w:t>-DST test</w:t>
+      </w:r>
+    </w:p>
+    <w:p>
+      <w:r>
+        <w:rPr>
+          <w:sz w:val="20"/>
+          <w:szCs w:val="20"/>
+        </w:rPr>
+        <w:t>-ACTH</w:t>
+      </w:r>
+    </w:p>
+    <w:p>
+      <w:r>
+        <w:rPr>
+          <w:sz w:val="20"/>
+          <w:szCs w:val="20"/>
+        </w:rPr>
+        <w:t>-more various cortisol tests (salivary new one)</w:t>
+      </w:r>
+    </w:p>
+    <w:p/>
+  </w:comment>
+  <w:comment w:id="9" w:author="Dave Bridges" w:date="2025-09-05T19:38:00Z" w:initials="DB">
+    <w:p>
+      <w:r>
+        <w:rPr>
+          <w:rStyle w:val="CommentReference"/>
+        </w:rPr>
+        <w:annotationRef/>
+      </w:r>
+      <w:r>
+        <w:rPr>
+          <w:sz w:val="20"/>
+          <w:szCs w:val="20"/>
+        </w:rPr>
         <w:t>@trey also any data on demographic propensities towards Cushings we can cite?</w:t>
       </w:r>
     </w:p>
   </w:comment>
-  <w:comment w:id="7" w:author="Dave Bridges" w:date="2025-09-07T20:08:00Z" w:initials="DB">
+  <w:comment w:id="10" w:author="Dave Bridges" w:date="2025-09-07T20:08:00Z" w:initials="DB">
     <w:p>
       <w:r>
         <w:rPr>
@@ -3729,6 +4069,9 @@
   <w15:commentEx w15:paraId="1DD21AA1" w15:done="0"/>
   <w15:commentEx w15:paraId="2B4220B9" w15:done="0"/>
   <w15:commentEx w15:paraId="3F27DAC3" w15:done="0"/>
+  <w15:commentEx w15:paraId="3B9D134E" w15:paraIdParent="3F27DAC3" w15:done="0"/>
+  <w15:commentEx w15:paraId="0BE13372" w15:paraIdParent="3F27DAC3" w15:done="0"/>
+  <w15:commentEx w15:paraId="1B19137F" w15:paraIdParent="3F27DAC3" w15:done="0"/>
   <w15:commentEx w15:paraId="392E4D0B" w15:done="0"/>
   <w15:commentEx w15:paraId="57ADD46F" w15:done="0"/>
 </w15:commentsEx>
@@ -3742,6 +4085,9 @@
   <w16cex:commentExtensible w16cex:durableId="1A95B88A" w16cex:dateUtc="2025-09-05T23:50:00Z"/>
   <w16cex:commentExtensible w16cex:durableId="73524BEF" w16cex:dateUtc="2025-09-07T18:40:00Z"/>
   <w16cex:commentExtensible w16cex:durableId="10479658" w16cex:dateUtc="2025-09-05T22:06:00Z"/>
+  <w16cex:commentExtensible w16cex:durableId="2B1FD511" w16cex:dateUtc="2025-09-08T16:19:00Z"/>
+  <w16cex:commentExtensible w16cex:durableId="40A56FB1" w16cex:dateUtc="2025-09-14T21:23:00Z"/>
+  <w16cex:commentExtensible w16cex:durableId="3E036B7C" w16cex:dateUtc="2025-09-14T21:35:00Z"/>
   <w16cex:commentExtensible w16cex:durableId="4FC4BC49" w16cex:dateUtc="2025-09-05T23:38:00Z"/>
   <w16cex:commentExtensible w16cex:durableId="4855A8FC" w16cex:dateUtc="2025-09-08T00:08:00Z"/>
 </w16cex:commentsExtensible>
@@ -3755,6 +4101,9 @@
   <w16cid:commentId w16cid:paraId="1DD21AA1" w16cid:durableId="1A95B88A"/>
   <w16cid:commentId w16cid:paraId="2B4220B9" w16cid:durableId="73524BEF"/>
   <w16cid:commentId w16cid:paraId="3F27DAC3" w16cid:durableId="10479658"/>
+  <w16cid:commentId w16cid:paraId="3B9D134E" w16cid:durableId="2B1FD511"/>
+  <w16cid:commentId w16cid:paraId="0BE13372" w16cid:durableId="40A56FB1"/>
+  <w16cid:commentId w16cid:paraId="1B19137F" w16cid:durableId="3E036B7C"/>
   <w16cid:commentId w16cid:paraId="392E4D0B" w16cid:durableId="4FC4BC49"/>
   <w16cid:commentId w16cid:paraId="57ADD46F" w16cid:durableId="4855A8FC"/>
 </w16cid:commentsIds>
@@ -4645,6 +4994,9 @@
 <w15:people xmlns:wpc="http://schemas.microsoft.com/office/word/2010/wordprocessingCanvas" xmlns:cx="http://schemas.microsoft.com/office/drawing/2014/chartex" xmlns:cx1="http://schemas.microsoft.com/office/drawing/2015/9/8/chartex" xmlns:cx2="http://schemas.microsoft.com/office/drawing/2015/10/21/chartex" xmlns:cx3="http://schemas.microsoft.com/office/drawing/2016/5/9/chartex" xmlns:cx4="http://schemas.microsoft.com/office/drawing/2016/5/10/chartex" xmlns:cx5="http://schemas.microsoft.com/office/drawing/2016/5/11/chartex" xmlns:cx6="http://schemas.microsoft.com/office/drawing/2016/5/12/chartex" xmlns:cx7="http://schemas.microsoft.com/office/drawing/2016/5/13/chartex" xmlns:cx8="http://schemas.microsoft.com/office/drawing/2016/5/14/chartex" xmlns:mc="http://schemas.openxmlformats.org/markup-compatibility/2006" xmlns:aink="http://schemas.microsoft.com/office/drawing/2016/ink" xmlns:am3d="http://schemas.microsoft.com/office/drawing/2017/model3d" xmlns:o="urn:schemas-microsoft-com:office:office" xmlns:oel="http://schemas.microsoft.com/office/2019/extlst" xmlns:r="http://schemas.openxmlformats.org/officeDocument/2006/relationships" xmlns:m="http://schemas.openxmlformats.org/officeDocument/2006/math" xmlns:v="urn:schemas-microsoft-com:vml" xmlns:wp14="http://schemas.microsoft.com/office/word/2010/wordprocessingDrawing" xmlns:wp="http://schemas.openxmlformats.org/drawingml/2006/wordprocessingDrawing" xmlns:w10="urn:schemas-microsoft-com:office:word" xmlns:w="http://schemas.openxmlformats.org/wordprocessingml/2006/main" xmlns:w14="http://schemas.microsoft.com/office/word/2010/wordml" xmlns:w15="http://schemas.microsoft.com/office/word/2012/wordml" xmlns:w16cex="http://schemas.microsoft.com/office/word/2018/wordml/cex" xmlns:w16cid="http://schemas.microsoft.com/office/word/2016/wordml/cid" xmlns:w16="http://schemas.microsoft.com/office/word/2018/wordml" xmlns:w16du="http://schemas.microsoft.com/office/word/2023/wordml/word16du" xmlns:w16sdtdh="http://schemas.microsoft.com/office/word/2020/wordml/sdtdatahash" xmlns:w16sdtfl="http://schemas.microsoft.com/office/word/2024/wordml/sdtformatlock" xmlns:w16se="http://schemas.microsoft.com/office/word/2015/wordml/symex" xmlns:wpg="http://schemas.microsoft.com/office/word/2010/wordprocessingGroup" xmlns:wpi="http://schemas.microsoft.com/office/word/2010/wordprocessingInk" xmlns:wne="http://schemas.microsoft.com/office/word/2006/wordml" xmlns:wps="http://schemas.microsoft.com/office/word/2010/wordprocessingShape" mc:Ignorable="w14 w15 w16se w16cid w16 w16cex w16sdtdh w16sdtfl w16du wp14">
   <w15:person w15:author="Dave Bridges">
     <w15:presenceInfo w15:providerId="None" w15:userId="Dave Bridges"/>
+  </w15:person>
+  <w15:person w15:author="Carr, Treyton">
+    <w15:presenceInfo w15:providerId="AD" w15:userId="S::treycarr@umich.edu::2d7a502c-7154-4eba-af5f-8ba5f8b51ac9"/>
   </w15:person>
 </w15:people>
 </file>
@@ -5671,6 +6023,29 @@
       <w:ind w:left="720" w:hanging="720"/>
     </w:pPr>
   </w:style>
+  <w:style w:type="character" w:styleId="Hyperlink">
+    <w:name w:val="Hyperlink"/>
+    <w:basedOn w:val="DefaultParagraphFont"/>
+    <w:uiPriority w:val="99"/>
+    <w:unhideWhenUsed/>
+    <w:rsid w:val="00C13A34"/>
+    <w:rPr>
+      <w:color w:val="467886" w:themeColor="hyperlink"/>
+      <w:u w:val="single"/>
+    </w:rPr>
+  </w:style>
+  <w:style w:type="character" w:styleId="UnresolvedMention">
+    <w:name w:val="Unresolved Mention"/>
+    <w:basedOn w:val="DefaultParagraphFont"/>
+    <w:uiPriority w:val="99"/>
+    <w:semiHidden/>
+    <w:unhideWhenUsed/>
+    <w:rsid w:val="00C13A34"/>
+    <w:rPr>
+      <w:color w:val="605E5C"/>
+      <w:shd w:val="clear" w:color="auto" w:fill="E1DFDD"/>
+    </w:rPr>
+  </w:style>
 </w:styles>
 </file>
 

</xml_diff>

<commit_message>
Added Cushing's articles that looked at race
</commit_message>
<xml_diff>
--- a/manuscript/Cushings-Obesity/manuscript.docx
+++ b/manuscript/Cushings-Obesity/manuscript.docx
@@ -600,6 +600,7 @@
       <w:commentRangeStart w:id="6"/>
       <w:commentRangeStart w:id="7"/>
       <w:commentRangeStart w:id="8"/>
+      <w:commentRangeStart w:id="9"/>
       <w:r>
         <w:t xml:space="preserve">(284 vs 72) </w:t>
       </w:r>
@@ -631,13 +632,21 @@
         </w:rPr>
         <w:commentReference w:id="8"/>
       </w:r>
+      <w:commentRangeEnd w:id="9"/>
+      <w:r>
+        <w:rPr>
+          <w:rStyle w:val="CommentReference"/>
+        </w:rPr>
+        <w:commentReference w:id="9"/>
+      </w:r>
       <w:r>
         <w:t>and a higher body mass index for patients with Cushing’s disease (both p&lt;0.001).</w:t>
       </w:r>
       <w:r>
         <w:t xml:space="preserve">  </w:t>
       </w:r>
-      <w:commentRangeStart w:id="9"/>
+      <w:commentRangeStart w:id="10"/>
+      <w:commentRangeStart w:id="11"/>
       <w:r>
         <w:t>Prior to matching for Race and Ethnicity, we noted that participants</w:t>
       </w:r>
@@ -671,12 +680,19 @@
       <w:r>
         <w:t>or Black</w:t>
       </w:r>
-      <w:commentRangeEnd w:id="9"/>
+      <w:commentRangeEnd w:id="10"/>
       <w:r>
         <w:rPr>
           <w:rStyle w:val="CommentReference"/>
         </w:rPr>
-        <w:commentReference w:id="9"/>
+        <w:commentReference w:id="10"/>
+      </w:r>
+      <w:commentRangeEnd w:id="11"/>
+      <w:r>
+        <w:rPr>
+          <w:rStyle w:val="CommentReference"/>
+        </w:rPr>
+        <w:commentReference w:id="11"/>
       </w:r>
       <w:r>
         <w:t xml:space="preserve"> (p=0.01</w:t>
@@ -921,7 +937,7 @@
           <w:bCs/>
         </w:rPr>
       </w:pPr>
-      <w:commentRangeStart w:id="10"/>
+      <w:commentRangeStart w:id="12"/>
       <w:proofErr w:type="spellStart"/>
       <w:r>
         <w:rPr>
@@ -978,7 +994,7 @@
         </w:rPr>
         <w:t>Blood Pressure</w:t>
       </w:r>
-      <w:commentRangeEnd w:id="10"/>
+      <w:commentRangeEnd w:id="12"/>
       <w:r>
         <w:rPr>
           <w:rStyle w:val="CommentReference"/>
@@ -986,7 +1002,7 @@
           <w:kern w:val="2"/>
           <w14:ligatures w14:val="standardContextual"/>
         </w:rPr>
-        <w:commentReference w:id="10"/>
+        <w:commentReference w:id="12"/>
       </w:r>
     </w:p>
     <w:p>
@@ -4024,7 +4040,7 @@
     </w:p>
     <w:p/>
   </w:comment>
-  <w:comment w:id="9" w:author="Dave Bridges" w:date="2025-09-05T19:38:00Z" w:initials="DB">
+  <w:comment w:id="9" w:author="Carr, Treyton" w:date="2025-09-16T11:36:00Z" w:initials="CT">
     <w:p>
       <w:r>
         <w:rPr>
@@ -4037,11 +4053,114 @@
           <w:sz w:val="20"/>
           <w:szCs w:val="20"/>
         </w:rPr>
+        <w:t>10.2147/CLEP.S44336</w:t>
+      </w:r>
+    </w:p>
+    <w:p>
+      <w:r>
+        <w:rPr>
+          <w:sz w:val="20"/>
+          <w:szCs w:val="20"/>
+        </w:rPr>
+        <w:t>-multiple types of Dex tests</w:t>
+      </w:r>
+    </w:p>
+  </w:comment>
+  <w:comment w:id="10" w:author="Dave Bridges" w:date="2025-09-05T19:38:00Z" w:initials="DB">
+    <w:p>
+      <w:r>
+        <w:rPr>
+          <w:rStyle w:val="CommentReference"/>
+        </w:rPr>
+        <w:annotationRef/>
+      </w:r>
+      <w:r>
+        <w:rPr>
+          <w:sz w:val="20"/>
+          <w:szCs w:val="20"/>
+        </w:rPr>
         <w:t>@trey also any data on demographic propensities towards Cushings we can cite?</w:t>
       </w:r>
     </w:p>
   </w:comment>
-  <w:comment w:id="10" w:author="Dave Bridges" w:date="2025-09-07T20:08:00Z" w:initials="DB">
+  <w:comment w:id="11" w:author="Carr, Treyton" w:date="2025-09-16T11:51:00Z" w:initials="CT">
+    <w:p>
+      <w:r>
+        <w:rPr>
+          <w:rStyle w:val="CommentReference"/>
+        </w:rPr>
+        <w:annotationRef/>
+      </w:r>
+      <w:r>
+        <w:rPr>
+          <w:sz w:val="20"/>
+          <w:szCs w:val="20"/>
+        </w:rPr>
+        <w:t>Some articles that include race in their analysis:</w:t>
+      </w:r>
+    </w:p>
+    <w:p>
+      <w:hyperlink r:id="rId6" w:history="1">
+        <w:r>
+          <w:rPr>
+            <w:rStyle w:val="Hyperlink"/>
+            <w:sz w:val="20"/>
+            <w:szCs w:val="20"/>
+          </w:rPr>
+          <w:t>https://doi-org.proxy.lib.umich.edu/10.1210/jendso/bvab176</w:t>
+        </w:r>
+      </w:hyperlink>
+    </w:p>
+    <w:p/>
+    <w:p>
+      <w:hyperlink r:id="rId7" w:history="1">
+        <w:r>
+          <w:rPr>
+            <w:rStyle w:val="Hyperlink"/>
+            <w:sz w:val="20"/>
+            <w:szCs w:val="20"/>
+          </w:rPr>
+          <w:t>https://doi.org/10.3171/2014.11.FOCUS14694</w:t>
+        </w:r>
+      </w:hyperlink>
+    </w:p>
+    <w:p/>
+    <w:p>
+      <w:r>
+        <w:rPr>
+          <w:sz w:val="20"/>
+          <w:szCs w:val="20"/>
+        </w:rPr>
+        <w:t xml:space="preserve"> </w:t>
+      </w:r>
+      <w:hyperlink r:id="rId8" w:history="1">
+        <w:r>
+          <w:rPr>
+            <w:rStyle w:val="Hyperlink"/>
+            <w:sz w:val="20"/>
+            <w:szCs w:val="20"/>
+          </w:rPr>
+          <w:t>https://doi.org/10.1111/cen.12644</w:t>
+        </w:r>
+      </w:hyperlink>
+    </w:p>
+    <w:p/>
+    <w:p>
+      <w:hyperlink r:id="rId9" w:history="1">
+        <w:r>
+          <w:rPr>
+            <w:rStyle w:val="Hyperlink"/>
+            <w:sz w:val="20"/>
+            <w:szCs w:val="20"/>
+          </w:rPr>
+          <w:t>https://doi.org/10.1038/pr.2017.58</w:t>
+        </w:r>
+      </w:hyperlink>
+    </w:p>
+    <w:p/>
+    <w:p/>
+  </w:comment>
+  <w:comment w:id="12" w:author="Dave Bridges" w:date="2025-09-07T20:08:00Z" w:initials="DB">
     <w:p>
       <w:r>
         <w:rPr>
@@ -4072,7 +4191,9 @@
   <w15:commentEx w15:paraId="3B9D134E" w15:paraIdParent="3F27DAC3" w15:done="0"/>
   <w15:commentEx w15:paraId="0BE13372" w15:paraIdParent="3F27DAC3" w15:done="0"/>
   <w15:commentEx w15:paraId="1B19137F" w15:paraIdParent="3F27DAC3" w15:done="0"/>
+  <w15:commentEx w15:paraId="1A3AF2A1" w15:paraIdParent="3F27DAC3" w15:done="0"/>
   <w15:commentEx w15:paraId="392E4D0B" w15:done="0"/>
+  <w15:commentEx w15:paraId="72F74B19" w15:paraIdParent="392E4D0B" w15:done="0"/>
   <w15:commentEx w15:paraId="57ADD46F" w15:done="0"/>
 </w15:commentsEx>
 </file>
@@ -4088,7 +4209,9 @@
   <w16cex:commentExtensible w16cex:durableId="2B1FD511" w16cex:dateUtc="2025-09-08T16:19:00Z"/>
   <w16cex:commentExtensible w16cex:durableId="40A56FB1" w16cex:dateUtc="2025-09-14T21:23:00Z"/>
   <w16cex:commentExtensible w16cex:durableId="3E036B7C" w16cex:dateUtc="2025-09-14T21:35:00Z"/>
+  <w16cex:commentExtensible w16cex:durableId="3DCB4B99" w16cex:dateUtc="2025-09-16T15:36:00Z"/>
   <w16cex:commentExtensible w16cex:durableId="4FC4BC49" w16cex:dateUtc="2025-09-05T23:38:00Z"/>
+  <w16cex:commentExtensible w16cex:durableId="5D0CA468" w16cex:dateUtc="2025-09-16T15:51:00Z"/>
   <w16cex:commentExtensible w16cex:durableId="4855A8FC" w16cex:dateUtc="2025-09-08T00:08:00Z"/>
 </w16cex:commentsExtensible>
 </file>
@@ -4104,7 +4227,9 @@
   <w16cid:commentId w16cid:paraId="3B9D134E" w16cid:durableId="2B1FD511"/>
   <w16cid:commentId w16cid:paraId="0BE13372" w16cid:durableId="40A56FB1"/>
   <w16cid:commentId w16cid:paraId="1B19137F" w16cid:durableId="3E036B7C"/>
+  <w16cid:commentId w16cid:paraId="1A3AF2A1" w16cid:durableId="3DCB4B99"/>
   <w16cid:commentId w16cid:paraId="392E4D0B" w16cid:durableId="4FC4BC49"/>
+  <w16cid:commentId w16cid:paraId="72F74B19" w16cid:durableId="5D0CA468"/>
   <w16cid:commentId w16cid:paraId="57ADD46F" w16cid:durableId="4855A8FC"/>
 </w16cid:commentsIds>
 </file>

</xml_diff>

<commit_message>
Added in references about racial and sex differences
</commit_message>
<xml_diff>
--- a/manuscript/Cushings-Obesity/manuscript.docx
+++ b/manuscript/Cushings-Obesity/manuscript.docx
@@ -3,18 +3,25 @@
 <w:document xmlns:wpc="http://schemas.microsoft.com/office/word/2010/wordprocessingCanvas" xmlns:cx="http://schemas.microsoft.com/office/drawing/2014/chartex" xmlns:cx1="http://schemas.microsoft.com/office/drawing/2015/9/8/chartex" xmlns:cx2="http://schemas.microsoft.com/office/drawing/2015/10/21/chartex" xmlns:cx3="http://schemas.microsoft.com/office/drawing/2016/5/9/chartex" xmlns:cx4="http://schemas.microsoft.com/office/drawing/2016/5/10/chartex" xmlns:cx5="http://schemas.microsoft.com/office/drawing/2016/5/11/chartex" xmlns:cx6="http://schemas.microsoft.com/office/drawing/2016/5/12/chartex" xmlns:cx7="http://schemas.microsoft.com/office/drawing/2016/5/13/chartex" xmlns:cx8="http://schemas.microsoft.com/office/drawing/2016/5/14/chartex" xmlns:mc="http://schemas.openxmlformats.org/markup-compatibility/2006" xmlns:aink="http://schemas.microsoft.com/office/drawing/2016/ink" xmlns:am3d="http://schemas.microsoft.com/office/drawing/2017/model3d" xmlns:o="urn:schemas-microsoft-com:office:office" xmlns:oel="http://schemas.microsoft.com/office/2019/extlst" xmlns:r="http://schemas.openxmlformats.org/officeDocument/2006/relationships" xmlns:m="http://schemas.openxmlformats.org/officeDocument/2006/math" xmlns:v="urn:schemas-microsoft-com:vml" xmlns:wp14="http://schemas.microsoft.com/office/word/2010/wordprocessingDrawing" xmlns:wp="http://schemas.openxmlformats.org/drawingml/2006/wordprocessingDrawing" xmlns:w10="urn:schemas-microsoft-com:office:word" xmlns:w="http://schemas.openxmlformats.org/wordprocessingml/2006/main" xmlns:w14="http://schemas.microsoft.com/office/word/2010/wordml" xmlns:w15="http://schemas.microsoft.com/office/word/2012/wordml" xmlns:w16cex="http://schemas.microsoft.com/office/word/2018/wordml/cex" xmlns:w16cid="http://schemas.microsoft.com/office/word/2016/wordml/cid" xmlns:w16="http://schemas.microsoft.com/office/word/2018/wordml" xmlns:w16du="http://schemas.microsoft.com/office/word/2023/wordml/word16du" xmlns:w16sdtdh="http://schemas.microsoft.com/office/word/2020/wordml/sdtdatahash" xmlns:w16sdtfl="http://schemas.microsoft.com/office/word/2024/wordml/sdtformatlock" xmlns:w16se="http://schemas.microsoft.com/office/word/2015/wordml/symex" xmlns:wpg="http://schemas.microsoft.com/office/word/2010/wordprocessingGroup" xmlns:wpi="http://schemas.microsoft.com/office/word/2010/wordprocessingInk" xmlns:wne="http://schemas.microsoft.com/office/word/2006/wordml" xmlns:wps="http://schemas.microsoft.com/office/word/2010/wordprocessingShape" mc:Ignorable="w14 w15 w16se w16cid w16 w16cex w16sdtdh w16sdtfl w16du wp14">
   <w:body>
     <w:p>
+      <w:r>
+        <w:t>Treyton Carr, Irit Hochberg, and Dave Bridges</w:t>
+      </w:r>
+    </w:p>
+    <w:p/>
+    <w:p>
       <w:pPr>
         <w:pStyle w:val="Heading1"/>
       </w:pPr>
       <w:r>
-        <w:t xml:space="preserve">Authors: Trey Carr, </w:t>
-      </w:r>
-    </w:p>
-    <w:p>
-      <w:pPr>
-        <w:pStyle w:val="Heading1"/>
-      </w:pPr>
-    </w:p>
+        <w:t>Introduction</w:t>
+      </w:r>
+    </w:p>
+    <w:p>
+      <w:r>
+        <w:t>Cushing’s disease</w:t>
+      </w:r>
+    </w:p>
+    <w:p/>
     <w:p>
       <w:pPr>
         <w:pStyle w:val="Heading1"/>
@@ -78,6 +85,7 @@
       </w:r>
       <w:commentRangeStart w:id="0"/>
       <w:commentRangeStart w:id="1"/>
+      <w:commentRangeStart w:id="2"/>
       <w:r>
         <w:t>XXXX</w:t>
       </w:r>
@@ -95,6 +103,13 @@
         </w:rPr>
         <w:commentReference w:id="1"/>
       </w:r>
+      <w:commentRangeEnd w:id="2"/>
+      <w:r>
+        <w:rPr>
+          <w:rStyle w:val="CommentReference"/>
+        </w:rPr>
+        <w:commentReference w:id="2"/>
+      </w:r>
       <w:r>
         <w:t>)</w:t>
       </w:r>
@@ -113,16 +128,16 @@
       <w:r>
         <w:t xml:space="preserve"> we included procedure codes </w:t>
       </w:r>
-      <w:commentRangeStart w:id="2"/>
+      <w:commentRangeStart w:id="3"/>
       <w:r>
         <w:t>YYY</w:t>
       </w:r>
-      <w:commentRangeEnd w:id="2"/>
+      <w:commentRangeEnd w:id="3"/>
       <w:r>
         <w:rPr>
           <w:rStyle w:val="CommentReference"/>
         </w:rPr>
-        <w:commentReference w:id="2"/>
+        <w:commentReference w:id="3"/>
       </w:r>
       <w:r>
         <w:t>.</w:t>
@@ -133,16 +148,16 @@
       <w:r>
         <w:t xml:space="preserve">were </w:t>
       </w:r>
-      <w:commentRangeStart w:id="3"/>
+      <w:commentRangeStart w:id="4"/>
       <w:r>
         <w:t>YYY</w:t>
       </w:r>
-      <w:commentRangeEnd w:id="3"/>
+      <w:commentRangeEnd w:id="4"/>
       <w:r>
         <w:rPr>
           <w:rStyle w:val="CommentReference"/>
         </w:rPr>
-        <w:commentReference w:id="3"/>
+        <w:commentReference w:id="4"/>
       </w:r>
       <w:r>
         <w:t>.</w:t>
@@ -331,7 +346,7 @@
       <w:r>
         <w:t xml:space="preserve"> and </w:t>
       </w:r>
-      <w:commentRangeStart w:id="4"/>
+      <w:commentRangeStart w:id="5"/>
       <w:r>
         <w:t xml:space="preserve">repeated all outcome models </w:t>
       </w:r>
@@ -341,18 +356,15 @@
       <w:r>
         <w:t>.</w:t>
       </w:r>
-      <w:commentRangeEnd w:id="4"/>
+      <w:commentRangeEnd w:id="5"/>
       <w:r>
         <w:rPr>
           <w:rStyle w:val="CommentReference"/>
         </w:rPr>
-        <w:commentReference w:id="4"/>
-      </w:r>
-      <w:r>
-        <w:t xml:space="preserve"> In our search, we </w:t>
-      </w:r>
-      <w:r>
-        <w:t xml:space="preserve">only included patients with </w:t>
+        <w:commentReference w:id="5"/>
+      </w:r>
+      <w:r>
+        <w:t xml:space="preserve"> In our search, we only included patients with </w:t>
       </w:r>
       <w:proofErr w:type="gramStart"/>
       <w:r>
@@ -360,10 +372,7 @@
       </w:r>
       <w:proofErr w:type="gramEnd"/>
       <w:r>
-        <w:t xml:space="preserve"> within the 5-75 range, and between 5-75 years of age. Finally, we also only included</w:t>
-      </w:r>
-      <w:r>
-        <w:t xml:space="preserve"> patients within the </w:t>
+        <w:t xml:space="preserve"> within the 5-75 range, and between 5-75 years of age. Finally, we also only included patients within the </w:t>
       </w:r>
       <w:proofErr w:type="gramStart"/>
       <w:r>
@@ -390,7 +399,11 @@
         <w:t>. Subsequent</w:t>
       </w:r>
       <w:r>
-        <w:t xml:space="preserve"> analyses were stratified by obesity (BMI ≥30 kg/m²). Within each obesity stratum, BMI was evaluated </w:t>
+        <w:t xml:space="preserve"> analyses were stratified by </w:t>
+      </w:r>
+      <w:r>
+        <w:lastRenderedPageBreak/>
+        <w:t xml:space="preserve">obesity (BMI ≥30 kg/m²). Within each obesity stratum, BMI was evaluated </w:t>
       </w:r>
       <w:proofErr w:type="gramStart"/>
       <w:r>
@@ -419,7 +432,6 @@
           <w:b/>
           <w:bCs/>
         </w:rPr>
-        <w:lastRenderedPageBreak/>
         <w:t>Statistical Analyses.</w:t>
       </w:r>
       <w:r>
@@ -497,7 +509,7 @@
       </w:r>
     </w:p>
     <w:p>
-      <w:commentRangeStart w:id="5"/>
+      <w:commentRangeStart w:id="6"/>
       <w:r>
         <w:t xml:space="preserve">As shown in Figure 1, we identified YYYY participants with diagnoses of Cushing’s disease.  </w:t>
       </w:r>
@@ -507,12 +519,12 @@
       <w:r>
         <w:t>Their average age at diagnosis was XXX (+/- XXX).  They</w:t>
       </w:r>
-      <w:commentRangeEnd w:id="5"/>
+      <w:commentRangeEnd w:id="6"/>
       <w:r>
         <w:rPr>
           <w:rStyle w:val="CommentReference"/>
         </w:rPr>
-        <w:commentReference w:id="5"/>
+        <w:commentReference w:id="6"/>
       </w:r>
       <w:r>
         <w:t xml:space="preserve"> </w:t>
@@ -635,125 +647,432 @@
         <w:t>.</w:t>
       </w:r>
       <w:r>
-        <w:t xml:space="preserve">   Here we reproduce several notable characteristics, including a higher prevalence of Cushing’s disease in females </w:t>
-      </w:r>
-      <w:commentRangeStart w:id="6"/>
+        <w:t xml:space="preserve">   Here we reproduce several notable characteristics, including a higher prevalence of Cushing’s disease in females (284 vs 72</w:t>
+      </w:r>
+      <w:r>
+        <w:t>, p&lt;0.00</w:t>
+      </w:r>
+      <w:r>
+        <w:t>1</w:t>
+      </w:r>
+      <w:r>
+        <w:t>)</w:t>
+      </w:r>
+      <w:r>
+        <w:t>, consistent with the prior literature</w:t>
+      </w:r>
+      <w:r>
+        <w:t xml:space="preserve"> </w:t>
+      </w:r>
+      <w:r>
+        <w:fldChar w:fldCharType="begin"/>
+      </w:r>
+      <w:r>
+        <w:instrText xml:space="preserve"> ADDIN ZOTERO_ITEM CSL_CITATION {"citationID":"5iZIPs39","properties":{"formattedCitation":"(Alqeeq et al., 2024; Broder et al., 2015; Etxabe &amp; Vazquez, 1994; Matthiasdottir et al., 2024; Steffensen et al., 2010)","plainCitation":"(Alqeeq et al., 2024; Broder et al., 2015; Etxabe &amp; Vazquez, 1994; Matthiasdottir et al., 2024; Steffensen et al., 2010)","noteIndex":0},"citationItems":[{"id":27029,"uris":["http://zotero.org/users/7317906/items/5UXH2J3G"],"itemData":{"id":27029,"type":"article-journal","abstract":"BACKGROUND AND OBJECTIVES: Cushing's disease is a rare endocrine disorder. This review aimed to examine sex-specific differences in Cushing's disease.\nDESIGN AND SETTINGS: A meta-analysis was performed on published articles discussing the gender impact of Cushing's disease.\nMETHODS: A systematic search was conducted to identify studies from Medline, Embase, CENTRAL and Scopus. Nine studies enrolling 1047 patients diagnosed with Cushing's disease were included in this meta-analysis.\nRESULTS: Male patients presented at a younger age (MD [mean difference]=-5.43; 95% CI [-5.78, -5.08]; P&lt;.00001) than females. Male patients had a significantly higher prevalence of osteoporosis (RR [risk ratio]=1.75; 95% CI [1.36, 225]; P&lt;.0001) and hypokalemia (RR=1.66; 95% CI [1.27, 2.16]; P=.0002). In addition, males had significantly higher rates of negative magnetic resonance imaging (RR=1.53; 95% CI [1.18, 2.0]; P=.002). No sex difference was observed in the prevalence of diabetes (RR=0.92; 95% CI [0.70, 1.22]); P=.57) and dyslipidemia (RR=1.33; 95% CI [0.88, 2.0]; P=.17).\nCONCLUSION: Cushing's disease has a worse clinical presentation in males and more diagnostic difficulties compared to females.","container-title":"Annals of Saudi Medicine","DOI":"10.5144/0256-4947.2024.55","ISSN":"0975-4466","issue":"1","journalAbbreviation":"Ann Saudi Med","language":"eng","note":"PMID: 38311874\nPMCID: PMC10839456","page":"55-65","source":"PubMed","title":"Sex-related differences in Cushing's disease: a systematic review and meta-analysis","title-short":"Sex-related differences in Cushing's disease","volume":"44","author":[{"family":"Alqeeq","given":"Basel F."},{"family":"Ayyad","given":"Mohammed"},{"family":"Almadhoun","given":"Waseem J."},{"family":"Aboabdo","given":"Mohammad"},{"family":"Aldahdouh","given":"Mosheer S."},{"family":"Al-Tawil","given":"Mohammed"},{"family":"Al-Ghazali","given":"Ahmed M."}],"issued":{"date-parts":[["2024"]]},"citation-key":"alqeeqSexrelatedDifferencesCushings2024"}},{"id":27016,"uris":["http://zotero.org/users/7317906/items/RNS3FR6N"],"itemData":{"id":27016,"type":"article-journal","abstract":"PURPOSE: To estimate the incidence of Cushing's syndrome (CS) and Cushing's disease (CD) in the US.\nMETHODS: MarketScan Commercial database 2007-2010 (age &lt;65 years) was used. CS patients were defined with ≥2 claims of CS diagnosis, while CD patients were defined with CS plus a benign pituitary adenoma diagnosis or hypophysectomy in the same calendar year. Annual incidence was calculated by dividing the number of CS or CD cases by the total number of members with the same enrollment requirement during the calendar years.\nRESULTS: CS incidence rates per million person-years were 48.6 in 2009 and 39.5 in 2010. The lowest rates of CS were in ≤17-year-olds and highest rates were in 35 to 44-year-olds. CD incidence rates were 7.6 in 2009 and 6.2 in 2010. The lowest rates of CD were in ≤17-year-olds and highest rates were in 18 to 24-year-olds. The rates varied by sex (2.3-2.7 in males, 9.8-12.1 in females). In females, lowest rates ranged 2.5-4.0 in ≤17-year-olds and highest 16.7-27.2 in 18-24 year olds. In males, there were too few cases to report estimates by age.\nCONCLUSIONS: In the first large US-based study, the annual incidence of CS in individuals &lt;65 years old was nearly 49 cases per million, substantially higher than previous estimates, which were based primarily on European data. Using similar methods, we estimated the incidence of CD at nearly 8 cases per million US population. These estimates, if confirmed in other epidemiologic databases, represent a new data reference in these rare conditions.","container-title":"Pituitary","DOI":"10.1007/s11102-014-0569-6","ISSN":"1573-7403","issue":"3","journalAbbreviation":"Pituitary","language":"eng","note":"PMID: 24803324","page":"283-289","source":"PubMed","title":"Incidence of Cushing's syndrome and Cushing's disease in commercially-insured patients &lt;65 years old in the United States","volume":"18","author":[{"family":"Broder","given":"Michael S."},{"family":"Neary","given":"Maureen P."},{"family":"Chang","given":"Eunice"},{"family":"Cherepanov","given":"Dasha"},{"family":"Ludlam","given":"William H."}],"issued":{"date-parts":[["2015",6]]},"citation-key":"broderIncidenceCushingsSyndrome2015"}},{"id":1348,"uris":["http://zotero.org/users/7317906/items/V5L6B4RJ"],"itemData":{"id":1348,"type":"article-journal","abstract":"OBJECTIVE: Although Cushing's disease is a well documented clinical entity, there is no epidemiological information about it. The present study tries to obtain this information. DESIGN AND PATIENTS: Forty-nine patients affected by Cushing's disease living in Vizcaya (Spain) between 1975 and 1992 were considered for an epidemiological study. RESULTS: The prevalence of known cases at the end of 1992 was 39.1 per million inhabitants. The average incidence of newly diagnosed cases was 2.4 cases per million people per year. Cushing's disease was more frequent in women (n = 46) than in men (n = 3), with a ratio of 15:1. Diabetes mellitus and hypertension were observed in 38.7 and 55.1% of patients, respectively. Remission of Cushing's disease was achieved in 36 out of 41 patients (87.5%). In general, the mortality was higher than that expected for the control population (standardized mortality ratio, SMR 3.8, 95% confidence interval, CI 2.5-17.9, P &lt; 0.03). Concerning the cause of death, the SMR of vascular disease was 5 (95% CI 3.4-48.6, P &lt; 0.05). Higher age, persistence of hypertension and abnormalities of glucose metabolism after treatment, were independent predictors of mortality (multivariate analyses, P &lt; 0.01). CONCLUSIONS: Prevalence of Cushing's disease was 39.1 cases/million inhabitants and average incidence was 2.4 cases/million per year. Mortality was elevated, due to vascular disease, associated with higher age, persistence of hypertension and impaired glucose metabolism.","container-title":"Clin Endocrinol (Oxf)","DOI":"10.1111/j.1365-2265.1994.tb02486.x","ISSN":"0300-0664","issue":"4","note":"PMID: 8187313\nISBN: 0300-0664 (Print)\\r0300-0664 (Linking)","page":"479-484","title":"Morbidity and mortality in Cushing's disease: an epidemiological approach","volume":"40","author":[{"family":"Etxabe","given":"J"},{"family":"Vazquez","given":"J A"}],"issued":{"date-parts":[["1994"]]},"citation-key":"etxabeMorbidityMortalityCushings1994"}},{"id":27026,"uris":["http://zotero.org/users/7317906/items/X2VBVW53"],"itemData":{"id":27026,"type":"article-journal","abstract":"Introduction: In 2011, we reported the overall incidence of Cushing’s disease (CD) in Iceland from 1955 through 2009 to be 1.5 cases per million per year with highest incidence in the last decade of the study, a higher incidence then earlier reported. We now present a follow-up study reporting the epidemiology of the disease in Iceland during the 10-year period from 2010 to 2019. Methods: In this nationwide retrospective study, clinical information on patients diagnosed with CD was obtained from electronic medical records, reviewed by consulting endocrinologists. Results: Seventeen patients were diagnosed with CD, 12 women (71%) and 5 men (29%) giving an overall incidence of 5.2 cases per million per year. The mean age at diagnosis was 46 years (range 13–85 years). Biochemical analysis was recorded for all patients and 12 patients (71%) had visible pituitary adenoma on imaging studies. Sixteen patients (94%) were treated with transsphenoidal surgery of which 4 patients (24%) had gamma knife radiosurgery and three (18%) bilateral adrenalectomy after pituitary surgery. Two patients died during the study period. Conclusion: The overall incidence of CD of 5.2 cases per million per year is higher than previously reported, indicating the importance of awareness of CD. As all patients with CD are diagnosed and/or treated at the only University Hospital in Iceland, housing the only department of endocrinology as well as neurosurgery, we are confident that all cases diagnosed during the study period were included in the study.","container-title":"Neuroendocrinology","DOI":"10.1159/000540205","ISSN":"0028-3835","issue":"10","journalAbbreviation":"Neuroendocrinology","page":"950-957","source":"Silverchair","title":"Cushing’s Disease May Have Higher Incidence than Previously Thought: A Nationwide Study in Iceland 2010–2019","title-short":"Cushing’s Disease May Have Higher Incidence than Previously Thought","volume":"114","author":[{"family":"Matthiasdottir","given":"Anna Mjoll"},{"family":"Hardarson","given":"Thorgeir Orri"},{"family":"Arnardottir","given":"Steinunn"},{"family":"Sigurjonsdottir","given":"Helga Agusta"}],"issued":{"date-parts":[["2024",7,22]]},"citation-key":"matthiasdottirCushingsDiseaseMay2024"}},{"id":27019,"uris":["http://zotero.org/users/7317906/items/RTX3YT8D"],"itemData":{"id":27019,"type":"article-journal","abstract":"Overt Cushing’s syndrome is a rare disorder with an annual incidence of 2–3/million of which benign adrenal adenomas account for 0.6/million. The female:male ratio is 3:1. Preliminary data indicate a high proportion of subclinical Cushing’s syndrome in certain risk populations such as patients with type 2 diabetes or osteoporosis. The clinical implications of these observations are presently unclear. Surgery remains first line treatment for overt disease and initial cure or remission is obtained in 65–85% of patients with Cushing’s disease. Late recurrences, however, occur in up to 20% and the risk does not seem to plateau even after 20 years of follow-up. A 2- to 3-fold increase in mortality is observed in most studies, and this excess mortality seems confined to patients in whom initial cure was not obtained. Cushing’s syndrome continues to pose diagnostic and therapeutic challenges and life-long follow-up is mandatory.","container-title":"Neuroendocrinology","DOI":"10.1159/000314297","ISSN":"0028-3835","issue":"Suppl. 1","journalAbbreviation":"Neuroendocrinology","page":"1-5","source":"Silverchair","title":"Epidemiology of Cushing’s Syndrome","volume":"92","author":[{"family":"Steffensen","given":"Charlotte"},{"family":"Bak","given":"Ann Mosegaard"},{"family":"Zøylner Rubeck","given":"Kristine"},{"family":"Jørgensen","given":"Jens Otto Lunde"}],"issued":{"date-parts":[["2010",9,10]]},"citation-key":"steffensenEpidemiologyCushingsSyndrome2010"}}],"schema":"https://github.com/citation-style-language/schema/raw/master/csl-citation.json"} </w:instrText>
+      </w:r>
+      <w:r>
+        <w:fldChar w:fldCharType="separate"/>
+      </w:r>
+      <w:r>
+        <w:rPr>
+          <w:noProof/>
+        </w:rPr>
+        <w:t>(Alqeeq et al., 2024; Broder et al., 2015; Etxabe &amp; Vazquez, 1994; Matthiasdottir et al., 2024; Steffensen et al., 2010)</w:t>
+      </w:r>
+      <w:r>
+        <w:fldChar w:fldCharType="end"/>
+      </w:r>
+      <w:r>
+        <w:t xml:space="preserve">.  As </w:t>
+      </w:r>
+      <w:proofErr w:type="gramStart"/>
+      <w:r>
+        <w:t>expected</w:t>
+      </w:r>
+      <w:proofErr w:type="gramEnd"/>
+      <w:r>
+        <w:t xml:space="preserve"> we also observed</w:t>
+      </w:r>
+      <w:r>
+        <w:rPr>
+          <w:rStyle w:val="CommentReference"/>
+        </w:rPr>
+        <w:t xml:space="preserve"> </w:t>
+      </w:r>
+      <w:r>
+        <w:t>a higher body mass index for patients with Cushing’s disease (both p&lt;0.001).</w:t>
+      </w:r>
+      <w:r>
+        <w:t xml:space="preserve">  </w:t>
+      </w:r>
       <w:commentRangeStart w:id="7"/>
       <w:commentRangeStart w:id="8"/>
       <w:commentRangeStart w:id="9"/>
-      <w:commentRangeStart w:id="10"/>
-      <w:r>
-        <w:t xml:space="preserve">(284 vs 72) </w:t>
-      </w:r>
-      <w:commentRangeEnd w:id="6"/>
+      <w:r>
+        <w:t>Prior to matching for Race and Ethnicity, we noted that participants</w:t>
+      </w:r>
+      <w:r>
+        <w:t xml:space="preserve"> with Cushing’s disease were more likely to </w:t>
+      </w:r>
+      <w:r>
+        <w:t>identify as Non-Hispanic White (87%) than the overall Michigan Medicine participant population (75% Non-Hispanic White</w:t>
+      </w:r>
+      <w:r>
+        <w:t>, p</w:t>
+      </w:r>
+      <w:r>
+        <w:t>&lt;0.001</w:t>
+      </w:r>
+      <w:r>
+        <w:t>).</w:t>
+      </w:r>
+      <w:r>
+        <w:t xml:space="preserve">  Correspondingly</w:t>
+      </w:r>
+      <w:r>
+        <w:t>,</w:t>
+      </w:r>
+      <w:r>
+        <w:t xml:space="preserve"> participants with Cushing’s disease were less likely to identify as Asian </w:t>
+      </w:r>
+      <w:r>
+        <w:t xml:space="preserve">(p&lt;0.001) </w:t>
+      </w:r>
+      <w:r>
+        <w:t>or Black</w:t>
+      </w:r>
+      <w:commentRangeEnd w:id="7"/>
       <w:r>
         <w:rPr>
           <w:rStyle w:val="CommentReference"/>
         </w:rPr>
-        <w:commentReference w:id="6"/>
-      </w:r>
-      <w:commentRangeEnd w:id="7"/>
+        <w:commentReference w:id="7"/>
+      </w:r>
+      <w:commentRangeEnd w:id="8"/>
       <w:r>
         <w:rPr>
           <w:rStyle w:val="CommentReference"/>
         </w:rPr>
-        <w:commentReference w:id="7"/>
-      </w:r>
-      <w:commentRangeEnd w:id="8"/>
+        <w:commentReference w:id="8"/>
+      </w:r>
+      <w:commentRangeEnd w:id="9"/>
       <w:r>
         <w:rPr>
           <w:rStyle w:val="CommentReference"/>
         </w:rPr>
-        <w:commentReference w:id="8"/>
-      </w:r>
-      <w:commentRangeEnd w:id="9"/>
-      <w:r>
-        <w:rPr>
-          <w:rStyle w:val="CommentReference"/>
-        </w:rPr>
         <w:commentReference w:id="9"/>
       </w:r>
-      <w:commentRangeEnd w:id="10"/>
-      <w:r>
-        <w:rPr>
-          <w:rStyle w:val="CommentReference"/>
-        </w:rPr>
-        <w:commentReference w:id="10"/>
-      </w:r>
-      <w:r>
-        <w:t>and a higher body mass index for patients with Cushing’s disease (both p&lt;0.001).</w:t>
+      <w:r>
+        <w:t xml:space="preserve"> (p=0.01</w:t>
+      </w:r>
+      <w:r>
+        <w:t>8</w:t>
+      </w:r>
+      <w:r>
+        <w:t>)</w:t>
+      </w:r>
+      <w:r>
+        <w:t>.</w:t>
+      </w:r>
+      <w:r>
+        <w:t xml:space="preserve">  This is consistent with other reports on the prevalence of Cushing’s disease across racial groups </w:t>
+      </w:r>
+      <w:r>
+        <w:fldChar w:fldCharType="begin"/>
+      </w:r>
+      <w:r>
+        <w:instrText xml:space="preserve"> ADDIN ZOTERO_ITEM CSL_CITATION {"citationID":"Zf5euBGy","properties":{"formattedCitation":"(Ioachimescu et al., 2022; Omotosho et al., 2024)","plainCitation":"(Ioachimescu et al., 2022; Omotosho et al., 2024)","noteIndex":0},"citationItems":[{"id":27032,"uris":["http://zotero.org/users/7317906/items/EVS87VVY"],"itemData":{"id":27032,"type":"article-journal","abstract":"Acromegaly (ACM) and Cushing’s disease (CD) are caused by functioning pituitary adenomas secreting growth hormone and ACTH respectively.To determine the impact of race on presentation and postoperative outcomes in adults with ACM and CD, which has not yet been evaluated.This is a retrospective study of consecutive patients operated at a large-volume pituitary center. We evaluated (1) racial distribution of patients residing in the metropolitan area (Metro, N</w:instrText>
+      </w:r>
+      <w:r>
+        <w:rPr>
+          <w:rFonts w:ascii="Arial" w:hAnsi="Arial" w:cs="Arial"/>
+        </w:rPr>
+        <w:instrText> </w:instrText>
+      </w:r>
+      <w:r>
+        <w:instrText>=</w:instrText>
+      </w:r>
+      <w:r>
+        <w:rPr>
+          <w:rFonts w:ascii="Arial" w:hAnsi="Arial" w:cs="Arial"/>
+        </w:rPr>
+        <w:instrText> </w:instrText>
+      </w:r>
+      <w:r>
+        <w:instrText>124) vs 2010 US census data, and(2) presentation and postoperative outcomes in Black vs White for patients from the entire catchment area (N</w:instrText>
+      </w:r>
+      <w:r>
+        <w:rPr>
+          <w:rFonts w:ascii="Arial" w:hAnsi="Arial" w:cs="Arial"/>
+        </w:rPr>
+        <w:instrText> </w:instrText>
+      </w:r>
+      <w:r>
+        <w:instrText>=</w:instrText>
+      </w:r>
+      <w:r>
+        <w:rPr>
+          <w:rFonts w:ascii="Arial" w:hAnsi="Arial" w:cs="Arial"/>
+        </w:rPr>
+        <w:instrText> </w:instrText>
+      </w:r>
+      <w:r>
+        <w:instrText>241).For Metro area (32.4% Black population), Black patients represented 16.75% ACM (P</w:instrText>
+      </w:r>
+      <w:r>
+        <w:rPr>
+          <w:rFonts w:ascii="Arial" w:hAnsi="Arial" w:cs="Arial"/>
+        </w:rPr>
+        <w:instrText> </w:instrText>
+      </w:r>
+      <w:r>
+        <w:instrText>=</w:instrText>
+      </w:r>
+      <w:r>
+        <w:rPr>
+          <w:rFonts w:ascii="Arial" w:hAnsi="Arial" w:cs="Arial"/>
+        </w:rPr>
+        <w:instrText> </w:instrText>
+      </w:r>
+      <w:r>
+        <w:instrText>.006) and 29.2% CD (P</w:instrText>
+      </w:r>
+      <w:r>
+        <w:rPr>
+          <w:rFonts w:ascii="Arial" w:hAnsi="Arial" w:cs="Arial"/>
+        </w:rPr>
+        <w:instrText> </w:instrText>
+      </w:r>
+      <w:r>
+        <w:instrText>=</w:instrText>
+      </w:r>
+      <w:r>
+        <w:rPr>
+          <w:rFonts w:ascii="Arial" w:hAnsi="Arial" w:cs="Arial"/>
+        </w:rPr>
+        <w:instrText> </w:instrText>
+      </w:r>
+      <w:r>
+        <w:instrText>.56). Among the total 112 patients with ACM, presentations with headaches or incidentaloma were more common in Black patients (76.9% vs 31% White, P</w:instrText>
+      </w:r>
+      <w:r>
+        <w:rPr>
+          <w:rFonts w:ascii="Arial" w:hAnsi="Arial" w:cs="Arial"/>
+        </w:rPr>
+        <w:instrText> </w:instrText>
+      </w:r>
+      <w:r>
+        <w:instrText>=</w:instrText>
+      </w:r>
+      <w:r>
+        <w:rPr>
+          <w:rFonts w:ascii="Arial" w:hAnsi="Arial" w:cs="Arial"/>
+        </w:rPr>
+        <w:instrText> </w:instrText>
+      </w:r>
+      <w:r>
+        <w:instrText>.01). Black patients had a higher prevalence of diabetes (54% vs 16% White, P</w:instrText>
+      </w:r>
+      <w:r>
+        <w:rPr>
+          <w:rFonts w:ascii="Arial" w:hAnsi="Arial" w:cs="Arial"/>
+        </w:rPr>
+        <w:instrText> </w:instrText>
+      </w:r>
+      <w:r>
+        <w:instrText>=</w:instrText>
+      </w:r>
+      <w:r>
+        <w:rPr>
+          <w:rFonts w:ascii="Arial" w:hAnsi="Arial" w:cs="Arial"/>
+        </w:rPr>
+        <w:instrText> </w:instrText>
+      </w:r>
+      <w:r>
+        <w:instrText>.005), significantly lower insulin-like growth factor (IGF)-1 deviation from normal (P</w:instrText>
+      </w:r>
+      <w:r>
+        <w:rPr>
+          <w:rFonts w:ascii="Arial" w:hAnsi="Arial" w:cs="Arial"/>
+        </w:rPr>
+        <w:instrText> </w:instrText>
+      </w:r>
+      <w:r>
+        <w:instrText>=</w:instrText>
+      </w:r>
+      <w:r>
+        <w:rPr>
+          <w:rFonts w:ascii="Arial" w:hAnsi="Arial" w:cs="Arial"/>
+        </w:rPr>
+        <w:instrText> </w:instrText>
+      </w:r>
+      <w:r>
+        <w:instrText>.03) and borderline lower median growth hormone levels (P</w:instrText>
+      </w:r>
+      <w:r>
+        <w:rPr>
+          <w:rFonts w:ascii="Arial" w:hAnsi="Arial" w:cs="Arial"/>
+        </w:rPr>
+        <w:instrText> </w:instrText>
+      </w:r>
+      <w:r>
+        <w:instrText>=</w:instrText>
+      </w:r>
+      <w:r>
+        <w:rPr>
+          <w:rFonts w:ascii="Arial" w:hAnsi="Arial" w:cs="Arial"/>
+        </w:rPr>
+        <w:instrText> </w:instrText>
+      </w:r>
+      <w:r>
+        <w:instrText>.09). Mean tumor diameter and proportion of tumors with cavernous sinus invasion were similar. Three-month biochemical remission (46% Black, 55% White, P</w:instrText>
+      </w:r>
+      <w:r>
+        <w:rPr>
+          <w:rFonts w:ascii="Arial" w:hAnsi="Arial" w:cs="Arial"/>
+        </w:rPr>
+        <w:instrText> </w:instrText>
+      </w:r>
+      <w:r>
+        <w:instrText>=</w:instrText>
+      </w:r>
+      <w:r>
+        <w:rPr>
+          <w:rFonts w:ascii="Arial" w:hAnsi="Arial" w:cs="Arial"/>
+        </w:rPr>
+        <w:instrText> </w:instrText>
+      </w:r>
+      <w:r>
+        <w:instrText>.76) and long-term IGF-1 control by multimodality therapy (92.3% Black, 80.5% White, P</w:instrText>
+      </w:r>
+      <w:r>
+        <w:rPr>
+          <w:rFonts w:ascii="Arial" w:hAnsi="Arial" w:cs="Arial"/>
+        </w:rPr>
+        <w:instrText> </w:instrText>
+      </w:r>
+      <w:r>
+        <w:instrText>=</w:instrText>
+      </w:r>
+      <w:r>
+        <w:rPr>
+          <w:rFonts w:ascii="Arial" w:hAnsi="Arial" w:cs="Arial"/>
+        </w:rPr>
+        <w:instrText> </w:instrText>
+      </w:r>
+      <w:r>
+        <w:instrText>.45) were similar. Among the total 129 patients with CD, Black patients had more hypopituitarism (69% vs 45% White, P</w:instrText>
+      </w:r>
+      <w:r>
+        <w:rPr>
+          <w:rFonts w:ascii="Arial" w:hAnsi="Arial" w:cs="Arial"/>
+        </w:rPr>
+        <w:instrText> </w:instrText>
+      </w:r>
+      <w:r>
+        <w:instrText>=</w:instrText>
+      </w:r>
+      <w:r>
+        <w:rPr>
+          <w:rFonts w:ascii="Arial" w:hAnsi="Arial" w:cs="Arial"/>
+        </w:rPr>
+        <w:instrText> </w:instrText>
+      </w:r>
+      <w:r>
+        <w:instrText>.04) and macroadenomas (33% vs 15% White, P</w:instrText>
+      </w:r>
+      <w:r>
+        <w:rPr>
+          <w:rFonts w:ascii="Arial" w:hAnsi="Arial" w:cs="Arial"/>
+        </w:rPr>
+        <w:instrText> </w:instrText>
+      </w:r>
+      <w:r>
+        <w:instrText>=</w:instrText>
+      </w:r>
+      <w:r>
+        <w:rPr>
+          <w:rFonts w:ascii="Arial" w:hAnsi="Arial" w:cs="Arial"/>
+        </w:rPr>
+        <w:instrText> </w:instrText>
+      </w:r>
+      <w:r>
+        <w:instrText>.05). At 3 months, remission rate was borderline higher in White (92% vs 78% Black, P</w:instrText>
+      </w:r>
+      <w:r>
+        <w:rPr>
+          <w:rFonts w:ascii="Arial" w:hAnsi="Arial" w:cs="Arial"/>
+        </w:rPr>
+        <w:instrText> </w:instrText>
+      </w:r>
+      <w:r>
+        <w:instrText>=</w:instrText>
+      </w:r>
+      <w:r>
+        <w:rPr>
+          <w:rFonts w:ascii="Arial" w:hAnsi="Arial" w:cs="Arial"/>
+        </w:rPr>
+        <w:instrText> </w:instrText>
+      </w:r>
+      <w:r>
+        <w:instrText xml:space="preserve">0.08), which was attributed to macroadenomas by logistic regression.We identified disparities regarding racial distribution, and clinical and biochemical characteristics in ACM, suggesting late or missed diagnosis in Black patients. Large nationwide studies are necessary to confirm our findings.","container-title":"Journal of the Endocrine Society","DOI":"10.1210/jendso/bvab176","ISSN":"2472-1972","issue":"1","journalAbbreviation":"J. Endocr. Soc.","page":"bvab176","source":"Silverchair","title":"Racial Disparities in Acromegaly and Cushing’s Disease: A Referral Center Study in 241 Patients","title-short":"Racial Disparities in Acromegaly and Cushing’s Disease","volume":"6","author":[{"family":"Ioachimescu","given":"Adriana G"},{"family":"Goswami","given":"Neevedita"},{"family":"Handa","given":"Talin"},{"family":"Pappy","given":"Adlai"},{"family":"Veledar","given":"Emir"},{"family":"Oyesiku","given":"Nelson M"}],"issued":{"date-parts":[["2022",1,1]]},"citation-key":"ioachimescuRacialDisparitiesAcromegaly2022"}},{"id":27042,"uris":["http://zotero.org/users/7317906/items/H96MA6T6"],"itemData":{"id":27042,"type":"article-journal","abstract":"Y.B. Omotosho: None. R. McGlotten: None. P. Chittiboina: None. L. Nieman: None.Background: Early recognition and treatment of Cushing’s syndrome (CS) is important to reduce mortality, forestall additional co-morbidities, and improve long-term quality of life. Little is known about how adverse social determinants of health (SDOH) influence the achievement of this goal.Objective: To investigate the impact of race (Black vs White) and UFC on the time to definitive diagnosis and treatment of Cushing’s disease (CD).Methods: This is a retrospective cohort study of 114 patients (pts) (including all Non-Hispanic Blacks) evaluated at the National Institutes of Health between 1990-2022, who had CD based on pathology (ACTH-positive tumor immunohistochemistry) or biochemical remission after transsphenoidal surgery (TSS). 38 Non-Hispanic Black patients met entry criteria. They were matched 1:2 by age (within five years) and sex. We excluded patients with cyclic CS, recurrent CD, previous pituitary surgery or radiation therapy and/or a delay between diagnostic evaluation and surgery of more than 4 weeks. We limited cohorts to only Non-Hispanic Blacks and Whites for this pilot study and plan to extend this to smaller race/ethnicity groups in the future. The onset of clinical symptoms was documented as self-reported by the patients. We analyzed the difference between the year of symptom onset and the date TSS was performed, to obtain an estimated duration of diagnosis. The highest 24h urine cortisol (UFC) value for each patient was noted. Non-normal data are described as median [interquartile range]. Group comparisons used the Wilcoxon rank sum test for the time to etiologic diagnosis, age, and UFC. Statistical analyses were done using R/RStudio statistical software. P value &amp;lt;0.05 was considered significant. Results: Each racial group included 76.3% females and 23.7% males. The median age at TSS was 39.5 years [30.0 – 50.8] for Blacks and 41.5 years [31.8 - 53.3] for Whites (P= 0.7). The median UFC was 326 mcg/24h [156 - 491] for Blacks and 264 [166 - 609] for Whites (P= 0.8). The median duration from symptom onset to CD diagnosis was 3.67 years [2.76 - 6.29] for Blacks and for 2.56 years [1.57 - 4.13] for Whites. Analysis of the differences in time to diagnosis between both groups confirmed a significant disparity with blacks having a median delay of 1.1 years more than whites (P= 0.001). Discussion: We do not have information on other SDOH in our patients, such as access to providers, education level, or their perception of the medical community. The present data suggest that racial background serves as a limiting factor in the diagnosis and differential diagnosis of CS, and that differences in severity of hypercortisolism do not explain this disparity. More work is needed to understand the reasons for this disparity as we continue to strive towards health equity.Monday, June 3, 2024","container-title":"Journal of the Endocrine Society","DOI":"10.1210/jendso/bvae163.2408","ISSN":"2472-1972","issue":"Supplement_1","journalAbbreviation":"J. Endocr. Soc.","page":"bvae163.2408","source":"Silverchair","title":"MON-113 Racial Disparity in the Time to Diagnosis of Cushing’s Disease","volume":"8","author":[{"family":"Omotosho","given":"Y B"},{"family":"McGlotten","given":"R"},{"family":"Chittiboina","given":"P"},{"family":"Nieman","given":"L"}],"issued":{"date-parts":[["2024",10,1]]},"citation-key":"omotoshoMON113RacialDisparity2024"}}],"schema":"https://github.com/citation-style-language/schema/raw/master/csl-citation.json"} </w:instrText>
+      </w:r>
+      <w:r>
+        <w:fldChar w:fldCharType="separate"/>
+      </w:r>
+      <w:r>
+        <w:rPr>
+          <w:noProof/>
+        </w:rPr>
+        <w:t>(Ioachimescu et al., 2022; Omotosho et al., 2024)</w:t>
+      </w:r>
+      <w:r>
+        <w:fldChar w:fldCharType="end"/>
+      </w:r>
+      <w:r>
+        <w:t>.</w:t>
+      </w:r>
+    </w:p>
+    <w:p>
+      <w:r>
+        <w:lastRenderedPageBreak/>
+        <w:t>As we expected, participants with Cushing’s disease had a higher BMI than the controls</w:t>
+      </w:r>
+      <w:r>
+        <w:t>, with 64% of participants with Cushing’s disease having a BMI above 30 kg/m</w:t>
+      </w:r>
+      <w:r>
+        <w:rPr>
+          <w:vertAlign w:val="superscript"/>
+        </w:rPr>
+        <w:t>2</w:t>
+      </w:r>
+      <w:r>
+        <w:t xml:space="preserve">, compared to </w:t>
+      </w:r>
+      <w:r>
+        <w:t>40</w:t>
+      </w:r>
+      <w:r>
+        <w:t>% controls (p&lt;0.001).</w:t>
       </w:r>
       <w:r>
         <w:t xml:space="preserve">  </w:t>
       </w:r>
-      <w:commentRangeStart w:id="11"/>
-      <w:commentRangeStart w:id="12"/>
-      <w:r>
-        <w:t>Prior to matching for Race and Ethnicity, we noted that participants</w:t>
-      </w:r>
-      <w:r>
-        <w:t xml:space="preserve"> with Cushing’s disease were more likely to </w:t>
-      </w:r>
-      <w:r>
-        <w:t>identify as Non-Hispanic White (87%) than the overall Michigan Medicine participant population (75% Non-Hispanic White</w:t>
-      </w:r>
-      <w:r>
-        <w:t>, p</w:t>
-      </w:r>
-      <w:r>
-        <w:t>&lt;0.001</w:t>
-      </w:r>
-      <w:r>
-        <w:t>).</w:t>
-      </w:r>
-      <w:r>
-        <w:t xml:space="preserve">  Correspondingly</w:t>
-      </w:r>
-      <w:r>
-        <w:t>,</w:t>
-      </w:r>
-      <w:r>
-        <w:t xml:space="preserve"> participants with Cushing’s disease were less likely to identify as Asian </w:t>
-      </w:r>
-      <w:r>
-        <w:t xml:space="preserve">(p&lt;0.001) </w:t>
-      </w:r>
-      <w:r>
-        <w:t>or Black</w:t>
-      </w:r>
-      <w:commentRangeEnd w:id="11"/>
-      <w:r>
-        <w:rPr>
-          <w:rStyle w:val="CommentReference"/>
-        </w:rPr>
-        <w:commentReference w:id="11"/>
-      </w:r>
-      <w:commentRangeEnd w:id="12"/>
-      <w:r>
-        <w:rPr>
-          <w:rStyle w:val="CommentReference"/>
-        </w:rPr>
-        <w:commentReference w:id="12"/>
-      </w:r>
-      <w:r>
-        <w:t xml:space="preserve"> (p=0.01</w:t>
-      </w:r>
-      <w:r>
-        <w:t>8</w:t>
-      </w:r>
-      <w:r>
-        <w:t>)</w:t>
-      </w:r>
-      <w:r>
-        <w:t>.</w:t>
-      </w:r>
-    </w:p>
-    <w:p>
-      <w:r>
-        <w:t>As we expected, participants with Cushing’s disease had a higher BMI than the controls</w:t>
-      </w:r>
-      <w:r>
-        <w:t>, with 64% of participants with Cushing’s disease having a BMI above 30 kg/m</w:t>
+      <w:r>
+        <w:t xml:space="preserve">To understand the </w:t>
+      </w:r>
+      <w:r>
+        <w:t xml:space="preserve">cross-sectional </w:t>
+      </w:r>
+      <w:r>
+        <w:t>relationship between obesity and Cushing’s disease, we</w:t>
+      </w:r>
+      <w:r>
+        <w:t xml:space="preserve"> stratified our participants </w:t>
+      </w:r>
+      <w:r>
+        <w:t>with a BMI above or below 30 kg/m</w:t>
       </w:r>
       <w:r>
         <w:rPr>
@@ -762,39 +1081,6 @@
         <w:t>2</w:t>
       </w:r>
       <w:r>
-        <w:t xml:space="preserve">, compared to </w:t>
-      </w:r>
-      <w:r>
-        <w:t>40</w:t>
-      </w:r>
-      <w:r>
-        <w:t>% controls (p&lt;0.001).</w:t>
-      </w:r>
-      <w:r>
-        <w:t xml:space="preserve">  </w:t>
-      </w:r>
-      <w:r>
-        <w:t xml:space="preserve">To understand the </w:t>
-      </w:r>
-      <w:r>
-        <w:t xml:space="preserve">cross-sectional </w:t>
-      </w:r>
-      <w:r>
-        <w:t>relationship between obesity and Cushing’s disease, we</w:t>
-      </w:r>
-      <w:r>
-        <w:t xml:space="preserve"> stratified our participants </w:t>
-      </w:r>
-      <w:r>
-        <w:t>with a BMI above or below 30 kg/m</w:t>
-      </w:r>
-      <w:r>
-        <w:rPr>
-          <w:vertAlign w:val="superscript"/>
-        </w:rPr>
-        <w:t>2</w:t>
-      </w:r>
-      <w:r>
         <w:t xml:space="preserve">, </w:t>
       </w:r>
       <w:r>
@@ -813,11 +1099,7 @@
         <w:t>which</w:t>
       </w:r>
       <w:r>
-        <w:t xml:space="preserve"> will be adjusted for </w:t>
-      </w:r>
-      <w:r>
-        <w:lastRenderedPageBreak/>
-        <w:t>in multivariable models below</w:t>
+        <w:t xml:space="preserve"> will be adjusted for in multivariable models below</w:t>
       </w:r>
       <w:r>
         <w:t>.</w:t>
@@ -978,8 +1260,8 @@
           <w:bCs/>
         </w:rPr>
       </w:pPr>
-      <w:commentRangeStart w:id="13"/>
-      <w:commentRangeStart w:id="14"/>
+      <w:commentRangeStart w:id="10"/>
+      <w:commentRangeStart w:id="11"/>
       <w:r>
         <w:rPr>
           <w:b/>
@@ -1048,6 +1330,7 @@
           <w:b/>
           <w:bCs/>
         </w:rPr>
+        <w:lastRenderedPageBreak/>
         <w:t xml:space="preserve">To measure liver enzyme activity, we looked at ALT test results for our population. In both our obese, and non-obese populations, we saw an increase in ALT levels regardless of Cushing’s disease </w:t>
       </w:r>
       <w:proofErr w:type="gramStart"/>
@@ -1109,7 +1392,7 @@
         </w:rPr>
         <w:t>Blood Pressure</w:t>
       </w:r>
-      <w:commentRangeEnd w:id="13"/>
+      <w:commentRangeEnd w:id="10"/>
       <w:r>
         <w:rPr>
           <w:rStyle w:val="CommentReference"/>
@@ -1117,9 +1400,9 @@
           <w:kern w:val="2"/>
           <w14:ligatures w14:val="standardContextual"/>
         </w:rPr>
-        <w:commentReference w:id="13"/>
-      </w:r>
-      <w:commentRangeEnd w:id="14"/>
+        <w:commentReference w:id="10"/>
+      </w:r>
+      <w:commentRangeEnd w:id="11"/>
       <w:r>
         <w:rPr>
           <w:rStyle w:val="CommentReference"/>
@@ -1127,7 +1410,7 @@
           <w:kern w:val="2"/>
           <w14:ligatures w14:val="standardContextual"/>
         </w:rPr>
-        <w:commentReference w:id="14"/>
+        <w:commentReference w:id="11"/>
       </w:r>
     </w:p>
     <w:p>
@@ -1322,8 +1605,14 @@
         <w:pStyle w:val="Heading1"/>
       </w:pPr>
       <w:r>
+        <w:lastRenderedPageBreak/>
         <w:t>Discussion</w:t>
       </w:r>
+    </w:p>
+    <w:p>
+      <w:pPr>
+        <w:pStyle w:val="ListParagraph"/>
+      </w:pPr>
     </w:p>
     <w:p>
       <w:pPr>
@@ -1426,11 +1715,61 @@
       <w:r>
         <w:fldChar w:fldCharType="separate"/>
       </w:r>
-      <w:r>
-        <w:rPr>
-          <w:rFonts w:ascii="Aptos"/>
-        </w:rPr>
-        <w:t xml:space="preserve">Ho, D., Imai, K., King, G., &amp; Stuart, E. A. (2011). MatchIt: Nonparametric Preprocessing for Parametric Causal Inference. </w:t>
+      <w:proofErr w:type="spellStart"/>
+      <w:r>
+        <w:rPr>
+          <w:rFonts w:ascii="Aptos"/>
+        </w:rPr>
+        <w:t>Alqeeq</w:t>
+      </w:r>
+      <w:proofErr w:type="spellEnd"/>
+      <w:r>
+        <w:rPr>
+          <w:rFonts w:ascii="Aptos"/>
+        </w:rPr>
+        <w:t xml:space="preserve">, B. F., Ayyad, M., </w:t>
+      </w:r>
+      <w:proofErr w:type="spellStart"/>
+      <w:r>
+        <w:rPr>
+          <w:rFonts w:ascii="Aptos"/>
+        </w:rPr>
+        <w:t>Almadhoun</w:t>
+      </w:r>
+      <w:proofErr w:type="spellEnd"/>
+      <w:r>
+        <w:rPr>
+          <w:rFonts w:ascii="Aptos"/>
+        </w:rPr>
+        <w:t xml:space="preserve">, W. J., </w:t>
+      </w:r>
+      <w:proofErr w:type="spellStart"/>
+      <w:r>
+        <w:rPr>
+          <w:rFonts w:ascii="Aptos"/>
+        </w:rPr>
+        <w:t>Aboabdo</w:t>
+      </w:r>
+      <w:proofErr w:type="spellEnd"/>
+      <w:r>
+        <w:rPr>
+          <w:rFonts w:ascii="Aptos"/>
+        </w:rPr>
+        <w:t xml:space="preserve">, M., </w:t>
+      </w:r>
+      <w:proofErr w:type="spellStart"/>
+      <w:r>
+        <w:rPr>
+          <w:rFonts w:ascii="Aptos"/>
+        </w:rPr>
+        <w:t>Aldahdouh</w:t>
+      </w:r>
+      <w:proofErr w:type="spellEnd"/>
+      <w:r>
+        <w:rPr>
+          <w:rFonts w:ascii="Aptos"/>
+        </w:rPr>
+        <w:t xml:space="preserve">, M. S., Al-Tawil, M., &amp; Al-Ghazali, A. M. (2024). Sex-related differences in Cushing’s disease: A systematic review and meta-analysis. </w:t>
       </w:r>
       <w:r>
         <w:rPr>
@@ -1438,7 +1777,7 @@
           <w:i/>
           <w:iCs/>
         </w:rPr>
-        <w:t>Journal of Statistical Software</w:t>
+        <w:t>Annals of Saudi Medicine</w:t>
       </w:r>
       <w:r>
         <w:rPr>
@@ -1452,13 +1791,13 @@
           <w:i/>
           <w:iCs/>
         </w:rPr>
-        <w:t>42</w:t>
-      </w:r>
-      <w:r>
-        <w:rPr>
-          <w:rFonts w:ascii="Aptos"/>
-        </w:rPr>
-        <w:t>, 1–28. https://doi.org/10.18637/jss.v042.i08</w:t>
+        <w:t>44</w:t>
+      </w:r>
+      <w:r>
+        <w:rPr>
+          <w:rFonts w:ascii="Aptos"/>
+        </w:rPr>
+        <w:t>(1), 55–65. https://doi.org/10.5144/0256-4947.2024.55</w:t>
       </w:r>
     </w:p>
     <w:p>
@@ -1472,7 +1811,21 @@
         <w:rPr>
           <w:rFonts w:ascii="Aptos"/>
         </w:rPr>
-        <w:t xml:space="preserve">R Core Team. (2019). </w:t>
+        <w:t xml:space="preserve">Broder, M. S., Neary, M. P., Chang, E., Cherepanov, D., &amp; Ludlam, W. H. (2015). Incidence of Cushing’s syndrome and Cushing’s disease in </w:t>
+      </w:r>
+      <w:proofErr w:type="gramStart"/>
+      <w:r>
+        <w:rPr>
+          <w:rFonts w:ascii="Aptos"/>
+        </w:rPr>
+        <w:t>commercially-insured</w:t>
+      </w:r>
+      <w:proofErr w:type="gramEnd"/>
+      <w:r>
+        <w:rPr>
+          <w:rFonts w:ascii="Aptos"/>
+        </w:rPr>
+        <w:t xml:space="preserve"> patients &lt;65 years old in the United States. </w:t>
       </w:r>
       <w:r>
         <w:rPr>
@@ -1480,6 +1833,357 @@
           <w:i/>
           <w:iCs/>
         </w:rPr>
+        <w:t>Pituitary</w:t>
+      </w:r>
+      <w:r>
+        <w:rPr>
+          <w:rFonts w:ascii="Aptos"/>
+        </w:rPr>
+        <w:t xml:space="preserve">, </w:t>
+      </w:r>
+      <w:r>
+        <w:rPr>
+          <w:rFonts w:ascii="Aptos"/>
+          <w:i/>
+          <w:iCs/>
+        </w:rPr>
+        <w:t>18</w:t>
+      </w:r>
+      <w:r>
+        <w:rPr>
+          <w:rFonts w:ascii="Aptos"/>
+        </w:rPr>
+        <w:t>(3), 283–289. https://doi.org/10.1007/s11102-014-0569-6</w:t>
+      </w:r>
+    </w:p>
+    <w:p>
+      <w:pPr>
+        <w:pStyle w:val="Bibliography"/>
+        <w:rPr>
+          <w:rFonts w:ascii="Aptos"/>
+        </w:rPr>
+      </w:pPr>
+      <w:proofErr w:type="spellStart"/>
+      <w:r>
+        <w:rPr>
+          <w:rFonts w:ascii="Aptos"/>
+        </w:rPr>
+        <w:t>Etxabe</w:t>
+      </w:r>
+      <w:proofErr w:type="spellEnd"/>
+      <w:r>
+        <w:rPr>
+          <w:rFonts w:ascii="Aptos"/>
+        </w:rPr>
+        <w:t xml:space="preserve">, J., &amp; Vazquez, J. A. (1994). Morbidity and mortality in Cushing’s disease: An epidemiological approach. </w:t>
+      </w:r>
+      <w:r>
+        <w:rPr>
+          <w:rFonts w:ascii="Aptos"/>
+          <w:i/>
+          <w:iCs/>
+        </w:rPr>
+        <w:t>Clin Endocrinol (</w:t>
+      </w:r>
+      <w:proofErr w:type="spellStart"/>
+      <w:r>
+        <w:rPr>
+          <w:rFonts w:ascii="Aptos"/>
+          <w:i/>
+          <w:iCs/>
+        </w:rPr>
+        <w:t>Oxf</w:t>
+      </w:r>
+      <w:proofErr w:type="spellEnd"/>
+      <w:r>
+        <w:rPr>
+          <w:rFonts w:ascii="Aptos"/>
+          <w:i/>
+          <w:iCs/>
+        </w:rPr>
+        <w:t>)</w:t>
+      </w:r>
+      <w:r>
+        <w:rPr>
+          <w:rFonts w:ascii="Aptos"/>
+        </w:rPr>
+        <w:t xml:space="preserve">, </w:t>
+      </w:r>
+      <w:r>
+        <w:rPr>
+          <w:rFonts w:ascii="Aptos"/>
+          <w:i/>
+          <w:iCs/>
+        </w:rPr>
+        <w:t>40</w:t>
+      </w:r>
+      <w:r>
+        <w:rPr>
+          <w:rFonts w:ascii="Aptos"/>
+        </w:rPr>
+        <w:t>(4), 479–484. https://doi.org/10.1111/j.1365-2265.1994.tb02486.x</w:t>
+      </w:r>
+    </w:p>
+    <w:p>
+      <w:pPr>
+        <w:pStyle w:val="Bibliography"/>
+        <w:rPr>
+          <w:rFonts w:ascii="Aptos"/>
+        </w:rPr>
+      </w:pPr>
+      <w:r>
+        <w:rPr>
+          <w:rFonts w:ascii="Aptos"/>
+        </w:rPr>
+        <w:t xml:space="preserve">Ho, D., Imai, K., King, G., &amp; Stuart, E. A. (2011). </w:t>
+      </w:r>
+      <w:proofErr w:type="spellStart"/>
+      <w:r>
+        <w:rPr>
+          <w:rFonts w:ascii="Aptos"/>
+        </w:rPr>
+        <w:t>MatchIt</w:t>
+      </w:r>
+      <w:proofErr w:type="spellEnd"/>
+      <w:r>
+        <w:rPr>
+          <w:rFonts w:ascii="Aptos"/>
+        </w:rPr>
+        <w:t xml:space="preserve">: Nonparametric Preprocessing for Parametric Causal Inference. </w:t>
+      </w:r>
+      <w:r>
+        <w:rPr>
+          <w:rFonts w:ascii="Aptos"/>
+          <w:i/>
+          <w:iCs/>
+        </w:rPr>
+        <w:t>Journal of Statistical Software</w:t>
+      </w:r>
+      <w:r>
+        <w:rPr>
+          <w:rFonts w:ascii="Aptos"/>
+        </w:rPr>
+        <w:t xml:space="preserve">, </w:t>
+      </w:r>
+      <w:r>
+        <w:rPr>
+          <w:rFonts w:ascii="Aptos"/>
+          <w:i/>
+          <w:iCs/>
+        </w:rPr>
+        <w:t>42</w:t>
+      </w:r>
+      <w:r>
+        <w:rPr>
+          <w:rFonts w:ascii="Aptos"/>
+        </w:rPr>
+        <w:t>, 1–28. https://doi.org/10.18637/jss.v042.i08</w:t>
+      </w:r>
+    </w:p>
+    <w:p>
+      <w:pPr>
+        <w:pStyle w:val="Bibliography"/>
+        <w:rPr>
+          <w:rFonts w:ascii="Aptos"/>
+        </w:rPr>
+      </w:pPr>
+      <w:proofErr w:type="spellStart"/>
+      <w:r>
+        <w:rPr>
+          <w:rFonts w:ascii="Aptos"/>
+        </w:rPr>
+        <w:lastRenderedPageBreak/>
+        <w:t>Ioachimescu</w:t>
+      </w:r>
+      <w:proofErr w:type="spellEnd"/>
+      <w:r>
+        <w:rPr>
+          <w:rFonts w:ascii="Aptos"/>
+        </w:rPr>
+        <w:t xml:space="preserve">, A. G., Goswami, N., Handa, T., Pappy, A., </w:t>
+      </w:r>
+      <w:proofErr w:type="spellStart"/>
+      <w:r>
+        <w:rPr>
+          <w:rFonts w:ascii="Aptos"/>
+        </w:rPr>
+        <w:t>Veledar</w:t>
+      </w:r>
+      <w:proofErr w:type="spellEnd"/>
+      <w:r>
+        <w:rPr>
+          <w:rFonts w:ascii="Aptos"/>
+        </w:rPr>
+        <w:t xml:space="preserve">, E., &amp; </w:t>
+      </w:r>
+      <w:proofErr w:type="spellStart"/>
+      <w:r>
+        <w:rPr>
+          <w:rFonts w:ascii="Aptos"/>
+        </w:rPr>
+        <w:t>Oyesiku</w:t>
+      </w:r>
+      <w:proofErr w:type="spellEnd"/>
+      <w:r>
+        <w:rPr>
+          <w:rFonts w:ascii="Aptos"/>
+        </w:rPr>
+        <w:t xml:space="preserve">, N. M. (2022). Racial Disparities in Acromegaly and Cushing’s Disease: A Referral Center Study in 241 Patients. </w:t>
+      </w:r>
+      <w:r>
+        <w:rPr>
+          <w:rFonts w:ascii="Aptos"/>
+          <w:i/>
+          <w:iCs/>
+        </w:rPr>
+        <w:t>Journal of the Endocrine Society</w:t>
+      </w:r>
+      <w:r>
+        <w:rPr>
+          <w:rFonts w:ascii="Aptos"/>
+        </w:rPr>
+        <w:t xml:space="preserve">, </w:t>
+      </w:r>
+      <w:r>
+        <w:rPr>
+          <w:rFonts w:ascii="Aptos"/>
+          <w:i/>
+          <w:iCs/>
+        </w:rPr>
+        <w:t>6</w:t>
+      </w:r>
+      <w:r>
+        <w:rPr>
+          <w:rFonts w:ascii="Aptos"/>
+        </w:rPr>
+        <w:t>(1), bvab176. https://doi.org/10.1210/jendso/bvab176</w:t>
+      </w:r>
+    </w:p>
+    <w:p>
+      <w:pPr>
+        <w:pStyle w:val="Bibliography"/>
+        <w:rPr>
+          <w:rFonts w:ascii="Aptos"/>
+        </w:rPr>
+      </w:pPr>
+      <w:proofErr w:type="spellStart"/>
+      <w:r>
+        <w:rPr>
+          <w:rFonts w:ascii="Aptos"/>
+        </w:rPr>
+        <w:t>Matthiasdottir</w:t>
+      </w:r>
+      <w:proofErr w:type="spellEnd"/>
+      <w:r>
+        <w:rPr>
+          <w:rFonts w:ascii="Aptos"/>
+        </w:rPr>
+        <w:t xml:space="preserve">, A. M., Hardarson, T. O., Arnardottir, S., &amp; Sigurjonsdottir, H. A. (2024). Cushing’s Disease May Have Higher Incidence than Previously Thought: A Nationwide Study in Iceland 2010–2019. </w:t>
+      </w:r>
+      <w:r>
+        <w:rPr>
+          <w:rFonts w:ascii="Aptos"/>
+          <w:i/>
+          <w:iCs/>
+        </w:rPr>
+        <w:t>Neuroendocrinology</w:t>
+      </w:r>
+      <w:r>
+        <w:rPr>
+          <w:rFonts w:ascii="Aptos"/>
+        </w:rPr>
+        <w:t xml:space="preserve">, </w:t>
+      </w:r>
+      <w:r>
+        <w:rPr>
+          <w:rFonts w:ascii="Aptos"/>
+          <w:i/>
+          <w:iCs/>
+        </w:rPr>
+        <w:t>114</w:t>
+      </w:r>
+      <w:r>
+        <w:rPr>
+          <w:rFonts w:ascii="Aptos"/>
+        </w:rPr>
+        <w:t>(10), 950–957. https://doi.org/10.1159/000540205</w:t>
+      </w:r>
+    </w:p>
+    <w:p>
+      <w:pPr>
+        <w:pStyle w:val="Bibliography"/>
+        <w:rPr>
+          <w:rFonts w:ascii="Aptos"/>
+        </w:rPr>
+      </w:pPr>
+      <w:r>
+        <w:rPr>
+          <w:rFonts w:ascii="Aptos"/>
+        </w:rPr>
+        <w:t xml:space="preserve">Omotosho, Y. B., McGlotten, R., </w:t>
+      </w:r>
+      <w:proofErr w:type="spellStart"/>
+      <w:r>
+        <w:rPr>
+          <w:rFonts w:ascii="Aptos"/>
+        </w:rPr>
+        <w:t>Chittiboina</w:t>
+      </w:r>
+      <w:proofErr w:type="spellEnd"/>
+      <w:r>
+        <w:rPr>
+          <w:rFonts w:ascii="Aptos"/>
+        </w:rPr>
+        <w:t xml:space="preserve">, P., &amp; Nieman, L. (2024). MON-113 Racial Disparity in the Time to Diagnosis of Cushing’s Disease. </w:t>
+      </w:r>
+      <w:r>
+        <w:rPr>
+          <w:rFonts w:ascii="Aptos"/>
+          <w:i/>
+          <w:iCs/>
+        </w:rPr>
+        <w:t>Journal of the Endocrine Society</w:t>
+      </w:r>
+      <w:r>
+        <w:rPr>
+          <w:rFonts w:ascii="Aptos"/>
+        </w:rPr>
+        <w:t xml:space="preserve">, </w:t>
+      </w:r>
+      <w:r>
+        <w:rPr>
+          <w:rFonts w:ascii="Aptos"/>
+          <w:i/>
+          <w:iCs/>
+        </w:rPr>
+        <w:t>8</w:t>
+      </w:r>
+      <w:r>
+        <w:rPr>
+          <w:rFonts w:ascii="Aptos"/>
+        </w:rPr>
+        <w:t>(Supplement_1), bvae163.2408. https://doi.org/10.1210/jendso/bvae163.2408</w:t>
+      </w:r>
+    </w:p>
+    <w:p>
+      <w:pPr>
+        <w:pStyle w:val="Bibliography"/>
+        <w:rPr>
+          <w:rFonts w:ascii="Aptos"/>
+        </w:rPr>
+      </w:pPr>
+      <w:r>
+        <w:rPr>
+          <w:rFonts w:ascii="Aptos"/>
+        </w:rPr>
+        <w:t xml:space="preserve">R Core Team. (2019). </w:t>
+      </w:r>
+      <w:r>
+        <w:rPr>
+          <w:rFonts w:ascii="Aptos"/>
+          <w:i/>
+          <w:iCs/>
+        </w:rPr>
         <w:t>R: A Language and Environment for Statistical Computing</w:t>
       </w:r>
       <w:r>
@@ -1487,6 +2191,48 @@
           <w:rFonts w:ascii="Aptos"/>
         </w:rPr>
         <w:t>. R Foundation for Statistical Computing. http://www.r-project.org/</w:t>
+      </w:r>
+    </w:p>
+    <w:p>
+      <w:pPr>
+        <w:pStyle w:val="Bibliography"/>
+        <w:rPr>
+          <w:rFonts w:ascii="Aptos"/>
+        </w:rPr>
+      </w:pPr>
+      <w:r>
+        <w:rPr>
+          <w:rFonts w:ascii="Aptos"/>
+        </w:rPr>
+        <w:t xml:space="preserve">Steffensen, C., Bak, A. M., Zøylner Rubeck, K., &amp; Jørgensen, J. O. L. (2010). Epidemiology of Cushing’s Syndrome. </w:t>
+      </w:r>
+      <w:r>
+        <w:rPr>
+          <w:rFonts w:ascii="Aptos"/>
+          <w:i/>
+          <w:iCs/>
+        </w:rPr>
+        <w:t>Neuroendocrinology</w:t>
+      </w:r>
+      <w:r>
+        <w:rPr>
+          <w:rFonts w:ascii="Aptos"/>
+        </w:rPr>
+        <w:t xml:space="preserve">, </w:t>
+      </w:r>
+      <w:r>
+        <w:rPr>
+          <w:rFonts w:ascii="Aptos"/>
+          <w:i/>
+          <w:iCs/>
+        </w:rPr>
+        <w:t>92</w:t>
+      </w:r>
+      <w:r>
+        <w:rPr>
+          <w:rFonts w:ascii="Aptos"/>
+        </w:rPr>
+        <w:t>(Suppl. 1), 1–5. https://doi.org/10.1159/000314297</w:t>
       </w:r>
     </w:p>
     <w:p>
@@ -1560,7 +2306,11 @@
         <w:t xml:space="preserve">Effects of Cushing’s disease and Obesity on Laboratory Values.  </w:t>
       </w:r>
       <w:r>
-        <w:t>Laboratory values were within 30 days of Cushing’s disease surgery for cases.  Obesity was defined as a BMI above or below 30 kg/m</w:t>
+        <w:t xml:space="preserve">Laboratory values were within 30 days of Cushing’s disease surgery for cases.  Obesity was defined as a BMI </w:t>
+      </w:r>
+      <w:r>
+        <w:lastRenderedPageBreak/>
+        <w:t>above or below 30 kg/m</w:t>
       </w:r>
       <w:r>
         <w:rPr>
@@ -1709,7 +2459,6 @@
           <w:b/>
           <w:bCs/>
         </w:rPr>
-        <w:lastRenderedPageBreak/>
         <w:t>Supplementary Figure</w:t>
       </w:r>
       <w:r>
@@ -2565,6 +3314,7 @@
           <w:szCs w:val="18"/>
           <w14:ligatures w14:val="none"/>
         </w:rPr>
+        <w:lastRenderedPageBreak/>
         <w:t xml:space="preserve">   </w:t>
       </w:r>
       <w:r>
@@ -3294,7 +4044,6 @@
           <w:szCs w:val="18"/>
           <w14:ligatures w14:val="none"/>
         </w:rPr>
-        <w:lastRenderedPageBreak/>
         <w:t>-</w:t>
       </w:r>
       <w:r>
@@ -3865,7 +4614,7 @@
       </w:r>
     </w:p>
   </w:comment>
-  <w:comment w:id="2" w:author="Dave Bridges" w:date="2025-09-07T19:14:00Z" w:initials="DB">
+  <w:comment w:id="2" w:author="Dave Bridges" w:date="2025-09-23T09:08:00Z" w:initials="DB">
     <w:p>
       <w:r>
         <w:rPr>
@@ -3878,11 +4627,11 @@
           <w:sz w:val="20"/>
           <w:szCs w:val="20"/>
         </w:rPr>
-        <w:t>@trey can you add these</w:t>
+        <w:t>sure</w:t>
       </w:r>
     </w:p>
   </w:comment>
-  <w:comment w:id="3" w:author="Dave Bridges" w:date="2025-09-07T19:15:00Z" w:initials="DB">
+  <w:comment w:id="3" w:author="Dave Bridges" w:date="2025-09-07T19:14:00Z" w:initials="DB">
     <w:p>
       <w:r>
         <w:rPr>
@@ -3895,11 +4644,11 @@
           <w:sz w:val="20"/>
           <w:szCs w:val="20"/>
         </w:rPr>
-        <w:t>@trey This should include people who you removed from the diagram, including those with NA</w:t>
+        <w:t>@trey can you add these</w:t>
       </w:r>
     </w:p>
   </w:comment>
-  <w:comment w:id="4" w:author="Dave Bridges" w:date="2025-09-05T19:50:00Z" w:initials="DB">
+  <w:comment w:id="4" w:author="Dave Bridges" w:date="2025-09-07T19:15:00Z" w:initials="DB">
     <w:p>
       <w:r>
         <w:rPr>
@@ -3912,11 +4661,11 @@
           <w:sz w:val="20"/>
           <w:szCs w:val="20"/>
         </w:rPr>
-        <w:t>todo</w:t>
+        <w:t>@trey This should include people who you removed from the diagram, including those with NA</w:t>
       </w:r>
     </w:p>
   </w:comment>
-  <w:comment w:id="5" w:author="Dave Bridges" w:date="2025-09-07T14:40:00Z" w:initials="DB">
+  <w:comment w:id="5" w:author="Dave Bridges" w:date="2025-09-05T19:50:00Z" w:initials="DB">
     <w:p>
       <w:r>
         <w:rPr>
@@ -3929,11 +4678,11 @@
           <w:sz w:val="20"/>
           <w:szCs w:val="20"/>
         </w:rPr>
-        <w:t>@trey can you describe this part, and enter details in the methods of how this was done</w:t>
+        <w:t>todo</w:t>
       </w:r>
     </w:p>
   </w:comment>
-  <w:comment w:id="6" w:author="Dave Bridges" w:date="2025-09-05T18:06:00Z" w:initials="DB">
+  <w:comment w:id="6" w:author="Dave Bridges" w:date="2025-09-07T14:40:00Z" w:initials="DB">
     <w:p>
       <w:r>
         <w:rPr>
@@ -3946,11 +4695,11 @@
           <w:sz w:val="20"/>
           <w:szCs w:val="20"/>
         </w:rPr>
-        <w:t>@trey are there other papers that describe this?</w:t>
+        <w:t>@trey can you describe this part, and enter details in the methods of how this was done</w:t>
       </w:r>
     </w:p>
   </w:comment>
-  <w:comment w:id="7" w:author="Carr, Treyton" w:date="2025-09-08T12:19:00Z" w:initials="CT">
+  <w:comment w:id="7" w:author="Dave Bridges" w:date="2025-09-05T19:38:00Z" w:initials="DB">
     <w:p>
       <w:r>
         <w:rPr>
@@ -3963,11 +4712,11 @@
           <w:sz w:val="20"/>
           <w:szCs w:val="20"/>
         </w:rPr>
-        <w:t>also look for which lab outcomes they looked at</w:t>
+        <w:t>@trey also any data on demographic propensities towards Cushings we can cite?</w:t>
       </w:r>
     </w:p>
   </w:comment>
-  <w:comment w:id="8" w:author="Carr, Treyton" w:date="2025-09-14T17:23:00Z" w:initials="CT">
+  <w:comment w:id="8" w:author="Carr, Treyton" w:date="2025-09-16T11:51:00Z" w:initials="CT">
     <w:p>
       <w:r>
         <w:rPr>
@@ -3980,298 +4729,11 @@
           <w:sz w:val="20"/>
           <w:szCs w:val="20"/>
         </w:rPr>
-        <w:t>other papers that describe higher proportion of women with Cushings:</w:t>
-      </w:r>
-    </w:p>
-    <w:p>
-      <w:r>
-        <w:rPr>
-          <w:sz w:val="20"/>
-          <w:szCs w:val="20"/>
-        </w:rPr>
-        <w:t xml:space="preserve"> </w:t>
-      </w:r>
+        <w:t>Some articles that include race in their analysis:</w:t>
+      </w:r>
+    </w:p>
+    <w:p>
       <w:hyperlink r:id="rId1" w:history="1">
-        <w:r>
-          <w:rPr>
-            <w:rStyle w:val="Hyperlink"/>
-            <w:sz w:val="20"/>
-            <w:szCs w:val="20"/>
-          </w:rPr>
-          <w:t>https://doi.org/10.1111/j.1365-2265.1994.tb02486.x</w:t>
-        </w:r>
-      </w:hyperlink>
-    </w:p>
-    <w:p/>
-    <w:p>
-      <w:r>
-        <w:rPr>
-          <w:sz w:val="20"/>
-          <w:szCs w:val="20"/>
-        </w:rPr>
-        <w:t>DOI:  10.1007/s11102-014-0569-6</w:t>
-      </w:r>
-    </w:p>
-    <w:p/>
-    <w:p>
-      <w:hyperlink r:id="rId2" w:history="1">
-        <w:r>
-          <w:rPr>
-            <w:rStyle w:val="Hyperlink"/>
-            <w:sz w:val="20"/>
-            <w:szCs w:val="20"/>
-          </w:rPr>
-          <w:t>https://doi.org/10.1159/000314297</w:t>
-        </w:r>
-      </w:hyperlink>
-    </w:p>
-    <w:p/>
-    <w:p>
-      <w:hyperlink r:id="rId3" w:history="1">
-        <w:r>
-          <w:rPr>
-            <w:rStyle w:val="Hyperlink"/>
-            <w:sz w:val="20"/>
-            <w:szCs w:val="20"/>
-          </w:rPr>
-          <w:t>https://doi.org/10.1186/s40478-025-01938-9</w:t>
-        </w:r>
-      </w:hyperlink>
-    </w:p>
-    <w:p/>
-    <w:p>
-      <w:hyperlink r:id="rId4" w:history="1">
-        <w:r>
-          <w:rPr>
-            <w:rStyle w:val="Hyperlink"/>
-            <w:sz w:val="20"/>
-            <w:szCs w:val="20"/>
-          </w:rPr>
-          <w:t>https://doi.org/10.1159/000540205</w:t>
-        </w:r>
-      </w:hyperlink>
-    </w:p>
-    <w:p/>
-    <w:p>
-      <w:r>
-        <w:rPr>
-          <w:sz w:val="20"/>
-          <w:szCs w:val="20"/>
-        </w:rPr>
-        <w:t>DOI: 10.3390/jcm14093000</w:t>
-      </w:r>
-    </w:p>
-    <w:p/>
-    <w:p>
-      <w:r>
-        <w:rPr>
-          <w:sz w:val="20"/>
-          <w:szCs w:val="20"/>
-        </w:rPr>
-        <w:t>There are many more articles that show this, this is a shotgun of articles over the last 20 years or so</w:t>
-      </w:r>
-    </w:p>
-  </w:comment>
-  <w:comment w:id="9" w:author="Carr, Treyton" w:date="2025-09-14T17:35:00Z" w:initials="CT">
-    <w:p>
-      <w:r>
-        <w:rPr>
-          <w:rStyle w:val="CommentReference"/>
-        </w:rPr>
-        <w:annotationRef/>
-      </w:r>
-      <w:r>
-        <w:rPr>
-          <w:sz w:val="20"/>
-          <w:szCs w:val="20"/>
-        </w:rPr>
-        <w:t>Lab outcomes looked at in those cushings studies</w:t>
-      </w:r>
-    </w:p>
-    <w:p>
-      <w:r>
-        <w:rPr>
-          <w:sz w:val="20"/>
-          <w:szCs w:val="20"/>
-        </w:rPr>
-        <w:t>in this one:</w:t>
-      </w:r>
-    </w:p>
-    <w:p>
-      <w:r>
-        <w:rPr>
-          <w:sz w:val="20"/>
-          <w:szCs w:val="20"/>
-        </w:rPr>
-        <w:t>10.1007/s11102-014-0567-8</w:t>
-      </w:r>
-    </w:p>
-    <w:p>
-      <w:r>
-        <w:rPr>
-          <w:sz w:val="20"/>
-          <w:szCs w:val="20"/>
-        </w:rPr>
-        <w:t>-mean basal serum cortisol, other cortisol measurements</w:t>
-      </w:r>
-    </w:p>
-    <w:p>
-      <w:r>
-        <w:rPr>
-          <w:sz w:val="20"/>
-          <w:szCs w:val="20"/>
-        </w:rPr>
-        <w:t>-plasma acth</w:t>
-      </w:r>
-    </w:p>
-    <w:p>
-      <w:r>
-        <w:rPr>
-          <w:sz w:val="20"/>
-          <w:szCs w:val="20"/>
-        </w:rPr>
-        <w:t>doi:10.1111/cen.12644.</w:t>
-      </w:r>
-    </w:p>
-    <w:p>
-      <w:r>
-        <w:rPr>
-          <w:sz w:val="20"/>
-          <w:szCs w:val="20"/>
-        </w:rPr>
-        <w:t>-Fasting glucose</w:t>
-      </w:r>
-    </w:p>
-    <w:p>
-      <w:r>
-        <w:rPr>
-          <w:sz w:val="20"/>
-          <w:szCs w:val="20"/>
-        </w:rPr>
-        <w:t>-LDL and HDL</w:t>
-      </w:r>
-    </w:p>
-    <w:p>
-      <w:r>
-        <w:rPr>
-          <w:sz w:val="20"/>
-          <w:szCs w:val="20"/>
-        </w:rPr>
-        <w:t>-total cholesterol</w:t>
-      </w:r>
-    </w:p>
-    <w:p>
-      <w:r>
-        <w:rPr>
-          <w:sz w:val="20"/>
-          <w:szCs w:val="20"/>
-        </w:rPr>
-        <w:t>-insulin</w:t>
-      </w:r>
-    </w:p>
-    <w:p/>
-    <w:p>
-      <w:hyperlink r:id="rId5" w:history="1">
-        <w:r>
-          <w:rPr>
-            <w:rStyle w:val="Hyperlink"/>
-            <w:sz w:val="20"/>
-            <w:szCs w:val="20"/>
-          </w:rPr>
-          <w:t>https://doi-org.proxy.lib.umich.edu/10.1210/clinem/dgae904</w:t>
-        </w:r>
-      </w:hyperlink>
-    </w:p>
-    <w:p>
-      <w:r>
-        <w:rPr>
-          <w:sz w:val="20"/>
-          <w:szCs w:val="20"/>
-        </w:rPr>
-        <w:t>-DST test</w:t>
-      </w:r>
-    </w:p>
-    <w:p>
-      <w:r>
-        <w:rPr>
-          <w:sz w:val="20"/>
-          <w:szCs w:val="20"/>
-        </w:rPr>
-        <w:t>-ACTH</w:t>
-      </w:r>
-    </w:p>
-    <w:p>
-      <w:r>
-        <w:rPr>
-          <w:sz w:val="20"/>
-          <w:szCs w:val="20"/>
-        </w:rPr>
-        <w:t>-more various cortisol tests (salivary new one)</w:t>
-      </w:r>
-    </w:p>
-    <w:p/>
-  </w:comment>
-  <w:comment w:id="10" w:author="Carr, Treyton" w:date="2025-09-16T11:36:00Z" w:initials="CT">
-    <w:p>
-      <w:r>
-        <w:rPr>
-          <w:rStyle w:val="CommentReference"/>
-        </w:rPr>
-        <w:annotationRef/>
-      </w:r>
-      <w:r>
-        <w:rPr>
-          <w:sz w:val="20"/>
-          <w:szCs w:val="20"/>
-        </w:rPr>
-        <w:t>10.2147/CLEP.S44336</w:t>
-      </w:r>
-    </w:p>
-    <w:p>
-      <w:r>
-        <w:rPr>
-          <w:sz w:val="20"/>
-          <w:szCs w:val="20"/>
-        </w:rPr>
-        <w:t>-multiple types of Dex tests</w:t>
-      </w:r>
-    </w:p>
-  </w:comment>
-  <w:comment w:id="11" w:author="Dave Bridges" w:date="2025-09-05T19:38:00Z" w:initials="DB">
-    <w:p>
-      <w:r>
-        <w:rPr>
-          <w:rStyle w:val="CommentReference"/>
-        </w:rPr>
-        <w:annotationRef/>
-      </w:r>
-      <w:r>
-        <w:rPr>
-          <w:sz w:val="20"/>
-          <w:szCs w:val="20"/>
-        </w:rPr>
-        <w:t>@trey also any data on demographic propensities towards Cushings we can cite?</w:t>
-      </w:r>
-    </w:p>
-  </w:comment>
-  <w:comment w:id="12" w:author="Carr, Treyton" w:date="2025-09-16T11:51:00Z" w:initials="CT">
-    <w:p>
-      <w:r>
-        <w:rPr>
-          <w:rStyle w:val="CommentReference"/>
-        </w:rPr>
-        <w:annotationRef/>
-      </w:r>
-      <w:r>
-        <w:rPr>
-          <w:sz w:val="20"/>
-          <w:szCs w:val="20"/>
-        </w:rPr>
-        <w:t>Some articles that include race in their analysis:</w:t>
-      </w:r>
-    </w:p>
-    <w:p>
-      <w:hyperlink r:id="rId6" w:history="1">
         <w:r>
           <w:rPr>
             <w:rStyle w:val="Hyperlink"/>
@@ -4284,7 +4746,7 @@
     </w:p>
     <w:p/>
     <w:p>
-      <w:hyperlink r:id="rId7" w:history="1">
+      <w:hyperlink r:id="rId2" w:history="1">
         <w:r>
           <w:rPr>
             <w:rStyle w:val="Hyperlink"/>
@@ -4304,7 +4766,7 @@
         </w:rPr>
         <w:t xml:space="preserve"> </w:t>
       </w:r>
-      <w:hyperlink r:id="rId8" w:history="1">
+      <w:hyperlink r:id="rId3" w:history="1">
         <w:r>
           <w:rPr>
             <w:rStyle w:val="Hyperlink"/>
@@ -4317,7 +4779,7 @@
     </w:p>
     <w:p/>
     <w:p>
-      <w:hyperlink r:id="rId9" w:history="1">
+      <w:hyperlink r:id="rId4" w:history="1">
         <w:r>
           <w:rPr>
             <w:rStyle w:val="Hyperlink"/>
@@ -4331,7 +4793,7 @@
     <w:p/>
     <w:p/>
   </w:comment>
-  <w:comment w:id="13" w:author="Dave Bridges" w:date="2025-09-07T20:08:00Z" w:initials="DB">
+  <w:comment w:id="9" w:author="Dave Bridges" w:date="2025-09-23T09:31:00Z" w:initials="DB">
     <w:p>
       <w:r>
         <w:rPr>
@@ -4344,11 +4806,51 @@
           <w:sz w:val="20"/>
           <w:szCs w:val="20"/>
         </w:rPr>
+        <w:t xml:space="preserve">I think only the first one directly tests the effects of race relative to the general population.  </w:t>
+      </w:r>
+    </w:p>
+    <w:p/>
+    <w:p>
+      <w:r>
+        <w:rPr>
+          <w:sz w:val="20"/>
+          <w:szCs w:val="20"/>
+        </w:rPr>
+        <w:t>This paper looks at time to diagnosis as a potential reason</w:t>
+      </w:r>
+    </w:p>
+    <w:p/>
+    <w:p>
+      <w:hyperlink r:id="rId5" w:history="1">
+        <w:r>
+          <w:rPr>
+            <w:rStyle w:val="Hyperlink"/>
+            <w:sz w:val="20"/>
+            <w:szCs w:val="20"/>
+          </w:rPr>
+          <w:t>https://pmc.ncbi.nlm.nih.gov/articles/PMC5552413/</w:t>
+        </w:r>
+      </w:hyperlink>
+    </w:p>
+  </w:comment>
+  <w:comment w:id="10" w:author="Dave Bridges" w:date="2025-09-07T20:08:00Z" w:initials="DB">
+    <w:p>
+      <w:r>
+        <w:rPr>
+          <w:rStyle w:val="CommentReference"/>
+        </w:rPr>
+        <w:annotationRef/>
+      </w:r>
+      <w:r>
+        <w:rPr>
+          <w:sz w:val="20"/>
+          <w:szCs w:val="20"/>
+        </w:rPr>
         <w:t>@trey why dont you give a try of explaining these, first talking about the effects of Cushings (see Table 3A) and then whether there is evidence of positive or negative effect modification (Table 3B)</w:t>
       </w:r>
     </w:p>
   </w:comment>
-  <w:comment w:id="14" w:author="Carr, Treyton" w:date="2025-09-23T00:51:00Z" w:initials="CT">
+  <w:comment w:id="11" w:author="Carr, Treyton" w:date="2025-09-23T00:51:00Z" w:initials="CT">
     <w:p>
       <w:r>
         <w:rPr>
@@ -4372,17 +4874,14 @@
 <w15:commentsEx xmlns:wpc="http://schemas.microsoft.com/office/word/2010/wordprocessingCanvas" xmlns:cx="http://schemas.microsoft.com/office/drawing/2014/chartex" xmlns:cx1="http://schemas.microsoft.com/office/drawing/2015/9/8/chartex" xmlns:cx2="http://schemas.microsoft.com/office/drawing/2015/10/21/chartex" xmlns:cx3="http://schemas.microsoft.com/office/drawing/2016/5/9/chartex" xmlns:cx4="http://schemas.microsoft.com/office/drawing/2016/5/10/chartex" xmlns:cx5="http://schemas.microsoft.com/office/drawing/2016/5/11/chartex" xmlns:cx6="http://schemas.microsoft.com/office/drawing/2016/5/12/chartex" xmlns:cx7="http://schemas.microsoft.com/office/drawing/2016/5/13/chartex" xmlns:cx8="http://schemas.microsoft.com/office/drawing/2016/5/14/chartex" xmlns:mc="http://schemas.openxmlformats.org/markup-compatibility/2006" xmlns:aink="http://schemas.microsoft.com/office/drawing/2016/ink" xmlns:am3d="http://schemas.microsoft.com/office/drawing/2017/model3d" xmlns:o="urn:schemas-microsoft-com:office:office" xmlns:oel="http://schemas.microsoft.com/office/2019/extlst" xmlns:r="http://schemas.openxmlformats.org/officeDocument/2006/relationships" xmlns:m="http://schemas.openxmlformats.org/officeDocument/2006/math" xmlns:v="urn:schemas-microsoft-com:vml" xmlns:wp14="http://schemas.microsoft.com/office/word/2010/wordprocessingDrawing" xmlns:wp="http://schemas.openxmlformats.org/drawingml/2006/wordprocessingDrawing" xmlns:w10="urn:schemas-microsoft-com:office:word" xmlns:w="http://schemas.openxmlformats.org/wordprocessingml/2006/main" xmlns:w14="http://schemas.microsoft.com/office/word/2010/wordml" xmlns:w15="http://schemas.microsoft.com/office/word/2012/wordml" xmlns:w16cex="http://schemas.microsoft.com/office/word/2018/wordml/cex" xmlns:w16cid="http://schemas.microsoft.com/office/word/2016/wordml/cid" xmlns:w16="http://schemas.microsoft.com/office/word/2018/wordml" xmlns:w16du="http://schemas.microsoft.com/office/word/2023/wordml/word16du" xmlns:w16sdtdh="http://schemas.microsoft.com/office/word/2020/wordml/sdtdatahash" xmlns:w16sdtfl="http://schemas.microsoft.com/office/word/2024/wordml/sdtformatlock" xmlns:w16se="http://schemas.microsoft.com/office/word/2015/wordml/symex" xmlns:wpg="http://schemas.microsoft.com/office/word/2010/wordprocessingGroup" xmlns:wpi="http://schemas.microsoft.com/office/word/2010/wordprocessingInk" xmlns:wne="http://schemas.microsoft.com/office/word/2006/wordml" xmlns:wps="http://schemas.microsoft.com/office/word/2010/wordprocessingShape" mc:Ignorable="w14 w15 w16se w16cid w16 w16cex w16sdtdh w16sdtfl w16du wp14">
   <w15:commentEx w15:paraId="4DBE4D40" w15:done="0"/>
   <w15:commentEx w15:paraId="6D0A8CE2" w15:paraIdParent="4DBE4D40" w15:done="0"/>
+  <w15:commentEx w15:paraId="0ED88EF0" w15:paraIdParent="4DBE4D40" w15:done="0"/>
   <w15:commentEx w15:paraId="30EA8164" w15:done="0"/>
   <w15:commentEx w15:paraId="69A0B22F" w15:done="0"/>
   <w15:commentEx w15:paraId="1DD21AA1" w15:done="0"/>
   <w15:commentEx w15:paraId="2B4220B9" w15:done="0"/>
-  <w15:commentEx w15:paraId="3F27DAC3" w15:done="0"/>
-  <w15:commentEx w15:paraId="3B9D134E" w15:paraIdParent="3F27DAC3" w15:done="0"/>
-  <w15:commentEx w15:paraId="0BE13372" w15:paraIdParent="3F27DAC3" w15:done="0"/>
-  <w15:commentEx w15:paraId="1B19137F" w15:paraIdParent="3F27DAC3" w15:done="0"/>
-  <w15:commentEx w15:paraId="1A3AF2A1" w15:paraIdParent="3F27DAC3" w15:done="0"/>
   <w15:commentEx w15:paraId="392E4D0B" w15:done="0"/>
   <w15:commentEx w15:paraId="72F74B19" w15:paraIdParent="392E4D0B" w15:done="0"/>
+  <w15:commentEx w15:paraId="55516B0E" w15:paraIdParent="392E4D0B" w15:done="0"/>
   <w15:commentEx w15:paraId="57ADD46F" w15:done="0"/>
   <w15:commentEx w15:paraId="54EF4F8A" w15:paraIdParent="57ADD46F" w15:done="0"/>
 </w15:commentsEx>
@@ -4392,17 +4891,14 @@
 <w16cex:commentsExtensible xmlns:wpc="http://schemas.microsoft.com/office/word/2010/wordprocessingCanvas" xmlns:cx="http://schemas.microsoft.com/office/drawing/2014/chartex" xmlns:cx1="http://schemas.microsoft.com/office/drawing/2015/9/8/chartex" xmlns:cx2="http://schemas.microsoft.com/office/drawing/2015/10/21/chartex" xmlns:cx3="http://schemas.microsoft.com/office/drawing/2016/5/9/chartex" xmlns:cx4="http://schemas.microsoft.com/office/drawing/2016/5/10/chartex" xmlns:cx5="http://schemas.microsoft.com/office/drawing/2016/5/11/chartex" xmlns:cx6="http://schemas.microsoft.com/office/drawing/2016/5/12/chartex" xmlns:cx7="http://schemas.microsoft.com/office/drawing/2016/5/13/chartex" xmlns:cx8="http://schemas.microsoft.com/office/drawing/2016/5/14/chartex" xmlns:cr="http://schemas.microsoft.com/office/comments/2020/reactions" xmlns:mc="http://schemas.openxmlformats.org/markup-compatibility/2006" xmlns:aink="http://schemas.microsoft.com/office/drawing/2016/ink" xmlns:am3d="http://schemas.microsoft.com/office/drawing/2017/model3d" xmlns:o="urn:schemas-microsoft-com:office:office" xmlns:oel="http://schemas.microsoft.com/office/2019/extlst" xmlns:r="http://schemas.openxmlformats.org/officeDocument/2006/relationships" xmlns:m="http://schemas.openxmlformats.org/officeDocument/2006/math" xmlns:v="urn:schemas-microsoft-com:vml" xmlns:wp14="http://schemas.microsoft.com/office/word/2010/wordprocessingDrawing" xmlns:wp="http://schemas.openxmlformats.org/drawingml/2006/wordprocessingDrawing" xmlns:w10="urn:schemas-microsoft-com:office:word" xmlns:w="http://schemas.openxmlformats.org/wordprocessingml/2006/main" xmlns:w14="http://schemas.microsoft.com/office/word/2010/wordml" xmlns:w15="http://schemas.microsoft.com/office/word/2012/wordml" xmlns:w16cex="http://schemas.microsoft.com/office/word/2018/wordml/cex" xmlns:w16cid="http://schemas.microsoft.com/office/word/2016/wordml/cid" xmlns:w16="http://schemas.microsoft.com/office/word/2018/wordml" xmlns:w16du="http://schemas.microsoft.com/office/word/2023/wordml/word16du" xmlns:w16sdtdh="http://schemas.microsoft.com/office/word/2020/wordml/sdtdatahash" xmlns:w16sdtfl="http://schemas.microsoft.com/office/word/2024/wordml/sdtformatlock" xmlns:w16se="http://schemas.microsoft.com/office/word/2015/wordml/symex" xmlns:wpg="http://schemas.microsoft.com/office/word/2010/wordprocessingGroup" xmlns:wpi="http://schemas.microsoft.com/office/word/2010/wordprocessingInk" xmlns:wne="http://schemas.microsoft.com/office/word/2006/wordml" xmlns:wps="http://schemas.microsoft.com/office/word/2010/wordprocessingShape" mc:Ignorable="w14 w15 w16se w16cid w16 w16cex w16sdtdh w16sdtfl cr w16du wp14">
   <w16cex:commentExtensible w16cex:durableId="68EF662C" w16cex:dateUtc="2025-09-05T15:11:00Z"/>
   <w16cex:commentExtensible w16cex:durableId="70F30A32" w16cex:dateUtc="2025-09-23T04:52:00Z"/>
+  <w16cex:commentExtensible w16cex:durableId="5CF4B9C2" w16cex:dateUtc="2025-09-23T13:08:00Z"/>
   <w16cex:commentExtensible w16cex:durableId="7BBB9387" w16cex:dateUtc="2025-09-07T23:14:00Z"/>
   <w16cex:commentExtensible w16cex:durableId="306CE51F" w16cex:dateUtc="2025-09-07T23:15:00Z"/>
   <w16cex:commentExtensible w16cex:durableId="1A95B88A" w16cex:dateUtc="2025-09-05T23:50:00Z"/>
   <w16cex:commentExtensible w16cex:durableId="73524BEF" w16cex:dateUtc="2025-09-07T18:40:00Z"/>
-  <w16cex:commentExtensible w16cex:durableId="10479658" w16cex:dateUtc="2025-09-05T22:06:00Z"/>
-  <w16cex:commentExtensible w16cex:durableId="2B1FD511" w16cex:dateUtc="2025-09-08T16:19:00Z"/>
-  <w16cex:commentExtensible w16cex:durableId="40A56FB1" w16cex:dateUtc="2025-09-14T21:23:00Z"/>
-  <w16cex:commentExtensible w16cex:durableId="3E036B7C" w16cex:dateUtc="2025-09-14T21:35:00Z"/>
-  <w16cex:commentExtensible w16cex:durableId="3DCB4B99" w16cex:dateUtc="2025-09-16T15:36:00Z"/>
   <w16cex:commentExtensible w16cex:durableId="4FC4BC49" w16cex:dateUtc="2025-09-05T23:38:00Z"/>
   <w16cex:commentExtensible w16cex:durableId="5D0CA468" w16cex:dateUtc="2025-09-16T15:51:00Z"/>
+  <w16cex:commentExtensible w16cex:durableId="01936C22" w16cex:dateUtc="2025-09-23T13:31:00Z"/>
   <w16cex:commentExtensible w16cex:durableId="4855A8FC" w16cex:dateUtc="2025-09-08T00:08:00Z"/>
   <w16cex:commentExtensible w16cex:durableId="4A77F548" w16cex:dateUtc="2025-09-23T04:51:00Z"/>
 </w16cex:commentsExtensible>
@@ -4412,17 +4908,14 @@
 <w16cid:commentsIds xmlns:wpc="http://schemas.microsoft.com/office/word/2010/wordprocessingCanvas" xmlns:cx="http://schemas.microsoft.com/office/drawing/2014/chartex" xmlns:cx1="http://schemas.microsoft.com/office/drawing/2015/9/8/chartex" xmlns:cx2="http://schemas.microsoft.com/office/drawing/2015/10/21/chartex" xmlns:cx3="http://schemas.microsoft.com/office/drawing/2016/5/9/chartex" xmlns:cx4="http://schemas.microsoft.com/office/drawing/2016/5/10/chartex" xmlns:cx5="http://schemas.microsoft.com/office/drawing/2016/5/11/chartex" xmlns:cx6="http://schemas.microsoft.com/office/drawing/2016/5/12/chartex" xmlns:cx7="http://schemas.microsoft.com/office/drawing/2016/5/13/chartex" xmlns:cx8="http://schemas.microsoft.com/office/drawing/2016/5/14/chartex" xmlns:mc="http://schemas.openxmlformats.org/markup-compatibility/2006" xmlns:aink="http://schemas.microsoft.com/office/drawing/2016/ink" xmlns:am3d="http://schemas.microsoft.com/office/drawing/2017/model3d" xmlns:o="urn:schemas-microsoft-com:office:office" xmlns:oel="http://schemas.microsoft.com/office/2019/extlst" xmlns:r="http://schemas.openxmlformats.org/officeDocument/2006/relationships" xmlns:m="http://schemas.openxmlformats.org/officeDocument/2006/math" xmlns:v="urn:schemas-microsoft-com:vml" xmlns:wp14="http://schemas.microsoft.com/office/word/2010/wordprocessingDrawing" xmlns:wp="http://schemas.openxmlformats.org/drawingml/2006/wordprocessingDrawing" xmlns:w10="urn:schemas-microsoft-com:office:word" xmlns:w="http://schemas.openxmlformats.org/wordprocessingml/2006/main" xmlns:w14="http://schemas.microsoft.com/office/word/2010/wordml" xmlns:w15="http://schemas.microsoft.com/office/word/2012/wordml" xmlns:w16cex="http://schemas.microsoft.com/office/word/2018/wordml/cex" xmlns:w16cid="http://schemas.microsoft.com/office/word/2016/wordml/cid" xmlns:w16="http://schemas.microsoft.com/office/word/2018/wordml" xmlns:w16du="http://schemas.microsoft.com/office/word/2023/wordml/word16du" xmlns:w16sdtdh="http://schemas.microsoft.com/office/word/2020/wordml/sdtdatahash" xmlns:w16sdtfl="http://schemas.microsoft.com/office/word/2024/wordml/sdtformatlock" xmlns:w16se="http://schemas.microsoft.com/office/word/2015/wordml/symex" xmlns:wpg="http://schemas.microsoft.com/office/word/2010/wordprocessingGroup" xmlns:wpi="http://schemas.microsoft.com/office/word/2010/wordprocessingInk" xmlns:wne="http://schemas.microsoft.com/office/word/2006/wordml" xmlns:wps="http://schemas.microsoft.com/office/word/2010/wordprocessingShape" mc:Ignorable="w14 w15 w16se w16cid w16 w16cex w16sdtdh w16sdtfl w16du wp14">
   <w16cid:commentId w16cid:paraId="4DBE4D40" w16cid:durableId="68EF662C"/>
   <w16cid:commentId w16cid:paraId="6D0A8CE2" w16cid:durableId="70F30A32"/>
+  <w16cid:commentId w16cid:paraId="0ED88EF0" w16cid:durableId="5CF4B9C2"/>
   <w16cid:commentId w16cid:paraId="30EA8164" w16cid:durableId="7BBB9387"/>
   <w16cid:commentId w16cid:paraId="69A0B22F" w16cid:durableId="306CE51F"/>
   <w16cid:commentId w16cid:paraId="1DD21AA1" w16cid:durableId="1A95B88A"/>
   <w16cid:commentId w16cid:paraId="2B4220B9" w16cid:durableId="73524BEF"/>
-  <w16cid:commentId w16cid:paraId="3F27DAC3" w16cid:durableId="10479658"/>
-  <w16cid:commentId w16cid:paraId="3B9D134E" w16cid:durableId="2B1FD511"/>
-  <w16cid:commentId w16cid:paraId="0BE13372" w16cid:durableId="40A56FB1"/>
-  <w16cid:commentId w16cid:paraId="1B19137F" w16cid:durableId="3E036B7C"/>
-  <w16cid:commentId w16cid:paraId="1A3AF2A1" w16cid:durableId="3DCB4B99"/>
   <w16cid:commentId w16cid:paraId="392E4D0B" w16cid:durableId="4FC4BC49"/>
   <w16cid:commentId w16cid:paraId="72F74B19" w16cid:durableId="5D0CA468"/>
+  <w16cid:commentId w16cid:paraId="55516B0E" w16cid:durableId="01936C22"/>
   <w16cid:commentId w16cid:paraId="57ADD46F" w16cid:durableId="4855A8FC"/>
   <w16cid:commentId w16cid:paraId="54EF4F8A" w16cid:durableId="4A77F548"/>
 </w16cid:commentsIds>
@@ -5922,7 +6415,6 @@
   <w:style w:type="character" w:default="1" w:styleId="DefaultParagraphFont">
     <w:name w:val="Default Paragraph Font"/>
     <w:uiPriority w:val="1"/>
-    <w:semiHidden/>
     <w:unhideWhenUsed/>
   </w:style>
   <w:style w:type="table" w:default="1" w:styleId="TableNormal">

</xml_diff>

<commit_message>
Made minor changes to results section
</commit_message>
<xml_diff>
--- a/manuscript/Cushings-Obesity/manuscript.docx
+++ b/manuscript/Cushings-Obesity/manuscript.docx
@@ -708,6 +708,7 @@
       <w:commentRangeStart w:id="7"/>
       <w:commentRangeStart w:id="8"/>
       <w:commentRangeStart w:id="9"/>
+      <w:commentRangeStart w:id="10"/>
       <w:r>
         <w:t>Prior to matching for Race and Ethnicity, we noted that participants</w:t>
       </w:r>
@@ -761,6 +762,13 @@
           <w:rStyle w:val="CommentReference"/>
         </w:rPr>
         <w:commentReference w:id="9"/>
+      </w:r>
+      <w:commentRangeEnd w:id="10"/>
+      <w:r>
+        <w:rPr>
+          <w:rStyle w:val="CommentReference"/>
+        </w:rPr>
+        <w:commentReference w:id="10"/>
       </w:r>
       <w:r>
         <w:t xml:space="preserve"> (p=0.01</w:t>
@@ -1254,194 +1262,217 @@
     </w:p>
     <w:p>
       <w:pPr>
+        <w:pStyle w:val="Heading3"/>
+      </w:pPr>
+      <w:commentRangeStart w:id="11"/>
+      <w:commentRangeStart w:id="12"/>
+      <w:r>
+        <w:t>Dysglycemia</w:t>
+      </w:r>
+    </w:p>
+    <w:p>
+      <w:r>
+        <w:t>As aforementioned, our first metabolic variable of interest was the fasting glucose levels of our obese and non-obese populations. As shown in Table 3a, we observed a</w:t>
+      </w:r>
+      <w:r>
+        <w:t xml:space="preserve"> significant </w:t>
+      </w:r>
+      <w:r>
+        <w:t xml:space="preserve">increase in </w:t>
+      </w:r>
+      <w:r>
+        <w:t xml:space="preserve">fasting </w:t>
+      </w:r>
+      <w:r>
+        <w:t xml:space="preserve">blood glucose levels </w:t>
+      </w:r>
+      <w:r>
+        <w:t xml:space="preserve">among </w:t>
+      </w:r>
+      <w:r>
+        <w:t>participants</w:t>
+      </w:r>
+      <w:r>
+        <w:t xml:space="preserve"> with Cushing’s disease, regardless of </w:t>
+      </w:r>
+      <w:commentRangeStart w:id="13"/>
+      <w:r>
+        <w:t>obesity status</w:t>
+      </w:r>
+      <w:r>
+        <w:t xml:space="preserve"> (p=1.03e^-23, 2.16e^-37)</w:t>
+      </w:r>
+      <w:r>
+        <w:t xml:space="preserve">. </w:t>
+      </w:r>
+      <w:commentRangeEnd w:id="13"/>
+      <w:r>
+        <w:rPr>
+          <w:rStyle w:val="CommentReference"/>
+        </w:rPr>
+        <w:commentReference w:id="13"/>
+      </w:r>
+      <w:r>
+        <w:t xml:space="preserve">The non-obese population had a slightly larger increase (26.95 vs. 26.18) than the obese population, but this was not a large enough difference to provide any significant evidence of an effect modification for obesity. </w:t>
+      </w:r>
+      <w:proofErr w:type="gramStart"/>
+      <w:r>
+        <w:t>Also</w:t>
+      </w:r>
+      <w:proofErr w:type="gramEnd"/>
+      <w:r>
+        <w:t xml:space="preserve"> in Table 3a, our collected HbA1c data indicated a</w:t>
+      </w:r>
+      <w:r>
+        <w:t xml:space="preserve"> slightly insignificant increase in HbA1c levels between the non-obese, and the non-obese with Cushing’s population (p=0.056). However, there was evidence of a significant increase in HbA1c levels of our obese, and obese with Cushing’s population (p=1.71e^-6). This leads us to believe that there is evidence for obesity being a positive modifier in patients with Cushing’s disease****.</w:t>
+      </w:r>
+    </w:p>
+    <w:p>
+      <w:pPr>
+        <w:pStyle w:val="Heading3"/>
+      </w:pPr>
+      <w:r>
+        <w:lastRenderedPageBreak/>
+        <w:t>MASLD and liver enzymes</w:t>
+      </w:r>
+    </w:p>
+    <w:p>
+      <w:r>
+        <w:t xml:space="preserve">To </w:t>
+      </w:r>
+      <w:r>
+        <w:t>assess</w:t>
+      </w:r>
+      <w:r>
+        <w:t xml:space="preserve"> </w:t>
+      </w:r>
+      <w:r>
+        <w:t>MASLD</w:t>
+      </w:r>
+      <w:r>
+        <w:t xml:space="preserve"> we looked at </w:t>
+      </w:r>
+      <w:commentRangeStart w:id="14"/>
+      <w:r>
+        <w:t xml:space="preserve">ALT </w:t>
+      </w:r>
+      <w:commentRangeEnd w:id="14"/>
+      <w:r>
+        <w:rPr>
+          <w:rStyle w:val="CommentReference"/>
+        </w:rPr>
+        <w:commentReference w:id="14"/>
+      </w:r>
+      <w:r>
+        <w:t>test results for our population. In both our obese, and non-obese populations, we saw an increase in ALT levels regardless of Cushing’s disease status</w:t>
+      </w:r>
+      <w:r>
+        <w:t xml:space="preserve"> </w:t>
+      </w:r>
+      <w:commentRangeStart w:id="15"/>
+      <w:r>
+        <w:t xml:space="preserve">(p=2.17e^-8, 1.94e^-46). </w:t>
+      </w:r>
+      <w:commentRangeEnd w:id="15"/>
+      <w:r>
+        <w:rPr>
+          <w:rStyle w:val="CommentReference"/>
+        </w:rPr>
+        <w:commentReference w:id="15"/>
+      </w:r>
+      <w:r>
+        <w:t>However, the increase in the obese population’s control group and Cushing’s patient population was far greater than the non-obese group’s increase (33.07 vs. 69.23). This suggests that obesity could have a positive effect modification on ALT levels.</w:t>
+      </w:r>
+    </w:p>
+    <w:p>
+      <w:pPr>
+        <w:pStyle w:val="Heading3"/>
+      </w:pPr>
+      <w:commentRangeStart w:id="16"/>
+      <w:r>
+        <w:t>Dyslipidemia</w:t>
+      </w:r>
+      <w:r>
+        <w:t xml:space="preserve"> </w:t>
+      </w:r>
+      <w:commentRangeEnd w:id="16"/>
+      <w:r>
+        <w:rPr>
+          <w:rStyle w:val="CommentReference"/>
+          <w:rFonts w:eastAsiaTheme="minorHAnsi" w:cstheme="minorBidi"/>
+          <w:color w:val="auto"/>
+        </w:rPr>
+        <w:commentReference w:id="16"/>
+      </w:r>
+    </w:p>
+    <w:p>
+      <w:pPr>
         <w:pStyle w:val="NormalWeb"/>
-        <w:rPr>
-          <w:b/>
-          <w:bCs/>
-        </w:rPr>
-      </w:pPr>
-      <w:commentRangeStart w:id="10"/>
-      <w:commentRangeStart w:id="11"/>
-      <w:r>
-        <w:rPr>
-          <w:b/>
-          <w:bCs/>
-        </w:rPr>
-        <w:t>Dysglycemia</w:t>
-      </w:r>
-    </w:p>
-    <w:p>
-      <w:r>
-        <w:t>As aforementioned, our first metabolic variable of interest was the fasting glucose levels of our obese and non-obese populations. As shown in Table 3a, we observed a</w:t>
-      </w:r>
-      <w:r>
-        <w:t xml:space="preserve"> significant </w:t>
-      </w:r>
-      <w:r>
-        <w:t xml:space="preserve">increase in blood glucose levels </w:t>
-      </w:r>
-      <w:r>
-        <w:t>among people with Cushing’s disease, regardless of obesity status</w:t>
-      </w:r>
-      <w:r>
-        <w:t xml:space="preserve"> (p=1.03e^-23, 2.16e^-37)</w:t>
-      </w:r>
-      <w:r>
-        <w:t xml:space="preserve">. The non-obese population had a slightly larger increase (26.95 vs. 26.18) than the obese population, but this was not a large enough difference to provide any significant evidence of an effect modification for obesity. </w:t>
+      </w:pPr>
+      <w:r>
+        <w:t>L</w:t>
+      </w:r>
+      <w:r>
+        <w:t xml:space="preserve"> Only a small number of participants with Cushing’s disease had LDL-C records within 30 days prior to treatment.</w:t>
+      </w:r>
+      <w:r>
+        <w:t xml:space="preserve"> With this in mind, we did not observe any significant increase or decrease in LDL levels between our control and Cushing’s population, regardless of obesity status. This gives us no evidence of obesity being a modifier for Cushing’s disease patients.</w:t>
+      </w:r>
+    </w:p>
+    <w:p>
+      <w:pPr>
+        <w:pStyle w:val="Heading3"/>
+      </w:pPr>
+      <w:r>
+        <w:t>Blood Pressure</w:t>
+      </w:r>
+      <w:commentRangeEnd w:id="11"/>
+      <w:r>
+        <w:rPr>
+          <w:rStyle w:val="CommentReference"/>
+          <w:rFonts w:eastAsiaTheme="minorHAnsi" w:cstheme="minorBidi"/>
+        </w:rPr>
+        <w:commentReference w:id="11"/>
+      </w:r>
+      <w:commentRangeEnd w:id="12"/>
+      <w:r>
+        <w:rPr>
+          <w:rStyle w:val="CommentReference"/>
+          <w:rFonts w:eastAsiaTheme="minorHAnsi" w:cstheme="minorBidi"/>
+        </w:rPr>
+        <w:commentReference w:id="12"/>
+      </w:r>
+    </w:p>
+    <w:p>
+      <w:r>
+        <w:t xml:space="preserve">We </w:t>
+      </w:r>
+      <w:r>
+        <w:t xml:space="preserve">parameterized blood pressure readings as systolic, diastolic and mean arterial </w:t>
       </w:r>
       <w:proofErr w:type="gramStart"/>
       <w:r>
-        <w:t>Also</w:t>
+        <w:t xml:space="preserve">pressure </w:t>
+      </w:r>
+      <w:r>
+        <w:t xml:space="preserve"> (</w:t>
       </w:r>
       <w:proofErr w:type="gramEnd"/>
       <w:r>
-        <w:t xml:space="preserve"> in Table 3a, our collected HbA1c data indicated a</w:t>
-      </w:r>
-      <w:r>
-        <w:t xml:space="preserve"> slightly insignificant increase in HbA1c levels between the non-obese, and the non-obese with Cushing’s population (p=0.056). However, there was evidence of a significant increase in HbA1c levels of our obese, and obese with Cushing’s population (p=1.71e^-6). This leads us to believe that there is evidence for obesity being a positive modifier in patients with Cushing’s disease****.</w:t>
-      </w:r>
-    </w:p>
-    <w:p>
-      <w:pPr>
-        <w:pStyle w:val="NormalWeb"/>
-        <w:rPr>
-          <w:b/>
-          <w:bCs/>
-        </w:rPr>
-      </w:pPr>
-      <w:r>
-        <w:rPr>
-          <w:b/>
-          <w:bCs/>
-        </w:rPr>
-        <w:t>MASLD and liver enzymes</w:t>
-      </w:r>
-    </w:p>
-    <w:p>
-      <w:pPr>
-        <w:pStyle w:val="NormalWeb"/>
-        <w:rPr>
-          <w:b/>
-          <w:bCs/>
-        </w:rPr>
-      </w:pPr>
-      <w:r>
-        <w:rPr>
-          <w:b/>
-          <w:bCs/>
-        </w:rPr>
-        <w:lastRenderedPageBreak/>
-        <w:t xml:space="preserve">To measure liver enzyme activity, we looked at ALT test results for our population. In both our obese, and non-obese populations, we saw an increase in ALT levels regardless of Cushing’s disease </w:t>
+        <w:t xml:space="preserve">Table 3A). In our data regarding the mean arteriole pressure, we did see a significant increase in our non-obese population between the patients with and without Cushing’s disease (p=0.010). We did not, however, </w:t>
+      </w:r>
+      <w:r>
+        <w:t>observe</w:t>
+      </w:r>
+      <w:r>
+        <w:t xml:space="preserve"> this same significant increase in the obese population (p=0.072). We saw this same relationship in our diastolic blood measurement, with a significant increase in the non-obese population, but not a significant increase in the obese population (p=3.13e^-6, 0.422). This pattern changed in our recorded measurements for systolic blood pressure. In this metric, we saw a significant increase in both the non-obese and obese populations between the control and Cushing’s patient populations (p=9.91e^-10, 9.28e^-4). This increase was much larger in the non-obese population (10.88 vs. 4.50), which suggests that obesity could be a negative effect modifier </w:t>
       </w:r>
       <w:proofErr w:type="gramStart"/>
       <w:r>
-        <w:rPr>
-          <w:b/>
-          <w:bCs/>
-        </w:rPr>
-        <w:t>status(</w:t>
+        <w:t>in regards to</w:t>
       </w:r>
       <w:proofErr w:type="gramEnd"/>
       <w:r>
-        <w:rPr>
-          <w:b/>
-          <w:bCs/>
-        </w:rPr>
-        <w:t>p=2.17e^-8, 1.94e^-46). However, the increase in the obese population’s control group and Cushing’s patient population was far greater than the non-obese group’s increase (33.07 vs. 69.23). This suggests that obesity could have a positive effect modification on ALT levels.</w:t>
-      </w:r>
-    </w:p>
-    <w:p>
-      <w:pPr>
-        <w:pStyle w:val="NormalWeb"/>
-        <w:rPr>
-          <w:b/>
-          <w:bCs/>
-        </w:rPr>
-      </w:pPr>
-    </w:p>
-    <w:p>
-      <w:pPr>
-        <w:pStyle w:val="NormalWeb"/>
-      </w:pPr>
-      <w:r>
-        <w:rPr>
-          <w:b/>
-          <w:bCs/>
-        </w:rPr>
-        <w:t>LDL-Cholesterol levels</w:t>
-      </w:r>
-      <w:r>
-        <w:t>.  Only a small number of participants with Cushing’s disease had LDL-C records within 30 days prior to treatment.</w:t>
-      </w:r>
-      <w:r>
-        <w:t xml:space="preserve"> With this in mind, we did not observe any significant increase or decrease in LDL levels between our control and Cushing’s population, regardless of obesity status. This gives us no evidence of obesity being a modifier for Cushing’s disease patients.</w:t>
-      </w:r>
-    </w:p>
-    <w:p>
-      <w:pPr>
-        <w:pStyle w:val="NormalWeb"/>
-        <w:rPr>
-          <w:b/>
-          <w:bCs/>
-        </w:rPr>
-      </w:pPr>
-      <w:r>
-        <w:rPr>
-          <w:b/>
-          <w:bCs/>
-        </w:rPr>
-        <w:t>Blood Pressure</w:t>
-      </w:r>
-      <w:commentRangeEnd w:id="10"/>
-      <w:r>
-        <w:rPr>
-          <w:rStyle w:val="CommentReference"/>
-          <w:rFonts w:asciiTheme="minorHAnsi" w:eastAsiaTheme="minorHAnsi" w:hAnsiTheme="minorHAnsi" w:cstheme="minorBidi"/>
-          <w:kern w:val="2"/>
-          <w14:ligatures w14:val="standardContextual"/>
-        </w:rPr>
-        <w:commentReference w:id="10"/>
-      </w:r>
-      <w:commentRangeEnd w:id="11"/>
-      <w:r>
-        <w:rPr>
-          <w:rStyle w:val="CommentReference"/>
-          <w:rFonts w:asciiTheme="minorHAnsi" w:eastAsiaTheme="minorHAnsi" w:hAnsiTheme="minorHAnsi" w:cstheme="minorBidi"/>
-          <w:kern w:val="2"/>
-          <w14:ligatures w14:val="standardContextual"/>
-        </w:rPr>
-        <w:commentReference w:id="11"/>
-      </w:r>
-    </w:p>
-    <w:p>
-      <w:pPr>
-        <w:pStyle w:val="NormalWeb"/>
-        <w:rPr>
-          <w:b/>
-          <w:bCs/>
-        </w:rPr>
-      </w:pPr>
-      <w:r>
-        <w:rPr>
-          <w:b/>
-          <w:bCs/>
-        </w:rPr>
-        <w:t xml:space="preserve">We recorded three different measurements regarding blood pressure (Table 3A). In our data regarding the mean arteriole pressure, we did see a significant increase in our non-obese population between the patients with and without Cushing’s disease (p=0.010). We did not, however, see this same significant increase in the obese population (p=0.072). We saw this same relationship in our diastolic blood measurement, with a significant increase in the non-obese population, but not a significant increase in the obese population (p=3.13e^-6, 0.422). This pattern changed in our recorded measurements for systolic blood pressure. In this metric, we saw a significant increase in both the non-obese and obese populations between the control and Cushing’s patient populations (p=9.91e^-10, 9.28e^-4). This increase was much larger in the non-obese population (10.88 vs. 4.50), which suggests that obesity could be a negative effect modifier </w:t>
-      </w:r>
-      <w:proofErr w:type="gramStart"/>
-      <w:r>
-        <w:rPr>
-          <w:b/>
-          <w:bCs/>
-        </w:rPr>
-        <w:t>in regards to</w:t>
-      </w:r>
-      <w:proofErr w:type="gramEnd"/>
-      <w:r>
-        <w:rPr>
-          <w:b/>
-          <w:bCs/>
-        </w:rPr>
         <w:t xml:space="preserve"> systolic blood pressure.</w:t>
       </w:r>
     </w:p>
@@ -1597,6 +1628,7 @@
         </w:numPr>
       </w:pPr>
       <w:r>
+        <w:lastRenderedPageBreak/>
         <w:t>IPTW</w:t>
       </w:r>
     </w:p>
@@ -1605,7 +1637,6 @@
         <w:pStyle w:val="Heading1"/>
       </w:pPr>
       <w:r>
-        <w:lastRenderedPageBreak/>
         <w:t>Discussion</w:t>
       </w:r>
     </w:p>
@@ -1659,7 +1690,7 @@
         </w:numPr>
       </w:pPr>
       <w:r>
-        <w:t>Control population has more recent labs</w:t>
+        <w:t>Race could be under-diagnosis (given previous papers of time to treatment)</w:t>
       </w:r>
     </w:p>
     <w:p>
@@ -1671,15 +1702,7 @@
         </w:numPr>
       </w:pPr>
       <w:r>
-        <w:t xml:space="preserve">BMI Higher in </w:t>
-      </w:r>
-      <w:proofErr w:type="spellStart"/>
-      <w:r>
-        <w:t>cushings</w:t>
-      </w:r>
-      <w:proofErr w:type="spellEnd"/>
-      <w:r>
-        <w:t xml:space="preserve"> case</w:t>
+        <w:t>Control population has more recent labs</w:t>
       </w:r>
     </w:p>
     <w:p>
@@ -1690,6 +1713,26 @@
           <w:numId w:val="6"/>
         </w:numPr>
       </w:pPr>
+      <w:r>
+        <w:t xml:space="preserve">BMI Higher in </w:t>
+      </w:r>
+      <w:proofErr w:type="spellStart"/>
+      <w:r>
+        <w:t>cushings</w:t>
+      </w:r>
+      <w:proofErr w:type="spellEnd"/>
+      <w:r>
+        <w:t xml:space="preserve"> case</w:t>
+      </w:r>
+    </w:p>
+    <w:p>
+      <w:pPr>
+        <w:pStyle w:val="ListParagraph"/>
+        <w:numPr>
+          <w:ilvl w:val="0"/>
+          <w:numId w:val="6"/>
+        </w:numPr>
+      </w:pPr>
     </w:p>
     <w:p>
       <w:pPr>
@@ -1935,6 +1978,7 @@
         <w:rPr>
           <w:rFonts w:ascii="Aptos"/>
         </w:rPr>
+        <w:lastRenderedPageBreak/>
         <w:t xml:space="preserve">Ho, D., Imai, K., King, G., &amp; Stuart, E. A. (2011). </w:t>
       </w:r>
       <w:proofErr w:type="spellStart"/>
@@ -1992,7 +2036,6 @@
         <w:rPr>
           <w:rFonts w:ascii="Aptos"/>
         </w:rPr>
-        <w:lastRenderedPageBreak/>
         <w:t>Ioachimescu</w:t>
       </w:r>
       <w:proofErr w:type="spellEnd"/>
@@ -2248,6 +2291,7 @@
         <w:pStyle w:val="Heading1"/>
       </w:pPr>
       <w:r>
+        <w:lastRenderedPageBreak/>
         <w:t xml:space="preserve">Figure </w:t>
       </w:r>
       <w:r>
@@ -2306,11 +2350,7 @@
         <w:t xml:space="preserve">Effects of Cushing’s disease and Obesity on Laboratory Values.  </w:t>
       </w:r>
       <w:r>
-        <w:t xml:space="preserve">Laboratory values were within 30 days of Cushing’s disease surgery for cases.  Obesity was defined as a BMI </w:t>
-      </w:r>
-      <w:r>
-        <w:lastRenderedPageBreak/>
-        <w:t>above or below 30 kg/m</w:t>
+        <w:t>Laboratory values were within 30 days of Cushing’s disease surgery for cases.  Obesity was defined as a BMI above or below 30 kg/m</w:t>
       </w:r>
       <w:r>
         <w:rPr>
@@ -3025,6 +3065,7 @@
           <w:szCs w:val="18"/>
           <w14:ligatures w14:val="none"/>
         </w:rPr>
+        <w:lastRenderedPageBreak/>
         <w:t xml:space="preserve">   </w:t>
       </w:r>
       <w:r>
@@ -3314,7 +3355,6 @@
           <w:szCs w:val="18"/>
           <w14:ligatures w14:val="none"/>
         </w:rPr>
-        <w:lastRenderedPageBreak/>
         <w:t xml:space="preserve">   </w:t>
       </w:r>
       <w:r>
@@ -4833,7 +4873,7 @@
       </w:hyperlink>
     </w:p>
   </w:comment>
-  <w:comment w:id="10" w:author="Dave Bridges" w:date="2025-09-07T20:08:00Z" w:initials="DB">
+  <w:comment w:id="10" w:author="Dave Bridges" w:date="2025-09-23T09:32:00Z" w:initials="DB">
     <w:p>
       <w:r>
         <w:rPr>
@@ -4846,11 +4886,129 @@
           <w:sz w:val="20"/>
           <w:szCs w:val="20"/>
         </w:rPr>
+        <w:t xml:space="preserve">More about severity here </w:t>
+      </w:r>
+    </w:p>
+    <w:p/>
+    <w:p>
+      <w:hyperlink r:id="rId6" w:history="1">
+        <w:r>
+          <w:rPr>
+            <w:rStyle w:val="Hyperlink"/>
+            <w:sz w:val="20"/>
+            <w:szCs w:val="20"/>
+          </w:rPr>
+          <w:t>https://pmc.ncbi.nlm.nih.gov/articles/PMC5552413/</w:t>
+        </w:r>
+      </w:hyperlink>
+    </w:p>
+  </w:comment>
+  <w:comment w:id="13" w:author="Dave Bridges" w:date="2025-09-23T09:44:00Z" w:initials="DB">
+    <w:p>
+      <w:r>
+        <w:rPr>
+          <w:rStyle w:val="CommentReference"/>
+        </w:rPr>
+        <w:annotationRef/>
+      </w:r>
+      <w:r>
+        <w:rPr>
+          <w:sz w:val="20"/>
+          <w:szCs w:val="20"/>
+        </w:rPr>
+        <w:t>Here do you mean in people with a BMI above or below 30?  Try to report as Effect size ... p value</w:t>
+      </w:r>
+    </w:p>
+    <w:p/>
+    <w:p>
+      <w:r>
+        <w:rPr>
+          <w:sz w:val="20"/>
+          <w:szCs w:val="20"/>
+        </w:rPr>
+        <w:t>So for example here i woudl say something like fasting glucose was increased in participants with BMI above and below 30 kg/m2 (27.0 and 26.1 mg/dL respectively, both p&lt;0.001).</w:t>
+      </w:r>
+    </w:p>
+  </w:comment>
+  <w:comment w:id="14" w:author="Dave Bridges" w:date="2025-09-23T09:45:00Z" w:initials="DB">
+    <w:p>
+      <w:r>
+        <w:rPr>
+          <w:rStyle w:val="CommentReference"/>
+        </w:rPr>
+        <w:annotationRef/>
+      </w:r>
+      <w:r>
+        <w:rPr>
+          <w:sz w:val="20"/>
+          <w:szCs w:val="20"/>
+        </w:rPr>
+        <w:t>lets add AST</w:t>
+      </w:r>
+    </w:p>
+  </w:comment>
+  <w:comment w:id="15" w:author="Dave Bridges" w:date="2025-09-23T09:45:00Z" w:initials="DB">
+    <w:p>
+      <w:r>
+        <w:rPr>
+          <w:rStyle w:val="CommentReference"/>
+        </w:rPr>
+        <w:annotationRef/>
+      </w:r>
+      <w:r>
+        <w:rPr>
+          <w:sz w:val="20"/>
+          <w:szCs w:val="20"/>
+        </w:rPr>
+        <w:t>Lets just report anything under 0.001 as &lt;0.001 since these are all astronomically low.</w:t>
+      </w:r>
+    </w:p>
+    <w:p/>
+    <w:p>
+      <w:r>
+        <w:rPr>
+          <w:sz w:val="20"/>
+          <w:szCs w:val="20"/>
+        </w:rPr>
+        <w:t>Also include effect sizes</w:t>
+      </w:r>
+    </w:p>
+  </w:comment>
+  <w:comment w:id="16" w:author="Dave Bridges" w:date="2025-09-23T09:45:00Z" w:initials="DB">
+    <w:p>
+      <w:r>
+        <w:rPr>
+          <w:rStyle w:val="CommentReference"/>
+        </w:rPr>
+        <w:annotationRef/>
+      </w:r>
+      <w:r>
+        <w:rPr>
+          <w:sz w:val="20"/>
+          <w:szCs w:val="20"/>
+        </w:rPr>
+        <w:t>Lets expand to TG, HDL and total C when we do the next data pull</w:t>
+      </w:r>
+    </w:p>
+  </w:comment>
+  <w:comment w:id="11" w:author="Dave Bridges" w:date="2025-09-07T20:08:00Z" w:initials="DB">
+    <w:p>
+      <w:r>
+        <w:rPr>
+          <w:rStyle w:val="CommentReference"/>
+        </w:rPr>
+        <w:annotationRef/>
+      </w:r>
+      <w:r>
+        <w:rPr>
+          <w:sz w:val="20"/>
+          <w:szCs w:val="20"/>
+        </w:rPr>
         <w:t>@trey why dont you give a try of explaining these, first talking about the effects of Cushings (see Table 3A) and then whether there is evidence of positive or negative effect modification (Table 3B)</w:t>
       </w:r>
     </w:p>
   </w:comment>
-  <w:comment w:id="11" w:author="Carr, Treyton" w:date="2025-09-23T00:51:00Z" w:initials="CT">
+  <w:comment w:id="12" w:author="Carr, Treyton" w:date="2025-09-23T00:51:00Z" w:initials="CT">
     <w:p>
       <w:r>
         <w:rPr>
@@ -4882,6 +5040,11 @@
   <w15:commentEx w15:paraId="392E4D0B" w15:done="0"/>
   <w15:commentEx w15:paraId="72F74B19" w15:paraIdParent="392E4D0B" w15:done="0"/>
   <w15:commentEx w15:paraId="55516B0E" w15:paraIdParent="392E4D0B" w15:done="0"/>
+  <w15:commentEx w15:paraId="27A1600A" w15:paraIdParent="392E4D0B" w15:done="0"/>
+  <w15:commentEx w15:paraId="00B0B8E1" w15:done="0"/>
+  <w15:commentEx w15:paraId="1C9C357C" w15:done="0"/>
+  <w15:commentEx w15:paraId="4ACD75D6" w15:done="0"/>
+  <w15:commentEx w15:paraId="5D48BE75" w15:done="0"/>
   <w15:commentEx w15:paraId="57ADD46F" w15:done="0"/>
   <w15:commentEx w15:paraId="54EF4F8A" w15:paraIdParent="57ADD46F" w15:done="0"/>
 </w15:commentsEx>
@@ -4899,6 +5062,11 @@
   <w16cex:commentExtensible w16cex:durableId="4FC4BC49" w16cex:dateUtc="2025-09-05T23:38:00Z"/>
   <w16cex:commentExtensible w16cex:durableId="5D0CA468" w16cex:dateUtc="2025-09-16T15:51:00Z"/>
   <w16cex:commentExtensible w16cex:durableId="01936C22" w16cex:dateUtc="2025-09-23T13:31:00Z"/>
+  <w16cex:commentExtensible w16cex:durableId="587436AC" w16cex:dateUtc="2025-09-23T13:32:00Z"/>
+  <w16cex:commentExtensible w16cex:durableId="399AC0EA" w16cex:dateUtc="2025-09-23T13:44:00Z"/>
+  <w16cex:commentExtensible w16cex:durableId="766235EF" w16cex:dateUtc="2025-09-23T13:45:00Z"/>
+  <w16cex:commentExtensible w16cex:durableId="2F71EC13" w16cex:dateUtc="2025-09-23T13:45:00Z"/>
+  <w16cex:commentExtensible w16cex:durableId="7A7E4C1B" w16cex:dateUtc="2025-09-23T13:45:00Z"/>
   <w16cex:commentExtensible w16cex:durableId="4855A8FC" w16cex:dateUtc="2025-09-08T00:08:00Z"/>
   <w16cex:commentExtensible w16cex:durableId="4A77F548" w16cex:dateUtc="2025-09-23T04:51:00Z"/>
 </w16cex:commentsExtensible>
@@ -4916,6 +5084,11 @@
   <w16cid:commentId w16cid:paraId="392E4D0B" w16cid:durableId="4FC4BC49"/>
   <w16cid:commentId w16cid:paraId="72F74B19" w16cid:durableId="5D0CA468"/>
   <w16cid:commentId w16cid:paraId="55516B0E" w16cid:durableId="01936C22"/>
+  <w16cid:commentId w16cid:paraId="27A1600A" w16cid:durableId="587436AC"/>
+  <w16cid:commentId w16cid:paraId="00B0B8E1" w16cid:durableId="399AC0EA"/>
+  <w16cid:commentId w16cid:paraId="1C9C357C" w16cid:durableId="766235EF"/>
+  <w16cid:commentId w16cid:paraId="4ACD75D6" w16cid:durableId="2F71EC13"/>
+  <w16cid:commentId w16cid:paraId="5D48BE75" w16cid:durableId="7A7E4C1B"/>
   <w16cid:commentId w16cid:paraId="57ADD46F" w16cid:durableId="4855A8FC"/>
   <w16cid:commentId w16cid:paraId="54EF4F8A" w16cid:durableId="4A77F548"/>
 </w16cid:commentsIds>
@@ -6263,7 +6436,6 @@
     <w:next w:val="Normal"/>
     <w:link w:val="Heading3Char"/>
     <w:uiPriority w:val="9"/>
-    <w:semiHidden/>
     <w:unhideWhenUsed/>
     <w:qFormat/>
     <w:rsid w:val="00233DA7"/>
@@ -6469,7 +6641,6 @@
     <w:basedOn w:val="DefaultParagraphFont"/>
     <w:link w:val="Heading3"/>
     <w:uiPriority w:val="9"/>
-    <w:semiHidden/>
     <w:rsid w:val="00233DA7"/>
     <w:rPr>
       <w:rFonts w:eastAsiaTheme="majorEastAsia" w:cstheme="majorBidi"/>

</xml_diff>

<commit_message>
Intro work, some methods, and also hypothesized some limitations
Went in and began the introduction, cleaned up some p values, added in some information in the methods about our patient selection process, and jotted some ideas down on potential limitations.
</commit_message>
<xml_diff>
--- a/manuscript/Cushings-Obesity/manuscript.docx
+++ b/manuscript/Cushings-Obesity/manuscript.docx
@@ -20,6 +20,26 @@
       <w:r>
         <w:t>Cushing’s disease</w:t>
       </w:r>
+      <w:r>
+        <w:t xml:space="preserve"> is a rare endocrine disorder</w:t>
+      </w:r>
+      <w:r>
+        <w:t xml:space="preserve"> caused by the overproduction of cortisol, resulting in chronic hypercortisolism.</w:t>
+      </w:r>
+      <w:r>
+        <w:t xml:space="preserve"> The sickness affects women disproportionally to men and is most often caused by a tumor on the anterior pituitary gland, or the adrenal gland. The effects of sustained elevation of cortisol in the body can present in a variety of ways in humans, but they are generally well known in a general population. These can include high blood pressure, diabetes, and weight gain. Many of these symptoms are caused by both obesity and metabolic related symptoms, and it is difficult to discern from the obesity-dependent from the obesity-independent mechanisms of Cushing’s </w:t>
+      </w:r>
+      <w:commentRangeStart w:id="0"/>
+      <w:r>
+        <w:t xml:space="preserve">disease. </w:t>
+      </w:r>
+      <w:commentRangeEnd w:id="0"/>
+      <w:r>
+        <w:rPr>
+          <w:rStyle w:val="CommentReference"/>
+        </w:rPr>
+        <w:commentReference w:id="0"/>
+      </w:r>
     </w:p>
     <w:p/>
     <w:p>
@@ -83,311 +103,277 @@
       <w:r>
         <w:t xml:space="preserve"> Michigan Medicine dating back to January 1, 2000, searching for diagnoses of Cushing’s disease including ICD Codes (</w:t>
       </w:r>
-      <w:commentRangeStart w:id="0"/>
+      <w:r>
+        <w:t>E24.0, 255.0</w:t>
+      </w:r>
+      <w:r>
+        <w:t>)</w:t>
+      </w:r>
+      <w:r>
+        <w:t xml:space="preserve">.  </w:t>
+      </w:r>
+      <w:r>
+        <w:t xml:space="preserve"> </w:t>
+      </w:r>
+      <w:r>
+        <w:t>To identify when patients were treated</w:t>
+      </w:r>
+      <w:r>
+        <w:t xml:space="preserve"> via surgery,</w:t>
+      </w:r>
+      <w:r>
+        <w:t xml:space="preserve"> we included procedure codes </w:t>
+      </w:r>
       <w:commentRangeStart w:id="1"/>
       <w:commentRangeStart w:id="2"/>
       <w:r>
-        <w:t>XXXX</w:t>
-      </w:r>
-      <w:commentRangeEnd w:id="0"/>
+        <w:t>YYY</w:t>
+      </w:r>
+      <w:commentRangeEnd w:id="1"/>
       <w:r>
         <w:rPr>
           <w:rStyle w:val="CommentReference"/>
         </w:rPr>
-        <w:commentReference w:id="0"/>
-      </w:r>
-      <w:commentRangeEnd w:id="1"/>
+        <w:commentReference w:id="1"/>
+      </w:r>
+      <w:commentRangeEnd w:id="2"/>
       <w:r>
         <w:rPr>
           <w:rStyle w:val="CommentReference"/>
         </w:rPr>
-        <w:commentReference w:id="1"/>
-      </w:r>
-      <w:commentRangeEnd w:id="2"/>
+        <w:commentReference w:id="2"/>
+      </w:r>
+      <w:r>
+        <w:t>.</w:t>
+      </w:r>
+      <w:r>
+        <w:t xml:space="preserve">  We excluded participants if they </w:t>
+      </w:r>
+      <w:r>
+        <w:t>did not have a Cushing’s disease diagnosis, treatment date, lab history, or relevant demographic data documented.</w:t>
+      </w:r>
+      <w:r>
+        <w:t xml:space="preserve"> Race and ethnicity were self-reported, with groups of &lt;10 aggregated into the other category.</w:t>
+      </w:r>
+      <w:r>
+        <w:t xml:space="preserve"> </w:t>
+      </w:r>
+    </w:p>
+    <w:p>
+      <w:r>
+        <w:t xml:space="preserve">To identify controls, </w:t>
+      </w:r>
+      <w:r>
+        <w:t>we used</w:t>
+      </w:r>
+      <w:r>
+        <w:t xml:space="preserve"> the </w:t>
+      </w:r>
+      <w:r>
+        <w:t xml:space="preserve"> </w:t>
+      </w:r>
+      <w:proofErr w:type="spellStart"/>
+      <w:r>
+        <w:t>MatchIt</w:t>
+      </w:r>
+      <w:proofErr w:type="spellEnd"/>
+      <w:r>
+        <w:t xml:space="preserve"> </w:t>
+      </w:r>
+      <w:r>
+        <w:t xml:space="preserve">package </w:t>
+      </w:r>
+      <w:r>
+        <w:t xml:space="preserve">(version </w:t>
+      </w:r>
+      <w:r>
+        <w:t xml:space="preserve">4.7.1; </w:t>
+      </w:r>
+      <w:r>
+        <w:fldChar w:fldCharType="begin"/>
+      </w:r>
+      <w:r>
+        <w:instrText xml:space="preserve"> ADDIN ZOTERO_ITEM CSL_CITATION {"citationID":"Pl5Gc3F1","properties":{"formattedCitation":"(Ho et al., 2011)","plainCitation":"(Ho et al., 2011)","noteIndex":0},"citationItems":[{"id":12196,"uris":["http://zotero.org/users/7317906/items/H5CAAL6F"],"itemData":{"id":12196,"type":"article-journal","abstract":"MatchIt implements the suggestions of Ho, Imai, King, and Stuart (2007) for improving parametric statistical models by preprocessing data with nonparametric matching methods. MatchIt implements a wide range of sophisticated matching methods, making it possible to greatly reduce the dependence of causal inferences on hard-to-justify, but commonly made, statistical modeling assumptions. The software also easily fits into existing research practices since, after preprocessing data with MatchIt, researchers can use whatever parametric model they would have used without MatchIt, but produce inferences with substantially more robustness and less sensitivity to modeling assumptions. MatchIt is an R program, and also works seamlessly with Zelig.","container-title":"Journal of Statistical Software","DOI":"10.18637/jss.v042.i08","ISSN":"1548-7660","language":"en","license":"Copyright (c) 2006 Daniel Ho, Kosuke Imai, Gary King, Elizabeth A. Stuart","page":"1-28","source":"www.jstatsoft.org","title":"MatchIt: Nonparametric Preprocessing for Parametric Causal Inference","title-short":"MatchIt","volume":"42","author":[{"family":"Ho","given":"Daniel"},{"family":"Imai","given":"Kosuke"},{"family":"King","given":"Gary"},{"family":"Stuart","given":"Elizabeth A."}],"issued":{"date-parts":[["2011",6,14]]},"citation-key":"hoMatchItNonparametricPreprocessing2011"}}],"schema":"https://github.com/citation-style-language/schema/raw/master/csl-citation.json"} </w:instrText>
+      </w:r>
+      <w:r>
+        <w:fldChar w:fldCharType="separate"/>
+      </w:r>
+      <w:r>
+        <w:rPr>
+          <w:noProof/>
+        </w:rPr>
+        <w:t>(Ho et al., 2011)</w:t>
+      </w:r>
+      <w:r>
+        <w:fldChar w:fldCharType="end"/>
+      </w:r>
+      <w:r>
+        <w:t>)</w:t>
+      </w:r>
+      <w:r>
+        <w:t>. F</w:t>
+      </w:r>
+      <w:r>
+        <w:t xml:space="preserve">or </w:t>
+      </w:r>
+      <w:r>
+        <w:t xml:space="preserve">each outcome we identified all Cushing’s cases </w:t>
+      </w:r>
+      <w:r>
+        <w:t xml:space="preserve">with that measurement </w:t>
+      </w:r>
+      <w:r>
+        <w:t xml:space="preserve">and potential controls with that measurement available. </w:t>
+      </w:r>
+      <w:r>
+        <w:t>For Cushing’s cases to be included they had to have had the laboratory measure</w:t>
+      </w:r>
+      <w:r>
+        <w:t>d</w:t>
+      </w:r>
+      <w:r>
+        <w:t xml:space="preserve"> </w:t>
+      </w:r>
+      <w:r>
+        <w:t xml:space="preserve">30 days or fewer </w:t>
+      </w:r>
+      <w:r>
+        <w:t xml:space="preserve">prior to surgical treatment.  </w:t>
+      </w:r>
+      <w:r>
+        <w:t>We performed nearest</w:t>
+      </w:r>
+      <w:r>
+        <w:rPr>
+          <w:rFonts w:ascii="Cambria Math" w:hAnsi="Cambria Math" w:cs="Cambria Math"/>
+        </w:rPr>
+        <w:t>‐</w:t>
+      </w:r>
+      <w:r>
+        <w:t xml:space="preserve">neighbor propensity score matching (ratio = </w:t>
+      </w:r>
+      <w:r>
+        <w:t>10:1</w:t>
+      </w:r>
+      <w:r>
+        <w:t xml:space="preserve">) with age in the </w:t>
+      </w:r>
+      <w:r>
+        <w:t>propensity score</w:t>
+      </w:r>
+      <w:r>
+        <w:t xml:space="preserve"> model and exact matching on gender and race/ethnicity</w:t>
+      </w:r>
+      <w:r>
+        <w:t xml:space="preserve"> from a pool of </w:t>
+      </w:r>
+      <w:r>
+        <w:t>70</w:t>
+      </w:r>
+      <w:r>
+        <w:t>,</w:t>
+      </w:r>
+      <w:r>
+        <w:t>327</w:t>
+      </w:r>
+      <w:r>
+        <w:t xml:space="preserve"> </w:t>
+      </w:r>
+      <w:r>
+        <w:t>Michigan Medicine patients</w:t>
+      </w:r>
+      <w:r>
+        <w:t xml:space="preserve">. This procedure was repeated separately for each outcome </w:t>
+      </w:r>
+      <w:r>
+        <w:t xml:space="preserve">as our </w:t>
+      </w:r>
+      <w:r>
+        <w:t>primary analys</w:t>
+      </w:r>
+      <w:r>
+        <w:t>e</w:t>
+      </w:r>
+      <w:r>
+        <w:t xml:space="preserve">s. </w:t>
+      </w:r>
+      <w:r>
+        <w:t xml:space="preserve"> The</w:t>
+      </w:r>
+      <w:r>
+        <w:t xml:space="preserve"> maximal</w:t>
+      </w:r>
+      <w:r>
+        <w:t xml:space="preserve"> post-matching standardized mean difference for </w:t>
+      </w:r>
+      <w:r>
+        <w:t>a</w:t>
+      </w:r>
+      <w:r>
+        <w:t xml:space="preserve">ge </w:t>
+      </w:r>
+      <w:r>
+        <w:t>was</w:t>
+      </w:r>
+      <w:r>
+        <w:t xml:space="preserve"> &lt;0.</w:t>
+      </w:r>
+      <w:r>
+        <w:t>05</w:t>
+      </w:r>
+      <w:r>
+        <w:t xml:space="preserve"> for all outcomes, indicating adequate balance.</w:t>
+      </w:r>
+      <w:r>
+        <w:t xml:space="preserve">  </w:t>
+      </w:r>
+      <w:r>
+        <w:t xml:space="preserve">As a sensitivity analysis we also created a single matched cohort using participants with </w:t>
+      </w:r>
+      <w:r>
+        <w:t xml:space="preserve">any of the </w:t>
+      </w:r>
+      <w:r>
+        <w:lastRenderedPageBreak/>
+        <w:t>laboratory results we tested (glucose, HbA1c, ALT, blood pressure, r LDL-cholesterol)</w:t>
+      </w:r>
+      <w:r>
+        <w:t xml:space="preserve"> and </w:t>
+      </w:r>
+      <w:commentRangeStart w:id="3"/>
+      <w:r>
+        <w:t xml:space="preserve">repeated all outcome models </w:t>
+      </w:r>
+      <w:r>
+        <w:t>with that dataset</w:t>
+      </w:r>
+      <w:r>
+        <w:t>.</w:t>
+      </w:r>
+      <w:commentRangeEnd w:id="3"/>
       <w:r>
         <w:rPr>
           <w:rStyle w:val="CommentReference"/>
         </w:rPr>
-        <w:commentReference w:id="2"/>
-      </w:r>
-      <w:r>
-        <w:t>)</w:t>
-      </w:r>
-      <w:r>
-        <w:t xml:space="preserve">.  </w:t>
-      </w:r>
-      <w:r>
-        <w:t xml:space="preserve"> </w:t>
-      </w:r>
-      <w:r>
-        <w:t>To identify when patients were treated</w:t>
-      </w:r>
-      <w:r>
-        <w:t xml:space="preserve"> via surgery,</w:t>
-      </w:r>
-      <w:r>
-        <w:t xml:space="preserve"> we included procedure codes </w:t>
-      </w:r>
-      <w:commentRangeStart w:id="3"/>
-      <w:r>
-        <w:t>YYY</w:t>
-      </w:r>
-      <w:commentRangeEnd w:id="3"/>
-      <w:r>
-        <w:rPr>
-          <w:rStyle w:val="CommentReference"/>
-        </w:rPr>
         <w:commentReference w:id="3"/>
       </w:r>
       <w:r>
-        <w:t>.</w:t>
-      </w:r>
-      <w:r>
-        <w:t xml:space="preserve">  We excluded participants if they </w:t>
-      </w:r>
-      <w:r>
-        <w:t xml:space="preserve">were </w:t>
-      </w:r>
-      <w:commentRangeStart w:id="4"/>
-      <w:r>
-        <w:t>YYY</w:t>
-      </w:r>
-      <w:commentRangeEnd w:id="4"/>
-      <w:r>
-        <w:rPr>
-          <w:rStyle w:val="CommentReference"/>
-        </w:rPr>
-        <w:commentReference w:id="4"/>
-      </w:r>
-      <w:r>
-        <w:t>.</w:t>
-      </w:r>
-      <w:r>
-        <w:t xml:space="preserve">  Race and ethnicity were self-reported, with groups of &lt;10 aggregated into the other category.</w:t>
-      </w:r>
-      <w:r>
-        <w:t xml:space="preserve"> </w:t>
-      </w:r>
-    </w:p>
-    <w:p>
-      <w:r>
-        <w:t xml:space="preserve">To identify controls, </w:t>
-      </w:r>
-      <w:r>
-        <w:t>we used</w:t>
-      </w:r>
-      <w:r>
-        <w:t xml:space="preserve"> the </w:t>
-      </w:r>
-      <w:r>
-        <w:t xml:space="preserve"> </w:t>
-      </w:r>
-      <w:proofErr w:type="spellStart"/>
-      <w:r>
-        <w:t>MatchIt</w:t>
-      </w:r>
-      <w:proofErr w:type="spellEnd"/>
-      <w:r>
-        <w:t xml:space="preserve"> </w:t>
-      </w:r>
-      <w:r>
-        <w:t xml:space="preserve">package </w:t>
-      </w:r>
-      <w:r>
-        <w:t xml:space="preserve">(version </w:t>
-      </w:r>
-      <w:r>
-        <w:t xml:space="preserve">4.7.1; </w:t>
-      </w:r>
-      <w:r>
-        <w:fldChar w:fldCharType="begin"/>
-      </w:r>
-      <w:r>
-        <w:instrText xml:space="preserve"> ADDIN ZOTERO_ITEM CSL_CITATION {"citationID":"Pl5Gc3F1","properties":{"formattedCitation":"(Ho et al., 2011)","plainCitation":"(Ho et al., 2011)","noteIndex":0},"citationItems":[{"id":12196,"uris":["http://zotero.org/users/7317906/items/H5CAAL6F"],"itemData":{"id":12196,"type":"article-journal","abstract":"MatchIt implements the suggestions of Ho, Imai, King, and Stuart (2007) for improving parametric statistical models by preprocessing data with nonparametric matching methods. MatchIt implements a wide range of sophisticated matching methods, making it possible to greatly reduce the dependence of causal inferences on hard-to-justify, but commonly made, statistical modeling assumptions. The software also easily fits into existing research practices since, after preprocessing data with MatchIt, researchers can use whatever parametric model they would have used without MatchIt, but produce inferences with substantially more robustness and less sensitivity to modeling assumptions. MatchIt is an R program, and also works seamlessly with Zelig.","container-title":"Journal of Statistical Software","DOI":"10.18637/jss.v042.i08","ISSN":"1548-7660","language":"en","license":"Copyright (c) 2006 Daniel Ho, Kosuke Imai, Gary King, Elizabeth A. Stuart","page":"1-28","source":"www.jstatsoft.org","title":"MatchIt: Nonparametric Preprocessing for Parametric Causal Inference","title-short":"MatchIt","volume":"42","author":[{"family":"Ho","given":"Daniel"},{"family":"Imai","given":"Kosuke"},{"family":"King","given":"Gary"},{"family":"Stuart","given":"Elizabeth A."}],"issued":{"date-parts":[["2011",6,14]]},"citation-key":"hoMatchItNonparametricPreprocessing2011"}}],"schema":"https://github.com/citation-style-language/schema/raw/master/csl-citation.json"} </w:instrText>
-      </w:r>
-      <w:r>
-        <w:fldChar w:fldCharType="separate"/>
-      </w:r>
-      <w:r>
-        <w:rPr>
-          <w:noProof/>
-        </w:rPr>
-        <w:t>(Ho et al., 2011)</w:t>
-      </w:r>
-      <w:r>
-        <w:fldChar w:fldCharType="end"/>
-      </w:r>
-      <w:r>
-        <w:t>)</w:t>
-      </w:r>
-      <w:r>
-        <w:t>. F</w:t>
-      </w:r>
-      <w:r>
-        <w:t xml:space="preserve">or </w:t>
-      </w:r>
-      <w:r>
-        <w:t xml:space="preserve">each outcome we identified all Cushing’s cases </w:t>
-      </w:r>
-      <w:r>
-        <w:t xml:space="preserve">with that measurement </w:t>
-      </w:r>
-      <w:r>
-        <w:t xml:space="preserve">and potential controls with that measurement available. </w:t>
-      </w:r>
-      <w:r>
-        <w:t>For Cushing’s cases to be included they had to have had the laboratory measure</w:t>
-      </w:r>
-      <w:r>
-        <w:t>d</w:t>
-      </w:r>
-      <w:r>
-        <w:t xml:space="preserve"> </w:t>
-      </w:r>
-      <w:r>
-        <w:t xml:space="preserve">30 days or fewer </w:t>
-      </w:r>
-      <w:r>
-        <w:t xml:space="preserve">prior to surgical treatment.  </w:t>
-      </w:r>
-      <w:r>
-        <w:t>We performed nearest</w:t>
-      </w:r>
-      <w:r>
-        <w:rPr>
-          <w:rFonts w:ascii="Cambria Math" w:hAnsi="Cambria Math" w:cs="Cambria Math"/>
-        </w:rPr>
-        <w:t>‐</w:t>
-      </w:r>
-      <w:r>
-        <w:t xml:space="preserve">neighbor propensity score matching (ratio = </w:t>
-      </w:r>
-      <w:r>
-        <w:t>10:1</w:t>
-      </w:r>
-      <w:r>
-        <w:t xml:space="preserve">) with age in the </w:t>
-      </w:r>
-      <w:r>
-        <w:t>propensity score</w:t>
-      </w:r>
-      <w:r>
-        <w:t xml:space="preserve"> model and exact matching on gender and race/ethnicity</w:t>
-      </w:r>
-      <w:r>
-        <w:t xml:space="preserve"> from a pool of </w:t>
-      </w:r>
-      <w:r>
-        <w:t>70</w:t>
-      </w:r>
-      <w:r>
-        <w:t>,</w:t>
-      </w:r>
-      <w:r>
-        <w:t>327</w:t>
-      </w:r>
-      <w:r>
-        <w:t xml:space="preserve"> </w:t>
-      </w:r>
-      <w:r>
-        <w:t>Michigan Medicine patients</w:t>
-      </w:r>
-      <w:r>
-        <w:t xml:space="preserve">. This procedure was repeated separately for each outcome </w:t>
-      </w:r>
-      <w:r>
-        <w:t xml:space="preserve">as our </w:t>
-      </w:r>
-      <w:r>
-        <w:t>primary analys</w:t>
-      </w:r>
-      <w:r>
-        <w:t>e</w:t>
-      </w:r>
-      <w:r>
-        <w:t xml:space="preserve">s. </w:t>
-      </w:r>
-      <w:r>
-        <w:t xml:space="preserve"> The</w:t>
-      </w:r>
-      <w:r>
-        <w:t xml:space="preserve"> maximal</w:t>
-      </w:r>
-      <w:r>
-        <w:t xml:space="preserve"> post-matching standardized mean difference for </w:t>
-      </w:r>
-      <w:r>
-        <w:t>a</w:t>
-      </w:r>
-      <w:r>
-        <w:t xml:space="preserve">ge </w:t>
-      </w:r>
-      <w:r>
-        <w:t>was</w:t>
-      </w:r>
-      <w:r>
-        <w:t xml:space="preserve"> &lt;0.</w:t>
-      </w:r>
-      <w:r>
-        <w:t>05</w:t>
-      </w:r>
-      <w:r>
-        <w:t xml:space="preserve"> for all outcomes, indicating adequate balance.</w:t>
-      </w:r>
-      <w:r>
-        <w:t xml:space="preserve">  </w:t>
-      </w:r>
-      <w:r>
-        <w:t xml:space="preserve">As a sensitivity analysis we also created a single matched cohort using participants with </w:t>
-      </w:r>
-      <w:r>
-        <w:t>any of the laboratory results we tested (glucose, HbA1c, ALT, blood pressure, r LDL-cholesterol)</w:t>
-      </w:r>
-      <w:r>
-        <w:t xml:space="preserve"> and </w:t>
-      </w:r>
-      <w:commentRangeStart w:id="5"/>
-      <w:r>
-        <w:t xml:space="preserve">repeated all outcome models </w:t>
-      </w:r>
-      <w:r>
-        <w:t>with that dataset</w:t>
-      </w:r>
-      <w:r>
-        <w:t>.</w:t>
-      </w:r>
-      <w:commentRangeEnd w:id="5"/>
-      <w:r>
-        <w:rPr>
-          <w:rStyle w:val="CommentReference"/>
-        </w:rPr>
-        <w:commentReference w:id="5"/>
-      </w:r>
-      <w:r>
-        <w:t xml:space="preserve"> In our search, we only included patients with </w:t>
+        <w:t xml:space="preserve"> In our search, we only included patients with BMI’s within the 5-75 range, and between 5-75 years of age. Finally, we also only included patients within the </w:t>
       </w:r>
       <w:proofErr w:type="gramStart"/>
       <w:r>
-        <w:t>BMI’s</w:t>
+        <w:t>2022-2025 year</w:t>
       </w:r>
       <w:proofErr w:type="gramEnd"/>
       <w:r>
-        <w:t xml:space="preserve"> within the 5-75 range, and between 5-75 years of age. Finally, we also only included patients within the </w:t>
+        <w:t xml:space="preserve"> range. This was done to create a data pull request that was less than 100,000 people, which was necessary with the Data Direct software </w:t>
       </w:r>
       <w:proofErr w:type="gramStart"/>
       <w:r>
-        <w:t>2022-2025 year</w:t>
+        <w:t>used.*</w:t>
       </w:r>
       <w:proofErr w:type="gramEnd"/>
       <w:r>
-        <w:t xml:space="preserve"> range. This was done to create a data pull request that was less than 100,000 people, which was necessary with the Data Direct software </w:t>
-      </w:r>
-      <w:proofErr w:type="gramStart"/>
-      <w:r>
-        <w:t>used.*</w:t>
-      </w:r>
-      <w:proofErr w:type="gramEnd"/>
-      <w:r>
         <w:t>**talk about this more</w:t>
       </w:r>
     </w:p>
@@ -399,11 +385,7 @@
         <w:t>. Subsequent</w:t>
       </w:r>
       <w:r>
-        <w:t xml:space="preserve"> analyses were stratified by </w:t>
-      </w:r>
-      <w:r>
-        <w:lastRenderedPageBreak/>
-        <w:t xml:space="preserve">obesity (BMI ≥30 kg/m²). Within each obesity stratum, BMI was evaluated </w:t>
+        <w:t xml:space="preserve"> analyses were stratified by obesity (BMI ≥30 kg/m²). Within each obesity stratum, BMI was evaluated </w:t>
       </w:r>
       <w:proofErr w:type="gramStart"/>
       <w:r>
@@ -509,7 +491,7 @@
       </w:r>
     </w:p>
     <w:p>
-      <w:commentRangeStart w:id="6"/>
+      <w:commentRangeStart w:id="4"/>
       <w:r>
         <w:t xml:space="preserve">As shown in Figure 1, we identified YYYY participants with diagnoses of Cushing’s disease.  </w:t>
       </w:r>
@@ -519,12 +501,12 @@
       <w:r>
         <w:t>Their average age at diagnosis was XXX (+/- XXX).  They</w:t>
       </w:r>
-      <w:commentRangeEnd w:id="6"/>
+      <w:commentRangeEnd w:id="4"/>
       <w:r>
         <w:rPr>
           <w:rStyle w:val="CommentReference"/>
         </w:rPr>
-        <w:commentReference w:id="6"/>
+        <w:commentReference w:id="4"/>
       </w:r>
       <w:r>
         <w:t xml:space="preserve"> </w:t>
@@ -659,7 +641,11 @@
         <w:t>)</w:t>
       </w:r>
       <w:r>
-        <w:t>, consistent with the prior literature</w:t>
+        <w:t xml:space="preserve">, </w:t>
+      </w:r>
+      <w:r>
+        <w:lastRenderedPageBreak/>
+        <w:t>consistent with the prior literature</w:t>
       </w:r>
       <w:r>
         <w:t xml:space="preserve"> </w:t>
@@ -705,704 +691,736 @@
       <w:r>
         <w:t xml:space="preserve">  </w:t>
       </w:r>
+      <w:commentRangeStart w:id="5"/>
+      <w:commentRangeStart w:id="6"/>
       <w:commentRangeStart w:id="7"/>
       <w:commentRangeStart w:id="8"/>
+      <w:r>
+        <w:t>Prior to matching for Race and Ethnicity, we noted that participants</w:t>
+      </w:r>
+      <w:r>
+        <w:t xml:space="preserve"> with Cushing’s disease were more likely to </w:t>
+      </w:r>
+      <w:r>
+        <w:t>identify as Non-Hispanic White (87%) than the overall Michigan Medicine participant population (75% Non-Hispanic White</w:t>
+      </w:r>
+      <w:r>
+        <w:t>, p</w:t>
+      </w:r>
+      <w:r>
+        <w:t>&lt;0.001</w:t>
+      </w:r>
+      <w:r>
+        <w:t>).</w:t>
+      </w:r>
+      <w:r>
+        <w:t xml:space="preserve">  Correspondingly</w:t>
+      </w:r>
+      <w:r>
+        <w:t>,</w:t>
+      </w:r>
+      <w:r>
+        <w:t xml:space="preserve"> participants with Cushing’s disease were less likely to identify as Asian </w:t>
+      </w:r>
+      <w:r>
+        <w:t xml:space="preserve">(p&lt;0.001) </w:t>
+      </w:r>
+      <w:r>
+        <w:t>or Black</w:t>
+      </w:r>
+      <w:commentRangeEnd w:id="5"/>
+      <w:r>
+        <w:rPr>
+          <w:rStyle w:val="CommentReference"/>
+        </w:rPr>
+        <w:commentReference w:id="5"/>
+      </w:r>
+      <w:commentRangeEnd w:id="6"/>
+      <w:r>
+        <w:rPr>
+          <w:rStyle w:val="CommentReference"/>
+        </w:rPr>
+        <w:commentReference w:id="6"/>
+      </w:r>
+      <w:commentRangeEnd w:id="7"/>
+      <w:r>
+        <w:rPr>
+          <w:rStyle w:val="CommentReference"/>
+        </w:rPr>
+        <w:commentReference w:id="7"/>
+      </w:r>
+      <w:commentRangeEnd w:id="8"/>
+      <w:r>
+        <w:rPr>
+          <w:rStyle w:val="CommentReference"/>
+        </w:rPr>
+        <w:commentReference w:id="8"/>
+      </w:r>
+      <w:r>
+        <w:t xml:space="preserve"> (p=0.01</w:t>
+      </w:r>
+      <w:r>
+        <w:t>8</w:t>
+      </w:r>
+      <w:r>
+        <w:t>)</w:t>
+      </w:r>
+      <w:r>
+        <w:t>.</w:t>
+      </w:r>
+      <w:r>
+        <w:t xml:space="preserve">  This is consistent with other reports on the prevalence of Cushing’s disease across racial groups </w:t>
+      </w:r>
+      <w:r>
+        <w:fldChar w:fldCharType="begin"/>
+      </w:r>
+      <w:r>
+        <w:instrText xml:space="preserve"> ADDIN ZOTERO_ITEM CSL_CITATION {"citationID":"Zf5euBGy","properties":{"formattedCitation":"(Ioachimescu et al., 2022; Omotosho et al., 2024)","plainCitation":"(Ioachimescu et al., 2022; Omotosho et al., 2024)","noteIndex":0},"citationItems":[{"id":27032,"uris":["http://zotero.org/users/7317906/items/EVS87VVY"],"itemData":{"id":27032,"type":"article-journal","abstract":"Acromegaly (ACM) and Cushing’s disease (CD) are caused by functioning pituitary adenomas secreting growth hormone and ACTH respectively.To determine the impact of race on presentation and postoperative outcomes in adults with ACM and CD, which has not yet been evaluated.This is a retrospective study of consecutive patients operated at a large-volume pituitary center. We evaluated (1) racial distribution of patients residing in the metropolitan area (Metro, N</w:instrText>
+      </w:r>
+      <w:r>
+        <w:rPr>
+          <w:rFonts w:ascii="Arial" w:hAnsi="Arial" w:cs="Arial"/>
+        </w:rPr>
+        <w:instrText> </w:instrText>
+      </w:r>
+      <w:r>
+        <w:instrText>=</w:instrText>
+      </w:r>
+      <w:r>
+        <w:rPr>
+          <w:rFonts w:ascii="Arial" w:hAnsi="Arial" w:cs="Arial"/>
+        </w:rPr>
+        <w:instrText> </w:instrText>
+      </w:r>
+      <w:r>
+        <w:instrText>124) vs 2010 US census data, and(2) presentation and postoperative outcomes in Black vs White for patients from the entire catchment area (N</w:instrText>
+      </w:r>
+      <w:r>
+        <w:rPr>
+          <w:rFonts w:ascii="Arial" w:hAnsi="Arial" w:cs="Arial"/>
+        </w:rPr>
+        <w:instrText> </w:instrText>
+      </w:r>
+      <w:r>
+        <w:instrText>=</w:instrText>
+      </w:r>
+      <w:r>
+        <w:rPr>
+          <w:rFonts w:ascii="Arial" w:hAnsi="Arial" w:cs="Arial"/>
+        </w:rPr>
+        <w:instrText> </w:instrText>
+      </w:r>
+      <w:r>
+        <w:instrText>241).For Metro area (32.4% Black population), Black patients represented 16.75% ACM (P</w:instrText>
+      </w:r>
+      <w:r>
+        <w:rPr>
+          <w:rFonts w:ascii="Arial" w:hAnsi="Arial" w:cs="Arial"/>
+        </w:rPr>
+        <w:instrText> </w:instrText>
+      </w:r>
+      <w:r>
+        <w:instrText>=</w:instrText>
+      </w:r>
+      <w:r>
+        <w:rPr>
+          <w:rFonts w:ascii="Arial" w:hAnsi="Arial" w:cs="Arial"/>
+        </w:rPr>
+        <w:instrText> </w:instrText>
+      </w:r>
+      <w:r>
+        <w:instrText>.006) and 29.2% CD (P</w:instrText>
+      </w:r>
+      <w:r>
+        <w:rPr>
+          <w:rFonts w:ascii="Arial" w:hAnsi="Arial" w:cs="Arial"/>
+        </w:rPr>
+        <w:instrText> </w:instrText>
+      </w:r>
+      <w:r>
+        <w:instrText>=</w:instrText>
+      </w:r>
+      <w:r>
+        <w:rPr>
+          <w:rFonts w:ascii="Arial" w:hAnsi="Arial" w:cs="Arial"/>
+        </w:rPr>
+        <w:instrText> </w:instrText>
+      </w:r>
+      <w:r>
+        <w:instrText>.56). Among the total 112 patients with ACM, presentations with headaches or incidentaloma were more common in Black patients (76.9% vs 31% White, P</w:instrText>
+      </w:r>
+      <w:r>
+        <w:rPr>
+          <w:rFonts w:ascii="Arial" w:hAnsi="Arial" w:cs="Arial"/>
+        </w:rPr>
+        <w:instrText> </w:instrText>
+      </w:r>
+      <w:r>
+        <w:instrText>=</w:instrText>
+      </w:r>
+      <w:r>
+        <w:rPr>
+          <w:rFonts w:ascii="Arial" w:hAnsi="Arial" w:cs="Arial"/>
+        </w:rPr>
+        <w:instrText> </w:instrText>
+      </w:r>
+      <w:r>
+        <w:instrText>.01). Black patients had a higher prevalence of diabetes (54% vs 16% White, P</w:instrText>
+      </w:r>
+      <w:r>
+        <w:rPr>
+          <w:rFonts w:ascii="Arial" w:hAnsi="Arial" w:cs="Arial"/>
+        </w:rPr>
+        <w:instrText> </w:instrText>
+      </w:r>
+      <w:r>
+        <w:instrText>=</w:instrText>
+      </w:r>
+      <w:r>
+        <w:rPr>
+          <w:rFonts w:ascii="Arial" w:hAnsi="Arial" w:cs="Arial"/>
+        </w:rPr>
+        <w:instrText> </w:instrText>
+      </w:r>
+      <w:r>
+        <w:instrText>.005), significantly lower insulin-like growth factor (IGF)-1 deviation from normal (P</w:instrText>
+      </w:r>
+      <w:r>
+        <w:rPr>
+          <w:rFonts w:ascii="Arial" w:hAnsi="Arial" w:cs="Arial"/>
+        </w:rPr>
+        <w:instrText> </w:instrText>
+      </w:r>
+      <w:r>
+        <w:instrText>=</w:instrText>
+      </w:r>
+      <w:r>
+        <w:rPr>
+          <w:rFonts w:ascii="Arial" w:hAnsi="Arial" w:cs="Arial"/>
+        </w:rPr>
+        <w:instrText> </w:instrText>
+      </w:r>
+      <w:r>
+        <w:instrText>.03) and borderline lower median growth hormone levels (P</w:instrText>
+      </w:r>
+      <w:r>
+        <w:rPr>
+          <w:rFonts w:ascii="Arial" w:hAnsi="Arial" w:cs="Arial"/>
+        </w:rPr>
+        <w:instrText> </w:instrText>
+      </w:r>
+      <w:r>
+        <w:instrText>=</w:instrText>
+      </w:r>
+      <w:r>
+        <w:rPr>
+          <w:rFonts w:ascii="Arial" w:hAnsi="Arial" w:cs="Arial"/>
+        </w:rPr>
+        <w:instrText> </w:instrText>
+      </w:r>
+      <w:r>
+        <w:instrText>.09). Mean tumor diameter and proportion of tumors with cavernous sinus invasion were similar. Three-month biochemical remission (46% Black, 55% White, P</w:instrText>
+      </w:r>
+      <w:r>
+        <w:rPr>
+          <w:rFonts w:ascii="Arial" w:hAnsi="Arial" w:cs="Arial"/>
+        </w:rPr>
+        <w:instrText> </w:instrText>
+      </w:r>
+      <w:r>
+        <w:instrText>=</w:instrText>
+      </w:r>
+      <w:r>
+        <w:rPr>
+          <w:rFonts w:ascii="Arial" w:hAnsi="Arial" w:cs="Arial"/>
+        </w:rPr>
+        <w:instrText> </w:instrText>
+      </w:r>
+      <w:r>
+        <w:instrText>.76) and long-term IGF-1 control by multimodality therapy (92.3% Black, 80.5% White, P</w:instrText>
+      </w:r>
+      <w:r>
+        <w:rPr>
+          <w:rFonts w:ascii="Arial" w:hAnsi="Arial" w:cs="Arial"/>
+        </w:rPr>
+        <w:instrText> </w:instrText>
+      </w:r>
+      <w:r>
+        <w:instrText>=</w:instrText>
+      </w:r>
+      <w:r>
+        <w:rPr>
+          <w:rFonts w:ascii="Arial" w:hAnsi="Arial" w:cs="Arial"/>
+        </w:rPr>
+        <w:instrText> </w:instrText>
+      </w:r>
+      <w:r>
+        <w:instrText>.45) were similar. Among the total 129 patients with CD, Black patients had more hypopituitarism (69% vs 45% White, P</w:instrText>
+      </w:r>
+      <w:r>
+        <w:rPr>
+          <w:rFonts w:ascii="Arial" w:hAnsi="Arial" w:cs="Arial"/>
+        </w:rPr>
+        <w:instrText> </w:instrText>
+      </w:r>
+      <w:r>
+        <w:instrText>=</w:instrText>
+      </w:r>
+      <w:r>
+        <w:rPr>
+          <w:rFonts w:ascii="Arial" w:hAnsi="Arial" w:cs="Arial"/>
+        </w:rPr>
+        <w:instrText> </w:instrText>
+      </w:r>
+      <w:r>
+        <w:instrText>.04) and macroadenomas (33% vs 15% White, P</w:instrText>
+      </w:r>
+      <w:r>
+        <w:rPr>
+          <w:rFonts w:ascii="Arial" w:hAnsi="Arial" w:cs="Arial"/>
+        </w:rPr>
+        <w:instrText> </w:instrText>
+      </w:r>
+      <w:r>
+        <w:instrText>=</w:instrText>
+      </w:r>
+      <w:r>
+        <w:rPr>
+          <w:rFonts w:ascii="Arial" w:hAnsi="Arial" w:cs="Arial"/>
+        </w:rPr>
+        <w:instrText> </w:instrText>
+      </w:r>
+      <w:r>
+        <w:instrText>.05). At 3 months, remission rate was borderline higher in White (92% vs 78% Black, P</w:instrText>
+      </w:r>
+      <w:r>
+        <w:rPr>
+          <w:rFonts w:ascii="Arial" w:hAnsi="Arial" w:cs="Arial"/>
+        </w:rPr>
+        <w:instrText> </w:instrText>
+      </w:r>
+      <w:r>
+        <w:instrText>=</w:instrText>
+      </w:r>
+      <w:r>
+        <w:rPr>
+          <w:rFonts w:ascii="Arial" w:hAnsi="Arial" w:cs="Arial"/>
+        </w:rPr>
+        <w:instrText> </w:instrText>
+      </w:r>
+      <w:r>
+        <w:instrText xml:space="preserve">0.08), which was attributed to macroadenomas by logistic regression.We identified disparities regarding racial distribution, and clinical and biochemical characteristics in ACM, suggesting late or missed diagnosis in Black patients. Large nationwide studies are necessary to confirm our findings.","container-title":"Journal of the Endocrine Society","DOI":"10.1210/jendso/bvab176","ISSN":"2472-1972","issue":"1","journalAbbreviation":"J. Endocr. Soc.","page":"bvab176","source":"Silverchair","title":"Racial Disparities in Acromegaly and Cushing’s Disease: A Referral Center Study in 241 Patients","title-short":"Racial Disparities in Acromegaly and Cushing’s Disease","volume":"6","author":[{"family":"Ioachimescu","given":"Adriana G"},{"family":"Goswami","given":"Neevedita"},{"family":"Handa","given":"Talin"},{"family":"Pappy","given":"Adlai"},{"family":"Veledar","given":"Emir"},{"family":"Oyesiku","given":"Nelson M"}],"issued":{"date-parts":[["2022",1,1]]},"citation-key":"ioachimescuRacialDisparitiesAcromegaly2022"}},{"id":27042,"uris":["http://zotero.org/users/7317906/items/H96MA6T6"],"itemData":{"id":27042,"type":"article-journal","abstract":"Y.B. Omotosho: None. R. McGlotten: None. P. Chittiboina: None. L. Nieman: None.Background: Early recognition and treatment of Cushing’s syndrome (CS) is important to reduce mortality, forestall additional co-morbidities, and improve long-term quality of life. Little is known about how adverse social determinants of health (SDOH) influence the achievement of this goal.Objective: To investigate the impact of race (Black vs White) and UFC on the time to definitive diagnosis and treatment of Cushing’s disease (CD).Methods: This is a retrospective cohort study of 114 patients (pts) (including all Non-Hispanic Blacks) evaluated at the National Institutes of Health between 1990-2022, who had CD based on pathology (ACTH-positive tumor immunohistochemistry) or biochemical remission after transsphenoidal surgery (TSS). 38 Non-Hispanic Black patients met entry criteria. They were matched 1:2 by age (within five years) and sex. We excluded patients with cyclic CS, recurrent CD, previous pituitary surgery or radiation therapy and/or a delay between diagnostic evaluation and surgery of more than 4 weeks. We limited cohorts to only Non-Hispanic Blacks and Whites for this pilot study and plan to extend this to smaller race/ethnicity groups in the future. The onset of clinical symptoms was documented as self-reported by the patients. We analyzed the difference between the year of symptom onset and the date TSS was performed, to obtain an estimated duration of diagnosis. The highest 24h urine cortisol (UFC) value for each patient was noted. Non-normal data are described as median [interquartile range]. Group comparisons used the Wilcoxon rank sum test for the time to etiologic diagnosis, age, and UFC. Statistical analyses were done using R/RStudio statistical software. P value &amp;lt;0.05 was considered significant. Results: Each racial group included 76.3% females and 23.7% males. The median age at TSS was 39.5 years [30.0 – 50.8] for Blacks and 41.5 years [31.8 - 53.3] for Whites (P= 0.7). The median UFC was 326 mcg/24h [156 - 491] for Blacks and 264 [166 - 609] for Whites (P= 0.8). The median duration from symptom onset to CD diagnosis was 3.67 years [2.76 - 6.29] for Blacks and for 2.56 years [1.57 - 4.13] for Whites. Analysis of the differences in time to diagnosis between both groups confirmed a significant disparity with blacks having a median delay of 1.1 years more than whites (P= 0.001). Discussion: We do not have information on other SDOH in our patients, such as access to providers, education level, or their perception of the medical community. The present data suggest that racial background serves as a limiting factor in the diagnosis and differential diagnosis of CS, and that differences in severity of hypercortisolism do not explain this disparity. More work is needed to understand the reasons for this disparity as we continue to strive towards health equity.Monday, June 3, 2024","container-title":"Journal of the Endocrine Society","DOI":"10.1210/jendso/bvae163.2408","ISSN":"2472-1972","issue":"Supplement_1","journalAbbreviation":"J. Endocr. Soc.","page":"bvae163.2408","source":"Silverchair","title":"MON-113 Racial Disparity in the Time to Diagnosis of Cushing’s Disease","volume":"8","author":[{"family":"Omotosho","given":"Y B"},{"family":"McGlotten","given":"R"},{"family":"Chittiboina","given":"P"},{"family":"Nieman","given":"L"}],"issued":{"date-parts":[["2024",10,1]]},"citation-key":"omotoshoMON113RacialDisparity2024"}}],"schema":"https://github.com/citation-style-language/schema/raw/master/csl-citation.json"} </w:instrText>
+      </w:r>
+      <w:r>
+        <w:fldChar w:fldCharType="separate"/>
+      </w:r>
+      <w:r>
+        <w:rPr>
+          <w:noProof/>
+        </w:rPr>
+        <w:t>(Ioachimescu et al., 2022; Omotosho et al., 2024)</w:t>
+      </w:r>
+      <w:r>
+        <w:fldChar w:fldCharType="end"/>
+      </w:r>
+      <w:r>
+        <w:t>.</w:t>
+      </w:r>
+    </w:p>
+    <w:p>
+      <w:r>
+        <w:t>As we expected, participants with Cushing’s disease had a higher BMI than the controls</w:t>
+      </w:r>
+      <w:r>
+        <w:t>, with 64% of participants with Cushing’s disease having a BMI above 30 kg/m</w:t>
+      </w:r>
+      <w:r>
+        <w:rPr>
+          <w:vertAlign w:val="superscript"/>
+        </w:rPr>
+        <w:t>2</w:t>
+      </w:r>
+      <w:r>
+        <w:t xml:space="preserve">, compared to </w:t>
+      </w:r>
+      <w:r>
+        <w:t>40</w:t>
+      </w:r>
+      <w:r>
+        <w:t>% controls (p&lt;0.001).</w:t>
+      </w:r>
+      <w:r>
+        <w:t xml:space="preserve">  </w:t>
+      </w:r>
+      <w:r>
+        <w:t xml:space="preserve">To understand the </w:t>
+      </w:r>
+      <w:r>
+        <w:t xml:space="preserve">cross-sectional </w:t>
+      </w:r>
+      <w:r>
+        <w:t>relationship between obesity and Cushing’s disease, we</w:t>
+      </w:r>
+      <w:r>
+        <w:t xml:space="preserve"> stratified our participants </w:t>
+      </w:r>
+      <w:r>
+        <w:t>with a BMI above or below 30 kg/m</w:t>
+      </w:r>
+      <w:r>
+        <w:rPr>
+          <w:vertAlign w:val="superscript"/>
+        </w:rPr>
+        <w:t>2</w:t>
+      </w:r>
+      <w:r>
+        <w:t xml:space="preserve">, </w:t>
+      </w:r>
+      <w:r>
+        <w:t>across</w:t>
+      </w:r>
+      <w:r>
+        <w:t xml:space="preserve"> both cases and controls</w:t>
+      </w:r>
+      <w:r>
+        <w:t>.  As shown in Table 2, and as expected given our stratification, the four groups differed in several characteristics</w:t>
+      </w:r>
+      <w:r>
+        <w:t xml:space="preserve">, </w:t>
+      </w:r>
+      <w:r>
+        <w:t>which</w:t>
+      </w:r>
+      <w:r>
+        <w:t xml:space="preserve"> will be adjusted for in multivariable models below</w:t>
+      </w:r>
+      <w:r>
+        <w:t>.</w:t>
+      </w:r>
+      <w:r>
+        <w:t xml:space="preserve">  For example, among</w:t>
+      </w:r>
+      <w:r>
+        <w:t xml:space="preserve"> the subgroup of</w:t>
+      </w:r>
+      <w:r>
+        <w:t xml:space="preserve"> participants with a BMI &gt; 30 mg/m</w:t>
+      </w:r>
+      <w:r>
+        <w:rPr>
+          <w:vertAlign w:val="superscript"/>
+        </w:rPr>
+        <w:t>2</w:t>
+      </w:r>
+      <w:r>
+        <w:t>, participants with Cushing’s disease had a higher BMI than controls</w:t>
+      </w:r>
+      <w:r>
+        <w:t xml:space="preserve"> (p=0.0024 by a Mann-Whitney test)</w:t>
+      </w:r>
+      <w:r>
+        <w:t xml:space="preserve">.  </w:t>
+      </w:r>
+      <w:r>
+        <w:t>Females with Cushing’s disease were more likely to have a BMI over 30 kg/m</w:t>
+      </w:r>
+      <w:r>
+        <w:rPr>
+          <w:vertAlign w:val="superscript"/>
+        </w:rPr>
+        <w:t>2</w:t>
+      </w:r>
+      <w:r>
+        <w:t xml:space="preserve"> (68% </w:t>
+      </w:r>
+      <w:r>
+        <w:t xml:space="preserve">of </w:t>
+      </w:r>
+      <w:r>
+        <w:t xml:space="preserve">females </w:t>
+      </w:r>
+      <w:r>
+        <w:t>compared to</w:t>
+      </w:r>
+      <w:r>
+        <w:t xml:space="preserve"> 51% of males with Cushing’s disease, p=0.015).  </w:t>
+      </w:r>
+      <w:r>
+        <w:t>Among participants with Cushing’s disease, Asian (6</w:t>
+      </w:r>
+      <w:r>
+        <w:t xml:space="preserve"> out of </w:t>
+      </w:r>
+      <w:r>
+        <w:t xml:space="preserve">10) and Hispanic or Latino </w:t>
+      </w:r>
+      <w:r>
+        <w:t>(6</w:t>
+      </w:r>
+      <w:r>
+        <w:t xml:space="preserve"> out of </w:t>
+      </w:r>
+      <w:r>
+        <w:t xml:space="preserve">8) </w:t>
+      </w:r>
+      <w:r>
+        <w:t>participants were more likely have a BMI under 30 kg/m</w:t>
+      </w:r>
+      <w:r>
+        <w:rPr>
+          <w:vertAlign w:val="superscript"/>
+        </w:rPr>
+        <w:t xml:space="preserve">2 </w:t>
+      </w:r>
+      <w:r>
+        <w:t xml:space="preserve">compared to </w:t>
+      </w:r>
+      <w:r>
+        <w:t xml:space="preserve">the overall average </w:t>
+      </w:r>
+      <w:r>
+        <w:t>(</w:t>
+      </w:r>
+      <w:r>
+        <w:t>36%</w:t>
+      </w:r>
+      <w:r>
+        <w:t>, p=0.027 and 0.176 respectively via Fisher’s exact test</w:t>
+      </w:r>
+      <w:r>
+        <w:t>s</w:t>
+      </w:r>
+      <w:r>
+        <w:t xml:space="preserve">).  </w:t>
+      </w:r>
+      <w:r>
+        <w:t>The</w:t>
+      </w:r>
+      <w:r>
+        <w:t xml:space="preserve"> average age of </w:t>
+      </w:r>
+      <w:r>
+        <w:t xml:space="preserve">participants with </w:t>
+      </w:r>
+      <w:r>
+        <w:t>Cushing’s</w:t>
+      </w:r>
+      <w:r>
+        <w:t xml:space="preserve"> disease</w:t>
+      </w:r>
+      <w:r>
+        <w:t xml:space="preserve"> with or without obesity was similar</w:t>
+      </w:r>
+      <w:r>
+        <w:t xml:space="preserve"> after stratification</w:t>
+      </w:r>
+      <w:r>
+        <w:t>.</w:t>
+      </w:r>
+    </w:p>
+    <w:p>
+      <w:pPr>
+        <w:pStyle w:val="NormalWeb"/>
+        <w:rPr>
+          <w:rStyle w:val="Heading2Char"/>
+        </w:rPr>
+      </w:pPr>
+      <w:r>
+        <w:rPr>
+          <w:rStyle w:val="Heading2Char"/>
+        </w:rPr>
+        <w:t>Modification of Cushing’s disease-related traits by obesity status</w:t>
+      </w:r>
+    </w:p>
+    <w:p>
+      <w:r>
+        <w:t xml:space="preserve">To identify how obesity alters metabolic outcomes related to Cushing’s disease, we evaluated the effects of Cushing’s disease on several key metabolic variables including </w:t>
+      </w:r>
+      <w:proofErr w:type="spellStart"/>
+      <w:r>
+        <w:t>glycemica</w:t>
+      </w:r>
+      <w:proofErr w:type="spellEnd"/>
+      <w:r>
+        <w:t xml:space="preserve"> (fasting glucose and HbA1c), liver enzymes, LDL-C and blood pressure (Figure 2 and Table 3A).  As described below we noted substantial effect modification by obesity status in these fully adjusted models for liver enzymes and blood pressure (Table 3B).</w:t>
+      </w:r>
+    </w:p>
+    <w:p>
+      <w:pPr>
+        <w:pStyle w:val="Heading3"/>
+      </w:pPr>
       <w:commentRangeStart w:id="9"/>
       <w:commentRangeStart w:id="10"/>
       <w:r>
-        <w:t>Prior to matching for Race and Ethnicity, we noted that participants</w:t>
-      </w:r>
-      <w:r>
-        <w:t xml:space="preserve"> with Cushing’s disease were more likely to </w:t>
-      </w:r>
-      <w:r>
-        <w:t>identify as Non-Hispanic White (87%) than the overall Michigan Medicine participant population (75% Non-Hispanic White</w:t>
-      </w:r>
-      <w:r>
-        <w:t>, p</w:t>
-      </w:r>
-      <w:r>
-        <w:t>&lt;0.001</w:t>
-      </w:r>
-      <w:r>
-        <w:t>).</w:t>
-      </w:r>
-      <w:r>
-        <w:t xml:space="preserve">  Correspondingly</w:t>
-      </w:r>
-      <w:r>
-        <w:t>,</w:t>
-      </w:r>
-      <w:r>
-        <w:t xml:space="preserve"> participants with Cushing’s disease were less likely to identify as Asian </w:t>
-      </w:r>
-      <w:r>
-        <w:t xml:space="preserve">(p&lt;0.001) </w:t>
-      </w:r>
-      <w:r>
-        <w:t>or Black</w:t>
-      </w:r>
-      <w:commentRangeEnd w:id="7"/>
+        <w:t>Dysglycemia</w:t>
+      </w:r>
+    </w:p>
+    <w:p>
+      <w:r>
+        <w:t>As aforementioned, our first metabolic variable of interest was the fasting glucose levels of our obese and non-obese populations. As shown in Table 3a, we observed a</w:t>
+      </w:r>
+      <w:r>
+        <w:t xml:space="preserve"> significant </w:t>
+      </w:r>
+      <w:r>
+        <w:t xml:space="preserve">increase in </w:t>
+      </w:r>
+      <w:r>
+        <w:t xml:space="preserve">fasting </w:t>
+      </w:r>
+      <w:r>
+        <w:t xml:space="preserve">blood glucose levels </w:t>
+      </w:r>
+      <w:r>
+        <w:t xml:space="preserve">among </w:t>
+      </w:r>
+      <w:r>
+        <w:t>participants</w:t>
+      </w:r>
+      <w:r>
+        <w:t xml:space="preserve"> with Cushing’s disease, regardless of </w:t>
+      </w:r>
+      <w:commentRangeStart w:id="11"/>
+      <w:r>
+        <w:t>obesity status</w:t>
+      </w:r>
+      <w:r>
+        <w:t xml:space="preserve"> (p</w:t>
+      </w:r>
+      <w:r>
+        <w:t>&lt;0.01</w:t>
+      </w:r>
+      <w:r>
+        <w:t xml:space="preserve">, </w:t>
+      </w:r>
+      <w:r>
+        <w:t>&lt;0.01</w:t>
+      </w:r>
+      <w:r>
+        <w:t>)</w:t>
+      </w:r>
+      <w:r>
+        <w:t xml:space="preserve">. </w:t>
+      </w:r>
+      <w:commentRangeEnd w:id="11"/>
       <w:r>
         <w:rPr>
           <w:rStyle w:val="CommentReference"/>
         </w:rPr>
-        <w:commentReference w:id="7"/>
-      </w:r>
-      <w:commentRangeEnd w:id="8"/>
+        <w:commentReference w:id="11"/>
+      </w:r>
+      <w:r>
+        <w:t xml:space="preserve">The non-obese population had a slightly larger </w:t>
+      </w:r>
+      <w:r>
+        <w:lastRenderedPageBreak/>
+        <w:t xml:space="preserve">increase (26.95 vs. 26.18) than the obese population, but this was not a large enough difference to provide any significant evidence of an effect modification for obesity. </w:t>
+      </w:r>
+      <w:proofErr w:type="gramStart"/>
+      <w:r>
+        <w:t>Also</w:t>
+      </w:r>
+      <w:proofErr w:type="gramEnd"/>
+      <w:r>
+        <w:t xml:space="preserve"> in Table 3a, our collected HbA1c data indicated a</w:t>
+      </w:r>
+      <w:r>
+        <w:t xml:space="preserve"> slightly insignificant increase in HbA1c levels between the non-obese, and the non-obese with Cushing’s population (p=0.056). However, there was evidence of a significant increase in HbA1c levels of our obese, and obese with Cushing’s population (p</w:t>
+      </w:r>
+      <w:r>
+        <w:t>&lt;0.01</w:t>
+      </w:r>
+      <w:r>
+        <w:t>). This leads us to believe that there is evidence for obesity being a positive modifier in patients with Cushing’s disease****.</w:t>
+      </w:r>
+    </w:p>
+    <w:p>
+      <w:pPr>
+        <w:pStyle w:val="Heading3"/>
+      </w:pPr>
+      <w:r>
+        <w:t>MASLD and liver enzymes</w:t>
+      </w:r>
+    </w:p>
+    <w:p>
+      <w:r>
+        <w:t xml:space="preserve">To </w:t>
+      </w:r>
+      <w:r>
+        <w:t>assess</w:t>
+      </w:r>
+      <w:r>
+        <w:t xml:space="preserve"> </w:t>
+      </w:r>
+      <w:r>
+        <w:t>MASLD</w:t>
+      </w:r>
+      <w:r>
+        <w:t xml:space="preserve"> we looked at </w:t>
+      </w:r>
+      <w:commentRangeStart w:id="12"/>
+      <w:r>
+        <w:t xml:space="preserve">ALT </w:t>
+      </w:r>
+      <w:commentRangeEnd w:id="12"/>
       <w:r>
         <w:rPr>
           <w:rStyle w:val="CommentReference"/>
         </w:rPr>
-        <w:commentReference w:id="8"/>
-      </w:r>
-      <w:commentRangeEnd w:id="9"/>
+        <w:commentReference w:id="12"/>
+      </w:r>
+      <w:r>
+        <w:t>test results for our population. In both our obese, and non-obese populations, we saw an increase in ALT levels regardless of Cushing’s disease status</w:t>
+      </w:r>
+      <w:r>
+        <w:t xml:space="preserve"> </w:t>
+      </w:r>
+      <w:commentRangeStart w:id="13"/>
+      <w:r>
+        <w:t>(p</w:t>
+      </w:r>
+      <w:r>
+        <w:t>&lt;0.01</w:t>
+      </w:r>
+      <w:r>
+        <w:t xml:space="preserve">, </w:t>
+      </w:r>
+      <w:r>
+        <w:t>&lt;0.01</w:t>
+      </w:r>
+      <w:r>
+        <w:t xml:space="preserve">). </w:t>
+      </w:r>
+      <w:commentRangeEnd w:id="13"/>
       <w:r>
         <w:rPr>
           <w:rStyle w:val="CommentReference"/>
         </w:rPr>
-        <w:commentReference w:id="9"/>
-      </w:r>
-      <w:commentRangeEnd w:id="10"/>
-      <w:r>
-        <w:rPr>
-          <w:rStyle w:val="CommentReference"/>
-        </w:rPr>
-        <w:commentReference w:id="10"/>
-      </w:r>
-      <w:r>
-        <w:t xml:space="preserve"> (p=0.01</w:t>
-      </w:r>
-      <w:r>
-        <w:t>8</w:t>
-      </w:r>
-      <w:r>
-        <w:t>)</w:t>
-      </w:r>
-      <w:r>
-        <w:t>.</w:t>
-      </w:r>
-      <w:r>
-        <w:t xml:space="preserve">  This is consistent with other reports on the prevalence of Cushing’s disease across racial groups </w:t>
-      </w:r>
-      <w:r>
-        <w:fldChar w:fldCharType="begin"/>
-      </w:r>
-      <w:r>
-        <w:instrText xml:space="preserve"> ADDIN ZOTERO_ITEM CSL_CITATION {"citationID":"Zf5euBGy","properties":{"formattedCitation":"(Ioachimescu et al., 2022; Omotosho et al., 2024)","plainCitation":"(Ioachimescu et al., 2022; Omotosho et al., 2024)","noteIndex":0},"citationItems":[{"id":27032,"uris":["http://zotero.org/users/7317906/items/EVS87VVY"],"itemData":{"id":27032,"type":"article-journal","abstract":"Acromegaly (ACM) and Cushing’s disease (CD) are caused by functioning pituitary adenomas secreting growth hormone and ACTH respectively.To determine the impact of race on presentation and postoperative outcomes in adults with ACM and CD, which has not yet been evaluated.This is a retrospective study of consecutive patients operated at a large-volume pituitary center. We evaluated (1) racial distribution of patients residing in the metropolitan area (Metro, N</w:instrText>
-      </w:r>
-      <w:r>
-        <w:rPr>
-          <w:rFonts w:ascii="Arial" w:hAnsi="Arial" w:cs="Arial"/>
-        </w:rPr>
-        <w:instrText> </w:instrText>
-      </w:r>
-      <w:r>
-        <w:instrText>=</w:instrText>
-      </w:r>
-      <w:r>
-        <w:rPr>
-          <w:rFonts w:ascii="Arial" w:hAnsi="Arial" w:cs="Arial"/>
-        </w:rPr>
-        <w:instrText> </w:instrText>
-      </w:r>
-      <w:r>
-        <w:instrText>124) vs 2010 US census data, and(2) presentation and postoperative outcomes in Black vs White for patients from the entire catchment area (N</w:instrText>
-      </w:r>
-      <w:r>
-        <w:rPr>
-          <w:rFonts w:ascii="Arial" w:hAnsi="Arial" w:cs="Arial"/>
-        </w:rPr>
-        <w:instrText> </w:instrText>
-      </w:r>
-      <w:r>
-        <w:instrText>=</w:instrText>
-      </w:r>
-      <w:r>
-        <w:rPr>
-          <w:rFonts w:ascii="Arial" w:hAnsi="Arial" w:cs="Arial"/>
-        </w:rPr>
-        <w:instrText> </w:instrText>
-      </w:r>
-      <w:r>
-        <w:instrText>241).For Metro area (32.4% Black population), Black patients represented 16.75% ACM (P</w:instrText>
-      </w:r>
-      <w:r>
-        <w:rPr>
-          <w:rFonts w:ascii="Arial" w:hAnsi="Arial" w:cs="Arial"/>
-        </w:rPr>
-        <w:instrText> </w:instrText>
-      </w:r>
-      <w:r>
-        <w:instrText>=</w:instrText>
-      </w:r>
-      <w:r>
-        <w:rPr>
-          <w:rFonts w:ascii="Arial" w:hAnsi="Arial" w:cs="Arial"/>
-        </w:rPr>
-        <w:instrText> </w:instrText>
-      </w:r>
-      <w:r>
-        <w:instrText>.006) and 29.2% CD (P</w:instrText>
-      </w:r>
-      <w:r>
-        <w:rPr>
-          <w:rFonts w:ascii="Arial" w:hAnsi="Arial" w:cs="Arial"/>
-        </w:rPr>
-        <w:instrText> </w:instrText>
-      </w:r>
-      <w:r>
-        <w:instrText>=</w:instrText>
-      </w:r>
-      <w:r>
-        <w:rPr>
-          <w:rFonts w:ascii="Arial" w:hAnsi="Arial" w:cs="Arial"/>
-        </w:rPr>
-        <w:instrText> </w:instrText>
-      </w:r>
-      <w:r>
-        <w:instrText>.56). Among the total 112 patients with ACM, presentations with headaches or incidentaloma were more common in Black patients (76.9% vs 31% White, P</w:instrText>
-      </w:r>
-      <w:r>
-        <w:rPr>
-          <w:rFonts w:ascii="Arial" w:hAnsi="Arial" w:cs="Arial"/>
-        </w:rPr>
-        <w:instrText> </w:instrText>
-      </w:r>
-      <w:r>
-        <w:instrText>=</w:instrText>
-      </w:r>
-      <w:r>
-        <w:rPr>
-          <w:rFonts w:ascii="Arial" w:hAnsi="Arial" w:cs="Arial"/>
-        </w:rPr>
-        <w:instrText> </w:instrText>
-      </w:r>
-      <w:r>
-        <w:instrText>.01). Black patients had a higher prevalence of diabetes (54% vs 16% White, P</w:instrText>
-      </w:r>
-      <w:r>
-        <w:rPr>
-          <w:rFonts w:ascii="Arial" w:hAnsi="Arial" w:cs="Arial"/>
-        </w:rPr>
-        <w:instrText> </w:instrText>
-      </w:r>
-      <w:r>
-        <w:instrText>=</w:instrText>
-      </w:r>
-      <w:r>
-        <w:rPr>
-          <w:rFonts w:ascii="Arial" w:hAnsi="Arial" w:cs="Arial"/>
-        </w:rPr>
-        <w:instrText> </w:instrText>
-      </w:r>
-      <w:r>
-        <w:instrText>.005), significantly lower insulin-like growth factor (IGF)-1 deviation from normal (P</w:instrText>
-      </w:r>
-      <w:r>
-        <w:rPr>
-          <w:rFonts w:ascii="Arial" w:hAnsi="Arial" w:cs="Arial"/>
-        </w:rPr>
-        <w:instrText> </w:instrText>
-      </w:r>
-      <w:r>
-        <w:instrText>=</w:instrText>
-      </w:r>
-      <w:r>
-        <w:rPr>
-          <w:rFonts w:ascii="Arial" w:hAnsi="Arial" w:cs="Arial"/>
-        </w:rPr>
-        <w:instrText> </w:instrText>
-      </w:r>
-      <w:r>
-        <w:instrText>.03) and borderline lower median growth hormone levels (P</w:instrText>
-      </w:r>
-      <w:r>
-        <w:rPr>
-          <w:rFonts w:ascii="Arial" w:hAnsi="Arial" w:cs="Arial"/>
-        </w:rPr>
-        <w:instrText> </w:instrText>
-      </w:r>
-      <w:r>
-        <w:instrText>=</w:instrText>
-      </w:r>
-      <w:r>
-        <w:rPr>
-          <w:rFonts w:ascii="Arial" w:hAnsi="Arial" w:cs="Arial"/>
-        </w:rPr>
-        <w:instrText> </w:instrText>
-      </w:r>
-      <w:r>
-        <w:instrText>.09). Mean tumor diameter and proportion of tumors with cavernous sinus invasion were similar. Three-month biochemical remission (46% Black, 55% White, P</w:instrText>
-      </w:r>
-      <w:r>
-        <w:rPr>
-          <w:rFonts w:ascii="Arial" w:hAnsi="Arial" w:cs="Arial"/>
-        </w:rPr>
-        <w:instrText> </w:instrText>
-      </w:r>
-      <w:r>
-        <w:instrText>=</w:instrText>
-      </w:r>
-      <w:r>
-        <w:rPr>
-          <w:rFonts w:ascii="Arial" w:hAnsi="Arial" w:cs="Arial"/>
-        </w:rPr>
-        <w:instrText> </w:instrText>
-      </w:r>
-      <w:r>
-        <w:instrText>.76) and long-term IGF-1 control by multimodality therapy (92.3% Black, 80.5% White, P</w:instrText>
-      </w:r>
-      <w:r>
-        <w:rPr>
-          <w:rFonts w:ascii="Arial" w:hAnsi="Arial" w:cs="Arial"/>
-        </w:rPr>
-        <w:instrText> </w:instrText>
-      </w:r>
-      <w:r>
-        <w:instrText>=</w:instrText>
-      </w:r>
-      <w:r>
-        <w:rPr>
-          <w:rFonts w:ascii="Arial" w:hAnsi="Arial" w:cs="Arial"/>
-        </w:rPr>
-        <w:instrText> </w:instrText>
-      </w:r>
-      <w:r>
-        <w:instrText>.45) were similar. Among the total 129 patients with CD, Black patients had more hypopituitarism (69% vs 45% White, P</w:instrText>
-      </w:r>
-      <w:r>
-        <w:rPr>
-          <w:rFonts w:ascii="Arial" w:hAnsi="Arial" w:cs="Arial"/>
-        </w:rPr>
-        <w:instrText> </w:instrText>
-      </w:r>
-      <w:r>
-        <w:instrText>=</w:instrText>
-      </w:r>
-      <w:r>
-        <w:rPr>
-          <w:rFonts w:ascii="Arial" w:hAnsi="Arial" w:cs="Arial"/>
-        </w:rPr>
-        <w:instrText> </w:instrText>
-      </w:r>
-      <w:r>
-        <w:instrText>.04) and macroadenomas (33% vs 15% White, P</w:instrText>
-      </w:r>
-      <w:r>
-        <w:rPr>
-          <w:rFonts w:ascii="Arial" w:hAnsi="Arial" w:cs="Arial"/>
-        </w:rPr>
-        <w:instrText> </w:instrText>
-      </w:r>
-      <w:r>
-        <w:instrText>=</w:instrText>
-      </w:r>
-      <w:r>
-        <w:rPr>
-          <w:rFonts w:ascii="Arial" w:hAnsi="Arial" w:cs="Arial"/>
-        </w:rPr>
-        <w:instrText> </w:instrText>
-      </w:r>
-      <w:r>
-        <w:instrText>.05). At 3 months, remission rate was borderline higher in White (92% vs 78% Black, P</w:instrText>
-      </w:r>
-      <w:r>
-        <w:rPr>
-          <w:rFonts w:ascii="Arial" w:hAnsi="Arial" w:cs="Arial"/>
-        </w:rPr>
-        <w:instrText> </w:instrText>
-      </w:r>
-      <w:r>
-        <w:instrText>=</w:instrText>
-      </w:r>
-      <w:r>
-        <w:rPr>
-          <w:rFonts w:ascii="Arial" w:hAnsi="Arial" w:cs="Arial"/>
-        </w:rPr>
-        <w:instrText> </w:instrText>
-      </w:r>
-      <w:r>
-        <w:instrText xml:space="preserve">0.08), which was attributed to macroadenomas by logistic regression.We identified disparities regarding racial distribution, and clinical and biochemical characteristics in ACM, suggesting late or missed diagnosis in Black patients. Large nationwide studies are necessary to confirm our findings.","container-title":"Journal of the Endocrine Society","DOI":"10.1210/jendso/bvab176","ISSN":"2472-1972","issue":"1","journalAbbreviation":"J. Endocr. Soc.","page":"bvab176","source":"Silverchair","title":"Racial Disparities in Acromegaly and Cushing’s Disease: A Referral Center Study in 241 Patients","title-short":"Racial Disparities in Acromegaly and Cushing’s Disease","volume":"6","author":[{"family":"Ioachimescu","given":"Adriana G"},{"family":"Goswami","given":"Neevedita"},{"family":"Handa","given":"Talin"},{"family":"Pappy","given":"Adlai"},{"family":"Veledar","given":"Emir"},{"family":"Oyesiku","given":"Nelson M"}],"issued":{"date-parts":[["2022",1,1]]},"citation-key":"ioachimescuRacialDisparitiesAcromegaly2022"}},{"id":27042,"uris":["http://zotero.org/users/7317906/items/H96MA6T6"],"itemData":{"id":27042,"type":"article-journal","abstract":"Y.B. Omotosho: None. R. McGlotten: None. P. Chittiboina: None. L. Nieman: None.Background: Early recognition and treatment of Cushing’s syndrome (CS) is important to reduce mortality, forestall additional co-morbidities, and improve long-term quality of life. Little is known about how adverse social determinants of health (SDOH) influence the achievement of this goal.Objective: To investigate the impact of race (Black vs White) and UFC on the time to definitive diagnosis and treatment of Cushing’s disease (CD).Methods: This is a retrospective cohort study of 114 patients (pts) (including all Non-Hispanic Blacks) evaluated at the National Institutes of Health between 1990-2022, who had CD based on pathology (ACTH-positive tumor immunohistochemistry) or biochemical remission after transsphenoidal surgery (TSS). 38 Non-Hispanic Black patients met entry criteria. They were matched 1:2 by age (within five years) and sex. We excluded patients with cyclic CS, recurrent CD, previous pituitary surgery or radiation therapy and/or a delay between diagnostic evaluation and surgery of more than 4 weeks. We limited cohorts to only Non-Hispanic Blacks and Whites for this pilot study and plan to extend this to smaller race/ethnicity groups in the future. The onset of clinical symptoms was documented as self-reported by the patients. We analyzed the difference between the year of symptom onset and the date TSS was performed, to obtain an estimated duration of diagnosis. The highest 24h urine cortisol (UFC) value for each patient was noted. Non-normal data are described as median [interquartile range]. Group comparisons used the Wilcoxon rank sum test for the time to etiologic diagnosis, age, and UFC. Statistical analyses were done using R/RStudio statistical software. P value &amp;lt;0.05 was considered significant. Results: Each racial group included 76.3% females and 23.7% males. The median age at TSS was 39.5 years [30.0 – 50.8] for Blacks and 41.5 years [31.8 - 53.3] for Whites (P= 0.7). The median UFC was 326 mcg/24h [156 - 491] for Blacks and 264 [166 - 609] for Whites (P= 0.8). The median duration from symptom onset to CD diagnosis was 3.67 years [2.76 - 6.29] for Blacks and for 2.56 years [1.57 - 4.13] for Whites. Analysis of the differences in time to diagnosis between both groups confirmed a significant disparity with blacks having a median delay of 1.1 years more than whites (P= 0.001). Discussion: We do not have information on other SDOH in our patients, such as access to providers, education level, or their perception of the medical community. The present data suggest that racial background serves as a limiting factor in the diagnosis and differential diagnosis of CS, and that differences in severity of hypercortisolism do not explain this disparity. More work is needed to understand the reasons for this disparity as we continue to strive towards health equity.Monday, June 3, 2024","container-title":"Journal of the Endocrine Society","DOI":"10.1210/jendso/bvae163.2408","ISSN":"2472-1972","issue":"Supplement_1","journalAbbreviation":"J. Endocr. Soc.","page":"bvae163.2408","source":"Silverchair","title":"MON-113 Racial Disparity in the Time to Diagnosis of Cushing’s Disease","volume":"8","author":[{"family":"Omotosho","given":"Y B"},{"family":"McGlotten","given":"R"},{"family":"Chittiboina","given":"P"},{"family":"Nieman","given":"L"}],"issued":{"date-parts":[["2024",10,1]]},"citation-key":"omotoshoMON113RacialDisparity2024"}}],"schema":"https://github.com/citation-style-language/schema/raw/master/csl-citation.json"} </w:instrText>
-      </w:r>
-      <w:r>
-        <w:fldChar w:fldCharType="separate"/>
-      </w:r>
-      <w:r>
-        <w:rPr>
-          <w:noProof/>
-        </w:rPr>
-        <w:t>(Ioachimescu et al., 2022; Omotosho et al., 2024)</w:t>
-      </w:r>
-      <w:r>
-        <w:fldChar w:fldCharType="end"/>
-      </w:r>
-      <w:r>
-        <w:t>.</w:t>
-      </w:r>
-    </w:p>
-    <w:p>
-      <w:r>
-        <w:lastRenderedPageBreak/>
-        <w:t>As we expected, participants with Cushing’s disease had a higher BMI than the controls</w:t>
-      </w:r>
-      <w:r>
-        <w:t>, with 64% of participants with Cushing’s disease having a BMI above 30 kg/m</w:t>
-      </w:r>
-      <w:r>
-        <w:rPr>
-          <w:vertAlign w:val="superscript"/>
-        </w:rPr>
-        <w:t>2</w:t>
-      </w:r>
-      <w:r>
-        <w:t xml:space="preserve">, compared to </w:t>
-      </w:r>
-      <w:r>
-        <w:t>40</w:t>
-      </w:r>
-      <w:r>
-        <w:t>% controls (p&lt;0.001).</w:t>
-      </w:r>
-      <w:r>
-        <w:t xml:space="preserve">  </w:t>
-      </w:r>
-      <w:r>
-        <w:t xml:space="preserve">To understand the </w:t>
-      </w:r>
-      <w:r>
-        <w:t xml:space="preserve">cross-sectional </w:t>
-      </w:r>
-      <w:r>
-        <w:t>relationship between obesity and Cushing’s disease, we</w:t>
-      </w:r>
-      <w:r>
-        <w:t xml:space="preserve"> stratified our participants </w:t>
-      </w:r>
-      <w:r>
-        <w:t>with a BMI above or below 30 kg/m</w:t>
-      </w:r>
-      <w:r>
-        <w:rPr>
-          <w:vertAlign w:val="superscript"/>
-        </w:rPr>
-        <w:t>2</w:t>
-      </w:r>
-      <w:r>
-        <w:t xml:space="preserve">, </w:t>
-      </w:r>
-      <w:r>
-        <w:t>across</w:t>
-      </w:r>
-      <w:r>
-        <w:t xml:space="preserve"> both cases and controls</w:t>
-      </w:r>
-      <w:r>
-        <w:t>.  As shown in Table 2, and as expected given our stratification, the four groups differed in several characteristics</w:t>
-      </w:r>
-      <w:r>
-        <w:t xml:space="preserve">, </w:t>
-      </w:r>
-      <w:r>
-        <w:t>which</w:t>
-      </w:r>
-      <w:r>
-        <w:t xml:space="preserve"> will be adjusted for in multivariable models below</w:t>
-      </w:r>
-      <w:r>
-        <w:t>.</w:t>
-      </w:r>
-      <w:r>
-        <w:t xml:space="preserve">  For example, among</w:t>
-      </w:r>
-      <w:r>
-        <w:t xml:space="preserve"> the subgroup of</w:t>
-      </w:r>
-      <w:r>
-        <w:t xml:space="preserve"> participants with a BMI &gt; 30 mg/m</w:t>
-      </w:r>
-      <w:r>
-        <w:rPr>
-          <w:vertAlign w:val="superscript"/>
-        </w:rPr>
-        <w:t>2</w:t>
-      </w:r>
-      <w:r>
-        <w:t>, participants with Cushing’s disease had a higher BMI than controls</w:t>
-      </w:r>
-      <w:r>
-        <w:t xml:space="preserve"> (p=0.0024 by a Mann-Whitney test)</w:t>
-      </w:r>
-      <w:r>
-        <w:t xml:space="preserve">.  </w:t>
-      </w:r>
-      <w:r>
-        <w:t>Females with Cushing’s disease were more likely to have a BMI over 30 kg/m</w:t>
-      </w:r>
-      <w:r>
-        <w:rPr>
-          <w:vertAlign w:val="superscript"/>
-        </w:rPr>
-        <w:t>2</w:t>
-      </w:r>
-      <w:r>
-        <w:t xml:space="preserve"> (68% </w:t>
-      </w:r>
-      <w:r>
-        <w:t xml:space="preserve">of </w:t>
-      </w:r>
-      <w:r>
-        <w:t xml:space="preserve">females </w:t>
-      </w:r>
-      <w:r>
-        <w:t>compared to</w:t>
-      </w:r>
-      <w:r>
-        <w:t xml:space="preserve"> 51% of males with Cushing’s disease, p=0.015).  </w:t>
-      </w:r>
-      <w:r>
-        <w:t>Among participants with Cushing’s disease, Asian (6</w:t>
-      </w:r>
-      <w:r>
-        <w:t xml:space="preserve"> out of </w:t>
-      </w:r>
-      <w:r>
-        <w:t xml:space="preserve">10) and Hispanic or Latino </w:t>
-      </w:r>
-      <w:r>
-        <w:t>(6</w:t>
-      </w:r>
-      <w:r>
-        <w:t xml:space="preserve"> out of </w:t>
-      </w:r>
-      <w:r>
-        <w:t xml:space="preserve">8) </w:t>
-      </w:r>
-      <w:r>
-        <w:t>participants were more likely have a BMI under 30 kg/m</w:t>
-      </w:r>
-      <w:r>
-        <w:rPr>
-          <w:vertAlign w:val="superscript"/>
-        </w:rPr>
-        <w:t xml:space="preserve">2 </w:t>
-      </w:r>
-      <w:r>
-        <w:t xml:space="preserve">compared to </w:t>
-      </w:r>
-      <w:r>
-        <w:t xml:space="preserve">the overall average </w:t>
-      </w:r>
-      <w:r>
-        <w:t>(</w:t>
-      </w:r>
-      <w:r>
-        <w:t>36%</w:t>
-      </w:r>
-      <w:r>
-        <w:t>, p=0.027 and 0.176 respectively via Fisher’s exact test</w:t>
-      </w:r>
-      <w:r>
-        <w:t>s</w:t>
-      </w:r>
-      <w:r>
-        <w:t xml:space="preserve">).  </w:t>
-      </w:r>
-      <w:r>
-        <w:t>The</w:t>
-      </w:r>
-      <w:r>
-        <w:t xml:space="preserve"> average age of </w:t>
-      </w:r>
-      <w:r>
-        <w:t xml:space="preserve">participants with </w:t>
-      </w:r>
-      <w:r>
-        <w:t>Cushing’s</w:t>
-      </w:r>
-      <w:r>
-        <w:t xml:space="preserve"> disease</w:t>
-      </w:r>
-      <w:r>
-        <w:t xml:space="preserve"> with or without obesity was similar</w:t>
-      </w:r>
-      <w:r>
-        <w:t xml:space="preserve"> after stratification</w:t>
-      </w:r>
-      <w:r>
-        <w:t>.</w:t>
-      </w:r>
-    </w:p>
-    <w:p>
-      <w:pPr>
-        <w:pStyle w:val="NormalWeb"/>
-        <w:rPr>
-          <w:rStyle w:val="Heading2Char"/>
-        </w:rPr>
-      </w:pPr>
-      <w:r>
-        <w:rPr>
-          <w:rStyle w:val="Heading2Char"/>
-        </w:rPr>
-        <w:t>Modification of Cushing’s disease-related traits by obesity status</w:t>
-      </w:r>
-    </w:p>
-    <w:p>
-      <w:r>
-        <w:t xml:space="preserve">To identify how obesity alters metabolic outcomes related to Cushing’s disease, we evaluated the effects of Cushing’s disease on several key metabolic variables including </w:t>
-      </w:r>
-      <w:proofErr w:type="spellStart"/>
-      <w:r>
-        <w:t>glycemica</w:t>
-      </w:r>
-      <w:proofErr w:type="spellEnd"/>
-      <w:r>
-        <w:t xml:space="preserve"> (fasting glucose and HbA1c), liver enzymes, LDL-C and blood pressure (Figure 2 and Table 3A).  As described below we noted substantial effect modification by obesity status in these fully adjusted models for liver enzymes and blood pressure (Table 3B).</w:t>
+        <w:commentReference w:id="13"/>
+      </w:r>
+      <w:r>
+        <w:t>However, the increase in the obese population’s control group and Cushing’s patient population was far greater than the non-obese group’s increase (33.07 vs. 69.23). This suggests that obesity could have a positive effect modification on ALT levels.</w:t>
       </w:r>
     </w:p>
     <w:p>
       <w:pPr>
         <w:pStyle w:val="Heading3"/>
       </w:pPr>
-      <w:commentRangeStart w:id="11"/>
-      <w:commentRangeStart w:id="12"/>
-      <w:r>
-        <w:t>Dysglycemia</w:t>
-      </w:r>
-    </w:p>
-    <w:p>
-      <w:r>
-        <w:t>As aforementioned, our first metabolic variable of interest was the fasting glucose levels of our obese and non-obese populations. As shown in Table 3a, we observed a</w:t>
-      </w:r>
-      <w:r>
-        <w:t xml:space="preserve"> significant </w:t>
-      </w:r>
-      <w:r>
-        <w:t xml:space="preserve">increase in </w:t>
-      </w:r>
-      <w:r>
-        <w:t xml:space="preserve">fasting </w:t>
-      </w:r>
-      <w:r>
-        <w:t xml:space="preserve">blood glucose levels </w:t>
-      </w:r>
-      <w:r>
-        <w:t xml:space="preserve">among </w:t>
-      </w:r>
-      <w:r>
-        <w:t>participants</w:t>
-      </w:r>
-      <w:r>
-        <w:t xml:space="preserve"> with Cushing’s disease, regardless of </w:t>
-      </w:r>
-      <w:commentRangeStart w:id="13"/>
-      <w:r>
-        <w:t>obesity status</w:t>
-      </w:r>
-      <w:r>
-        <w:t xml:space="preserve"> (p=1.03e^-23, 2.16e^-37)</w:t>
-      </w:r>
-      <w:r>
-        <w:t xml:space="preserve">. </w:t>
-      </w:r>
-      <w:commentRangeEnd w:id="13"/>
-      <w:r>
-        <w:rPr>
-          <w:rStyle w:val="CommentReference"/>
-        </w:rPr>
-        <w:commentReference w:id="13"/>
-      </w:r>
-      <w:r>
-        <w:t xml:space="preserve">The non-obese population had a slightly larger increase (26.95 vs. 26.18) than the obese population, but this was not a large enough difference to provide any significant evidence of an effect modification for obesity. </w:t>
-      </w:r>
-      <w:proofErr w:type="gramStart"/>
-      <w:r>
-        <w:t>Also</w:t>
-      </w:r>
-      <w:proofErr w:type="gramEnd"/>
-      <w:r>
-        <w:t xml:space="preserve"> in Table 3a, our collected HbA1c data indicated a</w:t>
-      </w:r>
-      <w:r>
-        <w:t xml:space="preserve"> slightly insignificant increase in HbA1c levels between the non-obese, and the non-obese with Cushing’s population (p=0.056). However, there was evidence of a significant increase in HbA1c levels of our obese, and obese with Cushing’s population (p=1.71e^-6). This leads us to believe that there is evidence for obesity being a positive modifier in patients with Cushing’s disease****.</w:t>
-      </w:r>
-    </w:p>
-    <w:p>
-      <w:pPr>
-        <w:pStyle w:val="Heading3"/>
-      </w:pPr>
-      <w:r>
-        <w:lastRenderedPageBreak/>
-        <w:t>MASLD and liver enzymes</w:t>
-      </w:r>
-    </w:p>
-    <w:p>
-      <w:r>
-        <w:t xml:space="preserve">To </w:t>
-      </w:r>
-      <w:r>
-        <w:t>assess</w:t>
+      <w:commentRangeStart w:id="14"/>
+      <w:r>
+        <w:t>Dyslipidemia</w:t>
       </w:r>
       <w:r>
         <w:t xml:space="preserve"> </w:t>
       </w:r>
-      <w:r>
-        <w:t>MASLD</w:t>
-      </w:r>
-      <w:r>
-        <w:t xml:space="preserve"> we looked at </w:t>
-      </w:r>
-      <w:commentRangeStart w:id="14"/>
-      <w:r>
-        <w:t xml:space="preserve">ALT </w:t>
-      </w:r>
       <w:commentRangeEnd w:id="14"/>
-      <w:r>
-        <w:rPr>
-          <w:rStyle w:val="CommentReference"/>
-        </w:rPr>
-        <w:commentReference w:id="14"/>
-      </w:r>
-      <w:r>
-        <w:t>test results for our population. In both our obese, and non-obese populations, we saw an increase in ALT levels regardless of Cushing’s disease status</w:t>
-      </w:r>
-      <w:r>
-        <w:t xml:space="preserve"> </w:t>
-      </w:r>
-      <w:commentRangeStart w:id="15"/>
-      <w:r>
-        <w:t xml:space="preserve">(p=2.17e^-8, 1.94e^-46). </w:t>
-      </w:r>
-      <w:commentRangeEnd w:id="15"/>
-      <w:r>
-        <w:rPr>
-          <w:rStyle w:val="CommentReference"/>
-        </w:rPr>
-        <w:commentReference w:id="15"/>
-      </w:r>
-      <w:r>
-        <w:t>However, the increase in the obese population’s control group and Cushing’s patient population was far greater than the non-obese group’s increase (33.07 vs. 69.23). This suggests that obesity could have a positive effect modification on ALT levels.</w:t>
-      </w:r>
-    </w:p>
-    <w:p>
-      <w:pPr>
-        <w:pStyle w:val="Heading3"/>
-      </w:pPr>
-      <w:commentRangeStart w:id="16"/>
-      <w:r>
-        <w:t>Dyslipidemia</w:t>
-      </w:r>
-      <w:r>
-        <w:t xml:space="preserve"> </w:t>
-      </w:r>
-      <w:commentRangeEnd w:id="16"/>
       <w:r>
         <w:rPr>
           <w:rStyle w:val="CommentReference"/>
           <w:rFonts w:eastAsiaTheme="minorHAnsi" w:cstheme="minorBidi"/>
           <w:color w:val="auto"/>
         </w:rPr>
-        <w:commentReference w:id="16"/>
+        <w:commentReference w:id="14"/>
       </w:r>
     </w:p>
     <w:p>
@@ -1426,21 +1444,21 @@
       <w:r>
         <w:t>Blood Pressure</w:t>
       </w:r>
-      <w:commentRangeEnd w:id="11"/>
+      <w:commentRangeEnd w:id="9"/>
       <w:r>
         <w:rPr>
           <w:rStyle w:val="CommentReference"/>
           <w:rFonts w:eastAsiaTheme="minorHAnsi" w:cstheme="minorBidi"/>
         </w:rPr>
-        <w:commentReference w:id="11"/>
-      </w:r>
-      <w:commentRangeEnd w:id="12"/>
+        <w:commentReference w:id="9"/>
+      </w:r>
+      <w:commentRangeEnd w:id="10"/>
       <w:r>
         <w:rPr>
           <w:rStyle w:val="CommentReference"/>
           <w:rFonts w:eastAsiaTheme="minorHAnsi" w:cstheme="minorBidi"/>
         </w:rPr>
-        <w:commentReference w:id="12"/>
+        <w:commentReference w:id="10"/>
       </w:r>
     </w:p>
     <w:p>
@@ -1465,7 +1483,31 @@
         <w:t>observe</w:t>
       </w:r>
       <w:r>
-        <w:t xml:space="preserve"> this same significant increase in the obese population (p=0.072). We saw this same relationship in our diastolic blood measurement, with a significant increase in the non-obese population, but not a significant increase in the obese population (p=3.13e^-6, 0.422). This pattern changed in our recorded measurements for systolic blood pressure. In this metric, we saw a significant increase in both the non-obese and obese populations between the control and Cushing’s patient populations (p=9.91e^-10, 9.28e^-4). This increase was much larger in the non-obese population (10.88 vs. 4.50), which suggests that obesity could be a negative effect modifier </w:t>
+        <w:t xml:space="preserve"> this same significant increase in the obese population (p=0.072). We saw this same relationship in our diastolic blood measurement, with a significant increase in the non-obese population, but not a significant increase in the obese population (p</w:t>
+      </w:r>
+      <w:r>
+        <w:t>&lt;0.01</w:t>
+      </w:r>
+      <w:r>
+        <w:t xml:space="preserve">, </w:t>
+      </w:r>
+      <w:r>
+        <w:t>&lt;0.01</w:t>
+      </w:r>
+      <w:r>
+        <w:t>). This pattern changed in our recorded measurements for systolic blood pressure. In this metric, we saw a significant increase in both the non-obese and obese populations between the control and Cushing’s patient populations (p</w:t>
+      </w:r>
+      <w:r>
+        <w:t>&lt;0.01</w:t>
+      </w:r>
+      <w:r>
+        <w:t xml:space="preserve">, </w:t>
+      </w:r>
+      <w:r>
+        <w:t>&lt;0.01</w:t>
+      </w:r>
+      <w:r>
+        <w:t xml:space="preserve">). This increase was much larger in the non-obese population (10.88 vs. 4.50), which suggests that obesity could be a negative effect modifier </w:t>
       </w:r>
       <w:proofErr w:type="gramStart"/>
       <w:r>
@@ -1511,6 +1553,7 @@
         <w:rPr>
           <w:rStyle w:val="Heading2Char"/>
         </w:rPr>
+        <w:lastRenderedPageBreak/>
         <w:t>Sensitivity and secondary analyses</w:t>
       </w:r>
     </w:p>
@@ -1628,7 +1671,6 @@
         </w:numPr>
       </w:pPr>
       <w:r>
-        <w:lastRenderedPageBreak/>
         <w:t>IPTW</w:t>
       </w:r>
     </w:p>
@@ -1733,6 +1775,66 @@
           <w:numId w:val="6"/>
         </w:numPr>
       </w:pPr>
+      <w:r>
+        <w:t>Limitations:</w:t>
+      </w:r>
+    </w:p>
+    <w:p>
+      <w:pPr>
+        <w:pStyle w:val="ListParagraph"/>
+        <w:numPr>
+          <w:ilvl w:val="1"/>
+          <w:numId w:val="6"/>
+        </w:numPr>
+      </w:pPr>
+      <w:r>
+        <w:t>Lost a seemingly large amount of people in the patient selection process between diagnoses, and treatments.</w:t>
+      </w:r>
+    </w:p>
+    <w:p>
+      <w:pPr>
+        <w:pStyle w:val="ListParagraph"/>
+        <w:numPr>
+          <w:ilvl w:val="1"/>
+          <w:numId w:val="6"/>
+        </w:numPr>
+      </w:pPr>
+      <w:r>
+        <w:t>Possibly disproportionate number of white patients in our population, fewer patients from other ethic/racial backgrounds.</w:t>
+      </w:r>
+    </w:p>
+    <w:p>
+      <w:pPr>
+        <w:pStyle w:val="ListParagraph"/>
+        <w:numPr>
+          <w:ilvl w:val="1"/>
+          <w:numId w:val="6"/>
+        </w:numPr>
+      </w:pPr>
+      <w:r>
+        <w:t>**When selecting our control groups, we could only pull from ~5 years ago due to DataDirect only being able to pull 100k people at one time.</w:t>
+      </w:r>
+    </w:p>
+    <w:p>
+      <w:pPr>
+        <w:pStyle w:val="ListParagraph"/>
+        <w:numPr>
+          <w:ilvl w:val="1"/>
+          <w:numId w:val="6"/>
+        </w:numPr>
+      </w:pPr>
+      <w:r>
+        <w:t>Relatively small n value for some lab results such as LDL cholesterol, osteoporosis (although we probably just will not use any of that data in our final paper anyways)</w:t>
+      </w:r>
+    </w:p>
+    <w:p>
+      <w:pPr>
+        <w:pStyle w:val="ListParagraph"/>
+        <w:numPr>
+          <w:ilvl w:val="1"/>
+          <w:numId w:val="6"/>
+        </w:numPr>
+      </w:pPr>
     </w:p>
     <w:p>
       <w:pPr>
@@ -1758,61 +1860,18 @@
       <w:r>
         <w:fldChar w:fldCharType="separate"/>
       </w:r>
-      <w:proofErr w:type="spellStart"/>
       <w:r>
         <w:rPr>
           <w:rFonts w:ascii="Aptos"/>
         </w:rPr>
-        <w:t>Alqeeq</w:t>
-      </w:r>
-      <w:proofErr w:type="spellEnd"/>
+        <w:t xml:space="preserve">Alqeeq, B. F., Ayyad, M., Almadhoun, W. J., Aboabdo, M., Aldahdouh, M. S., Al-Tawil, M., &amp; Al-Ghazali, A. M. (2024). Sex-related differences in Cushing’s disease: A systematic </w:t>
+      </w:r>
       <w:r>
         <w:rPr>
           <w:rFonts w:ascii="Aptos"/>
         </w:rPr>
-        <w:t xml:space="preserve">, B. F., Ayyad, M., </w:t>
-      </w:r>
-      <w:proofErr w:type="spellStart"/>
-      <w:r>
-        <w:rPr>
-          <w:rFonts w:ascii="Aptos"/>
-        </w:rPr>
-        <w:t>Almadhoun</w:t>
-      </w:r>
-      <w:proofErr w:type="spellEnd"/>
-      <w:r>
-        <w:rPr>
-          <w:rFonts w:ascii="Aptos"/>
-        </w:rPr>
-        <w:t xml:space="preserve">, W. J., </w:t>
-      </w:r>
-      <w:proofErr w:type="spellStart"/>
-      <w:r>
-        <w:rPr>
-          <w:rFonts w:ascii="Aptos"/>
-        </w:rPr>
-        <w:t>Aboabdo</w:t>
-      </w:r>
-      <w:proofErr w:type="spellEnd"/>
-      <w:r>
-        <w:rPr>
-          <w:rFonts w:ascii="Aptos"/>
-        </w:rPr>
-        <w:t xml:space="preserve">, M., </w:t>
-      </w:r>
-      <w:proofErr w:type="spellStart"/>
-      <w:r>
-        <w:rPr>
-          <w:rFonts w:ascii="Aptos"/>
-        </w:rPr>
-        <w:t>Aldahdouh</w:t>
-      </w:r>
-      <w:proofErr w:type="spellEnd"/>
-      <w:r>
-        <w:rPr>
-          <w:rFonts w:ascii="Aptos"/>
-        </w:rPr>
-        <w:t xml:space="preserve">, M. S., Al-Tawil, M., &amp; Al-Ghazali, A. M. (2024). Sex-related differences in Cushing’s disease: A systematic review and meta-analysis. </w:t>
+        <w:lastRenderedPageBreak/>
+        <w:t xml:space="preserve">review and meta-analysis. </w:t>
       </w:r>
       <w:r>
         <w:rPr>
@@ -1854,21 +1913,7 @@
         <w:rPr>
           <w:rFonts w:ascii="Aptos"/>
         </w:rPr>
-        <w:t xml:space="preserve">Broder, M. S., Neary, M. P., Chang, E., Cherepanov, D., &amp; Ludlam, W. H. (2015). Incidence of Cushing’s syndrome and Cushing’s disease in </w:t>
-      </w:r>
-      <w:proofErr w:type="gramStart"/>
-      <w:r>
-        <w:rPr>
-          <w:rFonts w:ascii="Aptos"/>
-        </w:rPr>
-        <w:t>commercially-insured</w:t>
-      </w:r>
-      <w:proofErr w:type="gramEnd"/>
-      <w:r>
-        <w:rPr>
-          <w:rFonts w:ascii="Aptos"/>
-        </w:rPr>
-        <w:t xml:space="preserve"> patients &lt;65 years old in the United States. </w:t>
+        <w:t xml:space="preserve">Broder, M. S., Neary, M. P., Chang, E., Cherepanov, D., &amp; Ludlam, W. H. (2015). Incidence of Cushing’s syndrome and Cushing’s disease in commercially-insured patients &lt;65 years old in the United States. </w:t>
       </w:r>
       <w:r>
         <w:rPr>
@@ -1906,19 +1951,11 @@
           <w:rFonts w:ascii="Aptos"/>
         </w:rPr>
       </w:pPr>
-      <w:proofErr w:type="spellStart"/>
       <w:r>
         <w:rPr>
           <w:rFonts w:ascii="Aptos"/>
         </w:rPr>
-        <w:t>Etxabe</w:t>
-      </w:r>
-      <w:proofErr w:type="spellEnd"/>
-      <w:r>
-        <w:rPr>
-          <w:rFonts w:ascii="Aptos"/>
-        </w:rPr>
-        <w:t xml:space="preserve">, J., &amp; Vazquez, J. A. (1994). Morbidity and mortality in Cushing’s disease: An epidemiological approach. </w:t>
+        <w:t xml:space="preserve">Etxabe, J., &amp; Vazquez, J. A. (1994). Morbidity and mortality in Cushing’s disease: An epidemiological approach. </w:t>
       </w:r>
       <w:r>
         <w:rPr>
@@ -1926,25 +1963,49 @@
           <w:i/>
           <w:iCs/>
         </w:rPr>
-        <w:t>Clin Endocrinol (</w:t>
-      </w:r>
-      <w:proofErr w:type="spellStart"/>
+        <w:t>Clin Endocrinol (Oxf)</w:t>
+      </w:r>
+      <w:r>
+        <w:rPr>
+          <w:rFonts w:ascii="Aptos"/>
+        </w:rPr>
+        <w:t xml:space="preserve">, </w:t>
+      </w:r>
       <w:r>
         <w:rPr>
           <w:rFonts w:ascii="Aptos"/>
           <w:i/>
           <w:iCs/>
         </w:rPr>
-        <w:t>Oxf</w:t>
-      </w:r>
-      <w:proofErr w:type="spellEnd"/>
+        <w:t>40</w:t>
+      </w:r>
+      <w:r>
+        <w:rPr>
+          <w:rFonts w:ascii="Aptos"/>
+        </w:rPr>
+        <w:t>(4), 479–484. https://doi.org/10.1111/j.1365-2265.1994.tb02486.x</w:t>
+      </w:r>
+    </w:p>
+    <w:p>
+      <w:pPr>
+        <w:pStyle w:val="Bibliography"/>
+        <w:rPr>
+          <w:rFonts w:ascii="Aptos"/>
+        </w:rPr>
+      </w:pPr>
+      <w:r>
+        <w:rPr>
+          <w:rFonts w:ascii="Aptos"/>
+        </w:rPr>
+        <w:t xml:space="preserve">Ho, D., Imai, K., King, G., &amp; Stuart, E. A. (2011). MatchIt: Nonparametric Preprocessing for Parametric Causal Inference. </w:t>
+      </w:r>
       <w:r>
         <w:rPr>
           <w:rFonts w:ascii="Aptos"/>
           <w:i/>
           <w:iCs/>
         </w:rPr>
-        <w:t>)</w:t>
+        <w:t>Journal of Statistical Software</w:t>
       </w:r>
       <w:r>
         <w:rPr>
@@ -1958,13 +2019,13 @@
           <w:i/>
           <w:iCs/>
         </w:rPr>
-        <w:t>40</w:t>
+        <w:t>42</w:t>
       </w:r>
       <w:r>
         <w:rPr>
           <w:rFonts w:ascii="Aptos"/>
         </w:rPr>
-        <w:t>(4), 479–484. https://doi.org/10.1111/j.1365-2265.1994.tb02486.x</w:t>
+        <w:t>, 1–28. https://doi.org/10.18637/jss.v042.i08</w:t>
       </w:r>
     </w:p>
     <w:p>
@@ -1978,22 +2039,7 @@
         <w:rPr>
           <w:rFonts w:ascii="Aptos"/>
         </w:rPr>
-        <w:lastRenderedPageBreak/>
-        <w:t xml:space="preserve">Ho, D., Imai, K., King, G., &amp; Stuart, E. A. (2011). </w:t>
-      </w:r>
-      <w:proofErr w:type="spellStart"/>
-      <w:r>
-        <w:rPr>
-          <w:rFonts w:ascii="Aptos"/>
-        </w:rPr>
-        <w:t>MatchIt</w:t>
-      </w:r>
-      <w:proofErr w:type="spellEnd"/>
-      <w:r>
-        <w:rPr>
-          <w:rFonts w:ascii="Aptos"/>
-        </w:rPr>
-        <w:t xml:space="preserve">: Nonparametric Preprocessing for Parametric Causal Inference. </w:t>
+        <w:t xml:space="preserve">Ioachimescu, A. G., Goswami, N., Handa, T., Pappy, A., Veledar, E., &amp; Oyesiku, N. M. (2022). Racial Disparities in Acromegaly and Cushing’s Disease: A Referral Center Study in 241 Patients. </w:t>
       </w:r>
       <w:r>
         <w:rPr>
@@ -2001,7 +2047,7 @@
           <w:i/>
           <w:iCs/>
         </w:rPr>
-        <w:t>Journal of Statistical Software</w:t>
+        <w:t>Journal of the Endocrine Society</w:t>
       </w:r>
       <w:r>
         <w:rPr>
@@ -2015,13 +2061,13 @@
           <w:i/>
           <w:iCs/>
         </w:rPr>
-        <w:t>42</w:t>
+        <w:t>6</w:t>
       </w:r>
       <w:r>
         <w:rPr>
           <w:rFonts w:ascii="Aptos"/>
         </w:rPr>
-        <w:t>, 1–28. https://doi.org/10.18637/jss.v042.i08</w:t>
+        <w:t>(1), bvab176. https://doi.org/10.1210/jendso/bvab176</w:t>
       </w:r>
     </w:p>
     <w:p>
@@ -2031,47 +2077,11 @@
           <w:rFonts w:ascii="Aptos"/>
         </w:rPr>
       </w:pPr>
-      <w:proofErr w:type="spellStart"/>
       <w:r>
         <w:rPr>
           <w:rFonts w:ascii="Aptos"/>
         </w:rPr>
-        <w:t>Ioachimescu</w:t>
-      </w:r>
-      <w:proofErr w:type="spellEnd"/>
-      <w:r>
-        <w:rPr>
-          <w:rFonts w:ascii="Aptos"/>
-        </w:rPr>
-        <w:t xml:space="preserve">, A. G., Goswami, N., Handa, T., Pappy, A., </w:t>
-      </w:r>
-      <w:proofErr w:type="spellStart"/>
-      <w:r>
-        <w:rPr>
-          <w:rFonts w:ascii="Aptos"/>
-        </w:rPr>
-        <w:t>Veledar</w:t>
-      </w:r>
-      <w:proofErr w:type="spellEnd"/>
-      <w:r>
-        <w:rPr>
-          <w:rFonts w:ascii="Aptos"/>
-        </w:rPr>
-        <w:t xml:space="preserve">, E., &amp; </w:t>
-      </w:r>
-      <w:proofErr w:type="spellStart"/>
-      <w:r>
-        <w:rPr>
-          <w:rFonts w:ascii="Aptos"/>
-        </w:rPr>
-        <w:t>Oyesiku</w:t>
-      </w:r>
-      <w:proofErr w:type="spellEnd"/>
-      <w:r>
-        <w:rPr>
-          <w:rFonts w:ascii="Aptos"/>
-        </w:rPr>
-        <w:t xml:space="preserve">, N. M. (2022). Racial Disparities in Acromegaly and Cushing’s Disease: A Referral Center Study in 241 Patients. </w:t>
+        <w:t xml:space="preserve">Matthiasdottir, A. M., Hardarson, T. O., Arnardottir, S., &amp; Sigurjonsdottir, H. A. (2024). Cushing’s Disease May Have Higher Incidence than Previously Thought: A Nationwide Study in Iceland 2010–2019. </w:t>
       </w:r>
       <w:r>
         <w:rPr>
@@ -2079,7 +2089,7 @@
           <w:i/>
           <w:iCs/>
         </w:rPr>
-        <w:t>Journal of the Endocrine Society</w:t>
+        <w:t>Neuroendocrinology</w:t>
       </w:r>
       <w:r>
         <w:rPr>
@@ -2093,13 +2103,13 @@
           <w:i/>
           <w:iCs/>
         </w:rPr>
-        <w:t>6</w:t>
+        <w:t>114</w:t>
       </w:r>
       <w:r>
         <w:rPr>
           <w:rFonts w:ascii="Aptos"/>
         </w:rPr>
-        <w:t>(1), bvab176. https://doi.org/10.1210/jendso/bvab176</w:t>
+        <w:t>(10), 950–957. https://doi.org/10.1159/000540205</w:t>
       </w:r>
     </w:p>
     <w:p>
@@ -2109,19 +2119,11 @@
           <w:rFonts w:ascii="Aptos"/>
         </w:rPr>
       </w:pPr>
-      <w:proofErr w:type="spellStart"/>
       <w:r>
         <w:rPr>
           <w:rFonts w:ascii="Aptos"/>
         </w:rPr>
-        <w:t>Matthiasdottir</w:t>
-      </w:r>
-      <w:proofErr w:type="spellEnd"/>
-      <w:r>
-        <w:rPr>
-          <w:rFonts w:ascii="Aptos"/>
-        </w:rPr>
-        <w:t xml:space="preserve">, A. M., Hardarson, T. O., Arnardottir, S., &amp; Sigurjonsdottir, H. A. (2024). Cushing’s Disease May Have Higher Incidence than Previously Thought: A Nationwide Study in Iceland 2010–2019. </w:t>
+        <w:t xml:space="preserve">Omotosho, Y. B., McGlotten, R., Chittiboina, P., &amp; Nieman, L. (2024). MON-113 Racial Disparity in the Time to Diagnosis of Cushing’s Disease. </w:t>
       </w:r>
       <w:r>
         <w:rPr>
@@ -2129,13 +2131,7 @@
           <w:i/>
           <w:iCs/>
         </w:rPr>
-        <w:t>Neuroendocrinology</w:t>
-      </w:r>
-      <w:r>
-        <w:rPr>
-          <w:rFonts w:ascii="Aptos"/>
-        </w:rPr>
-        <w:t xml:space="preserve">, </w:t>
+        <w:t xml:space="preserve">Journal of the Endocrine </w:t>
       </w:r>
       <w:r>
         <w:rPr>
@@ -2143,41 +2139,14 @@
           <w:i/>
           <w:iCs/>
         </w:rPr>
-        <w:t>114</w:t>
+        <w:lastRenderedPageBreak/>
+        <w:t>Society</w:t>
       </w:r>
       <w:r>
         <w:rPr>
           <w:rFonts w:ascii="Aptos"/>
         </w:rPr>
-        <w:t>(10), 950–957. https://doi.org/10.1159/000540205</w:t>
-      </w:r>
-    </w:p>
-    <w:p>
-      <w:pPr>
-        <w:pStyle w:val="Bibliography"/>
-        <w:rPr>
-          <w:rFonts w:ascii="Aptos"/>
-        </w:rPr>
-      </w:pPr>
-      <w:r>
-        <w:rPr>
-          <w:rFonts w:ascii="Aptos"/>
-        </w:rPr>
-        <w:t xml:space="preserve">Omotosho, Y. B., McGlotten, R., </w:t>
-      </w:r>
-      <w:proofErr w:type="spellStart"/>
-      <w:r>
-        <w:rPr>
-          <w:rFonts w:ascii="Aptos"/>
-        </w:rPr>
-        <w:t>Chittiboina</w:t>
-      </w:r>
-      <w:proofErr w:type="spellEnd"/>
-      <w:r>
-        <w:rPr>
-          <w:rFonts w:ascii="Aptos"/>
-        </w:rPr>
-        <w:t xml:space="preserve">, P., &amp; Nieman, L. (2024). MON-113 Racial Disparity in the Time to Diagnosis of Cushing’s Disease. </w:t>
+        <w:t xml:space="preserve">, </w:t>
       </w:r>
       <w:r>
         <w:rPr>
@@ -2185,13 +2154,27 @@
           <w:i/>
           <w:iCs/>
         </w:rPr>
-        <w:t>Journal of the Endocrine Society</w:t>
+        <w:t>8</w:t>
       </w:r>
       <w:r>
         <w:rPr>
           <w:rFonts w:ascii="Aptos"/>
         </w:rPr>
-        <w:t xml:space="preserve">, </w:t>
+        <w:t>(Supplement_1), bvae163.2408. https://doi.org/10.1210/jendso/bvae163.2408</w:t>
+      </w:r>
+    </w:p>
+    <w:p>
+      <w:pPr>
+        <w:pStyle w:val="Bibliography"/>
+        <w:rPr>
+          <w:rFonts w:ascii="Aptos"/>
+        </w:rPr>
+      </w:pPr>
+      <w:r>
+        <w:rPr>
+          <w:rFonts w:ascii="Aptos"/>
+        </w:rPr>
+        <w:t xml:space="preserve">R Core Team. (2019). </w:t>
       </w:r>
       <w:r>
         <w:rPr>
@@ -2199,13 +2182,13 @@
           <w:i/>
           <w:iCs/>
         </w:rPr>
-        <w:t>8</w:t>
+        <w:t>R: A Language and Environment for Statistical Computing</w:t>
       </w:r>
       <w:r>
         <w:rPr>
           <w:rFonts w:ascii="Aptos"/>
         </w:rPr>
-        <w:t>(Supplement_1), bvae163.2408. https://doi.org/10.1210/jendso/bvae163.2408</w:t>
+        <w:t>. R Foundation for Statistical Computing. http://www.r-project.org/</w:t>
       </w:r>
     </w:p>
     <w:p>
@@ -2219,7 +2202,7 @@
         <w:rPr>
           <w:rFonts w:ascii="Aptos"/>
         </w:rPr>
-        <w:t xml:space="preserve">R Core Team. (2019). </w:t>
+        <w:t xml:space="preserve">Steffensen, C., Bak, A. M., Zøylner Rubeck, K., &amp; Jørgensen, J. O. L. (2010). Epidemiology of Cushing’s Syndrome. </w:t>
       </w:r>
       <w:r>
         <w:rPr>
@@ -2227,27 +2210,13 @@
           <w:i/>
           <w:iCs/>
         </w:rPr>
-        <w:t>R: A Language and Environment for Statistical Computing</w:t>
+        <w:t>Neuroendocrinology</w:t>
       </w:r>
       <w:r>
         <w:rPr>
           <w:rFonts w:ascii="Aptos"/>
         </w:rPr>
-        <w:t>. R Foundation for Statistical Computing. http://www.r-project.org/</w:t>
-      </w:r>
-    </w:p>
-    <w:p>
-      <w:pPr>
-        <w:pStyle w:val="Bibliography"/>
-        <w:rPr>
-          <w:rFonts w:ascii="Aptos"/>
-        </w:rPr>
-      </w:pPr>
-      <w:r>
-        <w:rPr>
-          <w:rFonts w:ascii="Aptos"/>
-        </w:rPr>
-        <w:t xml:space="preserve">Steffensen, C., Bak, A. M., Zøylner Rubeck, K., &amp; Jørgensen, J. O. L. (2010). Epidemiology of Cushing’s Syndrome. </w:t>
+        <w:t xml:space="preserve">, </w:t>
       </w:r>
       <w:r>
         <w:rPr>
@@ -2255,26 +2224,12 @@
           <w:i/>
           <w:iCs/>
         </w:rPr>
-        <w:t>Neuroendocrinology</w:t>
+        <w:t>92</w:t>
       </w:r>
       <w:r>
         <w:rPr>
           <w:rFonts w:ascii="Aptos"/>
         </w:rPr>
-        <w:t xml:space="preserve">, </w:t>
-      </w:r>
-      <w:r>
-        <w:rPr>
-          <w:rFonts w:ascii="Aptos"/>
-          <w:i/>
-          <w:iCs/>
-        </w:rPr>
-        <w:t>92</w:t>
-      </w:r>
-      <w:r>
-        <w:rPr>
-          <w:rFonts w:ascii="Aptos"/>
-        </w:rPr>
         <w:t>(Suppl. 1), 1–5. https://doi.org/10.1159/000314297</w:t>
       </w:r>
     </w:p>
@@ -2291,7 +2246,6 @@
         <w:pStyle w:val="Heading1"/>
       </w:pPr>
       <w:r>
-        <w:lastRenderedPageBreak/>
         <w:t xml:space="preserve">Figure </w:t>
       </w:r>
       <w:r>
@@ -2499,6 +2453,7 @@
           <w:b/>
           <w:bCs/>
         </w:rPr>
+        <w:lastRenderedPageBreak/>
         <w:t>Supplementary Figure</w:t>
       </w:r>
       <w:r>
@@ -3065,7 +3020,6 @@
           <w:szCs w:val="18"/>
           <w14:ligatures w14:val="none"/>
         </w:rPr>
-        <w:lastRenderedPageBreak/>
         <w:t xml:space="preserve">   </w:t>
       </w:r>
       <w:r>
@@ -4084,6 +4038,7 @@
           <w:szCs w:val="18"/>
           <w14:ligatures w14:val="none"/>
         </w:rPr>
+        <w:lastRenderedPageBreak/>
         <w:t>-</w:t>
       </w:r>
       <w:r>
@@ -4620,7 +4575,7 @@
 
 <file path=word/comments.xml><?xml version="1.0" encoding="utf-8"?>
 <w:comments xmlns:wpc="http://schemas.microsoft.com/office/word/2010/wordprocessingCanvas" xmlns:cx="http://schemas.microsoft.com/office/drawing/2014/chartex" xmlns:cx1="http://schemas.microsoft.com/office/drawing/2015/9/8/chartex" xmlns:cx2="http://schemas.microsoft.com/office/drawing/2015/10/21/chartex" xmlns:cx3="http://schemas.microsoft.com/office/drawing/2016/5/9/chartex" xmlns:cx4="http://schemas.microsoft.com/office/drawing/2016/5/10/chartex" xmlns:cx5="http://schemas.microsoft.com/office/drawing/2016/5/11/chartex" xmlns:cx6="http://schemas.microsoft.com/office/drawing/2016/5/12/chartex" xmlns:cx7="http://schemas.microsoft.com/office/drawing/2016/5/13/chartex" xmlns:cx8="http://schemas.microsoft.com/office/drawing/2016/5/14/chartex" xmlns:mc="http://schemas.openxmlformats.org/markup-compatibility/2006" xmlns:aink="http://schemas.microsoft.com/office/drawing/2016/ink" xmlns:am3d="http://schemas.microsoft.com/office/drawing/2017/model3d" xmlns:o="urn:schemas-microsoft-com:office:office" xmlns:oel="http://schemas.microsoft.com/office/2019/extlst" xmlns:r="http://schemas.openxmlformats.org/officeDocument/2006/relationships" xmlns:m="http://schemas.openxmlformats.org/officeDocument/2006/math" xmlns:v="urn:schemas-microsoft-com:vml" xmlns:wp14="http://schemas.microsoft.com/office/word/2010/wordprocessingDrawing" xmlns:wp="http://schemas.openxmlformats.org/drawingml/2006/wordprocessingDrawing" xmlns:w10="urn:schemas-microsoft-com:office:word" xmlns:w="http://schemas.openxmlformats.org/wordprocessingml/2006/main" xmlns:w14="http://schemas.microsoft.com/office/word/2010/wordml" xmlns:w15="http://schemas.microsoft.com/office/word/2012/wordml" xmlns:w16cex="http://schemas.microsoft.com/office/word/2018/wordml/cex" xmlns:w16cid="http://schemas.microsoft.com/office/word/2016/wordml/cid" xmlns:w16="http://schemas.microsoft.com/office/word/2018/wordml" xmlns:w16du="http://schemas.microsoft.com/office/word/2023/wordml/word16du" xmlns:w16sdtdh="http://schemas.microsoft.com/office/word/2020/wordml/sdtdatahash" xmlns:w16sdtfl="http://schemas.microsoft.com/office/word/2024/wordml/sdtformatlock" xmlns:w16se="http://schemas.microsoft.com/office/word/2015/wordml/symex" xmlns:wpg="http://schemas.microsoft.com/office/word/2010/wordprocessingGroup" xmlns:wpi="http://schemas.microsoft.com/office/word/2010/wordprocessingInk" xmlns:wne="http://schemas.microsoft.com/office/word/2006/wordml" xmlns:wps="http://schemas.microsoft.com/office/word/2010/wordprocessingShape" mc:Ignorable="w14 w15 w16se w16cid w16 w16cex w16sdtdh w16sdtfl w16du wp14">
-  <w:comment w:id="0" w:author="Dave Bridges" w:date="2025-09-05T11:11:00Z" w:initials="DB">
+  <w:comment w:id="0" w:author="Carr, Treyton" w:date="2025-11-08T23:56:00Z" w:initials="CT">
     <w:p>
       <w:r>
         <w:rPr>
@@ -4633,11 +4588,11 @@
           <w:sz w:val="20"/>
           <w:szCs w:val="20"/>
         </w:rPr>
-        <w:t>@trey can you fill in XXX and YYY in based on the participant flow diagram</w:t>
+        <w:t>@dave So from here I was thinking about going more into study design/what this study aims to do, but I feel like that is more of the abstract's goal? Also, should I add on more at the beginning about more symptoms of cushings (moon face, weight holding, hump on neck, etc.)?</w:t>
       </w:r>
     </w:p>
   </w:comment>
-  <w:comment w:id="1" w:author="Carr, Treyton" w:date="2025-09-23T00:52:00Z" w:initials="CT">
+  <w:comment w:id="1" w:author="Dave Bridges" w:date="2025-09-07T19:14:00Z" w:initials="DB">
     <w:p>
       <w:r>
         <w:rPr>
@@ -4650,11 +4605,11 @@
           <w:sz w:val="20"/>
           <w:szCs w:val="20"/>
         </w:rPr>
-        <w:t>Do these once PRISMA is finalized?</w:t>
+        <w:t>@trey can you add these</w:t>
       </w:r>
     </w:p>
   </w:comment>
-  <w:comment w:id="2" w:author="Dave Bridges" w:date="2025-09-23T09:08:00Z" w:initials="DB">
+  <w:comment w:id="2" w:author="Carr, Treyton" w:date="2025-11-08T23:41:00Z" w:initials="CT">
     <w:p>
       <w:r>
         <w:rPr>
@@ -4667,11 +4622,11 @@
           <w:sz w:val="20"/>
           <w:szCs w:val="20"/>
         </w:rPr>
-        <w:t>sure</w:t>
+        <w:t>Because we have a total of 86 codes for this category, should we list them somewhere else in the document in an appendix?</w:t>
       </w:r>
     </w:p>
   </w:comment>
-  <w:comment w:id="3" w:author="Dave Bridges" w:date="2025-09-07T19:14:00Z" w:initials="DB">
+  <w:comment w:id="3" w:author="Dave Bridges" w:date="2025-09-05T19:50:00Z" w:initials="DB">
     <w:p>
       <w:r>
         <w:rPr>
@@ -4684,11 +4639,11 @@
           <w:sz w:val="20"/>
           <w:szCs w:val="20"/>
         </w:rPr>
-        <w:t>@trey can you add these</w:t>
+        <w:t>todo</w:t>
       </w:r>
     </w:p>
   </w:comment>
-  <w:comment w:id="4" w:author="Dave Bridges" w:date="2025-09-07T19:15:00Z" w:initials="DB">
+  <w:comment w:id="4" w:author="Dave Bridges" w:date="2025-09-07T14:40:00Z" w:initials="DB">
     <w:p>
       <w:r>
         <w:rPr>
@@ -4701,11 +4656,11 @@
           <w:sz w:val="20"/>
           <w:szCs w:val="20"/>
         </w:rPr>
-        <w:t>@trey This should include people who you removed from the diagram, including those with NA</w:t>
+        <w:t>@trey can you describe this part, and enter details in the methods of how this was done</w:t>
       </w:r>
     </w:p>
   </w:comment>
-  <w:comment w:id="5" w:author="Dave Bridges" w:date="2025-09-05T19:50:00Z" w:initials="DB">
+  <w:comment w:id="5" w:author="Dave Bridges" w:date="2025-09-05T19:38:00Z" w:initials="DB">
     <w:p>
       <w:r>
         <w:rPr>
@@ -4718,45 +4673,11 @@
           <w:sz w:val="20"/>
           <w:szCs w:val="20"/>
         </w:rPr>
-        <w:t>todo</w:t>
+        <w:t>@trey also any data on demographic propensities towards Cushings we can cite?</w:t>
       </w:r>
     </w:p>
   </w:comment>
-  <w:comment w:id="6" w:author="Dave Bridges" w:date="2025-09-07T14:40:00Z" w:initials="DB">
-    <w:p>
-      <w:r>
-        <w:rPr>
-          <w:rStyle w:val="CommentReference"/>
-        </w:rPr>
-        <w:annotationRef/>
-      </w:r>
-      <w:r>
-        <w:rPr>
-          <w:sz w:val="20"/>
-          <w:szCs w:val="20"/>
-        </w:rPr>
-        <w:t>@trey can you describe this part, and enter details in the methods of how this was done</w:t>
-      </w:r>
-    </w:p>
-  </w:comment>
-  <w:comment w:id="7" w:author="Dave Bridges" w:date="2025-09-05T19:38:00Z" w:initials="DB">
-    <w:p>
-      <w:r>
-        <w:rPr>
-          <w:rStyle w:val="CommentReference"/>
-        </w:rPr>
-        <w:annotationRef/>
-      </w:r>
-      <w:r>
-        <w:rPr>
-          <w:sz w:val="20"/>
-          <w:szCs w:val="20"/>
-        </w:rPr>
-        <w:t>@trey also any data on demographic propensities towards Cushings we can cite?</w:t>
-      </w:r>
-    </w:p>
-  </w:comment>
-  <w:comment w:id="8" w:author="Carr, Treyton" w:date="2025-09-16T11:51:00Z" w:initials="CT">
+  <w:comment w:id="6" w:author="Carr, Treyton" w:date="2025-09-16T11:51:00Z" w:initials="CT">
     <w:p>
       <w:r>
         <w:rPr>
@@ -4833,7 +4754,7 @@
     <w:p/>
     <w:p/>
   </w:comment>
-  <w:comment w:id="9" w:author="Dave Bridges" w:date="2025-09-23T09:31:00Z" w:initials="DB">
+  <w:comment w:id="7" w:author="Dave Bridges" w:date="2025-09-23T09:31:00Z" w:initials="DB">
     <w:p>
       <w:r>
         <w:rPr>
@@ -4873,7 +4794,7 @@
       </w:hyperlink>
     </w:p>
   </w:comment>
-  <w:comment w:id="10" w:author="Dave Bridges" w:date="2025-09-23T09:32:00Z" w:initials="DB">
+  <w:comment w:id="8" w:author="Dave Bridges" w:date="2025-09-23T09:32:00Z" w:initials="DB">
     <w:p>
       <w:r>
         <w:rPr>
@@ -4903,7 +4824,7 @@
       </w:hyperlink>
     </w:p>
   </w:comment>
-  <w:comment w:id="13" w:author="Dave Bridges" w:date="2025-09-23T09:44:00Z" w:initials="DB">
+  <w:comment w:id="11" w:author="Dave Bridges" w:date="2025-09-23T09:44:00Z" w:initials="DB">
     <w:p>
       <w:r>
         <w:rPr>
@@ -4930,7 +4851,7 @@
       </w:r>
     </w:p>
   </w:comment>
-  <w:comment w:id="14" w:author="Dave Bridges" w:date="2025-09-23T09:45:00Z" w:initials="DB">
+  <w:comment w:id="12" w:author="Dave Bridges" w:date="2025-09-23T09:45:00Z" w:initials="DB">
     <w:p>
       <w:r>
         <w:rPr>
@@ -4947,7 +4868,7 @@
       </w:r>
     </w:p>
   </w:comment>
-  <w:comment w:id="15" w:author="Dave Bridges" w:date="2025-09-23T09:45:00Z" w:initials="DB">
+  <w:comment w:id="13" w:author="Dave Bridges" w:date="2025-09-23T09:45:00Z" w:initials="DB">
     <w:p>
       <w:r>
         <w:rPr>
@@ -4974,7 +4895,7 @@
       </w:r>
     </w:p>
   </w:comment>
-  <w:comment w:id="16" w:author="Dave Bridges" w:date="2025-09-23T09:45:00Z" w:initials="DB">
+  <w:comment w:id="14" w:author="Dave Bridges" w:date="2025-09-23T09:45:00Z" w:initials="DB">
     <w:p>
       <w:r>
         <w:rPr>
@@ -4991,7 +4912,7 @@
       </w:r>
     </w:p>
   </w:comment>
-  <w:comment w:id="11" w:author="Dave Bridges" w:date="2025-09-07T20:08:00Z" w:initials="DB">
+  <w:comment w:id="9" w:author="Dave Bridges" w:date="2025-09-07T20:08:00Z" w:initials="DB">
     <w:p>
       <w:r>
         <w:rPr>
@@ -5008,7 +4929,7 @@
       </w:r>
     </w:p>
   </w:comment>
-  <w:comment w:id="12" w:author="Carr, Treyton" w:date="2025-09-23T00:51:00Z" w:initials="CT">
+  <w:comment w:id="10" w:author="Carr, Treyton" w:date="2025-09-23T00:51:00Z" w:initials="CT">
     <w:p>
       <w:r>
         <w:rPr>
@@ -5030,11 +4951,9 @@
 
 <file path=word/commentsExtended.xml><?xml version="1.0" encoding="utf-8"?>
 <w15:commentsEx xmlns:wpc="http://schemas.microsoft.com/office/word/2010/wordprocessingCanvas" xmlns:cx="http://schemas.microsoft.com/office/drawing/2014/chartex" xmlns:cx1="http://schemas.microsoft.com/office/drawing/2015/9/8/chartex" xmlns:cx2="http://schemas.microsoft.com/office/drawing/2015/10/21/chartex" xmlns:cx3="http://schemas.microsoft.com/office/drawing/2016/5/9/chartex" xmlns:cx4="http://schemas.microsoft.com/office/drawing/2016/5/10/chartex" xmlns:cx5="http://schemas.microsoft.com/office/drawing/2016/5/11/chartex" xmlns:cx6="http://schemas.microsoft.com/office/drawing/2016/5/12/chartex" xmlns:cx7="http://schemas.microsoft.com/office/drawing/2016/5/13/chartex" xmlns:cx8="http://schemas.microsoft.com/office/drawing/2016/5/14/chartex" xmlns:mc="http://schemas.openxmlformats.org/markup-compatibility/2006" xmlns:aink="http://schemas.microsoft.com/office/drawing/2016/ink" xmlns:am3d="http://schemas.microsoft.com/office/drawing/2017/model3d" xmlns:o="urn:schemas-microsoft-com:office:office" xmlns:oel="http://schemas.microsoft.com/office/2019/extlst" xmlns:r="http://schemas.openxmlformats.org/officeDocument/2006/relationships" xmlns:m="http://schemas.openxmlformats.org/officeDocument/2006/math" xmlns:v="urn:schemas-microsoft-com:vml" xmlns:wp14="http://schemas.microsoft.com/office/word/2010/wordprocessingDrawing" xmlns:wp="http://schemas.openxmlformats.org/drawingml/2006/wordprocessingDrawing" xmlns:w10="urn:schemas-microsoft-com:office:word" xmlns:w="http://schemas.openxmlformats.org/wordprocessingml/2006/main" xmlns:w14="http://schemas.microsoft.com/office/word/2010/wordml" xmlns:w15="http://schemas.microsoft.com/office/word/2012/wordml" xmlns:w16cex="http://schemas.microsoft.com/office/word/2018/wordml/cex" xmlns:w16cid="http://schemas.microsoft.com/office/word/2016/wordml/cid" xmlns:w16="http://schemas.microsoft.com/office/word/2018/wordml" xmlns:w16du="http://schemas.microsoft.com/office/word/2023/wordml/word16du" xmlns:w16sdtdh="http://schemas.microsoft.com/office/word/2020/wordml/sdtdatahash" xmlns:w16sdtfl="http://schemas.microsoft.com/office/word/2024/wordml/sdtformatlock" xmlns:w16se="http://schemas.microsoft.com/office/word/2015/wordml/symex" xmlns:wpg="http://schemas.microsoft.com/office/word/2010/wordprocessingGroup" xmlns:wpi="http://schemas.microsoft.com/office/word/2010/wordprocessingInk" xmlns:wne="http://schemas.microsoft.com/office/word/2006/wordml" xmlns:wps="http://schemas.microsoft.com/office/word/2010/wordprocessingShape" mc:Ignorable="w14 w15 w16se w16cid w16 w16cex w16sdtdh w16sdtfl w16du wp14">
-  <w15:commentEx w15:paraId="4DBE4D40" w15:done="0"/>
-  <w15:commentEx w15:paraId="6D0A8CE2" w15:paraIdParent="4DBE4D40" w15:done="0"/>
-  <w15:commentEx w15:paraId="0ED88EF0" w15:paraIdParent="4DBE4D40" w15:done="0"/>
+  <w15:commentEx w15:paraId="3048B1C6" w15:done="0"/>
   <w15:commentEx w15:paraId="30EA8164" w15:done="0"/>
-  <w15:commentEx w15:paraId="69A0B22F" w15:done="0"/>
+  <w15:commentEx w15:paraId="03BC0566" w15:paraIdParent="30EA8164" w15:done="0"/>
   <w15:commentEx w15:paraId="1DD21AA1" w15:done="0"/>
   <w15:commentEx w15:paraId="2B4220B9" w15:done="0"/>
   <w15:commentEx w15:paraId="392E4D0B" w15:done="0"/>
@@ -5043,8 +4962,8 @@
   <w15:commentEx w15:paraId="27A1600A" w15:paraIdParent="392E4D0B" w15:done="0"/>
   <w15:commentEx w15:paraId="00B0B8E1" w15:done="0"/>
   <w15:commentEx w15:paraId="1C9C357C" w15:done="0"/>
-  <w15:commentEx w15:paraId="4ACD75D6" w15:done="0"/>
-  <w15:commentEx w15:paraId="5D48BE75" w15:done="0"/>
+  <w15:commentEx w15:paraId="4ACD75D6" w15:done="1"/>
+  <w15:commentEx w15:paraId="5D48BE75" w15:done="1"/>
   <w15:commentEx w15:paraId="57ADD46F" w15:done="0"/>
   <w15:commentEx w15:paraId="54EF4F8A" w15:paraIdParent="57ADD46F" w15:done="0"/>
 </w15:commentsEx>
@@ -5052,11 +4971,9 @@
 
 <file path=word/commentsExtensible.xml><?xml version="1.0" encoding="utf-8"?>
 <w16cex:commentsExtensible xmlns:wpc="http://schemas.microsoft.com/office/word/2010/wordprocessingCanvas" xmlns:cx="http://schemas.microsoft.com/office/drawing/2014/chartex" xmlns:cx1="http://schemas.microsoft.com/office/drawing/2015/9/8/chartex" xmlns:cx2="http://schemas.microsoft.com/office/drawing/2015/10/21/chartex" xmlns:cx3="http://schemas.microsoft.com/office/drawing/2016/5/9/chartex" xmlns:cx4="http://schemas.microsoft.com/office/drawing/2016/5/10/chartex" xmlns:cx5="http://schemas.microsoft.com/office/drawing/2016/5/11/chartex" xmlns:cx6="http://schemas.microsoft.com/office/drawing/2016/5/12/chartex" xmlns:cx7="http://schemas.microsoft.com/office/drawing/2016/5/13/chartex" xmlns:cx8="http://schemas.microsoft.com/office/drawing/2016/5/14/chartex" xmlns:cr="http://schemas.microsoft.com/office/comments/2020/reactions" xmlns:mc="http://schemas.openxmlformats.org/markup-compatibility/2006" xmlns:aink="http://schemas.microsoft.com/office/drawing/2016/ink" xmlns:am3d="http://schemas.microsoft.com/office/drawing/2017/model3d" xmlns:o="urn:schemas-microsoft-com:office:office" xmlns:oel="http://schemas.microsoft.com/office/2019/extlst" xmlns:r="http://schemas.openxmlformats.org/officeDocument/2006/relationships" xmlns:m="http://schemas.openxmlformats.org/officeDocument/2006/math" xmlns:v="urn:schemas-microsoft-com:vml" xmlns:wp14="http://schemas.microsoft.com/office/word/2010/wordprocessingDrawing" xmlns:wp="http://schemas.openxmlformats.org/drawingml/2006/wordprocessingDrawing" xmlns:w10="urn:schemas-microsoft-com:office:word" xmlns:w="http://schemas.openxmlformats.org/wordprocessingml/2006/main" xmlns:w14="http://schemas.microsoft.com/office/word/2010/wordml" xmlns:w15="http://schemas.microsoft.com/office/word/2012/wordml" xmlns:w16cex="http://schemas.microsoft.com/office/word/2018/wordml/cex" xmlns:w16cid="http://schemas.microsoft.com/office/word/2016/wordml/cid" xmlns:w16="http://schemas.microsoft.com/office/word/2018/wordml" xmlns:w16du="http://schemas.microsoft.com/office/word/2023/wordml/word16du" xmlns:w16sdtdh="http://schemas.microsoft.com/office/word/2020/wordml/sdtdatahash" xmlns:w16sdtfl="http://schemas.microsoft.com/office/word/2024/wordml/sdtformatlock" xmlns:w16se="http://schemas.microsoft.com/office/word/2015/wordml/symex" xmlns:wpg="http://schemas.microsoft.com/office/word/2010/wordprocessingGroup" xmlns:wpi="http://schemas.microsoft.com/office/word/2010/wordprocessingInk" xmlns:wne="http://schemas.microsoft.com/office/word/2006/wordml" xmlns:wps="http://schemas.microsoft.com/office/word/2010/wordprocessingShape" mc:Ignorable="w14 w15 w16se w16cid w16 w16cex w16sdtdh w16sdtfl cr w16du wp14">
-  <w16cex:commentExtensible w16cex:durableId="68EF662C" w16cex:dateUtc="2025-09-05T15:11:00Z"/>
-  <w16cex:commentExtensible w16cex:durableId="70F30A32" w16cex:dateUtc="2025-09-23T04:52:00Z"/>
-  <w16cex:commentExtensible w16cex:durableId="5CF4B9C2" w16cex:dateUtc="2025-09-23T13:08:00Z"/>
+  <w16cex:commentExtensible w16cex:durableId="7B615881" w16cex:dateUtc="2025-11-09T04:56:00Z"/>
   <w16cex:commentExtensible w16cex:durableId="7BBB9387" w16cex:dateUtc="2025-09-07T23:14:00Z"/>
-  <w16cex:commentExtensible w16cex:durableId="306CE51F" w16cex:dateUtc="2025-09-07T23:15:00Z"/>
+  <w16cex:commentExtensible w16cex:durableId="5C3B7975" w16cex:dateUtc="2025-11-09T04:41:00Z"/>
   <w16cex:commentExtensible w16cex:durableId="1A95B88A" w16cex:dateUtc="2025-09-05T23:50:00Z"/>
   <w16cex:commentExtensible w16cex:durableId="73524BEF" w16cex:dateUtc="2025-09-07T18:40:00Z"/>
   <w16cex:commentExtensible w16cex:durableId="4FC4BC49" w16cex:dateUtc="2025-09-05T23:38:00Z"/>
@@ -5074,11 +4991,9 @@
 
 <file path=word/commentsIds.xml><?xml version="1.0" encoding="utf-8"?>
 <w16cid:commentsIds xmlns:wpc="http://schemas.microsoft.com/office/word/2010/wordprocessingCanvas" xmlns:cx="http://schemas.microsoft.com/office/drawing/2014/chartex" xmlns:cx1="http://schemas.microsoft.com/office/drawing/2015/9/8/chartex" xmlns:cx2="http://schemas.microsoft.com/office/drawing/2015/10/21/chartex" xmlns:cx3="http://schemas.microsoft.com/office/drawing/2016/5/9/chartex" xmlns:cx4="http://schemas.microsoft.com/office/drawing/2016/5/10/chartex" xmlns:cx5="http://schemas.microsoft.com/office/drawing/2016/5/11/chartex" xmlns:cx6="http://schemas.microsoft.com/office/drawing/2016/5/12/chartex" xmlns:cx7="http://schemas.microsoft.com/office/drawing/2016/5/13/chartex" xmlns:cx8="http://schemas.microsoft.com/office/drawing/2016/5/14/chartex" xmlns:mc="http://schemas.openxmlformats.org/markup-compatibility/2006" xmlns:aink="http://schemas.microsoft.com/office/drawing/2016/ink" xmlns:am3d="http://schemas.microsoft.com/office/drawing/2017/model3d" xmlns:o="urn:schemas-microsoft-com:office:office" xmlns:oel="http://schemas.microsoft.com/office/2019/extlst" xmlns:r="http://schemas.openxmlformats.org/officeDocument/2006/relationships" xmlns:m="http://schemas.openxmlformats.org/officeDocument/2006/math" xmlns:v="urn:schemas-microsoft-com:vml" xmlns:wp14="http://schemas.microsoft.com/office/word/2010/wordprocessingDrawing" xmlns:wp="http://schemas.openxmlformats.org/drawingml/2006/wordprocessingDrawing" xmlns:w10="urn:schemas-microsoft-com:office:word" xmlns:w="http://schemas.openxmlformats.org/wordprocessingml/2006/main" xmlns:w14="http://schemas.microsoft.com/office/word/2010/wordml" xmlns:w15="http://schemas.microsoft.com/office/word/2012/wordml" xmlns:w16cex="http://schemas.microsoft.com/office/word/2018/wordml/cex" xmlns:w16cid="http://schemas.microsoft.com/office/word/2016/wordml/cid" xmlns:w16="http://schemas.microsoft.com/office/word/2018/wordml" xmlns:w16du="http://schemas.microsoft.com/office/word/2023/wordml/word16du" xmlns:w16sdtdh="http://schemas.microsoft.com/office/word/2020/wordml/sdtdatahash" xmlns:w16sdtfl="http://schemas.microsoft.com/office/word/2024/wordml/sdtformatlock" xmlns:w16se="http://schemas.microsoft.com/office/word/2015/wordml/symex" xmlns:wpg="http://schemas.microsoft.com/office/word/2010/wordprocessingGroup" xmlns:wpi="http://schemas.microsoft.com/office/word/2010/wordprocessingInk" xmlns:wne="http://schemas.microsoft.com/office/word/2006/wordml" xmlns:wps="http://schemas.microsoft.com/office/word/2010/wordprocessingShape" mc:Ignorable="w14 w15 w16se w16cid w16 w16cex w16sdtdh w16sdtfl w16du wp14">
-  <w16cid:commentId w16cid:paraId="4DBE4D40" w16cid:durableId="68EF662C"/>
-  <w16cid:commentId w16cid:paraId="6D0A8CE2" w16cid:durableId="70F30A32"/>
-  <w16cid:commentId w16cid:paraId="0ED88EF0" w16cid:durableId="5CF4B9C2"/>
+  <w16cid:commentId w16cid:paraId="3048B1C6" w16cid:durableId="7B615881"/>
   <w16cid:commentId w16cid:paraId="30EA8164" w16cid:durableId="7BBB9387"/>
-  <w16cid:commentId w16cid:paraId="69A0B22F" w16cid:durableId="306CE51F"/>
+  <w16cid:commentId w16cid:paraId="03BC0566" w16cid:durableId="5C3B7975"/>
   <w16cid:commentId w16cid:paraId="1DD21AA1" w16cid:durableId="1A95B88A"/>
   <w16cid:commentId w16cid:paraId="2B4220B9" w16cid:durableId="73524BEF"/>
   <w16cid:commentId w16cid:paraId="392E4D0B" w16cid:durableId="4FC4BC49"/>
@@ -5112,7 +5027,7 @@
         <w:rFonts w:ascii="Symbol" w:hAnsi="Symbol" w:hint="default"/>
       </w:rPr>
     </w:lvl>
-    <w:lvl w:ilvl="1" w:tplc="04090003" w:tentative="1">
+    <w:lvl w:ilvl="1" w:tplc="04090003">
       <w:start w:val="1"/>
       <w:numFmt w:val="bullet"/>
       <w:lvlText w:val="o"/>
@@ -5977,11 +5892,11 @@
 
 <file path=word/people.xml><?xml version="1.0" encoding="utf-8"?>
 <w15:people xmlns:wpc="http://schemas.microsoft.com/office/word/2010/wordprocessingCanvas" xmlns:cx="http://schemas.microsoft.com/office/drawing/2014/chartex" xmlns:cx1="http://schemas.microsoft.com/office/drawing/2015/9/8/chartex" xmlns:cx2="http://schemas.microsoft.com/office/drawing/2015/10/21/chartex" xmlns:cx3="http://schemas.microsoft.com/office/drawing/2016/5/9/chartex" xmlns:cx4="http://schemas.microsoft.com/office/drawing/2016/5/10/chartex" xmlns:cx5="http://schemas.microsoft.com/office/drawing/2016/5/11/chartex" xmlns:cx6="http://schemas.microsoft.com/office/drawing/2016/5/12/chartex" xmlns:cx7="http://schemas.microsoft.com/office/drawing/2016/5/13/chartex" xmlns:cx8="http://schemas.microsoft.com/office/drawing/2016/5/14/chartex" xmlns:mc="http://schemas.openxmlformats.org/markup-compatibility/2006" xmlns:aink="http://schemas.microsoft.com/office/drawing/2016/ink" xmlns:am3d="http://schemas.microsoft.com/office/drawing/2017/model3d" xmlns:o="urn:schemas-microsoft-com:office:office" xmlns:oel="http://schemas.microsoft.com/office/2019/extlst" xmlns:r="http://schemas.openxmlformats.org/officeDocument/2006/relationships" xmlns:m="http://schemas.openxmlformats.org/officeDocument/2006/math" xmlns:v="urn:schemas-microsoft-com:vml" xmlns:wp14="http://schemas.microsoft.com/office/word/2010/wordprocessingDrawing" xmlns:wp="http://schemas.openxmlformats.org/drawingml/2006/wordprocessingDrawing" xmlns:w10="urn:schemas-microsoft-com:office:word" xmlns:w="http://schemas.openxmlformats.org/wordprocessingml/2006/main" xmlns:w14="http://schemas.microsoft.com/office/word/2010/wordml" xmlns:w15="http://schemas.microsoft.com/office/word/2012/wordml" xmlns:w16cex="http://schemas.microsoft.com/office/word/2018/wordml/cex" xmlns:w16cid="http://schemas.microsoft.com/office/word/2016/wordml/cid" xmlns:w16="http://schemas.microsoft.com/office/word/2018/wordml" xmlns:w16du="http://schemas.microsoft.com/office/word/2023/wordml/word16du" xmlns:w16sdtdh="http://schemas.microsoft.com/office/word/2020/wordml/sdtdatahash" xmlns:w16sdtfl="http://schemas.microsoft.com/office/word/2024/wordml/sdtformatlock" xmlns:w16se="http://schemas.microsoft.com/office/word/2015/wordml/symex" xmlns:wpg="http://schemas.microsoft.com/office/word/2010/wordprocessingGroup" xmlns:wpi="http://schemas.microsoft.com/office/word/2010/wordprocessingInk" xmlns:wne="http://schemas.microsoft.com/office/word/2006/wordml" xmlns:wps="http://schemas.microsoft.com/office/word/2010/wordprocessingShape" mc:Ignorable="w14 w15 w16se w16cid w16 w16cex w16sdtdh w16sdtfl w16du wp14">
+  <w15:person w15:author="Carr, Treyton">
+    <w15:presenceInfo w15:providerId="AD" w15:userId="S::treycarr@umich.edu::2d7a502c-7154-4eba-af5f-8ba5f8b51ac9"/>
+  </w15:person>
   <w15:person w15:author="Dave Bridges">
     <w15:presenceInfo w15:providerId="None" w15:userId="Dave Bridges"/>
-  </w15:person>
-  <w15:person w15:author="Carr, Treyton">
-    <w15:presenceInfo w15:providerId="AD" w15:userId="S::treycarr@umich.edu::2d7a502c-7154-4eba-af5f-8ba5f8b51ac9"/>
   </w15:person>
 </w15:people>
 </file>
@@ -6587,6 +6502,7 @@
   <w:style w:type="character" w:default="1" w:styleId="DefaultParagraphFont">
     <w:name w:val="Default Paragraph Font"/>
     <w:uiPriority w:val="1"/>
+    <w:semiHidden/>
     <w:unhideWhenUsed/>
   </w:style>
   <w:style w:type="table" w:default="1" w:styleId="TableNormal">

</xml_diff>

<commit_message>
Changes we made in meeting last week
</commit_message>
<xml_diff>
--- a/manuscript/Cushings-Obesity/manuscript.docx
+++ b/manuscript/Cushings-Obesity/manuscript.docx
@@ -1826,15 +1826,6 @@
       <w:r>
         <w:t>Relatively small n value for some lab results such as LDL cholesterol, osteoporosis (although we probably just will not use any of that data in our final paper anyways)</w:t>
       </w:r>
-    </w:p>
-    <w:p>
-      <w:pPr>
-        <w:pStyle w:val="ListParagraph"/>
-        <w:numPr>
-          <w:ilvl w:val="1"/>
-          <w:numId w:val="6"/>
-        </w:numPr>
-      </w:pPr>
     </w:p>
     <w:p>
       <w:pPr>

</xml_diff>

<commit_message>
Added first batch of sensitivity analyses.
</commit_message>
<xml_diff>
--- a/manuscript/Cushings-Obesity/manuscript.docx
+++ b/manuscript/Cushings-Obesity/manuscript.docx
@@ -37,6 +37,8 @@
       <w:r>
         <w:rPr>
           <w:rStyle w:val="CommentReference"/>
+          <w:sz w:val="24"/>
+          <w:szCs w:val="24"/>
         </w:rPr>
         <w:commentReference w:id="0"/>
       </w:r>
@@ -133,6 +135,8 @@
       <w:r>
         <w:rPr>
           <w:rStyle w:val="CommentReference"/>
+          <w:sz w:val="24"/>
+          <w:szCs w:val="24"/>
         </w:rPr>
         <w:commentReference w:id="1"/>
       </w:r>
@@ -140,6 +144,8 @@
       <w:r>
         <w:rPr>
           <w:rStyle w:val="CommentReference"/>
+          <w:sz w:val="24"/>
+          <w:szCs w:val="24"/>
         </w:rPr>
         <w:commentReference w:id="2"/>
       </w:r>
@@ -170,15 +176,7 @@
         <w:t xml:space="preserve"> the </w:t>
       </w:r>
       <w:r>
-        <w:t xml:space="preserve"> </w:t>
-      </w:r>
-      <w:proofErr w:type="spellStart"/>
-      <w:r>
-        <w:t>MatchIt</w:t>
-      </w:r>
-      <w:proofErr w:type="spellEnd"/>
-      <w:r>
-        <w:t xml:space="preserve"> </w:t>
+        <w:t xml:space="preserve"> MatchIt </w:t>
       </w:r>
       <w:r>
         <w:t xml:space="preserve">package </w:t>
@@ -354,27 +352,13 @@
       <w:r>
         <w:rPr>
           <w:rStyle w:val="CommentReference"/>
+          <w:sz w:val="24"/>
+          <w:szCs w:val="24"/>
         </w:rPr>
         <w:commentReference w:id="3"/>
       </w:r>
       <w:r>
-        <w:t xml:space="preserve"> In our search, we only included patients with BMI’s within the 5-75 range, and between 5-75 years of age. Finally, we also only included patients within the </w:t>
-      </w:r>
-      <w:proofErr w:type="gramStart"/>
-      <w:r>
-        <w:t>2022-2025 year</w:t>
-      </w:r>
-      <w:proofErr w:type="gramEnd"/>
-      <w:r>
-        <w:t xml:space="preserve"> range. This was done to create a data pull request that was less than 100,000 people, which was necessary with the Data Direct software </w:t>
-      </w:r>
-      <w:proofErr w:type="gramStart"/>
-      <w:r>
-        <w:t>used.*</w:t>
-      </w:r>
-      <w:proofErr w:type="gramEnd"/>
-      <w:r>
-        <w:t>**talk about this more</w:t>
+        <w:t xml:space="preserve"> In our search, we only included patients with BMI’s within the 5-75 range, and between 5-75 years of age. Finally, we also only included patients within the 2022-2025 year range. This was done to create a data pull request that was less than 100,000 people, which was necessary with the Data Direct software used.***talk about this more</w:t>
       </w:r>
     </w:p>
     <w:p>
@@ -385,27 +369,30 @@
         <w:t>. Subsequent</w:t>
       </w:r>
       <w:r>
-        <w:t xml:space="preserve"> analyses were stratified by obesity (BMI ≥30 kg/m²). Within each obesity stratum, BMI was evaluated </w:t>
-      </w:r>
-      <w:proofErr w:type="gramStart"/>
-      <w:r>
-        <w:t>descriptively</w:t>
+        <w:t xml:space="preserve"> analyses were stratified by obesity (BMI ≥30 kg/m²). Within each obesity stratum, BMI was evaluated descriptively</w:t>
       </w:r>
       <w:r>
         <w:t>,</w:t>
       </w:r>
       <w:r>
-        <w:t xml:space="preserve"> and</w:t>
-      </w:r>
-      <w:proofErr w:type="gramEnd"/>
-      <w:r>
-        <w:t xml:space="preserve"> </w:t>
+        <w:t xml:space="preserve"> and </w:t>
       </w:r>
       <w:r>
         <w:t xml:space="preserve">also </w:t>
       </w:r>
       <w:r>
         <w:t>included as a covariate in sensitivity models.</w:t>
+      </w:r>
+    </w:p>
+    <w:p>
+      <w:r>
+        <w:t>Mean arterial pressure was directly measured in the majority of cases. When MAP was missing but systolic and diastolic BP were available</w:t>
+      </w:r>
+      <w:r>
+        <w:t xml:space="preserve">, </w:t>
+      </w:r>
+      <w:r>
+        <w:t>MAP was calculated as (SBP + 2×DBP)/3. The calculated values showed high agreement with measured MAP (r=0.963, mean difference=1.32 ± 3.38 mmHg) in cases where both were available.</w:t>
       </w:r>
     </w:p>
     <w:p>
@@ -505,6 +492,8 @@
       <w:r>
         <w:rPr>
           <w:rStyle w:val="CommentReference"/>
+          <w:sz w:val="24"/>
+          <w:szCs w:val="24"/>
         </w:rPr>
         <w:commentReference w:id="4"/>
       </w:r>
@@ -567,16 +556,11 @@
       <w:r>
         <w:t xml:space="preserve">We performed outcome-specific propensity matching to identify appropriate controls, starting from those with generating exact matches for gender, race and ethnicity.  We then algorithmically matched for age, generating 10 controls for each case.  Matching was </w:t>
       </w:r>
-      <w:proofErr w:type="gramStart"/>
       <w:r>
         <w:t xml:space="preserve">effective </w:t>
       </w:r>
       <w:r>
-        <w:t xml:space="preserve"> with</w:t>
-      </w:r>
-      <w:proofErr w:type="gramEnd"/>
-      <w:r>
-        <w:t xml:space="preserve"> a </w:t>
+        <w:t xml:space="preserve"> with a </w:t>
       </w:r>
       <w:r>
         <w:t>standardized mean difference</w:t>
@@ -602,6 +586,7 @@
     </w:p>
     <w:p>
       <w:r>
+        <w:lastRenderedPageBreak/>
         <w:t xml:space="preserve">Primary descriptive characteristics are </w:t>
       </w:r>
       <w:r>
@@ -641,11 +626,7 @@
         <w:t>)</w:t>
       </w:r>
       <w:r>
-        <w:t xml:space="preserve">, </w:t>
-      </w:r>
-      <w:r>
-        <w:lastRenderedPageBreak/>
-        <w:t>consistent with the prior literature</w:t>
+        <w:t>, consistent with the prior literature</w:t>
       </w:r>
       <w:r>
         <w:t xml:space="preserve"> </w:t>
@@ -669,15 +650,7 @@
         <w:fldChar w:fldCharType="end"/>
       </w:r>
       <w:r>
-        <w:t xml:space="preserve">.  As </w:t>
-      </w:r>
-      <w:proofErr w:type="gramStart"/>
-      <w:r>
-        <w:t>expected</w:t>
-      </w:r>
-      <w:proofErr w:type="gramEnd"/>
-      <w:r>
-        <w:t xml:space="preserve"> we also observed</w:t>
+        <w:t>.  As expected we also observed</w:t>
       </w:r>
       <w:r>
         <w:rPr>
@@ -732,6 +705,8 @@
       <w:r>
         <w:rPr>
           <w:rStyle w:val="CommentReference"/>
+          <w:sz w:val="24"/>
+          <w:szCs w:val="24"/>
         </w:rPr>
         <w:commentReference w:id="5"/>
       </w:r>
@@ -739,6 +714,8 @@
       <w:r>
         <w:rPr>
           <w:rStyle w:val="CommentReference"/>
+          <w:sz w:val="24"/>
+          <w:szCs w:val="24"/>
         </w:rPr>
         <w:commentReference w:id="6"/>
       </w:r>
@@ -746,6 +723,8 @@
       <w:r>
         <w:rPr>
           <w:rStyle w:val="CommentReference"/>
+          <w:sz w:val="24"/>
+          <w:szCs w:val="24"/>
         </w:rPr>
         <w:commentReference w:id="7"/>
       </w:r>
@@ -753,6 +732,8 @@
       <w:r>
         <w:rPr>
           <w:rStyle w:val="CommentReference"/>
+          <w:sz w:val="24"/>
+          <w:szCs w:val="24"/>
         </w:rPr>
         <w:commentReference w:id="8"/>
       </w:r>
@@ -1234,15 +1215,7 @@
     </w:p>
     <w:p>
       <w:r>
-        <w:t xml:space="preserve">To identify how obesity alters metabolic outcomes related to Cushing’s disease, we evaluated the effects of Cushing’s disease on several key metabolic variables including </w:t>
-      </w:r>
-      <w:proofErr w:type="spellStart"/>
-      <w:r>
-        <w:t>glycemica</w:t>
-      </w:r>
-      <w:proofErr w:type="spellEnd"/>
-      <w:r>
-        <w:t xml:space="preserve"> (fasting glucose and HbA1c), liver enzymes, LDL-C and blood pressure (Figure 2 and Table 3A).  As described below we noted substantial effect modification by obesity status in these fully adjusted models for liver enzymes and blood pressure (Table 3B).</w:t>
+        <w:t>To identify how obesity alters metabolic outcomes related to Cushing’s disease, we evaluated the effects of Cushing’s disease on several key metabolic variables including glycemica (fasting glucose and HbA1c), liver enzymes, LDL-C and blood pressure (Figure 2 and Table 3A).  As described below we noted substantial effect modification by obesity status in these fully adjusted models for liver enzymes and blood pressure (Table 3B).</w:t>
       </w:r>
     </w:p>
     <w:p>
@@ -1252,6 +1225,7 @@
       <w:commentRangeStart w:id="9"/>
       <w:commentRangeStart w:id="10"/>
       <w:r>
+        <w:lastRenderedPageBreak/>
         <w:t>Dysglycemia</w:t>
       </w:r>
     </w:p>
@@ -1306,216 +1280,200 @@
       <w:r>
         <w:rPr>
           <w:rStyle w:val="CommentReference"/>
+          <w:sz w:val="24"/>
+          <w:szCs w:val="24"/>
         </w:rPr>
         <w:commentReference w:id="11"/>
       </w:r>
       <w:r>
-        <w:t xml:space="preserve">The non-obese population had a slightly larger </w:t>
+        <w:t>The non-obese population had a slightly larger increase (26.95 vs. 26.18) than the obese population, but this was not a large enough difference to provide any significant evidence of an effect modification for obesity. Also in Table 3a, our collected HbA1c data indicated a</w:t>
+      </w:r>
+      <w:r>
+        <w:t xml:space="preserve"> slightly insignificant increase in HbA1c levels between the non-obese, and the non-obese with Cushing’s population (p=0.056). However, there was evidence of a significant increase in HbA1c levels of our obese, and obese with Cushing’s population (p</w:t>
+      </w:r>
+      <w:r>
+        <w:t>&lt;0.01</w:t>
+      </w:r>
+      <w:r>
+        <w:t>). This leads us to believe that there is evidence for obesity being a positive modifier in patients with Cushing’s disease****.</w:t>
+      </w:r>
+    </w:p>
+    <w:p>
+      <w:pPr>
+        <w:pStyle w:val="Heading3"/>
+      </w:pPr>
+      <w:r>
+        <w:t>MASLD and liver enzymes</w:t>
+      </w:r>
+    </w:p>
+    <w:p>
+      <w:r>
+        <w:t xml:space="preserve">To </w:t>
+      </w:r>
+      <w:r>
+        <w:t>assess</w:t>
+      </w:r>
+      <w:r>
+        <w:t xml:space="preserve"> </w:t>
+      </w:r>
+      <w:r>
+        <w:t>MASLD</w:t>
+      </w:r>
+      <w:r>
+        <w:t xml:space="preserve"> we looked at </w:t>
+      </w:r>
+      <w:commentRangeStart w:id="12"/>
+      <w:r>
+        <w:t xml:space="preserve">ALT </w:t>
+      </w:r>
+      <w:commentRangeEnd w:id="12"/>
+      <w:r>
+        <w:rPr>
+          <w:rStyle w:val="CommentReference"/>
+          <w:sz w:val="24"/>
+          <w:szCs w:val="24"/>
+        </w:rPr>
+        <w:commentReference w:id="12"/>
+      </w:r>
+      <w:r>
+        <w:t>test results for our population. In both our obese, and non-obese populations, we saw an increase in ALT levels regardless of Cushing’s disease status</w:t>
+      </w:r>
+      <w:r>
+        <w:t xml:space="preserve"> </w:t>
+      </w:r>
+      <w:commentRangeStart w:id="13"/>
+      <w:r>
+        <w:t>(p</w:t>
+      </w:r>
+      <w:r>
+        <w:t>&lt;0.01</w:t>
+      </w:r>
+      <w:r>
+        <w:t xml:space="preserve">, </w:t>
+      </w:r>
+      <w:r>
+        <w:t>&lt;0.01</w:t>
+      </w:r>
+      <w:r>
+        <w:t xml:space="preserve">). </w:t>
+      </w:r>
+      <w:commentRangeEnd w:id="13"/>
+      <w:r>
+        <w:rPr>
+          <w:rStyle w:val="CommentReference"/>
+          <w:sz w:val="24"/>
+          <w:szCs w:val="24"/>
+        </w:rPr>
+        <w:commentReference w:id="13"/>
+      </w:r>
+      <w:r>
+        <w:t>However, the increase in the obese population’s control group and Cushing’s patient population was far greater than the non-obese group’s increase (33.07 vs. 69.23). This suggests that obesity could have a positive effect modification on ALT levels.</w:t>
+      </w:r>
+    </w:p>
+    <w:p>
+      <w:pPr>
+        <w:pStyle w:val="Heading3"/>
+      </w:pPr>
+      <w:commentRangeStart w:id="14"/>
+      <w:r>
+        <w:t>Dyslipidemia</w:t>
+      </w:r>
+      <w:r>
+        <w:t xml:space="preserve"> </w:t>
+      </w:r>
+      <w:commentRangeEnd w:id="14"/>
+      <w:r>
+        <w:rPr>
+          <w:rStyle w:val="CommentReference"/>
+          <w:sz w:val="28"/>
+          <w:szCs w:val="28"/>
+        </w:rPr>
+        <w:commentReference w:id="14"/>
+      </w:r>
+    </w:p>
+    <w:p>
+      <w:pPr>
+        <w:pStyle w:val="NormalWeb"/>
+      </w:pPr>
+      <w:r>
+        <w:t>L</w:t>
+      </w:r>
+      <w:r>
+        <w:t xml:space="preserve"> Only a small number of participants with Cushing’s disease had LDL-C records within 30 days prior to treatment.</w:t>
+      </w:r>
+      <w:r>
+        <w:t xml:space="preserve"> With this in mind, we did not observe any significant increase or decrease in LDL levels between our control and Cushing’s population, regardless of obesity status. This gives us no evidence of obesity being a modifier for Cushing’s disease patients.</w:t>
+      </w:r>
+    </w:p>
+    <w:p>
+      <w:pPr>
+        <w:pStyle w:val="Heading3"/>
+      </w:pPr>
+      <w:r>
+        <w:t>Blood Pressure</w:t>
+      </w:r>
+      <w:commentRangeEnd w:id="9"/>
+      <w:r>
+        <w:rPr>
+          <w:rStyle w:val="CommentReference"/>
+          <w:sz w:val="28"/>
+          <w:szCs w:val="28"/>
+        </w:rPr>
+        <w:commentReference w:id="9"/>
+      </w:r>
+      <w:commentRangeEnd w:id="10"/>
+      <w:r>
+        <w:rPr>
+          <w:rStyle w:val="CommentReference"/>
+          <w:sz w:val="28"/>
+          <w:szCs w:val="28"/>
+        </w:rPr>
+        <w:commentReference w:id="10"/>
+      </w:r>
+    </w:p>
+    <w:p>
+      <w:r>
+        <w:t xml:space="preserve">We </w:t>
+      </w:r>
+      <w:r>
+        <w:t xml:space="preserve">parameterized blood pressure readings as systolic, diastolic and mean arterial pressure </w:t>
+      </w:r>
+      <w:r>
+        <w:t xml:space="preserve"> (Table 3A). In our data regarding the mean arteriole pressure, we did see a significant increase in our non-obese population between the patients with and without Cushing’s disease (p=0.010). We did not, however, </w:t>
+      </w:r>
+      <w:r>
+        <w:t>observe</w:t>
+      </w:r>
+      <w:r>
+        <w:t xml:space="preserve"> this same significant increase in the obese population (p=0.072). We saw this same relationship in our diastolic blood measurement, with a significant increase in the non-obese population, but not a significant increase in the obese population (p</w:t>
+      </w:r>
+      <w:r>
+        <w:t>&lt;0.01</w:t>
+      </w:r>
+      <w:r>
+        <w:t xml:space="preserve">, </w:t>
+      </w:r>
+      <w:r>
+        <w:t>&lt;0.01</w:t>
+      </w:r>
+      <w:r>
+        <w:t>). This pattern changed in our recorded measurements for systolic blood pressure. In this metric, we saw a significant increase in both the non-obese and obese populations between the control and Cushing’s patient populations (p</w:t>
+      </w:r>
+      <w:r>
+        <w:t>&lt;0.01</w:t>
+      </w:r>
+      <w:r>
+        <w:t xml:space="preserve">, </w:t>
+      </w:r>
+      <w:r>
+        <w:t>&lt;0.01</w:t>
+      </w:r>
+      <w:r>
+        <w:t xml:space="preserve">). This increase was much larger in the non-obese population </w:t>
       </w:r>
       <w:r>
         <w:lastRenderedPageBreak/>
-        <w:t xml:space="preserve">increase (26.95 vs. 26.18) than the obese population, but this was not a large enough difference to provide any significant evidence of an effect modification for obesity. </w:t>
-      </w:r>
-      <w:proofErr w:type="gramStart"/>
-      <w:r>
-        <w:t>Also</w:t>
-      </w:r>
-      <w:proofErr w:type="gramEnd"/>
-      <w:r>
-        <w:t xml:space="preserve"> in Table 3a, our collected HbA1c data indicated a</w:t>
-      </w:r>
-      <w:r>
-        <w:t xml:space="preserve"> slightly insignificant increase in HbA1c levels between the non-obese, and the non-obese with Cushing’s population (p=0.056). However, there was evidence of a significant increase in HbA1c levels of our obese, and obese with Cushing’s population (p</w:t>
-      </w:r>
-      <w:r>
-        <w:t>&lt;0.01</w:t>
-      </w:r>
-      <w:r>
-        <w:t>). This leads us to believe that there is evidence for obesity being a positive modifier in patients with Cushing’s disease****.</w:t>
-      </w:r>
-    </w:p>
-    <w:p>
-      <w:pPr>
-        <w:pStyle w:val="Heading3"/>
-      </w:pPr>
-      <w:r>
-        <w:t>MASLD and liver enzymes</w:t>
-      </w:r>
-    </w:p>
-    <w:p>
-      <w:r>
-        <w:t xml:space="preserve">To </w:t>
-      </w:r>
-      <w:r>
-        <w:t>assess</w:t>
-      </w:r>
-      <w:r>
-        <w:t xml:space="preserve"> </w:t>
-      </w:r>
-      <w:r>
-        <w:t>MASLD</w:t>
-      </w:r>
-      <w:r>
-        <w:t xml:space="preserve"> we looked at </w:t>
-      </w:r>
-      <w:commentRangeStart w:id="12"/>
-      <w:r>
-        <w:t xml:space="preserve">ALT </w:t>
-      </w:r>
-      <w:commentRangeEnd w:id="12"/>
-      <w:r>
-        <w:rPr>
-          <w:rStyle w:val="CommentReference"/>
-        </w:rPr>
-        <w:commentReference w:id="12"/>
-      </w:r>
-      <w:r>
-        <w:t>test results for our population. In both our obese, and non-obese populations, we saw an increase in ALT levels regardless of Cushing’s disease status</w:t>
-      </w:r>
-      <w:r>
-        <w:t xml:space="preserve"> </w:t>
-      </w:r>
-      <w:commentRangeStart w:id="13"/>
-      <w:r>
-        <w:t>(p</w:t>
-      </w:r>
-      <w:r>
-        <w:t>&lt;0.01</w:t>
-      </w:r>
-      <w:r>
-        <w:t xml:space="preserve">, </w:t>
-      </w:r>
-      <w:r>
-        <w:t>&lt;0.01</w:t>
-      </w:r>
-      <w:r>
-        <w:t xml:space="preserve">). </w:t>
-      </w:r>
-      <w:commentRangeEnd w:id="13"/>
-      <w:r>
-        <w:rPr>
-          <w:rStyle w:val="CommentReference"/>
-        </w:rPr>
-        <w:commentReference w:id="13"/>
-      </w:r>
-      <w:r>
-        <w:t>However, the increase in the obese population’s control group and Cushing’s patient population was far greater than the non-obese group’s increase (33.07 vs. 69.23). This suggests that obesity could have a positive effect modification on ALT levels.</w:t>
-      </w:r>
-    </w:p>
-    <w:p>
-      <w:pPr>
-        <w:pStyle w:val="Heading3"/>
-      </w:pPr>
-      <w:commentRangeStart w:id="14"/>
-      <w:r>
-        <w:t>Dyslipidemia</w:t>
-      </w:r>
-      <w:r>
-        <w:t xml:space="preserve"> </w:t>
-      </w:r>
-      <w:commentRangeEnd w:id="14"/>
-      <w:r>
-        <w:rPr>
-          <w:rStyle w:val="CommentReference"/>
-          <w:rFonts w:eastAsiaTheme="minorHAnsi" w:cstheme="minorBidi"/>
-          <w:color w:val="auto"/>
-        </w:rPr>
-        <w:commentReference w:id="14"/>
-      </w:r>
-    </w:p>
-    <w:p>
-      <w:pPr>
-        <w:pStyle w:val="NormalWeb"/>
-      </w:pPr>
-      <w:r>
-        <w:t>L</w:t>
-      </w:r>
-      <w:r>
-        <w:t xml:space="preserve"> Only a small number of participants with Cushing’s disease had LDL-C records within 30 days prior to treatment.</w:t>
-      </w:r>
-      <w:r>
-        <w:t xml:space="preserve"> With this in mind, we did not observe any significant increase or decrease in LDL levels between our control and Cushing’s population, regardless of obesity status. This gives us no evidence of obesity being a modifier for Cushing’s disease patients.</w:t>
-      </w:r>
-    </w:p>
-    <w:p>
-      <w:pPr>
-        <w:pStyle w:val="Heading3"/>
-      </w:pPr>
-      <w:r>
-        <w:t>Blood Pressure</w:t>
-      </w:r>
-      <w:commentRangeEnd w:id="9"/>
-      <w:r>
-        <w:rPr>
-          <w:rStyle w:val="CommentReference"/>
-          <w:rFonts w:eastAsiaTheme="minorHAnsi" w:cstheme="minorBidi"/>
-        </w:rPr>
-        <w:commentReference w:id="9"/>
-      </w:r>
-      <w:commentRangeEnd w:id="10"/>
-      <w:r>
-        <w:rPr>
-          <w:rStyle w:val="CommentReference"/>
-          <w:rFonts w:eastAsiaTheme="minorHAnsi" w:cstheme="minorBidi"/>
-        </w:rPr>
-        <w:commentReference w:id="10"/>
-      </w:r>
-    </w:p>
-    <w:p>
-      <w:r>
-        <w:t xml:space="preserve">We </w:t>
-      </w:r>
-      <w:r>
-        <w:t xml:space="preserve">parameterized blood pressure readings as systolic, diastolic and mean arterial </w:t>
-      </w:r>
-      <w:proofErr w:type="gramStart"/>
-      <w:r>
-        <w:t xml:space="preserve">pressure </w:t>
-      </w:r>
-      <w:r>
-        <w:t xml:space="preserve"> (</w:t>
-      </w:r>
-      <w:proofErr w:type="gramEnd"/>
-      <w:r>
-        <w:t xml:space="preserve">Table 3A). In our data regarding the mean arteriole pressure, we did see a significant increase in our non-obese population between the patients with and without Cushing’s disease (p=0.010). We did not, however, </w:t>
-      </w:r>
-      <w:r>
-        <w:t>observe</w:t>
-      </w:r>
-      <w:r>
-        <w:t xml:space="preserve"> this same significant increase in the obese population (p=0.072). We saw this same relationship in our diastolic blood measurement, with a significant increase in the non-obese population, but not a significant increase in the obese population (p</w:t>
-      </w:r>
-      <w:r>
-        <w:t>&lt;0.01</w:t>
-      </w:r>
-      <w:r>
-        <w:t xml:space="preserve">, </w:t>
-      </w:r>
-      <w:r>
-        <w:t>&lt;0.01</w:t>
-      </w:r>
-      <w:r>
-        <w:t>). This pattern changed in our recorded measurements for systolic blood pressure. In this metric, we saw a significant increase in both the non-obese and obese populations between the control and Cushing’s patient populations (p</w:t>
-      </w:r>
-      <w:r>
-        <w:t>&lt;0.01</w:t>
-      </w:r>
-      <w:r>
-        <w:t xml:space="preserve">, </w:t>
-      </w:r>
-      <w:r>
-        <w:t>&lt;0.01</w:t>
-      </w:r>
-      <w:r>
-        <w:t xml:space="preserve">). This increase was much larger in the non-obese population (10.88 vs. 4.50), which suggests that obesity could be a negative effect modifier </w:t>
-      </w:r>
-      <w:proofErr w:type="gramStart"/>
-      <w:r>
-        <w:t>in regards to</w:t>
-      </w:r>
-      <w:proofErr w:type="gramEnd"/>
-      <w:r>
-        <w:t xml:space="preserve"> systolic blood pressure.</w:t>
+        <w:t>(10.88 vs. 4.50), which suggests that obesity could be a negative effect modifier in regards to systolic blood pressure.</w:t>
       </w:r>
     </w:p>
     <w:p>
@@ -1553,7 +1511,6 @@
         <w:rPr>
           <w:rStyle w:val="Heading2Char"/>
         </w:rPr>
-        <w:lastRenderedPageBreak/>
         <w:t>Sensitivity and secondary analyses</w:t>
       </w:r>
     </w:p>
@@ -1614,23 +1571,7 @@
         </w:numPr>
       </w:pPr>
       <w:r>
-        <w:t xml:space="preserve">BMI instead of Obesity, </w:t>
-      </w:r>
-      <w:proofErr w:type="gramStart"/>
-      <w:r>
-        <w:t>ns(</w:t>
-      </w:r>
-      <w:proofErr w:type="gramEnd"/>
-      <w:r>
-        <w:t xml:space="preserve">BMI, </w:t>
-      </w:r>
-      <w:proofErr w:type="spellStart"/>
-      <w:r>
-        <w:t>df</w:t>
-      </w:r>
-      <w:proofErr w:type="spellEnd"/>
-      <w:r>
-        <w:t>=3) instead of Obesity</w:t>
+        <w:t>BMI instead of Obesity, ns(BMI, df=3) instead of Obesity</w:t>
       </w:r>
     </w:p>
     <w:p>
@@ -1641,13 +1582,8 @@
           <w:numId w:val="5"/>
         </w:numPr>
       </w:pPr>
-      <w:proofErr w:type="spellStart"/>
-      <w:r>
-        <w:t>Cushings</w:t>
-      </w:r>
-      <w:proofErr w:type="spellEnd"/>
-      <w:r>
-        <w:t xml:space="preserve"> x Sex</w:t>
+      <w:r>
+        <w:t>Cushings x Sex</w:t>
       </w:r>
     </w:p>
     <w:p>
@@ -1756,15 +1692,7 @@
         </w:numPr>
       </w:pPr>
       <w:r>
-        <w:t xml:space="preserve">BMI Higher in </w:t>
-      </w:r>
-      <w:proofErr w:type="spellStart"/>
-      <w:r>
-        <w:t>cushings</w:t>
-      </w:r>
-      <w:proofErr w:type="spellEnd"/>
-      <w:r>
-        <w:t xml:space="preserve"> case</w:t>
+        <w:t>BMI Higher in cushings case</w:t>
       </w:r>
     </w:p>
     <w:p>
@@ -1832,6 +1760,7 @@
         <w:pStyle w:val="Heading1"/>
       </w:pPr>
       <w:r>
+        <w:lastRenderedPageBreak/>
         <w:t>References</w:t>
       </w:r>
     </w:p>
@@ -1855,14 +1784,7 @@
         <w:rPr>
           <w:rFonts w:ascii="Aptos"/>
         </w:rPr>
-        <w:t xml:space="preserve">Alqeeq, B. F., Ayyad, M., Almadhoun, W. J., Aboabdo, M., Aldahdouh, M. S., Al-Tawil, M., &amp; Al-Ghazali, A. M. (2024). Sex-related differences in Cushing’s disease: A systematic </w:t>
-      </w:r>
-      <w:r>
-        <w:rPr>
-          <w:rFonts w:ascii="Aptos"/>
-        </w:rPr>
-        <w:lastRenderedPageBreak/>
-        <w:t xml:space="preserve">review and meta-analysis. </w:t>
+        <w:t xml:space="preserve">Alqeeq, B. F., Ayyad, M., Almadhoun, W. J., Aboabdo, M., Aldahdouh, M. S., Al-Tawil, M., &amp; Al-Ghazali, A. M. (2024). Sex-related differences in Cushing’s disease: A systematic review and meta-analysis. </w:t>
       </w:r>
       <w:r>
         <w:rPr>
@@ -2072,7 +1994,14 @@
         <w:rPr>
           <w:rFonts w:ascii="Aptos"/>
         </w:rPr>
-        <w:t xml:space="preserve">Matthiasdottir, A. M., Hardarson, T. O., Arnardottir, S., &amp; Sigurjonsdottir, H. A. (2024). Cushing’s Disease May Have Higher Incidence than Previously Thought: A Nationwide Study in Iceland 2010–2019. </w:t>
+        <w:t xml:space="preserve">Matthiasdottir, A. M., Hardarson, T. O., Arnardottir, S., &amp; Sigurjonsdottir, H. A. (2024). Cushing’s Disease May Have Higher Incidence than Previously Thought: A </w:t>
+      </w:r>
+      <w:r>
+        <w:rPr>
+          <w:rFonts w:ascii="Aptos"/>
+        </w:rPr>
+        <w:lastRenderedPageBreak/>
+        <w:t xml:space="preserve">Nationwide Study in Iceland 2010–2019. </w:t>
       </w:r>
       <w:r>
         <w:rPr>
@@ -2122,7 +2051,13 @@
           <w:i/>
           <w:iCs/>
         </w:rPr>
-        <w:t xml:space="preserve">Journal of the Endocrine </w:t>
+        <w:t>Journal of the Endocrine Society</w:t>
+      </w:r>
+      <w:r>
+        <w:rPr>
+          <w:rFonts w:ascii="Aptos"/>
+        </w:rPr>
+        <w:t xml:space="preserve">, </w:t>
       </w:r>
       <w:r>
         <w:rPr>
@@ -2130,14 +2065,27 @@
           <w:i/>
           <w:iCs/>
         </w:rPr>
-        <w:lastRenderedPageBreak/>
-        <w:t>Society</w:t>
+        <w:t>8</w:t>
       </w:r>
       <w:r>
         <w:rPr>
           <w:rFonts w:ascii="Aptos"/>
         </w:rPr>
-        <w:t xml:space="preserve">, </w:t>
+        <w:t>(Supplement_1), bvae163.2408. https://doi.org/10.1210/jendso/bvae163.2408</w:t>
+      </w:r>
+    </w:p>
+    <w:p>
+      <w:pPr>
+        <w:pStyle w:val="Bibliography"/>
+        <w:rPr>
+          <w:rFonts w:ascii="Aptos"/>
+        </w:rPr>
+      </w:pPr>
+      <w:r>
+        <w:rPr>
+          <w:rFonts w:ascii="Aptos"/>
+        </w:rPr>
+        <w:t xml:space="preserve">R Core Team. (2019). </w:t>
       </w:r>
       <w:r>
         <w:rPr>
@@ -2145,13 +2093,13 @@
           <w:i/>
           <w:iCs/>
         </w:rPr>
-        <w:t>8</w:t>
+        <w:t>R: A Language and Environment for Statistical Computing</w:t>
       </w:r>
       <w:r>
         <w:rPr>
           <w:rFonts w:ascii="Aptos"/>
         </w:rPr>
-        <w:t>(Supplement_1), bvae163.2408. https://doi.org/10.1210/jendso/bvae163.2408</w:t>
+        <w:t>. R Foundation for Statistical Computing. http://www.r-project.org/</w:t>
       </w:r>
     </w:p>
     <w:p>
@@ -2165,7 +2113,7 @@
         <w:rPr>
           <w:rFonts w:ascii="Aptos"/>
         </w:rPr>
-        <w:t xml:space="preserve">R Core Team. (2019). </w:t>
+        <w:t xml:space="preserve">Steffensen, C., Bak, A. M., Zøylner Rubeck, K., &amp; Jørgensen, J. O. L. (2010). Epidemiology of Cushing’s Syndrome. </w:t>
       </w:r>
       <w:r>
         <w:rPr>
@@ -2173,27 +2121,13 @@
           <w:i/>
           <w:iCs/>
         </w:rPr>
-        <w:t>R: A Language and Environment for Statistical Computing</w:t>
+        <w:t>Neuroendocrinology</w:t>
       </w:r>
       <w:r>
         <w:rPr>
           <w:rFonts w:ascii="Aptos"/>
         </w:rPr>
-        <w:t>. R Foundation for Statistical Computing. http://www.r-project.org/</w:t>
-      </w:r>
-    </w:p>
-    <w:p>
-      <w:pPr>
-        <w:pStyle w:val="Bibliography"/>
-        <w:rPr>
-          <w:rFonts w:ascii="Aptos"/>
-        </w:rPr>
-      </w:pPr>
-      <w:r>
-        <w:rPr>
-          <w:rFonts w:ascii="Aptos"/>
-        </w:rPr>
-        <w:t xml:space="preserve">Steffensen, C., Bak, A. M., Zøylner Rubeck, K., &amp; Jørgensen, J. O. L. (2010). Epidemiology of Cushing’s Syndrome. </w:t>
+        <w:t xml:space="preserve">, </w:t>
       </w:r>
       <w:r>
         <w:rPr>
@@ -2201,20 +2135,6 @@
           <w:i/>
           <w:iCs/>
         </w:rPr>
-        <w:t>Neuroendocrinology</w:t>
-      </w:r>
-      <w:r>
-        <w:rPr>
-          <w:rFonts w:ascii="Aptos"/>
-        </w:rPr>
-        <w:t xml:space="preserve">, </w:t>
-      </w:r>
-      <w:r>
-        <w:rPr>
-          <w:rFonts w:ascii="Aptos"/>
-          <w:i/>
-          <w:iCs/>
-        </w:rPr>
         <w:t>92</w:t>
       </w:r>
       <w:r>
@@ -2406,6 +2326,7 @@
           <w:b/>
           <w:bCs/>
         </w:rPr>
+        <w:lastRenderedPageBreak/>
         <w:t xml:space="preserve">Table 3: Effect sizes and statistical significance for each outcome.  </w:t>
       </w:r>
       <w:r>
@@ -2415,18 +2336,10 @@
         <w:t xml:space="preserve">Data are presented as mean with 95% confidence intervals.  </w:t>
       </w:r>
       <w:r>
-        <w:t xml:space="preserve">For </w:t>
-      </w:r>
-      <w:proofErr w:type="gramStart"/>
-      <w:r>
-        <w:t xml:space="preserve">both </w:t>
-      </w:r>
-      <w:r>
-        <w:t>of these</w:t>
-      </w:r>
-      <w:proofErr w:type="gramEnd"/>
-      <w:r>
-        <w:t xml:space="preserve"> </w:t>
+        <w:t xml:space="preserve">For both </w:t>
+      </w:r>
+      <w:r>
+        <w:t xml:space="preserve">of these </w:t>
       </w:r>
       <w:r>
         <w:t>tables</w:t>
@@ -2444,7 +2357,6 @@
           <w:b/>
           <w:bCs/>
         </w:rPr>
-        <w:lastRenderedPageBreak/>
         <w:t>Supplementary Figure</w:t>
       </w:r>
       <w:r>
@@ -2649,9 +2561,116 @@
           <w:szCs w:val="18"/>
           <w14:ligatures w14:val="none"/>
         </w:rPr>
-        <w:t>**Figure 1. Study flow diagram (STROBE-</w:t>
-      </w:r>
-      <w:proofErr w:type="gramStart"/>
+        <w:t>**Figure 1. Study flow diagram (STROBE-style)**</w:t>
+      </w:r>
+      <w:r>
+        <w:rPr>
+          <w:rFonts w:ascii="Menlo" w:eastAsia="Times New Roman" w:hAnsi="Menlo" w:cs="Menlo"/>
+          <w:color w:val="3B3B3B"/>
+          <w:kern w:val="0"/>
+          <w:sz w:val="18"/>
+          <w:szCs w:val="18"/>
+          <w14:ligatures w14:val="none"/>
+        </w:rPr>
+        <w:t xml:space="preserve">  </w:t>
+      </w:r>
+    </w:p>
+    <w:p>
+      <w:pPr>
+        <w:shd w:val="clear" w:color="auto" w:fill="FFFFFF"/>
+        <w:spacing w:after="0" w:line="270" w:lineRule="atLeast"/>
+        <w:rPr>
+          <w:rFonts w:ascii="Menlo" w:eastAsia="Times New Roman" w:hAnsi="Menlo" w:cs="Menlo"/>
+          <w:color w:val="3B3B3B"/>
+          <w:kern w:val="0"/>
+          <w:sz w:val="18"/>
+          <w:szCs w:val="18"/>
+          <w14:ligatures w14:val="none"/>
+        </w:rPr>
+      </w:pPr>
+      <w:r>
+        <w:rPr>
+          <w:rFonts w:ascii="Menlo" w:eastAsia="Times New Roman" w:hAnsi="Menlo" w:cs="Menlo"/>
+          <w:color w:val="3B3B3B"/>
+          <w:kern w:val="0"/>
+          <w:sz w:val="18"/>
+          <w:szCs w:val="18"/>
+          <w14:ligatures w14:val="none"/>
+        </w:rPr>
+        <w:t xml:space="preserve">   </w:t>
+      </w:r>
+      <w:r>
+        <w:rPr>
+          <w:rFonts w:ascii="Menlo" w:eastAsia="Times New Roman" w:hAnsi="Menlo" w:cs="Menlo"/>
+          <w:color w:val="0451A5"/>
+          <w:kern w:val="0"/>
+          <w:sz w:val="18"/>
+          <w:szCs w:val="18"/>
+          <w14:ligatures w14:val="none"/>
+        </w:rPr>
+        <w:t>-</w:t>
+      </w:r>
+      <w:r>
+        <w:rPr>
+          <w:rFonts w:ascii="Menlo" w:eastAsia="Times New Roman" w:hAnsi="Menlo" w:cs="Menlo"/>
+          <w:color w:val="3B3B3B"/>
+          <w:kern w:val="0"/>
+          <w:sz w:val="18"/>
+          <w:szCs w:val="18"/>
+          <w14:ligatures w14:val="none"/>
+        </w:rPr>
+        <w:t xml:space="preserve"> Source population → exclusions → final analytic sample per outcome.</w:t>
+      </w:r>
+    </w:p>
+    <w:p>
+      <w:pPr>
+        <w:shd w:val="clear" w:color="auto" w:fill="FFFFFF"/>
+        <w:spacing w:after="0" w:line="270" w:lineRule="atLeast"/>
+        <w:rPr>
+          <w:rFonts w:ascii="Menlo" w:eastAsia="Times New Roman" w:hAnsi="Menlo" w:cs="Menlo"/>
+          <w:color w:val="3B3B3B"/>
+          <w:kern w:val="0"/>
+          <w:sz w:val="18"/>
+          <w:szCs w:val="18"/>
+          <w14:ligatures w14:val="none"/>
+        </w:rPr>
+      </w:pPr>
+    </w:p>
+    <w:p>
+      <w:pPr>
+        <w:shd w:val="clear" w:color="auto" w:fill="FFFFFF"/>
+        <w:spacing w:after="0" w:line="270" w:lineRule="atLeast"/>
+        <w:rPr>
+          <w:rFonts w:ascii="Menlo" w:eastAsia="Times New Roman" w:hAnsi="Menlo" w:cs="Menlo"/>
+          <w:color w:val="3B3B3B"/>
+          <w:kern w:val="0"/>
+          <w:sz w:val="18"/>
+          <w:szCs w:val="18"/>
+          <w14:ligatures w14:val="none"/>
+        </w:rPr>
+      </w:pPr>
+      <w:r>
+        <w:rPr>
+          <w:rFonts w:ascii="Menlo" w:eastAsia="Times New Roman" w:hAnsi="Menlo" w:cs="Menlo"/>
+          <w:color w:val="0451A5"/>
+          <w:kern w:val="0"/>
+          <w:sz w:val="18"/>
+          <w:szCs w:val="18"/>
+          <w14:ligatures w14:val="none"/>
+        </w:rPr>
+        <w:t>2.</w:t>
+      </w:r>
+      <w:r>
+        <w:rPr>
+          <w:rFonts w:ascii="Menlo" w:eastAsia="Times New Roman" w:hAnsi="Menlo" w:cs="Menlo"/>
+          <w:color w:val="3B3B3B"/>
+          <w:kern w:val="0"/>
+          <w:sz w:val="18"/>
+          <w:szCs w:val="18"/>
+          <w14:ligatures w14:val="none"/>
+        </w:rPr>
+        <w:t xml:space="preserve"> </w:t>
+      </w:r>
       <w:r>
         <w:rPr>
           <w:rFonts w:ascii="Menlo" w:eastAsia="Times New Roman" w:hAnsi="Menlo" w:cs="Menlo"/>
@@ -2663,9 +2682,116 @@
           <w:szCs w:val="18"/>
           <w14:ligatures w14:val="none"/>
         </w:rPr>
-        <w:t>style)*</w:t>
-      </w:r>
-      <w:proofErr w:type="gramEnd"/>
+        <w:t>**Figure 2. Covariate balance plot (“Love plot”)**</w:t>
+      </w:r>
+      <w:r>
+        <w:rPr>
+          <w:rFonts w:ascii="Menlo" w:eastAsia="Times New Roman" w:hAnsi="Menlo" w:cs="Menlo"/>
+          <w:color w:val="3B3B3B"/>
+          <w:kern w:val="0"/>
+          <w:sz w:val="18"/>
+          <w:szCs w:val="18"/>
+          <w14:ligatures w14:val="none"/>
+        </w:rPr>
+        <w:t xml:space="preserve">  </w:t>
+      </w:r>
+    </w:p>
+    <w:p>
+      <w:pPr>
+        <w:shd w:val="clear" w:color="auto" w:fill="FFFFFF"/>
+        <w:spacing w:after="0" w:line="270" w:lineRule="atLeast"/>
+        <w:rPr>
+          <w:rFonts w:ascii="Menlo" w:eastAsia="Times New Roman" w:hAnsi="Menlo" w:cs="Menlo"/>
+          <w:color w:val="3B3B3B"/>
+          <w:kern w:val="0"/>
+          <w:sz w:val="18"/>
+          <w:szCs w:val="18"/>
+          <w14:ligatures w14:val="none"/>
+        </w:rPr>
+      </w:pPr>
+      <w:r>
+        <w:rPr>
+          <w:rFonts w:ascii="Menlo" w:eastAsia="Times New Roman" w:hAnsi="Menlo" w:cs="Menlo"/>
+          <w:color w:val="3B3B3B"/>
+          <w:kern w:val="0"/>
+          <w:sz w:val="18"/>
+          <w:szCs w:val="18"/>
+          <w14:ligatures w14:val="none"/>
+        </w:rPr>
+        <w:t xml:space="preserve">   </w:t>
+      </w:r>
+      <w:r>
+        <w:rPr>
+          <w:rFonts w:ascii="Menlo" w:eastAsia="Times New Roman" w:hAnsi="Menlo" w:cs="Menlo"/>
+          <w:color w:val="0451A5"/>
+          <w:kern w:val="0"/>
+          <w:sz w:val="18"/>
+          <w:szCs w:val="18"/>
+          <w14:ligatures w14:val="none"/>
+        </w:rPr>
+        <w:t>-</w:t>
+      </w:r>
+      <w:r>
+        <w:rPr>
+          <w:rFonts w:ascii="Menlo" w:eastAsia="Times New Roman" w:hAnsi="Menlo" w:cs="Menlo"/>
+          <w:color w:val="3B3B3B"/>
+          <w:kern w:val="0"/>
+          <w:sz w:val="18"/>
+          <w:szCs w:val="18"/>
+          <w14:ligatures w14:val="none"/>
+        </w:rPr>
+        <w:t xml:space="preserve"> Standardized mean differences for matched variables before vs after matching.</w:t>
+      </w:r>
+    </w:p>
+    <w:p>
+      <w:pPr>
+        <w:shd w:val="clear" w:color="auto" w:fill="FFFFFF"/>
+        <w:spacing w:after="0" w:line="270" w:lineRule="atLeast"/>
+        <w:rPr>
+          <w:rFonts w:ascii="Menlo" w:eastAsia="Times New Roman" w:hAnsi="Menlo" w:cs="Menlo"/>
+          <w:color w:val="3B3B3B"/>
+          <w:kern w:val="0"/>
+          <w:sz w:val="18"/>
+          <w:szCs w:val="18"/>
+          <w14:ligatures w14:val="none"/>
+        </w:rPr>
+      </w:pPr>
+    </w:p>
+    <w:p>
+      <w:pPr>
+        <w:shd w:val="clear" w:color="auto" w:fill="FFFFFF"/>
+        <w:spacing w:after="0" w:line="270" w:lineRule="atLeast"/>
+        <w:rPr>
+          <w:rFonts w:ascii="Menlo" w:eastAsia="Times New Roman" w:hAnsi="Menlo" w:cs="Menlo"/>
+          <w:color w:val="3B3B3B"/>
+          <w:kern w:val="0"/>
+          <w:sz w:val="18"/>
+          <w:szCs w:val="18"/>
+          <w14:ligatures w14:val="none"/>
+        </w:rPr>
+      </w:pPr>
+      <w:r>
+        <w:rPr>
+          <w:rFonts w:ascii="Menlo" w:eastAsia="Times New Roman" w:hAnsi="Menlo" w:cs="Menlo"/>
+          <w:color w:val="0451A5"/>
+          <w:kern w:val="0"/>
+          <w:sz w:val="18"/>
+          <w:szCs w:val="18"/>
+          <w14:ligatures w14:val="none"/>
+        </w:rPr>
+        <w:t>3.</w:t>
+      </w:r>
+      <w:r>
+        <w:rPr>
+          <w:rFonts w:ascii="Menlo" w:eastAsia="Times New Roman" w:hAnsi="Menlo" w:cs="Menlo"/>
+          <w:color w:val="3B3B3B"/>
+          <w:kern w:val="0"/>
+          <w:sz w:val="18"/>
+          <w:szCs w:val="18"/>
+          <w14:ligatures w14:val="none"/>
+        </w:rPr>
+        <w:t xml:space="preserve"> </w:t>
+      </w:r>
       <w:r>
         <w:rPr>
           <w:rFonts w:ascii="Menlo" w:eastAsia="Times New Roman" w:hAnsi="Menlo" w:cs="Menlo"/>
@@ -2677,7 +2803,7 @@
           <w:szCs w:val="18"/>
           <w14:ligatures w14:val="none"/>
         </w:rPr>
-        <w:t>*</w:t>
+        <w:t>**Figure 3. Primary interaction plots (Cushing’s × Obesity)**</w:t>
       </w:r>
       <w:r>
         <w:rPr>
@@ -2735,7 +2861,7 @@
           <w:szCs w:val="18"/>
           <w14:ligatures w14:val="none"/>
         </w:rPr>
-        <w:t xml:space="preserve"> Source population → exclusions → final analytic sample per outcome.</w:t>
+        <w:t xml:space="preserve"> Panels for HbA1c, SBP, DBP, LDL-C, fasting glucose.  </w:t>
       </w:r>
     </w:p>
     <w:p>
@@ -2751,6 +2877,39 @@
           <w14:ligatures w14:val="none"/>
         </w:rPr>
       </w:pPr>
+      <w:r>
+        <w:rPr>
+          <w:rFonts w:ascii="Menlo" w:eastAsia="Times New Roman" w:hAnsi="Menlo" w:cs="Menlo"/>
+          <w:color w:val="3B3B3B"/>
+          <w:kern w:val="0"/>
+          <w:sz w:val="18"/>
+          <w:szCs w:val="18"/>
+          <w14:ligatures w14:val="none"/>
+        </w:rPr>
+        <w:t xml:space="preserve">   </w:t>
+      </w:r>
+      <w:r>
+        <w:rPr>
+          <w:rFonts w:ascii="Menlo" w:eastAsia="Times New Roman" w:hAnsi="Menlo" w:cs="Menlo"/>
+          <w:color w:val="0451A5"/>
+          <w:kern w:val="0"/>
+          <w:sz w:val="18"/>
+          <w:szCs w:val="18"/>
+          <w14:ligatures w14:val="none"/>
+        </w:rPr>
+        <w:t>-</w:t>
+      </w:r>
+      <w:r>
+        <w:rPr>
+          <w:rFonts w:ascii="Menlo" w:eastAsia="Times New Roman" w:hAnsi="Menlo" w:cs="Menlo"/>
+          <w:color w:val="3B3B3B"/>
+          <w:kern w:val="0"/>
+          <w:sz w:val="18"/>
+          <w:szCs w:val="18"/>
+          <w14:ligatures w14:val="none"/>
+        </w:rPr>
+        <w:t xml:space="preserve"> Y-axis: adjusted marginal mean (95% CI); X-axis: obesity stratum; color: Cushing’s vs Control.</w:t>
+      </w:r>
     </w:p>
     <w:p>
       <w:pPr>
@@ -2765,6 +2924,20 @@
           <w14:ligatures w14:val="none"/>
         </w:rPr>
       </w:pPr>
+    </w:p>
+    <w:p>
+      <w:pPr>
+        <w:shd w:val="clear" w:color="auto" w:fill="FFFFFF"/>
+        <w:spacing w:after="0" w:line="270" w:lineRule="atLeast"/>
+        <w:rPr>
+          <w:rFonts w:ascii="Menlo" w:eastAsia="Times New Roman" w:hAnsi="Menlo" w:cs="Menlo"/>
+          <w:color w:val="3B3B3B"/>
+          <w:kern w:val="0"/>
+          <w:sz w:val="18"/>
+          <w:szCs w:val="18"/>
+          <w14:ligatures w14:val="none"/>
+        </w:rPr>
+      </w:pPr>
       <w:r>
         <w:rPr>
           <w:rFonts w:ascii="Menlo" w:eastAsia="Times New Roman" w:hAnsi="Menlo" w:cs="Menlo"/>
@@ -2774,7 +2947,7 @@
           <w:szCs w:val="18"/>
           <w14:ligatures w14:val="none"/>
         </w:rPr>
-        <w:t>2.</w:t>
+        <w:t>4.</w:t>
       </w:r>
       <w:r>
         <w:rPr>
@@ -2798,9 +2971,116 @@
           <w:szCs w:val="18"/>
           <w14:ligatures w14:val="none"/>
         </w:rPr>
-        <w:t>**Figure 2. Covariate balance plot (“Love plot</w:t>
-      </w:r>
-      <w:proofErr w:type="gramStart"/>
+        <w:t>**Figure 4. Forest plot of interaction estimates**</w:t>
+      </w:r>
+      <w:r>
+        <w:rPr>
+          <w:rFonts w:ascii="Menlo" w:eastAsia="Times New Roman" w:hAnsi="Menlo" w:cs="Menlo"/>
+          <w:color w:val="3B3B3B"/>
+          <w:kern w:val="0"/>
+          <w:sz w:val="18"/>
+          <w:szCs w:val="18"/>
+          <w14:ligatures w14:val="none"/>
+        </w:rPr>
+        <w:t xml:space="preserve">  </w:t>
+      </w:r>
+    </w:p>
+    <w:p>
+      <w:pPr>
+        <w:shd w:val="clear" w:color="auto" w:fill="FFFFFF"/>
+        <w:spacing w:after="0" w:line="270" w:lineRule="atLeast"/>
+        <w:rPr>
+          <w:rFonts w:ascii="Menlo" w:eastAsia="Times New Roman" w:hAnsi="Menlo" w:cs="Menlo"/>
+          <w:color w:val="3B3B3B"/>
+          <w:kern w:val="0"/>
+          <w:sz w:val="18"/>
+          <w:szCs w:val="18"/>
+          <w14:ligatures w14:val="none"/>
+        </w:rPr>
+      </w:pPr>
+      <w:r>
+        <w:rPr>
+          <w:rFonts w:ascii="Menlo" w:eastAsia="Times New Roman" w:hAnsi="Menlo" w:cs="Menlo"/>
+          <w:color w:val="3B3B3B"/>
+          <w:kern w:val="0"/>
+          <w:sz w:val="18"/>
+          <w:szCs w:val="18"/>
+          <w14:ligatures w14:val="none"/>
+        </w:rPr>
+        <w:t xml:space="preserve">   </w:t>
+      </w:r>
+      <w:r>
+        <w:rPr>
+          <w:rFonts w:ascii="Menlo" w:eastAsia="Times New Roman" w:hAnsi="Menlo" w:cs="Menlo"/>
+          <w:color w:val="0451A5"/>
+          <w:kern w:val="0"/>
+          <w:sz w:val="18"/>
+          <w:szCs w:val="18"/>
+          <w14:ligatures w14:val="none"/>
+        </w:rPr>
+        <w:t>-</w:t>
+      </w:r>
+      <w:r>
+        <w:rPr>
+          <w:rFonts w:ascii="Menlo" w:eastAsia="Times New Roman" w:hAnsi="Menlo" w:cs="Menlo"/>
+          <w:color w:val="3B3B3B"/>
+          <w:kern w:val="0"/>
+          <w:sz w:val="18"/>
+          <w:szCs w:val="18"/>
+          <w14:ligatures w14:val="none"/>
+        </w:rPr>
+        <w:t xml:space="preserve"> For each outcome, plot difference-in-differences (interaction term) with 95% CI.</w:t>
+      </w:r>
+    </w:p>
+    <w:p>
+      <w:pPr>
+        <w:shd w:val="clear" w:color="auto" w:fill="FFFFFF"/>
+        <w:spacing w:after="0" w:line="270" w:lineRule="atLeast"/>
+        <w:rPr>
+          <w:rFonts w:ascii="Menlo" w:eastAsia="Times New Roman" w:hAnsi="Menlo" w:cs="Menlo"/>
+          <w:color w:val="3B3B3B"/>
+          <w:kern w:val="0"/>
+          <w:sz w:val="18"/>
+          <w:szCs w:val="18"/>
+          <w14:ligatures w14:val="none"/>
+        </w:rPr>
+      </w:pPr>
+    </w:p>
+    <w:p>
+      <w:pPr>
+        <w:shd w:val="clear" w:color="auto" w:fill="FFFFFF"/>
+        <w:spacing w:after="0" w:line="270" w:lineRule="atLeast"/>
+        <w:rPr>
+          <w:rFonts w:ascii="Menlo" w:eastAsia="Times New Roman" w:hAnsi="Menlo" w:cs="Menlo"/>
+          <w:color w:val="3B3B3B"/>
+          <w:kern w:val="0"/>
+          <w:sz w:val="18"/>
+          <w:szCs w:val="18"/>
+          <w14:ligatures w14:val="none"/>
+        </w:rPr>
+      </w:pPr>
+      <w:r>
+        <w:rPr>
+          <w:rFonts w:ascii="Menlo" w:eastAsia="Times New Roman" w:hAnsi="Menlo" w:cs="Menlo"/>
+          <w:color w:val="0451A5"/>
+          <w:kern w:val="0"/>
+          <w:sz w:val="18"/>
+          <w:szCs w:val="18"/>
+          <w14:ligatures w14:val="none"/>
+        </w:rPr>
+        <w:t>5.</w:t>
+      </w:r>
+      <w:r>
+        <w:rPr>
+          <w:rFonts w:ascii="Menlo" w:eastAsia="Times New Roman" w:hAnsi="Menlo" w:cs="Menlo"/>
+          <w:color w:val="3B3B3B"/>
+          <w:kern w:val="0"/>
+          <w:sz w:val="18"/>
+          <w:szCs w:val="18"/>
+          <w14:ligatures w14:val="none"/>
+        </w:rPr>
+        <w:t xml:space="preserve"> </w:t>
+      </w:r>
       <w:r>
         <w:rPr>
           <w:rFonts w:ascii="Menlo" w:eastAsia="Times New Roman" w:hAnsi="Menlo" w:cs="Menlo"/>
@@ -2812,9 +3092,157 @@
           <w:szCs w:val="18"/>
           <w14:ligatures w14:val="none"/>
         </w:rPr>
-        <w:t>”)*</w:t>
-      </w:r>
-      <w:proofErr w:type="gramEnd"/>
+        <w:t>**Figure 5 (optional). Outcome distributions by 2×2 groups**</w:t>
+      </w:r>
+      <w:r>
+        <w:rPr>
+          <w:rFonts w:ascii="Menlo" w:eastAsia="Times New Roman" w:hAnsi="Menlo" w:cs="Menlo"/>
+          <w:color w:val="3B3B3B"/>
+          <w:kern w:val="0"/>
+          <w:sz w:val="18"/>
+          <w:szCs w:val="18"/>
+          <w14:ligatures w14:val="none"/>
+        </w:rPr>
+        <w:t xml:space="preserve">  </w:t>
+      </w:r>
+    </w:p>
+    <w:p>
+      <w:pPr>
+        <w:shd w:val="clear" w:color="auto" w:fill="FFFFFF"/>
+        <w:spacing w:after="0" w:line="270" w:lineRule="atLeast"/>
+        <w:rPr>
+          <w:rFonts w:ascii="Menlo" w:eastAsia="Times New Roman" w:hAnsi="Menlo" w:cs="Menlo"/>
+          <w:color w:val="3B3B3B"/>
+          <w:kern w:val="0"/>
+          <w:sz w:val="18"/>
+          <w:szCs w:val="18"/>
+          <w14:ligatures w14:val="none"/>
+        </w:rPr>
+      </w:pPr>
+      <w:r>
+        <w:rPr>
+          <w:rFonts w:ascii="Menlo" w:eastAsia="Times New Roman" w:hAnsi="Menlo" w:cs="Menlo"/>
+          <w:color w:val="3B3B3B"/>
+          <w:kern w:val="0"/>
+          <w:sz w:val="18"/>
+          <w:szCs w:val="18"/>
+          <w14:ligatures w14:val="none"/>
+        </w:rPr>
+        <w:t xml:space="preserve">   </w:t>
+      </w:r>
+      <w:r>
+        <w:rPr>
+          <w:rFonts w:ascii="Menlo" w:eastAsia="Times New Roman" w:hAnsi="Menlo" w:cs="Menlo"/>
+          <w:color w:val="0451A5"/>
+          <w:kern w:val="0"/>
+          <w:sz w:val="18"/>
+          <w:szCs w:val="18"/>
+          <w14:ligatures w14:val="none"/>
+        </w:rPr>
+        <w:t>-</w:t>
+      </w:r>
+      <w:r>
+        <w:rPr>
+          <w:rFonts w:ascii="Menlo" w:eastAsia="Times New Roman" w:hAnsi="Menlo" w:cs="Menlo"/>
+          <w:color w:val="3B3B3B"/>
+          <w:kern w:val="0"/>
+          <w:sz w:val="18"/>
+          <w:szCs w:val="18"/>
+          <w14:ligatures w14:val="none"/>
+        </w:rPr>
+        <w:t xml:space="preserve"> Box/violin plots or ridge plots showing distribution shapes.</w:t>
+      </w:r>
+    </w:p>
+    <w:p>
+      <w:pPr>
+        <w:shd w:val="clear" w:color="auto" w:fill="FFFFFF"/>
+        <w:spacing w:after="0" w:line="270" w:lineRule="atLeast"/>
+        <w:rPr>
+          <w:rFonts w:ascii="Menlo" w:eastAsia="Times New Roman" w:hAnsi="Menlo" w:cs="Menlo"/>
+          <w:color w:val="3B3B3B"/>
+          <w:kern w:val="0"/>
+          <w:sz w:val="18"/>
+          <w:szCs w:val="18"/>
+          <w14:ligatures w14:val="none"/>
+        </w:rPr>
+      </w:pPr>
+    </w:p>
+    <w:p>
+      <w:pPr>
+        <w:shd w:val="clear" w:color="auto" w:fill="FFFFFF"/>
+        <w:spacing w:after="0" w:line="270" w:lineRule="atLeast"/>
+        <w:rPr>
+          <w:rFonts w:ascii="Menlo" w:eastAsia="Times New Roman" w:hAnsi="Menlo" w:cs="Menlo"/>
+          <w:color w:val="3B3B3B"/>
+          <w:kern w:val="0"/>
+          <w:sz w:val="18"/>
+          <w:szCs w:val="18"/>
+          <w14:ligatures w14:val="none"/>
+        </w:rPr>
+      </w:pPr>
+      <w:r>
+        <w:rPr>
+          <w:rFonts w:ascii="Menlo" w:eastAsia="Times New Roman" w:hAnsi="Menlo" w:cs="Menlo"/>
+          <w:b/>
+          <w:bCs/>
+          <w:color w:val="800000"/>
+          <w:kern w:val="0"/>
+          <w:sz w:val="18"/>
+          <w:szCs w:val="18"/>
+          <w14:ligatures w14:val="none"/>
+        </w:rPr>
+        <w:t>## Recommended Tables</w:t>
+      </w:r>
+    </w:p>
+    <w:p>
+      <w:pPr>
+        <w:shd w:val="clear" w:color="auto" w:fill="FFFFFF"/>
+        <w:spacing w:after="0" w:line="270" w:lineRule="atLeast"/>
+        <w:rPr>
+          <w:rFonts w:ascii="Menlo" w:eastAsia="Times New Roman" w:hAnsi="Menlo" w:cs="Menlo"/>
+          <w:color w:val="3B3B3B"/>
+          <w:kern w:val="0"/>
+          <w:sz w:val="18"/>
+          <w:szCs w:val="18"/>
+          <w14:ligatures w14:val="none"/>
+        </w:rPr>
+      </w:pPr>
+    </w:p>
+    <w:p>
+      <w:pPr>
+        <w:shd w:val="clear" w:color="auto" w:fill="FFFFFF"/>
+        <w:spacing w:after="0" w:line="270" w:lineRule="atLeast"/>
+        <w:rPr>
+          <w:rFonts w:ascii="Menlo" w:eastAsia="Times New Roman" w:hAnsi="Menlo" w:cs="Menlo"/>
+          <w:color w:val="3B3B3B"/>
+          <w:kern w:val="0"/>
+          <w:sz w:val="18"/>
+          <w:szCs w:val="18"/>
+          <w14:ligatures w14:val="none"/>
+        </w:rPr>
+      </w:pPr>
+      <w:r>
+        <w:rPr>
+          <w:rFonts w:ascii="Menlo" w:eastAsia="Times New Roman" w:hAnsi="Menlo" w:cs="Menlo"/>
+          <w:color w:val="0451A5"/>
+          <w:kern w:val="0"/>
+          <w:sz w:val="18"/>
+          <w:szCs w:val="18"/>
+          <w14:ligatures w14:val="none"/>
+        </w:rPr>
+        <w:t>1.</w:t>
+      </w:r>
+      <w:r>
+        <w:rPr>
+          <w:rFonts w:ascii="Menlo" w:eastAsia="Times New Roman" w:hAnsi="Menlo" w:cs="Menlo"/>
+          <w:color w:val="3B3B3B"/>
+          <w:kern w:val="0"/>
+          <w:sz w:val="18"/>
+          <w:szCs w:val="18"/>
+          <w14:ligatures w14:val="none"/>
+        </w:rPr>
+        <w:t xml:space="preserve"> </w:t>
+      </w:r>
       <w:r>
         <w:rPr>
           <w:rFonts w:ascii="Menlo" w:eastAsia="Times New Roman" w:hAnsi="Menlo" w:cs="Menlo"/>
@@ -2826,7 +3254,7 @@
           <w:szCs w:val="18"/>
           <w14:ligatures w14:val="none"/>
         </w:rPr>
-        <w:t>*</w:t>
+        <w:t>**Table 1. Baseline characteristics by Cushing’s status (matched sample)**</w:t>
       </w:r>
       <w:r>
         <w:rPr>
@@ -2884,7 +3312,29 @@
           <w:szCs w:val="18"/>
           <w14:ligatures w14:val="none"/>
         </w:rPr>
-        <w:t xml:space="preserve"> Standardized mean differences for matched variables before vs after matching.</w:t>
+        <w:t xml:space="preserve"> N, mean±SD or median [</w:t>
+      </w:r>
+      <w:r>
+        <w:rPr>
+          <w:rFonts w:ascii="Menlo" w:eastAsia="Times New Roman" w:hAnsi="Menlo" w:cs="Menlo"/>
+          <w:color w:val="A31515"/>
+          <w:kern w:val="0"/>
+          <w:sz w:val="18"/>
+          <w:szCs w:val="18"/>
+          <w14:ligatures w14:val="none"/>
+        </w:rPr>
+        <w:t>IQR</w:t>
+      </w:r>
+      <w:r>
+        <w:rPr>
+          <w:rFonts w:ascii="Menlo" w:eastAsia="Times New Roman" w:hAnsi="Menlo" w:cs="Menlo"/>
+          <w:color w:val="3B3B3B"/>
+          <w:kern w:val="0"/>
+          <w:sz w:val="18"/>
+          <w:szCs w:val="18"/>
+          <w14:ligatures w14:val="none"/>
+        </w:rPr>
+        <w:t>], standardized mean differences.</w:t>
       </w:r>
     </w:p>
     <w:p>
@@ -2923,7 +3373,7 @@
           <w:szCs w:val="18"/>
           <w14:ligatures w14:val="none"/>
         </w:rPr>
-        <w:t>3.</w:t>
+        <w:t>2.</w:t>
       </w:r>
       <w:r>
         <w:rPr>
@@ -2947,9 +3397,116 @@
           <w:szCs w:val="18"/>
           <w14:ligatures w14:val="none"/>
         </w:rPr>
-        <w:t xml:space="preserve">**Figure 3. Primary interaction plots (Cushing’s × </w:t>
-      </w:r>
-      <w:proofErr w:type="gramStart"/>
+        <w:t>**Table 2. Characteristics by 2×2 groups (Cushing’s × Obesity)**</w:t>
+      </w:r>
+      <w:r>
+        <w:rPr>
+          <w:rFonts w:ascii="Menlo" w:eastAsia="Times New Roman" w:hAnsi="Menlo" w:cs="Menlo"/>
+          <w:color w:val="3B3B3B"/>
+          <w:kern w:val="0"/>
+          <w:sz w:val="18"/>
+          <w:szCs w:val="18"/>
+          <w14:ligatures w14:val="none"/>
+        </w:rPr>
+        <w:t xml:space="preserve">  </w:t>
+      </w:r>
+    </w:p>
+    <w:p>
+      <w:pPr>
+        <w:shd w:val="clear" w:color="auto" w:fill="FFFFFF"/>
+        <w:spacing w:after="0" w:line="270" w:lineRule="atLeast"/>
+        <w:rPr>
+          <w:rFonts w:ascii="Menlo" w:eastAsia="Times New Roman" w:hAnsi="Menlo" w:cs="Menlo"/>
+          <w:color w:val="3B3B3B"/>
+          <w:kern w:val="0"/>
+          <w:sz w:val="18"/>
+          <w:szCs w:val="18"/>
+          <w14:ligatures w14:val="none"/>
+        </w:rPr>
+      </w:pPr>
+      <w:r>
+        <w:rPr>
+          <w:rFonts w:ascii="Menlo" w:eastAsia="Times New Roman" w:hAnsi="Menlo" w:cs="Menlo"/>
+          <w:color w:val="3B3B3B"/>
+          <w:kern w:val="0"/>
+          <w:sz w:val="18"/>
+          <w:szCs w:val="18"/>
+          <w14:ligatures w14:val="none"/>
+        </w:rPr>
+        <w:t xml:space="preserve">   </w:t>
+      </w:r>
+      <w:r>
+        <w:rPr>
+          <w:rFonts w:ascii="Menlo" w:eastAsia="Times New Roman" w:hAnsi="Menlo" w:cs="Menlo"/>
+          <w:color w:val="0451A5"/>
+          <w:kern w:val="0"/>
+          <w:sz w:val="18"/>
+          <w:szCs w:val="18"/>
+          <w14:ligatures w14:val="none"/>
+        </w:rPr>
+        <w:t>-</w:t>
+      </w:r>
+      <w:r>
+        <w:rPr>
+          <w:rFonts w:ascii="Menlo" w:eastAsia="Times New Roman" w:hAnsi="Menlo" w:cs="Menlo"/>
+          <w:color w:val="3B3B3B"/>
+          <w:kern w:val="0"/>
+          <w:sz w:val="18"/>
+          <w:szCs w:val="18"/>
+          <w14:ligatures w14:val="none"/>
+        </w:rPr>
+        <w:t xml:space="preserve"> Four columns: Lean-Control, Lean-Cushing’s, Obese-Control, Obese-Cushing’s.</w:t>
+      </w:r>
+    </w:p>
+    <w:p>
+      <w:pPr>
+        <w:shd w:val="clear" w:color="auto" w:fill="FFFFFF"/>
+        <w:spacing w:after="0" w:line="270" w:lineRule="atLeast"/>
+        <w:rPr>
+          <w:rFonts w:ascii="Menlo" w:eastAsia="Times New Roman" w:hAnsi="Menlo" w:cs="Menlo"/>
+          <w:color w:val="3B3B3B"/>
+          <w:kern w:val="0"/>
+          <w:sz w:val="18"/>
+          <w:szCs w:val="18"/>
+          <w14:ligatures w14:val="none"/>
+        </w:rPr>
+      </w:pPr>
+    </w:p>
+    <w:p>
+      <w:pPr>
+        <w:shd w:val="clear" w:color="auto" w:fill="FFFFFF"/>
+        <w:spacing w:after="0" w:line="270" w:lineRule="atLeast"/>
+        <w:rPr>
+          <w:rFonts w:ascii="Menlo" w:eastAsia="Times New Roman" w:hAnsi="Menlo" w:cs="Menlo"/>
+          <w:color w:val="3B3B3B"/>
+          <w:kern w:val="0"/>
+          <w:sz w:val="18"/>
+          <w:szCs w:val="18"/>
+          <w14:ligatures w14:val="none"/>
+        </w:rPr>
+      </w:pPr>
+      <w:r>
+        <w:rPr>
+          <w:rFonts w:ascii="Menlo" w:eastAsia="Times New Roman" w:hAnsi="Menlo" w:cs="Menlo"/>
+          <w:color w:val="0451A5"/>
+          <w:kern w:val="0"/>
+          <w:sz w:val="18"/>
+          <w:szCs w:val="18"/>
+          <w14:ligatures w14:val="none"/>
+        </w:rPr>
+        <w:t>3.</w:t>
+      </w:r>
+      <w:r>
+        <w:rPr>
+          <w:rFonts w:ascii="Menlo" w:eastAsia="Times New Roman" w:hAnsi="Menlo" w:cs="Menlo"/>
+          <w:color w:val="3B3B3B"/>
+          <w:kern w:val="0"/>
+          <w:sz w:val="18"/>
+          <w:szCs w:val="18"/>
+          <w14:ligatures w14:val="none"/>
+        </w:rPr>
+        <w:t xml:space="preserve"> </w:t>
+      </w:r>
       <w:r>
         <w:rPr>
           <w:rFonts w:ascii="Menlo" w:eastAsia="Times New Roman" w:hAnsi="Menlo" w:cs="Menlo"/>
@@ -2961,9 +3518,116 @@
           <w:szCs w:val="18"/>
           <w14:ligatures w14:val="none"/>
         </w:rPr>
-        <w:t>Obesity)*</w:t>
-      </w:r>
-      <w:proofErr w:type="gramEnd"/>
+        <w:t>**Table 3. Primary adjusted results with interaction**</w:t>
+      </w:r>
+      <w:r>
+        <w:rPr>
+          <w:rFonts w:ascii="Menlo" w:eastAsia="Times New Roman" w:hAnsi="Menlo" w:cs="Menlo"/>
+          <w:color w:val="3B3B3B"/>
+          <w:kern w:val="0"/>
+          <w:sz w:val="18"/>
+          <w:szCs w:val="18"/>
+          <w14:ligatures w14:val="none"/>
+        </w:rPr>
+        <w:t xml:space="preserve">  </w:t>
+      </w:r>
+    </w:p>
+    <w:p>
+      <w:pPr>
+        <w:shd w:val="clear" w:color="auto" w:fill="FFFFFF"/>
+        <w:spacing w:after="0" w:line="270" w:lineRule="atLeast"/>
+        <w:rPr>
+          <w:rFonts w:ascii="Menlo" w:eastAsia="Times New Roman" w:hAnsi="Menlo" w:cs="Menlo"/>
+          <w:color w:val="3B3B3B"/>
+          <w:kern w:val="0"/>
+          <w:sz w:val="18"/>
+          <w:szCs w:val="18"/>
+          <w14:ligatures w14:val="none"/>
+        </w:rPr>
+      </w:pPr>
+      <w:r>
+        <w:rPr>
+          <w:rFonts w:ascii="Menlo" w:eastAsia="Times New Roman" w:hAnsi="Menlo" w:cs="Menlo"/>
+          <w:color w:val="3B3B3B"/>
+          <w:kern w:val="0"/>
+          <w:sz w:val="18"/>
+          <w:szCs w:val="18"/>
+          <w14:ligatures w14:val="none"/>
+        </w:rPr>
+        <w:t xml:space="preserve">   </w:t>
+      </w:r>
+      <w:r>
+        <w:rPr>
+          <w:rFonts w:ascii="Menlo" w:eastAsia="Times New Roman" w:hAnsi="Menlo" w:cs="Menlo"/>
+          <w:color w:val="0451A5"/>
+          <w:kern w:val="0"/>
+          <w:sz w:val="18"/>
+          <w:szCs w:val="18"/>
+          <w14:ligatures w14:val="none"/>
+        </w:rPr>
+        <w:t>-</w:t>
+      </w:r>
+      <w:r>
+        <w:rPr>
+          <w:rFonts w:ascii="Menlo" w:eastAsia="Times New Roman" w:hAnsi="Menlo" w:cs="Menlo"/>
+          <w:color w:val="3B3B3B"/>
+          <w:kern w:val="0"/>
+          <w:sz w:val="18"/>
+          <w:szCs w:val="18"/>
+          <w14:ligatures w14:val="none"/>
+        </w:rPr>
+        <w:t xml:space="preserve"> Adjusted means by group; within-stratum differences; interaction estimate (95% CI, p-value).</w:t>
+      </w:r>
+    </w:p>
+    <w:p>
+      <w:pPr>
+        <w:shd w:val="clear" w:color="auto" w:fill="FFFFFF"/>
+        <w:spacing w:after="0" w:line="270" w:lineRule="atLeast"/>
+        <w:rPr>
+          <w:rFonts w:ascii="Menlo" w:eastAsia="Times New Roman" w:hAnsi="Menlo" w:cs="Menlo"/>
+          <w:color w:val="3B3B3B"/>
+          <w:kern w:val="0"/>
+          <w:sz w:val="18"/>
+          <w:szCs w:val="18"/>
+          <w14:ligatures w14:val="none"/>
+        </w:rPr>
+      </w:pPr>
+    </w:p>
+    <w:p>
+      <w:pPr>
+        <w:shd w:val="clear" w:color="auto" w:fill="FFFFFF"/>
+        <w:spacing w:after="0" w:line="270" w:lineRule="atLeast"/>
+        <w:rPr>
+          <w:rFonts w:ascii="Menlo" w:eastAsia="Times New Roman" w:hAnsi="Menlo" w:cs="Menlo"/>
+          <w:color w:val="3B3B3B"/>
+          <w:kern w:val="0"/>
+          <w:sz w:val="18"/>
+          <w:szCs w:val="18"/>
+          <w14:ligatures w14:val="none"/>
+        </w:rPr>
+      </w:pPr>
+      <w:r>
+        <w:rPr>
+          <w:rFonts w:ascii="Menlo" w:eastAsia="Times New Roman" w:hAnsi="Menlo" w:cs="Menlo"/>
+          <w:color w:val="0451A5"/>
+          <w:kern w:val="0"/>
+          <w:sz w:val="18"/>
+          <w:szCs w:val="18"/>
+          <w14:ligatures w14:val="none"/>
+        </w:rPr>
+        <w:t>4.</w:t>
+      </w:r>
+      <w:r>
+        <w:rPr>
+          <w:rFonts w:ascii="Menlo" w:eastAsia="Times New Roman" w:hAnsi="Menlo" w:cs="Menlo"/>
+          <w:color w:val="3B3B3B"/>
+          <w:kern w:val="0"/>
+          <w:sz w:val="18"/>
+          <w:szCs w:val="18"/>
+          <w14:ligatures w14:val="none"/>
+        </w:rPr>
+        <w:t xml:space="preserve"> </w:t>
+      </w:r>
       <w:r>
         <w:rPr>
           <w:rFonts w:ascii="Menlo" w:eastAsia="Times New Roman" w:hAnsi="Menlo" w:cs="Menlo"/>
@@ -2975,7 +3639,7 @@
           <w:szCs w:val="18"/>
           <w14:ligatures w14:val="none"/>
         </w:rPr>
-        <w:t>*</w:t>
+        <w:t>**Table 4. Sensitivity analyses**</w:t>
       </w:r>
       <w:r>
         <w:rPr>
@@ -3033,296 +3697,7 @@
           <w:szCs w:val="18"/>
           <w14:ligatures w14:val="none"/>
         </w:rPr>
-        <w:t xml:space="preserve"> Panels for HbA1c, SBP, DBP, LDL-C, fasting glucose.  </w:t>
-      </w:r>
-    </w:p>
-    <w:p>
-      <w:pPr>
-        <w:shd w:val="clear" w:color="auto" w:fill="FFFFFF"/>
-        <w:spacing w:after="0" w:line="270" w:lineRule="atLeast"/>
-        <w:rPr>
-          <w:rFonts w:ascii="Menlo" w:eastAsia="Times New Roman" w:hAnsi="Menlo" w:cs="Menlo"/>
-          <w:color w:val="3B3B3B"/>
-          <w:kern w:val="0"/>
-          <w:sz w:val="18"/>
-          <w:szCs w:val="18"/>
-          <w14:ligatures w14:val="none"/>
-        </w:rPr>
-      </w:pPr>
-      <w:r>
-        <w:rPr>
-          <w:rFonts w:ascii="Menlo" w:eastAsia="Times New Roman" w:hAnsi="Menlo" w:cs="Menlo"/>
-          <w:color w:val="3B3B3B"/>
-          <w:kern w:val="0"/>
-          <w:sz w:val="18"/>
-          <w:szCs w:val="18"/>
-          <w14:ligatures w14:val="none"/>
-        </w:rPr>
-        <w:t xml:space="preserve">   </w:t>
-      </w:r>
-      <w:r>
-        <w:rPr>
-          <w:rFonts w:ascii="Menlo" w:eastAsia="Times New Roman" w:hAnsi="Menlo" w:cs="Menlo"/>
-          <w:color w:val="0451A5"/>
-          <w:kern w:val="0"/>
-          <w:sz w:val="18"/>
-          <w:szCs w:val="18"/>
-          <w14:ligatures w14:val="none"/>
-        </w:rPr>
-        <w:t>-</w:t>
-      </w:r>
-      <w:r>
-        <w:rPr>
-          <w:rFonts w:ascii="Menlo" w:eastAsia="Times New Roman" w:hAnsi="Menlo" w:cs="Menlo"/>
-          <w:color w:val="3B3B3B"/>
-          <w:kern w:val="0"/>
-          <w:sz w:val="18"/>
-          <w:szCs w:val="18"/>
-          <w14:ligatures w14:val="none"/>
-        </w:rPr>
-        <w:t xml:space="preserve"> Y-axis: adjusted marginal mean (95% CI); X-axis: obesity stratum; color: Cushing’s vs Control.</w:t>
-      </w:r>
-    </w:p>
-    <w:p>
-      <w:pPr>
-        <w:shd w:val="clear" w:color="auto" w:fill="FFFFFF"/>
-        <w:spacing w:after="0" w:line="270" w:lineRule="atLeast"/>
-        <w:rPr>
-          <w:rFonts w:ascii="Menlo" w:eastAsia="Times New Roman" w:hAnsi="Menlo" w:cs="Menlo"/>
-          <w:color w:val="3B3B3B"/>
-          <w:kern w:val="0"/>
-          <w:sz w:val="18"/>
-          <w:szCs w:val="18"/>
-          <w14:ligatures w14:val="none"/>
-        </w:rPr>
-      </w:pPr>
-    </w:p>
-    <w:p>
-      <w:pPr>
-        <w:shd w:val="clear" w:color="auto" w:fill="FFFFFF"/>
-        <w:spacing w:after="0" w:line="270" w:lineRule="atLeast"/>
-        <w:rPr>
-          <w:rFonts w:ascii="Menlo" w:eastAsia="Times New Roman" w:hAnsi="Menlo" w:cs="Menlo"/>
-          <w:color w:val="3B3B3B"/>
-          <w:kern w:val="0"/>
-          <w:sz w:val="18"/>
-          <w:szCs w:val="18"/>
-          <w14:ligatures w14:val="none"/>
-        </w:rPr>
-      </w:pPr>
-      <w:r>
-        <w:rPr>
-          <w:rFonts w:ascii="Menlo" w:eastAsia="Times New Roman" w:hAnsi="Menlo" w:cs="Menlo"/>
-          <w:color w:val="0451A5"/>
-          <w:kern w:val="0"/>
-          <w:sz w:val="18"/>
-          <w:szCs w:val="18"/>
-          <w14:ligatures w14:val="none"/>
-        </w:rPr>
-        <w:t>4.</w:t>
-      </w:r>
-      <w:r>
-        <w:rPr>
-          <w:rFonts w:ascii="Menlo" w:eastAsia="Times New Roman" w:hAnsi="Menlo" w:cs="Menlo"/>
-          <w:color w:val="3B3B3B"/>
-          <w:kern w:val="0"/>
-          <w:sz w:val="18"/>
-          <w:szCs w:val="18"/>
-          <w14:ligatures w14:val="none"/>
-        </w:rPr>
-        <w:t xml:space="preserve"> </w:t>
-      </w:r>
-      <w:r>
-        <w:rPr>
-          <w:rFonts w:ascii="Menlo" w:eastAsia="Times New Roman" w:hAnsi="Menlo" w:cs="Menlo"/>
-          <w:b/>
-          <w:bCs/>
-          <w:color w:val="000080"/>
-          <w:kern w:val="0"/>
-          <w:sz w:val="18"/>
-          <w:szCs w:val="18"/>
-          <w14:ligatures w14:val="none"/>
-        </w:rPr>
-        <w:t>**Figure 4. Forest plot of interaction estimates**</w:t>
-      </w:r>
-      <w:r>
-        <w:rPr>
-          <w:rFonts w:ascii="Menlo" w:eastAsia="Times New Roman" w:hAnsi="Menlo" w:cs="Menlo"/>
-          <w:color w:val="3B3B3B"/>
-          <w:kern w:val="0"/>
-          <w:sz w:val="18"/>
-          <w:szCs w:val="18"/>
-          <w14:ligatures w14:val="none"/>
-        </w:rPr>
-        <w:t xml:space="preserve">  </w:t>
-      </w:r>
-    </w:p>
-    <w:p>
-      <w:pPr>
-        <w:shd w:val="clear" w:color="auto" w:fill="FFFFFF"/>
-        <w:spacing w:after="0" w:line="270" w:lineRule="atLeast"/>
-        <w:rPr>
-          <w:rFonts w:ascii="Menlo" w:eastAsia="Times New Roman" w:hAnsi="Menlo" w:cs="Menlo"/>
-          <w:color w:val="3B3B3B"/>
-          <w:kern w:val="0"/>
-          <w:sz w:val="18"/>
-          <w:szCs w:val="18"/>
-          <w14:ligatures w14:val="none"/>
-        </w:rPr>
-      </w:pPr>
-      <w:r>
-        <w:rPr>
-          <w:rFonts w:ascii="Menlo" w:eastAsia="Times New Roman" w:hAnsi="Menlo" w:cs="Menlo"/>
-          <w:color w:val="3B3B3B"/>
-          <w:kern w:val="0"/>
-          <w:sz w:val="18"/>
-          <w:szCs w:val="18"/>
-          <w14:ligatures w14:val="none"/>
-        </w:rPr>
-        <w:t xml:space="preserve">   </w:t>
-      </w:r>
-      <w:r>
-        <w:rPr>
-          <w:rFonts w:ascii="Menlo" w:eastAsia="Times New Roman" w:hAnsi="Menlo" w:cs="Menlo"/>
-          <w:color w:val="0451A5"/>
-          <w:kern w:val="0"/>
-          <w:sz w:val="18"/>
-          <w:szCs w:val="18"/>
-          <w14:ligatures w14:val="none"/>
-        </w:rPr>
-        <w:t>-</w:t>
-      </w:r>
-      <w:r>
-        <w:rPr>
-          <w:rFonts w:ascii="Menlo" w:eastAsia="Times New Roman" w:hAnsi="Menlo" w:cs="Menlo"/>
-          <w:color w:val="3B3B3B"/>
-          <w:kern w:val="0"/>
-          <w:sz w:val="18"/>
-          <w:szCs w:val="18"/>
-          <w14:ligatures w14:val="none"/>
-        </w:rPr>
-        <w:t xml:space="preserve"> For each outcome, plot difference-in-differences (interaction term) with 95% CI.</w:t>
-      </w:r>
-    </w:p>
-    <w:p>
-      <w:pPr>
-        <w:shd w:val="clear" w:color="auto" w:fill="FFFFFF"/>
-        <w:spacing w:after="0" w:line="270" w:lineRule="atLeast"/>
-        <w:rPr>
-          <w:rFonts w:ascii="Menlo" w:eastAsia="Times New Roman" w:hAnsi="Menlo" w:cs="Menlo"/>
-          <w:color w:val="3B3B3B"/>
-          <w:kern w:val="0"/>
-          <w:sz w:val="18"/>
-          <w:szCs w:val="18"/>
-          <w14:ligatures w14:val="none"/>
-        </w:rPr>
-      </w:pPr>
-    </w:p>
-    <w:p>
-      <w:pPr>
-        <w:shd w:val="clear" w:color="auto" w:fill="FFFFFF"/>
-        <w:spacing w:after="0" w:line="270" w:lineRule="atLeast"/>
-        <w:rPr>
-          <w:rFonts w:ascii="Menlo" w:eastAsia="Times New Roman" w:hAnsi="Menlo" w:cs="Menlo"/>
-          <w:color w:val="3B3B3B"/>
-          <w:kern w:val="0"/>
-          <w:sz w:val="18"/>
-          <w:szCs w:val="18"/>
-          <w14:ligatures w14:val="none"/>
-        </w:rPr>
-      </w:pPr>
-      <w:r>
-        <w:rPr>
-          <w:rFonts w:ascii="Menlo" w:eastAsia="Times New Roman" w:hAnsi="Menlo" w:cs="Menlo"/>
-          <w:color w:val="0451A5"/>
-          <w:kern w:val="0"/>
-          <w:sz w:val="18"/>
-          <w:szCs w:val="18"/>
-          <w14:ligatures w14:val="none"/>
-        </w:rPr>
-        <w:t>5.</w:t>
-      </w:r>
-      <w:r>
-        <w:rPr>
-          <w:rFonts w:ascii="Menlo" w:eastAsia="Times New Roman" w:hAnsi="Menlo" w:cs="Menlo"/>
-          <w:color w:val="3B3B3B"/>
-          <w:kern w:val="0"/>
-          <w:sz w:val="18"/>
-          <w:szCs w:val="18"/>
-          <w14:ligatures w14:val="none"/>
-        </w:rPr>
-        <w:t xml:space="preserve"> </w:t>
-      </w:r>
-      <w:r>
-        <w:rPr>
-          <w:rFonts w:ascii="Menlo" w:eastAsia="Times New Roman" w:hAnsi="Menlo" w:cs="Menlo"/>
-          <w:b/>
-          <w:bCs/>
-          <w:color w:val="000080"/>
-          <w:kern w:val="0"/>
-          <w:sz w:val="18"/>
-          <w:szCs w:val="18"/>
-          <w14:ligatures w14:val="none"/>
-        </w:rPr>
-        <w:t>**Figure 5 (optional). Outcome distributions by 2×2 groups**</w:t>
-      </w:r>
-      <w:r>
-        <w:rPr>
-          <w:rFonts w:ascii="Menlo" w:eastAsia="Times New Roman" w:hAnsi="Menlo" w:cs="Menlo"/>
-          <w:color w:val="3B3B3B"/>
-          <w:kern w:val="0"/>
-          <w:sz w:val="18"/>
-          <w:szCs w:val="18"/>
-          <w14:ligatures w14:val="none"/>
-        </w:rPr>
-        <w:t xml:space="preserve">  </w:t>
-      </w:r>
-    </w:p>
-    <w:p>
-      <w:pPr>
-        <w:shd w:val="clear" w:color="auto" w:fill="FFFFFF"/>
-        <w:spacing w:after="0" w:line="270" w:lineRule="atLeast"/>
-        <w:rPr>
-          <w:rFonts w:ascii="Menlo" w:eastAsia="Times New Roman" w:hAnsi="Menlo" w:cs="Menlo"/>
-          <w:color w:val="3B3B3B"/>
-          <w:kern w:val="0"/>
-          <w:sz w:val="18"/>
-          <w:szCs w:val="18"/>
-          <w14:ligatures w14:val="none"/>
-        </w:rPr>
-      </w:pPr>
-      <w:r>
-        <w:rPr>
-          <w:rFonts w:ascii="Menlo" w:eastAsia="Times New Roman" w:hAnsi="Menlo" w:cs="Menlo"/>
-          <w:color w:val="3B3B3B"/>
-          <w:kern w:val="0"/>
-          <w:sz w:val="18"/>
-          <w:szCs w:val="18"/>
-          <w14:ligatures w14:val="none"/>
-        </w:rPr>
-        <w:t xml:space="preserve">   </w:t>
-      </w:r>
-      <w:r>
-        <w:rPr>
-          <w:rFonts w:ascii="Menlo" w:eastAsia="Times New Roman" w:hAnsi="Menlo" w:cs="Menlo"/>
-          <w:color w:val="0451A5"/>
-          <w:kern w:val="0"/>
-          <w:sz w:val="18"/>
-          <w:szCs w:val="18"/>
-          <w14:ligatures w14:val="none"/>
-        </w:rPr>
-        <w:t>-</w:t>
-      </w:r>
-      <w:r>
-        <w:rPr>
-          <w:rFonts w:ascii="Menlo" w:eastAsia="Times New Roman" w:hAnsi="Menlo" w:cs="Menlo"/>
-          <w:color w:val="3B3B3B"/>
-          <w:kern w:val="0"/>
-          <w:sz w:val="18"/>
-          <w:szCs w:val="18"/>
-          <w14:ligatures w14:val="none"/>
-        </w:rPr>
-        <w:t xml:space="preserve"> Box/violin plots or ridge plots showing distribution shapes.</w:t>
+        <w:t xml:space="preserve"> Interaction estimates across alternative specifications (different calipers, continuous BMI, etc.).</w:t>
       </w:r>
     </w:p>
     <w:p>
@@ -3363,7 +3738,7 @@
           <w:szCs w:val="18"/>
           <w14:ligatures w14:val="none"/>
         </w:rPr>
-        <w:t>## Recommended Tables</w:t>
+        <w:t>## Supplementary Material (Examples)</w:t>
       </w:r>
     </w:p>
     <w:p>
@@ -3402,70 +3777,18 @@
           <w:szCs w:val="18"/>
           <w14:ligatures w14:val="none"/>
         </w:rPr>
-        <w:t>1.</w:t>
-      </w:r>
-      <w:r>
-        <w:rPr>
-          <w:rFonts w:ascii="Menlo" w:eastAsia="Times New Roman" w:hAnsi="Menlo" w:cs="Menlo"/>
-          <w:color w:val="3B3B3B"/>
-          <w:kern w:val="0"/>
-          <w:sz w:val="18"/>
-          <w:szCs w:val="18"/>
-          <w14:ligatures w14:val="none"/>
-        </w:rPr>
-        <w:t xml:space="preserve"> </w:t>
-      </w:r>
-      <w:r>
-        <w:rPr>
-          <w:rFonts w:ascii="Menlo" w:eastAsia="Times New Roman" w:hAnsi="Menlo" w:cs="Menlo"/>
-          <w:b/>
-          <w:bCs/>
-          <w:color w:val="000080"/>
-          <w:kern w:val="0"/>
-          <w:sz w:val="18"/>
-          <w:szCs w:val="18"/>
-          <w14:ligatures w14:val="none"/>
-        </w:rPr>
-        <w:t xml:space="preserve">**Table 1. Baseline characteristics by Cushing’s status (matched </w:t>
-      </w:r>
-      <w:proofErr w:type="gramStart"/>
-      <w:r>
-        <w:rPr>
-          <w:rFonts w:ascii="Menlo" w:eastAsia="Times New Roman" w:hAnsi="Menlo" w:cs="Menlo"/>
-          <w:b/>
-          <w:bCs/>
-          <w:color w:val="000080"/>
-          <w:kern w:val="0"/>
-          <w:sz w:val="18"/>
-          <w:szCs w:val="18"/>
-          <w14:ligatures w14:val="none"/>
-        </w:rPr>
-        <w:t>sample)*</w:t>
-      </w:r>
-      <w:proofErr w:type="gramEnd"/>
-      <w:r>
-        <w:rPr>
-          <w:rFonts w:ascii="Menlo" w:eastAsia="Times New Roman" w:hAnsi="Menlo" w:cs="Menlo"/>
-          <w:b/>
-          <w:bCs/>
-          <w:color w:val="000080"/>
-          <w:kern w:val="0"/>
-          <w:sz w:val="18"/>
-          <w:szCs w:val="18"/>
-          <w14:ligatures w14:val="none"/>
-        </w:rPr>
-        <w:t>*</w:t>
-      </w:r>
-      <w:r>
-        <w:rPr>
-          <w:rFonts w:ascii="Menlo" w:eastAsia="Times New Roman" w:hAnsi="Menlo" w:cs="Menlo"/>
-          <w:color w:val="3B3B3B"/>
-          <w:kern w:val="0"/>
-          <w:sz w:val="18"/>
-          <w:szCs w:val="18"/>
-          <w14:ligatures w14:val="none"/>
-        </w:rPr>
-        <w:t xml:space="preserve">  </w:t>
+        <w:t>-</w:t>
+      </w:r>
+      <w:r>
+        <w:rPr>
+          <w:rFonts w:ascii="Menlo" w:eastAsia="Times New Roman" w:hAnsi="Menlo" w:cs="Menlo"/>
+          <w:color w:val="3B3B3B"/>
+          <w:kern w:val="0"/>
+          <w:sz w:val="18"/>
+          <w:szCs w:val="18"/>
+          <w14:ligatures w14:val="none"/>
+        </w:rPr>
+        <w:t xml:space="preserve"> eFigure 1. Detailed flow diagram per outcome.</w:t>
       </w:r>
     </w:p>
     <w:p>
@@ -3484,17 +3807,6 @@
       <w:r>
         <w:rPr>
           <w:rFonts w:ascii="Menlo" w:eastAsia="Times New Roman" w:hAnsi="Menlo" w:cs="Menlo"/>
-          <w:color w:val="3B3B3B"/>
-          <w:kern w:val="0"/>
-          <w:sz w:val="18"/>
-          <w:szCs w:val="18"/>
-          <w14:ligatures w14:val="none"/>
-        </w:rPr>
-        <w:t xml:space="preserve">   </w:t>
-      </w:r>
-      <w:r>
-        <w:rPr>
-          <w:rFonts w:ascii="Menlo" w:eastAsia="Times New Roman" w:hAnsi="Menlo" w:cs="Menlo"/>
           <w:color w:val="0451A5"/>
           <w:kern w:val="0"/>
           <w:sz w:val="18"/>
@@ -3512,53 +3824,7 @@
           <w:szCs w:val="18"/>
           <w14:ligatures w14:val="none"/>
         </w:rPr>
-        <w:t xml:space="preserve"> N, </w:t>
-      </w:r>
-      <w:proofErr w:type="spellStart"/>
-      <w:r>
-        <w:rPr>
-          <w:rFonts w:ascii="Menlo" w:eastAsia="Times New Roman" w:hAnsi="Menlo" w:cs="Menlo"/>
-          <w:color w:val="3B3B3B"/>
-          <w:kern w:val="0"/>
-          <w:sz w:val="18"/>
-          <w:szCs w:val="18"/>
-          <w14:ligatures w14:val="none"/>
-        </w:rPr>
-        <w:t>mean±SD</w:t>
-      </w:r>
-      <w:proofErr w:type="spellEnd"/>
-      <w:r>
-        <w:rPr>
-          <w:rFonts w:ascii="Menlo" w:eastAsia="Times New Roman" w:hAnsi="Menlo" w:cs="Menlo"/>
-          <w:color w:val="3B3B3B"/>
-          <w:kern w:val="0"/>
-          <w:sz w:val="18"/>
-          <w:szCs w:val="18"/>
-          <w14:ligatures w14:val="none"/>
-        </w:rPr>
-        <w:t xml:space="preserve"> or median [</w:t>
-      </w:r>
-      <w:r>
-        <w:rPr>
-          <w:rFonts w:ascii="Menlo" w:eastAsia="Times New Roman" w:hAnsi="Menlo" w:cs="Menlo"/>
-          <w:color w:val="A31515"/>
-          <w:kern w:val="0"/>
-          <w:sz w:val="18"/>
-          <w:szCs w:val="18"/>
-          <w14:ligatures w14:val="none"/>
-        </w:rPr>
-        <w:t>IQR</w:t>
-      </w:r>
-      <w:r>
-        <w:rPr>
-          <w:rFonts w:ascii="Menlo" w:eastAsia="Times New Roman" w:hAnsi="Menlo" w:cs="Menlo"/>
-          <w:color w:val="3B3B3B"/>
-          <w:kern w:val="0"/>
-          <w:sz w:val="18"/>
-          <w:szCs w:val="18"/>
-          <w14:ligatures w14:val="none"/>
-        </w:rPr>
-        <w:t>], standardized mean differences.</w:t>
+        <w:t xml:space="preserve"> eFigure 2. Additional balance plots.</w:t>
       </w:r>
     </w:p>
     <w:p>
@@ -3574,6 +3840,28 @@
           <w14:ligatures w14:val="none"/>
         </w:rPr>
       </w:pPr>
+      <w:r>
+        <w:rPr>
+          <w:rFonts w:ascii="Menlo" w:eastAsia="Times New Roman" w:hAnsi="Menlo" w:cs="Menlo"/>
+          <w:color w:val="0451A5"/>
+          <w:kern w:val="0"/>
+          <w:sz w:val="18"/>
+          <w:szCs w:val="18"/>
+          <w14:ligatures w14:val="none"/>
+        </w:rPr>
+        <w:t>-</w:t>
+      </w:r>
+      <w:r>
+        <w:rPr>
+          <w:rFonts w:ascii="Menlo" w:eastAsia="Times New Roman" w:hAnsi="Menlo" w:cs="Menlo"/>
+          <w:color w:val="3B3B3B"/>
+          <w:kern w:val="0"/>
+          <w:sz w:val="18"/>
+          <w:szCs w:val="18"/>
+          <w14:ligatures w14:val="none"/>
+        </w:rPr>
+        <w:t xml:space="preserve"> eFigure 3. DAG of confounding.</w:t>
+      </w:r>
     </w:p>
     <w:p>
       <w:pPr>
@@ -3597,70 +3885,18 @@
           <w:szCs w:val="18"/>
           <w14:ligatures w14:val="none"/>
         </w:rPr>
-        <w:t>2.</w:t>
-      </w:r>
-      <w:r>
-        <w:rPr>
-          <w:rFonts w:ascii="Menlo" w:eastAsia="Times New Roman" w:hAnsi="Menlo" w:cs="Menlo"/>
-          <w:color w:val="3B3B3B"/>
-          <w:kern w:val="0"/>
-          <w:sz w:val="18"/>
-          <w:szCs w:val="18"/>
-          <w14:ligatures w14:val="none"/>
-        </w:rPr>
-        <w:t xml:space="preserve"> </w:t>
-      </w:r>
-      <w:r>
-        <w:rPr>
-          <w:rFonts w:ascii="Menlo" w:eastAsia="Times New Roman" w:hAnsi="Menlo" w:cs="Menlo"/>
-          <w:b/>
-          <w:bCs/>
-          <w:color w:val="000080"/>
-          <w:kern w:val="0"/>
-          <w:sz w:val="18"/>
-          <w:szCs w:val="18"/>
-          <w14:ligatures w14:val="none"/>
-        </w:rPr>
-        <w:t xml:space="preserve">**Table 2. Characteristics by 2×2 groups (Cushing’s × </w:t>
-      </w:r>
-      <w:proofErr w:type="gramStart"/>
-      <w:r>
-        <w:rPr>
-          <w:rFonts w:ascii="Menlo" w:eastAsia="Times New Roman" w:hAnsi="Menlo" w:cs="Menlo"/>
-          <w:b/>
-          <w:bCs/>
-          <w:color w:val="000080"/>
-          <w:kern w:val="0"/>
-          <w:sz w:val="18"/>
-          <w:szCs w:val="18"/>
-          <w14:ligatures w14:val="none"/>
-        </w:rPr>
-        <w:t>Obesity)*</w:t>
-      </w:r>
-      <w:proofErr w:type="gramEnd"/>
-      <w:r>
-        <w:rPr>
-          <w:rFonts w:ascii="Menlo" w:eastAsia="Times New Roman" w:hAnsi="Menlo" w:cs="Menlo"/>
-          <w:b/>
-          <w:bCs/>
-          <w:color w:val="000080"/>
-          <w:kern w:val="0"/>
-          <w:sz w:val="18"/>
-          <w:szCs w:val="18"/>
-          <w14:ligatures w14:val="none"/>
-        </w:rPr>
-        <w:t>*</w:t>
-      </w:r>
-      <w:r>
-        <w:rPr>
-          <w:rFonts w:ascii="Menlo" w:eastAsia="Times New Roman" w:hAnsi="Menlo" w:cs="Menlo"/>
-          <w:color w:val="3B3B3B"/>
-          <w:kern w:val="0"/>
-          <w:sz w:val="18"/>
-          <w:szCs w:val="18"/>
-          <w14:ligatures w14:val="none"/>
-        </w:rPr>
-        <w:t xml:space="preserve">  </w:t>
+        <w:t>-</w:t>
+      </w:r>
+      <w:r>
+        <w:rPr>
+          <w:rFonts w:ascii="Menlo" w:eastAsia="Times New Roman" w:hAnsi="Menlo" w:cs="Menlo"/>
+          <w:color w:val="3B3B3B"/>
+          <w:kern w:val="0"/>
+          <w:sz w:val="18"/>
+          <w:szCs w:val="18"/>
+          <w14:ligatures w14:val="none"/>
+        </w:rPr>
+        <w:t xml:space="preserve"> eTable 1. Variable definitions.</w:t>
       </w:r>
     </w:p>
     <w:p>
@@ -3679,17 +3915,6 @@
       <w:r>
         <w:rPr>
           <w:rFonts w:ascii="Menlo" w:eastAsia="Times New Roman" w:hAnsi="Menlo" w:cs="Menlo"/>
-          <w:color w:val="3B3B3B"/>
-          <w:kern w:val="0"/>
-          <w:sz w:val="18"/>
-          <w:szCs w:val="18"/>
-          <w14:ligatures w14:val="none"/>
-        </w:rPr>
-        <w:t xml:space="preserve">   </w:t>
-      </w:r>
-      <w:r>
-        <w:rPr>
-          <w:rFonts w:ascii="Menlo" w:eastAsia="Times New Roman" w:hAnsi="Menlo" w:cs="Menlo"/>
           <w:color w:val="0451A5"/>
           <w:kern w:val="0"/>
           <w:sz w:val="18"/>
@@ -3707,7 +3932,7 @@
           <w:szCs w:val="18"/>
           <w14:ligatures w14:val="none"/>
         </w:rPr>
-        <w:t xml:space="preserve"> Four columns: Lean-Control, Lean-Cushing’s, Obese-Control, Obese-Cushing’s.</w:t>
+        <w:t xml:space="preserve"> eTable 2. Full baseline table.</w:t>
       </w:r>
     </w:p>
     <w:p>
@@ -3723,6 +3948,28 @@
           <w14:ligatures w14:val="none"/>
         </w:rPr>
       </w:pPr>
+      <w:r>
+        <w:rPr>
+          <w:rFonts w:ascii="Menlo" w:eastAsia="Times New Roman" w:hAnsi="Menlo" w:cs="Menlo"/>
+          <w:color w:val="0451A5"/>
+          <w:kern w:val="0"/>
+          <w:sz w:val="18"/>
+          <w:szCs w:val="18"/>
+          <w14:ligatures w14:val="none"/>
+        </w:rPr>
+        <w:t>-</w:t>
+      </w:r>
+      <w:r>
+        <w:rPr>
+          <w:rFonts w:ascii="Menlo" w:eastAsia="Times New Roman" w:hAnsi="Menlo" w:cs="Menlo"/>
+          <w:color w:val="3B3B3B"/>
+          <w:kern w:val="0"/>
+          <w:sz w:val="18"/>
+          <w:szCs w:val="18"/>
+          <w14:ligatures w14:val="none"/>
+        </w:rPr>
+        <w:t xml:space="preserve"> eTable 3. Unadjusted outcome comparisons.</w:t>
+      </w:r>
     </w:p>
     <w:p>
       <w:pPr>
@@ -3746,42 +3993,18 @@
           <w:szCs w:val="18"/>
           <w14:ligatures w14:val="none"/>
         </w:rPr>
-        <w:t>3.</w:t>
-      </w:r>
-      <w:r>
-        <w:rPr>
-          <w:rFonts w:ascii="Menlo" w:eastAsia="Times New Roman" w:hAnsi="Menlo" w:cs="Menlo"/>
-          <w:color w:val="3B3B3B"/>
-          <w:kern w:val="0"/>
-          <w:sz w:val="18"/>
-          <w:szCs w:val="18"/>
-          <w14:ligatures w14:val="none"/>
-        </w:rPr>
-        <w:t xml:space="preserve"> </w:t>
-      </w:r>
-      <w:r>
-        <w:rPr>
-          <w:rFonts w:ascii="Menlo" w:eastAsia="Times New Roman" w:hAnsi="Menlo" w:cs="Menlo"/>
-          <w:b/>
-          <w:bCs/>
-          <w:color w:val="000080"/>
-          <w:kern w:val="0"/>
-          <w:sz w:val="18"/>
-          <w:szCs w:val="18"/>
-          <w14:ligatures w14:val="none"/>
-        </w:rPr>
-        <w:t>**Table 3. Primary adjusted results with interaction**</w:t>
-      </w:r>
-      <w:r>
-        <w:rPr>
-          <w:rFonts w:ascii="Menlo" w:eastAsia="Times New Roman" w:hAnsi="Menlo" w:cs="Menlo"/>
-          <w:color w:val="3B3B3B"/>
-          <w:kern w:val="0"/>
-          <w:sz w:val="18"/>
-          <w:szCs w:val="18"/>
-          <w14:ligatures w14:val="none"/>
-        </w:rPr>
-        <w:t xml:space="preserve">  </w:t>
+        <w:t>-</w:t>
+      </w:r>
+      <w:r>
+        <w:rPr>
+          <w:rFonts w:ascii="Menlo" w:eastAsia="Times New Roman" w:hAnsi="Menlo" w:cs="Menlo"/>
+          <w:color w:val="3B3B3B"/>
+          <w:kern w:val="0"/>
+          <w:sz w:val="18"/>
+          <w:szCs w:val="18"/>
+          <w14:ligatures w14:val="none"/>
+        </w:rPr>
+        <w:t xml:space="preserve"> eTable 4. Model diagnostics.</w:t>
       </w:r>
     </w:p>
     <w:p>
@@ -3800,17 +4023,6 @@
       <w:r>
         <w:rPr>
           <w:rFonts w:ascii="Menlo" w:eastAsia="Times New Roman" w:hAnsi="Menlo" w:cs="Menlo"/>
-          <w:color w:val="3B3B3B"/>
-          <w:kern w:val="0"/>
-          <w:sz w:val="18"/>
-          <w:szCs w:val="18"/>
-          <w14:ligatures w14:val="none"/>
-        </w:rPr>
-        <w:t xml:space="preserve">   </w:t>
-      </w:r>
-      <w:r>
-        <w:rPr>
-          <w:rFonts w:ascii="Menlo" w:eastAsia="Times New Roman" w:hAnsi="Menlo" w:cs="Menlo"/>
           <w:color w:val="0451A5"/>
           <w:kern w:val="0"/>
           <w:sz w:val="18"/>
@@ -3828,7 +4040,7 @@
           <w:szCs w:val="18"/>
           <w14:ligatures w14:val="none"/>
         </w:rPr>
-        <w:t xml:space="preserve"> Adjusted means by group; within-stratum differences; interaction estimate (95% CI, p-value).</w:t>
+        <w:t xml:space="preserve"> eTable 5. Missing data patterns and imputation specs.</w:t>
       </w:r>
     </w:p>
     <w:p>
@@ -3844,20 +4056,6 @@
           <w14:ligatures w14:val="none"/>
         </w:rPr>
       </w:pPr>
-    </w:p>
-    <w:p>
-      <w:pPr>
-        <w:shd w:val="clear" w:color="auto" w:fill="FFFFFF"/>
-        <w:spacing w:after="0" w:line="270" w:lineRule="atLeast"/>
-        <w:rPr>
-          <w:rFonts w:ascii="Menlo" w:eastAsia="Times New Roman" w:hAnsi="Menlo" w:cs="Menlo"/>
-          <w:color w:val="3B3B3B"/>
-          <w:kern w:val="0"/>
-          <w:sz w:val="18"/>
-          <w:szCs w:val="18"/>
-          <w14:ligatures w14:val="none"/>
-        </w:rPr>
-      </w:pPr>
       <w:r>
         <w:rPr>
           <w:rFonts w:ascii="Menlo" w:eastAsia="Times New Roman" w:hAnsi="Menlo" w:cs="Menlo"/>
@@ -3867,77 +4065,6 @@
           <w:szCs w:val="18"/>
           <w14:ligatures w14:val="none"/>
         </w:rPr>
-        <w:t>4.</w:t>
-      </w:r>
-      <w:r>
-        <w:rPr>
-          <w:rFonts w:ascii="Menlo" w:eastAsia="Times New Roman" w:hAnsi="Menlo" w:cs="Menlo"/>
-          <w:color w:val="3B3B3B"/>
-          <w:kern w:val="0"/>
-          <w:sz w:val="18"/>
-          <w:szCs w:val="18"/>
-          <w14:ligatures w14:val="none"/>
-        </w:rPr>
-        <w:t xml:space="preserve"> </w:t>
-      </w:r>
-      <w:r>
-        <w:rPr>
-          <w:rFonts w:ascii="Menlo" w:eastAsia="Times New Roman" w:hAnsi="Menlo" w:cs="Menlo"/>
-          <w:b/>
-          <w:bCs/>
-          <w:color w:val="000080"/>
-          <w:kern w:val="0"/>
-          <w:sz w:val="18"/>
-          <w:szCs w:val="18"/>
-          <w14:ligatures w14:val="none"/>
-        </w:rPr>
-        <w:t>**Table 4. Sensitivity analyses**</w:t>
-      </w:r>
-      <w:r>
-        <w:rPr>
-          <w:rFonts w:ascii="Menlo" w:eastAsia="Times New Roman" w:hAnsi="Menlo" w:cs="Menlo"/>
-          <w:color w:val="3B3B3B"/>
-          <w:kern w:val="0"/>
-          <w:sz w:val="18"/>
-          <w:szCs w:val="18"/>
-          <w14:ligatures w14:val="none"/>
-        </w:rPr>
-        <w:t xml:space="preserve">  </w:t>
-      </w:r>
-    </w:p>
-    <w:p>
-      <w:pPr>
-        <w:shd w:val="clear" w:color="auto" w:fill="FFFFFF"/>
-        <w:spacing w:after="0" w:line="270" w:lineRule="atLeast"/>
-        <w:rPr>
-          <w:rFonts w:ascii="Menlo" w:eastAsia="Times New Roman" w:hAnsi="Menlo" w:cs="Menlo"/>
-          <w:color w:val="3B3B3B"/>
-          <w:kern w:val="0"/>
-          <w:sz w:val="18"/>
-          <w:szCs w:val="18"/>
-          <w14:ligatures w14:val="none"/>
-        </w:rPr>
-      </w:pPr>
-      <w:r>
-        <w:rPr>
-          <w:rFonts w:ascii="Menlo" w:eastAsia="Times New Roman" w:hAnsi="Menlo" w:cs="Menlo"/>
-          <w:color w:val="3B3B3B"/>
-          <w:kern w:val="0"/>
-          <w:sz w:val="18"/>
-          <w:szCs w:val="18"/>
-          <w14:ligatures w14:val="none"/>
-        </w:rPr>
-        <w:t xml:space="preserve">   </w:t>
-      </w:r>
-      <w:r>
-        <w:rPr>
-          <w:rFonts w:ascii="Menlo" w:eastAsia="Times New Roman" w:hAnsi="Menlo" w:cs="Menlo"/>
-          <w:color w:val="0451A5"/>
-          <w:kern w:val="0"/>
-          <w:sz w:val="18"/>
-          <w:szCs w:val="18"/>
-          <w14:ligatures w14:val="none"/>
-        </w:rPr>
         <w:t>-</w:t>
       </w:r>
       <w:r>
@@ -3949,603 +4076,7 @@
           <w:szCs w:val="18"/>
           <w14:ligatures w14:val="none"/>
         </w:rPr>
-        <w:t xml:space="preserve"> Interaction estimates across alternative specifications (different calipers, continuous BMI, etc.).</w:t>
-      </w:r>
-    </w:p>
-    <w:p>
-      <w:pPr>
-        <w:shd w:val="clear" w:color="auto" w:fill="FFFFFF"/>
-        <w:spacing w:after="0" w:line="270" w:lineRule="atLeast"/>
-        <w:rPr>
-          <w:rFonts w:ascii="Menlo" w:eastAsia="Times New Roman" w:hAnsi="Menlo" w:cs="Menlo"/>
-          <w:color w:val="3B3B3B"/>
-          <w:kern w:val="0"/>
-          <w:sz w:val="18"/>
-          <w:szCs w:val="18"/>
-          <w14:ligatures w14:val="none"/>
-        </w:rPr>
-      </w:pPr>
-    </w:p>
-    <w:p>
-      <w:pPr>
-        <w:shd w:val="clear" w:color="auto" w:fill="FFFFFF"/>
-        <w:spacing w:after="0" w:line="270" w:lineRule="atLeast"/>
-        <w:rPr>
-          <w:rFonts w:ascii="Menlo" w:eastAsia="Times New Roman" w:hAnsi="Menlo" w:cs="Menlo"/>
-          <w:color w:val="3B3B3B"/>
-          <w:kern w:val="0"/>
-          <w:sz w:val="18"/>
-          <w:szCs w:val="18"/>
-          <w14:ligatures w14:val="none"/>
-        </w:rPr>
-      </w:pPr>
-      <w:r>
-        <w:rPr>
-          <w:rFonts w:ascii="Menlo" w:eastAsia="Times New Roman" w:hAnsi="Menlo" w:cs="Menlo"/>
-          <w:b/>
-          <w:bCs/>
-          <w:color w:val="800000"/>
-          <w:kern w:val="0"/>
-          <w:sz w:val="18"/>
-          <w:szCs w:val="18"/>
-          <w14:ligatures w14:val="none"/>
-        </w:rPr>
-        <w:t>## Supplementary Material (Examples)</w:t>
-      </w:r>
-    </w:p>
-    <w:p>
-      <w:pPr>
-        <w:shd w:val="clear" w:color="auto" w:fill="FFFFFF"/>
-        <w:spacing w:after="0" w:line="270" w:lineRule="atLeast"/>
-        <w:rPr>
-          <w:rFonts w:ascii="Menlo" w:eastAsia="Times New Roman" w:hAnsi="Menlo" w:cs="Menlo"/>
-          <w:color w:val="3B3B3B"/>
-          <w:kern w:val="0"/>
-          <w:sz w:val="18"/>
-          <w:szCs w:val="18"/>
-          <w14:ligatures w14:val="none"/>
-        </w:rPr>
-      </w:pPr>
-    </w:p>
-    <w:p>
-      <w:pPr>
-        <w:shd w:val="clear" w:color="auto" w:fill="FFFFFF"/>
-        <w:spacing w:after="0" w:line="270" w:lineRule="atLeast"/>
-        <w:rPr>
-          <w:rFonts w:ascii="Menlo" w:eastAsia="Times New Roman" w:hAnsi="Menlo" w:cs="Menlo"/>
-          <w:color w:val="3B3B3B"/>
-          <w:kern w:val="0"/>
-          <w:sz w:val="18"/>
-          <w:szCs w:val="18"/>
-          <w14:ligatures w14:val="none"/>
-        </w:rPr>
-      </w:pPr>
-      <w:r>
-        <w:rPr>
-          <w:rFonts w:ascii="Menlo" w:eastAsia="Times New Roman" w:hAnsi="Menlo" w:cs="Menlo"/>
-          <w:color w:val="0451A5"/>
-          <w:kern w:val="0"/>
-          <w:sz w:val="18"/>
-          <w:szCs w:val="18"/>
-          <w14:ligatures w14:val="none"/>
-        </w:rPr>
-        <w:lastRenderedPageBreak/>
-        <w:t>-</w:t>
-      </w:r>
-      <w:r>
-        <w:rPr>
-          <w:rFonts w:ascii="Menlo" w:eastAsia="Times New Roman" w:hAnsi="Menlo" w:cs="Menlo"/>
-          <w:color w:val="3B3B3B"/>
-          <w:kern w:val="0"/>
-          <w:sz w:val="18"/>
-          <w:szCs w:val="18"/>
-          <w14:ligatures w14:val="none"/>
-        </w:rPr>
-        <w:t xml:space="preserve"> </w:t>
-      </w:r>
-      <w:proofErr w:type="spellStart"/>
-      <w:r>
-        <w:rPr>
-          <w:rFonts w:ascii="Menlo" w:eastAsia="Times New Roman" w:hAnsi="Menlo" w:cs="Menlo"/>
-          <w:color w:val="3B3B3B"/>
-          <w:kern w:val="0"/>
-          <w:sz w:val="18"/>
-          <w:szCs w:val="18"/>
-          <w14:ligatures w14:val="none"/>
-        </w:rPr>
-        <w:t>eFigure</w:t>
-      </w:r>
-      <w:proofErr w:type="spellEnd"/>
-      <w:r>
-        <w:rPr>
-          <w:rFonts w:ascii="Menlo" w:eastAsia="Times New Roman" w:hAnsi="Menlo" w:cs="Menlo"/>
-          <w:color w:val="3B3B3B"/>
-          <w:kern w:val="0"/>
-          <w:sz w:val="18"/>
-          <w:szCs w:val="18"/>
-          <w14:ligatures w14:val="none"/>
-        </w:rPr>
-        <w:t xml:space="preserve"> 1. Detailed flow diagram per outcome.</w:t>
-      </w:r>
-    </w:p>
-    <w:p>
-      <w:pPr>
-        <w:shd w:val="clear" w:color="auto" w:fill="FFFFFF"/>
-        <w:spacing w:after="0" w:line="270" w:lineRule="atLeast"/>
-        <w:rPr>
-          <w:rFonts w:ascii="Menlo" w:eastAsia="Times New Roman" w:hAnsi="Menlo" w:cs="Menlo"/>
-          <w:color w:val="3B3B3B"/>
-          <w:kern w:val="0"/>
-          <w:sz w:val="18"/>
-          <w:szCs w:val="18"/>
-          <w14:ligatures w14:val="none"/>
-        </w:rPr>
-      </w:pPr>
-      <w:r>
-        <w:rPr>
-          <w:rFonts w:ascii="Menlo" w:eastAsia="Times New Roman" w:hAnsi="Menlo" w:cs="Menlo"/>
-          <w:color w:val="0451A5"/>
-          <w:kern w:val="0"/>
-          <w:sz w:val="18"/>
-          <w:szCs w:val="18"/>
-          <w14:ligatures w14:val="none"/>
-        </w:rPr>
-        <w:t>-</w:t>
-      </w:r>
-      <w:r>
-        <w:rPr>
-          <w:rFonts w:ascii="Menlo" w:eastAsia="Times New Roman" w:hAnsi="Menlo" w:cs="Menlo"/>
-          <w:color w:val="3B3B3B"/>
-          <w:kern w:val="0"/>
-          <w:sz w:val="18"/>
-          <w:szCs w:val="18"/>
-          <w14:ligatures w14:val="none"/>
-        </w:rPr>
-        <w:t xml:space="preserve"> </w:t>
-      </w:r>
-      <w:proofErr w:type="spellStart"/>
-      <w:r>
-        <w:rPr>
-          <w:rFonts w:ascii="Menlo" w:eastAsia="Times New Roman" w:hAnsi="Menlo" w:cs="Menlo"/>
-          <w:color w:val="3B3B3B"/>
-          <w:kern w:val="0"/>
-          <w:sz w:val="18"/>
-          <w:szCs w:val="18"/>
-          <w14:ligatures w14:val="none"/>
-        </w:rPr>
-        <w:t>eFigure</w:t>
-      </w:r>
-      <w:proofErr w:type="spellEnd"/>
-      <w:r>
-        <w:rPr>
-          <w:rFonts w:ascii="Menlo" w:eastAsia="Times New Roman" w:hAnsi="Menlo" w:cs="Menlo"/>
-          <w:color w:val="3B3B3B"/>
-          <w:kern w:val="0"/>
-          <w:sz w:val="18"/>
-          <w:szCs w:val="18"/>
-          <w14:ligatures w14:val="none"/>
-        </w:rPr>
-        <w:t xml:space="preserve"> 2. Additional balance plots.</w:t>
-      </w:r>
-    </w:p>
-    <w:p>
-      <w:pPr>
-        <w:shd w:val="clear" w:color="auto" w:fill="FFFFFF"/>
-        <w:spacing w:after="0" w:line="270" w:lineRule="atLeast"/>
-        <w:rPr>
-          <w:rFonts w:ascii="Menlo" w:eastAsia="Times New Roman" w:hAnsi="Menlo" w:cs="Menlo"/>
-          <w:color w:val="3B3B3B"/>
-          <w:kern w:val="0"/>
-          <w:sz w:val="18"/>
-          <w:szCs w:val="18"/>
-          <w14:ligatures w14:val="none"/>
-        </w:rPr>
-      </w:pPr>
-      <w:r>
-        <w:rPr>
-          <w:rFonts w:ascii="Menlo" w:eastAsia="Times New Roman" w:hAnsi="Menlo" w:cs="Menlo"/>
-          <w:color w:val="0451A5"/>
-          <w:kern w:val="0"/>
-          <w:sz w:val="18"/>
-          <w:szCs w:val="18"/>
-          <w14:ligatures w14:val="none"/>
-        </w:rPr>
-        <w:t>-</w:t>
-      </w:r>
-      <w:r>
-        <w:rPr>
-          <w:rFonts w:ascii="Menlo" w:eastAsia="Times New Roman" w:hAnsi="Menlo" w:cs="Menlo"/>
-          <w:color w:val="3B3B3B"/>
-          <w:kern w:val="0"/>
-          <w:sz w:val="18"/>
-          <w:szCs w:val="18"/>
-          <w14:ligatures w14:val="none"/>
-        </w:rPr>
-        <w:t xml:space="preserve"> </w:t>
-      </w:r>
-      <w:proofErr w:type="spellStart"/>
-      <w:r>
-        <w:rPr>
-          <w:rFonts w:ascii="Menlo" w:eastAsia="Times New Roman" w:hAnsi="Menlo" w:cs="Menlo"/>
-          <w:color w:val="3B3B3B"/>
-          <w:kern w:val="0"/>
-          <w:sz w:val="18"/>
-          <w:szCs w:val="18"/>
-          <w14:ligatures w14:val="none"/>
-        </w:rPr>
-        <w:t>eFigure</w:t>
-      </w:r>
-      <w:proofErr w:type="spellEnd"/>
-      <w:r>
-        <w:rPr>
-          <w:rFonts w:ascii="Menlo" w:eastAsia="Times New Roman" w:hAnsi="Menlo" w:cs="Menlo"/>
-          <w:color w:val="3B3B3B"/>
-          <w:kern w:val="0"/>
-          <w:sz w:val="18"/>
-          <w:szCs w:val="18"/>
-          <w14:ligatures w14:val="none"/>
-        </w:rPr>
-        <w:t xml:space="preserve"> 3. DAG of confounding.</w:t>
-      </w:r>
-    </w:p>
-    <w:p>
-      <w:pPr>
-        <w:shd w:val="clear" w:color="auto" w:fill="FFFFFF"/>
-        <w:spacing w:after="0" w:line="270" w:lineRule="atLeast"/>
-        <w:rPr>
-          <w:rFonts w:ascii="Menlo" w:eastAsia="Times New Roman" w:hAnsi="Menlo" w:cs="Menlo"/>
-          <w:color w:val="3B3B3B"/>
-          <w:kern w:val="0"/>
-          <w:sz w:val="18"/>
-          <w:szCs w:val="18"/>
-          <w14:ligatures w14:val="none"/>
-        </w:rPr>
-      </w:pPr>
-      <w:r>
-        <w:rPr>
-          <w:rFonts w:ascii="Menlo" w:eastAsia="Times New Roman" w:hAnsi="Menlo" w:cs="Menlo"/>
-          <w:color w:val="0451A5"/>
-          <w:kern w:val="0"/>
-          <w:sz w:val="18"/>
-          <w:szCs w:val="18"/>
-          <w14:ligatures w14:val="none"/>
-        </w:rPr>
-        <w:t>-</w:t>
-      </w:r>
-      <w:r>
-        <w:rPr>
-          <w:rFonts w:ascii="Menlo" w:eastAsia="Times New Roman" w:hAnsi="Menlo" w:cs="Menlo"/>
-          <w:color w:val="3B3B3B"/>
-          <w:kern w:val="0"/>
-          <w:sz w:val="18"/>
-          <w:szCs w:val="18"/>
-          <w14:ligatures w14:val="none"/>
-        </w:rPr>
-        <w:t xml:space="preserve"> </w:t>
-      </w:r>
-      <w:proofErr w:type="spellStart"/>
-      <w:r>
-        <w:rPr>
-          <w:rFonts w:ascii="Menlo" w:eastAsia="Times New Roman" w:hAnsi="Menlo" w:cs="Menlo"/>
-          <w:color w:val="3B3B3B"/>
-          <w:kern w:val="0"/>
-          <w:sz w:val="18"/>
-          <w:szCs w:val="18"/>
-          <w14:ligatures w14:val="none"/>
-        </w:rPr>
-        <w:t>eTable</w:t>
-      </w:r>
-      <w:proofErr w:type="spellEnd"/>
-      <w:r>
-        <w:rPr>
-          <w:rFonts w:ascii="Menlo" w:eastAsia="Times New Roman" w:hAnsi="Menlo" w:cs="Menlo"/>
-          <w:color w:val="3B3B3B"/>
-          <w:kern w:val="0"/>
-          <w:sz w:val="18"/>
-          <w:szCs w:val="18"/>
-          <w14:ligatures w14:val="none"/>
-        </w:rPr>
-        <w:t xml:space="preserve"> 1. Variable definitions.</w:t>
-      </w:r>
-    </w:p>
-    <w:p>
-      <w:pPr>
-        <w:shd w:val="clear" w:color="auto" w:fill="FFFFFF"/>
-        <w:spacing w:after="0" w:line="270" w:lineRule="atLeast"/>
-        <w:rPr>
-          <w:rFonts w:ascii="Menlo" w:eastAsia="Times New Roman" w:hAnsi="Menlo" w:cs="Menlo"/>
-          <w:color w:val="3B3B3B"/>
-          <w:kern w:val="0"/>
-          <w:sz w:val="18"/>
-          <w:szCs w:val="18"/>
-          <w14:ligatures w14:val="none"/>
-        </w:rPr>
-      </w:pPr>
-      <w:r>
-        <w:rPr>
-          <w:rFonts w:ascii="Menlo" w:eastAsia="Times New Roman" w:hAnsi="Menlo" w:cs="Menlo"/>
-          <w:color w:val="0451A5"/>
-          <w:kern w:val="0"/>
-          <w:sz w:val="18"/>
-          <w:szCs w:val="18"/>
-          <w14:ligatures w14:val="none"/>
-        </w:rPr>
-        <w:t>-</w:t>
-      </w:r>
-      <w:r>
-        <w:rPr>
-          <w:rFonts w:ascii="Menlo" w:eastAsia="Times New Roman" w:hAnsi="Menlo" w:cs="Menlo"/>
-          <w:color w:val="3B3B3B"/>
-          <w:kern w:val="0"/>
-          <w:sz w:val="18"/>
-          <w:szCs w:val="18"/>
-          <w14:ligatures w14:val="none"/>
-        </w:rPr>
-        <w:t xml:space="preserve"> </w:t>
-      </w:r>
-      <w:proofErr w:type="spellStart"/>
-      <w:r>
-        <w:rPr>
-          <w:rFonts w:ascii="Menlo" w:eastAsia="Times New Roman" w:hAnsi="Menlo" w:cs="Menlo"/>
-          <w:color w:val="3B3B3B"/>
-          <w:kern w:val="0"/>
-          <w:sz w:val="18"/>
-          <w:szCs w:val="18"/>
-          <w14:ligatures w14:val="none"/>
-        </w:rPr>
-        <w:t>eTable</w:t>
-      </w:r>
-      <w:proofErr w:type="spellEnd"/>
-      <w:r>
-        <w:rPr>
-          <w:rFonts w:ascii="Menlo" w:eastAsia="Times New Roman" w:hAnsi="Menlo" w:cs="Menlo"/>
-          <w:color w:val="3B3B3B"/>
-          <w:kern w:val="0"/>
-          <w:sz w:val="18"/>
-          <w:szCs w:val="18"/>
-          <w14:ligatures w14:val="none"/>
-        </w:rPr>
-        <w:t xml:space="preserve"> 2. Full baseline table.</w:t>
-      </w:r>
-    </w:p>
-    <w:p>
-      <w:pPr>
-        <w:shd w:val="clear" w:color="auto" w:fill="FFFFFF"/>
-        <w:spacing w:after="0" w:line="270" w:lineRule="atLeast"/>
-        <w:rPr>
-          <w:rFonts w:ascii="Menlo" w:eastAsia="Times New Roman" w:hAnsi="Menlo" w:cs="Menlo"/>
-          <w:color w:val="3B3B3B"/>
-          <w:kern w:val="0"/>
-          <w:sz w:val="18"/>
-          <w:szCs w:val="18"/>
-          <w14:ligatures w14:val="none"/>
-        </w:rPr>
-      </w:pPr>
-      <w:r>
-        <w:rPr>
-          <w:rFonts w:ascii="Menlo" w:eastAsia="Times New Roman" w:hAnsi="Menlo" w:cs="Menlo"/>
-          <w:color w:val="0451A5"/>
-          <w:kern w:val="0"/>
-          <w:sz w:val="18"/>
-          <w:szCs w:val="18"/>
-          <w14:ligatures w14:val="none"/>
-        </w:rPr>
-        <w:t>-</w:t>
-      </w:r>
-      <w:r>
-        <w:rPr>
-          <w:rFonts w:ascii="Menlo" w:eastAsia="Times New Roman" w:hAnsi="Menlo" w:cs="Menlo"/>
-          <w:color w:val="3B3B3B"/>
-          <w:kern w:val="0"/>
-          <w:sz w:val="18"/>
-          <w:szCs w:val="18"/>
-          <w14:ligatures w14:val="none"/>
-        </w:rPr>
-        <w:t xml:space="preserve"> </w:t>
-      </w:r>
-      <w:proofErr w:type="spellStart"/>
-      <w:r>
-        <w:rPr>
-          <w:rFonts w:ascii="Menlo" w:eastAsia="Times New Roman" w:hAnsi="Menlo" w:cs="Menlo"/>
-          <w:color w:val="3B3B3B"/>
-          <w:kern w:val="0"/>
-          <w:sz w:val="18"/>
-          <w:szCs w:val="18"/>
-          <w14:ligatures w14:val="none"/>
-        </w:rPr>
-        <w:t>eTable</w:t>
-      </w:r>
-      <w:proofErr w:type="spellEnd"/>
-      <w:r>
-        <w:rPr>
-          <w:rFonts w:ascii="Menlo" w:eastAsia="Times New Roman" w:hAnsi="Menlo" w:cs="Menlo"/>
-          <w:color w:val="3B3B3B"/>
-          <w:kern w:val="0"/>
-          <w:sz w:val="18"/>
-          <w:szCs w:val="18"/>
-          <w14:ligatures w14:val="none"/>
-        </w:rPr>
-        <w:t xml:space="preserve"> 3. Unadjusted outcome comparisons.</w:t>
-      </w:r>
-    </w:p>
-    <w:p>
-      <w:pPr>
-        <w:shd w:val="clear" w:color="auto" w:fill="FFFFFF"/>
-        <w:spacing w:after="0" w:line="270" w:lineRule="atLeast"/>
-        <w:rPr>
-          <w:rFonts w:ascii="Menlo" w:eastAsia="Times New Roman" w:hAnsi="Menlo" w:cs="Menlo"/>
-          <w:color w:val="3B3B3B"/>
-          <w:kern w:val="0"/>
-          <w:sz w:val="18"/>
-          <w:szCs w:val="18"/>
-          <w14:ligatures w14:val="none"/>
-        </w:rPr>
-      </w:pPr>
-      <w:r>
-        <w:rPr>
-          <w:rFonts w:ascii="Menlo" w:eastAsia="Times New Roman" w:hAnsi="Menlo" w:cs="Menlo"/>
-          <w:color w:val="0451A5"/>
-          <w:kern w:val="0"/>
-          <w:sz w:val="18"/>
-          <w:szCs w:val="18"/>
-          <w14:ligatures w14:val="none"/>
-        </w:rPr>
-        <w:t>-</w:t>
-      </w:r>
-      <w:r>
-        <w:rPr>
-          <w:rFonts w:ascii="Menlo" w:eastAsia="Times New Roman" w:hAnsi="Menlo" w:cs="Menlo"/>
-          <w:color w:val="3B3B3B"/>
-          <w:kern w:val="0"/>
-          <w:sz w:val="18"/>
-          <w:szCs w:val="18"/>
-          <w14:ligatures w14:val="none"/>
-        </w:rPr>
-        <w:t xml:space="preserve"> </w:t>
-      </w:r>
-      <w:proofErr w:type="spellStart"/>
-      <w:r>
-        <w:rPr>
-          <w:rFonts w:ascii="Menlo" w:eastAsia="Times New Roman" w:hAnsi="Menlo" w:cs="Menlo"/>
-          <w:color w:val="3B3B3B"/>
-          <w:kern w:val="0"/>
-          <w:sz w:val="18"/>
-          <w:szCs w:val="18"/>
-          <w14:ligatures w14:val="none"/>
-        </w:rPr>
-        <w:t>eTable</w:t>
-      </w:r>
-      <w:proofErr w:type="spellEnd"/>
-      <w:r>
-        <w:rPr>
-          <w:rFonts w:ascii="Menlo" w:eastAsia="Times New Roman" w:hAnsi="Menlo" w:cs="Menlo"/>
-          <w:color w:val="3B3B3B"/>
-          <w:kern w:val="0"/>
-          <w:sz w:val="18"/>
-          <w:szCs w:val="18"/>
-          <w14:ligatures w14:val="none"/>
-        </w:rPr>
-        <w:t xml:space="preserve"> 4. Model diagnostics.</w:t>
-      </w:r>
-    </w:p>
-    <w:p>
-      <w:pPr>
-        <w:shd w:val="clear" w:color="auto" w:fill="FFFFFF"/>
-        <w:spacing w:after="0" w:line="270" w:lineRule="atLeast"/>
-        <w:rPr>
-          <w:rFonts w:ascii="Menlo" w:eastAsia="Times New Roman" w:hAnsi="Menlo" w:cs="Menlo"/>
-          <w:color w:val="3B3B3B"/>
-          <w:kern w:val="0"/>
-          <w:sz w:val="18"/>
-          <w:szCs w:val="18"/>
-          <w14:ligatures w14:val="none"/>
-        </w:rPr>
-      </w:pPr>
-      <w:r>
-        <w:rPr>
-          <w:rFonts w:ascii="Menlo" w:eastAsia="Times New Roman" w:hAnsi="Menlo" w:cs="Menlo"/>
-          <w:color w:val="0451A5"/>
-          <w:kern w:val="0"/>
-          <w:sz w:val="18"/>
-          <w:szCs w:val="18"/>
-          <w14:ligatures w14:val="none"/>
-        </w:rPr>
-        <w:t>-</w:t>
-      </w:r>
-      <w:r>
-        <w:rPr>
-          <w:rFonts w:ascii="Menlo" w:eastAsia="Times New Roman" w:hAnsi="Menlo" w:cs="Menlo"/>
-          <w:color w:val="3B3B3B"/>
-          <w:kern w:val="0"/>
-          <w:sz w:val="18"/>
-          <w:szCs w:val="18"/>
-          <w14:ligatures w14:val="none"/>
-        </w:rPr>
-        <w:t xml:space="preserve"> </w:t>
-      </w:r>
-      <w:proofErr w:type="spellStart"/>
-      <w:r>
-        <w:rPr>
-          <w:rFonts w:ascii="Menlo" w:eastAsia="Times New Roman" w:hAnsi="Menlo" w:cs="Menlo"/>
-          <w:color w:val="3B3B3B"/>
-          <w:kern w:val="0"/>
-          <w:sz w:val="18"/>
-          <w:szCs w:val="18"/>
-          <w14:ligatures w14:val="none"/>
-        </w:rPr>
-        <w:t>eTable</w:t>
-      </w:r>
-      <w:proofErr w:type="spellEnd"/>
-      <w:r>
-        <w:rPr>
-          <w:rFonts w:ascii="Menlo" w:eastAsia="Times New Roman" w:hAnsi="Menlo" w:cs="Menlo"/>
-          <w:color w:val="3B3B3B"/>
-          <w:kern w:val="0"/>
-          <w:sz w:val="18"/>
-          <w:szCs w:val="18"/>
-          <w14:ligatures w14:val="none"/>
-        </w:rPr>
-        <w:t xml:space="preserve"> 5. Missing data patterns and imputation specs.</w:t>
-      </w:r>
-    </w:p>
-    <w:p>
-      <w:pPr>
-        <w:shd w:val="clear" w:color="auto" w:fill="FFFFFF"/>
-        <w:spacing w:after="0" w:line="270" w:lineRule="atLeast"/>
-        <w:rPr>
-          <w:rFonts w:ascii="Menlo" w:eastAsia="Times New Roman" w:hAnsi="Menlo" w:cs="Menlo"/>
-          <w:color w:val="3B3B3B"/>
-          <w:kern w:val="0"/>
-          <w:sz w:val="18"/>
-          <w:szCs w:val="18"/>
-          <w14:ligatures w14:val="none"/>
-        </w:rPr>
-      </w:pPr>
-      <w:r>
-        <w:rPr>
-          <w:rFonts w:ascii="Menlo" w:eastAsia="Times New Roman" w:hAnsi="Menlo" w:cs="Menlo"/>
-          <w:color w:val="0451A5"/>
-          <w:kern w:val="0"/>
-          <w:sz w:val="18"/>
-          <w:szCs w:val="18"/>
-          <w14:ligatures w14:val="none"/>
-        </w:rPr>
-        <w:t>-</w:t>
-      </w:r>
-      <w:r>
-        <w:rPr>
-          <w:rFonts w:ascii="Menlo" w:eastAsia="Times New Roman" w:hAnsi="Menlo" w:cs="Menlo"/>
-          <w:color w:val="3B3B3B"/>
-          <w:kern w:val="0"/>
-          <w:sz w:val="18"/>
-          <w:szCs w:val="18"/>
-          <w14:ligatures w14:val="none"/>
-        </w:rPr>
-        <w:t xml:space="preserve"> </w:t>
-      </w:r>
-      <w:proofErr w:type="spellStart"/>
-      <w:r>
-        <w:rPr>
-          <w:rFonts w:ascii="Menlo" w:eastAsia="Times New Roman" w:hAnsi="Menlo" w:cs="Menlo"/>
-          <w:color w:val="3B3B3B"/>
-          <w:kern w:val="0"/>
-          <w:sz w:val="18"/>
-          <w:szCs w:val="18"/>
-          <w14:ligatures w14:val="none"/>
-        </w:rPr>
-        <w:t>eTable</w:t>
-      </w:r>
-      <w:proofErr w:type="spellEnd"/>
-      <w:r>
-        <w:rPr>
-          <w:rFonts w:ascii="Menlo" w:eastAsia="Times New Roman" w:hAnsi="Menlo" w:cs="Menlo"/>
-          <w:color w:val="3B3B3B"/>
-          <w:kern w:val="0"/>
-          <w:sz w:val="18"/>
-          <w:szCs w:val="18"/>
-          <w14:ligatures w14:val="none"/>
-        </w:rPr>
-        <w:t xml:space="preserve"> 6. Medication status stratifications.</w:t>
+        <w:t xml:space="preserve"> eTable 6. Medication status stratifications.</w:t>
       </w:r>
     </w:p>
     <w:p>

</xml_diff>

<commit_message>
Started adding to the introduction, not done yet.
</commit_message>
<xml_diff>
--- a/manuscript/Cushings-Obesity/manuscript.docx
+++ b/manuscript/Cushings-Obesity/manuscript.docx
@@ -18,6 +18,43 @@
     </w:p>
     <w:p>
       <w:r>
+        <w:t>Cushing’s disease is a rare endocrine disorder, with an incidence rate of 1.8-2.5 cases per million people per year (</w:t>
+      </w:r>
+      <w:commentRangeStart w:id="0"/>
+      <w:r>
+        <w:t>sources</w:t>
+      </w:r>
+      <w:commentRangeEnd w:id="0"/>
+      <w:r>
+        <w:rPr>
+          <w:rStyle w:val="CommentReference"/>
+        </w:rPr>
+        <w:commentReference w:id="0"/>
+      </w:r>
+      <w:r>
+        <w:t>).</w:t>
+      </w:r>
+      <w:r>
+        <w:t xml:space="preserve"> This condition results from excess adrenocorticotropic hormone secretion from the pituitary gland, leading the adrenal glands to produce excess cortisol. Cushing’s disease also occurs far more commonly in women, with a female-to-male ratio of 4:1 (</w:t>
+      </w:r>
+      <w:commentRangeStart w:id="1"/>
+      <w:r>
+        <w:t>sources</w:t>
+      </w:r>
+      <w:commentRangeEnd w:id="1"/>
+      <w:r>
+        <w:rPr>
+          <w:rStyle w:val="CommentReference"/>
+        </w:rPr>
+        <w:commentReference w:id="1"/>
+      </w:r>
+      <w:r>
+        <w:t>).</w:t>
+      </w:r>
+    </w:p>
+    <w:p/>
+    <w:p>
+      <w:r>
         <w:t>Cushing’s disease</w:t>
       </w:r>
       <w:r>
@@ -29,18 +66,18 @@
       <w:r>
         <w:t xml:space="preserve"> The sickness affects women disproportionally to men and is most often caused by a tumor on the anterior pituitary gland, or the adrenal gland. The effects of sustained elevation of cortisol in the body can present in a variety of ways in humans, but they are generally well known in a general population. These can include high blood pressure, diabetes, and weight gain. Many of these symptoms are caused by both obesity and metabolic related symptoms, and it is difficult to discern from the obesity-dependent from the obesity-independent mechanisms of Cushing’s </w:t>
       </w:r>
-      <w:commentRangeStart w:id="0"/>
+      <w:commentRangeStart w:id="2"/>
       <w:r>
         <w:t xml:space="preserve">disease. </w:t>
       </w:r>
-      <w:commentRangeEnd w:id="0"/>
+      <w:commentRangeEnd w:id="2"/>
       <w:r>
         <w:rPr>
           <w:rStyle w:val="CommentReference"/>
           <w:sz w:val="24"/>
           <w:szCs w:val="24"/>
         </w:rPr>
-        <w:commentReference w:id="0"/>
+        <w:commentReference w:id="2"/>
       </w:r>
     </w:p>
     <w:p/>
@@ -126,28 +163,28 @@
       <w:r>
         <w:t xml:space="preserve"> we included procedure codes </w:t>
       </w:r>
-      <w:commentRangeStart w:id="1"/>
-      <w:commentRangeStart w:id="2"/>
+      <w:commentRangeStart w:id="3"/>
+      <w:commentRangeStart w:id="4"/>
       <w:r>
         <w:t>YYY</w:t>
       </w:r>
-      <w:commentRangeEnd w:id="1"/>
+      <w:commentRangeEnd w:id="3"/>
       <w:r>
         <w:rPr>
           <w:rStyle w:val="CommentReference"/>
           <w:sz w:val="24"/>
           <w:szCs w:val="24"/>
         </w:rPr>
-        <w:commentReference w:id="1"/>
-      </w:r>
-      <w:commentRangeEnd w:id="2"/>
+        <w:commentReference w:id="3"/>
+      </w:r>
+      <w:commentRangeEnd w:id="4"/>
       <w:r>
         <w:rPr>
           <w:rStyle w:val="CommentReference"/>
           <w:sz w:val="24"/>
           <w:szCs w:val="24"/>
         </w:rPr>
-        <w:commentReference w:id="2"/>
+        <w:commentReference w:id="4"/>
       </w:r>
       <w:r>
         <w:t>.</w:t>
@@ -176,7 +213,15 @@
         <w:t xml:space="preserve"> the </w:t>
       </w:r>
       <w:r>
-        <w:t xml:space="preserve"> MatchIt </w:t>
+        <w:t xml:space="preserve"> </w:t>
+      </w:r>
+      <w:proofErr w:type="spellStart"/>
+      <w:r>
+        <w:t>MatchIt</w:t>
+      </w:r>
+      <w:proofErr w:type="spellEnd"/>
+      <w:r>
+        <w:t xml:space="preserve"> </w:t>
       </w:r>
       <w:r>
         <w:t xml:space="preserve">package </w:t>
@@ -224,7 +269,11 @@
         <w:t xml:space="preserve">and potential controls with that measurement available. </w:t>
       </w:r>
       <w:r>
-        <w:t>For Cushing’s cases to be included they had to have had the laboratory measure</w:t>
+        <w:t xml:space="preserve">For Cushing’s cases to be included they had to </w:t>
+      </w:r>
+      <w:r>
+        <w:lastRenderedPageBreak/>
+        <w:t>have had the laboratory measure</w:t>
       </w:r>
       <w:r>
         <w:t>d</w:t>
@@ -329,16 +378,12 @@
         <w:t xml:space="preserve">As a sensitivity analysis we also created a single matched cohort using participants with </w:t>
       </w:r>
       <w:r>
-        <w:t xml:space="preserve">any of the </w:t>
-      </w:r>
-      <w:r>
-        <w:lastRenderedPageBreak/>
-        <w:t>laboratory results we tested (glucose, HbA1c, ALT, blood pressure, r LDL-cholesterol)</w:t>
+        <w:t>any of the laboratory results we tested (glucose, HbA1c, ALT, blood pressure, r LDL-cholesterol)</w:t>
       </w:r>
       <w:r>
         <w:t xml:space="preserve"> and </w:t>
       </w:r>
-      <w:commentRangeStart w:id="3"/>
+      <w:commentRangeStart w:id="5"/>
       <w:r>
         <w:t xml:space="preserve">repeated all outcome models </w:t>
       </w:r>
@@ -348,17 +393,33 @@
       <w:r>
         <w:t>.</w:t>
       </w:r>
-      <w:commentRangeEnd w:id="3"/>
+      <w:commentRangeEnd w:id="5"/>
       <w:r>
         <w:rPr>
           <w:rStyle w:val="CommentReference"/>
           <w:sz w:val="24"/>
           <w:szCs w:val="24"/>
         </w:rPr>
-        <w:commentReference w:id="3"/>
-      </w:r>
-      <w:r>
-        <w:t xml:space="preserve"> In our search, we only included patients with BMI’s within the 5-75 range, and between 5-75 years of age. Finally, we also only included patients within the 2022-2025 year range. This was done to create a data pull request that was less than 100,000 people, which was necessary with the Data Direct software used.***talk about this more</w:t>
+        <w:commentReference w:id="5"/>
+      </w:r>
+      <w:r>
+        <w:t xml:space="preserve"> In our search, we only included patients with BMI’s within the 5-75 range, and between 5-75 years of age. Finally, we also only included patients within the </w:t>
+      </w:r>
+      <w:proofErr w:type="gramStart"/>
+      <w:r>
+        <w:t>2022-2025 year</w:t>
+      </w:r>
+      <w:proofErr w:type="gramEnd"/>
+      <w:r>
+        <w:t xml:space="preserve"> range. This was done to create a data pull request that was less than 100,000 people, which was necessary with the Data Direct software </w:t>
+      </w:r>
+      <w:proofErr w:type="gramStart"/>
+      <w:r>
+        <w:t>used.*</w:t>
+      </w:r>
+      <w:proofErr w:type="gramEnd"/>
+      <w:r>
+        <w:t>**talk about this more</w:t>
       </w:r>
     </w:p>
     <w:p>
@@ -369,13 +430,21 @@
         <w:t>. Subsequent</w:t>
       </w:r>
       <w:r>
-        <w:t xml:space="preserve"> analyses were stratified by obesity (BMI ≥30 kg/m²). Within each obesity stratum, BMI was evaluated descriptively</w:t>
+        <w:t xml:space="preserve"> analyses were stratified by obesity (BMI ≥30 kg/m²). Within each obesity stratum, BMI was evaluated </w:t>
+      </w:r>
+      <w:proofErr w:type="gramStart"/>
+      <w:r>
+        <w:t>descriptively</w:t>
       </w:r>
       <w:r>
         <w:t>,</w:t>
       </w:r>
       <w:r>
-        <w:t xml:space="preserve"> and </w:t>
+        <w:t xml:space="preserve"> and</w:t>
+      </w:r>
+      <w:proofErr w:type="gramEnd"/>
+      <w:r>
+        <w:t xml:space="preserve"> </w:t>
       </w:r>
       <w:r>
         <w:t xml:space="preserve">also </w:t>
@@ -386,7 +455,15 @@
     </w:p>
     <w:p>
       <w:r>
-        <w:t>Mean arterial pressure was directly measured in the majority of cases. When MAP was missing but systolic and diastolic BP were available</w:t>
+        <w:t xml:space="preserve">Mean arterial pressure was directly measured in </w:t>
+      </w:r>
+      <w:proofErr w:type="gramStart"/>
+      <w:r>
+        <w:t>the majority of</w:t>
+      </w:r>
+      <w:proofErr w:type="gramEnd"/>
+      <w:r>
+        <w:t xml:space="preserve"> cases. When MAP was missing but systolic and diastolic BP were available</w:t>
       </w:r>
       <w:r>
         <w:t xml:space="preserve">, </w:t>
@@ -478,7 +555,7 @@
       </w:r>
     </w:p>
     <w:p>
-      <w:commentRangeStart w:id="4"/>
+      <w:commentRangeStart w:id="6"/>
       <w:r>
         <w:t xml:space="preserve">As shown in Figure 1, we identified YYYY participants with diagnoses of Cushing’s disease.  </w:t>
       </w:r>
@@ -488,14 +565,14 @@
       <w:r>
         <w:t>Their average age at diagnosis was XXX (+/- XXX).  They</w:t>
       </w:r>
-      <w:commentRangeEnd w:id="4"/>
+      <w:commentRangeEnd w:id="6"/>
       <w:r>
         <w:rPr>
           <w:rStyle w:val="CommentReference"/>
           <w:sz w:val="24"/>
           <w:szCs w:val="24"/>
         </w:rPr>
-        <w:commentReference w:id="4"/>
+        <w:commentReference w:id="6"/>
       </w:r>
       <w:r>
         <w:t xml:space="preserve"> </w:t>
@@ -517,6 +594,7 @@
           <w:b w:val="0"/>
           <w:bCs w:val="0"/>
         </w:rPr>
+        <w:lastRenderedPageBreak/>
         <w:t>Participant characteristics</w:t>
       </w:r>
       <w:r>
@@ -556,11 +634,16 @@
       <w:r>
         <w:t xml:space="preserve">We performed outcome-specific propensity matching to identify appropriate controls, starting from those with generating exact matches for gender, race and ethnicity.  We then algorithmically matched for age, generating 10 controls for each case.  Matching was </w:t>
       </w:r>
+      <w:proofErr w:type="gramStart"/>
       <w:r>
         <w:t xml:space="preserve">effective </w:t>
       </w:r>
       <w:r>
-        <w:t xml:space="preserve"> with a </w:t>
+        <w:t xml:space="preserve"> with</w:t>
+      </w:r>
+      <w:proofErr w:type="gramEnd"/>
+      <w:r>
+        <w:t xml:space="preserve"> a </w:t>
       </w:r>
       <w:r>
         <w:t>standardized mean difference</w:t>
@@ -586,7 +669,6 @@
     </w:p>
     <w:p>
       <w:r>
-        <w:lastRenderedPageBreak/>
         <w:t xml:space="preserve">Primary descriptive characteristics are </w:t>
       </w:r>
       <w:r>
@@ -650,7 +732,15 @@
         <w:fldChar w:fldCharType="end"/>
       </w:r>
       <w:r>
-        <w:t>.  As expected we also observed</w:t>
+        <w:t xml:space="preserve">.  As </w:t>
+      </w:r>
+      <w:proofErr w:type="gramStart"/>
+      <w:r>
+        <w:t>expected</w:t>
+      </w:r>
+      <w:proofErr w:type="gramEnd"/>
+      <w:r>
+        <w:t xml:space="preserve"> we also observed</w:t>
       </w:r>
       <w:r>
         <w:rPr>
@@ -664,10 +754,10 @@
       <w:r>
         <w:t xml:space="preserve">  </w:t>
       </w:r>
-      <w:commentRangeStart w:id="5"/>
-      <w:commentRangeStart w:id="6"/>
       <w:commentRangeStart w:id="7"/>
       <w:commentRangeStart w:id="8"/>
+      <w:commentRangeStart w:id="9"/>
+      <w:commentRangeStart w:id="10"/>
       <w:r>
         <w:t>Prior to matching for Race and Ethnicity, we noted that participants</w:t>
       </w:r>
@@ -701,41 +791,41 @@
       <w:r>
         <w:t>or Black</w:t>
       </w:r>
-      <w:commentRangeEnd w:id="5"/>
+      <w:commentRangeEnd w:id="7"/>
       <w:r>
         <w:rPr>
           <w:rStyle w:val="CommentReference"/>
           <w:sz w:val="24"/>
           <w:szCs w:val="24"/>
         </w:rPr>
-        <w:commentReference w:id="5"/>
-      </w:r>
-      <w:commentRangeEnd w:id="6"/>
+        <w:commentReference w:id="7"/>
+      </w:r>
+      <w:commentRangeEnd w:id="8"/>
       <w:r>
         <w:rPr>
           <w:rStyle w:val="CommentReference"/>
           <w:sz w:val="24"/>
           <w:szCs w:val="24"/>
         </w:rPr>
-        <w:commentReference w:id="6"/>
-      </w:r>
-      <w:commentRangeEnd w:id="7"/>
+        <w:commentReference w:id="8"/>
+      </w:r>
+      <w:commentRangeEnd w:id="9"/>
       <w:r>
         <w:rPr>
           <w:rStyle w:val="CommentReference"/>
           <w:sz w:val="24"/>
           <w:szCs w:val="24"/>
         </w:rPr>
-        <w:commentReference w:id="7"/>
-      </w:r>
-      <w:commentRangeEnd w:id="8"/>
+        <w:commentReference w:id="9"/>
+      </w:r>
+      <w:commentRangeEnd w:id="10"/>
       <w:r>
         <w:rPr>
           <w:rStyle w:val="CommentReference"/>
           <w:sz w:val="24"/>
           <w:szCs w:val="24"/>
         </w:rPr>
-        <w:commentReference w:id="8"/>
+        <w:commentReference w:id="10"/>
       </w:r>
       <w:r>
         <w:t xml:space="preserve"> (p=0.01</w:t>
@@ -1215,19 +1305,29 @@
     </w:p>
     <w:p>
       <w:r>
-        <w:t>To identify how obesity alters metabolic outcomes related to Cushing’s disease, we evaluated the effects of Cushing’s disease on several key metabolic variables including glycemica (fasting glucose and HbA1c), liver enzymes, LDL-C and blood pressure (Figure 2 and Table 3A).  As described below we noted substantial effect modification by obesity status in these fully adjusted models for liver enzymes and blood pressure (Table 3B).</w:t>
+        <w:lastRenderedPageBreak/>
+        <w:t xml:space="preserve">To identify how obesity alters metabolic outcomes related to Cushing’s disease, we evaluated the effects of Cushing’s disease on several key metabolic variables including </w:t>
+      </w:r>
+      <w:proofErr w:type="spellStart"/>
+      <w:r>
+        <w:t>glycemica</w:t>
+      </w:r>
+      <w:proofErr w:type="spellEnd"/>
+      <w:r>
+        <w:t xml:space="preserve"> (fasting glucose and HbA1c), liver enzymes, LDL-C and blood pressure (Figure 2 and Table 3A).  As described below we noted substantial effect modification by obesity status in these fully adjusted models for liver enzymes and blood pressure (Table 3B).</w:t>
       </w:r>
     </w:p>
     <w:p>
       <w:pPr>
         <w:pStyle w:val="Heading3"/>
       </w:pPr>
-      <w:commentRangeStart w:id="9"/>
-      <w:commentRangeStart w:id="10"/>
-      <w:r>
-        <w:lastRenderedPageBreak/>
+      <w:commentRangeStart w:id="11"/>
+      <w:commentRangeStart w:id="12"/>
+      <w:proofErr w:type="spellStart"/>
+      <w:r>
         <w:t>Dysglycemia</w:t>
       </w:r>
+      <w:proofErr w:type="spellEnd"/>
     </w:p>
     <w:p>
       <w:r>
@@ -1254,7 +1354,7 @@
       <w:r>
         <w:t xml:space="preserve"> with Cushing’s disease, regardless of </w:t>
       </w:r>
-      <w:commentRangeStart w:id="11"/>
+      <w:commentRangeStart w:id="13"/>
       <w:r>
         <w:t>obesity status</w:t>
       </w:r>
@@ -1276,17 +1376,25 @@
       <w:r>
         <w:t xml:space="preserve">. </w:t>
       </w:r>
-      <w:commentRangeEnd w:id="11"/>
+      <w:commentRangeEnd w:id="13"/>
       <w:r>
         <w:rPr>
           <w:rStyle w:val="CommentReference"/>
           <w:sz w:val="24"/>
           <w:szCs w:val="24"/>
         </w:rPr>
-        <w:commentReference w:id="11"/>
-      </w:r>
-      <w:r>
-        <w:t>The non-obese population had a slightly larger increase (26.95 vs. 26.18) than the obese population, but this was not a large enough difference to provide any significant evidence of an effect modification for obesity. Also in Table 3a, our collected HbA1c data indicated a</w:t>
+        <w:commentReference w:id="13"/>
+      </w:r>
+      <w:r>
+        <w:t xml:space="preserve">The non-obese population had a slightly larger increase (26.95 vs. 26.18) than the obese population, but this was not a large enough difference to provide any significant evidence of an effect modification for obesity. </w:t>
+      </w:r>
+      <w:proofErr w:type="gramStart"/>
+      <w:r>
+        <w:t>Also</w:t>
+      </w:r>
+      <w:proofErr w:type="gramEnd"/>
+      <w:r>
+        <w:t xml:space="preserve"> in Table 3a, our collected HbA1c data indicated a</w:t>
       </w:r>
       <w:r>
         <w:t xml:space="preserve"> slightly insignificant increase in HbA1c levels between the non-obese, and the non-obese with Cushing’s population (p=0.056). However, there was evidence of a significant increase in HbA1c levels of our obese, and obese with Cushing’s population (p</w:t>
@@ -1322,18 +1430,18 @@
       <w:r>
         <w:t xml:space="preserve"> we looked at </w:t>
       </w:r>
-      <w:commentRangeStart w:id="12"/>
+      <w:commentRangeStart w:id="14"/>
       <w:r>
         <w:t xml:space="preserve">ALT </w:t>
       </w:r>
-      <w:commentRangeEnd w:id="12"/>
+      <w:commentRangeEnd w:id="14"/>
       <w:r>
         <w:rPr>
           <w:rStyle w:val="CommentReference"/>
           <w:sz w:val="24"/>
           <w:szCs w:val="24"/>
         </w:rPr>
-        <w:commentReference w:id="12"/>
+        <w:commentReference w:id="14"/>
       </w:r>
       <w:r>
         <w:t>test results for our population. In both our obese, and non-obese populations, we saw an increase in ALT levels regardless of Cushing’s disease status</w:t>
@@ -1341,7 +1449,7 @@
       <w:r>
         <w:t xml:space="preserve"> </w:t>
       </w:r>
-      <w:commentRangeStart w:id="13"/>
+      <w:commentRangeStart w:id="15"/>
       <w:r>
         <w:t>(p</w:t>
       </w:r>
@@ -1357,14 +1465,14 @@
       <w:r>
         <w:t xml:space="preserve">). </w:t>
       </w:r>
-      <w:commentRangeEnd w:id="13"/>
+      <w:commentRangeEnd w:id="15"/>
       <w:r>
         <w:rPr>
           <w:rStyle w:val="CommentReference"/>
           <w:sz w:val="24"/>
           <w:szCs w:val="24"/>
         </w:rPr>
-        <w:commentReference w:id="13"/>
+        <w:commentReference w:id="15"/>
       </w:r>
       <w:r>
         <w:t>However, the increase in the obese population’s control group and Cushing’s patient population was far greater than the non-obese group’s increase (33.07 vs. 69.23). This suggests that obesity could have a positive effect modification on ALT levels.</w:t>
@@ -1374,21 +1482,21 @@
       <w:pPr>
         <w:pStyle w:val="Heading3"/>
       </w:pPr>
-      <w:commentRangeStart w:id="14"/>
+      <w:commentRangeStart w:id="16"/>
       <w:r>
         <w:t>Dyslipidemia</w:t>
       </w:r>
       <w:r>
         <w:t xml:space="preserve"> </w:t>
       </w:r>
-      <w:commentRangeEnd w:id="14"/>
+      <w:commentRangeEnd w:id="16"/>
       <w:r>
         <w:rPr>
           <w:rStyle w:val="CommentReference"/>
           <w:sz w:val="28"/>
           <w:szCs w:val="28"/>
         </w:rPr>
-        <w:commentReference w:id="14"/>
+        <w:commentReference w:id="16"/>
       </w:r>
     </w:p>
     <w:p>
@@ -1412,23 +1520,23 @@
       <w:r>
         <w:t>Blood Pressure</w:t>
       </w:r>
-      <w:commentRangeEnd w:id="9"/>
+      <w:commentRangeEnd w:id="11"/>
       <w:r>
         <w:rPr>
           <w:rStyle w:val="CommentReference"/>
           <w:sz w:val="28"/>
           <w:szCs w:val="28"/>
         </w:rPr>
-        <w:commentReference w:id="9"/>
-      </w:r>
-      <w:commentRangeEnd w:id="10"/>
+        <w:commentReference w:id="11"/>
+      </w:r>
+      <w:commentRangeEnd w:id="12"/>
       <w:r>
         <w:rPr>
           <w:rStyle w:val="CommentReference"/>
           <w:sz w:val="28"/>
           <w:szCs w:val="28"/>
         </w:rPr>
-        <w:commentReference w:id="10"/>
+        <w:commentReference w:id="12"/>
       </w:r>
     </w:p>
     <w:p>
@@ -1436,16 +1544,28 @@
         <w:t xml:space="preserve">We </w:t>
       </w:r>
       <w:r>
-        <w:t xml:space="preserve">parameterized blood pressure readings as systolic, diastolic and mean arterial pressure </w:t>
-      </w:r>
-      <w:r>
-        <w:t xml:space="preserve"> (Table 3A). In our data regarding the mean arteriole pressure, we did see a significant increase in our non-obese population between the patients with and without Cushing’s disease (p=0.010). We did not, however, </w:t>
+        <w:t xml:space="preserve">parameterized blood pressure readings as systolic, diastolic and mean arterial </w:t>
+      </w:r>
+      <w:proofErr w:type="gramStart"/>
+      <w:r>
+        <w:t xml:space="preserve">pressure </w:t>
+      </w:r>
+      <w:r>
+        <w:t xml:space="preserve"> (</w:t>
+      </w:r>
+      <w:proofErr w:type="gramEnd"/>
+      <w:r>
+        <w:t xml:space="preserve">Table 3A). In our data regarding the mean arteriole pressure, we did see a significant increase in our non-obese population between the patients with and without Cushing’s disease (p=0.010). We did not, however, </w:t>
       </w:r>
       <w:r>
         <w:t>observe</w:t>
       </w:r>
       <w:r>
-        <w:t xml:space="preserve"> this same significant increase in the obese population (p=0.072). We saw this same relationship in our diastolic blood measurement, with a significant increase in the non-obese population, but not a significant increase in the obese population (p</w:t>
+        <w:t xml:space="preserve"> this same significant increase in the </w:t>
+      </w:r>
+      <w:r>
+        <w:lastRenderedPageBreak/>
+        <w:t>obese population (p=0.072). We saw this same relationship in our diastolic blood measurement, with a significant increase in the non-obese population, but not a significant increase in the obese population (p</w:t>
       </w:r>
       <w:r>
         <w:t>&lt;0.01</w:t>
@@ -1469,11 +1589,15 @@
         <w:t>&lt;0.01</w:t>
       </w:r>
       <w:r>
-        <w:t xml:space="preserve">). This increase was much larger in the non-obese population </w:t>
-      </w:r>
-      <w:r>
-        <w:lastRenderedPageBreak/>
-        <w:t>(10.88 vs. 4.50), which suggests that obesity could be a negative effect modifier in regards to systolic blood pressure.</w:t>
+        <w:t xml:space="preserve">). This increase was much larger in the non-obese population (10.88 vs. 4.50), which suggests that obesity could be a negative effect modifier </w:t>
+      </w:r>
+      <w:proofErr w:type="gramStart"/>
+      <w:r>
+        <w:t>in regards to</w:t>
+      </w:r>
+      <w:proofErr w:type="gramEnd"/>
+      <w:r>
+        <w:t xml:space="preserve"> systolic blood pressure.</w:t>
       </w:r>
     </w:p>
     <w:p>
@@ -1571,7 +1695,23 @@
         </w:numPr>
       </w:pPr>
       <w:r>
-        <w:t>BMI instead of Obesity, ns(BMI, df=3) instead of Obesity</w:t>
+        <w:t xml:space="preserve">BMI instead of Obesity, </w:t>
+      </w:r>
+      <w:proofErr w:type="gramStart"/>
+      <w:r>
+        <w:t>ns(</w:t>
+      </w:r>
+      <w:proofErr w:type="gramEnd"/>
+      <w:r>
+        <w:t xml:space="preserve">BMI, </w:t>
+      </w:r>
+      <w:proofErr w:type="spellStart"/>
+      <w:r>
+        <w:t>df</w:t>
+      </w:r>
+      <w:proofErr w:type="spellEnd"/>
+      <w:r>
+        <w:t>=3) instead of Obesity</w:t>
       </w:r>
     </w:p>
     <w:p>
@@ -1582,8 +1722,13 @@
           <w:numId w:val="5"/>
         </w:numPr>
       </w:pPr>
-      <w:r>
-        <w:t>Cushings x Sex</w:t>
+      <w:proofErr w:type="spellStart"/>
+      <w:r>
+        <w:t>Cushings</w:t>
+      </w:r>
+      <w:proofErr w:type="spellEnd"/>
+      <w:r>
+        <w:t xml:space="preserve"> x Sex</w:t>
       </w:r>
     </w:p>
     <w:p>
@@ -1692,7 +1837,15 @@
         </w:numPr>
       </w:pPr>
       <w:r>
-        <w:t>BMI Higher in cushings case</w:t>
+        <w:t xml:space="preserve">BMI Higher in </w:t>
+      </w:r>
+      <w:proofErr w:type="spellStart"/>
+      <w:r>
+        <w:t>cushings</w:t>
+      </w:r>
+      <w:proofErr w:type="spellEnd"/>
+      <w:r>
+        <w:t xml:space="preserve"> case</w:t>
       </w:r>
     </w:p>
     <w:p>
@@ -1740,7 +1893,15 @@
         </w:numPr>
       </w:pPr>
       <w:r>
-        <w:t>**When selecting our control groups, we could only pull from ~5 years ago due to DataDirect only being able to pull 100k people at one time.</w:t>
+        <w:t xml:space="preserve">**When selecting our control groups, we could only pull from ~5 years ago due to </w:t>
+      </w:r>
+      <w:proofErr w:type="spellStart"/>
+      <w:r>
+        <w:t>DataDirect</w:t>
+      </w:r>
+      <w:proofErr w:type="spellEnd"/>
+      <w:r>
+        <w:t xml:space="preserve"> only being able to pull 100k people at one time.</w:t>
       </w:r>
     </w:p>
     <w:p>
@@ -1752,6 +1913,7 @@
         </w:numPr>
       </w:pPr>
       <w:r>
+        <w:lastRenderedPageBreak/>
         <w:t>Relatively small n value for some lab results such as LDL cholesterol, osteoporosis (although we probably just will not use any of that data in our final paper anyways)</w:t>
       </w:r>
     </w:p>
@@ -1760,7 +1922,6 @@
         <w:pStyle w:val="Heading1"/>
       </w:pPr>
       <w:r>
-        <w:lastRenderedPageBreak/>
         <w:t>References</w:t>
       </w:r>
     </w:p>
@@ -1994,14 +2155,8 @@
         <w:rPr>
           <w:rFonts w:ascii="Aptos"/>
         </w:rPr>
-        <w:t xml:space="preserve">Matthiasdottir, A. M., Hardarson, T. O., Arnardottir, S., &amp; Sigurjonsdottir, H. A. (2024). Cushing’s Disease May Have Higher Incidence than Previously Thought: A </w:t>
-      </w:r>
-      <w:r>
-        <w:rPr>
-          <w:rFonts w:ascii="Aptos"/>
-        </w:rPr>
         <w:lastRenderedPageBreak/>
-        <w:t xml:space="preserve">Nationwide Study in Iceland 2010–2019. </w:t>
+        <w:t xml:space="preserve">Matthiasdottir, A. M., Hardarson, T. O., Arnardottir, S., &amp; Sigurjonsdottir, H. A. (2024). Cushing’s Disease May Have Higher Incidence than Previously Thought: A Nationwide Study in Iceland 2010–2019. </w:t>
       </w:r>
       <w:r>
         <w:rPr>
@@ -2311,6 +2466,7 @@
           <w:b/>
           <w:bCs/>
         </w:rPr>
+        <w:lastRenderedPageBreak/>
         <w:t>Table 2: Participant characteristics after stratification by obesity</w:t>
       </w:r>
       <w:r>
@@ -2326,7 +2482,6 @@
           <w:b/>
           <w:bCs/>
         </w:rPr>
-        <w:lastRenderedPageBreak/>
         <w:t xml:space="preserve">Table 3: Effect sizes and statistical significance for each outcome.  </w:t>
       </w:r>
       <w:r>
@@ -2336,10 +2491,18 @@
         <w:t xml:space="preserve">Data are presented as mean with 95% confidence intervals.  </w:t>
       </w:r>
       <w:r>
-        <w:t xml:space="preserve">For both </w:t>
-      </w:r>
-      <w:r>
-        <w:t xml:space="preserve">of these </w:t>
+        <w:t xml:space="preserve">For </w:t>
+      </w:r>
+      <w:proofErr w:type="gramStart"/>
+      <w:r>
+        <w:t xml:space="preserve">both </w:t>
+      </w:r>
+      <w:r>
+        <w:t>of these</w:t>
+      </w:r>
+      <w:proofErr w:type="gramEnd"/>
+      <w:r>
+        <w:t xml:space="preserve"> </w:t>
       </w:r>
       <w:r>
         <w:t>tables</w:t>
@@ -2561,116 +2724,9 @@
           <w:szCs w:val="18"/>
           <w14:ligatures w14:val="none"/>
         </w:rPr>
-        <w:t>**Figure 1. Study flow diagram (STROBE-style)**</w:t>
-      </w:r>
-      <w:r>
-        <w:rPr>
-          <w:rFonts w:ascii="Menlo" w:eastAsia="Times New Roman" w:hAnsi="Menlo" w:cs="Menlo"/>
-          <w:color w:val="3B3B3B"/>
-          <w:kern w:val="0"/>
-          <w:sz w:val="18"/>
-          <w:szCs w:val="18"/>
-          <w14:ligatures w14:val="none"/>
-        </w:rPr>
-        <w:t xml:space="preserve">  </w:t>
-      </w:r>
-    </w:p>
-    <w:p>
-      <w:pPr>
-        <w:shd w:val="clear" w:color="auto" w:fill="FFFFFF"/>
-        <w:spacing w:after="0" w:line="270" w:lineRule="atLeast"/>
-        <w:rPr>
-          <w:rFonts w:ascii="Menlo" w:eastAsia="Times New Roman" w:hAnsi="Menlo" w:cs="Menlo"/>
-          <w:color w:val="3B3B3B"/>
-          <w:kern w:val="0"/>
-          <w:sz w:val="18"/>
-          <w:szCs w:val="18"/>
-          <w14:ligatures w14:val="none"/>
-        </w:rPr>
-      </w:pPr>
-      <w:r>
-        <w:rPr>
-          <w:rFonts w:ascii="Menlo" w:eastAsia="Times New Roman" w:hAnsi="Menlo" w:cs="Menlo"/>
-          <w:color w:val="3B3B3B"/>
-          <w:kern w:val="0"/>
-          <w:sz w:val="18"/>
-          <w:szCs w:val="18"/>
-          <w14:ligatures w14:val="none"/>
-        </w:rPr>
-        <w:t xml:space="preserve">   </w:t>
-      </w:r>
-      <w:r>
-        <w:rPr>
-          <w:rFonts w:ascii="Menlo" w:eastAsia="Times New Roman" w:hAnsi="Menlo" w:cs="Menlo"/>
-          <w:color w:val="0451A5"/>
-          <w:kern w:val="0"/>
-          <w:sz w:val="18"/>
-          <w:szCs w:val="18"/>
-          <w14:ligatures w14:val="none"/>
-        </w:rPr>
-        <w:t>-</w:t>
-      </w:r>
-      <w:r>
-        <w:rPr>
-          <w:rFonts w:ascii="Menlo" w:eastAsia="Times New Roman" w:hAnsi="Menlo" w:cs="Menlo"/>
-          <w:color w:val="3B3B3B"/>
-          <w:kern w:val="0"/>
-          <w:sz w:val="18"/>
-          <w:szCs w:val="18"/>
-          <w14:ligatures w14:val="none"/>
-        </w:rPr>
-        <w:t xml:space="preserve"> Source population → exclusions → final analytic sample per outcome.</w:t>
-      </w:r>
-    </w:p>
-    <w:p>
-      <w:pPr>
-        <w:shd w:val="clear" w:color="auto" w:fill="FFFFFF"/>
-        <w:spacing w:after="0" w:line="270" w:lineRule="atLeast"/>
-        <w:rPr>
-          <w:rFonts w:ascii="Menlo" w:eastAsia="Times New Roman" w:hAnsi="Menlo" w:cs="Menlo"/>
-          <w:color w:val="3B3B3B"/>
-          <w:kern w:val="0"/>
-          <w:sz w:val="18"/>
-          <w:szCs w:val="18"/>
-          <w14:ligatures w14:val="none"/>
-        </w:rPr>
-      </w:pPr>
-    </w:p>
-    <w:p>
-      <w:pPr>
-        <w:shd w:val="clear" w:color="auto" w:fill="FFFFFF"/>
-        <w:spacing w:after="0" w:line="270" w:lineRule="atLeast"/>
-        <w:rPr>
-          <w:rFonts w:ascii="Menlo" w:eastAsia="Times New Roman" w:hAnsi="Menlo" w:cs="Menlo"/>
-          <w:color w:val="3B3B3B"/>
-          <w:kern w:val="0"/>
-          <w:sz w:val="18"/>
-          <w:szCs w:val="18"/>
-          <w14:ligatures w14:val="none"/>
-        </w:rPr>
-      </w:pPr>
-      <w:r>
-        <w:rPr>
-          <w:rFonts w:ascii="Menlo" w:eastAsia="Times New Roman" w:hAnsi="Menlo" w:cs="Menlo"/>
-          <w:color w:val="0451A5"/>
-          <w:kern w:val="0"/>
-          <w:sz w:val="18"/>
-          <w:szCs w:val="18"/>
-          <w14:ligatures w14:val="none"/>
-        </w:rPr>
-        <w:t>2.</w:t>
-      </w:r>
-      <w:r>
-        <w:rPr>
-          <w:rFonts w:ascii="Menlo" w:eastAsia="Times New Roman" w:hAnsi="Menlo" w:cs="Menlo"/>
-          <w:color w:val="3B3B3B"/>
-          <w:kern w:val="0"/>
-          <w:sz w:val="18"/>
-          <w:szCs w:val="18"/>
-          <w14:ligatures w14:val="none"/>
-        </w:rPr>
-        <w:t xml:space="preserve"> </w:t>
-      </w:r>
+        <w:t>**Figure 1. Study flow diagram (STROBE-</w:t>
+      </w:r>
+      <w:proofErr w:type="gramStart"/>
       <w:r>
         <w:rPr>
           <w:rFonts w:ascii="Menlo" w:eastAsia="Times New Roman" w:hAnsi="Menlo" w:cs="Menlo"/>
@@ -2682,116 +2738,9 @@
           <w:szCs w:val="18"/>
           <w14:ligatures w14:val="none"/>
         </w:rPr>
-        <w:t>**Figure 2. Covariate balance plot (“Love plot”)**</w:t>
-      </w:r>
-      <w:r>
-        <w:rPr>
-          <w:rFonts w:ascii="Menlo" w:eastAsia="Times New Roman" w:hAnsi="Menlo" w:cs="Menlo"/>
-          <w:color w:val="3B3B3B"/>
-          <w:kern w:val="0"/>
-          <w:sz w:val="18"/>
-          <w:szCs w:val="18"/>
-          <w14:ligatures w14:val="none"/>
-        </w:rPr>
-        <w:t xml:space="preserve">  </w:t>
-      </w:r>
-    </w:p>
-    <w:p>
-      <w:pPr>
-        <w:shd w:val="clear" w:color="auto" w:fill="FFFFFF"/>
-        <w:spacing w:after="0" w:line="270" w:lineRule="atLeast"/>
-        <w:rPr>
-          <w:rFonts w:ascii="Menlo" w:eastAsia="Times New Roman" w:hAnsi="Menlo" w:cs="Menlo"/>
-          <w:color w:val="3B3B3B"/>
-          <w:kern w:val="0"/>
-          <w:sz w:val="18"/>
-          <w:szCs w:val="18"/>
-          <w14:ligatures w14:val="none"/>
-        </w:rPr>
-      </w:pPr>
-      <w:r>
-        <w:rPr>
-          <w:rFonts w:ascii="Menlo" w:eastAsia="Times New Roman" w:hAnsi="Menlo" w:cs="Menlo"/>
-          <w:color w:val="3B3B3B"/>
-          <w:kern w:val="0"/>
-          <w:sz w:val="18"/>
-          <w:szCs w:val="18"/>
-          <w14:ligatures w14:val="none"/>
-        </w:rPr>
-        <w:t xml:space="preserve">   </w:t>
-      </w:r>
-      <w:r>
-        <w:rPr>
-          <w:rFonts w:ascii="Menlo" w:eastAsia="Times New Roman" w:hAnsi="Menlo" w:cs="Menlo"/>
-          <w:color w:val="0451A5"/>
-          <w:kern w:val="0"/>
-          <w:sz w:val="18"/>
-          <w:szCs w:val="18"/>
-          <w14:ligatures w14:val="none"/>
-        </w:rPr>
-        <w:t>-</w:t>
-      </w:r>
-      <w:r>
-        <w:rPr>
-          <w:rFonts w:ascii="Menlo" w:eastAsia="Times New Roman" w:hAnsi="Menlo" w:cs="Menlo"/>
-          <w:color w:val="3B3B3B"/>
-          <w:kern w:val="0"/>
-          <w:sz w:val="18"/>
-          <w:szCs w:val="18"/>
-          <w14:ligatures w14:val="none"/>
-        </w:rPr>
-        <w:t xml:space="preserve"> Standardized mean differences for matched variables before vs after matching.</w:t>
-      </w:r>
-    </w:p>
-    <w:p>
-      <w:pPr>
-        <w:shd w:val="clear" w:color="auto" w:fill="FFFFFF"/>
-        <w:spacing w:after="0" w:line="270" w:lineRule="atLeast"/>
-        <w:rPr>
-          <w:rFonts w:ascii="Menlo" w:eastAsia="Times New Roman" w:hAnsi="Menlo" w:cs="Menlo"/>
-          <w:color w:val="3B3B3B"/>
-          <w:kern w:val="0"/>
-          <w:sz w:val="18"/>
-          <w:szCs w:val="18"/>
-          <w14:ligatures w14:val="none"/>
-        </w:rPr>
-      </w:pPr>
-    </w:p>
-    <w:p>
-      <w:pPr>
-        <w:shd w:val="clear" w:color="auto" w:fill="FFFFFF"/>
-        <w:spacing w:after="0" w:line="270" w:lineRule="atLeast"/>
-        <w:rPr>
-          <w:rFonts w:ascii="Menlo" w:eastAsia="Times New Roman" w:hAnsi="Menlo" w:cs="Menlo"/>
-          <w:color w:val="3B3B3B"/>
-          <w:kern w:val="0"/>
-          <w:sz w:val="18"/>
-          <w:szCs w:val="18"/>
-          <w14:ligatures w14:val="none"/>
-        </w:rPr>
-      </w:pPr>
-      <w:r>
-        <w:rPr>
-          <w:rFonts w:ascii="Menlo" w:eastAsia="Times New Roman" w:hAnsi="Menlo" w:cs="Menlo"/>
-          <w:color w:val="0451A5"/>
-          <w:kern w:val="0"/>
-          <w:sz w:val="18"/>
-          <w:szCs w:val="18"/>
-          <w14:ligatures w14:val="none"/>
-        </w:rPr>
-        <w:t>3.</w:t>
-      </w:r>
-      <w:r>
-        <w:rPr>
-          <w:rFonts w:ascii="Menlo" w:eastAsia="Times New Roman" w:hAnsi="Menlo" w:cs="Menlo"/>
-          <w:color w:val="3B3B3B"/>
-          <w:kern w:val="0"/>
-          <w:sz w:val="18"/>
-          <w:szCs w:val="18"/>
-          <w14:ligatures w14:val="none"/>
-        </w:rPr>
-        <w:t xml:space="preserve"> </w:t>
-      </w:r>
+        <w:t>style)*</w:t>
+      </w:r>
+      <w:proofErr w:type="gramEnd"/>
       <w:r>
         <w:rPr>
           <w:rFonts w:ascii="Menlo" w:eastAsia="Times New Roman" w:hAnsi="Menlo" w:cs="Menlo"/>
@@ -2803,7 +2752,7 @@
           <w:szCs w:val="18"/>
           <w14:ligatures w14:val="none"/>
         </w:rPr>
-        <w:t>**Figure 3. Primary interaction plots (Cushing’s × Obesity)**</w:t>
+        <w:t>*</w:t>
       </w:r>
       <w:r>
         <w:rPr>
@@ -2861,7 +2810,7 @@
           <w:szCs w:val="18"/>
           <w14:ligatures w14:val="none"/>
         </w:rPr>
-        <w:t xml:space="preserve"> Panels for HbA1c, SBP, DBP, LDL-C, fasting glucose.  </w:t>
+        <w:t xml:space="preserve"> Source population → exclusions → final analytic sample per outcome.</w:t>
       </w:r>
     </w:p>
     <w:p>
@@ -2877,39 +2826,6 @@
           <w14:ligatures w14:val="none"/>
         </w:rPr>
       </w:pPr>
-      <w:r>
-        <w:rPr>
-          <w:rFonts w:ascii="Menlo" w:eastAsia="Times New Roman" w:hAnsi="Menlo" w:cs="Menlo"/>
-          <w:color w:val="3B3B3B"/>
-          <w:kern w:val="0"/>
-          <w:sz w:val="18"/>
-          <w:szCs w:val="18"/>
-          <w14:ligatures w14:val="none"/>
-        </w:rPr>
-        <w:t xml:space="preserve">   </w:t>
-      </w:r>
-      <w:r>
-        <w:rPr>
-          <w:rFonts w:ascii="Menlo" w:eastAsia="Times New Roman" w:hAnsi="Menlo" w:cs="Menlo"/>
-          <w:color w:val="0451A5"/>
-          <w:kern w:val="0"/>
-          <w:sz w:val="18"/>
-          <w:szCs w:val="18"/>
-          <w14:ligatures w14:val="none"/>
-        </w:rPr>
-        <w:t>-</w:t>
-      </w:r>
-      <w:r>
-        <w:rPr>
-          <w:rFonts w:ascii="Menlo" w:eastAsia="Times New Roman" w:hAnsi="Menlo" w:cs="Menlo"/>
-          <w:color w:val="3B3B3B"/>
-          <w:kern w:val="0"/>
-          <w:sz w:val="18"/>
-          <w:szCs w:val="18"/>
-          <w14:ligatures w14:val="none"/>
-        </w:rPr>
-        <w:t xml:space="preserve"> Y-axis: adjusted marginal mean (95% CI); X-axis: obesity stratum; color: Cushing’s vs Control.</w:t>
-      </w:r>
     </w:p>
     <w:p>
       <w:pPr>
@@ -2924,20 +2840,6 @@
           <w14:ligatures w14:val="none"/>
         </w:rPr>
       </w:pPr>
-    </w:p>
-    <w:p>
-      <w:pPr>
-        <w:shd w:val="clear" w:color="auto" w:fill="FFFFFF"/>
-        <w:spacing w:after="0" w:line="270" w:lineRule="atLeast"/>
-        <w:rPr>
-          <w:rFonts w:ascii="Menlo" w:eastAsia="Times New Roman" w:hAnsi="Menlo" w:cs="Menlo"/>
-          <w:color w:val="3B3B3B"/>
-          <w:kern w:val="0"/>
-          <w:sz w:val="18"/>
-          <w:szCs w:val="18"/>
-          <w14:ligatures w14:val="none"/>
-        </w:rPr>
-      </w:pPr>
       <w:r>
         <w:rPr>
           <w:rFonts w:ascii="Menlo" w:eastAsia="Times New Roman" w:hAnsi="Menlo" w:cs="Menlo"/>
@@ -2947,7 +2849,7 @@
           <w:szCs w:val="18"/>
           <w14:ligatures w14:val="none"/>
         </w:rPr>
-        <w:t>4.</w:t>
+        <w:t>2.</w:t>
       </w:r>
       <w:r>
         <w:rPr>
@@ -2971,116 +2873,9 @@
           <w:szCs w:val="18"/>
           <w14:ligatures w14:val="none"/>
         </w:rPr>
-        <w:t>**Figure 4. Forest plot of interaction estimates**</w:t>
-      </w:r>
-      <w:r>
-        <w:rPr>
-          <w:rFonts w:ascii="Menlo" w:eastAsia="Times New Roman" w:hAnsi="Menlo" w:cs="Menlo"/>
-          <w:color w:val="3B3B3B"/>
-          <w:kern w:val="0"/>
-          <w:sz w:val="18"/>
-          <w:szCs w:val="18"/>
-          <w14:ligatures w14:val="none"/>
-        </w:rPr>
-        <w:t xml:space="preserve">  </w:t>
-      </w:r>
-    </w:p>
-    <w:p>
-      <w:pPr>
-        <w:shd w:val="clear" w:color="auto" w:fill="FFFFFF"/>
-        <w:spacing w:after="0" w:line="270" w:lineRule="atLeast"/>
-        <w:rPr>
-          <w:rFonts w:ascii="Menlo" w:eastAsia="Times New Roman" w:hAnsi="Menlo" w:cs="Menlo"/>
-          <w:color w:val="3B3B3B"/>
-          <w:kern w:val="0"/>
-          <w:sz w:val="18"/>
-          <w:szCs w:val="18"/>
-          <w14:ligatures w14:val="none"/>
-        </w:rPr>
-      </w:pPr>
-      <w:r>
-        <w:rPr>
-          <w:rFonts w:ascii="Menlo" w:eastAsia="Times New Roman" w:hAnsi="Menlo" w:cs="Menlo"/>
-          <w:color w:val="3B3B3B"/>
-          <w:kern w:val="0"/>
-          <w:sz w:val="18"/>
-          <w:szCs w:val="18"/>
-          <w14:ligatures w14:val="none"/>
-        </w:rPr>
-        <w:t xml:space="preserve">   </w:t>
-      </w:r>
-      <w:r>
-        <w:rPr>
-          <w:rFonts w:ascii="Menlo" w:eastAsia="Times New Roman" w:hAnsi="Menlo" w:cs="Menlo"/>
-          <w:color w:val="0451A5"/>
-          <w:kern w:val="0"/>
-          <w:sz w:val="18"/>
-          <w:szCs w:val="18"/>
-          <w14:ligatures w14:val="none"/>
-        </w:rPr>
-        <w:t>-</w:t>
-      </w:r>
-      <w:r>
-        <w:rPr>
-          <w:rFonts w:ascii="Menlo" w:eastAsia="Times New Roman" w:hAnsi="Menlo" w:cs="Menlo"/>
-          <w:color w:val="3B3B3B"/>
-          <w:kern w:val="0"/>
-          <w:sz w:val="18"/>
-          <w:szCs w:val="18"/>
-          <w14:ligatures w14:val="none"/>
-        </w:rPr>
-        <w:t xml:space="preserve"> For each outcome, plot difference-in-differences (interaction term) with 95% CI.</w:t>
-      </w:r>
-    </w:p>
-    <w:p>
-      <w:pPr>
-        <w:shd w:val="clear" w:color="auto" w:fill="FFFFFF"/>
-        <w:spacing w:after="0" w:line="270" w:lineRule="atLeast"/>
-        <w:rPr>
-          <w:rFonts w:ascii="Menlo" w:eastAsia="Times New Roman" w:hAnsi="Menlo" w:cs="Menlo"/>
-          <w:color w:val="3B3B3B"/>
-          <w:kern w:val="0"/>
-          <w:sz w:val="18"/>
-          <w:szCs w:val="18"/>
-          <w14:ligatures w14:val="none"/>
-        </w:rPr>
-      </w:pPr>
-    </w:p>
-    <w:p>
-      <w:pPr>
-        <w:shd w:val="clear" w:color="auto" w:fill="FFFFFF"/>
-        <w:spacing w:after="0" w:line="270" w:lineRule="atLeast"/>
-        <w:rPr>
-          <w:rFonts w:ascii="Menlo" w:eastAsia="Times New Roman" w:hAnsi="Menlo" w:cs="Menlo"/>
-          <w:color w:val="3B3B3B"/>
-          <w:kern w:val="0"/>
-          <w:sz w:val="18"/>
-          <w:szCs w:val="18"/>
-          <w14:ligatures w14:val="none"/>
-        </w:rPr>
-      </w:pPr>
-      <w:r>
-        <w:rPr>
-          <w:rFonts w:ascii="Menlo" w:eastAsia="Times New Roman" w:hAnsi="Menlo" w:cs="Menlo"/>
-          <w:color w:val="0451A5"/>
-          <w:kern w:val="0"/>
-          <w:sz w:val="18"/>
-          <w:szCs w:val="18"/>
-          <w14:ligatures w14:val="none"/>
-        </w:rPr>
-        <w:t>5.</w:t>
-      </w:r>
-      <w:r>
-        <w:rPr>
-          <w:rFonts w:ascii="Menlo" w:eastAsia="Times New Roman" w:hAnsi="Menlo" w:cs="Menlo"/>
-          <w:color w:val="3B3B3B"/>
-          <w:kern w:val="0"/>
-          <w:sz w:val="18"/>
-          <w:szCs w:val="18"/>
-          <w14:ligatures w14:val="none"/>
-        </w:rPr>
-        <w:t xml:space="preserve"> </w:t>
-      </w:r>
+        <w:t>**Figure 2. Covariate balance plot (“Love plot</w:t>
+      </w:r>
+      <w:proofErr w:type="gramStart"/>
       <w:r>
         <w:rPr>
           <w:rFonts w:ascii="Menlo" w:eastAsia="Times New Roman" w:hAnsi="Menlo" w:cs="Menlo"/>
@@ -3092,6 +2887,458 @@
           <w:szCs w:val="18"/>
           <w14:ligatures w14:val="none"/>
         </w:rPr>
+        <w:t>”)*</w:t>
+      </w:r>
+      <w:proofErr w:type="gramEnd"/>
+      <w:r>
+        <w:rPr>
+          <w:rFonts w:ascii="Menlo" w:eastAsia="Times New Roman" w:hAnsi="Menlo" w:cs="Menlo"/>
+          <w:b/>
+          <w:bCs/>
+          <w:color w:val="000080"/>
+          <w:kern w:val="0"/>
+          <w:sz w:val="18"/>
+          <w:szCs w:val="18"/>
+          <w14:ligatures w14:val="none"/>
+        </w:rPr>
+        <w:t>*</w:t>
+      </w:r>
+      <w:r>
+        <w:rPr>
+          <w:rFonts w:ascii="Menlo" w:eastAsia="Times New Roman" w:hAnsi="Menlo" w:cs="Menlo"/>
+          <w:color w:val="3B3B3B"/>
+          <w:kern w:val="0"/>
+          <w:sz w:val="18"/>
+          <w:szCs w:val="18"/>
+          <w14:ligatures w14:val="none"/>
+        </w:rPr>
+        <w:t xml:space="preserve">  </w:t>
+      </w:r>
+    </w:p>
+    <w:p>
+      <w:pPr>
+        <w:shd w:val="clear" w:color="auto" w:fill="FFFFFF"/>
+        <w:spacing w:after="0" w:line="270" w:lineRule="atLeast"/>
+        <w:rPr>
+          <w:rFonts w:ascii="Menlo" w:eastAsia="Times New Roman" w:hAnsi="Menlo" w:cs="Menlo"/>
+          <w:color w:val="3B3B3B"/>
+          <w:kern w:val="0"/>
+          <w:sz w:val="18"/>
+          <w:szCs w:val="18"/>
+          <w14:ligatures w14:val="none"/>
+        </w:rPr>
+      </w:pPr>
+      <w:r>
+        <w:rPr>
+          <w:rFonts w:ascii="Menlo" w:eastAsia="Times New Roman" w:hAnsi="Menlo" w:cs="Menlo"/>
+          <w:color w:val="3B3B3B"/>
+          <w:kern w:val="0"/>
+          <w:sz w:val="18"/>
+          <w:szCs w:val="18"/>
+          <w14:ligatures w14:val="none"/>
+        </w:rPr>
+        <w:t xml:space="preserve">   </w:t>
+      </w:r>
+      <w:r>
+        <w:rPr>
+          <w:rFonts w:ascii="Menlo" w:eastAsia="Times New Roman" w:hAnsi="Menlo" w:cs="Menlo"/>
+          <w:color w:val="0451A5"/>
+          <w:kern w:val="0"/>
+          <w:sz w:val="18"/>
+          <w:szCs w:val="18"/>
+          <w14:ligatures w14:val="none"/>
+        </w:rPr>
+        <w:t>-</w:t>
+      </w:r>
+      <w:r>
+        <w:rPr>
+          <w:rFonts w:ascii="Menlo" w:eastAsia="Times New Roman" w:hAnsi="Menlo" w:cs="Menlo"/>
+          <w:color w:val="3B3B3B"/>
+          <w:kern w:val="0"/>
+          <w:sz w:val="18"/>
+          <w:szCs w:val="18"/>
+          <w14:ligatures w14:val="none"/>
+        </w:rPr>
+        <w:t xml:space="preserve"> Standardized mean differences for matched variables before vs after matching.</w:t>
+      </w:r>
+    </w:p>
+    <w:p>
+      <w:pPr>
+        <w:shd w:val="clear" w:color="auto" w:fill="FFFFFF"/>
+        <w:spacing w:after="0" w:line="270" w:lineRule="atLeast"/>
+        <w:rPr>
+          <w:rFonts w:ascii="Menlo" w:eastAsia="Times New Roman" w:hAnsi="Menlo" w:cs="Menlo"/>
+          <w:color w:val="3B3B3B"/>
+          <w:kern w:val="0"/>
+          <w:sz w:val="18"/>
+          <w:szCs w:val="18"/>
+          <w14:ligatures w14:val="none"/>
+        </w:rPr>
+      </w:pPr>
+    </w:p>
+    <w:p>
+      <w:pPr>
+        <w:shd w:val="clear" w:color="auto" w:fill="FFFFFF"/>
+        <w:spacing w:after="0" w:line="270" w:lineRule="atLeast"/>
+        <w:rPr>
+          <w:rFonts w:ascii="Menlo" w:eastAsia="Times New Roman" w:hAnsi="Menlo" w:cs="Menlo"/>
+          <w:color w:val="3B3B3B"/>
+          <w:kern w:val="0"/>
+          <w:sz w:val="18"/>
+          <w:szCs w:val="18"/>
+          <w14:ligatures w14:val="none"/>
+        </w:rPr>
+      </w:pPr>
+      <w:r>
+        <w:rPr>
+          <w:rFonts w:ascii="Menlo" w:eastAsia="Times New Roman" w:hAnsi="Menlo" w:cs="Menlo"/>
+          <w:color w:val="0451A5"/>
+          <w:kern w:val="0"/>
+          <w:sz w:val="18"/>
+          <w:szCs w:val="18"/>
+          <w14:ligatures w14:val="none"/>
+        </w:rPr>
+        <w:t>3.</w:t>
+      </w:r>
+      <w:r>
+        <w:rPr>
+          <w:rFonts w:ascii="Menlo" w:eastAsia="Times New Roman" w:hAnsi="Menlo" w:cs="Menlo"/>
+          <w:color w:val="3B3B3B"/>
+          <w:kern w:val="0"/>
+          <w:sz w:val="18"/>
+          <w:szCs w:val="18"/>
+          <w14:ligatures w14:val="none"/>
+        </w:rPr>
+        <w:t xml:space="preserve"> </w:t>
+      </w:r>
+      <w:r>
+        <w:rPr>
+          <w:rFonts w:ascii="Menlo" w:eastAsia="Times New Roman" w:hAnsi="Menlo" w:cs="Menlo"/>
+          <w:b/>
+          <w:bCs/>
+          <w:color w:val="000080"/>
+          <w:kern w:val="0"/>
+          <w:sz w:val="18"/>
+          <w:szCs w:val="18"/>
+          <w14:ligatures w14:val="none"/>
+        </w:rPr>
+        <w:t xml:space="preserve">**Figure 3. Primary interaction plots (Cushing’s × </w:t>
+      </w:r>
+      <w:proofErr w:type="gramStart"/>
+      <w:r>
+        <w:rPr>
+          <w:rFonts w:ascii="Menlo" w:eastAsia="Times New Roman" w:hAnsi="Menlo" w:cs="Menlo"/>
+          <w:b/>
+          <w:bCs/>
+          <w:color w:val="000080"/>
+          <w:kern w:val="0"/>
+          <w:sz w:val="18"/>
+          <w:szCs w:val="18"/>
+          <w14:ligatures w14:val="none"/>
+        </w:rPr>
+        <w:t>Obesity)*</w:t>
+      </w:r>
+      <w:proofErr w:type="gramEnd"/>
+      <w:r>
+        <w:rPr>
+          <w:rFonts w:ascii="Menlo" w:eastAsia="Times New Roman" w:hAnsi="Menlo" w:cs="Menlo"/>
+          <w:b/>
+          <w:bCs/>
+          <w:color w:val="000080"/>
+          <w:kern w:val="0"/>
+          <w:sz w:val="18"/>
+          <w:szCs w:val="18"/>
+          <w14:ligatures w14:val="none"/>
+        </w:rPr>
+        <w:t>*</w:t>
+      </w:r>
+      <w:r>
+        <w:rPr>
+          <w:rFonts w:ascii="Menlo" w:eastAsia="Times New Roman" w:hAnsi="Menlo" w:cs="Menlo"/>
+          <w:color w:val="3B3B3B"/>
+          <w:kern w:val="0"/>
+          <w:sz w:val="18"/>
+          <w:szCs w:val="18"/>
+          <w14:ligatures w14:val="none"/>
+        </w:rPr>
+        <w:t xml:space="preserve">  </w:t>
+      </w:r>
+    </w:p>
+    <w:p>
+      <w:pPr>
+        <w:shd w:val="clear" w:color="auto" w:fill="FFFFFF"/>
+        <w:spacing w:after="0" w:line="270" w:lineRule="atLeast"/>
+        <w:rPr>
+          <w:rFonts w:ascii="Menlo" w:eastAsia="Times New Roman" w:hAnsi="Menlo" w:cs="Menlo"/>
+          <w:color w:val="3B3B3B"/>
+          <w:kern w:val="0"/>
+          <w:sz w:val="18"/>
+          <w:szCs w:val="18"/>
+          <w14:ligatures w14:val="none"/>
+        </w:rPr>
+      </w:pPr>
+      <w:r>
+        <w:rPr>
+          <w:rFonts w:ascii="Menlo" w:eastAsia="Times New Roman" w:hAnsi="Menlo" w:cs="Menlo"/>
+          <w:color w:val="3B3B3B"/>
+          <w:kern w:val="0"/>
+          <w:sz w:val="18"/>
+          <w:szCs w:val="18"/>
+          <w14:ligatures w14:val="none"/>
+        </w:rPr>
+        <w:t xml:space="preserve">   </w:t>
+      </w:r>
+      <w:r>
+        <w:rPr>
+          <w:rFonts w:ascii="Menlo" w:eastAsia="Times New Roman" w:hAnsi="Menlo" w:cs="Menlo"/>
+          <w:color w:val="0451A5"/>
+          <w:kern w:val="0"/>
+          <w:sz w:val="18"/>
+          <w:szCs w:val="18"/>
+          <w14:ligatures w14:val="none"/>
+        </w:rPr>
+        <w:t>-</w:t>
+      </w:r>
+      <w:r>
+        <w:rPr>
+          <w:rFonts w:ascii="Menlo" w:eastAsia="Times New Roman" w:hAnsi="Menlo" w:cs="Menlo"/>
+          <w:color w:val="3B3B3B"/>
+          <w:kern w:val="0"/>
+          <w:sz w:val="18"/>
+          <w:szCs w:val="18"/>
+          <w14:ligatures w14:val="none"/>
+        </w:rPr>
+        <w:t xml:space="preserve"> Panels for HbA1c, SBP, DBP, LDL-C, fasting glucose.  </w:t>
+      </w:r>
+    </w:p>
+    <w:p>
+      <w:pPr>
+        <w:shd w:val="clear" w:color="auto" w:fill="FFFFFF"/>
+        <w:spacing w:after="0" w:line="270" w:lineRule="atLeast"/>
+        <w:rPr>
+          <w:rFonts w:ascii="Menlo" w:eastAsia="Times New Roman" w:hAnsi="Menlo" w:cs="Menlo"/>
+          <w:color w:val="3B3B3B"/>
+          <w:kern w:val="0"/>
+          <w:sz w:val="18"/>
+          <w:szCs w:val="18"/>
+          <w14:ligatures w14:val="none"/>
+        </w:rPr>
+      </w:pPr>
+      <w:r>
+        <w:rPr>
+          <w:rFonts w:ascii="Menlo" w:eastAsia="Times New Roman" w:hAnsi="Menlo" w:cs="Menlo"/>
+          <w:color w:val="3B3B3B"/>
+          <w:kern w:val="0"/>
+          <w:sz w:val="18"/>
+          <w:szCs w:val="18"/>
+          <w14:ligatures w14:val="none"/>
+        </w:rPr>
+        <w:t xml:space="preserve">   </w:t>
+      </w:r>
+      <w:r>
+        <w:rPr>
+          <w:rFonts w:ascii="Menlo" w:eastAsia="Times New Roman" w:hAnsi="Menlo" w:cs="Menlo"/>
+          <w:color w:val="0451A5"/>
+          <w:kern w:val="0"/>
+          <w:sz w:val="18"/>
+          <w:szCs w:val="18"/>
+          <w14:ligatures w14:val="none"/>
+        </w:rPr>
+        <w:t>-</w:t>
+      </w:r>
+      <w:r>
+        <w:rPr>
+          <w:rFonts w:ascii="Menlo" w:eastAsia="Times New Roman" w:hAnsi="Menlo" w:cs="Menlo"/>
+          <w:color w:val="3B3B3B"/>
+          <w:kern w:val="0"/>
+          <w:sz w:val="18"/>
+          <w:szCs w:val="18"/>
+          <w14:ligatures w14:val="none"/>
+        </w:rPr>
+        <w:t xml:space="preserve"> Y-axis: adjusted marginal mean (95% CI); X-axis: obesity stratum; color: Cushing’s vs Control.</w:t>
+      </w:r>
+    </w:p>
+    <w:p>
+      <w:pPr>
+        <w:shd w:val="clear" w:color="auto" w:fill="FFFFFF"/>
+        <w:spacing w:after="0" w:line="270" w:lineRule="atLeast"/>
+        <w:rPr>
+          <w:rFonts w:ascii="Menlo" w:eastAsia="Times New Roman" w:hAnsi="Menlo" w:cs="Menlo"/>
+          <w:color w:val="3B3B3B"/>
+          <w:kern w:val="0"/>
+          <w:sz w:val="18"/>
+          <w:szCs w:val="18"/>
+          <w14:ligatures w14:val="none"/>
+        </w:rPr>
+      </w:pPr>
+    </w:p>
+    <w:p>
+      <w:pPr>
+        <w:shd w:val="clear" w:color="auto" w:fill="FFFFFF"/>
+        <w:spacing w:after="0" w:line="270" w:lineRule="atLeast"/>
+        <w:rPr>
+          <w:rFonts w:ascii="Menlo" w:eastAsia="Times New Roman" w:hAnsi="Menlo" w:cs="Menlo"/>
+          <w:color w:val="3B3B3B"/>
+          <w:kern w:val="0"/>
+          <w:sz w:val="18"/>
+          <w:szCs w:val="18"/>
+          <w14:ligatures w14:val="none"/>
+        </w:rPr>
+      </w:pPr>
+      <w:r>
+        <w:rPr>
+          <w:rFonts w:ascii="Menlo" w:eastAsia="Times New Roman" w:hAnsi="Menlo" w:cs="Menlo"/>
+          <w:color w:val="0451A5"/>
+          <w:kern w:val="0"/>
+          <w:sz w:val="18"/>
+          <w:szCs w:val="18"/>
+          <w14:ligatures w14:val="none"/>
+        </w:rPr>
+        <w:t>4.</w:t>
+      </w:r>
+      <w:r>
+        <w:rPr>
+          <w:rFonts w:ascii="Menlo" w:eastAsia="Times New Roman" w:hAnsi="Menlo" w:cs="Menlo"/>
+          <w:color w:val="3B3B3B"/>
+          <w:kern w:val="0"/>
+          <w:sz w:val="18"/>
+          <w:szCs w:val="18"/>
+          <w14:ligatures w14:val="none"/>
+        </w:rPr>
+        <w:t xml:space="preserve"> </w:t>
+      </w:r>
+      <w:r>
+        <w:rPr>
+          <w:rFonts w:ascii="Menlo" w:eastAsia="Times New Roman" w:hAnsi="Menlo" w:cs="Menlo"/>
+          <w:b/>
+          <w:bCs/>
+          <w:color w:val="000080"/>
+          <w:kern w:val="0"/>
+          <w:sz w:val="18"/>
+          <w:szCs w:val="18"/>
+          <w14:ligatures w14:val="none"/>
+        </w:rPr>
+        <w:t>**Figure 4. Forest plot of interaction estimates**</w:t>
+      </w:r>
+      <w:r>
+        <w:rPr>
+          <w:rFonts w:ascii="Menlo" w:eastAsia="Times New Roman" w:hAnsi="Menlo" w:cs="Menlo"/>
+          <w:color w:val="3B3B3B"/>
+          <w:kern w:val="0"/>
+          <w:sz w:val="18"/>
+          <w:szCs w:val="18"/>
+          <w14:ligatures w14:val="none"/>
+        </w:rPr>
+        <w:t xml:space="preserve">  </w:t>
+      </w:r>
+    </w:p>
+    <w:p>
+      <w:pPr>
+        <w:shd w:val="clear" w:color="auto" w:fill="FFFFFF"/>
+        <w:spacing w:after="0" w:line="270" w:lineRule="atLeast"/>
+        <w:rPr>
+          <w:rFonts w:ascii="Menlo" w:eastAsia="Times New Roman" w:hAnsi="Menlo" w:cs="Menlo"/>
+          <w:color w:val="3B3B3B"/>
+          <w:kern w:val="0"/>
+          <w:sz w:val="18"/>
+          <w:szCs w:val="18"/>
+          <w14:ligatures w14:val="none"/>
+        </w:rPr>
+      </w:pPr>
+      <w:r>
+        <w:rPr>
+          <w:rFonts w:ascii="Menlo" w:eastAsia="Times New Roman" w:hAnsi="Menlo" w:cs="Menlo"/>
+          <w:color w:val="3B3B3B"/>
+          <w:kern w:val="0"/>
+          <w:sz w:val="18"/>
+          <w:szCs w:val="18"/>
+          <w14:ligatures w14:val="none"/>
+        </w:rPr>
+        <w:t xml:space="preserve">   </w:t>
+      </w:r>
+      <w:r>
+        <w:rPr>
+          <w:rFonts w:ascii="Menlo" w:eastAsia="Times New Roman" w:hAnsi="Menlo" w:cs="Menlo"/>
+          <w:color w:val="0451A5"/>
+          <w:kern w:val="0"/>
+          <w:sz w:val="18"/>
+          <w:szCs w:val="18"/>
+          <w14:ligatures w14:val="none"/>
+        </w:rPr>
+        <w:t>-</w:t>
+      </w:r>
+      <w:r>
+        <w:rPr>
+          <w:rFonts w:ascii="Menlo" w:eastAsia="Times New Roman" w:hAnsi="Menlo" w:cs="Menlo"/>
+          <w:color w:val="3B3B3B"/>
+          <w:kern w:val="0"/>
+          <w:sz w:val="18"/>
+          <w:szCs w:val="18"/>
+          <w14:ligatures w14:val="none"/>
+        </w:rPr>
+        <w:t xml:space="preserve"> For each outcome, plot difference-in-differences (interaction term) with 95% CI.</w:t>
+      </w:r>
+    </w:p>
+    <w:p>
+      <w:pPr>
+        <w:shd w:val="clear" w:color="auto" w:fill="FFFFFF"/>
+        <w:spacing w:after="0" w:line="270" w:lineRule="atLeast"/>
+        <w:rPr>
+          <w:rFonts w:ascii="Menlo" w:eastAsia="Times New Roman" w:hAnsi="Menlo" w:cs="Menlo"/>
+          <w:color w:val="3B3B3B"/>
+          <w:kern w:val="0"/>
+          <w:sz w:val="18"/>
+          <w:szCs w:val="18"/>
+          <w14:ligatures w14:val="none"/>
+        </w:rPr>
+      </w:pPr>
+    </w:p>
+    <w:p>
+      <w:pPr>
+        <w:shd w:val="clear" w:color="auto" w:fill="FFFFFF"/>
+        <w:spacing w:after="0" w:line="270" w:lineRule="atLeast"/>
+        <w:rPr>
+          <w:rFonts w:ascii="Menlo" w:eastAsia="Times New Roman" w:hAnsi="Menlo" w:cs="Menlo"/>
+          <w:color w:val="3B3B3B"/>
+          <w:kern w:val="0"/>
+          <w:sz w:val="18"/>
+          <w:szCs w:val="18"/>
+          <w14:ligatures w14:val="none"/>
+        </w:rPr>
+      </w:pPr>
+      <w:r>
+        <w:rPr>
+          <w:rFonts w:ascii="Menlo" w:eastAsia="Times New Roman" w:hAnsi="Menlo" w:cs="Menlo"/>
+          <w:color w:val="0451A5"/>
+          <w:kern w:val="0"/>
+          <w:sz w:val="18"/>
+          <w:szCs w:val="18"/>
+          <w14:ligatures w14:val="none"/>
+        </w:rPr>
+        <w:t>5.</w:t>
+      </w:r>
+      <w:r>
+        <w:rPr>
+          <w:rFonts w:ascii="Menlo" w:eastAsia="Times New Roman" w:hAnsi="Menlo" w:cs="Menlo"/>
+          <w:color w:val="3B3B3B"/>
+          <w:kern w:val="0"/>
+          <w:sz w:val="18"/>
+          <w:szCs w:val="18"/>
+          <w14:ligatures w14:val="none"/>
+        </w:rPr>
+        <w:t xml:space="preserve"> </w:t>
+      </w:r>
+      <w:r>
+        <w:rPr>
+          <w:rFonts w:ascii="Menlo" w:eastAsia="Times New Roman" w:hAnsi="Menlo" w:cs="Menlo"/>
+          <w:b/>
+          <w:bCs/>
+          <w:color w:val="000080"/>
+          <w:kern w:val="0"/>
+          <w:sz w:val="18"/>
+          <w:szCs w:val="18"/>
+          <w14:ligatures w14:val="none"/>
+        </w:rPr>
         <w:t>**Figure 5 (optional). Outcome distributions by 2×2 groups**</w:t>
       </w:r>
       <w:r>
@@ -3254,138 +3501,9 @@
           <w:szCs w:val="18"/>
           <w14:ligatures w14:val="none"/>
         </w:rPr>
-        <w:t>**Table 1. Baseline characteristics by Cushing’s status (matched sample)**</w:t>
-      </w:r>
-      <w:r>
-        <w:rPr>
-          <w:rFonts w:ascii="Menlo" w:eastAsia="Times New Roman" w:hAnsi="Menlo" w:cs="Menlo"/>
-          <w:color w:val="3B3B3B"/>
-          <w:kern w:val="0"/>
-          <w:sz w:val="18"/>
-          <w:szCs w:val="18"/>
-          <w14:ligatures w14:val="none"/>
-        </w:rPr>
-        <w:t xml:space="preserve">  </w:t>
-      </w:r>
-    </w:p>
-    <w:p>
-      <w:pPr>
-        <w:shd w:val="clear" w:color="auto" w:fill="FFFFFF"/>
-        <w:spacing w:after="0" w:line="270" w:lineRule="atLeast"/>
-        <w:rPr>
-          <w:rFonts w:ascii="Menlo" w:eastAsia="Times New Roman" w:hAnsi="Menlo" w:cs="Menlo"/>
-          <w:color w:val="3B3B3B"/>
-          <w:kern w:val="0"/>
-          <w:sz w:val="18"/>
-          <w:szCs w:val="18"/>
-          <w14:ligatures w14:val="none"/>
-        </w:rPr>
-      </w:pPr>
-      <w:r>
-        <w:rPr>
-          <w:rFonts w:ascii="Menlo" w:eastAsia="Times New Roman" w:hAnsi="Menlo" w:cs="Menlo"/>
-          <w:color w:val="3B3B3B"/>
-          <w:kern w:val="0"/>
-          <w:sz w:val="18"/>
-          <w:szCs w:val="18"/>
-          <w14:ligatures w14:val="none"/>
-        </w:rPr>
-        <w:t xml:space="preserve">   </w:t>
-      </w:r>
-      <w:r>
-        <w:rPr>
-          <w:rFonts w:ascii="Menlo" w:eastAsia="Times New Roman" w:hAnsi="Menlo" w:cs="Menlo"/>
-          <w:color w:val="0451A5"/>
-          <w:kern w:val="0"/>
-          <w:sz w:val="18"/>
-          <w:szCs w:val="18"/>
-          <w14:ligatures w14:val="none"/>
-        </w:rPr>
-        <w:t>-</w:t>
-      </w:r>
-      <w:r>
-        <w:rPr>
-          <w:rFonts w:ascii="Menlo" w:eastAsia="Times New Roman" w:hAnsi="Menlo" w:cs="Menlo"/>
-          <w:color w:val="3B3B3B"/>
-          <w:kern w:val="0"/>
-          <w:sz w:val="18"/>
-          <w:szCs w:val="18"/>
-          <w14:ligatures w14:val="none"/>
-        </w:rPr>
-        <w:t xml:space="preserve"> N, mean±SD or median [</w:t>
-      </w:r>
-      <w:r>
-        <w:rPr>
-          <w:rFonts w:ascii="Menlo" w:eastAsia="Times New Roman" w:hAnsi="Menlo" w:cs="Menlo"/>
-          <w:color w:val="A31515"/>
-          <w:kern w:val="0"/>
-          <w:sz w:val="18"/>
-          <w:szCs w:val="18"/>
-          <w14:ligatures w14:val="none"/>
-        </w:rPr>
-        <w:t>IQR</w:t>
-      </w:r>
-      <w:r>
-        <w:rPr>
-          <w:rFonts w:ascii="Menlo" w:eastAsia="Times New Roman" w:hAnsi="Menlo" w:cs="Menlo"/>
-          <w:color w:val="3B3B3B"/>
-          <w:kern w:val="0"/>
-          <w:sz w:val="18"/>
-          <w:szCs w:val="18"/>
-          <w14:ligatures w14:val="none"/>
-        </w:rPr>
-        <w:t>], standardized mean differences.</w:t>
-      </w:r>
-    </w:p>
-    <w:p>
-      <w:pPr>
-        <w:shd w:val="clear" w:color="auto" w:fill="FFFFFF"/>
-        <w:spacing w:after="0" w:line="270" w:lineRule="atLeast"/>
-        <w:rPr>
-          <w:rFonts w:ascii="Menlo" w:eastAsia="Times New Roman" w:hAnsi="Menlo" w:cs="Menlo"/>
-          <w:color w:val="3B3B3B"/>
-          <w:kern w:val="0"/>
-          <w:sz w:val="18"/>
-          <w:szCs w:val="18"/>
-          <w14:ligatures w14:val="none"/>
-        </w:rPr>
-      </w:pPr>
-    </w:p>
-    <w:p>
-      <w:pPr>
-        <w:shd w:val="clear" w:color="auto" w:fill="FFFFFF"/>
-        <w:spacing w:after="0" w:line="270" w:lineRule="atLeast"/>
-        <w:rPr>
-          <w:rFonts w:ascii="Menlo" w:eastAsia="Times New Roman" w:hAnsi="Menlo" w:cs="Menlo"/>
-          <w:color w:val="3B3B3B"/>
-          <w:kern w:val="0"/>
-          <w:sz w:val="18"/>
-          <w:szCs w:val="18"/>
-          <w14:ligatures w14:val="none"/>
-        </w:rPr>
-      </w:pPr>
-      <w:r>
-        <w:rPr>
-          <w:rFonts w:ascii="Menlo" w:eastAsia="Times New Roman" w:hAnsi="Menlo" w:cs="Menlo"/>
-          <w:color w:val="0451A5"/>
-          <w:kern w:val="0"/>
-          <w:sz w:val="18"/>
-          <w:szCs w:val="18"/>
-          <w14:ligatures w14:val="none"/>
-        </w:rPr>
-        <w:t>2.</w:t>
-      </w:r>
-      <w:r>
-        <w:rPr>
-          <w:rFonts w:ascii="Menlo" w:eastAsia="Times New Roman" w:hAnsi="Menlo" w:cs="Menlo"/>
-          <w:color w:val="3B3B3B"/>
-          <w:kern w:val="0"/>
-          <w:sz w:val="18"/>
-          <w:szCs w:val="18"/>
-          <w14:ligatures w14:val="none"/>
-        </w:rPr>
-        <w:t xml:space="preserve"> </w:t>
-      </w:r>
+        <w:t xml:space="preserve">**Table 1. Baseline characteristics by Cushing’s status (matched </w:t>
+      </w:r>
+      <w:proofErr w:type="gramStart"/>
       <w:r>
         <w:rPr>
           <w:rFonts w:ascii="Menlo" w:eastAsia="Times New Roman" w:hAnsi="Menlo" w:cs="Menlo"/>
@@ -3397,116 +3515,9 @@
           <w:szCs w:val="18"/>
           <w14:ligatures w14:val="none"/>
         </w:rPr>
-        <w:t>**Table 2. Characteristics by 2×2 groups (Cushing’s × Obesity)**</w:t>
-      </w:r>
-      <w:r>
-        <w:rPr>
-          <w:rFonts w:ascii="Menlo" w:eastAsia="Times New Roman" w:hAnsi="Menlo" w:cs="Menlo"/>
-          <w:color w:val="3B3B3B"/>
-          <w:kern w:val="0"/>
-          <w:sz w:val="18"/>
-          <w:szCs w:val="18"/>
-          <w14:ligatures w14:val="none"/>
-        </w:rPr>
-        <w:t xml:space="preserve">  </w:t>
-      </w:r>
-    </w:p>
-    <w:p>
-      <w:pPr>
-        <w:shd w:val="clear" w:color="auto" w:fill="FFFFFF"/>
-        <w:spacing w:after="0" w:line="270" w:lineRule="atLeast"/>
-        <w:rPr>
-          <w:rFonts w:ascii="Menlo" w:eastAsia="Times New Roman" w:hAnsi="Menlo" w:cs="Menlo"/>
-          <w:color w:val="3B3B3B"/>
-          <w:kern w:val="0"/>
-          <w:sz w:val="18"/>
-          <w:szCs w:val="18"/>
-          <w14:ligatures w14:val="none"/>
-        </w:rPr>
-      </w:pPr>
-      <w:r>
-        <w:rPr>
-          <w:rFonts w:ascii="Menlo" w:eastAsia="Times New Roman" w:hAnsi="Menlo" w:cs="Menlo"/>
-          <w:color w:val="3B3B3B"/>
-          <w:kern w:val="0"/>
-          <w:sz w:val="18"/>
-          <w:szCs w:val="18"/>
-          <w14:ligatures w14:val="none"/>
-        </w:rPr>
-        <w:t xml:space="preserve">   </w:t>
-      </w:r>
-      <w:r>
-        <w:rPr>
-          <w:rFonts w:ascii="Menlo" w:eastAsia="Times New Roman" w:hAnsi="Menlo" w:cs="Menlo"/>
-          <w:color w:val="0451A5"/>
-          <w:kern w:val="0"/>
-          <w:sz w:val="18"/>
-          <w:szCs w:val="18"/>
-          <w14:ligatures w14:val="none"/>
-        </w:rPr>
-        <w:t>-</w:t>
-      </w:r>
-      <w:r>
-        <w:rPr>
-          <w:rFonts w:ascii="Menlo" w:eastAsia="Times New Roman" w:hAnsi="Menlo" w:cs="Menlo"/>
-          <w:color w:val="3B3B3B"/>
-          <w:kern w:val="0"/>
-          <w:sz w:val="18"/>
-          <w:szCs w:val="18"/>
-          <w14:ligatures w14:val="none"/>
-        </w:rPr>
-        <w:t xml:space="preserve"> Four columns: Lean-Control, Lean-Cushing’s, Obese-Control, Obese-Cushing’s.</w:t>
-      </w:r>
-    </w:p>
-    <w:p>
-      <w:pPr>
-        <w:shd w:val="clear" w:color="auto" w:fill="FFFFFF"/>
-        <w:spacing w:after="0" w:line="270" w:lineRule="atLeast"/>
-        <w:rPr>
-          <w:rFonts w:ascii="Menlo" w:eastAsia="Times New Roman" w:hAnsi="Menlo" w:cs="Menlo"/>
-          <w:color w:val="3B3B3B"/>
-          <w:kern w:val="0"/>
-          <w:sz w:val="18"/>
-          <w:szCs w:val="18"/>
-          <w14:ligatures w14:val="none"/>
-        </w:rPr>
-      </w:pPr>
-    </w:p>
-    <w:p>
-      <w:pPr>
-        <w:shd w:val="clear" w:color="auto" w:fill="FFFFFF"/>
-        <w:spacing w:after="0" w:line="270" w:lineRule="atLeast"/>
-        <w:rPr>
-          <w:rFonts w:ascii="Menlo" w:eastAsia="Times New Roman" w:hAnsi="Menlo" w:cs="Menlo"/>
-          <w:color w:val="3B3B3B"/>
-          <w:kern w:val="0"/>
-          <w:sz w:val="18"/>
-          <w:szCs w:val="18"/>
-          <w14:ligatures w14:val="none"/>
-        </w:rPr>
-      </w:pPr>
-      <w:r>
-        <w:rPr>
-          <w:rFonts w:ascii="Menlo" w:eastAsia="Times New Roman" w:hAnsi="Menlo" w:cs="Menlo"/>
-          <w:color w:val="0451A5"/>
-          <w:kern w:val="0"/>
-          <w:sz w:val="18"/>
-          <w:szCs w:val="18"/>
-          <w14:ligatures w14:val="none"/>
-        </w:rPr>
-        <w:t>3.</w:t>
-      </w:r>
-      <w:r>
-        <w:rPr>
-          <w:rFonts w:ascii="Menlo" w:eastAsia="Times New Roman" w:hAnsi="Menlo" w:cs="Menlo"/>
-          <w:color w:val="3B3B3B"/>
-          <w:kern w:val="0"/>
-          <w:sz w:val="18"/>
-          <w:szCs w:val="18"/>
-          <w14:ligatures w14:val="none"/>
-        </w:rPr>
-        <w:t xml:space="preserve"> </w:t>
-      </w:r>
+        <w:t>sample)*</w:t>
+      </w:r>
+      <w:proofErr w:type="gramEnd"/>
       <w:r>
         <w:rPr>
           <w:rFonts w:ascii="Menlo" w:eastAsia="Times New Roman" w:hAnsi="Menlo" w:cs="Menlo"/>
@@ -3518,7 +3529,7 @@
           <w:szCs w:val="18"/>
           <w14:ligatures w14:val="none"/>
         </w:rPr>
-        <w:t>**Table 3. Primary adjusted results with interaction**</w:t>
+        <w:t>*</w:t>
       </w:r>
       <w:r>
         <w:rPr>
@@ -3576,7 +3587,53 @@
           <w:szCs w:val="18"/>
           <w14:ligatures w14:val="none"/>
         </w:rPr>
-        <w:t xml:space="preserve"> Adjusted means by group; within-stratum differences; interaction estimate (95% CI, p-value).</w:t>
+        <w:t xml:space="preserve"> N, </w:t>
+      </w:r>
+      <w:proofErr w:type="spellStart"/>
+      <w:r>
+        <w:rPr>
+          <w:rFonts w:ascii="Menlo" w:eastAsia="Times New Roman" w:hAnsi="Menlo" w:cs="Menlo"/>
+          <w:color w:val="3B3B3B"/>
+          <w:kern w:val="0"/>
+          <w:sz w:val="18"/>
+          <w:szCs w:val="18"/>
+          <w14:ligatures w14:val="none"/>
+        </w:rPr>
+        <w:t>mean±SD</w:t>
+      </w:r>
+      <w:proofErr w:type="spellEnd"/>
+      <w:r>
+        <w:rPr>
+          <w:rFonts w:ascii="Menlo" w:eastAsia="Times New Roman" w:hAnsi="Menlo" w:cs="Menlo"/>
+          <w:color w:val="3B3B3B"/>
+          <w:kern w:val="0"/>
+          <w:sz w:val="18"/>
+          <w:szCs w:val="18"/>
+          <w14:ligatures w14:val="none"/>
+        </w:rPr>
+        <w:t xml:space="preserve"> or median [</w:t>
+      </w:r>
+      <w:r>
+        <w:rPr>
+          <w:rFonts w:ascii="Menlo" w:eastAsia="Times New Roman" w:hAnsi="Menlo" w:cs="Menlo"/>
+          <w:color w:val="A31515"/>
+          <w:kern w:val="0"/>
+          <w:sz w:val="18"/>
+          <w:szCs w:val="18"/>
+          <w14:ligatures w14:val="none"/>
+        </w:rPr>
+        <w:t>IQR</w:t>
+      </w:r>
+      <w:r>
+        <w:rPr>
+          <w:rFonts w:ascii="Menlo" w:eastAsia="Times New Roman" w:hAnsi="Menlo" w:cs="Menlo"/>
+          <w:color w:val="3B3B3B"/>
+          <w:kern w:val="0"/>
+          <w:sz w:val="18"/>
+          <w:szCs w:val="18"/>
+          <w14:ligatures w14:val="none"/>
+        </w:rPr>
+        <w:t>], standardized mean differences.</w:t>
       </w:r>
     </w:p>
     <w:p>
@@ -3615,7 +3672,7 @@
           <w:szCs w:val="18"/>
           <w14:ligatures w14:val="none"/>
         </w:rPr>
-        <w:t>4.</w:t>
+        <w:t>2.</w:t>
       </w:r>
       <w:r>
         <w:rPr>
@@ -3639,6 +3696,276 @@
           <w:szCs w:val="18"/>
           <w14:ligatures w14:val="none"/>
         </w:rPr>
+        <w:t xml:space="preserve">**Table 2. Characteristics by 2×2 groups (Cushing’s × </w:t>
+      </w:r>
+      <w:proofErr w:type="gramStart"/>
+      <w:r>
+        <w:rPr>
+          <w:rFonts w:ascii="Menlo" w:eastAsia="Times New Roman" w:hAnsi="Menlo" w:cs="Menlo"/>
+          <w:b/>
+          <w:bCs/>
+          <w:color w:val="000080"/>
+          <w:kern w:val="0"/>
+          <w:sz w:val="18"/>
+          <w:szCs w:val="18"/>
+          <w14:ligatures w14:val="none"/>
+        </w:rPr>
+        <w:t>Obesity)*</w:t>
+      </w:r>
+      <w:proofErr w:type="gramEnd"/>
+      <w:r>
+        <w:rPr>
+          <w:rFonts w:ascii="Menlo" w:eastAsia="Times New Roman" w:hAnsi="Menlo" w:cs="Menlo"/>
+          <w:b/>
+          <w:bCs/>
+          <w:color w:val="000080"/>
+          <w:kern w:val="0"/>
+          <w:sz w:val="18"/>
+          <w:szCs w:val="18"/>
+          <w14:ligatures w14:val="none"/>
+        </w:rPr>
+        <w:t>*</w:t>
+      </w:r>
+      <w:r>
+        <w:rPr>
+          <w:rFonts w:ascii="Menlo" w:eastAsia="Times New Roman" w:hAnsi="Menlo" w:cs="Menlo"/>
+          <w:color w:val="3B3B3B"/>
+          <w:kern w:val="0"/>
+          <w:sz w:val="18"/>
+          <w:szCs w:val="18"/>
+          <w14:ligatures w14:val="none"/>
+        </w:rPr>
+        <w:t xml:space="preserve">  </w:t>
+      </w:r>
+    </w:p>
+    <w:p>
+      <w:pPr>
+        <w:shd w:val="clear" w:color="auto" w:fill="FFFFFF"/>
+        <w:spacing w:after="0" w:line="270" w:lineRule="atLeast"/>
+        <w:rPr>
+          <w:rFonts w:ascii="Menlo" w:eastAsia="Times New Roman" w:hAnsi="Menlo" w:cs="Menlo"/>
+          <w:color w:val="3B3B3B"/>
+          <w:kern w:val="0"/>
+          <w:sz w:val="18"/>
+          <w:szCs w:val="18"/>
+          <w14:ligatures w14:val="none"/>
+        </w:rPr>
+      </w:pPr>
+      <w:r>
+        <w:rPr>
+          <w:rFonts w:ascii="Menlo" w:eastAsia="Times New Roman" w:hAnsi="Menlo" w:cs="Menlo"/>
+          <w:color w:val="3B3B3B"/>
+          <w:kern w:val="0"/>
+          <w:sz w:val="18"/>
+          <w:szCs w:val="18"/>
+          <w14:ligatures w14:val="none"/>
+        </w:rPr>
+        <w:t xml:space="preserve">   </w:t>
+      </w:r>
+      <w:r>
+        <w:rPr>
+          <w:rFonts w:ascii="Menlo" w:eastAsia="Times New Roman" w:hAnsi="Menlo" w:cs="Menlo"/>
+          <w:color w:val="0451A5"/>
+          <w:kern w:val="0"/>
+          <w:sz w:val="18"/>
+          <w:szCs w:val="18"/>
+          <w14:ligatures w14:val="none"/>
+        </w:rPr>
+        <w:t>-</w:t>
+      </w:r>
+      <w:r>
+        <w:rPr>
+          <w:rFonts w:ascii="Menlo" w:eastAsia="Times New Roman" w:hAnsi="Menlo" w:cs="Menlo"/>
+          <w:color w:val="3B3B3B"/>
+          <w:kern w:val="0"/>
+          <w:sz w:val="18"/>
+          <w:szCs w:val="18"/>
+          <w14:ligatures w14:val="none"/>
+        </w:rPr>
+        <w:t xml:space="preserve"> Four columns: Lean-Control, Lean-Cushing’s, Obese-Control, Obese-Cushing’s.</w:t>
+      </w:r>
+    </w:p>
+    <w:p>
+      <w:pPr>
+        <w:shd w:val="clear" w:color="auto" w:fill="FFFFFF"/>
+        <w:spacing w:after="0" w:line="270" w:lineRule="atLeast"/>
+        <w:rPr>
+          <w:rFonts w:ascii="Menlo" w:eastAsia="Times New Roman" w:hAnsi="Menlo" w:cs="Menlo"/>
+          <w:color w:val="3B3B3B"/>
+          <w:kern w:val="0"/>
+          <w:sz w:val="18"/>
+          <w:szCs w:val="18"/>
+          <w14:ligatures w14:val="none"/>
+        </w:rPr>
+      </w:pPr>
+    </w:p>
+    <w:p>
+      <w:pPr>
+        <w:shd w:val="clear" w:color="auto" w:fill="FFFFFF"/>
+        <w:spacing w:after="0" w:line="270" w:lineRule="atLeast"/>
+        <w:rPr>
+          <w:rFonts w:ascii="Menlo" w:eastAsia="Times New Roman" w:hAnsi="Menlo" w:cs="Menlo"/>
+          <w:color w:val="3B3B3B"/>
+          <w:kern w:val="0"/>
+          <w:sz w:val="18"/>
+          <w:szCs w:val="18"/>
+          <w14:ligatures w14:val="none"/>
+        </w:rPr>
+      </w:pPr>
+      <w:r>
+        <w:rPr>
+          <w:rFonts w:ascii="Menlo" w:eastAsia="Times New Roman" w:hAnsi="Menlo" w:cs="Menlo"/>
+          <w:color w:val="0451A5"/>
+          <w:kern w:val="0"/>
+          <w:sz w:val="18"/>
+          <w:szCs w:val="18"/>
+          <w14:ligatures w14:val="none"/>
+        </w:rPr>
+        <w:t>3.</w:t>
+      </w:r>
+      <w:r>
+        <w:rPr>
+          <w:rFonts w:ascii="Menlo" w:eastAsia="Times New Roman" w:hAnsi="Menlo" w:cs="Menlo"/>
+          <w:color w:val="3B3B3B"/>
+          <w:kern w:val="0"/>
+          <w:sz w:val="18"/>
+          <w:szCs w:val="18"/>
+          <w14:ligatures w14:val="none"/>
+        </w:rPr>
+        <w:t xml:space="preserve"> </w:t>
+      </w:r>
+      <w:r>
+        <w:rPr>
+          <w:rFonts w:ascii="Menlo" w:eastAsia="Times New Roman" w:hAnsi="Menlo" w:cs="Menlo"/>
+          <w:b/>
+          <w:bCs/>
+          <w:color w:val="000080"/>
+          <w:kern w:val="0"/>
+          <w:sz w:val="18"/>
+          <w:szCs w:val="18"/>
+          <w14:ligatures w14:val="none"/>
+        </w:rPr>
+        <w:t>**Table 3. Primary adjusted results with interaction**</w:t>
+      </w:r>
+      <w:r>
+        <w:rPr>
+          <w:rFonts w:ascii="Menlo" w:eastAsia="Times New Roman" w:hAnsi="Menlo" w:cs="Menlo"/>
+          <w:color w:val="3B3B3B"/>
+          <w:kern w:val="0"/>
+          <w:sz w:val="18"/>
+          <w:szCs w:val="18"/>
+          <w14:ligatures w14:val="none"/>
+        </w:rPr>
+        <w:t xml:space="preserve">  </w:t>
+      </w:r>
+    </w:p>
+    <w:p>
+      <w:pPr>
+        <w:shd w:val="clear" w:color="auto" w:fill="FFFFFF"/>
+        <w:spacing w:after="0" w:line="270" w:lineRule="atLeast"/>
+        <w:rPr>
+          <w:rFonts w:ascii="Menlo" w:eastAsia="Times New Roman" w:hAnsi="Menlo" w:cs="Menlo"/>
+          <w:color w:val="3B3B3B"/>
+          <w:kern w:val="0"/>
+          <w:sz w:val="18"/>
+          <w:szCs w:val="18"/>
+          <w14:ligatures w14:val="none"/>
+        </w:rPr>
+      </w:pPr>
+      <w:r>
+        <w:rPr>
+          <w:rFonts w:ascii="Menlo" w:eastAsia="Times New Roman" w:hAnsi="Menlo" w:cs="Menlo"/>
+          <w:color w:val="3B3B3B"/>
+          <w:kern w:val="0"/>
+          <w:sz w:val="18"/>
+          <w:szCs w:val="18"/>
+          <w14:ligatures w14:val="none"/>
+        </w:rPr>
+        <w:t xml:space="preserve">   </w:t>
+      </w:r>
+      <w:r>
+        <w:rPr>
+          <w:rFonts w:ascii="Menlo" w:eastAsia="Times New Roman" w:hAnsi="Menlo" w:cs="Menlo"/>
+          <w:color w:val="0451A5"/>
+          <w:kern w:val="0"/>
+          <w:sz w:val="18"/>
+          <w:szCs w:val="18"/>
+          <w14:ligatures w14:val="none"/>
+        </w:rPr>
+        <w:t>-</w:t>
+      </w:r>
+      <w:r>
+        <w:rPr>
+          <w:rFonts w:ascii="Menlo" w:eastAsia="Times New Roman" w:hAnsi="Menlo" w:cs="Menlo"/>
+          <w:color w:val="3B3B3B"/>
+          <w:kern w:val="0"/>
+          <w:sz w:val="18"/>
+          <w:szCs w:val="18"/>
+          <w14:ligatures w14:val="none"/>
+        </w:rPr>
+        <w:t xml:space="preserve"> Adjusted means by group; within-stratum differences; interaction estimate (95% CI, p-value).</w:t>
+      </w:r>
+    </w:p>
+    <w:p>
+      <w:pPr>
+        <w:shd w:val="clear" w:color="auto" w:fill="FFFFFF"/>
+        <w:spacing w:after="0" w:line="270" w:lineRule="atLeast"/>
+        <w:rPr>
+          <w:rFonts w:ascii="Menlo" w:eastAsia="Times New Roman" w:hAnsi="Menlo" w:cs="Menlo"/>
+          <w:color w:val="3B3B3B"/>
+          <w:kern w:val="0"/>
+          <w:sz w:val="18"/>
+          <w:szCs w:val="18"/>
+          <w14:ligatures w14:val="none"/>
+        </w:rPr>
+      </w:pPr>
+    </w:p>
+    <w:p>
+      <w:pPr>
+        <w:shd w:val="clear" w:color="auto" w:fill="FFFFFF"/>
+        <w:spacing w:after="0" w:line="270" w:lineRule="atLeast"/>
+        <w:rPr>
+          <w:rFonts w:ascii="Menlo" w:eastAsia="Times New Roman" w:hAnsi="Menlo" w:cs="Menlo"/>
+          <w:color w:val="3B3B3B"/>
+          <w:kern w:val="0"/>
+          <w:sz w:val="18"/>
+          <w:szCs w:val="18"/>
+          <w14:ligatures w14:val="none"/>
+        </w:rPr>
+      </w:pPr>
+      <w:r>
+        <w:rPr>
+          <w:rFonts w:ascii="Menlo" w:eastAsia="Times New Roman" w:hAnsi="Menlo" w:cs="Menlo"/>
+          <w:color w:val="0451A5"/>
+          <w:kern w:val="0"/>
+          <w:sz w:val="18"/>
+          <w:szCs w:val="18"/>
+          <w14:ligatures w14:val="none"/>
+        </w:rPr>
+        <w:t>4.</w:t>
+      </w:r>
+      <w:r>
+        <w:rPr>
+          <w:rFonts w:ascii="Menlo" w:eastAsia="Times New Roman" w:hAnsi="Menlo" w:cs="Menlo"/>
+          <w:color w:val="3B3B3B"/>
+          <w:kern w:val="0"/>
+          <w:sz w:val="18"/>
+          <w:szCs w:val="18"/>
+          <w14:ligatures w14:val="none"/>
+        </w:rPr>
+        <w:t xml:space="preserve"> </w:t>
+      </w:r>
+      <w:r>
+        <w:rPr>
+          <w:rFonts w:ascii="Menlo" w:eastAsia="Times New Roman" w:hAnsi="Menlo" w:cs="Menlo"/>
+          <w:b/>
+          <w:bCs/>
+          <w:color w:val="000080"/>
+          <w:kern w:val="0"/>
+          <w:sz w:val="18"/>
+          <w:szCs w:val="18"/>
+          <w14:ligatures w14:val="none"/>
+        </w:rPr>
         <w:t>**Table 4. Sensitivity analyses**</w:t>
       </w:r>
       <w:r>
@@ -3788,7 +4115,31 @@
           <w:szCs w:val="18"/>
           <w14:ligatures w14:val="none"/>
         </w:rPr>
-        <w:t xml:space="preserve"> eFigure 1. Detailed flow diagram per outcome.</w:t>
+        <w:t xml:space="preserve"> </w:t>
+      </w:r>
+      <w:proofErr w:type="spellStart"/>
+      <w:r>
+        <w:rPr>
+          <w:rFonts w:ascii="Menlo" w:eastAsia="Times New Roman" w:hAnsi="Menlo" w:cs="Menlo"/>
+          <w:color w:val="3B3B3B"/>
+          <w:kern w:val="0"/>
+          <w:sz w:val="18"/>
+          <w:szCs w:val="18"/>
+          <w14:ligatures w14:val="none"/>
+        </w:rPr>
+        <w:t>eFigure</w:t>
+      </w:r>
+      <w:proofErr w:type="spellEnd"/>
+      <w:r>
+        <w:rPr>
+          <w:rFonts w:ascii="Menlo" w:eastAsia="Times New Roman" w:hAnsi="Menlo" w:cs="Menlo"/>
+          <w:color w:val="3B3B3B"/>
+          <w:kern w:val="0"/>
+          <w:sz w:val="18"/>
+          <w:szCs w:val="18"/>
+          <w14:ligatures w14:val="none"/>
+        </w:rPr>
+        <w:t xml:space="preserve"> 1. Detailed flow diagram per outcome.</w:t>
       </w:r>
     </w:p>
     <w:p>
@@ -3824,7 +4175,31 @@
           <w:szCs w:val="18"/>
           <w14:ligatures w14:val="none"/>
         </w:rPr>
-        <w:t xml:space="preserve"> eFigure 2. Additional balance plots.</w:t>
+        <w:t xml:space="preserve"> </w:t>
+      </w:r>
+      <w:proofErr w:type="spellStart"/>
+      <w:r>
+        <w:rPr>
+          <w:rFonts w:ascii="Menlo" w:eastAsia="Times New Roman" w:hAnsi="Menlo" w:cs="Menlo"/>
+          <w:color w:val="3B3B3B"/>
+          <w:kern w:val="0"/>
+          <w:sz w:val="18"/>
+          <w:szCs w:val="18"/>
+          <w14:ligatures w14:val="none"/>
+        </w:rPr>
+        <w:t>eFigure</w:t>
+      </w:r>
+      <w:proofErr w:type="spellEnd"/>
+      <w:r>
+        <w:rPr>
+          <w:rFonts w:ascii="Menlo" w:eastAsia="Times New Roman" w:hAnsi="Menlo" w:cs="Menlo"/>
+          <w:color w:val="3B3B3B"/>
+          <w:kern w:val="0"/>
+          <w:sz w:val="18"/>
+          <w:szCs w:val="18"/>
+          <w14:ligatures w14:val="none"/>
+        </w:rPr>
+        <w:t xml:space="preserve"> 2. Additional balance plots.</w:t>
       </w:r>
     </w:p>
     <w:p>
@@ -3860,7 +4235,31 @@
           <w:szCs w:val="18"/>
           <w14:ligatures w14:val="none"/>
         </w:rPr>
-        <w:t xml:space="preserve"> eFigure 3. DAG of confounding.</w:t>
+        <w:t xml:space="preserve"> </w:t>
+      </w:r>
+      <w:proofErr w:type="spellStart"/>
+      <w:r>
+        <w:rPr>
+          <w:rFonts w:ascii="Menlo" w:eastAsia="Times New Roman" w:hAnsi="Menlo" w:cs="Menlo"/>
+          <w:color w:val="3B3B3B"/>
+          <w:kern w:val="0"/>
+          <w:sz w:val="18"/>
+          <w:szCs w:val="18"/>
+          <w14:ligatures w14:val="none"/>
+        </w:rPr>
+        <w:t>eFigure</w:t>
+      </w:r>
+      <w:proofErr w:type="spellEnd"/>
+      <w:r>
+        <w:rPr>
+          <w:rFonts w:ascii="Menlo" w:eastAsia="Times New Roman" w:hAnsi="Menlo" w:cs="Menlo"/>
+          <w:color w:val="3B3B3B"/>
+          <w:kern w:val="0"/>
+          <w:sz w:val="18"/>
+          <w:szCs w:val="18"/>
+          <w14:ligatures w14:val="none"/>
+        </w:rPr>
+        <w:t xml:space="preserve"> 3. DAG of confounding.</w:t>
       </w:r>
     </w:p>
     <w:p>
@@ -3896,7 +4295,31 @@
           <w:szCs w:val="18"/>
           <w14:ligatures w14:val="none"/>
         </w:rPr>
-        <w:t xml:space="preserve"> eTable 1. Variable definitions.</w:t>
+        <w:t xml:space="preserve"> </w:t>
+      </w:r>
+      <w:proofErr w:type="spellStart"/>
+      <w:r>
+        <w:rPr>
+          <w:rFonts w:ascii="Menlo" w:eastAsia="Times New Roman" w:hAnsi="Menlo" w:cs="Menlo"/>
+          <w:color w:val="3B3B3B"/>
+          <w:kern w:val="0"/>
+          <w:sz w:val="18"/>
+          <w:szCs w:val="18"/>
+          <w14:ligatures w14:val="none"/>
+        </w:rPr>
+        <w:t>eTable</w:t>
+      </w:r>
+      <w:proofErr w:type="spellEnd"/>
+      <w:r>
+        <w:rPr>
+          <w:rFonts w:ascii="Menlo" w:eastAsia="Times New Roman" w:hAnsi="Menlo" w:cs="Menlo"/>
+          <w:color w:val="3B3B3B"/>
+          <w:kern w:val="0"/>
+          <w:sz w:val="18"/>
+          <w:szCs w:val="18"/>
+          <w14:ligatures w14:val="none"/>
+        </w:rPr>
+        <w:t xml:space="preserve"> 1. Variable definitions.</w:t>
       </w:r>
     </w:p>
     <w:p>
@@ -3932,7 +4355,31 @@
           <w:szCs w:val="18"/>
           <w14:ligatures w14:val="none"/>
         </w:rPr>
-        <w:t xml:space="preserve"> eTable 2. Full baseline table.</w:t>
+        <w:t xml:space="preserve"> </w:t>
+      </w:r>
+      <w:proofErr w:type="spellStart"/>
+      <w:r>
+        <w:rPr>
+          <w:rFonts w:ascii="Menlo" w:eastAsia="Times New Roman" w:hAnsi="Menlo" w:cs="Menlo"/>
+          <w:color w:val="3B3B3B"/>
+          <w:kern w:val="0"/>
+          <w:sz w:val="18"/>
+          <w:szCs w:val="18"/>
+          <w14:ligatures w14:val="none"/>
+        </w:rPr>
+        <w:t>eTable</w:t>
+      </w:r>
+      <w:proofErr w:type="spellEnd"/>
+      <w:r>
+        <w:rPr>
+          <w:rFonts w:ascii="Menlo" w:eastAsia="Times New Roman" w:hAnsi="Menlo" w:cs="Menlo"/>
+          <w:color w:val="3B3B3B"/>
+          <w:kern w:val="0"/>
+          <w:sz w:val="18"/>
+          <w:szCs w:val="18"/>
+          <w14:ligatures w14:val="none"/>
+        </w:rPr>
+        <w:t xml:space="preserve"> 2. Full baseline table.</w:t>
       </w:r>
     </w:p>
     <w:p>
@@ -3968,7 +4415,31 @@
           <w:szCs w:val="18"/>
           <w14:ligatures w14:val="none"/>
         </w:rPr>
-        <w:t xml:space="preserve"> eTable 3. Unadjusted outcome comparisons.</w:t>
+        <w:t xml:space="preserve"> </w:t>
+      </w:r>
+      <w:proofErr w:type="spellStart"/>
+      <w:r>
+        <w:rPr>
+          <w:rFonts w:ascii="Menlo" w:eastAsia="Times New Roman" w:hAnsi="Menlo" w:cs="Menlo"/>
+          <w:color w:val="3B3B3B"/>
+          <w:kern w:val="0"/>
+          <w:sz w:val="18"/>
+          <w:szCs w:val="18"/>
+          <w14:ligatures w14:val="none"/>
+        </w:rPr>
+        <w:t>eTable</w:t>
+      </w:r>
+      <w:proofErr w:type="spellEnd"/>
+      <w:r>
+        <w:rPr>
+          <w:rFonts w:ascii="Menlo" w:eastAsia="Times New Roman" w:hAnsi="Menlo" w:cs="Menlo"/>
+          <w:color w:val="3B3B3B"/>
+          <w:kern w:val="0"/>
+          <w:sz w:val="18"/>
+          <w:szCs w:val="18"/>
+          <w14:ligatures w14:val="none"/>
+        </w:rPr>
+        <w:t xml:space="preserve"> 3. Unadjusted outcome comparisons.</w:t>
       </w:r>
     </w:p>
     <w:p>
@@ -4004,7 +4475,31 @@
           <w:szCs w:val="18"/>
           <w14:ligatures w14:val="none"/>
         </w:rPr>
-        <w:t xml:space="preserve"> eTable 4. Model diagnostics.</w:t>
+        <w:t xml:space="preserve"> </w:t>
+      </w:r>
+      <w:proofErr w:type="spellStart"/>
+      <w:r>
+        <w:rPr>
+          <w:rFonts w:ascii="Menlo" w:eastAsia="Times New Roman" w:hAnsi="Menlo" w:cs="Menlo"/>
+          <w:color w:val="3B3B3B"/>
+          <w:kern w:val="0"/>
+          <w:sz w:val="18"/>
+          <w:szCs w:val="18"/>
+          <w14:ligatures w14:val="none"/>
+        </w:rPr>
+        <w:t>eTable</w:t>
+      </w:r>
+      <w:proofErr w:type="spellEnd"/>
+      <w:r>
+        <w:rPr>
+          <w:rFonts w:ascii="Menlo" w:eastAsia="Times New Roman" w:hAnsi="Menlo" w:cs="Menlo"/>
+          <w:color w:val="3B3B3B"/>
+          <w:kern w:val="0"/>
+          <w:sz w:val="18"/>
+          <w:szCs w:val="18"/>
+          <w14:ligatures w14:val="none"/>
+        </w:rPr>
+        <w:t xml:space="preserve"> 4. Model diagnostics.</w:t>
       </w:r>
     </w:p>
     <w:p>
@@ -4040,7 +4535,31 @@
           <w:szCs w:val="18"/>
           <w14:ligatures w14:val="none"/>
         </w:rPr>
-        <w:t xml:space="preserve"> eTable 5. Missing data patterns and imputation specs.</w:t>
+        <w:t xml:space="preserve"> </w:t>
+      </w:r>
+      <w:proofErr w:type="spellStart"/>
+      <w:r>
+        <w:rPr>
+          <w:rFonts w:ascii="Menlo" w:eastAsia="Times New Roman" w:hAnsi="Menlo" w:cs="Menlo"/>
+          <w:color w:val="3B3B3B"/>
+          <w:kern w:val="0"/>
+          <w:sz w:val="18"/>
+          <w:szCs w:val="18"/>
+          <w14:ligatures w14:val="none"/>
+        </w:rPr>
+        <w:t>eTable</w:t>
+      </w:r>
+      <w:proofErr w:type="spellEnd"/>
+      <w:r>
+        <w:rPr>
+          <w:rFonts w:ascii="Menlo" w:eastAsia="Times New Roman" w:hAnsi="Menlo" w:cs="Menlo"/>
+          <w:color w:val="3B3B3B"/>
+          <w:kern w:val="0"/>
+          <w:sz w:val="18"/>
+          <w:szCs w:val="18"/>
+          <w14:ligatures w14:val="none"/>
+        </w:rPr>
+        <w:t xml:space="preserve"> 5. Missing data patterns and imputation specs.</w:t>
       </w:r>
     </w:p>
     <w:p>
@@ -4076,7 +4595,31 @@
           <w:szCs w:val="18"/>
           <w14:ligatures w14:val="none"/>
         </w:rPr>
-        <w:t xml:space="preserve"> eTable 6. Medication status stratifications.</w:t>
+        <w:t xml:space="preserve"> </w:t>
+      </w:r>
+      <w:proofErr w:type="spellStart"/>
+      <w:r>
+        <w:rPr>
+          <w:rFonts w:ascii="Menlo" w:eastAsia="Times New Roman" w:hAnsi="Menlo" w:cs="Menlo"/>
+          <w:color w:val="3B3B3B"/>
+          <w:kern w:val="0"/>
+          <w:sz w:val="18"/>
+          <w:szCs w:val="18"/>
+          <w14:ligatures w14:val="none"/>
+        </w:rPr>
+        <w:t>eTable</w:t>
+      </w:r>
+      <w:proofErr w:type="spellEnd"/>
+      <w:r>
+        <w:rPr>
+          <w:rFonts w:ascii="Menlo" w:eastAsia="Times New Roman" w:hAnsi="Menlo" w:cs="Menlo"/>
+          <w:color w:val="3B3B3B"/>
+          <w:kern w:val="0"/>
+          <w:sz w:val="18"/>
+          <w:szCs w:val="18"/>
+          <w14:ligatures w14:val="none"/>
+        </w:rPr>
+        <w:t xml:space="preserve"> 6. Medication status stratifications.</w:t>
       </w:r>
     </w:p>
     <w:p>
@@ -4097,7 +4640,74 @@
 
 <file path=word/comments.xml><?xml version="1.0" encoding="utf-8"?>
 <w:comments xmlns:wpc="http://schemas.microsoft.com/office/word/2010/wordprocessingCanvas" xmlns:cx="http://schemas.microsoft.com/office/drawing/2014/chartex" xmlns:cx1="http://schemas.microsoft.com/office/drawing/2015/9/8/chartex" xmlns:cx2="http://schemas.microsoft.com/office/drawing/2015/10/21/chartex" xmlns:cx3="http://schemas.microsoft.com/office/drawing/2016/5/9/chartex" xmlns:cx4="http://schemas.microsoft.com/office/drawing/2016/5/10/chartex" xmlns:cx5="http://schemas.microsoft.com/office/drawing/2016/5/11/chartex" xmlns:cx6="http://schemas.microsoft.com/office/drawing/2016/5/12/chartex" xmlns:cx7="http://schemas.microsoft.com/office/drawing/2016/5/13/chartex" xmlns:cx8="http://schemas.microsoft.com/office/drawing/2016/5/14/chartex" xmlns:mc="http://schemas.openxmlformats.org/markup-compatibility/2006" xmlns:aink="http://schemas.microsoft.com/office/drawing/2016/ink" xmlns:am3d="http://schemas.microsoft.com/office/drawing/2017/model3d" xmlns:o="urn:schemas-microsoft-com:office:office" xmlns:oel="http://schemas.microsoft.com/office/2019/extlst" xmlns:r="http://schemas.openxmlformats.org/officeDocument/2006/relationships" xmlns:m="http://schemas.openxmlformats.org/officeDocument/2006/math" xmlns:v="urn:schemas-microsoft-com:vml" xmlns:wp14="http://schemas.microsoft.com/office/word/2010/wordprocessingDrawing" xmlns:wp="http://schemas.openxmlformats.org/drawingml/2006/wordprocessingDrawing" xmlns:w10="urn:schemas-microsoft-com:office:word" xmlns:w="http://schemas.openxmlformats.org/wordprocessingml/2006/main" xmlns:w14="http://schemas.microsoft.com/office/word/2010/wordml" xmlns:w15="http://schemas.microsoft.com/office/word/2012/wordml" xmlns:w16cex="http://schemas.microsoft.com/office/word/2018/wordml/cex" xmlns:w16cid="http://schemas.microsoft.com/office/word/2016/wordml/cid" xmlns:w16="http://schemas.microsoft.com/office/word/2018/wordml" xmlns:w16du="http://schemas.microsoft.com/office/word/2023/wordml/word16du" xmlns:w16sdtdh="http://schemas.microsoft.com/office/word/2020/wordml/sdtdatahash" xmlns:w16sdtfl="http://schemas.microsoft.com/office/word/2024/wordml/sdtformatlock" xmlns:w16se="http://schemas.microsoft.com/office/word/2015/wordml/symex" xmlns:wpg="http://schemas.microsoft.com/office/word/2010/wordprocessingGroup" xmlns:wpi="http://schemas.microsoft.com/office/word/2010/wordprocessingInk" xmlns:wne="http://schemas.microsoft.com/office/word/2006/wordml" xmlns:wps="http://schemas.microsoft.com/office/word/2010/wordprocessingShape" mc:Ignorable="w14 w15 w16se w16cid w16 w16cex w16sdtdh w16sdtfl w16du wp14">
-  <w:comment w:id="0" w:author="Carr, Treyton" w:date="2025-11-08T23:56:00Z" w:initials="CT">
+  <w:comment w:id="0" w:author="Carr, Treyton" w:date="2025-12-01T15:44:00Z" w:initials="CT">
+    <w:p>
+      <w:r>
+        <w:rPr>
+          <w:rStyle w:val="CommentReference"/>
+        </w:rPr>
+        <w:annotationRef/>
+      </w:r>
+      <w:hyperlink r:id="rId1" w:history="1">
+        <w:r>
+          <w:rPr>
+            <w:rStyle w:val="Hyperlink"/>
+            <w:sz w:val="20"/>
+            <w:szCs w:val="20"/>
+          </w:rPr>
+          <w:t>https://www.sciencedirect.com/science/article/abs/pii/S014067362301961X</w:t>
+        </w:r>
+      </w:hyperlink>
+    </w:p>
+    <w:p/>
+    <w:p>
+      <w:hyperlink r:id="rId2" w:history="1">
+        <w:r>
+          <w:rPr>
+            <w:rStyle w:val="Hyperlink"/>
+            <w:sz w:val="20"/>
+            <w:szCs w:val="20"/>
+          </w:rPr>
+          <w:t>https://pmc.ncbi.nlm.nih.gov/articles/PMC4407747/</w:t>
+        </w:r>
+      </w:hyperlink>
+    </w:p>
+    <w:p/>
+  </w:comment>
+  <w:comment w:id="1" w:author="Carr, Treyton" w:date="2025-12-01T15:54:00Z" w:initials="CT">
+    <w:p>
+      <w:r>
+        <w:rPr>
+          <w:rStyle w:val="CommentReference"/>
+        </w:rPr>
+        <w:annotationRef/>
+      </w:r>
+      <w:hyperlink r:id="rId3" w:history="1">
+        <w:r>
+          <w:rPr>
+            <w:rStyle w:val="Hyperlink"/>
+            <w:sz w:val="20"/>
+            <w:szCs w:val="20"/>
+          </w:rPr>
+          <w:t>https://pubmed-ncbi-nlm-nih-gov.proxy.lib.umich.edu/23889360/</w:t>
+        </w:r>
+      </w:hyperlink>
+    </w:p>
+    <w:p/>
+    <w:p>
+      <w:hyperlink r:id="rId4" w:history="1">
+        <w:r>
+          <w:rPr>
+            <w:rStyle w:val="Hyperlink"/>
+            <w:sz w:val="20"/>
+            <w:szCs w:val="20"/>
+          </w:rPr>
+          <w:t>https://www.sciencedirect.com/science/article/abs/pii/S014067362301961X</w:t>
+        </w:r>
+      </w:hyperlink>
+    </w:p>
+  </w:comment>
+  <w:comment w:id="2" w:author="Carr, Treyton" w:date="2025-11-08T23:56:00Z" w:initials="CT">
     <w:p>
       <w:r>
         <w:rPr>
@@ -4114,7 +4724,7 @@
       </w:r>
     </w:p>
   </w:comment>
-  <w:comment w:id="1" w:author="Dave Bridges" w:date="2025-09-07T19:14:00Z" w:initials="DB">
+  <w:comment w:id="3" w:author="Dave Bridges" w:date="2025-09-07T19:14:00Z" w:initials="DB">
     <w:p>
       <w:r>
         <w:rPr>
@@ -4131,7 +4741,7 @@
       </w:r>
     </w:p>
   </w:comment>
-  <w:comment w:id="2" w:author="Carr, Treyton" w:date="2025-11-08T23:41:00Z" w:initials="CT">
+  <w:comment w:id="4" w:author="Carr, Treyton" w:date="2025-11-08T23:41:00Z" w:initials="CT">
     <w:p>
       <w:r>
         <w:rPr>
@@ -4148,7 +4758,7 @@
       </w:r>
     </w:p>
   </w:comment>
-  <w:comment w:id="3" w:author="Dave Bridges" w:date="2025-09-05T19:50:00Z" w:initials="DB">
+  <w:comment w:id="5" w:author="Dave Bridges" w:date="2025-09-05T19:50:00Z" w:initials="DB">
     <w:p>
       <w:r>
         <w:rPr>
@@ -4165,7 +4775,7 @@
       </w:r>
     </w:p>
   </w:comment>
-  <w:comment w:id="4" w:author="Dave Bridges" w:date="2025-09-07T14:40:00Z" w:initials="DB">
+  <w:comment w:id="6" w:author="Dave Bridges" w:date="2025-09-07T14:40:00Z" w:initials="DB">
     <w:p>
       <w:r>
         <w:rPr>
@@ -4182,7 +4792,7 @@
       </w:r>
     </w:p>
   </w:comment>
-  <w:comment w:id="5" w:author="Dave Bridges" w:date="2025-09-05T19:38:00Z" w:initials="DB">
+  <w:comment w:id="7" w:author="Dave Bridges" w:date="2025-09-05T19:38:00Z" w:initials="DB">
     <w:p>
       <w:r>
         <w:rPr>
@@ -4199,7 +4809,7 @@
       </w:r>
     </w:p>
   </w:comment>
-  <w:comment w:id="6" w:author="Carr, Treyton" w:date="2025-09-16T11:51:00Z" w:initials="CT">
+  <w:comment w:id="8" w:author="Carr, Treyton" w:date="2025-09-16T11:51:00Z" w:initials="CT">
     <w:p>
       <w:r>
         <w:rPr>
@@ -4216,7 +4826,7 @@
       </w:r>
     </w:p>
     <w:p>
-      <w:hyperlink r:id="rId1" w:history="1">
+      <w:hyperlink r:id="rId5" w:history="1">
         <w:r>
           <w:rPr>
             <w:rStyle w:val="Hyperlink"/>
@@ -4229,7 +4839,7 @@
     </w:p>
     <w:p/>
     <w:p>
-      <w:hyperlink r:id="rId2" w:history="1">
+      <w:hyperlink r:id="rId6" w:history="1">
         <w:r>
           <w:rPr>
             <w:rStyle w:val="Hyperlink"/>
@@ -4249,7 +4859,7 @@
         </w:rPr>
         <w:t xml:space="preserve"> </w:t>
       </w:r>
-      <w:hyperlink r:id="rId3" w:history="1">
+      <w:hyperlink r:id="rId7" w:history="1">
         <w:r>
           <w:rPr>
             <w:rStyle w:val="Hyperlink"/>
@@ -4262,7 +4872,7 @@
     </w:p>
     <w:p/>
     <w:p>
-      <w:hyperlink r:id="rId4" w:history="1">
+      <w:hyperlink r:id="rId8" w:history="1">
         <w:r>
           <w:rPr>
             <w:rStyle w:val="Hyperlink"/>
@@ -4276,7 +4886,7 @@
     <w:p/>
     <w:p/>
   </w:comment>
-  <w:comment w:id="7" w:author="Dave Bridges" w:date="2025-09-23T09:31:00Z" w:initials="DB">
+  <w:comment w:id="9" w:author="Dave Bridges" w:date="2025-09-23T09:31:00Z" w:initials="DB">
     <w:p>
       <w:r>
         <w:rPr>
@@ -4304,7 +4914,7 @@
     </w:p>
     <w:p/>
     <w:p>
-      <w:hyperlink r:id="rId5" w:history="1">
+      <w:hyperlink r:id="rId9" w:history="1">
         <w:r>
           <w:rPr>
             <w:rStyle w:val="Hyperlink"/>
@@ -4316,7 +4926,7 @@
       </w:hyperlink>
     </w:p>
   </w:comment>
-  <w:comment w:id="8" w:author="Dave Bridges" w:date="2025-09-23T09:32:00Z" w:initials="DB">
+  <w:comment w:id="10" w:author="Dave Bridges" w:date="2025-09-23T09:32:00Z" w:initials="DB">
     <w:p>
       <w:r>
         <w:rPr>
@@ -4334,7 +4944,7 @@
     </w:p>
     <w:p/>
     <w:p>
-      <w:hyperlink r:id="rId6" w:history="1">
+      <w:hyperlink r:id="rId10" w:history="1">
         <w:r>
           <w:rPr>
             <w:rStyle w:val="Hyperlink"/>
@@ -4346,7 +4956,7 @@
       </w:hyperlink>
     </w:p>
   </w:comment>
-  <w:comment w:id="11" w:author="Dave Bridges" w:date="2025-09-23T09:44:00Z" w:initials="DB">
+  <w:comment w:id="13" w:author="Dave Bridges" w:date="2025-09-23T09:44:00Z" w:initials="DB">
     <w:p>
       <w:r>
         <w:rPr>
@@ -4373,7 +4983,7 @@
       </w:r>
     </w:p>
   </w:comment>
-  <w:comment w:id="12" w:author="Dave Bridges" w:date="2025-09-23T09:45:00Z" w:initials="DB">
+  <w:comment w:id="14" w:author="Dave Bridges" w:date="2025-09-23T09:45:00Z" w:initials="DB">
     <w:p>
       <w:r>
         <w:rPr>
@@ -4390,7 +5000,7 @@
       </w:r>
     </w:p>
   </w:comment>
-  <w:comment w:id="13" w:author="Dave Bridges" w:date="2025-09-23T09:45:00Z" w:initials="DB">
+  <w:comment w:id="15" w:author="Dave Bridges" w:date="2025-09-23T09:45:00Z" w:initials="DB">
     <w:p>
       <w:r>
         <w:rPr>
@@ -4417,7 +5027,7 @@
       </w:r>
     </w:p>
   </w:comment>
-  <w:comment w:id="14" w:author="Dave Bridges" w:date="2025-09-23T09:45:00Z" w:initials="DB">
+  <w:comment w:id="16" w:author="Dave Bridges" w:date="2025-09-23T09:45:00Z" w:initials="DB">
     <w:p>
       <w:r>
         <w:rPr>
@@ -4434,7 +5044,7 @@
       </w:r>
     </w:p>
   </w:comment>
-  <w:comment w:id="9" w:author="Dave Bridges" w:date="2025-09-07T20:08:00Z" w:initials="DB">
+  <w:comment w:id="11" w:author="Dave Bridges" w:date="2025-09-07T20:08:00Z" w:initials="DB">
     <w:p>
       <w:r>
         <w:rPr>
@@ -4451,7 +5061,7 @@
       </w:r>
     </w:p>
   </w:comment>
-  <w:comment w:id="10" w:author="Carr, Treyton" w:date="2025-09-23T00:51:00Z" w:initials="CT">
+  <w:comment w:id="12" w:author="Carr, Treyton" w:date="2025-09-23T00:51:00Z" w:initials="CT">
     <w:p>
       <w:r>
         <w:rPr>
@@ -4473,6 +5083,8 @@
 
 <file path=word/commentsExtended.xml><?xml version="1.0" encoding="utf-8"?>
 <w15:commentsEx xmlns:wpc="http://schemas.microsoft.com/office/word/2010/wordprocessingCanvas" xmlns:cx="http://schemas.microsoft.com/office/drawing/2014/chartex" xmlns:cx1="http://schemas.microsoft.com/office/drawing/2015/9/8/chartex" xmlns:cx2="http://schemas.microsoft.com/office/drawing/2015/10/21/chartex" xmlns:cx3="http://schemas.microsoft.com/office/drawing/2016/5/9/chartex" xmlns:cx4="http://schemas.microsoft.com/office/drawing/2016/5/10/chartex" xmlns:cx5="http://schemas.microsoft.com/office/drawing/2016/5/11/chartex" xmlns:cx6="http://schemas.microsoft.com/office/drawing/2016/5/12/chartex" xmlns:cx7="http://schemas.microsoft.com/office/drawing/2016/5/13/chartex" xmlns:cx8="http://schemas.microsoft.com/office/drawing/2016/5/14/chartex" xmlns:mc="http://schemas.openxmlformats.org/markup-compatibility/2006" xmlns:aink="http://schemas.microsoft.com/office/drawing/2016/ink" xmlns:am3d="http://schemas.microsoft.com/office/drawing/2017/model3d" xmlns:o="urn:schemas-microsoft-com:office:office" xmlns:oel="http://schemas.microsoft.com/office/2019/extlst" xmlns:r="http://schemas.openxmlformats.org/officeDocument/2006/relationships" xmlns:m="http://schemas.openxmlformats.org/officeDocument/2006/math" xmlns:v="urn:schemas-microsoft-com:vml" xmlns:wp14="http://schemas.microsoft.com/office/word/2010/wordprocessingDrawing" xmlns:wp="http://schemas.openxmlformats.org/drawingml/2006/wordprocessingDrawing" xmlns:w10="urn:schemas-microsoft-com:office:word" xmlns:w="http://schemas.openxmlformats.org/wordprocessingml/2006/main" xmlns:w14="http://schemas.microsoft.com/office/word/2010/wordml" xmlns:w15="http://schemas.microsoft.com/office/word/2012/wordml" xmlns:w16cex="http://schemas.microsoft.com/office/word/2018/wordml/cex" xmlns:w16cid="http://schemas.microsoft.com/office/word/2016/wordml/cid" xmlns:w16="http://schemas.microsoft.com/office/word/2018/wordml" xmlns:w16du="http://schemas.microsoft.com/office/word/2023/wordml/word16du" xmlns:w16sdtdh="http://schemas.microsoft.com/office/word/2020/wordml/sdtdatahash" xmlns:w16sdtfl="http://schemas.microsoft.com/office/word/2024/wordml/sdtformatlock" xmlns:w16se="http://schemas.microsoft.com/office/word/2015/wordml/symex" xmlns:wpg="http://schemas.microsoft.com/office/word/2010/wordprocessingGroup" xmlns:wpi="http://schemas.microsoft.com/office/word/2010/wordprocessingInk" xmlns:wne="http://schemas.microsoft.com/office/word/2006/wordml" xmlns:wps="http://schemas.microsoft.com/office/word/2010/wordprocessingShape" mc:Ignorable="w14 w15 w16se w16cid w16 w16cex w16sdtdh w16sdtfl w16du wp14">
+  <w15:commentEx w15:paraId="5E7166E4" w15:done="0"/>
+  <w15:commentEx w15:paraId="6D4C1547" w15:done="0"/>
   <w15:commentEx w15:paraId="3048B1C6" w15:done="0"/>
   <w15:commentEx w15:paraId="30EA8164" w15:done="0"/>
   <w15:commentEx w15:paraId="03BC0566" w15:paraIdParent="30EA8164" w15:done="0"/>
@@ -4493,6 +5105,8 @@
 
 <file path=word/commentsExtensible.xml><?xml version="1.0" encoding="utf-8"?>
 <w16cex:commentsExtensible xmlns:wpc="http://schemas.microsoft.com/office/word/2010/wordprocessingCanvas" xmlns:cx="http://schemas.microsoft.com/office/drawing/2014/chartex" xmlns:cx1="http://schemas.microsoft.com/office/drawing/2015/9/8/chartex" xmlns:cx2="http://schemas.microsoft.com/office/drawing/2015/10/21/chartex" xmlns:cx3="http://schemas.microsoft.com/office/drawing/2016/5/9/chartex" xmlns:cx4="http://schemas.microsoft.com/office/drawing/2016/5/10/chartex" xmlns:cx5="http://schemas.microsoft.com/office/drawing/2016/5/11/chartex" xmlns:cx6="http://schemas.microsoft.com/office/drawing/2016/5/12/chartex" xmlns:cx7="http://schemas.microsoft.com/office/drawing/2016/5/13/chartex" xmlns:cx8="http://schemas.microsoft.com/office/drawing/2016/5/14/chartex" xmlns:cr="http://schemas.microsoft.com/office/comments/2020/reactions" xmlns:mc="http://schemas.openxmlformats.org/markup-compatibility/2006" xmlns:aink="http://schemas.microsoft.com/office/drawing/2016/ink" xmlns:am3d="http://schemas.microsoft.com/office/drawing/2017/model3d" xmlns:o="urn:schemas-microsoft-com:office:office" xmlns:oel="http://schemas.microsoft.com/office/2019/extlst" xmlns:r="http://schemas.openxmlformats.org/officeDocument/2006/relationships" xmlns:m="http://schemas.openxmlformats.org/officeDocument/2006/math" xmlns:v="urn:schemas-microsoft-com:vml" xmlns:wp14="http://schemas.microsoft.com/office/word/2010/wordprocessingDrawing" xmlns:wp="http://schemas.openxmlformats.org/drawingml/2006/wordprocessingDrawing" xmlns:w10="urn:schemas-microsoft-com:office:word" xmlns:w="http://schemas.openxmlformats.org/wordprocessingml/2006/main" xmlns:w14="http://schemas.microsoft.com/office/word/2010/wordml" xmlns:w15="http://schemas.microsoft.com/office/word/2012/wordml" xmlns:w16cex="http://schemas.microsoft.com/office/word/2018/wordml/cex" xmlns:w16cid="http://schemas.microsoft.com/office/word/2016/wordml/cid" xmlns:w16="http://schemas.microsoft.com/office/word/2018/wordml" xmlns:w16du="http://schemas.microsoft.com/office/word/2023/wordml/word16du" xmlns:w16sdtdh="http://schemas.microsoft.com/office/word/2020/wordml/sdtdatahash" xmlns:w16sdtfl="http://schemas.microsoft.com/office/word/2024/wordml/sdtformatlock" xmlns:w16se="http://schemas.microsoft.com/office/word/2015/wordml/symex" xmlns:wpg="http://schemas.microsoft.com/office/word/2010/wordprocessingGroup" xmlns:wpi="http://schemas.microsoft.com/office/word/2010/wordprocessingInk" xmlns:wne="http://schemas.microsoft.com/office/word/2006/wordml" xmlns:wps="http://schemas.microsoft.com/office/word/2010/wordprocessingShape" mc:Ignorable="w14 w15 w16se w16cid w16 w16cex w16sdtdh w16sdtfl cr w16du wp14">
+  <w16cex:commentExtensible w16cex:durableId="354F1AD7" w16cex:dateUtc="2025-12-01T20:44:00Z"/>
+  <w16cex:commentExtensible w16cex:durableId="08232419" w16cex:dateUtc="2025-12-01T20:54:00Z"/>
   <w16cex:commentExtensible w16cex:durableId="7B615881" w16cex:dateUtc="2025-11-09T04:56:00Z"/>
   <w16cex:commentExtensible w16cex:durableId="7BBB9387" w16cex:dateUtc="2025-09-07T23:14:00Z"/>
   <w16cex:commentExtensible w16cex:durableId="5C3B7975" w16cex:dateUtc="2025-11-09T04:41:00Z"/>
@@ -4513,6 +5127,8 @@
 
 <file path=word/commentsIds.xml><?xml version="1.0" encoding="utf-8"?>
 <w16cid:commentsIds xmlns:wpc="http://schemas.microsoft.com/office/word/2010/wordprocessingCanvas" xmlns:cx="http://schemas.microsoft.com/office/drawing/2014/chartex" xmlns:cx1="http://schemas.microsoft.com/office/drawing/2015/9/8/chartex" xmlns:cx2="http://schemas.microsoft.com/office/drawing/2015/10/21/chartex" xmlns:cx3="http://schemas.microsoft.com/office/drawing/2016/5/9/chartex" xmlns:cx4="http://schemas.microsoft.com/office/drawing/2016/5/10/chartex" xmlns:cx5="http://schemas.microsoft.com/office/drawing/2016/5/11/chartex" xmlns:cx6="http://schemas.microsoft.com/office/drawing/2016/5/12/chartex" xmlns:cx7="http://schemas.microsoft.com/office/drawing/2016/5/13/chartex" xmlns:cx8="http://schemas.microsoft.com/office/drawing/2016/5/14/chartex" xmlns:mc="http://schemas.openxmlformats.org/markup-compatibility/2006" xmlns:aink="http://schemas.microsoft.com/office/drawing/2016/ink" xmlns:am3d="http://schemas.microsoft.com/office/drawing/2017/model3d" xmlns:o="urn:schemas-microsoft-com:office:office" xmlns:oel="http://schemas.microsoft.com/office/2019/extlst" xmlns:r="http://schemas.openxmlformats.org/officeDocument/2006/relationships" xmlns:m="http://schemas.openxmlformats.org/officeDocument/2006/math" xmlns:v="urn:schemas-microsoft-com:vml" xmlns:wp14="http://schemas.microsoft.com/office/word/2010/wordprocessingDrawing" xmlns:wp="http://schemas.openxmlformats.org/drawingml/2006/wordprocessingDrawing" xmlns:w10="urn:schemas-microsoft-com:office:word" xmlns:w="http://schemas.openxmlformats.org/wordprocessingml/2006/main" xmlns:w14="http://schemas.microsoft.com/office/word/2010/wordml" xmlns:w15="http://schemas.microsoft.com/office/word/2012/wordml" xmlns:w16cex="http://schemas.microsoft.com/office/word/2018/wordml/cex" xmlns:w16cid="http://schemas.microsoft.com/office/word/2016/wordml/cid" xmlns:w16="http://schemas.microsoft.com/office/word/2018/wordml" xmlns:w16du="http://schemas.microsoft.com/office/word/2023/wordml/word16du" xmlns:w16sdtdh="http://schemas.microsoft.com/office/word/2020/wordml/sdtdatahash" xmlns:w16sdtfl="http://schemas.microsoft.com/office/word/2024/wordml/sdtformatlock" xmlns:w16se="http://schemas.microsoft.com/office/word/2015/wordml/symex" xmlns:wpg="http://schemas.microsoft.com/office/word/2010/wordprocessingGroup" xmlns:wpi="http://schemas.microsoft.com/office/word/2010/wordprocessingInk" xmlns:wne="http://schemas.microsoft.com/office/word/2006/wordml" xmlns:wps="http://schemas.microsoft.com/office/word/2010/wordprocessingShape" mc:Ignorable="w14 w15 w16se w16cid w16 w16cex w16sdtdh w16sdtfl w16du wp14">
+  <w16cid:commentId w16cid:paraId="5E7166E4" w16cid:durableId="354F1AD7"/>
+  <w16cid:commentId w16cid:paraId="6D4C1547" w16cid:durableId="08232419"/>
   <w16cid:commentId w16cid:paraId="3048B1C6" w16cid:durableId="7B615881"/>
   <w16cid:commentId w16cid:paraId="30EA8164" w16cid:durableId="7BBB9387"/>
   <w16cid:commentId w16cid:paraId="03BC0566" w16cid:durableId="5C3B7975"/>

</xml_diff>

<commit_message>
Finished Draft of Introduction
Included sources for statements as comments for your review/proper formatting. I can also format these if needed/if you explain how you would like them in the references.
</commit_message>
<xml_diff>
--- a/manuscript/Cushings-Obesity/manuscript.docx
+++ b/manuscript/Cushings-Obesity/manuscript.docx
@@ -35,7 +35,22 @@
         <w:t>).</w:t>
       </w:r>
       <w:r>
-        <w:t xml:space="preserve"> This condition results from excess adrenocorticotropic hormone secretion from the pituitary gland, leading the adrenal glands to produce excess cortisol. Cushing’s disease also occurs far more commonly in women, with a female-to-male ratio of 4:1 (</w:t>
+        <w:t xml:space="preserve"> This condition results from excess adrenocorticotropic </w:t>
+      </w:r>
+      <w:r>
+        <w:t xml:space="preserve">(ACTH) </w:t>
+      </w:r>
+      <w:r>
+        <w:t xml:space="preserve">hormone secretion </w:t>
+      </w:r>
+      <w:r>
+        <w:t xml:space="preserve">from the </w:t>
+      </w:r>
+      <w:r>
+        <w:t xml:space="preserve">pituitary gland, leading the adrenal glands to produce excess cortisol. </w:t>
+      </w:r>
+      <w:r>
+        <w:t>This is often due to the presence of a pituitary adenoma (</w:t>
       </w:r>
       <w:commentRangeStart w:id="1"/>
       <w:r>
@@ -49,1454 +64,1575 @@
         <w:commentReference w:id="1"/>
       </w:r>
       <w:r>
+        <w:t xml:space="preserve">). </w:t>
+      </w:r>
+      <w:r>
+        <w:t>Cushing’s disease also occurs far more commonly in women, with a female-to-male ratio of 4:1 (</w:t>
+      </w:r>
+      <w:commentRangeStart w:id="2"/>
+      <w:r>
+        <w:t>sources</w:t>
+      </w:r>
+      <w:commentRangeEnd w:id="2"/>
+      <w:r>
+        <w:rPr>
+          <w:rStyle w:val="CommentReference"/>
+        </w:rPr>
+        <w:commentReference w:id="2"/>
+      </w:r>
+      <w:r>
         <w:t>).</w:t>
       </w:r>
+      <w:r>
+        <w:t xml:space="preserve"> Patients often experience cardiovascular issues, abnormal liver enzyme levels, weight gain, and hyperglycemia (</w:t>
+      </w:r>
+      <w:commentRangeStart w:id="3"/>
+      <w:commentRangeStart w:id="4"/>
+      <w:r>
+        <w:t>sources</w:t>
+      </w:r>
+      <w:commentRangeEnd w:id="3"/>
+      <w:r>
+        <w:rPr>
+          <w:rStyle w:val="CommentReference"/>
+        </w:rPr>
+        <w:commentReference w:id="3"/>
+      </w:r>
+      <w:commentRangeEnd w:id="4"/>
+      <w:r>
+        <w:rPr>
+          <w:rStyle w:val="CommentReference"/>
+        </w:rPr>
+        <w:commentReference w:id="4"/>
+      </w:r>
+      <w:r>
+        <w:t>).</w:t>
+      </w:r>
+      <w:r>
+        <w:t xml:space="preserve"> </w:t>
+      </w:r>
+      <w:r>
+        <w:t xml:space="preserve">**here I may add something from the following source </w:t>
+      </w:r>
+      <w:proofErr w:type="spellStart"/>
+      <w:r>
+        <w:t>abt</w:t>
+      </w:r>
+      <w:proofErr w:type="spellEnd"/>
+      <w:r>
+        <w:t xml:space="preserve"> how x </w:t>
+      </w:r>
+      <w:proofErr w:type="gramStart"/>
+      <w:r>
+        <w:t>amount</w:t>
+      </w:r>
+      <w:proofErr w:type="gramEnd"/>
+      <w:r>
+        <w:t xml:space="preserve"> of patients are affected by cardiovascular issues, </w:t>
+      </w:r>
+      <w:proofErr w:type="spellStart"/>
+      <w:r>
+        <w:t>etc</w:t>
+      </w:r>
+      <w:proofErr w:type="spellEnd"/>
+    </w:p>
+    <w:p>
+      <w:r>
+        <w:t>Weight gain, and obesity, are classic clinical manifestations of Cushing’s disease (</w:t>
+      </w:r>
+      <w:commentRangeStart w:id="5"/>
+      <w:r>
+        <w:t>sources</w:t>
+      </w:r>
+      <w:commentRangeEnd w:id="5"/>
+      <w:r>
+        <w:rPr>
+          <w:rStyle w:val="CommentReference"/>
+        </w:rPr>
+        <w:commentReference w:id="5"/>
+      </w:r>
+      <w:r>
+        <w:t>).</w:t>
+      </w:r>
+      <w:r>
+        <w:t xml:space="preserve"> </w:t>
+      </w:r>
+      <w:r>
+        <w:t>In (author name/paper title), 70-95% of patients experienced weight gain, 21-48% of patients became overweight, and 32-41% of patients became obese (</w:t>
+      </w:r>
+      <w:commentRangeStart w:id="6"/>
+      <w:r>
+        <w:t>source</w:t>
+      </w:r>
+      <w:commentRangeEnd w:id="6"/>
+      <w:r>
+        <w:rPr>
+          <w:rStyle w:val="CommentReference"/>
+        </w:rPr>
+        <w:commentReference w:id="6"/>
+      </w:r>
+      <w:r>
+        <w:t xml:space="preserve">). </w:t>
+      </w:r>
+      <w:r>
+        <w:t xml:space="preserve">Many of the other comorbidities common with Cushing’s disease are caused by both metabolic and obesity related symptoms, and it is difficult to discern </w:t>
+      </w:r>
+      <w:r>
+        <w:t xml:space="preserve">the obesity-independent from the obesity-dependent mechanisms of Cushing’s disease. </w:t>
+      </w:r>
+      <w:r>
+        <w:t xml:space="preserve">To address this gap, our </w:t>
+      </w:r>
+      <w:commentRangeStart w:id="7"/>
+      <w:r>
+        <w:t xml:space="preserve">retrospective </w:t>
+      </w:r>
+      <w:r>
+        <w:t xml:space="preserve">matched </w:t>
+      </w:r>
+      <w:r>
+        <w:t xml:space="preserve">case-control study </w:t>
+      </w:r>
+      <w:commentRangeEnd w:id="7"/>
+      <w:r>
+        <w:rPr>
+          <w:rStyle w:val="CommentReference"/>
+        </w:rPr>
+        <w:commentReference w:id="7"/>
+      </w:r>
+      <w:r>
+        <w:t xml:space="preserve">examined how obesity status modified the effects of Cushing’s disease through statistical analysis of the difference in effect sizes between the obese and non-obese Cushing’s disease </w:t>
+      </w:r>
+      <w:commentRangeStart w:id="8"/>
+      <w:r>
+        <w:t>population.</w:t>
+      </w:r>
+      <w:commentRangeEnd w:id="8"/>
+      <w:r>
+        <w:rPr>
+          <w:rStyle w:val="CommentReference"/>
+        </w:rPr>
+        <w:commentReference w:id="8"/>
+      </w:r>
     </w:p>
     <w:p/>
     <w:p>
-      <w:r>
-        <w:t>Cushing’s disease</w:t>
-      </w:r>
-      <w:r>
-        <w:t xml:space="preserve"> is a rare endocrine disorder</w:t>
-      </w:r>
-      <w:r>
-        <w:t xml:space="preserve"> caused by the overproduction of cortisol, resulting in chronic hypercortisolism.</w:t>
-      </w:r>
-      <w:r>
-        <w:t xml:space="preserve"> The sickness affects women disproportionally to men and is most often caused by a tumor on the anterior pituitary gland, or the adrenal gland. The effects of sustained elevation of cortisol in the body can present in a variety of ways in humans, but they are generally well known in a general population. These can include high blood pressure, diabetes, and weight gain. Many of these symptoms are caused by both obesity and metabolic related symptoms, and it is difficult to discern from the obesity-dependent from the obesity-independent mechanisms of Cushing’s </w:t>
-      </w:r>
-      <w:commentRangeStart w:id="2"/>
-      <w:r>
-        <w:t xml:space="preserve">disease. </w:t>
-      </w:r>
-      <w:commentRangeEnd w:id="2"/>
+      <w:pPr>
+        <w:pStyle w:val="Heading1"/>
+      </w:pPr>
+      <w:r>
+        <w:t>Methods</w:t>
+      </w:r>
+    </w:p>
+    <w:p>
+      <w:pPr>
+        <w:rPr>
+          <w:b/>
+          <w:bCs/>
+        </w:rPr>
+      </w:pPr>
+      <w:r>
+        <w:rPr>
+          <w:b/>
+          <w:bCs/>
+        </w:rPr>
+        <w:t>Study Participants</w:t>
+      </w:r>
+      <w:r>
+        <w:rPr>
+          <w:b/>
+          <w:bCs/>
+        </w:rPr>
+        <w:t xml:space="preserve">. </w:t>
+      </w:r>
+      <w:r>
+        <w:t xml:space="preserve">This study was reviewed by the University of Michigan </w:t>
+      </w:r>
+      <w:r>
+        <w:t>Institutional</w:t>
+      </w:r>
+      <w:r>
+        <w:t xml:space="preserve"> Review Board (</w:t>
+      </w:r>
+      <w:r>
+        <w:t>HUM00247814</w:t>
+      </w:r>
+      <w:r>
+        <w:t xml:space="preserve">) </w:t>
+      </w:r>
+      <w:r>
+        <w:t xml:space="preserve">and </w:t>
+      </w:r>
+      <w:r>
+        <w:t>adjudicated as not regulated.</w:t>
+      </w:r>
+    </w:p>
+    <w:p>
+      <w:r>
+        <w:t xml:space="preserve">To identify patients with Cushing’s disease, we evaluated electronic health records </w:t>
+      </w:r>
+      <w:r>
+        <w:t>for participants at</w:t>
+      </w:r>
+      <w:r>
+        <w:t xml:space="preserve"> Michigan Medicine dating back to January 1, 2000, searching for diagnoses of Cushing’s disease including ICD Codes (</w:t>
+      </w:r>
+      <w:r>
+        <w:t>E24.0, 255.0</w:t>
+      </w:r>
+      <w:r>
+        <w:t>)</w:t>
+      </w:r>
+      <w:r>
+        <w:t xml:space="preserve">.  </w:t>
+      </w:r>
+      <w:r>
+        <w:t xml:space="preserve"> </w:t>
+      </w:r>
+      <w:r>
+        <w:t>To identify when patients were treated</w:t>
+      </w:r>
+      <w:r>
+        <w:t xml:space="preserve"> via surgery,</w:t>
+      </w:r>
+      <w:r>
+        <w:t xml:space="preserve"> we included procedure codes </w:t>
+      </w:r>
+      <w:commentRangeStart w:id="9"/>
+      <w:commentRangeStart w:id="10"/>
+      <w:r>
+        <w:t>YYY</w:t>
+      </w:r>
+      <w:commentRangeEnd w:id="9"/>
       <w:r>
         <w:rPr>
           <w:rStyle w:val="CommentReference"/>
           <w:sz w:val="24"/>
           <w:szCs w:val="24"/>
         </w:rPr>
-        <w:commentReference w:id="2"/>
-      </w:r>
-    </w:p>
-    <w:p/>
-    <w:p>
-      <w:pPr>
-        <w:pStyle w:val="Heading1"/>
-      </w:pPr>
-      <w:r>
-        <w:t>Methods</w:t>
-      </w:r>
-    </w:p>
-    <w:p>
-      <w:pPr>
-        <w:rPr>
-          <w:b/>
-          <w:bCs/>
-        </w:rPr>
-      </w:pPr>
-      <w:r>
-        <w:rPr>
-          <w:b/>
-          <w:bCs/>
-        </w:rPr>
-        <w:t>Study Participants</w:t>
-      </w:r>
-      <w:r>
-        <w:rPr>
-          <w:b/>
-          <w:bCs/>
-        </w:rPr>
-        <w:t xml:space="preserve">. </w:t>
-      </w:r>
-      <w:r>
-        <w:t xml:space="preserve">This study was reviewed by the University of Michigan </w:t>
-      </w:r>
-      <w:r>
-        <w:t>Institutional</w:t>
-      </w:r>
-      <w:r>
-        <w:t xml:space="preserve"> Review Board (</w:t>
-      </w:r>
-      <w:r>
-        <w:t>HUM00247814</w:t>
-      </w:r>
-      <w:r>
-        <w:t xml:space="preserve">) </w:t>
-      </w:r>
-      <w:r>
-        <w:t xml:space="preserve">and </w:t>
-      </w:r>
-      <w:r>
-        <w:t>adjudicated as not regulated.</w:t>
-      </w:r>
-    </w:p>
-    <w:p>
-      <w:r>
-        <w:t xml:space="preserve">To identify patients with Cushing’s disease, we evaluated electronic health records </w:t>
-      </w:r>
-      <w:r>
-        <w:t>for participants at</w:t>
-      </w:r>
-      <w:r>
-        <w:t xml:space="preserve"> Michigan Medicine dating back to January 1, 2000, searching for diagnoses of Cushing’s disease including ICD Codes (</w:t>
-      </w:r>
-      <w:r>
-        <w:t>E24.0, 255.0</w:t>
-      </w:r>
-      <w:r>
-        <w:t>)</w:t>
-      </w:r>
-      <w:r>
-        <w:t xml:space="preserve">.  </w:t>
-      </w:r>
-      <w:r>
-        <w:t xml:space="preserve"> </w:t>
-      </w:r>
-      <w:r>
-        <w:t>To identify when patients were treated</w:t>
-      </w:r>
-      <w:r>
-        <w:t xml:space="preserve"> via surgery,</w:t>
-      </w:r>
-      <w:r>
-        <w:t xml:space="preserve"> we included procedure codes </w:t>
-      </w:r>
-      <w:commentRangeStart w:id="3"/>
-      <w:commentRangeStart w:id="4"/>
-      <w:r>
-        <w:t>YYY</w:t>
-      </w:r>
-      <w:commentRangeEnd w:id="3"/>
+        <w:commentReference w:id="9"/>
+      </w:r>
+      <w:commentRangeEnd w:id="10"/>
       <w:r>
         <w:rPr>
           <w:rStyle w:val="CommentReference"/>
           <w:sz w:val="24"/>
           <w:szCs w:val="24"/>
         </w:rPr>
-        <w:commentReference w:id="3"/>
-      </w:r>
-      <w:commentRangeEnd w:id="4"/>
+        <w:commentReference w:id="10"/>
+      </w:r>
+      <w:r>
+        <w:t>.</w:t>
+      </w:r>
+      <w:r>
+        <w:t xml:space="preserve">  We excluded participants if they </w:t>
+      </w:r>
+      <w:r>
+        <w:t>did not have a Cushing’s disease diagnosis, treatment date, lab history, or relevant demographic data documented.</w:t>
+      </w:r>
+      <w:r>
+        <w:t xml:space="preserve"> Race and ethnicity were self-reported, with groups of &lt;10 aggregated into the other category.</w:t>
+      </w:r>
+      <w:r>
+        <w:t xml:space="preserve"> </w:t>
+      </w:r>
+    </w:p>
+    <w:p>
+      <w:r>
+        <w:lastRenderedPageBreak/>
+        <w:t xml:space="preserve">To identify controls, </w:t>
+      </w:r>
+      <w:r>
+        <w:t>we used</w:t>
+      </w:r>
+      <w:r>
+        <w:t xml:space="preserve"> the </w:t>
+      </w:r>
+      <w:r>
+        <w:t xml:space="preserve"> </w:t>
+      </w:r>
+      <w:proofErr w:type="spellStart"/>
+      <w:r>
+        <w:t>MatchIt</w:t>
+      </w:r>
+      <w:proofErr w:type="spellEnd"/>
+      <w:r>
+        <w:t xml:space="preserve"> </w:t>
+      </w:r>
+      <w:r>
+        <w:t xml:space="preserve">package </w:t>
+      </w:r>
+      <w:r>
+        <w:t xml:space="preserve">(version </w:t>
+      </w:r>
+      <w:r>
+        <w:t xml:space="preserve">4.7.1; </w:t>
+      </w:r>
+      <w:r>
+        <w:fldChar w:fldCharType="begin"/>
+      </w:r>
+      <w:r>
+        <w:instrText xml:space="preserve"> ADDIN ZOTERO_ITEM CSL_CITATION {"citationID":"Pl5Gc3F1","properties":{"formattedCitation":"(Ho et al., 2011)","plainCitation":"(Ho et al., 2011)","noteIndex":0},"citationItems":[{"id":12196,"uris":["http://zotero.org/users/7317906/items/H5CAAL6F"],"itemData":{"id":12196,"type":"article-journal","abstract":"MatchIt implements the suggestions of Ho, Imai, King, and Stuart (2007) for improving parametric statistical models by preprocessing data with nonparametric matching methods. MatchIt implements a wide range of sophisticated matching methods, making it possible to greatly reduce the dependence of causal inferences on hard-to-justify, but commonly made, statistical modeling assumptions. The software also easily fits into existing research practices since, after preprocessing data with MatchIt, researchers can use whatever parametric model they would have used without MatchIt, but produce inferences with substantially more robustness and less sensitivity to modeling assumptions. MatchIt is an R program, and also works seamlessly with Zelig.","container-title":"Journal of Statistical Software","DOI":"10.18637/jss.v042.i08","ISSN":"1548-7660","language":"en","license":"Copyright (c) 2006 Daniel Ho, Kosuke Imai, Gary King, Elizabeth A. Stuart","page":"1-28","source":"www.jstatsoft.org","title":"MatchIt: Nonparametric Preprocessing for Parametric Causal Inference","title-short":"MatchIt","volume":"42","author":[{"family":"Ho","given":"Daniel"},{"family":"Imai","given":"Kosuke"},{"family":"King","given":"Gary"},{"family":"Stuart","given":"Elizabeth A."}],"issued":{"date-parts":[["2011",6,14]]},"citation-key":"hoMatchItNonparametricPreprocessing2011"}}],"schema":"https://github.com/citation-style-language/schema/raw/master/csl-citation.json"} </w:instrText>
+      </w:r>
+      <w:r>
+        <w:fldChar w:fldCharType="separate"/>
+      </w:r>
+      <w:r>
+        <w:rPr>
+          <w:noProof/>
+        </w:rPr>
+        <w:t>(Ho et al., 2011)</w:t>
+      </w:r>
+      <w:r>
+        <w:fldChar w:fldCharType="end"/>
+      </w:r>
+      <w:r>
+        <w:t>)</w:t>
+      </w:r>
+      <w:r>
+        <w:t>. F</w:t>
+      </w:r>
+      <w:r>
+        <w:t xml:space="preserve">or </w:t>
+      </w:r>
+      <w:r>
+        <w:t xml:space="preserve">each outcome we identified all Cushing’s cases </w:t>
+      </w:r>
+      <w:r>
+        <w:t xml:space="preserve">with that measurement </w:t>
+      </w:r>
+      <w:r>
+        <w:t xml:space="preserve">and potential controls with that measurement available. </w:t>
+      </w:r>
+      <w:r>
+        <w:t>For Cushing’s cases to be included they had to have had the laboratory measure</w:t>
+      </w:r>
+      <w:r>
+        <w:t>d</w:t>
+      </w:r>
+      <w:r>
+        <w:t xml:space="preserve"> </w:t>
+      </w:r>
+      <w:r>
+        <w:t xml:space="preserve">30 days or fewer </w:t>
+      </w:r>
+      <w:r>
+        <w:t xml:space="preserve">prior to surgical treatment.  </w:t>
+      </w:r>
+      <w:r>
+        <w:t>We performed nearest</w:t>
+      </w:r>
+      <w:r>
+        <w:rPr>
+          <w:rFonts w:ascii="Cambria Math" w:hAnsi="Cambria Math" w:cs="Cambria Math"/>
+        </w:rPr>
+        <w:t>‐</w:t>
+      </w:r>
+      <w:r>
+        <w:t xml:space="preserve">neighbor propensity score matching (ratio = </w:t>
+      </w:r>
+      <w:r>
+        <w:t>10:1</w:t>
+      </w:r>
+      <w:r>
+        <w:t xml:space="preserve">) with age in the </w:t>
+      </w:r>
+      <w:r>
+        <w:t>propensity score</w:t>
+      </w:r>
+      <w:r>
+        <w:t xml:space="preserve"> model and exact matching on gender and race/ethnicity</w:t>
+      </w:r>
+      <w:r>
+        <w:t xml:space="preserve"> from a pool of </w:t>
+      </w:r>
+      <w:r>
+        <w:t>70</w:t>
+      </w:r>
+      <w:r>
+        <w:t>,</w:t>
+      </w:r>
+      <w:r>
+        <w:t>327</w:t>
+      </w:r>
+      <w:r>
+        <w:t xml:space="preserve"> </w:t>
+      </w:r>
+      <w:r>
+        <w:t>Michigan Medicine patients</w:t>
+      </w:r>
+      <w:r>
+        <w:t xml:space="preserve">. This procedure was repeated separately for each outcome </w:t>
+      </w:r>
+      <w:r>
+        <w:t xml:space="preserve">as our </w:t>
+      </w:r>
+      <w:r>
+        <w:t>primary analys</w:t>
+      </w:r>
+      <w:r>
+        <w:t>e</w:t>
+      </w:r>
+      <w:r>
+        <w:t xml:space="preserve">s. </w:t>
+      </w:r>
+      <w:r>
+        <w:t xml:space="preserve"> The</w:t>
+      </w:r>
+      <w:r>
+        <w:t xml:space="preserve"> maximal</w:t>
+      </w:r>
+      <w:r>
+        <w:t xml:space="preserve"> post-matching standardized mean difference for </w:t>
+      </w:r>
+      <w:r>
+        <w:t>a</w:t>
+      </w:r>
+      <w:r>
+        <w:t xml:space="preserve">ge </w:t>
+      </w:r>
+      <w:r>
+        <w:t>was</w:t>
+      </w:r>
+      <w:r>
+        <w:t xml:space="preserve"> &lt;0.</w:t>
+      </w:r>
+      <w:r>
+        <w:t>05</w:t>
+      </w:r>
+      <w:r>
+        <w:t xml:space="preserve"> for all outcomes, indicating adequate balance.</w:t>
+      </w:r>
+      <w:r>
+        <w:t xml:space="preserve">  </w:t>
+      </w:r>
+      <w:r>
+        <w:t xml:space="preserve">As a sensitivity analysis we also created a single matched cohort using participants with </w:t>
+      </w:r>
+      <w:r>
+        <w:t>any of the laboratory results we tested (glucose, HbA1c, ALT, blood pressure, r LDL-cholesterol)</w:t>
+      </w:r>
+      <w:r>
+        <w:t xml:space="preserve"> and </w:t>
+      </w:r>
+      <w:commentRangeStart w:id="11"/>
+      <w:r>
+        <w:t xml:space="preserve">repeated all outcome models </w:t>
+      </w:r>
+      <w:r>
+        <w:t>with that dataset</w:t>
+      </w:r>
+      <w:r>
+        <w:t>.</w:t>
+      </w:r>
+      <w:commentRangeEnd w:id="11"/>
       <w:r>
         <w:rPr>
           <w:rStyle w:val="CommentReference"/>
           <w:sz w:val="24"/>
           <w:szCs w:val="24"/>
         </w:rPr>
-        <w:commentReference w:id="4"/>
+        <w:commentReference w:id="11"/>
+      </w:r>
+      <w:r>
+        <w:t xml:space="preserve"> In our search, we only included patients with BMI’s within the 5-75 range, and between 5-75 years of age. Finally, we also only included patients within the </w:t>
+      </w:r>
+      <w:proofErr w:type="gramStart"/>
+      <w:r>
+        <w:t>2022-2025 year</w:t>
+      </w:r>
+      <w:proofErr w:type="gramEnd"/>
+      <w:r>
+        <w:t xml:space="preserve"> range. This was done to create a data pull request that was less than 100,000 people, which was necessary with the Data Direct software </w:t>
+      </w:r>
+      <w:proofErr w:type="gramStart"/>
+      <w:r>
+        <w:t>used.*</w:t>
+      </w:r>
+      <w:proofErr w:type="gramEnd"/>
+      <w:r>
+        <w:t>**talk about this more</w:t>
+      </w:r>
+    </w:p>
+    <w:p>
+      <w:r>
+        <w:t>BMI was not included in the propensity score because we aimed to evaluate obesity as a moderator of the effects of Cushing’s disease</w:t>
+      </w:r>
+      <w:r>
+        <w:t>. Subsequent</w:t>
+      </w:r>
+      <w:r>
+        <w:t xml:space="preserve"> analyses were stratified by obesity (BMI ≥30 kg/m²). Within each obesity stratum, BMI was evaluated </w:t>
+      </w:r>
+      <w:proofErr w:type="gramStart"/>
+      <w:r>
+        <w:t>descriptively</w:t>
+      </w:r>
+      <w:r>
+        <w:t>,</w:t>
+      </w:r>
+      <w:r>
+        <w:t xml:space="preserve"> and</w:t>
+      </w:r>
+      <w:proofErr w:type="gramEnd"/>
+      <w:r>
+        <w:t xml:space="preserve"> </w:t>
+      </w:r>
+      <w:r>
+        <w:t xml:space="preserve">also </w:t>
+      </w:r>
+      <w:r>
+        <w:t>included as a covariate in sensitivity models.</w:t>
+      </w:r>
+    </w:p>
+    <w:p>
+      <w:r>
+        <w:t xml:space="preserve">Mean arterial pressure was directly measured in </w:t>
+      </w:r>
+      <w:proofErr w:type="gramStart"/>
+      <w:r>
+        <w:t>the majority of</w:t>
+      </w:r>
+      <w:proofErr w:type="gramEnd"/>
+      <w:r>
+        <w:t xml:space="preserve"> cases. When MAP was missing but systolic and diastolic BP were available</w:t>
+      </w:r>
+      <w:r>
+        <w:t xml:space="preserve">, </w:t>
+      </w:r>
+      <w:r>
+        <w:t>MAP was calculated as (SBP + 2×DBP)/3. The calculated values showed high agreement with measured MAP (r=0.963, mean difference=1.32 ± 3.38 mmHg) in cases where both were available.</w:t>
+      </w:r>
+    </w:p>
+    <w:p>
+      <w:r>
+        <w:rPr>
+          <w:b/>
+          <w:bCs/>
+        </w:rPr>
+        <w:t>Statistical Analyses.</w:t>
+      </w:r>
+      <w:r>
+        <w:t xml:space="preserve">  Statistical significance</w:t>
+      </w:r>
+      <w:r>
+        <w:t xml:space="preserve"> for this stud</w:t>
+      </w:r>
+      <w:r>
+        <w:t xml:space="preserve"> was set at p&lt;0.05.  All analyses were performed using R version 4.4.0 </w:t>
+      </w:r>
+      <w:r>
+        <w:fldChar w:fldCharType="begin"/>
+      </w:r>
+      <w:r>
+        <w:instrText xml:space="preserve"> ADDIN ZOTERO_ITEM CSL_CITATION {"citationID":"UlCX6dpA","properties":{"formattedCitation":"(R Core Team, 2019)","plainCitation":"(R Core Team, 2019)","noteIndex":0},"citationItems":[{"id":8230,"uris":["http://zotero.org/users/7317906/items/3HZT7KXK"],"itemData":{"id":8230,"type":"document","note":"Citation Key: base\npublisher-place: Vienna, Austria","publisher":"R Foundation for Statistical Computing","title":"R: A Language and Environment for Statistical Computing","URL":"http://www.r-project.org/","author":[{"literal":"R Core Team"}],"accessed":{"date-parts":[["2010",10,22]]},"issued":{"date-parts":[["2019"]]},"citation-key":"base"}}],"schema":"https://github.com/citation-style-language/schema/raw/master/csl-citation.json"} </w:instrText>
+      </w:r>
+      <w:r>
+        <w:fldChar w:fldCharType="separate"/>
+      </w:r>
+      <w:r>
+        <w:rPr>
+          <w:noProof/>
+        </w:rPr>
+        <w:t>(R Core Team, 2019)</w:t>
+      </w:r>
+      <w:r>
+        <w:fldChar w:fldCharType="end"/>
+      </w:r>
+      <w:r>
+        <w:t xml:space="preserve">.  For participant demographics, Kruskal-Wallis or Mann-Whitney tests were used as both BMI and participant Age were not normally distributed (p&lt;0.05 via Shapiro-Wilk tests).  </w:t>
+      </w:r>
+      <w:r>
+        <w:t>χ</w:t>
+      </w:r>
+      <w:r>
+        <w:rPr>
+          <w:vertAlign w:val="superscript"/>
+        </w:rPr>
+        <w:t>2</w:t>
+      </w:r>
+      <w:r>
+        <w:t xml:space="preserve"> tests were used to compare counts across groups</w:t>
+      </w:r>
+      <w:r>
+        <w:t xml:space="preserve"> unless counts were expected to be under five per group, in which case Fisher’s exact test was used</w:t>
       </w:r>
       <w:r>
         <w:t>.</w:t>
       </w:r>
-      <w:r>
-        <w:t xml:space="preserve">  We excluded participants if they </w:t>
-      </w:r>
-      <w:r>
-        <w:t>did not have a Cushing’s disease diagnosis, treatment date, lab history, or relevant demographic data documented.</w:t>
-      </w:r>
-      <w:r>
-        <w:t xml:space="preserve"> Race and ethnicity were self-reported, with groups of &lt;10 aggregated into the other category.</w:t>
-      </w:r>
-      <w:r>
-        <w:t xml:space="preserve"> </w:t>
-      </w:r>
-    </w:p>
-    <w:p>
-      <w:r>
-        <w:t xml:space="preserve">To identify controls, </w:t>
-      </w:r>
-      <w:r>
-        <w:t>we used</w:t>
-      </w:r>
-      <w:r>
-        <w:t xml:space="preserve"> the </w:t>
-      </w:r>
-      <w:r>
-        <w:t xml:space="preserve"> </w:t>
-      </w:r>
-      <w:proofErr w:type="spellStart"/>
-      <w:r>
-        <w:t>MatchIt</w:t>
-      </w:r>
-      <w:proofErr w:type="spellEnd"/>
-      <w:r>
-        <w:t xml:space="preserve"> </w:t>
-      </w:r>
-      <w:r>
-        <w:t xml:space="preserve">package </w:t>
-      </w:r>
-      <w:r>
-        <w:t xml:space="preserve">(version </w:t>
-      </w:r>
-      <w:r>
-        <w:t xml:space="preserve">4.7.1; </w:t>
-      </w:r>
-      <w:r>
-        <w:fldChar w:fldCharType="begin"/>
-      </w:r>
-      <w:r>
-        <w:instrText xml:space="preserve"> ADDIN ZOTERO_ITEM CSL_CITATION {"citationID":"Pl5Gc3F1","properties":{"formattedCitation":"(Ho et al., 2011)","plainCitation":"(Ho et al., 2011)","noteIndex":0},"citationItems":[{"id":12196,"uris":["http://zotero.org/users/7317906/items/H5CAAL6F"],"itemData":{"id":12196,"type":"article-journal","abstract":"MatchIt implements the suggestions of Ho, Imai, King, and Stuart (2007) for improving parametric statistical models by preprocessing data with nonparametric matching methods. MatchIt implements a wide range of sophisticated matching methods, making it possible to greatly reduce the dependence of causal inferences on hard-to-justify, but commonly made, statistical modeling assumptions. The software also easily fits into existing research practices since, after preprocessing data with MatchIt, researchers can use whatever parametric model they would have used without MatchIt, but produce inferences with substantially more robustness and less sensitivity to modeling assumptions. MatchIt is an R program, and also works seamlessly with Zelig.","container-title":"Journal of Statistical Software","DOI":"10.18637/jss.v042.i08","ISSN":"1548-7660","language":"en","license":"Copyright (c) 2006 Daniel Ho, Kosuke Imai, Gary King, Elizabeth A. Stuart","page":"1-28","source":"www.jstatsoft.org","title":"MatchIt: Nonparametric Preprocessing for Parametric Causal Inference","title-short":"MatchIt","volume":"42","author":[{"family":"Ho","given":"Daniel"},{"family":"Imai","given":"Kosuke"},{"family":"King","given":"Gary"},{"family":"Stuart","given":"Elizabeth A."}],"issued":{"date-parts":[["2011",6,14]]},"citation-key":"hoMatchItNonparametricPreprocessing2011"}}],"schema":"https://github.com/citation-style-language/schema/raw/master/csl-citation.json"} </w:instrText>
-      </w:r>
-      <w:r>
-        <w:fldChar w:fldCharType="separate"/>
-      </w:r>
-      <w:r>
-        <w:rPr>
-          <w:noProof/>
-        </w:rPr>
-        <w:t>(Ho et al., 2011)</w:t>
-      </w:r>
-      <w:r>
-        <w:fldChar w:fldCharType="end"/>
-      </w:r>
-      <w:r>
-        <w:t>)</w:t>
-      </w:r>
-      <w:r>
-        <w:t>. F</w:t>
-      </w:r>
-      <w:r>
-        <w:t xml:space="preserve">or </w:t>
-      </w:r>
-      <w:r>
-        <w:t xml:space="preserve">each outcome we identified all Cushing’s cases </w:t>
-      </w:r>
-      <w:r>
-        <w:t xml:space="preserve">with that measurement </w:t>
-      </w:r>
-      <w:r>
-        <w:t xml:space="preserve">and potential controls with that measurement available. </w:t>
-      </w:r>
-      <w:r>
-        <w:t xml:space="preserve">For Cushing’s cases to be included they had to </w:t>
-      </w:r>
+    </w:p>
+    <w:p>
+      <w:pPr>
+        <w:pStyle w:val="Heading1"/>
+      </w:pPr>
       <w:r>
         <w:lastRenderedPageBreak/>
-        <w:t>have had the laboratory measure</w:t>
-      </w:r>
-      <w:r>
-        <w:t>d</w:t>
-      </w:r>
-      <w:r>
-        <w:t xml:space="preserve"> </w:t>
-      </w:r>
-      <w:r>
-        <w:t xml:space="preserve">30 days or fewer </w:t>
-      </w:r>
-      <w:r>
-        <w:t xml:space="preserve">prior to surgical treatment.  </w:t>
-      </w:r>
-      <w:r>
-        <w:t>We performed nearest</w:t>
-      </w:r>
-      <w:r>
-        <w:rPr>
-          <w:rFonts w:ascii="Cambria Math" w:hAnsi="Cambria Math" w:cs="Cambria Math"/>
-        </w:rPr>
-        <w:t>‐</w:t>
-      </w:r>
-      <w:r>
-        <w:t xml:space="preserve">neighbor propensity score matching (ratio = </w:t>
-      </w:r>
-      <w:r>
-        <w:t>10:1</w:t>
-      </w:r>
-      <w:r>
-        <w:t xml:space="preserve">) with age in the </w:t>
-      </w:r>
-      <w:r>
-        <w:t>propensity score</w:t>
-      </w:r>
-      <w:r>
-        <w:t xml:space="preserve"> model and exact matching on gender and race/ethnicity</w:t>
-      </w:r>
-      <w:r>
-        <w:t xml:space="preserve"> from a pool of </w:t>
-      </w:r>
-      <w:r>
-        <w:t>70</w:t>
-      </w:r>
-      <w:r>
-        <w:t>,</w:t>
-      </w:r>
-      <w:r>
-        <w:t>327</w:t>
-      </w:r>
-      <w:r>
-        <w:t xml:space="preserve"> </w:t>
-      </w:r>
-      <w:r>
-        <w:t>Michigan Medicine patients</w:t>
-      </w:r>
-      <w:r>
-        <w:t xml:space="preserve">. This procedure was repeated separately for each outcome </w:t>
-      </w:r>
-      <w:r>
-        <w:t xml:space="preserve">as our </w:t>
-      </w:r>
-      <w:r>
-        <w:t>primary analys</w:t>
-      </w:r>
-      <w:r>
-        <w:t>e</w:t>
-      </w:r>
-      <w:r>
-        <w:t xml:space="preserve">s. </w:t>
-      </w:r>
-      <w:r>
-        <w:t xml:space="preserve"> The</w:t>
-      </w:r>
-      <w:r>
-        <w:t xml:space="preserve"> maximal</w:t>
-      </w:r>
-      <w:r>
-        <w:t xml:space="preserve"> post-matching standardized mean difference for </w:t>
-      </w:r>
-      <w:r>
-        <w:t>a</w:t>
-      </w:r>
-      <w:r>
-        <w:t xml:space="preserve">ge </w:t>
-      </w:r>
-      <w:r>
-        <w:t>was</w:t>
-      </w:r>
-      <w:r>
-        <w:t xml:space="preserve"> &lt;0.</w:t>
-      </w:r>
-      <w:r>
-        <w:t>05</w:t>
-      </w:r>
-      <w:r>
-        <w:t xml:space="preserve"> for all outcomes, indicating adequate balance.</w:t>
-      </w:r>
-      <w:r>
-        <w:t xml:space="preserve">  </w:t>
-      </w:r>
-      <w:r>
-        <w:t xml:space="preserve">As a sensitivity analysis we also created a single matched cohort using participants with </w:t>
-      </w:r>
-      <w:r>
-        <w:t>any of the laboratory results we tested (glucose, HbA1c, ALT, blood pressure, r LDL-cholesterol)</w:t>
-      </w:r>
-      <w:r>
-        <w:t xml:space="preserve"> and </w:t>
-      </w:r>
-      <w:commentRangeStart w:id="5"/>
-      <w:r>
-        <w:t xml:space="preserve">repeated all outcome models </w:t>
-      </w:r>
-      <w:r>
-        <w:t>with that dataset</w:t>
-      </w:r>
-      <w:r>
-        <w:t>.</w:t>
-      </w:r>
-      <w:commentRangeEnd w:id="5"/>
+        <w:t>Results</w:t>
+      </w:r>
+    </w:p>
+    <w:p>
+      <w:pPr>
+        <w:pStyle w:val="Heading2"/>
+        <w:rPr>
+          <w:b/>
+          <w:bCs/>
+        </w:rPr>
+      </w:pPr>
+      <w:r>
+        <w:rPr>
+          <w:rStyle w:val="Strong"/>
+          <w:b w:val="0"/>
+          <w:bCs w:val="0"/>
+        </w:rPr>
+        <w:t>Study population</w:t>
+      </w:r>
+    </w:p>
+    <w:p>
+      <w:commentRangeStart w:id="12"/>
+      <w:r>
+        <w:t xml:space="preserve">As shown in Figure 1, we identified YYYY participants with diagnoses of Cushing’s disease.  </w:t>
+      </w:r>
+      <w:r>
+        <w:t xml:space="preserve">This included YYYY adrenal tumors and ZZZ pituitary tumors.  </w:t>
+      </w:r>
+      <w:r>
+        <w:t>Their average age at diagnosis was XXX (+/- XXX).  They</w:t>
+      </w:r>
+      <w:commentRangeEnd w:id="12"/>
       <w:r>
         <w:rPr>
           <w:rStyle w:val="CommentReference"/>
           <w:sz w:val="24"/>
           <w:szCs w:val="24"/>
         </w:rPr>
-        <w:commentReference w:id="5"/>
-      </w:r>
-      <w:r>
-        <w:t xml:space="preserve"> In our search, we only included patients with BMI’s within the 5-75 range, and between 5-75 years of age. Finally, we also only included patients within the </w:t>
-      </w:r>
-      <w:proofErr w:type="gramStart"/>
-      <w:r>
-        <w:t>2022-2025 year</w:t>
-      </w:r>
-      <w:proofErr w:type="gramEnd"/>
-      <w:r>
-        <w:t xml:space="preserve"> range. This was done to create a data pull request that was less than 100,000 people, which was necessary with the Data Direct software </w:t>
-      </w:r>
-      <w:proofErr w:type="gramStart"/>
-      <w:r>
-        <w:t>used.*</w:t>
-      </w:r>
-      <w:proofErr w:type="gramEnd"/>
-      <w:r>
-        <w:t>**talk about this more</w:t>
-      </w:r>
-    </w:p>
-    <w:p>
-      <w:r>
-        <w:t>BMI was not included in the propensity score because we aimed to evaluate obesity as a moderator of the effects of Cushing’s disease</w:t>
-      </w:r>
-      <w:r>
-        <w:t>. Subsequent</w:t>
-      </w:r>
-      <w:r>
-        <w:t xml:space="preserve"> analyses were stratified by obesity (BMI ≥30 kg/m²). Within each obesity stratum, BMI was evaluated </w:t>
-      </w:r>
-      <w:proofErr w:type="gramStart"/>
-      <w:r>
-        <w:t>descriptively</w:t>
-      </w:r>
-      <w:r>
-        <w:t>,</w:t>
-      </w:r>
-      <w:r>
-        <w:t xml:space="preserve"> and</w:t>
-      </w:r>
-      <w:proofErr w:type="gramEnd"/>
+        <w:commentReference w:id="12"/>
+      </w:r>
       <w:r>
         <w:t xml:space="preserve"> </w:t>
       </w:r>
-      <w:r>
-        <w:t xml:space="preserve">also </w:t>
-      </w:r>
-      <w:r>
-        <w:t>included as a covariate in sensitivity models.</w:t>
-      </w:r>
-    </w:p>
-    <w:p>
-      <w:r>
-        <w:t xml:space="preserve">Mean arterial pressure was directly measured in </w:t>
-      </w:r>
-      <w:proofErr w:type="gramStart"/>
-      <w:r>
-        <w:t>the majority of</w:t>
-      </w:r>
-      <w:proofErr w:type="gramEnd"/>
-      <w:r>
-        <w:t xml:space="preserve"> cases. When MAP was missing but systolic and diastolic BP were available</w:t>
-      </w:r>
-      <w:r>
-        <w:t xml:space="preserve">, </w:t>
-      </w:r>
-      <w:r>
-        <w:t>MAP was calculated as (SBP + 2×DBP)/3. The calculated values showed high agreement with measured MAP (r=0.963, mean difference=1.32 ± 3.38 mmHg) in cases where both were available.</w:t>
-      </w:r>
-    </w:p>
-    <w:p>
-      <w:r>
-        <w:rPr>
-          <w:b/>
-          <w:bCs/>
-        </w:rPr>
-        <w:t>Statistical Analyses.</w:t>
-      </w:r>
-      <w:r>
-        <w:t xml:space="preserve">  Statistical significance</w:t>
-      </w:r>
-      <w:r>
-        <w:t xml:space="preserve"> for this stud</w:t>
-      </w:r>
-      <w:r>
-        <w:t xml:space="preserve"> was set at p&lt;0.05.  All analyses were performed using R version 4.4.0 </w:t>
-      </w:r>
-      <w:r>
-        <w:fldChar w:fldCharType="begin"/>
-      </w:r>
-      <w:r>
-        <w:instrText xml:space="preserve"> ADDIN ZOTERO_ITEM CSL_CITATION {"citationID":"UlCX6dpA","properties":{"formattedCitation":"(R Core Team, 2019)","plainCitation":"(R Core Team, 2019)","noteIndex":0},"citationItems":[{"id":8230,"uris":["http://zotero.org/users/7317906/items/3HZT7KXK"],"itemData":{"id":8230,"type":"document","note":"Citation Key: base\npublisher-place: Vienna, Austria","publisher":"R Foundation for Statistical Computing","title":"R: A Language and Environment for Statistical Computing","URL":"http://www.r-project.org/","author":[{"literal":"R Core Team"}],"accessed":{"date-parts":[["2010",10,22]]},"issued":{"date-parts":[["2019"]]},"citation-key":"base"}}],"schema":"https://github.com/citation-style-language/schema/raw/master/csl-citation.json"} </w:instrText>
-      </w:r>
-      <w:r>
-        <w:fldChar w:fldCharType="separate"/>
-      </w:r>
-      <w:r>
-        <w:rPr>
-          <w:noProof/>
-        </w:rPr>
-        <w:t>(R Core Team, 2019)</w:t>
-      </w:r>
-      <w:r>
-        <w:fldChar w:fldCharType="end"/>
-      </w:r>
-      <w:r>
-        <w:t xml:space="preserve">.  For participant demographics, Kruskal-Wallis or Mann-Whitney tests were used as both BMI and participant Age were not normally distributed (p&lt;0.05 via Shapiro-Wilk tests).  </w:t>
-      </w:r>
-      <w:r>
-        <w:t>χ</w:t>
-      </w:r>
-      <w:r>
-        <w:rPr>
-          <w:vertAlign w:val="superscript"/>
-        </w:rPr>
-        <w:t>2</w:t>
-      </w:r>
-      <w:r>
-        <w:t xml:space="preserve"> tests were used to compare counts across groups</w:t>
-      </w:r>
-      <w:r>
-        <w:t xml:space="preserve"> unless counts were expected to be under five per group, in which case Fisher’s exact test was used</w:t>
-      </w:r>
-      <w:r>
-        <w:t>.</w:t>
-      </w:r>
-    </w:p>
-    <w:p>
-      <w:pPr>
-        <w:pStyle w:val="Heading1"/>
-      </w:pPr>
-      <w:r>
-        <w:t>Results</w:t>
-      </w:r>
-    </w:p>
+    </w:p>
+    <w:p/>
     <w:p>
       <w:pPr>
         <w:pStyle w:val="Heading2"/>
-        <w:rPr>
-          <w:b/>
-          <w:bCs/>
-        </w:rPr>
-      </w:pPr>
-      <w:r>
         <w:rPr>
           <w:rStyle w:val="Strong"/>
           <w:b w:val="0"/>
           <w:bCs w:val="0"/>
         </w:rPr>
-        <w:t>Study population</w:t>
-      </w:r>
-    </w:p>
-    <w:p>
-      <w:commentRangeStart w:id="6"/>
-      <w:r>
-        <w:t xml:space="preserve">As shown in Figure 1, we identified YYYY participants with diagnoses of Cushing’s disease.  </w:t>
-      </w:r>
-      <w:r>
-        <w:t xml:space="preserve">This included YYYY adrenal tumors and ZZZ pituitary tumors.  </w:t>
-      </w:r>
-      <w:r>
-        <w:t>Their average age at diagnosis was XXX (+/- XXX).  They</w:t>
-      </w:r>
-      <w:commentRangeEnd w:id="6"/>
+      </w:pPr>
+      <w:r>
+        <w:rPr>
+          <w:rStyle w:val="Strong"/>
+          <w:b w:val="0"/>
+          <w:bCs w:val="0"/>
+        </w:rPr>
+        <w:t>Participant characteristics</w:t>
+      </w:r>
+      <w:r>
+        <w:rPr>
+          <w:rStyle w:val="Strong"/>
+          <w:b w:val="0"/>
+          <w:bCs w:val="0"/>
+        </w:rPr>
+        <w:t xml:space="preserve"> </w:t>
+      </w:r>
+      <w:r>
+        <w:rPr>
+          <w:rStyle w:val="Strong"/>
+          <w:b w:val="0"/>
+          <w:bCs w:val="0"/>
+        </w:rPr>
+        <w:t xml:space="preserve">associated with </w:t>
+      </w:r>
+      <w:r>
+        <w:rPr>
+          <w:rStyle w:val="Strong"/>
+          <w:b w:val="0"/>
+          <w:bCs w:val="0"/>
+        </w:rPr>
+        <w:t xml:space="preserve">Cushing’s </w:t>
+      </w:r>
+      <w:r>
+        <w:rPr>
+          <w:rStyle w:val="Strong"/>
+          <w:b w:val="0"/>
+          <w:bCs w:val="0"/>
+        </w:rPr>
+        <w:t xml:space="preserve">disease </w:t>
+      </w:r>
+    </w:p>
+    <w:p>
+      <w:r>
+        <w:t xml:space="preserve">We performed outcome-specific propensity matching to identify appropriate controls, starting from those with generating exact matches for gender, race and ethnicity.  We then algorithmically matched for age, generating 10 controls for each case.  Matching was </w:t>
+      </w:r>
+      <w:proofErr w:type="gramStart"/>
+      <w:r>
+        <w:t xml:space="preserve">effective </w:t>
+      </w:r>
+      <w:r>
+        <w:t xml:space="preserve"> with</w:t>
+      </w:r>
+      <w:proofErr w:type="gramEnd"/>
+      <w:r>
+        <w:t xml:space="preserve"> a </w:t>
+      </w:r>
+      <w:r>
+        <w:t>standardized mean difference</w:t>
+      </w:r>
+      <w:r>
+        <w:t xml:space="preserve"> for age of &lt;0.05 for each outcome (see </w:t>
+      </w:r>
+      <w:r>
+        <w:t xml:space="preserve">Table 1, </w:t>
+      </w:r>
+      <w:r>
+        <w:t xml:space="preserve">Supplementary </w:t>
+      </w:r>
+      <w:r>
+        <w:t xml:space="preserve">Figure </w:t>
+      </w:r>
+      <w:r>
+        <w:t>1</w:t>
+      </w:r>
+      <w:r>
+        <w:t xml:space="preserve"> and Supplementary Table S1).</w:t>
+      </w:r>
+    </w:p>
+    <w:p>
+      <w:r>
+        <w:t xml:space="preserve">Primary descriptive characteristics are </w:t>
+      </w:r>
+      <w:r>
+        <w:t>provided</w:t>
+      </w:r>
+      <w:r>
+        <w:t xml:space="preserve"> for all participants with any available laboratory measurement</w:t>
+      </w:r>
+      <w:r>
+        <w:t xml:space="preserve"> </w:t>
+      </w:r>
+      <w:r>
+        <w:t>(Table 1)</w:t>
+      </w:r>
+      <w:r>
+        <w:t xml:space="preserve">. </w:t>
+      </w:r>
+      <w:r>
+        <w:t>Outcome-specific matched sets are described in Supplementary Tables S2</w:t>
+      </w:r>
+      <w:r>
+        <w:t>A-E</w:t>
+      </w:r>
+      <w:r>
+        <w:t>.</w:t>
+      </w:r>
+      <w:r>
+        <w:t xml:space="preserve">   Here we reproduce several notable characteristics, including a higher prevalence of Cushing’s disease in females (284 vs 72</w:t>
+      </w:r>
+      <w:r>
+        <w:t>, p&lt;0.00</w:t>
+      </w:r>
+      <w:r>
+        <w:t>1</w:t>
+      </w:r>
+      <w:r>
+        <w:t>)</w:t>
+      </w:r>
+      <w:r>
+        <w:t>, consistent with the prior literature</w:t>
+      </w:r>
+      <w:r>
+        <w:t xml:space="preserve"> </w:t>
+      </w:r>
+      <w:r>
+        <w:fldChar w:fldCharType="begin"/>
+      </w:r>
+      <w:r>
+        <w:instrText xml:space="preserve"> ADDIN ZOTERO_ITEM CSL_CITATION {"citationID":"5iZIPs39","properties":{"formattedCitation":"(Alqeeq et al., 2024; Broder et al., 2015; Etxabe &amp; Vazquez, 1994; Matthiasdottir et al., 2024; Steffensen et al., 2010)","plainCitation":"(Alqeeq et al., 2024; Broder et al., 2015; Etxabe &amp; Vazquez, 1994; Matthiasdottir et al., 2024; Steffensen et al., 2010)","noteIndex":0},"citationItems":[{"id":27029,"uris":["http://zotero.org/users/7317906/items/5UXH2J3G"],"itemData":{"id":27029,"type":"article-journal","abstract":"BACKGROUND AND OBJECTIVES: Cushing's disease is a rare endocrine disorder. This review aimed to examine sex-specific differences in Cushing's disease.\nDESIGN AND SETTINGS: A meta-analysis was performed on published articles discussing the gender impact of Cushing's disease.\nMETHODS: A systematic search was conducted to identify studies from Medline, Embase, CENTRAL and Scopus. Nine studies enrolling 1047 patients diagnosed with Cushing's disease were included in this meta-analysis.\nRESULTS: Male patients presented at a younger age (MD [mean difference]=-5.43; 95% CI [-5.78, -5.08]; P&lt;.00001) than females. Male patients had a significantly higher prevalence of osteoporosis (RR [risk ratio]=1.75; 95% CI [1.36, 225]; P&lt;.0001) and hypokalemia (RR=1.66; 95% CI [1.27, 2.16]; P=.0002). In addition, males had significantly higher rates of negative magnetic resonance imaging (RR=1.53; 95% CI [1.18, 2.0]; P=.002). No sex difference was observed in the prevalence of diabetes (RR=0.92; 95% CI [0.70, 1.22]); P=.57) and dyslipidemia (RR=1.33; 95% CI [0.88, 2.0]; P=.17).\nCONCLUSION: Cushing's disease has a worse clinical presentation in males and more diagnostic difficulties compared to females.","container-title":"Annals of Saudi Medicine","DOI":"10.5144/0256-4947.2024.55","ISSN":"0975-4466","issue":"1","journalAbbreviation":"Ann Saudi Med","language":"eng","note":"PMID: 38311874\nPMCID: PMC10839456","page":"55-65","source":"PubMed","title":"Sex-related differences in Cushing's disease: a systematic review and meta-analysis","title-short":"Sex-related differences in Cushing's disease","volume":"44","author":[{"family":"Alqeeq","given":"Basel F."},{"family":"Ayyad","given":"Mohammed"},{"family":"Almadhoun","given":"Waseem J."},{"family":"Aboabdo","given":"Mohammad"},{"family":"Aldahdouh","given":"Mosheer S."},{"family":"Al-Tawil","given":"Mohammed"},{"family":"Al-Ghazali","given":"Ahmed M."}],"issued":{"date-parts":[["2024"]]},"citation-key":"alqeeqSexrelatedDifferencesCushings2024"}},{"id":27016,"uris":["http://zotero.org/users/7317906/items/RNS3FR6N"],"itemData":{"id":27016,"type":"article-journal","abstract":"PURPOSE: To estimate the incidence of Cushing's syndrome (CS) and Cushing's disease (CD) in the US.\nMETHODS: MarketScan Commercial database 2007-2010 (age &lt;65 years) was used. CS patients were defined with ≥2 claims of CS diagnosis, while CD patients were defined with CS plus a benign pituitary adenoma diagnosis or hypophysectomy in the same calendar year. Annual incidence was calculated by dividing the number of CS or CD cases by the total number of members with the same enrollment requirement during the calendar years.\nRESULTS: CS incidence rates per million person-years were 48.6 in 2009 and 39.5 in 2010. The lowest rates of CS were in ≤17-year-olds and highest rates were in 35 to 44-year-olds. CD incidence rates were 7.6 in 2009 and 6.2 in 2010. The lowest rates of CD were in ≤17-year-olds and highest rates were in 18 to 24-year-olds. The rates varied by sex (2.3-2.7 in males, 9.8-12.1 in females). In females, lowest rates ranged 2.5-4.0 in ≤17-year-olds and highest 16.7-27.2 in 18-24 year olds. In males, there were too few cases to report estimates by age.\nCONCLUSIONS: In the first large US-based study, the annual incidence of CS in individuals &lt;65 years old was nearly 49 cases per million, substantially higher than previous estimates, which were based primarily on European data. Using similar methods, we estimated the incidence of CD at nearly 8 cases per million US population. These estimates, if confirmed in other epidemiologic databases, represent a new data reference in these rare conditions.","container-title":"Pituitary","DOI":"10.1007/s11102-014-0569-6","ISSN":"1573-7403","issue":"3","journalAbbreviation":"Pituitary","language":"eng","note":"PMID: 24803324","page":"283-289","source":"PubMed","title":"Incidence of Cushing's syndrome and Cushing's disease in commercially-insured patients &lt;65 years old in the United States","volume":"18","author":[{"family":"Broder","given":"Michael S."},{"family":"Neary","given":"Maureen P."},{"family":"Chang","given":"Eunice"},{"family":"Cherepanov","given":"Dasha"},{"family":"Ludlam","given":"William H."}],"issued":{"date-parts":[["2015",6]]},"citation-key":"broderIncidenceCushingsSyndrome2015"}},{"id":1348,"uris":["http://zotero.org/users/7317906/items/V5L6B4RJ"],"itemData":{"id":1348,"type":"article-journal","abstract":"OBJECTIVE: Although Cushing's disease is a well documented clinical entity, there is no epidemiological information about it. The present study tries to obtain this information. DESIGN AND PATIENTS: Forty-nine patients affected by Cushing's disease living in Vizcaya (Spain) between 1975 and 1992 were considered for an epidemiological study. RESULTS: The prevalence of known cases at the end of 1992 was 39.1 per million inhabitants. The average incidence of newly diagnosed cases was 2.4 cases per million people per year. Cushing's disease was more frequent in women (n = 46) than in men (n = 3), with a ratio of 15:1. Diabetes mellitus and hypertension were observed in 38.7 and 55.1% of patients, respectively. Remission of Cushing's disease was achieved in 36 out of 41 patients (87.5%). In general, the mortality was higher than that expected for the control population (standardized mortality ratio, SMR 3.8, 95% confidence interval, CI 2.5-17.9, P &lt; 0.03). Concerning the cause of death, the SMR of vascular disease was 5 (95% CI 3.4-48.6, P &lt; 0.05). Higher age, persistence of hypertension and abnormalities of glucose metabolism after treatment, were independent predictors of mortality (multivariate analyses, P &lt; 0.01). CONCLUSIONS: Prevalence of Cushing's disease was 39.1 cases/million inhabitants and average incidence was 2.4 cases/million per year. Mortality was elevated, due to vascular disease, associated with higher age, persistence of hypertension and impaired glucose metabolism.","container-title":"Clin Endocrinol (Oxf)","DOI":"10.1111/j.1365-2265.1994.tb02486.x","ISSN":"0300-0664","issue":"4","note":"PMID: 8187313\nISBN: 0300-0664 (Print)\\r0300-0664 (Linking)","page":"479-484","title":"Morbidity and mortality in Cushing's disease: an epidemiological approach","volume":"40","author":[{"family":"Etxabe","given":"J"},{"family":"Vazquez","given":"J A"}],"issued":{"date-parts":[["1994"]]},"citation-key":"etxabeMorbidityMortalityCushings1994"}},{"id":27026,"uris":["http://zotero.org/users/7317906/items/X2VBVW53"],"itemData":{"id":27026,"type":"article-journal","abstract":"Introduction: In 2011, we reported the overall incidence of Cushing’s disease (CD) in Iceland from 1955 through 2009 to be 1.5 cases per million per year with highest incidence in the last decade of the study, a higher incidence then earlier reported. We now present a follow-up study reporting the epidemiology of the disease in Iceland during the 10-year period from 2010 to 2019. Methods: In this nationwide retrospective study, clinical information on patients diagnosed with CD was obtained from electronic medical records, reviewed by consulting endocrinologists. Results: Seventeen patients were diagnosed with CD, 12 women (71%) and 5 men (29%) giving an overall incidence of 5.2 cases per million per year. The mean age at diagnosis was 46 years (range 13–85 years). Biochemical analysis was recorded for all patients and 12 patients (71%) had visible pituitary adenoma on imaging studies. Sixteen patients (94%) were treated with transsphenoidal surgery of which 4 patients (24%) had gamma knife radiosurgery and three (18%) bilateral adrenalectomy after pituitary surgery. Two patients died during the study period. Conclusion: The overall incidence of CD of 5.2 cases per million per year is higher than previously reported, indicating the importance of awareness of CD. As all patients with CD are diagnosed and/or treated at the only University Hospital in Iceland, housing the only department of endocrinology as well as neurosurgery, we are confident that all cases diagnosed during the study period were included in the study.","container-title":"Neuroendocrinology","DOI":"10.1159/000540205","ISSN":"0028-3835","issue":"10","journalAbbreviation":"Neuroendocrinology","page":"950-957","source":"Silverchair","title":"Cushing’s Disease May Have Higher Incidence than Previously Thought: A Nationwide Study in Iceland 2010–2019","title-short":"Cushing’s Disease May Have Higher Incidence than Previously Thought","volume":"114","author":[{"family":"Matthiasdottir","given":"Anna Mjoll"},{"family":"Hardarson","given":"Thorgeir Orri"},{"family":"Arnardottir","given":"Steinunn"},{"family":"Sigurjonsdottir","given":"Helga Agusta"}],"issued":{"date-parts":[["2024",7,22]]},"citation-key":"matthiasdottirCushingsDiseaseMay2024"}},{"id":27019,"uris":["http://zotero.org/users/7317906/items/RTX3YT8D"],"itemData":{"id":27019,"type":"article-journal","abstract":"Overt Cushing’s syndrome is a rare disorder with an annual incidence of 2–3/million of which benign adrenal adenomas account for 0.6/million. The female:male ratio is 3:1. Preliminary data indicate a high proportion of subclinical Cushing’s syndrome in certain risk populations such as patients with type 2 diabetes or osteoporosis. The clinical implications of these observations are presently unclear. Surgery remains first line treatment for overt disease and initial cure or remission is obtained in 65–85% of patients with Cushing’s disease. Late recurrences, however, occur in up to 20% and the risk does not seem to plateau even after 20 years of follow-up. A 2- to 3-fold increase in mortality is observed in most studies, and this excess mortality seems confined to patients in whom initial cure was not obtained. Cushing’s syndrome continues to pose diagnostic and therapeutic challenges and life-long follow-up is mandatory.","container-title":"Neuroendocrinology","DOI":"10.1159/000314297","ISSN":"0028-3835","issue":"Suppl. 1","journalAbbreviation":"Neuroendocrinology","page":"1-5","source":"Silverchair","title":"Epidemiology of Cushing’s Syndrome","volume":"92","author":[{"family":"Steffensen","given":"Charlotte"},{"family":"Bak","given":"Ann Mosegaard"},{"family":"Zøylner Rubeck","given":"Kristine"},{"family":"Jørgensen","given":"Jens Otto Lunde"}],"issued":{"date-parts":[["2010",9,10]]},"citation-key":"steffensenEpidemiologyCushingsSyndrome2010"}}],"schema":"https://github.com/citation-style-language/schema/raw/master/csl-citation.json"} </w:instrText>
+      </w:r>
+      <w:r>
+        <w:fldChar w:fldCharType="separate"/>
+      </w:r>
+      <w:r>
+        <w:rPr>
+          <w:noProof/>
+        </w:rPr>
+        <w:t>(Alqeeq et al., 2024; Broder et al., 2015; Etxabe &amp; Vazquez, 1994; Matthiasdottir et al., 2024; Steffensen et al., 2010)</w:t>
+      </w:r>
+      <w:r>
+        <w:fldChar w:fldCharType="end"/>
+      </w:r>
+      <w:r>
+        <w:t xml:space="preserve">.  As </w:t>
+      </w:r>
+      <w:proofErr w:type="gramStart"/>
+      <w:r>
+        <w:t>expected</w:t>
+      </w:r>
+      <w:proofErr w:type="gramEnd"/>
+      <w:r>
+        <w:t xml:space="preserve"> we also observed</w:t>
+      </w:r>
+      <w:r>
+        <w:rPr>
+          <w:rStyle w:val="CommentReference"/>
+        </w:rPr>
+        <w:t xml:space="preserve"> </w:t>
+      </w:r>
+      <w:r>
+        <w:t>a higher body mass index for patients with Cushing’s disease (both p&lt;0.001).</w:t>
+      </w:r>
+      <w:r>
+        <w:t xml:space="preserve">  </w:t>
+      </w:r>
+      <w:commentRangeStart w:id="13"/>
+      <w:commentRangeStart w:id="14"/>
+      <w:commentRangeStart w:id="15"/>
+      <w:commentRangeStart w:id="16"/>
+      <w:r>
+        <w:t>Prior to matching for Race and Ethnicity, we noted that participants</w:t>
+      </w:r>
+      <w:r>
+        <w:t xml:space="preserve"> with Cushing’s disease were more likely to </w:t>
+      </w:r>
+      <w:r>
+        <w:t>identify as Non-Hispanic White (87%) than the overall Michigan Medicine participant population (75% Non-Hispanic White</w:t>
+      </w:r>
+      <w:r>
+        <w:t>, p</w:t>
+      </w:r>
+      <w:r>
+        <w:t>&lt;0.001</w:t>
+      </w:r>
+      <w:r>
+        <w:t>).</w:t>
+      </w:r>
+      <w:r>
+        <w:t xml:space="preserve">  Correspondingly</w:t>
+      </w:r>
+      <w:r>
+        <w:t>,</w:t>
+      </w:r>
+      <w:r>
+        <w:t xml:space="preserve"> participants with Cushing’s disease were less likely to identify as Asian </w:t>
+      </w:r>
+      <w:r>
+        <w:t xml:space="preserve">(p&lt;0.001) </w:t>
+      </w:r>
+      <w:r>
+        <w:t>or Black</w:t>
+      </w:r>
+      <w:commentRangeEnd w:id="13"/>
       <w:r>
         <w:rPr>
           <w:rStyle w:val="CommentReference"/>
           <w:sz w:val="24"/>
           <w:szCs w:val="24"/>
         </w:rPr>
-        <w:commentReference w:id="6"/>
-      </w:r>
-      <w:r>
-        <w:t xml:space="preserve"> </w:t>
-      </w:r>
-    </w:p>
-    <w:p/>
-    <w:p>
-      <w:pPr>
-        <w:pStyle w:val="Heading2"/>
-        <w:rPr>
-          <w:rStyle w:val="Strong"/>
-          <w:b w:val="0"/>
-          <w:bCs w:val="0"/>
-        </w:rPr>
-      </w:pPr>
-      <w:r>
-        <w:rPr>
-          <w:rStyle w:val="Strong"/>
-          <w:b w:val="0"/>
-          <w:bCs w:val="0"/>
-        </w:rPr>
-        <w:lastRenderedPageBreak/>
-        <w:t>Participant characteristics</w:t>
-      </w:r>
-      <w:r>
-        <w:rPr>
-          <w:rStyle w:val="Strong"/>
-          <w:b w:val="0"/>
-          <w:bCs w:val="0"/>
-        </w:rPr>
-        <w:t xml:space="preserve"> </w:t>
-      </w:r>
-      <w:r>
-        <w:rPr>
-          <w:rStyle w:val="Strong"/>
-          <w:b w:val="0"/>
-          <w:bCs w:val="0"/>
-        </w:rPr>
-        <w:t xml:space="preserve">associated with </w:t>
-      </w:r>
-      <w:r>
-        <w:rPr>
-          <w:rStyle w:val="Strong"/>
-          <w:b w:val="0"/>
-          <w:bCs w:val="0"/>
-        </w:rPr>
-        <w:t xml:space="preserve">Cushing’s </w:t>
-      </w:r>
-      <w:r>
-        <w:rPr>
-          <w:rStyle w:val="Strong"/>
-          <w:b w:val="0"/>
-          <w:bCs w:val="0"/>
-        </w:rPr>
-        <w:t xml:space="preserve">disease </w:t>
-      </w:r>
-    </w:p>
-    <w:p>
-      <w:r>
-        <w:t xml:space="preserve">We performed outcome-specific propensity matching to identify appropriate controls, starting from those with generating exact matches for gender, race and ethnicity.  We then algorithmically matched for age, generating 10 controls for each case.  Matching was </w:t>
-      </w:r>
-      <w:proofErr w:type="gramStart"/>
-      <w:r>
-        <w:t xml:space="preserve">effective </w:t>
-      </w:r>
-      <w:r>
-        <w:t xml:space="preserve"> with</w:t>
-      </w:r>
-      <w:proofErr w:type="gramEnd"/>
-      <w:r>
-        <w:t xml:space="preserve"> a </w:t>
-      </w:r>
-      <w:r>
-        <w:t>standardized mean difference</w:t>
-      </w:r>
-      <w:r>
-        <w:t xml:space="preserve"> for age of &lt;0.05 for each outcome (see </w:t>
-      </w:r>
-      <w:r>
-        <w:t xml:space="preserve">Table 1, </w:t>
-      </w:r>
-      <w:r>
-        <w:t xml:space="preserve">Supplementary </w:t>
-      </w:r>
-      <w:r>
-        <w:t xml:space="preserve">Figure </w:t>
-      </w:r>
-      <w:r>
-        <w:t>1</w:t>
-      </w:r>
-      <w:r>
-        <w:t xml:space="preserve"> and Supplementary Table S1).</w:t>
-      </w:r>
-    </w:p>
-    <w:p>
-      <w:r>
-        <w:t xml:space="preserve">Primary descriptive characteristics are </w:t>
-      </w:r>
-      <w:r>
-        <w:t>provided</w:t>
-      </w:r>
-      <w:r>
-        <w:t xml:space="preserve"> for all participants with any available laboratory measurement</w:t>
-      </w:r>
-      <w:r>
-        <w:t xml:space="preserve"> </w:t>
-      </w:r>
-      <w:r>
-        <w:t>(Table 1)</w:t>
-      </w:r>
-      <w:r>
-        <w:t xml:space="preserve">. </w:t>
-      </w:r>
-      <w:r>
-        <w:t>Outcome-specific matched sets are described in Supplementary Tables S2</w:t>
-      </w:r>
-      <w:r>
-        <w:t>A-E</w:t>
-      </w:r>
-      <w:r>
-        <w:t>.</w:t>
-      </w:r>
-      <w:r>
-        <w:t xml:space="preserve">   Here we reproduce several notable characteristics, including a higher prevalence of Cushing’s disease in females (284 vs 72</w:t>
-      </w:r>
-      <w:r>
-        <w:t>, p&lt;0.00</w:t>
-      </w:r>
-      <w:r>
-        <w:t>1</w:t>
-      </w:r>
-      <w:r>
-        <w:t>)</w:t>
-      </w:r>
-      <w:r>
-        <w:t>, consistent with the prior literature</w:t>
-      </w:r>
-      <w:r>
-        <w:t xml:space="preserve"> </w:t>
-      </w:r>
-      <w:r>
-        <w:fldChar w:fldCharType="begin"/>
-      </w:r>
-      <w:r>
-        <w:instrText xml:space="preserve"> ADDIN ZOTERO_ITEM CSL_CITATION {"citationID":"5iZIPs39","properties":{"formattedCitation":"(Alqeeq et al., 2024; Broder et al., 2015; Etxabe &amp; Vazquez, 1994; Matthiasdottir et al., 2024; Steffensen et al., 2010)","plainCitation":"(Alqeeq et al., 2024; Broder et al., 2015; Etxabe &amp; Vazquez, 1994; Matthiasdottir et al., 2024; Steffensen et al., 2010)","noteIndex":0},"citationItems":[{"id":27029,"uris":["http://zotero.org/users/7317906/items/5UXH2J3G"],"itemData":{"id":27029,"type":"article-journal","abstract":"BACKGROUND AND OBJECTIVES: Cushing's disease is a rare endocrine disorder. This review aimed to examine sex-specific differences in Cushing's disease.\nDESIGN AND SETTINGS: A meta-analysis was performed on published articles discussing the gender impact of Cushing's disease.\nMETHODS: A systematic search was conducted to identify studies from Medline, Embase, CENTRAL and Scopus. Nine studies enrolling 1047 patients diagnosed with Cushing's disease were included in this meta-analysis.\nRESULTS: Male patients presented at a younger age (MD [mean difference]=-5.43; 95% CI [-5.78, -5.08]; P&lt;.00001) than females. Male patients had a significantly higher prevalence of osteoporosis (RR [risk ratio]=1.75; 95% CI [1.36, 225]; P&lt;.0001) and hypokalemia (RR=1.66; 95% CI [1.27, 2.16]; P=.0002). In addition, males had significantly higher rates of negative magnetic resonance imaging (RR=1.53; 95% CI [1.18, 2.0]; P=.002). No sex difference was observed in the prevalence of diabetes (RR=0.92; 95% CI [0.70, 1.22]); P=.57) and dyslipidemia (RR=1.33; 95% CI [0.88, 2.0]; P=.17).\nCONCLUSION: Cushing's disease has a worse clinical presentation in males and more diagnostic difficulties compared to females.","container-title":"Annals of Saudi Medicine","DOI":"10.5144/0256-4947.2024.55","ISSN":"0975-4466","issue":"1","journalAbbreviation":"Ann Saudi Med","language":"eng","note":"PMID: 38311874\nPMCID: PMC10839456","page":"55-65","source":"PubMed","title":"Sex-related differences in Cushing's disease: a systematic review and meta-analysis","title-short":"Sex-related differences in Cushing's disease","volume":"44","author":[{"family":"Alqeeq","given":"Basel F."},{"family":"Ayyad","given":"Mohammed"},{"family":"Almadhoun","given":"Waseem J."},{"family":"Aboabdo","given":"Mohammad"},{"family":"Aldahdouh","given":"Mosheer S."},{"family":"Al-Tawil","given":"Mohammed"},{"family":"Al-Ghazali","given":"Ahmed M."}],"issued":{"date-parts":[["2024"]]},"citation-key":"alqeeqSexrelatedDifferencesCushings2024"}},{"id":27016,"uris":["http://zotero.org/users/7317906/items/RNS3FR6N"],"itemData":{"id":27016,"type":"article-journal","abstract":"PURPOSE: To estimate the incidence of Cushing's syndrome (CS) and Cushing's disease (CD) in the US.\nMETHODS: MarketScan Commercial database 2007-2010 (age &lt;65 years) was used. CS patients were defined with ≥2 claims of CS diagnosis, while CD patients were defined with CS plus a benign pituitary adenoma diagnosis or hypophysectomy in the same calendar year. Annual incidence was calculated by dividing the number of CS or CD cases by the total number of members with the same enrollment requirement during the calendar years.\nRESULTS: CS incidence rates per million person-years were 48.6 in 2009 and 39.5 in 2010. The lowest rates of CS were in ≤17-year-olds and highest rates were in 35 to 44-year-olds. CD incidence rates were 7.6 in 2009 and 6.2 in 2010. The lowest rates of CD were in ≤17-year-olds and highest rates were in 18 to 24-year-olds. The rates varied by sex (2.3-2.7 in males, 9.8-12.1 in females). In females, lowest rates ranged 2.5-4.0 in ≤17-year-olds and highest 16.7-27.2 in 18-24 year olds. In males, there were too few cases to report estimates by age.\nCONCLUSIONS: In the first large US-based study, the annual incidence of CS in individuals &lt;65 years old was nearly 49 cases per million, substantially higher than previous estimates, which were based primarily on European data. Using similar methods, we estimated the incidence of CD at nearly 8 cases per million US population. These estimates, if confirmed in other epidemiologic databases, represent a new data reference in these rare conditions.","container-title":"Pituitary","DOI":"10.1007/s11102-014-0569-6","ISSN":"1573-7403","issue":"3","journalAbbreviation":"Pituitary","language":"eng","note":"PMID: 24803324","page":"283-289","source":"PubMed","title":"Incidence of Cushing's syndrome and Cushing's disease in commercially-insured patients &lt;65 years old in the United States","volume":"18","author":[{"family":"Broder","given":"Michael S."},{"family":"Neary","given":"Maureen P."},{"family":"Chang","given":"Eunice"},{"family":"Cherepanov","given":"Dasha"},{"family":"Ludlam","given":"William H."}],"issued":{"date-parts":[["2015",6]]},"citation-key":"broderIncidenceCushingsSyndrome2015"}},{"id":1348,"uris":["http://zotero.org/users/7317906/items/V5L6B4RJ"],"itemData":{"id":1348,"type":"article-journal","abstract":"OBJECTIVE: Although Cushing's disease is a well documented clinical entity, there is no epidemiological information about it. The present study tries to obtain this information. DESIGN AND PATIENTS: Forty-nine patients affected by Cushing's disease living in Vizcaya (Spain) between 1975 and 1992 were considered for an epidemiological study. RESULTS: The prevalence of known cases at the end of 1992 was 39.1 per million inhabitants. The average incidence of newly diagnosed cases was 2.4 cases per million people per year. Cushing's disease was more frequent in women (n = 46) than in men (n = 3), with a ratio of 15:1. Diabetes mellitus and hypertension were observed in 38.7 and 55.1% of patients, respectively. Remission of Cushing's disease was achieved in 36 out of 41 patients (87.5%). In general, the mortality was higher than that expected for the control population (standardized mortality ratio, SMR 3.8, 95% confidence interval, CI 2.5-17.9, P &lt; 0.03). Concerning the cause of death, the SMR of vascular disease was 5 (95% CI 3.4-48.6, P &lt; 0.05). Higher age, persistence of hypertension and abnormalities of glucose metabolism after treatment, were independent predictors of mortality (multivariate analyses, P &lt; 0.01). CONCLUSIONS: Prevalence of Cushing's disease was 39.1 cases/million inhabitants and average incidence was 2.4 cases/million per year. Mortality was elevated, due to vascular disease, associated with higher age, persistence of hypertension and impaired glucose metabolism.","container-title":"Clin Endocrinol (Oxf)","DOI":"10.1111/j.1365-2265.1994.tb02486.x","ISSN":"0300-0664","issue":"4","note":"PMID: 8187313\nISBN: 0300-0664 (Print)\\r0300-0664 (Linking)","page":"479-484","title":"Morbidity and mortality in Cushing's disease: an epidemiological approach","volume":"40","author":[{"family":"Etxabe","given":"J"},{"family":"Vazquez","given":"J A"}],"issued":{"date-parts":[["1994"]]},"citation-key":"etxabeMorbidityMortalityCushings1994"}},{"id":27026,"uris":["http://zotero.org/users/7317906/items/X2VBVW53"],"itemData":{"id":27026,"type":"article-journal","abstract":"Introduction: In 2011, we reported the overall incidence of Cushing’s disease (CD) in Iceland from 1955 through 2009 to be 1.5 cases per million per year with highest incidence in the last decade of the study, a higher incidence then earlier reported. We now present a follow-up study reporting the epidemiology of the disease in Iceland during the 10-year period from 2010 to 2019. Methods: In this nationwide retrospective study, clinical information on patients diagnosed with CD was obtained from electronic medical records, reviewed by consulting endocrinologists. Results: Seventeen patients were diagnosed with CD, 12 women (71%) and 5 men (29%) giving an overall incidence of 5.2 cases per million per year. The mean age at diagnosis was 46 years (range 13–85 years). Biochemical analysis was recorded for all patients and 12 patients (71%) had visible pituitary adenoma on imaging studies. Sixteen patients (94%) were treated with transsphenoidal surgery of which 4 patients (24%) had gamma knife radiosurgery and three (18%) bilateral adrenalectomy after pituitary surgery. Two patients died during the study period. Conclusion: The overall incidence of CD of 5.2 cases per million per year is higher than previously reported, indicating the importance of awareness of CD. As all patients with CD are diagnosed and/or treated at the only University Hospital in Iceland, housing the only department of endocrinology as well as neurosurgery, we are confident that all cases diagnosed during the study period were included in the study.","container-title":"Neuroendocrinology","DOI":"10.1159/000540205","ISSN":"0028-3835","issue":"10","journalAbbreviation":"Neuroendocrinology","page":"950-957","source":"Silverchair","title":"Cushing’s Disease May Have Higher Incidence than Previously Thought: A Nationwide Study in Iceland 2010–2019","title-short":"Cushing’s Disease May Have Higher Incidence than Previously Thought","volume":"114","author":[{"family":"Matthiasdottir","given":"Anna Mjoll"},{"family":"Hardarson","given":"Thorgeir Orri"},{"family":"Arnardottir","given":"Steinunn"},{"family":"Sigurjonsdottir","given":"Helga Agusta"}],"issued":{"date-parts":[["2024",7,22]]},"citation-key":"matthiasdottirCushingsDiseaseMay2024"}},{"id":27019,"uris":["http://zotero.org/users/7317906/items/RTX3YT8D"],"itemData":{"id":27019,"type":"article-journal","abstract":"Overt Cushing’s syndrome is a rare disorder with an annual incidence of 2–3/million of which benign adrenal adenomas account for 0.6/million. The female:male ratio is 3:1. Preliminary data indicate a high proportion of subclinical Cushing’s syndrome in certain risk populations such as patients with type 2 diabetes or osteoporosis. The clinical implications of these observations are presently unclear. Surgery remains first line treatment for overt disease and initial cure or remission is obtained in 65–85% of patients with Cushing’s disease. Late recurrences, however, occur in up to 20% and the risk does not seem to plateau even after 20 years of follow-up. A 2- to 3-fold increase in mortality is observed in most studies, and this excess mortality seems confined to patients in whom initial cure was not obtained. Cushing’s syndrome continues to pose diagnostic and therapeutic challenges and life-long follow-up is mandatory.","container-title":"Neuroendocrinology","DOI":"10.1159/000314297","ISSN":"0028-3835","issue":"Suppl. 1","journalAbbreviation":"Neuroendocrinology","page":"1-5","source":"Silverchair","title":"Epidemiology of Cushing’s Syndrome","volume":"92","author":[{"family":"Steffensen","given":"Charlotte"},{"family":"Bak","given":"Ann Mosegaard"},{"family":"Zøylner Rubeck","given":"Kristine"},{"family":"Jørgensen","given":"Jens Otto Lunde"}],"issued":{"date-parts":[["2010",9,10]]},"citation-key":"steffensenEpidemiologyCushingsSyndrome2010"}}],"schema":"https://github.com/citation-style-language/schema/raw/master/csl-citation.json"} </w:instrText>
-      </w:r>
-      <w:r>
-        <w:fldChar w:fldCharType="separate"/>
-      </w:r>
-      <w:r>
-        <w:rPr>
-          <w:noProof/>
-        </w:rPr>
-        <w:t>(Alqeeq et al., 2024; Broder et al., 2015; Etxabe &amp; Vazquez, 1994; Matthiasdottir et al., 2024; Steffensen et al., 2010)</w:t>
-      </w:r>
-      <w:r>
-        <w:fldChar w:fldCharType="end"/>
-      </w:r>
-      <w:r>
-        <w:t xml:space="preserve">.  As </w:t>
-      </w:r>
-      <w:proofErr w:type="gramStart"/>
-      <w:r>
-        <w:t>expected</w:t>
-      </w:r>
-      <w:proofErr w:type="gramEnd"/>
-      <w:r>
-        <w:t xml:space="preserve"> we also observed</w:t>
-      </w:r>
-      <w:r>
-        <w:rPr>
-          <w:rStyle w:val="CommentReference"/>
-        </w:rPr>
-        <w:t xml:space="preserve"> </w:t>
-      </w:r>
-      <w:r>
-        <w:t>a higher body mass index for patients with Cushing’s disease (both p&lt;0.001).</w:t>
-      </w:r>
-      <w:r>
-        <w:t xml:space="preserve">  </w:t>
-      </w:r>
-      <w:commentRangeStart w:id="7"/>
-      <w:commentRangeStart w:id="8"/>
-      <w:commentRangeStart w:id="9"/>
-      <w:commentRangeStart w:id="10"/>
-      <w:r>
-        <w:t>Prior to matching for Race and Ethnicity, we noted that participants</w:t>
-      </w:r>
-      <w:r>
-        <w:t xml:space="preserve"> with Cushing’s disease were more likely to </w:t>
-      </w:r>
-      <w:r>
-        <w:t>identify as Non-Hispanic White (87%) than the overall Michigan Medicine participant population (75% Non-Hispanic White</w:t>
-      </w:r>
-      <w:r>
-        <w:t>, p</w:t>
-      </w:r>
-      <w:r>
-        <w:t>&lt;0.001</w:t>
-      </w:r>
-      <w:r>
-        <w:t>).</w:t>
-      </w:r>
-      <w:r>
-        <w:t xml:space="preserve">  Correspondingly</w:t>
-      </w:r>
-      <w:r>
-        <w:t>,</w:t>
-      </w:r>
-      <w:r>
-        <w:t xml:space="preserve"> participants with Cushing’s disease were less likely to identify as Asian </w:t>
-      </w:r>
-      <w:r>
-        <w:t xml:space="preserve">(p&lt;0.001) </w:t>
-      </w:r>
-      <w:r>
-        <w:t>or Black</w:t>
-      </w:r>
-      <w:commentRangeEnd w:id="7"/>
+        <w:commentReference w:id="13"/>
+      </w:r>
+      <w:commentRangeEnd w:id="14"/>
       <w:r>
         <w:rPr>
           <w:rStyle w:val="CommentReference"/>
           <w:sz w:val="24"/>
           <w:szCs w:val="24"/>
         </w:rPr>
-        <w:commentReference w:id="7"/>
-      </w:r>
-      <w:commentRangeEnd w:id="8"/>
+        <w:commentReference w:id="14"/>
+      </w:r>
+      <w:commentRangeEnd w:id="15"/>
       <w:r>
         <w:rPr>
           <w:rStyle w:val="CommentReference"/>
           <w:sz w:val="24"/>
           <w:szCs w:val="24"/>
         </w:rPr>
-        <w:commentReference w:id="8"/>
-      </w:r>
-      <w:commentRangeEnd w:id="9"/>
+        <w:commentReference w:id="15"/>
+      </w:r>
+      <w:commentRangeEnd w:id="16"/>
       <w:r>
         <w:rPr>
           <w:rStyle w:val="CommentReference"/>
           <w:sz w:val="24"/>
           <w:szCs w:val="24"/>
         </w:rPr>
-        <w:commentReference w:id="9"/>
-      </w:r>
-      <w:commentRangeEnd w:id="10"/>
+        <w:commentReference w:id="16"/>
+      </w:r>
+      <w:r>
+        <w:t xml:space="preserve"> (p=0.01</w:t>
+      </w:r>
+      <w:r>
+        <w:t>8</w:t>
+      </w:r>
+      <w:r>
+        <w:t>)</w:t>
+      </w:r>
+      <w:r>
+        <w:t>.</w:t>
+      </w:r>
+      <w:r>
+        <w:t xml:space="preserve">  This is consistent with other reports on the prevalence of Cushing’s disease across racial groups </w:t>
+      </w:r>
+      <w:r>
+        <w:fldChar w:fldCharType="begin"/>
+      </w:r>
+      <w:r>
+        <w:instrText xml:space="preserve"> ADDIN ZOTERO_ITEM CSL_CITATION {"citationID":"Zf5euBGy","properties":{"formattedCitation":"(Ioachimescu et al., 2022; Omotosho et al., 2024)","plainCitation":"(Ioachimescu et al., 2022; Omotosho et al., 2024)","noteIndex":0},"citationItems":[{"id":27032,"uris":["http://zotero.org/users/7317906/items/EVS87VVY"],"itemData":{"id":27032,"type":"article-journal","abstract":"Acromegaly (ACM) and Cushing’s disease (CD) are caused by functioning pituitary adenomas secreting growth hormone and ACTH respectively.To determine the impact of race on presentation and postoperative outcomes in adults with ACM and CD, which has not yet been evaluated.This is a retrospective study of consecutive patients operated at a large-volume pituitary center. We evaluated (1) racial distribution of patients residing in the metropolitan area (Metro, N</w:instrText>
+      </w:r>
+      <w:r>
+        <w:rPr>
+          <w:rFonts w:ascii="Arial" w:hAnsi="Arial" w:cs="Arial"/>
+        </w:rPr>
+        <w:instrText> </w:instrText>
+      </w:r>
+      <w:r>
+        <w:instrText>=</w:instrText>
+      </w:r>
+      <w:r>
+        <w:rPr>
+          <w:rFonts w:ascii="Arial" w:hAnsi="Arial" w:cs="Arial"/>
+        </w:rPr>
+        <w:instrText> </w:instrText>
+      </w:r>
+      <w:r>
+        <w:instrText>124) vs 2010 US census data, and(2) presentation and postoperative outcomes in Black vs White for patients from the entire catchment area (N</w:instrText>
+      </w:r>
+      <w:r>
+        <w:rPr>
+          <w:rFonts w:ascii="Arial" w:hAnsi="Arial" w:cs="Arial"/>
+        </w:rPr>
+        <w:instrText> </w:instrText>
+      </w:r>
+      <w:r>
+        <w:instrText>=</w:instrText>
+      </w:r>
+      <w:r>
+        <w:rPr>
+          <w:rFonts w:ascii="Arial" w:hAnsi="Arial" w:cs="Arial"/>
+        </w:rPr>
+        <w:instrText> </w:instrText>
+      </w:r>
+      <w:r>
+        <w:instrText>241).For Metro area (32.4% Black population), Black patients represented 16.75% ACM (P</w:instrText>
+      </w:r>
+      <w:r>
+        <w:rPr>
+          <w:rFonts w:ascii="Arial" w:hAnsi="Arial" w:cs="Arial"/>
+        </w:rPr>
+        <w:instrText> </w:instrText>
+      </w:r>
+      <w:r>
+        <w:instrText>=</w:instrText>
+      </w:r>
+      <w:r>
+        <w:rPr>
+          <w:rFonts w:ascii="Arial" w:hAnsi="Arial" w:cs="Arial"/>
+        </w:rPr>
+        <w:instrText> </w:instrText>
+      </w:r>
+      <w:r>
+        <w:instrText>.006) and 29.2% CD (P</w:instrText>
+      </w:r>
+      <w:r>
+        <w:rPr>
+          <w:rFonts w:ascii="Arial" w:hAnsi="Arial" w:cs="Arial"/>
+        </w:rPr>
+        <w:instrText> </w:instrText>
+      </w:r>
+      <w:r>
+        <w:instrText>=</w:instrText>
+      </w:r>
+      <w:r>
+        <w:rPr>
+          <w:rFonts w:ascii="Arial" w:hAnsi="Arial" w:cs="Arial"/>
+        </w:rPr>
+        <w:instrText> </w:instrText>
+      </w:r>
+      <w:r>
+        <w:instrText>.56). Among the total 112 patients with ACM, presentations with headaches or incidentaloma were more common in Black patients (76.9% vs 31% White, P</w:instrText>
+      </w:r>
+      <w:r>
+        <w:rPr>
+          <w:rFonts w:ascii="Arial" w:hAnsi="Arial" w:cs="Arial"/>
+        </w:rPr>
+        <w:instrText> </w:instrText>
+      </w:r>
+      <w:r>
+        <w:instrText>=</w:instrText>
+      </w:r>
+      <w:r>
+        <w:rPr>
+          <w:rFonts w:ascii="Arial" w:hAnsi="Arial" w:cs="Arial"/>
+        </w:rPr>
+        <w:instrText> </w:instrText>
+      </w:r>
+      <w:r>
+        <w:instrText>.01). Black patients had a higher prevalence of diabetes (54% vs 16% White, P</w:instrText>
+      </w:r>
+      <w:r>
+        <w:rPr>
+          <w:rFonts w:ascii="Arial" w:hAnsi="Arial" w:cs="Arial"/>
+        </w:rPr>
+        <w:instrText> </w:instrText>
+      </w:r>
+      <w:r>
+        <w:instrText>=</w:instrText>
+      </w:r>
+      <w:r>
+        <w:rPr>
+          <w:rFonts w:ascii="Arial" w:hAnsi="Arial" w:cs="Arial"/>
+        </w:rPr>
+        <w:instrText> </w:instrText>
+      </w:r>
+      <w:r>
+        <w:instrText>.005), significantly lower insulin-like growth factor (IGF)-1 deviation from normal (P</w:instrText>
+      </w:r>
+      <w:r>
+        <w:rPr>
+          <w:rFonts w:ascii="Arial" w:hAnsi="Arial" w:cs="Arial"/>
+        </w:rPr>
+        <w:instrText> </w:instrText>
+      </w:r>
+      <w:r>
+        <w:instrText>=</w:instrText>
+      </w:r>
+      <w:r>
+        <w:rPr>
+          <w:rFonts w:ascii="Arial" w:hAnsi="Arial" w:cs="Arial"/>
+        </w:rPr>
+        <w:instrText> </w:instrText>
+      </w:r>
+      <w:r>
+        <w:instrText>.03) and borderline lower median growth hormone levels (P</w:instrText>
+      </w:r>
+      <w:r>
+        <w:rPr>
+          <w:rFonts w:ascii="Arial" w:hAnsi="Arial" w:cs="Arial"/>
+        </w:rPr>
+        <w:instrText> </w:instrText>
+      </w:r>
+      <w:r>
+        <w:instrText>=</w:instrText>
+      </w:r>
+      <w:r>
+        <w:rPr>
+          <w:rFonts w:ascii="Arial" w:hAnsi="Arial" w:cs="Arial"/>
+        </w:rPr>
+        <w:instrText> </w:instrText>
+      </w:r>
+      <w:r>
+        <w:instrText>.09). Mean tumor diameter and proportion of tumors with cavernous sinus invasion were similar. Three-month biochemical remission (46% Black, 55% White, P</w:instrText>
+      </w:r>
+      <w:r>
+        <w:rPr>
+          <w:rFonts w:ascii="Arial" w:hAnsi="Arial" w:cs="Arial"/>
+        </w:rPr>
+        <w:instrText> </w:instrText>
+      </w:r>
+      <w:r>
+        <w:instrText>=</w:instrText>
+      </w:r>
+      <w:r>
+        <w:rPr>
+          <w:rFonts w:ascii="Arial" w:hAnsi="Arial" w:cs="Arial"/>
+        </w:rPr>
+        <w:instrText> </w:instrText>
+      </w:r>
+      <w:r>
+        <w:instrText>.76) and long-term IGF-1 control by multimodality therapy (92.3% Black, 80.5% White, P</w:instrText>
+      </w:r>
+      <w:r>
+        <w:rPr>
+          <w:rFonts w:ascii="Arial" w:hAnsi="Arial" w:cs="Arial"/>
+        </w:rPr>
+        <w:instrText> </w:instrText>
+      </w:r>
+      <w:r>
+        <w:instrText>=</w:instrText>
+      </w:r>
+      <w:r>
+        <w:rPr>
+          <w:rFonts w:ascii="Arial" w:hAnsi="Arial" w:cs="Arial"/>
+        </w:rPr>
+        <w:instrText> </w:instrText>
+      </w:r>
+      <w:r>
+        <w:instrText>.45) were similar. Among the total 129 patients with CD, Black patients had more hypopituitarism (69% vs 45% White, P</w:instrText>
+      </w:r>
+      <w:r>
+        <w:rPr>
+          <w:rFonts w:ascii="Arial" w:hAnsi="Arial" w:cs="Arial"/>
+        </w:rPr>
+        <w:instrText> </w:instrText>
+      </w:r>
+      <w:r>
+        <w:instrText>=</w:instrText>
+      </w:r>
+      <w:r>
+        <w:rPr>
+          <w:rFonts w:ascii="Arial" w:hAnsi="Arial" w:cs="Arial"/>
+        </w:rPr>
+        <w:instrText> </w:instrText>
+      </w:r>
+      <w:r>
+        <w:instrText>.04) and macroadenomas (33% vs 15% White, P</w:instrText>
+      </w:r>
+      <w:r>
+        <w:rPr>
+          <w:rFonts w:ascii="Arial" w:hAnsi="Arial" w:cs="Arial"/>
+        </w:rPr>
+        <w:instrText> </w:instrText>
+      </w:r>
+      <w:r>
+        <w:instrText>=</w:instrText>
+      </w:r>
+      <w:r>
+        <w:rPr>
+          <w:rFonts w:ascii="Arial" w:hAnsi="Arial" w:cs="Arial"/>
+        </w:rPr>
+        <w:instrText> </w:instrText>
+      </w:r>
+      <w:r>
+        <w:instrText>.05). At 3 months, remission rate was borderline higher in White (92% vs 78% Black, P</w:instrText>
+      </w:r>
+      <w:r>
+        <w:rPr>
+          <w:rFonts w:ascii="Arial" w:hAnsi="Arial" w:cs="Arial"/>
+        </w:rPr>
+        <w:instrText> </w:instrText>
+      </w:r>
+      <w:r>
+        <w:instrText>=</w:instrText>
+      </w:r>
+      <w:r>
+        <w:rPr>
+          <w:rFonts w:ascii="Arial" w:hAnsi="Arial" w:cs="Arial"/>
+        </w:rPr>
+        <w:instrText> </w:instrText>
+      </w:r>
+      <w:r>
+        <w:instrText xml:space="preserve">0.08), which was attributed to macroadenomas by logistic regression.We identified disparities regarding racial distribution, and clinical and biochemical characteristics in ACM, suggesting late or missed diagnosis in Black patients. Large nationwide studies are necessary to confirm our findings.","container-title":"Journal of the Endocrine Society","DOI":"10.1210/jendso/bvab176","ISSN":"2472-1972","issue":"1","journalAbbreviation":"J. Endocr. Soc.","page":"bvab176","source":"Silverchair","title":"Racial Disparities in Acromegaly and Cushing’s Disease: A Referral Center Study in 241 Patients","title-short":"Racial Disparities in Acromegaly and Cushing’s Disease","volume":"6","author":[{"family":"Ioachimescu","given":"Adriana G"},{"family":"Goswami","given":"Neevedita"},{"family":"Handa","given":"Talin"},{"family":"Pappy","given":"Adlai"},{"family":"Veledar","given":"Emir"},{"family":"Oyesiku","given":"Nelson M"}],"issued":{"date-parts":[["2022",1,1]]},"citation-key":"ioachimescuRacialDisparitiesAcromegaly2022"}},{"id":27042,"uris":["http://zotero.org/users/7317906/items/H96MA6T6"],"itemData":{"id":27042,"type":"article-journal","abstract":"Y.B. Omotosho: None. R. McGlotten: None. P. Chittiboina: None. L. Nieman: None.Background: Early recognition and treatment of Cushing’s syndrome (CS) is important to reduce mortality, forestall additional co-morbidities, and improve long-term quality of life. Little is known about how adverse social determinants of health (SDOH) influence the achievement of this goal.Objective: To investigate the impact of race (Black vs White) and UFC on the time to definitive diagnosis and treatment of Cushing’s disease (CD).Methods: This is a retrospective cohort study of 114 patients (pts) (including all Non-Hispanic Blacks) evaluated at the National Institutes of Health between 1990-2022, who had CD based on pathology (ACTH-positive tumor immunohistochemistry) or biochemical remission after transsphenoidal surgery (TSS). 38 Non-Hispanic Black patients met entry criteria. They were matched 1:2 by age (within five years) and sex. We excluded patients with cyclic CS, recurrent CD, previous pituitary surgery or radiation therapy and/or a delay between diagnostic evaluation and surgery of more than 4 weeks. We limited cohorts to only Non-Hispanic Blacks and Whites for this pilot study and plan to extend this to smaller race/ethnicity groups in the future. The onset of clinical symptoms was documented as self-reported by the patients. We analyzed the difference between the year of symptom onset and the date TSS was performed, to obtain an estimated duration of diagnosis. The highest 24h urine cortisol (UFC) value for each patient was noted. Non-normal data are described as median [interquartile range]. Group comparisons used the Wilcoxon rank sum test for the time to etiologic diagnosis, age, and UFC. Statistical analyses were done using R/RStudio statistical software. P value &amp;lt;0.05 was considered significant. Results: Each racial group included 76.3% females and 23.7% males. The median age at TSS was 39.5 years [30.0 – 50.8] for Blacks and 41.5 years [31.8 - 53.3] for Whites (P= 0.7). The median UFC was 326 mcg/24h [156 - 491] for Blacks and 264 [166 - 609] for Whites (P= 0.8). The median duration from symptom onset to CD diagnosis was 3.67 years [2.76 - 6.29] for Blacks and for 2.56 years [1.57 - 4.13] for Whites. Analysis of the differences in time to diagnosis between both groups confirmed a significant disparity with blacks having a median delay of 1.1 years more than whites (P= 0.001). Discussion: We do not have information on other SDOH in our patients, such as access to providers, education level, or their perception of the medical community. The present data suggest that racial background serves as a limiting factor in the diagnosis and differential diagnosis of CS, and that differences in severity of hypercortisolism do not explain this disparity. More work is needed to understand the reasons for this disparity as we continue to strive towards health equity.Monday, June 3, 2024","container-title":"Journal of the Endocrine Society","DOI":"10.1210/jendso/bvae163.2408","ISSN":"2472-1972","issue":"Supplement_1","journalAbbreviation":"J. Endocr. Soc.","page":"bvae163.2408","source":"Silverchair","title":"MON-113 Racial Disparity in the Time to Diagnosis of Cushing’s Disease","volume":"8","author":[{"family":"Omotosho","given":"Y B"},{"family":"McGlotten","given":"R"},{"family":"Chittiboina","given":"P"},{"family":"Nieman","given":"L"}],"issued":{"date-parts":[["2024",10,1]]},"citation-key":"omotoshoMON113RacialDisparity2024"}}],"schema":"https://github.com/citation-style-language/schema/raw/master/csl-citation.json"} </w:instrText>
+      </w:r>
+      <w:r>
+        <w:fldChar w:fldCharType="separate"/>
+      </w:r>
+      <w:r>
+        <w:rPr>
+          <w:noProof/>
+        </w:rPr>
+        <w:t>(Ioachimescu et al., 2022; Omotosho et al., 2024)</w:t>
+      </w:r>
+      <w:r>
+        <w:fldChar w:fldCharType="end"/>
+      </w:r>
+      <w:r>
+        <w:t>.</w:t>
+      </w:r>
+    </w:p>
+    <w:p>
+      <w:r>
+        <w:t>As we expected, participants with Cushing’s disease had a higher BMI than the controls</w:t>
+      </w:r>
+      <w:r>
+        <w:t>, with 64% of participants with Cushing’s disease having a BMI above 30 kg/m</w:t>
+      </w:r>
+      <w:r>
+        <w:rPr>
+          <w:vertAlign w:val="superscript"/>
+        </w:rPr>
+        <w:t>2</w:t>
+      </w:r>
+      <w:r>
+        <w:t xml:space="preserve">, compared to </w:t>
+      </w:r>
+      <w:r>
+        <w:t>40</w:t>
+      </w:r>
+      <w:r>
+        <w:t>% controls (p&lt;0.001).</w:t>
+      </w:r>
+      <w:r>
+        <w:t xml:space="preserve">  </w:t>
+      </w:r>
+      <w:r>
+        <w:t xml:space="preserve">To understand the </w:t>
+      </w:r>
+      <w:r>
+        <w:t xml:space="preserve">cross-sectional </w:t>
+      </w:r>
+      <w:r>
+        <w:t>relationship between obesity and Cushing’s disease, we</w:t>
+      </w:r>
+      <w:r>
+        <w:t xml:space="preserve"> stratified our participants </w:t>
+      </w:r>
+      <w:r>
+        <w:t>with a BMI above or below 30 kg/m</w:t>
+      </w:r>
+      <w:r>
+        <w:rPr>
+          <w:vertAlign w:val="superscript"/>
+        </w:rPr>
+        <w:t>2</w:t>
+      </w:r>
+      <w:r>
+        <w:t xml:space="preserve">, </w:t>
+      </w:r>
+      <w:r>
+        <w:t>across</w:t>
+      </w:r>
+      <w:r>
+        <w:t xml:space="preserve"> both cases and controls</w:t>
+      </w:r>
+      <w:r>
+        <w:t>.  As shown in Table 2, and as expected given our stratification, the four groups differed in several characteristics</w:t>
+      </w:r>
+      <w:r>
+        <w:t xml:space="preserve">, </w:t>
+      </w:r>
+      <w:r>
+        <w:t>which</w:t>
+      </w:r>
+      <w:r>
+        <w:t xml:space="preserve"> will be adjusted for in multivariable models below</w:t>
+      </w:r>
+      <w:r>
+        <w:t>.</w:t>
+      </w:r>
+      <w:r>
+        <w:t xml:space="preserve">  For example, among</w:t>
+      </w:r>
+      <w:r>
+        <w:t xml:space="preserve"> the subgroup of</w:t>
+      </w:r>
+      <w:r>
+        <w:t xml:space="preserve"> participants with a BMI &gt; 30 mg/m</w:t>
+      </w:r>
+      <w:r>
+        <w:rPr>
+          <w:vertAlign w:val="superscript"/>
+        </w:rPr>
+        <w:t>2</w:t>
+      </w:r>
+      <w:r>
+        <w:t>, participants with Cushing’s disease had a higher BMI than controls</w:t>
+      </w:r>
+      <w:r>
+        <w:t xml:space="preserve"> (p=0.0024 by a Mann-Whitney test)</w:t>
+      </w:r>
+      <w:r>
+        <w:t xml:space="preserve">.  </w:t>
+      </w:r>
+      <w:r>
+        <w:t xml:space="preserve">Females with Cushing’s disease were more likely to </w:t>
+      </w:r>
+      <w:r>
+        <w:lastRenderedPageBreak/>
+        <w:t>have a BMI over 30 kg/m</w:t>
+      </w:r>
+      <w:r>
+        <w:rPr>
+          <w:vertAlign w:val="superscript"/>
+        </w:rPr>
+        <w:t>2</w:t>
+      </w:r>
+      <w:r>
+        <w:t xml:space="preserve"> (68% </w:t>
+      </w:r>
+      <w:r>
+        <w:t xml:space="preserve">of </w:t>
+      </w:r>
+      <w:r>
+        <w:t xml:space="preserve">females </w:t>
+      </w:r>
+      <w:r>
+        <w:t>compared to</w:t>
+      </w:r>
+      <w:r>
+        <w:t xml:space="preserve"> 51% of males with Cushing’s disease, p=0.015).  </w:t>
+      </w:r>
+      <w:r>
+        <w:t>Among participants with Cushing’s disease, Asian (6</w:t>
+      </w:r>
+      <w:r>
+        <w:t xml:space="preserve"> out of </w:t>
+      </w:r>
+      <w:r>
+        <w:t xml:space="preserve">10) and Hispanic or Latino </w:t>
+      </w:r>
+      <w:r>
+        <w:t>(6</w:t>
+      </w:r>
+      <w:r>
+        <w:t xml:space="preserve"> out of </w:t>
+      </w:r>
+      <w:r>
+        <w:t xml:space="preserve">8) </w:t>
+      </w:r>
+      <w:r>
+        <w:t>participants were more likely have a BMI under 30 kg/m</w:t>
+      </w:r>
+      <w:r>
+        <w:rPr>
+          <w:vertAlign w:val="superscript"/>
+        </w:rPr>
+        <w:t xml:space="preserve">2 </w:t>
+      </w:r>
+      <w:r>
+        <w:t xml:space="preserve">compared to </w:t>
+      </w:r>
+      <w:r>
+        <w:t xml:space="preserve">the overall average </w:t>
+      </w:r>
+      <w:r>
+        <w:t>(</w:t>
+      </w:r>
+      <w:r>
+        <w:t>36%</w:t>
+      </w:r>
+      <w:r>
+        <w:t>, p=0.027 and 0.176 respectively via Fisher’s exact test</w:t>
+      </w:r>
+      <w:r>
+        <w:t>s</w:t>
+      </w:r>
+      <w:r>
+        <w:t xml:space="preserve">).  </w:t>
+      </w:r>
+      <w:r>
+        <w:t>The</w:t>
+      </w:r>
+      <w:r>
+        <w:t xml:space="preserve"> average age of </w:t>
+      </w:r>
+      <w:r>
+        <w:t xml:space="preserve">participants with </w:t>
+      </w:r>
+      <w:r>
+        <w:t>Cushing’s</w:t>
+      </w:r>
+      <w:r>
+        <w:t xml:space="preserve"> disease</w:t>
+      </w:r>
+      <w:r>
+        <w:t xml:space="preserve"> with or without obesity was similar</w:t>
+      </w:r>
+      <w:r>
+        <w:t xml:space="preserve"> after stratification</w:t>
+      </w:r>
+      <w:r>
+        <w:t>.</w:t>
+      </w:r>
+    </w:p>
+    <w:p>
+      <w:pPr>
+        <w:pStyle w:val="NormalWeb"/>
+        <w:rPr>
+          <w:rStyle w:val="Heading2Char"/>
+        </w:rPr>
+      </w:pPr>
+      <w:r>
+        <w:rPr>
+          <w:rStyle w:val="Heading2Char"/>
+        </w:rPr>
+        <w:t>Modification of Cushing’s disease-related traits by obesity status</w:t>
+      </w:r>
+    </w:p>
+    <w:p>
+      <w:r>
+        <w:t xml:space="preserve">To identify how obesity alters metabolic outcomes related to Cushing’s disease, we evaluated the effects of Cushing’s disease on several key metabolic variables including </w:t>
+      </w:r>
+      <w:proofErr w:type="spellStart"/>
+      <w:r>
+        <w:t>glycemica</w:t>
+      </w:r>
+      <w:proofErr w:type="spellEnd"/>
+      <w:r>
+        <w:t xml:space="preserve"> (fasting glucose and HbA1c), liver enzymes, LDL-C and blood pressure (Figure 2 and Table 3A).  As described below we noted substantial effect modification by obesity status in these fully adjusted models for liver enzymes and blood pressure (Table 3B).</w:t>
+      </w:r>
+    </w:p>
+    <w:p>
+      <w:pPr>
+        <w:pStyle w:val="Heading3"/>
+      </w:pPr>
+      <w:commentRangeStart w:id="17"/>
+      <w:commentRangeStart w:id="18"/>
+      <w:proofErr w:type="spellStart"/>
+      <w:r>
+        <w:t>Dysglycemia</w:t>
+      </w:r>
+      <w:proofErr w:type="spellEnd"/>
+    </w:p>
+    <w:p>
+      <w:r>
+        <w:t>As aforementioned, our first metabolic variable of interest was the fasting glucose levels of our obese and non-obese populations. As shown in Table 3a, we observed a</w:t>
+      </w:r>
+      <w:r>
+        <w:t xml:space="preserve"> significant </w:t>
+      </w:r>
+      <w:r>
+        <w:t xml:space="preserve">increase in </w:t>
+      </w:r>
+      <w:r>
+        <w:t xml:space="preserve">fasting </w:t>
+      </w:r>
+      <w:r>
+        <w:t xml:space="preserve">blood glucose levels </w:t>
+      </w:r>
+      <w:r>
+        <w:t xml:space="preserve">among </w:t>
+      </w:r>
+      <w:r>
+        <w:t>participants</w:t>
+      </w:r>
+      <w:r>
+        <w:t xml:space="preserve"> with Cushing’s disease, regardless of </w:t>
+      </w:r>
+      <w:commentRangeStart w:id="19"/>
+      <w:r>
+        <w:t>obesity status</w:t>
+      </w:r>
+      <w:r>
+        <w:t xml:space="preserve"> (p</w:t>
+      </w:r>
+      <w:r>
+        <w:t>&lt;0.01</w:t>
+      </w:r>
+      <w:r>
+        <w:t xml:space="preserve">, </w:t>
+      </w:r>
+      <w:r>
+        <w:t>&lt;0.01</w:t>
+      </w:r>
+      <w:r>
+        <w:t>)</w:t>
+      </w:r>
+      <w:r>
+        <w:t xml:space="preserve">. </w:t>
+      </w:r>
+      <w:commentRangeEnd w:id="19"/>
       <w:r>
         <w:rPr>
           <w:rStyle w:val="CommentReference"/>
           <w:sz w:val="24"/>
           <w:szCs w:val="24"/>
         </w:rPr>
-        <w:commentReference w:id="10"/>
-      </w:r>
-      <w:r>
-        <w:t xml:space="preserve"> (p=0.01</w:t>
-      </w:r>
-      <w:r>
-        <w:t>8</w:t>
-      </w:r>
-      <w:r>
-        <w:t>)</w:t>
-      </w:r>
-      <w:r>
-        <w:t>.</w:t>
-      </w:r>
-      <w:r>
-        <w:t xml:space="preserve">  This is consistent with other reports on the prevalence of Cushing’s disease across racial groups </w:t>
-      </w:r>
-      <w:r>
-        <w:fldChar w:fldCharType="begin"/>
-      </w:r>
-      <w:r>
-        <w:instrText xml:space="preserve"> ADDIN ZOTERO_ITEM CSL_CITATION {"citationID":"Zf5euBGy","properties":{"formattedCitation":"(Ioachimescu et al., 2022; Omotosho et al., 2024)","plainCitation":"(Ioachimescu et al., 2022; Omotosho et al., 2024)","noteIndex":0},"citationItems":[{"id":27032,"uris":["http://zotero.org/users/7317906/items/EVS87VVY"],"itemData":{"id":27032,"type":"article-journal","abstract":"Acromegaly (ACM) and Cushing’s disease (CD) are caused by functioning pituitary adenomas secreting growth hormone and ACTH respectively.To determine the impact of race on presentation and postoperative outcomes in adults with ACM and CD, which has not yet been evaluated.This is a retrospective study of consecutive patients operated at a large-volume pituitary center. We evaluated (1) racial distribution of patients residing in the metropolitan area (Metro, N</w:instrText>
-      </w:r>
-      <w:r>
-        <w:rPr>
-          <w:rFonts w:ascii="Arial" w:hAnsi="Arial" w:cs="Arial"/>
-        </w:rPr>
-        <w:instrText> </w:instrText>
-      </w:r>
-      <w:r>
-        <w:instrText>=</w:instrText>
-      </w:r>
-      <w:r>
-        <w:rPr>
-          <w:rFonts w:ascii="Arial" w:hAnsi="Arial" w:cs="Arial"/>
-        </w:rPr>
-        <w:instrText> </w:instrText>
-      </w:r>
-      <w:r>
-        <w:instrText>124) vs 2010 US census data, and(2) presentation and postoperative outcomes in Black vs White for patients from the entire catchment area (N</w:instrText>
-      </w:r>
-      <w:r>
-        <w:rPr>
-          <w:rFonts w:ascii="Arial" w:hAnsi="Arial" w:cs="Arial"/>
-        </w:rPr>
-        <w:instrText> </w:instrText>
-      </w:r>
-      <w:r>
-        <w:instrText>=</w:instrText>
-      </w:r>
-      <w:r>
-        <w:rPr>
-          <w:rFonts w:ascii="Arial" w:hAnsi="Arial" w:cs="Arial"/>
-        </w:rPr>
-        <w:instrText> </w:instrText>
-      </w:r>
-      <w:r>
-        <w:instrText>241).For Metro area (32.4% Black population), Black patients represented 16.75% ACM (P</w:instrText>
-      </w:r>
-      <w:r>
-        <w:rPr>
-          <w:rFonts w:ascii="Arial" w:hAnsi="Arial" w:cs="Arial"/>
-        </w:rPr>
-        <w:instrText> </w:instrText>
-      </w:r>
-      <w:r>
-        <w:instrText>=</w:instrText>
-      </w:r>
-      <w:r>
-        <w:rPr>
-          <w:rFonts w:ascii="Arial" w:hAnsi="Arial" w:cs="Arial"/>
-        </w:rPr>
-        <w:instrText> </w:instrText>
-      </w:r>
-      <w:r>
-        <w:instrText>.006) and 29.2% CD (P</w:instrText>
-      </w:r>
-      <w:r>
-        <w:rPr>
-          <w:rFonts w:ascii="Arial" w:hAnsi="Arial" w:cs="Arial"/>
-        </w:rPr>
-        <w:instrText> </w:instrText>
-      </w:r>
-      <w:r>
-        <w:instrText>=</w:instrText>
-      </w:r>
-      <w:r>
-        <w:rPr>
-          <w:rFonts w:ascii="Arial" w:hAnsi="Arial" w:cs="Arial"/>
-        </w:rPr>
-        <w:instrText> </w:instrText>
-      </w:r>
-      <w:r>
-        <w:instrText>.56). Among the total 112 patients with ACM, presentations with headaches or incidentaloma were more common in Black patients (76.9% vs 31% White, P</w:instrText>
-      </w:r>
-      <w:r>
-        <w:rPr>
-          <w:rFonts w:ascii="Arial" w:hAnsi="Arial" w:cs="Arial"/>
-        </w:rPr>
-        <w:instrText> </w:instrText>
-      </w:r>
-      <w:r>
-        <w:instrText>=</w:instrText>
-      </w:r>
-      <w:r>
-        <w:rPr>
-          <w:rFonts w:ascii="Arial" w:hAnsi="Arial" w:cs="Arial"/>
-        </w:rPr>
-        <w:instrText> </w:instrText>
-      </w:r>
-      <w:r>
-        <w:instrText>.01). Black patients had a higher prevalence of diabetes (54% vs 16% White, P</w:instrText>
-      </w:r>
-      <w:r>
-        <w:rPr>
-          <w:rFonts w:ascii="Arial" w:hAnsi="Arial" w:cs="Arial"/>
-        </w:rPr>
-        <w:instrText> </w:instrText>
-      </w:r>
-      <w:r>
-        <w:instrText>=</w:instrText>
-      </w:r>
-      <w:r>
-        <w:rPr>
-          <w:rFonts w:ascii="Arial" w:hAnsi="Arial" w:cs="Arial"/>
-        </w:rPr>
-        <w:instrText> </w:instrText>
-      </w:r>
-      <w:r>
-        <w:instrText>.005), significantly lower insulin-like growth factor (IGF)-1 deviation from normal (P</w:instrText>
-      </w:r>
-      <w:r>
-        <w:rPr>
-          <w:rFonts w:ascii="Arial" w:hAnsi="Arial" w:cs="Arial"/>
-        </w:rPr>
-        <w:instrText> </w:instrText>
-      </w:r>
-      <w:r>
-        <w:instrText>=</w:instrText>
-      </w:r>
-      <w:r>
-        <w:rPr>
-          <w:rFonts w:ascii="Arial" w:hAnsi="Arial" w:cs="Arial"/>
-        </w:rPr>
-        <w:instrText> </w:instrText>
-      </w:r>
-      <w:r>
-        <w:instrText>.03) and borderline lower median growth hormone levels (P</w:instrText>
-      </w:r>
-      <w:r>
-        <w:rPr>
-          <w:rFonts w:ascii="Arial" w:hAnsi="Arial" w:cs="Arial"/>
-        </w:rPr>
-        <w:instrText> </w:instrText>
-      </w:r>
-      <w:r>
-        <w:instrText>=</w:instrText>
-      </w:r>
-      <w:r>
-        <w:rPr>
-          <w:rFonts w:ascii="Arial" w:hAnsi="Arial" w:cs="Arial"/>
-        </w:rPr>
-        <w:instrText> </w:instrText>
-      </w:r>
-      <w:r>
-        <w:instrText>.09). Mean tumor diameter and proportion of tumors with cavernous sinus invasion were similar. Three-month biochemical remission (46% Black, 55% White, P</w:instrText>
-      </w:r>
-      <w:r>
-        <w:rPr>
-          <w:rFonts w:ascii="Arial" w:hAnsi="Arial" w:cs="Arial"/>
-        </w:rPr>
-        <w:instrText> </w:instrText>
-      </w:r>
-      <w:r>
-        <w:instrText>=</w:instrText>
-      </w:r>
-      <w:r>
-        <w:rPr>
-          <w:rFonts w:ascii="Arial" w:hAnsi="Arial" w:cs="Arial"/>
-        </w:rPr>
-        <w:instrText> </w:instrText>
-      </w:r>
-      <w:r>
-        <w:instrText>.76) and long-term IGF-1 control by multimodality therapy (92.3% Black, 80.5% White, P</w:instrText>
-      </w:r>
-      <w:r>
-        <w:rPr>
-          <w:rFonts w:ascii="Arial" w:hAnsi="Arial" w:cs="Arial"/>
-        </w:rPr>
-        <w:instrText> </w:instrText>
-      </w:r>
-      <w:r>
-        <w:instrText>=</w:instrText>
-      </w:r>
-      <w:r>
-        <w:rPr>
-          <w:rFonts w:ascii="Arial" w:hAnsi="Arial" w:cs="Arial"/>
-        </w:rPr>
-        <w:instrText> </w:instrText>
-      </w:r>
-      <w:r>
-        <w:instrText>.45) were similar. Among the total 129 patients with CD, Black patients had more hypopituitarism (69% vs 45% White, P</w:instrText>
-      </w:r>
-      <w:r>
-        <w:rPr>
-          <w:rFonts w:ascii="Arial" w:hAnsi="Arial" w:cs="Arial"/>
-        </w:rPr>
-        <w:instrText> </w:instrText>
-      </w:r>
-      <w:r>
-        <w:instrText>=</w:instrText>
-      </w:r>
-      <w:r>
-        <w:rPr>
-          <w:rFonts w:ascii="Arial" w:hAnsi="Arial" w:cs="Arial"/>
-        </w:rPr>
-        <w:instrText> </w:instrText>
-      </w:r>
-      <w:r>
-        <w:instrText>.04) and macroadenomas (33% vs 15% White, P</w:instrText>
-      </w:r>
-      <w:r>
-        <w:rPr>
-          <w:rFonts w:ascii="Arial" w:hAnsi="Arial" w:cs="Arial"/>
-        </w:rPr>
-        <w:instrText> </w:instrText>
-      </w:r>
-      <w:r>
-        <w:instrText>=</w:instrText>
-      </w:r>
-      <w:r>
-        <w:rPr>
-          <w:rFonts w:ascii="Arial" w:hAnsi="Arial" w:cs="Arial"/>
-        </w:rPr>
-        <w:instrText> </w:instrText>
-      </w:r>
-      <w:r>
-        <w:instrText>.05). At 3 months, remission rate was borderline higher in White (92% vs 78% Black, P</w:instrText>
-      </w:r>
-      <w:r>
-        <w:rPr>
-          <w:rFonts w:ascii="Arial" w:hAnsi="Arial" w:cs="Arial"/>
-        </w:rPr>
-        <w:instrText> </w:instrText>
-      </w:r>
-      <w:r>
-        <w:instrText>=</w:instrText>
-      </w:r>
-      <w:r>
-        <w:rPr>
-          <w:rFonts w:ascii="Arial" w:hAnsi="Arial" w:cs="Arial"/>
-        </w:rPr>
-        <w:instrText> </w:instrText>
-      </w:r>
-      <w:r>
-        <w:instrText xml:space="preserve">0.08), which was attributed to macroadenomas by logistic regression.We identified disparities regarding racial distribution, and clinical and biochemical characteristics in ACM, suggesting late or missed diagnosis in Black patients. Large nationwide studies are necessary to confirm our findings.","container-title":"Journal of the Endocrine Society","DOI":"10.1210/jendso/bvab176","ISSN":"2472-1972","issue":"1","journalAbbreviation":"J. Endocr. Soc.","page":"bvab176","source":"Silverchair","title":"Racial Disparities in Acromegaly and Cushing’s Disease: A Referral Center Study in 241 Patients","title-short":"Racial Disparities in Acromegaly and Cushing’s Disease","volume":"6","author":[{"family":"Ioachimescu","given":"Adriana G"},{"family":"Goswami","given":"Neevedita"},{"family":"Handa","given":"Talin"},{"family":"Pappy","given":"Adlai"},{"family":"Veledar","given":"Emir"},{"family":"Oyesiku","given":"Nelson M"}],"issued":{"date-parts":[["2022",1,1]]},"citation-key":"ioachimescuRacialDisparitiesAcromegaly2022"}},{"id":27042,"uris":["http://zotero.org/users/7317906/items/H96MA6T6"],"itemData":{"id":27042,"type":"article-journal","abstract":"Y.B. Omotosho: None. R. McGlotten: None. P. Chittiboina: None. L. Nieman: None.Background: Early recognition and treatment of Cushing’s syndrome (CS) is important to reduce mortality, forestall additional co-morbidities, and improve long-term quality of life. Little is known about how adverse social determinants of health (SDOH) influence the achievement of this goal.Objective: To investigate the impact of race (Black vs White) and UFC on the time to definitive diagnosis and treatment of Cushing’s disease (CD).Methods: This is a retrospective cohort study of 114 patients (pts) (including all Non-Hispanic Blacks) evaluated at the National Institutes of Health between 1990-2022, who had CD based on pathology (ACTH-positive tumor immunohistochemistry) or biochemical remission after transsphenoidal surgery (TSS). 38 Non-Hispanic Black patients met entry criteria. They were matched 1:2 by age (within five years) and sex. We excluded patients with cyclic CS, recurrent CD, previous pituitary surgery or radiation therapy and/or a delay between diagnostic evaluation and surgery of more than 4 weeks. We limited cohorts to only Non-Hispanic Blacks and Whites for this pilot study and plan to extend this to smaller race/ethnicity groups in the future. The onset of clinical symptoms was documented as self-reported by the patients. We analyzed the difference between the year of symptom onset and the date TSS was performed, to obtain an estimated duration of diagnosis. The highest 24h urine cortisol (UFC) value for each patient was noted. Non-normal data are described as median [interquartile range]. Group comparisons used the Wilcoxon rank sum test for the time to etiologic diagnosis, age, and UFC. Statistical analyses were done using R/RStudio statistical software. P value &amp;lt;0.05 was considered significant. Results: Each racial group included 76.3% females and 23.7% males. The median age at TSS was 39.5 years [30.0 – 50.8] for Blacks and 41.5 years [31.8 - 53.3] for Whites (P= 0.7). The median UFC was 326 mcg/24h [156 - 491] for Blacks and 264 [166 - 609] for Whites (P= 0.8). The median duration from symptom onset to CD diagnosis was 3.67 years [2.76 - 6.29] for Blacks and for 2.56 years [1.57 - 4.13] for Whites. Analysis of the differences in time to diagnosis between both groups confirmed a significant disparity with blacks having a median delay of 1.1 years more than whites (P= 0.001). Discussion: We do not have information on other SDOH in our patients, such as access to providers, education level, or their perception of the medical community. The present data suggest that racial background serves as a limiting factor in the diagnosis and differential diagnosis of CS, and that differences in severity of hypercortisolism do not explain this disparity. More work is needed to understand the reasons for this disparity as we continue to strive towards health equity.Monday, June 3, 2024","container-title":"Journal of the Endocrine Society","DOI":"10.1210/jendso/bvae163.2408","ISSN":"2472-1972","issue":"Supplement_1","journalAbbreviation":"J. Endocr. Soc.","page":"bvae163.2408","source":"Silverchair","title":"MON-113 Racial Disparity in the Time to Diagnosis of Cushing’s Disease","volume":"8","author":[{"family":"Omotosho","given":"Y B"},{"family":"McGlotten","given":"R"},{"family":"Chittiboina","given":"P"},{"family":"Nieman","given":"L"}],"issued":{"date-parts":[["2024",10,1]]},"citation-key":"omotoshoMON113RacialDisparity2024"}}],"schema":"https://github.com/citation-style-language/schema/raw/master/csl-citation.json"} </w:instrText>
-      </w:r>
-      <w:r>
-        <w:fldChar w:fldCharType="separate"/>
-      </w:r>
-      <w:r>
-        <w:rPr>
-          <w:noProof/>
-        </w:rPr>
-        <w:t>(Ioachimescu et al., 2022; Omotosho et al., 2024)</w:t>
-      </w:r>
-      <w:r>
-        <w:fldChar w:fldCharType="end"/>
-      </w:r>
-      <w:r>
-        <w:t>.</w:t>
-      </w:r>
-    </w:p>
-    <w:p>
-      <w:r>
-        <w:t>As we expected, participants with Cushing’s disease had a higher BMI than the controls</w:t>
-      </w:r>
-      <w:r>
-        <w:t>, with 64% of participants with Cushing’s disease having a BMI above 30 kg/m</w:t>
-      </w:r>
-      <w:r>
-        <w:rPr>
-          <w:vertAlign w:val="superscript"/>
-        </w:rPr>
-        <w:t>2</w:t>
-      </w:r>
-      <w:r>
-        <w:t xml:space="preserve">, compared to </w:t>
-      </w:r>
-      <w:r>
-        <w:t>40</w:t>
-      </w:r>
-      <w:r>
-        <w:t>% controls (p&lt;0.001).</w:t>
-      </w:r>
-      <w:r>
-        <w:t xml:space="preserve">  </w:t>
-      </w:r>
-      <w:r>
-        <w:t xml:space="preserve">To understand the </w:t>
-      </w:r>
-      <w:r>
-        <w:t xml:space="preserve">cross-sectional </w:t>
-      </w:r>
-      <w:r>
-        <w:t>relationship between obesity and Cushing’s disease, we</w:t>
-      </w:r>
-      <w:r>
-        <w:t xml:space="preserve"> stratified our participants </w:t>
-      </w:r>
-      <w:r>
-        <w:t>with a BMI above or below 30 kg/m</w:t>
-      </w:r>
-      <w:r>
-        <w:rPr>
-          <w:vertAlign w:val="superscript"/>
-        </w:rPr>
-        <w:t>2</w:t>
-      </w:r>
-      <w:r>
-        <w:t xml:space="preserve">, </w:t>
-      </w:r>
-      <w:r>
-        <w:t>across</w:t>
-      </w:r>
-      <w:r>
-        <w:t xml:space="preserve"> both cases and controls</w:t>
-      </w:r>
-      <w:r>
-        <w:t>.  As shown in Table 2, and as expected given our stratification, the four groups differed in several characteristics</w:t>
-      </w:r>
-      <w:r>
-        <w:t xml:space="preserve">, </w:t>
-      </w:r>
-      <w:r>
-        <w:t>which</w:t>
-      </w:r>
-      <w:r>
-        <w:t xml:space="preserve"> will be adjusted for in multivariable models below</w:t>
-      </w:r>
-      <w:r>
-        <w:t>.</w:t>
-      </w:r>
-      <w:r>
-        <w:t xml:space="preserve">  For example, among</w:t>
-      </w:r>
-      <w:r>
-        <w:t xml:space="preserve"> the subgroup of</w:t>
-      </w:r>
-      <w:r>
-        <w:t xml:space="preserve"> participants with a BMI &gt; 30 mg/m</w:t>
-      </w:r>
-      <w:r>
-        <w:rPr>
-          <w:vertAlign w:val="superscript"/>
-        </w:rPr>
-        <w:t>2</w:t>
-      </w:r>
-      <w:r>
-        <w:t>, participants with Cushing’s disease had a higher BMI than controls</w:t>
-      </w:r>
-      <w:r>
-        <w:t xml:space="preserve"> (p=0.0024 by a Mann-Whitney test)</w:t>
-      </w:r>
-      <w:r>
-        <w:t xml:space="preserve">.  </w:t>
-      </w:r>
-      <w:r>
-        <w:t>Females with Cushing’s disease were more likely to have a BMI over 30 kg/m</w:t>
-      </w:r>
-      <w:r>
-        <w:rPr>
-          <w:vertAlign w:val="superscript"/>
-        </w:rPr>
-        <w:t>2</w:t>
-      </w:r>
-      <w:r>
-        <w:t xml:space="preserve"> (68% </w:t>
-      </w:r>
-      <w:r>
-        <w:t xml:space="preserve">of </w:t>
-      </w:r>
-      <w:r>
-        <w:t xml:space="preserve">females </w:t>
-      </w:r>
-      <w:r>
-        <w:t>compared to</w:t>
-      </w:r>
-      <w:r>
-        <w:t xml:space="preserve"> 51% of males with Cushing’s disease, p=0.015).  </w:t>
-      </w:r>
-      <w:r>
-        <w:t>Among participants with Cushing’s disease, Asian (6</w:t>
-      </w:r>
-      <w:r>
-        <w:t xml:space="preserve"> out of </w:t>
-      </w:r>
-      <w:r>
-        <w:t xml:space="preserve">10) and Hispanic or Latino </w:t>
-      </w:r>
-      <w:r>
-        <w:t>(6</w:t>
-      </w:r>
-      <w:r>
-        <w:t xml:space="preserve"> out of </w:t>
-      </w:r>
-      <w:r>
-        <w:t xml:space="preserve">8) </w:t>
-      </w:r>
-      <w:r>
-        <w:t>participants were more likely have a BMI under 30 kg/m</w:t>
-      </w:r>
-      <w:r>
-        <w:rPr>
-          <w:vertAlign w:val="superscript"/>
-        </w:rPr>
-        <w:t xml:space="preserve">2 </w:t>
-      </w:r>
-      <w:r>
-        <w:t xml:space="preserve">compared to </w:t>
-      </w:r>
-      <w:r>
-        <w:t xml:space="preserve">the overall average </w:t>
-      </w:r>
-      <w:r>
-        <w:t>(</w:t>
-      </w:r>
-      <w:r>
-        <w:t>36%</w:t>
-      </w:r>
-      <w:r>
-        <w:t>, p=0.027 and 0.176 respectively via Fisher’s exact test</w:t>
-      </w:r>
-      <w:r>
-        <w:t>s</w:t>
-      </w:r>
-      <w:r>
-        <w:t xml:space="preserve">).  </w:t>
-      </w:r>
-      <w:r>
-        <w:t>The</w:t>
-      </w:r>
-      <w:r>
-        <w:t xml:space="preserve"> average age of </w:t>
-      </w:r>
-      <w:r>
-        <w:t xml:space="preserve">participants with </w:t>
-      </w:r>
-      <w:r>
-        <w:t>Cushing’s</w:t>
-      </w:r>
-      <w:r>
-        <w:t xml:space="preserve"> disease</w:t>
-      </w:r>
-      <w:r>
-        <w:t xml:space="preserve"> with or without obesity was similar</w:t>
-      </w:r>
-      <w:r>
-        <w:t xml:space="preserve"> after stratification</w:t>
-      </w:r>
-      <w:r>
-        <w:t>.</w:t>
-      </w:r>
-    </w:p>
-    <w:p>
-      <w:pPr>
-        <w:pStyle w:val="NormalWeb"/>
-        <w:rPr>
-          <w:rStyle w:val="Heading2Char"/>
-        </w:rPr>
-      </w:pPr>
-      <w:r>
-        <w:rPr>
-          <w:rStyle w:val="Heading2Char"/>
-        </w:rPr>
-        <w:t>Modification of Cushing’s disease-related traits by obesity status</w:t>
-      </w:r>
-    </w:p>
-    <w:p>
-      <w:r>
-        <w:lastRenderedPageBreak/>
-        <w:t xml:space="preserve">To identify how obesity alters metabolic outcomes related to Cushing’s disease, we evaluated the effects of Cushing’s disease on several key metabolic variables including </w:t>
-      </w:r>
-      <w:proofErr w:type="spellStart"/>
-      <w:r>
-        <w:t>glycemica</w:t>
-      </w:r>
-      <w:proofErr w:type="spellEnd"/>
-      <w:r>
-        <w:t xml:space="preserve"> (fasting glucose and HbA1c), liver enzymes, LDL-C and blood pressure (Figure 2 and Table 3A).  As described below we noted substantial effect modification by obesity status in these fully adjusted models for liver enzymes and blood pressure (Table 3B).</w:t>
+        <w:commentReference w:id="19"/>
+      </w:r>
+      <w:r>
+        <w:t xml:space="preserve">The non-obese population had a slightly larger increase (26.95 vs. 26.18) than the obese population, but this was not a large enough difference to provide any significant evidence of an effect modification for obesity. </w:t>
+      </w:r>
+      <w:proofErr w:type="gramStart"/>
+      <w:r>
+        <w:t>Also</w:t>
+      </w:r>
+      <w:proofErr w:type="gramEnd"/>
+      <w:r>
+        <w:t xml:space="preserve"> in Table 3a, our collected HbA1c data indicated a</w:t>
+      </w:r>
+      <w:r>
+        <w:t xml:space="preserve"> slightly insignificant increase in HbA1c levels between the non-obese, and the non-obese with Cushing’s population (p=0.056). However, there was evidence of a significant increase in HbA1c levels of our obese, and obese with Cushing’s population (p</w:t>
+      </w:r>
+      <w:r>
+        <w:t>&lt;0.01</w:t>
+      </w:r>
+      <w:r>
+        <w:t>). This leads us to believe that there is evidence for obesity being a positive modifier in patients with Cushing’s disease****.</w:t>
       </w:r>
     </w:p>
     <w:p>
       <w:pPr>
         <w:pStyle w:val="Heading3"/>
       </w:pPr>
-      <w:commentRangeStart w:id="11"/>
-      <w:commentRangeStart w:id="12"/>
-      <w:proofErr w:type="spellStart"/>
-      <w:r>
-        <w:t>Dysglycemia</w:t>
-      </w:r>
-      <w:proofErr w:type="spellEnd"/>
-    </w:p>
-    <w:p>
-      <w:r>
-        <w:t>As aforementioned, our first metabolic variable of interest was the fasting glucose levels of our obese and non-obese populations. As shown in Table 3a, we observed a</w:t>
-      </w:r>
-      <w:r>
-        <w:t xml:space="preserve"> significant </w:t>
-      </w:r>
-      <w:r>
-        <w:t xml:space="preserve">increase in </w:t>
-      </w:r>
-      <w:r>
-        <w:t xml:space="preserve">fasting </w:t>
-      </w:r>
-      <w:r>
-        <w:t xml:space="preserve">blood glucose levels </w:t>
-      </w:r>
-      <w:r>
-        <w:t xml:space="preserve">among </w:t>
-      </w:r>
-      <w:r>
-        <w:t>participants</w:t>
-      </w:r>
-      <w:r>
-        <w:t xml:space="preserve"> with Cushing’s disease, regardless of </w:t>
-      </w:r>
-      <w:commentRangeStart w:id="13"/>
-      <w:r>
-        <w:t>obesity status</w:t>
-      </w:r>
-      <w:r>
-        <w:t xml:space="preserve"> (p</w:t>
-      </w:r>
-      <w:r>
-        <w:t>&lt;0.01</w:t>
-      </w:r>
-      <w:r>
-        <w:t xml:space="preserve">, </w:t>
-      </w:r>
-      <w:r>
-        <w:t>&lt;0.01</w:t>
-      </w:r>
-      <w:r>
-        <w:t>)</w:t>
-      </w:r>
-      <w:r>
-        <w:t xml:space="preserve">. </w:t>
-      </w:r>
-      <w:commentRangeEnd w:id="13"/>
+      <w:r>
+        <w:t>MASLD and liver enzymes</w:t>
+      </w:r>
+    </w:p>
+    <w:p>
+      <w:r>
+        <w:t xml:space="preserve">To </w:t>
+      </w:r>
+      <w:r>
+        <w:t>assess</w:t>
+      </w:r>
+      <w:r>
+        <w:t xml:space="preserve"> </w:t>
+      </w:r>
+      <w:r>
+        <w:t>MASLD</w:t>
+      </w:r>
+      <w:r>
+        <w:t xml:space="preserve"> we looked at </w:t>
+      </w:r>
+      <w:commentRangeStart w:id="20"/>
+      <w:r>
+        <w:t xml:space="preserve">ALT </w:t>
+      </w:r>
+      <w:commentRangeEnd w:id="20"/>
       <w:r>
         <w:rPr>
           <w:rStyle w:val="CommentReference"/>
           <w:sz w:val="24"/>
           <w:szCs w:val="24"/>
         </w:rPr>
-        <w:commentReference w:id="13"/>
-      </w:r>
-      <w:r>
-        <w:t xml:space="preserve">The non-obese population had a slightly larger increase (26.95 vs. 26.18) than the obese population, but this was not a large enough difference to provide any significant evidence of an effect modification for obesity. </w:t>
-      </w:r>
-      <w:proofErr w:type="gramStart"/>
-      <w:r>
-        <w:t>Also</w:t>
-      </w:r>
-      <w:proofErr w:type="gramEnd"/>
-      <w:r>
-        <w:t xml:space="preserve"> in Table 3a, our collected HbA1c data indicated a</w:t>
-      </w:r>
-      <w:r>
-        <w:t xml:space="preserve"> slightly insignificant increase in HbA1c levels between the non-obese, and the non-obese with Cushing’s population (p=0.056). However, there was evidence of a significant increase in HbA1c levels of our obese, and obese with Cushing’s population (p</w:t>
+        <w:commentReference w:id="20"/>
+      </w:r>
+      <w:r>
+        <w:t>test results for our population. In both our obese, and non-obese populations, we saw an increase in ALT levels regardless of Cushing’s disease status</w:t>
+      </w:r>
+      <w:r>
+        <w:t xml:space="preserve"> </w:t>
+      </w:r>
+      <w:commentRangeStart w:id="21"/>
+      <w:r>
+        <w:t>(p</w:t>
       </w:r>
       <w:r>
         <w:t>&lt;0.01</w:t>
       </w:r>
       <w:r>
-        <w:t>). This leads us to believe that there is evidence for obesity being a positive modifier in patients with Cushing’s disease****.</w:t>
-      </w:r>
-    </w:p>
-    <w:p>
-      <w:pPr>
-        <w:pStyle w:val="Heading3"/>
-      </w:pPr>
-      <w:r>
-        <w:t>MASLD and liver enzymes</w:t>
-      </w:r>
-    </w:p>
-    <w:p>
-      <w:r>
-        <w:t xml:space="preserve">To </w:t>
-      </w:r>
-      <w:r>
-        <w:t>assess</w:t>
-      </w:r>
-      <w:r>
-        <w:t xml:space="preserve"> </w:t>
-      </w:r>
-      <w:r>
-        <w:t>MASLD</w:t>
-      </w:r>
-      <w:r>
-        <w:t xml:space="preserve"> we looked at </w:t>
-      </w:r>
-      <w:commentRangeStart w:id="14"/>
-      <w:r>
-        <w:t xml:space="preserve">ALT </w:t>
-      </w:r>
-      <w:commentRangeEnd w:id="14"/>
+        <w:t xml:space="preserve">, </w:t>
+      </w:r>
+      <w:r>
+        <w:t>&lt;0.01</w:t>
+      </w:r>
+      <w:r>
+        <w:t xml:space="preserve">). </w:t>
+      </w:r>
+      <w:commentRangeEnd w:id="21"/>
       <w:r>
         <w:rPr>
           <w:rStyle w:val="CommentReference"/>
           <w:sz w:val="24"/>
           <w:szCs w:val="24"/>
         </w:rPr>
-        <w:commentReference w:id="14"/>
-      </w:r>
-      <w:r>
-        <w:t>test results for our population. In both our obese, and non-obese populations, we saw an increase in ALT levels regardless of Cushing’s disease status</w:t>
+        <w:commentReference w:id="21"/>
+      </w:r>
+      <w:r>
+        <w:t>However, the increase in the obese population’s control group and Cushing’s patient population was far greater than the non-obese group’s increase (33.07 vs. 69.23). This suggests that obesity could have a positive effect modification on ALT levels.</w:t>
+      </w:r>
+    </w:p>
+    <w:p>
+      <w:pPr>
+        <w:pStyle w:val="Heading3"/>
+      </w:pPr>
+      <w:commentRangeStart w:id="22"/>
+      <w:r>
+        <w:lastRenderedPageBreak/>
+        <w:t>Dyslipidemia</w:t>
       </w:r>
       <w:r>
         <w:t xml:space="preserve"> </w:t>
       </w:r>
-      <w:commentRangeStart w:id="15"/>
-      <w:r>
-        <w:t>(p</w:t>
-      </w:r>
-      <w:r>
-        <w:t>&lt;0.01</w:t>
-      </w:r>
-      <w:r>
-        <w:t xml:space="preserve">, </w:t>
-      </w:r>
-      <w:r>
-        <w:t>&lt;0.01</w:t>
-      </w:r>
-      <w:r>
-        <w:t xml:space="preserve">). </w:t>
-      </w:r>
-      <w:commentRangeEnd w:id="15"/>
-      <w:r>
-        <w:rPr>
-          <w:rStyle w:val="CommentReference"/>
-          <w:sz w:val="24"/>
-          <w:szCs w:val="24"/>
-        </w:rPr>
-        <w:commentReference w:id="15"/>
-      </w:r>
-      <w:r>
-        <w:t>However, the increase in the obese population’s control group and Cushing’s patient population was far greater than the non-obese group’s increase (33.07 vs. 69.23). This suggests that obesity could have a positive effect modification on ALT levels.</w:t>
-      </w:r>
-    </w:p>
-    <w:p>
-      <w:pPr>
-        <w:pStyle w:val="Heading3"/>
-      </w:pPr>
-      <w:commentRangeStart w:id="16"/>
-      <w:r>
-        <w:t>Dyslipidemia</w:t>
-      </w:r>
-      <w:r>
-        <w:t xml:space="preserve"> </w:t>
-      </w:r>
-      <w:commentRangeEnd w:id="16"/>
+      <w:commentRangeEnd w:id="22"/>
       <w:r>
         <w:rPr>
           <w:rStyle w:val="CommentReference"/>
           <w:sz w:val="28"/>
           <w:szCs w:val="28"/>
         </w:rPr>
-        <w:commentReference w:id="16"/>
+        <w:commentReference w:id="22"/>
       </w:r>
     </w:p>
     <w:p>
@@ -1520,23 +1656,23 @@
       <w:r>
         <w:t>Blood Pressure</w:t>
       </w:r>
-      <w:commentRangeEnd w:id="11"/>
+      <w:commentRangeEnd w:id="17"/>
       <w:r>
         <w:rPr>
           <w:rStyle w:val="CommentReference"/>
           <w:sz w:val="28"/>
           <w:szCs w:val="28"/>
         </w:rPr>
-        <w:commentReference w:id="11"/>
-      </w:r>
-      <w:commentRangeEnd w:id="12"/>
+        <w:commentReference w:id="17"/>
+      </w:r>
+      <w:commentRangeEnd w:id="18"/>
       <w:r>
         <w:rPr>
           <w:rStyle w:val="CommentReference"/>
           <w:sz w:val="28"/>
           <w:szCs w:val="28"/>
         </w:rPr>
-        <w:commentReference w:id="12"/>
+        <w:commentReference w:id="18"/>
       </w:r>
     </w:p>
     <w:p>
@@ -1561,11 +1697,7 @@
         <w:t>observe</w:t>
       </w:r>
       <w:r>
-        <w:t xml:space="preserve"> this same significant increase in the </w:t>
-      </w:r>
-      <w:r>
-        <w:lastRenderedPageBreak/>
-        <w:t>obese population (p=0.072). We saw this same relationship in our diastolic blood measurement, with a significant increase in the non-obese population, but not a significant increase in the obese population (p</w:t>
+        <w:t xml:space="preserve"> this same significant increase in the obese population (p=0.072). We saw this same relationship in our diastolic blood measurement, with a significant increase in the non-obese population, but not a significant increase in the obese population (p</w:t>
       </w:r>
       <w:r>
         <w:t>&lt;0.01</w:t>
@@ -1801,6 +1933,7 @@
         </w:numPr>
       </w:pPr>
       <w:r>
+        <w:lastRenderedPageBreak/>
         <w:t>Gender difference is interesting – increasing fivefold (probably something biological and not a social aspect of doctor frequency)</w:t>
       </w:r>
     </w:p>
@@ -1913,7 +2046,6 @@
         </w:numPr>
       </w:pPr>
       <w:r>
-        <w:lastRenderedPageBreak/>
         <w:t>Relatively small n value for some lab results such as LDL cholesterol, osteoporosis (although we probably just will not use any of that data in our final paper anyways)</w:t>
       </w:r>
     </w:p>
@@ -2071,6 +2203,7 @@
         <w:rPr>
           <w:rFonts w:ascii="Aptos"/>
         </w:rPr>
+        <w:lastRenderedPageBreak/>
         <w:t xml:space="preserve">Ho, D., Imai, K., King, G., &amp; Stuart, E. A. (2011). MatchIt: Nonparametric Preprocessing for Parametric Causal Inference. </w:t>
       </w:r>
       <w:r>
@@ -2155,7 +2288,6 @@
         <w:rPr>
           <w:rFonts w:ascii="Aptos"/>
         </w:rPr>
-        <w:lastRenderedPageBreak/>
         <w:t xml:space="preserve">Matthiasdottir, A. M., Hardarson, T. O., Arnardottir, S., &amp; Sigurjonsdottir, H. A. (2024). Cushing’s Disease May Have Higher Incidence than Previously Thought: A Nationwide Study in Iceland 2010–2019. </w:t>
       </w:r>
       <w:r>
@@ -2312,6 +2444,7 @@
         <w:pStyle w:val="Heading1"/>
       </w:pPr>
       <w:r>
+        <w:lastRenderedPageBreak/>
         <w:t xml:space="preserve">Figure </w:t>
       </w:r>
       <w:r>
@@ -2466,7 +2599,6 @@
           <w:b/>
           <w:bCs/>
         </w:rPr>
-        <w:lastRenderedPageBreak/>
         <w:t>Table 2: Participant characteristics after stratification by obesity</w:t>
       </w:r>
       <w:r>
@@ -3086,6 +3218,7 @@
           <w:szCs w:val="18"/>
           <w14:ligatures w14:val="none"/>
         </w:rPr>
+        <w:lastRenderedPageBreak/>
         <w:t xml:space="preserve">   </w:t>
       </w:r>
       <w:r>
@@ -4674,7 +4807,7 @@
     </w:p>
     <w:p/>
   </w:comment>
-  <w:comment w:id="1" w:author="Carr, Treyton" w:date="2025-12-01T15:54:00Z" w:initials="CT">
+  <w:comment w:id="1" w:author="Carr, Treyton" w:date="2025-12-03T00:11:00Z" w:initials="CT">
     <w:p>
       <w:r>
         <w:rPr>
@@ -4683,6 +4816,26 @@
         <w:annotationRef/>
       </w:r>
       <w:hyperlink r:id="rId3" w:history="1">
+        <w:r>
+          <w:rPr>
+            <w:rStyle w:val="Hyperlink"/>
+            <w:sz w:val="20"/>
+            <w:szCs w:val="20"/>
+          </w:rPr>
+          <w:t>https://pmc.ncbi.nlm.nih.gov/articles/PMC8743006/</w:t>
+        </w:r>
+      </w:hyperlink>
+    </w:p>
+  </w:comment>
+  <w:comment w:id="2" w:author="Carr, Treyton" w:date="2025-12-01T15:54:00Z" w:initials="CT">
+    <w:p>
+      <w:r>
+        <w:rPr>
+          <w:rStyle w:val="CommentReference"/>
+        </w:rPr>
+        <w:annotationRef/>
+      </w:r>
+      <w:hyperlink r:id="rId4" w:history="1">
         <w:r>
           <w:rPr>
             <w:rStyle w:val="Hyperlink"/>
@@ -4695,7 +4848,7 @@
     </w:p>
     <w:p/>
     <w:p>
-      <w:hyperlink r:id="rId4" w:history="1">
+      <w:hyperlink r:id="rId5" w:history="1">
         <w:r>
           <w:rPr>
             <w:rStyle w:val="Hyperlink"/>
@@ -4707,7 +4860,53 @@
       </w:hyperlink>
     </w:p>
   </w:comment>
-  <w:comment w:id="2" w:author="Carr, Treyton" w:date="2025-11-08T23:56:00Z" w:initials="CT">
+  <w:comment w:id="3" w:author="Carr, Treyton" w:date="2025-12-02T19:34:00Z" w:initials="CT">
+    <w:p>
+      <w:r>
+        <w:rPr>
+          <w:rStyle w:val="CommentReference"/>
+        </w:rPr>
+        <w:annotationRef/>
+      </w:r>
+      <w:hyperlink r:id="rId6" w:history="1">
+        <w:r>
+          <w:rPr>
+            <w:rStyle w:val="Hyperlink"/>
+            <w:sz w:val="20"/>
+            <w:szCs w:val="20"/>
+          </w:rPr>
+          <w:t>https://pubmed.ncbi.nlm.nih.gov/21521323/</w:t>
+        </w:r>
+      </w:hyperlink>
+    </w:p>
+    <w:p/>
+    <w:p>
+      <w:hyperlink r:id="rId7" w:history="1">
+        <w:r>
+          <w:rPr>
+            <w:rStyle w:val="Hyperlink"/>
+            <w:sz w:val="20"/>
+            <w:szCs w:val="20"/>
+          </w:rPr>
+          <w:t>https://pubmed.ncbi.nlm.nih.gov/14671173/</w:t>
+        </w:r>
+      </w:hyperlink>
+    </w:p>
+    <w:p/>
+    <w:p>
+      <w:hyperlink r:id="rId8" w:history="1">
+        <w:r>
+          <w:rPr>
+            <w:rStyle w:val="Hyperlink"/>
+            <w:sz w:val="20"/>
+            <w:szCs w:val="20"/>
+          </w:rPr>
+          <w:t>https://pmc.ncbi.nlm.nih.gov/articles/PMC6856055/</w:t>
+        </w:r>
+      </w:hyperlink>
+    </w:p>
+  </w:comment>
+  <w:comment w:id="4" w:author="Carr, Treyton" w:date="2025-12-02T19:41:00Z" w:initials="CT">
     <w:p>
       <w:r>
         <w:rPr>
@@ -4720,11 +4919,64 @@
           <w:sz w:val="20"/>
           <w:szCs w:val="20"/>
         </w:rPr>
-        <w:t>@dave So from here I was thinking about going more into study design/what this study aims to do, but I feel like that is more of the abstract's goal? Also, should I add on more at the beginning about more symptoms of cushings (moon face, weight holding, hump on neck, etc.)?</w:t>
+        <w:t>Do i need numbers for each of these values (ex: by x amount generally)?</w:t>
       </w:r>
     </w:p>
   </w:comment>
-  <w:comment w:id="3" w:author="Dave Bridges" w:date="2025-09-07T19:14:00Z" w:initials="DB">
+  <w:comment w:id="5" w:author="Carr, Treyton" w:date="2025-12-02T19:42:00Z" w:initials="CT">
+    <w:p>
+      <w:r>
+        <w:rPr>
+          <w:rStyle w:val="CommentReference"/>
+        </w:rPr>
+        <w:annotationRef/>
+      </w:r>
+      <w:hyperlink r:id="rId9" w:history="1">
+        <w:r>
+          <w:rPr>
+            <w:rStyle w:val="Hyperlink"/>
+            <w:sz w:val="20"/>
+            <w:szCs w:val="20"/>
+          </w:rPr>
+          <w:t>https://pmc.ncbi.nlm.nih.gov/articles/PMC6856055/</w:t>
+        </w:r>
+      </w:hyperlink>
+    </w:p>
+    <w:p/>
+    <w:p>
+      <w:hyperlink r:id="rId10" w:history="1">
+        <w:r>
+          <w:rPr>
+            <w:rStyle w:val="Hyperlink"/>
+            <w:sz w:val="20"/>
+            <w:szCs w:val="20"/>
+          </w:rPr>
+          <w:t>https://nyaspubs.onlinelibrary.wiley.com/doi/full/10.1111/j.1749-6632.2002.tb04417.x</w:t>
+        </w:r>
+      </w:hyperlink>
+    </w:p>
+  </w:comment>
+  <w:comment w:id="6" w:author="Carr, Treyton" w:date="2025-12-02T23:49:00Z" w:initials="CT">
+    <w:p>
+      <w:r>
+        <w:rPr>
+          <w:rStyle w:val="CommentReference"/>
+        </w:rPr>
+        <w:annotationRef/>
+      </w:r>
+      <w:hyperlink r:id="rId11" w:history="1">
+        <w:r>
+          <w:rPr>
+            <w:rStyle w:val="Hyperlink"/>
+            <w:sz w:val="20"/>
+            <w:szCs w:val="20"/>
+          </w:rPr>
+          <w:t>https://pmc.ncbi.nlm.nih.gov/articles/PMC6856055/</w:t>
+        </w:r>
+      </w:hyperlink>
+    </w:p>
+  </w:comment>
+  <w:comment w:id="7" w:author="Carr, Treyton" w:date="2025-12-03T00:07:00Z" w:initials="CT">
     <w:p>
       <w:r>
         <w:rPr>
@@ -4737,11 +4989,11 @@
           <w:sz w:val="20"/>
           <w:szCs w:val="20"/>
         </w:rPr>
-        <w:t>@trey can you add these</w:t>
+        <w:t>....is this the correct title of the study?</w:t>
       </w:r>
     </w:p>
   </w:comment>
-  <w:comment w:id="4" w:author="Carr, Treyton" w:date="2025-11-08T23:41:00Z" w:initials="CT">
+  <w:comment w:id="8" w:author="Carr, Treyton" w:date="2025-12-03T00:16:00Z" w:initials="CT">
     <w:p>
       <w:r>
         <w:rPr>
@@ -4754,11 +5006,11 @@
           <w:sz w:val="20"/>
           <w:szCs w:val="20"/>
         </w:rPr>
-        <w:t>Because we have a total of 86 codes for this category, should we list them somewhere else in the document in an appendix?</w:t>
+        <w:t>should I add any more info on diagnostic challenges? Or is that outside of our scope</w:t>
       </w:r>
     </w:p>
   </w:comment>
-  <w:comment w:id="5" w:author="Dave Bridges" w:date="2025-09-05T19:50:00Z" w:initials="DB">
+  <w:comment w:id="9" w:author="Dave Bridges" w:date="2025-09-07T19:14:00Z" w:initials="DB">
     <w:p>
       <w:r>
         <w:rPr>
@@ -4771,11 +5023,11 @@
           <w:sz w:val="20"/>
           <w:szCs w:val="20"/>
         </w:rPr>
-        <w:t>todo</w:t>
+        <w:t>@trey can you add these</w:t>
       </w:r>
     </w:p>
   </w:comment>
-  <w:comment w:id="6" w:author="Dave Bridges" w:date="2025-09-07T14:40:00Z" w:initials="DB">
+  <w:comment w:id="10" w:author="Carr, Treyton" w:date="2025-11-08T23:41:00Z" w:initials="CT">
     <w:p>
       <w:r>
         <w:rPr>
@@ -4788,11 +5040,11 @@
           <w:sz w:val="20"/>
           <w:szCs w:val="20"/>
         </w:rPr>
-        <w:t>@trey can you describe this part, and enter details in the methods of how this was done</w:t>
+        <w:t>Because we have a total of 86 codes for this category, should we list them somewhere else in the document in an appendix?</w:t>
       </w:r>
     </w:p>
   </w:comment>
-  <w:comment w:id="7" w:author="Dave Bridges" w:date="2025-09-05T19:38:00Z" w:initials="DB">
+  <w:comment w:id="11" w:author="Dave Bridges" w:date="2025-09-05T19:50:00Z" w:initials="DB">
     <w:p>
       <w:r>
         <w:rPr>
@@ -4805,11 +5057,11 @@
           <w:sz w:val="20"/>
           <w:szCs w:val="20"/>
         </w:rPr>
-        <w:t>@trey also any data on demographic propensities towards Cushings we can cite?</w:t>
+        <w:t>todo</w:t>
       </w:r>
     </w:p>
   </w:comment>
-  <w:comment w:id="8" w:author="Carr, Treyton" w:date="2025-09-16T11:51:00Z" w:initials="CT">
+  <w:comment w:id="12" w:author="Dave Bridges" w:date="2025-09-07T14:40:00Z" w:initials="DB">
     <w:p>
       <w:r>
         <w:rPr>
@@ -4822,11 +5074,45 @@
           <w:sz w:val="20"/>
           <w:szCs w:val="20"/>
         </w:rPr>
+        <w:t>@trey can you describe this part, and enter details in the methods of how this was done</w:t>
+      </w:r>
+    </w:p>
+  </w:comment>
+  <w:comment w:id="13" w:author="Dave Bridges" w:date="2025-09-05T19:38:00Z" w:initials="DB">
+    <w:p>
+      <w:r>
+        <w:rPr>
+          <w:rStyle w:val="CommentReference"/>
+        </w:rPr>
+        <w:annotationRef/>
+      </w:r>
+      <w:r>
+        <w:rPr>
+          <w:sz w:val="20"/>
+          <w:szCs w:val="20"/>
+        </w:rPr>
+        <w:t>@trey also any data on demographic propensities towards Cushings we can cite?</w:t>
+      </w:r>
+    </w:p>
+  </w:comment>
+  <w:comment w:id="14" w:author="Carr, Treyton" w:date="2025-09-16T11:51:00Z" w:initials="CT">
+    <w:p>
+      <w:r>
+        <w:rPr>
+          <w:rStyle w:val="CommentReference"/>
+        </w:rPr>
+        <w:annotationRef/>
+      </w:r>
+      <w:r>
+        <w:rPr>
+          <w:sz w:val="20"/>
+          <w:szCs w:val="20"/>
+        </w:rPr>
         <w:t>Some articles that include race in their analysis:</w:t>
       </w:r>
     </w:p>
     <w:p>
-      <w:hyperlink r:id="rId5" w:history="1">
+      <w:hyperlink r:id="rId12" w:history="1">
         <w:r>
           <w:rPr>
             <w:rStyle w:val="Hyperlink"/>
@@ -4839,7 +5125,7 @@
     </w:p>
     <w:p/>
     <w:p>
-      <w:hyperlink r:id="rId6" w:history="1">
+      <w:hyperlink r:id="rId13" w:history="1">
         <w:r>
           <w:rPr>
             <w:rStyle w:val="Hyperlink"/>
@@ -4859,7 +5145,7 @@
         </w:rPr>
         <w:t xml:space="preserve"> </w:t>
       </w:r>
-      <w:hyperlink r:id="rId7" w:history="1">
+      <w:hyperlink r:id="rId14" w:history="1">
         <w:r>
           <w:rPr>
             <w:rStyle w:val="Hyperlink"/>
@@ -4872,7 +5158,7 @@
     </w:p>
     <w:p/>
     <w:p>
-      <w:hyperlink r:id="rId8" w:history="1">
+      <w:hyperlink r:id="rId15" w:history="1">
         <w:r>
           <w:rPr>
             <w:rStyle w:val="Hyperlink"/>
@@ -4886,7 +5172,7 @@
     <w:p/>
     <w:p/>
   </w:comment>
-  <w:comment w:id="9" w:author="Dave Bridges" w:date="2025-09-23T09:31:00Z" w:initials="DB">
+  <w:comment w:id="15" w:author="Dave Bridges" w:date="2025-09-23T09:31:00Z" w:initials="DB">
     <w:p>
       <w:r>
         <w:rPr>
@@ -4914,7 +5200,7 @@
     </w:p>
     <w:p/>
     <w:p>
-      <w:hyperlink r:id="rId9" w:history="1">
+      <w:hyperlink r:id="rId16" w:history="1">
         <w:r>
           <w:rPr>
             <w:rStyle w:val="Hyperlink"/>
@@ -4926,7 +5212,7 @@
       </w:hyperlink>
     </w:p>
   </w:comment>
-  <w:comment w:id="10" w:author="Dave Bridges" w:date="2025-09-23T09:32:00Z" w:initials="DB">
+  <w:comment w:id="16" w:author="Dave Bridges" w:date="2025-09-23T09:32:00Z" w:initials="DB">
     <w:p>
       <w:r>
         <w:rPr>
@@ -4944,7 +5230,7 @@
     </w:p>
     <w:p/>
     <w:p>
-      <w:hyperlink r:id="rId10" w:history="1">
+      <w:hyperlink r:id="rId17" w:history="1">
         <w:r>
           <w:rPr>
             <w:rStyle w:val="Hyperlink"/>
@@ -4956,7 +5242,7 @@
       </w:hyperlink>
     </w:p>
   </w:comment>
-  <w:comment w:id="13" w:author="Dave Bridges" w:date="2025-09-23T09:44:00Z" w:initials="DB">
+  <w:comment w:id="19" w:author="Dave Bridges" w:date="2025-09-23T09:44:00Z" w:initials="DB">
     <w:p>
       <w:r>
         <w:rPr>
@@ -4983,7 +5269,7 @@
       </w:r>
     </w:p>
   </w:comment>
-  <w:comment w:id="14" w:author="Dave Bridges" w:date="2025-09-23T09:45:00Z" w:initials="DB">
+  <w:comment w:id="20" w:author="Dave Bridges" w:date="2025-09-23T09:45:00Z" w:initials="DB">
     <w:p>
       <w:r>
         <w:rPr>
@@ -5000,7 +5286,7 @@
       </w:r>
     </w:p>
   </w:comment>
-  <w:comment w:id="15" w:author="Dave Bridges" w:date="2025-09-23T09:45:00Z" w:initials="DB">
+  <w:comment w:id="21" w:author="Dave Bridges" w:date="2025-09-23T09:45:00Z" w:initials="DB">
     <w:p>
       <w:r>
         <w:rPr>
@@ -5027,7 +5313,7 @@
       </w:r>
     </w:p>
   </w:comment>
-  <w:comment w:id="16" w:author="Dave Bridges" w:date="2025-09-23T09:45:00Z" w:initials="DB">
+  <w:comment w:id="22" w:author="Dave Bridges" w:date="2025-09-23T09:45:00Z" w:initials="DB">
     <w:p>
       <w:r>
         <w:rPr>
@@ -5044,7 +5330,7 @@
       </w:r>
     </w:p>
   </w:comment>
-  <w:comment w:id="11" w:author="Dave Bridges" w:date="2025-09-07T20:08:00Z" w:initials="DB">
+  <w:comment w:id="17" w:author="Dave Bridges" w:date="2025-09-07T20:08:00Z" w:initials="DB">
     <w:p>
       <w:r>
         <w:rPr>
@@ -5061,7 +5347,7 @@
       </w:r>
     </w:p>
   </w:comment>
-  <w:comment w:id="12" w:author="Carr, Treyton" w:date="2025-09-23T00:51:00Z" w:initials="CT">
+  <w:comment w:id="18" w:author="Carr, Treyton" w:date="2025-09-23T00:51:00Z" w:initials="CT">
     <w:p>
       <w:r>
         <w:rPr>
@@ -5084,10 +5370,16 @@
 <file path=word/commentsExtended.xml><?xml version="1.0" encoding="utf-8"?>
 <w15:commentsEx xmlns:wpc="http://schemas.microsoft.com/office/word/2010/wordprocessingCanvas" xmlns:cx="http://schemas.microsoft.com/office/drawing/2014/chartex" xmlns:cx1="http://schemas.microsoft.com/office/drawing/2015/9/8/chartex" xmlns:cx2="http://schemas.microsoft.com/office/drawing/2015/10/21/chartex" xmlns:cx3="http://schemas.microsoft.com/office/drawing/2016/5/9/chartex" xmlns:cx4="http://schemas.microsoft.com/office/drawing/2016/5/10/chartex" xmlns:cx5="http://schemas.microsoft.com/office/drawing/2016/5/11/chartex" xmlns:cx6="http://schemas.microsoft.com/office/drawing/2016/5/12/chartex" xmlns:cx7="http://schemas.microsoft.com/office/drawing/2016/5/13/chartex" xmlns:cx8="http://schemas.microsoft.com/office/drawing/2016/5/14/chartex" xmlns:mc="http://schemas.openxmlformats.org/markup-compatibility/2006" xmlns:aink="http://schemas.microsoft.com/office/drawing/2016/ink" xmlns:am3d="http://schemas.microsoft.com/office/drawing/2017/model3d" xmlns:o="urn:schemas-microsoft-com:office:office" xmlns:oel="http://schemas.microsoft.com/office/2019/extlst" xmlns:r="http://schemas.openxmlformats.org/officeDocument/2006/relationships" xmlns:m="http://schemas.openxmlformats.org/officeDocument/2006/math" xmlns:v="urn:schemas-microsoft-com:vml" xmlns:wp14="http://schemas.microsoft.com/office/word/2010/wordprocessingDrawing" xmlns:wp="http://schemas.openxmlformats.org/drawingml/2006/wordprocessingDrawing" xmlns:w10="urn:schemas-microsoft-com:office:word" xmlns:w="http://schemas.openxmlformats.org/wordprocessingml/2006/main" xmlns:w14="http://schemas.microsoft.com/office/word/2010/wordml" xmlns:w15="http://schemas.microsoft.com/office/word/2012/wordml" xmlns:w16cex="http://schemas.microsoft.com/office/word/2018/wordml/cex" xmlns:w16cid="http://schemas.microsoft.com/office/word/2016/wordml/cid" xmlns:w16="http://schemas.microsoft.com/office/word/2018/wordml" xmlns:w16du="http://schemas.microsoft.com/office/word/2023/wordml/word16du" xmlns:w16sdtdh="http://schemas.microsoft.com/office/word/2020/wordml/sdtdatahash" xmlns:w16sdtfl="http://schemas.microsoft.com/office/word/2024/wordml/sdtformatlock" xmlns:w16se="http://schemas.microsoft.com/office/word/2015/wordml/symex" xmlns:wpg="http://schemas.microsoft.com/office/word/2010/wordprocessingGroup" xmlns:wpi="http://schemas.microsoft.com/office/word/2010/wordprocessingInk" xmlns:wne="http://schemas.microsoft.com/office/word/2006/wordml" xmlns:wps="http://schemas.microsoft.com/office/word/2010/wordprocessingShape" mc:Ignorable="w14 w15 w16se w16cid w16 w16cex w16sdtdh w16sdtfl w16du wp14">
   <w15:commentEx w15:paraId="5E7166E4" w15:done="0"/>
+  <w15:commentEx w15:paraId="5DE1ED22" w15:done="0"/>
   <w15:commentEx w15:paraId="6D4C1547" w15:done="0"/>
-  <w15:commentEx w15:paraId="3048B1C6" w15:done="0"/>
-  <w15:commentEx w15:paraId="30EA8164" w15:done="0"/>
-  <w15:commentEx w15:paraId="03BC0566" w15:paraIdParent="30EA8164" w15:done="0"/>
+  <w15:commentEx w15:paraId="600A3090" w15:done="0"/>
+  <w15:commentEx w15:paraId="2F406576" w15:paraIdParent="600A3090" w15:done="0"/>
+  <w15:commentEx w15:paraId="422C9601" w15:done="0"/>
+  <w15:commentEx w15:paraId="7B0ABE96" w15:done="0"/>
+  <w15:commentEx w15:paraId="5A0030CA" w15:done="0"/>
+  <w15:commentEx w15:paraId="1EC95409" w15:done="0"/>
+  <w15:commentEx w15:paraId="30EA8164" w15:done="1"/>
+  <w15:commentEx w15:paraId="03BC0566" w15:paraIdParent="30EA8164" w15:done="1"/>
   <w15:commentEx w15:paraId="1DD21AA1" w15:done="0"/>
   <w15:commentEx w15:paraId="2B4220B9" w15:done="0"/>
   <w15:commentEx w15:paraId="392E4D0B" w15:done="0"/>
@@ -5106,8 +5398,14 @@
 <file path=word/commentsExtensible.xml><?xml version="1.0" encoding="utf-8"?>
 <w16cex:commentsExtensible xmlns:wpc="http://schemas.microsoft.com/office/word/2010/wordprocessingCanvas" xmlns:cx="http://schemas.microsoft.com/office/drawing/2014/chartex" xmlns:cx1="http://schemas.microsoft.com/office/drawing/2015/9/8/chartex" xmlns:cx2="http://schemas.microsoft.com/office/drawing/2015/10/21/chartex" xmlns:cx3="http://schemas.microsoft.com/office/drawing/2016/5/9/chartex" xmlns:cx4="http://schemas.microsoft.com/office/drawing/2016/5/10/chartex" xmlns:cx5="http://schemas.microsoft.com/office/drawing/2016/5/11/chartex" xmlns:cx6="http://schemas.microsoft.com/office/drawing/2016/5/12/chartex" xmlns:cx7="http://schemas.microsoft.com/office/drawing/2016/5/13/chartex" xmlns:cx8="http://schemas.microsoft.com/office/drawing/2016/5/14/chartex" xmlns:cr="http://schemas.microsoft.com/office/comments/2020/reactions" xmlns:mc="http://schemas.openxmlformats.org/markup-compatibility/2006" xmlns:aink="http://schemas.microsoft.com/office/drawing/2016/ink" xmlns:am3d="http://schemas.microsoft.com/office/drawing/2017/model3d" xmlns:o="urn:schemas-microsoft-com:office:office" xmlns:oel="http://schemas.microsoft.com/office/2019/extlst" xmlns:r="http://schemas.openxmlformats.org/officeDocument/2006/relationships" xmlns:m="http://schemas.openxmlformats.org/officeDocument/2006/math" xmlns:v="urn:schemas-microsoft-com:vml" xmlns:wp14="http://schemas.microsoft.com/office/word/2010/wordprocessingDrawing" xmlns:wp="http://schemas.openxmlformats.org/drawingml/2006/wordprocessingDrawing" xmlns:w10="urn:schemas-microsoft-com:office:word" xmlns:w="http://schemas.openxmlformats.org/wordprocessingml/2006/main" xmlns:w14="http://schemas.microsoft.com/office/word/2010/wordml" xmlns:w15="http://schemas.microsoft.com/office/word/2012/wordml" xmlns:w16cex="http://schemas.microsoft.com/office/word/2018/wordml/cex" xmlns:w16cid="http://schemas.microsoft.com/office/word/2016/wordml/cid" xmlns:w16="http://schemas.microsoft.com/office/word/2018/wordml" xmlns:w16du="http://schemas.microsoft.com/office/word/2023/wordml/word16du" xmlns:w16sdtdh="http://schemas.microsoft.com/office/word/2020/wordml/sdtdatahash" xmlns:w16sdtfl="http://schemas.microsoft.com/office/word/2024/wordml/sdtformatlock" xmlns:w16se="http://schemas.microsoft.com/office/word/2015/wordml/symex" xmlns:wpg="http://schemas.microsoft.com/office/word/2010/wordprocessingGroup" xmlns:wpi="http://schemas.microsoft.com/office/word/2010/wordprocessingInk" xmlns:wne="http://schemas.microsoft.com/office/word/2006/wordml" xmlns:wps="http://schemas.microsoft.com/office/word/2010/wordprocessingShape" mc:Ignorable="w14 w15 w16se w16cid w16 w16cex w16sdtdh w16sdtfl cr w16du wp14">
   <w16cex:commentExtensible w16cex:durableId="354F1AD7" w16cex:dateUtc="2025-12-01T20:44:00Z"/>
+  <w16cex:commentExtensible w16cex:durableId="50772C8C" w16cex:dateUtc="2025-12-03T05:11:00Z"/>
   <w16cex:commentExtensible w16cex:durableId="08232419" w16cex:dateUtc="2025-12-01T20:54:00Z"/>
-  <w16cex:commentExtensible w16cex:durableId="7B615881" w16cex:dateUtc="2025-11-09T04:56:00Z"/>
+  <w16cex:commentExtensible w16cex:durableId="63B3FDBC" w16cex:dateUtc="2025-12-03T00:34:00Z"/>
+  <w16cex:commentExtensible w16cex:durableId="724D0662" w16cex:dateUtc="2025-12-03T00:41:00Z"/>
+  <w16cex:commentExtensible w16cex:durableId="2A2F0DAC" w16cex:dateUtc="2025-12-03T00:42:00Z"/>
+  <w16cex:commentExtensible w16cex:durableId="50D29B1F" w16cex:dateUtc="2025-12-03T04:49:00Z"/>
+  <w16cex:commentExtensible w16cex:durableId="5F9281EB" w16cex:dateUtc="2025-12-03T05:07:00Z"/>
+  <w16cex:commentExtensible w16cex:durableId="20CDB372" w16cex:dateUtc="2025-12-03T05:16:00Z"/>
   <w16cex:commentExtensible w16cex:durableId="7BBB9387" w16cex:dateUtc="2025-09-07T23:14:00Z"/>
   <w16cex:commentExtensible w16cex:durableId="5C3B7975" w16cex:dateUtc="2025-11-09T04:41:00Z"/>
   <w16cex:commentExtensible w16cex:durableId="1A95B88A" w16cex:dateUtc="2025-09-05T23:50:00Z"/>
@@ -5128,8 +5426,14 @@
 <file path=word/commentsIds.xml><?xml version="1.0" encoding="utf-8"?>
 <w16cid:commentsIds xmlns:wpc="http://schemas.microsoft.com/office/word/2010/wordprocessingCanvas" xmlns:cx="http://schemas.microsoft.com/office/drawing/2014/chartex" xmlns:cx1="http://schemas.microsoft.com/office/drawing/2015/9/8/chartex" xmlns:cx2="http://schemas.microsoft.com/office/drawing/2015/10/21/chartex" xmlns:cx3="http://schemas.microsoft.com/office/drawing/2016/5/9/chartex" xmlns:cx4="http://schemas.microsoft.com/office/drawing/2016/5/10/chartex" xmlns:cx5="http://schemas.microsoft.com/office/drawing/2016/5/11/chartex" xmlns:cx6="http://schemas.microsoft.com/office/drawing/2016/5/12/chartex" xmlns:cx7="http://schemas.microsoft.com/office/drawing/2016/5/13/chartex" xmlns:cx8="http://schemas.microsoft.com/office/drawing/2016/5/14/chartex" xmlns:mc="http://schemas.openxmlformats.org/markup-compatibility/2006" xmlns:aink="http://schemas.microsoft.com/office/drawing/2016/ink" xmlns:am3d="http://schemas.microsoft.com/office/drawing/2017/model3d" xmlns:o="urn:schemas-microsoft-com:office:office" xmlns:oel="http://schemas.microsoft.com/office/2019/extlst" xmlns:r="http://schemas.openxmlformats.org/officeDocument/2006/relationships" xmlns:m="http://schemas.openxmlformats.org/officeDocument/2006/math" xmlns:v="urn:schemas-microsoft-com:vml" xmlns:wp14="http://schemas.microsoft.com/office/word/2010/wordprocessingDrawing" xmlns:wp="http://schemas.openxmlformats.org/drawingml/2006/wordprocessingDrawing" xmlns:w10="urn:schemas-microsoft-com:office:word" xmlns:w="http://schemas.openxmlformats.org/wordprocessingml/2006/main" xmlns:w14="http://schemas.microsoft.com/office/word/2010/wordml" xmlns:w15="http://schemas.microsoft.com/office/word/2012/wordml" xmlns:w16cex="http://schemas.microsoft.com/office/word/2018/wordml/cex" xmlns:w16cid="http://schemas.microsoft.com/office/word/2016/wordml/cid" xmlns:w16="http://schemas.microsoft.com/office/word/2018/wordml" xmlns:w16du="http://schemas.microsoft.com/office/word/2023/wordml/word16du" xmlns:w16sdtdh="http://schemas.microsoft.com/office/word/2020/wordml/sdtdatahash" xmlns:w16sdtfl="http://schemas.microsoft.com/office/word/2024/wordml/sdtformatlock" xmlns:w16se="http://schemas.microsoft.com/office/word/2015/wordml/symex" xmlns:wpg="http://schemas.microsoft.com/office/word/2010/wordprocessingGroup" xmlns:wpi="http://schemas.microsoft.com/office/word/2010/wordprocessingInk" xmlns:wne="http://schemas.microsoft.com/office/word/2006/wordml" xmlns:wps="http://schemas.microsoft.com/office/word/2010/wordprocessingShape" mc:Ignorable="w14 w15 w16se w16cid w16 w16cex w16sdtdh w16sdtfl w16du wp14">
   <w16cid:commentId w16cid:paraId="5E7166E4" w16cid:durableId="354F1AD7"/>
+  <w16cid:commentId w16cid:paraId="5DE1ED22" w16cid:durableId="50772C8C"/>
   <w16cid:commentId w16cid:paraId="6D4C1547" w16cid:durableId="08232419"/>
-  <w16cid:commentId w16cid:paraId="3048B1C6" w16cid:durableId="7B615881"/>
+  <w16cid:commentId w16cid:paraId="600A3090" w16cid:durableId="63B3FDBC"/>
+  <w16cid:commentId w16cid:paraId="2F406576" w16cid:durableId="724D0662"/>
+  <w16cid:commentId w16cid:paraId="422C9601" w16cid:durableId="2A2F0DAC"/>
+  <w16cid:commentId w16cid:paraId="7B0ABE96" w16cid:durableId="50D29B1F"/>
+  <w16cid:commentId w16cid:paraId="5A0030CA" w16cid:durableId="5F9281EB"/>
+  <w16cid:commentId w16cid:paraId="1EC95409" w16cid:durableId="20CDB372"/>
   <w16cid:commentId w16cid:paraId="30EA8164" w16cid:durableId="7BBB9387"/>
   <w16cid:commentId w16cid:paraId="03BC0566" w16cid:durableId="5C3B7975"/>
   <w16cid:commentId w16cid:paraId="1DD21AA1" w16cid:durableId="1A95B88A"/>

</xml_diff>

<commit_message>
Updated values for blood pressure evaluation in results
</commit_message>
<xml_diff>
--- a/manuscript/Cushings-Obesity/manuscript.docx
+++ b/manuscript/Cushings-Obesity/manuscript.docx
@@ -1570,7 +1570,13 @@
     </w:p>
     <w:p>
       <w:r>
-        <w:t>As aforementioned, our first metabolic variable of interest was the fasting glucose levels of our obese and non-obese populations. As shown in Table 3</w:t>
+        <w:t xml:space="preserve">As aforementioned, our first metabolic variable of interest was the fasting glucose levels of our obese and non-obese populations. As shown in </w:t>
+      </w:r>
+      <w:r>
+        <w:t xml:space="preserve">Figure 2 and </w:t>
+      </w:r>
+      <w:r>
+        <w:t>Table 3</w:t>
       </w:r>
       <w:r>
         <w:t>A</w:t>
@@ -1636,11 +1642,11 @@
         <w:t>2</w:t>
       </w:r>
       <w:r>
-        <w:t xml:space="preserve">, but this was not a large enough difference to provide any significant evidence of an effect </w:t>
+        <w:t xml:space="preserve">, but this was not a large enough difference to provide any significant evidence of </w:t>
       </w:r>
       <w:r>
         <w:lastRenderedPageBreak/>
-        <w:t>modification for obesity</w:t>
+        <w:t>an effect modification for obesity</w:t>
       </w:r>
       <w:r>
         <w:t xml:space="preserve"> (p=0.51; Table 3B)</w:t>
@@ -1755,10 +1761,16 @@
         <w:t>and AST levels as indicators of liver damage</w:t>
       </w:r>
       <w:r>
+        <w:t xml:space="preserve"> (Figure 2 and Table 3A)</w:t>
+      </w:r>
+      <w:r>
         <w:t xml:space="preserve">. In both our obese, and non-obese populations, we saw an increase in ALT </w:t>
       </w:r>
       <w:r>
         <w:t>and AST</w:t>
+      </w:r>
+      <w:r>
+        <w:t xml:space="preserve"> </w:t>
       </w:r>
       <w:r>
         <w:t>levels regardless of Cushing’s disease status</w:t>
@@ -1859,67 +1871,97 @@
         <w:t>evaluated</w:t>
       </w:r>
       <w:r>
-        <w:t xml:space="preserve"> blood pressure readings as systolic, diastolic and mean arterial pressure </w:t>
-      </w:r>
-      <w:r>
-        <w:t xml:space="preserve"> (Table 3A). In our data regarding the mean arteriole pressure, we did see a significant increase in our non-obese population between the patients with and without Cushing’s disease (p=0.010). We did not, however, </w:t>
+        <w:t xml:space="preserve"> blood pressure readings as systolic, diastolic and mean arterial pressure</w:t>
+      </w:r>
+      <w:r>
+        <w:t>s</w:t>
+      </w:r>
+      <w:r>
+        <w:t xml:space="preserve"> </w:t>
+      </w:r>
+      <w:r>
+        <w:t xml:space="preserve"> (</w:t>
+      </w:r>
+      <w:r>
+        <w:t xml:space="preserve">Figure 2 and </w:t>
+      </w:r>
+      <w:r>
+        <w:t xml:space="preserve">Table 3A). </w:t>
+      </w:r>
+      <w:r>
+        <w:t>We</w:t>
+      </w:r>
+      <w:r>
+        <w:t xml:space="preserve"> </w:t>
+      </w:r>
+      <w:r>
+        <w:t>observed</w:t>
+      </w:r>
+      <w:r>
+        <w:t xml:space="preserve"> significant increase</w:t>
+      </w:r>
+      <w:r>
+        <w:t>s for all measures</w:t>
+      </w:r>
+      <w:r>
+        <w:t xml:space="preserve"> in </w:t>
+      </w:r>
+      <w:r>
+        <w:t>patients without obesity</w:t>
+      </w:r>
+      <w:r>
+        <w:t xml:space="preserve"> (p=</w:t>
+      </w:r>
+      <w:r>
+        <w:t>&lt;0.01</w:t>
+      </w:r>
+      <w:r>
+        <w:t xml:space="preserve">). We did not, however, </w:t>
       </w:r>
       <w:r>
         <w:t>observe</w:t>
       </w:r>
       <w:r>
-        <w:t xml:space="preserve"> this same significant increase in the obese population (p=0.072). We saw this same relationship in our diastolic blood measurement, with a significant increase in the non-obese population, but not a significant increase in the obese population (p</w:t>
-      </w:r>
-      <w:r>
-        <w:t>&lt;0.01</w:t>
-      </w:r>
-      <w:r>
-        <w:t xml:space="preserve">, </w:t>
-      </w:r>
-      <w:r>
-        <w:t>&lt;0.01</w:t>
-      </w:r>
-      <w:r>
-        <w:t>). This pattern changed in our recorded measurements for systolic blood pressure. In this metric, we saw a significant increase in both the non-obese and obese populations between the control and Cushing’s patient populations (p</w:t>
-      </w:r>
-      <w:r>
-        <w:t>&lt;0.01</w:t>
-      </w:r>
-      <w:r>
-        <w:t xml:space="preserve">, </w:t>
-      </w:r>
-      <w:r>
-        <w:t>&lt;0.01</w:t>
-      </w:r>
-      <w:r>
-        <w:t>). This increase was much larger in the non-obese population (10.88 vs. 4.50), which suggests that obesity could be a negative effect modifier in regards to systolic blood pressure.</w:t>
-      </w:r>
-    </w:p>
-    <w:p>
-      <w:pPr>
-        <w:pStyle w:val="NormalWeb"/>
-        <w:numPr>
-          <w:ilvl w:val="0"/>
-          <w:numId w:val="3"/>
-        </w:numPr>
-      </w:pPr>
-      <w:r>
-        <w:t>Refer to Table 3</w:t>
-      </w:r>
-      <w:r>
-        <w:t>A/B</w:t>
-      </w:r>
-      <w:r>
-        <w:t xml:space="preserve"> and Figure </w:t>
-      </w:r>
-      <w:r>
-        <w:t>2</w:t>
-      </w:r>
-      <w:r>
-        <w:t xml:space="preserve"> and 3 (not done yet)</w:t>
-      </w:r>
-      <w:r>
-        <w:t>.</w:t>
+        <w:t xml:space="preserve"> this same significant </w:t>
+      </w:r>
+      <w:r>
+        <w:t xml:space="preserve">magnitude of </w:t>
+      </w:r>
+      <w:r>
+        <w:t>increase</w:t>
+      </w:r>
+      <w:r>
+        <w:t>s in blood pressure</w:t>
+      </w:r>
+      <w:r>
+        <w:t xml:space="preserve"> in </w:t>
+      </w:r>
+      <w:r>
+        <w:t>Cushing’s patients with obesity</w:t>
+      </w:r>
+      <w:r>
+        <w:t xml:space="preserve"> population</w:t>
+      </w:r>
+      <w:r>
+        <w:t xml:space="preserve">.  For example, in terms of systolic blood pressure, Cushing’s disease was associated with an increase of 11.97 mm Hg in patients without obesity but 3.08 mm Hg.  This attenuation of the effect of Cushing’s disease with obesity was significant </w:t>
+      </w:r>
+      <w:r>
+        <w:t>for mean, systolic, and diastolic bood pressure (p</w:t>
+      </w:r>
+      <w:r>
+        <w:rPr>
+          <w:vertAlign w:val="subscript"/>
+        </w:rPr>
+        <w:t>interaction</w:t>
+      </w:r>
+      <w:r>
+        <w:t xml:space="preserve">&lt;0.01 for each).  </w:t>
+      </w:r>
+      <w:r>
+        <w:t xml:space="preserve">This </w:t>
+      </w:r>
+      <w:r>
+        <w:t>suggests that obesity may have a protective effect on Cushing’s induced hypertension.</w:t>
       </w:r>
     </w:p>
     <w:p>
@@ -1979,7 +2021,6 @@
         </w:numPr>
       </w:pPr>
       <w:r>
-        <w:lastRenderedPageBreak/>
         <w:t>BP increases only in lean (refer back to numbers or figures)</w:t>
       </w:r>
     </w:p>
@@ -2016,6 +2057,7 @@
         </w:numPr>
       </w:pPr>
       <w:r>
+        <w:lastRenderedPageBreak/>
         <w:t xml:space="preserve">We also observe increases in BP with obesity (Table 3A),  this is also well established add </w:t>
       </w:r>
       <w:commentRangeStart w:id="21"/>
@@ -2344,6 +2386,7 @@
         <w:pStyle w:val="Heading1"/>
       </w:pPr>
       <w:r>
+        <w:lastRenderedPageBreak/>
         <w:t>References</w:t>
       </w:r>
     </w:p>
@@ -2577,8 +2620,14 @@
         <w:rPr>
           <w:rFonts w:ascii="Aptos"/>
         </w:rPr>
+        <w:t xml:space="preserve">Matthiasdottir, A. M., Hardarson, T. O., Arnardottir, S., &amp; Sigurjonsdottir, H. A. (2024). Cushing’s Disease May Have Higher Incidence than Previously Thought: A </w:t>
+      </w:r>
+      <w:r>
+        <w:rPr>
+          <w:rFonts w:ascii="Aptos"/>
+        </w:rPr>
         <w:lastRenderedPageBreak/>
-        <w:t xml:space="preserve">Matthiasdottir, A. M., Hardarson, T. O., Arnardottir, S., &amp; Sigurjonsdottir, H. A. (2024). Cushing’s Disease May Have Higher Incidence than Previously Thought: A Nationwide Study in Iceland 2010–2019. </w:t>
+        <w:t xml:space="preserve">Nationwide Study in Iceland 2010–2019. </w:t>
       </w:r>
       <w:r>
         <w:rPr>
@@ -2888,7 +2937,6 @@
           <w:b/>
           <w:bCs/>
         </w:rPr>
-        <w:lastRenderedPageBreak/>
         <w:t>Table 2: Participant characteristics after stratification by obesity</w:t>
       </w:r>
       <w:r>
@@ -2904,6 +2952,7 @@
           <w:b/>
           <w:bCs/>
         </w:rPr>
+        <w:lastRenderedPageBreak/>
         <w:t xml:space="preserve">Table 3: Effect sizes and statistical significance for each outcome.  </w:t>
       </w:r>
       <w:r>

</xml_diff>

<commit_message>
Added sensitivity analyses table, added panel identifiers to figures
</commit_message>
<xml_diff>
--- a/manuscript/Cushings-Obesity/manuscript.docx
+++ b/manuscript/Cushings-Obesity/manuscript.docx
@@ -1967,12 +1967,20 @@
     <w:p>
       <w:pPr>
         <w:pStyle w:val="NormalWeb"/>
-      </w:pPr>
-      <w:r>
         <w:rPr>
           <w:rStyle w:val="Heading2Char"/>
         </w:rPr>
+      </w:pPr>
+      <w:r>
+        <w:rPr>
+          <w:rStyle w:val="Heading2Char"/>
+        </w:rPr>
         <w:t>Sensitivity and secondary analyses</w:t>
+      </w:r>
+    </w:p>
+    <w:p>
+      <w:r>
+        <w:t>We performed a variety of sensitivity analyses to test the assumptions used in evaluating these effects, summarized in Table 4.</w:t>
       </w:r>
     </w:p>
     <w:p>
@@ -2033,6 +2041,7 @@
         </w:numPr>
       </w:pPr>
       <w:r>
+        <w:lastRenderedPageBreak/>
         <w:t>Consistent across SBP/DBP</w:t>
       </w:r>
     </w:p>
@@ -2057,7 +2066,6 @@
         </w:numPr>
       </w:pPr>
       <w:r>
-        <w:lastRenderedPageBreak/>
         <w:t xml:space="preserve">We also observe increases in BP with obesity (Table 3A),  this is also well established add </w:t>
       </w:r>
       <w:commentRangeStart w:id="21"/>
@@ -2378,6 +2386,7 @@
         <w:pStyle w:val="ListParagraph"/>
       </w:pPr>
       <w:r>
+        <w:lastRenderedPageBreak/>
         <w:t xml:space="preserve">Takeaway – sepated metabolic complicatons in cushings patienst with and without obesity we found …. This is relevant because … </w:t>
       </w:r>
     </w:p>
@@ -2386,7 +2395,6 @@
         <w:pStyle w:val="Heading1"/>
       </w:pPr>
       <w:r>
-        <w:lastRenderedPageBreak/>
         <w:t>References</w:t>
       </w:r>
     </w:p>
@@ -2620,14 +2628,8 @@
         <w:rPr>
           <w:rFonts w:ascii="Aptos"/>
         </w:rPr>
-        <w:t xml:space="preserve">Matthiasdottir, A. M., Hardarson, T. O., Arnardottir, S., &amp; Sigurjonsdottir, H. A. (2024). Cushing’s Disease May Have Higher Incidence than Previously Thought: A </w:t>
-      </w:r>
-      <w:r>
-        <w:rPr>
-          <w:rFonts w:ascii="Aptos"/>
-        </w:rPr>
         <w:lastRenderedPageBreak/>
-        <w:t xml:space="preserve">Nationwide Study in Iceland 2010–2019. </w:t>
+        <w:t xml:space="preserve">Matthiasdottir, A. M., Hardarson, T. O., Arnardottir, S., &amp; Sigurjonsdottir, H. A. (2024). Cushing’s Disease May Have Higher Incidence than Previously Thought: A Nationwide Study in Iceland 2010–2019. </w:t>
       </w:r>
       <w:r>
         <w:rPr>
@@ -2841,7 +2843,13 @@
         <w:t xml:space="preserve">Effects of Cushing’s disease and Obesity on Laboratory Values.  </w:t>
       </w:r>
       <w:r>
-        <w:t>Laboratory values were within 30 days of Cushing’s disease surgery for cases.  Obesity was defined as a BMI above or below 30 kg/m</w:t>
+        <w:t xml:space="preserve">Laboratory values were within </w:t>
+      </w:r>
+      <w:r>
+        <w:t>a year</w:t>
+      </w:r>
+      <w:r>
+        <w:t xml:space="preserve"> of Cushing’s disease surgery for cases.  Obesity was defined as a BMI above or below 30 kg/m</w:t>
       </w:r>
       <w:r>
         <w:rPr>
@@ -2868,10 +2876,19 @@
         <w:t>er grey indicating data from participants with Cushing’s disease</w:t>
       </w:r>
       <w:r>
+        <w:t xml:space="preserve"> compared to propensity matched controls</w:t>
+      </w:r>
+      <w:r>
         <w:t>.</w:t>
       </w:r>
       <w:r>
-        <w:t xml:space="preserve">   Table 3 reports adjusted p-values for effects of Cushing’s disease and the interaction between disease and obesity.</w:t>
+        <w:t xml:space="preserve">   Table 3 reports </w:t>
+      </w:r>
+      <w:r>
+        <w:t>effect sizes and</w:t>
+      </w:r>
+      <w:r>
+        <w:t xml:space="preserve"> p-values for effects of Cushing’s disease and the interaction between disease and obesity.</w:t>
       </w:r>
     </w:p>
     <w:p>
@@ -2910,7 +2927,11 @@
         <w:t xml:space="preserve">  Participants were matched for age, gender and race/ethnicity but not BMI.  This table represents the matched set for </w:t>
       </w:r>
       <w:r>
-        <w:t xml:space="preserve">patients with </w:t>
+        <w:t xml:space="preserve">patients </w:t>
+      </w:r>
+      <w:r>
+        <w:lastRenderedPageBreak/>
+        <w:t xml:space="preserve">with </w:t>
       </w:r>
       <w:r>
         <w:t xml:space="preserve">Cushing’s </w:t>
@@ -2952,7 +2973,6 @@
           <w:b/>
           <w:bCs/>
         </w:rPr>
-        <w:lastRenderedPageBreak/>
         <w:t xml:space="preserve">Table 3: Effect sizes and statistical significance for each outcome.  </w:t>
       </w:r>
       <w:r>
@@ -3135,7 +3155,21 @@
           <w:b/>
           <w:bCs/>
         </w:rPr>
-        <w:t>Supplementary Tables S2A-E: Outcome-specific participant characteristics after matching</w:t>
+        <w:t>Supplementary Tables S2</w:t>
+      </w:r>
+      <w:r>
+        <w:rPr>
+          <w:b/>
+          <w:bCs/>
+        </w:rPr>
+        <w:t>-6</w:t>
+      </w:r>
+      <w:r>
+        <w:rPr>
+          <w:b/>
+          <w:bCs/>
+        </w:rPr>
+        <w:t>: Outcome-specific participant characteristics after matching</w:t>
       </w:r>
       <w:r>
         <w:t>. A) Glucose, B) HbA1c, C) ALT, D) Blood Pressure and E) LDL-C</w:t>

</xml_diff>

<commit_message>
Added references to introduction
</commit_message>
<xml_diff>
--- a/manuscript/Cushings-Obesity/manuscript.docx
+++ b/manuscript/Cushings-Obesity/manuscript.docx
@@ -18,11 +18,364 @@
     </w:p>
     <w:p>
       <w:r>
-        <w:t>Cushing’s disease is a rare endocrine disorder, with an incidence rate of 1.8-2.5 cases per million people per year (</w:t>
+        <w:t>Cushing’s disease is a rare endocrine disorder, with an incidence rate of 1.8-2.5 cases per million people per year</w:t>
+      </w:r>
+      <w:r>
+        <w:t xml:space="preserve"> </w:t>
+      </w:r>
+      <w:r>
+        <w:fldChar w:fldCharType="begin"/>
+      </w:r>
+      <w:r>
+        <w:instrText xml:space="preserve"> ADDIN ZOTERO_ITEM CSL_CITATION {"citationID":"Q0k2p23E","properties":{"formattedCitation":"(Gadelha et al., 2023; Sharma, Susmeeta T. et al., 2015)","plainCitation":"(Gadelha et al., 2023; Sharma, Susmeeta T. et al., 2015)","noteIndex":0},"citationItems":[{"id":27385,"uris":["http://zotero.org/users/7317906/items/943TJHQ8"],"itemData":{"id":27385,"type":"article-journal","abstract":"Endogenous Cushing's syndrome results from excess glucocorticoid secretion, which leads to a myriad of clinical manifestations, comorbidities, and increased mortality despite treatment. Molecular mechanisms and genetic alterations associated with different causes of Cushing's syndrome have been described in the last decade. Imaging modalities and biochemical testing have evolved; however, both the diagnosis and management of Cushing's syndrome remain challenging. Surgery is the preferred treatment for all causes, but medical therapy has markedly advanced, with new drug options becoming available. Nevertheless, several comorbidities remain even after patient remission, which can affect quality of life. Accurate and timely diagnosis and treatment are essential for mitigating chronic complications of excess glucocorticoids and improving patient quality of life. In this Seminar, we aim to update several important aspects of diagnosis, complications, and treatment of endogenous Cushing's syndrome of all causes.","container-title":"The Lancet","DOI":"10.1016/S0140-6736(23)01961-X","ISSN":"0140-6736","issue":"10418","journalAbbreviation":"The Lancet","page":"2237-2252","source":"ScienceDirect","title":"Cushing's syndrome","volume":"402","author":[{"family":"Gadelha","given":"Mônica"},{"family":"Gatto","given":"Federico"},{"family":"Wildemberg","given":"Luiz Eduardo"},{"family":"Fleseriu","given":"Maria"}],"issued":{"date-parts":[["2023",12,9]]},"citation-key":"gadelhaCushingsSyndrome2023"}},{"id":27387,"uris":["http://zotero.org/users/7317906/items/TDFR4SXD"],"itemData":{"id":27387,"type":"article-journal","abstract":"Cushing&amp;#39;s syndrome: epidemiology and developments in disease management Susmeeta T Sharma,1 Lynnette K Nieman,1 Richard A Feelders2 1Program in Reproductive and Adult Endocrinology, Eunice Kennedy Shriver National Institute of Child Health and Human Development, National Institutes of Health, Bethesda, MD, USA; 2Division of Endocrinology, Department of Internal Medicine, Erasmus Medical Center, Rotterdam, the Netherlands  Abstract: Cushing&amp;rsquo;s syndrome is a rare disorder resulting from prolonged exposure to excess glucocorticoids. Early diagnosis and treatment of Cushing&amp;rsquo;s syndrome is associated with a decrease in morbidity and mortality. Clinical presentation can be highly variable, and establishing the diagnosis can often be difficult. Surgery (resection of the pituitary or ectopic source of adrenocorticotropic hormone, or unilateral or bilateral adrenalectomy) remains the optimal treatment in all forms of Cushing&amp;rsquo;s syndrome, but may not always lead to remission. Medical therapy (steroidogenesis inhibitors, agents that decrease adrenocorticotropic hormone levels or glucocorticoid receptor antagonists) and pituitary radiotherapy may be needed as an adjunct. A multidisciplinary approach, long-term follow-up, and treatment modalities customized to each individual are essential for optimal control of hypercortisolemia and management of comorbidities.  Keywords: Cushing&amp;rsquo;s syndrome, hypercortisolemia, treatment, epidemiology","container-title":"Clinical Epidemiology","language":"en","page":"281–293","source":"www.dovepress.com","title":"Cushing's syndrome: epidemiology and developments in disease management","title-short":"Cushing&amp;#39;s syndrome","author":[{"literal":"Sharma, Susmeeta T."},{"family":"Nieman","given":"Lynnette K."},{"family":"Feelders","given":"Richard A."}],"issued":{"date-parts":[["2015"]]},"citation-key":"sharmasusmeetat.CushingsSyndromeEpidemiology2015"}}],"schema":"https://github.com/citation-style-language/schema/raw/master/csl-citation.json"} </w:instrText>
+      </w:r>
+      <w:r>
+        <w:fldChar w:fldCharType="separate"/>
+      </w:r>
+      <w:r>
+        <w:rPr>
+          <w:noProof/>
+        </w:rPr>
+        <w:t>(Gadelha et al., 2023; Sharma, Susmeeta T. et al., 2015)</w:t>
+      </w:r>
+      <w:r>
+        <w:fldChar w:fldCharType="end"/>
+      </w:r>
+      <w:r>
+        <w:t xml:space="preserve">.  </w:t>
+      </w:r>
+      <w:r>
+        <w:t xml:space="preserve">This condition results from excess adrenocorticotropic </w:t>
+      </w:r>
+      <w:r>
+        <w:t xml:space="preserve">(ACTH) </w:t>
+      </w:r>
+      <w:r>
+        <w:t xml:space="preserve">hormone secretion </w:t>
+      </w:r>
+      <w:r>
+        <w:t xml:space="preserve">from the </w:t>
+      </w:r>
+      <w:r>
+        <w:t xml:space="preserve">pituitary gland, leading the adrenal glands to produce excess cortisol. </w:t>
+      </w:r>
+      <w:r>
+        <w:t>This is often due to the presence of a pituitary adenoma</w:t>
+      </w:r>
+      <w:r>
+        <w:t xml:space="preserve"> </w:t>
+      </w:r>
+      <w:r>
+        <w:fldChar w:fldCharType="begin"/>
+      </w:r>
+      <w:r>
+        <w:instrText xml:space="preserve"> ADDIN ZOTERO_ITEM CSL_CITATION {"citationID":"edWKwbVp","properties":{"formattedCitation":"(Fleseriu et al., 2021)","plainCitation":"(Fleseriu et al., 2021)","noteIndex":0},"citationItems":[{"id":27389,"uris":["http://zotero.org/users/7317906/items/UMD9Q429"],"itemData":{"id":27389,"type":"article-journal","abstract":"Cushing’s disease (CD) requires accurate diagnosis, careful treatment selection, and long-term management to optimize patient outcomes. The Pituitary Society convened a Consensus Workshop comprising more than 50 academic researchers and clinical experts to discuss the application of recent evidence to clinical practice. In advance of the virtual meeting, recent data on screening and diagnosis; surgery, medical and radiation therapy; and disease- and treatment-related complications of CD were critically summarized in recorded lectures that were reviewed by all participants. During the meeting, concise summaries of the recorded lectures were presented, followed by small group breakout discussions. Consensus opinions from each group were collated into a draft document, which was reviewed and approved by all participants. Recommendations regarding use of laboratory tests, imaging, and treatment options are presented, along with algorithms for diagnosis of Cushing’s syndrome and management of CD. Topics considered most important to address in future research are also identified.","container-title":"The lancet. Diabetes &amp; endocrinology","DOI":"10.1016/S2213-8587(21)00235-7","ISSN":"2213-8587","issue":"12","journalAbbreviation":"Lancet Diabetes Endocrinol","note":"PMID: 34687601\nPMCID: PMC8743006","page":"847-875","source":"PubMed Central","title":"Consensus on Diagnosis and Management of Cushing’s Disease: A Guideline Update","title-short":"Consensus on Diagnosis and Management of Cushing’s Disease","volume":"9","author":[{"family":"Fleseriu","given":"Maria"},{"family":"Auchus","given":"Richard"},{"family":"Bancos","given":"Irina"},{"family":"Ben-Shlomo","given":"Anat"},{"family":"Bertherat","given":"Jerome"},{"family":"Biermasz","given":"Nienke R"},{"family":"Boguszewski","given":"Cesar L"},{"family":"Bronstein","given":"Marcello D"},{"family":"Buchfelder","given":"Michael"},{"family":"Carmichael","given":"John D"},{"family":"Casanueva","given":"Felipe F"},{"family":"Castinetti","given":"Frederic"},{"family":"Chanson","given":"Philippe"},{"family":"Findling","given":"James"},{"family":"Gadelha","given":"Mônica"},{"family":"Geer","given":"Eliza B"},{"family":"Giustina","given":"Andrea"},{"family":"Grossman","given":"Ashley"},{"family":"Gurnell","given":"Mark"},{"family":"Ho","given":"Ken"},{"family":"Ioachimescu","given":"Adriana G"},{"family":"Kaiser","given":"Ursula B"},{"family":"Karavitaki","given":"Niki"},{"family":"Katznelson","given":"Laurence"},{"family":"Kelly","given":"Daniel F"},{"family":"Lacroix","given":"André"},{"family":"McCormack","given":"Ann"},{"family":"Melmed","given":"Shlomo"},{"family":"Molitch","given":"Mark"},{"family":"Mortini","given":"Pietro"},{"family":"Newell-Price","given":"John"},{"family":"Nieman","given":"Lynnette"},{"family":"Pereira","given":"Alberto M"},{"family":"Petersenn","given":"Stephan"},{"family":"Pivonello","given":"Rosario"},{"family":"Raff","given":"Hershel"},{"family":"Reincke","given":"Martin"},{"family":"Salvatori","given":"Roberto"},{"family":"Scaroni","given":"Carla"},{"family":"Shimon","given":"Ilan"},{"family":"Stratakis","given":"Constantine A"},{"family":"Swearingen","given":"Brooke"},{"family":"Tabarin","given":"Antoine"},{"family":"Takahashi","given":"Yutaka"},{"family":"Theodoropoulou","given":"Marily"},{"family":"Tsagarakis","given":"Stylianos"},{"family":"Valassi","given":"Elena"},{"family":"Varlamov","given":"Elena V"},{"family":"Vila","given":"Greisa"},{"family":"Wass","given":"John"},{"family":"Webb","given":"Susan M"},{"family":"Zatelli","given":"Maria C"},{"family":"Biller","given":"Beverly M K"}],"issued":{"date-parts":[["2021",12]]},"citation-key":"fleseriuConsensusDiagnosisManagement2021"}}],"schema":"https://github.com/citation-style-language/schema/raw/master/csl-citation.json"} </w:instrText>
+      </w:r>
+      <w:r>
+        <w:fldChar w:fldCharType="separate"/>
+      </w:r>
+      <w:r>
+        <w:rPr>
+          <w:noProof/>
+        </w:rPr>
+        <w:t>(Fleseriu et al., 2021)</w:t>
+      </w:r>
+      <w:r>
+        <w:fldChar w:fldCharType="end"/>
+      </w:r>
+      <w:r>
+        <w:t xml:space="preserve">.  </w:t>
+      </w:r>
+      <w:r>
+        <w:t>Cushing’s disease also occurs far more commonly in women, with a</w:t>
+      </w:r>
+      <w:r>
+        <w:t>n approximate</w:t>
+      </w:r>
+      <w:r>
+        <w:t xml:space="preserve"> female-to-male ratio of 4:1 </w:t>
+      </w:r>
+      <w:r>
+        <w:fldChar w:fldCharType="begin"/>
+      </w:r>
+      <w:r>
+        <w:instrText xml:space="preserve"> ADDIN ZOTERO_ITEM CSL_CITATION {"citationID":"8pJugPrg","properties":{"formattedCitation":"(Gadelha et al., 2023; Zillo et al., 2014)","plainCitation":"(Gadelha et al., 2023; Zillo et al., 2014)","noteIndex":0},"citationItems":[{"id":27385,"uris":["http://zotero.org/users/7317906/items/943TJHQ8"],"itemData":{"id":27385,"type":"article-journal","abstract":"Endogenous Cushing's syndrome results from excess glucocorticoid secretion, which leads to a myriad of clinical manifestations, comorbidities, and increased mortality despite treatment. Molecular mechanisms and genetic alterations associated with different causes of Cushing's syndrome have been described in the last decade. Imaging modalities and biochemical testing have evolved; however, both the diagnosis and management of Cushing's syndrome remain challenging. Surgery is the preferred treatment for all causes, but medical therapy has markedly advanced, with new drug options becoming available. Nevertheless, several comorbidities remain even after patient remission, which can affect quality of life. Accurate and timely diagnosis and treatment are essential for mitigating chronic complications of excess glucocorticoids and improving patient quality of life. In this Seminar, we aim to update several important aspects of diagnosis, complications, and treatment of endogenous Cushing's syndrome of all causes.","container-title":"The Lancet","DOI":"10.1016/S0140-6736(23)01961-X","ISSN":"0140-6736","issue":"10418","journalAbbreviation":"The Lancet","page":"2237-2252","source":"ScienceDirect","title":"Cushing's syndrome","volume":"402","author":[{"family":"Gadelha","given":"Mônica"},{"family":"Gatto","given":"Federico"},{"family":"Wildemberg","given":"Luiz Eduardo"},{"family":"Fleseriu","given":"Maria"}],"issued":{"date-parts":[["2023",12,9]]},"citation-key":"gadelhaCushingsSyndrome2023"}},{"id":27398,"uris":["http://zotero.org/users/7317906/items/FN8C5BU6"],"itemData":{"id":27398,"type":"article-journal","abstract":"Although CD is less frequent in male patients, in this gender, it presents with more florid clinical manifestations and may imply more diagnostic difficulties.","container-title":"Clinical Endocrinology","issue":"3","language":"en","page":"403-10","source":"pubmed-ncbi-nlm-nih-gov.proxy.lib.umich.edu","title":"Diagnosis and complications of Cushing's disease: gender-related differences","title-short":"Diagnosis and complications of Cushing's disease","volume":"80","author":[{"family":"Zillo","given":"M"},{"family":"Barbot","given":"M"},{"family":"Ceccato","given":"F"},{"family":"Camozzi","given":"CamoVzzi"},{"family":"Bilora","given":"F"},{"family":"Casonato","given":"A"},{"family":"Frigo","given":"AC"},{"family":"Albiger","given":"N"},{"family":"Daidone","given":"V"},{"family":"Mazzai","given":"Mazzai"},{"family":"Mantero","given":"F"},{"family":"Scaroni","given":"C"}],"issued":{"date-parts":[["2014"]]},"citation-key":"zilloDiagnosisComplicationsCushings2014"}}],"schema":"https://github.com/citation-style-language/schema/raw/master/csl-citation.json"} </w:instrText>
+      </w:r>
+      <w:r>
+        <w:fldChar w:fldCharType="separate"/>
+      </w:r>
+      <w:r>
+        <w:rPr>
+          <w:noProof/>
+        </w:rPr>
+        <w:t>(Gadelha et al., 2023; Zillo et al., 2014)</w:t>
+      </w:r>
+      <w:r>
+        <w:fldChar w:fldCharType="end"/>
+      </w:r>
+      <w:r>
+        <w:t xml:space="preserve">. </w:t>
+      </w:r>
+      <w:r>
+        <w:t xml:space="preserve"> Patients </w:t>
+      </w:r>
+      <w:r>
+        <w:t xml:space="preserve">with Cushing’s disease </w:t>
+      </w:r>
+      <w:r>
+        <w:t xml:space="preserve">often experience </w:t>
+      </w:r>
+      <w:r>
+        <w:t>hypertension</w:t>
+      </w:r>
+      <w:r>
+        <w:t>,</w:t>
+      </w:r>
+      <w:r>
+        <w:t xml:space="preserve"> myocardial infractions,</w:t>
+      </w:r>
+      <w:r>
+        <w:t xml:space="preserve"> </w:t>
+      </w:r>
+      <w:r>
+        <w:t>MASLD</w:t>
+      </w:r>
+      <w:r>
+        <w:t xml:space="preserve">, weight gain, and hyperglycemia </w:t>
+      </w:r>
+      <w:r>
+        <w:fldChar w:fldCharType="begin"/>
+      </w:r>
+      <w:r>
+        <w:instrText xml:space="preserve"> ADDIN ZOTERO_ITEM CSL_CITATION {"citationID":"rmXVU7rv","properties":{"formattedCitation":"(Braun et al., 2019; DeFronzo &amp; Auchus, 2025; Giordano et al., 2011)","plainCitation":"(Braun et al., 2019; DeFronzo &amp; Auchus, 2025; Giordano et al., 2011)","noteIndex":0},"citationItems":[{"id":27407,"uris":["http://zotero.org/users/7317906/items/T3P5KXQY"],"itemData":{"id":27407,"type":"article-journal","abstract":"Cushing's syndrome (CS) is a classical rare disease: it is often suspected in patients who do not have the disease; at the same time, it takes a mean of 3 years to diagnose CS in affected individuals. The main reason is the extreme rarity (1–3/million/year) in combination with the lack of a single lead symptom. CS has to be suspected when a combination of signs and symptoms is present, which together make up the characteristic phenotype of cortisol excess. Unusual fat distribution affecting the face, neck, and trunk; skin changes including plethora, acne, hirsutism, livid striae, and easy bruising; and signs of protein catabolism such as thinned and vulnerable skin, osteoporotic fractures, and proximal myopathy indicate the need for biochemical screening for CS. In contrast, common symptoms like hypertension, weight gain, or diabetes also occur quite frequently in the general population and per se do not justify biochemical testing. First-line screening tests include urinary free cortisol excretion, dexamethasone suppression testing, and late-night salivary cortisol measurements. All three tests have overall reasonable sensitivity and specificity, and first-line testing should be selected on the basis of the physiologic conditions of the patient, drug intake, and available laboratory quality control measures. Two normal test results usually exclude the presence of CS. Other tests and laboratory parameters like the high-dose dexamethasone suppression test, plasma ACTH, the CRH test, and the bilateral inferior petrosal sinus sampling are not part of the initial biochemical screening. As a general rule, biochemical screening should only be performed if the pre-test probability for CS is reasonably high. This article provides an overview about the current standard in the diagnosis of CS starting with clinical scores and screenings, the clinical signs, relevant differential diagnoses, the first-line biochemical screening, and ending with a few exceptional cases.","container-title":"Frontiers in Endocrinology","DOI":"10.3389/fendo.2019.00766","ISSN":"1664-2392","journalAbbreviation":"Front Endocrinol (Lausanne)","note":"PMID: 31787931\nPMCID: PMC6856055","page":"766","source":"PubMed Central","title":"Toward a Diagnostic Score in Cushing's Syndrome","volume":"10","author":[{"family":"Braun","given":"Leah T."},{"family":"Riester","given":"Anna"},{"family":"Oßwald-Kopp","given":"Andrea"},{"family":"Fazel","given":"Julia"},{"family":"Rubinstein","given":"German"},{"family":"Bidlingmaier","given":"Martin"},{"family":"Beuschlein","given":"Felix"},{"family":"Reincke","given":"Martin"}],"issued":{"date-parts":[["2019",11,8]]},"citation-key":"braunDiagnosticScoreCushings2019"}},{"id":27412,"uris":["http://zotero.org/users/7317906/items/3KUT7EVD"],"itemData":{"id":27412,"type":"article-journal","abstract":"Until recently, the prevalence of endogenous Cushing syndrome has been considered to be low. However, improved diagnostic strategies and increased awareness have broadened our understanding of hypercortisolism and its role in the pathophysiology of type 2 diabetes, obesity, hypertension, and cardiovascular disease. Recent studies from Europe, South America, and the U.S. have demonstrated that a significant percentage of individuals with difficult-to-control type 2 diabetes, despite treatment with multiple glucose-lowering agents, have hypercortisolism as a causative factor in their poorly managed diabetes. In this review, we examine the pathophysiologic mechanisms via which excess cortisol contributes to the impairment in glucose homeostasis and recommend that hypercortisolism be added to the Ominous Octet to form the Noxious Nine as the pathophysiologic foundation for the development of type 2 diabetes.","container-title":"Diabetes","DOI":"10.2337/db25-0120","ISSN":"0012-1797","issue":"12","journalAbbreviation":"Diabetes","note":"PMID: 40663715\nPMCID: PMC12645169","page":"2168-2178","source":"PubMed Central","title":"Cushing Syndrome, Hypercortisolism, and Glucose Homeostasis: A Review","title-short":"Cushing Syndrome, Hypercortisolism, and Glucose Homeostasis","volume":"74","author":[{"family":"DeFronzo","given":"Ralph A."},{"family":"Auchus","given":"Richard J."}],"issued":{"date-parts":[["2025",7,15]]},"citation-key":"defronzoCushingSyndromeHypercortisolism2025"}},{"id":27402,"uris":["http://zotero.org/users/7317906/items/VUQD2ZQG"],"itemData":{"id":27402,"type":"article-journal","abstract":"Objective Cushing’s syndrome is associated with several comorbidities responsible for the increased cardiovascular risk, not only during the active phase but also after disease remission. Design In 29 patients with Cushing’s syndrome (14 Cushing’s diseases and 15 adrenal adenomas), waist circumference, fasting and 2-h glucose after oral glucose tolerance test (OGTT), lipid profile and blood pressure were evaluated during the active disease and 1 year after remission and compared with those in 29 sex-, age- and BMI-matched controls. Results During the active disease, waist circumference, 2-h glucose after OGTT, total and LDL cholesterol were higher in patients with Cushing’s syndrome than in controls (P &lt; 0·001) but similar in Cushing’s disease and adrenal adenomas. The prevalence of impaired glucose tolerance (IGT), diabetes mellitus, dyslipidaemia and hypertension was higher (P &lt; 0·001) in patients with Cushing’s syndrome (27%, 24%, 59% and 72%) than in controls (10%, 0%, 21% and 10%), with no significant difference between Cushing’s disease and adrenal adenomas. One year following hormonal remission, waist circumference persisted higher than in controls (P &lt; 0·05) in both Cushing’s disease and adrenal adenomas. Metabolic and cardiovascular abnormalities were still present in both groups, although with a lower prevalence, as well as with a more marked decrease in adrenal adenomas (P &lt; 0·05 vs active disease for IGT, dyslipidaemia and hypertension). Conclusions These results show that chronic hypercortisolism, independently of its aetiology, contributes to metabolic impairment and increased cardiovascular risk, while these abnormalities mostly persist in patients with previous Cushing’s disease after hormonal remission. Pituitary hormonal deficiencies, hormonal replacement treatments and/or incomplete cure from Cushing’s disease may account for these findings.","container-title":"Clinical Endocrinology","DOI":"10.1111/j.1365-2265.2011.04055.x","ISSN":"1365-2265","issue":"3","language":"en","license":"© 2011 Blackwell Publishing Ltd","note":"_eprint: https://onlinelibrary.wiley.com/doi/pdf/10.1111/j.1365-2265.2011.04055.x","page":"354-360","source":"Wiley Online Library","title":"Metabolic and cardiovascular outcomes in patients with Cushing’s syndrome of different aetiologies during active disease and 1 year after remission","volume":"75","author":[{"family":"Giordano","given":"Roberta"},{"family":"Picu","given":"Andreea"},{"family":"Marinazzo","given":"Elisa"},{"family":"D’Angelo","given":"Valentina"},{"family":"Berardelli","given":"Rita"},{"family":"Karamouzis","given":"Ioannis"},{"family":"Forno","given":"Daniela"},{"family":"Zinnà","given":"Domenico"},{"family":"Maccario","given":"Mauro"},{"family":"Ghigo","given":"Ezio"},{"family":"Arvat","given":"Emanuela"}],"issued":{"date-parts":[["2011"]]},"citation-key":"giordanoMetabolicCardiovascularOutcomes2011"}}],"schema":"https://github.com/citation-style-language/schema/raw/master/csl-citation.json"} </w:instrText>
+      </w:r>
+      <w:r>
+        <w:fldChar w:fldCharType="separate"/>
+      </w:r>
+      <w:r>
+        <w:rPr>
+          <w:noProof/>
+        </w:rPr>
+        <w:t>(Braun et al., 2019; DeFronzo &amp; Auchus, 2025; Giordano et al., 2011)</w:t>
+      </w:r>
+      <w:r>
+        <w:fldChar w:fldCharType="end"/>
+      </w:r>
+      <w:r>
+        <w:t>.</w:t>
+      </w:r>
+      <w:r>
+        <w:t xml:space="preserve"> </w:t>
+      </w:r>
+    </w:p>
+    <w:p>
+      <w:r>
+        <w:t xml:space="preserve">Weight gain, and obesity, are classic clinical manifestations of Cushing’s disease </w:t>
+      </w:r>
+      <w:r>
+        <w:fldChar w:fldCharType="begin"/>
+      </w:r>
+      <w:r>
+        <w:instrText xml:space="preserve"> ADDIN ZOTERO_ITEM CSL_CITATION {"citationID":"3e07jI8Y","properties":{"formattedCitation":"(Giordano et al., 2011; Nieman, 2002)","plainCitation":"(Giordano et al., 2011; Nieman, 2002)","noteIndex":0},"citationItems":[{"id":27402,"uris":["http://zotero.org/users/7317906/items/VUQD2ZQG"],"itemData":{"id":27402,"type":"article-journal","abstract":"Objective Cushing’s syndrome is associated with several comorbidities responsible for the increased cardiovascular risk, not only during the active phase but also after disease remission. Design In 29 patients with Cushing’s syndrome (14 Cushing’s diseases and 15 adrenal adenomas), waist circumference, fasting and 2-h glucose after oral glucose tolerance test (OGTT), lipid profile and blood pressure were evaluated during the active disease and 1 year after remission and compared with those in 29 sex-, age- and BMI-matched controls. Results During the active disease, waist circumference, 2-h glucose after OGTT, total and LDL cholesterol were higher in patients with Cushing’s syndrome than in controls (P &lt; 0·001) but similar in Cushing’s disease and adrenal adenomas. The prevalence of impaired glucose tolerance (IGT), diabetes mellitus, dyslipidaemia and hypertension was higher (P &lt; 0·001) in patients with Cushing’s syndrome (27%, 24%, 59% and 72%) than in controls (10%, 0%, 21% and 10%), with no significant difference between Cushing’s disease and adrenal adenomas. One year following hormonal remission, waist circumference persisted higher than in controls (P &lt; 0·05) in both Cushing’s disease and adrenal adenomas. Metabolic and cardiovascular abnormalities were still present in both groups, although with a lower prevalence, as well as with a more marked decrease in adrenal adenomas (P &lt; 0·05 vs active disease for IGT, dyslipidaemia and hypertension). Conclusions These results show that chronic hypercortisolism, independently of its aetiology, contributes to metabolic impairment and increased cardiovascular risk, while these abnormalities mostly persist in patients with previous Cushing’s disease after hormonal remission. Pituitary hormonal deficiencies, hormonal replacement treatments and/or incomplete cure from Cushing’s disease may account for these findings.","container-title":"Clinical Endocrinology","DOI":"10.1111/j.1365-2265.2011.04055.x","ISSN":"1365-2265","issue":"3","language":"en","license":"© 2011 Blackwell Publishing Ltd","note":"_eprint: https://onlinelibrary.wiley.com/doi/pdf/10.1111/j.1365-2265.2011.04055.x","page":"354-360","source":"Wiley Online Library","title":"Metabolic and cardiovascular outcomes in patients with Cushing’s syndrome of different aetiologies during active disease and 1 year after remission","volume":"75","author":[{"family":"Giordano","given":"Roberta"},{"family":"Picu","given":"Andreea"},{"family":"Marinazzo","given":"Elisa"},{"family":"D’Angelo","given":"Valentina"},{"family":"Berardelli","given":"Rita"},{"family":"Karamouzis","given":"Ioannis"},{"family":"Forno","given":"Daniela"},{"family":"Zinnà","given":"Domenico"},{"family":"Maccario","given":"Mauro"},{"family":"Ghigo","given":"Ezio"},{"family":"Arvat","given":"Emanuela"}],"issued":{"date-parts":[["2011"]]},"citation-key":"giordanoMetabolicCardiovascularOutcomes2011"}},{"id":27410,"uris":["http://zotero.org/users/7317906/items/HGJSN792"],"itemData":{"id":27410,"type":"article-journal","abstract":"Abstract: The diagnosis of Cushing's syndrome rests on the demonstration of clinical features and biochemical abnormalities that reflect hypercortisolism. If a patient presents with typical clinical features such as weight gain with truncal obesity and supraclavicular fat deposition, wide purple striae, and proximal muscle weakness, the diagnosis is clear-cut and is nearly always substantiated by a 24-hour urine free cortisol excretion value more than four times the normal level. However, many patients present with signs and symptoms that are common in the general population, such as hypertension, generalized weight gain, reproductive abnormalities, and depression. Many of these patients have normal cortisol excretion and do not have Cushing's syndrome. Others have mild hypercortisolism caused by psychiatric disorders, obligate exercise, morbid obesity, sleep apnea, or uncontrolled diabetes mellitus. These patients may be confused with those with the true Cushing's syndrome, and thus are considered to have a “pseudo-Cushing” state. Additional observation over time, and testing with midnight cortisol measurements, the 2-day-2-mg dexamethasone suppression test, or the dexamethasone suppression-CRH stimulation test may be useful to identify true Cushing's syndrome in these patients.","container-title":"Annals of the New York Academy of Sciences","DOI":"10.1111/j.1749-6632.2002.tb04417.x","ISSN":"1749-6632","issue":"1","language":"en","note":"_eprint: https://nyaspubs.onlinelibrary.wiley.com/doi/pdf/10.1111/j.1749-6632.2002.tb04417.x","page":"112-118","source":"Wiley Online Library","title":"Diagnostic Tests for Cushing's Syndrome","volume":"970","author":[{"family":"Nieman","given":"Lynnette K."}],"issued":{"date-parts":[["2002"]]},"citation-key":"niemanDiagnosticTestsCushings2002"}}],"schema":"https://github.com/citation-style-language/schema/raw/master/csl-citation.json"} </w:instrText>
+      </w:r>
+      <w:r>
+        <w:fldChar w:fldCharType="separate"/>
+      </w:r>
+      <w:r>
+        <w:rPr>
+          <w:noProof/>
+        </w:rPr>
+        <w:t>(Giordano et al., 2011; Nieman, 2002)</w:t>
+      </w:r>
+      <w:r>
+        <w:fldChar w:fldCharType="end"/>
+      </w:r>
+      <w:r>
+        <w:t>.</w:t>
+      </w:r>
+      <w:r>
+        <w:t xml:space="preserve"> </w:t>
+      </w:r>
+      <w:r>
+        <w:t xml:space="preserve">70-95% of patients experienced weight gain, 21-48% of patients became overweight, and 32-41% of patients became obese </w:t>
+      </w:r>
+      <w:r>
+        <w:fldChar w:fldCharType="begin"/>
+      </w:r>
+      <w:r>
+        <w:instrText xml:space="preserve"> ADDIN ZOTERO_ITEM CSL_CITATION {"citationID":"A8yXXs5g","properties":{"formattedCitation":"(Braun et al., 2019)","plainCitation":"(Braun et al., 2019)","noteIndex":0},"citationItems":[{"id":27407,"uris":["http://zotero.org/users/7317906/items/T3P5KXQY"],"itemData":{"id":27407,"type":"article-journal","abstract":"Cushing's syndrome (CS) is a classical rare disease: it is often suspected in patients who do not have the disease; at the same time, it takes a mean of 3 years to diagnose CS in affected individuals. The main reason is the extreme rarity (1–3/million/year) in combination with the lack of a single lead symptom. CS has to be suspected when a combination of signs and symptoms is present, which together make up the characteristic phenotype of cortisol excess. Unusual fat distribution affecting the face, neck, and trunk; skin changes including plethora, acne, hirsutism, livid striae, and easy bruising; and signs of protein catabolism such as thinned and vulnerable skin, osteoporotic fractures, and proximal myopathy indicate the need for biochemical screening for CS. In contrast, common symptoms like hypertension, weight gain, or diabetes also occur quite frequently in the general population and per se do not justify biochemical testing. First-line screening tests include urinary free cortisol excretion, dexamethasone suppression testing, and late-night salivary cortisol measurements. All three tests have overall reasonable sensitivity and specificity, and first-line testing should be selected on the basis of the physiologic conditions of the patient, drug intake, and available laboratory quality control measures. Two normal test results usually exclude the presence of CS. Other tests and laboratory parameters like the high-dose dexamethasone suppression test, plasma ACTH, the CRH test, and the bilateral inferior petrosal sinus sampling are not part of the initial biochemical screening. As a general rule, biochemical screening should only be performed if the pre-test probability for CS is reasonably high. This article provides an overview about the current standard in the diagnosis of CS starting with clinical scores and screenings, the clinical signs, relevant differential diagnoses, the first-line biochemical screening, and ending with a few exceptional cases.","container-title":"Frontiers in Endocrinology","DOI":"10.3389/fendo.2019.00766","ISSN":"1664-2392","journalAbbreviation":"Front Endocrinol (Lausanne)","note":"PMID: 31787931\nPMCID: PMC6856055","page":"766","source":"PubMed Central","title":"Toward a Diagnostic Score in Cushing's Syndrome","volume":"10","author":[{"family":"Braun","given":"Leah T."},{"family":"Riester","given":"Anna"},{"family":"Oßwald-Kopp","given":"Andrea"},{"family":"Fazel","given":"Julia"},{"family":"Rubinstein","given":"German"},{"family":"Bidlingmaier","given":"Martin"},{"family":"Beuschlein","given":"Felix"},{"family":"Reincke","given":"Martin"}],"issued":{"date-parts":[["2019",11,8]]},"citation-key":"braunDiagnosticScoreCushings2019"}}],"schema":"https://github.com/citation-style-language/schema/raw/master/csl-citation.json"} </w:instrText>
+      </w:r>
+      <w:r>
+        <w:fldChar w:fldCharType="separate"/>
+      </w:r>
+      <w:r>
+        <w:rPr>
+          <w:noProof/>
+        </w:rPr>
+        <w:t>(Braun et al., 2019)</w:t>
+      </w:r>
+      <w:r>
+        <w:fldChar w:fldCharType="end"/>
+      </w:r>
+      <w:r>
+        <w:t xml:space="preserve">. </w:t>
+      </w:r>
+      <w:r>
+        <w:t xml:space="preserve">Obesity is also a leading cause of several of the Cushing’s </w:t>
+      </w:r>
+      <w:r>
+        <w:t>related</w:t>
+      </w:r>
+      <w:r>
+        <w:t xml:space="preserve"> complications.  As such i</w:t>
+      </w:r>
+      <w:r>
+        <w:t xml:space="preserve">t is difficult to discern </w:t>
+      </w:r>
+      <w:r>
+        <w:t xml:space="preserve">the obesity-independent from the obesity-dependent </w:t>
+      </w:r>
+      <w:r>
+        <w:t>pathophysiology</w:t>
+      </w:r>
+      <w:r>
+        <w:t xml:space="preserve"> of Cushing’s disease. </w:t>
+      </w:r>
+      <w:r>
+        <w:t xml:space="preserve">To address this gap, </w:t>
+      </w:r>
+      <w:r>
+        <w:t>we performed a</w:t>
+      </w:r>
+      <w:r>
+        <w:t xml:space="preserve"> retrospective</w:t>
+      </w:r>
+      <w:r>
+        <w:t>,</w:t>
+      </w:r>
+      <w:r>
+        <w:t xml:space="preserve"> case-control study</w:t>
+      </w:r>
+      <w:r>
+        <w:t xml:space="preserve"> from electronic medical records.  We</w:t>
+      </w:r>
+      <w:r>
+        <w:t xml:space="preserve"> </w:t>
+      </w:r>
+      <w:r>
+        <w:t xml:space="preserve">examined how obesity status modified the effects of Cushing’s disease </w:t>
+      </w:r>
+      <w:r>
+        <w:t>by evaluating</w:t>
+      </w:r>
+      <w:r>
+        <w:t xml:space="preserve"> Cushing’s </w:t>
+      </w:r>
+      <w:r>
+        <w:t>patients and matched controls with and without obesity</w:t>
+      </w:r>
+      <w:r>
+        <w:t>.</w:t>
+      </w:r>
+    </w:p>
+    <w:p/>
+    <w:p>
+      <w:pPr>
+        <w:pStyle w:val="Heading1"/>
+      </w:pPr>
+      <w:r>
+        <w:t>Methods</w:t>
+      </w:r>
+    </w:p>
+    <w:p>
+      <w:pPr>
+        <w:rPr>
+          <w:b/>
+          <w:bCs/>
+        </w:rPr>
+      </w:pPr>
+      <w:r>
+        <w:rPr>
+          <w:b/>
+          <w:bCs/>
+        </w:rPr>
+        <w:t>Study Participants</w:t>
+      </w:r>
+      <w:r>
+        <w:rPr>
+          <w:b/>
+          <w:bCs/>
+        </w:rPr>
+        <w:t xml:space="preserve">. </w:t>
+      </w:r>
+      <w:r>
+        <w:t xml:space="preserve">This study was reviewed by the University of Michigan </w:t>
+      </w:r>
+      <w:r>
+        <w:t>Institutional</w:t>
+      </w:r>
+      <w:r>
+        <w:t xml:space="preserve"> Review Board (</w:t>
+      </w:r>
+      <w:r>
+        <w:t>HUM00247814</w:t>
+      </w:r>
+      <w:r>
+        <w:t xml:space="preserve">) </w:t>
+      </w:r>
+      <w:r>
+        <w:t xml:space="preserve">and </w:t>
+      </w:r>
+      <w:r>
+        <w:t>adjudicated as not regulated.</w:t>
+      </w:r>
+    </w:p>
+    <w:p>
+      <w:r>
+        <w:t xml:space="preserve">To identify patients with Cushing’s disease, we evaluated electronic health records </w:t>
+      </w:r>
+      <w:r>
+        <w:t>for participants at</w:t>
+      </w:r>
+      <w:r>
+        <w:t xml:space="preserve"> Michigan Medicine dating back to January 1, 2000, searching for diagnoses of Cushing’s disease </w:t>
+      </w:r>
+      <w:r>
+        <w:t>(</w:t>
+      </w:r>
+      <w:r>
+        <w:t xml:space="preserve">including ICD Codes </w:t>
+      </w:r>
+      <w:r>
+        <w:t xml:space="preserve">E24.0, </w:t>
+      </w:r>
+      <w:r>
+        <w:t xml:space="preserve">and </w:t>
+      </w:r>
+      <w:r>
+        <w:t>255.0</w:t>
+      </w:r>
+      <w:r>
+        <w:t>)</w:t>
+      </w:r>
+      <w:r>
+        <w:t xml:space="preserve">.  </w:t>
+      </w:r>
+      <w:r>
+        <w:t xml:space="preserve"> </w:t>
+      </w:r>
+      <w:r>
+        <w:t>To identify when patients were treated</w:t>
+      </w:r>
+      <w:r>
+        <w:t xml:space="preserve"> via surgery,</w:t>
+      </w:r>
+      <w:r>
+        <w:t xml:space="preserve"> we included procedure codes </w:t>
       </w:r>
       <w:commentRangeStart w:id="0"/>
       <w:r>
-        <w:t>sources</w:t>
+        <w:t>YYY</w:t>
       </w:r>
       <w:commentRangeEnd w:id="0"/>
       <w:r>
@@ -34,29 +387,200 @@
         <w:commentReference w:id="0"/>
       </w:r>
       <w:r>
-        <w:t>).</w:t>
-      </w:r>
-      <w:r>
-        <w:t xml:space="preserve"> This condition results from excess adrenocorticotropic </w:t>
-      </w:r>
-      <w:r>
-        <w:t xml:space="preserve">(ACTH) </w:t>
-      </w:r>
-      <w:r>
-        <w:t xml:space="preserve">hormone secretion </w:t>
-      </w:r>
-      <w:r>
-        <w:t xml:space="preserve">from the </w:t>
-      </w:r>
-      <w:r>
-        <w:t xml:space="preserve">pituitary gland, leading the adrenal glands to produce excess cortisol. </w:t>
-      </w:r>
-      <w:r>
-        <w:t>This is often due to the presence of a pituitary adenoma (</w:t>
+        <w:t>.</w:t>
+      </w:r>
+      <w:r>
+        <w:t xml:space="preserve">  We excluded participants if they </w:t>
+      </w:r>
+      <w:r>
+        <w:t>did not have a Cushing’s disease diagnosis, treatment date, lab history, or relevant demographic data documented.</w:t>
+      </w:r>
+      <w:r>
+        <w:t xml:space="preserve"> Race and ethnicity were self-reported, with groups of &lt;10 aggregated into the other category.</w:t>
+      </w:r>
+      <w:r>
+        <w:t xml:space="preserve"> </w:t>
+      </w:r>
+    </w:p>
+    <w:p>
+      <w:r>
+        <w:lastRenderedPageBreak/>
+        <w:t xml:space="preserve">To identify controls, </w:t>
+      </w:r>
+      <w:r>
+        <w:t>we used</w:t>
+      </w:r>
+      <w:r>
+        <w:t xml:space="preserve"> the </w:t>
+      </w:r>
+      <w:r>
+        <w:t xml:space="preserve"> MatchIt </w:t>
+      </w:r>
+      <w:r>
+        <w:t xml:space="preserve">package </w:t>
+      </w:r>
+      <w:r>
+        <w:t xml:space="preserve">(version </w:t>
+      </w:r>
+      <w:r>
+        <w:t xml:space="preserve">4.7.1; </w:t>
+      </w:r>
+      <w:r>
+        <w:fldChar w:fldCharType="begin"/>
+      </w:r>
+      <w:r>
+        <w:instrText xml:space="preserve"> ADDIN ZOTERO_ITEM CSL_CITATION {"citationID":"Pl5Gc3F1","properties":{"formattedCitation":"(Ho et al., 2011)","plainCitation":"(Ho et al., 2011)","noteIndex":0},"citationItems":[{"id":12196,"uris":["http://zotero.org/users/7317906/items/H5CAAL6F"],"itemData":{"id":12196,"type":"article-journal","abstract":"MatchIt implements the suggestions of Ho, Imai, King, and Stuart (2007) for improving parametric statistical models by preprocessing data with nonparametric matching methods. MatchIt implements a wide range of sophisticated matching methods, making it possible to greatly reduce the dependence of causal inferences on hard-to-justify, but commonly made, statistical modeling assumptions. The software also easily fits into existing research practices since, after preprocessing data with MatchIt, researchers can use whatever parametric model they would have used without MatchIt, but produce inferences with substantially more robustness and less sensitivity to modeling assumptions. MatchIt is an R program, and also works seamlessly with Zelig.","container-title":"Journal of Statistical Software","DOI":"10.18637/jss.v042.i08","ISSN":"1548-7660","language":"en","license":"Copyright (c) 2006 Daniel Ho, Kosuke Imai, Gary King, Elizabeth A. Stuart","page":"1-28","source":"www.jstatsoft.org","title":"MatchIt: Nonparametric Preprocessing for Parametric Causal Inference","title-short":"MatchIt","volume":"42","author":[{"family":"Ho","given":"Daniel"},{"family":"Imai","given":"Kosuke"},{"family":"King","given":"Gary"},{"family":"Stuart","given":"Elizabeth A."}],"issued":{"date-parts":[["2011",6,14]]},"citation-key":"hoMatchItNonparametricPreprocessing2011"}}],"schema":"https://github.com/citation-style-language/schema/raw/master/csl-citation.json"} </w:instrText>
+      </w:r>
+      <w:r>
+        <w:fldChar w:fldCharType="separate"/>
+      </w:r>
+      <w:r>
+        <w:rPr>
+          <w:noProof/>
+        </w:rPr>
+        <w:t>(Ho et al., 2011)</w:t>
+      </w:r>
+      <w:r>
+        <w:fldChar w:fldCharType="end"/>
+      </w:r>
+      <w:r>
+        <w:t>)</w:t>
+      </w:r>
+      <w:r>
+        <w:t>. F</w:t>
+      </w:r>
+      <w:r>
+        <w:t xml:space="preserve">or </w:t>
+      </w:r>
+      <w:r>
+        <w:t xml:space="preserve">each outcome we identified all Cushing’s cases </w:t>
+      </w:r>
+      <w:r>
+        <w:t xml:space="preserve">with that measurement </w:t>
+      </w:r>
+      <w:r>
+        <w:t xml:space="preserve">and potential controls with that measurement available. </w:t>
+      </w:r>
+      <w:r>
+        <w:t>For Cushing’s cases to be included they had to have had the laboratory measure</w:t>
+      </w:r>
+      <w:r>
+        <w:t>d</w:t>
+      </w:r>
+      <w:r>
+        <w:t xml:space="preserve"> </w:t>
+      </w:r>
+      <w:r>
+        <w:t>within a year</w:t>
+      </w:r>
+      <w:r>
+        <w:t xml:space="preserve"> </w:t>
+      </w:r>
+      <w:r>
+        <w:t>prior to surgical treatment</w:t>
+      </w:r>
+      <w:r>
+        <w:t>, taking the most recent value</w:t>
+      </w:r>
+      <w:r>
+        <w:t xml:space="preserve">.  </w:t>
+      </w:r>
+      <w:r>
+        <w:t>We performed nearest</w:t>
+      </w:r>
+      <w:r>
+        <w:rPr>
+          <w:rFonts w:ascii="Cambria Math" w:hAnsi="Cambria Math" w:cs="Cambria Math"/>
+        </w:rPr>
+        <w:t>‐</w:t>
+      </w:r>
+      <w:r>
+        <w:t xml:space="preserve">neighbor propensity score matching (ratio = </w:t>
+      </w:r>
+      <w:r>
+        <w:t>10:1</w:t>
+      </w:r>
+      <w:r>
+        <w:t xml:space="preserve">) with age in the </w:t>
+      </w:r>
+      <w:r>
+        <w:t>propensity score</w:t>
+      </w:r>
+      <w:r>
+        <w:t xml:space="preserve"> model and exact matching on gender and race/ethnicity</w:t>
+      </w:r>
+      <w:r>
+        <w:t xml:space="preserve"> from a pool of </w:t>
+      </w:r>
+      <w:r>
+        <w:t>98,436</w:t>
+      </w:r>
+      <w:r>
+        <w:t xml:space="preserve"> </w:t>
+      </w:r>
+      <w:r>
+        <w:t>Michigan Medicine patients</w:t>
+      </w:r>
+      <w:r>
+        <w:t xml:space="preserve">. This procedure was repeated separately for each outcome </w:t>
+      </w:r>
+      <w:r>
+        <w:t xml:space="preserve">as our </w:t>
+      </w:r>
+      <w:r>
+        <w:t>primary analys</w:t>
+      </w:r>
+      <w:r>
+        <w:t>e</w:t>
+      </w:r>
+      <w:r>
+        <w:t xml:space="preserve">s. </w:t>
+      </w:r>
+      <w:r>
+        <w:t xml:space="preserve"> The</w:t>
+      </w:r>
+      <w:r>
+        <w:t xml:space="preserve"> maximal</w:t>
+      </w:r>
+      <w:r>
+        <w:t xml:space="preserve"> post-matching standardized mean difference for </w:t>
+      </w:r>
+      <w:r>
+        <w:t>a</w:t>
+      </w:r>
+      <w:r>
+        <w:t xml:space="preserve">ge </w:t>
+      </w:r>
+      <w:r>
+        <w:t>was</w:t>
+      </w:r>
+      <w:r>
+        <w:t xml:space="preserve"> &lt;0.</w:t>
+      </w:r>
+      <w:r>
+        <w:t>05</w:t>
+      </w:r>
+      <w:r>
+        <w:t xml:space="preserve"> for all outcomes, indicating adequate balance</w:t>
+      </w:r>
+      <w:r>
+        <w:t xml:space="preserve"> (Supplementary Figure 1 and Supplementary Table 1)</w:t>
+      </w:r>
+      <w:r>
+        <w:t>.</w:t>
+      </w:r>
+      <w:r>
+        <w:t xml:space="preserve">  </w:t>
+      </w:r>
+      <w:r>
+        <w:t>We</w:t>
+      </w:r>
+      <w:r>
+        <w:t xml:space="preserve"> only included patients with BMI’s within the 5-75 range, and between 5-75 years of age. </w:t>
       </w:r>
       <w:commentRangeStart w:id="1"/>
       <w:r>
-        <w:t>sources</w:t>
+        <w:t xml:space="preserve">Finally, we also only included patients within the 2022-2025 year range. </w:t>
       </w:r>
       <w:commentRangeEnd w:id="1"/>
       <w:r>
@@ -68,10 +592,140 @@
         <w:commentReference w:id="1"/>
       </w:r>
       <w:r>
+        <w:t>This was done to create a data pull request that was less than 100,000 people, which was necessary with the Data Direct software used.</w:t>
+      </w:r>
+    </w:p>
+    <w:p>
+      <w:r>
+        <w:t>BMI was not included in the propensity score because we aimed to evaluate obesity as a moderator of the effects of Cushing’s disease</w:t>
+      </w:r>
+      <w:r>
+        <w:t>. Subsequent</w:t>
+      </w:r>
+      <w:r>
+        <w:t xml:space="preserve"> analyses were stratified by obesity (BMI ≥30 kg/m²). Within each obesity stratum, BMI was included as a covariate in sensitivity models.</w:t>
+      </w:r>
+    </w:p>
+    <w:p>
+      <w:r>
+        <w:t>Mean arterial pressure was directly measured in the majority of cases. When MAP was missing but systolic and diastolic BP were available</w:t>
+      </w:r>
+      <w:r>
+        <w:t xml:space="preserve">, </w:t>
+      </w:r>
+      <w:r>
+        <w:t>MAP was calculated as (SBP + 2×DBP)/3. The calculated values showed high agreement with measured MAP (r=0.963, mean difference=1.32 ± 3.38 mmHg) in cases where both were available.</w:t>
+      </w:r>
+    </w:p>
+    <w:p>
+      <w:r>
+        <w:rPr>
+          <w:b/>
+          <w:bCs/>
+        </w:rPr>
+        <w:t>Statistical Analyses.</w:t>
+      </w:r>
+      <w:r>
+        <w:t xml:space="preserve">  Statistical significance</w:t>
+      </w:r>
+      <w:r>
+        <w:t xml:space="preserve"> for this stud</w:t>
+      </w:r>
+      <w:r>
+        <w:t xml:space="preserve"> was set at p&lt;0.05.  All analyses were performed using R version 4.4.0 </w:t>
+      </w:r>
+      <w:r>
+        <w:fldChar w:fldCharType="begin"/>
+      </w:r>
+      <w:r>
+        <w:instrText xml:space="preserve"> ADDIN ZOTERO_ITEM CSL_CITATION {"citationID":"UlCX6dpA","properties":{"formattedCitation":"(R Core Team, 2019)","plainCitation":"(R Core Team, 2019)","noteIndex":0},"citationItems":[{"id":8230,"uris":["http://zotero.org/users/7317906/items/3HZT7KXK"],"itemData":{"id":8230,"type":"document","note":"Citation Key: base\npublisher-place: Vienna, Austria","publisher":"R Foundation for Statistical Computing","title":"R: A Language and Environment for Statistical Computing","URL":"http://www.r-project.org/","author":[{"literal":"R Core Team"}],"accessed":{"date-parts":[["2010",10,22]]},"issued":{"date-parts":[["2019"]]},"citation-key":"base"}}],"schema":"https://github.com/citation-style-language/schema/raw/master/csl-citation.json"} </w:instrText>
+      </w:r>
+      <w:r>
+        <w:fldChar w:fldCharType="separate"/>
+      </w:r>
+      <w:r>
+        <w:rPr>
+          <w:noProof/>
+        </w:rPr>
+        <w:t>(R Core Team, 2019)</w:t>
+      </w:r>
+      <w:r>
+        <w:fldChar w:fldCharType="end"/>
+      </w:r>
+      <w:r>
+        <w:t xml:space="preserve">.  For participant demographics, Kruskal-Wallis or Mann-Whitney tests were used as both BMI and participant Age were not normally distributed (p&lt;0.05 via Shapiro-Wilk tests).  </w:t>
+      </w:r>
+      <w:r>
+        <w:t>χ</w:t>
+      </w:r>
+      <w:r>
+        <w:rPr>
+          <w:vertAlign w:val="superscript"/>
+        </w:rPr>
+        <w:t>2</w:t>
+      </w:r>
+      <w:r>
+        <w:t xml:space="preserve"> tests were used to compare counts across groups</w:t>
+      </w:r>
+      <w:r>
+        <w:t xml:space="preserve"> unless counts were expected to be under five per group, in which case Fisher’s exact test was used</w:t>
+      </w:r>
+      <w:r>
+        <w:t>.</w:t>
+      </w:r>
+    </w:p>
+    <w:p>
+      <w:pPr>
+        <w:pStyle w:val="Heading1"/>
+      </w:pPr>
+      <w:r>
+        <w:t>Results</w:t>
+      </w:r>
+    </w:p>
+    <w:p>
+      <w:pPr>
+        <w:pStyle w:val="Heading2"/>
+        <w:rPr>
+          <w:b/>
+          <w:bCs/>
+        </w:rPr>
+      </w:pPr>
+      <w:r>
+        <w:rPr>
+          <w:rStyle w:val="Strong"/>
+          <w:b w:val="0"/>
+          <w:bCs w:val="0"/>
+        </w:rPr>
+        <w:t>Study population</w:t>
+      </w:r>
+    </w:p>
+    <w:p>
+      <w:r>
+        <w:t xml:space="preserve">As shown in Figure 1, we identified </w:t>
+      </w:r>
+      <w:r>
+        <w:t xml:space="preserve">2,893 </w:t>
+      </w:r>
+      <w:r>
+        <w:t xml:space="preserve">participants with diagnoses of Cushing’s disease.  Their average age at diagnosis was </w:t>
+      </w:r>
+      <w:r>
+        <w:t>46.26</w:t>
+      </w:r>
+      <w:r>
+        <w:t xml:space="preserve"> (+/- </w:t>
+      </w:r>
+      <w:r>
+        <w:t>15.53</w:t>
+      </w:r>
+      <w:r>
         <w:t xml:space="preserve">). </w:t>
       </w:r>
       <w:r>
-        <w:t>Cushing’s disease also occurs far more commonly in women, with a female-to-male ratio of 4:1 (</w:t>
+        <w:t xml:space="preserve">There were 287 female participants, and 72 male participants (80%,20%). </w:t>
+      </w:r>
+      <w:r>
+        <w:t>This is consistent with the gender difference in diagnosis of 4:1 seen in previous studies (</w:t>
       </w:r>
       <w:commentRangeStart w:id="2"/>
       <w:r>
@@ -87,33 +741,29 @@
         <w:commentReference w:id="2"/>
       </w:r>
       <w:r>
-        <w:t>).</w:t>
-      </w:r>
-      <w:r>
-        <w:t xml:space="preserve"> Patients often experience </w:t>
-      </w:r>
-      <w:r>
-        <w:t>hypertension</w:t>
-      </w:r>
-      <w:r>
-        <w:t>,</w:t>
-      </w:r>
-      <w:r>
-        <w:t xml:space="preserve"> myocardial infractions,</w:t>
-      </w:r>
-      <w:r>
-        <w:t xml:space="preserve"> </w:t>
-      </w:r>
-      <w:r>
-        <w:t>MASLD</w:t>
-      </w:r>
-      <w:r>
-        <w:t>, weight gain, and hyperglycemia (</w:t>
+        <w:t xml:space="preserve">). </w:t>
+      </w:r>
+      <w:r>
+        <w:t xml:space="preserve">The average BMI was 34.72 (+/- 13.78). The participant population was predominately White (87.19%), with the remaining </w:t>
+      </w:r>
+      <w:r>
+        <w:lastRenderedPageBreak/>
+        <w:t xml:space="preserve">participants identifying as Black (5.29%), Hispanic or Latino (2.79%), Asian (2.23%), or Other (2.51%). </w:t>
+      </w:r>
+    </w:p>
+    <w:p>
+      <w:r>
+        <w:t xml:space="preserve">To select our patient population, we first began with 5,428,302 participants from the electronic health records of Michigan Medicine. We then eliminated participants that did not have a Cushing’s disease diagnosis, leaving us with 2,893. </w:t>
+      </w:r>
+      <w:r>
+        <w:t>Next, we eliminated participants that did not have a documented treatment date after their diagnosis, giving us 476 participants. We then removed participants that did not have any lab history that we had access to, giving us 453 participants. Finally, we removed a final set of participants that did not have any demographic data, leaving us with our final participant population size of 365.</w:t>
+      </w:r>
+      <w:r>
+        <w:t xml:space="preserve"> This leaves us with a diagnosis rate of xx, as our first recorded patient diagnosis date was in the year </w:t>
       </w:r>
       <w:commentRangeStart w:id="3"/>
-      <w:commentRangeStart w:id="4"/>
-      <w:r>
-        <w:t>sources</w:t>
+      <w:r>
+        <w:t>xxx</w:t>
       </w:r>
       <w:commentRangeEnd w:id="3"/>
       <w:r>
@@ -124,6 +774,13 @@
         </w:rPr>
         <w:commentReference w:id="3"/>
       </w:r>
+      <w:r>
+        <w:t xml:space="preserve">. This is </w:t>
+      </w:r>
+      <w:commentRangeStart w:id="4"/>
+      <w:r>
+        <w:t xml:space="preserve">consistent </w:t>
+      </w:r>
       <w:commentRangeEnd w:id="4"/>
       <w:r>
         <w:rPr>
@@ -134,15 +791,10 @@
         <w:commentReference w:id="4"/>
       </w:r>
       <w:r>
-        <w:t>).</w:t>
-      </w:r>
-      <w:r>
-        <w:t xml:space="preserve"> </w:t>
-      </w:r>
-    </w:p>
-    <w:p>
-      <w:r>
-        <w:t>Weight gain, and obesity, are classic clinical manifestations of Cushing’s disease (</w:t>
+        <w:t xml:space="preserve">with the average incidence rate per year established in previous studies, which is </w:t>
+      </w:r>
+      <w:r>
+        <w:t>1.39-2.4 cases per million per year (</w:t>
       </w:r>
       <w:commentRangeStart w:id="5"/>
       <w:r>
@@ -158,17 +810,14 @@
         <w:commentReference w:id="5"/>
       </w:r>
       <w:r>
-        <w:t>).</w:t>
-      </w:r>
-      <w:r>
-        <w:t xml:space="preserve"> </w:t>
-      </w:r>
-      <w:r>
-        <w:t>In (author name/paper title), 70-95% of patients experienced weight gain, 21-48% of patients became overweight, and 32-41% of patients became obese (</w:t>
+        <w:t xml:space="preserve">). Of </w:t>
+      </w:r>
+      <w:r>
+        <w:t xml:space="preserve">these 365 participants, we were able to get glucose </w:t>
       </w:r>
       <w:commentRangeStart w:id="6"/>
       <w:r>
-        <w:t>source</w:t>
+        <w:t>measurements</w:t>
       </w:r>
       <w:commentRangeEnd w:id="6"/>
       <w:r>
@@ -180,53 +829,14 @@
         <w:commentReference w:id="6"/>
       </w:r>
       <w:r>
-        <w:t xml:space="preserve">). </w:t>
-      </w:r>
-      <w:r>
-        <w:t xml:space="preserve">Obesity is also a leading cause of several of the Cushing’s </w:t>
-      </w:r>
-      <w:r>
-        <w:t>related</w:t>
-      </w:r>
-      <w:r>
-        <w:t xml:space="preserve"> complications.  As such i</w:t>
-      </w:r>
-      <w:r>
-        <w:t xml:space="preserve">t is difficult to discern </w:t>
-      </w:r>
-      <w:r>
-        <w:t xml:space="preserve">the obesity-independent from the obesity-dependent </w:t>
-      </w:r>
-      <w:r>
-        <w:t>pathophysiology</w:t>
-      </w:r>
-      <w:r>
-        <w:t xml:space="preserve"> of Cushing’s disease. </w:t>
-      </w:r>
-      <w:r>
-        <w:t xml:space="preserve">To address this gap, </w:t>
-      </w:r>
-      <w:r>
-        <w:t>we performed a</w:t>
-      </w:r>
-      <w:r>
-        <w:t xml:space="preserve"> </w:t>
+        <w:t xml:space="preserve"> for all 365, HbA1c values for 17, ALT values for 84, </w:t>
+      </w:r>
+      <w:r>
+        <w:t xml:space="preserve">AST values for </w:t>
       </w:r>
       <w:commentRangeStart w:id="7"/>
       <w:r>
-        <w:t>retrospective</w:t>
-      </w:r>
-      <w:r>
-        <w:t>,</w:t>
-      </w:r>
-      <w:r>
-        <w:t xml:space="preserve"> case-control study</w:t>
-      </w:r>
-      <w:r>
-        <w:t xml:space="preserve"> from electronic medical records.  We</w:t>
-      </w:r>
-      <w:r>
-        <w:t xml:space="preserve"> </w:t>
+        <w:t>xx</w:t>
       </w:r>
       <w:commentRangeEnd w:id="7"/>
       <w:r>
@@ -238,20 +848,22 @@
         <w:commentReference w:id="7"/>
       </w:r>
       <w:r>
-        <w:t xml:space="preserve">examined how obesity status modified the effects of Cushing’s disease </w:t>
-      </w:r>
-      <w:r>
-        <w:t>by evaluating</w:t>
-      </w:r>
-      <w:r>
-        <w:t xml:space="preserve"> Cushing’s </w:t>
-      </w:r>
-      <w:r>
-        <w:t>patients and matched controls with and without obesity</w:t>
+        <w:t>, LDL-C values for 10, and blood pressure data for 306 participants.</w:t>
+      </w:r>
+      <w:r>
+        <w:t xml:space="preserve"> </w:t>
+      </w:r>
+    </w:p>
+    <w:p>
+      <w:r>
+        <w:t xml:space="preserve">To select our control group population, we began with the same 5,428,302 patients from the electronic health records of Michigan Medicine. We then eliminated 5,075,888 participants that were not part of Michigan Medicine primary care, leaving us with 352,414 participants. We then eliminated people that did not have a complete demographic set, leaving us with 181,624 participants. </w:t>
       </w:r>
       <w:commentRangeStart w:id="8"/>
       <w:r>
-        <w:t>.</w:t>
+        <w:t>We then eliminated participants for a variety of reasons to get our final control group population under 100,000. This was necessary as Data</w:t>
+      </w:r>
+      <w:r>
+        <w:t>Direct only allowed a maximum data pull of 100,000 or less.</w:t>
       </w:r>
       <w:commentRangeEnd w:id="8"/>
       <w:r>
@@ -262,94 +874,12 @@
         </w:rPr>
         <w:commentReference w:id="8"/>
       </w:r>
-    </w:p>
-    <w:p/>
-    <w:p>
-      <w:pPr>
-        <w:pStyle w:val="Heading1"/>
-      </w:pPr>
-      <w:r>
-        <w:t>Methods</w:t>
-      </w:r>
-    </w:p>
-    <w:p>
-      <w:pPr>
-        <w:rPr>
-          <w:b/>
-          <w:bCs/>
-        </w:rPr>
-      </w:pPr>
-      <w:r>
-        <w:rPr>
-          <w:b/>
-          <w:bCs/>
-        </w:rPr>
-        <w:t>Study Participants</w:t>
-      </w:r>
-      <w:r>
-        <w:rPr>
-          <w:b/>
-          <w:bCs/>
-        </w:rPr>
-        <w:t xml:space="preserve">. </w:t>
-      </w:r>
-      <w:r>
-        <w:t xml:space="preserve">This study was reviewed by the University of Michigan </w:t>
-      </w:r>
-      <w:r>
-        <w:t>Institutional</w:t>
-      </w:r>
-      <w:r>
-        <w:t xml:space="preserve"> Review Board (</w:t>
-      </w:r>
-      <w:r>
-        <w:t>HUM00247814</w:t>
-      </w:r>
-      <w:r>
-        <w:t xml:space="preserve">) </w:t>
-      </w:r>
-      <w:r>
-        <w:t xml:space="preserve">and </w:t>
-      </w:r>
-      <w:r>
-        <w:t>adjudicated as not regulated.</w:t>
-      </w:r>
-    </w:p>
-    <w:p>
-      <w:r>
-        <w:t xml:space="preserve">To identify patients with Cushing’s disease, we evaluated electronic health records </w:t>
-      </w:r>
-      <w:r>
-        <w:t>for participants at</w:t>
-      </w:r>
-      <w:r>
-        <w:t xml:space="preserve"> Michigan Medicine dating back to January 1, 2000, searching for diagnoses of Cushing’s disease including ICD Codes (</w:t>
-      </w:r>
-      <w:r>
-        <w:t>E24.0, 255.0</w:t>
-      </w:r>
-      <w:r>
-        <w:t>)</w:t>
-      </w:r>
-      <w:r>
-        <w:t xml:space="preserve">.  </w:t>
-      </w:r>
-      <w:r>
-        <w:t xml:space="preserve"> </w:t>
-      </w:r>
-      <w:r>
-        <w:t>To identify when patients were treated</w:t>
-      </w:r>
-      <w:r>
-        <w:t xml:space="preserve"> via surgery,</w:t>
-      </w:r>
-      <w:r>
-        <w:t xml:space="preserve"> we included procedure codes </w:t>
+      <w:r>
+        <w:t xml:space="preserve"> Among the criteria was the date of service must have been between 11/01/2022 – 03/24/2025, and participants must have been ages 18-100. Their BMI also had to be </w:t>
       </w:r>
       <w:commentRangeStart w:id="9"/>
-      <w:commentRangeStart w:id="10"/>
-      <w:r>
-        <w:t>YYY</w:t>
+      <w:r>
+        <w:t>within 5.0 and 75.0.</w:t>
       </w:r>
       <w:commentRangeEnd w:id="9"/>
       <w:r>
@@ -360,6 +890,921 @@
         </w:rPr>
         <w:commentReference w:id="9"/>
       </w:r>
+    </w:p>
+    <w:p/>
+    <w:p>
+      <w:pPr>
+        <w:pStyle w:val="Heading2"/>
+        <w:rPr>
+          <w:rStyle w:val="Strong"/>
+          <w:b w:val="0"/>
+          <w:bCs w:val="0"/>
+        </w:rPr>
+      </w:pPr>
+      <w:r>
+        <w:rPr>
+          <w:rStyle w:val="Strong"/>
+          <w:b w:val="0"/>
+          <w:bCs w:val="0"/>
+        </w:rPr>
+        <w:t>Participant characteristics</w:t>
+      </w:r>
+      <w:r>
+        <w:rPr>
+          <w:rStyle w:val="Strong"/>
+          <w:b w:val="0"/>
+          <w:bCs w:val="0"/>
+        </w:rPr>
+        <w:t xml:space="preserve"> </w:t>
+      </w:r>
+      <w:r>
+        <w:rPr>
+          <w:rStyle w:val="Strong"/>
+          <w:b w:val="0"/>
+          <w:bCs w:val="0"/>
+        </w:rPr>
+        <w:t xml:space="preserve">associated with </w:t>
+      </w:r>
+      <w:r>
+        <w:rPr>
+          <w:rStyle w:val="Strong"/>
+          <w:b w:val="0"/>
+          <w:bCs w:val="0"/>
+        </w:rPr>
+        <w:t xml:space="preserve">Cushing’s </w:t>
+      </w:r>
+      <w:r>
+        <w:rPr>
+          <w:rStyle w:val="Strong"/>
+          <w:b w:val="0"/>
+          <w:bCs w:val="0"/>
+        </w:rPr>
+        <w:t xml:space="preserve">disease </w:t>
+      </w:r>
+    </w:p>
+    <w:p>
+      <w:r>
+        <w:t xml:space="preserve">We performed outcome-specific propensity matching to identify appropriate controls, starting from those with generating exact matches for gender, race and ethnicity.  We then algorithmically matched for age, generating 10 controls for each case.  Matching was </w:t>
+      </w:r>
+      <w:r>
+        <w:t xml:space="preserve">effective </w:t>
+      </w:r>
+      <w:r>
+        <w:t xml:space="preserve"> with a </w:t>
+      </w:r>
+      <w:r>
+        <w:t>standardized mean difference</w:t>
+      </w:r>
+      <w:r>
+        <w:t xml:space="preserve"> for age of &lt;0.05 for each outcome (see </w:t>
+      </w:r>
+      <w:r>
+        <w:t xml:space="preserve">Table 1, </w:t>
+      </w:r>
+      <w:r>
+        <w:t xml:space="preserve">Supplementary </w:t>
+      </w:r>
+      <w:r>
+        <w:t xml:space="preserve">Figure </w:t>
+      </w:r>
+      <w:r>
+        <w:t>1</w:t>
+      </w:r>
+      <w:r>
+        <w:t xml:space="preserve"> and Supplementary Table S1).</w:t>
+      </w:r>
+    </w:p>
+    <w:p>
+      <w:r>
+        <w:t xml:space="preserve">Primary descriptive characteristics are </w:t>
+      </w:r>
+      <w:r>
+        <w:t>provided</w:t>
+      </w:r>
+      <w:r>
+        <w:t xml:space="preserve"> for all participants with any available laboratory measurement</w:t>
+      </w:r>
+      <w:r>
+        <w:t xml:space="preserve"> </w:t>
+      </w:r>
+      <w:r>
+        <w:t>(Table 1)</w:t>
+      </w:r>
+      <w:r>
+        <w:t xml:space="preserve">. </w:t>
+      </w:r>
+      <w:r>
+        <w:t>Outcome-specific matched sets are described in Supplementary Tables S2</w:t>
+      </w:r>
+      <w:r>
+        <w:t>A-E</w:t>
+      </w:r>
+      <w:r>
+        <w:t>.</w:t>
+      </w:r>
+      <w:r>
+        <w:t xml:space="preserve">   Here we reproduce several notable characteristics, including a higher prevalence of Cushing’s disease in females (284 vs 72</w:t>
+      </w:r>
+      <w:r>
+        <w:t>, p&lt;0.00</w:t>
+      </w:r>
+      <w:r>
+        <w:t>1</w:t>
+      </w:r>
+      <w:r>
+        <w:t>)</w:t>
+      </w:r>
+      <w:r>
+        <w:t xml:space="preserve">, </w:t>
+      </w:r>
+      <w:r>
+        <w:lastRenderedPageBreak/>
+        <w:t>consistent with the prior literature</w:t>
+      </w:r>
+      <w:r>
+        <w:t xml:space="preserve"> </w:t>
+      </w:r>
+      <w:r>
+        <w:fldChar w:fldCharType="begin"/>
+      </w:r>
+      <w:r>
+        <w:instrText xml:space="preserve"> ADDIN ZOTERO_ITEM CSL_CITATION {"citationID":"5iZIPs39","properties":{"formattedCitation":"(Alqeeq et al., 2024; Broder et al., 2015; Etxabe &amp; Vazquez, 1994; Matthiasdottir et al., 2024; Steffensen et al., 2010)","plainCitation":"(Alqeeq et al., 2024; Broder et al., 2015; Etxabe &amp; Vazquez, 1994; Matthiasdottir et al., 2024; Steffensen et al., 2010)","noteIndex":0},"citationItems":[{"id":27029,"uris":["http://zotero.org/users/7317906/items/5UXH2J3G"],"itemData":{"id":27029,"type":"article-journal","abstract":"BACKGROUND AND OBJECTIVES: Cushing's disease is a rare endocrine disorder. This review aimed to examine sex-specific differences in Cushing's disease.\nDESIGN AND SETTINGS: A meta-analysis was performed on published articles discussing the gender impact of Cushing's disease.\nMETHODS: A systematic search was conducted to identify studies from Medline, Embase, CENTRAL and Scopus. Nine studies enrolling 1047 patients diagnosed with Cushing's disease were included in this meta-analysis.\nRESULTS: Male patients presented at a younger age (MD [mean difference]=-5.43; 95% CI [-5.78, -5.08]; P&lt;.00001) than females. Male patients had a significantly higher prevalence of osteoporosis (RR [risk ratio]=1.75; 95% CI [1.36, 225]; P&lt;.0001) and hypokalemia (RR=1.66; 95% CI [1.27, 2.16]; P=.0002). In addition, males had significantly higher rates of negative magnetic resonance imaging (RR=1.53; 95% CI [1.18, 2.0]; P=.002). No sex difference was observed in the prevalence of diabetes (RR=0.92; 95% CI [0.70, 1.22]); P=.57) and dyslipidemia (RR=1.33; 95% CI [0.88, 2.0]; P=.17).\nCONCLUSION: Cushing's disease has a worse clinical presentation in males and more diagnostic difficulties compared to females.","container-title":"Annals of Saudi Medicine","DOI":"10.5144/0256-4947.2024.55","ISSN":"0975-4466","issue":"1","journalAbbreviation":"Ann Saudi Med","language":"eng","note":"PMID: 38311874\nPMCID: PMC10839456","page":"55-65","source":"PubMed","title":"Sex-related differences in Cushing's disease: a systematic review and meta-analysis","title-short":"Sex-related differences in Cushing's disease","volume":"44","author":[{"family":"Alqeeq","given":"Basel F."},{"family":"Ayyad","given":"Mohammed"},{"family":"Almadhoun","given":"Waseem J."},{"family":"Aboabdo","given":"Mohammad"},{"family":"Aldahdouh","given":"Mosheer S."},{"family":"Al-Tawil","given":"Mohammed"},{"family":"Al-Ghazali","given":"Ahmed M."}],"issued":{"date-parts":[["2024"]]},"citation-key":"alqeeqSexrelatedDifferencesCushings2024"}},{"id":27016,"uris":["http://zotero.org/users/7317906/items/RNS3FR6N"],"itemData":{"id":27016,"type":"article-journal","abstract":"PURPOSE: To estimate the incidence of Cushing's syndrome (CS) and Cushing's disease (CD) in the US.\nMETHODS: MarketScan Commercial database 2007-2010 (age &lt;65 years) was used. CS patients were defined with ≥2 claims of CS diagnosis, while CD patients were defined with CS plus a benign pituitary adenoma diagnosis or hypophysectomy in the same calendar year. Annual incidence was calculated by dividing the number of CS or CD cases by the total number of members with the same enrollment requirement during the calendar years.\nRESULTS: CS incidence rates per million person-years were 48.6 in 2009 and 39.5 in 2010. The lowest rates of CS were in ≤17-year-olds and highest rates were in 35 to 44-year-olds. CD incidence rates were 7.6 in 2009 and 6.2 in 2010. The lowest rates of CD were in ≤17-year-olds and highest rates were in 18 to 24-year-olds. The rates varied by sex (2.3-2.7 in males, 9.8-12.1 in females). In females, lowest rates ranged 2.5-4.0 in ≤17-year-olds and highest 16.7-27.2 in 18-24 year olds. In males, there were too few cases to report estimates by age.\nCONCLUSIONS: In the first large US-based study, the annual incidence of CS in individuals &lt;65 years old was nearly 49 cases per million, substantially higher than previous estimates, which were based primarily on European data. Using similar methods, we estimated the incidence of CD at nearly 8 cases per million US population. These estimates, if confirmed in other epidemiologic databases, represent a new data reference in these rare conditions.","container-title":"Pituitary","DOI":"10.1007/s11102-014-0569-6","ISSN":"1573-7403","issue":"3","journalAbbreviation":"Pituitary","language":"eng","note":"PMID: 24803324","page":"283-289","source":"PubMed","title":"Incidence of Cushing's syndrome and Cushing's disease in commercially-insured patients &lt;65 years old in the United States","volume":"18","author":[{"family":"Broder","given":"Michael S."},{"family":"Neary","given":"Maureen P."},{"family":"Chang","given":"Eunice"},{"family":"Cherepanov","given":"Dasha"},{"family":"Ludlam","given":"William H."}],"issued":{"date-parts":[["2015",6]]},"citation-key":"broderIncidenceCushingsSyndrome2015"}},{"id":1348,"uris":["http://zotero.org/users/7317906/items/V5L6B4RJ"],"itemData":{"id":1348,"type":"article-journal","abstract":"OBJECTIVE: Although Cushing's disease is a well documented clinical entity, there is no epidemiological information about it. The present study tries to obtain this information. DESIGN AND PATIENTS: Forty-nine patients affected by Cushing's disease living in Vizcaya (Spain) between 1975 and 1992 were considered for an epidemiological study. RESULTS: The prevalence of known cases at the end of 1992 was 39.1 per million inhabitants. The average incidence of newly diagnosed cases was 2.4 cases per million people per year. Cushing's disease was more frequent in women (n = 46) than in men (n = 3), with a ratio of 15:1. Diabetes mellitus and hypertension were observed in 38.7 and 55.1% of patients, respectively. Remission of Cushing's disease was achieved in 36 out of 41 patients (87.5%). In general, the mortality was higher than that expected for the control population (standardized mortality ratio, SMR 3.8, 95% confidence interval, CI 2.5-17.9, P &lt; 0.03). Concerning the cause of death, the SMR of vascular disease was 5 (95% CI 3.4-48.6, P &lt; 0.05). Higher age, persistence of hypertension and abnormalities of glucose metabolism after treatment, were independent predictors of mortality (multivariate analyses, P &lt; 0.01). CONCLUSIONS: Prevalence of Cushing's disease was 39.1 cases/million inhabitants and average incidence was 2.4 cases/million per year. Mortality was elevated, due to vascular disease, associated with higher age, persistence of hypertension and impaired glucose metabolism.","container-title":"Clin Endocrinol (Oxf)","DOI":"10.1111/j.1365-2265.1994.tb02486.x","ISSN":"0300-0664","issue":"4","note":"PMID: 8187313\nISBN: 0300-0664 (Print)\\r0300-0664 (Linking)","page":"479-484","title":"Morbidity and mortality in Cushing's disease: an epidemiological approach","volume":"40","author":[{"family":"Etxabe","given":"J"},{"family":"Vazquez","given":"J A"}],"issued":{"date-parts":[["1994"]]},"citation-key":"etxabeMorbidityMortalityCushings1994"}},{"id":27026,"uris":["http://zotero.org/users/7317906/items/X2VBVW53"],"itemData":{"id":27026,"type":"article-journal","abstract":"Introduction: In 2011, we reported the overall incidence of Cushing’s disease (CD) in Iceland from 1955 through 2009 to be 1.5 cases per million per year with highest incidence in the last decade of the study, a higher incidence then earlier reported. We now present a follow-up study reporting the epidemiology of the disease in Iceland during the 10-year period from 2010 to 2019. Methods: In this nationwide retrospective study, clinical information on patients diagnosed with CD was obtained from electronic medical records, reviewed by consulting endocrinologists. Results: Seventeen patients were diagnosed with CD, 12 women (71%) and 5 men (29%) giving an overall incidence of 5.2 cases per million per year. The mean age at diagnosis was 46 years (range 13–85 years). Biochemical analysis was recorded for all patients and 12 patients (71%) had visible pituitary adenoma on imaging studies. Sixteen patients (94%) were treated with transsphenoidal surgery of which 4 patients (24%) had gamma knife radiosurgery and three (18%) bilateral adrenalectomy after pituitary surgery. Two patients died during the study period. Conclusion: The overall incidence of CD of 5.2 cases per million per year is higher than previously reported, indicating the importance of awareness of CD. As all patients with CD are diagnosed and/or treated at the only University Hospital in Iceland, housing the only department of endocrinology as well as neurosurgery, we are confident that all cases diagnosed during the study period were included in the study.","container-title":"Neuroendocrinology","DOI":"10.1159/000540205","ISSN":"0028-3835","issue":"10","journalAbbreviation":"Neuroendocrinology","page":"950-957","source":"Silverchair","title":"Cushing’s Disease May Have Higher Incidence than Previously Thought: A Nationwide Study in Iceland 2010–2019","title-short":"Cushing’s Disease May Have Higher Incidence than Previously Thought","volume":"114","author":[{"family":"Matthiasdottir","given":"Anna Mjoll"},{"family":"Hardarson","given":"Thorgeir Orri"},{"family":"Arnardottir","given":"Steinunn"},{"family":"Sigurjonsdottir","given":"Helga Agusta"}],"issued":{"date-parts":[["2024",7,22]]},"citation-key":"matthiasdottirCushingsDiseaseMay2024"}},{"id":27019,"uris":["http://zotero.org/users/7317906/items/RTX3YT8D"],"itemData":{"id":27019,"type":"article-journal","abstract":"Overt Cushing’s syndrome is a rare disorder with an annual incidence of 2–3/million of which benign adrenal adenomas account for 0.6/million. The female:male ratio is 3:1. Preliminary data indicate a high proportion of subclinical Cushing’s syndrome in certain risk populations such as patients with type 2 diabetes or osteoporosis. The clinical implications of these observations are presently unclear. Surgery remains first line treatment for overt disease and initial cure or remission is obtained in 65–85% of patients with Cushing’s disease. Late recurrences, however, occur in up to 20% and the risk does not seem to plateau even after 20 years of follow-up. A 2- to 3-fold increase in mortality is observed in most studies, and this excess mortality seems confined to patients in whom initial cure was not obtained. Cushing’s syndrome continues to pose diagnostic and therapeutic challenges and life-long follow-up is mandatory.","container-title":"Neuroendocrinology","DOI":"10.1159/000314297","ISSN":"0028-3835","issue":"Suppl. 1","journalAbbreviation":"Neuroendocrinology","page":"1-5","source":"Silverchair","title":"Epidemiology of Cushing’s Syndrome","volume":"92","author":[{"family":"Steffensen","given":"Charlotte"},{"family":"Bak","given":"Ann Mosegaard"},{"family":"Zøylner Rubeck","given":"Kristine"},{"family":"Jørgensen","given":"Jens Otto Lunde"}],"issued":{"date-parts":[["2010",9,10]]},"citation-key":"steffensenEpidemiologyCushingsSyndrome2010"}}],"schema":"https://github.com/citation-style-language/schema/raw/master/csl-citation.json"} </w:instrText>
+      </w:r>
+      <w:r>
+        <w:fldChar w:fldCharType="separate"/>
+      </w:r>
+      <w:r>
+        <w:rPr>
+          <w:noProof/>
+        </w:rPr>
+        <w:t>(Alqeeq et al., 2024; Broder et al., 2015; Etxabe &amp; Vazquez, 1994; Matthiasdottir et al., 2024; Steffensen et al., 2010)</w:t>
+      </w:r>
+      <w:r>
+        <w:fldChar w:fldCharType="end"/>
+      </w:r>
+      <w:r>
+        <w:t>.  As expected</w:t>
+      </w:r>
+      <w:r>
+        <w:t>,</w:t>
+      </w:r>
+      <w:r>
+        <w:t xml:space="preserve"> we also observed</w:t>
+      </w:r>
+      <w:r>
+        <w:rPr>
+          <w:rStyle w:val="CommentReference"/>
+        </w:rPr>
+        <w:t xml:space="preserve"> </w:t>
+      </w:r>
+      <w:r>
+        <w:t>a higher body mass index for patients with Cushing’s disease (both p&lt;0.001).</w:t>
+      </w:r>
+      <w:r>
+        <w:t xml:space="preserve">  </w:t>
+      </w:r>
+      <w:r>
+        <w:t>Prior to matching for Race and Ethnicity, we noted that participants</w:t>
+      </w:r>
+      <w:r>
+        <w:t xml:space="preserve"> with Cushing’s disease were more likely to </w:t>
+      </w:r>
+      <w:r>
+        <w:t>identify as Non-Hispanic White (87%) than the overall Michigan Medicine participant population (75% Non-Hispanic White</w:t>
+      </w:r>
+      <w:r>
+        <w:t>, p</w:t>
+      </w:r>
+      <w:r>
+        <w:t>&lt;0.001</w:t>
+      </w:r>
+      <w:r>
+        <w:t>).</w:t>
+      </w:r>
+      <w:r>
+        <w:t xml:space="preserve">  Correspondingly</w:t>
+      </w:r>
+      <w:r>
+        <w:t>,</w:t>
+      </w:r>
+      <w:r>
+        <w:t xml:space="preserve"> participants with Cushing’s disease were less likely to identify as Asian </w:t>
+      </w:r>
+      <w:r>
+        <w:t xml:space="preserve">(p&lt;0.001) </w:t>
+      </w:r>
+      <w:r>
+        <w:t>or Black</w:t>
+      </w:r>
+      <w:r>
+        <w:t xml:space="preserve"> (p=0.01</w:t>
+      </w:r>
+      <w:r>
+        <w:t>8</w:t>
+      </w:r>
+      <w:r>
+        <w:t>)</w:t>
+      </w:r>
+      <w:r>
+        <w:t>.</w:t>
+      </w:r>
+      <w:r>
+        <w:t xml:space="preserve">  This is consistent with other reports on the prevalence of Cushing’s disease across racial groups </w:t>
+      </w:r>
+      <w:r>
+        <w:fldChar w:fldCharType="begin"/>
+      </w:r>
+      <w:r>
+        <w:instrText xml:space="preserve"> ADDIN ZOTERO_ITEM CSL_CITATION {"citationID":"Zf5euBGy","properties":{"formattedCitation":"(Ioachimescu et al., 2022; Omotosho et al., 2024)","plainCitation":"(Ioachimescu et al., 2022; Omotosho et al., 2024)","noteIndex":0},"citationItems":[{"id":27032,"uris":["http://zotero.org/users/7317906/items/EVS87VVY"],"itemData":{"id":27032,"type":"article-journal","abstract":"Acromegaly (ACM) and Cushing’s disease (CD) are caused by functioning pituitary adenomas secreting growth hormone and ACTH respectively.To determine the impact of race on presentation and postoperative outcomes in adults with ACM and CD, which has not yet been evaluated.This is a retrospective study of consecutive patients operated at a large-volume pituitary center. We evaluated (1) racial distribution of patients residing in the metropolitan area (Metro, N</w:instrText>
+      </w:r>
+      <w:r>
+        <w:rPr>
+          <w:rFonts w:ascii="Arial" w:hAnsi="Arial" w:cs="Arial"/>
+        </w:rPr>
+        <w:instrText> </w:instrText>
+      </w:r>
+      <w:r>
+        <w:instrText>=</w:instrText>
+      </w:r>
+      <w:r>
+        <w:rPr>
+          <w:rFonts w:ascii="Arial" w:hAnsi="Arial" w:cs="Arial"/>
+        </w:rPr>
+        <w:instrText> </w:instrText>
+      </w:r>
+      <w:r>
+        <w:instrText>124) vs 2010 US census data, and(2) presentation and postoperative outcomes in Black vs White for patients from the entire catchment area (N</w:instrText>
+      </w:r>
+      <w:r>
+        <w:rPr>
+          <w:rFonts w:ascii="Arial" w:hAnsi="Arial" w:cs="Arial"/>
+        </w:rPr>
+        <w:instrText> </w:instrText>
+      </w:r>
+      <w:r>
+        <w:instrText>=</w:instrText>
+      </w:r>
+      <w:r>
+        <w:rPr>
+          <w:rFonts w:ascii="Arial" w:hAnsi="Arial" w:cs="Arial"/>
+        </w:rPr>
+        <w:instrText> </w:instrText>
+      </w:r>
+      <w:r>
+        <w:instrText>241).For Metro area (32.4% Black population), Black patients represented 16.75% ACM (P</w:instrText>
+      </w:r>
+      <w:r>
+        <w:rPr>
+          <w:rFonts w:ascii="Arial" w:hAnsi="Arial" w:cs="Arial"/>
+        </w:rPr>
+        <w:instrText> </w:instrText>
+      </w:r>
+      <w:r>
+        <w:instrText>=</w:instrText>
+      </w:r>
+      <w:r>
+        <w:rPr>
+          <w:rFonts w:ascii="Arial" w:hAnsi="Arial" w:cs="Arial"/>
+        </w:rPr>
+        <w:instrText> </w:instrText>
+      </w:r>
+      <w:r>
+        <w:instrText>.006) and 29.2% CD (P</w:instrText>
+      </w:r>
+      <w:r>
+        <w:rPr>
+          <w:rFonts w:ascii="Arial" w:hAnsi="Arial" w:cs="Arial"/>
+        </w:rPr>
+        <w:instrText> </w:instrText>
+      </w:r>
+      <w:r>
+        <w:instrText>=</w:instrText>
+      </w:r>
+      <w:r>
+        <w:rPr>
+          <w:rFonts w:ascii="Arial" w:hAnsi="Arial" w:cs="Arial"/>
+        </w:rPr>
+        <w:instrText> </w:instrText>
+      </w:r>
+      <w:r>
+        <w:instrText>.56). Among the total 112 patients with ACM, presentations with headaches or incidentaloma were more common in Black patients (76.9% vs 31% White, P</w:instrText>
+      </w:r>
+      <w:r>
+        <w:rPr>
+          <w:rFonts w:ascii="Arial" w:hAnsi="Arial" w:cs="Arial"/>
+        </w:rPr>
+        <w:instrText> </w:instrText>
+      </w:r>
+      <w:r>
+        <w:instrText>=</w:instrText>
+      </w:r>
+      <w:r>
+        <w:rPr>
+          <w:rFonts w:ascii="Arial" w:hAnsi="Arial" w:cs="Arial"/>
+        </w:rPr>
+        <w:instrText> </w:instrText>
+      </w:r>
+      <w:r>
+        <w:instrText>.01). Black patients had a higher prevalence of diabetes (54% vs 16% White, P</w:instrText>
+      </w:r>
+      <w:r>
+        <w:rPr>
+          <w:rFonts w:ascii="Arial" w:hAnsi="Arial" w:cs="Arial"/>
+        </w:rPr>
+        <w:instrText> </w:instrText>
+      </w:r>
+      <w:r>
+        <w:instrText>=</w:instrText>
+      </w:r>
+      <w:r>
+        <w:rPr>
+          <w:rFonts w:ascii="Arial" w:hAnsi="Arial" w:cs="Arial"/>
+        </w:rPr>
+        <w:instrText> </w:instrText>
+      </w:r>
+      <w:r>
+        <w:instrText>.005), significantly lower insulin-like growth factor (IGF)-1 deviation from normal (P</w:instrText>
+      </w:r>
+      <w:r>
+        <w:rPr>
+          <w:rFonts w:ascii="Arial" w:hAnsi="Arial" w:cs="Arial"/>
+        </w:rPr>
+        <w:instrText> </w:instrText>
+      </w:r>
+      <w:r>
+        <w:instrText>=</w:instrText>
+      </w:r>
+      <w:r>
+        <w:rPr>
+          <w:rFonts w:ascii="Arial" w:hAnsi="Arial" w:cs="Arial"/>
+        </w:rPr>
+        <w:instrText> </w:instrText>
+      </w:r>
+      <w:r>
+        <w:instrText>.03) and borderline lower median growth hormone levels (P</w:instrText>
+      </w:r>
+      <w:r>
+        <w:rPr>
+          <w:rFonts w:ascii="Arial" w:hAnsi="Arial" w:cs="Arial"/>
+        </w:rPr>
+        <w:instrText> </w:instrText>
+      </w:r>
+      <w:r>
+        <w:instrText>=</w:instrText>
+      </w:r>
+      <w:r>
+        <w:rPr>
+          <w:rFonts w:ascii="Arial" w:hAnsi="Arial" w:cs="Arial"/>
+        </w:rPr>
+        <w:instrText> </w:instrText>
+      </w:r>
+      <w:r>
+        <w:instrText>.09). Mean tumor diameter and proportion of tumors with cavernous sinus invasion were similar. Three-month biochemical remission (46% Black, 55% White, P</w:instrText>
+      </w:r>
+      <w:r>
+        <w:rPr>
+          <w:rFonts w:ascii="Arial" w:hAnsi="Arial" w:cs="Arial"/>
+        </w:rPr>
+        <w:instrText> </w:instrText>
+      </w:r>
+      <w:r>
+        <w:instrText>=</w:instrText>
+      </w:r>
+      <w:r>
+        <w:rPr>
+          <w:rFonts w:ascii="Arial" w:hAnsi="Arial" w:cs="Arial"/>
+        </w:rPr>
+        <w:instrText> </w:instrText>
+      </w:r>
+      <w:r>
+        <w:instrText>.76) and long-term IGF-1 control by multimodality therapy (92.3% Black, 80.5% White, P</w:instrText>
+      </w:r>
+      <w:r>
+        <w:rPr>
+          <w:rFonts w:ascii="Arial" w:hAnsi="Arial" w:cs="Arial"/>
+        </w:rPr>
+        <w:instrText> </w:instrText>
+      </w:r>
+      <w:r>
+        <w:instrText>=</w:instrText>
+      </w:r>
+      <w:r>
+        <w:rPr>
+          <w:rFonts w:ascii="Arial" w:hAnsi="Arial" w:cs="Arial"/>
+        </w:rPr>
+        <w:instrText> </w:instrText>
+      </w:r>
+      <w:r>
+        <w:instrText>.45) were similar. Among the total 129 patients with CD, Black patients had more hypopituitarism (69% vs 45% White, P</w:instrText>
+      </w:r>
+      <w:r>
+        <w:rPr>
+          <w:rFonts w:ascii="Arial" w:hAnsi="Arial" w:cs="Arial"/>
+        </w:rPr>
+        <w:instrText> </w:instrText>
+      </w:r>
+      <w:r>
+        <w:instrText>=</w:instrText>
+      </w:r>
+      <w:r>
+        <w:rPr>
+          <w:rFonts w:ascii="Arial" w:hAnsi="Arial" w:cs="Arial"/>
+        </w:rPr>
+        <w:instrText> </w:instrText>
+      </w:r>
+      <w:r>
+        <w:instrText>.04) and macroadenomas (33% vs 15% White, P</w:instrText>
+      </w:r>
+      <w:r>
+        <w:rPr>
+          <w:rFonts w:ascii="Arial" w:hAnsi="Arial" w:cs="Arial"/>
+        </w:rPr>
+        <w:instrText> </w:instrText>
+      </w:r>
+      <w:r>
+        <w:instrText>=</w:instrText>
+      </w:r>
+      <w:r>
+        <w:rPr>
+          <w:rFonts w:ascii="Arial" w:hAnsi="Arial" w:cs="Arial"/>
+        </w:rPr>
+        <w:instrText> </w:instrText>
+      </w:r>
+      <w:r>
+        <w:instrText>.05). At 3 months, remission rate was borderline higher in White (92% vs 78% Black, P</w:instrText>
+      </w:r>
+      <w:r>
+        <w:rPr>
+          <w:rFonts w:ascii="Arial" w:hAnsi="Arial" w:cs="Arial"/>
+        </w:rPr>
+        <w:instrText> </w:instrText>
+      </w:r>
+      <w:r>
+        <w:instrText>=</w:instrText>
+      </w:r>
+      <w:r>
+        <w:rPr>
+          <w:rFonts w:ascii="Arial" w:hAnsi="Arial" w:cs="Arial"/>
+        </w:rPr>
+        <w:instrText> </w:instrText>
+      </w:r>
+      <w:r>
+        <w:instrText xml:space="preserve">0.08), which was attributed to macroadenomas by logistic regression.We identified disparities regarding racial distribution, and clinical and biochemical characteristics in ACM, suggesting late or missed diagnosis in Black patients. Large nationwide studies are necessary to confirm our findings.","container-title":"Journal of the Endocrine Society","DOI":"10.1210/jendso/bvab176","ISSN":"2472-1972","issue":"1","journalAbbreviation":"J. Endocr. Soc.","page":"bvab176","source":"Silverchair","title":"Racial Disparities in Acromegaly and Cushing’s Disease: A Referral Center Study in 241 Patients","title-short":"Racial Disparities in Acromegaly and Cushing’s Disease","volume":"6","author":[{"family":"Ioachimescu","given":"Adriana G"},{"family":"Goswami","given":"Neevedita"},{"family":"Handa","given":"Talin"},{"family":"Pappy","given":"Adlai"},{"family":"Veledar","given":"Emir"},{"family":"Oyesiku","given":"Nelson M"}],"issued":{"date-parts":[["2022",1,1]]},"citation-key":"ioachimescuRacialDisparitiesAcromegaly2022"}},{"id":27042,"uris":["http://zotero.org/users/7317906/items/H96MA6T6"],"itemData":{"id":27042,"type":"article-journal","abstract":"Y.B. Omotosho: None. R. McGlotten: None. P. Chittiboina: None. L. Nieman: None.Background: Early recognition and treatment of Cushing’s syndrome (CS) is important to reduce mortality, forestall additional co-morbidities, and improve long-term quality of life. Little is known about how adverse social determinants of health (SDOH) influence the achievement of this goal.Objective: To investigate the impact of race (Black vs White) and UFC on the time to definitive diagnosis and treatment of Cushing’s disease (CD).Methods: This is a retrospective cohort study of 114 patients (pts) (including all Non-Hispanic Blacks) evaluated at the National Institutes of Health between 1990-2022, who had CD based on pathology (ACTH-positive tumor immunohistochemistry) or biochemical remission after transsphenoidal surgery (TSS). 38 Non-Hispanic Black patients met entry criteria. They were matched 1:2 by age (within five years) and sex. We excluded patients with cyclic CS, recurrent CD, previous pituitary surgery or radiation therapy and/or a delay between diagnostic evaluation and surgery of more than 4 weeks. We limited cohorts to only Non-Hispanic Blacks and Whites for this pilot study and plan to extend this to smaller race/ethnicity groups in the future. The onset of clinical symptoms was documented as self-reported by the patients. We analyzed the difference between the year of symptom onset and the date TSS was performed, to obtain an estimated duration of diagnosis. The highest 24h urine cortisol (UFC) value for each patient was noted. Non-normal data are described as median [interquartile range]. Group comparisons used the Wilcoxon rank sum test for the time to etiologic diagnosis, age, and UFC. Statistical analyses were done using R/RStudio statistical software. P value &amp;lt;0.05 was considered significant. Results: Each racial group included 76.3% females and 23.7% males. The median age at TSS was 39.5 years [30.0 – 50.8] for Blacks and 41.5 years [31.8 - 53.3] for Whites (P= 0.7). The median UFC was 326 mcg/24h [156 - 491] for Blacks and 264 [166 - 609] for Whites (P= 0.8). The median duration from symptom onset to CD diagnosis was 3.67 years [2.76 - 6.29] for Blacks and for 2.56 years [1.57 - 4.13] for Whites. Analysis of the differences in time to diagnosis between both groups confirmed a significant disparity with blacks having a median delay of 1.1 years more than whites (P= 0.001). Discussion: We do not have information on other SDOH in our patients, such as access to providers, education level, or their perception of the medical community. The present data suggest that racial background serves as a limiting factor in the diagnosis and differential diagnosis of CS, and that differences in severity of hypercortisolism do not explain this disparity. More work is needed to understand the reasons for this disparity as we continue to strive towards health equity.Monday, June 3, 2024","container-title":"Journal of the Endocrine Society","DOI":"10.1210/jendso/bvae163.2408","ISSN":"2472-1972","issue":"Supplement_1","journalAbbreviation":"J. Endocr. Soc.","page":"bvae163.2408","source":"Silverchair","title":"MON-113 Racial Disparity in the Time to Diagnosis of Cushing’s Disease","volume":"8","author":[{"family":"Omotosho","given":"Y B"},{"family":"McGlotten","given":"R"},{"family":"Chittiboina","given":"P"},{"family":"Nieman","given":"L"}],"issued":{"date-parts":[["2024",10,1]]},"citation-key":"omotoshoMON113RacialDisparity2024"}}],"schema":"https://github.com/citation-style-language/schema/raw/master/csl-citation.json"} </w:instrText>
+      </w:r>
+      <w:r>
+        <w:fldChar w:fldCharType="separate"/>
+      </w:r>
+      <w:r>
+        <w:rPr>
+          <w:noProof/>
+        </w:rPr>
+        <w:t>(Ioachimescu et al., 2022; Omotosho et al., 2024)</w:t>
+      </w:r>
+      <w:r>
+        <w:fldChar w:fldCharType="end"/>
+      </w:r>
+      <w:r>
+        <w:t>.</w:t>
+      </w:r>
+    </w:p>
+    <w:p>
+      <w:r>
+        <w:t>As we expected, participants with Cushing’s disease had a higher BMI than the controls</w:t>
+      </w:r>
+      <w:r>
+        <w:t>, with 64% of participants with Cushing’s disease having a BMI above 30 kg/m</w:t>
+      </w:r>
+      <w:r>
+        <w:rPr>
+          <w:vertAlign w:val="superscript"/>
+        </w:rPr>
+        <w:t>2</w:t>
+      </w:r>
+      <w:r>
+        <w:t xml:space="preserve">, compared to </w:t>
+      </w:r>
+      <w:r>
+        <w:t>40</w:t>
+      </w:r>
+      <w:r>
+        <w:t>% controls (p&lt;0.001).</w:t>
+      </w:r>
+      <w:r>
+        <w:t xml:space="preserve">  </w:t>
+      </w:r>
+      <w:r>
+        <w:t xml:space="preserve">To understand the </w:t>
+      </w:r>
+      <w:r>
+        <w:t xml:space="preserve">cross-sectional </w:t>
+      </w:r>
+      <w:r>
+        <w:t>relationship between obesity and Cushing’s disease, we</w:t>
+      </w:r>
+      <w:r>
+        <w:t xml:space="preserve"> stratified our participants </w:t>
+      </w:r>
+      <w:r>
+        <w:t>with a BMI above or below 30 kg/m</w:t>
+      </w:r>
+      <w:r>
+        <w:rPr>
+          <w:vertAlign w:val="superscript"/>
+        </w:rPr>
+        <w:t>2</w:t>
+      </w:r>
+      <w:r>
+        <w:t xml:space="preserve">, </w:t>
+      </w:r>
+      <w:r>
+        <w:t>across</w:t>
+      </w:r>
+      <w:r>
+        <w:t xml:space="preserve"> both cases and controls</w:t>
+      </w:r>
+      <w:r>
+        <w:t>.  As shown in Table 2, and as expected given our stratification, the four groups differed in several characteristics</w:t>
+      </w:r>
+      <w:r>
+        <w:t xml:space="preserve">, </w:t>
+      </w:r>
+      <w:r>
+        <w:t>which</w:t>
+      </w:r>
+      <w:r>
+        <w:t xml:space="preserve"> will be adjusted for in multivariable models below</w:t>
+      </w:r>
+      <w:r>
+        <w:t>.</w:t>
+      </w:r>
+      <w:r>
+        <w:t xml:space="preserve">  For example, among</w:t>
+      </w:r>
+      <w:r>
+        <w:t xml:space="preserve"> the subgroup of</w:t>
+      </w:r>
+      <w:r>
+        <w:t xml:space="preserve"> participants with a BMI &gt; 30 mg/m</w:t>
+      </w:r>
+      <w:r>
+        <w:rPr>
+          <w:vertAlign w:val="superscript"/>
+        </w:rPr>
+        <w:t>2</w:t>
+      </w:r>
+      <w:r>
+        <w:t>, participants with Cushing’s disease had a higher BMI than controls</w:t>
+      </w:r>
+      <w:r>
+        <w:t xml:space="preserve"> (p=0.0024 by a Mann-Whitney test)</w:t>
+      </w:r>
+      <w:r>
+        <w:t xml:space="preserve">.  </w:t>
+      </w:r>
+      <w:r>
+        <w:t>Females with Cushing’s disease were more likely to have a BMI over 30 kg/m</w:t>
+      </w:r>
+      <w:r>
+        <w:rPr>
+          <w:vertAlign w:val="superscript"/>
+        </w:rPr>
+        <w:t>2</w:t>
+      </w:r>
+      <w:r>
+        <w:t xml:space="preserve"> (68% </w:t>
+      </w:r>
+      <w:r>
+        <w:t xml:space="preserve">of </w:t>
+      </w:r>
+      <w:r>
+        <w:t xml:space="preserve">females </w:t>
+      </w:r>
+      <w:r>
+        <w:t>compared to</w:t>
+      </w:r>
+      <w:r>
+        <w:t xml:space="preserve"> 51% of males with Cushing’s disease, p=0.015).  </w:t>
+      </w:r>
+      <w:r>
+        <w:t>Among participants with Cushing’s disease, Asian (6</w:t>
+      </w:r>
+      <w:r>
+        <w:t xml:space="preserve"> out of </w:t>
+      </w:r>
+      <w:r>
+        <w:t xml:space="preserve">10) and Hispanic or Latino </w:t>
+      </w:r>
+      <w:r>
+        <w:t>(6</w:t>
+      </w:r>
+      <w:r>
+        <w:t xml:space="preserve"> out of </w:t>
+      </w:r>
+      <w:r>
+        <w:t xml:space="preserve">8) </w:t>
+      </w:r>
+      <w:r>
+        <w:t>participants were more likely have a BMI under 30 kg/m</w:t>
+      </w:r>
+      <w:r>
+        <w:rPr>
+          <w:vertAlign w:val="superscript"/>
+        </w:rPr>
+        <w:t xml:space="preserve">2 </w:t>
+      </w:r>
+      <w:r>
+        <w:t xml:space="preserve">compared to </w:t>
+      </w:r>
+      <w:r>
+        <w:t xml:space="preserve">the overall average </w:t>
+      </w:r>
+      <w:r>
+        <w:t>(</w:t>
+      </w:r>
+      <w:r>
+        <w:t>36%</w:t>
+      </w:r>
+      <w:r>
+        <w:t>, p=0.027 and 0.176 respectively via Fisher’s exact test</w:t>
+      </w:r>
+      <w:r>
+        <w:t>s</w:t>
+      </w:r>
+      <w:r>
+        <w:t xml:space="preserve">).  </w:t>
+      </w:r>
+      <w:r>
+        <w:t>The</w:t>
+      </w:r>
+      <w:r>
+        <w:t xml:space="preserve"> average age of </w:t>
+      </w:r>
+      <w:r>
+        <w:t xml:space="preserve">participants with </w:t>
+      </w:r>
+      <w:r>
+        <w:t>Cushing’s</w:t>
+      </w:r>
+      <w:r>
+        <w:t xml:space="preserve"> disease</w:t>
+      </w:r>
+      <w:r>
+        <w:t xml:space="preserve"> with or without obesity was similar</w:t>
+      </w:r>
+      <w:r>
+        <w:t xml:space="preserve"> after stratification</w:t>
+      </w:r>
+      <w:r>
+        <w:t>.</w:t>
+      </w:r>
+    </w:p>
+    <w:p>
+      <w:pPr>
+        <w:pStyle w:val="NormalWeb"/>
+        <w:rPr>
+          <w:rStyle w:val="Heading2Char"/>
+        </w:rPr>
+      </w:pPr>
+      <w:r>
+        <w:rPr>
+          <w:rStyle w:val="Heading2Char"/>
+        </w:rPr>
+        <w:t>Modification of Cushing’s disease-related traits by obesity status</w:t>
+      </w:r>
+    </w:p>
+    <w:p>
+      <w:r>
+        <w:t>To identify how obesity alters metabolic outcomes related to Cushing’s disease, we evaluated the effects of Cushing’s disease on several key metabolic variables including glycemica (fasting glucose and HbA1c), liver enzymes, LDL-C and blood pressure (Figure 2 and Table 3A).  As described below we noted substantial effect modification by obesity status in these fully adjusted models for liver enzymes and blood pressure (Table 3B).</w:t>
+      </w:r>
+    </w:p>
+    <w:p>
+      <w:pPr>
+        <w:pStyle w:val="Heading3"/>
+      </w:pPr>
+      <w:r>
+        <w:t>Dysglycemia</w:t>
+      </w:r>
+    </w:p>
+    <w:p>
+      <w:r>
+        <w:t xml:space="preserve">As aforementioned, our first metabolic variable of interest was the fasting glucose levels of our obese and non-obese populations. As shown in </w:t>
+      </w:r>
+      <w:r>
+        <w:t xml:space="preserve">Figure 2 and </w:t>
+      </w:r>
+      <w:r>
+        <w:t>Table 3</w:t>
+      </w:r>
+      <w:r>
+        <w:t>A</w:t>
+      </w:r>
+      <w:r>
+        <w:t>, we observed a</w:t>
+      </w:r>
+      <w:r>
+        <w:t xml:space="preserve"> significant </w:t>
+      </w:r>
+      <w:r>
+        <w:t xml:space="preserve">increase in </w:t>
+      </w:r>
+      <w:r>
+        <w:t xml:space="preserve">fasting </w:t>
+      </w:r>
+      <w:r>
+        <w:t xml:space="preserve">blood glucose levels </w:t>
+      </w:r>
+      <w:r>
+        <w:t xml:space="preserve">among </w:t>
+      </w:r>
+      <w:r>
+        <w:t>participants</w:t>
+      </w:r>
+      <w:r>
+        <w:t xml:space="preserve"> with Cushing’s disease, regardless of obesity status</w:t>
+      </w:r>
+      <w:r>
+        <w:t xml:space="preserve"> (p</w:t>
+      </w:r>
+      <w:r>
+        <w:t>&lt;0.01</w:t>
+      </w:r>
+      <w:r>
+        <w:t xml:space="preserve"> for both groups).</w:t>
+      </w:r>
+      <w:r>
+        <w:t xml:space="preserve"> The </w:t>
+      </w:r>
+      <w:r>
+        <w:t xml:space="preserve">patients with obesity </w:t>
+      </w:r>
+      <w:r>
+        <w:lastRenderedPageBreak/>
+        <w:t xml:space="preserve">population had a slightly larger increase (26.9 vs. </w:t>
+      </w:r>
+      <w:r>
+        <w:t>24.6</w:t>
+      </w:r>
+      <w:r>
+        <w:t xml:space="preserve"> mg/dL</w:t>
+      </w:r>
+      <w:r>
+        <w:t xml:space="preserve">) than </w:t>
+      </w:r>
+      <w:r>
+        <w:t>those with a BMI under 30 kg/m</w:t>
+      </w:r>
+      <w:r>
+        <w:rPr>
+          <w:vertAlign w:val="superscript"/>
+        </w:rPr>
+        <w:t>2</w:t>
+      </w:r>
+      <w:r>
+        <w:t>, but this was not a large enough difference to provide any significant evidence of an effect modification for obesity</w:t>
+      </w:r>
+      <w:r>
+        <w:t xml:space="preserve"> (p=0.51; Table 3B)</w:t>
+      </w:r>
+      <w:r>
+        <w:t xml:space="preserve">. </w:t>
+      </w:r>
+      <w:r>
+        <w:t>Similarly</w:t>
+      </w:r>
+      <w:r>
+        <w:t>,</w:t>
+      </w:r>
+      <w:r>
+        <w:t xml:space="preserve"> in Table 3</w:t>
+      </w:r>
+      <w:r>
+        <w:t>A</w:t>
+      </w:r>
+      <w:r>
+        <w:t xml:space="preserve"> </w:t>
+      </w:r>
+      <w:r>
+        <w:t>among the small number of patients with</w:t>
+      </w:r>
+      <w:r>
+        <w:t xml:space="preserve"> HbA1c </w:t>
+      </w:r>
+      <w:r>
+        <w:t>values, there was</w:t>
+      </w:r>
+      <w:r>
+        <w:t xml:space="preserve"> a</w:t>
+      </w:r>
+      <w:r>
+        <w:t xml:space="preserve">n </w:t>
+      </w:r>
+      <w:r>
+        <w:t xml:space="preserve">insignificant increase in HbA1c levels </w:t>
+      </w:r>
+      <w:r>
+        <w:t>in</w:t>
+      </w:r>
+      <w:r>
+        <w:t xml:space="preserve"> the non-obese</w:t>
+      </w:r>
+      <w:r>
+        <w:t xml:space="preserve"> patients</w:t>
+      </w:r>
+      <w:r>
+        <w:t xml:space="preserve"> (</w:t>
+      </w:r>
+      <w:r>
+        <w:t xml:space="preserve">0.91%; </w:t>
+      </w:r>
+      <w:r>
+        <w:t xml:space="preserve">p=0.056). However, there was evidence of a significant increase in HbA1c levels </w:t>
+      </w:r>
+      <w:r>
+        <w:t xml:space="preserve">in patients with obesity </w:t>
+      </w:r>
+      <w:r>
+        <w:t>(</w:t>
+      </w:r>
+      <w:r>
+        <w:t xml:space="preserve">1.38% </w:t>
+      </w:r>
+      <w:r>
+        <w:t>p</w:t>
+      </w:r>
+      <w:r>
+        <w:t>&lt;0.01</w:t>
+      </w:r>
+      <w:r>
+        <w:t xml:space="preserve">). </w:t>
+      </w:r>
+      <w:r>
+        <w:t xml:space="preserve">  Again</w:t>
+      </w:r>
+      <w:r>
+        <w:t>.</w:t>
+      </w:r>
+      <w:r>
+        <w:t xml:space="preserve"> there was no evidence of effect modification by obesity (p=0.41)</w:t>
+      </w:r>
+    </w:p>
+    <w:p>
+      <w:pPr>
+        <w:pStyle w:val="Heading3"/>
+      </w:pPr>
+      <w:r>
+        <w:t>MASLD and liver enzymes</w:t>
+      </w:r>
+    </w:p>
+    <w:p>
+      <w:r>
+        <w:t xml:space="preserve">To </w:t>
+      </w:r>
+      <w:r>
+        <w:t>assess</w:t>
+      </w:r>
+      <w:r>
+        <w:t xml:space="preserve"> </w:t>
+      </w:r>
+      <w:r>
+        <w:t>MASLD</w:t>
+      </w:r>
+      <w:r>
+        <w:t xml:space="preserve"> we looked at ALT </w:t>
+      </w:r>
+      <w:r>
+        <w:t>and AST levels as indicators of liver damage</w:t>
+      </w:r>
+      <w:r>
+        <w:t xml:space="preserve"> (Figure 2 and Table 3A)</w:t>
+      </w:r>
+      <w:r>
+        <w:t xml:space="preserve">. In both our obese, and non-obese populations, we saw an increase in ALT </w:t>
+      </w:r>
+      <w:r>
+        <w:t>and AST</w:t>
+      </w:r>
+      <w:r>
+        <w:t xml:space="preserve"> </w:t>
+      </w:r>
+      <w:r>
+        <w:t>levels regardless of Cushing’s disease status</w:t>
+      </w:r>
+      <w:r>
+        <w:t xml:space="preserve"> </w:t>
+      </w:r>
+      <w:commentRangeStart w:id="10"/>
+      <w:r>
+        <w:t>(p</w:t>
+      </w:r>
+      <w:r>
+        <w:t>&lt;0.0</w:t>
+      </w:r>
+      <w:r>
+        <w:t>1 for both groups</w:t>
+      </w:r>
+      <w:r>
+        <w:t xml:space="preserve">). </w:t>
+      </w:r>
       <w:commentRangeEnd w:id="10"/>
       <w:r>
         <w:rPr>
@@ -370,1437 +1815,6 @@
         <w:commentReference w:id="10"/>
       </w:r>
       <w:r>
-        <w:t>.</w:t>
-      </w:r>
-      <w:r>
-        <w:t xml:space="preserve">  We excluded participants if they </w:t>
-      </w:r>
-      <w:r>
-        <w:t>did not have a Cushing’s disease diagnosis, treatment date, lab history, or relevant demographic data documented.</w:t>
-      </w:r>
-      <w:r>
-        <w:t xml:space="preserve"> Race and ethnicity were self-reported, with groups of &lt;10 aggregated into the other category.</w:t>
-      </w:r>
-      <w:r>
-        <w:t xml:space="preserve"> </w:t>
-      </w:r>
-    </w:p>
-    <w:p>
-      <w:r>
-        <w:t xml:space="preserve">To identify controls, </w:t>
-      </w:r>
-      <w:r>
-        <w:t>we used</w:t>
-      </w:r>
-      <w:r>
-        <w:t xml:space="preserve"> the </w:t>
-      </w:r>
-      <w:r>
-        <w:t xml:space="preserve"> MatchIt </w:t>
-      </w:r>
-      <w:r>
-        <w:t xml:space="preserve">package </w:t>
-      </w:r>
-      <w:r>
-        <w:t xml:space="preserve">(version </w:t>
-      </w:r>
-      <w:r>
-        <w:t xml:space="preserve">4.7.1; </w:t>
-      </w:r>
-      <w:r>
-        <w:fldChar w:fldCharType="begin"/>
-      </w:r>
-      <w:r>
-        <w:instrText xml:space="preserve"> ADDIN ZOTERO_ITEM CSL_CITATION {"citationID":"Pl5Gc3F1","properties":{"formattedCitation":"(Ho et al., 2011)","plainCitation":"(Ho et al., 2011)","noteIndex":0},"citationItems":[{"id":12196,"uris":["http://zotero.org/users/7317906/items/H5CAAL6F"],"itemData":{"id":12196,"type":"article-journal","abstract":"MatchIt implements the suggestions of Ho, Imai, King, and Stuart (2007) for improving parametric statistical models by preprocessing data with nonparametric matching methods. MatchIt implements a wide range of sophisticated matching methods, making it possible to greatly reduce the dependence of causal inferences on hard-to-justify, but commonly made, statistical modeling assumptions. The software also easily fits into existing research practices since, after preprocessing data with MatchIt, researchers can use whatever parametric model they would have used without MatchIt, but produce inferences with substantially more robustness and less sensitivity to modeling assumptions. MatchIt is an R program, and also works seamlessly with Zelig.","container-title":"Journal of Statistical Software","DOI":"10.18637/jss.v042.i08","ISSN":"1548-7660","language":"en","license":"Copyright (c) 2006 Daniel Ho, Kosuke Imai, Gary King, Elizabeth A. Stuart","page":"1-28","source":"www.jstatsoft.org","title":"MatchIt: Nonparametric Preprocessing for Parametric Causal Inference","title-short":"MatchIt","volume":"42","author":[{"family":"Ho","given":"Daniel"},{"family":"Imai","given":"Kosuke"},{"family":"King","given":"Gary"},{"family":"Stuart","given":"Elizabeth A."}],"issued":{"date-parts":[["2011",6,14]]},"citation-key":"hoMatchItNonparametricPreprocessing2011"}}],"schema":"https://github.com/citation-style-language/schema/raw/master/csl-citation.json"} </w:instrText>
-      </w:r>
-      <w:r>
-        <w:fldChar w:fldCharType="separate"/>
-      </w:r>
-      <w:r>
-        <w:rPr>
-          <w:noProof/>
-        </w:rPr>
-        <w:t>(Ho et al., 2011)</w:t>
-      </w:r>
-      <w:r>
-        <w:fldChar w:fldCharType="end"/>
-      </w:r>
-      <w:r>
-        <w:t>)</w:t>
-      </w:r>
-      <w:r>
-        <w:t>. F</w:t>
-      </w:r>
-      <w:r>
-        <w:t xml:space="preserve">or </w:t>
-      </w:r>
-      <w:r>
-        <w:t xml:space="preserve">each outcome we identified all Cushing’s cases </w:t>
-      </w:r>
-      <w:r>
-        <w:t xml:space="preserve">with that measurement </w:t>
-      </w:r>
-      <w:r>
-        <w:t xml:space="preserve">and potential </w:t>
-      </w:r>
-      <w:r>
-        <w:lastRenderedPageBreak/>
-        <w:t xml:space="preserve">controls with that measurement available. </w:t>
-      </w:r>
-      <w:r>
-        <w:t>For Cushing’s cases to be included they had to have had the laboratory measure</w:t>
-      </w:r>
-      <w:r>
-        <w:t>d</w:t>
-      </w:r>
-      <w:r>
-        <w:t xml:space="preserve"> </w:t>
-      </w:r>
-      <w:r>
-        <w:t>within a year</w:t>
-      </w:r>
-      <w:r>
-        <w:t xml:space="preserve"> </w:t>
-      </w:r>
-      <w:r>
-        <w:t>prior to surgical treatment</w:t>
-      </w:r>
-      <w:r>
-        <w:t>, taking the most recent value</w:t>
-      </w:r>
-      <w:r>
-        <w:t xml:space="preserve">.  </w:t>
-      </w:r>
-      <w:r>
-        <w:t>We performed nearest</w:t>
-      </w:r>
-      <w:r>
-        <w:rPr>
-          <w:rFonts w:ascii="Cambria Math" w:hAnsi="Cambria Math" w:cs="Cambria Math"/>
-        </w:rPr>
-        <w:t>‐</w:t>
-      </w:r>
-      <w:r>
-        <w:t xml:space="preserve">neighbor propensity score matching (ratio = </w:t>
-      </w:r>
-      <w:r>
-        <w:t>10:1</w:t>
-      </w:r>
-      <w:r>
-        <w:t xml:space="preserve">) with age in the </w:t>
-      </w:r>
-      <w:r>
-        <w:t>propensity score</w:t>
-      </w:r>
-      <w:r>
-        <w:t xml:space="preserve"> model and exact matching on gender and race/ethnicity</w:t>
-      </w:r>
-      <w:r>
-        <w:t xml:space="preserve"> from a pool of </w:t>
-      </w:r>
-      <w:r>
-        <w:t>98,436</w:t>
-      </w:r>
-      <w:r>
-        <w:t xml:space="preserve"> </w:t>
-      </w:r>
-      <w:r>
-        <w:t>Michigan Medicine patients</w:t>
-      </w:r>
-      <w:r>
-        <w:t xml:space="preserve">. This procedure was repeated separately for each outcome </w:t>
-      </w:r>
-      <w:r>
-        <w:t xml:space="preserve">as our </w:t>
-      </w:r>
-      <w:r>
-        <w:t>primary analys</w:t>
-      </w:r>
-      <w:r>
-        <w:t>e</w:t>
-      </w:r>
-      <w:r>
-        <w:t xml:space="preserve">s. </w:t>
-      </w:r>
-      <w:r>
-        <w:t xml:space="preserve"> The</w:t>
-      </w:r>
-      <w:r>
-        <w:t xml:space="preserve"> maximal</w:t>
-      </w:r>
-      <w:r>
-        <w:t xml:space="preserve"> post-matching standardized mean difference for </w:t>
-      </w:r>
-      <w:r>
-        <w:t>a</w:t>
-      </w:r>
-      <w:r>
-        <w:t xml:space="preserve">ge </w:t>
-      </w:r>
-      <w:r>
-        <w:t>was</w:t>
-      </w:r>
-      <w:r>
-        <w:t xml:space="preserve"> &lt;0.</w:t>
-      </w:r>
-      <w:r>
-        <w:t>05</w:t>
-      </w:r>
-      <w:r>
-        <w:t xml:space="preserve"> for all outcomes, indicating adequate balance</w:t>
-      </w:r>
-      <w:r>
-        <w:t xml:space="preserve"> (Supplementary Figure 1 and Supplementary Table 1)</w:t>
-      </w:r>
-      <w:r>
-        <w:t>.</w:t>
-      </w:r>
-      <w:r>
-        <w:t xml:space="preserve">  </w:t>
-      </w:r>
-      <w:r>
-        <w:t>We</w:t>
-      </w:r>
-      <w:r>
-        <w:t xml:space="preserve"> only included patients with BMI’s within the 5-75 range, and between 5-75 years of age. </w:t>
-      </w:r>
-      <w:commentRangeStart w:id="11"/>
-      <w:r>
-        <w:t xml:space="preserve">Finally, we also only included patients within the 2022-2025 year range. </w:t>
-      </w:r>
-      <w:commentRangeEnd w:id="11"/>
-      <w:r>
-        <w:rPr>
-          <w:rStyle w:val="CommentReference"/>
-          <w:sz w:val="24"/>
-          <w:szCs w:val="24"/>
-        </w:rPr>
-        <w:commentReference w:id="11"/>
-      </w:r>
-      <w:r>
-        <w:t>This was done to create a data pull request that was less than 100,000 people, which was necessary with the Data Direct software used.</w:t>
-      </w:r>
-    </w:p>
-    <w:p>
-      <w:r>
-        <w:t>BMI was not included in the propensity score because we aimed to evaluate obesity as a moderator of the effects of Cushing’s disease</w:t>
-      </w:r>
-      <w:r>
-        <w:t>. Subsequent</w:t>
-      </w:r>
-      <w:r>
-        <w:t xml:space="preserve"> analyses were stratified by obesity (BMI ≥30 kg/m²). Within each obesity stratum, BMI was included as a covariate in sensitivity models.</w:t>
-      </w:r>
-    </w:p>
-    <w:p>
-      <w:r>
-        <w:t>Mean arterial pressure was directly measured in the majority of cases. When MAP was missing but systolic and diastolic BP were available</w:t>
-      </w:r>
-      <w:r>
-        <w:t xml:space="preserve">, </w:t>
-      </w:r>
-      <w:r>
-        <w:t>MAP was calculated as (SBP + 2×DBP)/3. The calculated values showed high agreement with measured MAP (r=0.963, mean difference=1.32 ± 3.38 mmHg) in cases where both were available.</w:t>
-      </w:r>
-    </w:p>
-    <w:p>
-      <w:r>
-        <w:rPr>
-          <w:b/>
-          <w:bCs/>
-        </w:rPr>
-        <w:t>Statistical Analyses.</w:t>
-      </w:r>
-      <w:r>
-        <w:t xml:space="preserve">  Statistical significance</w:t>
-      </w:r>
-      <w:r>
-        <w:t xml:space="preserve"> for this stud</w:t>
-      </w:r>
-      <w:r>
-        <w:t xml:space="preserve"> was set at p&lt;0.05.  All analyses were performed using R version 4.4.0 </w:t>
-      </w:r>
-      <w:r>
-        <w:fldChar w:fldCharType="begin"/>
-      </w:r>
-      <w:r>
-        <w:instrText xml:space="preserve"> ADDIN ZOTERO_ITEM CSL_CITATION {"citationID":"UlCX6dpA","properties":{"formattedCitation":"(R Core Team, 2019)","plainCitation":"(R Core Team, 2019)","noteIndex":0},"citationItems":[{"id":8230,"uris":["http://zotero.org/users/7317906/items/3HZT7KXK"],"itemData":{"id":8230,"type":"document","note":"Citation Key: base\npublisher-place: Vienna, Austria","publisher":"R Foundation for Statistical Computing","title":"R: A Language and Environment for Statistical Computing","URL":"http://www.r-project.org/","author":[{"literal":"R Core Team"}],"accessed":{"date-parts":[["2010",10,22]]},"issued":{"date-parts":[["2019"]]},"citation-key":"base"}}],"schema":"https://github.com/citation-style-language/schema/raw/master/csl-citation.json"} </w:instrText>
-      </w:r>
-      <w:r>
-        <w:fldChar w:fldCharType="separate"/>
-      </w:r>
-      <w:r>
-        <w:rPr>
-          <w:noProof/>
-        </w:rPr>
-        <w:t>(R Core Team, 2019)</w:t>
-      </w:r>
-      <w:r>
-        <w:fldChar w:fldCharType="end"/>
-      </w:r>
-      <w:r>
-        <w:t xml:space="preserve">.  For participant demographics, Kruskal-Wallis or Mann-Whitney tests were used as both BMI and participant Age were not normally distributed (p&lt;0.05 via Shapiro-Wilk tests).  </w:t>
-      </w:r>
-      <w:r>
-        <w:t>χ</w:t>
-      </w:r>
-      <w:r>
-        <w:rPr>
-          <w:vertAlign w:val="superscript"/>
-        </w:rPr>
-        <w:t>2</w:t>
-      </w:r>
-      <w:r>
-        <w:t xml:space="preserve"> tests were used to compare counts across groups</w:t>
-      </w:r>
-      <w:r>
-        <w:t xml:space="preserve"> unless counts were expected to be under five per group, in which case Fisher’s exact test was used</w:t>
-      </w:r>
-      <w:r>
-        <w:t>.</w:t>
-      </w:r>
-    </w:p>
-    <w:p>
-      <w:pPr>
-        <w:pStyle w:val="Heading1"/>
-      </w:pPr>
-      <w:r>
-        <w:t>Results</w:t>
-      </w:r>
-    </w:p>
-    <w:p>
-      <w:pPr>
-        <w:pStyle w:val="Heading2"/>
-        <w:rPr>
-          <w:b/>
-          <w:bCs/>
-        </w:rPr>
-      </w:pPr>
-      <w:r>
-        <w:rPr>
-          <w:rStyle w:val="Strong"/>
-          <w:b w:val="0"/>
-          <w:bCs w:val="0"/>
-        </w:rPr>
-        <w:t>Study population</w:t>
-      </w:r>
-    </w:p>
-    <w:p>
-      <w:r>
-        <w:t xml:space="preserve">As shown in Figure 1, we identified </w:t>
-      </w:r>
-      <w:r>
-        <w:t xml:space="preserve">2,893 </w:t>
-      </w:r>
-      <w:r>
-        <w:t xml:space="preserve">participants with diagnoses of Cushing’s disease.  Their average age at diagnosis was </w:t>
-      </w:r>
-      <w:r>
-        <w:t>46.26</w:t>
-      </w:r>
-      <w:r>
-        <w:t xml:space="preserve"> (+/- </w:t>
-      </w:r>
-      <w:r>
-        <w:t>15.53</w:t>
-      </w:r>
-      <w:r>
-        <w:t xml:space="preserve">). </w:t>
-      </w:r>
-      <w:r>
-        <w:t xml:space="preserve">There were 287 female participants, and 72 male participants (80%,20%). </w:t>
-      </w:r>
-      <w:r>
-        <w:t>This is consistent with the gender difference in diagnosis of 4:1 seen in previous studies (</w:t>
-      </w:r>
-      <w:commentRangeStart w:id="12"/>
-      <w:r>
-        <w:t>sources</w:t>
-      </w:r>
-      <w:commentRangeEnd w:id="12"/>
-      <w:r>
-        <w:rPr>
-          <w:rStyle w:val="CommentReference"/>
-          <w:sz w:val="24"/>
-          <w:szCs w:val="24"/>
-        </w:rPr>
-        <w:commentReference w:id="12"/>
-      </w:r>
-      <w:r>
-        <w:t xml:space="preserve">). </w:t>
-      </w:r>
-      <w:r>
-        <w:t xml:space="preserve">The average BMI was 34.72 (+/- 13.78). The participant population was predominately White (87.19%), with the remaining participants identifying as Black (5.29%), Hispanic or Latino (2.79%), Asian (2.23%), or Other (2.51%). </w:t>
-      </w:r>
-    </w:p>
-    <w:p>
-      <w:r>
-        <w:lastRenderedPageBreak/>
-        <w:t xml:space="preserve">To select our patient population, we first began with 5,428,302 participants from the electronic health records of Michigan Medicine. We then eliminated participants that did not have a Cushing’s disease diagnosis, leaving us with 2,893. </w:t>
-      </w:r>
-      <w:r>
-        <w:t>Next, we eliminated participants that did not have a documented treatment date after their diagnosis, giving us 476 participants. We then removed participants that did not have any lab history that we had access to, giving us 453 participants. Finally, we removed a final set of participants that did not have any demographic data, leaving us with our final participant population size of 365.</w:t>
-      </w:r>
-      <w:r>
-        <w:t xml:space="preserve"> This leaves us with a diagnosis rate of xx, as our first recorded patient diagnosis date was in the year </w:t>
-      </w:r>
-      <w:commentRangeStart w:id="13"/>
-      <w:r>
-        <w:t>xxx</w:t>
-      </w:r>
-      <w:commentRangeEnd w:id="13"/>
-      <w:r>
-        <w:rPr>
-          <w:rStyle w:val="CommentReference"/>
-          <w:sz w:val="24"/>
-          <w:szCs w:val="24"/>
-        </w:rPr>
-        <w:commentReference w:id="13"/>
-      </w:r>
-      <w:r>
-        <w:t xml:space="preserve">. This is </w:t>
-      </w:r>
-      <w:commentRangeStart w:id="14"/>
-      <w:r>
-        <w:t xml:space="preserve">consistent </w:t>
-      </w:r>
-      <w:commentRangeEnd w:id="14"/>
-      <w:r>
-        <w:rPr>
-          <w:rStyle w:val="CommentReference"/>
-          <w:sz w:val="24"/>
-          <w:szCs w:val="24"/>
-        </w:rPr>
-        <w:commentReference w:id="14"/>
-      </w:r>
-      <w:r>
-        <w:t xml:space="preserve">with the average incidence rate per year established in previous studies, which is </w:t>
-      </w:r>
-      <w:r>
-        <w:t>1.39-2.4 cases per million per year (</w:t>
-      </w:r>
-      <w:commentRangeStart w:id="15"/>
-      <w:r>
-        <w:t>sources</w:t>
-      </w:r>
-      <w:commentRangeEnd w:id="15"/>
-      <w:r>
-        <w:rPr>
-          <w:rStyle w:val="CommentReference"/>
-          <w:sz w:val="24"/>
-          <w:szCs w:val="24"/>
-        </w:rPr>
-        <w:commentReference w:id="15"/>
-      </w:r>
-      <w:r>
-        <w:t xml:space="preserve">). Of </w:t>
-      </w:r>
-      <w:r>
-        <w:t xml:space="preserve">these 365 participants, we were able to get glucose </w:t>
-      </w:r>
-      <w:commentRangeStart w:id="16"/>
-      <w:r>
-        <w:t>measurements</w:t>
-      </w:r>
-      <w:commentRangeEnd w:id="16"/>
-      <w:r>
-        <w:rPr>
-          <w:rStyle w:val="CommentReference"/>
-          <w:sz w:val="24"/>
-          <w:szCs w:val="24"/>
-        </w:rPr>
-        <w:commentReference w:id="16"/>
-      </w:r>
-      <w:r>
-        <w:t xml:space="preserve"> for all 365, HbA1c values for 17, ALT values for 84, </w:t>
-      </w:r>
-      <w:r>
-        <w:t xml:space="preserve">AST values for </w:t>
-      </w:r>
-      <w:commentRangeStart w:id="17"/>
-      <w:r>
-        <w:t>xx</w:t>
-      </w:r>
-      <w:commentRangeEnd w:id="17"/>
-      <w:r>
-        <w:rPr>
-          <w:rStyle w:val="CommentReference"/>
-          <w:sz w:val="24"/>
-          <w:szCs w:val="24"/>
-        </w:rPr>
-        <w:commentReference w:id="17"/>
-      </w:r>
-      <w:r>
-        <w:t>, LDL-C values for 10, and blood pressure data for 306 participants.</w:t>
-      </w:r>
-      <w:r>
-        <w:t xml:space="preserve"> </w:t>
-      </w:r>
-    </w:p>
-    <w:p>
-      <w:r>
-        <w:t xml:space="preserve">To select our control group population, we began with the same 5,428,302 patients from the electronic health records of Michigan Medicine. We then eliminated 5,075,888 participants that were not part of Michigan Medicine primary care, leaving us with 352,414 participants. We then eliminated people that did not have a complete demographic set, leaving us with 181,624 participants. </w:t>
-      </w:r>
-      <w:commentRangeStart w:id="18"/>
-      <w:r>
-        <w:t>We then eliminated participants for a variety of reasons to get our final control group population under 100,000. This was necessary as Data</w:t>
-      </w:r>
-      <w:r>
-        <w:t>Direct only allowed a maximum data pull of 100,000 or less.</w:t>
-      </w:r>
-      <w:commentRangeEnd w:id="18"/>
-      <w:r>
-        <w:rPr>
-          <w:rStyle w:val="CommentReference"/>
-          <w:sz w:val="24"/>
-          <w:szCs w:val="24"/>
-        </w:rPr>
-        <w:commentReference w:id="18"/>
-      </w:r>
-      <w:r>
-        <w:t xml:space="preserve"> Among the criteria was the date of service must have been between 11/01/2022 – 03/24/2025, and participants must have been ages 18-100. Their BMI also had to be </w:t>
-      </w:r>
-      <w:commentRangeStart w:id="19"/>
-      <w:r>
-        <w:t>within 5.0 and 75.0.</w:t>
-      </w:r>
-      <w:commentRangeEnd w:id="19"/>
-      <w:r>
-        <w:rPr>
-          <w:rStyle w:val="CommentReference"/>
-          <w:sz w:val="24"/>
-          <w:szCs w:val="24"/>
-        </w:rPr>
-        <w:commentReference w:id="19"/>
-      </w:r>
-    </w:p>
-    <w:p/>
-    <w:p>
-      <w:pPr>
-        <w:pStyle w:val="Heading2"/>
-        <w:rPr>
-          <w:rStyle w:val="Strong"/>
-          <w:b w:val="0"/>
-          <w:bCs w:val="0"/>
-        </w:rPr>
-      </w:pPr>
-      <w:r>
-        <w:rPr>
-          <w:rStyle w:val="Strong"/>
-          <w:b w:val="0"/>
-          <w:bCs w:val="0"/>
-        </w:rPr>
-        <w:t>Participant characteristics</w:t>
-      </w:r>
-      <w:r>
-        <w:rPr>
-          <w:rStyle w:val="Strong"/>
-          <w:b w:val="0"/>
-          <w:bCs w:val="0"/>
-        </w:rPr>
-        <w:t xml:space="preserve"> </w:t>
-      </w:r>
-      <w:r>
-        <w:rPr>
-          <w:rStyle w:val="Strong"/>
-          <w:b w:val="0"/>
-          <w:bCs w:val="0"/>
-        </w:rPr>
-        <w:t xml:space="preserve">associated with </w:t>
-      </w:r>
-      <w:r>
-        <w:rPr>
-          <w:rStyle w:val="Strong"/>
-          <w:b w:val="0"/>
-          <w:bCs w:val="0"/>
-        </w:rPr>
-        <w:t xml:space="preserve">Cushing’s </w:t>
-      </w:r>
-      <w:r>
-        <w:rPr>
-          <w:rStyle w:val="Strong"/>
-          <w:b w:val="0"/>
-          <w:bCs w:val="0"/>
-        </w:rPr>
-        <w:t xml:space="preserve">disease </w:t>
-      </w:r>
-    </w:p>
-    <w:p>
-      <w:r>
-        <w:t xml:space="preserve">We performed outcome-specific propensity matching to identify appropriate controls, starting from those with generating exact matches for gender, race and ethnicity.  We then algorithmically matched for age, generating 10 controls for each case.  Matching was </w:t>
-      </w:r>
-      <w:r>
-        <w:t xml:space="preserve">effective </w:t>
-      </w:r>
-      <w:r>
-        <w:t xml:space="preserve"> with a </w:t>
-      </w:r>
-      <w:r>
-        <w:t>standardized mean difference</w:t>
-      </w:r>
-      <w:r>
-        <w:t xml:space="preserve"> for age of &lt;0.05 for each outcome (see </w:t>
-      </w:r>
-      <w:r>
-        <w:t xml:space="preserve">Table 1, </w:t>
-      </w:r>
-      <w:r>
-        <w:t xml:space="preserve">Supplementary </w:t>
-      </w:r>
-      <w:r>
-        <w:t xml:space="preserve">Figure </w:t>
-      </w:r>
-      <w:r>
-        <w:t>1</w:t>
-      </w:r>
-      <w:r>
-        <w:t xml:space="preserve"> and Supplementary Table S1).</w:t>
-      </w:r>
-    </w:p>
-    <w:p>
-      <w:r>
-        <w:t xml:space="preserve">Primary descriptive characteristics are </w:t>
-      </w:r>
-      <w:r>
-        <w:t>provided</w:t>
-      </w:r>
-      <w:r>
-        <w:t xml:space="preserve"> for all participants with any available laboratory measurement</w:t>
-      </w:r>
-      <w:r>
-        <w:t xml:space="preserve"> </w:t>
-      </w:r>
-      <w:r>
-        <w:t>(Table 1)</w:t>
-      </w:r>
-      <w:r>
-        <w:t xml:space="preserve">. </w:t>
-      </w:r>
-      <w:r>
-        <w:t>Outcome-specific matched sets are described in Supplementary Tables S2</w:t>
-      </w:r>
-      <w:r>
-        <w:t>A-E</w:t>
-      </w:r>
-      <w:r>
-        <w:t>.</w:t>
-      </w:r>
-      <w:r>
-        <w:t xml:space="preserve">   Here we reproduce several notable characteristics, including a higher prevalence of Cushing’s disease in females (284 vs 72</w:t>
-      </w:r>
-      <w:r>
-        <w:t>, p&lt;0.00</w:t>
-      </w:r>
-      <w:r>
-        <w:t>1</w:t>
-      </w:r>
-      <w:r>
-        <w:t>)</w:t>
-      </w:r>
-      <w:r>
-        <w:t>, consistent with the prior literature</w:t>
-      </w:r>
-      <w:r>
-        <w:t xml:space="preserve"> </w:t>
-      </w:r>
-      <w:r>
-        <w:fldChar w:fldCharType="begin"/>
-      </w:r>
-      <w:r>
-        <w:instrText xml:space="preserve"> ADDIN ZOTERO_ITEM CSL_CITATION {"citationID":"5iZIPs39","properties":{"formattedCitation":"(Alqeeq et al., 2024; Broder et al., 2015; Etxabe &amp; Vazquez, 1994; Matthiasdottir et al., 2024; Steffensen et al., 2010)","plainCitation":"(Alqeeq et al., 2024; Broder et al., 2015; Etxabe &amp; Vazquez, 1994; Matthiasdottir et al., 2024; Steffensen et al., 2010)","noteIndex":0},"citationItems":[{"id":27029,"uris":["http://zotero.org/users/7317906/items/5UXH2J3G"],"itemData":{"id":27029,"type":"article-journal","abstract":"BACKGROUND AND OBJECTIVES: Cushing's disease is a rare endocrine disorder. This review aimed to examine sex-specific differences in Cushing's disease.\nDESIGN AND SETTINGS: A meta-analysis was performed on published articles discussing the gender impact of Cushing's disease.\nMETHODS: A systematic search was conducted to identify studies from Medline, Embase, CENTRAL and Scopus. Nine studies enrolling 1047 patients diagnosed with Cushing's disease were included in this meta-analysis.\nRESULTS: Male patients presented at a younger age (MD [mean difference]=-5.43; 95% CI [-5.78, -5.08]; P&lt;.00001) than females. Male patients had a significantly higher prevalence of osteoporosis (RR [risk ratio]=1.75; 95% CI [1.36, 225]; P&lt;.0001) and hypokalemia (RR=1.66; 95% CI [1.27, 2.16]; P=.0002). In addition, males had significantly higher rates of negative magnetic resonance imaging (RR=1.53; 95% CI [1.18, 2.0]; P=.002). No sex difference was observed in the prevalence of diabetes (RR=0.92; 95% CI [0.70, 1.22]); P=.57) and dyslipidemia (RR=1.33; 95% CI [0.88, 2.0]; P=.17).\nCONCLUSION: Cushing's disease has a worse clinical presentation in males and more diagnostic difficulties compared to females.","container-title":"Annals of Saudi Medicine","DOI":"10.5144/0256-4947.2024.55","ISSN":"0975-4466","issue":"1","journalAbbreviation":"Ann Saudi Med","language":"eng","note":"PMID: 38311874\nPMCID: PMC10839456","page":"55-65","source":"PubMed","title":"Sex-related differences in Cushing's disease: a systematic review and meta-analysis","title-short":"Sex-related differences in Cushing's disease","volume":"44","author":[{"family":"Alqeeq","given":"Basel F."},{"family":"Ayyad","given":"Mohammed"},{"family":"Almadhoun","given":"Waseem J."},{"family":"Aboabdo","given":"Mohammad"},{"family":"Aldahdouh","given":"Mosheer S."},{"family":"Al-Tawil","given":"Mohammed"},{"family":"Al-Ghazali","given":"Ahmed M."}],"issued":{"date-parts":[["2024"]]},"citation-key":"alqeeqSexrelatedDifferencesCushings2024"}},{"id":27016,"uris":["http://zotero.org/users/7317906/items/RNS3FR6N"],"itemData":{"id":27016,"type":"article-journal","abstract":"PURPOSE: To estimate the incidence of Cushing's syndrome (CS) and Cushing's disease (CD) in the US.\nMETHODS: MarketScan Commercial database 2007-2010 (age &lt;65 years) was used. CS patients were defined with ≥2 claims of CS diagnosis, while CD patients were defined with CS plus a benign pituitary adenoma diagnosis or hypophysectomy in the same calendar year. Annual incidence was calculated by dividing the number of CS or CD cases by the total number of members with the same enrollment requirement during the calendar years.\nRESULTS: CS incidence rates per million person-years were 48.6 in 2009 and 39.5 in 2010. The lowest rates of CS were in ≤17-year-olds and highest rates were in 35 to 44-year-olds. CD incidence rates were 7.6 in 2009 and 6.2 in 2010. The lowest rates of CD were in ≤17-year-olds and highest rates were in 18 to 24-year-olds. The rates varied by sex (2.3-2.7 in males, 9.8-12.1 in females). In females, lowest rates ranged 2.5-4.0 in ≤17-year-olds and highest 16.7-27.2 in 18-24 year olds. In males, there were too few cases to report estimates by age.\nCONCLUSIONS: In the first large US-based study, the annual incidence of CS in individuals &lt;65 years old was nearly 49 cases per million, substantially higher than previous estimates, which were based primarily on European data. Using similar methods, we estimated the incidence of CD at nearly 8 cases per million US population. These estimates, if confirmed in other epidemiologic databases, represent a new data reference in these rare conditions.","container-title":"Pituitary","DOI":"10.1007/s11102-014-0569-6","ISSN":"1573-7403","issue":"3","journalAbbreviation":"Pituitary","language":"eng","note":"PMID: 24803324","page":"283-289","source":"PubMed","title":"Incidence of Cushing's syndrome and Cushing's disease in commercially-insured patients &lt;65 years old in the United States","volume":"18","author":[{"family":"Broder","given":"Michael S."},{"family":"Neary","given":"Maureen P."},{"family":"Chang","given":"Eunice"},{"family":"Cherepanov","given":"Dasha"},{"family":"Ludlam","given":"William H."}],"issued":{"date-parts":[["2015",6]]},"citation-key":"broderIncidenceCushingsSyndrome2015"}},{"id":1348,"uris":["http://zotero.org/users/7317906/items/V5L6B4RJ"],"itemData":{"id":1348,"type":"article-journal","abstract":"OBJECTIVE: Although Cushing's disease is a well documented clinical entity, there is no epidemiological information about it. The present study tries to obtain this information. DESIGN AND PATIENTS: Forty-nine patients affected by Cushing's disease living in Vizcaya (Spain) between 1975 and 1992 were considered for an epidemiological study. RESULTS: The prevalence of known cases at the end of 1992 was 39.1 per million inhabitants. The average incidence of newly diagnosed cases was 2.4 cases per million people per year. Cushing's disease was more frequent in women (n = 46) than in men (n = 3), with a ratio of 15:1. Diabetes mellitus and hypertension were observed in 38.7 and 55.1% of patients, respectively. Remission of Cushing's disease was achieved in 36 out of 41 patients (87.5%). In general, the mortality was higher than that expected for the control population (standardized mortality ratio, SMR 3.8, 95% confidence interval, CI 2.5-17.9, P &lt; 0.03). Concerning the cause of death, the SMR of vascular disease was 5 (95% CI 3.4-48.6, P &lt; 0.05). Higher age, persistence of hypertension and abnormalities of glucose metabolism after treatment, were independent predictors of mortality (multivariate analyses, P &lt; 0.01). CONCLUSIONS: Prevalence of Cushing's disease was 39.1 cases/million inhabitants and average incidence was 2.4 cases/million per year. Mortality was elevated, due to vascular disease, associated with higher age, persistence of hypertension and impaired glucose metabolism.","container-title":"Clin Endocrinol (Oxf)","DOI":"10.1111/j.1365-2265.1994.tb02486.x","ISSN":"0300-0664","issue":"4","note":"PMID: 8187313\nISBN: 0300-0664 (Print)\\r0300-0664 (Linking)","page":"479-484","title":"Morbidity and mortality in Cushing's disease: an epidemiological approach","volume":"40","author":[{"family":"Etxabe","given":"J"},{"family":"Vazquez","given":"J A"}],"issued":{"date-parts":[["1994"]]},"citation-key":"etxabeMorbidityMortalityCushings1994"}},{"id":27026,"uris":["http://zotero.org/users/7317906/items/X2VBVW53"],"itemData":{"id":27026,"type":"article-journal","abstract":"Introduction: In 2011, we reported the overall incidence of Cushing’s disease (CD) in Iceland from 1955 through 2009 to be 1.5 cases per million per year with highest incidence in the last decade of the study, a higher incidence then earlier reported. We now present a follow-up study reporting the epidemiology of the disease in Iceland during the 10-year period from 2010 to 2019. Methods: In this nationwide retrospective study, clinical information on patients diagnosed with CD was obtained from electronic medical records, reviewed by consulting endocrinologists. Results: Seventeen patients were diagnosed with CD, 12 women (71%) and 5 men (29%) giving an overall incidence of 5.2 cases per million per year. The mean age at diagnosis was 46 years (range 13–85 years). Biochemical analysis was recorded for all patients and 12 patients (71%) had visible pituitary adenoma on imaging studies. Sixteen patients (94%) were treated with transsphenoidal surgery of which 4 patients (24%) had gamma knife radiosurgery and three (18%) bilateral adrenalectomy after pituitary surgery. Two patients died during the study period. Conclusion: The overall incidence of CD of 5.2 cases per million per year is higher than previously reported, indicating the importance of awareness of CD. As all patients with CD are diagnosed and/or treated at the only University Hospital in Iceland, housing the only department of endocrinology as well as neurosurgery, we are confident that all cases diagnosed during the study period were included in the study.","container-title":"Neuroendocrinology","DOI":"10.1159/000540205","ISSN":"0028-3835","issue":"10","journalAbbreviation":"Neuroendocrinology","page":"950-957","source":"Silverchair","title":"Cushing’s Disease May Have Higher Incidence than Previously Thought: A Nationwide Study in Iceland 2010–2019","title-short":"Cushing’s Disease May Have Higher Incidence than Previously Thought","volume":"114","author":[{"family":"Matthiasdottir","given":"Anna Mjoll"},{"family":"Hardarson","given":"Thorgeir Orri"},{"family":"Arnardottir","given":"Steinunn"},{"family":"Sigurjonsdottir","given":"Helga Agusta"}],"issued":{"date-parts":[["2024",7,22]]},"citation-key":"matthiasdottirCushingsDiseaseMay2024"}},{"id":27019,"uris":["http://zotero.org/users/7317906/items/RTX3YT8D"],"itemData":{"id":27019,"type":"article-journal","abstract":"Overt Cushing’s syndrome is a rare disorder with an annual incidence of 2–3/million of which benign adrenal adenomas account for 0.6/million. The female:male ratio is 3:1. Preliminary data indicate a high proportion of subclinical Cushing’s syndrome in certain risk populations such as patients with type 2 diabetes or osteoporosis. The clinical implications of these observations are presently unclear. Surgery remains first line treatment for overt disease and initial cure or remission is obtained in 65–85% of patients with Cushing’s disease. Late recurrences, however, occur in up to 20% and the risk does not seem to plateau even after 20 years of follow-up. A 2- to 3-fold increase in mortality is observed in most studies, and this excess mortality seems confined to patients in whom initial cure was not obtained. Cushing’s syndrome continues to pose diagnostic and therapeutic challenges and life-long follow-up is mandatory.","container-title":"Neuroendocrinology","DOI":"10.1159/000314297","ISSN":"0028-3835","issue":"Suppl. 1","journalAbbreviation":"Neuroendocrinology","page":"1-5","source":"Silverchair","title":"Epidemiology of Cushing’s Syndrome","volume":"92","author":[{"family":"Steffensen","given":"Charlotte"},{"family":"Bak","given":"Ann Mosegaard"},{"family":"Zøylner Rubeck","given":"Kristine"},{"family":"Jørgensen","given":"Jens Otto Lunde"}],"issued":{"date-parts":[["2010",9,10]]},"citation-key":"steffensenEpidemiologyCushingsSyndrome2010"}}],"schema":"https://github.com/citation-style-language/schema/raw/master/csl-citation.json"} </w:instrText>
-      </w:r>
-      <w:r>
-        <w:fldChar w:fldCharType="separate"/>
-      </w:r>
-      <w:r>
-        <w:rPr>
-          <w:noProof/>
-        </w:rPr>
-        <w:t>(Alqeeq et al., 2024; Broder et al., 2015; Etxabe &amp; Vazquez, 1994; Matthiasdottir et al., 2024; Steffensen et al., 2010)</w:t>
-      </w:r>
-      <w:r>
-        <w:fldChar w:fldCharType="end"/>
-      </w:r>
-      <w:r>
-        <w:t>.  As expected</w:t>
-      </w:r>
-      <w:r>
-        <w:t>,</w:t>
-      </w:r>
-      <w:r>
-        <w:t xml:space="preserve"> we also </w:t>
-      </w:r>
-      <w:r>
-        <w:lastRenderedPageBreak/>
-        <w:t>observed</w:t>
-      </w:r>
-      <w:r>
-        <w:rPr>
-          <w:rStyle w:val="CommentReference"/>
-        </w:rPr>
-        <w:t xml:space="preserve"> </w:t>
-      </w:r>
-      <w:r>
-        <w:t>a higher body mass index for patients with Cushing’s disease (both p&lt;0.001).</w:t>
-      </w:r>
-      <w:r>
-        <w:t xml:space="preserve">  </w:t>
-      </w:r>
-      <w:r>
-        <w:t>Prior to matching for Race and Ethnicity, we noted that participants</w:t>
-      </w:r>
-      <w:r>
-        <w:t xml:space="preserve"> with Cushing’s disease were more likely to </w:t>
-      </w:r>
-      <w:r>
-        <w:t>identify as Non-Hispanic White (87%) than the overall Michigan Medicine participant population (75% Non-Hispanic White</w:t>
-      </w:r>
-      <w:r>
-        <w:t>, p</w:t>
-      </w:r>
-      <w:r>
-        <w:t>&lt;0.001</w:t>
-      </w:r>
-      <w:r>
-        <w:t>).</w:t>
-      </w:r>
-      <w:r>
-        <w:t xml:space="preserve">  Correspondingly</w:t>
-      </w:r>
-      <w:r>
-        <w:t>,</w:t>
-      </w:r>
-      <w:r>
-        <w:t xml:space="preserve"> participants with Cushing’s disease were less likely to identify as Asian </w:t>
-      </w:r>
-      <w:r>
-        <w:t xml:space="preserve">(p&lt;0.001) </w:t>
-      </w:r>
-      <w:r>
-        <w:t>or Black</w:t>
-      </w:r>
-      <w:r>
-        <w:t xml:space="preserve"> (p=0.01</w:t>
-      </w:r>
-      <w:r>
-        <w:t>8</w:t>
-      </w:r>
-      <w:r>
-        <w:t>)</w:t>
-      </w:r>
-      <w:r>
-        <w:t>.</w:t>
-      </w:r>
-      <w:r>
-        <w:t xml:space="preserve">  This is consistent with other reports on the prevalence of Cushing’s disease across racial groups </w:t>
-      </w:r>
-      <w:r>
-        <w:fldChar w:fldCharType="begin"/>
-      </w:r>
-      <w:r>
-        <w:instrText xml:space="preserve"> ADDIN ZOTERO_ITEM CSL_CITATION {"citationID":"Zf5euBGy","properties":{"formattedCitation":"(Ioachimescu et al., 2022; Omotosho et al., 2024)","plainCitation":"(Ioachimescu et al., 2022; Omotosho et al., 2024)","noteIndex":0},"citationItems":[{"id":27032,"uris":["http://zotero.org/users/7317906/items/EVS87VVY"],"itemData":{"id":27032,"type":"article-journal","abstract":"Acromegaly (ACM) and Cushing’s disease (CD) are caused by functioning pituitary adenomas secreting growth hormone and ACTH respectively.To determine the impact of race on presentation and postoperative outcomes in adults with ACM and CD, which has not yet been evaluated.This is a retrospective study of consecutive patients operated at a large-volume pituitary center. We evaluated (1) racial distribution of patients residing in the metropolitan area (Metro, N</w:instrText>
-      </w:r>
-      <w:r>
-        <w:rPr>
-          <w:rFonts w:ascii="Arial" w:hAnsi="Arial" w:cs="Arial"/>
-        </w:rPr>
-        <w:instrText> </w:instrText>
-      </w:r>
-      <w:r>
-        <w:instrText>=</w:instrText>
-      </w:r>
-      <w:r>
-        <w:rPr>
-          <w:rFonts w:ascii="Arial" w:hAnsi="Arial" w:cs="Arial"/>
-        </w:rPr>
-        <w:instrText> </w:instrText>
-      </w:r>
-      <w:r>
-        <w:instrText>124) vs 2010 US census data, and(2) presentation and postoperative outcomes in Black vs White for patients from the entire catchment area (N</w:instrText>
-      </w:r>
-      <w:r>
-        <w:rPr>
-          <w:rFonts w:ascii="Arial" w:hAnsi="Arial" w:cs="Arial"/>
-        </w:rPr>
-        <w:instrText> </w:instrText>
-      </w:r>
-      <w:r>
-        <w:instrText>=</w:instrText>
-      </w:r>
-      <w:r>
-        <w:rPr>
-          <w:rFonts w:ascii="Arial" w:hAnsi="Arial" w:cs="Arial"/>
-        </w:rPr>
-        <w:instrText> </w:instrText>
-      </w:r>
-      <w:r>
-        <w:instrText>241).For Metro area (32.4% Black population), Black patients represented 16.75% ACM (P</w:instrText>
-      </w:r>
-      <w:r>
-        <w:rPr>
-          <w:rFonts w:ascii="Arial" w:hAnsi="Arial" w:cs="Arial"/>
-        </w:rPr>
-        <w:instrText> </w:instrText>
-      </w:r>
-      <w:r>
-        <w:instrText>=</w:instrText>
-      </w:r>
-      <w:r>
-        <w:rPr>
-          <w:rFonts w:ascii="Arial" w:hAnsi="Arial" w:cs="Arial"/>
-        </w:rPr>
-        <w:instrText> </w:instrText>
-      </w:r>
-      <w:r>
-        <w:instrText>.006) and 29.2% CD (P</w:instrText>
-      </w:r>
-      <w:r>
-        <w:rPr>
-          <w:rFonts w:ascii="Arial" w:hAnsi="Arial" w:cs="Arial"/>
-        </w:rPr>
-        <w:instrText> </w:instrText>
-      </w:r>
-      <w:r>
-        <w:instrText>=</w:instrText>
-      </w:r>
-      <w:r>
-        <w:rPr>
-          <w:rFonts w:ascii="Arial" w:hAnsi="Arial" w:cs="Arial"/>
-        </w:rPr>
-        <w:instrText> </w:instrText>
-      </w:r>
-      <w:r>
-        <w:instrText>.56). Among the total 112 patients with ACM, presentations with headaches or incidentaloma were more common in Black patients (76.9% vs 31% White, P</w:instrText>
-      </w:r>
-      <w:r>
-        <w:rPr>
-          <w:rFonts w:ascii="Arial" w:hAnsi="Arial" w:cs="Arial"/>
-        </w:rPr>
-        <w:instrText> </w:instrText>
-      </w:r>
-      <w:r>
-        <w:instrText>=</w:instrText>
-      </w:r>
-      <w:r>
-        <w:rPr>
-          <w:rFonts w:ascii="Arial" w:hAnsi="Arial" w:cs="Arial"/>
-        </w:rPr>
-        <w:instrText> </w:instrText>
-      </w:r>
-      <w:r>
-        <w:instrText>.01). Black patients had a higher prevalence of diabetes (54% vs 16% White, P</w:instrText>
-      </w:r>
-      <w:r>
-        <w:rPr>
-          <w:rFonts w:ascii="Arial" w:hAnsi="Arial" w:cs="Arial"/>
-        </w:rPr>
-        <w:instrText> </w:instrText>
-      </w:r>
-      <w:r>
-        <w:instrText>=</w:instrText>
-      </w:r>
-      <w:r>
-        <w:rPr>
-          <w:rFonts w:ascii="Arial" w:hAnsi="Arial" w:cs="Arial"/>
-        </w:rPr>
-        <w:instrText> </w:instrText>
-      </w:r>
-      <w:r>
-        <w:instrText>.005), significantly lower insulin-like growth factor (IGF)-1 deviation from normal (P</w:instrText>
-      </w:r>
-      <w:r>
-        <w:rPr>
-          <w:rFonts w:ascii="Arial" w:hAnsi="Arial" w:cs="Arial"/>
-        </w:rPr>
-        <w:instrText> </w:instrText>
-      </w:r>
-      <w:r>
-        <w:instrText>=</w:instrText>
-      </w:r>
-      <w:r>
-        <w:rPr>
-          <w:rFonts w:ascii="Arial" w:hAnsi="Arial" w:cs="Arial"/>
-        </w:rPr>
-        <w:instrText> </w:instrText>
-      </w:r>
-      <w:r>
-        <w:instrText>.03) and borderline lower median growth hormone levels (P</w:instrText>
-      </w:r>
-      <w:r>
-        <w:rPr>
-          <w:rFonts w:ascii="Arial" w:hAnsi="Arial" w:cs="Arial"/>
-        </w:rPr>
-        <w:instrText> </w:instrText>
-      </w:r>
-      <w:r>
-        <w:instrText>=</w:instrText>
-      </w:r>
-      <w:r>
-        <w:rPr>
-          <w:rFonts w:ascii="Arial" w:hAnsi="Arial" w:cs="Arial"/>
-        </w:rPr>
-        <w:instrText> </w:instrText>
-      </w:r>
-      <w:r>
-        <w:instrText>.09). Mean tumor diameter and proportion of tumors with cavernous sinus invasion were similar. Three-month biochemical remission (46% Black, 55% White, P</w:instrText>
-      </w:r>
-      <w:r>
-        <w:rPr>
-          <w:rFonts w:ascii="Arial" w:hAnsi="Arial" w:cs="Arial"/>
-        </w:rPr>
-        <w:instrText> </w:instrText>
-      </w:r>
-      <w:r>
-        <w:instrText>=</w:instrText>
-      </w:r>
-      <w:r>
-        <w:rPr>
-          <w:rFonts w:ascii="Arial" w:hAnsi="Arial" w:cs="Arial"/>
-        </w:rPr>
-        <w:instrText> </w:instrText>
-      </w:r>
-      <w:r>
-        <w:instrText>.76) and long-term IGF-1 control by multimodality therapy (92.3% Black, 80.5% White, P</w:instrText>
-      </w:r>
-      <w:r>
-        <w:rPr>
-          <w:rFonts w:ascii="Arial" w:hAnsi="Arial" w:cs="Arial"/>
-        </w:rPr>
-        <w:instrText> </w:instrText>
-      </w:r>
-      <w:r>
-        <w:instrText>=</w:instrText>
-      </w:r>
-      <w:r>
-        <w:rPr>
-          <w:rFonts w:ascii="Arial" w:hAnsi="Arial" w:cs="Arial"/>
-        </w:rPr>
-        <w:instrText> </w:instrText>
-      </w:r>
-      <w:r>
-        <w:instrText>.45) were similar. Among the total 129 patients with CD, Black patients had more hypopituitarism (69% vs 45% White, P</w:instrText>
-      </w:r>
-      <w:r>
-        <w:rPr>
-          <w:rFonts w:ascii="Arial" w:hAnsi="Arial" w:cs="Arial"/>
-        </w:rPr>
-        <w:instrText> </w:instrText>
-      </w:r>
-      <w:r>
-        <w:instrText>=</w:instrText>
-      </w:r>
-      <w:r>
-        <w:rPr>
-          <w:rFonts w:ascii="Arial" w:hAnsi="Arial" w:cs="Arial"/>
-        </w:rPr>
-        <w:instrText> </w:instrText>
-      </w:r>
-      <w:r>
-        <w:instrText>.04) and macroadenomas (33% vs 15% White, P</w:instrText>
-      </w:r>
-      <w:r>
-        <w:rPr>
-          <w:rFonts w:ascii="Arial" w:hAnsi="Arial" w:cs="Arial"/>
-        </w:rPr>
-        <w:instrText> </w:instrText>
-      </w:r>
-      <w:r>
-        <w:instrText>=</w:instrText>
-      </w:r>
-      <w:r>
-        <w:rPr>
-          <w:rFonts w:ascii="Arial" w:hAnsi="Arial" w:cs="Arial"/>
-        </w:rPr>
-        <w:instrText> </w:instrText>
-      </w:r>
-      <w:r>
-        <w:instrText>.05). At 3 months, remission rate was borderline higher in White (92% vs 78% Black, P</w:instrText>
-      </w:r>
-      <w:r>
-        <w:rPr>
-          <w:rFonts w:ascii="Arial" w:hAnsi="Arial" w:cs="Arial"/>
-        </w:rPr>
-        <w:instrText> </w:instrText>
-      </w:r>
-      <w:r>
-        <w:instrText>=</w:instrText>
-      </w:r>
-      <w:r>
-        <w:rPr>
-          <w:rFonts w:ascii="Arial" w:hAnsi="Arial" w:cs="Arial"/>
-        </w:rPr>
-        <w:instrText> </w:instrText>
-      </w:r>
-      <w:r>
-        <w:instrText xml:space="preserve">0.08), which was attributed to macroadenomas by logistic regression.We identified disparities regarding racial distribution, and clinical and biochemical characteristics in ACM, suggesting late or missed diagnosis in Black patients. Large nationwide studies are necessary to confirm our findings.","container-title":"Journal of the Endocrine Society","DOI":"10.1210/jendso/bvab176","ISSN":"2472-1972","issue":"1","journalAbbreviation":"J. Endocr. Soc.","page":"bvab176","source":"Silverchair","title":"Racial Disparities in Acromegaly and Cushing’s Disease: A Referral Center Study in 241 Patients","title-short":"Racial Disparities in Acromegaly and Cushing’s Disease","volume":"6","author":[{"family":"Ioachimescu","given":"Adriana G"},{"family":"Goswami","given":"Neevedita"},{"family":"Handa","given":"Talin"},{"family":"Pappy","given":"Adlai"},{"family":"Veledar","given":"Emir"},{"family":"Oyesiku","given":"Nelson M"}],"issued":{"date-parts":[["2022",1,1]]},"citation-key":"ioachimescuRacialDisparitiesAcromegaly2022"}},{"id":27042,"uris":["http://zotero.org/users/7317906/items/H96MA6T6"],"itemData":{"id":27042,"type":"article-journal","abstract":"Y.B. Omotosho: None. R. McGlotten: None. P. Chittiboina: None. L. Nieman: None.Background: Early recognition and treatment of Cushing’s syndrome (CS) is important to reduce mortality, forestall additional co-morbidities, and improve long-term quality of life. Little is known about how adverse social determinants of health (SDOH) influence the achievement of this goal.Objective: To investigate the impact of race (Black vs White) and UFC on the time to definitive diagnosis and treatment of Cushing’s disease (CD).Methods: This is a retrospective cohort study of 114 patients (pts) (including all Non-Hispanic Blacks) evaluated at the National Institutes of Health between 1990-2022, who had CD based on pathology (ACTH-positive tumor immunohistochemistry) or biochemical remission after transsphenoidal surgery (TSS). 38 Non-Hispanic Black patients met entry criteria. They were matched 1:2 by age (within five years) and sex. We excluded patients with cyclic CS, recurrent CD, previous pituitary surgery or radiation therapy and/or a delay between diagnostic evaluation and surgery of more than 4 weeks. We limited cohorts to only Non-Hispanic Blacks and Whites for this pilot study and plan to extend this to smaller race/ethnicity groups in the future. The onset of clinical symptoms was documented as self-reported by the patients. We analyzed the difference between the year of symptom onset and the date TSS was performed, to obtain an estimated duration of diagnosis. The highest 24h urine cortisol (UFC) value for each patient was noted. Non-normal data are described as median [interquartile range]. Group comparisons used the Wilcoxon rank sum test for the time to etiologic diagnosis, age, and UFC. Statistical analyses were done using R/RStudio statistical software. P value &amp;lt;0.05 was considered significant. Results: Each racial group included 76.3% females and 23.7% males. The median age at TSS was 39.5 years [30.0 – 50.8] for Blacks and 41.5 years [31.8 - 53.3] for Whites (P= 0.7). The median UFC was 326 mcg/24h [156 - 491] for Blacks and 264 [166 - 609] for Whites (P= 0.8). The median duration from symptom onset to CD diagnosis was 3.67 years [2.76 - 6.29] for Blacks and for 2.56 years [1.57 - 4.13] for Whites. Analysis of the differences in time to diagnosis between both groups confirmed a significant disparity with blacks having a median delay of 1.1 years more than whites (P= 0.001). Discussion: We do not have information on other SDOH in our patients, such as access to providers, education level, or their perception of the medical community. The present data suggest that racial background serves as a limiting factor in the diagnosis and differential diagnosis of CS, and that differences in severity of hypercortisolism do not explain this disparity. More work is needed to understand the reasons for this disparity as we continue to strive towards health equity.Monday, June 3, 2024","container-title":"Journal of the Endocrine Society","DOI":"10.1210/jendso/bvae163.2408","ISSN":"2472-1972","issue":"Supplement_1","journalAbbreviation":"J. Endocr. Soc.","page":"bvae163.2408","source":"Silverchair","title":"MON-113 Racial Disparity in the Time to Diagnosis of Cushing’s Disease","volume":"8","author":[{"family":"Omotosho","given":"Y B"},{"family":"McGlotten","given":"R"},{"family":"Chittiboina","given":"P"},{"family":"Nieman","given":"L"}],"issued":{"date-parts":[["2024",10,1]]},"citation-key":"omotoshoMON113RacialDisparity2024"}}],"schema":"https://github.com/citation-style-language/schema/raw/master/csl-citation.json"} </w:instrText>
-      </w:r>
-      <w:r>
-        <w:fldChar w:fldCharType="separate"/>
-      </w:r>
-      <w:r>
-        <w:rPr>
-          <w:noProof/>
-        </w:rPr>
-        <w:t>(Ioachimescu et al., 2022; Omotosho et al., 2024)</w:t>
-      </w:r>
-      <w:r>
-        <w:fldChar w:fldCharType="end"/>
-      </w:r>
-      <w:r>
-        <w:t>.</w:t>
-      </w:r>
-    </w:p>
-    <w:p>
-      <w:r>
-        <w:t>As we expected, participants with Cushing’s disease had a higher BMI than the controls</w:t>
-      </w:r>
-      <w:r>
-        <w:t>, with 64% of participants with Cushing’s disease having a BMI above 30 kg/m</w:t>
-      </w:r>
-      <w:r>
-        <w:rPr>
-          <w:vertAlign w:val="superscript"/>
-        </w:rPr>
-        <w:t>2</w:t>
-      </w:r>
-      <w:r>
-        <w:t xml:space="preserve">, compared to </w:t>
-      </w:r>
-      <w:r>
-        <w:t>40</w:t>
-      </w:r>
-      <w:r>
-        <w:t>% controls (p&lt;0.001).</w:t>
-      </w:r>
-      <w:r>
-        <w:t xml:space="preserve">  </w:t>
-      </w:r>
-      <w:r>
-        <w:t xml:space="preserve">To understand the </w:t>
-      </w:r>
-      <w:r>
-        <w:t xml:space="preserve">cross-sectional </w:t>
-      </w:r>
-      <w:r>
-        <w:t>relationship between obesity and Cushing’s disease, we</w:t>
-      </w:r>
-      <w:r>
-        <w:t xml:space="preserve"> stratified our participants </w:t>
-      </w:r>
-      <w:r>
-        <w:t>with a BMI above or below 30 kg/m</w:t>
-      </w:r>
-      <w:r>
-        <w:rPr>
-          <w:vertAlign w:val="superscript"/>
-        </w:rPr>
-        <w:t>2</w:t>
-      </w:r>
-      <w:r>
-        <w:t xml:space="preserve">, </w:t>
-      </w:r>
-      <w:r>
-        <w:t>across</w:t>
-      </w:r>
-      <w:r>
-        <w:t xml:space="preserve"> both cases and controls</w:t>
-      </w:r>
-      <w:r>
-        <w:t>.  As shown in Table 2, and as expected given our stratification, the four groups differed in several characteristics</w:t>
-      </w:r>
-      <w:r>
-        <w:t xml:space="preserve">, </w:t>
-      </w:r>
-      <w:r>
-        <w:t>which</w:t>
-      </w:r>
-      <w:r>
-        <w:t xml:space="preserve"> will be adjusted for in multivariable models below</w:t>
-      </w:r>
-      <w:r>
-        <w:t>.</w:t>
-      </w:r>
-      <w:r>
-        <w:t xml:space="preserve">  For example, among</w:t>
-      </w:r>
-      <w:r>
-        <w:t xml:space="preserve"> the subgroup of</w:t>
-      </w:r>
-      <w:r>
-        <w:t xml:space="preserve"> participants with a BMI &gt; 30 mg/m</w:t>
-      </w:r>
-      <w:r>
-        <w:rPr>
-          <w:vertAlign w:val="superscript"/>
-        </w:rPr>
-        <w:t>2</w:t>
-      </w:r>
-      <w:r>
-        <w:t>, participants with Cushing’s disease had a higher BMI than controls</w:t>
-      </w:r>
-      <w:r>
-        <w:t xml:space="preserve"> (p=0.0024 by a Mann-Whitney test)</w:t>
-      </w:r>
-      <w:r>
-        <w:t xml:space="preserve">.  </w:t>
-      </w:r>
-      <w:r>
-        <w:t>Females with Cushing’s disease were more likely to have a BMI over 30 kg/m</w:t>
-      </w:r>
-      <w:r>
-        <w:rPr>
-          <w:vertAlign w:val="superscript"/>
-        </w:rPr>
-        <w:t>2</w:t>
-      </w:r>
-      <w:r>
-        <w:t xml:space="preserve"> (68% </w:t>
-      </w:r>
-      <w:r>
-        <w:t xml:space="preserve">of </w:t>
-      </w:r>
-      <w:r>
-        <w:t xml:space="preserve">females </w:t>
-      </w:r>
-      <w:r>
-        <w:t>compared to</w:t>
-      </w:r>
-      <w:r>
-        <w:t xml:space="preserve"> 51% of males with Cushing’s disease, p=0.015).  </w:t>
-      </w:r>
-      <w:r>
-        <w:t>Among participants with Cushing’s disease, Asian (6</w:t>
-      </w:r>
-      <w:r>
-        <w:t xml:space="preserve"> out of </w:t>
-      </w:r>
-      <w:r>
-        <w:t xml:space="preserve">10) and Hispanic or Latino </w:t>
-      </w:r>
-      <w:r>
-        <w:t>(6</w:t>
-      </w:r>
-      <w:r>
-        <w:t xml:space="preserve"> out of </w:t>
-      </w:r>
-      <w:r>
-        <w:t xml:space="preserve">8) </w:t>
-      </w:r>
-      <w:r>
-        <w:t>participants were more likely have a BMI under 30 kg/m</w:t>
-      </w:r>
-      <w:r>
-        <w:rPr>
-          <w:vertAlign w:val="superscript"/>
-        </w:rPr>
-        <w:t xml:space="preserve">2 </w:t>
-      </w:r>
-      <w:r>
-        <w:t xml:space="preserve">compared to </w:t>
-      </w:r>
-      <w:r>
-        <w:t xml:space="preserve">the overall average </w:t>
-      </w:r>
-      <w:r>
-        <w:t>(</w:t>
-      </w:r>
-      <w:r>
-        <w:t>36%</w:t>
-      </w:r>
-      <w:r>
-        <w:t>, p=0.027 and 0.176 respectively via Fisher’s exact test</w:t>
-      </w:r>
-      <w:r>
-        <w:t>s</w:t>
-      </w:r>
-      <w:r>
-        <w:t xml:space="preserve">).  </w:t>
-      </w:r>
-      <w:r>
-        <w:t>The</w:t>
-      </w:r>
-      <w:r>
-        <w:t xml:space="preserve"> average age of </w:t>
-      </w:r>
-      <w:r>
-        <w:t xml:space="preserve">participants with </w:t>
-      </w:r>
-      <w:r>
-        <w:t>Cushing’s</w:t>
-      </w:r>
-      <w:r>
-        <w:t xml:space="preserve"> disease</w:t>
-      </w:r>
-      <w:r>
-        <w:t xml:space="preserve"> with or without obesity was similar</w:t>
-      </w:r>
-      <w:r>
-        <w:t xml:space="preserve"> after stratification</w:t>
-      </w:r>
-      <w:r>
-        <w:t>.</w:t>
-      </w:r>
-    </w:p>
-    <w:p>
-      <w:pPr>
-        <w:pStyle w:val="NormalWeb"/>
-        <w:rPr>
-          <w:rStyle w:val="Heading2Char"/>
-        </w:rPr>
-      </w:pPr>
-      <w:r>
-        <w:rPr>
-          <w:rStyle w:val="Heading2Char"/>
-        </w:rPr>
-        <w:t>Modification of Cushing’s disease-related traits by obesity status</w:t>
-      </w:r>
-    </w:p>
-    <w:p>
-      <w:r>
-        <w:t>To identify how obesity alters metabolic outcomes related to Cushing’s disease, we evaluated the effects of Cushing’s disease on several key metabolic variables including glycemica (fasting glucose and HbA1c), liver enzymes, LDL-C and blood pressure (Figure 2 and Table 3A).  As described below we noted substantial effect modification by obesity status in these fully adjusted models for liver enzymes and blood pressure (Table 3B).</w:t>
-      </w:r>
-    </w:p>
-    <w:p>
-      <w:pPr>
-        <w:pStyle w:val="Heading3"/>
-      </w:pPr>
-      <w:r>
-        <w:t>Dysglycemia</w:t>
-      </w:r>
-    </w:p>
-    <w:p>
-      <w:r>
-        <w:t xml:space="preserve">As aforementioned, our first metabolic variable of interest was the fasting glucose levels of our obese and non-obese populations. As shown in </w:t>
-      </w:r>
-      <w:r>
-        <w:t xml:space="preserve">Figure 2 and </w:t>
-      </w:r>
-      <w:r>
-        <w:t>Table 3</w:t>
-      </w:r>
-      <w:r>
-        <w:t>A</w:t>
-      </w:r>
-      <w:r>
-        <w:t>, we observed a</w:t>
-      </w:r>
-      <w:r>
-        <w:t xml:space="preserve"> significant </w:t>
-      </w:r>
-      <w:r>
-        <w:t xml:space="preserve">increase in </w:t>
-      </w:r>
-      <w:r>
-        <w:t xml:space="preserve">fasting </w:t>
-      </w:r>
-      <w:r>
-        <w:t xml:space="preserve">blood glucose levels </w:t>
-      </w:r>
-      <w:r>
-        <w:t xml:space="preserve">among </w:t>
-      </w:r>
-      <w:r>
-        <w:t>participants</w:t>
-      </w:r>
-      <w:r>
-        <w:t xml:space="preserve"> with Cushing’s disease, regardless of obesity status</w:t>
-      </w:r>
-      <w:r>
-        <w:t xml:space="preserve"> (p</w:t>
-      </w:r>
-      <w:r>
-        <w:t>&lt;0.01</w:t>
-      </w:r>
-      <w:r>
-        <w:t xml:space="preserve"> for both groups).</w:t>
-      </w:r>
-      <w:r>
-        <w:t xml:space="preserve"> The </w:t>
-      </w:r>
-      <w:r>
-        <w:t xml:space="preserve">patients with obesity </w:t>
-      </w:r>
-      <w:r>
-        <w:t xml:space="preserve">population had a slightly larger increase (26.9 vs. </w:t>
-      </w:r>
-      <w:r>
-        <w:t>24.6</w:t>
-      </w:r>
-      <w:r>
-        <w:t xml:space="preserve"> mg/dL</w:t>
-      </w:r>
-      <w:r>
-        <w:t xml:space="preserve">) than </w:t>
-      </w:r>
-      <w:r>
-        <w:t>those with a BMI under 30 kg/m</w:t>
-      </w:r>
-      <w:r>
-        <w:rPr>
-          <w:vertAlign w:val="superscript"/>
-        </w:rPr>
-        <w:t>2</w:t>
-      </w:r>
-      <w:r>
-        <w:t xml:space="preserve">, but this was not a large enough difference to provide any significant evidence of </w:t>
-      </w:r>
-      <w:r>
-        <w:lastRenderedPageBreak/>
-        <w:t>an effect modification for obesity</w:t>
-      </w:r>
-      <w:r>
-        <w:t xml:space="preserve"> (p=0.51; Table 3B)</w:t>
-      </w:r>
-      <w:r>
-        <w:t xml:space="preserve">. </w:t>
-      </w:r>
-      <w:r>
-        <w:t>Similarly</w:t>
-      </w:r>
-      <w:r>
-        <w:t>,</w:t>
-      </w:r>
-      <w:r>
-        <w:t xml:space="preserve"> in Table 3</w:t>
-      </w:r>
-      <w:r>
-        <w:t>A</w:t>
-      </w:r>
-      <w:r>
-        <w:t xml:space="preserve"> </w:t>
-      </w:r>
-      <w:r>
-        <w:t>among the small number of patients with</w:t>
-      </w:r>
-      <w:r>
-        <w:t xml:space="preserve"> HbA1c </w:t>
-      </w:r>
-      <w:r>
-        <w:t>values, there was</w:t>
-      </w:r>
-      <w:r>
-        <w:t xml:space="preserve"> a</w:t>
-      </w:r>
-      <w:r>
-        <w:t xml:space="preserve">n </w:t>
-      </w:r>
-      <w:r>
-        <w:t xml:space="preserve">insignificant increase in HbA1c levels </w:t>
-      </w:r>
-      <w:r>
-        <w:t>in</w:t>
-      </w:r>
-      <w:r>
-        <w:t xml:space="preserve"> the non-obese</w:t>
-      </w:r>
-      <w:r>
-        <w:t xml:space="preserve"> patients</w:t>
-      </w:r>
-      <w:r>
-        <w:t xml:space="preserve"> (</w:t>
-      </w:r>
-      <w:r>
-        <w:t xml:space="preserve">0.91%; </w:t>
-      </w:r>
-      <w:r>
-        <w:t xml:space="preserve">p=0.056). However, there was evidence of a significant increase in HbA1c levels </w:t>
-      </w:r>
-      <w:r>
-        <w:t xml:space="preserve">in patients with obesity </w:t>
-      </w:r>
-      <w:r>
-        <w:t>(</w:t>
-      </w:r>
-      <w:r>
-        <w:t xml:space="preserve">1.38% </w:t>
-      </w:r>
-      <w:r>
-        <w:t>p</w:t>
-      </w:r>
-      <w:r>
-        <w:t>&lt;0.01</w:t>
-      </w:r>
-      <w:r>
-        <w:t xml:space="preserve">). </w:t>
-      </w:r>
-      <w:r>
-        <w:t xml:space="preserve">  Again</w:t>
-      </w:r>
-      <w:r>
-        <w:t>.</w:t>
-      </w:r>
-      <w:r>
-        <w:t xml:space="preserve"> there was no evidence of effect modification by obesity (p=0.41)</w:t>
-      </w:r>
-    </w:p>
-    <w:p>
-      <w:pPr>
-        <w:pStyle w:val="Heading3"/>
-      </w:pPr>
-      <w:r>
-        <w:t>MASLD and liver enzymes</w:t>
-      </w:r>
-    </w:p>
-    <w:p>
-      <w:r>
-        <w:t xml:space="preserve">To </w:t>
-      </w:r>
-      <w:r>
-        <w:t>assess</w:t>
-      </w:r>
-      <w:r>
-        <w:t xml:space="preserve"> </w:t>
-      </w:r>
-      <w:r>
-        <w:t>MASLD</w:t>
-      </w:r>
-      <w:r>
-        <w:t xml:space="preserve"> we looked at ALT </w:t>
-      </w:r>
-      <w:r>
-        <w:t>and AST levels as indicators of liver damage</w:t>
-      </w:r>
-      <w:r>
-        <w:t xml:space="preserve"> (Figure 2 and Table 3A)</w:t>
-      </w:r>
-      <w:r>
-        <w:t xml:space="preserve">. In both our obese, and non-obese populations, we saw an increase in ALT </w:t>
-      </w:r>
-      <w:r>
-        <w:t>and AST</w:t>
-      </w:r>
-      <w:r>
-        <w:t xml:space="preserve"> </w:t>
-      </w:r>
-      <w:r>
-        <w:t>levels regardless of Cushing’s disease status</w:t>
-      </w:r>
-      <w:r>
-        <w:t xml:space="preserve"> </w:t>
-      </w:r>
-      <w:commentRangeStart w:id="20"/>
-      <w:r>
-        <w:t>(p</w:t>
-      </w:r>
-      <w:r>
-        <w:t>&lt;0.0</w:t>
-      </w:r>
-      <w:r>
-        <w:t>1 for both groups</w:t>
-      </w:r>
-      <w:r>
-        <w:t xml:space="preserve">). </w:t>
-      </w:r>
-      <w:commentRangeEnd w:id="20"/>
-      <w:r>
-        <w:rPr>
-          <w:rStyle w:val="CommentReference"/>
-          <w:sz w:val="24"/>
-          <w:szCs w:val="24"/>
-        </w:rPr>
-        <w:commentReference w:id="20"/>
-      </w:r>
-      <w:r>
         <w:t>In this case, the</w:t>
       </w:r>
       <w:r>
@@ -2017,6 +2031,7 @@
         <w:ind w:left="0"/>
       </w:pPr>
       <w:r>
+        <w:lastRenderedPageBreak/>
         <w:t>Blood pressure – suggest why</w:t>
       </w:r>
     </w:p>
@@ -2041,7 +2056,6 @@
         </w:numPr>
       </w:pPr>
       <w:r>
-        <w:lastRenderedPageBreak/>
         <w:t>Consistent across SBP/DBP</w:t>
       </w:r>
     </w:p>
@@ -2068,18 +2082,18 @@
       <w:r>
         <w:t xml:space="preserve">We also observe increases in BP with obesity (Table 3A),  this is also well established add </w:t>
       </w:r>
-      <w:commentRangeStart w:id="21"/>
+      <w:commentRangeStart w:id="11"/>
       <w:r>
         <w:t>refs</w:t>
       </w:r>
-      <w:commentRangeEnd w:id="21"/>
+      <w:commentRangeEnd w:id="11"/>
       <w:r>
         <w:rPr>
           <w:rStyle w:val="CommentReference"/>
           <w:sz w:val="24"/>
           <w:szCs w:val="24"/>
         </w:rPr>
-        <w:commentReference w:id="21"/>
+        <w:commentReference w:id="11"/>
       </w:r>
       <w:r>
         <w:t>c</w:t>
@@ -2108,18 +2122,18 @@
         <w:pStyle w:val="ListParagraph"/>
         <w:ind w:left="0"/>
       </w:pPr>
-      <w:commentRangeStart w:id="22"/>
+      <w:commentRangeStart w:id="12"/>
       <w:r>
         <w:t>ALT/AST – suggest why</w:t>
       </w:r>
-      <w:commentRangeEnd w:id="22"/>
+      <w:commentRangeEnd w:id="12"/>
       <w:r>
         <w:rPr>
           <w:rStyle w:val="CommentReference"/>
           <w:sz w:val="24"/>
           <w:szCs w:val="24"/>
         </w:rPr>
-        <w:commentReference w:id="22"/>
+        <w:commentReference w:id="12"/>
       </w:r>
     </w:p>
     <w:p>
@@ -2273,28 +2287,28 @@
           <w:numId w:val="9"/>
         </w:numPr>
       </w:pPr>
-      <w:commentRangeStart w:id="23"/>
-      <w:commentRangeStart w:id="24"/>
+      <w:commentRangeStart w:id="13"/>
+      <w:commentRangeStart w:id="14"/>
       <w:r>
         <w:t>Loss of patients due to unclear treatment</w:t>
       </w:r>
-      <w:commentRangeEnd w:id="23"/>
+      <w:commentRangeEnd w:id="13"/>
       <w:r>
         <w:rPr>
           <w:rStyle w:val="CommentReference"/>
           <w:sz w:val="24"/>
           <w:szCs w:val="24"/>
         </w:rPr>
-        <w:commentReference w:id="23"/>
-      </w:r>
-      <w:commentRangeEnd w:id="24"/>
+        <w:commentReference w:id="13"/>
+      </w:r>
+      <w:commentRangeEnd w:id="14"/>
       <w:r>
         <w:rPr>
           <w:rStyle w:val="CommentReference"/>
           <w:sz w:val="24"/>
           <w:szCs w:val="24"/>
         </w:rPr>
-        <w:commentReference w:id="24"/>
+        <w:commentReference w:id="14"/>
       </w:r>
     </w:p>
     <w:p>
@@ -2360,20 +2374,21 @@
         </w:numPr>
       </w:pPr>
       <w:r>
+        <w:lastRenderedPageBreak/>
         <w:t xml:space="preserve">BMI higher for Cushings -&gt; </w:t>
       </w:r>
-      <w:commentRangeStart w:id="25"/>
+      <w:commentRangeStart w:id="15"/>
       <w:r>
         <w:t>less of a concern due to sensitivity analyses</w:t>
       </w:r>
-      <w:commentRangeEnd w:id="25"/>
+      <w:commentRangeEnd w:id="15"/>
       <w:r>
         <w:rPr>
           <w:rStyle w:val="CommentReference"/>
           <w:sz w:val="24"/>
           <w:szCs w:val="24"/>
         </w:rPr>
-        <w:commentReference w:id="25"/>
+        <w:commentReference w:id="15"/>
       </w:r>
     </w:p>
     <w:p>
@@ -2386,7 +2401,6 @@
         <w:pStyle w:val="ListParagraph"/>
       </w:pPr>
       <w:r>
-        <w:lastRenderedPageBreak/>
         <w:t xml:space="preserve">Takeaway – sepated metabolic complicatons in cushings patienst with and without obesity we found …. This is relevant because … </w:t>
       </w:r>
     </w:p>
@@ -2460,7 +2474,7 @@
         <w:rPr>
           <w:rFonts w:ascii="Aptos"/>
         </w:rPr>
-        <w:t xml:space="preserve">Broder, M. S., Neary, M. P., Chang, E., Cherepanov, D., &amp; Ludlam, W. H. (2015). Incidence of Cushing’s syndrome and Cushing’s disease in commercially-insured patients &lt;65 years old in the United States. </w:t>
+        <w:t xml:space="preserve">Braun, L. T., Riester, A., Oßwald-Kopp, A., Fazel, J., Rubinstein, G., Bidlingmaier, M., Beuschlein, F., &amp; Reincke, M. (2019). Toward a Diagnostic Score in Cushing’s Syndrome. </w:t>
       </w:r>
       <w:r>
         <w:rPr>
@@ -2468,7 +2482,7 @@
           <w:i/>
           <w:iCs/>
         </w:rPr>
-        <w:t>Pituitary</w:t>
+        <w:t>Frontiers in Endocrinology</w:t>
       </w:r>
       <w:r>
         <w:rPr>
@@ -2482,13 +2496,13 @@
           <w:i/>
           <w:iCs/>
         </w:rPr>
-        <w:t>18</w:t>
-      </w:r>
-      <w:r>
-        <w:rPr>
-          <w:rFonts w:ascii="Aptos"/>
-        </w:rPr>
-        <w:t>(3), 283–289. https://doi.org/10.1007/s11102-014-0569-6</w:t>
+        <w:t>10</w:t>
+      </w:r>
+      <w:r>
+        <w:rPr>
+          <w:rFonts w:ascii="Aptos"/>
+        </w:rPr>
+        <w:t>, 766. https://doi.org/10.3389/fendo.2019.00766</w:t>
       </w:r>
     </w:p>
     <w:p>
@@ -2502,7 +2516,7 @@
         <w:rPr>
           <w:rFonts w:ascii="Aptos"/>
         </w:rPr>
-        <w:t xml:space="preserve">Etxabe, J., &amp; Vazquez, J. A. (1994). Morbidity and mortality in Cushing’s disease: An epidemiological approach. </w:t>
+        <w:t xml:space="preserve">Broder, M. S., Neary, M. P., Chang, E., Cherepanov, D., &amp; Ludlam, W. H. (2015). Incidence of Cushing’s syndrome and Cushing’s disease in commercially-insured patients &lt;65 years old in the United States. </w:t>
       </w:r>
       <w:r>
         <w:rPr>
@@ -2510,7 +2524,7 @@
           <w:i/>
           <w:iCs/>
         </w:rPr>
-        <w:t>Clin Endocrinol (Oxf)</w:t>
+        <w:t>Pituitary</w:t>
       </w:r>
       <w:r>
         <w:rPr>
@@ -2524,13 +2538,13 @@
           <w:i/>
           <w:iCs/>
         </w:rPr>
-        <w:t>40</w:t>
-      </w:r>
-      <w:r>
-        <w:rPr>
-          <w:rFonts w:ascii="Aptos"/>
-        </w:rPr>
-        <w:t>(4), 479–484. https://doi.org/10.1111/j.1365-2265.1994.tb02486.x</w:t>
+        <w:t>18</w:t>
+      </w:r>
+      <w:r>
+        <w:rPr>
+          <w:rFonts w:ascii="Aptos"/>
+        </w:rPr>
+        <w:t>(3), 283–289. https://doi.org/10.1007/s11102-014-0569-6</w:t>
       </w:r>
     </w:p>
     <w:p>
@@ -2544,7 +2558,7 @@
         <w:rPr>
           <w:rFonts w:ascii="Aptos"/>
         </w:rPr>
-        <w:t xml:space="preserve">Ho, D., Imai, K., King, G., &amp; Stuart, E. A. (2011). MatchIt: Nonparametric Preprocessing for Parametric Causal Inference. </w:t>
+        <w:t xml:space="preserve">DeFronzo, R. A., &amp; Auchus, R. J. (2025). Cushing Syndrome, Hypercortisolism, and Glucose Homeostasis: A Review. </w:t>
       </w:r>
       <w:r>
         <w:rPr>
@@ -2552,7 +2566,7 @@
           <w:i/>
           <w:iCs/>
         </w:rPr>
-        <w:t>Journal of Statistical Software</w:t>
+        <w:t>Diabetes</w:t>
       </w:r>
       <w:r>
         <w:rPr>
@@ -2566,13 +2580,13 @@
           <w:i/>
           <w:iCs/>
         </w:rPr>
-        <w:t>42</w:t>
-      </w:r>
-      <w:r>
-        <w:rPr>
-          <w:rFonts w:ascii="Aptos"/>
-        </w:rPr>
-        <w:t>, 1–28. https://doi.org/10.18637/jss.v042.i08</w:t>
+        <w:t>74</w:t>
+      </w:r>
+      <w:r>
+        <w:rPr>
+          <w:rFonts w:ascii="Aptos"/>
+        </w:rPr>
+        <w:t>(12), 2168–2178. https://doi.org/10.2337/db25-0120</w:t>
       </w:r>
     </w:p>
     <w:p>
@@ -2586,7 +2600,7 @@
         <w:rPr>
           <w:rFonts w:ascii="Aptos"/>
         </w:rPr>
-        <w:t xml:space="preserve">Ioachimescu, A. G., Goswami, N., Handa, T., Pappy, A., Veledar, E., &amp; Oyesiku, N. M. (2022). Racial Disparities in Acromegaly and Cushing’s Disease: A Referral Center Study in 241 Patients. </w:t>
+        <w:t xml:space="preserve">Etxabe, J., &amp; Vazquez, J. A. (1994). Morbidity and mortality in Cushing’s disease: An epidemiological approach. </w:t>
       </w:r>
       <w:r>
         <w:rPr>
@@ -2594,7 +2608,7 @@
           <w:i/>
           <w:iCs/>
         </w:rPr>
-        <w:t>Journal of the Endocrine Society</w:t>
+        <w:t>Clin Endocrinol (Oxf)</w:t>
       </w:r>
       <w:r>
         <w:rPr>
@@ -2608,13 +2622,13 @@
           <w:i/>
           <w:iCs/>
         </w:rPr>
-        <w:t>6</w:t>
-      </w:r>
-      <w:r>
-        <w:rPr>
-          <w:rFonts w:ascii="Aptos"/>
-        </w:rPr>
-        <w:t>(1), bvab176. https://doi.org/10.1210/jendso/bvab176</w:t>
+        <w:t>40</w:t>
+      </w:r>
+      <w:r>
+        <w:rPr>
+          <w:rFonts w:ascii="Aptos"/>
+        </w:rPr>
+        <w:t>(4), 479–484. https://doi.org/10.1111/j.1365-2265.1994.tb02486.x</w:t>
       </w:r>
     </w:p>
     <w:p>
@@ -2629,7 +2643,7 @@
           <w:rFonts w:ascii="Aptos"/>
         </w:rPr>
         <w:lastRenderedPageBreak/>
-        <w:t xml:space="preserve">Matthiasdottir, A. M., Hardarson, T. O., Arnardottir, S., &amp; Sigurjonsdottir, H. A. (2024). Cushing’s Disease May Have Higher Incidence than Previously Thought: A Nationwide Study in Iceland 2010–2019. </w:t>
+        <w:t xml:space="preserve">Fleseriu, M., Auchus, R., Bancos, I., Ben-Shlomo, A., Bertherat, J., Biermasz, N. R., Boguszewski, C. L., Bronstein, M. D., Buchfelder, M., Carmichael, J. D., Casanueva, F. F., Castinetti, F., Chanson, P., Findling, J., Gadelha, M., Geer, E. B., Giustina, A., Grossman, A., Gurnell, M., … Biller, B. M. K. (2021). Consensus on Diagnosis and Management of Cushing’s Disease: A Guideline Update. </w:t>
       </w:r>
       <w:r>
         <w:rPr>
@@ -2637,7 +2651,7 @@
           <w:i/>
           <w:iCs/>
         </w:rPr>
-        <w:t>Neuroendocrinology</w:t>
+        <w:t>The Lancet. Diabetes &amp; Endocrinology</w:t>
       </w:r>
       <w:r>
         <w:rPr>
@@ -2651,13 +2665,13 @@
           <w:i/>
           <w:iCs/>
         </w:rPr>
-        <w:t>114</w:t>
-      </w:r>
-      <w:r>
-        <w:rPr>
-          <w:rFonts w:ascii="Aptos"/>
-        </w:rPr>
-        <w:t>(10), 950–957. https://doi.org/10.1159/000540205</w:t>
+        <w:t>9</w:t>
+      </w:r>
+      <w:r>
+        <w:rPr>
+          <w:rFonts w:ascii="Aptos"/>
+        </w:rPr>
+        <w:t>(12), 847–875. https://doi.org/10.1016/S2213-8587(21)00235-7</w:t>
       </w:r>
     </w:p>
     <w:p>
@@ -2671,7 +2685,7 @@
         <w:rPr>
           <w:rFonts w:ascii="Aptos"/>
         </w:rPr>
-        <w:t xml:space="preserve">Omotosho, Y. B., McGlotten, R., Chittiboina, P., &amp; Nieman, L. (2024). MON-113 Racial Disparity in the Time to Diagnosis of Cushing’s Disease. </w:t>
+        <w:t xml:space="preserve">Gadelha, M., Gatto, F., Wildemberg, L. E., &amp; Fleseriu, M. (2023). Cushing’s syndrome. </w:t>
       </w:r>
       <w:r>
         <w:rPr>
@@ -2679,7 +2693,7 @@
           <w:i/>
           <w:iCs/>
         </w:rPr>
-        <w:t>Journal of the Endocrine Society</w:t>
+        <w:t>The Lancet</w:t>
       </w:r>
       <w:r>
         <w:rPr>
@@ -2693,13 +2707,13 @@
           <w:i/>
           <w:iCs/>
         </w:rPr>
-        <w:t>8</w:t>
-      </w:r>
-      <w:r>
-        <w:rPr>
-          <w:rFonts w:ascii="Aptos"/>
-        </w:rPr>
-        <w:t>(Supplement_1), bvae163.2408. https://doi.org/10.1210/jendso/bvae163.2408</w:t>
+        <w:t>402</w:t>
+      </w:r>
+      <w:r>
+        <w:rPr>
+          <w:rFonts w:ascii="Aptos"/>
+        </w:rPr>
+        <w:t>(10418), 2237–2252. https://doi.org/10.1016/S0140-6736(23)01961-X</w:t>
       </w:r>
     </w:p>
     <w:p>
@@ -2713,7 +2727,7 @@
         <w:rPr>
           <w:rFonts w:ascii="Aptos"/>
         </w:rPr>
-        <w:t xml:space="preserve">R Core Team. (2019). </w:t>
+        <w:t xml:space="preserve">Giordano, R., Picu, A., Marinazzo, E., D’Angelo, V., Berardelli, R., Karamouzis, I., Forno, D., Zinnà, D., Maccario, M., Ghigo, E., &amp; Arvat, E. (2011). Metabolic and cardiovascular outcomes in patients with Cushing’s syndrome of different aetiologies during active disease and 1 year after remission. </w:t>
       </w:r>
       <w:r>
         <w:rPr>
@@ -2721,27 +2735,13 @@
           <w:i/>
           <w:iCs/>
         </w:rPr>
-        <w:t>R: A Language and Environment for Statistical Computing</w:t>
-      </w:r>
-      <w:r>
-        <w:rPr>
-          <w:rFonts w:ascii="Aptos"/>
-        </w:rPr>
-        <w:t>. R Foundation for Statistical Computing. http://www.r-project.org/</w:t>
-      </w:r>
-    </w:p>
-    <w:p>
-      <w:pPr>
-        <w:pStyle w:val="Bibliography"/>
-        <w:rPr>
-          <w:rFonts w:ascii="Aptos"/>
-        </w:rPr>
-      </w:pPr>
-      <w:r>
-        <w:rPr>
-          <w:rFonts w:ascii="Aptos"/>
-        </w:rPr>
-        <w:t xml:space="preserve">Steffensen, C., Bak, A. M., Zøylner Rubeck, K., &amp; Jørgensen, J. O. L. (2010). Epidemiology of Cushing’s Syndrome. </w:t>
+        <w:t>Clinical Endocrinology</w:t>
+      </w:r>
+      <w:r>
+        <w:rPr>
+          <w:rFonts w:ascii="Aptos"/>
+        </w:rPr>
+        <w:t xml:space="preserve">, </w:t>
       </w:r>
       <w:r>
         <w:rPr>
@@ -2749,13 +2749,27 @@
           <w:i/>
           <w:iCs/>
         </w:rPr>
-        <w:t>Neuroendocrinology</w:t>
-      </w:r>
-      <w:r>
-        <w:rPr>
-          <w:rFonts w:ascii="Aptos"/>
-        </w:rPr>
-        <w:t xml:space="preserve">, </w:t>
+        <w:t>75</w:t>
+      </w:r>
+      <w:r>
+        <w:rPr>
+          <w:rFonts w:ascii="Aptos"/>
+        </w:rPr>
+        <w:t>(3), 354–360. https://doi.org/10.1111/j.1365-2265.2011.04055.x</w:t>
+      </w:r>
+    </w:p>
+    <w:p>
+      <w:pPr>
+        <w:pStyle w:val="Bibliography"/>
+        <w:rPr>
+          <w:rFonts w:ascii="Aptos"/>
+        </w:rPr>
+      </w:pPr>
+      <w:r>
+        <w:rPr>
+          <w:rFonts w:ascii="Aptos"/>
+        </w:rPr>
+        <w:t xml:space="preserve">Ho, D., Imai, K., King, G., &amp; Stuart, E. A. (2011). MatchIt: Nonparametric Preprocessing for Parametric Causal Inference. </w:t>
       </w:r>
       <w:r>
         <w:rPr>
@@ -2763,6 +2777,293 @@
           <w:i/>
           <w:iCs/>
         </w:rPr>
+        <w:t>Journal of Statistical Software</w:t>
+      </w:r>
+      <w:r>
+        <w:rPr>
+          <w:rFonts w:ascii="Aptos"/>
+        </w:rPr>
+        <w:t xml:space="preserve">, </w:t>
+      </w:r>
+      <w:r>
+        <w:rPr>
+          <w:rFonts w:ascii="Aptos"/>
+          <w:i/>
+          <w:iCs/>
+        </w:rPr>
+        <w:t>42</w:t>
+      </w:r>
+      <w:r>
+        <w:rPr>
+          <w:rFonts w:ascii="Aptos"/>
+        </w:rPr>
+        <w:t>, 1–28. https://doi.org/10.18637/jss.v042.i08</w:t>
+      </w:r>
+    </w:p>
+    <w:p>
+      <w:pPr>
+        <w:pStyle w:val="Bibliography"/>
+        <w:rPr>
+          <w:rFonts w:ascii="Aptos"/>
+        </w:rPr>
+      </w:pPr>
+      <w:r>
+        <w:rPr>
+          <w:rFonts w:ascii="Aptos"/>
+        </w:rPr>
+        <w:t xml:space="preserve">Ioachimescu, A. G., Goswami, N., Handa, T., Pappy, A., Veledar, E., &amp; Oyesiku, N. M. (2022). Racial Disparities in Acromegaly and Cushing’s Disease: A Referral Center Study in 241 Patients. </w:t>
+      </w:r>
+      <w:r>
+        <w:rPr>
+          <w:rFonts w:ascii="Aptos"/>
+          <w:i/>
+          <w:iCs/>
+        </w:rPr>
+        <w:t>Journal of the Endocrine Society</w:t>
+      </w:r>
+      <w:r>
+        <w:rPr>
+          <w:rFonts w:ascii="Aptos"/>
+        </w:rPr>
+        <w:t xml:space="preserve">, </w:t>
+      </w:r>
+      <w:r>
+        <w:rPr>
+          <w:rFonts w:ascii="Aptos"/>
+          <w:i/>
+          <w:iCs/>
+        </w:rPr>
+        <w:t>6</w:t>
+      </w:r>
+      <w:r>
+        <w:rPr>
+          <w:rFonts w:ascii="Aptos"/>
+        </w:rPr>
+        <w:t>(1), bvab176. https://doi.org/10.1210/jendso/bvab176</w:t>
+      </w:r>
+    </w:p>
+    <w:p>
+      <w:pPr>
+        <w:pStyle w:val="Bibliography"/>
+        <w:rPr>
+          <w:rFonts w:ascii="Aptos"/>
+        </w:rPr>
+      </w:pPr>
+      <w:r>
+        <w:rPr>
+          <w:rFonts w:ascii="Aptos"/>
+        </w:rPr>
+        <w:t xml:space="preserve">Matthiasdottir, A. M., Hardarson, T. O., Arnardottir, S., &amp; Sigurjonsdottir, H. A. (2024). Cushing’s Disease May Have Higher Incidence than Previously Thought: A </w:t>
+      </w:r>
+      <w:r>
+        <w:rPr>
+          <w:rFonts w:ascii="Aptos"/>
+        </w:rPr>
+        <w:lastRenderedPageBreak/>
+        <w:t xml:space="preserve">Nationwide Study in Iceland 2010–2019. </w:t>
+      </w:r>
+      <w:r>
+        <w:rPr>
+          <w:rFonts w:ascii="Aptos"/>
+          <w:i/>
+          <w:iCs/>
+        </w:rPr>
+        <w:t>Neuroendocrinology</w:t>
+      </w:r>
+      <w:r>
+        <w:rPr>
+          <w:rFonts w:ascii="Aptos"/>
+        </w:rPr>
+        <w:t xml:space="preserve">, </w:t>
+      </w:r>
+      <w:r>
+        <w:rPr>
+          <w:rFonts w:ascii="Aptos"/>
+          <w:i/>
+          <w:iCs/>
+        </w:rPr>
+        <w:t>114</w:t>
+      </w:r>
+      <w:r>
+        <w:rPr>
+          <w:rFonts w:ascii="Aptos"/>
+        </w:rPr>
+        <w:t>(10), 950–957. https://doi.org/10.1159/000540205</w:t>
+      </w:r>
+    </w:p>
+    <w:p>
+      <w:pPr>
+        <w:pStyle w:val="Bibliography"/>
+        <w:rPr>
+          <w:rFonts w:ascii="Aptos"/>
+        </w:rPr>
+      </w:pPr>
+      <w:r>
+        <w:rPr>
+          <w:rFonts w:ascii="Aptos"/>
+        </w:rPr>
+        <w:t xml:space="preserve">Nieman, L. K. (2002). Diagnostic Tests for Cushing’s Syndrome. </w:t>
+      </w:r>
+      <w:r>
+        <w:rPr>
+          <w:rFonts w:ascii="Aptos"/>
+          <w:i/>
+          <w:iCs/>
+        </w:rPr>
+        <w:t>Annals of the New York Academy of Sciences</w:t>
+      </w:r>
+      <w:r>
+        <w:rPr>
+          <w:rFonts w:ascii="Aptos"/>
+        </w:rPr>
+        <w:t xml:space="preserve">, </w:t>
+      </w:r>
+      <w:r>
+        <w:rPr>
+          <w:rFonts w:ascii="Aptos"/>
+          <w:i/>
+          <w:iCs/>
+        </w:rPr>
+        <w:t>970</w:t>
+      </w:r>
+      <w:r>
+        <w:rPr>
+          <w:rFonts w:ascii="Aptos"/>
+        </w:rPr>
+        <w:t>(1), 112–118. https://doi.org/10.1111/j.1749-6632.2002.tb04417.x</w:t>
+      </w:r>
+    </w:p>
+    <w:p>
+      <w:pPr>
+        <w:pStyle w:val="Bibliography"/>
+        <w:rPr>
+          <w:rFonts w:ascii="Aptos"/>
+        </w:rPr>
+      </w:pPr>
+      <w:r>
+        <w:rPr>
+          <w:rFonts w:ascii="Aptos"/>
+        </w:rPr>
+        <w:t xml:space="preserve">Omotosho, Y. B., McGlotten, R., Chittiboina, P., &amp; Nieman, L. (2024). MON-113 Racial Disparity in the Time to Diagnosis of Cushing’s Disease. </w:t>
+      </w:r>
+      <w:r>
+        <w:rPr>
+          <w:rFonts w:ascii="Aptos"/>
+          <w:i/>
+          <w:iCs/>
+        </w:rPr>
+        <w:t>Journal of the Endocrine Society</w:t>
+      </w:r>
+      <w:r>
+        <w:rPr>
+          <w:rFonts w:ascii="Aptos"/>
+        </w:rPr>
+        <w:t xml:space="preserve">, </w:t>
+      </w:r>
+      <w:r>
+        <w:rPr>
+          <w:rFonts w:ascii="Aptos"/>
+          <w:i/>
+          <w:iCs/>
+        </w:rPr>
+        <w:t>8</w:t>
+      </w:r>
+      <w:r>
+        <w:rPr>
+          <w:rFonts w:ascii="Aptos"/>
+        </w:rPr>
+        <w:t>(Supplement_1), bvae163.2408. https://doi.org/10.1210/jendso/bvae163.2408</w:t>
+      </w:r>
+    </w:p>
+    <w:p>
+      <w:pPr>
+        <w:pStyle w:val="Bibliography"/>
+        <w:rPr>
+          <w:rFonts w:ascii="Aptos"/>
+        </w:rPr>
+      </w:pPr>
+      <w:r>
+        <w:rPr>
+          <w:rFonts w:ascii="Aptos"/>
+        </w:rPr>
+        <w:t xml:space="preserve">R Core Team. (2019). </w:t>
+      </w:r>
+      <w:r>
+        <w:rPr>
+          <w:rFonts w:ascii="Aptos"/>
+          <w:i/>
+          <w:iCs/>
+        </w:rPr>
+        <w:t>R: A Language and Environment for Statistical Computing</w:t>
+      </w:r>
+      <w:r>
+        <w:rPr>
+          <w:rFonts w:ascii="Aptos"/>
+        </w:rPr>
+        <w:t>. R Foundation for Statistical Computing. http://www.r-project.org/</w:t>
+      </w:r>
+    </w:p>
+    <w:p>
+      <w:pPr>
+        <w:pStyle w:val="Bibliography"/>
+        <w:rPr>
+          <w:rFonts w:ascii="Aptos"/>
+        </w:rPr>
+      </w:pPr>
+      <w:r>
+        <w:rPr>
+          <w:rFonts w:ascii="Aptos"/>
+        </w:rPr>
+        <w:t xml:space="preserve">Sharma, Susmeeta T., Nieman, L. K., &amp; Feelders, R. A. (2015). Cushing’s syndrome: Epidemiology and developments in disease management. </w:t>
+      </w:r>
+      <w:r>
+        <w:rPr>
+          <w:rFonts w:ascii="Aptos"/>
+          <w:i/>
+          <w:iCs/>
+        </w:rPr>
+        <w:t>Clinical Epidemiology</w:t>
+      </w:r>
+      <w:r>
+        <w:rPr>
+          <w:rFonts w:ascii="Aptos"/>
+        </w:rPr>
+        <w:t>, 281–293.</w:t>
+      </w:r>
+    </w:p>
+    <w:p>
+      <w:pPr>
+        <w:pStyle w:val="Bibliography"/>
+        <w:rPr>
+          <w:rFonts w:ascii="Aptos"/>
+        </w:rPr>
+      </w:pPr>
+      <w:r>
+        <w:rPr>
+          <w:rFonts w:ascii="Aptos"/>
+        </w:rPr>
+        <w:t xml:space="preserve">Steffensen, C., Bak, A. M., Zøylner Rubeck, K., &amp; Jørgensen, J. O. L. (2010). Epidemiology of Cushing’s Syndrome. </w:t>
+      </w:r>
+      <w:r>
+        <w:rPr>
+          <w:rFonts w:ascii="Aptos"/>
+          <w:i/>
+          <w:iCs/>
+        </w:rPr>
+        <w:t>Neuroendocrinology</w:t>
+      </w:r>
+      <w:r>
+        <w:rPr>
+          <w:rFonts w:ascii="Aptos"/>
+        </w:rPr>
+        <w:t xml:space="preserve">, </w:t>
+      </w:r>
+      <w:r>
+        <w:rPr>
+          <w:rFonts w:ascii="Aptos"/>
+          <w:i/>
+          <w:iCs/>
+        </w:rPr>
         <w:t>92</w:t>
       </w:r>
       <w:r>
@@ -2775,6 +3076,48 @@
     <w:p>
       <w:pPr>
         <w:pStyle w:val="Bibliography"/>
+        <w:rPr>
+          <w:rFonts w:ascii="Aptos"/>
+        </w:rPr>
+      </w:pPr>
+      <w:r>
+        <w:rPr>
+          <w:rFonts w:ascii="Aptos"/>
+        </w:rPr>
+        <w:t xml:space="preserve">Zillo, M., Barbot, M., Ceccato, F., Camozzi, C., Bilora, F., Casonato, A., Frigo, A., Albiger, N., Daidone, V., Mazzai, M., Mantero, F., &amp; Scaroni, C. (2014). Diagnosis and complications of Cushing’s disease: Gender-related differences. </w:t>
+      </w:r>
+      <w:r>
+        <w:rPr>
+          <w:rFonts w:ascii="Aptos"/>
+          <w:i/>
+          <w:iCs/>
+        </w:rPr>
+        <w:t>Clinical Endocrinology</w:t>
+      </w:r>
+      <w:r>
+        <w:rPr>
+          <w:rFonts w:ascii="Aptos"/>
+        </w:rPr>
+        <w:t xml:space="preserve">, </w:t>
+      </w:r>
+      <w:r>
+        <w:rPr>
+          <w:rFonts w:ascii="Aptos"/>
+          <w:i/>
+          <w:iCs/>
+        </w:rPr>
+        <w:t>80</w:t>
+      </w:r>
+      <w:r>
+        <w:rPr>
+          <w:rFonts w:ascii="Aptos"/>
+        </w:rPr>
+        <w:t>(3), 403–410.</w:t>
+      </w:r>
+    </w:p>
+    <w:p>
+      <w:pPr>
+        <w:pStyle w:val="Bibliography"/>
       </w:pPr>
       <w:r>
         <w:fldChar w:fldCharType="end"/>
@@ -2785,6 +3128,7 @@
         <w:pStyle w:val="Heading1"/>
       </w:pPr>
       <w:r>
+        <w:lastRenderedPageBreak/>
         <w:t xml:space="preserve">Figure </w:t>
       </w:r>
       <w:r>
@@ -2927,11 +3271,7 @@
         <w:t xml:space="preserve">  Participants were matched for age, gender and race/ethnicity but not BMI.  This table represents the matched set for </w:t>
       </w:r>
       <w:r>
-        <w:t xml:space="preserve">patients </w:t>
-      </w:r>
-      <w:r>
-        <w:lastRenderedPageBreak/>
-        <w:t xml:space="preserve">with </w:t>
+        <w:t xml:space="preserve">patients with </w:t>
       </w:r>
       <w:r>
         <w:t xml:space="preserve">Cushing’s </w:t>
@@ -3439,6 +3779,7 @@
           <w:szCs w:val="18"/>
           <w14:ligatures w14:val="none"/>
         </w:rPr>
+        <w:lastRenderedPageBreak/>
         <w:t>3.</w:t>
       </w:r>
       <w:r>
@@ -4757,7 +5098,7 @@
 
 <file path=word/comments.xml><?xml version="1.0" encoding="utf-8"?>
 <w:comments xmlns:wpc="http://schemas.microsoft.com/office/word/2010/wordprocessingCanvas" xmlns:cx="http://schemas.microsoft.com/office/drawing/2014/chartex" xmlns:cx1="http://schemas.microsoft.com/office/drawing/2015/9/8/chartex" xmlns:cx2="http://schemas.microsoft.com/office/drawing/2015/10/21/chartex" xmlns:cx3="http://schemas.microsoft.com/office/drawing/2016/5/9/chartex" xmlns:cx4="http://schemas.microsoft.com/office/drawing/2016/5/10/chartex" xmlns:cx5="http://schemas.microsoft.com/office/drawing/2016/5/11/chartex" xmlns:cx6="http://schemas.microsoft.com/office/drawing/2016/5/12/chartex" xmlns:cx7="http://schemas.microsoft.com/office/drawing/2016/5/13/chartex" xmlns:cx8="http://schemas.microsoft.com/office/drawing/2016/5/14/chartex" xmlns:mc="http://schemas.openxmlformats.org/markup-compatibility/2006" xmlns:aink="http://schemas.microsoft.com/office/drawing/2016/ink" xmlns:am3d="http://schemas.microsoft.com/office/drawing/2017/model3d" xmlns:o="urn:schemas-microsoft-com:office:office" xmlns:oel="http://schemas.microsoft.com/office/2019/extlst" xmlns:r="http://schemas.openxmlformats.org/officeDocument/2006/relationships" xmlns:m="http://schemas.openxmlformats.org/officeDocument/2006/math" xmlns:v="urn:schemas-microsoft-com:vml" xmlns:wp14="http://schemas.microsoft.com/office/word/2010/wordprocessingDrawing" xmlns:wp="http://schemas.openxmlformats.org/drawingml/2006/wordprocessingDrawing" xmlns:w10="urn:schemas-microsoft-com:office:word" xmlns:w="http://schemas.openxmlformats.org/wordprocessingml/2006/main" xmlns:w14="http://schemas.microsoft.com/office/word/2010/wordml" xmlns:w15="http://schemas.microsoft.com/office/word/2012/wordml" xmlns:w16cex="http://schemas.microsoft.com/office/word/2018/wordml/cex" xmlns:w16cid="http://schemas.microsoft.com/office/word/2016/wordml/cid" xmlns:w16="http://schemas.microsoft.com/office/word/2018/wordml" xmlns:w16du="http://schemas.microsoft.com/office/word/2023/wordml/word16du" xmlns:w16sdtdh="http://schemas.microsoft.com/office/word/2020/wordml/sdtdatahash" xmlns:w16sdtfl="http://schemas.microsoft.com/office/word/2024/wordml/sdtformatlock" xmlns:w16se="http://schemas.microsoft.com/office/word/2015/wordml/symex" xmlns:wpg="http://schemas.microsoft.com/office/word/2010/wordprocessingGroup" xmlns:wpi="http://schemas.microsoft.com/office/word/2010/wordprocessingInk" xmlns:wne="http://schemas.microsoft.com/office/word/2006/wordml" xmlns:wps="http://schemas.microsoft.com/office/word/2010/wordprocessingShape" mc:Ignorable="w14 w15 w16se w16cid w16 w16cex w16sdtdh w16sdtfl w16du wp14">
-  <w:comment w:id="0" w:author="Carr, Treyton" w:date="2025-12-01T15:44:00Z" w:initials="CT">
+  <w:comment w:id="0" w:author="Dave Bridges" w:date="2025-12-12T11:23:00Z" w:initials="DB">
     <w:p>
       <w:r>
         <w:rPr>
@@ -4765,7 +5106,54 @@
         </w:rPr>
         <w:annotationRef/>
       </w:r>
+      <w:r>
+        <w:rPr>
+          <w:sz w:val="20"/>
+          <w:szCs w:val="20"/>
+        </w:rPr>
+        <w:t>Need to add</w:t>
+      </w:r>
+    </w:p>
+  </w:comment>
+  <w:comment w:id="1" w:author="Dave Bridges" w:date="2025-12-12T08:11:00Z" w:initials="DB">
+    <w:p>
+      <w:r>
+        <w:rPr>
+          <w:rStyle w:val="CommentReference"/>
+        </w:rPr>
+        <w:annotationRef/>
+      </w:r>
+      <w:r>
+        <w:rPr>
+          <w:sz w:val="20"/>
+          <w:szCs w:val="20"/>
+        </w:rPr>
+        <w:t>Is this what Data Direct Parameters means?</w:t>
+      </w:r>
+    </w:p>
+  </w:comment>
+  <w:comment w:id="2" w:author="Carr, Treyton" w:date="2025-12-01T15:54:00Z" w:initials="CT">
+    <w:p>
+      <w:r>
+        <w:rPr>
+          <w:rStyle w:val="CommentReference"/>
+        </w:rPr>
+        <w:annotationRef/>
+      </w:r>
       <w:hyperlink r:id="rId1" w:history="1">
+        <w:r>
+          <w:rPr>
+            <w:rStyle w:val="Hyperlink"/>
+            <w:sz w:val="20"/>
+            <w:szCs w:val="20"/>
+          </w:rPr>
+          <w:t>https://pubmed-ncbi-nlm-nih-gov.proxy.lib.umich.edu/23889360/</w:t>
+        </w:r>
+      </w:hyperlink>
+    </w:p>
+    <w:p/>
+    <w:p>
+      <w:hyperlink r:id="rId2" w:history="1">
         <w:r>
           <w:rPr>
             <w:rStyle w:val="Hyperlink"/>
@@ -4776,121 +5164,8 @@
         </w:r>
       </w:hyperlink>
     </w:p>
-    <w:p/>
-    <w:p>
-      <w:hyperlink r:id="rId2" w:history="1">
-        <w:r>
-          <w:rPr>
-            <w:rStyle w:val="Hyperlink"/>
-            <w:sz w:val="20"/>
-            <w:szCs w:val="20"/>
-          </w:rPr>
-          <w:t>https://pmc.ncbi.nlm.nih.gov/articles/PMC4407747/</w:t>
-        </w:r>
-      </w:hyperlink>
-    </w:p>
-    <w:p/>
   </w:comment>
-  <w:comment w:id="1" w:author="Carr, Treyton" w:date="2025-12-03T00:11:00Z" w:initials="CT">
-    <w:p>
-      <w:r>
-        <w:rPr>
-          <w:rStyle w:val="CommentReference"/>
-        </w:rPr>
-        <w:annotationRef/>
-      </w:r>
-      <w:hyperlink r:id="rId3" w:history="1">
-        <w:r>
-          <w:rPr>
-            <w:rStyle w:val="Hyperlink"/>
-            <w:sz w:val="20"/>
-            <w:szCs w:val="20"/>
-          </w:rPr>
-          <w:t>https://pmc.ncbi.nlm.nih.gov/articles/PMC8743006/</w:t>
-        </w:r>
-      </w:hyperlink>
-    </w:p>
-  </w:comment>
-  <w:comment w:id="2" w:author="Carr, Treyton" w:date="2025-12-01T15:54:00Z" w:initials="CT">
-    <w:p>
-      <w:r>
-        <w:rPr>
-          <w:rStyle w:val="CommentReference"/>
-        </w:rPr>
-        <w:annotationRef/>
-      </w:r>
-      <w:hyperlink r:id="rId4" w:history="1">
-        <w:r>
-          <w:rPr>
-            <w:rStyle w:val="Hyperlink"/>
-            <w:sz w:val="20"/>
-            <w:szCs w:val="20"/>
-          </w:rPr>
-          <w:t>https://pubmed-ncbi-nlm-nih-gov.proxy.lib.umich.edu/23889360/</w:t>
-        </w:r>
-      </w:hyperlink>
-    </w:p>
-    <w:p/>
-    <w:p>
-      <w:hyperlink r:id="rId5" w:history="1">
-        <w:r>
-          <w:rPr>
-            <w:rStyle w:val="Hyperlink"/>
-            <w:sz w:val="20"/>
-            <w:szCs w:val="20"/>
-          </w:rPr>
-          <w:t>https://www.sciencedirect.com/science/article/abs/pii/S014067362301961X</w:t>
-        </w:r>
-      </w:hyperlink>
-    </w:p>
-  </w:comment>
-  <w:comment w:id="3" w:author="Carr, Treyton" w:date="2025-12-02T19:34:00Z" w:initials="CT">
-    <w:p>
-      <w:r>
-        <w:rPr>
-          <w:rStyle w:val="CommentReference"/>
-        </w:rPr>
-        <w:annotationRef/>
-      </w:r>
-      <w:hyperlink r:id="rId6" w:history="1">
-        <w:r>
-          <w:rPr>
-            <w:rStyle w:val="Hyperlink"/>
-            <w:sz w:val="20"/>
-            <w:szCs w:val="20"/>
-          </w:rPr>
-          <w:t>https://pubmed.ncbi.nlm.nih.gov/21521323/</w:t>
-        </w:r>
-      </w:hyperlink>
-    </w:p>
-    <w:p/>
-    <w:p>
-      <w:hyperlink r:id="rId7" w:history="1">
-        <w:r>
-          <w:rPr>
-            <w:rStyle w:val="Hyperlink"/>
-            <w:sz w:val="20"/>
-            <w:szCs w:val="20"/>
-          </w:rPr>
-          <w:t>https://pubmed.ncbi.nlm.nih.gov/14671173/</w:t>
-        </w:r>
-      </w:hyperlink>
-    </w:p>
-    <w:p/>
-    <w:p>
-      <w:hyperlink r:id="rId8" w:history="1">
-        <w:r>
-          <w:rPr>
-            <w:rStyle w:val="Hyperlink"/>
-            <w:sz w:val="20"/>
-            <w:szCs w:val="20"/>
-          </w:rPr>
-          <w:t>https://pmc.ncbi.nlm.nih.gov/articles/PMC6856055/</w:t>
-        </w:r>
-      </w:hyperlink>
-    </w:p>
-  </w:comment>
-  <w:comment w:id="4" w:author="Carr, Treyton" w:date="2025-12-02T19:41:00Z" w:initials="CT">
+  <w:comment w:id="3" w:author="Carr, Treyton" w:date="2025-12-08T23:04:00Z" w:initials="CT">
     <w:p>
       <w:r>
         <w:rPr>
@@ -4903,64 +5178,11 @@
           <w:sz w:val="20"/>
           <w:szCs w:val="20"/>
         </w:rPr>
-        <w:t>Do i need numbers for each of these values (ex: by x amount generally)?</w:t>
+        <w:t>How do I find this date again?</w:t>
       </w:r>
     </w:p>
   </w:comment>
-  <w:comment w:id="5" w:author="Carr, Treyton" w:date="2025-12-02T19:42:00Z" w:initials="CT">
-    <w:p>
-      <w:r>
-        <w:rPr>
-          <w:rStyle w:val="CommentReference"/>
-        </w:rPr>
-        <w:annotationRef/>
-      </w:r>
-      <w:hyperlink r:id="rId9" w:history="1">
-        <w:r>
-          <w:rPr>
-            <w:rStyle w:val="Hyperlink"/>
-            <w:sz w:val="20"/>
-            <w:szCs w:val="20"/>
-          </w:rPr>
-          <w:t>https://pmc.ncbi.nlm.nih.gov/articles/PMC6856055/</w:t>
-        </w:r>
-      </w:hyperlink>
-    </w:p>
-    <w:p/>
-    <w:p>
-      <w:hyperlink r:id="rId10" w:history="1">
-        <w:r>
-          <w:rPr>
-            <w:rStyle w:val="Hyperlink"/>
-            <w:sz w:val="20"/>
-            <w:szCs w:val="20"/>
-          </w:rPr>
-          <w:t>https://nyaspubs.onlinelibrary.wiley.com/doi/full/10.1111/j.1749-6632.2002.tb04417.x</w:t>
-        </w:r>
-      </w:hyperlink>
-    </w:p>
-  </w:comment>
-  <w:comment w:id="6" w:author="Carr, Treyton" w:date="2025-12-02T23:49:00Z" w:initials="CT">
-    <w:p>
-      <w:r>
-        <w:rPr>
-          <w:rStyle w:val="CommentReference"/>
-        </w:rPr>
-        <w:annotationRef/>
-      </w:r>
-      <w:hyperlink r:id="rId11" w:history="1">
-        <w:r>
-          <w:rPr>
-            <w:rStyle w:val="Hyperlink"/>
-            <w:sz w:val="20"/>
-            <w:szCs w:val="20"/>
-          </w:rPr>
-          <w:t>https://pmc.ncbi.nlm.nih.gov/articles/PMC6856055/</w:t>
-        </w:r>
-      </w:hyperlink>
-    </w:p>
-  </w:comment>
-  <w:comment w:id="7" w:author="Carr, Treyton" w:date="2025-12-03T00:07:00Z" w:initials="CT">
+  <w:comment w:id="4" w:author="Carr, Treyton" w:date="2025-12-08T23:12:00Z" w:initials="CT">
     <w:p>
       <w:r>
         <w:rPr>
@@ -4973,11 +5195,11 @@
           <w:sz w:val="20"/>
           <w:szCs w:val="20"/>
         </w:rPr>
-        <w:t>....is this the correct title of the study?</w:t>
+        <w:t>edit this based on numbers previous statement</w:t>
       </w:r>
     </w:p>
   </w:comment>
-  <w:comment w:id="8" w:author="Carr, Treyton" w:date="2025-12-03T00:16:00Z" w:initials="CT">
+  <w:comment w:id="5" w:author="Carr, Treyton" w:date="2025-12-08T23:11:00Z" w:initials="CT">
     <w:p>
       <w:r>
         <w:rPr>
@@ -4985,142 +5207,7 @@
         </w:rPr>
         <w:annotationRef/>
       </w:r>
-      <w:r>
-        <w:rPr>
-          <w:sz w:val="20"/>
-          <w:szCs w:val="20"/>
-        </w:rPr>
-        <w:t>should I add any more info on diagnostic challenges? Or is that outside of our scope</w:t>
-      </w:r>
-    </w:p>
-  </w:comment>
-  <w:comment w:id="9" w:author="Dave Bridges" w:date="2025-09-07T19:14:00Z" w:initials="DB">
-    <w:p>
-      <w:r>
-        <w:rPr>
-          <w:rStyle w:val="CommentReference"/>
-        </w:rPr>
-        <w:annotationRef/>
-      </w:r>
-      <w:r>
-        <w:rPr>
-          <w:sz w:val="20"/>
-          <w:szCs w:val="20"/>
-        </w:rPr>
-        <w:t>@trey can you add these</w:t>
-      </w:r>
-    </w:p>
-  </w:comment>
-  <w:comment w:id="10" w:author="Carr, Treyton" w:date="2025-11-08T23:41:00Z" w:initials="CT">
-    <w:p>
-      <w:r>
-        <w:rPr>
-          <w:rStyle w:val="CommentReference"/>
-        </w:rPr>
-        <w:annotationRef/>
-      </w:r>
-      <w:r>
-        <w:rPr>
-          <w:sz w:val="20"/>
-          <w:szCs w:val="20"/>
-        </w:rPr>
-        <w:t>Because we have a total of 86 codes for this category, should we list them somewhere else in the document in an appendix?</w:t>
-      </w:r>
-    </w:p>
-  </w:comment>
-  <w:comment w:id="11" w:author="Dave Bridges" w:date="2025-12-12T08:11:00Z" w:initials="DB">
-    <w:p>
-      <w:r>
-        <w:rPr>
-          <w:rStyle w:val="CommentReference"/>
-        </w:rPr>
-        <w:annotationRef/>
-      </w:r>
-      <w:r>
-        <w:rPr>
-          <w:sz w:val="20"/>
-          <w:szCs w:val="20"/>
-        </w:rPr>
-        <w:t>Is this what Data Direct Parameters means?</w:t>
-      </w:r>
-    </w:p>
-  </w:comment>
-  <w:comment w:id="12" w:author="Carr, Treyton" w:date="2025-12-01T15:54:00Z" w:initials="CT">
-    <w:p>
-      <w:r>
-        <w:rPr>
-          <w:rStyle w:val="CommentReference"/>
-        </w:rPr>
-        <w:annotationRef/>
-      </w:r>
-      <w:hyperlink r:id="rId12" w:history="1">
-        <w:r>
-          <w:rPr>
-            <w:rStyle w:val="Hyperlink"/>
-            <w:sz w:val="20"/>
-            <w:szCs w:val="20"/>
-          </w:rPr>
-          <w:t>https://pubmed-ncbi-nlm-nih-gov.proxy.lib.umich.edu/23889360/</w:t>
-        </w:r>
-      </w:hyperlink>
-    </w:p>
-    <w:p/>
-    <w:p>
-      <w:hyperlink r:id="rId13" w:history="1">
-        <w:r>
-          <w:rPr>
-            <w:rStyle w:val="Hyperlink"/>
-            <w:sz w:val="20"/>
-            <w:szCs w:val="20"/>
-          </w:rPr>
-          <w:t>https://www.sciencedirect.com/science/article/abs/pii/S014067362301961X</w:t>
-        </w:r>
-      </w:hyperlink>
-    </w:p>
-  </w:comment>
-  <w:comment w:id="13" w:author="Carr, Treyton" w:date="2025-12-08T23:04:00Z" w:initials="CT">
-    <w:p>
-      <w:r>
-        <w:rPr>
-          <w:rStyle w:val="CommentReference"/>
-        </w:rPr>
-        <w:annotationRef/>
-      </w:r>
-      <w:r>
-        <w:rPr>
-          <w:sz w:val="20"/>
-          <w:szCs w:val="20"/>
-        </w:rPr>
-        <w:t>How do I find this date again?</w:t>
-      </w:r>
-    </w:p>
-  </w:comment>
-  <w:comment w:id="14" w:author="Carr, Treyton" w:date="2025-12-08T23:12:00Z" w:initials="CT">
-    <w:p>
-      <w:r>
-        <w:rPr>
-          <w:rStyle w:val="CommentReference"/>
-        </w:rPr>
-        <w:annotationRef/>
-      </w:r>
-      <w:r>
-        <w:rPr>
-          <w:sz w:val="20"/>
-          <w:szCs w:val="20"/>
-        </w:rPr>
-        <w:t>edit this based on numbers previous statement</w:t>
-      </w:r>
-    </w:p>
-  </w:comment>
-  <w:comment w:id="15" w:author="Carr, Treyton" w:date="2025-12-08T23:11:00Z" w:initials="CT">
-    <w:p>
-      <w:r>
-        <w:rPr>
-          <w:rStyle w:val="CommentReference"/>
-        </w:rPr>
-        <w:annotationRef/>
-      </w:r>
-      <w:hyperlink r:id="rId14" w:history="1">
+      <w:hyperlink r:id="rId3" w:history="1">
         <w:r>
           <w:rPr>
             <w:rStyle w:val="Hyperlink"/>
@@ -5133,7 +5220,7 @@
     </w:p>
     <w:p/>
     <w:p>
-      <w:hyperlink r:id="rId15" w:history="1">
+      <w:hyperlink r:id="rId4" w:history="1">
         <w:r>
           <w:rPr>
             <w:rStyle w:val="Hyperlink"/>
@@ -5145,7 +5232,7 @@
       </w:hyperlink>
     </w:p>
   </w:comment>
-  <w:comment w:id="16" w:author="Carr, Treyton" w:date="2025-12-08T22:35:00Z" w:initials="CT">
+  <w:comment w:id="6" w:author="Carr, Treyton" w:date="2025-12-08T22:35:00Z" w:initials="CT">
     <w:p>
       <w:r>
         <w:rPr>
@@ -5162,7 +5249,7 @@
       </w:r>
     </w:p>
   </w:comment>
-  <w:comment w:id="17" w:author="Carr, Treyton" w:date="2025-12-08T22:40:00Z" w:initials="CT">
+  <w:comment w:id="7" w:author="Carr, Treyton" w:date="2025-12-08T22:40:00Z" w:initials="CT">
     <w:p>
       <w:r>
         <w:rPr>
@@ -5179,7 +5266,7 @@
       </w:r>
     </w:p>
   </w:comment>
-  <w:comment w:id="18" w:author="Carr, Treyton" w:date="2025-12-08T22:47:00Z" w:initials="CT">
+  <w:comment w:id="8" w:author="Carr, Treyton" w:date="2025-12-08T22:47:00Z" w:initials="CT">
     <w:p>
       <w:r>
         <w:rPr>
@@ -5196,7 +5283,7 @@
       </w:r>
     </w:p>
   </w:comment>
-  <w:comment w:id="19" w:author="Carr, Treyton" w:date="2025-12-08T22:58:00Z" w:initials="CT">
+  <w:comment w:id="9" w:author="Carr, Treyton" w:date="2025-12-08T22:58:00Z" w:initials="CT">
     <w:p>
       <w:r>
         <w:rPr>
@@ -5213,7 +5300,7 @@
       </w:r>
     </w:p>
   </w:comment>
-  <w:comment w:id="20" w:author="Dave Bridges" w:date="2025-09-23T09:45:00Z" w:initials="DB">
+  <w:comment w:id="10" w:author="Dave Bridges" w:date="2025-09-23T09:45:00Z" w:initials="DB">
     <w:p>
       <w:r>
         <w:rPr>
@@ -5240,7 +5327,7 @@
       </w:r>
     </w:p>
   </w:comment>
-  <w:comment w:id="21" w:author="Dave Bridges" w:date="2025-12-03T11:23:00Z" w:initials="DB">
+  <w:comment w:id="11" w:author="Dave Bridges" w:date="2025-12-03T11:23:00Z" w:initials="DB">
     <w:p>
       <w:r>
         <w:rPr>
@@ -5257,7 +5344,7 @@
       </w:r>
     </w:p>
   </w:comment>
-  <w:comment w:id="22" w:author="Dave Bridges" w:date="2025-12-03T11:15:00Z" w:initials="DB">
+  <w:comment w:id="12" w:author="Dave Bridges" w:date="2025-12-03T11:15:00Z" w:initials="DB">
     <w:p>
       <w:r>
         <w:rPr>
@@ -5274,7 +5361,7 @@
       </w:r>
     </w:p>
   </w:comment>
-  <w:comment w:id="23" w:author="Dave Bridges" w:date="2025-12-03T11:24:00Z" w:initials="DB">
+  <w:comment w:id="13" w:author="Dave Bridges" w:date="2025-12-03T11:24:00Z" w:initials="DB">
     <w:p>
       <w:r>
         <w:rPr>
@@ -5291,7 +5378,7 @@
       </w:r>
     </w:p>
   </w:comment>
-  <w:comment w:id="24" w:author="Dave Bridges" w:date="2025-12-03T11:24:00Z" w:initials="DB">
+  <w:comment w:id="14" w:author="Dave Bridges" w:date="2025-12-03T11:24:00Z" w:initials="DB">
     <w:p>
       <w:r>
         <w:rPr>
@@ -5308,7 +5395,7 @@
       </w:r>
     </w:p>
   </w:comment>
-  <w:comment w:id="25" w:author="Dave Bridges" w:date="2025-12-03T11:23:00Z" w:initials="DB">
+  <w:comment w:id="15" w:author="Dave Bridges" w:date="2025-12-03T11:23:00Z" w:initials="DB">
     <w:p>
       <w:r>
         <w:rPr>
@@ -5330,17 +5417,7 @@
 
 <file path=word/commentsExtended.xml><?xml version="1.0" encoding="utf-8"?>
 <w15:commentsEx xmlns:wpc="http://schemas.microsoft.com/office/word/2010/wordprocessingCanvas" xmlns:cx="http://schemas.microsoft.com/office/drawing/2014/chartex" xmlns:cx1="http://schemas.microsoft.com/office/drawing/2015/9/8/chartex" xmlns:cx2="http://schemas.microsoft.com/office/drawing/2015/10/21/chartex" xmlns:cx3="http://schemas.microsoft.com/office/drawing/2016/5/9/chartex" xmlns:cx4="http://schemas.microsoft.com/office/drawing/2016/5/10/chartex" xmlns:cx5="http://schemas.microsoft.com/office/drawing/2016/5/11/chartex" xmlns:cx6="http://schemas.microsoft.com/office/drawing/2016/5/12/chartex" xmlns:cx7="http://schemas.microsoft.com/office/drawing/2016/5/13/chartex" xmlns:cx8="http://schemas.microsoft.com/office/drawing/2016/5/14/chartex" xmlns:mc="http://schemas.openxmlformats.org/markup-compatibility/2006" xmlns:aink="http://schemas.microsoft.com/office/drawing/2016/ink" xmlns:am3d="http://schemas.microsoft.com/office/drawing/2017/model3d" xmlns:o="urn:schemas-microsoft-com:office:office" xmlns:oel="http://schemas.microsoft.com/office/2019/extlst" xmlns:r="http://schemas.openxmlformats.org/officeDocument/2006/relationships" xmlns:m="http://schemas.openxmlformats.org/officeDocument/2006/math" xmlns:v="urn:schemas-microsoft-com:vml" xmlns:wp14="http://schemas.microsoft.com/office/word/2010/wordprocessingDrawing" xmlns:wp="http://schemas.openxmlformats.org/drawingml/2006/wordprocessingDrawing" xmlns:w10="urn:schemas-microsoft-com:office:word" xmlns:w="http://schemas.openxmlformats.org/wordprocessingml/2006/main" xmlns:w14="http://schemas.microsoft.com/office/word/2010/wordml" xmlns:w15="http://schemas.microsoft.com/office/word/2012/wordml" xmlns:w16cex="http://schemas.microsoft.com/office/word/2018/wordml/cex" xmlns:w16cid="http://schemas.microsoft.com/office/word/2016/wordml/cid" xmlns:w16="http://schemas.microsoft.com/office/word/2018/wordml" xmlns:w16du="http://schemas.microsoft.com/office/word/2023/wordml/word16du" xmlns:w16sdtdh="http://schemas.microsoft.com/office/word/2020/wordml/sdtdatahash" xmlns:w16sdtfl="http://schemas.microsoft.com/office/word/2024/wordml/sdtformatlock" xmlns:w16se="http://schemas.microsoft.com/office/word/2015/wordml/symex" xmlns:wpg="http://schemas.microsoft.com/office/word/2010/wordprocessingGroup" xmlns:wpi="http://schemas.microsoft.com/office/word/2010/wordprocessingInk" xmlns:wne="http://schemas.microsoft.com/office/word/2006/wordml" xmlns:wps="http://schemas.microsoft.com/office/word/2010/wordprocessingShape" mc:Ignorable="w14 w15 w16se w16cid w16 w16cex w16sdtdh w16sdtfl w16du wp14">
-  <w15:commentEx w15:paraId="5E7166E4" w15:done="0"/>
-  <w15:commentEx w15:paraId="5DE1ED22" w15:done="0"/>
-  <w15:commentEx w15:paraId="6D4C1547" w15:done="0"/>
-  <w15:commentEx w15:paraId="600A3090" w15:done="0"/>
-  <w15:commentEx w15:paraId="2F406576" w15:paraIdParent="600A3090" w15:done="0"/>
-  <w15:commentEx w15:paraId="422C9601" w15:done="0"/>
-  <w15:commentEx w15:paraId="7B0ABE96" w15:done="0"/>
-  <w15:commentEx w15:paraId="5A0030CA" w15:done="1"/>
-  <w15:commentEx w15:paraId="1EC95409" w15:done="0"/>
-  <w15:commentEx w15:paraId="30EA8164" w15:done="1"/>
-  <w15:commentEx w15:paraId="03BC0566" w15:paraIdParent="30EA8164" w15:done="1"/>
+  <w15:commentEx w15:paraId="1A4606F5" w15:done="0"/>
   <w15:commentEx w15:paraId="4F482A5D" w15:done="0"/>
   <w15:commentEx w15:paraId="55C5B726" w15:done="0"/>
   <w15:commentEx w15:paraId="34F38AE8" w15:done="0"/>
@@ -5361,17 +5438,7 @@
 
 <file path=word/commentsExtensible.xml><?xml version="1.0" encoding="utf-8"?>
 <w16cex:commentsExtensible xmlns:wpc="http://schemas.microsoft.com/office/word/2010/wordprocessingCanvas" xmlns:cx="http://schemas.microsoft.com/office/drawing/2014/chartex" xmlns:cx1="http://schemas.microsoft.com/office/drawing/2015/9/8/chartex" xmlns:cx2="http://schemas.microsoft.com/office/drawing/2015/10/21/chartex" xmlns:cx3="http://schemas.microsoft.com/office/drawing/2016/5/9/chartex" xmlns:cx4="http://schemas.microsoft.com/office/drawing/2016/5/10/chartex" xmlns:cx5="http://schemas.microsoft.com/office/drawing/2016/5/11/chartex" xmlns:cx6="http://schemas.microsoft.com/office/drawing/2016/5/12/chartex" xmlns:cx7="http://schemas.microsoft.com/office/drawing/2016/5/13/chartex" xmlns:cx8="http://schemas.microsoft.com/office/drawing/2016/5/14/chartex" xmlns:cr="http://schemas.microsoft.com/office/comments/2020/reactions" xmlns:mc="http://schemas.openxmlformats.org/markup-compatibility/2006" xmlns:aink="http://schemas.microsoft.com/office/drawing/2016/ink" xmlns:am3d="http://schemas.microsoft.com/office/drawing/2017/model3d" xmlns:o="urn:schemas-microsoft-com:office:office" xmlns:oel="http://schemas.microsoft.com/office/2019/extlst" xmlns:r="http://schemas.openxmlformats.org/officeDocument/2006/relationships" xmlns:m="http://schemas.openxmlformats.org/officeDocument/2006/math" xmlns:v="urn:schemas-microsoft-com:vml" xmlns:wp14="http://schemas.microsoft.com/office/word/2010/wordprocessingDrawing" xmlns:wp="http://schemas.openxmlformats.org/drawingml/2006/wordprocessingDrawing" xmlns:w10="urn:schemas-microsoft-com:office:word" xmlns:w="http://schemas.openxmlformats.org/wordprocessingml/2006/main" xmlns:w14="http://schemas.microsoft.com/office/word/2010/wordml" xmlns:w15="http://schemas.microsoft.com/office/word/2012/wordml" xmlns:w16cex="http://schemas.microsoft.com/office/word/2018/wordml/cex" xmlns:w16cid="http://schemas.microsoft.com/office/word/2016/wordml/cid" xmlns:w16="http://schemas.microsoft.com/office/word/2018/wordml" xmlns:w16du="http://schemas.microsoft.com/office/word/2023/wordml/word16du" xmlns:w16sdtdh="http://schemas.microsoft.com/office/word/2020/wordml/sdtdatahash" xmlns:w16sdtfl="http://schemas.microsoft.com/office/word/2024/wordml/sdtformatlock" xmlns:w16se="http://schemas.microsoft.com/office/word/2015/wordml/symex" xmlns:wpg="http://schemas.microsoft.com/office/word/2010/wordprocessingGroup" xmlns:wpi="http://schemas.microsoft.com/office/word/2010/wordprocessingInk" xmlns:wne="http://schemas.microsoft.com/office/word/2006/wordml" xmlns:wps="http://schemas.microsoft.com/office/word/2010/wordprocessingShape" mc:Ignorable="w14 w15 w16se w16cid w16 w16cex w16sdtdh w16sdtfl cr w16du wp14">
-  <w16cex:commentExtensible w16cex:durableId="354F1AD7" w16cex:dateUtc="2025-12-01T20:44:00Z"/>
-  <w16cex:commentExtensible w16cex:durableId="50772C8C" w16cex:dateUtc="2025-12-03T05:11:00Z"/>
-  <w16cex:commentExtensible w16cex:durableId="08232419" w16cex:dateUtc="2025-12-01T20:54:00Z"/>
-  <w16cex:commentExtensible w16cex:durableId="63B3FDBC" w16cex:dateUtc="2025-12-03T00:34:00Z"/>
-  <w16cex:commentExtensible w16cex:durableId="724D0662" w16cex:dateUtc="2025-12-03T00:41:00Z"/>
-  <w16cex:commentExtensible w16cex:durableId="2A2F0DAC" w16cex:dateUtc="2025-12-03T00:42:00Z"/>
-  <w16cex:commentExtensible w16cex:durableId="50D29B1F" w16cex:dateUtc="2025-12-03T04:49:00Z"/>
-  <w16cex:commentExtensible w16cex:durableId="5F9281EB" w16cex:dateUtc="2025-12-03T05:07:00Z"/>
-  <w16cex:commentExtensible w16cex:durableId="20CDB372" w16cex:dateUtc="2025-12-03T05:16:00Z"/>
-  <w16cex:commentExtensible w16cex:durableId="7BBB9387" w16cex:dateUtc="2025-09-07T23:14:00Z"/>
-  <w16cex:commentExtensible w16cex:durableId="5C3B7975" w16cex:dateUtc="2025-11-09T04:41:00Z"/>
+  <w16cex:commentExtensible w16cex:durableId="00CF6BFD" w16cex:dateUtc="2025-12-12T16:23:00Z"/>
   <w16cex:commentExtensible w16cex:durableId="1C9E561D" w16cex:dateUtc="2025-12-12T13:11:00Z"/>
   <w16cex:commentExtensible w16cex:durableId="72370C7F" w16cex:dateUtc="2025-12-01T20:54:00Z"/>
   <w16cex:commentExtensible w16cex:durableId="29668EE0" w16cex:dateUtc="2025-12-09T04:04:00Z"/>
@@ -5392,17 +5459,7 @@
 
 <file path=word/commentsIds.xml><?xml version="1.0" encoding="utf-8"?>
 <w16cid:commentsIds xmlns:wpc="http://schemas.microsoft.com/office/word/2010/wordprocessingCanvas" xmlns:cx="http://schemas.microsoft.com/office/drawing/2014/chartex" xmlns:cx1="http://schemas.microsoft.com/office/drawing/2015/9/8/chartex" xmlns:cx2="http://schemas.microsoft.com/office/drawing/2015/10/21/chartex" xmlns:cx3="http://schemas.microsoft.com/office/drawing/2016/5/9/chartex" xmlns:cx4="http://schemas.microsoft.com/office/drawing/2016/5/10/chartex" xmlns:cx5="http://schemas.microsoft.com/office/drawing/2016/5/11/chartex" xmlns:cx6="http://schemas.microsoft.com/office/drawing/2016/5/12/chartex" xmlns:cx7="http://schemas.microsoft.com/office/drawing/2016/5/13/chartex" xmlns:cx8="http://schemas.microsoft.com/office/drawing/2016/5/14/chartex" xmlns:mc="http://schemas.openxmlformats.org/markup-compatibility/2006" xmlns:aink="http://schemas.microsoft.com/office/drawing/2016/ink" xmlns:am3d="http://schemas.microsoft.com/office/drawing/2017/model3d" xmlns:o="urn:schemas-microsoft-com:office:office" xmlns:oel="http://schemas.microsoft.com/office/2019/extlst" xmlns:r="http://schemas.openxmlformats.org/officeDocument/2006/relationships" xmlns:m="http://schemas.openxmlformats.org/officeDocument/2006/math" xmlns:v="urn:schemas-microsoft-com:vml" xmlns:wp14="http://schemas.microsoft.com/office/word/2010/wordprocessingDrawing" xmlns:wp="http://schemas.openxmlformats.org/drawingml/2006/wordprocessingDrawing" xmlns:w10="urn:schemas-microsoft-com:office:word" xmlns:w="http://schemas.openxmlformats.org/wordprocessingml/2006/main" xmlns:w14="http://schemas.microsoft.com/office/word/2010/wordml" xmlns:w15="http://schemas.microsoft.com/office/word/2012/wordml" xmlns:w16cex="http://schemas.microsoft.com/office/word/2018/wordml/cex" xmlns:w16cid="http://schemas.microsoft.com/office/word/2016/wordml/cid" xmlns:w16="http://schemas.microsoft.com/office/word/2018/wordml" xmlns:w16du="http://schemas.microsoft.com/office/word/2023/wordml/word16du" xmlns:w16sdtdh="http://schemas.microsoft.com/office/word/2020/wordml/sdtdatahash" xmlns:w16sdtfl="http://schemas.microsoft.com/office/word/2024/wordml/sdtformatlock" xmlns:w16se="http://schemas.microsoft.com/office/word/2015/wordml/symex" xmlns:wpg="http://schemas.microsoft.com/office/word/2010/wordprocessingGroup" xmlns:wpi="http://schemas.microsoft.com/office/word/2010/wordprocessingInk" xmlns:wne="http://schemas.microsoft.com/office/word/2006/wordml" xmlns:wps="http://schemas.microsoft.com/office/word/2010/wordprocessingShape" mc:Ignorable="w14 w15 w16se w16cid w16 w16cex w16sdtdh w16sdtfl w16du wp14">
-  <w16cid:commentId w16cid:paraId="5E7166E4" w16cid:durableId="354F1AD7"/>
-  <w16cid:commentId w16cid:paraId="5DE1ED22" w16cid:durableId="50772C8C"/>
-  <w16cid:commentId w16cid:paraId="6D4C1547" w16cid:durableId="08232419"/>
-  <w16cid:commentId w16cid:paraId="600A3090" w16cid:durableId="63B3FDBC"/>
-  <w16cid:commentId w16cid:paraId="2F406576" w16cid:durableId="724D0662"/>
-  <w16cid:commentId w16cid:paraId="422C9601" w16cid:durableId="2A2F0DAC"/>
-  <w16cid:commentId w16cid:paraId="7B0ABE96" w16cid:durableId="50D29B1F"/>
-  <w16cid:commentId w16cid:paraId="5A0030CA" w16cid:durableId="5F9281EB"/>
-  <w16cid:commentId w16cid:paraId="1EC95409" w16cid:durableId="20CDB372"/>
-  <w16cid:commentId w16cid:paraId="30EA8164" w16cid:durableId="7BBB9387"/>
-  <w16cid:commentId w16cid:paraId="03BC0566" w16cid:durableId="5C3B7975"/>
+  <w16cid:commentId w16cid:paraId="1A4606F5" w16cid:durableId="00CF6BFD"/>
   <w16cid:commentId w16cid:paraId="4F482A5D" w16cid:durableId="1C9E561D"/>
   <w16cid:commentId w16cid:paraId="55C5B726" w16cid:durableId="72370C7F"/>
   <w16cid:commentId w16cid:paraId="34F38AE8" w16cid:durableId="29668EE0"/>
@@ -6768,11 +6825,11 @@
 
 <file path=word/people.xml><?xml version="1.0" encoding="utf-8"?>
 <w15:people xmlns:wpc="http://schemas.microsoft.com/office/word/2010/wordprocessingCanvas" xmlns:cx="http://schemas.microsoft.com/office/drawing/2014/chartex" xmlns:cx1="http://schemas.microsoft.com/office/drawing/2015/9/8/chartex" xmlns:cx2="http://schemas.microsoft.com/office/drawing/2015/10/21/chartex" xmlns:cx3="http://schemas.microsoft.com/office/drawing/2016/5/9/chartex" xmlns:cx4="http://schemas.microsoft.com/office/drawing/2016/5/10/chartex" xmlns:cx5="http://schemas.microsoft.com/office/drawing/2016/5/11/chartex" xmlns:cx6="http://schemas.microsoft.com/office/drawing/2016/5/12/chartex" xmlns:cx7="http://schemas.microsoft.com/office/drawing/2016/5/13/chartex" xmlns:cx8="http://schemas.microsoft.com/office/drawing/2016/5/14/chartex" xmlns:mc="http://schemas.openxmlformats.org/markup-compatibility/2006" xmlns:aink="http://schemas.microsoft.com/office/drawing/2016/ink" xmlns:am3d="http://schemas.microsoft.com/office/drawing/2017/model3d" xmlns:o="urn:schemas-microsoft-com:office:office" xmlns:oel="http://schemas.microsoft.com/office/2019/extlst" xmlns:r="http://schemas.openxmlformats.org/officeDocument/2006/relationships" xmlns:m="http://schemas.openxmlformats.org/officeDocument/2006/math" xmlns:v="urn:schemas-microsoft-com:vml" xmlns:wp14="http://schemas.microsoft.com/office/word/2010/wordprocessingDrawing" xmlns:wp="http://schemas.openxmlformats.org/drawingml/2006/wordprocessingDrawing" xmlns:w10="urn:schemas-microsoft-com:office:word" xmlns:w="http://schemas.openxmlformats.org/wordprocessingml/2006/main" xmlns:w14="http://schemas.microsoft.com/office/word/2010/wordml" xmlns:w15="http://schemas.microsoft.com/office/word/2012/wordml" xmlns:w16cex="http://schemas.microsoft.com/office/word/2018/wordml/cex" xmlns:w16cid="http://schemas.microsoft.com/office/word/2016/wordml/cid" xmlns:w16="http://schemas.microsoft.com/office/word/2018/wordml" xmlns:w16du="http://schemas.microsoft.com/office/word/2023/wordml/word16du" xmlns:w16sdtdh="http://schemas.microsoft.com/office/word/2020/wordml/sdtdatahash" xmlns:w16sdtfl="http://schemas.microsoft.com/office/word/2024/wordml/sdtformatlock" xmlns:w16se="http://schemas.microsoft.com/office/word/2015/wordml/symex" xmlns:wpg="http://schemas.microsoft.com/office/word/2010/wordprocessingGroup" xmlns:wpi="http://schemas.microsoft.com/office/word/2010/wordprocessingInk" xmlns:wne="http://schemas.microsoft.com/office/word/2006/wordml" xmlns:wps="http://schemas.microsoft.com/office/word/2010/wordprocessingShape" mc:Ignorable="w14 w15 w16se w16cid w16 w16cex w16sdtdh w16sdtfl w16du wp14">
+  <w15:person w15:author="Dave Bridges">
+    <w15:presenceInfo w15:providerId="None" w15:userId="Dave Bridges"/>
+  </w15:person>
   <w15:person w15:author="Carr, Treyton">
     <w15:presenceInfo w15:providerId="AD" w15:userId="S::treycarr@umich.edu::2d7a502c-7154-4eba-af5f-8ba5f8b51ac9"/>
-  </w15:person>
-  <w15:person w15:author="Dave Bridges">
-    <w15:presenceInfo w15:providerId="None" w15:userId="Dave Bridges"/>
   </w15:person>
 </w15:people>
 </file>

</xml_diff>

<commit_message>
Added last few references
</commit_message>
<xml_diff>
--- a/manuscript/Cushings-Obesity/manuscript.docx
+++ b/manuscript/Cushings-Obesity/manuscript.docx
@@ -36,7 +36,7 @@
         <w:fldChar w:fldCharType="begin"/>
       </w:r>
       <w:r>
-        <w:instrText xml:space="preserve"> ADDIN ZOTERO_ITEM CSL_CITATION {"citationID":"Q0k2p23E","properties":{"formattedCitation":"(Gadelha et al., 2023; Sharma, Susmeeta T. et al., 2015)","plainCitation":"(Gadelha et al., 2023; Sharma, Susmeeta T. et al., 2015)","noteIndex":0},"citationItems":[{"id":27385,"uris":["http://zotero.org/users/7317906/items/943TJHQ8"],"itemData":{"id":27385,"type":"article-journal","abstract":"Endogenous Cushing's syndrome results from excess glucocorticoid secretion, which leads to a myriad of clinical manifestations, comorbidities, and increased mortality despite treatment. Molecular mechanisms and genetic alterations associated with different causes of Cushing's syndrome have been described in the last decade. Imaging modalities and biochemical testing have evolved; however, both the diagnosis and management of Cushing's syndrome remain challenging. Surgery is the preferred treatment for all causes, but medical therapy has markedly advanced, with new drug options becoming available. Nevertheless, several comorbidities remain even after patient remission, which can affect quality of life. Accurate and timely diagnosis and treatment are essential for mitigating chronic complications of excess glucocorticoids and improving patient quality of life. In this Seminar, we aim to update several important aspects of diagnosis, complications, and treatment of endogenous Cushing's syndrome of all causes.","container-title":"The Lancet","DOI":"10.1016/S0140-6736(23)01961-X","ISSN":"0140-6736","issue":"10418","journalAbbreviation":"The Lancet","page":"2237-2252","source":"ScienceDirect","title":"Cushing's syndrome","volume":"402","author":[{"family":"Gadelha","given":"Mônica"},{"family":"Gatto","given":"Federico"},{"family":"Wildemberg","given":"Luiz Eduardo"},{"family":"Fleseriu","given":"Maria"}],"issued":{"date-parts":[["2023",12,9]]},"citation-key":"gadelhaCushingsSyndrome2023"}},{"id":27387,"uris":["http://zotero.org/users/7317906/items/TDFR4SXD"],"itemData":{"id":27387,"type":"article-journal","abstract":"Cushing&amp;#39;s syndrome: epidemiology and developments in disease management Susmeeta T Sharma,1 Lynnette K Nieman,1 Richard A Feelders2 1Program in Reproductive and Adult Endocrinology, Eunice Kennedy Shriver National Institute of Child Health and Human Development, National Institutes of Health, Bethesda, MD, USA; 2Division of Endocrinology, Department of Internal Medicine, Erasmus Medical Center, Rotterdam, the Netherlands  Abstract: Cushing&amp;rsquo;s syndrome is a rare disorder resulting from prolonged exposure to excess glucocorticoids. Early diagnosis and treatment of Cushing&amp;rsquo;s syndrome is associated with a decrease in morbidity and mortality. Clinical presentation can be highly variable, and establishing the diagnosis can often be difficult. Surgery (resection of the pituitary or ectopic source of adrenocorticotropic hormone, or unilateral or bilateral adrenalectomy) remains the optimal treatment in all forms of Cushing&amp;rsquo;s syndrome, but may not always lead to remission. Medical therapy (steroidogenesis inhibitors, agents that decrease adrenocorticotropic hormone levels or glucocorticoid receptor antagonists) and pituitary radiotherapy may be needed as an adjunct. A multidisciplinary approach, long-term follow-up, and treatment modalities customized to each individual are essential for optimal control of hypercortisolemia and management of comorbidities.  Keywords: Cushing&amp;rsquo;s syndrome, hypercortisolemia, treatment, epidemiology","container-title":"Clinical Epidemiology","language":"en","page":"281–293","source":"www.dovepress.com","title":"Cushing's syndrome: epidemiology and developments in disease management","title-short":"Cushing&amp;#39;s syndrome","author":[{"literal":"Sharma, Susmeeta T."},{"family":"Nieman","given":"Lynnette K."},{"family":"Feelders","given":"Richard A."}],"issued":{"date-parts":[["2015"]]},"citation-key":"sharmasusmeetat.CushingsSyndromeEpidemiology2015"}}],"schema":"https://github.com/citation-style-language/schema/raw/master/csl-citation.json"} </w:instrText>
+        <w:instrText xml:space="preserve"> ADDIN ZOTERO_ITEM CSL_CITATION {"citationID":"Q0k2p23E","properties":{"formattedCitation":"(Gadelha et al., 2023; Sharma et al., 2015)","plainCitation":"(Gadelha et al., 2023; Sharma et al., 2015)","noteIndex":0},"citationItems":[{"id":27385,"uris":["http://zotero.org/users/7317906/items/943TJHQ8"],"itemData":{"id":27385,"type":"article-journal","abstract":"Endogenous Cushing's syndrome results from excess glucocorticoid secretion, which leads to a myriad of clinical manifestations, comorbidities, and increased mortality despite treatment. Molecular mechanisms and genetic alterations associated with different causes of Cushing's syndrome have been described in the last decade. Imaging modalities and biochemical testing have evolved; however, both the diagnosis and management of Cushing's syndrome remain challenging. Surgery is the preferred treatment for all causes, but medical therapy has markedly advanced, with new drug options becoming available. Nevertheless, several comorbidities remain even after patient remission, which can affect quality of life. Accurate and timely diagnosis and treatment are essential for mitigating chronic complications of excess glucocorticoids and improving patient quality of life. In this Seminar, we aim to update several important aspects of diagnosis, complications, and treatment of endogenous Cushing's syndrome of all causes.","container-title":"The Lancet","DOI":"10.1016/S0140-6736(23)01961-X","ISSN":"0140-6736","issue":"10418","journalAbbreviation":"The Lancet","page":"2237-2252","source":"ScienceDirect","title":"Cushing's syndrome","volume":"402","author":[{"family":"Gadelha","given":"Mônica"},{"family":"Gatto","given":"Federico"},{"family":"Wildemberg","given":"Luiz Eduardo"},{"family":"Fleseriu","given":"Maria"}],"issued":{"date-parts":[["2023",12,9]]},"citation-key":"gadelhaCushingsSyndrome2023"}},{"id":27387,"uris":["http://zotero.org/users/7317906/items/TDFR4SXD"],"itemData":{"id":27387,"type":"article-journal","abstract":"Cushing&amp;#39;s syndrome: epidemiology and developments in disease management Susmeeta T Sharma,1 Lynnette K Nieman,1 Richard A Feelders2 1Program in Reproductive and Adult Endocrinology, Eunice Kennedy Shriver National Institute of Child Health and Human Development, National Institutes of Health, Bethesda, MD, USA; 2Division of Endocrinology, Department of Internal Medicine, Erasmus Medical Center, Rotterdam, the Netherlands  Abstract: Cushing&amp;rsquo;s syndrome is a rare disorder resulting from prolonged exposure to excess glucocorticoids. Early diagnosis and treatment of Cushing&amp;rsquo;s syndrome is associated with a decrease in morbidity and mortality. Clinical presentation can be highly variable, and establishing the diagnosis can often be difficult. Surgery (resection of the pituitary or ectopic source of adrenocorticotropic hormone, or unilateral or bilateral adrenalectomy) remains the optimal treatment in all forms of Cushing&amp;rsquo;s syndrome, but may not always lead to remission. Medical therapy (steroidogenesis inhibitors, agents that decrease adrenocorticotropic hormone levels or glucocorticoid receptor antagonists) and pituitary radiotherapy may be needed as an adjunct. A multidisciplinary approach, long-term follow-up, and treatment modalities customized to each individual are essential for optimal control of hypercortisolemia and management of comorbidities.  Keywords: Cushing&amp;rsquo;s syndrome, hypercortisolemia, treatment, epidemiology","container-title":"Clinical Epidemiology","language":"en","page":"281–293","source":"www.dovepress.com","title":"Cushing's syndrome: epidemiology and developments in disease management","title-short":"Cushing&amp;#39;s syndrome","author":[{"family":"Sharma","given":"Susmeeta T."},{"family":"Nieman","given":"Lynnette K."},{"family":"Feelders","given":"Richard A."}],"issued":{"date-parts":[["2015"]]},"citation-key":"sharmaCushingsSyndromeEpidemiology2015"}}],"schema":"https://github.com/citation-style-language/schema/raw/master/csl-citation.json"} </w:instrText>
       </w:r>
       <w:r>
         <w:fldChar w:fldCharType="separate"/>
@@ -45,7 +45,7 @@
         <w:rPr>
           <w:noProof/>
         </w:rPr>
-        <w:t>(Gadelha et al., 2023; Sharma, Susmeeta T. et al., 2015)</w:t>
+        <w:t>(Gadelha et al., 2023; Sharma et al., 2015)</w:t>
       </w:r>
       <w:r>
         <w:fldChar w:fldCharType="end"/>
@@ -801,10 +801,22 @@
         <w:t xml:space="preserve">Of </w:t>
       </w:r>
       <w:r>
-        <w:t xml:space="preserve">these 365 participants, we were able to get </w:t>
-      </w:r>
-      <w:r>
-        <w:t xml:space="preserve">fating </w:t>
+        <w:t xml:space="preserve">these 365 participants, we were </w:t>
+      </w:r>
+      <w:r>
+        <w:t>there were documented</w:t>
+      </w:r>
+      <w:r>
+        <w:t xml:space="preserve"> </w:t>
+      </w:r>
+      <w:r>
+        <w:t>fa</w:t>
+      </w:r>
+      <w:r>
+        <w:t>s</w:t>
+      </w:r>
+      <w:r>
+        <w:t xml:space="preserve">ting </w:t>
       </w:r>
       <w:r>
         <w:t xml:space="preserve">glucose measurements for all 365, HbA1c values for 17, ALT values for 84, </w:t>
@@ -822,11 +834,1414 @@
         <w:t xml:space="preserve">  </w:t>
       </w:r>
       <w:r>
-        <w:t>The average age at diagnosis was 46.3 +/- 15.5 years. There were 287 female and 72 male patients.  This is consistent with the gender difference in diagnosis of 4:1 seen in previous studies   (</w:t>
+        <w:t xml:space="preserve">The average age at diagnosis was 46.3 +/- 15.5 years. There were 287 female and 72 male patients.   The average BMI was 34.72 (+/- 13.78). The patient population was predominately White (87.19%), with the remaining participants identifying as Black (5.29%), Hispanic or Latino (2.79%), Asian (2.23%), or Other (2.51%). </w:t>
+      </w:r>
+      <w:r>
+        <w:t xml:space="preserve">These patients were then matched to controls without Cushing’s disease selected from a pool of </w:t>
+      </w:r>
+      <w:r>
+        <w:t xml:space="preserve">181,624 </w:t>
+      </w:r>
+      <w:r>
+        <w:t>patients</w:t>
+      </w:r>
+      <w:r>
+        <w:t xml:space="preserve">. </w:t>
+      </w:r>
+    </w:p>
+    <w:p>
+      <w:pPr>
+        <w:pStyle w:val="Heading2"/>
+        <w:rPr>
+          <w:rStyle w:val="Strong"/>
+          <w:b w:val="0"/>
+          <w:bCs w:val="0"/>
+        </w:rPr>
+      </w:pPr>
+      <w:r>
+        <w:rPr>
+          <w:rStyle w:val="Strong"/>
+          <w:b w:val="0"/>
+          <w:bCs w:val="0"/>
+        </w:rPr>
+        <w:t>Participant characteristics</w:t>
+      </w:r>
+      <w:r>
+        <w:rPr>
+          <w:rStyle w:val="Strong"/>
+          <w:b w:val="0"/>
+          <w:bCs w:val="0"/>
+        </w:rPr>
+        <w:t xml:space="preserve"> </w:t>
+      </w:r>
+      <w:r>
+        <w:rPr>
+          <w:rStyle w:val="Strong"/>
+          <w:b w:val="0"/>
+          <w:bCs w:val="0"/>
+        </w:rPr>
+        <w:t xml:space="preserve">associated with </w:t>
+      </w:r>
+      <w:r>
+        <w:rPr>
+          <w:rStyle w:val="Strong"/>
+          <w:b w:val="0"/>
+          <w:bCs w:val="0"/>
+        </w:rPr>
+        <w:t xml:space="preserve">Cushing’s </w:t>
+      </w:r>
+      <w:r>
+        <w:rPr>
+          <w:rStyle w:val="Strong"/>
+          <w:b w:val="0"/>
+          <w:bCs w:val="0"/>
+        </w:rPr>
+        <w:t xml:space="preserve">disease </w:t>
+      </w:r>
+    </w:p>
+    <w:p>
+      <w:r>
+        <w:t xml:space="preserve">We performed outcome-specific propensity matching to identify appropriate controls, starting from those with generating exact matches for gender, race and ethnicity.  We then algorithmically matched for age, generating 10 controls for each case.  Matching was </w:t>
+      </w:r>
+      <w:r>
+        <w:t xml:space="preserve">effective </w:t>
+      </w:r>
+      <w:r>
+        <w:t xml:space="preserve"> with a </w:t>
+      </w:r>
+      <w:r>
+        <w:t>standardized mean difference</w:t>
+      </w:r>
+      <w:r>
+        <w:t xml:space="preserve"> for age of &lt;0.05 for each outcome (see </w:t>
+      </w:r>
+      <w:r>
+        <w:t xml:space="preserve">Table 1, </w:t>
+      </w:r>
+      <w:r>
+        <w:t xml:space="preserve">Supplementary </w:t>
+      </w:r>
+      <w:r>
+        <w:t xml:space="preserve">Figure </w:t>
+      </w:r>
+      <w:r>
+        <w:t>1</w:t>
+      </w:r>
+      <w:r>
+        <w:t xml:space="preserve"> and Supplementary Table S1).</w:t>
+      </w:r>
+    </w:p>
+    <w:p>
+      <w:r>
+        <w:t xml:space="preserve">Primary descriptive characteristics are </w:t>
+      </w:r>
+      <w:r>
+        <w:t>provided</w:t>
+      </w:r>
+      <w:r>
+        <w:t xml:space="preserve"> for all participants with any available laboratory measurement</w:t>
+      </w:r>
+      <w:r>
+        <w:t xml:space="preserve"> </w:t>
+      </w:r>
+      <w:r>
+        <w:t>(Table 1)</w:t>
+      </w:r>
+      <w:r>
+        <w:t xml:space="preserve">. </w:t>
+      </w:r>
+      <w:r>
+        <w:t>Outcome-specific matched sets are described in Supplementary Tables S2</w:t>
+      </w:r>
+      <w:r>
+        <w:t>A-E</w:t>
+      </w:r>
+      <w:r>
+        <w:t>.</w:t>
+      </w:r>
+      <w:r>
+        <w:t xml:space="preserve">   </w:t>
+      </w:r>
+      <w:r>
+        <w:t xml:space="preserve">There was </w:t>
+      </w:r>
+      <w:r>
+        <w:t>a higher prevalence of Cushing’s disease in females (284 vs 72</w:t>
+      </w:r>
+      <w:r>
+        <w:t>, p&lt;0.00</w:t>
+      </w:r>
+      <w:r>
+        <w:t>1</w:t>
+      </w:r>
+      <w:r>
+        <w:t>)</w:t>
+      </w:r>
+      <w:r>
+        <w:t>, consistent with the prior literature</w:t>
+      </w:r>
+      <w:r>
+        <w:t xml:space="preserve"> </w:t>
+      </w:r>
+      <w:r>
+        <w:fldChar w:fldCharType="begin"/>
+      </w:r>
+      <w:r>
+        <w:instrText xml:space="preserve"> ADDIN ZOTERO_ITEM CSL_CITATION {"citationID":"5iZIPs39","properties":{"formattedCitation":"(Alqeeq et al., 2024; Broder et al., 2015; Etxabe &amp; Vazquez, 1994; Matthiasdottir et al., 2024; Steffensen et al., 2010)","plainCitation":"(Alqeeq et al., 2024; Broder et al., 2015; Etxabe &amp; Vazquez, 1994; Matthiasdottir et al., 2024; Steffensen et al., 2010)","noteIndex":0},"citationItems":[{"id":27029,"uris":["http://zotero.org/users/7317906/items/5UXH2J3G"],"itemData":{"id":27029,"type":"article-journal","abstract":"BACKGROUND AND OBJECTIVES: Cushing's disease is a rare endocrine disorder. This review aimed to examine sex-specific differences in Cushing's disease.\nDESIGN AND SETTINGS: A meta-analysis was performed on published articles discussing the gender impact of Cushing's disease.\nMETHODS: A systematic search was conducted to identify studies from Medline, Embase, CENTRAL and Scopus. Nine studies enrolling 1047 patients diagnosed with Cushing's disease were included in this meta-analysis.\nRESULTS: Male patients presented at a younger age (MD [mean difference]=-5.43; 95% CI [-5.78, -5.08]; P&lt;.00001) than females. Male patients had a significantly higher prevalence of osteoporosis (RR [risk ratio]=1.75; 95% CI [1.36, 225]; P&lt;.0001) and hypokalemia (RR=1.66; 95% CI [1.27, 2.16]; P=.0002). In addition, males had significantly higher rates of negative magnetic resonance imaging (RR=1.53; 95% CI [1.18, 2.0]; P=.002). No sex difference was observed in the prevalence of diabetes (RR=0.92; 95% CI [0.70, 1.22]); P=.57) and dyslipidemia (RR=1.33; 95% CI [0.88, 2.0]; P=.17).\nCONCLUSION: Cushing's disease has a worse clinical presentation in males and more diagnostic difficulties compared to females.","container-title":"Annals of Saudi Medicine","DOI":"10.5144/0256-4947.2024.55","ISSN":"0975-4466","issue":"1","journalAbbreviation":"Ann Saudi Med","language":"eng","note":"PMID: 38311874\nPMCID: PMC10839456","page":"55-65","source":"PubMed","title":"Sex-related differences in Cushing's disease: a systematic review and meta-analysis","title-short":"Sex-related differences in Cushing's disease","volume":"44","author":[{"family":"Alqeeq","given":"Basel F."},{"family":"Ayyad","given":"Mohammed"},{"family":"Almadhoun","given":"Waseem J."},{"family":"Aboabdo","given":"Mohammad"},{"family":"Aldahdouh","given":"Mosheer S."},{"family":"Al-Tawil","given":"Mohammed"},{"family":"Al-Ghazali","given":"Ahmed M."}],"issued":{"date-parts":[["2024"]]},"citation-key":"alqeeqSexrelatedDifferencesCushings2024"}},{"id":27016,"uris":["http://zotero.org/users/7317906/items/RNS3FR6N"],"itemData":{"id":27016,"type":"article-journal","abstract":"PURPOSE: To estimate the incidence of Cushing's syndrome (CS) and Cushing's disease (CD) in the US.\nMETHODS: MarketScan Commercial database 2007-2010 (age &lt;65 years) was used. CS patients were defined with ≥2 claims of CS diagnosis, while CD patients were defined with CS plus a benign pituitary adenoma diagnosis or hypophysectomy in the same calendar year. Annual incidence was calculated by dividing the number of CS or CD cases by the total number of members with the same enrollment requirement during the calendar years.\nRESULTS: CS incidence rates per million person-years were 48.6 in 2009 and 39.5 in 2010. The lowest rates of CS were in ≤17-year-olds and highest rates were in 35 to 44-year-olds. CD incidence rates were 7.6 in 2009 and 6.2 in 2010. The lowest rates of CD were in ≤17-year-olds and highest rates were in 18 to 24-year-olds. The rates varied by sex (2.3-2.7 in males, 9.8-12.1 in females). In females, lowest rates ranged 2.5-4.0 in ≤17-year-olds and highest 16.7-27.2 in 18-24 year olds. In males, there were too few cases to report estimates by age.\nCONCLUSIONS: In the first large US-based study, the annual incidence of CS in individuals &lt;65 years old was nearly 49 cases per million, substantially higher than previous estimates, which were based primarily on European data. Using similar methods, we estimated the incidence of CD at nearly 8 cases per million US population. These estimates, if confirmed in other epidemiologic databases, represent a new data reference in these rare conditions.","container-title":"Pituitary","DOI":"10.1007/s11102-014-0569-6","ISSN":"1573-7403","issue":"3","journalAbbreviation":"Pituitary","language":"eng","note":"PMID: 24803324","page":"283-289","source":"PubMed","title":"Incidence of Cushing's syndrome and Cushing's disease in commercially-insured patients &lt;65 years old in the United States","volume":"18","author":[{"family":"Broder","given":"Michael S."},{"family":"Neary","given":"Maureen P."},{"family":"Chang","given":"Eunice"},{"family":"Cherepanov","given":"Dasha"},{"family":"Ludlam","given":"William H."}],"issued":{"date-parts":[["2015",6]]},"citation-key":"broderIncidenceCushingsSyndrome2015"}},{"id":1348,"uris":["http://zotero.org/users/7317906/items/V5L6B4RJ"],"itemData":{"id":1348,"type":"article-journal","abstract":"OBJECTIVE: Although Cushing's disease is a well documented clinical entity, there is no epidemiological information about it. The present study tries to obtain this information. DESIGN AND PATIENTS: Forty-nine patients affected by Cushing's disease living in Vizcaya (Spain) between 1975 and 1992 were considered for an epidemiological study. RESULTS: The prevalence of known cases at the end of 1992 was 39.1 per million inhabitants. The average incidence of newly diagnosed cases was 2.4 cases per million people per year. Cushing's disease was more frequent in women (n = 46) than in men (n = 3), with a ratio of 15:1. Diabetes mellitus and hypertension were observed in 38.7 and 55.1% of patients, respectively. Remission of Cushing's disease was achieved in 36 out of 41 patients (87.5%). In general, the mortality was higher than that expected for the control population (standardized mortality ratio, SMR 3.8, 95% confidence interval, CI 2.5-17.9, P &lt; 0.03). Concerning the cause of death, the SMR of vascular disease was 5 (95% CI 3.4-48.6, P &lt; 0.05). Higher age, persistence of hypertension and abnormalities of glucose metabolism after treatment, were independent predictors of mortality (multivariate analyses, P &lt; 0.01). CONCLUSIONS: Prevalence of Cushing's disease was 39.1 cases/million inhabitants and average incidence was 2.4 cases/million per year. Mortality was elevated, due to vascular disease, associated with higher age, persistence of hypertension and impaired glucose metabolism.","container-title":"Clin Endocrinol (Oxf)","DOI":"10.1111/j.1365-2265.1994.tb02486.x","ISSN":"0300-0664","issue":"4","note":"PMID: 8187313\nISBN: 0300-0664 (Print)\\r0300-0664 (Linking)","page":"479-484","title":"Morbidity and mortality in Cushing's disease: an epidemiological approach","volume":"40","author":[{"family":"Etxabe","given":"J"},{"family":"Vazquez","given":"J A"}],"issued":{"date-parts":[["1994"]]},"citation-key":"etxabeMorbidityMortalityCushings1994"}},{"id":27026,"uris":["http://zotero.org/users/7317906/items/X2VBVW53"],"itemData":{"id":27026,"type":"article-journal","abstract":"Introduction: In 2011, we reported the overall incidence of Cushing’s disease (CD) in Iceland from 1955 through 2009 to be 1.5 cases per million per year with highest incidence in the last decade of the study, a higher incidence then earlier reported. We now present a follow-up study reporting the epidemiology of the disease in Iceland during the 10-year period from 2010 to 2019. Methods: In this nationwide retrospective study, clinical information on patients diagnosed with CD was obtained from electronic medical records, reviewed by consulting endocrinologists. Results: Seventeen patients were diagnosed with CD, 12 women (71%) and 5 men (29%) giving an overall incidence of 5.2 cases per million per year. The mean age at diagnosis was 46 years (range 13–85 years). Biochemical analysis was recorded for all patients and 12 patients (71%) had visible pituitary adenoma on imaging studies. Sixteen patients (94%) were treated with transsphenoidal surgery of which 4 patients (24%) had gamma knife radiosurgery and three (18%) bilateral adrenalectomy after pituitary surgery. Two patients died during the study period. Conclusion: The overall incidence of CD of 5.2 cases per million per year is higher than previously reported, indicating the importance of awareness of CD. As all patients with CD are diagnosed and/or treated at the only University Hospital in Iceland, housing the only department of endocrinology as well as neurosurgery, we are confident that all cases diagnosed during the study period were included in the study.","container-title":"Neuroendocrinology","DOI":"10.1159/000540205","ISSN":"0028-3835","issue":"10","journalAbbreviation":"Neuroendocrinology","page":"950-957","source":"Silverchair","title":"Cushing’s Disease May Have Higher Incidence than Previously Thought: A Nationwide Study in Iceland 2010–2019","title-short":"Cushing’s Disease May Have Higher Incidence than Previously Thought","volume":"114","author":[{"family":"Matthiasdottir","given":"Anna Mjoll"},{"family":"Hardarson","given":"Thorgeir Orri"},{"family":"Arnardottir","given":"Steinunn"},{"family":"Sigurjonsdottir","given":"Helga Agusta"}],"issued":{"date-parts":[["2024",7,22]]},"citation-key":"matthiasdottirCushingsDiseaseMay2024"}},{"id":27019,"uris":["http://zotero.org/users/7317906/items/RTX3YT8D"],"itemData":{"id":27019,"type":"article-journal","abstract":"Overt Cushing’s syndrome is a rare disorder with an annual incidence of 2–3/million of which benign adrenal adenomas account for 0.6/million. The female:male ratio is 3:1. Preliminary data indicate a high proportion of subclinical Cushing’s syndrome in certain risk populations such as patients with type 2 diabetes or osteoporosis. The clinical implications of these observations are presently unclear. Surgery remains first line treatment for overt disease and initial cure or remission is obtained in 65–85% of patients with Cushing’s disease. Late recurrences, however, occur in up to 20% and the risk does not seem to plateau even after 20 years of follow-up. A 2- to 3-fold increase in mortality is observed in most studies, and this excess mortality seems confined to patients in whom initial cure was not obtained. Cushing’s syndrome continues to pose diagnostic and therapeutic challenges and life-long follow-up is mandatory.","container-title":"Neuroendocrinology","DOI":"10.1159/000314297","ISSN":"0028-3835","issue":"Suppl. 1","journalAbbreviation":"Neuroendocrinology","page":"1-5","source":"Silverchair","title":"Epidemiology of Cushing’s Syndrome","volume":"92","author":[{"family":"Steffensen","given":"Charlotte"},{"family":"Bak","given":"Ann Mosegaard"},{"family":"Zøylner Rubeck","given":"Kristine"},{"family":"Jørgensen","given":"Jens Otto Lunde"}],"issued":{"date-parts":[["2010",9,10]]},"citation-key":"steffensenEpidemiologyCushingsSyndrome2010"}}],"schema":"https://github.com/citation-style-language/schema/raw/master/csl-citation.json"} </w:instrText>
+      </w:r>
+      <w:r>
+        <w:fldChar w:fldCharType="separate"/>
+      </w:r>
+      <w:r>
+        <w:rPr>
+          <w:noProof/>
+        </w:rPr>
+        <w:t>(Alqeeq et al., 2024; Broder et al., 2015; Etxabe &amp; Vazquez, 1994; Matthiasdottir et al., 2024; Steffensen et al., 2010)</w:t>
+      </w:r>
+      <w:r>
+        <w:fldChar w:fldCharType="end"/>
+      </w:r>
+      <w:r>
+        <w:t>.  As expected</w:t>
+      </w:r>
+      <w:r>
+        <w:t>,</w:t>
+      </w:r>
+      <w:r>
+        <w:t xml:space="preserve"> we also observed</w:t>
+      </w:r>
+      <w:r>
+        <w:rPr>
+          <w:rStyle w:val="CommentReference"/>
+        </w:rPr>
+        <w:t xml:space="preserve"> </w:t>
+      </w:r>
+      <w:r>
+        <w:t xml:space="preserve">a higher body mass index for patients with Cushing’s disease </w:t>
+      </w:r>
+      <w:r>
+        <w:t xml:space="preserve">compared to controls </w:t>
+      </w:r>
+      <w:r>
+        <w:t>(</w:t>
+      </w:r>
+      <w:r>
+        <w:t>34.7 vs 29.3 kg/m</w:t>
+      </w:r>
+      <w:r>
+        <w:rPr>
+          <w:vertAlign w:val="superscript"/>
+        </w:rPr>
+        <w:t>2</w:t>
+      </w:r>
+      <w:r>
+        <w:t xml:space="preserve">, </w:t>
+      </w:r>
+      <w:r>
+        <w:t>p&lt;0.001).</w:t>
+      </w:r>
+      <w:r>
+        <w:t xml:space="preserve">  </w:t>
+      </w:r>
+      <w:r>
+        <w:t>Prior to matching for Race and Ethnicity, we noted that participants</w:t>
+      </w:r>
+      <w:r>
+        <w:t xml:space="preserve"> with Cushing’s disease were more likely to </w:t>
+      </w:r>
+      <w:r>
+        <w:t>identify as Non-Hispanic White (87%) than the overall Michigan Medicine participant population (75%</w:t>
+      </w:r>
+      <w:r>
+        <w:t>, p</w:t>
+      </w:r>
+      <w:r>
+        <w:t>&lt;0.001</w:t>
+      </w:r>
+      <w:r>
+        <w:t>).</w:t>
+      </w:r>
+      <w:r>
+        <w:t xml:space="preserve">  Correspondingly</w:t>
+      </w:r>
+      <w:r>
+        <w:t>,</w:t>
+      </w:r>
+      <w:r>
+        <w:t xml:space="preserve"> </w:t>
+      </w:r>
+      <w:r>
+        <w:t>patients</w:t>
+      </w:r>
+      <w:r>
+        <w:t xml:space="preserve"> with Cushing’s disease were less likely to identify as Asian </w:t>
+      </w:r>
+      <w:r>
+        <w:t xml:space="preserve">(p&lt;0.001) </w:t>
+      </w:r>
+      <w:r>
+        <w:t>or Black</w:t>
+      </w:r>
+      <w:r>
+        <w:t xml:space="preserve"> (p=0.01</w:t>
+      </w:r>
+      <w:r>
+        <w:t>8</w:t>
+      </w:r>
+      <w:r>
+        <w:t>)</w:t>
+      </w:r>
+      <w:r>
+        <w:t>.</w:t>
+      </w:r>
+      <w:r>
+        <w:t xml:space="preserve">  This is consistent with other reports on the prevalence of Cushing’s disease across racial groups </w:t>
+      </w:r>
+      <w:r>
+        <w:fldChar w:fldCharType="begin"/>
+      </w:r>
+      <w:r>
+        <w:instrText xml:space="preserve"> ADDIN ZOTERO_ITEM CSL_CITATION {"citationID":"Zf5euBGy","properties":{"formattedCitation":"(Ioachimescu et al., 2022; Omotosho et al., 2024)","plainCitation":"(Ioachimescu et al., 2022; Omotosho et al., 2024)","noteIndex":0},"citationItems":[{"id":27032,"uris":["http://zotero.org/users/7317906/items/EVS87VVY"],"itemData":{"id":27032,"type":"article-journal","abstract":"Acromegaly (ACM) and Cushing’s disease (CD) are caused by functioning pituitary adenomas secreting growth hormone and ACTH respectively.To determine the impact of race on presentation and postoperative outcomes in adults with ACM and CD, which has not yet been evaluated.This is a retrospective study of consecutive patients operated at a large-volume pituitary center. We evaluated (1) racial distribution of patients residing in the metropolitan area (Metro, N</w:instrText>
+      </w:r>
+      <w:r>
+        <w:rPr>
+          <w:rFonts w:ascii="Arial" w:hAnsi="Arial" w:cs="Arial"/>
+        </w:rPr>
+        <w:instrText> </w:instrText>
+      </w:r>
+      <w:r>
+        <w:instrText>=</w:instrText>
+      </w:r>
+      <w:r>
+        <w:rPr>
+          <w:rFonts w:ascii="Arial" w:hAnsi="Arial" w:cs="Arial"/>
+        </w:rPr>
+        <w:instrText> </w:instrText>
+      </w:r>
+      <w:r>
+        <w:instrText>124) vs 2010 US census data, and(2) presentation and postoperative outcomes in Black vs White for patients from the entire catchment area (N</w:instrText>
+      </w:r>
+      <w:r>
+        <w:rPr>
+          <w:rFonts w:ascii="Arial" w:hAnsi="Arial" w:cs="Arial"/>
+        </w:rPr>
+        <w:instrText> </w:instrText>
+      </w:r>
+      <w:r>
+        <w:instrText>=</w:instrText>
+      </w:r>
+      <w:r>
+        <w:rPr>
+          <w:rFonts w:ascii="Arial" w:hAnsi="Arial" w:cs="Arial"/>
+        </w:rPr>
+        <w:instrText> </w:instrText>
+      </w:r>
+      <w:r>
+        <w:instrText>241).For Metro area (32.4% Black population), Black patients represented 16.75% ACM (P</w:instrText>
+      </w:r>
+      <w:r>
+        <w:rPr>
+          <w:rFonts w:ascii="Arial" w:hAnsi="Arial" w:cs="Arial"/>
+        </w:rPr>
+        <w:instrText> </w:instrText>
+      </w:r>
+      <w:r>
+        <w:instrText>=</w:instrText>
+      </w:r>
+      <w:r>
+        <w:rPr>
+          <w:rFonts w:ascii="Arial" w:hAnsi="Arial" w:cs="Arial"/>
+        </w:rPr>
+        <w:instrText> </w:instrText>
+      </w:r>
+      <w:r>
+        <w:instrText>.006) and 29.2% CD (P</w:instrText>
+      </w:r>
+      <w:r>
+        <w:rPr>
+          <w:rFonts w:ascii="Arial" w:hAnsi="Arial" w:cs="Arial"/>
+        </w:rPr>
+        <w:instrText> </w:instrText>
+      </w:r>
+      <w:r>
+        <w:instrText>=</w:instrText>
+      </w:r>
+      <w:r>
+        <w:rPr>
+          <w:rFonts w:ascii="Arial" w:hAnsi="Arial" w:cs="Arial"/>
+        </w:rPr>
+        <w:instrText> </w:instrText>
+      </w:r>
+      <w:r>
+        <w:instrText>.56). Among the total 112 patients with ACM, presentations with headaches or incidentaloma were more common in Black patients (76.9% vs 31% White, P</w:instrText>
+      </w:r>
+      <w:r>
+        <w:rPr>
+          <w:rFonts w:ascii="Arial" w:hAnsi="Arial" w:cs="Arial"/>
+        </w:rPr>
+        <w:instrText> </w:instrText>
+      </w:r>
+      <w:r>
+        <w:instrText>=</w:instrText>
+      </w:r>
+      <w:r>
+        <w:rPr>
+          <w:rFonts w:ascii="Arial" w:hAnsi="Arial" w:cs="Arial"/>
+        </w:rPr>
+        <w:instrText> </w:instrText>
+      </w:r>
+      <w:r>
+        <w:instrText>.01). Black patients had a higher prevalence of diabetes (54% vs 16% White, P</w:instrText>
+      </w:r>
+      <w:r>
+        <w:rPr>
+          <w:rFonts w:ascii="Arial" w:hAnsi="Arial" w:cs="Arial"/>
+        </w:rPr>
+        <w:instrText> </w:instrText>
+      </w:r>
+      <w:r>
+        <w:instrText>=</w:instrText>
+      </w:r>
+      <w:r>
+        <w:rPr>
+          <w:rFonts w:ascii="Arial" w:hAnsi="Arial" w:cs="Arial"/>
+        </w:rPr>
+        <w:instrText> </w:instrText>
+      </w:r>
+      <w:r>
+        <w:instrText>.005), significantly lower insulin-like growth factor (IGF)-1 deviation from normal (P</w:instrText>
+      </w:r>
+      <w:r>
+        <w:rPr>
+          <w:rFonts w:ascii="Arial" w:hAnsi="Arial" w:cs="Arial"/>
+        </w:rPr>
+        <w:instrText> </w:instrText>
+      </w:r>
+      <w:r>
+        <w:instrText>=</w:instrText>
+      </w:r>
+      <w:r>
+        <w:rPr>
+          <w:rFonts w:ascii="Arial" w:hAnsi="Arial" w:cs="Arial"/>
+        </w:rPr>
+        <w:instrText> </w:instrText>
+      </w:r>
+      <w:r>
+        <w:instrText>.03) and borderline lower median growth hormone levels (P</w:instrText>
+      </w:r>
+      <w:r>
+        <w:rPr>
+          <w:rFonts w:ascii="Arial" w:hAnsi="Arial" w:cs="Arial"/>
+        </w:rPr>
+        <w:instrText> </w:instrText>
+      </w:r>
+      <w:r>
+        <w:instrText>=</w:instrText>
+      </w:r>
+      <w:r>
+        <w:rPr>
+          <w:rFonts w:ascii="Arial" w:hAnsi="Arial" w:cs="Arial"/>
+        </w:rPr>
+        <w:instrText> </w:instrText>
+      </w:r>
+      <w:r>
+        <w:instrText>.09). Mean tumor diameter and proportion of tumors with cavernous sinus invasion were similar. Three-month biochemical remission (46% Black, 55% White, P</w:instrText>
+      </w:r>
+      <w:r>
+        <w:rPr>
+          <w:rFonts w:ascii="Arial" w:hAnsi="Arial" w:cs="Arial"/>
+        </w:rPr>
+        <w:instrText> </w:instrText>
+      </w:r>
+      <w:r>
+        <w:instrText>=</w:instrText>
+      </w:r>
+      <w:r>
+        <w:rPr>
+          <w:rFonts w:ascii="Arial" w:hAnsi="Arial" w:cs="Arial"/>
+        </w:rPr>
+        <w:instrText> </w:instrText>
+      </w:r>
+      <w:r>
+        <w:instrText>.76) and long-term IGF-1 control by multimodality therapy (92.3% Black, 80.5% White, P</w:instrText>
+      </w:r>
+      <w:r>
+        <w:rPr>
+          <w:rFonts w:ascii="Arial" w:hAnsi="Arial" w:cs="Arial"/>
+        </w:rPr>
+        <w:instrText> </w:instrText>
+      </w:r>
+      <w:r>
+        <w:instrText>=</w:instrText>
+      </w:r>
+      <w:r>
+        <w:rPr>
+          <w:rFonts w:ascii="Arial" w:hAnsi="Arial" w:cs="Arial"/>
+        </w:rPr>
+        <w:instrText> </w:instrText>
+      </w:r>
+      <w:r>
+        <w:instrText>.45) were similar. Among the total 129 patients with CD, Black patients had more hypopituitarism (69% vs 45% White, P</w:instrText>
+      </w:r>
+      <w:r>
+        <w:rPr>
+          <w:rFonts w:ascii="Arial" w:hAnsi="Arial" w:cs="Arial"/>
+        </w:rPr>
+        <w:instrText> </w:instrText>
+      </w:r>
+      <w:r>
+        <w:instrText>=</w:instrText>
+      </w:r>
+      <w:r>
+        <w:rPr>
+          <w:rFonts w:ascii="Arial" w:hAnsi="Arial" w:cs="Arial"/>
+        </w:rPr>
+        <w:instrText> </w:instrText>
+      </w:r>
+      <w:r>
+        <w:instrText>.04) and macroadenomas (33% vs 15% White, P</w:instrText>
+      </w:r>
+      <w:r>
+        <w:rPr>
+          <w:rFonts w:ascii="Arial" w:hAnsi="Arial" w:cs="Arial"/>
+        </w:rPr>
+        <w:instrText> </w:instrText>
+      </w:r>
+      <w:r>
+        <w:instrText>=</w:instrText>
+      </w:r>
+      <w:r>
+        <w:rPr>
+          <w:rFonts w:ascii="Arial" w:hAnsi="Arial" w:cs="Arial"/>
+        </w:rPr>
+        <w:instrText> </w:instrText>
+      </w:r>
+      <w:r>
+        <w:instrText>.05). At 3 months, remission rate was borderline higher in White (92% vs 78% Black, P</w:instrText>
+      </w:r>
+      <w:r>
+        <w:rPr>
+          <w:rFonts w:ascii="Arial" w:hAnsi="Arial" w:cs="Arial"/>
+        </w:rPr>
+        <w:instrText> </w:instrText>
+      </w:r>
+      <w:r>
+        <w:instrText>=</w:instrText>
+      </w:r>
+      <w:r>
+        <w:rPr>
+          <w:rFonts w:ascii="Arial" w:hAnsi="Arial" w:cs="Arial"/>
+        </w:rPr>
+        <w:instrText> </w:instrText>
+      </w:r>
+      <w:r>
+        <w:instrText xml:space="preserve">0.08), which was attributed to macroadenomas by logistic regression.We identified disparities regarding racial distribution, and clinical and biochemical characteristics in ACM, suggesting late or missed diagnosis in Black patients. Large nationwide studies are necessary to confirm our findings.","container-title":"Journal of the Endocrine Society","DOI":"10.1210/jendso/bvab176","ISSN":"2472-1972","issue":"1","journalAbbreviation":"J. Endocr. Soc.","page":"bvab176","source":"Silverchair","title":"Racial Disparities in Acromegaly and Cushing’s Disease: A Referral Center Study in 241 Patients","title-short":"Racial Disparities in Acromegaly and Cushing’s Disease","volume":"6","author":[{"family":"Ioachimescu","given":"Adriana G"},{"family":"Goswami","given":"Neevedita"},{"family":"Handa","given":"Talin"},{"family":"Pappy","given":"Adlai"},{"family":"Veledar","given":"Emir"},{"family":"Oyesiku","given":"Nelson M"}],"issued":{"date-parts":[["2022",1,1]]},"citation-key":"ioachimescuRacialDisparitiesAcromegaly2022"}},{"id":27042,"uris":["http://zotero.org/users/7317906/items/H96MA6T6"],"itemData":{"id":27042,"type":"article-journal","abstract":"Y.B. Omotosho: None. R. McGlotten: None. P. Chittiboina: None. L. Nieman: None.Background: Early recognition and treatment of Cushing’s syndrome (CS) is important to reduce mortality, forestall additional co-morbidities, and improve long-term quality of life. Little is known about how adverse social determinants of health (SDOH) influence the achievement of this goal.Objective: To investigate the impact of race (Black vs White) and UFC on the time to definitive diagnosis and treatment of Cushing’s disease (CD).Methods: This is a retrospective cohort study of 114 patients (pts) (including all Non-Hispanic Blacks) evaluated at the National Institutes of Health between 1990-2022, who had CD based on pathology (ACTH-positive tumor immunohistochemistry) or biochemical remission after transsphenoidal surgery (TSS). 38 Non-Hispanic Black patients met entry criteria. They were matched 1:2 by age (within five years) and sex. We excluded patients with cyclic CS, recurrent CD, previous pituitary surgery or radiation therapy and/or a delay between diagnostic evaluation and surgery of more than 4 weeks. We limited cohorts to only Non-Hispanic Blacks and Whites for this pilot study and plan to extend this to smaller race/ethnicity groups in the future. The onset of clinical symptoms was documented as self-reported by the patients. We analyzed the difference between the year of symptom onset and the date TSS was performed, to obtain an estimated duration of diagnosis. The highest 24h urine cortisol (UFC) value for each patient was noted. Non-normal data are described as median [interquartile range]. Group comparisons used the Wilcoxon rank sum test for the time to etiologic diagnosis, age, and UFC. Statistical analyses were done using R/RStudio statistical software. P value &amp;lt;0.05 was considered significant. Results: Each racial group included 76.3% females and 23.7% males. The median age at TSS was 39.5 years [30.0 – 50.8] for Blacks and 41.5 years [31.8 - 53.3] for Whites (P= 0.7). The median UFC was 326 mcg/24h [156 - 491] for Blacks and 264 [166 - 609] for Whites (P= 0.8). The median duration from symptom onset to CD diagnosis was 3.67 years [2.76 - 6.29] for Blacks and for 2.56 years [1.57 - 4.13] for Whites. Analysis of the differences in time to diagnosis between both groups confirmed a significant disparity with blacks having a median delay of 1.1 years more than whites (P= 0.001). Discussion: We do not have information on other SDOH in our patients, such as access to providers, education level, or their perception of the medical community. The present data suggest that racial background serves as a limiting factor in the diagnosis and differential diagnosis of CS, and that differences in severity of hypercortisolism do not explain this disparity. More work is needed to understand the reasons for this disparity as we continue to strive towards health equity.Monday, June 3, 2024","container-title":"Journal of the Endocrine Society","DOI":"10.1210/jendso/bvae163.2408","ISSN":"2472-1972","issue":"Supplement_1","journalAbbreviation":"J. Endocr. Soc.","page":"bvae163.2408","source":"Silverchair","title":"MON-113 Racial Disparity in the Time to Diagnosis of Cushing’s Disease","volume":"8","author":[{"family":"Omotosho","given":"Y B"},{"family":"McGlotten","given":"R"},{"family":"Chittiboina","given":"P"},{"family":"Nieman","given":"L"}],"issued":{"date-parts":[["2024",10,1]]},"citation-key":"omotoshoMON113RacialDisparity2024"}}],"schema":"https://github.com/citation-style-language/schema/raw/master/csl-citation.json"} </w:instrText>
+      </w:r>
+      <w:r>
+        <w:fldChar w:fldCharType="separate"/>
+      </w:r>
+      <w:r>
+        <w:rPr>
+          <w:noProof/>
+        </w:rPr>
+        <w:t>(Ioachimescu et al., 2022; Omotosho et al., 2024)</w:t>
+      </w:r>
+      <w:r>
+        <w:fldChar w:fldCharType="end"/>
+      </w:r>
+      <w:r>
+        <w:t>.</w:t>
+      </w:r>
+    </w:p>
+    <w:p>
+      <w:r>
+        <w:lastRenderedPageBreak/>
+        <w:t>As we expected, participants with Cushing’s disease had a higher BMI than the controls</w:t>
+      </w:r>
+      <w:r>
+        <w:t>, with 64% of participants with Cushing’s disease having a BMI above 30 kg/m</w:t>
+      </w:r>
+      <w:r>
+        <w:rPr>
+          <w:vertAlign w:val="superscript"/>
+        </w:rPr>
+        <w:t>2</w:t>
+      </w:r>
+      <w:r>
+        <w:t xml:space="preserve">, compared to </w:t>
+      </w:r>
+      <w:r>
+        <w:t>40</w:t>
+      </w:r>
+      <w:r>
+        <w:t>% controls (p&lt;0.001).</w:t>
+      </w:r>
+      <w:r>
+        <w:t xml:space="preserve">  </w:t>
+      </w:r>
+      <w:r>
+        <w:t xml:space="preserve">To understand the </w:t>
+      </w:r>
+      <w:r>
+        <w:t xml:space="preserve">cross-sectional </w:t>
+      </w:r>
+      <w:r>
+        <w:t>relationship between obesity and Cushing’s disease, we</w:t>
+      </w:r>
+      <w:r>
+        <w:t xml:space="preserve"> stratified our participants </w:t>
+      </w:r>
+      <w:r>
+        <w:t>with a BMI above or below 30 kg/m</w:t>
+      </w:r>
+      <w:r>
+        <w:rPr>
+          <w:vertAlign w:val="superscript"/>
+        </w:rPr>
+        <w:t>2</w:t>
+      </w:r>
+      <w:r>
+        <w:t xml:space="preserve">, </w:t>
+      </w:r>
+      <w:r>
+        <w:t>across</w:t>
+      </w:r>
+      <w:r>
+        <w:t xml:space="preserve"> both cases and controls</w:t>
+      </w:r>
+      <w:r>
+        <w:t xml:space="preserve">.  </w:t>
+      </w:r>
+      <w:r>
+        <w:t>We found that 232 patients had a BMI above 30 kg/m</w:t>
+      </w:r>
+      <w:r>
+        <w:rPr>
+          <w:vertAlign w:val="superscript"/>
+        </w:rPr>
+        <w:t>2</w:t>
+      </w:r>
+      <w:r>
+        <w:rPr>
+          <w:vertAlign w:val="superscript"/>
+        </w:rPr>
+        <w:t xml:space="preserve"> </w:t>
+      </w:r>
+      <w:r>
+        <w:t>and 128 had a BMI below 30 kg/m</w:t>
+      </w:r>
+      <w:r>
+        <w:rPr>
+          <w:vertAlign w:val="superscript"/>
+        </w:rPr>
+        <w:t>2</w:t>
+      </w:r>
+      <w:r>
+        <w:rPr>
+          <w:vertAlign w:val="superscript"/>
+        </w:rPr>
+        <w:t xml:space="preserve"> </w:t>
+      </w:r>
+      <w:r>
+        <w:t xml:space="preserve">at time of diagnosis. </w:t>
+      </w:r>
+      <w:r>
+        <w:t>As shown in Table 2, and as expected given our stratification, the four groups differed in several characteristics</w:t>
+      </w:r>
+      <w:r>
+        <w:t xml:space="preserve">, </w:t>
+      </w:r>
+      <w:r>
+        <w:t>which</w:t>
+      </w:r>
+      <w:r>
+        <w:t xml:space="preserve"> will be adjusted for in multivariable models below</w:t>
+      </w:r>
+      <w:r>
+        <w:t>.</w:t>
+      </w:r>
+      <w:r>
+        <w:t xml:space="preserve">  For example, among</w:t>
+      </w:r>
+      <w:r>
+        <w:t xml:space="preserve"> the subgroup of</w:t>
+      </w:r>
+      <w:r>
+        <w:t xml:space="preserve"> participants with a BMI &gt; 30 mg/m</w:t>
+      </w:r>
+      <w:r>
+        <w:rPr>
+          <w:vertAlign w:val="superscript"/>
+        </w:rPr>
+        <w:t>2</w:t>
+      </w:r>
+      <w:r>
+        <w:t>, participants with Cushing’s disease had a higher BMI than controls</w:t>
+      </w:r>
+      <w:r>
+        <w:t xml:space="preserve"> (p=0.0024 by a Mann-Whitney test)</w:t>
+      </w:r>
+      <w:r>
+        <w:t xml:space="preserve">.  </w:t>
+      </w:r>
+      <w:r>
+        <w:t>Females with Cushing’s disease were more likely to have a BMI over 30 kg/m</w:t>
+      </w:r>
+      <w:r>
+        <w:rPr>
+          <w:vertAlign w:val="superscript"/>
+        </w:rPr>
+        <w:t>2</w:t>
+      </w:r>
+      <w:r>
+        <w:t xml:space="preserve"> (68% </w:t>
+      </w:r>
+      <w:r>
+        <w:t xml:space="preserve">of </w:t>
+      </w:r>
+      <w:r>
+        <w:t xml:space="preserve">females </w:t>
+      </w:r>
+      <w:r>
+        <w:t>compared to</w:t>
+      </w:r>
+      <w:r>
+        <w:t xml:space="preserve"> 51% of males with Cushing’s disease, p=0.015).  </w:t>
+      </w:r>
+      <w:r>
+        <w:t>Among participants with Cushing’s disease, Asian (6</w:t>
+      </w:r>
+      <w:r>
+        <w:t xml:space="preserve"> out of </w:t>
+      </w:r>
+      <w:r>
+        <w:t xml:space="preserve">10) and Hispanic or Latino </w:t>
+      </w:r>
+      <w:r>
+        <w:t>(6</w:t>
+      </w:r>
+      <w:r>
+        <w:t xml:space="preserve"> out of </w:t>
+      </w:r>
+      <w:r>
+        <w:t xml:space="preserve">8) </w:t>
+      </w:r>
+      <w:r>
+        <w:t>participants were more likely have a BMI under 30 kg/m</w:t>
+      </w:r>
+      <w:r>
+        <w:rPr>
+          <w:vertAlign w:val="superscript"/>
+        </w:rPr>
+        <w:t xml:space="preserve">2 </w:t>
+      </w:r>
+      <w:r>
+        <w:t xml:space="preserve">compared to </w:t>
+      </w:r>
+      <w:r>
+        <w:t xml:space="preserve">the overall average </w:t>
+      </w:r>
+      <w:r>
+        <w:t>(</w:t>
+      </w:r>
+      <w:r>
+        <w:t>36%</w:t>
+      </w:r>
+      <w:r>
+        <w:t>, p=0.027 and 0.176 respectively via Fisher’s exact test</w:t>
+      </w:r>
+      <w:r>
+        <w:t>s</w:t>
+      </w:r>
+      <w:r>
+        <w:t xml:space="preserve">).  </w:t>
+      </w:r>
+      <w:r>
+        <w:t>The</w:t>
+      </w:r>
+      <w:r>
+        <w:t xml:space="preserve"> average age of </w:t>
+      </w:r>
+      <w:r>
+        <w:t xml:space="preserve">participants with </w:t>
+      </w:r>
+      <w:r>
+        <w:t>Cushing’s</w:t>
+      </w:r>
+      <w:r>
+        <w:t xml:space="preserve"> disease</w:t>
+      </w:r>
+      <w:r>
+        <w:t xml:space="preserve"> with or without obesity was similar</w:t>
+      </w:r>
+      <w:r>
+        <w:t xml:space="preserve"> after stratification</w:t>
+      </w:r>
+      <w:r>
+        <w:t>.</w:t>
+      </w:r>
+      <w:r>
+        <w:t xml:space="preserve">  Overall</w:t>
+      </w:r>
+      <w:r>
+        <w:t>,</w:t>
+      </w:r>
+      <w:r>
+        <w:t xml:space="preserve"> the subgroup of patients with obesity and Cushing’s disease tended to be disproportionately female and White, but similar in age.</w:t>
+      </w:r>
+    </w:p>
+    <w:p>
+      <w:pPr>
+        <w:pStyle w:val="NormalWeb"/>
+        <w:rPr>
+          <w:rStyle w:val="Heading2Char"/>
+        </w:rPr>
+      </w:pPr>
+      <w:r>
+        <w:rPr>
+          <w:rStyle w:val="Heading2Char"/>
+        </w:rPr>
+        <w:t xml:space="preserve">Modification of Cushing’s disease-related </w:t>
+      </w:r>
+      <w:r>
+        <w:rPr>
+          <w:rStyle w:val="Heading2Char"/>
+        </w:rPr>
+        <w:t>comorbidities</w:t>
+      </w:r>
+      <w:r>
+        <w:rPr>
+          <w:rStyle w:val="Heading2Char"/>
+        </w:rPr>
+        <w:t xml:space="preserve"> by obesity </w:t>
+      </w:r>
+    </w:p>
+    <w:p>
+      <w:r>
+        <w:t>To identify how obesity alters metabolic outcomes related to Cushing’s disease, we evaluated the effects of Cushing’s disease on several key metabolic variables including glycem</w:t>
+      </w:r>
+      <w:r>
+        <w:t>i</w:t>
+      </w:r>
+      <w:r>
+        <w:t xml:space="preserve">a (fasting glucose and </w:t>
+      </w:r>
+      <w:r>
+        <w:t xml:space="preserve">for a smaller number of participants, </w:t>
+      </w:r>
+      <w:r>
+        <w:t>HbA1c), liver enzymes, and blood pressure (Figure 2 and Table 3).  As described below we noted substantial effect modification by obesity for liver enzymes and blood pressure (Table 3B).</w:t>
+      </w:r>
+    </w:p>
+    <w:p>
+      <w:pPr>
+        <w:pStyle w:val="Heading3"/>
+      </w:pPr>
+      <w:r>
+        <w:t>Dysglycemia</w:t>
+      </w:r>
+    </w:p>
+    <w:p>
+      <w:r>
+        <w:t>The</w:t>
+      </w:r>
+      <w:r>
+        <w:t xml:space="preserve"> first metabolic variable of interest was the fasting glucose levels of our obese and non-obese populations. As shown in </w:t>
+      </w:r>
+      <w:r>
+        <w:t xml:space="preserve">Figure 2 and </w:t>
+      </w:r>
+      <w:r>
+        <w:t>Table 3</w:t>
+      </w:r>
+      <w:r>
+        <w:t>A</w:t>
+      </w:r>
+      <w:r>
+        <w:t>, we observed a</w:t>
+      </w:r>
+      <w:r>
+        <w:t xml:space="preserve"> significant </w:t>
+      </w:r>
+      <w:r>
+        <w:t xml:space="preserve">increase in </w:t>
+      </w:r>
+      <w:r>
+        <w:t xml:space="preserve">fasting </w:t>
+      </w:r>
+      <w:r>
+        <w:t xml:space="preserve">blood glucose levels </w:t>
+      </w:r>
+      <w:r>
+        <w:t xml:space="preserve">among </w:t>
+      </w:r>
+      <w:r>
+        <w:t>participants</w:t>
+      </w:r>
+      <w:r>
+        <w:t xml:space="preserve"> with Cushing’s disease, regardless of obesity status</w:t>
+      </w:r>
+      <w:r>
+        <w:t xml:space="preserve"> (p</w:t>
+      </w:r>
+      <w:r>
+        <w:t>&lt;0.01</w:t>
+      </w:r>
+      <w:r>
+        <w:t xml:space="preserve"> for both groups).</w:t>
+      </w:r>
+      <w:r>
+        <w:t xml:space="preserve"> The </w:t>
+      </w:r>
+      <w:r>
+        <w:t xml:space="preserve">patients with obesity </w:t>
+      </w:r>
+      <w:r>
+        <w:t xml:space="preserve">population had a slightly larger increase (26.9 vs. </w:t>
+      </w:r>
+      <w:r>
+        <w:t>24.6</w:t>
+      </w:r>
+      <w:r>
+        <w:t xml:space="preserve"> mg/dL</w:t>
+      </w:r>
+      <w:r>
+        <w:t xml:space="preserve">) than </w:t>
+      </w:r>
+      <w:r>
+        <w:t>those with a BMI under 30 kg/m</w:t>
+      </w:r>
+      <w:r>
+        <w:rPr>
+          <w:vertAlign w:val="superscript"/>
+        </w:rPr>
+        <w:t>2</w:t>
+      </w:r>
+      <w:r>
+        <w:t>, but this was not a large enough difference to provide any significant evidence of an effect modification for obesity</w:t>
+      </w:r>
+      <w:r>
+        <w:t xml:space="preserve"> (p=0.51; Table 3B)</w:t>
+      </w:r>
+      <w:r>
+        <w:t xml:space="preserve">. </w:t>
+      </w:r>
+      <w:r>
+        <w:t>Similarly</w:t>
+      </w:r>
+      <w:r>
+        <w:t>,</w:t>
+      </w:r>
+      <w:r>
+        <w:t xml:space="preserve"> in Table 3</w:t>
+      </w:r>
+      <w:r>
+        <w:t>A</w:t>
+      </w:r>
+      <w:r>
+        <w:t xml:space="preserve"> </w:t>
+      </w:r>
+      <w:r>
+        <w:t>among the small number of patients with</w:t>
+      </w:r>
+      <w:r>
+        <w:t xml:space="preserve"> HbA1c </w:t>
+      </w:r>
+      <w:r>
+        <w:t>values, there was</w:t>
+      </w:r>
+      <w:r>
+        <w:t xml:space="preserve"> a</w:t>
+      </w:r>
+      <w:r>
+        <w:t xml:space="preserve">n </w:t>
+      </w:r>
+      <w:r>
+        <w:t xml:space="preserve">insignificant increase in HbA1c levels </w:t>
+      </w:r>
+      <w:r>
+        <w:t>in</w:t>
+      </w:r>
+      <w:r>
+        <w:t xml:space="preserve"> the non-obese</w:t>
+      </w:r>
+      <w:r>
+        <w:t xml:space="preserve"> patients</w:t>
+      </w:r>
+      <w:r>
+        <w:t xml:space="preserve"> (</w:t>
+      </w:r>
+      <w:r>
+        <w:t xml:space="preserve">0.91%; </w:t>
+      </w:r>
+      <w:r>
+        <w:t xml:space="preserve">p=0.056). However, there was evidence of a significant increase in HbA1c levels </w:t>
+      </w:r>
+      <w:r>
+        <w:t xml:space="preserve">in patients with obesity </w:t>
+      </w:r>
+      <w:r>
+        <w:t>(</w:t>
+      </w:r>
+      <w:r>
+        <w:t xml:space="preserve">1.38% </w:t>
+      </w:r>
+      <w:r>
+        <w:t>p</w:t>
+      </w:r>
+      <w:r>
+        <w:t>&lt;0.01</w:t>
+      </w:r>
+      <w:r>
+        <w:t xml:space="preserve">). </w:t>
+      </w:r>
+      <w:r>
+        <w:t xml:space="preserve">  Again</w:t>
+      </w:r>
+      <w:r>
+        <w:t>.</w:t>
+      </w:r>
+      <w:r>
+        <w:t xml:space="preserve"> there was no evidence of effect </w:t>
+      </w:r>
+      <w:r>
+        <w:lastRenderedPageBreak/>
+        <w:t>modification by obesity (p=0.41)</w:t>
+      </w:r>
+      <w:r>
+        <w:t>.  This suggests that blood glucose increases with Cushing’s disease are largely additive.</w:t>
+      </w:r>
+    </w:p>
+    <w:p>
+      <w:pPr>
+        <w:pStyle w:val="Heading3"/>
+      </w:pPr>
+      <w:r>
+        <w:t>MASLD and liver enzymes</w:t>
+      </w:r>
+    </w:p>
+    <w:p>
+      <w:r>
+        <w:t xml:space="preserve">To </w:t>
+      </w:r>
+      <w:r>
+        <w:t>assess</w:t>
+      </w:r>
+      <w:r>
+        <w:t xml:space="preserve"> </w:t>
+      </w:r>
+      <w:r>
+        <w:t>MASLD</w:t>
+      </w:r>
+      <w:r>
+        <w:t xml:space="preserve"> we looked at ALT </w:t>
+      </w:r>
+      <w:r>
+        <w:t>and AST levels as indicators of liver damage</w:t>
+      </w:r>
+      <w:r>
+        <w:t xml:space="preserve"> (Figure 2 and Table 3A)</w:t>
+      </w:r>
+      <w:r>
+        <w:t xml:space="preserve">. In both our obese, and non-obese populations, we saw an increase in ALT </w:t>
+      </w:r>
+      <w:r>
+        <w:t>and AST</w:t>
+      </w:r>
+      <w:r>
+        <w:t xml:space="preserve"> </w:t>
+      </w:r>
+      <w:r>
+        <w:t>levels regardless of Cushing’s disease status</w:t>
+      </w:r>
+      <w:r>
+        <w:t xml:space="preserve"> </w:t>
+      </w:r>
+      <w:r>
+        <w:t>(p</w:t>
+      </w:r>
+      <w:r>
+        <w:t>&lt;0.0</w:t>
+      </w:r>
+      <w:r>
+        <w:t>1 for both groups</w:t>
+      </w:r>
+      <w:r>
+        <w:t xml:space="preserve">). </w:t>
+      </w:r>
+      <w:r>
+        <w:t>In this case, the</w:t>
+      </w:r>
+      <w:r>
+        <w:t xml:space="preserve"> increase </w:t>
+      </w:r>
+      <w:r>
+        <w:t xml:space="preserve">due to Cushing’s disease was much greater in the patients with obesity </w:t>
+      </w:r>
+      <w:r>
+        <w:t>(</w:t>
+      </w:r>
+      <w:r>
+        <w:t>73.4 vs 35.1 mg/dL, p</w:t>
+      </w:r>
+      <w:r>
+        <w:rPr>
+          <w:vertAlign w:val="subscript"/>
+        </w:rPr>
+        <w:t>interaction</w:t>
+      </w:r>
+      <w:r>
+        <w:t>&lt;0.01</w:t>
+      </w:r>
+      <w:r>
+        <w:t>).</w:t>
+      </w:r>
+      <w:r>
+        <w:t xml:space="preserve">  This was also true for AST levels (increase by 56.3 mg/dL in patients with obesity and 16.9 for patients without obesity,</w:t>
+      </w:r>
+      <w:r>
+        <w:t xml:space="preserve"> </w:t>
+      </w:r>
+      <w:r>
+        <w:t>p</w:t>
+      </w:r>
+      <w:r>
+        <w:rPr>
+          <w:vertAlign w:val="subscript"/>
+        </w:rPr>
+        <w:t>interaction</w:t>
+      </w:r>
+      <w:r>
+        <w:t>=0.034).  These data support the hypothesis</w:t>
+      </w:r>
+      <w:r>
+        <w:t xml:space="preserve"> that obesity </w:t>
+      </w:r>
+      <w:r>
+        <w:t>enhances Cushing’s associated liver damage</w:t>
+      </w:r>
+      <w:r>
+        <w:t>.</w:t>
+      </w:r>
+    </w:p>
+    <w:p>
+      <w:pPr>
+        <w:pStyle w:val="Heading3"/>
+      </w:pPr>
+      <w:r>
+        <w:t>Blood Pressure</w:t>
+      </w:r>
+    </w:p>
+    <w:p>
+      <w:r>
+        <w:t xml:space="preserve">We </w:t>
+      </w:r>
+      <w:r>
+        <w:t>evaluated</w:t>
+      </w:r>
+      <w:r>
+        <w:t xml:space="preserve"> blood pressure readings as systolic, diastolic and mean arterial pressure</w:t>
+      </w:r>
+      <w:r>
+        <w:t>s</w:t>
+      </w:r>
+      <w:r>
+        <w:t xml:space="preserve"> </w:t>
+      </w:r>
+      <w:r>
+        <w:t xml:space="preserve"> (</w:t>
+      </w:r>
+      <w:r>
+        <w:t xml:space="preserve">Figure 2 and </w:t>
+      </w:r>
+      <w:r>
+        <w:t xml:space="preserve">Table 3A). </w:t>
+      </w:r>
+      <w:r>
+        <w:t>We</w:t>
+      </w:r>
+      <w:r>
+        <w:t xml:space="preserve"> </w:t>
+      </w:r>
+      <w:r>
+        <w:t>observed</w:t>
+      </w:r>
+      <w:r>
+        <w:t xml:space="preserve"> significant increase</w:t>
+      </w:r>
+      <w:r>
+        <w:t>s for all measures</w:t>
+      </w:r>
+      <w:r>
+        <w:t xml:space="preserve"> in </w:t>
+      </w:r>
+      <w:r>
+        <w:t>patients without obesity</w:t>
+      </w:r>
+      <w:r>
+        <w:t xml:space="preserve"> (p=</w:t>
+      </w:r>
+      <w:r>
+        <w:t>&lt;0.01</w:t>
+      </w:r>
+      <w:r>
+        <w:t xml:space="preserve">). We did not, however, </w:t>
+      </w:r>
+      <w:r>
+        <w:t>observe</w:t>
+      </w:r>
+      <w:r>
+        <w:t xml:space="preserve"> this same significant </w:t>
+      </w:r>
+      <w:r>
+        <w:t xml:space="preserve">magnitude of </w:t>
+      </w:r>
+      <w:r>
+        <w:t>increase</w:t>
+      </w:r>
+      <w:r>
+        <w:t>s in blood pressure</w:t>
+      </w:r>
+      <w:r>
+        <w:t xml:space="preserve"> in </w:t>
+      </w:r>
+      <w:r>
+        <w:t>Cushing’s patients with obesity</w:t>
+      </w:r>
+      <w:r>
+        <w:t xml:space="preserve"> population</w:t>
+      </w:r>
+      <w:r>
+        <w:t>.  For example, in terms of systolic blood pressure, Cushing’s disease was associated with an increase of 11.97 mm Hg in patients without obesity but 3.08 mm Hg</w:t>
+      </w:r>
+      <w:r>
+        <w:t xml:space="preserve"> in those with a BMI over 30 kg/m</w:t>
+      </w:r>
+      <w:r>
+        <w:rPr>
+          <w:vertAlign w:val="superscript"/>
+        </w:rPr>
+        <w:t>2</w:t>
+      </w:r>
+      <w:r>
+        <w:t xml:space="preserve">.  </w:t>
+      </w:r>
+      <w:r>
+        <w:t>The</w:t>
+      </w:r>
+      <w:r>
+        <w:t xml:space="preserve"> attenuation of the </w:t>
+      </w:r>
+      <w:r>
+        <w:t>effect</w:t>
+      </w:r>
+      <w:r>
+        <w:t xml:space="preserve"> of Cushing’s disease </w:t>
+      </w:r>
+      <w:r>
+        <w:t>in patients</w:t>
+      </w:r>
+      <w:r>
+        <w:t xml:space="preserve"> obesity was significant </w:t>
+      </w:r>
+      <w:r>
+        <w:t>for mean, systolic, and diastolic bood pressure (p</w:t>
+      </w:r>
+      <w:r>
+        <w:rPr>
+          <w:vertAlign w:val="subscript"/>
+        </w:rPr>
+        <w:t>interaction</w:t>
+      </w:r>
+      <w:r>
+        <w:t xml:space="preserve">&lt;0.01 for each).  </w:t>
+      </w:r>
+      <w:r>
+        <w:t xml:space="preserve">This </w:t>
+      </w:r>
+      <w:r>
+        <w:t>suggests that obesity may have a protective effect on Cushing’s induced hypertension.</w:t>
+      </w:r>
+    </w:p>
+    <w:p>
+      <w:pPr>
+        <w:pStyle w:val="NormalWeb"/>
+        <w:rPr>
+          <w:rStyle w:val="Heading2Char"/>
+        </w:rPr>
+      </w:pPr>
+      <w:r>
+        <w:rPr>
+          <w:rStyle w:val="Heading2Char"/>
+        </w:rPr>
+        <w:t>Sensitivity and secondary analyses</w:t>
+      </w:r>
+    </w:p>
+    <w:p>
+      <w:r>
+        <w:t>We performed a variety of sensitivity analyses to test the assumptions used in evaluating these effects, summarized in Table 4.</w:t>
+      </w:r>
+      <w:r>
+        <w:t xml:space="preserve">  By and large, these analyses show that the effects described above are robust to different analytical methods.  For example, the synergistic effects of obesity and Cushing’s disease on liver enzymes was similar and significant across different demographic adjustments.  We also found that propensity matching cases for BMI, or including BMI as a covariate did not attenuate these effects.  Within subgroups, we did notice some suggestive trends.  For example, the synergistic (and antagonistic) effects of obesity increased as obesity increased.  For example, the interaction between Class I obesity and Cushing’s disease on ALT levels was -12.8 mg/dL but increased to </w:t>
+      </w:r>
+      <w:r>
+        <w:t>+</w:t>
+      </w:r>
+      <w:r>
+        <w:t xml:space="preserve">30.3 for Class II obesity and 80.7 for class III obesity.  Since this analysis already accounted for a main effect of obesity status, this suggest that as obesity increases, the negative effect of Cushing’s disease on liver enzymes increased, while the protective effect on blood pressure was also trended to increase in magnitude.  Stratifying by gender, we noticed that </w:t>
+      </w:r>
+      <w:r>
+        <w:lastRenderedPageBreak/>
+        <w:t xml:space="preserve">female patients generally had worsened but more variable effect estimates.  In the case of AST, the interaction between obesity and </w:t>
+      </w:r>
+      <w:r>
+        <w:t>Cushing’s</w:t>
+      </w:r>
+      <w:r>
+        <w:t xml:space="preserve"> </w:t>
+      </w:r>
+      <w:r>
+        <w:t xml:space="preserve">disease </w:t>
+      </w:r>
+      <w:r>
+        <w:t xml:space="preserve">was estimated at 41.9 [-3.7-87.5] mg/dL but for males it was 25.8 [11.4-40.1] mg/dL.  </w:t>
+      </w:r>
+    </w:p>
+    <w:p>
+      <w:pPr>
+        <w:pStyle w:val="Heading1"/>
+      </w:pPr>
+      <w:r>
+        <w:t>Discussion</w:t>
+      </w:r>
+    </w:p>
+    <w:p>
+      <w:pPr>
+        <w:pStyle w:val="ListParagraph"/>
+      </w:pPr>
+    </w:p>
+    <w:p>
+      <w:pPr>
+        <w:pStyle w:val="ListParagraph"/>
+        <w:ind w:left="0"/>
+      </w:pPr>
+      <w:r>
+        <w:t>This analysis of the effects of obesity and Cushing’s disease demonstrate a complex set of interactions between the presence of obesity on Cushing’s disease- and obesity-related pathophysiology.  We report that liver enzymes are enhanced relative to what we would predict from the additive effects of Cushing’s disease and obesity together, while in the case of blood pressure, obesity appears to reduce the effects of Cushing’s disease.  Glucose homeostasis appears to be explained well by an additive model</w:t>
+      </w:r>
+      <w:r>
+        <w:t xml:space="preserve"> in our primary analysis.</w:t>
+      </w:r>
+    </w:p>
+    <w:p>
+      <w:pPr>
+        <w:pStyle w:val="ListParagraph"/>
+        <w:ind w:left="0"/>
+      </w:pPr>
+    </w:p>
+    <w:p>
+      <w:pPr>
+        <w:pStyle w:val="ListParagraph"/>
+        <w:ind w:left="0"/>
+      </w:pPr>
+      <w:r>
+        <w:t xml:space="preserve">These data are in part consistent with experimental animal studies in our group where pre-existing obesity aggravated liver steatosis and muscle function loss </w:t>
+      </w:r>
+      <w:r>
+        <w:fldChar w:fldCharType="begin"/>
+      </w:r>
+      <w:r>
+        <w:instrText xml:space="preserve"> ADDIN ZOTERO_ITEM CSL_CITATION {"citationID":"LH1T8aA8","properties":{"formattedCitation":"(Gunder et al., 2020; Harvey et al., 2018)","plainCitation":"(Gunder et al., 2020; Harvey et al., 2018)","noteIndex":0},"citationItems":[{"id":9070,"uris":["http://zotero.org/users/7317906/items/UINYBGJP"],"itemData":{"id":9070,"type":"article-journal","abstract":"© 2020 by the authors. Licensee MDPI, Basel, Switzerland. Glucocorticoids promote muscle atrophy by inducing a class of proteins called atrogenes, resulting in reductions in muscle size and strength. In this work, we evaluated whether a mouse model with pre-existing diet-induced obesity had altered glucocorticoid responsiveness. We observed that all animals treated with the synthetic glucocorticoid dexamethasone had reduced strength, but that obesity exacerbated this effect. These changes were concordant with more pronounced reductions in muscle size, particularly in Type II muscle fibers, and potentiated induction of atrogene expression in the obese mice relative to lean mice. Furthermore, we show that the reductions in lean mass do not fully account for the dexamethasone-induced insulin resistance observed in these mice. Together, these data suggest that obesity potentiates glucocorticoid-induced muscle atrophy.","container-title":"Biomedicines","DOI":"10.3390/biomedicines8100420","ISSN":"22279059","issue":"10","note":"Citation Key: Gunder2020","title":"Obesity augments glucocorticoid-dependent muscle atrophy in male c57bl/6j mice","volume":"8","author":[{"family":"Gunder","given":"Laura C"},{"family":"Harvey","given":"I."},{"family":"Redd","given":"J.R."},{"family":"Davis","given":"C.S."},{"family":"Al-Tamimi","given":"A."},{"family":"Brooks","given":"S.V."},{"family":"Bridges","given":"Dave"}],"issued":{"date-parts":[["2020"]]},"citation-key":"Gunder2020"}},{"id":9074,"uris":["http://zotero.org/users/7317906/items/TX7KAVZ2"],"itemData":{"id":9074,"type":"article-journal","abstract":"© 2018 Endocrine Society. The purpose of this study was to determine the effects of glucocorticoid-induced metabolic dysfunction in the presence of diet-induced obesity. C57BL/6J adult male lean and diet-induced obese mice were given dexamethasone, and levels of hepatic steatosis, insulin resistance, and lipolysis were determined. Obese mice given dexamethasone had significant, synergistic effects on fasting glucose, insulin resistance, and markers of lipolysis, as well as hepatic steatosis. This was associated with synergistic transactivation of the lipolytic enzyme adipose triglyceride lipase. The combination of chronically elevated glucocorticoids and obesity leads to exacerbations in metabolic dysfunction. Our findings suggest lipolysis may be a key player in glucocorticoid-induced insulin resistance and fatty liver in individuals with obesity.","container-title":"Endocrinology","DOI":"10.1210/en.2018-00147","ISSN":"19457170","issue":"6","title":"Glucocorticoid-Induced Metabolic Disturbances Are Exacerbated in Obese Male Mice","volume":"159","author":[{"family":"Harvey","given":"Innocence"},{"family":"Stephenson","given":"Erin J."},{"family":"Redd","given":"J.R."},{"family":"Tran","given":"Quynh T."},{"family":"Hochberg","given":"I."},{"family":"Qi","given":"N."},{"family":"Bridges","given":"Dave"}],"issued":{"date-parts":[["2018"]]},"citation-key":"harveyGlucocorticoidInducedMetabolicDisturbances2018"}}],"schema":"https://github.com/citation-style-language/schema/raw/master/csl-citation.json"} </w:instrText>
+      </w:r>
+      <w:r>
+        <w:fldChar w:fldCharType="separate"/>
+      </w:r>
+      <w:r>
+        <w:rPr>
+          <w:noProof/>
+        </w:rPr>
+        <w:t>(Gunder et al., 2020; Harvey et al., 2018)</w:t>
+      </w:r>
+      <w:r>
+        <w:fldChar w:fldCharType="end"/>
+      </w:r>
+      <w:r>
+        <w:t xml:space="preserve">.  These data are also consistent with our previous report demonstrating that obesity modifies Cushing’s-induced transcriptional changes in adipose tissue </w:t>
+      </w:r>
+      <w:r>
+        <w:fldChar w:fldCharType="begin"/>
+      </w:r>
+      <w:r>
+        <w:instrText xml:space="preserve"> ADDIN ZOTERO_ITEM CSL_CITATION {"citationID":"JkUdYYW8","properties":{"formattedCitation":"(Hochberg et al., 2015)","plainCitation":"(Hochberg et al., 2015)","noteIndex":0},"citationItems":[{"id":4127,"uris":["http://zotero.org/users/7317906/items/2YQBFJRJ"],"itemData":{"id":4127,"type":"article-journal","abstract":"Glucocorticoids have major effects on adipose tissue metabolism. To study tissue mRNA expression changes induced by chronic elevated endogenous glucocorticoids, we performed RNA sequencing on subcutaneous adipose tissue from patients with Cushing's disease (n=5) compared to patients with non-functioning pituitary adenomas (n=11). We found higher expression of transcripts involved in several metabolic pathways, including lipogenesis, proteolysis and glucose oxidation as well as decreased expression of transcripts involved in inflammation and protein synthesis. To further study this in a model system, we subjected mice to dexamethasone treatment for 12 weeks and analyzed their inguinal (subcutaneous) fat pads, which led to similar findings. Additionally, mice treated with dexamethasone showed drastic decreases in lean body mass as well as increased fat mass, further supporting the human transcriptomic data. These data provide insight to transcriptional changes that may be responsible for the co-morbidities associated with chronic elevations of glucocorticoids.","container-title":"Journal of Molecular Endocrinology","DOI":"10.1530/JME-15-0119","ISSN":"0952-5041","issue":"2","note":"PMID: 26150553\nCitation Key: Hochberg2015a","page":"81-94","title":"Gene expression changes in subcutaneous adipose tissue due to Cushing's disease","volume":"55","author":[{"family":"Hochberg","given":"Irit"},{"family":"Harvey","given":"Innocence"},{"family":"Tran","given":"Quynh T."},{"family":"Stephenson","given":"Erin J."},{"family":"Barkan","given":"Ariel L"},{"family":"Saltiel","given":"Alan R."},{"family":"Chandler","given":"William F."},{"family":"Bridges","given":"Dave"}],"issued":{"date-parts":[["2015",10]]},"citation-key":"Hochberg2015a"}}],"schema":"https://github.com/citation-style-language/schema/raw/master/csl-citation.json"} </w:instrText>
+      </w:r>
+      <w:r>
+        <w:fldChar w:fldCharType="separate"/>
+      </w:r>
+      <w:r>
+        <w:rPr>
+          <w:noProof/>
+        </w:rPr>
+        <w:t>(Hochberg et al., 2015)</w:t>
+      </w:r>
+      <w:r>
+        <w:fldChar w:fldCharType="end"/>
+      </w:r>
+      <w:r>
+        <w:t>.  We remain interested in Cushing’s induced bone and muscle loss, as well as the effect of obesity and Cushing’s disease on blood lipids and kidney function, but did not have sufficient laboratory results in these participants to make reliable conclusions.</w:t>
+      </w:r>
+    </w:p>
+    <w:p>
+      <w:pPr>
+        <w:pStyle w:val="ListParagraph"/>
+        <w:ind w:left="0"/>
+      </w:pPr>
+    </w:p>
+    <w:p>
+      <w:pPr>
+        <w:pStyle w:val="ListParagraph"/>
+        <w:ind w:left="0"/>
+      </w:pPr>
+      <w:r>
+        <w:t xml:space="preserve">Pathophysiologically, the induction of adipocyte lipolysis by cortisol’s direct effects on adipocytes, as well as its indirect effects on insulin signaling in adipocytes may explain increased liver disease in patients with obesity and Cushing’s disease.  This could be due to a confluence of increased triglyceride stores available for release, increased signaling, and decreased hepatic triglyceride export due to hepatic insulin resistance.  </w:t>
+      </w:r>
+    </w:p>
+    <w:p>
+      <w:pPr>
+        <w:pStyle w:val="ListParagraph"/>
+        <w:ind w:left="0"/>
+      </w:pPr>
+    </w:p>
+    <w:p>
+      <w:pPr>
+        <w:pStyle w:val="ListParagraph"/>
+        <w:ind w:left="0"/>
+      </w:pPr>
+      <w:r>
+        <w:t xml:space="preserve">It is less clear to us why blood pressure is not augmented.  We report that both obesity and Cushing’s disease increase systolic, diastolic and mean arterial pressure, but when both are combined the effect is strongly attenuated (Figure 2 and Table 3).  Obesity is a well-known risk factor for hypertension </w:t>
+      </w:r>
+      <w:r>
+        <w:fldChar w:fldCharType="begin"/>
+      </w:r>
+      <w:r>
+        <w:instrText xml:space="preserve"> ADDIN ZOTERO_ITEM CSL_CITATION {"citationID":"1GoIA7L8","properties":{"formattedCitation":"(Parvanova et al., 2024)","plainCitation":"(Parvanova et al., 2024)","noteIndex":0},"citationItems":[{"id":27415,"uris":["http://zotero.org/users/7317906/items/CJNPIB38"],"itemData":{"id":27415,"type":"article-journal","abstract":"The prevalence of obesity has tripled over the past five decades. Obesity, especially visceral obesity, is closely related to hypertension, increasing the risk of primary (essential) hypertension by 65%–75%. Hypertension is a major risk factor for cardiovascular disease, the leading cause of death worldwide, and its prevalence is rapidly increasing following the pandemic rise in obesity. Although the causal relationship between obesity and high blood pressure (BP) is well established, the detailed mechanisms for such association are still under research. For more than 30 years sympathetic nervous system (SNS) and kidney sodium reabsorption activation, secondary to insulin resistance and compensatory hyperinsulinemia, have been considered as primary mediators of elevated BP in obesity. However, experimental and clinical data show that severe insulin resistance and hyperinsulinemia can occur in the absence of elevated BP, challenging the causal relationship between insulin resistance and hyperinsulinemia as the key factor linking obesity to hypertension. The purpose of Part 1 of this review is to summarize the available data on recently emerging mechanisms believed to contribute to obesity-related hypertension through increased sodium reabsorption and volume expansion, such as: physical compression of the kidney by perirenal/intrarenal fat and overactivation of the systemic/renal SNS and the renin–angiotensin–aldosterone system. The role of hyperleptinemia, impaired chemoreceptor and baroreceptor reflexes, and increased perivascular fat is also discussed. Specifically targeting these mechanisms may pave the way for a new therapeutic intervention in the treatment of obesity-related hypertension in the context of ‘precision medicine’ principles, which will be discussed in Part 2.","container-title":"Clinical Kidney Journal","DOI":"10.1093/ckj/sfad282","ISSN":"2048-8505","issue":"1","journalAbbreviation":"Clin Kidney J","page":"sfad282","source":"Silverchair","title":"Mechanisms and treatment of obesity-related hypertension—Part 1: Mechanisms","title-short":"Mechanisms and treatment of obesity-related hypertension—Part 1","volume":"17","author":[{"family":"Parvanova","given":"Aneliya"},{"family":"Reseghetti","given":"Elia"},{"family":"Abbate","given":"Manuela"},{"family":"Ruggenenti","given":"Piero"}],"issued":{"date-parts":[["2024",1,1]]},"citation-key":"parvanovaMechanismsTreatmentObesityrelated2024"}}],"schema":"https://github.com/citation-style-language/schema/raw/master/csl-citation.json"} </w:instrText>
+      </w:r>
+      <w:r>
+        <w:fldChar w:fldCharType="separate"/>
+      </w:r>
+      <w:r>
+        <w:rPr>
+          <w:noProof/>
+        </w:rPr>
+        <w:t>(Parvanova et al., 2024)</w:t>
+      </w:r>
+      <w:r>
+        <w:fldChar w:fldCharType="end"/>
+      </w:r>
+      <w:r>
+        <w:t xml:space="preserve">.  Prior studies have shown </w:t>
       </w:r>
       <w:commentRangeStart w:id="1"/>
       <w:r>
-        <w:t>sources</w:t>
+        <w:t xml:space="preserve">XXXX </w:t>
       </w:r>
       <w:commentRangeEnd w:id="1"/>
       <w:r>
@@ -838,1523 +2253,202 @@
         <w:commentReference w:id="1"/>
       </w:r>
       <w:r>
-        <w:t xml:space="preserve">). The average BMI was 34.72 (+/- 13.78). The patient population was predominately White (87.19%), with the remaining participants identifying as Black (5.29%), Hispanic or Latino (2.79%), Asian (2.23%), or Other (2.51%). </w:t>
-      </w:r>
-      <w:r>
-        <w:t xml:space="preserve">These patients were then matched to controls without Cushing’s disease selected from a pool of </w:t>
-      </w:r>
-      <w:r>
-        <w:t xml:space="preserve">181,624 </w:t>
-      </w:r>
-      <w:r>
-        <w:t>patients</w:t>
-      </w:r>
-      <w:r>
-        <w:t xml:space="preserve">. </w:t>
-      </w:r>
-    </w:p>
-    <w:p>
-      <w:pPr>
-        <w:pStyle w:val="Heading2"/>
-        <w:rPr>
-          <w:rStyle w:val="Strong"/>
-          <w:b w:val="0"/>
-          <w:bCs w:val="0"/>
-        </w:rPr>
-      </w:pPr>
-      <w:r>
-        <w:rPr>
-          <w:rStyle w:val="Strong"/>
-          <w:b w:val="0"/>
-          <w:bCs w:val="0"/>
-        </w:rPr>
-        <w:t>Participant characteristics</w:t>
-      </w:r>
-      <w:r>
-        <w:rPr>
-          <w:rStyle w:val="Strong"/>
-          <w:b w:val="0"/>
-          <w:bCs w:val="0"/>
-        </w:rPr>
-        <w:t xml:space="preserve"> </w:t>
-      </w:r>
-      <w:r>
-        <w:rPr>
-          <w:rStyle w:val="Strong"/>
-          <w:b w:val="0"/>
-          <w:bCs w:val="0"/>
-        </w:rPr>
-        <w:t xml:space="preserve">associated with </w:t>
-      </w:r>
-      <w:r>
-        <w:rPr>
-          <w:rStyle w:val="Strong"/>
-          <w:b w:val="0"/>
-          <w:bCs w:val="0"/>
-        </w:rPr>
-        <w:t xml:space="preserve">Cushing’s </w:t>
-      </w:r>
-      <w:r>
-        <w:rPr>
-          <w:rStyle w:val="Strong"/>
-          <w:b w:val="0"/>
-          <w:bCs w:val="0"/>
-        </w:rPr>
-        <w:t xml:space="preserve">disease </w:t>
-      </w:r>
-    </w:p>
-    <w:p>
-      <w:r>
-        <w:t xml:space="preserve">We performed outcome-specific propensity matching to identify appropriate controls, starting from those with generating exact matches for gender, race and ethnicity.  We then algorithmically matched for age, generating 10 controls for each case.  Matching was </w:t>
-      </w:r>
-      <w:r>
-        <w:t xml:space="preserve">effective </w:t>
-      </w:r>
-      <w:r>
-        <w:t xml:space="preserve"> with a </w:t>
-      </w:r>
-      <w:r>
-        <w:t>standardized mean difference</w:t>
-      </w:r>
-      <w:r>
-        <w:t xml:space="preserve"> for age of &lt;0.05 for each outcome (see </w:t>
-      </w:r>
-      <w:r>
-        <w:t xml:space="preserve">Table 1, </w:t>
-      </w:r>
-      <w:r>
-        <w:t xml:space="preserve">Supplementary </w:t>
-      </w:r>
-      <w:r>
-        <w:t xml:space="preserve">Figure </w:t>
-      </w:r>
-      <w:r>
-        <w:t>1</w:t>
-      </w:r>
-      <w:r>
-        <w:t xml:space="preserve"> and Supplementary Table S1).</w:t>
-      </w:r>
-    </w:p>
-    <w:p>
-      <w:r>
-        <w:t xml:space="preserve">Primary descriptive characteristics are </w:t>
-      </w:r>
-      <w:r>
-        <w:t>provided</w:t>
-      </w:r>
-      <w:r>
-        <w:t xml:space="preserve"> for all participants with any available laboratory measurement</w:t>
-      </w:r>
-      <w:r>
-        <w:t xml:space="preserve"> </w:t>
-      </w:r>
-      <w:r>
-        <w:t>(Table 1)</w:t>
-      </w:r>
-      <w:r>
-        <w:t xml:space="preserve">. </w:t>
-      </w:r>
-      <w:r>
-        <w:t>Outcome-specific matched sets are described in Supplementary Tables S2</w:t>
-      </w:r>
-      <w:r>
-        <w:t>A-E</w:t>
-      </w:r>
-      <w:r>
-        <w:t>.</w:t>
-      </w:r>
-      <w:r>
-        <w:t xml:space="preserve">   Here we reproduce several notable characteristics, including a higher prevalence of Cushing’s disease in females (284 vs 72</w:t>
-      </w:r>
-      <w:r>
-        <w:t>, p&lt;0.00</w:t>
-      </w:r>
-      <w:r>
-        <w:t>1</w:t>
-      </w:r>
-      <w:r>
-        <w:t>)</w:t>
-      </w:r>
-      <w:r>
-        <w:t>, consistent with the prior literature</w:t>
-      </w:r>
-      <w:r>
-        <w:t xml:space="preserve"> </w:t>
-      </w:r>
-      <w:r>
-        <w:fldChar w:fldCharType="begin"/>
-      </w:r>
-      <w:r>
-        <w:instrText xml:space="preserve"> ADDIN ZOTERO_ITEM CSL_CITATION {"citationID":"5iZIPs39","properties":{"formattedCitation":"(Alqeeq et al., 2024; Broder et al., 2015; Etxabe &amp; Vazquez, 1994; Matthiasdottir et al., 2024; Steffensen et al., 2010)","plainCitation":"(Alqeeq et al., 2024; Broder et al., 2015; Etxabe &amp; Vazquez, 1994; Matthiasdottir et al., 2024; Steffensen et al., 2010)","noteIndex":0},"citationItems":[{"id":27029,"uris":["http://zotero.org/users/7317906/items/5UXH2J3G"],"itemData":{"id":27029,"type":"article-journal","abstract":"BACKGROUND AND OBJECTIVES: Cushing's disease is a rare endocrine disorder. This review aimed to examine sex-specific differences in Cushing's disease.\nDESIGN AND SETTINGS: A meta-analysis was performed on published articles discussing the gender impact of Cushing's disease.\nMETHODS: A systematic search was conducted to identify studies from Medline, Embase, CENTRAL and Scopus. Nine studies enrolling 1047 patients diagnosed with Cushing's disease were included in this meta-analysis.\nRESULTS: Male patients presented at a younger age (MD [mean difference]=-5.43; 95% CI [-5.78, -5.08]; P&lt;.00001) than females. Male patients had a significantly higher prevalence of osteoporosis (RR [risk ratio]=1.75; 95% CI [1.36, 225]; P&lt;.0001) and hypokalemia (RR=1.66; 95% CI [1.27, 2.16]; P=.0002). In addition, males had significantly higher rates of negative magnetic resonance imaging (RR=1.53; 95% CI [1.18, 2.0]; P=.002). No sex difference was observed in the prevalence of diabetes (RR=0.92; 95% CI [0.70, 1.22]); P=.57) and dyslipidemia (RR=1.33; 95% CI [0.88, 2.0]; P=.17).\nCONCLUSION: Cushing's disease has a worse clinical presentation in males and more diagnostic difficulties compared to females.","container-title":"Annals of Saudi Medicine","DOI":"10.5144/0256-4947.2024.55","ISSN":"0975-4466","issue":"1","journalAbbreviation":"Ann Saudi Med","language":"eng","note":"PMID: 38311874\nPMCID: PMC10839456","page":"55-65","source":"PubMed","title":"Sex-related differences in Cushing's disease: a systematic review and meta-analysis","title-short":"Sex-related differences in Cushing's disease","volume":"44","author":[{"family":"Alqeeq","given":"Basel F."},{"family":"Ayyad","given":"Mohammed"},{"family":"Almadhoun","given":"Waseem J."},{"family":"Aboabdo","given":"Mohammad"},{"family":"Aldahdouh","given":"Mosheer S."},{"family":"Al-Tawil","given":"Mohammed"},{"family":"Al-Ghazali","given":"Ahmed M."}],"issued":{"date-parts":[["2024"]]},"citation-key":"alqeeqSexrelatedDifferencesCushings2024"}},{"id":27016,"uris":["http://zotero.org/users/7317906/items/RNS3FR6N"],"itemData":{"id":27016,"type":"article-journal","abstract":"PURPOSE: To estimate the incidence of Cushing's syndrome (CS) and Cushing's disease (CD) in the US.\nMETHODS: MarketScan Commercial database 2007-2010 (age &lt;65 years) was used. CS patients were defined with ≥2 claims of CS diagnosis, while CD patients were defined with CS plus a benign pituitary adenoma diagnosis or hypophysectomy in the same calendar year. Annual incidence was calculated by dividing the number of CS or CD cases by the total number of members with the same enrollment requirement during the calendar years.\nRESULTS: CS incidence rates per million person-years were 48.6 in 2009 and 39.5 in 2010. The lowest rates of CS were in ≤17-year-olds and highest rates were in 35 to 44-year-olds. CD incidence rates were 7.6 in 2009 and 6.2 in 2010. The lowest rates of CD were in ≤17-year-olds and highest rates were in 18 to 24-year-olds. The rates varied by sex (2.3-2.7 in males, 9.8-12.1 in females). In females, lowest rates ranged 2.5-4.0 in ≤17-year-olds and highest 16.7-27.2 in 18-24 year olds. In males, there were too few cases to report estimates by age.\nCONCLUSIONS: In the first large US-based study, the annual incidence of CS in individuals &lt;65 years old was nearly 49 cases per million, substantially higher than previous estimates, which were based primarily on European data. Using similar methods, we estimated the incidence of CD at nearly 8 cases per million US population. These estimates, if confirmed in other epidemiologic databases, represent a new data reference in these rare conditions.","container-title":"Pituitary","DOI":"10.1007/s11102-014-0569-6","ISSN":"1573-7403","issue":"3","journalAbbreviation":"Pituitary","language":"eng","note":"PMID: 24803324","page":"283-289","source":"PubMed","title":"Incidence of Cushing's syndrome and Cushing's disease in commercially-insured patients &lt;65 years old in the United States","volume":"18","author":[{"family":"Broder","given":"Michael S."},{"family":"Neary","given":"Maureen P."},{"family":"Chang","given":"Eunice"},{"family":"Cherepanov","given":"Dasha"},{"family":"Ludlam","given":"William H."}],"issued":{"date-parts":[["2015",6]]},"citation-key":"broderIncidenceCushingsSyndrome2015"}},{"id":1348,"uris":["http://zotero.org/users/7317906/items/V5L6B4RJ"],"itemData":{"id":1348,"type":"article-journal","abstract":"OBJECTIVE: Although Cushing's disease is a well documented clinical entity, there is no epidemiological information about it. The present study tries to obtain this information. DESIGN AND PATIENTS: Forty-nine patients affected by Cushing's disease living in Vizcaya (Spain) between 1975 and 1992 were considered for an epidemiological study. RESULTS: The prevalence of known cases at the end of 1992 was 39.1 per million inhabitants. The average incidence of newly diagnosed cases was 2.4 cases per million people per year. Cushing's disease was more frequent in women (n = 46) than in men (n = 3), with a ratio of 15:1. Diabetes mellitus and hypertension were observed in 38.7 and 55.1% of patients, respectively. Remission of Cushing's disease was achieved in 36 out of 41 patients (87.5%). In general, the mortality was higher than that expected for the control population (standardized mortality ratio, SMR 3.8, 95% confidence interval, CI 2.5-17.9, P &lt; 0.03). Concerning the cause of death, the SMR of vascular disease was 5 (95% CI 3.4-48.6, P &lt; 0.05). Higher age, persistence of hypertension and abnormalities of glucose metabolism after treatment, were independent predictors of mortality (multivariate analyses, P &lt; 0.01). CONCLUSIONS: Prevalence of Cushing's disease was 39.1 cases/million inhabitants and average incidence was 2.4 cases/million per year. Mortality was elevated, due to vascular disease, associated with higher age, persistence of hypertension and impaired glucose metabolism.","container-title":"Clin Endocrinol (Oxf)","DOI":"10.1111/j.1365-2265.1994.tb02486.x","ISSN":"0300-0664","issue":"4","note":"PMID: 8187313\nISBN: 0300-0664 (Print)\\r0300-0664 (Linking)","page":"479-484","title":"Morbidity and mortality in Cushing's disease: an epidemiological approach","volume":"40","author":[{"family":"Etxabe","given":"J"},{"family":"Vazquez","given":"J A"}],"issued":{"date-parts":[["1994"]]},"citation-key":"etxabeMorbidityMortalityCushings1994"}},{"id":27026,"uris":["http://zotero.org/users/7317906/items/X2VBVW53"],"itemData":{"id":27026,"type":"article-journal","abstract":"Introduction: In 2011, we reported the overall incidence of Cushing’s disease (CD) in Iceland from 1955 through 2009 to be 1.5 cases per million per year with highest incidence in the last decade of the study, a higher incidence then earlier reported. We now present a follow-up study reporting the epidemiology of the disease in Iceland during the 10-year period from 2010 to 2019. Methods: In this nationwide retrospective study, clinical information on patients diagnosed with CD was obtained from electronic medical records, reviewed by consulting endocrinologists. Results: Seventeen patients were diagnosed with CD, 12 women (71%) and 5 men (29%) giving an overall incidence of 5.2 cases per million per year. The mean age at diagnosis was 46 years (range 13–85 years). Biochemical analysis was recorded for all patients and 12 patients (71%) had visible pituitary adenoma on imaging studies. Sixteen patients (94%) were treated with transsphenoidal surgery of which 4 patients (24%) had gamma knife radiosurgery and three (18%) bilateral adrenalectomy after pituitary surgery. Two patients died during the study period. Conclusion: The overall incidence of CD of 5.2 cases per million per year is higher than previously reported, indicating the importance of awareness of CD. As all patients with CD are diagnosed and/or treated at the only University Hospital in Iceland, housing the only department of endocrinology as well as neurosurgery, we are confident that all cases diagnosed during the study period were included in the study.","container-title":"Neuroendocrinology","DOI":"10.1159/000540205","ISSN":"0028-3835","issue":"10","journalAbbreviation":"Neuroendocrinology","page":"950-957","source":"Silverchair","title":"Cushing’s Disease May Have Higher Incidence than Previously Thought: A Nationwide Study in Iceland 2010–2019","title-short":"Cushing’s Disease May Have Higher Incidence than Previously Thought","volume":"114","author":[{"family":"Matthiasdottir","given":"Anna Mjoll"},{"family":"Hardarson","given":"Thorgeir Orri"},{"family":"Arnardottir","given":"Steinunn"},{"family":"Sigurjonsdottir","given":"Helga Agusta"}],"issued":{"date-parts":[["2024",7,22]]},"citation-key":"matthiasdottirCushingsDiseaseMay2024"}},{"id":27019,"uris":["http://zotero.org/users/7317906/items/RTX3YT8D"],"itemData":{"id":27019,"type":"article-journal","abstract":"Overt Cushing’s syndrome is a rare disorder with an annual incidence of 2–3/million of which benign adrenal adenomas account for 0.6/million. The female:male ratio is 3:1. Preliminary data indicate a high proportion of subclinical Cushing’s syndrome in certain risk populations such as patients with type 2 diabetes or osteoporosis. The clinical implications of these observations are presently unclear. Surgery remains first line treatment for overt disease and initial cure or remission is obtained in 65–85% of patients with Cushing’s disease. Late recurrences, however, occur in up to 20% and the risk does not seem to plateau even after 20 years of follow-up. A 2- to 3-fold increase in mortality is observed in most studies, and this excess mortality seems confined to patients in whom initial cure was not obtained. Cushing’s syndrome continues to pose diagnostic and therapeutic challenges and life-long follow-up is mandatory.","container-title":"Neuroendocrinology","DOI":"10.1159/000314297","ISSN":"0028-3835","issue":"Suppl. 1","journalAbbreviation":"Neuroendocrinology","page":"1-5","source":"Silverchair","title":"Epidemiology of Cushing’s Syndrome","volume":"92","author":[{"family":"Steffensen","given":"Charlotte"},{"family":"Bak","given":"Ann Mosegaard"},{"family":"Zøylner Rubeck","given":"Kristine"},{"family":"Jørgensen","given":"Jens Otto Lunde"}],"issued":{"date-parts":[["2010",9,10]]},"citation-key":"steffensenEpidemiologyCushingsSyndrome2010"}}],"schema":"https://github.com/citation-style-language/schema/raw/master/csl-citation.json"} </w:instrText>
-      </w:r>
-      <w:r>
-        <w:fldChar w:fldCharType="separate"/>
-      </w:r>
-      <w:r>
-        <w:rPr>
-          <w:noProof/>
-        </w:rPr>
-        <w:t>(Alqeeq et al., 2024; Broder et al., 2015; Etxabe &amp; Vazquez, 1994; Matthiasdottir et al., 2024; Steffensen et al., 2010)</w:t>
-      </w:r>
-      <w:r>
-        <w:fldChar w:fldCharType="end"/>
-      </w:r>
-      <w:r>
-        <w:t>.  As expected</w:t>
-      </w:r>
-      <w:r>
-        <w:t>,</w:t>
-      </w:r>
-      <w:r>
-        <w:t xml:space="preserve"> we also observed</w:t>
-      </w:r>
-      <w:r>
-        <w:rPr>
-          <w:rStyle w:val="CommentReference"/>
-        </w:rPr>
-        <w:t xml:space="preserve"> </w:t>
-      </w:r>
-      <w:r>
-        <w:t xml:space="preserve">a higher body mass index for patients with Cushing’s disease </w:t>
-      </w:r>
-      <w:r>
-        <w:t xml:space="preserve">compared to controls </w:t>
-      </w:r>
-      <w:r>
-        <w:t>(</w:t>
-      </w:r>
-      <w:r>
-        <w:t>34.7 vs 29.3 kg/m</w:t>
-      </w:r>
-      <w:r>
-        <w:rPr>
-          <w:vertAlign w:val="superscript"/>
-        </w:rPr>
-        <w:t>2</w:t>
-      </w:r>
-      <w:r>
-        <w:t xml:space="preserve">, </w:t>
-      </w:r>
-      <w:r>
-        <w:t>p&lt;0.001).</w:t>
-      </w:r>
-      <w:r>
-        <w:t xml:space="preserve">  </w:t>
-      </w:r>
-      <w:r>
-        <w:t>Prior to matching for Race and Ethnicity, we noted that participants</w:t>
-      </w:r>
-      <w:r>
-        <w:t xml:space="preserve"> with Cushing’s disease were more likely to </w:t>
-      </w:r>
-      <w:r>
-        <w:t>identify as Non-Hispanic White (87%) than the overall Michigan Medicine participant population (75% Non-Hispanic White</w:t>
-      </w:r>
-      <w:r>
-        <w:t>, p</w:t>
-      </w:r>
-      <w:r>
-        <w:t>&lt;0.001</w:t>
-      </w:r>
-      <w:r>
-        <w:t>).</w:t>
-      </w:r>
-      <w:r>
-        <w:t xml:space="preserve">  Correspondingly</w:t>
-      </w:r>
-      <w:r>
-        <w:t>,</w:t>
-      </w:r>
-      <w:r>
-        <w:t xml:space="preserve"> participants with Cushing’s disease were less likely to identify as Asian </w:t>
-      </w:r>
-      <w:r>
-        <w:t xml:space="preserve">(p&lt;0.001) </w:t>
-      </w:r>
-      <w:r>
-        <w:t>or Black</w:t>
-      </w:r>
-      <w:r>
-        <w:t xml:space="preserve"> (p=0.01</w:t>
-      </w:r>
-      <w:r>
-        <w:t>8</w:t>
-      </w:r>
-      <w:r>
-        <w:t>)</w:t>
-      </w:r>
-      <w:r>
-        <w:t>.</w:t>
-      </w:r>
-      <w:r>
-        <w:t xml:space="preserve">  This is consistent with other reports on the </w:t>
-      </w:r>
-      <w:r>
-        <w:lastRenderedPageBreak/>
-        <w:t xml:space="preserve">prevalence of Cushing’s disease across racial groups </w:t>
-      </w:r>
-      <w:r>
-        <w:fldChar w:fldCharType="begin"/>
-      </w:r>
-      <w:r>
-        <w:instrText xml:space="preserve"> ADDIN ZOTERO_ITEM CSL_CITATION {"citationID":"Zf5euBGy","properties":{"formattedCitation":"(Ioachimescu et al., 2022; Omotosho et al., 2024)","plainCitation":"(Ioachimescu et al., 2022; Omotosho et al., 2024)","noteIndex":0},"citationItems":[{"id":27032,"uris":["http://zotero.org/users/7317906/items/EVS87VVY"],"itemData":{"id":27032,"type":"article-journal","abstract":"Acromegaly (ACM) and Cushing’s disease (CD) are caused by functioning pituitary adenomas secreting growth hormone and ACTH respectively.To determine the impact of race on presentation and postoperative outcomes in adults with ACM and CD, which has not yet been evaluated.This is a retrospective study of consecutive patients operated at a large-volume pituitary center. We evaluated (1) racial distribution of patients residing in the metropolitan area (Metro, N</w:instrText>
-      </w:r>
-      <w:r>
-        <w:rPr>
-          <w:rFonts w:ascii="Arial" w:hAnsi="Arial" w:cs="Arial"/>
-        </w:rPr>
-        <w:instrText> </w:instrText>
-      </w:r>
-      <w:r>
-        <w:instrText>=</w:instrText>
-      </w:r>
-      <w:r>
-        <w:rPr>
-          <w:rFonts w:ascii="Arial" w:hAnsi="Arial" w:cs="Arial"/>
-        </w:rPr>
-        <w:instrText> </w:instrText>
-      </w:r>
-      <w:r>
-        <w:instrText>124) vs 2010 US census data, and(2) presentation and postoperative outcomes in Black vs White for patients from the entire catchment area (N</w:instrText>
-      </w:r>
-      <w:r>
-        <w:rPr>
-          <w:rFonts w:ascii="Arial" w:hAnsi="Arial" w:cs="Arial"/>
-        </w:rPr>
-        <w:instrText> </w:instrText>
-      </w:r>
-      <w:r>
-        <w:instrText>=</w:instrText>
-      </w:r>
-      <w:r>
-        <w:rPr>
-          <w:rFonts w:ascii="Arial" w:hAnsi="Arial" w:cs="Arial"/>
-        </w:rPr>
-        <w:instrText> </w:instrText>
-      </w:r>
-      <w:r>
-        <w:instrText>241).For Metro area (32.4% Black population), Black patients represented 16.75% ACM (P</w:instrText>
-      </w:r>
-      <w:r>
-        <w:rPr>
-          <w:rFonts w:ascii="Arial" w:hAnsi="Arial" w:cs="Arial"/>
-        </w:rPr>
-        <w:instrText> </w:instrText>
-      </w:r>
-      <w:r>
-        <w:instrText>=</w:instrText>
-      </w:r>
-      <w:r>
-        <w:rPr>
-          <w:rFonts w:ascii="Arial" w:hAnsi="Arial" w:cs="Arial"/>
-        </w:rPr>
-        <w:instrText> </w:instrText>
-      </w:r>
-      <w:r>
-        <w:instrText>.006) and 29.2% CD (P</w:instrText>
-      </w:r>
-      <w:r>
-        <w:rPr>
-          <w:rFonts w:ascii="Arial" w:hAnsi="Arial" w:cs="Arial"/>
-        </w:rPr>
-        <w:instrText> </w:instrText>
-      </w:r>
-      <w:r>
-        <w:instrText>=</w:instrText>
-      </w:r>
-      <w:r>
-        <w:rPr>
-          <w:rFonts w:ascii="Arial" w:hAnsi="Arial" w:cs="Arial"/>
-        </w:rPr>
-        <w:instrText> </w:instrText>
-      </w:r>
-      <w:r>
-        <w:instrText>.56). Among the total 112 patients with ACM, presentations with headaches or incidentaloma were more common in Black patients (76.9% vs 31% White, P</w:instrText>
-      </w:r>
-      <w:r>
-        <w:rPr>
-          <w:rFonts w:ascii="Arial" w:hAnsi="Arial" w:cs="Arial"/>
-        </w:rPr>
-        <w:instrText> </w:instrText>
-      </w:r>
-      <w:r>
-        <w:instrText>=</w:instrText>
-      </w:r>
-      <w:r>
-        <w:rPr>
-          <w:rFonts w:ascii="Arial" w:hAnsi="Arial" w:cs="Arial"/>
-        </w:rPr>
-        <w:instrText> </w:instrText>
-      </w:r>
-      <w:r>
-        <w:instrText>.01). Black patients had a higher prevalence of diabetes (54% vs 16% White, P</w:instrText>
-      </w:r>
-      <w:r>
-        <w:rPr>
-          <w:rFonts w:ascii="Arial" w:hAnsi="Arial" w:cs="Arial"/>
-        </w:rPr>
-        <w:instrText> </w:instrText>
-      </w:r>
-      <w:r>
-        <w:instrText>=</w:instrText>
-      </w:r>
-      <w:r>
-        <w:rPr>
-          <w:rFonts w:ascii="Arial" w:hAnsi="Arial" w:cs="Arial"/>
-        </w:rPr>
-        <w:instrText> </w:instrText>
-      </w:r>
-      <w:r>
-        <w:instrText>.005), significantly lower insulin-like growth factor (IGF)-1 deviation from normal (P</w:instrText>
-      </w:r>
-      <w:r>
-        <w:rPr>
-          <w:rFonts w:ascii="Arial" w:hAnsi="Arial" w:cs="Arial"/>
-        </w:rPr>
-        <w:instrText> </w:instrText>
-      </w:r>
-      <w:r>
-        <w:instrText>=</w:instrText>
-      </w:r>
-      <w:r>
-        <w:rPr>
-          <w:rFonts w:ascii="Arial" w:hAnsi="Arial" w:cs="Arial"/>
-        </w:rPr>
-        <w:instrText> </w:instrText>
-      </w:r>
-      <w:r>
-        <w:instrText>.03) and borderline lower median growth hormone levels (P</w:instrText>
-      </w:r>
-      <w:r>
-        <w:rPr>
-          <w:rFonts w:ascii="Arial" w:hAnsi="Arial" w:cs="Arial"/>
-        </w:rPr>
-        <w:instrText> </w:instrText>
-      </w:r>
-      <w:r>
-        <w:instrText>=</w:instrText>
-      </w:r>
-      <w:r>
-        <w:rPr>
-          <w:rFonts w:ascii="Arial" w:hAnsi="Arial" w:cs="Arial"/>
-        </w:rPr>
-        <w:instrText> </w:instrText>
-      </w:r>
-      <w:r>
-        <w:instrText>.09). Mean tumor diameter and proportion of tumors with cavernous sinus invasion were similar. Three-month biochemical remission (46% Black, 55% White, P</w:instrText>
-      </w:r>
-      <w:r>
-        <w:rPr>
-          <w:rFonts w:ascii="Arial" w:hAnsi="Arial" w:cs="Arial"/>
-        </w:rPr>
-        <w:instrText> </w:instrText>
-      </w:r>
-      <w:r>
-        <w:instrText>=</w:instrText>
-      </w:r>
-      <w:r>
-        <w:rPr>
-          <w:rFonts w:ascii="Arial" w:hAnsi="Arial" w:cs="Arial"/>
-        </w:rPr>
-        <w:instrText> </w:instrText>
-      </w:r>
-      <w:r>
-        <w:instrText>.76) and long-term IGF-1 control by multimodality therapy (92.3% Black, 80.5% White, P</w:instrText>
-      </w:r>
-      <w:r>
-        <w:rPr>
-          <w:rFonts w:ascii="Arial" w:hAnsi="Arial" w:cs="Arial"/>
-        </w:rPr>
-        <w:instrText> </w:instrText>
-      </w:r>
-      <w:r>
-        <w:instrText>=</w:instrText>
-      </w:r>
-      <w:r>
-        <w:rPr>
-          <w:rFonts w:ascii="Arial" w:hAnsi="Arial" w:cs="Arial"/>
-        </w:rPr>
-        <w:instrText> </w:instrText>
-      </w:r>
-      <w:r>
-        <w:instrText>.45) were similar. Among the total 129 patients with CD, Black patients had more hypopituitarism (69% vs 45% White, P</w:instrText>
-      </w:r>
-      <w:r>
-        <w:rPr>
-          <w:rFonts w:ascii="Arial" w:hAnsi="Arial" w:cs="Arial"/>
-        </w:rPr>
-        <w:instrText> </w:instrText>
-      </w:r>
-      <w:r>
-        <w:instrText>=</w:instrText>
-      </w:r>
-      <w:r>
-        <w:rPr>
-          <w:rFonts w:ascii="Arial" w:hAnsi="Arial" w:cs="Arial"/>
-        </w:rPr>
-        <w:instrText> </w:instrText>
-      </w:r>
-      <w:r>
-        <w:instrText>.04) and macroadenomas (33% vs 15% White, P</w:instrText>
-      </w:r>
-      <w:r>
-        <w:rPr>
-          <w:rFonts w:ascii="Arial" w:hAnsi="Arial" w:cs="Arial"/>
-        </w:rPr>
-        <w:instrText> </w:instrText>
-      </w:r>
-      <w:r>
-        <w:instrText>=</w:instrText>
-      </w:r>
-      <w:r>
-        <w:rPr>
-          <w:rFonts w:ascii="Arial" w:hAnsi="Arial" w:cs="Arial"/>
-        </w:rPr>
-        <w:instrText> </w:instrText>
-      </w:r>
-      <w:r>
-        <w:instrText>.05). At 3 months, remission rate was borderline higher in White (92% vs 78% Black, P</w:instrText>
-      </w:r>
-      <w:r>
-        <w:rPr>
-          <w:rFonts w:ascii="Arial" w:hAnsi="Arial" w:cs="Arial"/>
-        </w:rPr>
-        <w:instrText> </w:instrText>
-      </w:r>
-      <w:r>
-        <w:instrText>=</w:instrText>
-      </w:r>
-      <w:r>
-        <w:rPr>
-          <w:rFonts w:ascii="Arial" w:hAnsi="Arial" w:cs="Arial"/>
-        </w:rPr>
-        <w:instrText> </w:instrText>
-      </w:r>
-      <w:r>
-        <w:instrText xml:space="preserve">0.08), which was attributed to macroadenomas by logistic regression.We identified disparities regarding racial distribution, and clinical and biochemical characteristics in ACM, suggesting late or missed diagnosis in Black patients. Large nationwide studies are necessary to confirm our findings.","container-title":"Journal of the Endocrine Society","DOI":"10.1210/jendso/bvab176","ISSN":"2472-1972","issue":"1","journalAbbreviation":"J. Endocr. Soc.","page":"bvab176","source":"Silverchair","title":"Racial Disparities in Acromegaly and Cushing’s Disease: A Referral Center Study in 241 Patients","title-short":"Racial Disparities in Acromegaly and Cushing’s Disease","volume":"6","author":[{"family":"Ioachimescu","given":"Adriana G"},{"family":"Goswami","given":"Neevedita"},{"family":"Handa","given":"Talin"},{"family":"Pappy","given":"Adlai"},{"family":"Veledar","given":"Emir"},{"family":"Oyesiku","given":"Nelson M"}],"issued":{"date-parts":[["2022",1,1]]},"citation-key":"ioachimescuRacialDisparitiesAcromegaly2022"}},{"id":27042,"uris":["http://zotero.org/users/7317906/items/H96MA6T6"],"itemData":{"id":27042,"type":"article-journal","abstract":"Y.B. Omotosho: None. R. McGlotten: None. P. Chittiboina: None. L. Nieman: None.Background: Early recognition and treatment of Cushing’s syndrome (CS) is important to reduce mortality, forestall additional co-morbidities, and improve long-term quality of life. Little is known about how adverse social determinants of health (SDOH) influence the achievement of this goal.Objective: To investigate the impact of race (Black vs White) and UFC on the time to definitive diagnosis and treatment of Cushing’s disease (CD).Methods: This is a retrospective cohort study of 114 patients (pts) (including all Non-Hispanic Blacks) evaluated at the National Institutes of Health between 1990-2022, who had CD based on pathology (ACTH-positive tumor immunohistochemistry) or biochemical remission after transsphenoidal surgery (TSS). 38 Non-Hispanic Black patients met entry criteria. They were matched 1:2 by age (within five years) and sex. We excluded patients with cyclic CS, recurrent CD, previous pituitary surgery or radiation therapy and/or a delay between diagnostic evaluation and surgery of more than 4 weeks. We limited cohorts to only Non-Hispanic Blacks and Whites for this pilot study and plan to extend this to smaller race/ethnicity groups in the future. The onset of clinical symptoms was documented as self-reported by the patients. We analyzed the difference between the year of symptom onset and the date TSS was performed, to obtain an estimated duration of diagnosis. The highest 24h urine cortisol (UFC) value for each patient was noted. Non-normal data are described as median [interquartile range]. Group comparisons used the Wilcoxon rank sum test for the time to etiologic diagnosis, age, and UFC. Statistical analyses were done using R/RStudio statistical software. P value &amp;lt;0.05 was considered significant. Results: Each racial group included 76.3% females and 23.7% males. The median age at TSS was 39.5 years [30.0 – 50.8] for Blacks and 41.5 years [31.8 - 53.3] for Whites (P= 0.7). The median UFC was 326 mcg/24h [156 - 491] for Blacks and 264 [166 - 609] for Whites (P= 0.8). The median duration from symptom onset to CD diagnosis was 3.67 years [2.76 - 6.29] for Blacks and for 2.56 years [1.57 - 4.13] for Whites. Analysis of the differences in time to diagnosis between both groups confirmed a significant disparity with blacks having a median delay of 1.1 years more than whites (P= 0.001). Discussion: We do not have information on other SDOH in our patients, such as access to providers, education level, or their perception of the medical community. The present data suggest that racial background serves as a limiting factor in the diagnosis and differential diagnosis of CS, and that differences in severity of hypercortisolism do not explain this disparity. More work is needed to understand the reasons for this disparity as we continue to strive towards health equity.Monday, June 3, 2024","container-title":"Journal of the Endocrine Society","DOI":"10.1210/jendso/bvae163.2408","ISSN":"2472-1972","issue":"Supplement_1","journalAbbreviation":"J. Endocr. Soc.","page":"bvae163.2408","source":"Silverchair","title":"MON-113 Racial Disparity in the Time to Diagnosis of Cushing’s Disease","volume":"8","author":[{"family":"Omotosho","given":"Y B"},{"family":"McGlotten","given":"R"},{"family":"Chittiboina","given":"P"},{"family":"Nieman","given":"L"}],"issued":{"date-parts":[["2024",10,1]]},"citation-key":"omotoshoMON113RacialDisparity2024"}}],"schema":"https://github.com/citation-style-language/schema/raw/master/csl-citation.json"} </w:instrText>
-      </w:r>
-      <w:r>
-        <w:fldChar w:fldCharType="separate"/>
-      </w:r>
-      <w:r>
-        <w:rPr>
-          <w:noProof/>
-        </w:rPr>
-        <w:t>(Ioachimescu et al., 2022; Omotosho et al., 2024)</w:t>
-      </w:r>
-      <w:r>
-        <w:fldChar w:fldCharType="end"/>
-      </w:r>
-      <w:r>
-        <w:t>.</w:t>
-      </w:r>
-    </w:p>
-    <w:p>
-      <w:r>
-        <w:t>As we expected, participants with Cushing’s disease had a higher BMI than the controls</w:t>
-      </w:r>
-      <w:r>
-        <w:t>, with 64% of participants with Cushing’s disease having a BMI above 30 kg/m</w:t>
-      </w:r>
-      <w:r>
-        <w:rPr>
-          <w:vertAlign w:val="superscript"/>
-        </w:rPr>
-        <w:t>2</w:t>
-      </w:r>
-      <w:r>
-        <w:t xml:space="preserve">, compared to </w:t>
-      </w:r>
-      <w:r>
-        <w:t>40</w:t>
-      </w:r>
-      <w:r>
-        <w:t>% controls (p&lt;0.001).</w:t>
-      </w:r>
-      <w:r>
-        <w:t xml:space="preserve">  </w:t>
-      </w:r>
-      <w:r>
-        <w:t xml:space="preserve">To understand the </w:t>
-      </w:r>
-      <w:r>
-        <w:t xml:space="preserve">cross-sectional </w:t>
-      </w:r>
-      <w:r>
-        <w:t>relationship between obesity and Cushing’s disease, we</w:t>
-      </w:r>
-      <w:r>
-        <w:t xml:space="preserve"> stratified our participants </w:t>
-      </w:r>
-      <w:r>
-        <w:t>with a BMI above or below 30 kg/m</w:t>
-      </w:r>
-      <w:r>
-        <w:rPr>
-          <w:vertAlign w:val="superscript"/>
-        </w:rPr>
-        <w:t>2</w:t>
-      </w:r>
-      <w:r>
-        <w:t xml:space="preserve">, </w:t>
-      </w:r>
-      <w:r>
-        <w:t>across</w:t>
-      </w:r>
-      <w:r>
-        <w:t xml:space="preserve"> both cases and controls</w:t>
-      </w:r>
-      <w:r>
-        <w:t xml:space="preserve">.  </w:t>
-      </w:r>
-      <w:r>
-        <w:t xml:space="preserve">We found that 232 patients had a BMI above 30 </w:t>
-      </w:r>
-      <w:r>
-        <w:t>kg/m</w:t>
-      </w:r>
-      <w:r>
-        <w:rPr>
-          <w:vertAlign w:val="superscript"/>
-        </w:rPr>
-        <w:t>2</w:t>
-      </w:r>
-      <w:r>
-        <w:rPr>
-          <w:vertAlign w:val="superscript"/>
-        </w:rPr>
-        <w:t xml:space="preserve"> </w:t>
-      </w:r>
-      <w:r>
-        <w:t xml:space="preserve">and 128 had a BMI below 30 </w:t>
-      </w:r>
-      <w:r>
-        <w:t>kg/m</w:t>
-      </w:r>
-      <w:r>
-        <w:rPr>
-          <w:vertAlign w:val="superscript"/>
-        </w:rPr>
-        <w:t>2</w:t>
-      </w:r>
-      <w:r>
-        <w:rPr>
-          <w:vertAlign w:val="superscript"/>
-        </w:rPr>
-        <w:t xml:space="preserve"> </w:t>
-      </w:r>
-      <w:r>
-        <w:t xml:space="preserve">at time of diagnosis. </w:t>
-      </w:r>
-      <w:r>
-        <w:t>As shown in Table 2, and as expected given our stratification, the four groups differed in several characteristics</w:t>
-      </w:r>
-      <w:r>
-        <w:t xml:space="preserve">, </w:t>
-      </w:r>
-      <w:r>
-        <w:t>which</w:t>
-      </w:r>
-      <w:r>
-        <w:t xml:space="preserve"> will be adjusted for in multivariable models below</w:t>
-      </w:r>
-      <w:r>
-        <w:t>.</w:t>
-      </w:r>
-      <w:r>
-        <w:t xml:space="preserve">  For example, among</w:t>
-      </w:r>
-      <w:r>
-        <w:t xml:space="preserve"> the subgroup of</w:t>
-      </w:r>
-      <w:r>
-        <w:t xml:space="preserve"> participants with a BMI &gt; 30 mg/m</w:t>
-      </w:r>
-      <w:r>
-        <w:rPr>
-          <w:vertAlign w:val="superscript"/>
-        </w:rPr>
-        <w:t>2</w:t>
-      </w:r>
-      <w:r>
-        <w:t>, participants with Cushing’s disease had a higher BMI than controls</w:t>
-      </w:r>
-      <w:r>
-        <w:t xml:space="preserve"> (p=0.0024 by a Mann-Whitney test)</w:t>
-      </w:r>
-      <w:r>
-        <w:t xml:space="preserve">.  </w:t>
-      </w:r>
-      <w:r>
-        <w:t>Females with Cushing’s disease were more likely to have a BMI over 30 kg/m</w:t>
-      </w:r>
-      <w:r>
-        <w:rPr>
-          <w:vertAlign w:val="superscript"/>
-        </w:rPr>
-        <w:t>2</w:t>
-      </w:r>
-      <w:r>
-        <w:t xml:space="preserve"> (68% </w:t>
-      </w:r>
-      <w:r>
-        <w:t xml:space="preserve">of </w:t>
-      </w:r>
-      <w:r>
-        <w:t xml:space="preserve">females </w:t>
-      </w:r>
-      <w:r>
-        <w:t>compared to</w:t>
-      </w:r>
-      <w:r>
-        <w:t xml:space="preserve"> 51% of males with Cushing’s disease, p=0.015).  </w:t>
-      </w:r>
-      <w:r>
-        <w:t>Among participants with Cushing’s disease, Asian (6</w:t>
-      </w:r>
-      <w:r>
-        <w:t xml:space="preserve"> out of </w:t>
-      </w:r>
-      <w:r>
-        <w:t xml:space="preserve">10) and Hispanic or Latino </w:t>
-      </w:r>
-      <w:r>
-        <w:t>(6</w:t>
-      </w:r>
-      <w:r>
-        <w:t xml:space="preserve"> out of </w:t>
-      </w:r>
-      <w:r>
-        <w:t xml:space="preserve">8) </w:t>
-      </w:r>
-      <w:r>
-        <w:t>participants were more likely have a BMI under 30 kg/m</w:t>
-      </w:r>
-      <w:r>
-        <w:rPr>
-          <w:vertAlign w:val="superscript"/>
-        </w:rPr>
-        <w:t xml:space="preserve">2 </w:t>
-      </w:r>
-      <w:r>
-        <w:t xml:space="preserve">compared to </w:t>
-      </w:r>
-      <w:r>
-        <w:t xml:space="preserve">the overall average </w:t>
-      </w:r>
-      <w:r>
-        <w:t>(</w:t>
-      </w:r>
-      <w:r>
-        <w:t>36%</w:t>
-      </w:r>
-      <w:r>
-        <w:t>, p=0.027 and 0.176 respectively via Fisher’s exact test</w:t>
-      </w:r>
-      <w:r>
-        <w:t>s</w:t>
-      </w:r>
-      <w:r>
-        <w:t xml:space="preserve">).  </w:t>
-      </w:r>
-      <w:r>
-        <w:t>The</w:t>
-      </w:r>
-      <w:r>
-        <w:t xml:space="preserve"> average age of </w:t>
-      </w:r>
-      <w:r>
-        <w:t xml:space="preserve">participants with </w:t>
-      </w:r>
-      <w:r>
-        <w:t>Cushing’s</w:t>
-      </w:r>
-      <w:r>
-        <w:t xml:space="preserve"> disease</w:t>
-      </w:r>
-      <w:r>
-        <w:t xml:space="preserve"> with or without obesity was similar</w:t>
-      </w:r>
-      <w:r>
-        <w:t xml:space="preserve"> after stratification</w:t>
-      </w:r>
-      <w:r>
-        <w:t>.</w:t>
-      </w:r>
-      <w:r>
-        <w:t xml:space="preserve">  Overall</w:t>
-      </w:r>
-      <w:r>
-        <w:t>,</w:t>
-      </w:r>
-      <w:r>
-        <w:t xml:space="preserve"> the subgroup of patients with obesity and Cushing’s disease tended to be disproportionately female and White, but similar in age.</w:t>
-      </w:r>
-    </w:p>
-    <w:p>
-      <w:pPr>
-        <w:pStyle w:val="NormalWeb"/>
-        <w:rPr>
-          <w:rStyle w:val="Heading2Char"/>
-        </w:rPr>
-      </w:pPr>
-      <w:r>
-        <w:rPr>
-          <w:rStyle w:val="Heading2Char"/>
-        </w:rPr>
-        <w:t>Modification of Cushing’s disease-related traits by obesity status</w:t>
-      </w:r>
-    </w:p>
-    <w:p>
-      <w:r>
-        <w:t>To identify how obesity alters metabolic outcomes related to Cushing’s disease, we evaluated the effects of Cushing’s disease on several key metabolic variables including glycem</w:t>
-      </w:r>
-      <w:r>
-        <w:t>i</w:t>
-      </w:r>
-      <w:r>
-        <w:t xml:space="preserve">a (fasting glucose and </w:t>
-      </w:r>
-      <w:r>
-        <w:t xml:space="preserve">for a smaller number of participants, </w:t>
-      </w:r>
-      <w:r>
-        <w:t>HbA1c), liver enzymes, and blood pressure (Figure 2 and Table 3).  As described below we noted substantial effect modification by obesity for liver enzymes and blood pressure (Table 3B).</w:t>
-      </w:r>
-    </w:p>
-    <w:p>
-      <w:pPr>
-        <w:pStyle w:val="Heading3"/>
-      </w:pPr>
-      <w:r>
-        <w:t>Dysglycemia</w:t>
-      </w:r>
-    </w:p>
-    <w:p>
-      <w:r>
-        <w:t>The</w:t>
-      </w:r>
-      <w:r>
-        <w:t xml:space="preserve"> first metabolic variable of interest was the fasting glucose levels of our obese and non-obese populations. As shown in </w:t>
-      </w:r>
-      <w:r>
-        <w:t xml:space="preserve">Figure 2 and </w:t>
-      </w:r>
-      <w:r>
-        <w:t>Table 3</w:t>
-      </w:r>
-      <w:r>
-        <w:t>A</w:t>
-      </w:r>
-      <w:r>
-        <w:t>, we observed a</w:t>
-      </w:r>
-      <w:r>
-        <w:t xml:space="preserve"> significant </w:t>
-      </w:r>
-      <w:r>
-        <w:t xml:space="preserve">increase in </w:t>
-      </w:r>
-      <w:r>
-        <w:t xml:space="preserve">fasting </w:t>
-      </w:r>
-      <w:r>
-        <w:t xml:space="preserve">blood glucose levels </w:t>
-      </w:r>
-      <w:r>
-        <w:t xml:space="preserve">among </w:t>
-      </w:r>
-      <w:r>
-        <w:t>participants</w:t>
-      </w:r>
-      <w:r>
-        <w:t xml:space="preserve"> with Cushing’s disease, regardless of obesity status</w:t>
-      </w:r>
-      <w:r>
-        <w:t xml:space="preserve"> (p</w:t>
-      </w:r>
-      <w:r>
-        <w:t>&lt;0.01</w:t>
-      </w:r>
-      <w:r>
-        <w:t xml:space="preserve"> for both groups).</w:t>
-      </w:r>
-      <w:r>
-        <w:t xml:space="preserve"> The </w:t>
-      </w:r>
-      <w:r>
-        <w:t xml:space="preserve">patients with obesity </w:t>
-      </w:r>
-      <w:r>
-        <w:t xml:space="preserve">population had a slightly larger increase (26.9 vs. </w:t>
-      </w:r>
-      <w:r>
-        <w:t>24.6</w:t>
-      </w:r>
-      <w:r>
-        <w:t xml:space="preserve"> mg/dL</w:t>
-      </w:r>
-      <w:r>
-        <w:t xml:space="preserve">) than </w:t>
-      </w:r>
-      <w:r>
-        <w:t>those with a BMI under 30 kg/m</w:t>
-      </w:r>
-      <w:r>
-        <w:rPr>
-          <w:vertAlign w:val="superscript"/>
-        </w:rPr>
-        <w:t>2</w:t>
-      </w:r>
-      <w:r>
-        <w:t>, but this was not a large enough difference to provide any significant evidence of an effect modification for obesity</w:t>
-      </w:r>
-      <w:r>
-        <w:t xml:space="preserve"> (p=0.51; Table 3B)</w:t>
-      </w:r>
-      <w:r>
-        <w:t xml:space="preserve">. </w:t>
-      </w:r>
-      <w:r>
-        <w:t>Similarly</w:t>
-      </w:r>
-      <w:r>
-        <w:t>,</w:t>
-      </w:r>
-      <w:r>
-        <w:t xml:space="preserve"> in Table 3</w:t>
-      </w:r>
-      <w:r>
-        <w:t>A</w:t>
-      </w:r>
-      <w:r>
-        <w:t xml:space="preserve"> </w:t>
-      </w:r>
-      <w:r>
-        <w:t>among the small number of patients with</w:t>
-      </w:r>
-      <w:r>
-        <w:t xml:space="preserve"> HbA1c </w:t>
-      </w:r>
-      <w:r>
-        <w:t>values, there was</w:t>
-      </w:r>
-      <w:r>
-        <w:t xml:space="preserve"> a</w:t>
-      </w:r>
-      <w:r>
-        <w:t xml:space="preserve">n </w:t>
-      </w:r>
-      <w:r>
-        <w:t xml:space="preserve">insignificant increase in HbA1c levels </w:t>
-      </w:r>
-      <w:r>
-        <w:t>in</w:t>
-      </w:r>
-      <w:r>
-        <w:t xml:space="preserve"> the non-obese</w:t>
-      </w:r>
-      <w:r>
-        <w:t xml:space="preserve"> patients</w:t>
-      </w:r>
-      <w:r>
-        <w:t xml:space="preserve"> (</w:t>
-      </w:r>
-      <w:r>
-        <w:t xml:space="preserve">0.91%; </w:t>
-      </w:r>
-      <w:r>
-        <w:t xml:space="preserve">p=0.056). However, there was evidence of a significant increase in HbA1c </w:t>
-      </w:r>
-      <w:r>
-        <w:lastRenderedPageBreak/>
-        <w:t xml:space="preserve">levels </w:t>
-      </w:r>
-      <w:r>
-        <w:t xml:space="preserve">in patients with obesity </w:t>
-      </w:r>
-      <w:r>
-        <w:t>(</w:t>
-      </w:r>
-      <w:r>
-        <w:t xml:space="preserve">1.38% </w:t>
-      </w:r>
-      <w:r>
-        <w:t>p</w:t>
-      </w:r>
-      <w:r>
-        <w:t>&lt;0.01</w:t>
-      </w:r>
-      <w:r>
-        <w:t xml:space="preserve">). </w:t>
-      </w:r>
-      <w:r>
-        <w:t xml:space="preserve">  Again</w:t>
-      </w:r>
-      <w:r>
-        <w:t>.</w:t>
-      </w:r>
-      <w:r>
-        <w:t xml:space="preserve"> there was no evidence of effect modification by obesity (p=0.41)</w:t>
-      </w:r>
-      <w:r>
-        <w:t>.  This suggests that blood glucose increases with Cushing’s disease are largely additive.</w:t>
-      </w:r>
-    </w:p>
-    <w:p>
-      <w:pPr>
-        <w:pStyle w:val="Heading3"/>
-      </w:pPr>
-      <w:r>
-        <w:t>MASLD and liver enzymes</w:t>
-      </w:r>
-    </w:p>
-    <w:p>
-      <w:r>
-        <w:t xml:space="preserve">To </w:t>
-      </w:r>
-      <w:r>
-        <w:t>assess</w:t>
-      </w:r>
-      <w:r>
-        <w:t xml:space="preserve"> </w:t>
-      </w:r>
-      <w:r>
-        <w:t>MASLD</w:t>
-      </w:r>
-      <w:r>
-        <w:t xml:space="preserve"> we looked at ALT </w:t>
-      </w:r>
-      <w:r>
-        <w:t>and AST levels as indicators of liver damage</w:t>
-      </w:r>
-      <w:r>
-        <w:t xml:space="preserve"> (Figure 2 and Table 3A)</w:t>
-      </w:r>
-      <w:r>
-        <w:t xml:space="preserve">. In both our obese, and non-obese populations, we saw an increase in ALT </w:t>
-      </w:r>
-      <w:r>
-        <w:t>and AST</w:t>
-      </w:r>
-      <w:r>
-        <w:t xml:space="preserve"> </w:t>
-      </w:r>
-      <w:r>
-        <w:t>levels regardless of Cushing’s disease status</w:t>
-      </w:r>
-      <w:r>
-        <w:t xml:space="preserve"> </w:t>
-      </w:r>
-      <w:r>
-        <w:t>(p</w:t>
-      </w:r>
-      <w:r>
-        <w:t>&lt;0.0</w:t>
-      </w:r>
-      <w:r>
-        <w:t>1 for both groups</w:t>
-      </w:r>
-      <w:r>
-        <w:t xml:space="preserve">). </w:t>
-      </w:r>
-      <w:r>
-        <w:t>In this case, the</w:t>
-      </w:r>
-      <w:r>
-        <w:t xml:space="preserve"> increase </w:t>
-      </w:r>
-      <w:r>
-        <w:t xml:space="preserve">due to Cushing’s disease was much greater in the patients with obesity </w:t>
-      </w:r>
-      <w:r>
-        <w:t>(</w:t>
-      </w:r>
-      <w:r>
-        <w:t>73.4 vs 35.1 mg/dL, p</w:t>
-      </w:r>
-      <w:r>
-        <w:rPr>
-          <w:vertAlign w:val="subscript"/>
-        </w:rPr>
-        <w:t>interaction</w:t>
-      </w:r>
-      <w:r>
-        <w:t>&lt;0.01</w:t>
-      </w:r>
-      <w:r>
-        <w:t>).</w:t>
-      </w:r>
-      <w:r>
-        <w:t xml:space="preserve">  This was also true for AST levels (increase by 56.3 mg/dL in patients with obesity and 16.9 for patients without obesity,</w:t>
-      </w:r>
-      <w:r>
-        <w:t xml:space="preserve"> </w:t>
-      </w:r>
-      <w:r>
-        <w:t>p</w:t>
-      </w:r>
-      <w:r>
-        <w:rPr>
-          <w:vertAlign w:val="subscript"/>
-        </w:rPr>
-        <w:t>interaction</w:t>
-      </w:r>
-      <w:r>
-        <w:t>=0.034).  These data support the hypothesis</w:t>
-      </w:r>
-      <w:r>
-        <w:t xml:space="preserve"> that obesity </w:t>
-      </w:r>
-      <w:r>
-        <w:t>enhances Cushing’s associated liver damage</w:t>
-      </w:r>
-      <w:r>
-        <w:t>.</w:t>
-      </w:r>
-    </w:p>
-    <w:p>
-      <w:pPr>
-        <w:pStyle w:val="Heading3"/>
-      </w:pPr>
-      <w:r>
-        <w:t>Blood Pressure</w:t>
-      </w:r>
-    </w:p>
-    <w:p>
-      <w:r>
-        <w:t xml:space="preserve">We </w:t>
-      </w:r>
-      <w:r>
-        <w:t>evaluated</w:t>
-      </w:r>
-      <w:r>
-        <w:t xml:space="preserve"> blood pressure readings as systolic, diastolic and mean arterial pressure</w:t>
-      </w:r>
-      <w:r>
-        <w:t>s</w:t>
-      </w:r>
-      <w:r>
-        <w:t xml:space="preserve"> </w:t>
-      </w:r>
-      <w:r>
-        <w:t xml:space="preserve"> (</w:t>
-      </w:r>
-      <w:r>
-        <w:t xml:space="preserve">Figure 2 and </w:t>
-      </w:r>
-      <w:r>
-        <w:t xml:space="preserve">Table 3A). </w:t>
-      </w:r>
-      <w:r>
-        <w:t>We</w:t>
-      </w:r>
-      <w:r>
-        <w:t xml:space="preserve"> </w:t>
-      </w:r>
-      <w:r>
-        <w:t>observed</w:t>
-      </w:r>
-      <w:r>
-        <w:t xml:space="preserve"> significant increase</w:t>
-      </w:r>
-      <w:r>
-        <w:t>s for all measures</w:t>
-      </w:r>
-      <w:r>
-        <w:t xml:space="preserve"> in </w:t>
-      </w:r>
-      <w:r>
-        <w:t>patients without obesity</w:t>
-      </w:r>
-      <w:r>
-        <w:t xml:space="preserve"> (p=</w:t>
-      </w:r>
-      <w:r>
-        <w:t>&lt;0.01</w:t>
-      </w:r>
-      <w:r>
-        <w:t xml:space="preserve">). We did not, however, </w:t>
-      </w:r>
-      <w:r>
-        <w:t>observe</w:t>
-      </w:r>
-      <w:r>
-        <w:t xml:space="preserve"> this same significant </w:t>
-      </w:r>
-      <w:r>
-        <w:t xml:space="preserve">magnitude of </w:t>
-      </w:r>
-      <w:r>
-        <w:t>increase</w:t>
-      </w:r>
-      <w:r>
-        <w:t>s in blood pressure</w:t>
-      </w:r>
-      <w:r>
-        <w:t xml:space="preserve"> in </w:t>
-      </w:r>
-      <w:r>
-        <w:t>Cushing’s patients with obesity</w:t>
-      </w:r>
-      <w:r>
-        <w:t xml:space="preserve"> population</w:t>
-      </w:r>
-      <w:r>
-        <w:t xml:space="preserve">.  For example, in terms of systolic blood pressure, Cushing’s disease was associated with an increase of 11.97 mm Hg in patients without obesity but 3.08 mm Hg.  This attenuation of the effect of Cushing’s disease with obesity was significant </w:t>
-      </w:r>
-      <w:r>
-        <w:t>for mean, systolic, and diastolic bood pressure (p</w:t>
-      </w:r>
-      <w:r>
-        <w:rPr>
-          <w:vertAlign w:val="subscript"/>
-        </w:rPr>
-        <w:t>interaction</w:t>
-      </w:r>
-      <w:r>
-        <w:t xml:space="preserve">&lt;0.01 for each).  </w:t>
-      </w:r>
-      <w:r>
-        <w:t xml:space="preserve">This </w:t>
-      </w:r>
-      <w:r>
-        <w:t>suggests that obesity may have a protective effect on Cushing’s induced hypertension.</w:t>
-      </w:r>
-    </w:p>
-    <w:p>
-      <w:pPr>
-        <w:pStyle w:val="NormalWeb"/>
-        <w:rPr>
-          <w:rStyle w:val="Heading2Char"/>
-        </w:rPr>
-      </w:pPr>
-      <w:r>
-        <w:rPr>
-          <w:rStyle w:val="Heading2Char"/>
-        </w:rPr>
-        <w:t>Sensitivity and secondary analyses</w:t>
-      </w:r>
-    </w:p>
-    <w:p>
-      <w:r>
-        <w:t>We performed a variety of sensitivity analyses to test the assumptions used in evaluating these effects, summarized in Table 4.</w:t>
-      </w:r>
-      <w:r>
-        <w:t xml:space="preserve">  By and large, these analyses show that the effects described above are robust to different analytical methods.  For example, the synergistic effects of obesity and Cushing’s disease on liver enzymes was similar and significant across different demographic adjustments.  We also found that propensity matching cases for BMI, or including BMI as a covariate did not attenuate these effects.  Within subgroups, we did notice some suggestive trends.  For example, the synergistic (and antagonistic) effects of obesity increased as obesity increased.  For example, the interaction between Class I obesity and Cushing’s disease on ALT levels was -12.8 mg/dL but increased to 30.3 for Class II obesity and 80.7 for class III obesity.  Since this analysis already accounted for a main effect of obesity status, this suggest that as obesity increases, the negative effect of Cushing’s disease on liver enzymes increased, while the protective effect on blood </w:t>
-      </w:r>
-      <w:r>
-        <w:lastRenderedPageBreak/>
-        <w:t xml:space="preserve">pressure was also trended to increase in magnitude.  Stratifying by gender, we noticed that female patients generally had worsened but more variable effect estimates.  In the case of AST, the interaction between obesity and Cushings’s was estimated at 41.9 [-3.7-87.5] mg/dL but for males it was 25.8 [11.4-40.1] mg/dL.  </w:t>
-      </w:r>
-    </w:p>
-    <w:p>
-      <w:pPr>
-        <w:pStyle w:val="Heading1"/>
-      </w:pPr>
-      <w:r>
-        <w:t>Discussion</w:t>
-      </w:r>
-    </w:p>
-    <w:p>
-      <w:pPr>
-        <w:pStyle w:val="ListParagraph"/>
-      </w:pPr>
+        <w:t xml:space="preserve">regarding blood pressure in Cushing’s disease patients.  One possibility is that patients with obesity and Cushing’s disease are already medicated to control their hypertension levels.  </w:t>
+      </w:r>
+      <w:r>
+        <w:t xml:space="preserve">Another possibility is there is already a ceiling effect as counter-regulatory mechanisms for blood pressure are already maximally engaged.  </w:t>
+      </w:r>
     </w:p>
     <w:p>
       <w:pPr>
         <w:pStyle w:val="ListParagraph"/>
         <w:ind w:left="0"/>
       </w:pPr>
-      <w:r>
-        <w:t>This analysis of the effects of obesity and Cushing’s disease demonstrate a complex set of interactions between the presence of obesity on Cushing’s disease- and obesity-related pathophysiology.  We report that liver enzymes are enhanced relative to what we would predict from the additive effects of Cushing’s disease and obesity together, while in the case of blood pressure, obesity appears to reduce the effects of Cushing’s disease.  Glucose homeostasis appears to be explained well by an additive model</w:t>
-      </w:r>
-      <w:r>
-        <w:t xml:space="preserve"> in our primary analysis.</w:t>
-      </w:r>
     </w:p>
     <w:p>
       <w:pPr>
         <w:pStyle w:val="ListParagraph"/>
         <w:ind w:left="0"/>
       </w:pPr>
+      <w:r>
+        <w:t>We also report several interesting gender differences in how obesity and Cushing’s disease interact.  We find, as others have before, that Cushing’s disease affects women at a higher rate.  We also find that among the pool of Cushing’s disease patients with obesity, that is also more likely to be female.  Women in this group, on average, tend to have worsened and more heterogeneous responses to these dual co-morbidities than males</w:t>
+      </w:r>
+      <w:r>
+        <w:t xml:space="preserve"> (Table 4)</w:t>
+      </w:r>
+      <w:r>
+        <w:t>.</w:t>
+      </w:r>
+      <w:r>
+        <w:t xml:space="preserve">  In our view, this warrants more detailed studies on sex differences, including the modifying effect of sex hormones on glucocorticoid signaling in the context of obesity.</w:t>
+      </w:r>
     </w:p>
     <w:p>
       <w:pPr>
         <w:pStyle w:val="ListParagraph"/>
         <w:ind w:left="0"/>
       </w:pPr>
-      <w:r>
-        <w:t xml:space="preserve">These data are in part consistent with experimental animal studies in our group where pre-existing obesity aggravated liver steatosis and muscle function </w:t>
-      </w:r>
-      <w:commentRangeStart w:id="2"/>
-      <w:r>
-        <w:t xml:space="preserve">loss </w:t>
-      </w:r>
-      <w:commentRangeEnd w:id="2"/>
-      <w:r>
-        <w:rPr>
-          <w:rStyle w:val="CommentReference"/>
-          <w:sz w:val="24"/>
-          <w:szCs w:val="24"/>
-        </w:rPr>
-        <w:commentReference w:id="2"/>
-      </w:r>
-      <w:r>
-        <w:t xml:space="preserve">.  These data are also consistent with our previous report demonstrating that obesity modifies Cushing’s-induced transcriptional changes in adipose </w:t>
-      </w:r>
-      <w:commentRangeStart w:id="3"/>
-      <w:r>
-        <w:t xml:space="preserve">tissue </w:t>
-      </w:r>
-      <w:commentRangeEnd w:id="3"/>
-      <w:r>
-        <w:rPr>
-          <w:rStyle w:val="CommentReference"/>
-          <w:sz w:val="24"/>
-          <w:szCs w:val="24"/>
-        </w:rPr>
-        <w:commentReference w:id="3"/>
-      </w:r>
-      <w:r>
-        <w:t>.  We remain interested in Cushing’s induced bone and muscle loss, as well as the effect of obesity and Cushing’s disease on blood lipids and kidney function, but did not have sufficient laboratory results in these participants to make reliable conclusions.</w:t>
-      </w:r>
     </w:p>
     <w:p>
       <w:pPr>
         <w:pStyle w:val="ListParagraph"/>
         <w:ind w:left="0"/>
       </w:pPr>
+      <w:r>
+        <w:t xml:space="preserve">There are several strengths of this study, including a large number of patients identified for a rare disease, coupled with standardized laboratory results and comprehensive medical records.  The ability to match patients by age and demographic factors is also a strength of this analysis, as is the robustness of the analysis as demonstrated by our sensitivity analyses.  In our primary analysis patients with Cushing’s disease and obesity tended to have a higher BMI than the non-Cushing’s patients with obesity (Table 2), raising a concern that perhaps the augmentation in ALT/AST was just due to patients being at a higher BMI.  While this is a concern, we report that adjusting for BMI within group, and propensity matching for BMI did not modify the interaction effect estimates, which remained significant and approximately the same magnitude (Table 4), limiting that concern.  </w:t>
+      </w:r>
     </w:p>
     <w:p>
       <w:pPr>
         <w:pStyle w:val="ListParagraph"/>
         <w:ind w:left="0"/>
       </w:pPr>
-      <w:r>
-        <w:t xml:space="preserve">Pathophysiologically, the induction of adipocyte lipolysis by cortisol’s direct effects on adipocytes, as well as its indirect effects on insulin signaling in adipocytes may explain increased liver disease in patients with obesity and Cushing’s disease.  This could be due to a confluence of increased triglyceride stores available for release, increased signaling, and decreased hepatic triglyceride export due to hepatic insulin resistance.  It is less clear to us why blood pressure is not augmented.  We report that both obesity and Cushing’s disease increase systolic, diastolic and mean arterial pressure, but when both are combined the effect is strongly attenuated (Figure 2 and Table 3).  Obesity is a well-known risk factor for </w:t>
-      </w:r>
-      <w:commentRangeStart w:id="4"/>
-      <w:r>
-        <w:t>hypertension</w:t>
-      </w:r>
-      <w:commentRangeEnd w:id="4"/>
-      <w:r>
-        <w:rPr>
-          <w:rStyle w:val="CommentReference"/>
-          <w:sz w:val="24"/>
-          <w:szCs w:val="24"/>
-        </w:rPr>
-        <w:commentReference w:id="4"/>
-      </w:r>
-      <w:r>
-        <w:t xml:space="preserve"> .  Prior studies have shown </w:t>
-      </w:r>
-      <w:commentRangeStart w:id="5"/>
-      <w:r>
-        <w:t xml:space="preserve">XXXX </w:t>
-      </w:r>
-      <w:commentRangeEnd w:id="5"/>
-      <w:r>
-        <w:rPr>
-          <w:rStyle w:val="CommentReference"/>
-          <w:sz w:val="24"/>
-          <w:szCs w:val="24"/>
-        </w:rPr>
-        <w:commentReference w:id="5"/>
-      </w:r>
-      <w:r>
-        <w:t xml:space="preserve">regarding blood pressure in Cushing’s disease patients.  One possibility is that patients with obesity and Cushing’s disease are already medicated to control their hypertension </w:t>
-      </w:r>
-      <w:commentRangeStart w:id="6"/>
-      <w:r>
-        <w:t>levels</w:t>
-      </w:r>
-      <w:commentRangeEnd w:id="6"/>
-      <w:r>
-        <w:rPr>
-          <w:rStyle w:val="CommentReference"/>
-          <w:sz w:val="24"/>
-          <w:szCs w:val="24"/>
-        </w:rPr>
-        <w:commentReference w:id="6"/>
-      </w:r>
-      <w:r>
-        <w:t xml:space="preserve">.  </w:t>
-      </w:r>
     </w:p>
     <w:p>
       <w:pPr>
         <w:pStyle w:val="ListParagraph"/>
         <w:ind w:left="0"/>
       </w:pPr>
+      <w:r>
+        <w:t xml:space="preserve">There are however several other limitations to this work.  A large number of patients were diagnosed with Cushing’s </w:t>
+      </w:r>
+      <w:r>
+        <w:t xml:space="preserve">disease </w:t>
+      </w:r>
+      <w:r>
+        <w:t>but their procedure date was not indicated.  Second, this patient cohort was relatively homogeneous, consisting of mostly White patients, limiting our ability to evaluate race- or ancestry-specific differences.  Several patients did not have laboratory results in our window, so we were underpowered for some analyses (</w:t>
+      </w:r>
+      <w:r>
+        <w:rPr>
+          <w:i/>
+          <w:iCs/>
+        </w:rPr>
+        <w:t>i.e.</w:t>
+      </w:r>
+      <w:r>
+        <w:t xml:space="preserve"> HbA1c) and unable to perform others (triglyceride levels, LDL levels, bone density) that were of interest.  In most cases, only one laboratory value was available prior to treatment.  The long-term consequences of Cushing’s disease, with or without obesity are also highly important as patients may live decades after their treatment and we look forward to future studies to investigate these effects.</w:t>
+      </w:r>
     </w:p>
     <w:p>
       <w:pPr>
         <w:pStyle w:val="ListParagraph"/>
         <w:ind w:left="0"/>
       </w:pPr>
-      <w:r>
-        <w:t xml:space="preserve">We also report several interesting gender differences in how obesity and Cushing’s disease interact.  We find, as others have before, that Cushing’s disease affects women at a higher </w:t>
-      </w:r>
-      <w:r>
-        <w:lastRenderedPageBreak/>
-        <w:t>rate.  We also find that among the pool of Cushing’s disease patients with obesity, that is also more likely to be female.  Women in this group, on average, tend to have worsened and more heterogeneous responses to these dual co-morbidities than males</w:t>
-      </w:r>
-      <w:r>
-        <w:t xml:space="preserve"> (Table 4)</w:t>
-      </w:r>
-      <w:r>
-        <w:t>.</w:t>
-      </w:r>
-      <w:r>
-        <w:t xml:space="preserve">  In our view, this warrants more detailed studies on sex differences, including the modifying effect of sex hormones on glucocorticoid signaling in the context of obesity.</w:t>
-      </w:r>
     </w:p>
     <w:p>
       <w:pPr>
         <w:pStyle w:val="ListParagraph"/>
         <w:ind w:left="0"/>
       </w:pPr>
-    </w:p>
-    <w:p>
-      <w:pPr>
-        <w:pStyle w:val="ListParagraph"/>
-        <w:ind w:left="0"/>
-      </w:pPr>
-      <w:r>
-        <w:t xml:space="preserve">There are several strengths of this study, including a large number of patients identified for a rare disease, coupled with standardized laboratory results and comprehensive medical records.  The ability to match patients by age and demographic factors is also a strength of this analysis, as is the robustness of the analysis as demonstrated by our sensitivity analyses.  In our primary analysis patients with Cushing’s disease and obesity tended to have a higher BMI than the non-Cushing’s patients with obesity (Table 2), raising a concern that perhaps the augmentation in ALT/AST was just due to patients being at a higher BMI.  While this is a concern, we report that adjusting for BMI within group, and propensity matching for BMI did not modify the interaction effect estimates, which remained significant and approximately the same magnitude (Table 4), limiting that concern.  </w:t>
-      </w:r>
-    </w:p>
-    <w:p>
-      <w:pPr>
-        <w:pStyle w:val="ListParagraph"/>
-        <w:ind w:left="0"/>
-      </w:pPr>
-    </w:p>
-    <w:p>
-      <w:pPr>
-        <w:pStyle w:val="ListParagraph"/>
-        <w:ind w:left="0"/>
-      </w:pPr>
-      <w:r>
-        <w:t>There are however several other limitations to this work.  A large number of patients were diagnosed with Cushing’s but their procedure date was not indicated.  Second, this patient cohort was relatively homogeneous, consisting of mostly White patients, limiting our ability to evaluate race- or ancestry-specific differences.  Several patients did not have laboratory results in our window, so we were underpowered for some analyses (</w:t>
-      </w:r>
-      <w:r>
-        <w:rPr>
+      <w:r>
+        <w:t xml:space="preserve">Cushing’s disease is unique in that it both causes obesity and causes several obesity-related pathophysiological comorbidities including MASLD, insulin resistance and hypertension.  </w:t>
+      </w:r>
+      <w:r>
+        <w:t>Our approach was geared towards separating the obesity- and Cushing</w:t>
+      </w:r>
+      <w:r>
+        <w:t>’</w:t>
+      </w:r>
+      <w:r>
+        <w:t xml:space="preserve">s dependent impacts on these co-morbidities and revealed a surprising and complex picture of integrated pathophysiology.  This study provides novel data that obesity and Cushing’s disease interact, suggesting that obesity and Cushing’s disease may result in worsened liver damage, but that the augmented effects on hypertension are lower than expected.  </w:t>
+      </w:r>
+      <w:r>
+        <w:lastRenderedPageBreak/>
+        <w:t>These results may be valuable for the accurate monitoring and treatment of the majority of Cushing’s patients who also have elevated adiposity.</w:t>
+      </w:r>
+    </w:p>
+    <w:p>
+      <w:pPr>
+        <w:pStyle w:val="Heading1"/>
+      </w:pPr>
+      <w:r>
+        <w:t>Acknowledgements</w:t>
+      </w:r>
+      <w:r>
+        <w:t xml:space="preserve"> and Funding</w:t>
+      </w:r>
+    </w:p>
+    <w:p>
+      <w:r>
+        <w:t xml:space="preserve">This work was supported by a pilot and feasibility grant from the Michigan Diabetes Research Center (NIH </w:t>
+      </w:r>
+      <w:r>
+        <w:t>P30DK020572</w:t>
+      </w:r>
+      <w:r>
+        <w:t>) and</w:t>
+      </w:r>
+      <w:r>
+        <w:t xml:space="preserve"> by consulting </w:t>
+      </w:r>
+      <w:r>
+        <w:t>provided by</w:t>
+      </w:r>
+      <w:r>
+        <w:t xml:space="preserve"> the University of Michigan Adipose Tissue Core, part of the Michigan Nutrition and Obesity Research Center (NIH </w:t>
+      </w:r>
+      <w:r>
+        <w:t>P30DK020572</w:t>
+      </w:r>
+      <w:r>
+        <w:t>).  This work was also supported by AI and Digital Health Innovation</w:t>
+      </w:r>
+      <w:r>
+        <w:t xml:space="preserve"> at the University of Michigan, and the University of Michigan Medical School Data Office for Clinical and Translational Research for providing data storage, management, processing, and distribution services.</w:t>
+      </w:r>
+      <w:r>
+        <w:t xml:space="preserve">  Finally</w:t>
+      </w:r>
+      <w:r>
+        <w:t>,</w:t>
+      </w:r>
+      <w:r>
+        <w:t xml:space="preserve"> we would like to thank the other members of the Bridges and Hochberg laboratories for valuable discussions regarding these analyses and their interpretation.</w:t>
+      </w:r>
+    </w:p>
+    <w:p>
+      <w:pPr>
+        <w:pStyle w:val="Heading1"/>
+      </w:pPr>
+      <w:r>
+        <w:t>References</w:t>
+      </w:r>
+    </w:p>
+    <w:p>
+      <w:pPr>
+        <w:pStyle w:val="Bibliography"/>
+        <w:rPr>
+          <w:rFonts w:ascii="Aptos"/>
+        </w:rPr>
+      </w:pPr>
+      <w:r>
+        <w:fldChar w:fldCharType="begin"/>
+      </w:r>
+      <w:r>
+        <w:instrText xml:space="preserve"> ADDIN ZOTERO_BIBL {"uncited":[],"omitted":[],"custom":[]} CSL_BIBLIOGRAPHY </w:instrText>
+      </w:r>
+      <w:r>
+        <w:fldChar w:fldCharType="separate"/>
+      </w:r>
+      <w:r>
+        <w:rPr>
+          <w:rFonts w:ascii="Aptos"/>
+        </w:rPr>
+        <w:t xml:space="preserve">Alqeeq, B. F., Ayyad, M., Almadhoun, W. J., Aboabdo, M., Aldahdouh, M. S., Al-Tawil, M., &amp; Al-Ghazali, A. M. (2024). Sex-related differences in Cushing’s disease: A systematic review and meta-analysis. </w:t>
+      </w:r>
+      <w:r>
+        <w:rPr>
+          <w:rFonts w:ascii="Aptos"/>
           <w:i/>
           <w:iCs/>
         </w:rPr>
-        <w:t>i.e.</w:t>
-      </w:r>
-      <w:r>
-        <w:t xml:space="preserve"> HbA1c) and unable to perform others (triglyceride levels, LDL levels, bone density) that were of interest.  In most cases, only one laboratory value was available prior to treatment.  The long-term consequences of Cushing’s disease, with or without obesity are also highly important as patients may live decades after their treatment and we look forward to future studies to investigate these effects.</w:t>
-      </w:r>
-    </w:p>
-    <w:p>
-      <w:pPr>
-        <w:pStyle w:val="ListParagraph"/>
-        <w:ind w:left="0"/>
-      </w:pPr>
-    </w:p>
-    <w:p>
-      <w:pPr>
-        <w:pStyle w:val="ListParagraph"/>
-        <w:ind w:left="0"/>
-      </w:pPr>
-      <w:r>
-        <w:t xml:space="preserve">Cushing’s disease is unique in that it both causes obesity and causes several obesity-related pathophysiological comorbidities including MASLD, insulin resistance and hypertension.  </w:t>
-      </w:r>
-      <w:r>
-        <w:t>Our approach was geared towards separating the obesity- and Cushing</w:t>
-      </w:r>
-      <w:r>
-        <w:t>’</w:t>
-      </w:r>
-      <w:r>
-        <w:t>s dependent impacts on these co-morbidities and revealed a surprising and complex picture of integrated pathophysiology.  This study provides novel data that obesity and Cushing’s disease interact, suggesting that obesity and Cushing’s disease may result in worsened liver damage, but that the augmented effects on hypertension are lower than expected.  These results may be valuable for the accurate monitoring and treatment of the majority of Cushing’s patients who also have elevated adiposity.</w:t>
-      </w:r>
-    </w:p>
-    <w:p>
-      <w:pPr>
-        <w:pStyle w:val="Heading1"/>
-      </w:pPr>
-      <w:r>
-        <w:lastRenderedPageBreak/>
-        <w:t>Acknowledgements</w:t>
-      </w:r>
-      <w:r>
-        <w:t xml:space="preserve"> and Funding</w:t>
-      </w:r>
-    </w:p>
-    <w:p>
-      <w:r>
-        <w:t xml:space="preserve">This work was supported by a pilot and feasibility grant from the Michigan Diabetes Research Center (NIH </w:t>
-      </w:r>
-      <w:r>
-        <w:t>P30DK020572</w:t>
-      </w:r>
-      <w:r>
-        <w:t>) and</w:t>
-      </w:r>
-      <w:r>
-        <w:t xml:space="preserve"> by consulting </w:t>
-      </w:r>
-      <w:r>
-        <w:t>provided by</w:t>
-      </w:r>
-      <w:r>
-        <w:t xml:space="preserve"> the University of Michigan Adipose Tissue Core, part of the Michigan Nutrition and Obesity Research Center (NIH </w:t>
-      </w:r>
-      <w:r>
-        <w:t>P30DK020572</w:t>
-      </w:r>
-      <w:r>
-        <w:t>).  This work was also supported by AI and Digital Health Innovation</w:t>
-      </w:r>
-      <w:r>
-        <w:t xml:space="preserve"> at the University of Michigan, and the University of Michigan Medical School Data Office for Clinical and Translational Research for providing data storage, management, processing, and distribution services.</w:t>
-      </w:r>
-      <w:r>
-        <w:t xml:space="preserve">  Finally</w:t>
-      </w:r>
-      <w:r>
-        <w:t>,</w:t>
-      </w:r>
-      <w:r>
-        <w:t xml:space="preserve"> we would like to thank the other members of the Bridges and Hochberg laboratories for valuable discussions regarding these analyses and their interpretation.</w:t>
-      </w:r>
-    </w:p>
-    <w:p>
-      <w:pPr>
-        <w:pStyle w:val="Heading1"/>
-      </w:pPr>
-      <w:r>
-        <w:t>References</w:t>
-      </w:r>
-    </w:p>
-    <w:p>
-      <w:pPr>
-        <w:pStyle w:val="Bibliography"/>
-        <w:spacing w:line="240" w:lineRule="auto"/>
-        <w:rPr>
-          <w:rFonts w:ascii="Aptos"/>
-        </w:rPr>
-      </w:pPr>
-      <w:r>
-        <w:fldChar w:fldCharType="begin"/>
-      </w:r>
-      <w:r>
-        <w:instrText xml:space="preserve"> ADDIN ZOTERO_BIBL {"uncited":[],"omitted":[],"custom":[]} CSL_BIBLIOGRAPHY </w:instrText>
-      </w:r>
-      <w:r>
-        <w:fldChar w:fldCharType="separate"/>
-      </w:r>
-      <w:r>
-        <w:rPr>
-          <w:rFonts w:ascii="Aptos"/>
-        </w:rPr>
-        <w:t xml:space="preserve">Alqeeq, B. F., Ayyad, M., Almadhoun, W. J., Aboabdo, M., Aldahdouh, M. S., Al-Tawil, M., &amp; Al-Ghazali, A. M. (2024). Sex-related differences in Cushing’s disease: A systematic review and meta-analysis. </w:t>
+        <w:t>Annals of Saudi Medicine</w:t>
+      </w:r>
+      <w:r>
+        <w:rPr>
+          <w:rFonts w:ascii="Aptos"/>
+        </w:rPr>
+        <w:t xml:space="preserve">, </w:t>
       </w:r>
       <w:r>
         <w:rPr>
@@ -2362,13 +2456,27 @@
           <w:i/>
           <w:iCs/>
         </w:rPr>
-        <w:t>Annals of Saudi Medicine</w:t>
-      </w:r>
-      <w:r>
-        <w:rPr>
-          <w:rFonts w:ascii="Aptos"/>
-        </w:rPr>
-        <w:t xml:space="preserve">, </w:t>
+        <w:t>44</w:t>
+      </w:r>
+      <w:r>
+        <w:rPr>
+          <w:rFonts w:ascii="Aptos"/>
+        </w:rPr>
+        <w:t>(1), 55–65. https://doi.org/10.5144/0256-4947.2024.55</w:t>
+      </w:r>
+    </w:p>
+    <w:p>
+      <w:pPr>
+        <w:pStyle w:val="Bibliography"/>
+        <w:rPr>
+          <w:rFonts w:ascii="Aptos"/>
+        </w:rPr>
+      </w:pPr>
+      <w:r>
+        <w:rPr>
+          <w:rFonts w:ascii="Aptos"/>
+        </w:rPr>
+        <w:t xml:space="preserve">Braun, L. T., Riester, A., Oßwald-Kopp, A., Fazel, J., Rubinstein, G., Bidlingmaier, M., Beuschlein, F., &amp; Reincke, M. (2019). Toward a Diagnostic Score in Cushing’s Syndrome. </w:t>
       </w:r>
       <w:r>
         <w:rPr>
@@ -2376,28 +2484,13 @@
           <w:i/>
           <w:iCs/>
         </w:rPr>
-        <w:t>44</w:t>
-      </w:r>
-      <w:r>
-        <w:rPr>
-          <w:rFonts w:ascii="Aptos"/>
-        </w:rPr>
-        <w:t>(1), 55–65. https://doi.org/10.5144/0256-4947.2024.55</w:t>
-      </w:r>
-    </w:p>
-    <w:p>
-      <w:pPr>
-        <w:pStyle w:val="Bibliography"/>
-        <w:spacing w:line="240" w:lineRule="auto"/>
-        <w:rPr>
-          <w:rFonts w:ascii="Aptos"/>
-        </w:rPr>
-      </w:pPr>
-      <w:r>
-        <w:rPr>
-          <w:rFonts w:ascii="Aptos"/>
-        </w:rPr>
-        <w:t xml:space="preserve">Braun, L. T., Riester, A., Oßwald-Kopp, A., Fazel, J., Rubinstein, G., Bidlingmaier, M., Beuschlein, F., &amp; Reincke, M. (2019). Toward a Diagnostic Score in Cushing’s Syndrome. </w:t>
+        <w:t>Frontiers in Endocrinology</w:t>
+      </w:r>
+      <w:r>
+        <w:rPr>
+          <w:rFonts w:ascii="Aptos"/>
+        </w:rPr>
+        <w:t xml:space="preserve">, </w:t>
       </w:r>
       <w:r>
         <w:rPr>
@@ -2405,13 +2498,27 @@
           <w:i/>
           <w:iCs/>
         </w:rPr>
-        <w:t>Frontiers in Endocrinology</w:t>
-      </w:r>
-      <w:r>
-        <w:rPr>
-          <w:rFonts w:ascii="Aptos"/>
-        </w:rPr>
-        <w:t xml:space="preserve">, </w:t>
+        <w:t>10</w:t>
+      </w:r>
+      <w:r>
+        <w:rPr>
+          <w:rFonts w:ascii="Aptos"/>
+        </w:rPr>
+        <w:t>, 766. https://doi.org/10.3389/fendo.2019.00766</w:t>
+      </w:r>
+    </w:p>
+    <w:p>
+      <w:pPr>
+        <w:pStyle w:val="Bibliography"/>
+        <w:rPr>
+          <w:rFonts w:ascii="Aptos"/>
+        </w:rPr>
+      </w:pPr>
+      <w:r>
+        <w:rPr>
+          <w:rFonts w:ascii="Aptos"/>
+        </w:rPr>
+        <w:t xml:space="preserve">Broder, M. S., Neary, M. P., Chang, E., Cherepanov, D., &amp; Ludlam, W. H. (2015). Incidence of Cushing’s syndrome and Cushing’s disease in commercially-insured patients &lt;65 years old in the United States. </w:t>
       </w:r>
       <w:r>
         <w:rPr>
@@ -2419,28 +2526,13 @@
           <w:i/>
           <w:iCs/>
         </w:rPr>
-        <w:t>10</w:t>
-      </w:r>
-      <w:r>
-        <w:rPr>
-          <w:rFonts w:ascii="Aptos"/>
-        </w:rPr>
-        <w:t>, 766. https://doi.org/10.3389/fendo.2019.00766</w:t>
-      </w:r>
-    </w:p>
-    <w:p>
-      <w:pPr>
-        <w:pStyle w:val="Bibliography"/>
-        <w:spacing w:line="240" w:lineRule="auto"/>
-        <w:rPr>
-          <w:rFonts w:ascii="Aptos"/>
-        </w:rPr>
-      </w:pPr>
-      <w:r>
-        <w:rPr>
-          <w:rFonts w:ascii="Aptos"/>
-        </w:rPr>
-        <w:t xml:space="preserve">Broder, M. S., Neary, M. P., Chang, E., Cherepanov, D., &amp; Ludlam, W. H. (2015). Incidence of Cushing’s syndrome and Cushing’s disease in commercially-insured patients &lt;65 years old in the United States. </w:t>
+        <w:t>Pituitary</w:t>
+      </w:r>
+      <w:r>
+        <w:rPr>
+          <w:rFonts w:ascii="Aptos"/>
+        </w:rPr>
+        <w:t xml:space="preserve">, </w:t>
       </w:r>
       <w:r>
         <w:rPr>
@@ -2448,13 +2540,28 @@
           <w:i/>
           <w:iCs/>
         </w:rPr>
-        <w:t>Pituitary</w:t>
-      </w:r>
-      <w:r>
-        <w:rPr>
-          <w:rFonts w:ascii="Aptos"/>
-        </w:rPr>
-        <w:t xml:space="preserve">, </w:t>
+        <w:t>18</w:t>
+      </w:r>
+      <w:r>
+        <w:rPr>
+          <w:rFonts w:ascii="Aptos"/>
+        </w:rPr>
+        <w:t>(3), 283–289. https://doi.org/10.1007/s11102-014-0569-6</w:t>
+      </w:r>
+    </w:p>
+    <w:p>
+      <w:pPr>
+        <w:pStyle w:val="Bibliography"/>
+        <w:rPr>
+          <w:rFonts w:ascii="Aptos"/>
+        </w:rPr>
+      </w:pPr>
+      <w:r>
+        <w:rPr>
+          <w:rFonts w:ascii="Aptos"/>
+        </w:rPr>
+        <w:lastRenderedPageBreak/>
+        <w:t xml:space="preserve">DeFronzo, R. A., &amp; Auchus, R. J. (2025). Cushing Syndrome, Hypercortisolism, and Glucose Homeostasis: A Review. </w:t>
       </w:r>
       <w:r>
         <w:rPr>
@@ -2462,28 +2569,13 @@
           <w:i/>
           <w:iCs/>
         </w:rPr>
-        <w:t>18</w:t>
-      </w:r>
-      <w:r>
-        <w:rPr>
-          <w:rFonts w:ascii="Aptos"/>
-        </w:rPr>
-        <w:t>(3), 283–289. https://doi.org/10.1007/s11102-014-0569-6</w:t>
-      </w:r>
-    </w:p>
-    <w:p>
-      <w:pPr>
-        <w:pStyle w:val="Bibliography"/>
-        <w:spacing w:line="240" w:lineRule="auto"/>
-        <w:rPr>
-          <w:rFonts w:ascii="Aptos"/>
-        </w:rPr>
-      </w:pPr>
-      <w:r>
-        <w:rPr>
-          <w:rFonts w:ascii="Aptos"/>
-        </w:rPr>
-        <w:t xml:space="preserve">DeFronzo, R. A., &amp; Auchus, R. J. (2025). Cushing Syndrome, Hypercortisolism, and Glucose Homeostasis: A Review. </w:t>
+        <w:t>Diabetes</w:t>
+      </w:r>
+      <w:r>
+        <w:rPr>
+          <w:rFonts w:ascii="Aptos"/>
+        </w:rPr>
+        <w:t xml:space="preserve">, </w:t>
       </w:r>
       <w:r>
         <w:rPr>
@@ -2491,13 +2583,27 @@
           <w:i/>
           <w:iCs/>
         </w:rPr>
-        <w:t>Diabetes</w:t>
-      </w:r>
-      <w:r>
-        <w:rPr>
-          <w:rFonts w:ascii="Aptos"/>
-        </w:rPr>
-        <w:t xml:space="preserve">, </w:t>
+        <w:t>74</w:t>
+      </w:r>
+      <w:r>
+        <w:rPr>
+          <w:rFonts w:ascii="Aptos"/>
+        </w:rPr>
+        <w:t>(12), 2168–2178. https://doi.org/10.2337/db25-0120</w:t>
+      </w:r>
+    </w:p>
+    <w:p>
+      <w:pPr>
+        <w:pStyle w:val="Bibliography"/>
+        <w:rPr>
+          <w:rFonts w:ascii="Aptos"/>
+        </w:rPr>
+      </w:pPr>
+      <w:r>
+        <w:rPr>
+          <w:rFonts w:ascii="Aptos"/>
+        </w:rPr>
+        <w:t xml:space="preserve">Etxabe, J., &amp; Vazquez, J. A. (1994). Morbidity and mortality in Cushing’s disease: An epidemiological approach. </w:t>
       </w:r>
       <w:r>
         <w:rPr>
@@ -2505,28 +2611,13 @@
           <w:i/>
           <w:iCs/>
         </w:rPr>
-        <w:t>74</w:t>
-      </w:r>
-      <w:r>
-        <w:rPr>
-          <w:rFonts w:ascii="Aptos"/>
-        </w:rPr>
-        <w:t>(12), 2168–2178. https://doi.org/10.2337/db25-0120</w:t>
-      </w:r>
-    </w:p>
-    <w:p>
-      <w:pPr>
-        <w:pStyle w:val="Bibliography"/>
-        <w:spacing w:line="240" w:lineRule="auto"/>
-        <w:rPr>
-          <w:rFonts w:ascii="Aptos"/>
-        </w:rPr>
-      </w:pPr>
-      <w:r>
-        <w:rPr>
-          <w:rFonts w:ascii="Aptos"/>
-        </w:rPr>
-        <w:t xml:space="preserve">Etxabe, J., &amp; Vazquez, J. A. (1994). Morbidity and mortality in Cushing’s disease: An epidemiological approach. </w:t>
+        <w:t>Clin Endocrinol (Oxf)</w:t>
+      </w:r>
+      <w:r>
+        <w:rPr>
+          <w:rFonts w:ascii="Aptos"/>
+        </w:rPr>
+        <w:t xml:space="preserve">, </w:t>
       </w:r>
       <w:r>
         <w:rPr>
@@ -2534,13 +2625,27 @@
           <w:i/>
           <w:iCs/>
         </w:rPr>
-        <w:t>Clin Endocrinol (Oxf)</w:t>
-      </w:r>
-      <w:r>
-        <w:rPr>
-          <w:rFonts w:ascii="Aptos"/>
-        </w:rPr>
-        <w:t xml:space="preserve">, </w:t>
+        <w:t>40</w:t>
+      </w:r>
+      <w:r>
+        <w:rPr>
+          <w:rFonts w:ascii="Aptos"/>
+        </w:rPr>
+        <w:t>(4), 479–484. https://doi.org/10.1111/j.1365-2265.1994.tb02486.x</w:t>
+      </w:r>
+    </w:p>
+    <w:p>
+      <w:pPr>
+        <w:pStyle w:val="Bibliography"/>
+        <w:rPr>
+          <w:rFonts w:ascii="Aptos"/>
+        </w:rPr>
+      </w:pPr>
+      <w:r>
+        <w:rPr>
+          <w:rFonts w:ascii="Aptos"/>
+        </w:rPr>
+        <w:t xml:space="preserve">Fleseriu, M., Auchus, R., Bancos, I., Ben-Shlomo, A., Bertherat, J., Biermasz, N. R., Boguszewski, C. L., Bronstein, M. D., Buchfelder, M., Carmichael, J. D., Casanueva, F. F., Castinetti, F., Chanson, P., Findling, J., Gadelha, M., Geer, E. B., Giustina, A., Grossman, A., Gurnell, M., … Biller, B. M. K. (2021). Consensus on Diagnosis and Management of Cushing’s Disease: A Guideline Update. </w:t>
       </w:r>
       <w:r>
         <w:rPr>
@@ -2548,28 +2653,13 @@
           <w:i/>
           <w:iCs/>
         </w:rPr>
-        <w:t>40</w:t>
-      </w:r>
-      <w:r>
-        <w:rPr>
-          <w:rFonts w:ascii="Aptos"/>
-        </w:rPr>
-        <w:t>(4), 479–484. https://doi.org/10.1111/j.1365-2265.1994.tb02486.x</w:t>
-      </w:r>
-    </w:p>
-    <w:p>
-      <w:pPr>
-        <w:pStyle w:val="Bibliography"/>
-        <w:spacing w:line="240" w:lineRule="auto"/>
-        <w:rPr>
-          <w:rFonts w:ascii="Aptos"/>
-        </w:rPr>
-      </w:pPr>
-      <w:r>
-        <w:rPr>
-          <w:rFonts w:ascii="Aptos"/>
-        </w:rPr>
-        <w:t xml:space="preserve">Fleseriu, M., Auchus, R., Bancos, I., Ben-Shlomo, A., Bertherat, J., Biermasz, N. R., Boguszewski, C. L., Bronstein, M. D., Buchfelder, M., Carmichael, J. D., Casanueva, F. F., Castinetti, F., Chanson, P., Findling, J., Gadelha, M., Geer, E. B., Giustina, A., Grossman, A., Gurnell, M., … Biller, B. M. K. (2021). Consensus on Diagnosis and Management of Cushing’s Disease: A Guideline Update. </w:t>
+        <w:t>The Lancet. Diabetes &amp; Endocrinology</w:t>
+      </w:r>
+      <w:r>
+        <w:rPr>
+          <w:rFonts w:ascii="Aptos"/>
+        </w:rPr>
+        <w:t xml:space="preserve">, </w:t>
       </w:r>
       <w:r>
         <w:rPr>
@@ -2577,13 +2667,27 @@
           <w:i/>
           <w:iCs/>
         </w:rPr>
-        <w:t>The Lancet. Diabetes &amp; Endocrinology</w:t>
-      </w:r>
-      <w:r>
-        <w:rPr>
-          <w:rFonts w:ascii="Aptos"/>
-        </w:rPr>
-        <w:t xml:space="preserve">, </w:t>
+        <w:t>9</w:t>
+      </w:r>
+      <w:r>
+        <w:rPr>
+          <w:rFonts w:ascii="Aptos"/>
+        </w:rPr>
+        <w:t>(12), 847–875. https://doi.org/10.1016/S2213-8587(21)00235-7</w:t>
+      </w:r>
+    </w:p>
+    <w:p>
+      <w:pPr>
+        <w:pStyle w:val="Bibliography"/>
+        <w:rPr>
+          <w:rFonts w:ascii="Aptos"/>
+        </w:rPr>
+      </w:pPr>
+      <w:r>
+        <w:rPr>
+          <w:rFonts w:ascii="Aptos"/>
+        </w:rPr>
+        <w:t xml:space="preserve">Gadelha, M., Gatto, F., Wildemberg, L. E., &amp; Fleseriu, M. (2023). Cushing’s syndrome. </w:t>
       </w:r>
       <w:r>
         <w:rPr>
@@ -2591,28 +2695,13 @@
           <w:i/>
           <w:iCs/>
         </w:rPr>
-        <w:t>9</w:t>
-      </w:r>
-      <w:r>
-        <w:rPr>
-          <w:rFonts w:ascii="Aptos"/>
-        </w:rPr>
-        <w:t>(12), 847–875. https://doi.org/10.1016/S2213-8587(21)00235-7</w:t>
-      </w:r>
-    </w:p>
-    <w:p>
-      <w:pPr>
-        <w:pStyle w:val="Bibliography"/>
-        <w:spacing w:line="240" w:lineRule="auto"/>
-        <w:rPr>
-          <w:rFonts w:ascii="Aptos"/>
-        </w:rPr>
-      </w:pPr>
-      <w:r>
-        <w:rPr>
-          <w:rFonts w:ascii="Aptos"/>
-        </w:rPr>
-        <w:t xml:space="preserve">Gadelha, M., Gatto, F., Wildemberg, L. E., &amp; Fleseriu, M. (2023). Cushing’s syndrome. </w:t>
+        <w:t>The Lancet</w:t>
+      </w:r>
+      <w:r>
+        <w:rPr>
+          <w:rFonts w:ascii="Aptos"/>
+        </w:rPr>
+        <w:t xml:space="preserve">, </w:t>
       </w:r>
       <w:r>
         <w:rPr>
@@ -2620,13 +2709,27 @@
           <w:i/>
           <w:iCs/>
         </w:rPr>
-        <w:t>The Lancet</w:t>
-      </w:r>
-      <w:r>
-        <w:rPr>
-          <w:rFonts w:ascii="Aptos"/>
-        </w:rPr>
-        <w:t xml:space="preserve">, </w:t>
+        <w:t>402</w:t>
+      </w:r>
+      <w:r>
+        <w:rPr>
+          <w:rFonts w:ascii="Aptos"/>
+        </w:rPr>
+        <w:t>(10418), 2237–2252. https://doi.org/10.1016/S0140-6736(23)01961-X</w:t>
+      </w:r>
+    </w:p>
+    <w:p>
+      <w:pPr>
+        <w:pStyle w:val="Bibliography"/>
+        <w:rPr>
+          <w:rFonts w:ascii="Aptos"/>
+        </w:rPr>
+      </w:pPr>
+      <w:r>
+        <w:rPr>
+          <w:rFonts w:ascii="Aptos"/>
+        </w:rPr>
+        <w:t xml:space="preserve">Giordano, R., Picu, A., Marinazzo, E., D’Angelo, V., Berardelli, R., Karamouzis, I., Forno, D., Zinnà, D., Maccario, M., Ghigo, E., &amp; Arvat, E. (2011). Metabolic and cardiovascular outcomes in patients with Cushing’s syndrome of different aetiologies during active disease and 1 year after remission. </w:t>
       </w:r>
       <w:r>
         <w:rPr>
@@ -2634,35 +2737,13 @@
           <w:i/>
           <w:iCs/>
         </w:rPr>
-        <w:t>402</w:t>
-      </w:r>
-      <w:r>
-        <w:rPr>
-          <w:rFonts w:ascii="Aptos"/>
-        </w:rPr>
-        <w:t>(10418), 2237–2252. https://doi.org/10.1016/S0140-6736(23)01961-X</w:t>
-      </w:r>
-    </w:p>
-    <w:p>
-      <w:pPr>
-        <w:pStyle w:val="Bibliography"/>
-        <w:spacing w:line="240" w:lineRule="auto"/>
-        <w:rPr>
-          <w:rFonts w:ascii="Aptos"/>
-        </w:rPr>
-      </w:pPr>
-      <w:r>
-        <w:rPr>
-          <w:rFonts w:ascii="Aptos"/>
-        </w:rPr>
-        <w:t xml:space="preserve">Giordano, R., Picu, A., Marinazzo, E., D’Angelo, V., Berardelli, R., Karamouzis, I., Forno, D., Zinnà, D., Maccario, M., Ghigo, E., &amp; Arvat, E. (2011). Metabolic and cardiovascular </w:t>
-      </w:r>
-      <w:r>
-        <w:rPr>
-          <w:rFonts w:ascii="Aptos"/>
-        </w:rPr>
-        <w:lastRenderedPageBreak/>
-        <w:t xml:space="preserve">outcomes in patients with Cushing’s syndrome of different aetiologies during active disease and 1 year after remission. </w:t>
+        <w:t>Clinical Endocrinology</w:t>
+      </w:r>
+      <w:r>
+        <w:rPr>
+          <w:rFonts w:ascii="Aptos"/>
+        </w:rPr>
+        <w:t xml:space="preserve">, </w:t>
       </w:r>
       <w:r>
         <w:rPr>
@@ -2670,13 +2751,27 @@
           <w:i/>
           <w:iCs/>
         </w:rPr>
-        <w:t>Clinical Endocrinology</w:t>
-      </w:r>
-      <w:r>
-        <w:rPr>
-          <w:rFonts w:ascii="Aptos"/>
-        </w:rPr>
-        <w:t xml:space="preserve">, </w:t>
+        <w:t>75</w:t>
+      </w:r>
+      <w:r>
+        <w:rPr>
+          <w:rFonts w:ascii="Aptos"/>
+        </w:rPr>
+        <w:t>(3), 354–360. https://doi.org/10.1111/j.1365-2265.2011.04055.x</w:t>
+      </w:r>
+    </w:p>
+    <w:p>
+      <w:pPr>
+        <w:pStyle w:val="Bibliography"/>
+        <w:rPr>
+          <w:rFonts w:ascii="Aptos"/>
+        </w:rPr>
+      </w:pPr>
+      <w:r>
+        <w:rPr>
+          <w:rFonts w:ascii="Aptos"/>
+        </w:rPr>
+        <w:t xml:space="preserve">Gunder, L. C., Harvey, I., Redd, J. R., Davis, C. S., Al-Tamimi, A., Brooks, S. V., &amp; Bridges, D. (2020). Obesity augments glucocorticoid-dependent muscle atrophy in male c57bl/6j mice. </w:t>
       </w:r>
       <w:r>
         <w:rPr>
@@ -2684,28 +2779,13 @@
           <w:i/>
           <w:iCs/>
         </w:rPr>
-        <w:t>75</w:t>
-      </w:r>
-      <w:r>
-        <w:rPr>
-          <w:rFonts w:ascii="Aptos"/>
-        </w:rPr>
-        <w:t>(3), 354–360. https://doi.org/10.1111/j.1365-2265.2011.04055.x</w:t>
-      </w:r>
-    </w:p>
-    <w:p>
-      <w:pPr>
-        <w:pStyle w:val="Bibliography"/>
-        <w:spacing w:line="240" w:lineRule="auto"/>
-        <w:rPr>
-          <w:rFonts w:ascii="Aptos"/>
-        </w:rPr>
-      </w:pPr>
-      <w:r>
-        <w:rPr>
-          <w:rFonts w:ascii="Aptos"/>
-        </w:rPr>
-        <w:t xml:space="preserve">Ho, D., Imai, K., King, G., &amp; Stuart, E. A. (2011). MatchIt: Nonparametric Preprocessing for Parametric Causal Inference. </w:t>
+        <w:t>Biomedicines</w:t>
+      </w:r>
+      <w:r>
+        <w:rPr>
+          <w:rFonts w:ascii="Aptos"/>
+        </w:rPr>
+        <w:t xml:space="preserve">, </w:t>
       </w:r>
       <w:r>
         <w:rPr>
@@ -2713,13 +2793,28 @@
           <w:i/>
           <w:iCs/>
         </w:rPr>
-        <w:t>Journal of Statistical Software</w:t>
-      </w:r>
-      <w:r>
-        <w:rPr>
-          <w:rFonts w:ascii="Aptos"/>
-        </w:rPr>
-        <w:t xml:space="preserve">, </w:t>
+        <w:t>8</w:t>
+      </w:r>
+      <w:r>
+        <w:rPr>
+          <w:rFonts w:ascii="Aptos"/>
+        </w:rPr>
+        <w:t>(10). https://doi.org/10.3390/biomedicines8100420</w:t>
+      </w:r>
+    </w:p>
+    <w:p>
+      <w:pPr>
+        <w:pStyle w:val="Bibliography"/>
+        <w:rPr>
+          <w:rFonts w:ascii="Aptos"/>
+        </w:rPr>
+      </w:pPr>
+      <w:r>
+        <w:rPr>
+          <w:rFonts w:ascii="Aptos"/>
+        </w:rPr>
+        <w:lastRenderedPageBreak/>
+        <w:t xml:space="preserve">Harvey, I., Stephenson, E. J., Redd, J. R., Tran, Q. T., Hochberg, I., Qi, N., &amp; Bridges, D. (2018). Glucocorticoid-Induced Metabolic Disturbances Are Exacerbated in Obese Male Mice. </w:t>
       </w:r>
       <w:r>
         <w:rPr>
@@ -2727,28 +2822,13 @@
           <w:i/>
           <w:iCs/>
         </w:rPr>
-        <w:t>42</w:t>
-      </w:r>
-      <w:r>
-        <w:rPr>
-          <w:rFonts w:ascii="Aptos"/>
-        </w:rPr>
-        <w:t>, 1–28. https://doi.org/10.18637/jss.v042.i08</w:t>
-      </w:r>
-    </w:p>
-    <w:p>
-      <w:pPr>
-        <w:pStyle w:val="Bibliography"/>
-        <w:spacing w:line="240" w:lineRule="auto"/>
-        <w:rPr>
-          <w:rFonts w:ascii="Aptos"/>
-        </w:rPr>
-      </w:pPr>
-      <w:r>
-        <w:rPr>
-          <w:rFonts w:ascii="Aptos"/>
-        </w:rPr>
-        <w:t xml:space="preserve">Ioachimescu, A. G., Goswami, N., Handa, T., Pappy, A., Veledar, E., &amp; Oyesiku, N. M. (2022). Racial Disparities in Acromegaly and Cushing’s Disease: A Referral Center Study in 241 Patients. </w:t>
+        <w:t>Endocrinology</w:t>
+      </w:r>
+      <w:r>
+        <w:rPr>
+          <w:rFonts w:ascii="Aptos"/>
+        </w:rPr>
+        <w:t xml:space="preserve">, </w:t>
       </w:r>
       <w:r>
         <w:rPr>
@@ -2756,13 +2836,27 @@
           <w:i/>
           <w:iCs/>
         </w:rPr>
-        <w:t>Journal of the Endocrine Society</w:t>
-      </w:r>
-      <w:r>
-        <w:rPr>
-          <w:rFonts w:ascii="Aptos"/>
-        </w:rPr>
-        <w:t xml:space="preserve">, </w:t>
+        <w:t>159</w:t>
+      </w:r>
+      <w:r>
+        <w:rPr>
+          <w:rFonts w:ascii="Aptos"/>
+        </w:rPr>
+        <w:t>(6). https://doi.org/10.1210/en.2018-00147</w:t>
+      </w:r>
+    </w:p>
+    <w:p>
+      <w:pPr>
+        <w:pStyle w:val="Bibliography"/>
+        <w:rPr>
+          <w:rFonts w:ascii="Aptos"/>
+        </w:rPr>
+      </w:pPr>
+      <w:r>
+        <w:rPr>
+          <w:rFonts w:ascii="Aptos"/>
+        </w:rPr>
+        <w:t xml:space="preserve">Ho, D., Imai, K., King, G., &amp; Stuart, E. A. (2011). MatchIt: Nonparametric Preprocessing for Parametric Causal Inference. </w:t>
       </w:r>
       <w:r>
         <w:rPr>
@@ -2770,28 +2864,13 @@
           <w:i/>
           <w:iCs/>
         </w:rPr>
-        <w:t>6</w:t>
-      </w:r>
-      <w:r>
-        <w:rPr>
-          <w:rFonts w:ascii="Aptos"/>
-        </w:rPr>
-        <w:t>(1), bvab176. https://doi.org/10.1210/jendso/bvab176</w:t>
-      </w:r>
-    </w:p>
-    <w:p>
-      <w:pPr>
-        <w:pStyle w:val="Bibliography"/>
-        <w:spacing w:line="240" w:lineRule="auto"/>
-        <w:rPr>
-          <w:rFonts w:ascii="Aptos"/>
-        </w:rPr>
-      </w:pPr>
-      <w:r>
-        <w:rPr>
-          <w:rFonts w:ascii="Aptos"/>
-        </w:rPr>
-        <w:t xml:space="preserve">Matthiasdottir, A. M., Hardarson, T. O., Arnardottir, S., &amp; Sigurjonsdottir, H. A. (2024). Cushing’s Disease May Have Higher Incidence than Previously Thought: A Nationwide Study in Iceland 2010–2019. </w:t>
+        <w:t>Journal of Statistical Software</w:t>
+      </w:r>
+      <w:r>
+        <w:rPr>
+          <w:rFonts w:ascii="Aptos"/>
+        </w:rPr>
+        <w:t xml:space="preserve">, </w:t>
       </w:r>
       <w:r>
         <w:rPr>
@@ -2799,13 +2878,27 @@
           <w:i/>
           <w:iCs/>
         </w:rPr>
-        <w:t>Neuroendocrinology</w:t>
-      </w:r>
-      <w:r>
-        <w:rPr>
-          <w:rFonts w:ascii="Aptos"/>
-        </w:rPr>
-        <w:t xml:space="preserve">, </w:t>
+        <w:t>42</w:t>
+      </w:r>
+      <w:r>
+        <w:rPr>
+          <w:rFonts w:ascii="Aptos"/>
+        </w:rPr>
+        <w:t>, 1–28. https://doi.org/10.18637/jss.v042.i08</w:t>
+      </w:r>
+    </w:p>
+    <w:p>
+      <w:pPr>
+        <w:pStyle w:val="Bibliography"/>
+        <w:rPr>
+          <w:rFonts w:ascii="Aptos"/>
+        </w:rPr>
+      </w:pPr>
+      <w:r>
+        <w:rPr>
+          <w:rFonts w:ascii="Aptos"/>
+        </w:rPr>
+        <w:t xml:space="preserve">Hochberg, I., Harvey, I., Tran, Q. T., Stephenson, E. J., Barkan, A. L., Saltiel, A. R., Chandler, W. F., &amp; Bridges, D. (2015). Gene expression changes in subcutaneous adipose tissue due to Cushing’s disease. </w:t>
       </w:r>
       <w:r>
         <w:rPr>
@@ -2813,28 +2906,13 @@
           <w:i/>
           <w:iCs/>
         </w:rPr>
-        <w:t>114</w:t>
-      </w:r>
-      <w:r>
-        <w:rPr>
-          <w:rFonts w:ascii="Aptos"/>
-        </w:rPr>
-        <w:t>(10), 950–957. https://doi.org/10.1159/000540205</w:t>
-      </w:r>
-    </w:p>
-    <w:p>
-      <w:pPr>
-        <w:pStyle w:val="Bibliography"/>
-        <w:spacing w:line="240" w:lineRule="auto"/>
-        <w:rPr>
-          <w:rFonts w:ascii="Aptos"/>
-        </w:rPr>
-      </w:pPr>
-      <w:r>
-        <w:rPr>
-          <w:rFonts w:ascii="Aptos"/>
-        </w:rPr>
-        <w:t xml:space="preserve">Nieman, L. K. (2002). Diagnostic Tests for Cushing’s Syndrome. </w:t>
+        <w:t>Journal of Molecular Endocrinology</w:t>
+      </w:r>
+      <w:r>
+        <w:rPr>
+          <w:rFonts w:ascii="Aptos"/>
+        </w:rPr>
+        <w:t xml:space="preserve">, </w:t>
       </w:r>
       <w:r>
         <w:rPr>
@@ -2842,13 +2920,27 @@
           <w:i/>
           <w:iCs/>
         </w:rPr>
-        <w:t>Annals of the New York Academy of Sciences</w:t>
-      </w:r>
-      <w:r>
-        <w:rPr>
-          <w:rFonts w:ascii="Aptos"/>
-        </w:rPr>
-        <w:t xml:space="preserve">, </w:t>
+        <w:t>55</w:t>
+      </w:r>
+      <w:r>
+        <w:rPr>
+          <w:rFonts w:ascii="Aptos"/>
+        </w:rPr>
+        <w:t>(2), 81–94. https://doi.org/10.1530/JME-15-0119</w:t>
+      </w:r>
+    </w:p>
+    <w:p>
+      <w:pPr>
+        <w:pStyle w:val="Bibliography"/>
+        <w:rPr>
+          <w:rFonts w:ascii="Aptos"/>
+        </w:rPr>
+      </w:pPr>
+      <w:r>
+        <w:rPr>
+          <w:rFonts w:ascii="Aptos"/>
+        </w:rPr>
+        <w:t xml:space="preserve">Ioachimescu, A. G., Goswami, N., Handa, T., Pappy, A., Veledar, E., &amp; Oyesiku, N. M. (2022). Racial Disparities in Acromegaly and Cushing’s Disease: A Referral Center Study in 241 Patients. </w:t>
       </w:r>
       <w:r>
         <w:rPr>
@@ -2856,28 +2948,13 @@
           <w:i/>
           <w:iCs/>
         </w:rPr>
-        <w:t>970</w:t>
-      </w:r>
-      <w:r>
-        <w:rPr>
-          <w:rFonts w:ascii="Aptos"/>
-        </w:rPr>
-        <w:t>(1), 112–118. https://doi.org/10.1111/j.1749-6632.2002.tb04417.x</w:t>
-      </w:r>
-    </w:p>
-    <w:p>
-      <w:pPr>
-        <w:pStyle w:val="Bibliography"/>
-        <w:spacing w:line="240" w:lineRule="auto"/>
-        <w:rPr>
-          <w:rFonts w:ascii="Aptos"/>
-        </w:rPr>
-      </w:pPr>
-      <w:r>
-        <w:rPr>
-          <w:rFonts w:ascii="Aptos"/>
-        </w:rPr>
-        <w:t xml:space="preserve">Omotosho, Y. B., McGlotten, R., Chittiboina, P., &amp; Nieman, L. (2024). MON-113 Racial Disparity in the Time to Diagnosis of Cushing’s Disease. </w:t>
+        <w:t>Journal of the Endocrine Society</w:t>
+      </w:r>
+      <w:r>
+        <w:rPr>
+          <w:rFonts w:ascii="Aptos"/>
+        </w:rPr>
+        <w:t xml:space="preserve">, </w:t>
       </w:r>
       <w:r>
         <w:rPr>
@@ -2885,13 +2962,27 @@
           <w:i/>
           <w:iCs/>
         </w:rPr>
-        <w:t>Journal of the Endocrine Society</w:t>
-      </w:r>
-      <w:r>
-        <w:rPr>
-          <w:rFonts w:ascii="Aptos"/>
-        </w:rPr>
-        <w:t xml:space="preserve">, </w:t>
+        <w:t>6</w:t>
+      </w:r>
+      <w:r>
+        <w:rPr>
+          <w:rFonts w:ascii="Aptos"/>
+        </w:rPr>
+        <w:t>(1), bvab176. https://doi.org/10.1210/jendso/bvab176</w:t>
+      </w:r>
+    </w:p>
+    <w:p>
+      <w:pPr>
+        <w:pStyle w:val="Bibliography"/>
+        <w:rPr>
+          <w:rFonts w:ascii="Aptos"/>
+        </w:rPr>
+      </w:pPr>
+      <w:r>
+        <w:rPr>
+          <w:rFonts w:ascii="Aptos"/>
+        </w:rPr>
+        <w:t xml:space="preserve">Matthiasdottir, A. M., Hardarson, T. O., Arnardottir, S., &amp; Sigurjonsdottir, H. A. (2024). Cushing’s Disease May Have Higher Incidence than Previously Thought: A Nationwide Study in Iceland 2010–2019. </w:t>
       </w:r>
       <w:r>
         <w:rPr>
@@ -2899,28 +2990,13 @@
           <w:i/>
           <w:iCs/>
         </w:rPr>
-        <w:t>8</w:t>
-      </w:r>
-      <w:r>
-        <w:rPr>
-          <w:rFonts w:ascii="Aptos"/>
-        </w:rPr>
-        <w:t>(Supplement_1), bvae163.2408. https://doi.org/10.1210/jendso/bvae163.2408</w:t>
-      </w:r>
-    </w:p>
-    <w:p>
-      <w:pPr>
-        <w:pStyle w:val="Bibliography"/>
-        <w:spacing w:line="240" w:lineRule="auto"/>
-        <w:rPr>
-          <w:rFonts w:ascii="Aptos"/>
-        </w:rPr>
-      </w:pPr>
-      <w:r>
-        <w:rPr>
-          <w:rFonts w:ascii="Aptos"/>
-        </w:rPr>
-        <w:t xml:space="preserve">R Core Team. (2019). </w:t>
+        <w:t>Neuroendocrinology</w:t>
+      </w:r>
+      <w:r>
+        <w:rPr>
+          <w:rFonts w:ascii="Aptos"/>
+        </w:rPr>
+        <w:t xml:space="preserve">, </w:t>
       </w:r>
       <w:r>
         <w:rPr>
@@ -2928,28 +3004,27 @@
           <w:i/>
           <w:iCs/>
         </w:rPr>
-        <w:t>R: A Language and Environment for Statistical Computing</w:t>
-      </w:r>
-      <w:r>
-        <w:rPr>
-          <w:rFonts w:ascii="Aptos"/>
-        </w:rPr>
-        <w:t>. R Foundation for Statistical Computing. http://www.r-project.org/</w:t>
+        <w:t>114</w:t>
+      </w:r>
+      <w:r>
+        <w:rPr>
+          <w:rFonts w:ascii="Aptos"/>
+        </w:rPr>
+        <w:t>(10), 950–957. https://doi.org/10.1159/000540205</w:t>
       </w:r>
     </w:p>
     <w:p>
       <w:pPr>
         <w:pStyle w:val="Bibliography"/>
-        <w:spacing w:line="240" w:lineRule="auto"/>
-        <w:rPr>
-          <w:rFonts w:ascii="Aptos"/>
-        </w:rPr>
-      </w:pPr>
-      <w:r>
-        <w:rPr>
-          <w:rFonts w:ascii="Aptos"/>
-        </w:rPr>
-        <w:t xml:space="preserve">Sharma, Susmeeta T., Nieman, L. K., &amp; Feelders, R. A. (2015). Cushing’s syndrome: Epidemiology and developments in disease management. </w:t>
+        <w:rPr>
+          <w:rFonts w:ascii="Aptos"/>
+        </w:rPr>
+      </w:pPr>
+      <w:r>
+        <w:rPr>
+          <w:rFonts w:ascii="Aptos"/>
+        </w:rPr>
+        <w:t xml:space="preserve">Nieman, L. K. (2002). Diagnostic Tests for Cushing’s Syndrome. </w:t>
       </w:r>
       <w:r>
         <w:rPr>
@@ -2957,28 +3032,13 @@
           <w:i/>
           <w:iCs/>
         </w:rPr>
-        <w:t>Clinical Epidemiology</w:t>
-      </w:r>
-      <w:r>
-        <w:rPr>
-          <w:rFonts w:ascii="Aptos"/>
-        </w:rPr>
-        <w:t>, 281–293.</w:t>
-      </w:r>
-    </w:p>
-    <w:p>
-      <w:pPr>
-        <w:pStyle w:val="Bibliography"/>
-        <w:spacing w:line="240" w:lineRule="auto"/>
-        <w:rPr>
-          <w:rFonts w:ascii="Aptos"/>
-        </w:rPr>
-      </w:pPr>
-      <w:r>
-        <w:rPr>
-          <w:rFonts w:ascii="Aptos"/>
-        </w:rPr>
-        <w:t xml:space="preserve">Steffensen, C., Bak, A. M., Zøylner Rubeck, K., &amp; Jørgensen, J. O. L. (2010). Epidemiology of Cushing’s Syndrome. </w:t>
+        <w:t>Annals of the New York Academy of Sciences</w:t>
+      </w:r>
+      <w:r>
+        <w:rPr>
+          <w:rFonts w:ascii="Aptos"/>
+        </w:rPr>
+        <w:t xml:space="preserve">, </w:t>
       </w:r>
       <w:r>
         <w:rPr>
@@ -2986,13 +3046,28 @@
           <w:i/>
           <w:iCs/>
         </w:rPr>
-        <w:t>Neuroendocrinology</w:t>
-      </w:r>
-      <w:r>
-        <w:rPr>
-          <w:rFonts w:ascii="Aptos"/>
-        </w:rPr>
-        <w:t xml:space="preserve">, </w:t>
+        <w:t>970</w:t>
+      </w:r>
+      <w:r>
+        <w:rPr>
+          <w:rFonts w:ascii="Aptos"/>
+        </w:rPr>
+        <w:t>(1), 112–118. https://doi.org/10.1111/j.1749-6632.2002.tb04417.x</w:t>
+      </w:r>
+    </w:p>
+    <w:p>
+      <w:pPr>
+        <w:pStyle w:val="Bibliography"/>
+        <w:rPr>
+          <w:rFonts w:ascii="Aptos"/>
+        </w:rPr>
+      </w:pPr>
+      <w:r>
+        <w:rPr>
+          <w:rFonts w:ascii="Aptos"/>
+        </w:rPr>
+        <w:lastRenderedPageBreak/>
+        <w:t xml:space="preserve">Omotosho, Y. B., McGlotten, R., Chittiboina, P., &amp; Nieman, L. (2024). MON-113 Racial Disparity in the Time to Diagnosis of Cushing’s Disease. </w:t>
       </w:r>
       <w:r>
         <w:rPr>
@@ -3000,28 +3075,13 @@
           <w:i/>
           <w:iCs/>
         </w:rPr>
-        <w:t>92</w:t>
-      </w:r>
-      <w:r>
-        <w:rPr>
-          <w:rFonts w:ascii="Aptos"/>
-        </w:rPr>
-        <w:t>(Suppl. 1), 1–5. https://doi.org/10.1159/000314297</w:t>
-      </w:r>
-    </w:p>
-    <w:p>
-      <w:pPr>
-        <w:pStyle w:val="Bibliography"/>
-        <w:spacing w:line="240" w:lineRule="auto"/>
-        <w:rPr>
-          <w:rFonts w:ascii="Aptos"/>
-        </w:rPr>
-      </w:pPr>
-      <w:r>
-        <w:rPr>
-          <w:rFonts w:ascii="Aptos"/>
-        </w:rPr>
-        <w:t xml:space="preserve">Zillo, M., Barbot, M., Ceccato, F., Camozzi, C., Bilora, F., Casonato, A., Frigo, A., Albiger, N., Daidone, V., Mazzai, M., Mantero, F., &amp; Scaroni, C. (2014). Diagnosis and complications of Cushing’s disease: Gender-related differences. </w:t>
+        <w:t>Journal of the Endocrine Society</w:t>
+      </w:r>
+      <w:r>
+        <w:rPr>
+          <w:rFonts w:ascii="Aptos"/>
+        </w:rPr>
+        <w:t xml:space="preserve">, </w:t>
       </w:r>
       <w:r>
         <w:rPr>
@@ -3029,13 +3089,27 @@
           <w:i/>
           <w:iCs/>
         </w:rPr>
-        <w:t>Clinical Endocrinology</w:t>
-      </w:r>
-      <w:r>
-        <w:rPr>
-          <w:rFonts w:ascii="Aptos"/>
-        </w:rPr>
-        <w:t xml:space="preserve">, </w:t>
+        <w:t>8</w:t>
+      </w:r>
+      <w:r>
+        <w:rPr>
+          <w:rFonts w:ascii="Aptos"/>
+        </w:rPr>
+        <w:t>(Supplement_1), bvae163.2408. https://doi.org/10.1210/jendso/bvae163.2408</w:t>
+      </w:r>
+    </w:p>
+    <w:p>
+      <w:pPr>
+        <w:pStyle w:val="Bibliography"/>
+        <w:rPr>
+          <w:rFonts w:ascii="Aptos"/>
+        </w:rPr>
+      </w:pPr>
+      <w:r>
+        <w:rPr>
+          <w:rFonts w:ascii="Aptos"/>
+        </w:rPr>
+        <w:t xml:space="preserve">Parvanova, A., Reseghetti, E., Abbate, M., &amp; Ruggenenti, P. (2024). Mechanisms and treatment of obesity-related hypertension—Part 1: Mechanisms. </w:t>
       </w:r>
       <w:r>
         <w:rPr>
@@ -3043,6 +3117,160 @@
           <w:i/>
           <w:iCs/>
         </w:rPr>
+        <w:t>Clinical Kidney Journal</w:t>
+      </w:r>
+      <w:r>
+        <w:rPr>
+          <w:rFonts w:ascii="Aptos"/>
+        </w:rPr>
+        <w:t xml:space="preserve">, </w:t>
+      </w:r>
+      <w:r>
+        <w:rPr>
+          <w:rFonts w:ascii="Aptos"/>
+          <w:i/>
+          <w:iCs/>
+        </w:rPr>
+        <w:t>17</w:t>
+      </w:r>
+      <w:r>
+        <w:rPr>
+          <w:rFonts w:ascii="Aptos"/>
+        </w:rPr>
+        <w:t>(1), sfad282. https://doi.org/10.1093/ckj/sfad282</w:t>
+      </w:r>
+    </w:p>
+    <w:p>
+      <w:pPr>
+        <w:pStyle w:val="Bibliography"/>
+        <w:rPr>
+          <w:rFonts w:ascii="Aptos"/>
+        </w:rPr>
+      </w:pPr>
+      <w:r>
+        <w:rPr>
+          <w:rFonts w:ascii="Aptos"/>
+        </w:rPr>
+        <w:t xml:space="preserve">R Core Team. (2019). </w:t>
+      </w:r>
+      <w:r>
+        <w:rPr>
+          <w:rFonts w:ascii="Aptos"/>
+          <w:i/>
+          <w:iCs/>
+        </w:rPr>
+        <w:t>R: A Language and Environment for Statistical Computing</w:t>
+      </w:r>
+      <w:r>
+        <w:rPr>
+          <w:rFonts w:ascii="Aptos"/>
+        </w:rPr>
+        <w:t>. R Foundation for Statistical Computing. http://www.r-project.org/</w:t>
+      </w:r>
+    </w:p>
+    <w:p>
+      <w:pPr>
+        <w:pStyle w:val="Bibliography"/>
+        <w:rPr>
+          <w:rFonts w:ascii="Aptos"/>
+        </w:rPr>
+      </w:pPr>
+      <w:r>
+        <w:rPr>
+          <w:rFonts w:ascii="Aptos"/>
+        </w:rPr>
+        <w:t xml:space="preserve">Sharma, S. T., Nieman, L. K., &amp; Feelders, R. A. (2015). Cushing’s syndrome: Epidemiology and developments in disease management. </w:t>
+      </w:r>
+      <w:r>
+        <w:rPr>
+          <w:rFonts w:ascii="Aptos"/>
+          <w:i/>
+          <w:iCs/>
+        </w:rPr>
+        <w:t>Clinical Epidemiology</w:t>
+      </w:r>
+      <w:r>
+        <w:rPr>
+          <w:rFonts w:ascii="Aptos"/>
+        </w:rPr>
+        <w:t>, 281–293.</w:t>
+      </w:r>
+    </w:p>
+    <w:p>
+      <w:pPr>
+        <w:pStyle w:val="Bibliography"/>
+        <w:rPr>
+          <w:rFonts w:ascii="Aptos"/>
+        </w:rPr>
+      </w:pPr>
+      <w:r>
+        <w:rPr>
+          <w:rFonts w:ascii="Aptos"/>
+        </w:rPr>
+        <w:t xml:space="preserve">Steffensen, C., Bak, A. M., Zøylner Rubeck, K., &amp; Jørgensen, J. O. L. (2010). Epidemiology of Cushing’s Syndrome. </w:t>
+      </w:r>
+      <w:r>
+        <w:rPr>
+          <w:rFonts w:ascii="Aptos"/>
+          <w:i/>
+          <w:iCs/>
+        </w:rPr>
+        <w:t>Neuroendocrinology</w:t>
+      </w:r>
+      <w:r>
+        <w:rPr>
+          <w:rFonts w:ascii="Aptos"/>
+        </w:rPr>
+        <w:t xml:space="preserve">, </w:t>
+      </w:r>
+      <w:r>
+        <w:rPr>
+          <w:rFonts w:ascii="Aptos"/>
+          <w:i/>
+          <w:iCs/>
+        </w:rPr>
+        <w:t>92</w:t>
+      </w:r>
+      <w:r>
+        <w:rPr>
+          <w:rFonts w:ascii="Aptos"/>
+        </w:rPr>
+        <w:t>(Suppl. 1), 1–5. https://doi.org/10.1159/000314297</w:t>
+      </w:r>
+    </w:p>
+    <w:p>
+      <w:pPr>
+        <w:pStyle w:val="Bibliography"/>
+        <w:rPr>
+          <w:rFonts w:ascii="Aptos"/>
+        </w:rPr>
+      </w:pPr>
+      <w:r>
+        <w:rPr>
+          <w:rFonts w:ascii="Aptos"/>
+        </w:rPr>
+        <w:t xml:space="preserve">Zillo, M., Barbot, M., Ceccato, F., Camozzi, C., Bilora, F., Casonato, A., Frigo, A., Albiger, N., Daidone, V., Mazzai, M., Mantero, F., &amp; Scaroni, C. (2014). Diagnosis and complications of Cushing’s disease: Gender-related differences. </w:t>
+      </w:r>
+      <w:r>
+        <w:rPr>
+          <w:rFonts w:ascii="Aptos"/>
+          <w:i/>
+          <w:iCs/>
+        </w:rPr>
+        <w:t>Clinical Endocrinology</w:t>
+      </w:r>
+      <w:r>
+        <w:rPr>
+          <w:rFonts w:ascii="Aptos"/>
+        </w:rPr>
+        <w:t xml:space="preserve">, </w:t>
+      </w:r>
+      <w:r>
+        <w:rPr>
+          <w:rFonts w:ascii="Aptos"/>
+          <w:i/>
+          <w:iCs/>
+        </w:rPr>
         <w:t>80</w:t>
       </w:r>
       <w:r>
@@ -3055,7 +3283,6 @@
     <w:p>
       <w:pPr>
         <w:pStyle w:val="Bibliography"/>
-        <w:spacing w:line="240" w:lineRule="auto"/>
       </w:pPr>
       <w:r>
         <w:fldChar w:fldCharType="end"/>
@@ -3626,40 +3853,7 @@
       </w:r>
     </w:p>
   </w:comment>
-  <w:comment w:id="1" w:author="Carr, Treyton" w:date="2025-12-01T15:54:00Z" w:initials="CT">
-    <w:p>
-      <w:r>
-        <w:rPr>
-          <w:rStyle w:val="CommentReference"/>
-        </w:rPr>
-        <w:annotationRef/>
-      </w:r>
-      <w:hyperlink r:id="rId1" w:history="1">
-        <w:r>
-          <w:rPr>
-            <w:rStyle w:val="Hyperlink"/>
-            <w:sz w:val="20"/>
-            <w:szCs w:val="20"/>
-          </w:rPr>
-          <w:t>https://pubmed-ncbi-nlm-nih-gov.proxy.lib.umich.edu/23889360/</w:t>
-        </w:r>
-      </w:hyperlink>
-    </w:p>
-    <w:p/>
-    <w:p>
-      <w:hyperlink r:id="rId2" w:history="1">
-        <w:r>
-          <w:rPr>
-            <w:rStyle w:val="Hyperlink"/>
-            <w:sz w:val="20"/>
-            <w:szCs w:val="20"/>
-          </w:rPr>
-          <w:t>https://www.sciencedirect.com/science/article/abs/pii/S014067362301961X</w:t>
-        </w:r>
-      </w:hyperlink>
-    </w:p>
-  </w:comment>
-  <w:comment w:id="2" w:author="Dave Bridges" w:date="2025-12-13T09:34:00Z" w:initials="DB">
+  <w:comment w:id="1" w:author="Dave Bridges" w:date="2025-12-13T09:39:00Z" w:initials="DB">
     <w:p>
       <w:r>
         <w:rPr>
@@ -3672,75 +3866,7 @@
           <w:sz w:val="20"/>
           <w:szCs w:val="20"/>
         </w:rPr>
-        <w:t>Harvey, Gunder</w:t>
-      </w:r>
-    </w:p>
-  </w:comment>
-  <w:comment w:id="3" w:author="Dave Bridges" w:date="2025-12-13T09:34:00Z" w:initials="DB">
-    <w:p>
-      <w:r>
-        <w:rPr>
-          <w:rStyle w:val="CommentReference"/>
-        </w:rPr>
-        <w:annotationRef/>
-      </w:r>
-      <w:r>
-        <w:rPr>
-          <w:sz w:val="20"/>
-          <w:szCs w:val="20"/>
-        </w:rPr>
-        <w:t>Hochberg</w:t>
-      </w:r>
-    </w:p>
-  </w:comment>
-  <w:comment w:id="4" w:author="Dave Bridges" w:date="2025-12-13T09:46:00Z" w:initials="DB">
-    <w:p>
-      <w:r>
-        <w:rPr>
-          <w:rStyle w:val="CommentReference"/>
-        </w:rPr>
-        <w:annotationRef/>
-      </w:r>
-      <w:r>
-        <w:rPr>
-          <w:sz w:val="20"/>
-          <w:szCs w:val="20"/>
-        </w:rPr>
-        <w:t>parvanovaMechanismsTreatmentObesityrelated2024</w:t>
-      </w:r>
-    </w:p>
-  </w:comment>
-  <w:comment w:id="5" w:author="Dave Bridges" w:date="2025-12-13T09:39:00Z" w:initials="DB">
-    <w:p>
-      <w:r>
-        <w:rPr>
-          <w:rStyle w:val="CommentReference"/>
-        </w:rPr>
-        <w:annotationRef/>
-      </w:r>
-      <w:r>
-        <w:rPr>
-          <w:sz w:val="20"/>
-          <w:szCs w:val="20"/>
-        </w:rPr>
         <w:t>Trey can you summarize</w:t>
-      </w:r>
-    </w:p>
-  </w:comment>
-  <w:comment w:id="6" w:author="Dave Bridges" w:date="2025-12-13T09:46:00Z" w:initials="DB">
-    <w:p>
-      <w:r>
-        <w:rPr>
-          <w:rStyle w:val="CommentReference"/>
-        </w:rPr>
-        <w:annotationRef/>
-      </w:r>
-      <w:r>
-        <w:rPr>
-          <w:sz w:val="20"/>
-          <w:szCs w:val="20"/>
-        </w:rPr>
-        <w:t>Look into sex differences in obesity and salt-sensitive hypertension</w:t>
       </w:r>
     </w:p>
   </w:comment>
@@ -3750,36 +3876,21 @@
 <file path=word/commentsExtended.xml><?xml version="1.0" encoding="utf-8"?>
 <w15:commentsEx xmlns:wpc="http://schemas.microsoft.com/office/word/2010/wordprocessingCanvas" xmlns:cx="http://schemas.microsoft.com/office/drawing/2014/chartex" xmlns:cx1="http://schemas.microsoft.com/office/drawing/2015/9/8/chartex" xmlns:cx2="http://schemas.microsoft.com/office/drawing/2015/10/21/chartex" xmlns:cx3="http://schemas.microsoft.com/office/drawing/2016/5/9/chartex" xmlns:cx4="http://schemas.microsoft.com/office/drawing/2016/5/10/chartex" xmlns:cx5="http://schemas.microsoft.com/office/drawing/2016/5/11/chartex" xmlns:cx6="http://schemas.microsoft.com/office/drawing/2016/5/12/chartex" xmlns:cx7="http://schemas.microsoft.com/office/drawing/2016/5/13/chartex" xmlns:cx8="http://schemas.microsoft.com/office/drawing/2016/5/14/chartex" xmlns:mc="http://schemas.openxmlformats.org/markup-compatibility/2006" xmlns:aink="http://schemas.microsoft.com/office/drawing/2016/ink" xmlns:am3d="http://schemas.microsoft.com/office/drawing/2017/model3d" xmlns:o="urn:schemas-microsoft-com:office:office" xmlns:oel="http://schemas.microsoft.com/office/2019/extlst" xmlns:r="http://schemas.openxmlformats.org/officeDocument/2006/relationships" xmlns:m="http://schemas.openxmlformats.org/officeDocument/2006/math" xmlns:v="urn:schemas-microsoft-com:vml" xmlns:wp14="http://schemas.microsoft.com/office/word/2010/wordprocessingDrawing" xmlns:wp="http://schemas.openxmlformats.org/drawingml/2006/wordprocessingDrawing" xmlns:w10="urn:schemas-microsoft-com:office:word" xmlns:w="http://schemas.openxmlformats.org/wordprocessingml/2006/main" xmlns:w14="http://schemas.microsoft.com/office/word/2010/wordml" xmlns:w15="http://schemas.microsoft.com/office/word/2012/wordml" xmlns:w16cex="http://schemas.microsoft.com/office/word/2018/wordml/cex" xmlns:w16cid="http://schemas.microsoft.com/office/word/2016/wordml/cid" xmlns:w16="http://schemas.microsoft.com/office/word/2018/wordml" xmlns:w16du="http://schemas.microsoft.com/office/word/2023/wordml/word16du" xmlns:w16sdtdh="http://schemas.microsoft.com/office/word/2020/wordml/sdtdatahash" xmlns:w16sdtfl="http://schemas.microsoft.com/office/word/2024/wordml/sdtformatlock" xmlns:w16se="http://schemas.microsoft.com/office/word/2015/wordml/symex" xmlns:wpg="http://schemas.microsoft.com/office/word/2010/wordprocessingGroup" xmlns:wpi="http://schemas.microsoft.com/office/word/2010/wordprocessingInk" xmlns:wne="http://schemas.microsoft.com/office/word/2006/wordml" xmlns:wps="http://schemas.microsoft.com/office/word/2010/wordprocessingShape" mc:Ignorable="w14 w15 w16se w16cid w16 w16cex w16sdtdh w16sdtfl w16du wp14">
   <w15:commentEx w15:paraId="1A4606F5" w15:done="0"/>
-  <w15:commentEx w15:paraId="4C73BA5E" w15:done="0"/>
-  <w15:commentEx w15:paraId="634B6532" w15:done="0"/>
-  <w15:commentEx w15:paraId="6B4E3D78" w15:done="0"/>
-  <w15:commentEx w15:paraId="76A58E14" w15:done="0"/>
   <w15:commentEx w15:paraId="6BA12295" w15:done="0"/>
-  <w15:commentEx w15:paraId="1725DB63" w15:done="0"/>
 </w15:commentsEx>
 </file>
 
 <file path=word/commentsExtensible.xml><?xml version="1.0" encoding="utf-8"?>
 <w16cex:commentsExtensible xmlns:wpc="http://schemas.microsoft.com/office/word/2010/wordprocessingCanvas" xmlns:cx="http://schemas.microsoft.com/office/drawing/2014/chartex" xmlns:cx1="http://schemas.microsoft.com/office/drawing/2015/9/8/chartex" xmlns:cx2="http://schemas.microsoft.com/office/drawing/2015/10/21/chartex" xmlns:cx3="http://schemas.microsoft.com/office/drawing/2016/5/9/chartex" xmlns:cx4="http://schemas.microsoft.com/office/drawing/2016/5/10/chartex" xmlns:cx5="http://schemas.microsoft.com/office/drawing/2016/5/11/chartex" xmlns:cx6="http://schemas.microsoft.com/office/drawing/2016/5/12/chartex" xmlns:cx7="http://schemas.microsoft.com/office/drawing/2016/5/13/chartex" xmlns:cx8="http://schemas.microsoft.com/office/drawing/2016/5/14/chartex" xmlns:cr="http://schemas.microsoft.com/office/comments/2020/reactions" xmlns:mc="http://schemas.openxmlformats.org/markup-compatibility/2006" xmlns:aink="http://schemas.microsoft.com/office/drawing/2016/ink" xmlns:am3d="http://schemas.microsoft.com/office/drawing/2017/model3d" xmlns:o="urn:schemas-microsoft-com:office:office" xmlns:oel="http://schemas.microsoft.com/office/2019/extlst" xmlns:r="http://schemas.openxmlformats.org/officeDocument/2006/relationships" xmlns:m="http://schemas.openxmlformats.org/officeDocument/2006/math" xmlns:v="urn:schemas-microsoft-com:vml" xmlns:wp14="http://schemas.microsoft.com/office/word/2010/wordprocessingDrawing" xmlns:wp="http://schemas.openxmlformats.org/drawingml/2006/wordprocessingDrawing" xmlns:w10="urn:schemas-microsoft-com:office:word" xmlns:w="http://schemas.openxmlformats.org/wordprocessingml/2006/main" xmlns:w14="http://schemas.microsoft.com/office/word/2010/wordml" xmlns:w15="http://schemas.microsoft.com/office/word/2012/wordml" xmlns:w16cex="http://schemas.microsoft.com/office/word/2018/wordml/cex" xmlns:w16cid="http://schemas.microsoft.com/office/word/2016/wordml/cid" xmlns:w16="http://schemas.microsoft.com/office/word/2018/wordml" xmlns:w16du="http://schemas.microsoft.com/office/word/2023/wordml/word16du" xmlns:w16sdtdh="http://schemas.microsoft.com/office/word/2020/wordml/sdtdatahash" xmlns:w16sdtfl="http://schemas.microsoft.com/office/word/2024/wordml/sdtformatlock" xmlns:w16se="http://schemas.microsoft.com/office/word/2015/wordml/symex" xmlns:wpg="http://schemas.microsoft.com/office/word/2010/wordprocessingGroup" xmlns:wpi="http://schemas.microsoft.com/office/word/2010/wordprocessingInk" xmlns:wne="http://schemas.microsoft.com/office/word/2006/wordml" xmlns:wps="http://schemas.microsoft.com/office/word/2010/wordprocessingShape" mc:Ignorable="w14 w15 w16se w16cid w16 w16cex w16sdtdh w16sdtfl cr w16du wp14">
   <w16cex:commentExtensible w16cex:durableId="00CF6BFD" w16cex:dateUtc="2025-12-12T16:23:00Z"/>
-  <w16cex:commentExtensible w16cex:durableId="5D090D3A" w16cex:dateUtc="2025-12-01T20:54:00Z"/>
-  <w16cex:commentExtensible w16cex:durableId="38E76C14" w16cex:dateUtc="2025-12-13T14:34:00Z"/>
-  <w16cex:commentExtensible w16cex:durableId="5031C284" w16cex:dateUtc="2025-12-13T14:34:00Z"/>
-  <w16cex:commentExtensible w16cex:durableId="42B8B1D8" w16cex:dateUtc="2025-12-13T14:46:00Z"/>
   <w16cex:commentExtensible w16cex:durableId="3B45A1F1" w16cex:dateUtc="2025-12-13T14:39:00Z"/>
-  <w16cex:commentExtensible w16cex:durableId="6C701679" w16cex:dateUtc="2025-12-13T14:46:00Z"/>
 </w16cex:commentsExtensible>
 </file>
 
 <file path=word/commentsIds.xml><?xml version="1.0" encoding="utf-8"?>
 <w16cid:commentsIds xmlns:wpc="http://schemas.microsoft.com/office/word/2010/wordprocessingCanvas" xmlns:cx="http://schemas.microsoft.com/office/drawing/2014/chartex" xmlns:cx1="http://schemas.microsoft.com/office/drawing/2015/9/8/chartex" xmlns:cx2="http://schemas.microsoft.com/office/drawing/2015/10/21/chartex" xmlns:cx3="http://schemas.microsoft.com/office/drawing/2016/5/9/chartex" xmlns:cx4="http://schemas.microsoft.com/office/drawing/2016/5/10/chartex" xmlns:cx5="http://schemas.microsoft.com/office/drawing/2016/5/11/chartex" xmlns:cx6="http://schemas.microsoft.com/office/drawing/2016/5/12/chartex" xmlns:cx7="http://schemas.microsoft.com/office/drawing/2016/5/13/chartex" xmlns:cx8="http://schemas.microsoft.com/office/drawing/2016/5/14/chartex" xmlns:mc="http://schemas.openxmlformats.org/markup-compatibility/2006" xmlns:aink="http://schemas.microsoft.com/office/drawing/2016/ink" xmlns:am3d="http://schemas.microsoft.com/office/drawing/2017/model3d" xmlns:o="urn:schemas-microsoft-com:office:office" xmlns:oel="http://schemas.microsoft.com/office/2019/extlst" xmlns:r="http://schemas.openxmlformats.org/officeDocument/2006/relationships" xmlns:m="http://schemas.openxmlformats.org/officeDocument/2006/math" xmlns:v="urn:schemas-microsoft-com:vml" xmlns:wp14="http://schemas.microsoft.com/office/word/2010/wordprocessingDrawing" xmlns:wp="http://schemas.openxmlformats.org/drawingml/2006/wordprocessingDrawing" xmlns:w10="urn:schemas-microsoft-com:office:word" xmlns:w="http://schemas.openxmlformats.org/wordprocessingml/2006/main" xmlns:w14="http://schemas.microsoft.com/office/word/2010/wordml" xmlns:w15="http://schemas.microsoft.com/office/word/2012/wordml" xmlns:w16cex="http://schemas.microsoft.com/office/word/2018/wordml/cex" xmlns:w16cid="http://schemas.microsoft.com/office/word/2016/wordml/cid" xmlns:w16="http://schemas.microsoft.com/office/word/2018/wordml" xmlns:w16du="http://schemas.microsoft.com/office/word/2023/wordml/word16du" xmlns:w16sdtdh="http://schemas.microsoft.com/office/word/2020/wordml/sdtdatahash" xmlns:w16sdtfl="http://schemas.microsoft.com/office/word/2024/wordml/sdtformatlock" xmlns:w16se="http://schemas.microsoft.com/office/word/2015/wordml/symex" xmlns:wpg="http://schemas.microsoft.com/office/word/2010/wordprocessingGroup" xmlns:wpi="http://schemas.microsoft.com/office/word/2010/wordprocessingInk" xmlns:wne="http://schemas.microsoft.com/office/word/2006/wordml" xmlns:wps="http://schemas.microsoft.com/office/word/2010/wordprocessingShape" mc:Ignorable="w14 w15 w16se w16cid w16 w16cex w16sdtdh w16sdtfl w16du wp14">
   <w16cid:commentId w16cid:paraId="1A4606F5" w16cid:durableId="00CF6BFD"/>
-  <w16cid:commentId w16cid:paraId="4C73BA5E" w16cid:durableId="5D090D3A"/>
-  <w16cid:commentId w16cid:paraId="634B6532" w16cid:durableId="38E76C14"/>
-  <w16cid:commentId w16cid:paraId="6B4E3D78" w16cid:durableId="5031C284"/>
-  <w16cid:commentId w16cid:paraId="76A58E14" w16cid:durableId="42B8B1D8"/>
   <w16cid:commentId w16cid:paraId="6BA12295" w16cid:durableId="3B45A1F1"/>
-  <w16cid:commentId w16cid:paraId="1725DB63" w16cid:durableId="6C701679"/>
 </w16cid:commentsIds>
 </file>
 
@@ -5132,9 +5243,6 @@
 <w15:people xmlns:wpc="http://schemas.microsoft.com/office/word/2010/wordprocessingCanvas" xmlns:cx="http://schemas.microsoft.com/office/drawing/2014/chartex" xmlns:cx1="http://schemas.microsoft.com/office/drawing/2015/9/8/chartex" xmlns:cx2="http://schemas.microsoft.com/office/drawing/2015/10/21/chartex" xmlns:cx3="http://schemas.microsoft.com/office/drawing/2016/5/9/chartex" xmlns:cx4="http://schemas.microsoft.com/office/drawing/2016/5/10/chartex" xmlns:cx5="http://schemas.microsoft.com/office/drawing/2016/5/11/chartex" xmlns:cx6="http://schemas.microsoft.com/office/drawing/2016/5/12/chartex" xmlns:cx7="http://schemas.microsoft.com/office/drawing/2016/5/13/chartex" xmlns:cx8="http://schemas.microsoft.com/office/drawing/2016/5/14/chartex" xmlns:mc="http://schemas.openxmlformats.org/markup-compatibility/2006" xmlns:aink="http://schemas.microsoft.com/office/drawing/2016/ink" xmlns:am3d="http://schemas.microsoft.com/office/drawing/2017/model3d" xmlns:o="urn:schemas-microsoft-com:office:office" xmlns:oel="http://schemas.microsoft.com/office/2019/extlst" xmlns:r="http://schemas.openxmlformats.org/officeDocument/2006/relationships" xmlns:m="http://schemas.openxmlformats.org/officeDocument/2006/math" xmlns:v="urn:schemas-microsoft-com:vml" xmlns:wp14="http://schemas.microsoft.com/office/word/2010/wordprocessingDrawing" xmlns:wp="http://schemas.openxmlformats.org/drawingml/2006/wordprocessingDrawing" xmlns:w10="urn:schemas-microsoft-com:office:word" xmlns:w="http://schemas.openxmlformats.org/wordprocessingml/2006/main" xmlns:w14="http://schemas.microsoft.com/office/word/2010/wordml" xmlns:w15="http://schemas.microsoft.com/office/word/2012/wordml" xmlns:w16cex="http://schemas.microsoft.com/office/word/2018/wordml/cex" xmlns:w16cid="http://schemas.microsoft.com/office/word/2016/wordml/cid" xmlns:w16="http://schemas.microsoft.com/office/word/2018/wordml" xmlns:w16du="http://schemas.microsoft.com/office/word/2023/wordml/word16du" xmlns:w16sdtdh="http://schemas.microsoft.com/office/word/2020/wordml/sdtdatahash" xmlns:w16sdtfl="http://schemas.microsoft.com/office/word/2024/wordml/sdtformatlock" xmlns:w16se="http://schemas.microsoft.com/office/word/2015/wordml/symex" xmlns:wpg="http://schemas.microsoft.com/office/word/2010/wordprocessingGroup" xmlns:wpi="http://schemas.microsoft.com/office/word/2010/wordprocessingInk" xmlns:wne="http://schemas.microsoft.com/office/word/2006/wordml" xmlns:wps="http://schemas.microsoft.com/office/word/2010/wordprocessingShape" mc:Ignorable="w14 w15 w16se w16cid w16 w16cex w16sdtdh w16sdtfl w16du wp14">
   <w15:person w15:author="Dave Bridges">
     <w15:presenceInfo w15:providerId="None" w15:userId="Dave Bridges"/>
-  </w15:person>
-  <w15:person w15:author="Carr, Treyton">
-    <w15:presenceInfo w15:providerId="AD" w15:userId="S::treycarr@umich.edu::2d7a502c-7154-4eba-af5f-8ba5f8b51ac9"/>
   </w15:person>
 </w15:people>
 </file>

</xml_diff>

<commit_message>
Abstract, BP summary and 2 sources
Added an abstract, cleaned up a few comments and grammar checked it a bit.
</commit_message>
<xml_diff>
--- a/manuscript/Cushings-Obesity/manuscript.docx
+++ b/manuscript/Cushings-Obesity/manuscript.docx
@@ -16,7 +16,215 @@
         <w:t>Abstract</w:t>
       </w:r>
     </w:p>
-    <w:p/>
+    <w:p>
+      <w:pPr>
+        <w:spacing w:after="0" w:line="240" w:lineRule="auto"/>
+        <w:rPr>
+          <w:rFonts w:eastAsia="Times New Roman" w:cs="Times New Roman"/>
+          <w:kern w:val="0"/>
+          <w14:ligatures w14:val="none"/>
+        </w:rPr>
+      </w:pPr>
+      <w:r>
+        <w:rPr>
+          <w:rFonts w:eastAsia="Times New Roman" w:cs="Arial"/>
+          <w:color w:val="000000"/>
+          <w:kern w:val="0"/>
+          <w14:ligatures w14:val="none"/>
+        </w:rPr>
+        <w:t>Cushing’s disease is caused by the overproduction of cortisol. The effects of this disease are well known in a general population, including high blood pressure, diabetes, and weight gain</w:t>
+      </w:r>
+      <w:r>
+        <w:rPr>
+          <w:rFonts w:eastAsia="Times New Roman" w:cs="Arial"/>
+          <w:color w:val="000000"/>
+          <w:kern w:val="0"/>
+          <w14:ligatures w14:val="none"/>
+        </w:rPr>
+        <w:t xml:space="preserve"> </w:t>
+      </w:r>
+      <w:r>
+        <w:fldChar w:fldCharType="begin"/>
+      </w:r>
+      <w:r>
+        <w:instrText xml:space="preserve"> ADDIN ZOTERO_ITEM CSL_CITATION {"citationID":"rmXVU7rv","properties":{"formattedCitation":"(Braun et al., 2019; DeFronzo &amp; Auchus, 2025; Giordano et al., 2011)","plainCitation":"(Braun et al., 2019; DeFronzo &amp; Auchus, 2025; Giordano et al., 2011)","noteIndex":0},"citationItems":[{"id":27407,"uris":["http://zotero.org/users/7317906/items/T3P5KXQY"],"itemData":{"id":27407,"type":"article-journal","abstract":"Cushing's syndrome (CS) is a classical rare disease: it is often suspected in patients who do not have the disease; at the same time, it takes a mean of 3 years to diagnose CS in affected individuals. The main reason is the extreme rarity (1–3/million/year) in combination with the lack of a single lead symptom. CS has to be suspected when a combination of signs and symptoms is present, which together make up the characteristic phenotype of cortisol excess. Unusual fat distribution affecting the face, neck, and trunk; skin changes including plethora, acne, hirsutism, livid striae, and easy bruising; and signs of protein catabolism such as thinned and vulnerable skin, osteoporotic fractures, and proximal myopathy indicate the need for biochemical screening for CS. In contrast, common symptoms like hypertension, weight gain, or diabetes also occur quite frequently in the general population and per se do not justify biochemical testing. First-line screening tests include urinary free cortisol excretion, dexamethasone suppression testing, and late-night salivary cortisol measurements. All three tests have overall reasonable sensitivity and specificity, and first-line testing should be selected on the basis of the physiologic conditions of the patient, drug intake, and available laboratory quality control measures. Two normal test results usually exclude the presence of CS. Other tests and laboratory parameters like the high-dose dexamethasone suppression test, plasma ACTH, the CRH test, and the bilateral inferior petrosal sinus sampling are not part of the initial biochemical screening. As a general rule, biochemical screening should only be performed if the pre-test probability for CS is reasonably high. This article provides an overview about the current standard in the diagnosis of CS starting with clinical scores and screenings, the clinical signs, relevant differential diagnoses, the first-line biochemical screening, and ending with a few exceptional cases.","container-title":"Frontiers in Endocrinology","DOI":"10.3389/fendo.2019.00766","ISSN":"1664-2392","journalAbbreviation":"Front Endocrinol (Lausanne)","note":"PMID: 31787931\nPMCID: PMC6856055","page":"766","source":"PubMed Central","title":"Toward a Diagnostic Score in Cushing's Syndrome","volume":"10","author":[{"family":"Braun","given":"Leah T."},{"family":"Riester","given":"Anna"},{"family":"Oßwald-Kopp","given":"Andrea"},{"family":"Fazel","given":"Julia"},{"family":"Rubinstein","given":"German"},{"family":"Bidlingmaier","given":"Martin"},{"family":"Beuschlein","given":"Felix"},{"family":"Reincke","given":"Martin"}],"issued":{"date-parts":[["2019",11,8]]},"citation-key":"braunDiagnosticScoreCushings2019"}},{"id":27412,"uris":["http://zotero.org/users/7317906/items/3KUT7EVD"],"itemData":{"id":27412,"type":"article-journal","abstract":"Until recently, the prevalence of endogenous Cushing syndrome has been considered to be low. However, improved diagnostic strategies and increased awareness have broadened our understanding of hypercortisolism and its role in the pathophysiology of type 2 diabetes, obesity, hypertension, and cardiovascular disease. Recent studies from Europe, South America, and the U.S. have demonstrated that a significant percentage of individuals with difficult-to-control type 2 diabetes, despite treatment with multiple glucose-lowering agents, have hypercortisolism as a causative factor in their poorly managed diabetes. In this review, we examine the pathophysiologic mechanisms via which excess cortisol contributes to the impairment in glucose homeostasis and recommend that hypercortisolism be added to the Ominous Octet to form the Noxious Nine as the pathophysiologic foundation for the development of type 2 diabetes.","container-title":"Diabetes","DOI":"10.2337/db25-0120","ISSN":"0012-1797","issue":"12","journalAbbreviation":"Diabetes","note":"PMID: 40663715\nPMCID: PMC12645169","page":"2168-2178","source":"PubMed Central","title":"Cushing Syndrome, Hypercortisolism, and Glucose Homeostasis: A Review","title-short":"Cushing Syndrome, Hypercortisolism, and Glucose Homeostasis","volume":"74","author":[{"family":"DeFronzo","given":"Ralph A."},{"family":"Auchus","given":"Richard J."}],"issued":{"date-parts":[["2025",7,15]]},"citation-key":"defronzoCushingSyndromeHypercortisolism2025"}},{"id":27402,"uris":["http://zotero.org/users/7317906/items/VUQD2ZQG"],"itemData":{"id":27402,"type":"article-journal","abstract":"Objective Cushing’s syndrome is associated with several comorbidities responsible for the increased cardiovascular risk, not only during the active phase but also after disease remission. Design In 29 patients with Cushing’s syndrome (14 Cushing’s diseases and 15 adrenal adenomas), waist circumference, fasting and 2-h glucose after oral glucose tolerance test (OGTT), lipid profile and blood pressure were evaluated during the active disease and 1 year after remission and compared with those in 29 sex-, age- and BMI-matched controls. Results During the active disease, waist circumference, 2-h glucose after OGTT, total and LDL cholesterol were higher in patients with Cushing’s syndrome than in controls (P &lt; 0·001) but similar in Cushing’s disease and adrenal adenomas. The prevalence of impaired glucose tolerance (IGT), diabetes mellitus, dyslipidaemia and hypertension was higher (P &lt; 0·001) in patients with Cushing’s syndrome (27%, 24%, 59% and 72%) than in controls (10%, 0%, 21% and 10%), with no significant difference between Cushing’s disease and adrenal adenomas. One year following hormonal remission, waist circumference persisted higher than in controls (P &lt; 0·05) in both Cushing’s disease and adrenal adenomas. Metabolic and cardiovascular abnormalities were still present in both groups, although with a lower prevalence, as well as with a more marked decrease in adrenal adenomas (P &lt; 0·05 vs active disease for IGT, dyslipidaemia and hypertension). Conclusions These results show that chronic hypercortisolism, independently of its aetiology, contributes to metabolic impairment and increased cardiovascular risk, while these abnormalities mostly persist in patients with previous Cushing’s disease after hormonal remission. Pituitary hormonal deficiencies, hormonal replacement treatments and/or incomplete cure from Cushing’s disease may account for these findings.","container-title":"Clinical Endocrinology","DOI":"10.1111/j.1365-2265.2011.04055.x","ISSN":"1365-2265","issue":"3","language":"en","license":"© 2011 Blackwell Publishing Ltd","note":"_eprint: https://onlinelibrary.wiley.com/doi/pdf/10.1111/j.1365-2265.2011.04055.x","page":"354-360","source":"Wiley Online Library","title":"Metabolic and cardiovascular outcomes in patients with Cushing’s syndrome of different aetiologies during active disease and 1 year after remission","volume":"75","author":[{"family":"Giordano","given":"Roberta"},{"family":"Picu","given":"Andreea"},{"family":"Marinazzo","given":"Elisa"},{"family":"D’Angelo","given":"Valentina"},{"family":"Berardelli","given":"Rita"},{"family":"Karamouzis","given":"Ioannis"},{"family":"Forno","given":"Daniela"},{"family":"Zinnà","given":"Domenico"},{"family":"Maccario","given":"Mauro"},{"family":"Ghigo","given":"Ezio"},{"family":"Arvat","given":"Emanuela"}],"issued":{"date-parts":[["2011"]]},"citation-key":"giordanoMetabolicCardiovascularOutcomes2011"}}],"schema":"https://github.com/citation-style-language/schema/raw/master/csl-citation.json"} </w:instrText>
+      </w:r>
+      <w:r>
+        <w:fldChar w:fldCharType="separate"/>
+      </w:r>
+      <w:r>
+        <w:rPr>
+          <w:noProof/>
+        </w:rPr>
+        <w:t>(Braun et al., 2019; DeFronzo &amp; Auchus, 2025; Giordano et al., 2011)</w:t>
+      </w:r>
+      <w:r>
+        <w:fldChar w:fldCharType="end"/>
+      </w:r>
+      <w:r>
+        <w:rPr>
+          <w:rFonts w:eastAsia="Times New Roman" w:cs="Arial"/>
+          <w:color w:val="000000"/>
+          <w:kern w:val="0"/>
+          <w14:ligatures w14:val="none"/>
+        </w:rPr>
+        <w:t>. Cushing’s disease causes both obesity and metabolic related symptoms, and it is difficult to discern the obesity-dependent from the obesity-independent mechanisms of Cushing’s disease. To identify patients with Cushing’s disease, we identified 476 Michigan Medicine participants with propensity-matched control cases for each participant. </w:t>
+      </w:r>
+    </w:p>
+    <w:p>
+      <w:pPr>
+        <w:spacing w:after="0" w:line="240" w:lineRule="auto"/>
+        <w:rPr>
+          <w:rFonts w:eastAsia="Times New Roman" w:cs="Times New Roman"/>
+          <w:kern w:val="0"/>
+          <w14:ligatures w14:val="none"/>
+        </w:rPr>
+      </w:pPr>
+    </w:p>
+    <w:p>
+      <w:pPr>
+        <w:spacing w:after="0" w:line="240" w:lineRule="auto"/>
+        <w:rPr>
+          <w:rFonts w:eastAsia="Times New Roman" w:cs="Arial"/>
+          <w:color w:val="000000"/>
+          <w:kern w:val="0"/>
+          <w14:ligatures w14:val="none"/>
+        </w:rPr>
+      </w:pPr>
+      <w:r>
+        <w:rPr>
+          <w:rFonts w:eastAsia="Times New Roman" w:cs="Arial"/>
+          <w:color w:val="000000"/>
+          <w:kern w:val="0"/>
+          <w14:ligatures w14:val="none"/>
+        </w:rPr>
+        <w:t>We stratified our participants by obesity status and into a Cushing’s disease group and a control group. The Cushing’s group had an elevated BMI compared to the control group (34 kg/m</w:t>
+      </w:r>
+      <w:r>
+        <w:rPr>
+          <w:rFonts w:eastAsia="Times New Roman" w:cs="Arial"/>
+          <w:color w:val="000000"/>
+          <w:kern w:val="0"/>
+          <w:vertAlign w:val="superscript"/>
+          <w14:ligatures w14:val="none"/>
+        </w:rPr>
+        <w:t>2</w:t>
+      </w:r>
+      <w:r>
+        <w:rPr>
+          <w:rFonts w:eastAsia="Times New Roman" w:cs="Arial"/>
+          <w:color w:val="000000"/>
+          <w:kern w:val="0"/>
+          <w14:ligatures w14:val="none"/>
+        </w:rPr>
+        <w:t xml:space="preserve"> vs 29 kg/m</w:t>
+      </w:r>
+      <w:r>
+        <w:rPr>
+          <w:rFonts w:eastAsia="Times New Roman" w:cs="Arial"/>
+          <w:color w:val="000000"/>
+          <w:kern w:val="0"/>
+          <w:vertAlign w:val="superscript"/>
+          <w14:ligatures w14:val="none"/>
+        </w:rPr>
+        <w:t>2</w:t>
+      </w:r>
+      <w:r>
+        <w:rPr>
+          <w:rFonts w:eastAsia="Times New Roman" w:cs="Arial"/>
+          <w:color w:val="000000"/>
+          <w:kern w:val="0"/>
+          <w14:ligatures w14:val="none"/>
+        </w:rPr>
+        <w:t xml:space="preserve">). We found a higher proportion of females diagnosed with Cushing’s compared to males (287 vs 72). Cushing’s disease was associated with an increase in the fasting glucose levels in both our non-obese and obese populations by 26.95 mg/dL and 26.18 mg/dL, respectively. </w:t>
+      </w:r>
+      <w:r>
+        <w:t>In both our obese, and non-obese populations, we saw an increase in ALT and AST levels regardless of Cushing’s disease status</w:t>
+      </w:r>
+      <w:r>
+        <w:t>.</w:t>
+      </w:r>
+      <w:r>
+        <w:t xml:space="preserve"> In the case of ALT levels, the increase due to Cushing’s disease was much greater in the patients with obesity (73.4 vs 35.1 mg/dL).  This was also true for AST levels (increase by 56.3 mg/dL in patients with obesity and 16.9 for patients without obesity</w:t>
+      </w:r>
+      <w:r>
+        <w:t>).</w:t>
+      </w:r>
+      <w:r>
+        <w:rPr>
+          <w:rFonts w:eastAsia="Times New Roman" w:cs="Arial"/>
+          <w:color w:val="000000"/>
+          <w:kern w:val="0"/>
+          <w14:ligatures w14:val="none"/>
+        </w:rPr>
+        <w:t xml:space="preserve"> </w:t>
+      </w:r>
+      <w:r>
+        <w:rPr>
+          <w:rFonts w:eastAsia="Times New Roman" w:cs="Arial"/>
+          <w:color w:val="000000"/>
+          <w:kern w:val="0"/>
+          <w14:ligatures w14:val="none"/>
+        </w:rPr>
+        <w:t>Cushing’s disease also had a moderating effect on blood pressure, with participants without a BMI under 30 increasing by 12.55 mmHg and participants with obesity increasing by only 7.94 mmHg.</w:t>
+      </w:r>
+    </w:p>
+    <w:p>
+      <w:pPr>
+        <w:spacing w:after="0" w:line="240" w:lineRule="auto"/>
+        <w:rPr>
+          <w:rFonts w:eastAsia="Times New Roman" w:cs="Times New Roman"/>
+          <w:kern w:val="0"/>
+          <w14:ligatures w14:val="none"/>
+        </w:rPr>
+      </w:pPr>
+      <w:r>
+        <w:rPr>
+          <w:rFonts w:eastAsia="Times New Roman" w:cs="Arial"/>
+          <w:color w:val="000000"/>
+          <w:kern w:val="0"/>
+          <w14:ligatures w14:val="none"/>
+        </w:rPr>
+        <w:t> </w:t>
+      </w:r>
+    </w:p>
+    <w:p>
+      <w:pPr>
+        <w:spacing w:after="0" w:line="240" w:lineRule="auto"/>
+        <w:rPr>
+          <w:rFonts w:eastAsia="Times New Roman" w:cs="Times New Roman"/>
+          <w:kern w:val="0"/>
+          <w14:ligatures w14:val="none"/>
+        </w:rPr>
+      </w:pPr>
+      <w:r>
+        <w:rPr>
+          <w:rFonts w:eastAsia="Times New Roman" w:cs="Arial"/>
+          <w:color w:val="000000"/>
+          <w:kern w:val="0"/>
+          <w14:ligatures w14:val="none"/>
+        </w:rPr>
+        <w:t xml:space="preserve">These findings highlight the need to </w:t>
+      </w:r>
+      <w:r>
+        <w:rPr>
+          <w:rFonts w:eastAsia="Times New Roman" w:cs="Arial"/>
+          <w:color w:val="000000"/>
+          <w:kern w:val="0"/>
+          <w14:ligatures w14:val="none"/>
+        </w:rPr>
+        <w:t>consider</w:t>
+      </w:r>
+      <w:r>
+        <w:rPr>
+          <w:rFonts w:eastAsia="Times New Roman" w:cs="Arial"/>
+          <w:color w:val="000000"/>
+          <w:kern w:val="0"/>
+          <w14:ligatures w14:val="none"/>
+        </w:rPr>
+        <w:t xml:space="preserve"> obesity status when evaluating the effects of Cushing’s disease. </w:t>
+      </w:r>
+    </w:p>
     <w:p>
       <w:pPr>
         <w:pStyle w:val="Heading1"/>
@@ -179,6 +387,7 @@
     </w:p>
     <w:p>
       <w:r>
+        <w:lastRenderedPageBreak/>
         <w:t xml:space="preserve">Weight gain, and obesity, are classic clinical manifestations of Cushing’s disease </w:t>
       </w:r>
       <w:r>
@@ -428,221 +637,230 @@
         <w:t xml:space="preserve">  We excluded participants if they </w:t>
       </w:r>
       <w:r>
-        <w:t xml:space="preserve">did not have a </w:t>
-      </w:r>
+        <w:t>did not have a Cushing’s disease diagnosis, treatment date, lab history, or relevant demographic data documented.</w:t>
+      </w:r>
+      <w:r>
+        <w:t xml:space="preserve"> Race and ethnicity were self-reported, with groups of &lt;10 aggregated into the other category.</w:t>
+      </w:r>
+      <w:r>
+        <w:t xml:space="preserve"> </w:t>
+      </w:r>
+    </w:p>
+    <w:p>
+      <w:r>
+        <w:t xml:space="preserve">To identify controls, </w:t>
+      </w:r>
+      <w:r>
+        <w:t>we used</w:t>
+      </w:r>
+      <w:r>
+        <w:t xml:space="preserve"> the </w:t>
+      </w:r>
+      <w:r>
+        <w:t xml:space="preserve"> MatchIt </w:t>
+      </w:r>
+      <w:r>
+        <w:t xml:space="preserve">package </w:t>
+      </w:r>
+      <w:r>
+        <w:t xml:space="preserve">(version </w:t>
+      </w:r>
+      <w:r>
+        <w:t xml:space="preserve">4.7.1; </w:t>
+      </w:r>
+      <w:r>
+        <w:fldChar w:fldCharType="begin"/>
+      </w:r>
+      <w:r>
+        <w:instrText xml:space="preserve"> ADDIN ZOTERO_ITEM CSL_CITATION {"citationID":"Pl5Gc3F1","properties":{"formattedCitation":"(Ho et al., 2011)","plainCitation":"(Ho et al., 2011)","noteIndex":0},"citationItems":[{"id":12196,"uris":["http://zotero.org/users/7317906/items/H5CAAL6F"],"itemData":{"id":12196,"type":"article-journal","abstract":"MatchIt implements the suggestions of Ho, Imai, King, and Stuart (2007) for improving parametric statistical models by preprocessing data with nonparametric matching methods. MatchIt implements a wide range of sophisticated matching methods, making it possible to greatly reduce the dependence of causal inferences on hard-to-justify, but commonly made, statistical modeling assumptions. The software also easily fits into existing research practices since, after preprocessing data with MatchIt, researchers can use whatever parametric model they would have used without MatchIt, but produce inferences with substantially more robustness and less sensitivity to modeling assumptions. MatchIt is an R program, and also works seamlessly with Zelig.","container-title":"Journal of Statistical Software","DOI":"10.18637/jss.v042.i08","ISSN":"1548-7660","language":"en","license":"Copyright (c) 2006 Daniel Ho, Kosuke Imai, Gary King, Elizabeth A. Stuart","page":"1-28","source":"www.jstatsoft.org","title":"MatchIt: Nonparametric Preprocessing for Parametric Causal Inference","title-short":"MatchIt","volume":"42","author":[{"family":"Ho","given":"Daniel"},{"family":"Imai","given":"Kosuke"},{"family":"King","given":"Gary"},{"family":"Stuart","given":"Elizabeth A."}],"issued":{"date-parts":[["2011",6,14]]},"citation-key":"hoMatchItNonparametricPreprocessing2011"}}],"schema":"https://github.com/citation-style-language/schema/raw/master/csl-citation.json"} </w:instrText>
+      </w:r>
+      <w:r>
+        <w:fldChar w:fldCharType="separate"/>
+      </w:r>
+      <w:r>
+        <w:rPr>
+          <w:noProof/>
+        </w:rPr>
+        <w:t>(Ho et al., 2011)</w:t>
+      </w:r>
+      <w:r>
+        <w:fldChar w:fldCharType="end"/>
+      </w:r>
+      <w:r>
+        <w:t>)</w:t>
+      </w:r>
+      <w:r>
+        <w:t>. F</w:t>
+      </w:r>
+      <w:r>
+        <w:t xml:space="preserve">or </w:t>
+      </w:r>
+      <w:r>
+        <w:t xml:space="preserve">each outcome we identified all Cushing’s cases </w:t>
+      </w:r>
+      <w:r>
+        <w:t xml:space="preserve">with that measurement </w:t>
+      </w:r>
+      <w:r>
+        <w:t xml:space="preserve">and potential controls with that measurement available. </w:t>
+      </w:r>
+      <w:r>
+        <w:t>For Cushing’s cases to be included they had to have had the laboratory measure</w:t>
+      </w:r>
+      <w:r>
+        <w:t>d</w:t>
+      </w:r>
+      <w:r>
+        <w:t xml:space="preserve"> </w:t>
+      </w:r>
+      <w:r>
+        <w:t>within a year</w:t>
+      </w:r>
+      <w:r>
+        <w:t xml:space="preserve"> </w:t>
+      </w:r>
+      <w:r>
+        <w:t>prior to surgical treatment</w:t>
+      </w:r>
+      <w:r>
+        <w:t>, taking the most recent value</w:t>
+      </w:r>
+      <w:r>
+        <w:t xml:space="preserve">.  </w:t>
+      </w:r>
+      <w:r>
+        <w:t>We performed nearest</w:t>
+      </w:r>
+      <w:r>
+        <w:rPr>
+          <w:rFonts w:ascii="Cambria Math" w:hAnsi="Cambria Math" w:cs="Cambria Math"/>
+        </w:rPr>
+        <w:t>‐</w:t>
+      </w:r>
+      <w:r>
+        <w:t xml:space="preserve">neighbor propensity score matching (ratio = </w:t>
+      </w:r>
+      <w:r>
+        <w:t>10:1</w:t>
+      </w:r>
+      <w:r>
+        <w:t xml:space="preserve">) with age in the </w:t>
+      </w:r>
+      <w:r>
+        <w:t>propensity score</w:t>
+      </w:r>
+      <w:r>
+        <w:t xml:space="preserve"> model and exact matching on gender and race/ethnicity</w:t>
+      </w:r>
+      <w:r>
+        <w:t xml:space="preserve"> from a pool of </w:t>
+      </w:r>
+      <w:r>
+        <w:t>98,436</w:t>
+      </w:r>
+      <w:r>
+        <w:t xml:space="preserve"> </w:t>
+      </w:r>
+      <w:r>
+        <w:t>Michigan Medicine patients</w:t>
+      </w:r>
+      <w:r>
+        <w:t xml:space="preserve">. This procedure was repeated separately for each outcome </w:t>
+      </w:r>
+      <w:r>
+        <w:t xml:space="preserve">as our </w:t>
+      </w:r>
+      <w:r>
+        <w:t>primary analys</w:t>
+      </w:r>
+      <w:r>
+        <w:t>e</w:t>
+      </w:r>
+      <w:r>
+        <w:t xml:space="preserve">s. </w:t>
+      </w:r>
+      <w:r>
+        <w:t xml:space="preserve"> The</w:t>
+      </w:r>
+      <w:r>
+        <w:t xml:space="preserve"> maximal</w:t>
+      </w:r>
+      <w:r>
+        <w:t xml:space="preserve"> post-matching standardized mean difference for </w:t>
+      </w:r>
+      <w:r>
+        <w:t>a</w:t>
+      </w:r>
+      <w:r>
+        <w:t xml:space="preserve">ge </w:t>
+      </w:r>
+      <w:r>
+        <w:t>was</w:t>
+      </w:r>
+      <w:r>
+        <w:t xml:space="preserve"> &lt;0.</w:t>
+      </w:r>
+      <w:r>
+        <w:t>05</w:t>
+      </w:r>
+      <w:r>
+        <w:t xml:space="preserve"> for all outcomes, indicating adequate balance</w:t>
+      </w:r>
+      <w:r>
+        <w:t xml:space="preserve"> (Supplementary Figure 1 and Supplementary Table 1)</w:t>
+      </w:r>
+      <w:r>
+        <w:t>.</w:t>
+      </w:r>
+      <w:r>
+        <w:t xml:space="preserve">  </w:t>
+      </w:r>
+      <w:r>
+        <w:t>We</w:t>
+      </w:r>
+      <w:r>
+        <w:t xml:space="preserve"> only included patients with BMI</w:t>
+      </w:r>
+      <w:r>
+        <w:t>’</w:t>
+      </w:r>
+      <w:r>
+        <w:t xml:space="preserve">s within the 5-75 range, and between </w:t>
+      </w:r>
+      <w:r>
+        <w:t>18</w:t>
+      </w:r>
+      <w:r>
+        <w:t xml:space="preserve">-75 years of age. Finally, we also only included </w:t>
+      </w:r>
+      <w:r>
+        <w:t>non-Cushing’s</w:t>
+      </w:r>
+      <w:r>
+        <w:t xml:space="preserve"> </w:t>
+      </w:r>
+      <w:r>
+        <w:t xml:space="preserve">patients </w:t>
+      </w:r>
+      <w:r>
+        <w:t xml:space="preserve">as potential controls if they had </w:t>
+      </w:r>
+      <w:r>
+        <w:t>at least one clinical visit in</w:t>
+      </w:r>
+      <w:r>
+        <w:t xml:space="preserve"> the </w:t>
+      </w:r>
+      <w:r>
+        <w:t>2022–2025-year</w:t>
+      </w:r>
+      <w:r>
+        <w:t xml:space="preserve"> range. </w:t>
+      </w:r>
+    </w:p>
+    <w:p>
       <w:r>
         <w:lastRenderedPageBreak/>
-        <w:t>Cushing’s disease diagnosis, treatment date, lab history, or relevant demographic data documented.</w:t>
-      </w:r>
-      <w:r>
-        <w:t xml:space="preserve"> Race and ethnicity were self-reported, with groups of &lt;10 aggregated into the other category.</w:t>
-      </w:r>
-      <w:r>
-        <w:t xml:space="preserve"> </w:t>
-      </w:r>
-    </w:p>
-    <w:p>
-      <w:r>
-        <w:t xml:space="preserve">To identify controls, </w:t>
-      </w:r>
-      <w:r>
-        <w:t>we used</w:t>
-      </w:r>
-      <w:r>
-        <w:t xml:space="preserve"> the </w:t>
-      </w:r>
-      <w:r>
-        <w:t xml:space="preserve"> MatchIt </w:t>
-      </w:r>
-      <w:r>
-        <w:t xml:space="preserve">package </w:t>
-      </w:r>
-      <w:r>
-        <w:t xml:space="preserve">(version </w:t>
-      </w:r>
-      <w:r>
-        <w:t xml:space="preserve">4.7.1; </w:t>
-      </w:r>
-      <w:r>
-        <w:fldChar w:fldCharType="begin"/>
-      </w:r>
-      <w:r>
-        <w:instrText xml:space="preserve"> ADDIN ZOTERO_ITEM CSL_CITATION {"citationID":"Pl5Gc3F1","properties":{"formattedCitation":"(Ho et al., 2011)","plainCitation":"(Ho et al., 2011)","noteIndex":0},"citationItems":[{"id":12196,"uris":["http://zotero.org/users/7317906/items/H5CAAL6F"],"itemData":{"id":12196,"type":"article-journal","abstract":"MatchIt implements the suggestions of Ho, Imai, King, and Stuart (2007) for improving parametric statistical models by preprocessing data with nonparametric matching methods. MatchIt implements a wide range of sophisticated matching methods, making it possible to greatly reduce the dependence of causal inferences on hard-to-justify, but commonly made, statistical modeling assumptions. The software also easily fits into existing research practices since, after preprocessing data with MatchIt, researchers can use whatever parametric model they would have used without MatchIt, but produce inferences with substantially more robustness and less sensitivity to modeling assumptions. MatchIt is an R program, and also works seamlessly with Zelig.","container-title":"Journal of Statistical Software","DOI":"10.18637/jss.v042.i08","ISSN":"1548-7660","language":"en","license":"Copyright (c) 2006 Daniel Ho, Kosuke Imai, Gary King, Elizabeth A. Stuart","page":"1-28","source":"www.jstatsoft.org","title":"MatchIt: Nonparametric Preprocessing for Parametric Causal Inference","title-short":"MatchIt","volume":"42","author":[{"family":"Ho","given":"Daniel"},{"family":"Imai","given":"Kosuke"},{"family":"King","given":"Gary"},{"family":"Stuart","given":"Elizabeth A."}],"issued":{"date-parts":[["2011",6,14]]},"citation-key":"hoMatchItNonparametricPreprocessing2011"}}],"schema":"https://github.com/citation-style-language/schema/raw/master/csl-citation.json"} </w:instrText>
-      </w:r>
-      <w:r>
-        <w:fldChar w:fldCharType="separate"/>
-      </w:r>
-      <w:r>
-        <w:rPr>
-          <w:noProof/>
-        </w:rPr>
-        <w:t>(Ho et al., 2011)</w:t>
-      </w:r>
-      <w:r>
-        <w:fldChar w:fldCharType="end"/>
-      </w:r>
-      <w:r>
-        <w:t>)</w:t>
-      </w:r>
-      <w:r>
-        <w:t>. F</w:t>
-      </w:r>
-      <w:r>
-        <w:t xml:space="preserve">or </w:t>
-      </w:r>
-      <w:r>
-        <w:t xml:space="preserve">each outcome we identified all Cushing’s cases </w:t>
-      </w:r>
-      <w:r>
-        <w:t xml:space="preserve">with that measurement </w:t>
-      </w:r>
-      <w:r>
-        <w:t xml:space="preserve">and potential controls with that measurement available. </w:t>
-      </w:r>
-      <w:r>
-        <w:t>For Cushing’s cases to be included they had to have had the laboratory measure</w:t>
-      </w:r>
-      <w:r>
-        <w:t>d</w:t>
-      </w:r>
-      <w:r>
-        <w:t xml:space="preserve"> </w:t>
-      </w:r>
-      <w:r>
-        <w:t>within a year</w:t>
-      </w:r>
-      <w:r>
-        <w:t xml:space="preserve"> </w:t>
-      </w:r>
-      <w:r>
-        <w:t>prior to surgical treatment</w:t>
-      </w:r>
-      <w:r>
-        <w:t>, taking the most recent value</w:t>
-      </w:r>
-      <w:r>
-        <w:t xml:space="preserve">.  </w:t>
-      </w:r>
-      <w:r>
-        <w:t>We performed nearest</w:t>
-      </w:r>
-      <w:r>
-        <w:rPr>
-          <w:rFonts w:ascii="Cambria Math" w:hAnsi="Cambria Math" w:cs="Cambria Math"/>
-        </w:rPr>
-        <w:t>‐</w:t>
-      </w:r>
-      <w:r>
-        <w:t xml:space="preserve">neighbor propensity score matching (ratio = </w:t>
-      </w:r>
-      <w:r>
-        <w:t>10:1</w:t>
-      </w:r>
-      <w:r>
-        <w:t xml:space="preserve">) with age in the </w:t>
-      </w:r>
-      <w:r>
-        <w:t>propensity score</w:t>
-      </w:r>
-      <w:r>
-        <w:t xml:space="preserve"> model and exact matching on gender and race/ethnicity</w:t>
-      </w:r>
-      <w:r>
-        <w:t xml:space="preserve"> from a pool of </w:t>
-      </w:r>
-      <w:r>
-        <w:t>98,436</w:t>
-      </w:r>
-      <w:r>
-        <w:t xml:space="preserve"> </w:t>
-      </w:r>
-      <w:r>
-        <w:t>Michigan Medicine patients</w:t>
-      </w:r>
-      <w:r>
-        <w:t xml:space="preserve">. This procedure was repeated separately for each outcome </w:t>
-      </w:r>
-      <w:r>
-        <w:t xml:space="preserve">as our </w:t>
-      </w:r>
-      <w:r>
-        <w:t>primary analys</w:t>
-      </w:r>
-      <w:r>
-        <w:t>e</w:t>
-      </w:r>
-      <w:r>
-        <w:t xml:space="preserve">s. </w:t>
-      </w:r>
-      <w:r>
-        <w:t xml:space="preserve"> The</w:t>
-      </w:r>
-      <w:r>
-        <w:t xml:space="preserve"> maximal</w:t>
-      </w:r>
-      <w:r>
-        <w:t xml:space="preserve"> post-matching standardized mean difference for </w:t>
-      </w:r>
-      <w:r>
-        <w:t>a</w:t>
-      </w:r>
-      <w:r>
-        <w:t xml:space="preserve">ge </w:t>
-      </w:r>
-      <w:r>
-        <w:t>was</w:t>
-      </w:r>
-      <w:r>
-        <w:t xml:space="preserve"> &lt;0.</w:t>
-      </w:r>
-      <w:r>
-        <w:t>05</w:t>
-      </w:r>
-      <w:r>
-        <w:t xml:space="preserve"> for all outcomes, indicating adequate balance</w:t>
-      </w:r>
-      <w:r>
-        <w:t xml:space="preserve"> (Supplementary Figure 1 and Supplementary Table 1)</w:t>
-      </w:r>
-      <w:r>
-        <w:t>.</w:t>
-      </w:r>
-      <w:r>
-        <w:t xml:space="preserve">  </w:t>
-      </w:r>
-      <w:r>
-        <w:t>We</w:t>
-      </w:r>
-      <w:r>
-        <w:t xml:space="preserve"> only included patients with BMI’s within the 5-75 range, and between </w:t>
-      </w:r>
-      <w:r>
-        <w:t>18</w:t>
-      </w:r>
-      <w:r>
-        <w:t xml:space="preserve">-75 years of age. Finally, we also only included </w:t>
-      </w:r>
-      <w:r>
-        <w:t>non-Cushing’s</w:t>
-      </w:r>
-      <w:r>
-        <w:t xml:space="preserve"> </w:t>
-      </w:r>
-      <w:r>
-        <w:t xml:space="preserve">patients </w:t>
-      </w:r>
-      <w:r>
-        <w:t xml:space="preserve">as potential controls if they had </w:t>
-      </w:r>
-      <w:r>
-        <w:t>at least one clinical visit in</w:t>
-      </w:r>
-      <w:r>
-        <w:t xml:space="preserve"> the 2022-2025 year range. </w:t>
-      </w:r>
-    </w:p>
-    <w:p>
-      <w:r>
         <w:t>BMI was not included in the propensity score because we aimed to evaluate obesity as a moderator of the effects of Cushing’s disease</w:t>
       </w:r>
       <w:r>
@@ -660,7 +878,13 @@
         <w:t xml:space="preserve">(MAP) </w:t>
       </w:r>
       <w:r>
-        <w:t>was directly measured in the majority of cases. When MAP was missing but systolic and diastolic BP were available</w:t>
+        <w:t xml:space="preserve">was directly measured in </w:t>
+      </w:r>
+      <w:r>
+        <w:t>most</w:t>
+      </w:r>
+      <w:r>
+        <w:t xml:space="preserve"> cases. When MAP was missing but systolic and diastolic BP were available</w:t>
       </w:r>
       <w:r>
         <w:t xml:space="preserve">, </w:t>
@@ -731,7 +955,6 @@
         <w:pStyle w:val="Heading1"/>
       </w:pPr>
       <w:r>
-        <w:lastRenderedPageBreak/>
         <w:t>Results</w:t>
       </w:r>
     </w:p>
@@ -901,7 +1124,11 @@
     </w:p>
     <w:p>
       <w:r>
-        <w:t xml:space="preserve">We performed outcome-specific propensity matching to identify appropriate controls, starting from those with generating exact matches for gender, race and ethnicity.  We then algorithmically matched for age, generating 10 controls for each case.  Matching was </w:t>
+        <w:t xml:space="preserve">We performed outcome-specific propensity matching to identify appropriate controls, starting from those with generating exact matches for gender, race and ethnicity.  We then </w:t>
+      </w:r>
+      <w:r>
+        <w:lastRenderedPageBreak/>
+        <w:t xml:space="preserve">algorithmically matched for age, generating 10 controls for each case.  Matching was </w:t>
       </w:r>
       <w:r>
         <w:t xml:space="preserve">effective </w:t>
@@ -1355,11 +1582,361 @@
     </w:p>
     <w:p>
       <w:r>
+        <w:t>As we expected, participants with Cushing’s disease had a higher BMI than the controls</w:t>
+      </w:r>
+      <w:r>
+        <w:t>, with 64% of participants with Cushing’s disease having a BMI above 30 kg/m</w:t>
+      </w:r>
+      <w:r>
+        <w:rPr>
+          <w:vertAlign w:val="superscript"/>
+        </w:rPr>
+        <w:t>2</w:t>
+      </w:r>
+      <w:r>
+        <w:t xml:space="preserve">, compared to </w:t>
+      </w:r>
+      <w:r>
+        <w:t>40</w:t>
+      </w:r>
+      <w:r>
+        <w:t>% controls (p&lt;0.001).</w:t>
+      </w:r>
+      <w:r>
+        <w:t xml:space="preserve">  </w:t>
+      </w:r>
+      <w:r>
+        <w:t xml:space="preserve">To understand the </w:t>
+      </w:r>
+      <w:r>
+        <w:t xml:space="preserve">cross-sectional </w:t>
+      </w:r>
+      <w:r>
+        <w:t>relationship between obesity and Cushing’s disease, we</w:t>
+      </w:r>
+      <w:r>
+        <w:t xml:space="preserve"> stratified our participants </w:t>
+      </w:r>
+      <w:r>
+        <w:t>with a BMI above or below 30 kg/m</w:t>
+      </w:r>
+      <w:r>
+        <w:rPr>
+          <w:vertAlign w:val="superscript"/>
+        </w:rPr>
+        <w:t>2</w:t>
+      </w:r>
+      <w:r>
+        <w:t xml:space="preserve">, </w:t>
+      </w:r>
+      <w:r>
+        <w:t>across</w:t>
+      </w:r>
+      <w:r>
+        <w:t xml:space="preserve"> both cases and controls</w:t>
+      </w:r>
+      <w:r>
+        <w:t xml:space="preserve">.  </w:t>
+      </w:r>
+      <w:r>
+        <w:t>We found that 232 patients had a BMI above 30 kg/m</w:t>
+      </w:r>
+      <w:r>
+        <w:rPr>
+          <w:vertAlign w:val="superscript"/>
+        </w:rPr>
+        <w:t>2</w:t>
+      </w:r>
+      <w:r>
+        <w:rPr>
+          <w:vertAlign w:val="superscript"/>
+        </w:rPr>
+        <w:t xml:space="preserve"> </w:t>
+      </w:r>
+      <w:r>
+        <w:t>and 128 had a BMI below 30 kg/m</w:t>
+      </w:r>
+      <w:r>
+        <w:rPr>
+          <w:vertAlign w:val="superscript"/>
+        </w:rPr>
+        <w:t>2</w:t>
+      </w:r>
+      <w:r>
+        <w:rPr>
+          <w:vertAlign w:val="superscript"/>
+        </w:rPr>
+        <w:t xml:space="preserve"> </w:t>
+      </w:r>
+      <w:r>
+        <w:t xml:space="preserve">at time of diagnosis. </w:t>
+      </w:r>
+      <w:r>
+        <w:t>As shown in Table 2, and as expected given our stratification, the four groups differed in several characteristics</w:t>
+      </w:r>
+      <w:r>
+        <w:t xml:space="preserve">, </w:t>
+      </w:r>
+      <w:r>
+        <w:t>which</w:t>
+      </w:r>
+      <w:r>
+        <w:t xml:space="preserve"> will be adjusted for in multivariable models below</w:t>
+      </w:r>
+      <w:r>
+        <w:t>.</w:t>
+      </w:r>
+      <w:r>
+        <w:t xml:space="preserve">  For example, among</w:t>
+      </w:r>
+      <w:r>
+        <w:t xml:space="preserve"> the subgroup of</w:t>
+      </w:r>
+      <w:r>
+        <w:t xml:space="preserve"> participants with a BMI &gt; 30 mg/m</w:t>
+      </w:r>
+      <w:r>
+        <w:rPr>
+          <w:vertAlign w:val="superscript"/>
+        </w:rPr>
+        <w:t>2</w:t>
+      </w:r>
+      <w:r>
+        <w:t>, participants with Cushing’s disease had a higher BMI than controls</w:t>
+      </w:r>
+      <w:r>
+        <w:t xml:space="preserve"> (p=0.0024 by a Mann-Whitney test)</w:t>
+      </w:r>
+      <w:r>
+        <w:t xml:space="preserve">.  </w:t>
+      </w:r>
+      <w:r>
+        <w:t>Females with Cushing’s disease were more likely to have a BMI over 30 kg/m</w:t>
+      </w:r>
+      <w:r>
+        <w:rPr>
+          <w:vertAlign w:val="superscript"/>
+        </w:rPr>
+        <w:t>2</w:t>
+      </w:r>
+      <w:r>
+        <w:t xml:space="preserve"> (68% </w:t>
+      </w:r>
+      <w:r>
+        <w:t xml:space="preserve">of </w:t>
+      </w:r>
+      <w:r>
+        <w:t xml:space="preserve">females </w:t>
+      </w:r>
+      <w:r>
+        <w:t>compared to</w:t>
+      </w:r>
+      <w:r>
+        <w:t xml:space="preserve"> 51% of males with Cushing’s disease, p=0.015).  </w:t>
+      </w:r>
+      <w:r>
+        <w:t>Among participants with Cushing’s disease, Asian (6</w:t>
+      </w:r>
+      <w:r>
+        <w:t xml:space="preserve"> out of </w:t>
+      </w:r>
+      <w:r>
+        <w:t xml:space="preserve">10) and Hispanic or Latino </w:t>
+      </w:r>
+      <w:r>
+        <w:t>(6</w:t>
+      </w:r>
+      <w:r>
+        <w:t xml:space="preserve"> out of </w:t>
+      </w:r>
+      <w:r>
+        <w:t xml:space="preserve">8) </w:t>
+      </w:r>
+      <w:r>
+        <w:t>participants were more likely have a BMI under 30 kg/m</w:t>
+      </w:r>
+      <w:r>
+        <w:rPr>
+          <w:vertAlign w:val="superscript"/>
+        </w:rPr>
+        <w:t xml:space="preserve">2 </w:t>
+      </w:r>
+      <w:r>
+        <w:t xml:space="preserve">compared to </w:t>
+      </w:r>
+      <w:r>
+        <w:t xml:space="preserve">the overall average </w:t>
+      </w:r>
+      <w:r>
+        <w:t>(</w:t>
+      </w:r>
+      <w:r>
+        <w:t>36%</w:t>
+      </w:r>
+      <w:r>
+        <w:t>, p=0.027 and 0.176 respectively via Fisher’s exact test</w:t>
+      </w:r>
+      <w:r>
+        <w:t>s</w:t>
+      </w:r>
+      <w:r>
+        <w:t xml:space="preserve">).  </w:t>
+      </w:r>
+      <w:r>
+        <w:t>The</w:t>
+      </w:r>
+      <w:r>
+        <w:t xml:space="preserve"> average age of </w:t>
+      </w:r>
+      <w:r>
+        <w:t xml:space="preserve">participants with </w:t>
+      </w:r>
+      <w:r>
+        <w:t>Cushing’s</w:t>
+      </w:r>
+      <w:r>
+        <w:t xml:space="preserve"> disease</w:t>
+      </w:r>
+      <w:r>
+        <w:t xml:space="preserve"> with or without obesity was similar</w:t>
+      </w:r>
+      <w:r>
+        <w:t xml:space="preserve"> after stratification</w:t>
+      </w:r>
+      <w:r>
+        <w:t>.</w:t>
+      </w:r>
+      <w:r>
+        <w:t xml:space="preserve">  Overall</w:t>
+      </w:r>
+      <w:r>
+        <w:t>,</w:t>
+      </w:r>
+      <w:r>
+        <w:t xml:space="preserve"> the subgroup of patients with obesity and Cushing’s disease tended to be disproportionately female and White, but similar in age.</w:t>
+      </w:r>
+    </w:p>
+    <w:p>
+      <w:pPr>
+        <w:pStyle w:val="NormalWeb"/>
+        <w:rPr>
+          <w:rStyle w:val="Heading2Char"/>
+        </w:rPr>
+      </w:pPr>
+      <w:r>
+        <w:rPr>
+          <w:rStyle w:val="Heading2Char"/>
+        </w:rPr>
+        <w:t xml:space="preserve">Modification of Cushing’s disease-related </w:t>
+      </w:r>
+      <w:r>
+        <w:rPr>
+          <w:rStyle w:val="Heading2Char"/>
+        </w:rPr>
+        <w:t>comorbidities</w:t>
+      </w:r>
+      <w:r>
+        <w:rPr>
+          <w:rStyle w:val="Heading2Char"/>
+        </w:rPr>
+        <w:t xml:space="preserve"> by obesity </w:t>
+      </w:r>
+    </w:p>
+    <w:p>
+      <w:r>
         <w:lastRenderedPageBreak/>
-        <w:t>As we expected, participants with Cushing’s disease had a higher BMI than the controls</w:t>
-      </w:r>
-      <w:r>
-        <w:t>, with 64% of participants with Cushing’s disease having a BMI above 30 kg/m</w:t>
+        <w:t>To identify how obesity alters metabolic outcomes related to Cushing’s disease, we evaluated the effects of Cushing’s disease on several key metabolic variables including glycem</w:t>
+      </w:r>
+      <w:r>
+        <w:t>i</w:t>
+      </w:r>
+      <w:r>
+        <w:t xml:space="preserve">a (fasting glucose and </w:t>
+      </w:r>
+      <w:r>
+        <w:t xml:space="preserve">for a smaller number of participants, </w:t>
+      </w:r>
+      <w:r>
+        <w:t>HbA1c), liver enzymes, and blood pressure (Figure 2 and Table 3).  As described below we noted substantial effect modification by obesity for liver enzymes and blood pressure (Table 3B).</w:t>
+      </w:r>
+    </w:p>
+    <w:p>
+      <w:pPr>
+        <w:pStyle w:val="Heading3"/>
+      </w:pPr>
+      <w:r>
+        <w:t>Dysglycemia</w:t>
+      </w:r>
+    </w:p>
+    <w:p>
+      <w:r>
+        <w:t>The</w:t>
+      </w:r>
+      <w:r>
+        <w:t xml:space="preserve"> first metabolic variable of interest was the fasting glucose levels of our obese and non-obese populations. As shown in </w:t>
+      </w:r>
+      <w:r>
+        <w:t xml:space="preserve">Figure 2 and </w:t>
+      </w:r>
+      <w:r>
+        <w:t>Table 3</w:t>
+      </w:r>
+      <w:r>
+        <w:t>A</w:t>
+      </w:r>
+      <w:r>
+        <w:t>, we observed a</w:t>
+      </w:r>
+      <w:r>
+        <w:t xml:space="preserve"> significant </w:t>
+      </w:r>
+      <w:r>
+        <w:t xml:space="preserve">increase in </w:t>
+      </w:r>
+      <w:r>
+        <w:t xml:space="preserve">fasting </w:t>
+      </w:r>
+      <w:r>
+        <w:t xml:space="preserve">blood glucose levels </w:t>
+      </w:r>
+      <w:r>
+        <w:t xml:space="preserve">among </w:t>
+      </w:r>
+      <w:r>
+        <w:t>participants</w:t>
+      </w:r>
+      <w:r>
+        <w:t xml:space="preserve"> with Cushing’s disease, regardless of obesity status</w:t>
+      </w:r>
+      <w:r>
+        <w:t xml:space="preserve"> (p</w:t>
+      </w:r>
+      <w:r>
+        <w:t>&lt;0.01</w:t>
+      </w:r>
+      <w:r>
+        <w:t xml:space="preserve"> for both groups).</w:t>
+      </w:r>
+      <w:r>
+        <w:t xml:space="preserve"> The </w:t>
+      </w:r>
+      <w:r>
+        <w:t xml:space="preserve">patients with obesity </w:t>
+      </w:r>
+      <w:r>
+        <w:t xml:space="preserve">population had a slightly larger increase (26.9 vs. </w:t>
+      </w:r>
+      <w:r>
+        <w:t>24.6</w:t>
+      </w:r>
+      <w:r>
+        <w:t xml:space="preserve"> mg/dL</w:t>
+      </w:r>
+      <w:r>
+        <w:t xml:space="preserve">) than </w:t>
+      </w:r>
+      <w:r>
+        <w:t>those with a BMI under 30 kg/m</w:t>
       </w:r>
       <w:r>
         <w:rPr>
@@ -1368,31 +1945,309 @@
         <w:t>2</w:t>
       </w:r>
       <w:r>
-        <w:t xml:space="preserve">, compared to </w:t>
-      </w:r>
-      <w:r>
-        <w:t>40</w:t>
-      </w:r>
-      <w:r>
-        <w:t>% controls (p&lt;0.001).</w:t>
-      </w:r>
-      <w:r>
-        <w:t xml:space="preserve">  </w:t>
-      </w:r>
-      <w:r>
-        <w:t xml:space="preserve">To understand the </w:t>
-      </w:r>
-      <w:r>
-        <w:t xml:space="preserve">cross-sectional </w:t>
-      </w:r>
-      <w:r>
-        <w:t>relationship between obesity and Cushing’s disease, we</w:t>
-      </w:r>
-      <w:r>
-        <w:t xml:space="preserve"> stratified our participants </w:t>
-      </w:r>
-      <w:r>
-        <w:t>with a BMI above or below 30 kg/m</w:t>
+        <w:t>, but this was not a large enough difference to provide any significant evidence of an effect modification for obesity</w:t>
+      </w:r>
+      <w:r>
+        <w:t xml:space="preserve"> (p=0.51; Table 3B)</w:t>
+      </w:r>
+      <w:r>
+        <w:t xml:space="preserve">. </w:t>
+      </w:r>
+      <w:r>
+        <w:t>Similarly</w:t>
+      </w:r>
+      <w:r>
+        <w:t>,</w:t>
+      </w:r>
+      <w:r>
+        <w:t xml:space="preserve"> in Table 3</w:t>
+      </w:r>
+      <w:r>
+        <w:t>A</w:t>
+      </w:r>
+      <w:r>
+        <w:t xml:space="preserve"> </w:t>
+      </w:r>
+      <w:r>
+        <w:t>among the small number of patients with</w:t>
+      </w:r>
+      <w:r>
+        <w:t xml:space="preserve"> HbA1c </w:t>
+      </w:r>
+      <w:r>
+        <w:t>values, there was</w:t>
+      </w:r>
+      <w:r>
+        <w:t xml:space="preserve"> a</w:t>
+      </w:r>
+      <w:r>
+        <w:t xml:space="preserve">n </w:t>
+      </w:r>
+      <w:r>
+        <w:t xml:space="preserve">insignificant increase in HbA1c levels </w:t>
+      </w:r>
+      <w:r>
+        <w:t>in</w:t>
+      </w:r>
+      <w:r>
+        <w:t xml:space="preserve"> the non-obese</w:t>
+      </w:r>
+      <w:r>
+        <w:t xml:space="preserve"> patients</w:t>
+      </w:r>
+      <w:r>
+        <w:t xml:space="preserve"> (</w:t>
+      </w:r>
+      <w:r>
+        <w:t xml:space="preserve">0.91%; </w:t>
+      </w:r>
+      <w:r>
+        <w:t xml:space="preserve">p=0.056). However, there was evidence of a significant increase in HbA1c levels </w:t>
+      </w:r>
+      <w:r>
+        <w:t xml:space="preserve">in patients with obesity </w:t>
+      </w:r>
+      <w:r>
+        <w:t>(</w:t>
+      </w:r>
+      <w:r>
+        <w:t xml:space="preserve">1.38% </w:t>
+      </w:r>
+      <w:r>
+        <w:t>p</w:t>
+      </w:r>
+      <w:r>
+        <w:t>&lt;0.01</w:t>
+      </w:r>
+      <w:r>
+        <w:t>).</w:t>
+      </w:r>
+      <w:r>
+        <w:t xml:space="preserve"> </w:t>
+      </w:r>
+      <w:r>
+        <w:t>Again</w:t>
+      </w:r>
+      <w:r>
+        <w:t>,</w:t>
+      </w:r>
+      <w:r>
+        <w:t xml:space="preserve"> there was no evidence of effect modification by obesity (p=0.41)</w:t>
+      </w:r>
+      <w:r>
+        <w:t>.  This suggests that blood glucose increases with Cushing’s disease are largely additive.</w:t>
+      </w:r>
+    </w:p>
+    <w:p>
+      <w:pPr>
+        <w:pStyle w:val="Heading3"/>
+      </w:pPr>
+      <w:r>
+        <w:t>MASLD and liver enzymes</w:t>
+      </w:r>
+    </w:p>
+    <w:p>
+      <w:r>
+        <w:t xml:space="preserve">To </w:t>
+      </w:r>
+      <w:r>
+        <w:t>assess</w:t>
+      </w:r>
+      <w:r>
+        <w:t xml:space="preserve"> </w:t>
+      </w:r>
+      <w:r>
+        <w:t>MASLD</w:t>
+      </w:r>
+      <w:r>
+        <w:t xml:space="preserve"> we looked at ALT </w:t>
+      </w:r>
+      <w:r>
+        <w:t>and AST levels as indicators of liver damage</w:t>
+      </w:r>
+      <w:r>
+        <w:t xml:space="preserve"> (Figure 2 and Table 3A)</w:t>
+      </w:r>
+      <w:r>
+        <w:t xml:space="preserve">. In both our obese, and non-obese populations, we saw an increase in ALT </w:t>
+      </w:r>
+      <w:r>
+        <w:t>and AST</w:t>
+      </w:r>
+      <w:r>
+        <w:t xml:space="preserve"> </w:t>
+      </w:r>
+      <w:r>
+        <w:t>levels regardless of Cushing’s disease status</w:t>
+      </w:r>
+      <w:r>
+        <w:t xml:space="preserve"> </w:t>
+      </w:r>
+      <w:r>
+        <w:t>(p</w:t>
+      </w:r>
+      <w:r>
+        <w:t>&lt;0.0</w:t>
+      </w:r>
+      <w:r>
+        <w:t>1 for both groups</w:t>
+      </w:r>
+      <w:r>
+        <w:t xml:space="preserve">). </w:t>
+      </w:r>
+      <w:r>
+        <w:t xml:space="preserve">In </w:t>
+      </w:r>
+      <w:r>
+        <w:t>the</w:t>
+      </w:r>
+      <w:r>
+        <w:t xml:space="preserve"> case</w:t>
+      </w:r>
+      <w:r>
+        <w:t xml:space="preserve"> of ALT levels</w:t>
+      </w:r>
+      <w:r>
+        <w:t>, the</w:t>
+      </w:r>
+      <w:r>
+        <w:t xml:space="preserve"> increase </w:t>
+      </w:r>
+      <w:r>
+        <w:t xml:space="preserve">due to Cushing’s disease was much greater in the patients with obesity </w:t>
+      </w:r>
+      <w:r>
+        <w:t>(</w:t>
+      </w:r>
+      <w:r>
+        <w:t>73.4 vs 35.1 mg/dL, p</w:t>
+      </w:r>
+      <w:r>
+        <w:rPr>
+          <w:vertAlign w:val="subscript"/>
+        </w:rPr>
+        <w:t>interaction</w:t>
+      </w:r>
+      <w:r>
+        <w:t>&lt;0.01</w:t>
+      </w:r>
+      <w:r>
+        <w:t>).</w:t>
+      </w:r>
+      <w:r>
+        <w:t xml:space="preserve">  This was also true for AST levels (increase by 56.3 mg/dL in patients with obesity and 16.9 for patients without obesity,</w:t>
+      </w:r>
+      <w:r>
+        <w:t xml:space="preserve"> </w:t>
+      </w:r>
+      <w:r>
+        <w:t>p</w:t>
+      </w:r>
+      <w:r>
+        <w:rPr>
+          <w:vertAlign w:val="subscript"/>
+        </w:rPr>
+        <w:t>interaction</w:t>
+      </w:r>
+      <w:r>
+        <w:t>=0.034).  These data support the hypothesis</w:t>
+      </w:r>
+      <w:r>
+        <w:t xml:space="preserve"> that obesity </w:t>
+      </w:r>
+      <w:r>
+        <w:t>enhances Cushing’s associated liver damage</w:t>
+      </w:r>
+      <w:r>
+        <w:t>.</w:t>
+      </w:r>
+    </w:p>
+    <w:p>
+      <w:pPr>
+        <w:pStyle w:val="Heading3"/>
+      </w:pPr>
+      <w:r>
+        <w:t>Blood Pressure</w:t>
+      </w:r>
+    </w:p>
+    <w:p>
+      <w:r>
+        <w:t xml:space="preserve">We </w:t>
+      </w:r>
+      <w:r>
+        <w:t>evaluated</w:t>
+      </w:r>
+      <w:r>
+        <w:t xml:space="preserve"> blood pressure readings as systolic, diastolic and mean arterial </w:t>
+      </w:r>
+      <w:r>
+        <w:t>pressures (</w:t>
+      </w:r>
+      <w:r>
+        <w:t xml:space="preserve">Figure 2 and </w:t>
+      </w:r>
+      <w:r>
+        <w:t xml:space="preserve">Table 3A). </w:t>
+      </w:r>
+      <w:r>
+        <w:t>We</w:t>
+      </w:r>
+      <w:r>
+        <w:t xml:space="preserve"> </w:t>
+      </w:r>
+      <w:r>
+        <w:t>observed</w:t>
+      </w:r>
+      <w:r>
+        <w:t xml:space="preserve"> significant increase</w:t>
+      </w:r>
+      <w:r>
+        <w:t>s for all measures</w:t>
+      </w:r>
+      <w:r>
+        <w:t xml:space="preserve"> in </w:t>
+      </w:r>
+      <w:r>
+        <w:t>patients without obesity</w:t>
+      </w:r>
+      <w:r>
+        <w:t xml:space="preserve"> (p=</w:t>
+      </w:r>
+      <w:r>
+        <w:t>&lt;0.01</w:t>
+      </w:r>
+      <w:r>
+        <w:t xml:space="preserve">). We did not, however, </w:t>
+      </w:r>
+      <w:r>
+        <w:t>observe</w:t>
+      </w:r>
+      <w:r>
+        <w:t xml:space="preserve"> this same significant </w:t>
+      </w:r>
+      <w:r>
+        <w:t xml:space="preserve">magnitude of </w:t>
+      </w:r>
+      <w:r>
+        <w:t>increase</w:t>
+      </w:r>
+      <w:r>
+        <w:t>s in blood pressure</w:t>
+      </w:r>
+      <w:r>
+        <w:t xml:space="preserve"> in </w:t>
+      </w:r>
+      <w:r>
+        <w:t>Cushing’s patients with obesity</w:t>
+      </w:r>
+      <w:r>
+        <w:t xml:space="preserve"> population</w:t>
+      </w:r>
+      <w:r>
+        <w:t>.  For example, in terms of systolic blood pressure, Cushing’s disease was associated with an increase of 11.97 mm Hg in patients without obesity but 3.08 mm Hg</w:t>
+      </w:r>
+      <w:r>
+        <w:t xml:space="preserve"> in those with a BMI over 30 kg/m</w:t>
       </w:r>
       <w:r>
         <w:rPr>
@@ -1401,193 +2256,56 @@
         <w:t>2</w:t>
       </w:r>
       <w:r>
-        <w:t xml:space="preserve">, </w:t>
-      </w:r>
-      <w:r>
-        <w:t>across</w:t>
-      </w:r>
-      <w:r>
-        <w:t xml:space="preserve"> both cases and controls</w:t>
-      </w:r>
-      <w:r>
         <w:t xml:space="preserve">.  </w:t>
       </w:r>
       <w:r>
-        <w:t>We found that 232 patients had a BMI above 30 kg/m</w:t>
-      </w:r>
-      <w:r>
-        <w:rPr>
-          <w:vertAlign w:val="superscript"/>
-        </w:rPr>
-        <w:t>2</w:t>
-      </w:r>
-      <w:r>
-        <w:rPr>
-          <w:vertAlign w:val="superscript"/>
-        </w:rPr>
-        <w:t xml:space="preserve"> </w:t>
-      </w:r>
-      <w:r>
-        <w:t>and 128 had a BMI below 30 kg/m</w:t>
-      </w:r>
-      <w:r>
-        <w:rPr>
-          <w:vertAlign w:val="superscript"/>
-        </w:rPr>
-        <w:t>2</w:t>
-      </w:r>
-      <w:r>
-        <w:rPr>
-          <w:vertAlign w:val="superscript"/>
-        </w:rPr>
-        <w:t xml:space="preserve"> </w:t>
-      </w:r>
-      <w:r>
-        <w:t xml:space="preserve">at time of diagnosis. </w:t>
-      </w:r>
-      <w:r>
-        <w:t>As shown in Table 2, and as expected given our stratification, the four groups differed in several characteristics</w:t>
-      </w:r>
-      <w:r>
-        <w:t xml:space="preserve">, </w:t>
-      </w:r>
-      <w:r>
-        <w:t>which</w:t>
-      </w:r>
-      <w:r>
-        <w:t xml:space="preserve"> will be adjusted for in multivariable models below</w:t>
-      </w:r>
-      <w:r>
-        <w:t>.</w:t>
-      </w:r>
-      <w:r>
-        <w:t xml:space="preserve">  For example, among</w:t>
-      </w:r>
-      <w:r>
-        <w:t xml:space="preserve"> the subgroup of</w:t>
-      </w:r>
-      <w:r>
-        <w:t xml:space="preserve"> participants with a BMI &gt; 30 mg/m</w:t>
-      </w:r>
-      <w:r>
-        <w:rPr>
-          <w:vertAlign w:val="superscript"/>
-        </w:rPr>
-        <w:t>2</w:t>
-      </w:r>
-      <w:r>
-        <w:t>, participants with Cushing’s disease had a higher BMI than controls</w:t>
-      </w:r>
-      <w:r>
-        <w:t xml:space="preserve"> (p=0.0024 by a Mann-Whitney test)</w:t>
-      </w:r>
-      <w:r>
-        <w:t xml:space="preserve">.  </w:t>
-      </w:r>
-      <w:r>
-        <w:t>Females with Cushing’s disease were more likely to have a BMI over 30 kg/m</w:t>
-      </w:r>
-      <w:r>
-        <w:rPr>
-          <w:vertAlign w:val="superscript"/>
-        </w:rPr>
-        <w:t>2</w:t>
-      </w:r>
-      <w:r>
-        <w:t xml:space="preserve"> (68% </w:t>
-      </w:r>
-      <w:r>
-        <w:t xml:space="preserve">of </w:t>
-      </w:r>
-      <w:r>
-        <w:t xml:space="preserve">females </w:t>
-      </w:r>
-      <w:r>
-        <w:t>compared to</w:t>
-      </w:r>
-      <w:r>
-        <w:t xml:space="preserve"> 51% of males with Cushing’s disease, p=0.015).  </w:t>
-      </w:r>
-      <w:r>
-        <w:t>Among participants with Cushing’s disease, Asian (6</w:t>
-      </w:r>
-      <w:r>
-        <w:t xml:space="preserve"> out of </w:t>
-      </w:r>
-      <w:r>
-        <w:t xml:space="preserve">10) and Hispanic or Latino </w:t>
-      </w:r>
-      <w:r>
-        <w:t>(6</w:t>
-      </w:r>
-      <w:r>
-        <w:t xml:space="preserve"> out of </w:t>
-      </w:r>
-      <w:r>
-        <w:t xml:space="preserve">8) </w:t>
-      </w:r>
-      <w:r>
-        <w:t>participants were more likely have a BMI under 30 kg/m</w:t>
-      </w:r>
-      <w:r>
-        <w:rPr>
-          <w:vertAlign w:val="superscript"/>
-        </w:rPr>
-        <w:t xml:space="preserve">2 </w:t>
-      </w:r>
-      <w:r>
-        <w:t xml:space="preserve">compared to </w:t>
-      </w:r>
-      <w:r>
-        <w:t xml:space="preserve">the overall average </w:t>
-      </w:r>
-      <w:r>
-        <w:t>(</w:t>
-      </w:r>
-      <w:r>
-        <w:t>36%</w:t>
-      </w:r>
-      <w:r>
-        <w:t>, p=0.027 and 0.176 respectively via Fisher’s exact test</w:t>
-      </w:r>
-      <w:r>
-        <w:t>s</w:t>
-      </w:r>
-      <w:r>
-        <w:t xml:space="preserve">).  </w:t>
-      </w:r>
-      <w:r>
         <w:t>The</w:t>
       </w:r>
       <w:r>
-        <w:t xml:space="preserve"> average age of </w:t>
-      </w:r>
-      <w:r>
-        <w:t xml:space="preserve">participants with </w:t>
-      </w:r>
-      <w:r>
-        <w:t>Cushing’s</w:t>
-      </w:r>
-      <w:r>
-        <w:t xml:space="preserve"> disease</w:t>
-      </w:r>
-      <w:r>
-        <w:t xml:space="preserve"> with or without obesity was similar</w:t>
-      </w:r>
-      <w:r>
-        <w:t xml:space="preserve"> after stratification</w:t>
-      </w:r>
-      <w:r>
-        <w:t>.</w:t>
-      </w:r>
-      <w:r>
-        <w:t xml:space="preserve">  Overall</w:t>
-      </w:r>
-      <w:r>
-        <w:t>,</w:t>
-      </w:r>
-      <w:r>
-        <w:t xml:space="preserve"> the subgroup of patients with obesity and Cushing’s disease tended to be disproportionately female and White, but similar in age.</w:t>
+        <w:t xml:space="preserve"> attenuation of the </w:t>
+      </w:r>
+      <w:r>
+        <w:t>effect</w:t>
+      </w:r>
+      <w:r>
+        <w:t xml:space="preserve"> of Cushing’s disease </w:t>
+      </w:r>
+      <w:r>
+        <w:t>in patients</w:t>
+      </w:r>
+      <w:r>
+        <w:t xml:space="preserve">’ </w:t>
+      </w:r>
+      <w:r>
+        <w:t xml:space="preserve">obesity was significant </w:t>
+      </w:r>
+      <w:r>
+        <w:t xml:space="preserve">for </w:t>
+      </w:r>
+      <w:r>
+        <w:lastRenderedPageBreak/>
+        <w:t xml:space="preserve">mean, systolic, and diastolic </w:t>
+      </w:r>
+      <w:r>
+        <w:t>blood</w:t>
+      </w:r>
+      <w:r>
+        <w:t xml:space="preserve"> pressure (p</w:t>
+      </w:r>
+      <w:r>
+        <w:rPr>
+          <w:vertAlign w:val="subscript"/>
+        </w:rPr>
+        <w:t>interaction</w:t>
+      </w:r>
+      <w:r>
+        <w:t xml:space="preserve">&lt;0.01 for each).  </w:t>
+      </w:r>
+      <w:r>
+        <w:t xml:space="preserve">This </w:t>
+      </w:r>
+      <w:r>
+        <w:t>suggests that obesity may have a protective effect on Cushing’s induced hypertension.</w:t>
       </w:r>
     </w:p>
     <w:p>
@@ -1601,479 +2319,6 @@
         <w:rPr>
           <w:rStyle w:val="Heading2Char"/>
         </w:rPr>
-        <w:t xml:space="preserve">Modification of Cushing’s disease-related </w:t>
-      </w:r>
-      <w:r>
-        <w:rPr>
-          <w:rStyle w:val="Heading2Char"/>
-        </w:rPr>
-        <w:t>comorbidities</w:t>
-      </w:r>
-      <w:r>
-        <w:rPr>
-          <w:rStyle w:val="Heading2Char"/>
-        </w:rPr>
-        <w:t xml:space="preserve"> by obesity </w:t>
-      </w:r>
-    </w:p>
-    <w:p>
-      <w:r>
-        <w:t>To identify how obesity alters metabolic outcomes related to Cushing’s disease, we evaluated the effects of Cushing’s disease on several key metabolic variables including glycem</w:t>
-      </w:r>
-      <w:r>
-        <w:t>i</w:t>
-      </w:r>
-      <w:r>
-        <w:t xml:space="preserve">a (fasting glucose and </w:t>
-      </w:r>
-      <w:r>
-        <w:t xml:space="preserve">for a smaller number of participants, </w:t>
-      </w:r>
-      <w:r>
-        <w:t>HbA1c), liver enzymes, and blood pressure (Figure 2 and Table 3).  As described below we noted substantial effect modification by obesity for liver enzymes and blood pressure (Table 3B).</w:t>
-      </w:r>
-    </w:p>
-    <w:p>
-      <w:pPr>
-        <w:pStyle w:val="Heading3"/>
-      </w:pPr>
-      <w:r>
-        <w:t>Dysglycemia</w:t>
-      </w:r>
-    </w:p>
-    <w:p>
-      <w:r>
-        <w:t>The</w:t>
-      </w:r>
-      <w:r>
-        <w:t xml:space="preserve"> first metabolic variable of interest was the fasting glucose levels of our obese and non-obese populations. As shown in </w:t>
-      </w:r>
-      <w:r>
-        <w:t xml:space="preserve">Figure 2 and </w:t>
-      </w:r>
-      <w:r>
-        <w:t>Table 3</w:t>
-      </w:r>
-      <w:r>
-        <w:t>A</w:t>
-      </w:r>
-      <w:r>
-        <w:t>, we observed a</w:t>
-      </w:r>
-      <w:r>
-        <w:t xml:space="preserve"> significant </w:t>
-      </w:r>
-      <w:r>
-        <w:t xml:space="preserve">increase in </w:t>
-      </w:r>
-      <w:r>
-        <w:t xml:space="preserve">fasting </w:t>
-      </w:r>
-      <w:r>
-        <w:t xml:space="preserve">blood glucose levels </w:t>
-      </w:r>
-      <w:r>
-        <w:t xml:space="preserve">among </w:t>
-      </w:r>
-      <w:r>
-        <w:t>participants</w:t>
-      </w:r>
-      <w:r>
-        <w:t xml:space="preserve"> with Cushing’s disease, regardless of obesity status</w:t>
-      </w:r>
-      <w:r>
-        <w:t xml:space="preserve"> (p</w:t>
-      </w:r>
-      <w:r>
-        <w:t>&lt;0.01</w:t>
-      </w:r>
-      <w:r>
-        <w:t xml:space="preserve"> for both groups).</w:t>
-      </w:r>
-      <w:r>
-        <w:t xml:space="preserve"> The </w:t>
-      </w:r>
-      <w:r>
-        <w:t xml:space="preserve">patients with obesity </w:t>
-      </w:r>
-      <w:r>
-        <w:t xml:space="preserve">population had a slightly larger increase (26.9 vs. </w:t>
-      </w:r>
-      <w:r>
-        <w:t>24.6</w:t>
-      </w:r>
-      <w:r>
-        <w:t xml:space="preserve"> mg/dL</w:t>
-      </w:r>
-      <w:r>
-        <w:t xml:space="preserve">) than </w:t>
-      </w:r>
-      <w:r>
-        <w:t>those with a BMI under 30 kg/m</w:t>
-      </w:r>
-      <w:r>
-        <w:rPr>
-          <w:vertAlign w:val="superscript"/>
-        </w:rPr>
-        <w:t>2</w:t>
-      </w:r>
-      <w:r>
-        <w:t>, but this was not a large enough difference to provide any significant evidence of an effect modification for obesity</w:t>
-      </w:r>
-      <w:r>
-        <w:t xml:space="preserve"> (p=0.51; Table 3B)</w:t>
-      </w:r>
-      <w:r>
-        <w:t xml:space="preserve">. </w:t>
-      </w:r>
-      <w:r>
-        <w:t>Similarly</w:t>
-      </w:r>
-      <w:r>
-        <w:t>,</w:t>
-      </w:r>
-      <w:r>
-        <w:t xml:space="preserve"> in Table 3</w:t>
-      </w:r>
-      <w:r>
-        <w:t>A</w:t>
-      </w:r>
-      <w:r>
-        <w:t xml:space="preserve"> </w:t>
-      </w:r>
-      <w:r>
-        <w:t>among the small number of patients with</w:t>
-      </w:r>
-      <w:r>
-        <w:t xml:space="preserve"> HbA1c </w:t>
-      </w:r>
-      <w:r>
-        <w:t>values, there was</w:t>
-      </w:r>
-      <w:r>
-        <w:t xml:space="preserve"> a</w:t>
-      </w:r>
-      <w:r>
-        <w:t xml:space="preserve">n </w:t>
-      </w:r>
-      <w:r>
-        <w:t xml:space="preserve">insignificant increase in HbA1c levels </w:t>
-      </w:r>
-      <w:r>
-        <w:t>in</w:t>
-      </w:r>
-      <w:r>
-        <w:t xml:space="preserve"> the non-obese</w:t>
-      </w:r>
-      <w:r>
-        <w:t xml:space="preserve"> patients</w:t>
-      </w:r>
-      <w:r>
-        <w:t xml:space="preserve"> (</w:t>
-      </w:r>
-      <w:r>
-        <w:t xml:space="preserve">0.91%; </w:t>
-      </w:r>
-      <w:r>
-        <w:t xml:space="preserve">p=0.056). However, there was evidence of a significant increase in HbA1c levels </w:t>
-      </w:r>
-      <w:r>
-        <w:t xml:space="preserve">in patients with obesity </w:t>
-      </w:r>
-      <w:r>
-        <w:t>(</w:t>
-      </w:r>
-      <w:r>
-        <w:t xml:space="preserve">1.38% </w:t>
-      </w:r>
-      <w:r>
-        <w:t>p</w:t>
-      </w:r>
-      <w:r>
-        <w:t>&lt;0.01</w:t>
-      </w:r>
-      <w:r>
-        <w:t xml:space="preserve">). </w:t>
-      </w:r>
-      <w:r>
-        <w:t xml:space="preserve">  Again</w:t>
-      </w:r>
-      <w:r>
-        <w:t>.</w:t>
-      </w:r>
-      <w:r>
-        <w:t xml:space="preserve"> there was no evidence of effect </w:t>
-      </w:r>
-      <w:r>
-        <w:lastRenderedPageBreak/>
-        <w:t>modification by obesity (p=0.41)</w:t>
-      </w:r>
-      <w:r>
-        <w:t>.  This suggests that blood glucose increases with Cushing’s disease are largely additive.</w:t>
-      </w:r>
-    </w:p>
-    <w:p>
-      <w:pPr>
-        <w:pStyle w:val="Heading3"/>
-      </w:pPr>
-      <w:r>
-        <w:t>MASLD and liver enzymes</w:t>
-      </w:r>
-    </w:p>
-    <w:p>
-      <w:r>
-        <w:t xml:space="preserve">To </w:t>
-      </w:r>
-      <w:r>
-        <w:t>assess</w:t>
-      </w:r>
-      <w:r>
-        <w:t xml:space="preserve"> </w:t>
-      </w:r>
-      <w:r>
-        <w:t>MASLD</w:t>
-      </w:r>
-      <w:r>
-        <w:t xml:space="preserve"> we looked at ALT </w:t>
-      </w:r>
-      <w:r>
-        <w:t>and AST levels as indicators of liver damage</w:t>
-      </w:r>
-      <w:r>
-        <w:t xml:space="preserve"> (Figure 2 and Table 3A)</w:t>
-      </w:r>
-      <w:r>
-        <w:t xml:space="preserve">. In both our obese, and non-obese populations, we saw an increase in ALT </w:t>
-      </w:r>
-      <w:r>
-        <w:t>and AST</w:t>
-      </w:r>
-      <w:r>
-        <w:t xml:space="preserve"> </w:t>
-      </w:r>
-      <w:r>
-        <w:t>levels regardless of Cushing’s disease status</w:t>
-      </w:r>
-      <w:r>
-        <w:t xml:space="preserve"> </w:t>
-      </w:r>
-      <w:r>
-        <w:t>(p</w:t>
-      </w:r>
-      <w:r>
-        <w:t>&lt;0.0</w:t>
-      </w:r>
-      <w:r>
-        <w:t>1 for both groups</w:t>
-      </w:r>
-      <w:r>
-        <w:t xml:space="preserve">). </w:t>
-      </w:r>
-      <w:r>
-        <w:t>In this case, the</w:t>
-      </w:r>
-      <w:r>
-        <w:t xml:space="preserve"> increase </w:t>
-      </w:r>
-      <w:r>
-        <w:t xml:space="preserve">due to Cushing’s disease was much greater in the patients with obesity </w:t>
-      </w:r>
-      <w:r>
-        <w:t>(</w:t>
-      </w:r>
-      <w:r>
-        <w:t>73.4 vs 35.1 mg/dL, p</w:t>
-      </w:r>
-      <w:r>
-        <w:rPr>
-          <w:vertAlign w:val="subscript"/>
-        </w:rPr>
-        <w:t>interaction</w:t>
-      </w:r>
-      <w:r>
-        <w:t>&lt;0.01</w:t>
-      </w:r>
-      <w:r>
-        <w:t>).</w:t>
-      </w:r>
-      <w:r>
-        <w:t xml:space="preserve">  This was also true for AST levels (increase by 56.3 mg/dL in patients with obesity and 16.9 for patients without obesity,</w:t>
-      </w:r>
-      <w:r>
-        <w:t xml:space="preserve"> </w:t>
-      </w:r>
-      <w:r>
-        <w:t>p</w:t>
-      </w:r>
-      <w:r>
-        <w:rPr>
-          <w:vertAlign w:val="subscript"/>
-        </w:rPr>
-        <w:t>interaction</w:t>
-      </w:r>
-      <w:r>
-        <w:t>=0.034).  These data support the hypothesis</w:t>
-      </w:r>
-      <w:r>
-        <w:t xml:space="preserve"> that obesity </w:t>
-      </w:r>
-      <w:r>
-        <w:t>enhances Cushing’s associated liver damage</w:t>
-      </w:r>
-      <w:r>
-        <w:t>.</w:t>
-      </w:r>
-    </w:p>
-    <w:p>
-      <w:pPr>
-        <w:pStyle w:val="Heading3"/>
-      </w:pPr>
-      <w:r>
-        <w:t>Blood Pressure</w:t>
-      </w:r>
-    </w:p>
-    <w:p>
-      <w:r>
-        <w:t xml:space="preserve">We </w:t>
-      </w:r>
-      <w:r>
-        <w:t>evaluated</w:t>
-      </w:r>
-      <w:r>
-        <w:t xml:space="preserve"> blood pressure readings as systolic, diastolic and mean arterial pressure</w:t>
-      </w:r>
-      <w:r>
-        <w:t>s</w:t>
-      </w:r>
-      <w:r>
-        <w:t xml:space="preserve"> </w:t>
-      </w:r>
-      <w:r>
-        <w:t xml:space="preserve"> (</w:t>
-      </w:r>
-      <w:r>
-        <w:t xml:space="preserve">Figure 2 and </w:t>
-      </w:r>
-      <w:r>
-        <w:t xml:space="preserve">Table 3A). </w:t>
-      </w:r>
-      <w:r>
-        <w:t>We</w:t>
-      </w:r>
-      <w:r>
-        <w:t xml:space="preserve"> </w:t>
-      </w:r>
-      <w:r>
-        <w:t>observed</w:t>
-      </w:r>
-      <w:r>
-        <w:t xml:space="preserve"> significant increase</w:t>
-      </w:r>
-      <w:r>
-        <w:t>s for all measures</w:t>
-      </w:r>
-      <w:r>
-        <w:t xml:space="preserve"> in </w:t>
-      </w:r>
-      <w:r>
-        <w:t>patients without obesity</w:t>
-      </w:r>
-      <w:r>
-        <w:t xml:space="preserve"> (p=</w:t>
-      </w:r>
-      <w:r>
-        <w:t>&lt;0.01</w:t>
-      </w:r>
-      <w:r>
-        <w:t xml:space="preserve">). We did not, however, </w:t>
-      </w:r>
-      <w:r>
-        <w:t>observe</w:t>
-      </w:r>
-      <w:r>
-        <w:t xml:space="preserve"> this same significant </w:t>
-      </w:r>
-      <w:r>
-        <w:t xml:space="preserve">magnitude of </w:t>
-      </w:r>
-      <w:r>
-        <w:t>increase</w:t>
-      </w:r>
-      <w:r>
-        <w:t>s in blood pressure</w:t>
-      </w:r>
-      <w:r>
-        <w:t xml:space="preserve"> in </w:t>
-      </w:r>
-      <w:r>
-        <w:t>Cushing’s patients with obesity</w:t>
-      </w:r>
-      <w:r>
-        <w:t xml:space="preserve"> population</w:t>
-      </w:r>
-      <w:r>
-        <w:t>.  For example, in terms of systolic blood pressure, Cushing’s disease was associated with an increase of 11.97 mm Hg in patients without obesity but 3.08 mm Hg</w:t>
-      </w:r>
-      <w:r>
-        <w:t xml:space="preserve"> in those with a BMI over 30 kg/m</w:t>
-      </w:r>
-      <w:r>
-        <w:rPr>
-          <w:vertAlign w:val="superscript"/>
-        </w:rPr>
-        <w:t>2</w:t>
-      </w:r>
-      <w:r>
-        <w:t xml:space="preserve">.  </w:t>
-      </w:r>
-      <w:r>
-        <w:t>The</w:t>
-      </w:r>
-      <w:r>
-        <w:t xml:space="preserve"> attenuation of the </w:t>
-      </w:r>
-      <w:r>
-        <w:t>effect</w:t>
-      </w:r>
-      <w:r>
-        <w:t xml:space="preserve"> of Cushing’s disease </w:t>
-      </w:r>
-      <w:r>
-        <w:t>in patients</w:t>
-      </w:r>
-      <w:r>
-        <w:t xml:space="preserve"> obesity was significant </w:t>
-      </w:r>
-      <w:r>
-        <w:t>for mean, systolic, and diastolic bood pressure (p</w:t>
-      </w:r>
-      <w:r>
-        <w:rPr>
-          <w:vertAlign w:val="subscript"/>
-        </w:rPr>
-        <w:t>interaction</w:t>
-      </w:r>
-      <w:r>
-        <w:t xml:space="preserve">&lt;0.01 for each).  </w:t>
-      </w:r>
-      <w:r>
-        <w:t xml:space="preserve">This </w:t>
-      </w:r>
-      <w:r>
-        <w:t>suggests that obesity may have a protective effect on Cushing’s induced hypertension.</w:t>
-      </w:r>
-    </w:p>
-    <w:p>
-      <w:pPr>
-        <w:pStyle w:val="NormalWeb"/>
-        <w:rPr>
-          <w:rStyle w:val="Heading2Char"/>
-        </w:rPr>
-      </w:pPr>
-      <w:r>
-        <w:rPr>
-          <w:rStyle w:val="Heading2Char"/>
-        </w:rPr>
         <w:t>Sensitivity and secondary analyses</w:t>
       </w:r>
     </w:p>
@@ -2088,11 +2333,7 @@
         <w:t>+</w:t>
       </w:r>
       <w:r>
-        <w:t xml:space="preserve">30.3 for Class II obesity and 80.7 for class III obesity.  Since this analysis already accounted for a main effect of obesity status, this suggest that as obesity increases, the negative effect of Cushing’s disease on liver enzymes increased, while the protective effect on blood pressure was also trended to increase in magnitude.  Stratifying by gender, we noticed that </w:t>
-      </w:r>
-      <w:r>
-        <w:lastRenderedPageBreak/>
-        <w:t xml:space="preserve">female patients generally had worsened but more variable effect estimates.  In the case of AST, the interaction between obesity and </w:t>
+        <w:t xml:space="preserve">30.3 for Class II obesity and 80.7 for class III obesity.  Since this analysis already accounted for a main effect of obesity status, this suggest that as obesity increases, the negative effect of Cushing’s disease on liver enzymes increased, while the protective effect on blood pressure was also trended to increase in magnitude.  Stratifying by gender, we noticed that female patients generally had worsened but more variable effect estimates.  In the case of AST, the interaction between obesity and </w:t>
       </w:r>
       <w:r>
         <w:t>Cushing’s</w:t>
@@ -2186,7 +2427,17 @@
         <w:fldChar w:fldCharType="end"/>
       </w:r>
       <w:r>
-        <w:t>.  We remain interested in Cushing’s induced bone and muscle loss, as well as the effect of obesity and Cushing’s disease on blood lipids and kidney function, but did not have sufficient laboratory results in these participants to make reliable conclusions.</w:t>
+        <w:t xml:space="preserve">.  We remain interested in Cushing’s induced bone and muscle loss, </w:t>
+      </w:r>
+      <w:r>
+        <w:lastRenderedPageBreak/>
+        <w:t xml:space="preserve">as well as the effect of obesity and Cushing’s disease on blood lipids and kidney </w:t>
+      </w:r>
+      <w:r>
+        <w:t>function, but</w:t>
+      </w:r>
+      <w:r>
+        <w:t xml:space="preserve"> did not have sufficient laboratory results in these participants to make reliable conclusions.</w:t>
       </w:r>
     </w:p>
     <w:p>
@@ -2201,7 +2452,10 @@
         <w:ind w:left="0"/>
       </w:pPr>
       <w:r>
-        <w:t xml:space="preserve">Pathophysiologically, the induction of adipocyte lipolysis by cortisol’s direct effects on adipocytes, as well as its indirect effects on insulin signaling in adipocytes may explain increased liver disease in patients with obesity and Cushing’s disease.  This could be due to a confluence of increased triglyceride stores available for release, increased signaling, and decreased hepatic triglyceride export due to hepatic insulin resistance.  </w:t>
+        <w:t>Pathophysiologically</w:t>
+      </w:r>
+      <w:r>
+        <w:t xml:space="preserve">, the induction of adipocyte lipolysis by cortisol’s direct effects on adipocytes, as well as its indirect effects on insulin signaling in adipocytes may explain increased liver disease in patients with obesity and Cushing’s disease.  This could be due to a confluence of increased triglyceride stores available for release, increased signaling, and decreased hepatic triglyceride export due to hepatic insulin resistance.  </w:t>
       </w:r>
     </w:p>
     <w:p>
@@ -2237,23 +2491,27 @@
         <w:fldChar w:fldCharType="end"/>
       </w:r>
       <w:r>
-        <w:t xml:space="preserve">.  Prior studies have shown </w:t>
+        <w:t xml:space="preserve">.  </w:t>
       </w:r>
       <w:commentRangeStart w:id="1"/>
       <w:r>
-        <w:t xml:space="preserve">XXXX </w:t>
+        <w:t xml:space="preserve">Prior </w:t>
       </w:r>
       <w:commentRangeEnd w:id="1"/>
       <w:r>
         <w:rPr>
           <w:rStyle w:val="CommentReference"/>
-          <w:sz w:val="24"/>
-          <w:szCs w:val="24"/>
         </w:rPr>
         <w:commentReference w:id="1"/>
       </w:r>
       <w:r>
-        <w:t xml:space="preserve">regarding blood pressure in Cushing’s disease patients.  One possibility is that patients with obesity and Cushing’s disease are already medicated to control their hypertension levels.  </w:t>
+        <w:t xml:space="preserve">studies have shown </w:t>
+      </w:r>
+      <w:r>
+        <w:t>70-85% of Cushing’s disease patients suffer from hypertension in addition to the disease</w:t>
+      </w:r>
+      <w:r>
+        <w:t xml:space="preserve">.  One possibility is that patients with obesity and Cushing’s disease are already medicated to control their hypertension levels.  </w:t>
       </w:r>
       <w:r>
         <w:t xml:space="preserve">Another possibility is there is already a ceiling effect as counter-regulatory mechanisms for blood pressure are already maximally engaged.  </w:t>
@@ -2310,10 +2568,20 @@
         <w:ind w:left="0"/>
       </w:pPr>
       <w:r>
-        <w:t xml:space="preserve">There are however several other limitations to this work.  A large number of patients were diagnosed with Cushing’s </w:t>
-      </w:r>
-      <w:r>
-        <w:t xml:space="preserve">disease </w:t>
+        <w:lastRenderedPageBreak/>
+        <w:t xml:space="preserve">There are however several other limitations to this work.  </w:t>
+      </w:r>
+      <w:r>
+        <w:t>Many</w:t>
+      </w:r>
+      <w:r>
+        <w:t xml:space="preserve"> patients were diagnosed with Cushing’s </w:t>
+      </w:r>
+      <w:r>
+        <w:t>disease,</w:t>
+      </w:r>
+      <w:r>
+        <w:t xml:space="preserve"> </w:t>
       </w:r>
       <w:r>
         <w:t>but their procedure date was not indicated.  Second, this patient cohort was relatively homogeneous, consisting of mostly White patients, limiting our ability to evaluate race- or ancestry-specific differences.  Several patients did not have laboratory results in our window, so we were underpowered for some analyses (</w:t>
@@ -2350,91 +2618,94 @@
         <w:t>’</w:t>
       </w:r>
       <w:r>
-        <w:t xml:space="preserve">s dependent impacts on these co-morbidities and revealed a surprising and complex picture of integrated pathophysiology.  This study provides novel data that obesity and Cushing’s disease interact, suggesting that obesity and Cushing’s disease may result in worsened liver damage, but that the augmented effects on hypertension are lower than expected.  </w:t>
-      </w:r>
-      <w:r>
+        <w:t>s dependent impacts on these co-morbidities and revealed a surprising and complex picture of integrated pathophysiology.  This study provides novel data that obesity and Cushing’s disease interact, suggesting that obesity and Cushing’s disease may result in worsened liver damage, but that the augmented effects on hypertension are lower than expected.  These results may be valuable for the accurate monitoring and treatment of the majority of Cushing’s patients who also have elevated adiposity.</w:t>
+      </w:r>
+    </w:p>
+    <w:p>
+      <w:pPr>
+        <w:pStyle w:val="Heading1"/>
+      </w:pPr>
+      <w:r>
+        <w:t>Acknowledgements</w:t>
+      </w:r>
+      <w:r>
+        <w:t xml:space="preserve"> and Funding</w:t>
+      </w:r>
+    </w:p>
+    <w:p>
+      <w:r>
+        <w:t xml:space="preserve">This work was supported by a pilot and feasibility grant from the Michigan Diabetes Research Center (NIH </w:t>
+      </w:r>
+      <w:r>
+        <w:t>P30DK020572</w:t>
+      </w:r>
+      <w:r>
+        <w:t>) and</w:t>
+      </w:r>
+      <w:r>
+        <w:t xml:space="preserve"> by consulting </w:t>
+      </w:r>
+      <w:r>
+        <w:t>provided by</w:t>
+      </w:r>
+      <w:r>
+        <w:t xml:space="preserve"> the University of Michigan Adipose Tissue Core, part of the Michigan Nutrition and Obesity Research Center (NIH </w:t>
+      </w:r>
+      <w:r>
+        <w:t>P30DK020572</w:t>
+      </w:r>
+      <w:r>
+        <w:t>).  This work was also supported by AI and Digital Health Innovation</w:t>
+      </w:r>
+      <w:r>
+        <w:t xml:space="preserve"> at the University of Michigan, and the University of Michigan Medical School Data Office for Clinical and Translational Research for providing data storage, management, processing, and distribution services.</w:t>
+      </w:r>
+      <w:r>
+        <w:t xml:space="preserve">  Finally</w:t>
+      </w:r>
+      <w:r>
+        <w:t>,</w:t>
+      </w:r>
+      <w:r>
+        <w:t xml:space="preserve"> we would like to thank the other members of the Bridges and Hochberg laboratories for valuable discussions regarding these analyses and their interpretation.</w:t>
+      </w:r>
+    </w:p>
+    <w:p>
+      <w:pPr>
+        <w:pStyle w:val="Heading1"/>
+      </w:pPr>
+      <w:r>
+        <w:t>References</w:t>
+      </w:r>
+    </w:p>
+    <w:p>
+      <w:pPr>
+        <w:pStyle w:val="Bibliography"/>
+        <w:rPr>
+          <w:rFonts w:ascii="Aptos"/>
+        </w:rPr>
+      </w:pPr>
+      <w:r>
+        <w:fldChar w:fldCharType="begin"/>
+      </w:r>
+      <w:r>
+        <w:instrText xml:space="preserve"> ADDIN ZOTERO_BIBL {"uncited":[],"omitted":[],"custom":[]} CSL_BIBLIOGRAPHY </w:instrText>
+      </w:r>
+      <w:r>
+        <w:fldChar w:fldCharType="separate"/>
+      </w:r>
+      <w:r>
+        <w:rPr>
+          <w:rFonts w:ascii="Aptos"/>
+        </w:rPr>
+        <w:t xml:space="preserve">Alqeeq, B. F., Ayyad, M., Almadhoun, W. J., Aboabdo, M., Aldahdouh, M. S., Al-Tawil, M., &amp; Al-Ghazali, A. M. (2024). Sex-related differences in Cushing’s disease: A systematic </w:t>
+      </w:r>
+      <w:r>
+        <w:rPr>
+          <w:rFonts w:ascii="Aptos"/>
+        </w:rPr>
         <w:lastRenderedPageBreak/>
-        <w:t>These results may be valuable for the accurate monitoring and treatment of the majority of Cushing’s patients who also have elevated adiposity.</w:t>
-      </w:r>
-    </w:p>
-    <w:p>
-      <w:pPr>
-        <w:pStyle w:val="Heading1"/>
-      </w:pPr>
-      <w:r>
-        <w:t>Acknowledgements</w:t>
-      </w:r>
-      <w:r>
-        <w:t xml:space="preserve"> and Funding</w:t>
-      </w:r>
-    </w:p>
-    <w:p>
-      <w:r>
-        <w:t xml:space="preserve">This work was supported by a pilot and feasibility grant from the Michigan Diabetes Research Center (NIH </w:t>
-      </w:r>
-      <w:r>
-        <w:t>P30DK020572</w:t>
-      </w:r>
-      <w:r>
-        <w:t>) and</w:t>
-      </w:r>
-      <w:r>
-        <w:t xml:space="preserve"> by consulting </w:t>
-      </w:r>
-      <w:r>
-        <w:t>provided by</w:t>
-      </w:r>
-      <w:r>
-        <w:t xml:space="preserve"> the University of Michigan Adipose Tissue Core, part of the Michigan Nutrition and Obesity Research Center (NIH </w:t>
-      </w:r>
-      <w:r>
-        <w:t>P30DK020572</w:t>
-      </w:r>
-      <w:r>
-        <w:t>).  This work was also supported by AI and Digital Health Innovation</w:t>
-      </w:r>
-      <w:r>
-        <w:t xml:space="preserve"> at the University of Michigan, and the University of Michigan Medical School Data Office for Clinical and Translational Research for providing data storage, management, processing, and distribution services.</w:t>
-      </w:r>
-      <w:r>
-        <w:t xml:space="preserve">  Finally</w:t>
-      </w:r>
-      <w:r>
-        <w:t>,</w:t>
-      </w:r>
-      <w:r>
-        <w:t xml:space="preserve"> we would like to thank the other members of the Bridges and Hochberg laboratories for valuable discussions regarding these analyses and their interpretation.</w:t>
-      </w:r>
-    </w:p>
-    <w:p>
-      <w:pPr>
-        <w:pStyle w:val="Heading1"/>
-      </w:pPr>
-      <w:r>
-        <w:t>References</w:t>
-      </w:r>
-    </w:p>
-    <w:p>
-      <w:pPr>
-        <w:pStyle w:val="Bibliography"/>
-        <w:rPr>
-          <w:rFonts w:ascii="Aptos"/>
-        </w:rPr>
-      </w:pPr>
-      <w:r>
-        <w:fldChar w:fldCharType="begin"/>
-      </w:r>
-      <w:r>
-        <w:instrText xml:space="preserve"> ADDIN ZOTERO_BIBL {"uncited":[],"omitted":[],"custom":[]} CSL_BIBLIOGRAPHY </w:instrText>
-      </w:r>
-      <w:r>
-        <w:fldChar w:fldCharType="separate"/>
-      </w:r>
-      <w:r>
-        <w:rPr>
-          <w:rFonts w:ascii="Aptos"/>
-        </w:rPr>
-        <w:t xml:space="preserve">Alqeeq, B. F., Ayyad, M., Almadhoun, W. J., Aboabdo, M., Aldahdouh, M. S., Al-Tawil, M., &amp; Al-Ghazali, A. M. (2024). Sex-related differences in Cushing’s disease: A systematic review and meta-analysis. </w:t>
+        <w:t xml:space="preserve">review and meta-analysis. </w:t>
       </w:r>
       <w:r>
         <w:rPr>
@@ -2560,7 +2831,6 @@
         <w:rPr>
           <w:rFonts w:ascii="Aptos"/>
         </w:rPr>
-        <w:lastRenderedPageBreak/>
         <w:t xml:space="preserve">DeFronzo, R. A., &amp; Auchus, R. J. (2025). Cushing Syndrome, Hypercortisolism, and Glucose Homeostasis: A Review. </w:t>
       </w:r>
       <w:r>
@@ -2687,6 +2957,7 @@
         <w:rPr>
           <w:rFonts w:ascii="Aptos"/>
         </w:rPr>
+        <w:lastRenderedPageBreak/>
         <w:t xml:space="preserve">Gadelha, M., Gatto, F., Wildemberg, L. E., &amp; Fleseriu, M. (2023). Cushing’s syndrome. </w:t>
       </w:r>
       <w:r>
@@ -2813,7 +3084,6 @@
         <w:rPr>
           <w:rFonts w:ascii="Aptos"/>
         </w:rPr>
-        <w:lastRenderedPageBreak/>
         <w:t xml:space="preserve">Harvey, I., Stephenson, E. J., Redd, J. R., Tran, Q. T., Hochberg, I., Qi, N., &amp; Bridges, D. (2018). Glucocorticoid-Induced Metabolic Disturbances Are Exacerbated in Obese Male Mice. </w:t>
       </w:r>
       <w:r>
@@ -2940,7 +3210,14 @@
         <w:rPr>
           <w:rFonts w:ascii="Aptos"/>
         </w:rPr>
-        <w:t xml:space="preserve">Ioachimescu, A. G., Goswami, N., Handa, T., Pappy, A., Veledar, E., &amp; Oyesiku, N. M. (2022). Racial Disparities in Acromegaly and Cushing’s Disease: A Referral Center Study in 241 Patients. </w:t>
+        <w:t xml:space="preserve">Ioachimescu, A. G., Goswami, N., Handa, T., Pappy, A., Veledar, E., &amp; Oyesiku, N. M. (2022). Racial Disparities in Acromegaly and Cushing’s Disease: A Referral Center Study in </w:t>
+      </w:r>
+      <w:r>
+        <w:rPr>
+          <w:rFonts w:ascii="Aptos"/>
+        </w:rPr>
+        <w:lastRenderedPageBreak/>
+        <w:t xml:space="preserve">241 Patients. </w:t>
       </w:r>
       <w:r>
         <w:rPr>
@@ -3066,7 +3343,6 @@
         <w:rPr>
           <w:rFonts w:ascii="Aptos"/>
         </w:rPr>
-        <w:lastRenderedPageBreak/>
         <w:t xml:space="preserve">Omotosho, Y. B., McGlotten, R., Chittiboina, P., &amp; Nieman, L. (2024). MON-113 Racial Disparity in the Time to Diagnosis of Cushing’s Disease. </w:t>
       </w:r>
       <w:r>
@@ -3207,6 +3483,7 @@
         <w:rPr>
           <w:rFonts w:ascii="Aptos"/>
         </w:rPr>
+        <w:lastRenderedPageBreak/>
         <w:t xml:space="preserve">Steffensen, C., Bak, A. M., Zøylner Rubeck, K., &amp; Jørgensen, J. O. L. (2010). Epidemiology of Cushing’s Syndrome. </w:t>
       </w:r>
       <w:r>
@@ -3757,7 +4034,15 @@
         <w:t xml:space="preserve">. </w:t>
       </w:r>
       <w:r>
-        <w:t xml:space="preserve">Since propensity matching was completed for each Cushing’s patient with a laboratory value, the specific demographic characteristics for each analysis varies.  </w:t>
+        <w:t xml:space="preserve">Since propensity matching was completed for each Cushing’s patient with a laboratory value, the specific demographic </w:t>
+      </w:r>
+      <w:proofErr w:type="gramStart"/>
+      <w:r>
+        <w:t>characteristics</w:t>
+      </w:r>
+      <w:proofErr w:type="gramEnd"/>
+      <w:r>
+        <w:t xml:space="preserve"> for each analysis varies.  </w:t>
       </w:r>
       <w:r>
         <w:t xml:space="preserve">For each analysis we report the demographics of those patients for </w:t>
@@ -3811,7 +4096,15 @@
         <w:t>,</w:t>
       </w:r>
       <w:r>
-        <w:t xml:space="preserve"> and  [S6] </w:t>
+        <w:t xml:space="preserve"> </w:t>
+      </w:r>
+      <w:proofErr w:type="gramStart"/>
+      <w:r>
+        <w:t>and  [</w:t>
+      </w:r>
+      <w:proofErr w:type="gramEnd"/>
+      <w:r>
+        <w:t xml:space="preserve">S6] </w:t>
       </w:r>
       <w:r>
         <w:t>Blood Pressure</w:t>
@@ -3853,7 +4146,7 @@
       </w:r>
     </w:p>
   </w:comment>
-  <w:comment w:id="1" w:author="Dave Bridges" w:date="2025-12-13T09:39:00Z" w:initials="DB">
+  <w:comment w:id="1" w:author="Carr, Treyton" w:date="2026-01-06T19:46:00Z" w:initials="CT">
     <w:p>
       <w:r>
         <w:rPr>
@@ -3866,8 +4159,33 @@
           <w:sz w:val="20"/>
           <w:szCs w:val="20"/>
         </w:rPr>
-        <w:t>Trey can you summarize</w:t>
-      </w:r>
+        <w:t>sources:</w:t>
+      </w:r>
+    </w:p>
+    <w:p>
+      <w:hyperlink r:id="rId1" w:history="1">
+        <w:r>
+          <w:rPr>
+            <w:rStyle w:val="Hyperlink"/>
+            <w:sz w:val="20"/>
+            <w:szCs w:val="20"/>
+          </w:rPr>
+          <w:t>https://www.sciencedirect.com/science/article/pii/S1521690X06000522?casa_token=vB1E5jy8AH0AAAAA:SlWLDFmJ840f-khzGkWn0K_xZdfxW-opIeGmNPob1qjBzPnF53m021D0XaSNLZ_O1BUC_lcCbMk</w:t>
+        </w:r>
+      </w:hyperlink>
+    </w:p>
+    <w:p/>
+    <w:p>
+      <w:hyperlink r:id="rId2" w:history="1">
+        <w:r>
+          <w:rPr>
+            <w:rStyle w:val="Hyperlink"/>
+            <w:sz w:val="20"/>
+            <w:szCs w:val="20"/>
+          </w:rPr>
+          <w:t>https://journals.lww.com/jhypertension/fulltext/2015/01000/The_hypertension_of_Cushing_s_syndrome_.6.aspxTest?casa_token=I--E6UkhUMMAAAAA:fkOVLRfHbzyQJsb_kVC-mIAOKPBO3pq533Lx7ct_fg3PYPwvP2wgsSC3t0mdLqPrs3mzyZOWtyeTGZyaYz1R8120QW8IXjI</w:t>
+        </w:r>
+      </w:hyperlink>
     </w:p>
   </w:comment>
 </w:comments>
@@ -3876,21 +4194,21 @@
 <file path=word/commentsExtended.xml><?xml version="1.0" encoding="utf-8"?>
 <w15:commentsEx xmlns:wpc="http://schemas.microsoft.com/office/word/2010/wordprocessingCanvas" xmlns:cx="http://schemas.microsoft.com/office/drawing/2014/chartex" xmlns:cx1="http://schemas.microsoft.com/office/drawing/2015/9/8/chartex" xmlns:cx2="http://schemas.microsoft.com/office/drawing/2015/10/21/chartex" xmlns:cx3="http://schemas.microsoft.com/office/drawing/2016/5/9/chartex" xmlns:cx4="http://schemas.microsoft.com/office/drawing/2016/5/10/chartex" xmlns:cx5="http://schemas.microsoft.com/office/drawing/2016/5/11/chartex" xmlns:cx6="http://schemas.microsoft.com/office/drawing/2016/5/12/chartex" xmlns:cx7="http://schemas.microsoft.com/office/drawing/2016/5/13/chartex" xmlns:cx8="http://schemas.microsoft.com/office/drawing/2016/5/14/chartex" xmlns:mc="http://schemas.openxmlformats.org/markup-compatibility/2006" xmlns:aink="http://schemas.microsoft.com/office/drawing/2016/ink" xmlns:am3d="http://schemas.microsoft.com/office/drawing/2017/model3d" xmlns:o="urn:schemas-microsoft-com:office:office" xmlns:oel="http://schemas.microsoft.com/office/2019/extlst" xmlns:r="http://schemas.openxmlformats.org/officeDocument/2006/relationships" xmlns:m="http://schemas.openxmlformats.org/officeDocument/2006/math" xmlns:v="urn:schemas-microsoft-com:vml" xmlns:wp14="http://schemas.microsoft.com/office/word/2010/wordprocessingDrawing" xmlns:wp="http://schemas.openxmlformats.org/drawingml/2006/wordprocessingDrawing" xmlns:w10="urn:schemas-microsoft-com:office:word" xmlns:w="http://schemas.openxmlformats.org/wordprocessingml/2006/main" xmlns:w14="http://schemas.microsoft.com/office/word/2010/wordml" xmlns:w15="http://schemas.microsoft.com/office/word/2012/wordml" xmlns:w16cex="http://schemas.microsoft.com/office/word/2018/wordml/cex" xmlns:w16cid="http://schemas.microsoft.com/office/word/2016/wordml/cid" xmlns:w16="http://schemas.microsoft.com/office/word/2018/wordml" xmlns:w16du="http://schemas.microsoft.com/office/word/2023/wordml/word16du" xmlns:w16sdtdh="http://schemas.microsoft.com/office/word/2020/wordml/sdtdatahash" xmlns:w16sdtfl="http://schemas.microsoft.com/office/word/2024/wordml/sdtformatlock" xmlns:w16se="http://schemas.microsoft.com/office/word/2015/wordml/symex" xmlns:wpg="http://schemas.microsoft.com/office/word/2010/wordprocessingGroup" xmlns:wpi="http://schemas.microsoft.com/office/word/2010/wordprocessingInk" xmlns:wne="http://schemas.microsoft.com/office/word/2006/wordml" xmlns:wps="http://schemas.microsoft.com/office/word/2010/wordprocessingShape" mc:Ignorable="w14 w15 w16se w16cid w16 w16cex w16sdtdh w16sdtfl w16du wp14">
   <w15:commentEx w15:paraId="1A4606F5" w15:done="0"/>
-  <w15:commentEx w15:paraId="6BA12295" w15:done="0"/>
+  <w15:commentEx w15:paraId="216FA133" w15:done="0"/>
 </w15:commentsEx>
 </file>
 
 <file path=word/commentsExtensible.xml><?xml version="1.0" encoding="utf-8"?>
 <w16cex:commentsExtensible xmlns:wpc="http://schemas.microsoft.com/office/word/2010/wordprocessingCanvas" xmlns:cx="http://schemas.microsoft.com/office/drawing/2014/chartex" xmlns:cx1="http://schemas.microsoft.com/office/drawing/2015/9/8/chartex" xmlns:cx2="http://schemas.microsoft.com/office/drawing/2015/10/21/chartex" xmlns:cx3="http://schemas.microsoft.com/office/drawing/2016/5/9/chartex" xmlns:cx4="http://schemas.microsoft.com/office/drawing/2016/5/10/chartex" xmlns:cx5="http://schemas.microsoft.com/office/drawing/2016/5/11/chartex" xmlns:cx6="http://schemas.microsoft.com/office/drawing/2016/5/12/chartex" xmlns:cx7="http://schemas.microsoft.com/office/drawing/2016/5/13/chartex" xmlns:cx8="http://schemas.microsoft.com/office/drawing/2016/5/14/chartex" xmlns:cr="http://schemas.microsoft.com/office/comments/2020/reactions" xmlns:mc="http://schemas.openxmlformats.org/markup-compatibility/2006" xmlns:aink="http://schemas.microsoft.com/office/drawing/2016/ink" xmlns:am3d="http://schemas.microsoft.com/office/drawing/2017/model3d" xmlns:o="urn:schemas-microsoft-com:office:office" xmlns:oel="http://schemas.microsoft.com/office/2019/extlst" xmlns:r="http://schemas.openxmlformats.org/officeDocument/2006/relationships" xmlns:m="http://schemas.openxmlformats.org/officeDocument/2006/math" xmlns:v="urn:schemas-microsoft-com:vml" xmlns:wp14="http://schemas.microsoft.com/office/word/2010/wordprocessingDrawing" xmlns:wp="http://schemas.openxmlformats.org/drawingml/2006/wordprocessingDrawing" xmlns:w10="urn:schemas-microsoft-com:office:word" xmlns:w="http://schemas.openxmlformats.org/wordprocessingml/2006/main" xmlns:w14="http://schemas.microsoft.com/office/word/2010/wordml" xmlns:w15="http://schemas.microsoft.com/office/word/2012/wordml" xmlns:w16cex="http://schemas.microsoft.com/office/word/2018/wordml/cex" xmlns:w16cid="http://schemas.microsoft.com/office/word/2016/wordml/cid" xmlns:w16="http://schemas.microsoft.com/office/word/2018/wordml" xmlns:w16du="http://schemas.microsoft.com/office/word/2023/wordml/word16du" xmlns:w16sdtdh="http://schemas.microsoft.com/office/word/2020/wordml/sdtdatahash" xmlns:w16sdtfl="http://schemas.microsoft.com/office/word/2024/wordml/sdtformatlock" xmlns:w16se="http://schemas.microsoft.com/office/word/2015/wordml/symex" xmlns:wpg="http://schemas.microsoft.com/office/word/2010/wordprocessingGroup" xmlns:wpi="http://schemas.microsoft.com/office/word/2010/wordprocessingInk" xmlns:wne="http://schemas.microsoft.com/office/word/2006/wordml" xmlns:wps="http://schemas.microsoft.com/office/word/2010/wordprocessingShape" mc:Ignorable="w14 w15 w16se w16cid w16 w16cex w16sdtdh w16sdtfl cr w16du wp14">
   <w16cex:commentExtensible w16cex:durableId="00CF6BFD" w16cex:dateUtc="2025-12-12T16:23:00Z"/>
-  <w16cex:commentExtensible w16cex:durableId="3B45A1F1" w16cex:dateUtc="2025-12-13T14:39:00Z"/>
+  <w16cex:commentExtensible w16cex:durableId="2095FDA8" w16cex:dateUtc="2026-01-07T00:46:00Z"/>
 </w16cex:commentsExtensible>
 </file>
 
 <file path=word/commentsIds.xml><?xml version="1.0" encoding="utf-8"?>
 <w16cid:commentsIds xmlns:wpc="http://schemas.microsoft.com/office/word/2010/wordprocessingCanvas" xmlns:cx="http://schemas.microsoft.com/office/drawing/2014/chartex" xmlns:cx1="http://schemas.microsoft.com/office/drawing/2015/9/8/chartex" xmlns:cx2="http://schemas.microsoft.com/office/drawing/2015/10/21/chartex" xmlns:cx3="http://schemas.microsoft.com/office/drawing/2016/5/9/chartex" xmlns:cx4="http://schemas.microsoft.com/office/drawing/2016/5/10/chartex" xmlns:cx5="http://schemas.microsoft.com/office/drawing/2016/5/11/chartex" xmlns:cx6="http://schemas.microsoft.com/office/drawing/2016/5/12/chartex" xmlns:cx7="http://schemas.microsoft.com/office/drawing/2016/5/13/chartex" xmlns:cx8="http://schemas.microsoft.com/office/drawing/2016/5/14/chartex" xmlns:mc="http://schemas.openxmlformats.org/markup-compatibility/2006" xmlns:aink="http://schemas.microsoft.com/office/drawing/2016/ink" xmlns:am3d="http://schemas.microsoft.com/office/drawing/2017/model3d" xmlns:o="urn:schemas-microsoft-com:office:office" xmlns:oel="http://schemas.microsoft.com/office/2019/extlst" xmlns:r="http://schemas.openxmlformats.org/officeDocument/2006/relationships" xmlns:m="http://schemas.openxmlformats.org/officeDocument/2006/math" xmlns:v="urn:schemas-microsoft-com:vml" xmlns:wp14="http://schemas.microsoft.com/office/word/2010/wordprocessingDrawing" xmlns:wp="http://schemas.openxmlformats.org/drawingml/2006/wordprocessingDrawing" xmlns:w10="urn:schemas-microsoft-com:office:word" xmlns:w="http://schemas.openxmlformats.org/wordprocessingml/2006/main" xmlns:w14="http://schemas.microsoft.com/office/word/2010/wordml" xmlns:w15="http://schemas.microsoft.com/office/word/2012/wordml" xmlns:w16cex="http://schemas.microsoft.com/office/word/2018/wordml/cex" xmlns:w16cid="http://schemas.microsoft.com/office/word/2016/wordml/cid" xmlns:w16="http://schemas.microsoft.com/office/word/2018/wordml" xmlns:w16du="http://schemas.microsoft.com/office/word/2023/wordml/word16du" xmlns:w16sdtdh="http://schemas.microsoft.com/office/word/2020/wordml/sdtdatahash" xmlns:w16sdtfl="http://schemas.microsoft.com/office/word/2024/wordml/sdtformatlock" xmlns:w16se="http://schemas.microsoft.com/office/word/2015/wordml/symex" xmlns:wpg="http://schemas.microsoft.com/office/word/2010/wordprocessingGroup" xmlns:wpi="http://schemas.microsoft.com/office/word/2010/wordprocessingInk" xmlns:wne="http://schemas.microsoft.com/office/word/2006/wordml" xmlns:wps="http://schemas.microsoft.com/office/word/2010/wordprocessingShape" mc:Ignorable="w14 w15 w16se w16cid w16 w16cex w16sdtdh w16sdtfl w16du wp14">
   <w16cid:commentId w16cid:paraId="1A4606F5" w16cid:durableId="00CF6BFD"/>
-  <w16cid:commentId w16cid:paraId="6BA12295" w16cid:durableId="3B45A1F1"/>
+  <w16cid:commentId w16cid:paraId="216FA133" w16cid:durableId="2095FDA8"/>
 </w16cid:commentsIds>
 </file>
 
@@ -5243,6 +5561,9 @@
 <w15:people xmlns:wpc="http://schemas.microsoft.com/office/word/2010/wordprocessingCanvas" xmlns:cx="http://schemas.microsoft.com/office/drawing/2014/chartex" xmlns:cx1="http://schemas.microsoft.com/office/drawing/2015/9/8/chartex" xmlns:cx2="http://schemas.microsoft.com/office/drawing/2015/10/21/chartex" xmlns:cx3="http://schemas.microsoft.com/office/drawing/2016/5/9/chartex" xmlns:cx4="http://schemas.microsoft.com/office/drawing/2016/5/10/chartex" xmlns:cx5="http://schemas.microsoft.com/office/drawing/2016/5/11/chartex" xmlns:cx6="http://schemas.microsoft.com/office/drawing/2016/5/12/chartex" xmlns:cx7="http://schemas.microsoft.com/office/drawing/2016/5/13/chartex" xmlns:cx8="http://schemas.microsoft.com/office/drawing/2016/5/14/chartex" xmlns:mc="http://schemas.openxmlformats.org/markup-compatibility/2006" xmlns:aink="http://schemas.microsoft.com/office/drawing/2016/ink" xmlns:am3d="http://schemas.microsoft.com/office/drawing/2017/model3d" xmlns:o="urn:schemas-microsoft-com:office:office" xmlns:oel="http://schemas.microsoft.com/office/2019/extlst" xmlns:r="http://schemas.openxmlformats.org/officeDocument/2006/relationships" xmlns:m="http://schemas.openxmlformats.org/officeDocument/2006/math" xmlns:v="urn:schemas-microsoft-com:vml" xmlns:wp14="http://schemas.microsoft.com/office/word/2010/wordprocessingDrawing" xmlns:wp="http://schemas.openxmlformats.org/drawingml/2006/wordprocessingDrawing" xmlns:w10="urn:schemas-microsoft-com:office:word" xmlns:w="http://schemas.openxmlformats.org/wordprocessingml/2006/main" xmlns:w14="http://schemas.microsoft.com/office/word/2010/wordml" xmlns:w15="http://schemas.microsoft.com/office/word/2012/wordml" xmlns:w16cex="http://schemas.microsoft.com/office/word/2018/wordml/cex" xmlns:w16cid="http://schemas.microsoft.com/office/word/2016/wordml/cid" xmlns:w16="http://schemas.microsoft.com/office/word/2018/wordml" xmlns:w16du="http://schemas.microsoft.com/office/word/2023/wordml/word16du" xmlns:w16sdtdh="http://schemas.microsoft.com/office/word/2020/wordml/sdtdatahash" xmlns:w16sdtfl="http://schemas.microsoft.com/office/word/2024/wordml/sdtformatlock" xmlns:w16se="http://schemas.microsoft.com/office/word/2015/wordml/symex" xmlns:wpg="http://schemas.microsoft.com/office/word/2010/wordprocessingGroup" xmlns:wpi="http://schemas.microsoft.com/office/word/2010/wordprocessingInk" xmlns:wne="http://schemas.microsoft.com/office/word/2006/wordml" xmlns:wps="http://schemas.microsoft.com/office/word/2010/wordprocessingShape" mc:Ignorable="w14 w15 w16se w16cid w16 w16cex w16sdtdh w16sdtfl w16du wp14">
   <w15:person w15:author="Dave Bridges">
     <w15:presenceInfo w15:providerId="None" w15:userId="Dave Bridges"/>
+  </w15:person>
+  <w15:person w15:author="Carr, Treyton">
+    <w15:presenceInfo w15:providerId="AD" w15:userId="S::treycarr@umich.edu::2d7a502c-7154-4eba-af5f-8ba5f8b51ac9"/>
   </w15:person>
 </w15:people>
 </file>

</xml_diff>

<commit_message>
Minor text changes to manuscript, clarifying differential effects
</commit_message>
<xml_diff>
--- a/manuscript/Cushings-Obesity/manuscript.docx
+++ b/manuscript/Cushings-Obesity/manuscript.docx
@@ -8,7 +8,13 @@
         <w:pStyle w:val="Title"/>
       </w:pPr>
       <w:r>
-        <w:t>Differential Metabolic Signatures of Cushing’s Disease in Obese and Non-Obese Patients</w:t>
+        <w:t xml:space="preserve">Differential Metabolic Signatures of Cushing’s Disease </w:t>
+      </w:r>
+      <w:r>
+        <w:t>Patients Dependent on their Obesity Status</w:t>
+      </w:r>
+      <w:r>
+        <w:t xml:space="preserve"> </w:t>
       </w:r>
     </w:p>
     <w:p/>
@@ -90,7 +96,13 @@
         <w:t>2</w:t>
       </w:r>
       <w:r>
-        <w:t xml:space="preserve"> IRIT CAN YOU INCLUDE YOUR NEW AFFILIATION</w:t>
+        <w:t xml:space="preserve"> </w:t>
+      </w:r>
+      <w:r>
+        <w:rPr>
+          <w:highlight w:val="yellow"/>
+        </w:rPr>
+        <w:t>IRIT CAN YOU INCLUDE YOUR NEW AFFILIATION</w:t>
       </w:r>
     </w:p>
     <w:p/>
@@ -2470,7 +2482,37 @@
         <w:ind w:left="0"/>
       </w:pPr>
       <w:r>
-        <w:t xml:space="preserve">It is less clear to us why blood pressure is not augmented.  We report that both obesity and Cushing’s disease increase systolic, diastolic and mean arterial pressure, but when both are combined the effect is strongly attenuated (Figure 2 and Table 3).  Obesity is a well-known risk factor for hypertension </w:t>
+        <w:t xml:space="preserve">It is less clear to us why blood pressure is </w:t>
+      </w:r>
+      <w:r>
+        <w:t>attenuated somewhat in patients with Cushing’s disease and obesity</w:t>
+      </w:r>
+      <w:r>
+        <w:t xml:space="preserve">.  </w:t>
+      </w:r>
+      <w:r>
+        <w:t>O</w:t>
+      </w:r>
+      <w:r>
+        <w:t>besity and Cushing’s disease</w:t>
+      </w:r>
+      <w:r>
+        <w:t xml:space="preserve"> both</w:t>
+      </w:r>
+      <w:r>
+        <w:t xml:space="preserve"> increase systolic, diastolic and mean arterial pressure, but when both are combined</w:t>
+      </w:r>
+      <w:r>
+        <w:t>,</w:t>
+      </w:r>
+      <w:r>
+        <w:t xml:space="preserve"> the effect is </w:t>
+      </w:r>
+      <w:r>
+        <w:t>significantly</w:t>
+      </w:r>
+      <w:r>
+        <w:t xml:space="preserve"> attenuated (Figure 2 and Table 3).  Obesity is a well-known risk factor for hypertension </w:t>
       </w:r>
       <w:r>
         <w:fldChar w:fldCharType="begin"/>
@@ -2526,6 +2568,9 @@
       <w:r>
         <w:t xml:space="preserve">  In our view, this warrants more detailed studies on sex differences, including the modifying effect of sex hormones on glucocorticoid signaling in the context of obesity.</w:t>
       </w:r>
+      <w:r>
+        <w:t xml:space="preserve">  More broadly, even though obesity status was similar between groups, patients with Cushing’s disease had much more severe hyperglycemia, blood pressure and liver enzymes than those with just obesity.</w:t>
+      </w:r>
     </w:p>
     <w:p>
       <w:pPr>
@@ -2539,11 +2584,7 @@
         <w:ind w:left="0"/>
       </w:pPr>
       <w:r>
-        <w:t xml:space="preserve">There are several strengths of this study, including a large number of patients identified for a rare disease, coupled with standardized laboratory results and comprehensive medical </w:t>
-      </w:r>
-      <w:r>
-        <w:lastRenderedPageBreak/>
-        <w:t xml:space="preserve">records.  The ability to match patients by age and demographic factors is also a strength of this analysis, as is the robustness of the analysis as demonstrated by our sensitivity analyses.  In our primary analysis patients with Cushing’s disease and obesity tended to have a higher BMI than the non-Cushing’s patients with obesity (Table 2), raising a concern that perhaps the augmentation in ALT/AST was just due to patients being at a higher BMI.  While this is a concern, we report that adjusting for BMI within group, and propensity matching for BMI did not modify the interaction effect estimates, which remained significant and approximately the same magnitude (Table 4), limiting that concern.  </w:t>
+        <w:t xml:space="preserve">There are several strengths of this study, including a large number of patients identified for a rare disease, coupled with standardized laboratory results and comprehensive medical records.  The ability to match patients by age and demographic factors is also a strength of this analysis, as is the robustness of the analysis as demonstrated by our sensitivity analyses.  In our primary analysis patients with Cushing’s disease and obesity tended to have a higher BMI than the non-Cushing’s patients with obesity (Table 2), raising a concern that perhaps the augmentation in ALT/AST was just due to patients being at a higher BMI.  While this is a concern, we report that adjusting for BMI within group, and propensity matching for BMI did not modify the interaction effect estimates, which remained significant and approximately the same magnitude (Table 4), limiting that concern.  </w:t>
       </w:r>
     </w:p>
     <w:p>
@@ -2638,7 +2679,11 @@
         <w:t>provided by</w:t>
       </w:r>
       <w:r>
-        <w:t xml:space="preserve"> the University of Michigan Adipose Tissue Core, part of the Michigan Nutrition and Obesity Research Center (NIH </w:t>
+        <w:t xml:space="preserve"> the University of Michigan Adipose Tissue Core, part of the Michigan Nutrition and Obesity Research Center </w:t>
+      </w:r>
+      <w:r>
+        <w:lastRenderedPageBreak/>
+        <w:t xml:space="preserve">(NIH </w:t>
       </w:r>
       <w:r>
         <w:t>P30DK020572</w:t>
@@ -2647,11 +2692,7 @@
         <w:t>).  This work was also supported by AI and Digital Health Innovation</w:t>
       </w:r>
       <w:r>
-        <w:t xml:space="preserve"> at the University of Michigan, and the University of Michigan Medical School Data Office for Clinical and Translational Research for providing data storage, management, processing, </w:t>
-      </w:r>
-      <w:r>
-        <w:lastRenderedPageBreak/>
-        <w:t>and distribution services.</w:t>
+        <w:t xml:space="preserve"> at the University of Michigan, and the University of Michigan Medical School Data Office for Clinical and Translational Research for providing data storage, management, processing, and distribution services.</w:t>
       </w:r>
       <w:r>
         <w:t xml:space="preserve">  Finally</w:t>
@@ -2698,37 +2739,8 @@
       <w:r>
         <w:fldChar w:fldCharType="separate"/>
       </w:r>
-      <w:proofErr w:type="spellStart"/>
-      <w:r>
-        <w:t>Alqeeq</w:t>
-      </w:r>
-      <w:proofErr w:type="spellEnd"/>
-      <w:r>
-        <w:t xml:space="preserve">, B. F., Ayyad, M., </w:t>
-      </w:r>
-      <w:proofErr w:type="spellStart"/>
-      <w:r>
-        <w:t>Almadhoun</w:t>
-      </w:r>
-      <w:proofErr w:type="spellEnd"/>
-      <w:r>
-        <w:t xml:space="preserve">, W. J., </w:t>
-      </w:r>
-      <w:proofErr w:type="spellStart"/>
-      <w:r>
-        <w:t>Aboabdo</w:t>
-      </w:r>
-      <w:proofErr w:type="spellEnd"/>
-      <w:r>
-        <w:t xml:space="preserve">, M., </w:t>
-      </w:r>
-      <w:proofErr w:type="spellStart"/>
-      <w:r>
-        <w:t>Aldahdouh</w:t>
-      </w:r>
-      <w:proofErr w:type="spellEnd"/>
-      <w:r>
-        <w:t xml:space="preserve">, M. S., Al-Tawil, M., &amp; Al-Ghazali, A. M. (2024). Sex-related differences in Cushing’s disease: A systematic review and meta-analysis. </w:t>
+      <w:r>
+        <w:t xml:space="preserve">Alqeeq, B. F., Ayyad, M., Almadhoun, W. J., Aboabdo, M., Aldahdouh, M. S., Al-Tawil, M., &amp; Al-Ghazali, A. M. (2024). Sex-related differences in Cushing’s disease: A systematic review and meta-analysis. </w:t>
       </w:r>
       <w:r>
         <w:rPr>
@@ -2756,15 +2768,7 @@
         <w:pStyle w:val="Bibliography"/>
       </w:pPr>
       <w:r>
-        <w:t xml:space="preserve">Braun, L. T., Riester, A., Oßwald-Kopp, A., Fazel, J., Rubinstein, G., </w:t>
-      </w:r>
-      <w:proofErr w:type="spellStart"/>
-      <w:r>
-        <w:t>Bidlingmaier</w:t>
-      </w:r>
-      <w:proofErr w:type="spellEnd"/>
-      <w:r>
-        <w:t xml:space="preserve">, M., Beuschlein, F., &amp; Reincke, M. (2019). Toward a Diagnostic Score in Cushing’s Syndrome. </w:t>
+        <w:t xml:space="preserve">Braun, L. T., Riester, A., Oßwald-Kopp, A., Fazel, J., Rubinstein, G., Bidlingmaier, M., Beuschlein, F., &amp; Reincke, M. (2019). Toward a Diagnostic Score in Cushing’s Syndrome. </w:t>
       </w:r>
       <w:r>
         <w:rPr>
@@ -2792,15 +2796,7 @@
         <w:pStyle w:val="Bibliography"/>
       </w:pPr>
       <w:r>
-        <w:t xml:space="preserve">Broder, M. S., Neary, M. P., Chang, E., Cherepanov, D., &amp; Ludlam, W. H. (2015). Incidence of Cushing’s syndrome and Cushing’s disease in </w:t>
-      </w:r>
-      <w:proofErr w:type="gramStart"/>
-      <w:r>
-        <w:t>commercially-insured</w:t>
-      </w:r>
-      <w:proofErr w:type="gramEnd"/>
-      <w:r>
-        <w:t xml:space="preserve"> patients &lt;65 years old in the United States. </w:t>
+        <w:t xml:space="preserve">Broder, M. S., Neary, M. P., Chang, E., Cherepanov, D., &amp; Ludlam, W. H. (2015). Incidence of Cushing’s syndrome and Cushing’s disease in commercially-insured patients &lt;65 years old in the United States. </w:t>
       </w:r>
       <w:r>
         <w:rPr>
@@ -2828,15 +2824,7 @@
         <w:pStyle w:val="Bibliography"/>
       </w:pPr>
       <w:r>
-        <w:t xml:space="preserve">DeFronzo, R. A., &amp; </w:t>
-      </w:r>
-      <w:proofErr w:type="spellStart"/>
-      <w:r>
-        <w:t>Auchus</w:t>
-      </w:r>
-      <w:proofErr w:type="spellEnd"/>
-      <w:r>
-        <w:t xml:space="preserve">, R. J. (2025). Cushing Syndrome, Hypercortisolism, and Glucose Homeostasis: A Review. </w:t>
+        <w:t xml:space="preserve">DeFronzo, R. A., &amp; Auchus, R. J. (2025). Cushing Syndrome, Hypercortisolism, and Glucose Homeostasis: A Review. </w:t>
       </w:r>
       <w:r>
         <w:rPr>
@@ -2863,36 +2851,47 @@
       <w:pPr>
         <w:pStyle w:val="Bibliography"/>
       </w:pPr>
-      <w:proofErr w:type="spellStart"/>
-      <w:r>
-        <w:t>Etxabe</w:t>
-      </w:r>
-      <w:proofErr w:type="spellEnd"/>
-      <w:r>
-        <w:t xml:space="preserve">, J., &amp; Vazquez, J. A. (1994). Morbidity and mortality in Cushing’s disease: An epidemiological approach. </w:t>
+      <w:r>
+        <w:t xml:space="preserve">Etxabe, J., &amp; Vazquez, J. A. (1994). Morbidity and mortality in Cushing’s disease: An epidemiological approach. </w:t>
       </w:r>
       <w:r>
         <w:rPr>
           <w:i/>
           <w:iCs/>
         </w:rPr>
-        <w:t>Clin Endocrinol (</w:t>
-      </w:r>
-      <w:proofErr w:type="spellStart"/>
+        <w:t>Clin Endocrinol (Oxf)</w:t>
+      </w:r>
+      <w:r>
+        <w:t xml:space="preserve">, </w:t>
+      </w:r>
       <w:r>
         <w:rPr>
           <w:i/>
           <w:iCs/>
         </w:rPr>
-        <w:t>Oxf</w:t>
-      </w:r>
-      <w:proofErr w:type="spellEnd"/>
+        <w:t>40</w:t>
+      </w:r>
+      <w:r>
+        <w:t>(4), 479–484. https://doi.org/10.1111/j.1365-2265.1994.tb02486.x</w:t>
+      </w:r>
+    </w:p>
+    <w:p>
+      <w:pPr>
+        <w:pStyle w:val="Bibliography"/>
+      </w:pPr>
+      <w:r>
+        <w:t xml:space="preserve">Fleseriu, M., Auchus, R., Bancos, I., Ben-Shlomo, A., Bertherat, J., Biermasz, N. R., Boguszewski, C. L., Bronstein, M. D., Buchfelder, M., Carmichael, J. D., Casanueva, F. F., Castinetti, F., Chanson, P., Findling, J., Gadelha, M., Geer, E. B., Giustina, A., </w:t>
+      </w:r>
+      <w:r>
+        <w:lastRenderedPageBreak/>
+        <w:t xml:space="preserve">Grossman, A., Gurnell, M., … Biller, B. M. K. (2021). Consensus on Diagnosis and Management of Cushing’s Disease: A Guideline Update. </w:t>
+      </w:r>
       <w:r>
         <w:rPr>
           <w:i/>
           <w:iCs/>
         </w:rPr>
-        <w:t>)</w:t>
+        <w:t>The Lancet. Diabetes &amp; Endocrinology</w:t>
       </w:r>
       <w:r>
         <w:t xml:space="preserve">, </w:t>
@@ -2902,66 +2901,25 @@
           <w:i/>
           <w:iCs/>
         </w:rPr>
-        <w:t>40</w:t>
-      </w:r>
-      <w:r>
-        <w:t>(4), 479–484. https://doi.org/10.1111/j.1365-2265.1994.tb02486.x</w:t>
+        <w:t>9</w:t>
+      </w:r>
+      <w:r>
+        <w:t>(12), 847–875. https://doi.org/10.1016/S2213-8587(21)00235-7</w:t>
       </w:r>
     </w:p>
     <w:p>
       <w:pPr>
         <w:pStyle w:val="Bibliography"/>
       </w:pPr>
-      <w:proofErr w:type="spellStart"/>
-      <w:r>
-        <w:t>Fleseriu</w:t>
-      </w:r>
-      <w:proofErr w:type="spellEnd"/>
-      <w:r>
-        <w:t xml:space="preserve">, M., </w:t>
-      </w:r>
-      <w:proofErr w:type="spellStart"/>
-      <w:r>
-        <w:t>Auchus</w:t>
-      </w:r>
-      <w:proofErr w:type="spellEnd"/>
-      <w:r>
-        <w:t xml:space="preserve">, R., Bancos, I., Ben-Shlomo, A., </w:t>
-      </w:r>
-      <w:proofErr w:type="spellStart"/>
-      <w:r>
-        <w:t>Bertherat</w:t>
-      </w:r>
-      <w:proofErr w:type="spellEnd"/>
-      <w:r>
-        <w:t xml:space="preserve">, J., </w:t>
-      </w:r>
-      <w:proofErr w:type="spellStart"/>
-      <w:r>
-        <w:t>Biermasz</w:t>
-      </w:r>
-      <w:proofErr w:type="spellEnd"/>
-      <w:r>
-        <w:t xml:space="preserve">, N. R., Boguszewski, C. L., Bronstein, M. D., </w:t>
-      </w:r>
-      <w:proofErr w:type="spellStart"/>
-      <w:r>
-        <w:t>Buchfelder</w:t>
-      </w:r>
-      <w:proofErr w:type="spellEnd"/>
-      <w:r>
-        <w:t xml:space="preserve">, M., Carmichael, J. D., Casanueva, F. F., Castinetti, F., Chanson, P., Findling, J., Gadelha, M., Geer, E. B., Giustina, A., </w:t>
-      </w:r>
-      <w:r>
-        <w:lastRenderedPageBreak/>
-        <w:t xml:space="preserve">Grossman, A., Gurnell, M., … Biller, B. M. K. (2021). Consensus on Diagnosis and Management of Cushing’s Disease: A Guideline Update. </w:t>
+      <w:r>
+        <w:t xml:space="preserve">Gadelha, M., Gatto, F., Wildemberg, L. E., &amp; Fleseriu, M. (2023). Cushing’s syndrome. </w:t>
       </w:r>
       <w:r>
         <w:rPr>
           <w:i/>
           <w:iCs/>
         </w:rPr>
-        <w:t>The Lancet. Diabetes &amp; Endocrinology</w:t>
+        <w:t>The Lancet</w:t>
       </w:r>
       <w:r>
         <w:t xml:space="preserve">, </w:t>
@@ -2971,10 +2929,10 @@
           <w:i/>
           <w:iCs/>
         </w:rPr>
-        <w:t>9</w:t>
-      </w:r>
-      <w:r>
-        <w:t>(12), 847–875. https://doi.org/10.1016/S2213-8587(21)00235-7</w:t>
+        <w:t>402</w:t>
+      </w:r>
+      <w:r>
+        <w:t>(10418), 2237–2252. https://doi.org/10.1016/S0140-6736(23)01961-X</w:t>
       </w:r>
     </w:p>
     <w:p>
@@ -2982,22 +2940,14 @@
         <w:pStyle w:val="Bibliography"/>
       </w:pPr>
       <w:r>
-        <w:t xml:space="preserve">Gadelha, M., Gatto, F., Wildemberg, L. E., &amp; </w:t>
-      </w:r>
-      <w:proofErr w:type="spellStart"/>
-      <w:r>
-        <w:t>Fleseriu</w:t>
-      </w:r>
-      <w:proofErr w:type="spellEnd"/>
-      <w:r>
-        <w:t xml:space="preserve">, M. (2023). Cushing’s syndrome. </w:t>
+        <w:t xml:space="preserve">Giordano, R., Picu, A., Marinazzo, E., D’Angelo, V., Berardelli, R., Karamouzis, I., Forno, D., Zinnà, D., Maccario, M., Ghigo, E., &amp; Arvat, E. (2011). Metabolic and cardiovascular outcomes in patients with Cushing’s syndrome of different aetiologies during active disease and 1 year after remission. </w:t>
       </w:r>
       <w:r>
         <w:rPr>
           <w:i/>
           <w:iCs/>
         </w:rPr>
-        <w:t>The Lancet</w:t>
+        <w:t>Clinical Endocrinology</w:t>
       </w:r>
       <w:r>
         <w:t xml:space="preserve">, </w:t>
@@ -3007,10 +2957,10 @@
           <w:i/>
           <w:iCs/>
         </w:rPr>
-        <w:t>402</w:t>
-      </w:r>
-      <w:r>
-        <w:t>(10418), 2237–2252. https://doi.org/10.1016/S0140-6736(23)01961-X</w:t>
+        <w:t>75</w:t>
+      </w:r>
+      <w:r>
+        <w:t>(3), 354–360. https://doi.org/10.1111/j.1365-2265.2011.04055.x</w:t>
       </w:r>
     </w:p>
     <w:p>
@@ -3018,62 +2968,14 @@
         <w:pStyle w:val="Bibliography"/>
       </w:pPr>
       <w:r>
-        <w:t xml:space="preserve">Giordano, R., </w:t>
-      </w:r>
-      <w:proofErr w:type="spellStart"/>
-      <w:r>
-        <w:t>Picu</w:t>
-      </w:r>
-      <w:proofErr w:type="spellEnd"/>
-      <w:r>
-        <w:t xml:space="preserve">, A., </w:t>
-      </w:r>
-      <w:proofErr w:type="spellStart"/>
-      <w:r>
-        <w:t>Marinazzo</w:t>
-      </w:r>
-      <w:proofErr w:type="spellEnd"/>
-      <w:r>
-        <w:t xml:space="preserve">, E., D’Angelo, V., Berardelli, R., </w:t>
-      </w:r>
-      <w:proofErr w:type="spellStart"/>
-      <w:r>
-        <w:t>Karamouzis</w:t>
-      </w:r>
-      <w:proofErr w:type="spellEnd"/>
-      <w:r>
-        <w:t xml:space="preserve">, I., Forno, D., </w:t>
-      </w:r>
-      <w:proofErr w:type="spellStart"/>
-      <w:r>
-        <w:t>Zinnà</w:t>
-      </w:r>
-      <w:proofErr w:type="spellEnd"/>
-      <w:r>
-        <w:t xml:space="preserve">, D., Maccario, M., Ghigo, E., &amp; </w:t>
-      </w:r>
-      <w:proofErr w:type="spellStart"/>
-      <w:r>
-        <w:t>Arvat</w:t>
-      </w:r>
-      <w:proofErr w:type="spellEnd"/>
-      <w:r>
-        <w:t xml:space="preserve">, E. (2011). Metabolic and cardiovascular outcomes in patients with Cushing’s syndrome of different </w:t>
-      </w:r>
-      <w:proofErr w:type="spellStart"/>
-      <w:r>
-        <w:t>aetiologies</w:t>
-      </w:r>
-      <w:proofErr w:type="spellEnd"/>
-      <w:r>
-        <w:t xml:space="preserve"> during active disease and 1 year after remission. </w:t>
+        <w:t xml:space="preserve">Gunder, L. C., Harvey, I., Redd, J. R., Davis, C. S., Al-Tamimi, A., Brooks, S. V., &amp; Bridges, D. (2020). Obesity augments glucocorticoid-dependent muscle atrophy in male c57bl/6j mice. </w:t>
       </w:r>
       <w:r>
         <w:rPr>
           <w:i/>
           <w:iCs/>
         </w:rPr>
-        <w:t>Clinical Endocrinology</w:t>
+        <w:t>Biomedicines</w:t>
       </w:r>
       <w:r>
         <w:t xml:space="preserve">, </w:t>
@@ -3083,10 +2985,10 @@
           <w:i/>
           <w:iCs/>
         </w:rPr>
-        <w:t>75</w:t>
-      </w:r>
-      <w:r>
-        <w:t>(3), 354–360. https://doi.org/10.1111/j.1365-2265.2011.04055.x</w:t>
+        <w:t>8</w:t>
+      </w:r>
+      <w:r>
+        <w:t>(10). https://doi.org/10.3390/biomedicines8100420</w:t>
       </w:r>
     </w:p>
     <w:p>
@@ -3094,14 +2996,14 @@
         <w:pStyle w:val="Bibliography"/>
       </w:pPr>
       <w:r>
-        <w:t xml:space="preserve">Gunder, L. C., Harvey, I., Redd, J. R., Davis, C. S., Al-Tamimi, A., Brooks, S. V., &amp; Bridges, D. (2020). Obesity augments glucocorticoid-dependent muscle atrophy in male c57bl/6j mice. </w:t>
+        <w:t xml:space="preserve">Harvey, I., Stephenson, E. J., Redd, J. R., Tran, Q. T., Hochberg, I., Qi, N., &amp; Bridges, D. (2018). Glucocorticoid-Induced Metabolic Disturbances Are Exacerbated in Obese Male Mice. </w:t>
       </w:r>
       <w:r>
         <w:rPr>
           <w:i/>
           <w:iCs/>
         </w:rPr>
-        <w:t>Biomedicines</w:t>
+        <w:t>Endocrinology</w:t>
       </w:r>
       <w:r>
         <w:t xml:space="preserve">, </w:t>
@@ -3111,10 +3013,10 @@
           <w:i/>
           <w:iCs/>
         </w:rPr>
-        <w:t>8</w:t>
-      </w:r>
-      <w:r>
-        <w:t>(10). https://doi.org/10.3390/biomedicines8100420</w:t>
+        <w:t>159</w:t>
+      </w:r>
+      <w:r>
+        <w:t>(6). https://doi.org/10.1210/en.2018-00147</w:t>
       </w:r>
     </w:p>
     <w:p>
@@ -3122,14 +3024,14 @@
         <w:pStyle w:val="Bibliography"/>
       </w:pPr>
       <w:r>
-        <w:t xml:space="preserve">Harvey, I., Stephenson, E. J., Redd, J. R., Tran, Q. T., Hochberg, I., Qi, N., &amp; Bridges, D. (2018). Glucocorticoid-Induced Metabolic Disturbances Are Exacerbated in Obese Male Mice. </w:t>
+        <w:t xml:space="preserve">Ho, D., Imai, K., King, G., &amp; Stuart, E. A. (2011). MatchIt: Nonparametric Preprocessing for Parametric Causal Inference. </w:t>
       </w:r>
       <w:r>
         <w:rPr>
           <w:i/>
           <w:iCs/>
         </w:rPr>
-        <w:t>Endocrinology</w:t>
+        <w:t>Journal of Statistical Software</w:t>
       </w:r>
       <w:r>
         <w:t xml:space="preserve">, </w:t>
@@ -3139,10 +3041,10 @@
           <w:i/>
           <w:iCs/>
         </w:rPr>
-        <w:t>159</w:t>
-      </w:r>
-      <w:r>
-        <w:t>(6). https://doi.org/10.1210/en.2018-00147</w:t>
+        <w:t>42</w:t>
+      </w:r>
+      <w:r>
+        <w:t>, 1–28. https://doi.org/10.18637/jss.v042.i08</w:t>
       </w:r>
     </w:p>
     <w:p>
@@ -3150,22 +3052,18 @@
         <w:pStyle w:val="Bibliography"/>
       </w:pPr>
       <w:r>
-        <w:t xml:space="preserve">Ho, D., Imai, K., King, G., &amp; Stuart, E. A. (2011). </w:t>
-      </w:r>
-      <w:proofErr w:type="spellStart"/>
-      <w:r>
-        <w:t>MatchIt</w:t>
-      </w:r>
-      <w:proofErr w:type="spellEnd"/>
-      <w:r>
-        <w:t xml:space="preserve">: Nonparametric Preprocessing for Parametric Causal Inference. </w:t>
+        <w:t xml:space="preserve">Hochberg, I., Harvey, I., Tran, Q. T., Stephenson, E. J., Barkan, A. L., Saltiel, A. R., Chandler, W. F., &amp; Bridges, D. (2015). Gene expression changes in subcutaneous adipose </w:t>
+      </w:r>
+      <w:r>
+        <w:lastRenderedPageBreak/>
+        <w:t xml:space="preserve">tissue due to Cushing’s disease. </w:t>
       </w:r>
       <w:r>
         <w:rPr>
           <w:i/>
           <w:iCs/>
         </w:rPr>
-        <w:t>Journal of Statistical Software</w:t>
+        <w:t>Journal of Molecular Endocrinology</w:t>
       </w:r>
       <w:r>
         <w:t xml:space="preserve">, </w:t>
@@ -3175,10 +3073,10 @@
           <w:i/>
           <w:iCs/>
         </w:rPr>
-        <w:t>42</w:t>
-      </w:r>
-      <w:r>
-        <w:t>, 1–28. https://doi.org/10.18637/jss.v042.i08</w:t>
+        <w:t>55</w:t>
+      </w:r>
+      <w:r>
+        <w:t>(2), 81–94. https://doi.org/10.1530/JME-15-0119</w:t>
       </w:r>
     </w:p>
     <w:p>
@@ -3186,18 +3084,14 @@
         <w:pStyle w:val="Bibliography"/>
       </w:pPr>
       <w:r>
-        <w:t xml:space="preserve">Hochberg, I., Harvey, I., Tran, Q. T., Stephenson, E. J., Barkan, A. L., Saltiel, A. R., Chandler, W. F., &amp; Bridges, D. (2015). Gene expression changes in subcutaneous adipose </w:t>
-      </w:r>
-      <w:r>
-        <w:lastRenderedPageBreak/>
-        <w:t xml:space="preserve">tissue due to Cushing’s disease. </w:t>
+        <w:t xml:space="preserve">Ioachimescu, A. G., Goswami, N., Handa, T., Pappy, A., Veledar, E., &amp; Oyesiku, N. M. (2022). Racial Disparities in Acromegaly and Cushing’s Disease: A Referral Center Study in 241 Patients. </w:t>
       </w:r>
       <w:r>
         <w:rPr>
           <w:i/>
           <w:iCs/>
         </w:rPr>
-        <w:t>Journal of Molecular Endocrinology</w:t>
+        <w:t>Journal of the Endocrine Society</w:t>
       </w:r>
       <w:r>
         <w:t xml:space="preserve">, </w:t>
@@ -3207,10 +3101,10 @@
           <w:i/>
           <w:iCs/>
         </w:rPr>
-        <w:t>55</w:t>
-      </w:r>
-      <w:r>
-        <w:t>(2), 81–94. https://doi.org/10.1530/JME-15-0119</w:t>
+        <w:t>6</w:t>
+      </w:r>
+      <w:r>
+        <w:t>(1), bvab176. https://doi.org/10.1210/jendso/bvab176</w:t>
       </w:r>
     </w:p>
     <w:p>
@@ -3218,30 +3112,23 @@
         <w:pStyle w:val="Bibliography"/>
       </w:pPr>
       <w:r>
-        <w:t xml:space="preserve">Ioachimescu, A. G., Goswami, N., Handa, T., Pappy, A., </w:t>
-      </w:r>
-      <w:proofErr w:type="spellStart"/>
-      <w:r>
-        <w:t>Veledar</w:t>
-      </w:r>
-      <w:proofErr w:type="spellEnd"/>
-      <w:r>
-        <w:t xml:space="preserve">, E., &amp; </w:t>
-      </w:r>
-      <w:proofErr w:type="spellStart"/>
-      <w:r>
-        <w:t>Oyesiku</w:t>
-      </w:r>
-      <w:proofErr w:type="spellEnd"/>
-      <w:r>
-        <w:t xml:space="preserve">, N. M. (2022). Racial Disparities in Acromegaly and Cushing’s Disease: A Referral Center Study in 241 Patients. </w:t>
+        <w:t>Isidori, A. M., Graziadio, C., Paragliola, R. M., Cozzolino, A., Ambrogio, A. G., Colao, A., Corsello, S. M., Pivonello, R., &amp; Group,  on behalf of the A. S. (2015). The hypertension of Cushing’s syndrome: Controversies in...</w:t>
+      </w:r>
+      <w:r>
+        <w:rPr>
+          <w:rFonts w:ascii="Arial" w:hAnsi="Arial" w:cs="Arial"/>
+        </w:rPr>
+        <w:t> </w:t>
+      </w:r>
+      <w:r>
+        <w:t xml:space="preserve">: Journal of Hypertension. </w:t>
       </w:r>
       <w:r>
         <w:rPr>
           <w:i/>
           <w:iCs/>
         </w:rPr>
-        <w:t>Journal of the Endocrine Society</w:t>
+        <w:t>Journal of Hypertension</w:t>
       </w:r>
       <w:r>
         <w:t xml:space="preserve">, </w:t>
@@ -3251,10 +3138,10 @@
           <w:i/>
           <w:iCs/>
         </w:rPr>
-        <w:t>6</w:t>
-      </w:r>
-      <w:r>
-        <w:t>(1), bvab176. https://doi.org/10.1210/jendso/bvab176</w:t>
+        <w:t>33</w:t>
+      </w:r>
+      <w:r>
+        <w:t>(1), 44–60. https://doi.org/10.1097/HJH.0000000000000415</w:t>
       </w:r>
     </w:p>
     <w:p>
@@ -3262,63 +3149,14 @@
         <w:pStyle w:val="Bibliography"/>
       </w:pPr>
       <w:r>
-        <w:t xml:space="preserve">Isidori, A. M., </w:t>
-      </w:r>
-      <w:proofErr w:type="spellStart"/>
-      <w:r>
-        <w:t>Graziadio</w:t>
-      </w:r>
-      <w:proofErr w:type="spellEnd"/>
-      <w:r>
-        <w:t xml:space="preserve">, C., </w:t>
-      </w:r>
-      <w:proofErr w:type="spellStart"/>
-      <w:r>
-        <w:t>Paragliola</w:t>
-      </w:r>
-      <w:proofErr w:type="spellEnd"/>
-      <w:r>
-        <w:t xml:space="preserve">, R. M., Cozzolino, A., Ambrogio, A. G., Colao, A., Corsello, S. M., </w:t>
-      </w:r>
-      <w:proofErr w:type="spellStart"/>
-      <w:r>
-        <w:t>Pivonello</w:t>
-      </w:r>
-      <w:proofErr w:type="spellEnd"/>
-      <w:r>
-        <w:t xml:space="preserve">, R., &amp; </w:t>
-      </w:r>
-      <w:proofErr w:type="gramStart"/>
-      <w:r>
-        <w:t>Group,  on</w:t>
-      </w:r>
-      <w:proofErr w:type="gramEnd"/>
-      <w:r>
-        <w:t xml:space="preserve"> behalf of the A. S. (2015). The hypertension of Cushing’s syndrome: Controversies in..</w:t>
-      </w:r>
-      <w:proofErr w:type="gramStart"/>
-      <w:r>
-        <w:t>.</w:t>
-      </w:r>
-      <w:r>
-        <w:rPr>
-          <w:rFonts w:ascii="Arial" w:hAnsi="Arial" w:cs="Arial"/>
-        </w:rPr>
-        <w:t> </w:t>
-      </w:r>
-      <w:r>
-        <w:t>:</w:t>
-      </w:r>
-      <w:proofErr w:type="gramEnd"/>
-      <w:r>
-        <w:t xml:space="preserve"> Journal of Hypertension. </w:t>
+        <w:t xml:space="preserve">Magiakou, M. A., Smyrnaki, P., &amp; Chrousos, G. P. (2006). Hypertension in Cushing’s syndrome. </w:t>
       </w:r>
       <w:r>
         <w:rPr>
           <w:i/>
           <w:iCs/>
         </w:rPr>
-        <w:t>Journal of Hypertension</w:t>
+        <w:t>Best Practice &amp; Research Clinical Endocrinology &amp; Metabolism</w:t>
       </w:r>
       <w:r>
         <w:t xml:space="preserve">, </w:t>
@@ -3328,38 +3166,25 @@
           <w:i/>
           <w:iCs/>
         </w:rPr>
-        <w:t>33</w:t>
-      </w:r>
-      <w:r>
-        <w:t>(1), 44–60. https://doi.org/10.1097/HJH.0000000000000415</w:t>
+        <w:t>20</w:t>
+      </w:r>
+      <w:r>
+        <w:t>(3), 467–482. https://doi.org/10.1016/j.beem.2006.07.006</w:t>
       </w:r>
     </w:p>
     <w:p>
       <w:pPr>
         <w:pStyle w:val="Bibliography"/>
       </w:pPr>
-      <w:proofErr w:type="spellStart"/>
-      <w:r>
-        <w:t>Magiakou</w:t>
-      </w:r>
-      <w:proofErr w:type="spellEnd"/>
-      <w:r>
-        <w:t xml:space="preserve">, M. A., Smyrnaki, P., &amp; </w:t>
-      </w:r>
-      <w:proofErr w:type="spellStart"/>
-      <w:r>
-        <w:t>Chrousos</w:t>
-      </w:r>
-      <w:proofErr w:type="spellEnd"/>
-      <w:r>
-        <w:t xml:space="preserve">, G. P. (2006). Hypertension in Cushing’s syndrome. </w:t>
+      <w:r>
+        <w:t xml:space="preserve">Matthiasdottir, A. M., Hardarson, T. O., Arnardottir, S., &amp; Sigurjonsdottir, H. A. (2024). Cushing’s Disease May Have Higher Incidence than Previously Thought: A Nationwide Study in Iceland 2010–2019. </w:t>
       </w:r>
       <w:r>
         <w:rPr>
           <w:i/>
           <w:iCs/>
         </w:rPr>
-        <w:t>Best Practice &amp; Research Clinical Endocrinology &amp; Metabolism</w:t>
+        <w:t>Neuroendocrinology</w:t>
       </w:r>
       <w:r>
         <w:t xml:space="preserve">, </w:t>
@@ -3369,30 +3194,25 @@
           <w:i/>
           <w:iCs/>
         </w:rPr>
-        <w:t>20</w:t>
-      </w:r>
-      <w:r>
-        <w:t>(3), 467–482. https://doi.org/10.1016/j.beem.2006.07.006</w:t>
+        <w:t>114</w:t>
+      </w:r>
+      <w:r>
+        <w:t>(10), 950–957. https://doi.org/10.1159/000540205</w:t>
       </w:r>
     </w:p>
     <w:p>
       <w:pPr>
         <w:pStyle w:val="Bibliography"/>
       </w:pPr>
-      <w:proofErr w:type="spellStart"/>
-      <w:r>
-        <w:t>Matthiasdottir</w:t>
-      </w:r>
-      <w:proofErr w:type="spellEnd"/>
-      <w:r>
-        <w:t xml:space="preserve">, A. M., Hardarson, T. O., Arnardottir, S., &amp; Sigurjonsdottir, H. A. (2024). Cushing’s Disease May Have Higher Incidence than Previously Thought: A Nationwide Study in Iceland 2010–2019. </w:t>
+      <w:r>
+        <w:t xml:space="preserve">Nieman, L. K. (2002). Diagnostic Tests for Cushing’s Syndrome. </w:t>
       </w:r>
       <w:r>
         <w:rPr>
           <w:i/>
           <w:iCs/>
         </w:rPr>
-        <w:t>Neuroendocrinology</w:t>
+        <w:t>Annals of the New York Academy of Sciences</w:t>
       </w:r>
       <w:r>
         <w:t xml:space="preserve">, </w:t>
@@ -3402,10 +3222,10 @@
           <w:i/>
           <w:iCs/>
         </w:rPr>
-        <w:t>114</w:t>
-      </w:r>
-      <w:r>
-        <w:t>(10), 950–957. https://doi.org/10.1159/000540205</w:t>
+        <w:t>970</w:t>
+      </w:r>
+      <w:r>
+        <w:t>(1), 112–118. https://doi.org/10.1111/j.1749-6632.2002.tb04417.x</w:t>
       </w:r>
     </w:p>
     <w:p>
@@ -3413,14 +3233,15 @@
         <w:pStyle w:val="Bibliography"/>
       </w:pPr>
       <w:r>
-        <w:t xml:space="preserve">Nieman, L. K. (2002). Diagnostic Tests for Cushing’s Syndrome. </w:t>
+        <w:lastRenderedPageBreak/>
+        <w:t xml:space="preserve">Omotosho, Y. B., McGlotten, R., Chittiboina, P., &amp; Nieman, L. (2024). MON-113 Racial Disparity in the Time to Diagnosis of Cushing’s Disease. </w:t>
       </w:r>
       <w:r>
         <w:rPr>
           <w:i/>
           <w:iCs/>
         </w:rPr>
-        <w:t>Annals of the New York Academy of Sciences</w:t>
+        <w:t>Journal of the Endocrine Society</w:t>
       </w:r>
       <w:r>
         <w:t xml:space="preserve">, </w:t>
@@ -3430,10 +3251,10 @@
           <w:i/>
           <w:iCs/>
         </w:rPr>
-        <w:t>970</w:t>
-      </w:r>
-      <w:r>
-        <w:t>(1), 112–118. https://doi.org/10.1111/j.1749-6632.2002.tb04417.x</w:t>
+        <w:t>8</w:t>
+      </w:r>
+      <w:r>
+        <w:t>(Supplement_1), bvae163.2408. https://doi.org/10.1210/jendso/bvae163.2408</w:t>
       </w:r>
     </w:p>
     <w:p>
@@ -3441,23 +3262,14 @@
         <w:pStyle w:val="Bibliography"/>
       </w:pPr>
       <w:r>
-        <w:lastRenderedPageBreak/>
-        <w:t xml:space="preserve">Omotosho, Y. B., McGlotten, R., </w:t>
-      </w:r>
-      <w:proofErr w:type="spellStart"/>
-      <w:r>
-        <w:t>Chittiboina</w:t>
-      </w:r>
-      <w:proofErr w:type="spellEnd"/>
-      <w:r>
-        <w:t xml:space="preserve">, P., &amp; Nieman, L. (2024). MON-113 Racial Disparity in the Time to Diagnosis of Cushing’s Disease. </w:t>
+        <w:t xml:space="preserve">Parvanova, A., Reseghetti, E., Abbate, M., &amp; Ruggenenti, P. (2024). Mechanisms and treatment of obesity-related hypertension—Part 1: Mechanisms. </w:t>
       </w:r>
       <w:r>
         <w:rPr>
           <w:i/>
           <w:iCs/>
         </w:rPr>
-        <w:t>Journal of the Endocrine Society</w:t>
+        <w:t>Clinical Kidney Journal</w:t>
       </w:r>
       <w:r>
         <w:t xml:space="preserve">, </w:t>
@@ -3467,59 +3279,46 @@
           <w:i/>
           <w:iCs/>
         </w:rPr>
-        <w:t>8</w:t>
-      </w:r>
-      <w:r>
-        <w:t>(Supplement_1), bvae163.2408. https://doi.org/10.1210/jendso/bvae163.2408</w:t>
+        <w:t>17</w:t>
+      </w:r>
+      <w:r>
+        <w:t>(1), sfad282. https://doi.org/10.1093/ckj/sfad282</w:t>
       </w:r>
     </w:p>
     <w:p>
       <w:pPr>
         <w:pStyle w:val="Bibliography"/>
       </w:pPr>
-      <w:proofErr w:type="spellStart"/>
-      <w:r>
-        <w:t>Parvanova</w:t>
-      </w:r>
-      <w:proofErr w:type="spellEnd"/>
-      <w:r>
-        <w:t xml:space="preserve">, A., </w:t>
-      </w:r>
-      <w:proofErr w:type="spellStart"/>
-      <w:r>
-        <w:t>Reseghetti</w:t>
-      </w:r>
-      <w:proofErr w:type="spellEnd"/>
-      <w:r>
-        <w:t xml:space="preserve">, E., Abbate, M., &amp; </w:t>
-      </w:r>
-      <w:proofErr w:type="spellStart"/>
-      <w:r>
-        <w:t>Ruggenenti</w:t>
-      </w:r>
-      <w:proofErr w:type="spellEnd"/>
-      <w:r>
-        <w:t xml:space="preserve">, P. (2024). Mechanisms and treatment of obesity-related hypertension—Part 1: Mechanisms. </w:t>
+      <w:r>
+        <w:t xml:space="preserve">R Core Team. (2019). </w:t>
       </w:r>
       <w:r>
         <w:rPr>
           <w:i/>
           <w:iCs/>
         </w:rPr>
-        <w:t>Clinical Kidney Journal</w:t>
-      </w:r>
-      <w:r>
-        <w:t xml:space="preserve">, </w:t>
+        <w:t>R: A Language and Environment for Statistical Computing</w:t>
+      </w:r>
+      <w:r>
+        <w:t>. R Foundation for Statistical Computing. http://www.r-project.org/</w:t>
+      </w:r>
+    </w:p>
+    <w:p>
+      <w:pPr>
+        <w:pStyle w:val="Bibliography"/>
+      </w:pPr>
+      <w:r>
+        <w:t xml:space="preserve">Sharma, S. T., Nieman, L. K., &amp; Feelders, R. A. (2015). Cushing’s syndrome: Epidemiology and developments in disease management. </w:t>
       </w:r>
       <w:r>
         <w:rPr>
           <w:i/>
           <w:iCs/>
         </w:rPr>
-        <w:t>17</w:t>
-      </w:r>
-      <w:r>
-        <w:t>(1), sfad282. https://doi.org/10.1093/ckj/sfad282</w:t>
+        <w:t>Clinical Epidemiology</w:t>
+      </w:r>
+      <w:r>
+        <w:t>, 281–293.</w:t>
       </w:r>
     </w:p>
     <w:p>
@@ -3527,43 +3326,27 @@
         <w:pStyle w:val="Bibliography"/>
       </w:pPr>
       <w:r>
-        <w:t xml:space="preserve">R Core Team. (2019). </w:t>
+        <w:t xml:space="preserve">Steffensen, C., Bak, A. M., Zøylner Rubeck, K., &amp; Jørgensen, J. O. L. (2010). Epidemiology of Cushing’s Syndrome. </w:t>
       </w:r>
       <w:r>
         <w:rPr>
           <w:i/>
           <w:iCs/>
         </w:rPr>
-        <w:t>R: A Language and Environment for Statistical Computing</w:t>
-      </w:r>
-      <w:r>
-        <w:t>. R Foundation for Statistical Computing. http://www.r-project.org/</w:t>
-      </w:r>
-    </w:p>
-    <w:p>
-      <w:pPr>
-        <w:pStyle w:val="Bibliography"/>
-      </w:pPr>
-      <w:r>
-        <w:t xml:space="preserve">Sharma, S. T., Nieman, L. K., &amp; </w:t>
-      </w:r>
-      <w:proofErr w:type="spellStart"/>
-      <w:r>
-        <w:t>Feelders</w:t>
-      </w:r>
-      <w:proofErr w:type="spellEnd"/>
-      <w:r>
-        <w:t xml:space="preserve">, R. A. (2015). Cushing’s syndrome: Epidemiology and developments in disease management. </w:t>
+        <w:t>Neuroendocrinology</w:t>
+      </w:r>
+      <w:r>
+        <w:t xml:space="preserve">, </w:t>
       </w:r>
       <w:r>
         <w:rPr>
           <w:i/>
           <w:iCs/>
         </w:rPr>
-        <w:t>Clinical Epidemiology</w:t>
-      </w:r>
-      <w:r>
-        <w:t>, 281–293.</w:t>
+        <w:t>92</w:t>
+      </w:r>
+      <w:r>
+        <w:t>(Suppl. 1), 1–5. https://doi.org/10.1159/000314297</w:t>
       </w:r>
     </w:p>
     <w:p>
@@ -3571,80 +3354,7 @@
         <w:pStyle w:val="Bibliography"/>
       </w:pPr>
       <w:r>
-        <w:t xml:space="preserve">Steffensen, C., Bak, A. M., Zøylner Rubeck, K., &amp; Jørgensen, J. O. L. (2010). Epidemiology of Cushing’s Syndrome. </w:t>
-      </w:r>
-      <w:r>
-        <w:rPr>
-          <w:i/>
-          <w:iCs/>
-        </w:rPr>
-        <w:t>Neuroendocrinology</w:t>
-      </w:r>
-      <w:r>
-        <w:t xml:space="preserve">, </w:t>
-      </w:r>
-      <w:r>
-        <w:rPr>
-          <w:i/>
-          <w:iCs/>
-        </w:rPr>
-        <w:t>92</w:t>
-      </w:r>
-      <w:r>
-        <w:t>(Suppl. 1), 1–5. https://doi.org/10.1159/000314297</w:t>
-      </w:r>
-    </w:p>
-    <w:p>
-      <w:pPr>
-        <w:pStyle w:val="Bibliography"/>
-      </w:pPr>
-      <w:proofErr w:type="spellStart"/>
-      <w:r>
-        <w:t>Zillo</w:t>
-      </w:r>
-      <w:proofErr w:type="spellEnd"/>
-      <w:r>
-        <w:t xml:space="preserve">, M., Barbot, M., Ceccato, F., Camozzi, C., </w:t>
-      </w:r>
-      <w:proofErr w:type="spellStart"/>
-      <w:r>
-        <w:t>Bilora</w:t>
-      </w:r>
-      <w:proofErr w:type="spellEnd"/>
-      <w:r>
-        <w:t xml:space="preserve">, F., </w:t>
-      </w:r>
-      <w:proofErr w:type="spellStart"/>
-      <w:r>
-        <w:t>Casonato</w:t>
-      </w:r>
-      <w:proofErr w:type="spellEnd"/>
-      <w:r>
-        <w:t xml:space="preserve">, A., Frigo, A., </w:t>
-      </w:r>
-      <w:proofErr w:type="spellStart"/>
-      <w:r>
-        <w:t>Albiger</w:t>
-      </w:r>
-      <w:proofErr w:type="spellEnd"/>
-      <w:r>
-        <w:t xml:space="preserve">, N., Daidone, V., Mazzai, M., </w:t>
-      </w:r>
-      <w:proofErr w:type="spellStart"/>
-      <w:r>
-        <w:t>Mantero</w:t>
-      </w:r>
-      <w:proofErr w:type="spellEnd"/>
-      <w:r>
-        <w:t xml:space="preserve">, F., &amp; </w:t>
-      </w:r>
-      <w:proofErr w:type="spellStart"/>
-      <w:r>
-        <w:t>Scaroni</w:t>
-      </w:r>
-      <w:proofErr w:type="spellEnd"/>
-      <w:r>
-        <w:t xml:space="preserve">, C. (2014). Diagnosis and complications of Cushing’s disease: Gender-related differences. </w:t>
+        <w:t xml:space="preserve">Zillo, M., Barbot, M., Ceccato, F., Camozzi, C., Bilora, F., Casonato, A., Frigo, A., Albiger, N., Daidone, V., Mazzai, M., Mantero, F., &amp; Scaroni, C. (2014). Diagnosis and complications of Cushing’s disease: Gender-related differences. </w:t>
       </w:r>
       <w:r>
         <w:rPr>
@@ -3704,9 +3414,6 @@
       </w:r>
     </w:p>
     <w:p>
-      <w:pPr>
-        <w:pStyle w:val="NormalWeb"/>
-      </w:pPr>
       <w:r>
         <w:rPr>
           <w:b/>
@@ -3743,9 +3450,6 @@
       </w:r>
     </w:p>
     <w:p>
-      <w:pPr>
-        <w:pStyle w:val="NormalWeb"/>
-      </w:pPr>
       <w:r>
         <w:rPr>
           <w:b/>
@@ -3810,9 +3514,6 @@
       </w:r>
     </w:p>
     <w:p>
-      <w:pPr>
-        <w:pStyle w:val="NormalWeb"/>
-      </w:pPr>
       <w:r>
         <w:rPr>
           <w:b/>
@@ -3864,9 +3565,6 @@
       </w:r>
     </w:p>
     <w:p>
-      <w:pPr>
-        <w:pStyle w:val="NormalWeb"/>
-      </w:pPr>
       <w:r>
         <w:rPr>
           <w:b/>
@@ -3888,9 +3586,6 @@
       </w:r>
     </w:p>
     <w:p>
-      <w:pPr>
-        <w:pStyle w:val="NormalWeb"/>
-      </w:pPr>
       <w:r>
         <w:rPr>
           <w:b/>
@@ -3906,9 +3601,6 @@
       </w:r>
     </w:p>
     <w:p>
-      <w:pPr>
-        <w:pStyle w:val="NormalWeb"/>
-      </w:pPr>
       <w:r>
         <w:rPr>
           <w:b/>
@@ -3945,9 +3637,6 @@
       </w:r>
     </w:p>
     <w:p>
-      <w:pPr>
-        <w:pStyle w:val="NormalWeb"/>
-      </w:pPr>
       <w:r>
         <w:rPr>
           <w:b/>
@@ -4080,14 +3769,12 @@
       </w:r>
     </w:p>
     <w:p>
-      <w:pPr>
-        <w:pStyle w:val="NormalWeb"/>
-      </w:pPr>
       <w:r>
         <w:rPr>
           <w:b/>
           <w:bCs/>
         </w:rPr>
+        <w:lastRenderedPageBreak/>
         <w:t xml:space="preserve">Supplementary Table S1: </w:t>
       </w:r>
       <w:r>
@@ -4115,15 +3802,11 @@
       </w:r>
     </w:p>
     <w:p>
-      <w:pPr>
-        <w:pStyle w:val="NormalWeb"/>
-      </w:pPr>
       <w:r>
         <w:rPr>
           <w:b/>
           <w:bCs/>
         </w:rPr>
-        <w:lastRenderedPageBreak/>
         <w:t>Supplementary Tables S2</w:t>
       </w:r>
       <w:r>

</xml_diff>

<commit_message>
Checklist, double checking the readme file.
</commit_message>
<xml_diff>
--- a/manuscript/Cushings-Obesity/manuscript.docx
+++ b/manuscript/Cushings-Obesity/manuscript.docx
@@ -637,13 +637,10 @@
         <w:t>)</w:t>
       </w:r>
       <w:r>
-        <w:t xml:space="preserve">.  </w:t>
-      </w:r>
-      <w:r>
-        <w:t xml:space="preserve"> </w:t>
-      </w:r>
-      <w:r>
-        <w:t xml:space="preserve">  We excluded participants if they </w:t>
+        <w:t xml:space="preserve">. </w:t>
+      </w:r>
+      <w:r>
+        <w:t xml:space="preserve">We excluded participants if they </w:t>
       </w:r>
       <w:r>
         <w:t>did not have a Cushing’s disease diagnosis, treatment date, lab history, or relevant demographic data documented.</w:t>
@@ -917,7 +914,18 @@
         <w:t xml:space="preserve">  Statistical significance</w:t>
       </w:r>
       <w:r>
-        <w:t xml:space="preserve"> for this stud</w:t>
+        <w:t xml:space="preserve"> for this </w:t>
+      </w:r>
+      <w:commentRangeStart w:id="0"/>
+      <w:r>
+        <w:t>stud</w:t>
+      </w:r>
+      <w:commentRangeEnd w:id="0"/>
+      <w:r>
+        <w:rPr>
+          <w:rStyle w:val="CommentReference"/>
+        </w:rPr>
+        <w:commentReference w:id="0"/>
       </w:r>
       <w:r>
         <w:t xml:space="preserve"> was set at p&lt;0.05.  All analyses were performed using R version 4.4.0 </w:t>
@@ -3919,6 +3927,47 @@
     </w:sectPr>
   </w:body>
 </w:document>
+</file>
+
+<file path=word/comments.xml><?xml version="1.0" encoding="utf-8"?>
+<w:comments xmlns:wpc="http://schemas.microsoft.com/office/word/2010/wordprocessingCanvas" xmlns:cx="http://schemas.microsoft.com/office/drawing/2014/chartex" xmlns:cx1="http://schemas.microsoft.com/office/drawing/2015/9/8/chartex" xmlns:cx2="http://schemas.microsoft.com/office/drawing/2015/10/21/chartex" xmlns:cx3="http://schemas.microsoft.com/office/drawing/2016/5/9/chartex" xmlns:cx4="http://schemas.microsoft.com/office/drawing/2016/5/10/chartex" xmlns:cx5="http://schemas.microsoft.com/office/drawing/2016/5/11/chartex" xmlns:cx6="http://schemas.microsoft.com/office/drawing/2016/5/12/chartex" xmlns:cx7="http://schemas.microsoft.com/office/drawing/2016/5/13/chartex" xmlns:cx8="http://schemas.microsoft.com/office/drawing/2016/5/14/chartex" xmlns:mc="http://schemas.openxmlformats.org/markup-compatibility/2006" xmlns:aink="http://schemas.microsoft.com/office/drawing/2016/ink" xmlns:am3d="http://schemas.microsoft.com/office/drawing/2017/model3d" xmlns:o="urn:schemas-microsoft-com:office:office" xmlns:oel="http://schemas.microsoft.com/office/2019/extlst" xmlns:r="http://schemas.openxmlformats.org/officeDocument/2006/relationships" xmlns:m="http://schemas.openxmlformats.org/officeDocument/2006/math" xmlns:v="urn:schemas-microsoft-com:vml" xmlns:wp14="http://schemas.microsoft.com/office/word/2010/wordprocessingDrawing" xmlns:wp="http://schemas.openxmlformats.org/drawingml/2006/wordprocessingDrawing" xmlns:w10="urn:schemas-microsoft-com:office:word" xmlns:w="http://schemas.openxmlformats.org/wordprocessingml/2006/main" xmlns:w14="http://schemas.microsoft.com/office/word/2010/wordml" xmlns:w15="http://schemas.microsoft.com/office/word/2012/wordml" xmlns:w16cex="http://schemas.microsoft.com/office/word/2018/wordml/cex" xmlns:w16cid="http://schemas.microsoft.com/office/word/2016/wordml/cid" xmlns:w16="http://schemas.microsoft.com/office/word/2018/wordml" xmlns:w16du="http://schemas.microsoft.com/office/word/2023/wordml/word16du" xmlns:w16sdtdh="http://schemas.microsoft.com/office/word/2020/wordml/sdtdatahash" xmlns:w16sdtfl="http://schemas.microsoft.com/office/word/2024/wordml/sdtformatlock" xmlns:w16se="http://schemas.microsoft.com/office/word/2015/wordml/symex" xmlns:wpg="http://schemas.microsoft.com/office/word/2010/wordprocessingGroup" xmlns:wpi="http://schemas.microsoft.com/office/word/2010/wordprocessingInk" xmlns:wne="http://schemas.microsoft.com/office/word/2006/wordml" xmlns:wps="http://schemas.microsoft.com/office/word/2010/wordprocessingShape" mc:Ignorable="w14 w15 w16se w16cid w16 w16cex w16sdtdh w16sdtfl w16du wp14">
+  <w:comment w:id="0" w:author="Carr, Treyton" w:date="2026-01-14T14:19:00Z" w:initials="CT">
+    <w:p>
+      <w:r>
+        <w:rPr>
+          <w:rStyle w:val="CommentReference"/>
+        </w:rPr>
+        <w:annotationRef/>
+      </w:r>
+      <w:r>
+        <w:rPr>
+          <w:sz w:val="20"/>
+          <w:szCs w:val="20"/>
+        </w:rPr>
+        <w:t>Is this the correct word?</w:t>
+      </w:r>
+    </w:p>
+    <w:p/>
+  </w:comment>
+</w:comments>
+</file>
+
+<file path=word/commentsExtended.xml><?xml version="1.0" encoding="utf-8"?>
+<w15:commentsEx xmlns:wpc="http://schemas.microsoft.com/office/word/2010/wordprocessingCanvas" xmlns:cx="http://schemas.microsoft.com/office/drawing/2014/chartex" xmlns:cx1="http://schemas.microsoft.com/office/drawing/2015/9/8/chartex" xmlns:cx2="http://schemas.microsoft.com/office/drawing/2015/10/21/chartex" xmlns:cx3="http://schemas.microsoft.com/office/drawing/2016/5/9/chartex" xmlns:cx4="http://schemas.microsoft.com/office/drawing/2016/5/10/chartex" xmlns:cx5="http://schemas.microsoft.com/office/drawing/2016/5/11/chartex" xmlns:cx6="http://schemas.microsoft.com/office/drawing/2016/5/12/chartex" xmlns:cx7="http://schemas.microsoft.com/office/drawing/2016/5/13/chartex" xmlns:cx8="http://schemas.microsoft.com/office/drawing/2016/5/14/chartex" xmlns:mc="http://schemas.openxmlformats.org/markup-compatibility/2006" xmlns:aink="http://schemas.microsoft.com/office/drawing/2016/ink" xmlns:am3d="http://schemas.microsoft.com/office/drawing/2017/model3d" xmlns:o="urn:schemas-microsoft-com:office:office" xmlns:oel="http://schemas.microsoft.com/office/2019/extlst" xmlns:r="http://schemas.openxmlformats.org/officeDocument/2006/relationships" xmlns:m="http://schemas.openxmlformats.org/officeDocument/2006/math" xmlns:v="urn:schemas-microsoft-com:vml" xmlns:wp14="http://schemas.microsoft.com/office/word/2010/wordprocessingDrawing" xmlns:wp="http://schemas.openxmlformats.org/drawingml/2006/wordprocessingDrawing" xmlns:w10="urn:schemas-microsoft-com:office:word" xmlns:w="http://schemas.openxmlformats.org/wordprocessingml/2006/main" xmlns:w14="http://schemas.microsoft.com/office/word/2010/wordml" xmlns:w15="http://schemas.microsoft.com/office/word/2012/wordml" xmlns:w16cex="http://schemas.microsoft.com/office/word/2018/wordml/cex" xmlns:w16cid="http://schemas.microsoft.com/office/word/2016/wordml/cid" xmlns:w16="http://schemas.microsoft.com/office/word/2018/wordml" xmlns:w16du="http://schemas.microsoft.com/office/word/2023/wordml/word16du" xmlns:w16sdtdh="http://schemas.microsoft.com/office/word/2020/wordml/sdtdatahash" xmlns:w16sdtfl="http://schemas.microsoft.com/office/word/2024/wordml/sdtformatlock" xmlns:w16se="http://schemas.microsoft.com/office/word/2015/wordml/symex" xmlns:wpg="http://schemas.microsoft.com/office/word/2010/wordprocessingGroup" xmlns:wpi="http://schemas.microsoft.com/office/word/2010/wordprocessingInk" xmlns:wne="http://schemas.microsoft.com/office/word/2006/wordml" xmlns:wps="http://schemas.microsoft.com/office/word/2010/wordprocessingShape" mc:Ignorable="w14 w15 w16se w16cid w16 w16cex w16sdtdh w16sdtfl w16du wp14">
+  <w15:commentEx w15:paraId="334D6868" w15:done="0"/>
+</w15:commentsEx>
+</file>
+
+<file path=word/commentsExtensible.xml><?xml version="1.0" encoding="utf-8"?>
+<w16cex:commentsExtensible xmlns:wpc="http://schemas.microsoft.com/office/word/2010/wordprocessingCanvas" xmlns:cx="http://schemas.microsoft.com/office/drawing/2014/chartex" xmlns:cx1="http://schemas.microsoft.com/office/drawing/2015/9/8/chartex" xmlns:cx2="http://schemas.microsoft.com/office/drawing/2015/10/21/chartex" xmlns:cx3="http://schemas.microsoft.com/office/drawing/2016/5/9/chartex" xmlns:cx4="http://schemas.microsoft.com/office/drawing/2016/5/10/chartex" xmlns:cx5="http://schemas.microsoft.com/office/drawing/2016/5/11/chartex" xmlns:cx6="http://schemas.microsoft.com/office/drawing/2016/5/12/chartex" xmlns:cx7="http://schemas.microsoft.com/office/drawing/2016/5/13/chartex" xmlns:cx8="http://schemas.microsoft.com/office/drawing/2016/5/14/chartex" xmlns:cr="http://schemas.microsoft.com/office/comments/2020/reactions" xmlns:mc="http://schemas.openxmlformats.org/markup-compatibility/2006" xmlns:aink="http://schemas.microsoft.com/office/drawing/2016/ink" xmlns:am3d="http://schemas.microsoft.com/office/drawing/2017/model3d" xmlns:o="urn:schemas-microsoft-com:office:office" xmlns:oel="http://schemas.microsoft.com/office/2019/extlst" xmlns:r="http://schemas.openxmlformats.org/officeDocument/2006/relationships" xmlns:m="http://schemas.openxmlformats.org/officeDocument/2006/math" xmlns:v="urn:schemas-microsoft-com:vml" xmlns:wp14="http://schemas.microsoft.com/office/word/2010/wordprocessingDrawing" xmlns:wp="http://schemas.openxmlformats.org/drawingml/2006/wordprocessingDrawing" xmlns:w10="urn:schemas-microsoft-com:office:word" xmlns:w="http://schemas.openxmlformats.org/wordprocessingml/2006/main" xmlns:w14="http://schemas.microsoft.com/office/word/2010/wordml" xmlns:w15="http://schemas.microsoft.com/office/word/2012/wordml" xmlns:w16cex="http://schemas.microsoft.com/office/word/2018/wordml/cex" xmlns:w16cid="http://schemas.microsoft.com/office/word/2016/wordml/cid" xmlns:w16="http://schemas.microsoft.com/office/word/2018/wordml" xmlns:w16du="http://schemas.microsoft.com/office/word/2023/wordml/word16du" xmlns:w16sdtdh="http://schemas.microsoft.com/office/word/2020/wordml/sdtdatahash" xmlns:w16sdtfl="http://schemas.microsoft.com/office/word/2024/wordml/sdtformatlock" xmlns:w16se="http://schemas.microsoft.com/office/word/2015/wordml/symex" xmlns:wpg="http://schemas.microsoft.com/office/word/2010/wordprocessingGroup" xmlns:wpi="http://schemas.microsoft.com/office/word/2010/wordprocessingInk" xmlns:wne="http://schemas.microsoft.com/office/word/2006/wordml" xmlns:wps="http://schemas.microsoft.com/office/word/2010/wordprocessingShape" mc:Ignorable="w14 w15 w16se w16cid w16 w16cex w16sdtdh w16sdtfl cr w16du wp14">
+  <w16cex:commentExtensible w16cex:durableId="5D44AEC0" w16cex:dateUtc="2026-01-14T19:19:00Z"/>
+</w16cex:commentsExtensible>
+</file>
+
+<file path=word/commentsIds.xml><?xml version="1.0" encoding="utf-8"?>
+<w16cid:commentsIds xmlns:wpc="http://schemas.microsoft.com/office/word/2010/wordprocessingCanvas" xmlns:cx="http://schemas.microsoft.com/office/drawing/2014/chartex" xmlns:cx1="http://schemas.microsoft.com/office/drawing/2015/9/8/chartex" xmlns:cx2="http://schemas.microsoft.com/office/drawing/2015/10/21/chartex" xmlns:cx3="http://schemas.microsoft.com/office/drawing/2016/5/9/chartex" xmlns:cx4="http://schemas.microsoft.com/office/drawing/2016/5/10/chartex" xmlns:cx5="http://schemas.microsoft.com/office/drawing/2016/5/11/chartex" xmlns:cx6="http://schemas.microsoft.com/office/drawing/2016/5/12/chartex" xmlns:cx7="http://schemas.microsoft.com/office/drawing/2016/5/13/chartex" xmlns:cx8="http://schemas.microsoft.com/office/drawing/2016/5/14/chartex" xmlns:mc="http://schemas.openxmlformats.org/markup-compatibility/2006" xmlns:aink="http://schemas.microsoft.com/office/drawing/2016/ink" xmlns:am3d="http://schemas.microsoft.com/office/drawing/2017/model3d" xmlns:o="urn:schemas-microsoft-com:office:office" xmlns:oel="http://schemas.microsoft.com/office/2019/extlst" xmlns:r="http://schemas.openxmlformats.org/officeDocument/2006/relationships" xmlns:m="http://schemas.openxmlformats.org/officeDocument/2006/math" xmlns:v="urn:schemas-microsoft-com:vml" xmlns:wp14="http://schemas.microsoft.com/office/word/2010/wordprocessingDrawing" xmlns:wp="http://schemas.openxmlformats.org/drawingml/2006/wordprocessingDrawing" xmlns:w10="urn:schemas-microsoft-com:office:word" xmlns:w="http://schemas.openxmlformats.org/wordprocessingml/2006/main" xmlns:w14="http://schemas.microsoft.com/office/word/2010/wordml" xmlns:w15="http://schemas.microsoft.com/office/word/2012/wordml" xmlns:w16cex="http://schemas.microsoft.com/office/word/2018/wordml/cex" xmlns:w16cid="http://schemas.microsoft.com/office/word/2016/wordml/cid" xmlns:w16="http://schemas.microsoft.com/office/word/2018/wordml" xmlns:w16du="http://schemas.microsoft.com/office/word/2023/wordml/word16du" xmlns:w16sdtdh="http://schemas.microsoft.com/office/word/2020/wordml/sdtdatahash" xmlns:w16sdtfl="http://schemas.microsoft.com/office/word/2024/wordml/sdtformatlock" xmlns:w16se="http://schemas.microsoft.com/office/word/2015/wordml/symex" xmlns:wpg="http://schemas.microsoft.com/office/word/2010/wordprocessingGroup" xmlns:wpi="http://schemas.microsoft.com/office/word/2010/wordprocessingInk" xmlns:wne="http://schemas.microsoft.com/office/word/2006/wordml" xmlns:wps="http://schemas.microsoft.com/office/word/2010/wordprocessingShape" mc:Ignorable="w14 w15 w16se w16cid w16 w16cex w16sdtdh w16sdtfl w16du wp14">
+  <w16cid:commentId w16cid:paraId="334D6868" w16cid:durableId="5D44AEC0"/>
+</w16cid:commentsIds>
 </file>
 
 <file path=word/numbering.xml><?xml version="1.0" encoding="utf-8"?>
@@ -5496,6 +5545,14 @@
     <w:abstractNumId w:val="0"/>
   </w:num>
 </w:numbering>
+</file>
+
+<file path=word/people.xml><?xml version="1.0" encoding="utf-8"?>
+<w15:people xmlns:wpc="http://schemas.microsoft.com/office/word/2010/wordprocessingCanvas" xmlns:cx="http://schemas.microsoft.com/office/drawing/2014/chartex" xmlns:cx1="http://schemas.microsoft.com/office/drawing/2015/9/8/chartex" xmlns:cx2="http://schemas.microsoft.com/office/drawing/2015/10/21/chartex" xmlns:cx3="http://schemas.microsoft.com/office/drawing/2016/5/9/chartex" xmlns:cx4="http://schemas.microsoft.com/office/drawing/2016/5/10/chartex" xmlns:cx5="http://schemas.microsoft.com/office/drawing/2016/5/11/chartex" xmlns:cx6="http://schemas.microsoft.com/office/drawing/2016/5/12/chartex" xmlns:cx7="http://schemas.microsoft.com/office/drawing/2016/5/13/chartex" xmlns:cx8="http://schemas.microsoft.com/office/drawing/2016/5/14/chartex" xmlns:mc="http://schemas.openxmlformats.org/markup-compatibility/2006" xmlns:aink="http://schemas.microsoft.com/office/drawing/2016/ink" xmlns:am3d="http://schemas.microsoft.com/office/drawing/2017/model3d" xmlns:o="urn:schemas-microsoft-com:office:office" xmlns:oel="http://schemas.microsoft.com/office/2019/extlst" xmlns:r="http://schemas.openxmlformats.org/officeDocument/2006/relationships" xmlns:m="http://schemas.openxmlformats.org/officeDocument/2006/math" xmlns:v="urn:schemas-microsoft-com:vml" xmlns:wp14="http://schemas.microsoft.com/office/word/2010/wordprocessingDrawing" xmlns:wp="http://schemas.openxmlformats.org/drawingml/2006/wordprocessingDrawing" xmlns:w10="urn:schemas-microsoft-com:office:word" xmlns:w="http://schemas.openxmlformats.org/wordprocessingml/2006/main" xmlns:w14="http://schemas.microsoft.com/office/word/2010/wordml" xmlns:w15="http://schemas.microsoft.com/office/word/2012/wordml" xmlns:w16cex="http://schemas.microsoft.com/office/word/2018/wordml/cex" xmlns:w16cid="http://schemas.microsoft.com/office/word/2016/wordml/cid" xmlns:w16="http://schemas.microsoft.com/office/word/2018/wordml" xmlns:w16du="http://schemas.microsoft.com/office/word/2023/wordml/word16du" xmlns:w16sdtdh="http://schemas.microsoft.com/office/word/2020/wordml/sdtdatahash" xmlns:w16sdtfl="http://schemas.microsoft.com/office/word/2024/wordml/sdtformatlock" xmlns:w16se="http://schemas.microsoft.com/office/word/2015/wordml/symex" xmlns:wpg="http://schemas.microsoft.com/office/word/2010/wordprocessingGroup" xmlns:wpi="http://schemas.microsoft.com/office/word/2010/wordprocessingInk" xmlns:wne="http://schemas.microsoft.com/office/word/2006/wordml" xmlns:wps="http://schemas.microsoft.com/office/word/2010/wordprocessingShape" mc:Ignorable="w14 w15 w16se w16cid w16 w16cex w16sdtdh w16sdtfl w16du wp14">
+  <w15:person w15:author="Carr, Treyton">
+    <w15:presenceInfo w15:providerId="AD" w15:userId="S::treycarr@umich.edu::2d7a502c-7154-4eba-af5f-8ba5f8b51ac9"/>
+  </w15:person>
+</w15:people>
 </file>
 
 <file path=word/styles.xml><?xml version="1.0" encoding="utf-8"?>

</xml_diff>

<commit_message>
Added references and note about surveilance bias
</commit_message>
<xml_diff>
--- a/manuscript/Cushings-Obesity/manuscript.docx
+++ b/manuscript/Cushings-Obesity/manuscript.docx
@@ -257,16 +257,6 @@
       <w:r>
         <w:t>These findings highlight the need to consider obesity status when evaluating the effects of Cushing’s disease. </w:t>
       </w:r>
-    </w:p>
-    <w:p>
-      <w:pPr>
-        <w:rPr>
-          <w:rFonts w:asciiTheme="majorHAnsi" w:eastAsiaTheme="majorEastAsia" w:hAnsiTheme="majorHAnsi" w:cstheme="majorBidi"/>
-          <w:color w:val="000000" w:themeColor="text1"/>
-          <w:sz w:val="40"/>
-          <w:szCs w:val="40"/>
-        </w:rPr>
-      </w:pPr>
       <w:r>
         <w:br w:type="page"/>
       </w:r>
@@ -655,7 +645,6 @@
       <w:r>
         <w:t xml:space="preserve">searching for diagnoses of Cushing’s disease </w:t>
       </w:r>
-      <w:commentRangeStart w:id="0"/>
       <w:r>
         <w:t>(</w:t>
       </w:r>
@@ -672,18 +661,68 @@
         <w:t>255.0</w:t>
       </w:r>
       <w:r>
+        <w:t xml:space="preserve">, validated in </w:t>
+      </w:r>
+      <w:r>
+        <w:fldChar w:fldCharType="begin"/>
+      </w:r>
+      <w:r>
+        <w:instrText xml:space="preserve"> ADDIN ZOTERO_ITEM CSL_CITATION {"citationID":"Bd97tZOS","properties":{"formattedCitation":"(Zhou et al., 2019)","plainCitation":"(Zhou et al., 2019)","noteIndex":0},"citationItems":[{"id":27440,"uris":["http://zotero.org/users/7317906/items/4UHHIV6Z"],"itemData":{"id":27440,"type":"article-journal","abstract":"Objective\nTo investigate the validity of discharge ICD-10 codes in detecting the etiology of endogenous Cushing’s syndrome (CS) in hospitalized patients.\n\nMethods\nWe evaluated the sensitivity, specificity, positive predictive value (PPV) and negative predictive value (NPV) of CS etiology-related ICD-10 codes or code combinations by comparing hospital discharge administrative data (DAD) with established diagnoses from medical records.\n\nResults\nCoding for patients with adrenocortical adenoma (ACA) and those with bilateral macronodular adrenal hyperplasia (BMAH) demonstrated disappointingly low sensitivity at 78.8% (95% CI: 70.1–85.6%) and 83.9% (95% CI: 65.5–93.9%), respectively. BMAH had the lowest PPV of 74.3% (95% CI: 56.4–86.9%). In confirmed ACA patients, the sensitivity for ACA code combinations was higher in patients initially admitted to the Department of Endocrinology before surgery than that in patients directly admitted to the Department of Urology (90.0 vs 73.1%, P</w:instrText>
+      </w:r>
+      <w:r>
+        <w:rPr>
+          <w:rFonts w:ascii="Arial" w:hAnsi="Arial" w:cs="Arial"/>
+        </w:rPr>
+        <w:instrText> </w:instrText>
+      </w:r>
+      <w:r>
+        <w:instrText>=</w:instrText>
+      </w:r>
+      <w:r>
+        <w:rPr>
+          <w:rFonts w:ascii="Arial" w:hAnsi="Arial" w:cs="Arial"/>
+        </w:rPr>
+        <w:instrText> </w:instrText>
+      </w:r>
+      <w:r>
+        <w:instrText>0.033). The same phenomenon was observed in the PPV for the BMAH code (100.0 vs 60.9%, P</w:instrText>
+      </w:r>
+      <w:r>
+        <w:rPr>
+          <w:rFonts w:ascii="Arial" w:hAnsi="Arial" w:cs="Arial"/>
+        </w:rPr>
+        <w:instrText> </w:instrText>
+      </w:r>
+      <w:r>
+        <w:instrText>=</w:instrText>
+      </w:r>
+      <w:r>
+        <w:rPr>
+          <w:rFonts w:ascii="Arial" w:hAnsi="Arial" w:cs="Arial"/>
+        </w:rPr>
+        <w:instrText> </w:instrText>
+      </w:r>
+      <w:r>
+        <w:instrText xml:space="preserve">0.012). Misinterpreted or confusing situations caused by coders (68.1%) and by the omission or denormalized documentation of symptomatic diagnosis by clinicians (26.1%) accounted for the main source of coding errors.\n\nConclusions\nHospital DAD is an effective data source for evaluating the etiology of CS but not ACA and BMAH. Improving surgeons’ documentation, especially in the delineation of symptomatic and locative diagnoses in discharge abstracts; department- or disease-specific training for coders and more multidisciplinary collaboration are ways to enhance the applicability of administrative data for CS etiologies.","container-title":"Endocrine Connections","DOI":"10.1530/EC-19-0312","ISSN":"2049-3614","issue":"8","journalAbbreviation":"Endocr Connect","note":"PMID: 31340196\nPMCID: PMC6709541","page":"1186-1194","source":"PubMed Central","title":"Validity of discharge ICD-10 codes in detecting the etiologies of endogenous Cushing’s syndrome","volume":"8","author":[{"family":"Zhou","given":"Jingya"},{"family":"Zhang","given":"Meng"},{"family":"Lu","given":"Lin"},{"family":"Guo","given":"Xiaopeng"},{"family":"Gao","given":"Lu"},{"family":"Yan","given":"Weigang"},{"family":"Pang","given":"Haiyu"},{"family":"Wang","given":"Yi"},{"family":"Xing","given":"Bing"}],"issued":{"date-parts":[["2019",7,24]]},"citation-key":"zhouValidityDischargeICD102019"}}],"schema":"https://github.com/citation-style-language/schema/raw/master/csl-citation.json"} </w:instrText>
+      </w:r>
+      <w:r>
+        <w:fldChar w:fldCharType="separate"/>
+      </w:r>
+      <w:r>
+        <w:rPr>
+          <w:noProof/>
+        </w:rPr>
+        <w:t>(Zhou et al., 2019)</w:t>
+      </w:r>
+      <w:r>
+        <w:fldChar w:fldCharType="end"/>
+      </w:r>
+      <w:r>
         <w:t>)</w:t>
       </w:r>
       <w:r>
         <w:t xml:space="preserve">. </w:t>
       </w:r>
-      <w:commentRangeEnd w:id="0"/>
-      <w:r>
-        <w:rPr>
-          <w:rStyle w:val="CommentReference"/>
-        </w:rPr>
-        <w:commentReference w:id="0"/>
-      </w:r>
       <w:r>
         <w:t xml:space="preserve">We excluded participants if they </w:t>
       </w:r>
@@ -774,7 +813,11 @@
         <w:t>prior to surgical treatment</w:t>
       </w:r>
       <w:r>
-        <w:t>, taking the most recent value</w:t>
+        <w:t xml:space="preserve">, taking the most </w:t>
+      </w:r>
+      <w:r>
+        <w:lastRenderedPageBreak/>
+        <w:t>recent value</w:t>
       </w:r>
       <w:r>
         <w:t xml:space="preserve">.  </w:t>
@@ -795,11 +838,7 @@
         <w:t>10:1</w:t>
       </w:r>
       <w:r>
-        <w:t xml:space="preserve">) with </w:t>
-      </w:r>
-      <w:r>
-        <w:lastRenderedPageBreak/>
-        <w:t xml:space="preserve">age in the </w:t>
+        <w:t xml:space="preserve">) with age in the </w:t>
       </w:r>
       <w:r>
         <w:t>propensity score</w:t>
@@ -959,18 +998,7 @@
         <w:t xml:space="preserve">  Statistical significance</w:t>
       </w:r>
       <w:r>
-        <w:t xml:space="preserve"> for this </w:t>
-      </w:r>
-      <w:commentRangeStart w:id="1"/>
-      <w:r>
-        <w:t>stud</w:t>
-      </w:r>
-      <w:commentRangeEnd w:id="1"/>
-      <w:r>
-        <w:rPr>
-          <w:rStyle w:val="CommentReference"/>
-        </w:rPr>
-        <w:commentReference w:id="1"/>
+        <w:t xml:space="preserve"> for this stud</w:t>
       </w:r>
       <w:r>
         <w:t>y</w:t>
@@ -1107,7 +1135,11 @@
         <w:t xml:space="preserve">these 365 participants, we were </w:t>
       </w:r>
       <w:r>
-        <w:t>there were documented</w:t>
+        <w:t xml:space="preserve">there were </w:t>
+      </w:r>
+      <w:r>
+        <w:lastRenderedPageBreak/>
+        <w:t>documented</w:t>
       </w:r>
       <w:r>
         <w:t xml:space="preserve"> </w:t>
@@ -1122,11 +1154,7 @@
         <w:t xml:space="preserve">ting </w:t>
       </w:r>
       <w:r>
-        <w:t xml:space="preserve">glucose measurements for all 365, HbA1c values for 17, ALT values for </w:t>
-      </w:r>
-      <w:r>
-        <w:lastRenderedPageBreak/>
-        <w:t xml:space="preserve">84, </w:t>
+        <w:t xml:space="preserve">glucose measurements for all 365, HbA1c values for 17, ALT values for 84, </w:t>
       </w:r>
       <w:r>
         <w:t xml:space="preserve">AST values for </w:t>
@@ -1791,7 +1819,11 @@
         <w:t xml:space="preserve">.  </w:t>
       </w:r>
       <w:r>
-        <w:t>Females with Cushing’s disease were more likely to have a BMI over 30 kg/m</w:t>
+        <w:t xml:space="preserve">Females with Cushing’s disease were </w:t>
+      </w:r>
+      <w:r>
+        <w:lastRenderedPageBreak/>
+        <w:t>more likely to have a BMI over 30 kg/m</w:t>
       </w:r>
       <w:r>
         <w:rPr>
@@ -1812,445 +1844,444 @@
         <w:t>compared to</w:t>
       </w:r>
       <w:r>
-        <w:t xml:space="preserve"> 51% of males with </w:t>
+        <w:t xml:space="preserve"> 51% of males with Cushing’s disease, p=0.015).  </w:t>
+      </w:r>
+      <w:r>
+        <w:t>Among participants with Cushing’s disease, Asian (6</w:t>
+      </w:r>
+      <w:r>
+        <w:t xml:space="preserve"> out of </w:t>
+      </w:r>
+      <w:r>
+        <w:t xml:space="preserve">10) and Hispanic or Latino </w:t>
+      </w:r>
+      <w:r>
+        <w:t>(6</w:t>
+      </w:r>
+      <w:r>
+        <w:t xml:space="preserve"> out of </w:t>
+      </w:r>
+      <w:r>
+        <w:t xml:space="preserve">8) </w:t>
+      </w:r>
+      <w:r>
+        <w:t>participants were more likely have a BMI under 30 kg/m</w:t>
+      </w:r>
+      <w:r>
+        <w:rPr>
+          <w:vertAlign w:val="superscript"/>
+        </w:rPr>
+        <w:t xml:space="preserve">2 </w:t>
+      </w:r>
+      <w:r>
+        <w:t xml:space="preserve">compared to </w:t>
+      </w:r>
+      <w:r>
+        <w:t xml:space="preserve">the overall average </w:t>
+      </w:r>
+      <w:r>
+        <w:t>(</w:t>
+      </w:r>
+      <w:r>
+        <w:t>36%</w:t>
+      </w:r>
+      <w:r>
+        <w:t>, p=0.027 and 0.176 respectively via Fisher’s exact test</w:t>
+      </w:r>
+      <w:r>
+        <w:t>s</w:t>
+      </w:r>
+      <w:r>
+        <w:t xml:space="preserve">).  </w:t>
+      </w:r>
+      <w:r>
+        <w:t>The</w:t>
+      </w:r>
+      <w:r>
+        <w:t xml:space="preserve"> average age of </w:t>
+      </w:r>
+      <w:r>
+        <w:t xml:space="preserve">participants with </w:t>
+      </w:r>
+      <w:r>
+        <w:t>Cushing’s</w:t>
+      </w:r>
+      <w:r>
+        <w:t xml:space="preserve"> disease</w:t>
+      </w:r>
+      <w:r>
+        <w:t xml:space="preserve"> with or without obesity was similar</w:t>
+      </w:r>
+      <w:r>
+        <w:t xml:space="preserve"> after stratification</w:t>
+      </w:r>
+      <w:r>
+        <w:t>.</w:t>
+      </w:r>
+      <w:r>
+        <w:t xml:space="preserve">  Overall</w:t>
+      </w:r>
+      <w:r>
+        <w:t>,</w:t>
+      </w:r>
+      <w:r>
+        <w:t xml:space="preserve"> the subgroup of patients with obesity and Cushing’s disease tended to be disproportionately female and White, but similar in age.</w:t>
+      </w:r>
+    </w:p>
+    <w:p>
+      <w:pPr>
+        <w:pStyle w:val="NormalWeb"/>
+        <w:rPr>
+          <w:rStyle w:val="Heading2Char"/>
+        </w:rPr>
+      </w:pPr>
+      <w:r>
+        <w:rPr>
+          <w:rStyle w:val="Heading2Char"/>
+        </w:rPr>
+        <w:t xml:space="preserve">Modification of Cushing’s disease-related </w:t>
+      </w:r>
+      <w:r>
+        <w:rPr>
+          <w:rStyle w:val="Heading2Char"/>
+        </w:rPr>
+        <w:t>comorbidities</w:t>
+      </w:r>
+      <w:r>
+        <w:rPr>
+          <w:rStyle w:val="Heading2Char"/>
+        </w:rPr>
+        <w:t xml:space="preserve"> by obesity </w:t>
+      </w:r>
+    </w:p>
+    <w:p>
+      <w:r>
+        <w:t>To identify how obesity alters metabolic outcomes related to Cushing’s disease, we evaluated the effects of Cushing’s disease on several key metabolic variables including glycem</w:t>
+      </w:r>
+      <w:r>
+        <w:t>i</w:t>
+      </w:r>
+      <w:r>
+        <w:t xml:space="preserve">a (fasting glucose and </w:t>
+      </w:r>
+      <w:r>
+        <w:t xml:space="preserve">for a smaller number of participants, </w:t>
+      </w:r>
+      <w:r>
+        <w:t>HbA1c), liver enzymes, and blood pressure (Figure 2 and Table 3).  As described below we noted substantial effect modification by obesity for liver enzymes and blood pressure (Table 3B).</w:t>
+      </w:r>
+    </w:p>
+    <w:p>
+      <w:pPr>
+        <w:pStyle w:val="Heading3"/>
+      </w:pPr>
+      <w:r>
+        <w:t>Dysglycemia</w:t>
+      </w:r>
+    </w:p>
+    <w:p>
+      <w:r>
+        <w:t>The</w:t>
+      </w:r>
+      <w:r>
+        <w:t xml:space="preserve"> first metabolic variable of interest was the fasting glucose levels of our obese and non-obese populations. As shown in </w:t>
+      </w:r>
+      <w:r>
+        <w:t xml:space="preserve">Figure 2 and </w:t>
+      </w:r>
+      <w:r>
+        <w:t>Table 3</w:t>
+      </w:r>
+      <w:r>
+        <w:t>A</w:t>
+      </w:r>
+      <w:r>
+        <w:t>, we observed a</w:t>
+      </w:r>
+      <w:r>
+        <w:t xml:space="preserve"> significant </w:t>
+      </w:r>
+      <w:r>
+        <w:t xml:space="preserve">increase in </w:t>
+      </w:r>
+      <w:r>
+        <w:t xml:space="preserve">fasting </w:t>
+      </w:r>
+      <w:r>
+        <w:t xml:space="preserve">blood glucose levels </w:t>
+      </w:r>
+      <w:r>
+        <w:t xml:space="preserve">among </w:t>
+      </w:r>
+      <w:r>
+        <w:t>participants</w:t>
+      </w:r>
+      <w:r>
+        <w:t xml:space="preserve"> with Cushing’s disease, regardless of obesity status</w:t>
+      </w:r>
+      <w:r>
+        <w:t xml:space="preserve"> (p</w:t>
+      </w:r>
+      <w:r>
+        <w:t>&lt;0.01</w:t>
+      </w:r>
+      <w:r>
+        <w:t xml:space="preserve"> for both groups).</w:t>
+      </w:r>
+      <w:r>
+        <w:t xml:space="preserve"> The </w:t>
+      </w:r>
+      <w:r>
+        <w:t xml:space="preserve">patients with obesity </w:t>
+      </w:r>
+      <w:r>
+        <w:t xml:space="preserve">population had a slightly larger increase (26.9 vs. </w:t>
+      </w:r>
+      <w:r>
+        <w:t>24.6</w:t>
+      </w:r>
+      <w:r>
+        <w:t xml:space="preserve"> mg/dL</w:t>
+      </w:r>
+      <w:r>
+        <w:t xml:space="preserve">) than </w:t>
+      </w:r>
+      <w:r>
+        <w:t>those with a BMI under 30 kg/m</w:t>
+      </w:r>
+      <w:r>
+        <w:rPr>
+          <w:vertAlign w:val="superscript"/>
+        </w:rPr>
+        <w:t>2</w:t>
+      </w:r>
+      <w:r>
+        <w:t>, but this was not a large enough difference to provide any significant evidence of an effect modification for obesity</w:t>
+      </w:r>
+      <w:r>
+        <w:t xml:space="preserve"> (p=0.51; Table 3B)</w:t>
+      </w:r>
+      <w:r>
+        <w:t xml:space="preserve">. </w:t>
+      </w:r>
+      <w:r>
+        <w:t>Similarly</w:t>
+      </w:r>
+      <w:r>
+        <w:t>,</w:t>
+      </w:r>
+      <w:r>
+        <w:t xml:space="preserve"> in Table 3</w:t>
+      </w:r>
+      <w:r>
+        <w:t>A</w:t>
+      </w:r>
+      <w:r>
+        <w:t xml:space="preserve"> </w:t>
+      </w:r>
+      <w:r>
+        <w:t>among the small number of patients with</w:t>
+      </w:r>
+      <w:r>
+        <w:t xml:space="preserve"> HbA1c </w:t>
+      </w:r>
+      <w:r>
+        <w:t>values, there was</w:t>
+      </w:r>
+      <w:r>
+        <w:t xml:space="preserve"> a</w:t>
+      </w:r>
+      <w:r>
+        <w:t xml:space="preserve">n </w:t>
+      </w:r>
+      <w:r>
+        <w:t xml:space="preserve">insignificant increase in HbA1c levels </w:t>
+      </w:r>
+      <w:r>
+        <w:t>in</w:t>
+      </w:r>
+      <w:r>
+        <w:t xml:space="preserve"> the non-obese</w:t>
+      </w:r>
+      <w:r>
+        <w:t xml:space="preserve"> patients</w:t>
+      </w:r>
+      <w:r>
+        <w:t xml:space="preserve"> (</w:t>
+      </w:r>
+      <w:r>
+        <w:t xml:space="preserve">0.91%; </w:t>
+      </w:r>
+      <w:r>
+        <w:t xml:space="preserve">p=0.056). However, there was evidence of a significant increase in HbA1c levels </w:t>
+      </w:r>
+      <w:r>
+        <w:t xml:space="preserve">in patients with obesity </w:t>
+      </w:r>
+      <w:r>
+        <w:t>(</w:t>
+      </w:r>
+      <w:r>
+        <w:t xml:space="preserve">1.38% </w:t>
+      </w:r>
+      <w:r>
+        <w:t>p</w:t>
+      </w:r>
+      <w:r>
+        <w:t>&lt;0.01</w:t>
+      </w:r>
+      <w:r>
+        <w:t>).</w:t>
+      </w:r>
+      <w:r>
+        <w:t xml:space="preserve"> </w:t>
+      </w:r>
+      <w:r>
+        <w:t>Again</w:t>
+      </w:r>
+      <w:r>
+        <w:t>,</w:t>
+      </w:r>
+      <w:r>
+        <w:t xml:space="preserve"> there was no evidence of effect modification by obesity (p=0.41)</w:t>
+      </w:r>
+      <w:r>
+        <w:t>.  This suggests that blood glucose increases with Cushing’s disease are largely additive.</w:t>
+      </w:r>
+    </w:p>
+    <w:p>
+      <w:pPr>
+        <w:pStyle w:val="Heading3"/>
+      </w:pPr>
+      <w:r>
+        <w:t>MASLD and liver enzymes</w:t>
+      </w:r>
+    </w:p>
+    <w:p>
+      <w:r>
+        <w:t xml:space="preserve">To </w:t>
+      </w:r>
+      <w:r>
+        <w:t>assess</w:t>
+      </w:r>
+      <w:r>
+        <w:t xml:space="preserve"> </w:t>
+      </w:r>
+      <w:r>
+        <w:t>MASLD</w:t>
+      </w:r>
+      <w:r>
+        <w:t xml:space="preserve"> we looked at ALT </w:t>
+      </w:r>
+      <w:r>
+        <w:t>and AST levels as indicators of liver damage</w:t>
+      </w:r>
+      <w:r>
+        <w:t xml:space="preserve"> (Figure 2 and Table 3A)</w:t>
+      </w:r>
+      <w:r>
+        <w:t xml:space="preserve">. In both our obese, and non-obese populations, we saw an increase in ALT </w:t>
+      </w:r>
+      <w:r>
+        <w:t>and AST</w:t>
+      </w:r>
+      <w:r>
+        <w:t xml:space="preserve"> </w:t>
+      </w:r>
+      <w:r>
+        <w:t>levels regardless of Cushing’s disease status</w:t>
+      </w:r>
+      <w:r>
+        <w:t xml:space="preserve"> </w:t>
+      </w:r>
+      <w:r>
+        <w:t>(p</w:t>
+      </w:r>
+      <w:r>
+        <w:t>&lt;0.0</w:t>
+      </w:r>
+      <w:r>
+        <w:t>1 for both groups</w:t>
+      </w:r>
+      <w:r>
+        <w:t xml:space="preserve">). </w:t>
+      </w:r>
+      <w:r>
+        <w:t xml:space="preserve">In </w:t>
+      </w:r>
+      <w:r>
+        <w:t>the</w:t>
+      </w:r>
+      <w:r>
+        <w:t xml:space="preserve"> case</w:t>
+      </w:r>
+      <w:r>
+        <w:t xml:space="preserve"> of ALT levels</w:t>
+      </w:r>
+      <w:r>
+        <w:t>, the</w:t>
+      </w:r>
+      <w:r>
+        <w:t xml:space="preserve"> increase </w:t>
+      </w:r>
+      <w:r>
+        <w:t xml:space="preserve">due to Cushing’s disease was much greater in the patients with obesity </w:t>
+      </w:r>
+      <w:r>
+        <w:t>(</w:t>
+      </w:r>
+      <w:r>
+        <w:t>73.4 vs 35.1 mg/dL, p</w:t>
+      </w:r>
+      <w:r>
+        <w:rPr>
+          <w:vertAlign w:val="subscript"/>
+        </w:rPr>
+        <w:t>interaction</w:t>
+      </w:r>
+      <w:r>
+        <w:t>&lt;0.01</w:t>
+      </w:r>
+      <w:r>
+        <w:t>).</w:t>
+      </w:r>
+      <w:r>
+        <w:t xml:space="preserve">  This was also true for AST levels (increase by 56.3 mg/dL in patients with obesity and 16.9 for patients without obesity,</w:t>
+      </w:r>
+      <w:r>
+        <w:t xml:space="preserve"> </w:t>
+      </w:r>
+      <w:r>
+        <w:t>p</w:t>
+      </w:r>
+      <w:r>
+        <w:rPr>
+          <w:vertAlign w:val="subscript"/>
+        </w:rPr>
+        <w:t>interaction</w:t>
+      </w:r>
+      <w:r>
+        <w:t xml:space="preserve">=0.034).  </w:t>
       </w:r>
       <w:r>
         <w:lastRenderedPageBreak/>
-        <w:t xml:space="preserve">Cushing’s disease, p=0.015).  </w:t>
-      </w:r>
-      <w:r>
-        <w:t>Among participants with Cushing’s disease, Asian (6</w:t>
-      </w:r>
-      <w:r>
-        <w:t xml:space="preserve"> out of </w:t>
-      </w:r>
-      <w:r>
-        <w:t xml:space="preserve">10) and Hispanic or Latino </w:t>
-      </w:r>
-      <w:r>
-        <w:t>(6</w:t>
-      </w:r>
-      <w:r>
-        <w:t xml:space="preserve"> out of </w:t>
-      </w:r>
-      <w:r>
-        <w:t xml:space="preserve">8) </w:t>
-      </w:r>
-      <w:r>
-        <w:t>participants were more likely have a BMI under 30 kg/m</w:t>
-      </w:r>
-      <w:r>
-        <w:rPr>
-          <w:vertAlign w:val="superscript"/>
-        </w:rPr>
-        <w:t xml:space="preserve">2 </w:t>
-      </w:r>
-      <w:r>
-        <w:t xml:space="preserve">compared to </w:t>
-      </w:r>
-      <w:r>
-        <w:t xml:space="preserve">the overall average </w:t>
-      </w:r>
-      <w:r>
-        <w:t>(</w:t>
-      </w:r>
-      <w:r>
-        <w:t>36%</w:t>
-      </w:r>
-      <w:r>
-        <w:t>, p=0.027 and 0.176 respectively via Fisher’s exact test</w:t>
-      </w:r>
-      <w:r>
-        <w:t>s</w:t>
-      </w:r>
-      <w:r>
-        <w:t xml:space="preserve">).  </w:t>
-      </w:r>
-      <w:r>
-        <w:t>The</w:t>
-      </w:r>
-      <w:r>
-        <w:t xml:space="preserve"> average age of </w:t>
-      </w:r>
-      <w:r>
-        <w:t xml:space="preserve">participants with </w:t>
-      </w:r>
-      <w:r>
-        <w:t>Cushing’s</w:t>
-      </w:r>
-      <w:r>
-        <w:t xml:space="preserve"> disease</w:t>
-      </w:r>
-      <w:r>
-        <w:t xml:space="preserve"> with or without obesity was similar</w:t>
-      </w:r>
-      <w:r>
-        <w:t xml:space="preserve"> after stratification</w:t>
+        <w:t>These data support the hypothesis</w:t>
+      </w:r>
+      <w:r>
+        <w:t xml:space="preserve"> that obesity </w:t>
+      </w:r>
+      <w:r>
+        <w:t>enhances Cushing’s associated liver damage</w:t>
       </w:r>
       <w:r>
         <w:t>.</w:t>
       </w:r>
-      <w:r>
-        <w:t xml:space="preserve">  Overall</w:t>
-      </w:r>
-      <w:r>
-        <w:t>,</w:t>
-      </w:r>
-      <w:r>
-        <w:t xml:space="preserve"> the subgroup of patients with obesity and Cushing’s disease tended to be disproportionately female and White, but similar in age.</w:t>
-      </w:r>
-    </w:p>
-    <w:p>
-      <w:pPr>
-        <w:pStyle w:val="NormalWeb"/>
-        <w:rPr>
-          <w:rStyle w:val="Heading2Char"/>
-        </w:rPr>
-      </w:pPr>
-      <w:r>
-        <w:rPr>
-          <w:rStyle w:val="Heading2Char"/>
-        </w:rPr>
-        <w:t xml:space="preserve">Modification of Cushing’s disease-related </w:t>
-      </w:r>
-      <w:r>
-        <w:rPr>
-          <w:rStyle w:val="Heading2Char"/>
-        </w:rPr>
-        <w:t>comorbidities</w:t>
-      </w:r>
-      <w:r>
-        <w:rPr>
-          <w:rStyle w:val="Heading2Char"/>
-        </w:rPr>
-        <w:t xml:space="preserve"> by obesity </w:t>
-      </w:r>
-    </w:p>
-    <w:p>
-      <w:r>
-        <w:t>To identify how obesity alters metabolic outcomes related to Cushing’s disease, we evaluated the effects of Cushing’s disease on several key metabolic variables including glycem</w:t>
-      </w:r>
-      <w:r>
-        <w:t>i</w:t>
-      </w:r>
-      <w:r>
-        <w:t xml:space="preserve">a (fasting glucose and </w:t>
-      </w:r>
-      <w:r>
-        <w:t xml:space="preserve">for a smaller number of participants, </w:t>
-      </w:r>
-      <w:r>
-        <w:t>HbA1c), liver enzymes, and blood pressure (Figure 2 and Table 3).  As described below we noted substantial effect modification by obesity for liver enzymes and blood pressure (Table 3B).</w:t>
-      </w:r>
     </w:p>
     <w:p>
       <w:pPr>
         <w:pStyle w:val="Heading3"/>
       </w:pPr>
       <w:r>
-        <w:t>Dysglycemia</w:t>
-      </w:r>
-    </w:p>
-    <w:p>
-      <w:r>
-        <w:t>The</w:t>
-      </w:r>
-      <w:r>
-        <w:t xml:space="preserve"> first metabolic variable of interest was the fasting glucose levels of our obese and non-obese populations. As shown in </w:t>
-      </w:r>
-      <w:r>
-        <w:t xml:space="preserve">Figure 2 and </w:t>
-      </w:r>
-      <w:r>
-        <w:t>Table 3</w:t>
-      </w:r>
-      <w:r>
-        <w:t>A</w:t>
-      </w:r>
-      <w:r>
-        <w:t>, we observed a</w:t>
-      </w:r>
-      <w:r>
-        <w:t xml:space="preserve"> significant </w:t>
-      </w:r>
-      <w:r>
-        <w:t xml:space="preserve">increase in </w:t>
-      </w:r>
-      <w:r>
-        <w:t xml:space="preserve">fasting </w:t>
-      </w:r>
-      <w:r>
-        <w:t xml:space="preserve">blood glucose levels </w:t>
-      </w:r>
-      <w:r>
-        <w:t xml:space="preserve">among </w:t>
-      </w:r>
-      <w:r>
-        <w:t>participants</w:t>
-      </w:r>
-      <w:r>
-        <w:t xml:space="preserve"> with Cushing’s disease, regardless of obesity status</w:t>
-      </w:r>
-      <w:r>
-        <w:t xml:space="preserve"> (p</w:t>
-      </w:r>
-      <w:r>
-        <w:t>&lt;0.01</w:t>
-      </w:r>
-      <w:r>
-        <w:t xml:space="preserve"> for both groups).</w:t>
-      </w:r>
-      <w:r>
-        <w:t xml:space="preserve"> The </w:t>
-      </w:r>
-      <w:r>
-        <w:t xml:space="preserve">patients with obesity </w:t>
-      </w:r>
-      <w:r>
-        <w:t xml:space="preserve">population had a slightly larger increase (26.9 vs. </w:t>
-      </w:r>
-      <w:r>
-        <w:t>24.6</w:t>
-      </w:r>
-      <w:r>
-        <w:t xml:space="preserve"> mg/dL</w:t>
-      </w:r>
-      <w:r>
-        <w:t xml:space="preserve">) than </w:t>
-      </w:r>
-      <w:r>
-        <w:t>those with a BMI under 30 kg/m</w:t>
-      </w:r>
-      <w:r>
-        <w:rPr>
-          <w:vertAlign w:val="superscript"/>
-        </w:rPr>
-        <w:t>2</w:t>
-      </w:r>
-      <w:r>
-        <w:t>, but this was not a large enough difference to provide any significant evidence of an effect modification for obesity</w:t>
-      </w:r>
-      <w:r>
-        <w:t xml:space="preserve"> (p=0.51; Table 3B)</w:t>
-      </w:r>
-      <w:r>
-        <w:t xml:space="preserve">. </w:t>
-      </w:r>
-      <w:r>
-        <w:t>Similarly</w:t>
-      </w:r>
-      <w:r>
-        <w:t>,</w:t>
-      </w:r>
-      <w:r>
-        <w:t xml:space="preserve"> in Table 3</w:t>
-      </w:r>
-      <w:r>
-        <w:t>A</w:t>
-      </w:r>
-      <w:r>
-        <w:t xml:space="preserve"> </w:t>
-      </w:r>
-      <w:r>
-        <w:t>among the small number of patients with</w:t>
-      </w:r>
-      <w:r>
-        <w:t xml:space="preserve"> HbA1c </w:t>
-      </w:r>
-      <w:r>
-        <w:t>values, there was</w:t>
-      </w:r>
-      <w:r>
-        <w:t xml:space="preserve"> a</w:t>
-      </w:r>
-      <w:r>
-        <w:t xml:space="preserve">n </w:t>
-      </w:r>
-      <w:r>
-        <w:t xml:space="preserve">insignificant increase in HbA1c levels </w:t>
-      </w:r>
-      <w:r>
-        <w:t>in</w:t>
-      </w:r>
-      <w:r>
-        <w:t xml:space="preserve"> the non-obese</w:t>
-      </w:r>
-      <w:r>
-        <w:t xml:space="preserve"> patients</w:t>
-      </w:r>
-      <w:r>
-        <w:t xml:space="preserve"> (</w:t>
-      </w:r>
-      <w:r>
-        <w:t xml:space="preserve">0.91%; </w:t>
-      </w:r>
-      <w:r>
-        <w:t xml:space="preserve">p=0.056). However, there was evidence of a significant increase in HbA1c levels </w:t>
-      </w:r>
-      <w:r>
-        <w:t xml:space="preserve">in patients with obesity </w:t>
-      </w:r>
-      <w:r>
-        <w:t>(</w:t>
-      </w:r>
-      <w:r>
-        <w:t xml:space="preserve">1.38% </w:t>
-      </w:r>
-      <w:r>
-        <w:t>p</w:t>
-      </w:r>
-      <w:r>
-        <w:t>&lt;0.01</w:t>
-      </w:r>
-      <w:r>
-        <w:t>).</w:t>
-      </w:r>
-      <w:r>
-        <w:t xml:space="preserve"> </w:t>
-      </w:r>
-      <w:r>
-        <w:t>Again</w:t>
-      </w:r>
-      <w:r>
-        <w:t>,</w:t>
-      </w:r>
-      <w:r>
-        <w:t xml:space="preserve"> there was no evidence of effect modification by obesity (p=0.41)</w:t>
-      </w:r>
-      <w:r>
-        <w:t>.  This suggests that blood glucose increases with Cushing’s disease are largely additive.</w:t>
-      </w:r>
-    </w:p>
-    <w:p>
-      <w:pPr>
-        <w:pStyle w:val="Heading3"/>
-      </w:pPr>
-      <w:r>
-        <w:t>MASLD and liver enzymes</w:t>
-      </w:r>
-    </w:p>
-    <w:p>
-      <w:r>
-        <w:t xml:space="preserve">To </w:t>
-      </w:r>
-      <w:r>
-        <w:t>assess</w:t>
-      </w:r>
-      <w:r>
-        <w:t xml:space="preserve"> </w:t>
-      </w:r>
-      <w:r>
-        <w:t>MASLD</w:t>
-      </w:r>
-      <w:r>
-        <w:t xml:space="preserve"> we looked at ALT </w:t>
-      </w:r>
-      <w:r>
-        <w:t>and AST levels as indicators of liver damage</w:t>
-      </w:r>
-      <w:r>
-        <w:t xml:space="preserve"> (Figure 2 and Table 3A)</w:t>
-      </w:r>
-      <w:r>
-        <w:t xml:space="preserve">. In both our obese, and non-obese populations, we saw an increase in ALT </w:t>
-      </w:r>
-      <w:r>
-        <w:t>and AST</w:t>
-      </w:r>
-      <w:r>
-        <w:t xml:space="preserve"> </w:t>
-      </w:r>
-      <w:r>
-        <w:t>levels regardless of Cushing’s disease status</w:t>
-      </w:r>
-      <w:r>
-        <w:t xml:space="preserve"> </w:t>
-      </w:r>
-      <w:r>
-        <w:t>(p</w:t>
-      </w:r>
-      <w:r>
-        <w:t>&lt;0.0</w:t>
-      </w:r>
-      <w:r>
-        <w:t>1 for both groups</w:t>
-      </w:r>
-      <w:r>
-        <w:t xml:space="preserve">). </w:t>
-      </w:r>
-      <w:r>
-        <w:t xml:space="preserve">In </w:t>
-      </w:r>
-      <w:r>
-        <w:t>the</w:t>
-      </w:r>
-      <w:r>
-        <w:t xml:space="preserve"> case</w:t>
-      </w:r>
-      <w:r>
-        <w:t xml:space="preserve"> of ALT levels</w:t>
-      </w:r>
-      <w:r>
-        <w:t>, the</w:t>
-      </w:r>
-      <w:r>
-        <w:t xml:space="preserve"> increase </w:t>
-      </w:r>
-      <w:r>
-        <w:t xml:space="preserve">due to Cushing’s disease was much greater in the patients with obesity </w:t>
-      </w:r>
-      <w:r>
-        <w:t>(</w:t>
-      </w:r>
-      <w:r>
-        <w:t>73.4 vs 35.1 mg/dL, p</w:t>
-      </w:r>
-      <w:r>
-        <w:rPr>
-          <w:vertAlign w:val="subscript"/>
-        </w:rPr>
-        <w:t>interaction</w:t>
-      </w:r>
-      <w:r>
-        <w:t>&lt;0.01</w:t>
-      </w:r>
-      <w:r>
-        <w:t>).</w:t>
-      </w:r>
-      <w:r>
-        <w:t xml:space="preserve">  This was also true for AST levels (increase by 56.3 mg/dL in patients with obesity and 16.9 for patients without obesity,</w:t>
-      </w:r>
-      <w:r>
-        <w:t xml:space="preserve"> </w:t>
-      </w:r>
-      <w:r>
-        <w:t>p</w:t>
-      </w:r>
-      <w:r>
-        <w:rPr>
-          <w:vertAlign w:val="subscript"/>
-        </w:rPr>
-        <w:t>interaction</w:t>
-      </w:r>
-      <w:r>
-        <w:t>=0.034).  These data support the hypothesis</w:t>
-      </w:r>
-      <w:r>
-        <w:t xml:space="preserve"> that obesity </w:t>
-      </w:r>
-      <w:r>
-        <w:t>enhances Cushing’s associated liver damage</w:t>
-      </w:r>
-      <w:r>
-        <w:t>.</w:t>
-      </w:r>
-    </w:p>
-    <w:p>
-      <w:pPr>
-        <w:pStyle w:val="Heading3"/>
-      </w:pPr>
-      <w:r>
-        <w:lastRenderedPageBreak/>
         <w:t>Blood Pressure</w:t>
       </w:r>
     </w:p>
@@ -2447,11 +2478,11 @@
         <w:ind w:left="0"/>
       </w:pPr>
       <w:r>
-        <w:t xml:space="preserve">This analysis of the effects of obesity and Cushing’s disease demonstrate a complex set of interactions between the presence of obesity on Cushing’s disease- and obesity-related pathophysiology.  We report that liver enzymes are enhanced relative to what we would predict from the additive effects of Cushing’s disease and obesity together, while in the case of blood pressure, obesity appears to reduce the effects of Cushing’s disease.  </w:t>
+        <w:t xml:space="preserve">This analysis of the effects of obesity and Cushing’s disease demonstrate a complex set of interactions between the presence of obesity on Cushing’s disease- and obesity-related </w:t>
       </w:r>
       <w:r>
         <w:lastRenderedPageBreak/>
-        <w:t>Glucose homeostasis appears to be explained well by an additive model</w:t>
+        <w:t>pathophysiology.  We report that liver enzymes are enhanced relative to what we would predict from the additive effects of Cushing’s disease and obesity together, while in the case of blood pressure, obesity appears to reduce the effects of Cushing’s disease.  Glucose homeostasis appears to be explained well by an additive model</w:t>
       </w:r>
       <w:r>
         <w:t xml:space="preserve"> in our primary analysis.</w:t>
@@ -2637,7 +2668,11 @@
         <w:t xml:space="preserve">  In our view, this warrants more detailed studies on sex differences, including the modifying effect of sex hormones on glucocorticoid signaling in the context of obesity.</w:t>
       </w:r>
       <w:r>
-        <w:t xml:space="preserve">  More broadly, even though obesity status was similar between groups, patients with Cushing’s disease had much more severe hyperglycemia, blood pressure and liver enzymes than those with just obesity.</w:t>
+        <w:t xml:space="preserve">  More broadly, even </w:t>
+      </w:r>
+      <w:r>
+        <w:lastRenderedPageBreak/>
+        <w:t>though obesity status was similar between groups, patients with Cushing’s disease had much more severe hyperglycemia, blood pressure and liver enzymes than those with just obesity.</w:t>
       </w:r>
     </w:p>
     <w:p>
@@ -2691,18 +2726,262 @@
         <w:t xml:space="preserve"> </w:t>
       </w:r>
       <w:r>
-        <w:t xml:space="preserve">has been previously </w:t>
-      </w:r>
-      <w:commentRangeStart w:id="2"/>
-      <w:r>
-        <w:t>reported</w:t>
-      </w:r>
-      <w:commentRangeEnd w:id="2"/>
-      <w:r>
-        <w:rPr>
-          <w:rStyle w:val="CommentReference"/>
-        </w:rPr>
-        <w:commentReference w:id="2"/>
+        <w:t>has been previously reported</w:t>
+      </w:r>
+      <w:r>
+        <w:t xml:space="preserve"> and remains plausible </w:t>
+      </w:r>
+      <w:r>
+        <w:fldChar w:fldCharType="begin"/>
+      </w:r>
+      <w:r>
+        <w:instrText xml:space="preserve"> ADDIN ZOTERO_ITEM CSL_CITATION {"citationID":"oiVXcg68","properties":{"formattedCitation":"(Ioachimescu et al., 2022)","plainCitation":"(Ioachimescu et al., 2022)","noteIndex":0},"citationItems":[{"id":27032,"uris":["http://zotero.org/users/7317906/items/EVS87VVY"],"itemData":{"id":27032,"type":"article-journal","abstract":"Acromegaly (ACM) and Cushing’s disease (CD) are caused by functioning pituitary adenomas secreting growth hormone and ACTH respectively.To determine the impact of race on presentation and postoperative outcomes in adults with ACM and CD, which has not yet been evaluated.This is a retrospective study of consecutive patients operated at a large-volume pituitary center. We evaluated (1) racial distribution of patients residing in the metropolitan area (Metro, N</w:instrText>
+      </w:r>
+      <w:r>
+        <w:rPr>
+          <w:rFonts w:ascii="Arial" w:hAnsi="Arial" w:cs="Arial"/>
+        </w:rPr>
+        <w:instrText> </w:instrText>
+      </w:r>
+      <w:r>
+        <w:instrText>=</w:instrText>
+      </w:r>
+      <w:r>
+        <w:rPr>
+          <w:rFonts w:ascii="Arial" w:hAnsi="Arial" w:cs="Arial"/>
+        </w:rPr>
+        <w:instrText> </w:instrText>
+      </w:r>
+      <w:r>
+        <w:instrText>124) vs 2010 US census data, and(2) presentation and postoperative outcomes in Black vs White for patients from the entire catchment area (N</w:instrText>
+      </w:r>
+      <w:r>
+        <w:rPr>
+          <w:rFonts w:ascii="Arial" w:hAnsi="Arial" w:cs="Arial"/>
+        </w:rPr>
+        <w:instrText> </w:instrText>
+      </w:r>
+      <w:r>
+        <w:instrText>=</w:instrText>
+      </w:r>
+      <w:r>
+        <w:rPr>
+          <w:rFonts w:ascii="Arial" w:hAnsi="Arial" w:cs="Arial"/>
+        </w:rPr>
+        <w:instrText> </w:instrText>
+      </w:r>
+      <w:r>
+        <w:instrText>241).For Metro area (32.4% Black population), Black patients represented 16.75% ACM (P</w:instrText>
+      </w:r>
+      <w:r>
+        <w:rPr>
+          <w:rFonts w:ascii="Arial" w:hAnsi="Arial" w:cs="Arial"/>
+        </w:rPr>
+        <w:instrText> </w:instrText>
+      </w:r>
+      <w:r>
+        <w:instrText>=</w:instrText>
+      </w:r>
+      <w:r>
+        <w:rPr>
+          <w:rFonts w:ascii="Arial" w:hAnsi="Arial" w:cs="Arial"/>
+        </w:rPr>
+        <w:instrText> </w:instrText>
+      </w:r>
+      <w:r>
+        <w:instrText>.006) and 29.2% CD (P</w:instrText>
+      </w:r>
+      <w:r>
+        <w:rPr>
+          <w:rFonts w:ascii="Arial" w:hAnsi="Arial" w:cs="Arial"/>
+        </w:rPr>
+        <w:instrText> </w:instrText>
+      </w:r>
+      <w:r>
+        <w:instrText>=</w:instrText>
+      </w:r>
+      <w:r>
+        <w:rPr>
+          <w:rFonts w:ascii="Arial" w:hAnsi="Arial" w:cs="Arial"/>
+        </w:rPr>
+        <w:instrText> </w:instrText>
+      </w:r>
+      <w:r>
+        <w:instrText>.56). Among the total 112 patients with ACM, presentations with headaches or incidentaloma were more common in Black patients (76.9% vs 31% White, P</w:instrText>
+      </w:r>
+      <w:r>
+        <w:rPr>
+          <w:rFonts w:ascii="Arial" w:hAnsi="Arial" w:cs="Arial"/>
+        </w:rPr>
+        <w:instrText> </w:instrText>
+      </w:r>
+      <w:r>
+        <w:instrText>=</w:instrText>
+      </w:r>
+      <w:r>
+        <w:rPr>
+          <w:rFonts w:ascii="Arial" w:hAnsi="Arial" w:cs="Arial"/>
+        </w:rPr>
+        <w:instrText> </w:instrText>
+      </w:r>
+      <w:r>
+        <w:instrText>.01). Black patients had a higher prevalence of diabetes (54% vs 16% White, P</w:instrText>
+      </w:r>
+      <w:r>
+        <w:rPr>
+          <w:rFonts w:ascii="Arial" w:hAnsi="Arial" w:cs="Arial"/>
+        </w:rPr>
+        <w:instrText> </w:instrText>
+      </w:r>
+      <w:r>
+        <w:instrText>=</w:instrText>
+      </w:r>
+      <w:r>
+        <w:rPr>
+          <w:rFonts w:ascii="Arial" w:hAnsi="Arial" w:cs="Arial"/>
+        </w:rPr>
+        <w:instrText> </w:instrText>
+      </w:r>
+      <w:r>
+        <w:instrText>.005), significantly lower insulin-like growth factor (IGF)-1 deviation from normal (P</w:instrText>
+      </w:r>
+      <w:r>
+        <w:rPr>
+          <w:rFonts w:ascii="Arial" w:hAnsi="Arial" w:cs="Arial"/>
+        </w:rPr>
+        <w:instrText> </w:instrText>
+      </w:r>
+      <w:r>
+        <w:instrText>=</w:instrText>
+      </w:r>
+      <w:r>
+        <w:rPr>
+          <w:rFonts w:ascii="Arial" w:hAnsi="Arial" w:cs="Arial"/>
+        </w:rPr>
+        <w:instrText> </w:instrText>
+      </w:r>
+      <w:r>
+        <w:instrText>.03) and borderline lower median growth hormone levels (P</w:instrText>
+      </w:r>
+      <w:r>
+        <w:rPr>
+          <w:rFonts w:ascii="Arial" w:hAnsi="Arial" w:cs="Arial"/>
+        </w:rPr>
+        <w:instrText> </w:instrText>
+      </w:r>
+      <w:r>
+        <w:instrText>=</w:instrText>
+      </w:r>
+      <w:r>
+        <w:rPr>
+          <w:rFonts w:ascii="Arial" w:hAnsi="Arial" w:cs="Arial"/>
+        </w:rPr>
+        <w:instrText> </w:instrText>
+      </w:r>
+      <w:r>
+        <w:instrText>.09). Mean tumor diameter and proportion of tumors with cavernous sinus invasion were similar. Three-month biochemical remission (46% Black, 55% White, P</w:instrText>
+      </w:r>
+      <w:r>
+        <w:rPr>
+          <w:rFonts w:ascii="Arial" w:hAnsi="Arial" w:cs="Arial"/>
+        </w:rPr>
+        <w:instrText> </w:instrText>
+      </w:r>
+      <w:r>
+        <w:instrText>=</w:instrText>
+      </w:r>
+      <w:r>
+        <w:rPr>
+          <w:rFonts w:ascii="Arial" w:hAnsi="Arial" w:cs="Arial"/>
+        </w:rPr>
+        <w:instrText> </w:instrText>
+      </w:r>
+      <w:r>
+        <w:instrText>.76) and long-term IGF-1 control by multimodality therapy (92.3% Black, 80.5% White, P</w:instrText>
+      </w:r>
+      <w:r>
+        <w:rPr>
+          <w:rFonts w:ascii="Arial" w:hAnsi="Arial" w:cs="Arial"/>
+        </w:rPr>
+        <w:instrText> </w:instrText>
+      </w:r>
+      <w:r>
+        <w:instrText>=</w:instrText>
+      </w:r>
+      <w:r>
+        <w:rPr>
+          <w:rFonts w:ascii="Arial" w:hAnsi="Arial" w:cs="Arial"/>
+        </w:rPr>
+        <w:instrText> </w:instrText>
+      </w:r>
+      <w:r>
+        <w:instrText>.45) were similar. Among the total 129 patients with CD, Black patients had more hypopituitarism (69% vs 45% White, P</w:instrText>
+      </w:r>
+      <w:r>
+        <w:rPr>
+          <w:rFonts w:ascii="Arial" w:hAnsi="Arial" w:cs="Arial"/>
+        </w:rPr>
+        <w:instrText> </w:instrText>
+      </w:r>
+      <w:r>
+        <w:instrText>=</w:instrText>
+      </w:r>
+      <w:r>
+        <w:rPr>
+          <w:rFonts w:ascii="Arial" w:hAnsi="Arial" w:cs="Arial"/>
+        </w:rPr>
+        <w:instrText> </w:instrText>
+      </w:r>
+      <w:r>
+        <w:instrText>.04) and macroadenomas (33% vs 15% White, P</w:instrText>
+      </w:r>
+      <w:r>
+        <w:rPr>
+          <w:rFonts w:ascii="Arial" w:hAnsi="Arial" w:cs="Arial"/>
+        </w:rPr>
+        <w:instrText> </w:instrText>
+      </w:r>
+      <w:r>
+        <w:instrText>=</w:instrText>
+      </w:r>
+      <w:r>
+        <w:rPr>
+          <w:rFonts w:ascii="Arial" w:hAnsi="Arial" w:cs="Arial"/>
+        </w:rPr>
+        <w:instrText> </w:instrText>
+      </w:r>
+      <w:r>
+        <w:instrText>.05). At 3 months, remission rate was borderline higher in White (92% vs 78% Black, P</w:instrText>
+      </w:r>
+      <w:r>
+        <w:rPr>
+          <w:rFonts w:ascii="Arial" w:hAnsi="Arial" w:cs="Arial"/>
+        </w:rPr>
+        <w:instrText> </w:instrText>
+      </w:r>
+      <w:r>
+        <w:instrText>=</w:instrText>
+      </w:r>
+      <w:r>
+        <w:rPr>
+          <w:rFonts w:ascii="Arial" w:hAnsi="Arial" w:cs="Arial"/>
+        </w:rPr>
+        <w:instrText> </w:instrText>
+      </w:r>
+      <w:r>
+        <w:instrText xml:space="preserve">0.08), which was attributed to macroadenomas by logistic regression.We identified disparities regarding racial distribution, and clinical and biochemical characteristics in ACM, suggesting late or missed diagnosis in Black patients. Large nationwide studies are necessary to confirm our findings.","container-title":"Journal of the Endocrine Society","DOI":"10.1210/jendso/bvab176","ISSN":"2472-1972","issue":"1","journalAbbreviation":"J. Endocr. Soc.","page":"bvab176","source":"Silverchair","title":"Racial Disparities in Acromegaly and Cushing’s Disease: A Referral Center Study in 241 Patients","title-short":"Racial Disparities in Acromegaly and Cushing’s Disease","volume":"6","author":[{"family":"Ioachimescu","given":"Adriana G"},{"family":"Goswami","given":"Neevedita"},{"family":"Handa","given":"Talin"},{"family":"Pappy","given":"Adlai"},{"family":"Veledar","given":"Emir"},{"family":"Oyesiku","given":"Nelson M"}],"issued":{"date-parts":[["2022",1,1]]},"citation-key":"ioachimescuRacialDisparitiesAcromegaly2022"}}],"schema":"https://github.com/citation-style-language/schema/raw/master/csl-citation.json"} </w:instrText>
+      </w:r>
+      <w:r>
+        <w:fldChar w:fldCharType="separate"/>
+      </w:r>
+      <w:r>
+        <w:rPr>
+          <w:noProof/>
+        </w:rPr>
+        <w:t>(Ioachimescu et al., 2022)</w:t>
+      </w:r>
+      <w:r>
+        <w:fldChar w:fldCharType="end"/>
       </w:r>
       <w:r>
         <w:t xml:space="preserve">. </w:t>
@@ -2718,7 +2997,27 @@
         <w:t>i.e.</w:t>
       </w:r>
       <w:r>
-        <w:t xml:space="preserve"> HbA1c) and unable to perform others (triglyceride levels, LDL levels, bone density) that were of interest.  In most cases, only one laboratory value was available prior to treatment.  The long-term consequences of Cushing’s disease, with or without obesity are also highly important as patients may live decades after their treatment and we look forward to future studies to investigate these effects.</w:t>
+        <w:t xml:space="preserve"> HbA1c) and unable to perform others (triglyceride levels, LDL levels, bone density) that were of interest.  </w:t>
+      </w:r>
+      <w:r>
+        <w:t xml:space="preserve">We appreciate that there also may be some surveillance bias in whom specific lab tests were reported, though these are </w:t>
+      </w:r>
+      <w:proofErr w:type="gramStart"/>
+      <w:r>
+        <w:t>fairly routine</w:t>
+      </w:r>
+      <w:proofErr w:type="gramEnd"/>
+      <w:r>
+        <w:t xml:space="preserve"> tests.  </w:t>
+      </w:r>
+      <w:r>
+        <w:t>In most cases, only one laboratory value was available prior to treatment</w:t>
+      </w:r>
+      <w:r>
+        <w:t>, with the most recent value being used, but this precludes detailed time courses leading up to treatments</w:t>
+      </w:r>
+      <w:r>
+        <w:t>.  The long-term consequences of Cushing’s disease, with or without obesity are also highly important as patients may live decades after their treatment and we look forward to future studies to investigate these effects.</w:t>
       </w:r>
     </w:p>
     <w:p>
@@ -2742,7 +3041,11 @@
         <w:t>’</w:t>
       </w:r>
       <w:r>
-        <w:t>s dependent impacts on these co-morbidities and revealed a surprising and complex picture of integrated pathophysiology.  This study provides novel data that obesity and Cushing’s disease interact, suggesting that obesity and Cushing’s disease may result in worsened liver damage, but that the augmented effects on hypertension are lower than expected.  These results may be valuable for the accurate monitoring and treatment of the majority of Cushing’s patients who also have elevated adiposity.</w:t>
+        <w:t xml:space="preserve">s dependent impacts on these co-morbidities and revealed a surprising and complex picture of integrated pathophysiology.  This study provides novel data that obesity and Cushing’s disease interact, suggesting that obesity and Cushing’s disease may result in worsened liver damage, but that the augmented effects on hypertension are lower than expected.  </w:t>
+      </w:r>
+      <w:r>
+        <w:lastRenderedPageBreak/>
+        <w:t>These results may be valuable for the accurate monitoring and treatment of the majority of Cushing’s patients who also have elevated adiposity.</w:t>
       </w:r>
     </w:p>
     <w:p>
@@ -2773,11 +3076,7 @@
         <w:t>provided by</w:t>
       </w:r>
       <w:r>
-        <w:t xml:space="preserve"> the University of </w:t>
-      </w:r>
-      <w:r>
-        <w:lastRenderedPageBreak/>
-        <w:t xml:space="preserve">Michigan Adipose Tissue Core, part of the Michigan Nutrition and Obesity Research Center (NIH </w:t>
+        <w:t xml:space="preserve"> the University of Michigan Adipose Tissue Core, part of the Michigan Nutrition and Obesity Research Center (NIH </w:t>
       </w:r>
       <w:r>
         <w:t>P30DK020572</w:t>
@@ -2797,16 +3096,6 @@
       <w:r>
         <w:t xml:space="preserve"> we would like to thank the other members of the Bridges and Hochberg laboratories for valuable discussions regarding these analyses and their interpretation.</w:t>
       </w:r>
-    </w:p>
-    <w:p>
-      <w:pPr>
-        <w:rPr>
-          <w:rFonts w:asciiTheme="majorHAnsi" w:eastAsiaTheme="majorEastAsia" w:hAnsiTheme="majorHAnsi" w:cstheme="majorBidi"/>
-          <w:color w:val="000000" w:themeColor="text1"/>
-          <w:sz w:val="40"/>
-          <w:szCs w:val="40"/>
-        </w:rPr>
-      </w:pPr>
       <w:r>
         <w:br w:type="page"/>
       </w:r>
@@ -2833,8 +3122,37 @@
       <w:r>
         <w:fldChar w:fldCharType="separate"/>
       </w:r>
-      <w:r>
-        <w:t xml:space="preserve">Alqeeq, B. F., Ayyad, M., Almadhoun, W. J., Aboabdo, M., Aldahdouh, M. S., Al-Tawil, M., &amp; Al-Ghazali, A. M. (2024). Sex-related differences in Cushing’s disease: A systematic review and meta-analysis. </w:t>
+      <w:proofErr w:type="spellStart"/>
+      <w:r>
+        <w:t>Alqeeq</w:t>
+      </w:r>
+      <w:proofErr w:type="spellEnd"/>
+      <w:r>
+        <w:t xml:space="preserve">, B. F., Ayyad, M., </w:t>
+      </w:r>
+      <w:proofErr w:type="spellStart"/>
+      <w:r>
+        <w:t>Almadhoun</w:t>
+      </w:r>
+      <w:proofErr w:type="spellEnd"/>
+      <w:r>
+        <w:t xml:space="preserve">, W. J., </w:t>
+      </w:r>
+      <w:proofErr w:type="spellStart"/>
+      <w:r>
+        <w:t>Aboabdo</w:t>
+      </w:r>
+      <w:proofErr w:type="spellEnd"/>
+      <w:r>
+        <w:t xml:space="preserve">, M., </w:t>
+      </w:r>
+      <w:proofErr w:type="spellStart"/>
+      <w:r>
+        <w:t>Aldahdouh</w:t>
+      </w:r>
+      <w:proofErr w:type="spellEnd"/>
+      <w:r>
+        <w:t xml:space="preserve">, M. S., Al-Tawil, M., &amp; Al-Ghazali, A. M. (2024). Sex-related differences in Cushing’s disease: A systematic review and meta-analysis. </w:t>
       </w:r>
       <w:r>
         <w:rPr>
@@ -2862,7 +3180,15 @@
         <w:pStyle w:val="Bibliography"/>
       </w:pPr>
       <w:r>
-        <w:t xml:space="preserve">Braun, L. T., Riester, A., Oßwald-Kopp, A., Fazel, J., Rubinstein, G., Bidlingmaier, M., Beuschlein, F., &amp; Reincke, M. (2019). Toward a Diagnostic Score in Cushing’s Syndrome. </w:t>
+        <w:t xml:space="preserve">Braun, L. T., Riester, A., Oßwald-Kopp, A., Fazel, J., Rubinstein, G., </w:t>
+      </w:r>
+      <w:proofErr w:type="spellStart"/>
+      <w:r>
+        <w:t>Bidlingmaier</w:t>
+      </w:r>
+      <w:proofErr w:type="spellEnd"/>
+      <w:r>
+        <w:t xml:space="preserve">, M., Beuschlein, F., &amp; Reincke, M. (2019). Toward a Diagnostic Score in Cushing’s Syndrome. </w:t>
       </w:r>
       <w:r>
         <w:rPr>
@@ -2890,7 +3216,15 @@
         <w:pStyle w:val="Bibliography"/>
       </w:pPr>
       <w:r>
-        <w:t xml:space="preserve">Broder, M. S., Neary, M. P., Chang, E., Cherepanov, D., &amp; Ludlam, W. H. (2015). Incidence of Cushing’s syndrome and Cushing’s disease in commercially-insured patients &lt;65 years old in the United States. </w:t>
+        <w:t xml:space="preserve">Broder, M. S., Neary, M. P., Chang, E., Cherepanov, D., &amp; Ludlam, W. H. (2015). Incidence of Cushing’s syndrome and Cushing’s disease in </w:t>
+      </w:r>
+      <w:proofErr w:type="gramStart"/>
+      <w:r>
+        <w:t>commercially-insured</w:t>
+      </w:r>
+      <w:proofErr w:type="gramEnd"/>
+      <w:r>
+        <w:t xml:space="preserve"> patients &lt;65 years old in the United States. </w:t>
       </w:r>
       <w:r>
         <w:rPr>
@@ -2918,7 +3252,15 @@
         <w:pStyle w:val="Bibliography"/>
       </w:pPr>
       <w:r>
-        <w:t xml:space="preserve">DeFronzo, R. A., &amp; Auchus, R. J. (2025). Cushing Syndrome, Hypercortisolism, and Glucose Homeostasis: A Review. </w:t>
+        <w:t xml:space="preserve">DeFronzo, R. A., &amp; </w:t>
+      </w:r>
+      <w:proofErr w:type="spellStart"/>
+      <w:r>
+        <w:t>Auchus</w:t>
+      </w:r>
+      <w:proofErr w:type="spellEnd"/>
+      <w:r>
+        <w:t xml:space="preserve">, R. J. (2025). Cushing Syndrome, Hypercortisolism, and Glucose Homeostasis: A Review. </w:t>
       </w:r>
       <w:r>
         <w:rPr>
@@ -2945,24 +3287,45 @@
       <w:pPr>
         <w:pStyle w:val="Bibliography"/>
       </w:pPr>
-      <w:r>
-        <w:t xml:space="preserve">Etxabe, J., &amp; Vazquez, J. A. (1994). Morbidity and mortality in Cushing’s disease: An epidemiological approach. </w:t>
+      <w:proofErr w:type="spellStart"/>
+      <w:r>
+        <w:t>Etxabe</w:t>
+      </w:r>
+      <w:proofErr w:type="spellEnd"/>
+      <w:r>
+        <w:t xml:space="preserve">, J., &amp; Vazquez, J. A. (1994). Morbidity and mortality in Cushing’s disease: An epidemiological approach. </w:t>
       </w:r>
       <w:r>
         <w:rPr>
           <w:i/>
           <w:iCs/>
         </w:rPr>
-        <w:t>Clin Endocrinol (Oxf)</w:t>
-      </w:r>
-      <w:r>
-        <w:t xml:space="preserve">, </w:t>
-      </w:r>
+        <w:t>Clin Endocrinol (</w:t>
+      </w:r>
+      <w:proofErr w:type="spellStart"/>
       <w:r>
         <w:rPr>
           <w:i/>
           <w:iCs/>
         </w:rPr>
+        <w:t>Oxf</w:t>
+      </w:r>
+      <w:proofErr w:type="spellEnd"/>
+      <w:r>
+        <w:rPr>
+          <w:i/>
+          <w:iCs/>
+        </w:rPr>
+        <w:t>)</w:t>
+      </w:r>
+      <w:r>
+        <w:t xml:space="preserve">, </w:t>
+      </w:r>
+      <w:r>
+        <w:rPr>
+          <w:i/>
+          <w:iCs/>
+        </w:rPr>
         <w:t>40</w:t>
       </w:r>
       <w:r>
@@ -2973,8 +3336,45 @@
       <w:pPr>
         <w:pStyle w:val="Bibliography"/>
       </w:pPr>
-      <w:r>
-        <w:t xml:space="preserve">Fleseriu, M., Auchus, R., Bancos, I., Ben-Shlomo, A., Bertherat, J., Biermasz, N. R., Boguszewski, C. L., Bronstein, M. D., Buchfelder, M., Carmichael, J. D., Casanueva, F. F., Castinetti, F., Chanson, P., Findling, J., Gadelha, M., Geer, E. B., Giustina, A., </w:t>
+      <w:proofErr w:type="spellStart"/>
+      <w:r>
+        <w:t>Fleseriu</w:t>
+      </w:r>
+      <w:proofErr w:type="spellEnd"/>
+      <w:r>
+        <w:t xml:space="preserve">, M., </w:t>
+      </w:r>
+      <w:proofErr w:type="spellStart"/>
+      <w:r>
+        <w:t>Auchus</w:t>
+      </w:r>
+      <w:proofErr w:type="spellEnd"/>
+      <w:r>
+        <w:t xml:space="preserve">, R., Bancos, I., Ben-Shlomo, A., </w:t>
+      </w:r>
+      <w:proofErr w:type="spellStart"/>
+      <w:r>
+        <w:t>Bertherat</w:t>
+      </w:r>
+      <w:proofErr w:type="spellEnd"/>
+      <w:r>
+        <w:t xml:space="preserve">, J., </w:t>
+      </w:r>
+      <w:proofErr w:type="spellStart"/>
+      <w:r>
+        <w:t>Biermasz</w:t>
+      </w:r>
+      <w:proofErr w:type="spellEnd"/>
+      <w:r>
+        <w:t xml:space="preserve">, N. R., Boguszewski, C. L., Bronstein, M. D., </w:t>
+      </w:r>
+      <w:proofErr w:type="spellStart"/>
+      <w:r>
+        <w:t>Buchfelder</w:t>
+      </w:r>
+      <w:proofErr w:type="spellEnd"/>
+      <w:r>
+        <w:t xml:space="preserve">, M., Carmichael, J. D., Casanueva, F. F., Castinetti, F., Chanson, P., Findling, J., Gadelha, M., Geer, E. B., Giustina, A., </w:t>
       </w:r>
       <w:r>
         <w:lastRenderedPageBreak/>
@@ -3006,7 +3406,15 @@
         <w:pStyle w:val="Bibliography"/>
       </w:pPr>
       <w:r>
-        <w:t xml:space="preserve">Gadelha, M., Gatto, F., Wildemberg, L. E., &amp; Fleseriu, M. (2023). Cushing’s syndrome. </w:t>
+        <w:t xml:space="preserve">Gadelha, M., Gatto, F., Wildemberg, L. E., &amp; </w:t>
+      </w:r>
+      <w:proofErr w:type="spellStart"/>
+      <w:r>
+        <w:t>Fleseriu</w:t>
+      </w:r>
+      <w:proofErr w:type="spellEnd"/>
+      <w:r>
+        <w:t xml:space="preserve">, M. (2023). Cushing’s syndrome. </w:t>
       </w:r>
       <w:r>
         <w:rPr>
@@ -3034,7 +3442,55 @@
         <w:pStyle w:val="Bibliography"/>
       </w:pPr>
       <w:r>
-        <w:t xml:space="preserve">Giordano, R., Picu, A., Marinazzo, E., D’Angelo, V., Berardelli, R., Karamouzis, I., Forno, D., Zinnà, D., Maccario, M., Ghigo, E., &amp; Arvat, E. (2011). Metabolic and cardiovascular outcomes in patients with Cushing’s syndrome of different aetiologies during active disease and 1 year after remission. </w:t>
+        <w:t xml:space="preserve">Giordano, R., </w:t>
+      </w:r>
+      <w:proofErr w:type="spellStart"/>
+      <w:r>
+        <w:t>Picu</w:t>
+      </w:r>
+      <w:proofErr w:type="spellEnd"/>
+      <w:r>
+        <w:t xml:space="preserve">, A., </w:t>
+      </w:r>
+      <w:proofErr w:type="spellStart"/>
+      <w:r>
+        <w:t>Marinazzo</w:t>
+      </w:r>
+      <w:proofErr w:type="spellEnd"/>
+      <w:r>
+        <w:t xml:space="preserve">, E., D’Angelo, V., Berardelli, R., </w:t>
+      </w:r>
+      <w:proofErr w:type="spellStart"/>
+      <w:r>
+        <w:t>Karamouzis</w:t>
+      </w:r>
+      <w:proofErr w:type="spellEnd"/>
+      <w:r>
+        <w:t xml:space="preserve">, I., Forno, D., </w:t>
+      </w:r>
+      <w:proofErr w:type="spellStart"/>
+      <w:r>
+        <w:t>Zinnà</w:t>
+      </w:r>
+      <w:proofErr w:type="spellEnd"/>
+      <w:r>
+        <w:t xml:space="preserve">, D., Maccario, M., Ghigo, E., &amp; </w:t>
+      </w:r>
+      <w:proofErr w:type="spellStart"/>
+      <w:r>
+        <w:t>Arvat</w:t>
+      </w:r>
+      <w:proofErr w:type="spellEnd"/>
+      <w:r>
+        <w:t xml:space="preserve">, E. (2011). Metabolic and cardiovascular outcomes in patients with Cushing’s syndrome of different </w:t>
+      </w:r>
+      <w:proofErr w:type="spellStart"/>
+      <w:r>
+        <w:t>aetiologies</w:t>
+      </w:r>
+      <w:proofErr w:type="spellEnd"/>
+      <w:r>
+        <w:t xml:space="preserve"> during active disease and 1 year after remission. </w:t>
       </w:r>
       <w:r>
         <w:rPr>
@@ -3118,7 +3574,15 @@
         <w:pStyle w:val="Bibliography"/>
       </w:pPr>
       <w:r>
-        <w:t xml:space="preserve">Ho, D., Imai, K., King, G., &amp; Stuart, E. A. (2011). MatchIt: Nonparametric Preprocessing for Parametric Causal Inference. </w:t>
+        <w:t xml:space="preserve">Ho, D., Imai, K., King, G., &amp; Stuart, E. A. (2011). </w:t>
+      </w:r>
+      <w:proofErr w:type="spellStart"/>
+      <w:r>
+        <w:t>MatchIt</w:t>
+      </w:r>
+      <w:proofErr w:type="spellEnd"/>
+      <w:r>
+        <w:t xml:space="preserve">: Nonparametric Preprocessing for Parametric Causal Inference. </w:t>
       </w:r>
       <w:r>
         <w:rPr>
@@ -3178,7 +3642,23 @@
         <w:pStyle w:val="Bibliography"/>
       </w:pPr>
       <w:r>
-        <w:t xml:space="preserve">Ioachimescu, A. G., Goswami, N., Handa, T., Pappy, A., Veledar, E., &amp; Oyesiku, N. M. (2022). Racial Disparities in Acromegaly and Cushing’s Disease: A Referral Center Study in 241 Patients. </w:t>
+        <w:t xml:space="preserve">Ioachimescu, A. G., Goswami, N., Handa, T., Pappy, A., </w:t>
+      </w:r>
+      <w:proofErr w:type="spellStart"/>
+      <w:r>
+        <w:t>Veledar</w:t>
+      </w:r>
+      <w:proofErr w:type="spellEnd"/>
+      <w:r>
+        <w:t xml:space="preserve">, E., &amp; </w:t>
+      </w:r>
+      <w:proofErr w:type="spellStart"/>
+      <w:r>
+        <w:t>Oyesiku</w:t>
+      </w:r>
+      <w:proofErr w:type="spellEnd"/>
+      <w:r>
+        <w:t xml:space="preserve">, N. M. (2022). Racial Disparities in Acromegaly and Cushing’s Disease: A Referral Center Study in 241 Patients. </w:t>
       </w:r>
       <w:r>
         <w:rPr>
@@ -3206,7 +3686,43 @@
         <w:pStyle w:val="Bibliography"/>
       </w:pPr>
       <w:r>
-        <w:t>Isidori, A. M., Graziadio, C., Paragliola, R. M., Cozzolino, A., Ambrogio, A. G., Colao, A., Corsello, S. M., Pivonello, R., &amp; Group,  on behalf of the A. S. (2015). The hypertension of Cushing’s syndrome: Controversies in...</w:t>
+        <w:t xml:space="preserve">Isidori, A. M., </w:t>
+      </w:r>
+      <w:proofErr w:type="spellStart"/>
+      <w:r>
+        <w:t>Graziadio</w:t>
+      </w:r>
+      <w:proofErr w:type="spellEnd"/>
+      <w:r>
+        <w:t xml:space="preserve">, C., </w:t>
+      </w:r>
+      <w:proofErr w:type="spellStart"/>
+      <w:r>
+        <w:t>Paragliola</w:t>
+      </w:r>
+      <w:proofErr w:type="spellEnd"/>
+      <w:r>
+        <w:t xml:space="preserve">, R. M., Cozzolino, A., Ambrogio, A. G., Colao, A., Corsello, S. M., </w:t>
+      </w:r>
+      <w:proofErr w:type="spellStart"/>
+      <w:r>
+        <w:t>Pivonello</w:t>
+      </w:r>
+      <w:proofErr w:type="spellEnd"/>
+      <w:r>
+        <w:t xml:space="preserve">, R., &amp; </w:t>
+      </w:r>
+      <w:proofErr w:type="gramStart"/>
+      <w:r>
+        <w:t>Group,  on</w:t>
+      </w:r>
+      <w:proofErr w:type="gramEnd"/>
+      <w:r>
+        <w:t xml:space="preserve"> behalf of the A. S. (2015). The hypertension of Cushing’s syndrome: Controversies in..</w:t>
+      </w:r>
+      <w:proofErr w:type="gramStart"/>
+      <w:r>
+        <w:t>.</w:t>
       </w:r>
       <w:r>
         <w:rPr>
@@ -3215,7 +3731,11 @@
         <w:t> </w:t>
       </w:r>
       <w:r>
-        <w:t xml:space="preserve">: Journal of Hypertension. </w:t>
+        <w:t>:</w:t>
+      </w:r>
+      <w:proofErr w:type="gramEnd"/>
+      <w:r>
+        <w:t xml:space="preserve"> Journal of Hypertension. </w:t>
       </w:r>
       <w:r>
         <w:rPr>
@@ -3242,8 +3762,21 @@
       <w:pPr>
         <w:pStyle w:val="Bibliography"/>
       </w:pPr>
-      <w:r>
-        <w:t xml:space="preserve">Magiakou, M. A., Smyrnaki, P., &amp; Chrousos, G. P. (2006). Hypertension in Cushing’s syndrome. </w:t>
+      <w:proofErr w:type="spellStart"/>
+      <w:r>
+        <w:t>Magiakou</w:t>
+      </w:r>
+      <w:proofErr w:type="spellEnd"/>
+      <w:r>
+        <w:t xml:space="preserve">, M. A., Smyrnaki, P., &amp; </w:t>
+      </w:r>
+      <w:proofErr w:type="spellStart"/>
+      <w:r>
+        <w:t>Chrousos</w:t>
+      </w:r>
+      <w:proofErr w:type="spellEnd"/>
+      <w:r>
+        <w:t xml:space="preserve">, G. P. (2006). Hypertension in Cushing’s syndrome. </w:t>
       </w:r>
       <w:r>
         <w:rPr>
@@ -3270,8 +3803,13 @@
       <w:pPr>
         <w:pStyle w:val="Bibliography"/>
       </w:pPr>
-      <w:r>
-        <w:t xml:space="preserve">Matthiasdottir, A. M., Hardarson, T. O., Arnardottir, S., &amp; Sigurjonsdottir, H. A. (2024). Cushing’s Disease May Have Higher Incidence than Previously Thought: A Nationwide Study in Iceland 2010–2019. </w:t>
+      <w:proofErr w:type="spellStart"/>
+      <w:r>
+        <w:t>Matthiasdottir</w:t>
+      </w:r>
+      <w:proofErr w:type="spellEnd"/>
+      <w:r>
+        <w:t xml:space="preserve">, A. M., Hardarson, T. O., Arnardottir, S., &amp; Sigurjonsdottir, H. A. (2024). Cushing’s Disease May Have Higher Incidence than Previously Thought: A Nationwide Study in Iceland 2010–2019. </w:t>
       </w:r>
       <w:r>
         <w:rPr>
@@ -3328,7 +3866,15 @@
       </w:pPr>
       <w:r>
         <w:lastRenderedPageBreak/>
-        <w:t xml:space="preserve">Omotosho, Y. B., McGlotten, R., Chittiboina, P., &amp; Nieman, L. (2024). MON-113 Racial Disparity in the Time to Diagnosis of Cushing’s Disease. </w:t>
+        <w:t xml:space="preserve">Omotosho, Y. B., McGlotten, R., </w:t>
+      </w:r>
+      <w:proofErr w:type="spellStart"/>
+      <w:r>
+        <w:t>Chittiboina</w:t>
+      </w:r>
+      <w:proofErr w:type="spellEnd"/>
+      <w:r>
+        <w:t xml:space="preserve">, P., &amp; Nieman, L. (2024). MON-113 Racial Disparity in the Time to Diagnosis of Cushing’s Disease. </w:t>
       </w:r>
       <w:r>
         <w:rPr>
@@ -3355,8 +3901,29 @@
       <w:pPr>
         <w:pStyle w:val="Bibliography"/>
       </w:pPr>
-      <w:r>
-        <w:t xml:space="preserve">Parvanova, A., Reseghetti, E., Abbate, M., &amp; Ruggenenti, P. (2024). Mechanisms and treatment of obesity-related hypertension—Part 1: Mechanisms. </w:t>
+      <w:proofErr w:type="spellStart"/>
+      <w:r>
+        <w:t>Parvanova</w:t>
+      </w:r>
+      <w:proofErr w:type="spellEnd"/>
+      <w:r>
+        <w:t xml:space="preserve">, A., </w:t>
+      </w:r>
+      <w:proofErr w:type="spellStart"/>
+      <w:r>
+        <w:t>Reseghetti</w:t>
+      </w:r>
+      <w:proofErr w:type="spellEnd"/>
+      <w:r>
+        <w:t xml:space="preserve">, E., Abbate, M., &amp; </w:t>
+      </w:r>
+      <w:proofErr w:type="spellStart"/>
+      <w:r>
+        <w:t>Ruggenenti</w:t>
+      </w:r>
+      <w:proofErr w:type="spellEnd"/>
+      <w:r>
+        <w:t xml:space="preserve">, P. (2024). Mechanisms and treatment of obesity-related hypertension—Part 1: Mechanisms. </w:t>
       </w:r>
       <w:r>
         <w:rPr>
@@ -3402,7 +3969,15 @@
         <w:pStyle w:val="Bibliography"/>
       </w:pPr>
       <w:r>
-        <w:t xml:space="preserve">Sharma, S. T., Nieman, L. K., &amp; Feelders, R. A. (2015). Cushing’s syndrome: Epidemiology and developments in disease management. </w:t>
+        <w:t xml:space="preserve">Sharma, S. T., Nieman, L. K., &amp; </w:t>
+      </w:r>
+      <w:proofErr w:type="spellStart"/>
+      <w:r>
+        <w:t>Feelders</w:t>
+      </w:r>
+      <w:proofErr w:type="spellEnd"/>
+      <w:r>
+        <w:t xml:space="preserve">, R. A. (2015). Cushing’s syndrome: Epidemiology and developments in disease management. </w:t>
       </w:r>
       <w:r>
         <w:rPr>
@@ -3448,14 +4023,14 @@
         <w:pStyle w:val="Bibliography"/>
       </w:pPr>
       <w:r>
-        <w:t xml:space="preserve">Zillo, M., Barbot, M., Ceccato, F., Camozzi, C., Bilora, F., Casonato, A., Frigo, A., Albiger, N., Daidone, V., Mazzai, M., Mantero, F., &amp; Scaroni, C. (2014). Diagnosis and complications of Cushing’s disease: Gender-related differences. </w:t>
+        <w:t xml:space="preserve">Zhou, J., Zhang, M., Lu, L., Guo, X., Gao, L., Yan, W., Pang, H., Wang, Y., &amp; Xing, B. (2019). Validity of discharge ICD-10 codes in detecting the etiologies of endogenous Cushing’s syndrome. </w:t>
       </w:r>
       <w:r>
         <w:rPr>
           <w:i/>
           <w:iCs/>
         </w:rPr>
-        <w:t>Clinical Endocrinology</w:t>
+        <w:t>Endocrine Connections</w:t>
       </w:r>
       <w:r>
         <w:t xml:space="preserve">, </w:t>
@@ -3465,6 +4040,79 @@
           <w:i/>
           <w:iCs/>
         </w:rPr>
+        <w:t>8</w:t>
+      </w:r>
+      <w:r>
+        <w:t>(8), 1186–1194. https://doi.org/10.1530/EC-19-0312</w:t>
+      </w:r>
+    </w:p>
+    <w:p>
+      <w:pPr>
+        <w:pStyle w:val="Bibliography"/>
+      </w:pPr>
+      <w:proofErr w:type="spellStart"/>
+      <w:r>
+        <w:t>Zillo</w:t>
+      </w:r>
+      <w:proofErr w:type="spellEnd"/>
+      <w:r>
+        <w:t xml:space="preserve">, M., Barbot, M., Ceccato, F., Camozzi, C., </w:t>
+      </w:r>
+      <w:proofErr w:type="spellStart"/>
+      <w:r>
+        <w:t>Bilora</w:t>
+      </w:r>
+      <w:proofErr w:type="spellEnd"/>
+      <w:r>
+        <w:t xml:space="preserve">, F., </w:t>
+      </w:r>
+      <w:proofErr w:type="spellStart"/>
+      <w:r>
+        <w:t>Casonato</w:t>
+      </w:r>
+      <w:proofErr w:type="spellEnd"/>
+      <w:r>
+        <w:t xml:space="preserve">, A., Frigo, A., </w:t>
+      </w:r>
+      <w:proofErr w:type="spellStart"/>
+      <w:r>
+        <w:t>Albiger</w:t>
+      </w:r>
+      <w:proofErr w:type="spellEnd"/>
+      <w:r>
+        <w:t xml:space="preserve">, N., Daidone, V., Mazzai, M., </w:t>
+      </w:r>
+      <w:proofErr w:type="spellStart"/>
+      <w:r>
+        <w:t>Mantero</w:t>
+      </w:r>
+      <w:proofErr w:type="spellEnd"/>
+      <w:r>
+        <w:t xml:space="preserve">, F., &amp; </w:t>
+      </w:r>
+      <w:proofErr w:type="spellStart"/>
+      <w:r>
+        <w:t>Scaroni</w:t>
+      </w:r>
+      <w:proofErr w:type="spellEnd"/>
+      <w:r>
+        <w:t xml:space="preserve">, C. (2014). Diagnosis and complications of Cushing’s disease: Gender-related differences. </w:t>
+      </w:r>
+      <w:r>
+        <w:rPr>
+          <w:i/>
+          <w:iCs/>
+        </w:rPr>
+        <w:t>Clinical Endocrinology</w:t>
+      </w:r>
+      <w:r>
+        <w:t xml:space="preserve">, </w:t>
+      </w:r>
+      <w:r>
+        <w:rPr>
+          <w:i/>
+          <w:iCs/>
+        </w:rPr>
         <w:t>80</w:t>
       </w:r>
       <w:r>
@@ -3474,20 +4122,12 @@
     <w:p>
       <w:pPr>
         <w:pStyle w:val="Bibliography"/>
-      </w:pPr>
-      <w:r>
+        <w:ind w:left="0" w:firstLine="0"/>
+      </w:pPr>
+      <w:r>
+        <w:lastRenderedPageBreak/>
         <w:fldChar w:fldCharType="end"/>
       </w:r>
-    </w:p>
-    <w:p>
-      <w:pPr>
-        <w:rPr>
-          <w:rFonts w:asciiTheme="majorHAnsi" w:eastAsiaTheme="majorEastAsia" w:hAnsiTheme="majorHAnsi" w:cstheme="majorBidi"/>
-          <w:color w:val="000000" w:themeColor="text1"/>
-          <w:sz w:val="40"/>
-          <w:szCs w:val="40"/>
-        </w:rPr>
-      </w:pPr>
       <w:r>
         <w:br w:type="page"/>
       </w:r>
@@ -4013,93 +4653,6 @@
     </w:sectPr>
   </w:body>
 </w:document>
-</file>
-
-<file path=word/comments.xml><?xml version="1.0" encoding="utf-8"?>
-<w:comments xmlns:wpc="http://schemas.microsoft.com/office/word/2010/wordprocessingCanvas" xmlns:cx="http://schemas.microsoft.com/office/drawing/2014/chartex" xmlns:cx1="http://schemas.microsoft.com/office/drawing/2015/9/8/chartex" xmlns:cx2="http://schemas.microsoft.com/office/drawing/2015/10/21/chartex" xmlns:cx3="http://schemas.microsoft.com/office/drawing/2016/5/9/chartex" xmlns:cx4="http://schemas.microsoft.com/office/drawing/2016/5/10/chartex" xmlns:cx5="http://schemas.microsoft.com/office/drawing/2016/5/11/chartex" xmlns:cx6="http://schemas.microsoft.com/office/drawing/2016/5/12/chartex" xmlns:cx7="http://schemas.microsoft.com/office/drawing/2016/5/13/chartex" xmlns:cx8="http://schemas.microsoft.com/office/drawing/2016/5/14/chartex" xmlns:mc="http://schemas.openxmlformats.org/markup-compatibility/2006" xmlns:aink="http://schemas.microsoft.com/office/drawing/2016/ink" xmlns:am3d="http://schemas.microsoft.com/office/drawing/2017/model3d" xmlns:o="urn:schemas-microsoft-com:office:office" xmlns:oel="http://schemas.microsoft.com/office/2019/extlst" xmlns:r="http://schemas.openxmlformats.org/officeDocument/2006/relationships" xmlns:m="http://schemas.openxmlformats.org/officeDocument/2006/math" xmlns:v="urn:schemas-microsoft-com:vml" xmlns:wp14="http://schemas.microsoft.com/office/word/2010/wordprocessingDrawing" xmlns:wp="http://schemas.openxmlformats.org/drawingml/2006/wordprocessingDrawing" xmlns:w10="urn:schemas-microsoft-com:office:word" xmlns:w="http://schemas.openxmlformats.org/wordprocessingml/2006/main" xmlns:w14="http://schemas.microsoft.com/office/word/2010/wordml" xmlns:w15="http://schemas.microsoft.com/office/word/2012/wordml" xmlns:w16cex="http://schemas.microsoft.com/office/word/2018/wordml/cex" xmlns:w16cid="http://schemas.microsoft.com/office/word/2016/wordml/cid" xmlns:w16="http://schemas.microsoft.com/office/word/2018/wordml" xmlns:w16du="http://schemas.microsoft.com/office/word/2023/wordml/word16du" xmlns:w16sdtdh="http://schemas.microsoft.com/office/word/2020/wordml/sdtdatahash" xmlns:w16sdtfl="http://schemas.microsoft.com/office/word/2024/wordml/sdtformatlock" xmlns:w16se="http://schemas.microsoft.com/office/word/2015/wordml/symex" xmlns:wpg="http://schemas.microsoft.com/office/word/2010/wordprocessingGroup" xmlns:wpi="http://schemas.microsoft.com/office/word/2010/wordprocessingInk" xmlns:wne="http://schemas.microsoft.com/office/word/2006/wordml" xmlns:wps="http://schemas.microsoft.com/office/word/2010/wordprocessingShape" mc:Ignorable="w14 w15 w16se w16cid w16 w16cex w16sdtdh w16sdtfl w16du wp14">
-  <w:comment w:id="0" w:author="Carr, Treyton" w:date="2026-01-15T12:08:00Z" w:initials="CT">
-    <w:p>
-      <w:r>
-        <w:rPr>
-          <w:rStyle w:val="CommentReference"/>
-        </w:rPr>
-        <w:annotationRef/>
-      </w:r>
-      <w:hyperlink r:id="rId1" w:history="1">
-        <w:r>
-          <w:rPr>
-            <w:rStyle w:val="Hyperlink"/>
-            <w:sz w:val="20"/>
-            <w:szCs w:val="20"/>
-          </w:rPr>
-          <w:t>https://pmc-ncbi-nlm-nih-gov.proxy.lib.umich.edu/articles/PMC6709541/</w:t>
-        </w:r>
-      </w:hyperlink>
-    </w:p>
-  </w:comment>
-  <w:comment w:id="1" w:author="Carr, Treyton" w:date="2026-01-14T14:19:00Z" w:initials="CT">
-    <w:p>
-      <w:r>
-        <w:rPr>
-          <w:rStyle w:val="CommentReference"/>
-        </w:rPr>
-        <w:annotationRef/>
-      </w:r>
-      <w:r>
-        <w:rPr>
-          <w:sz w:val="20"/>
-          <w:szCs w:val="20"/>
-        </w:rPr>
-        <w:t>Is this the correct word?</w:t>
-      </w:r>
-    </w:p>
-    <w:p/>
-  </w:comment>
-  <w:comment w:id="2" w:author="Carr, Treyton" w:date="2026-01-15T12:18:00Z" w:initials="CT">
-    <w:p>
-      <w:r>
-        <w:rPr>
-          <w:rStyle w:val="CommentReference"/>
-        </w:rPr>
-        <w:annotationRef/>
-      </w:r>
-      <w:hyperlink r:id="rId2" w:history="1">
-        <w:r>
-          <w:rPr>
-            <w:rStyle w:val="Hyperlink"/>
-            <w:sz w:val="20"/>
-            <w:szCs w:val="20"/>
-          </w:rPr>
-          <w:t>https://academic-oup-com.proxy.lib.umich.edu/jes/article/6/1/bvab176/6438520</w:t>
-        </w:r>
-      </w:hyperlink>
-    </w:p>
-  </w:comment>
-</w:comments>
-</file>
-
-<file path=word/commentsExtended.xml><?xml version="1.0" encoding="utf-8"?>
-<w15:commentsEx xmlns:wpc="http://schemas.microsoft.com/office/word/2010/wordprocessingCanvas" xmlns:cx="http://schemas.microsoft.com/office/drawing/2014/chartex" xmlns:cx1="http://schemas.microsoft.com/office/drawing/2015/9/8/chartex" xmlns:cx2="http://schemas.microsoft.com/office/drawing/2015/10/21/chartex" xmlns:cx3="http://schemas.microsoft.com/office/drawing/2016/5/9/chartex" xmlns:cx4="http://schemas.microsoft.com/office/drawing/2016/5/10/chartex" xmlns:cx5="http://schemas.microsoft.com/office/drawing/2016/5/11/chartex" xmlns:cx6="http://schemas.microsoft.com/office/drawing/2016/5/12/chartex" xmlns:cx7="http://schemas.microsoft.com/office/drawing/2016/5/13/chartex" xmlns:cx8="http://schemas.microsoft.com/office/drawing/2016/5/14/chartex" xmlns:mc="http://schemas.openxmlformats.org/markup-compatibility/2006" xmlns:aink="http://schemas.microsoft.com/office/drawing/2016/ink" xmlns:am3d="http://schemas.microsoft.com/office/drawing/2017/model3d" xmlns:o="urn:schemas-microsoft-com:office:office" xmlns:oel="http://schemas.microsoft.com/office/2019/extlst" xmlns:r="http://schemas.openxmlformats.org/officeDocument/2006/relationships" xmlns:m="http://schemas.openxmlformats.org/officeDocument/2006/math" xmlns:v="urn:schemas-microsoft-com:vml" xmlns:wp14="http://schemas.microsoft.com/office/word/2010/wordprocessingDrawing" xmlns:wp="http://schemas.openxmlformats.org/drawingml/2006/wordprocessingDrawing" xmlns:w10="urn:schemas-microsoft-com:office:word" xmlns:w="http://schemas.openxmlformats.org/wordprocessingml/2006/main" xmlns:w14="http://schemas.microsoft.com/office/word/2010/wordml" xmlns:w15="http://schemas.microsoft.com/office/word/2012/wordml" xmlns:w16cex="http://schemas.microsoft.com/office/word/2018/wordml/cex" xmlns:w16cid="http://schemas.microsoft.com/office/word/2016/wordml/cid" xmlns:w16="http://schemas.microsoft.com/office/word/2018/wordml" xmlns:w16du="http://schemas.microsoft.com/office/word/2023/wordml/word16du" xmlns:w16sdtdh="http://schemas.microsoft.com/office/word/2020/wordml/sdtdatahash" xmlns:w16sdtfl="http://schemas.microsoft.com/office/word/2024/wordml/sdtformatlock" xmlns:w16se="http://schemas.microsoft.com/office/word/2015/wordml/symex" xmlns:wpg="http://schemas.microsoft.com/office/word/2010/wordprocessingGroup" xmlns:wpi="http://schemas.microsoft.com/office/word/2010/wordprocessingInk" xmlns:wne="http://schemas.microsoft.com/office/word/2006/wordml" xmlns:wps="http://schemas.microsoft.com/office/word/2010/wordprocessingShape" mc:Ignorable="w14 w15 w16se w16cid w16 w16cex w16sdtdh w16sdtfl w16du wp14">
-  <w15:commentEx w15:paraId="5925EAE7" w15:done="0"/>
-  <w15:commentEx w15:paraId="334D6868" w15:done="1"/>
-  <w15:commentEx w15:paraId="03CB5157" w15:done="0"/>
-</w15:commentsEx>
-</file>
-
-<file path=word/commentsExtensible.xml><?xml version="1.0" encoding="utf-8"?>
-<w16cex:commentsExtensible xmlns:wpc="http://schemas.microsoft.com/office/word/2010/wordprocessingCanvas" xmlns:cx="http://schemas.microsoft.com/office/drawing/2014/chartex" xmlns:cx1="http://schemas.microsoft.com/office/drawing/2015/9/8/chartex" xmlns:cx2="http://schemas.microsoft.com/office/drawing/2015/10/21/chartex" xmlns:cx3="http://schemas.microsoft.com/office/drawing/2016/5/9/chartex" xmlns:cx4="http://schemas.microsoft.com/office/drawing/2016/5/10/chartex" xmlns:cx5="http://schemas.microsoft.com/office/drawing/2016/5/11/chartex" xmlns:cx6="http://schemas.microsoft.com/office/drawing/2016/5/12/chartex" xmlns:cx7="http://schemas.microsoft.com/office/drawing/2016/5/13/chartex" xmlns:cx8="http://schemas.microsoft.com/office/drawing/2016/5/14/chartex" xmlns:cr="http://schemas.microsoft.com/office/comments/2020/reactions" xmlns:mc="http://schemas.openxmlformats.org/markup-compatibility/2006" xmlns:aink="http://schemas.microsoft.com/office/drawing/2016/ink" xmlns:am3d="http://schemas.microsoft.com/office/drawing/2017/model3d" xmlns:o="urn:schemas-microsoft-com:office:office" xmlns:oel="http://schemas.microsoft.com/office/2019/extlst" xmlns:r="http://schemas.openxmlformats.org/officeDocument/2006/relationships" xmlns:m="http://schemas.openxmlformats.org/officeDocument/2006/math" xmlns:v="urn:schemas-microsoft-com:vml" xmlns:wp14="http://schemas.microsoft.com/office/word/2010/wordprocessingDrawing" xmlns:wp="http://schemas.openxmlformats.org/drawingml/2006/wordprocessingDrawing" xmlns:w10="urn:schemas-microsoft-com:office:word" xmlns:w="http://schemas.openxmlformats.org/wordprocessingml/2006/main" xmlns:w14="http://schemas.microsoft.com/office/word/2010/wordml" xmlns:w15="http://schemas.microsoft.com/office/word/2012/wordml" xmlns:w16cex="http://schemas.microsoft.com/office/word/2018/wordml/cex" xmlns:w16cid="http://schemas.microsoft.com/office/word/2016/wordml/cid" xmlns:w16="http://schemas.microsoft.com/office/word/2018/wordml" xmlns:w16du="http://schemas.microsoft.com/office/word/2023/wordml/word16du" xmlns:w16sdtdh="http://schemas.microsoft.com/office/word/2020/wordml/sdtdatahash" xmlns:w16sdtfl="http://schemas.microsoft.com/office/word/2024/wordml/sdtformatlock" xmlns:w16se="http://schemas.microsoft.com/office/word/2015/wordml/symex" xmlns:wpg="http://schemas.microsoft.com/office/word/2010/wordprocessingGroup" xmlns:wpi="http://schemas.microsoft.com/office/word/2010/wordprocessingInk" xmlns:wne="http://schemas.microsoft.com/office/word/2006/wordml" xmlns:wps="http://schemas.microsoft.com/office/word/2010/wordprocessingShape" mc:Ignorable="w14 w15 w16se w16cid w16 w16cex w16sdtdh w16sdtfl cr w16du wp14">
-  <w16cex:commentExtensible w16cex:durableId="5EFE4507" w16cex:dateUtc="2026-01-15T17:08:00Z"/>
-  <w16cex:commentExtensible w16cex:durableId="5D44AEC0" w16cex:dateUtc="2026-01-14T19:19:00Z"/>
-  <w16cex:commentExtensible w16cex:durableId="405D6B0A" w16cex:dateUtc="2026-01-15T17:18:00Z"/>
-</w16cex:commentsExtensible>
-</file>
-
-<file path=word/commentsIds.xml><?xml version="1.0" encoding="utf-8"?>
-<w16cid:commentsIds xmlns:wpc="http://schemas.microsoft.com/office/word/2010/wordprocessingCanvas" xmlns:cx="http://schemas.microsoft.com/office/drawing/2014/chartex" xmlns:cx1="http://schemas.microsoft.com/office/drawing/2015/9/8/chartex" xmlns:cx2="http://schemas.microsoft.com/office/drawing/2015/10/21/chartex" xmlns:cx3="http://schemas.microsoft.com/office/drawing/2016/5/9/chartex" xmlns:cx4="http://schemas.microsoft.com/office/drawing/2016/5/10/chartex" xmlns:cx5="http://schemas.microsoft.com/office/drawing/2016/5/11/chartex" xmlns:cx6="http://schemas.microsoft.com/office/drawing/2016/5/12/chartex" xmlns:cx7="http://schemas.microsoft.com/office/drawing/2016/5/13/chartex" xmlns:cx8="http://schemas.microsoft.com/office/drawing/2016/5/14/chartex" xmlns:mc="http://schemas.openxmlformats.org/markup-compatibility/2006" xmlns:aink="http://schemas.microsoft.com/office/drawing/2016/ink" xmlns:am3d="http://schemas.microsoft.com/office/drawing/2017/model3d" xmlns:o="urn:schemas-microsoft-com:office:office" xmlns:oel="http://schemas.microsoft.com/office/2019/extlst" xmlns:r="http://schemas.openxmlformats.org/officeDocument/2006/relationships" xmlns:m="http://schemas.openxmlformats.org/officeDocument/2006/math" xmlns:v="urn:schemas-microsoft-com:vml" xmlns:wp14="http://schemas.microsoft.com/office/word/2010/wordprocessingDrawing" xmlns:wp="http://schemas.openxmlformats.org/drawingml/2006/wordprocessingDrawing" xmlns:w10="urn:schemas-microsoft-com:office:word" xmlns:w="http://schemas.openxmlformats.org/wordprocessingml/2006/main" xmlns:w14="http://schemas.microsoft.com/office/word/2010/wordml" xmlns:w15="http://schemas.microsoft.com/office/word/2012/wordml" xmlns:w16cex="http://schemas.microsoft.com/office/word/2018/wordml/cex" xmlns:w16cid="http://schemas.microsoft.com/office/word/2016/wordml/cid" xmlns:w16="http://schemas.microsoft.com/office/word/2018/wordml" xmlns:w16du="http://schemas.microsoft.com/office/word/2023/wordml/word16du" xmlns:w16sdtdh="http://schemas.microsoft.com/office/word/2020/wordml/sdtdatahash" xmlns:w16sdtfl="http://schemas.microsoft.com/office/word/2024/wordml/sdtformatlock" xmlns:w16se="http://schemas.microsoft.com/office/word/2015/wordml/symex" xmlns:wpg="http://schemas.microsoft.com/office/word/2010/wordprocessingGroup" xmlns:wpi="http://schemas.microsoft.com/office/word/2010/wordprocessingInk" xmlns:wne="http://schemas.microsoft.com/office/word/2006/wordml" xmlns:wps="http://schemas.microsoft.com/office/word/2010/wordprocessingShape" mc:Ignorable="w14 w15 w16se w16cid w16 w16cex w16sdtdh w16sdtfl w16du wp14">
-  <w16cid:commentId w16cid:paraId="5925EAE7" w16cid:durableId="5EFE4507"/>
-  <w16cid:commentId w16cid:paraId="334D6868" w16cid:durableId="5D44AEC0"/>
-  <w16cid:commentId w16cid:paraId="03CB5157" w16cid:durableId="405D6B0A"/>
-</w16cid:commentsIds>
 </file>
 
 <file path=word/numbering.xml><?xml version="1.0" encoding="utf-8"?>
@@ -5677,14 +6230,6 @@
     <w:abstractNumId w:val="0"/>
   </w:num>
 </w:numbering>
-</file>
-
-<file path=word/people.xml><?xml version="1.0" encoding="utf-8"?>
-<w15:people xmlns:wpc="http://schemas.microsoft.com/office/word/2010/wordprocessingCanvas" xmlns:cx="http://schemas.microsoft.com/office/drawing/2014/chartex" xmlns:cx1="http://schemas.microsoft.com/office/drawing/2015/9/8/chartex" xmlns:cx2="http://schemas.microsoft.com/office/drawing/2015/10/21/chartex" xmlns:cx3="http://schemas.microsoft.com/office/drawing/2016/5/9/chartex" xmlns:cx4="http://schemas.microsoft.com/office/drawing/2016/5/10/chartex" xmlns:cx5="http://schemas.microsoft.com/office/drawing/2016/5/11/chartex" xmlns:cx6="http://schemas.microsoft.com/office/drawing/2016/5/12/chartex" xmlns:cx7="http://schemas.microsoft.com/office/drawing/2016/5/13/chartex" xmlns:cx8="http://schemas.microsoft.com/office/drawing/2016/5/14/chartex" xmlns:mc="http://schemas.openxmlformats.org/markup-compatibility/2006" xmlns:aink="http://schemas.microsoft.com/office/drawing/2016/ink" xmlns:am3d="http://schemas.microsoft.com/office/drawing/2017/model3d" xmlns:o="urn:schemas-microsoft-com:office:office" xmlns:oel="http://schemas.microsoft.com/office/2019/extlst" xmlns:r="http://schemas.openxmlformats.org/officeDocument/2006/relationships" xmlns:m="http://schemas.openxmlformats.org/officeDocument/2006/math" xmlns:v="urn:schemas-microsoft-com:vml" xmlns:wp14="http://schemas.microsoft.com/office/word/2010/wordprocessingDrawing" xmlns:wp="http://schemas.openxmlformats.org/drawingml/2006/wordprocessingDrawing" xmlns:w10="urn:schemas-microsoft-com:office:word" xmlns:w="http://schemas.openxmlformats.org/wordprocessingml/2006/main" xmlns:w14="http://schemas.microsoft.com/office/word/2010/wordml" xmlns:w15="http://schemas.microsoft.com/office/word/2012/wordml" xmlns:w16cex="http://schemas.microsoft.com/office/word/2018/wordml/cex" xmlns:w16cid="http://schemas.microsoft.com/office/word/2016/wordml/cid" xmlns:w16="http://schemas.microsoft.com/office/word/2018/wordml" xmlns:w16du="http://schemas.microsoft.com/office/word/2023/wordml/word16du" xmlns:w16sdtdh="http://schemas.microsoft.com/office/word/2020/wordml/sdtdatahash" xmlns:w16sdtfl="http://schemas.microsoft.com/office/word/2024/wordml/sdtformatlock" xmlns:w16se="http://schemas.microsoft.com/office/word/2015/wordml/symex" xmlns:wpg="http://schemas.microsoft.com/office/word/2010/wordprocessingGroup" xmlns:wpi="http://schemas.microsoft.com/office/word/2010/wordprocessingInk" xmlns:wne="http://schemas.microsoft.com/office/word/2006/wordml" xmlns:wps="http://schemas.microsoft.com/office/word/2010/wordprocessingShape" mc:Ignorable="w14 w15 w16se w16cid w16 w16cex w16sdtdh w16sdtfl w16du wp14">
-  <w15:person w15:author="Carr, Treyton">
-    <w15:presenceInfo w15:providerId="AD" w15:userId="S::treycarr@umich.edu::2d7a502c-7154-4eba-af5f-8ba5f8b51ac9"/>
-  </w15:person>
-</w15:people>
 </file>
 
 <file path=word/styles.xml><?xml version="1.0" encoding="utf-8"?>

</xml_diff>

<commit_message>
Finished more Irit's Comments
</commit_message>
<xml_diff>
--- a/manuscript/Cushings-Obesity/manuscript.docx
+++ b/manuscript/Cushings-Obesity/manuscript.docx
@@ -380,14 +380,6 @@
       <w:r>
         <w:t>pituitary gland, leading the adrenal glands to produce excess cortisol</w:t>
       </w:r>
-      <w:del w:id="2" w:author="עירית הוכברג" w:date="2026-01-18T15:38:00Z">
-        <w:r>
-          <w:delText xml:space="preserve">. </w:delText>
-        </w:r>
-        <w:r>
-          <w:delText>This is often due to the presence of a pituitary adenoma</w:delText>
-        </w:r>
-      </w:del>
       <w:r>
         <w:t xml:space="preserve"> </w:t>
       </w:r>
@@ -418,21 +410,8 @@
       <w:r>
         <w:t>is known to</w:t>
       </w:r>
-      <w:del w:id="3" w:author="עירית הוכברג" w:date="2026-01-18T15:38:00Z">
-        <w:r>
-          <w:delText>also</w:delText>
-        </w:r>
-      </w:del>
-      <w:r>
-        <w:t xml:space="preserve"> occur</w:t>
-      </w:r>
-      <w:del w:id="4" w:author="עירית הוכברג" w:date="2026-01-18T15:39:00Z">
-        <w:r>
-          <w:delText>s</w:delText>
-        </w:r>
-      </w:del>
-      <w:r>
-        <w:t xml:space="preserve"> far more commonly in women, with a</w:t>
+      <w:r>
+        <w:t xml:space="preserve"> occur far more commonly in women, with a</w:t>
       </w:r>
       <w:r>
         <w:t>n approximate</w:t>
@@ -494,21 +473,9 @@
       <w:r>
         <w:t>MASLD</w:t>
       </w:r>
-      <w:ins w:id="5" w:author="עירית הוכברג" w:date="2026-01-18T15:39:00Z">
-        <w:r>
-          <w:t>)</w:t>
-        </w:r>
-      </w:ins>
-      <w:ins w:id="6" w:author="Irit Hochberg" w:date="2026-01-22T09:36:00Z" w16du:dateUtc="2026-01-22T14:36:00Z">
-        <w:r>
-          <w:t>,</w:t>
-        </w:r>
-      </w:ins>
-      <w:del w:id="7" w:author="Irit Hochberg" w:date="2026-01-22T09:36:00Z" w16du:dateUtc="2026-01-22T14:36:00Z">
-        <w:r>
-          <w:delText>,</w:delText>
-        </w:r>
-      </w:del>
+      <w:r>
+        <w:t>),</w:t>
+      </w:r>
       <w:r>
         <w:t xml:space="preserve"> weight gain, and hyperglycemia </w:t>
       </w:r>
@@ -580,21 +547,8 @@
       <w:r>
         <w:t>o</w:t>
       </w:r>
-      <w:del w:id="8" w:author="עירית הוכברג" w:date="2026-01-18T15:40:00Z">
-        <w:r>
-          <w:delText>a</w:delText>
-        </w:r>
-      </w:del>
-      <w:r>
-        <w:t>me</w:t>
-      </w:r>
-      <w:del w:id="9" w:author="Irit Hochberg" w:date="2026-01-22T09:36:00Z" w16du:dateUtc="2026-01-22T14:36:00Z">
-        <w:r>
-          <w:delText>became</w:delText>
-        </w:r>
-      </w:del>
-      <w:r>
-        <w:t xml:space="preserve"> overweight, and 32-41% of patients bec</w:t>
+      <w:r>
+        <w:t>me overweight, and 32-41% of patients bec</w:t>
       </w:r>
       <w:r>
         <w:t>o</w:t>
@@ -626,26 +580,11 @@
       <w:r>
         <w:t xml:space="preserve">Development of </w:t>
       </w:r>
-      <w:del w:id="10" w:author="עירית הוכברג" w:date="2026-01-18T15:40:00Z">
-        <w:r>
-          <w:delText>O</w:delText>
-        </w:r>
-      </w:del>
-      <w:ins w:id="11" w:author="עירית הוכברג" w:date="2026-01-18T15:40:00Z">
-        <w:r>
-          <w:t>o</w:t>
-        </w:r>
-      </w:ins>
-      <w:r>
-        <w:t>besity</w:t>
-      </w:r>
-      <w:del w:id="12" w:author="Irit Hochberg" w:date="2026-01-22T09:36:00Z" w16du:dateUtc="2026-01-22T14:36:00Z">
-        <w:r>
-          <w:delText>Obesity</w:delText>
-        </w:r>
-      </w:del>
-      <w:r>
-        <w:t xml:space="preserve"> is also a leading cause of several of the Cushing’s </w:t>
+      <w:r>
+        <w:t>o</w:t>
+      </w:r>
+      <w:r>
+        <w:t xml:space="preserve">besity is also a leading cause of several of the Cushing’s </w:t>
       </w:r>
       <w:r>
         <w:t>related</w:t>
@@ -781,40 +720,14 @@
       <w:r>
         <w:t>rom</w:t>
       </w:r>
-      <w:del w:id="13" w:author="עירית הוכברג" w:date="2026-01-18T15:41:00Z">
-        <w:r>
-          <w:delText>or</w:delText>
-        </w:r>
-      </w:del>
-      <w:del w:id="14" w:author="Irit Hochberg" w:date="2026-01-22T09:36:00Z" w16du:dateUtc="2026-01-22T14:36:00Z">
-        <w:r>
-          <w:delText>for</w:delText>
-        </w:r>
-      </w:del>
       <w:r>
         <w:t xml:space="preserve"> participants at</w:t>
       </w:r>
       <w:r>
         <w:t xml:space="preserve"> Michigan Medicine </w:t>
       </w:r>
-      <w:del w:id="15" w:author="Dave Bridges" w:date="2026-01-22T09:36:00Z" w16du:dateUtc="2026-01-22T14:36:00Z">
-        <w:r>
-          <w:delText xml:space="preserve">dating back to </w:delText>
-        </w:r>
-      </w:del>
-      <w:r>
-        <w:t xml:space="preserve">between </w:t>
-      </w:r>
-      <w:r>
-        <w:t xml:space="preserve">January </w:t>
-      </w:r>
-      <w:del w:id="16" w:author="Dave Bridges" w:date="2026-01-22T09:36:00Z" w16du:dateUtc="2026-01-22T14:36:00Z">
-        <w:r>
-          <w:delText>1,</w:delText>
-        </w:r>
-      </w:del>
-      <w:r>
-        <w:t>1</w:t>
+      <w:r>
+        <w:t>between January 1</w:t>
       </w:r>
       <w:r>
         <w:rPr>
@@ -823,144 +736,116 @@
         <w:t>st</w:t>
       </w:r>
       <w:r>
-        <w:t xml:space="preserve"> 2000</w:t>
-      </w:r>
-      <w:del w:id="17" w:author="Dave Bridges" w:date="2026-01-22T09:36:00Z" w16du:dateUtc="2026-01-22T14:36:00Z">
-        <w:r>
-          <w:delText>,</w:delText>
-        </w:r>
-      </w:del>
-      <w:r>
-        <w:t>-2025</w:t>
+        <w:t xml:space="preserve"> 2000-2025 </w:t>
+      </w:r>
+      <w:r>
+        <w:t xml:space="preserve">searching for diagnoses of Cushing’s disease </w:t>
+      </w:r>
+      <w:r>
+        <w:t>(</w:t>
+      </w:r>
+      <w:r>
+        <w:t xml:space="preserve">including ICD Codes </w:t>
+      </w:r>
+      <w:r>
+        <w:t xml:space="preserve">E24.0, </w:t>
+      </w:r>
+      <w:r>
+        <w:t xml:space="preserve">and </w:t>
+      </w:r>
+      <w:r>
+        <w:t>255.0</w:t>
+      </w:r>
+      <w:r>
+        <w:t xml:space="preserve">, validated in </w:t>
+      </w:r>
+      <w:r>
+        <w:fldChar w:fldCharType="begin"/>
+      </w:r>
+      <w:r>
+        <w:instrText xml:space="preserve"> ADDIN ZOTERO_ITEM CSL_CITATION {"citationID":"Bd97tZOS","properties":{"formattedCitation":"(Zhou et al., 2019)","plainCitation":"(Zhou et al., 2019)","noteIndex":0},"citationItems":[{"id":27440,"uris":["http://zotero.org/users/7317906/items/4UHHIV6Z"],"itemData":{"id":27440,"type":"article-journal","abstract":"Objective\nTo investigate the validity of discharge ICD-10 codes in detecting the etiology of endogenous Cushing’s syndrome (CS) in hospitalized patients.\n\nMethods\nWe evaluated the sensitivity, specificity, positive predictive value (PPV) and negative predictive value (NPV) of CS etiology-related ICD-10 codes or code combinations by comparing hospital discharge administrative data (DAD) with established diagnoses from medical records.\n\nResults\nCoding for patients with adrenocortical adenoma (ACA) and those with bilateral macronodular adrenal hyperplasia (BMAH) demonstrated disappointingly low sensitivity at 78.8% (95% CI: 70.1–85.6%) and 83.9% (95% CI: 65.5–93.9%), respectively. BMAH had the lowest PPV of 74.3% (95% CI: 56.4–86.9%). In confirmed ACA patients, the sensitivity for ACA code combinations was higher in patients initially admitted to the Department of Endocrinology before surgery than that in patients directly admitted to the Department of Urology (90.0 vs 73.1%, P</w:instrText>
+      </w:r>
+      <w:r>
+        <w:rPr>
+          <w:rFonts w:ascii="Arial" w:hAnsi="Arial" w:cs="Arial"/>
+        </w:rPr>
+        <w:instrText> </w:instrText>
+      </w:r>
+      <w:r>
+        <w:instrText>=</w:instrText>
+      </w:r>
+      <w:r>
+        <w:rPr>
+          <w:rFonts w:ascii="Arial" w:hAnsi="Arial" w:cs="Arial"/>
+        </w:rPr>
+        <w:instrText> </w:instrText>
+      </w:r>
+      <w:r>
+        <w:instrText>0.033). The same phenomenon was observed in the PPV for the BMAH code (100.0 vs 60.9%, P</w:instrText>
+      </w:r>
+      <w:r>
+        <w:rPr>
+          <w:rFonts w:ascii="Arial" w:hAnsi="Arial" w:cs="Arial"/>
+        </w:rPr>
+        <w:instrText> </w:instrText>
+      </w:r>
+      <w:r>
+        <w:instrText>=</w:instrText>
+      </w:r>
+      <w:r>
+        <w:rPr>
+          <w:rFonts w:ascii="Arial" w:hAnsi="Arial" w:cs="Arial"/>
+        </w:rPr>
+        <w:instrText> </w:instrText>
+      </w:r>
+      <w:r>
+        <w:instrText xml:space="preserve">0.012). Misinterpreted or confusing situations caused by coders (68.1%) and by the omission or denormalized documentation of symptomatic diagnosis by clinicians (26.1%) accounted for the main source of coding errors.\n\nConclusions\nHospital DAD is an effective data source for evaluating the etiology of CS but not ACA and BMAH. Improving surgeons’ documentation, especially in the delineation of symptomatic and locative diagnoses in discharge abstracts; department- or disease-specific training for coders and more multidisciplinary collaboration are ways to enhance the applicability of administrative data for CS etiologies.","container-title":"Endocrine Connections","DOI":"10.1530/EC-19-0312","ISSN":"2049-3614","issue":"8","journalAbbreviation":"Endocr Connect","note":"PMID: 31340196\nPMCID: PMC6709541","page":"1186-1194","source":"PubMed Central","title":"Validity of discharge ICD-10 codes in detecting the etiologies of endogenous Cushing’s syndrome","volume":"8","author":[{"family":"Zhou","given":"Jingya"},{"family":"Zhang","given":"Meng"},{"family":"Lu","given":"Lin"},{"family":"Guo","given":"Xiaopeng"},{"family":"Gao","given":"Lu"},{"family":"Yan","given":"Weigang"},{"family":"Pang","given":"Haiyu"},{"family":"Wang","given":"Yi"},{"family":"Xing","given":"Bing"}],"issued":{"date-parts":[["2019",7,24]]},"citation-key":"zhouValidityDischargeICD102019"}}],"schema":"https://github.com/citation-style-language/schema/raw/master/csl-citation.json"} </w:instrText>
+      </w:r>
+      <w:r>
+        <w:fldChar w:fldCharType="separate"/>
+      </w:r>
+      <w:r>
+        <w:rPr>
+          <w:noProof/>
+        </w:rPr>
+        <w:t>(Zhou et al., 2019)</w:t>
+      </w:r>
+      <w:r>
+        <w:fldChar w:fldCharType="end"/>
+      </w:r>
+      <w:r>
+        <w:t>)</w:t>
+      </w:r>
+      <w:r>
+        <w:t xml:space="preserve">. </w:t>
+      </w:r>
+      <w:r>
+        <w:t xml:space="preserve">We excluded participants if they </w:t>
+      </w:r>
+      <w:r>
+        <w:t>did not have a Cushing’s disease diagnosis, treatment date, lab history, or relevant demographic data documented.</w:t>
+      </w:r>
+      <w:r>
+        <w:t xml:space="preserve"> Race and ethnicity were self-reported, with groups of &lt;10 aggregated into the other</w:t>
+      </w:r>
+      <w:r>
+        <w:t xml:space="preserve"> reported</w:t>
       </w:r>
       <w:r>
         <w:t xml:space="preserve"> </w:t>
       </w:r>
-      <w:r>
-        <w:t xml:space="preserve">searching for diagnoses of Cushing’s disease </w:t>
-      </w:r>
-      <w:r>
-        <w:t>(</w:t>
-      </w:r>
-      <w:r>
-        <w:t xml:space="preserve">including ICD Codes </w:t>
-      </w:r>
-      <w:r>
-        <w:t xml:space="preserve">E24.0, </w:t>
-      </w:r>
-      <w:r>
-        <w:t xml:space="preserve">and </w:t>
-      </w:r>
-      <w:r>
-        <w:t>255.0</w:t>
-      </w:r>
-      <w:del w:id="18" w:author="Dave Bridges" w:date="2026-01-22T09:36:00Z" w16du:dateUtc="2026-01-22T14:36:00Z">
-        <w:r>
-          <w:delText>)</w:delText>
-        </w:r>
-        <w:r>
-          <w:delText xml:space="preserve">.  </w:delText>
-        </w:r>
-        <w:r>
-          <w:delText xml:space="preserve"> </w:delText>
-        </w:r>
-        <w:r>
-          <w:delText xml:space="preserve"> </w:delText>
-        </w:r>
-      </w:del>
-      <w:r>
-        <w:t xml:space="preserve">, validated in </w:t>
-      </w:r>
-      <w:r>
-        <w:fldChar w:fldCharType="begin"/>
-      </w:r>
-      <w:r>
-        <w:instrText xml:space="preserve"> ADDIN ZOTERO_ITEM CSL_CITATION {"citationID":"Bd97tZOS","properties":{"formattedCitation":"(Zhou et al., 2019)","plainCitation":"(Zhou et al., 2019)","noteIndex":0},"citationItems":[{"id":27440,"uris":["http://zotero.org/users/7317906/items/4UHHIV6Z"],"itemData":{"id":27440,"type":"article-journal","abstract":"Objective\nTo investigate the validity of discharge ICD-10 codes in detecting the etiology of endogenous Cushing’s syndrome (CS) in hospitalized patients.\n\nMethods\nWe evaluated the sensitivity, specificity, positive predictive value (PPV) and negative predictive value (NPV) of CS etiology-related ICD-10 codes or code combinations by comparing hospital discharge administrative data (DAD) with established diagnoses from medical records.\n\nResults\nCoding for patients with adrenocortical adenoma (ACA) and those with bilateral macronodular adrenal hyperplasia (BMAH) demonstrated disappointingly low sensitivity at 78.8% (95% CI: 70.1–85.6%) and 83.9% (95% CI: 65.5–93.9%), respectively. BMAH had the lowest PPV of 74.3% (95% CI: 56.4–86.9%). In confirmed ACA patients, the sensitivity for ACA code combinations was higher in patients initially admitted to the Department of Endocrinology before surgery than that in patients directly admitted to the Department of Urology (90.0 vs 73.1%, P</w:instrText>
-      </w:r>
-      <w:r>
-        <w:rPr>
-          <w:rFonts w:ascii="Arial" w:hAnsi="Arial" w:cs="Arial"/>
-        </w:rPr>
-        <w:instrText> </w:instrText>
-      </w:r>
-      <w:r>
-        <w:instrText>=</w:instrText>
-      </w:r>
-      <w:r>
-        <w:rPr>
-          <w:rFonts w:ascii="Arial" w:hAnsi="Arial" w:cs="Arial"/>
-        </w:rPr>
-        <w:instrText> </w:instrText>
-      </w:r>
-      <w:r>
-        <w:instrText>0.033). The same phenomenon was observed in the PPV for the BMAH code (100.0 vs 60.9%, P</w:instrText>
-      </w:r>
-      <w:r>
-        <w:rPr>
-          <w:rFonts w:ascii="Arial" w:hAnsi="Arial" w:cs="Arial"/>
-        </w:rPr>
-        <w:instrText> </w:instrText>
-      </w:r>
-      <w:r>
-        <w:instrText>=</w:instrText>
-      </w:r>
-      <w:r>
-        <w:rPr>
-          <w:rFonts w:ascii="Arial" w:hAnsi="Arial" w:cs="Arial"/>
-        </w:rPr>
-        <w:instrText> </w:instrText>
-      </w:r>
-      <w:r>
-        <w:instrText xml:space="preserve">0.012). Misinterpreted or confusing situations caused by coders (68.1%) and by the omission or denormalized documentation of symptomatic diagnosis by clinicians (26.1%) accounted for the main source of coding errors.\n\nConclusions\nHospital DAD is an effective data source for evaluating the etiology of CS but not ACA and BMAH. Improving surgeons’ documentation, especially in the delineation of symptomatic and locative diagnoses in discharge abstracts; department- or disease-specific training for coders and more multidisciplinary collaboration are ways to enhance the applicability of administrative data for CS etiologies.","container-title":"Endocrine Connections","DOI":"10.1530/EC-19-0312","ISSN":"2049-3614","issue":"8","journalAbbreviation":"Endocr Connect","note":"PMID: 31340196\nPMCID: PMC6709541","page":"1186-1194","source":"PubMed Central","title":"Validity of discharge ICD-10 codes in detecting the etiologies of endogenous Cushing’s syndrome","volume":"8","author":[{"family":"Zhou","given":"Jingya"},{"family":"Zhang","given":"Meng"},{"family":"Lu","given":"Lin"},{"family":"Guo","given":"Xiaopeng"},{"family":"Gao","given":"Lu"},{"family":"Yan","given":"Weigang"},{"family":"Pang","given":"Haiyu"},{"family":"Wang","given":"Yi"},{"family":"Xing","given":"Bing"}],"issued":{"date-parts":[["2019",7,24]]},"citation-key":"zhouValidityDischargeICD102019"}}],"schema":"https://github.com/citation-style-language/schema/raw/master/csl-citation.json"} </w:instrText>
-      </w:r>
-      <w:r>
-        <w:fldChar w:fldCharType="separate"/>
-      </w:r>
-      <w:r>
-        <w:rPr>
-          <w:noProof/>
-        </w:rPr>
-        <w:t>(Zhou et al., 2019)</w:t>
-      </w:r>
-      <w:r>
-        <w:fldChar w:fldCharType="end"/>
-      </w:r>
-      <w:r>
-        <w:t>)</w:t>
-      </w:r>
-      <w:r>
-        <w:t>.</w:t>
-      </w:r>
-      <w:r>
-        <w:t xml:space="preserve"> </w:t>
-      </w:r>
-      <w:r>
-        <w:t xml:space="preserve">We excluded participants if they </w:t>
-      </w:r>
-      <w:r>
-        <w:t>did not have a Cushing’s disease diagnosis, treatment date, lab history, or relevant demographic data documented.</w:t>
-      </w:r>
-      <w:r>
-        <w:t xml:space="preserve"> Race and ethnicity were self-reported, with groups of &lt;10 aggregated into the other</w:t>
-      </w:r>
-      <w:r>
-        <w:t xml:space="preserve"> reported</w:t>
-      </w:r>
-      <w:r>
-        <w:t xml:space="preserve"> </w:t>
-      </w:r>
-      <w:commentRangeStart w:id="19"/>
+      <w:commentRangeStart w:id="2"/>
       <w:r>
         <w:t>categor</w:t>
       </w:r>
-      <w:commentRangeEnd w:id="19"/>
+      <w:commentRangeEnd w:id="2"/>
       <w:r>
         <w:rPr>
           <w:rStyle w:val="CommentReference"/>
           <w:sz w:val="24"/>
           <w:szCs w:val="24"/>
         </w:rPr>
-        <w:commentReference w:id="19"/>
+        <w:commentReference w:id="2"/>
       </w:r>
       <w:r>
         <w:t>ies</w:t>
@@ -1032,18 +917,18 @@
       <w:r>
         <w:t xml:space="preserve">with that </w:t>
       </w:r>
-      <w:commentRangeStart w:id="20"/>
+      <w:commentRangeStart w:id="3"/>
       <w:r>
         <w:t>measurement</w:t>
       </w:r>
-      <w:commentRangeEnd w:id="20"/>
+      <w:commentRangeEnd w:id="3"/>
       <w:r>
         <w:rPr>
           <w:rStyle w:val="CommentReference"/>
           <w:sz w:val="24"/>
           <w:szCs w:val="24"/>
         </w:rPr>
-        <w:commentReference w:id="20"/>
+        <w:commentReference w:id="3"/>
       </w:r>
       <w:r>
         <w:t xml:space="preserve"> </w:t>
@@ -1172,17 +1057,9 @@
       <w:r>
         <w:t xml:space="preserve"> only included patients with </w:t>
       </w:r>
-      <w:proofErr w:type="gramStart"/>
-      <w:r>
-        <w:t>BMI</w:t>
-      </w:r>
-      <w:r>
-        <w:t>’</w:t>
-      </w:r>
-      <w:r>
-        <w:t>s</w:t>
-      </w:r>
-      <w:proofErr w:type="gramEnd"/>
+      <w:r>
+        <w:t>BMIs</w:t>
+      </w:r>
       <w:r>
         <w:t xml:space="preserve"> within the 5-75 range, and between </w:t>
       </w:r>
@@ -1241,11 +1118,6 @@
       <w:r>
         <w:t>reported</w:t>
       </w:r>
-      <w:del w:id="21" w:author="עירית הוכברג" w:date="2026-01-18T15:54:00Z">
-        <w:r>
-          <w:delText>measured</w:delText>
-        </w:r>
-      </w:del>
       <w:r>
         <w:t xml:space="preserve"> in </w:t>
       </w:r>
@@ -1358,7 +1230,7 @@
     <w:p>
       <w:pPr>
         <w:rPr>
-          <w:ins w:id="22" w:author="עירית הוכברג" w:date="2026-01-18T15:57:00Z"/>
+          <w:ins w:id="4" w:author="עירית הוכברג" w:date="2026-01-18T15:57:00Z"/>
         </w:rPr>
       </w:pPr>
       <w:r>
@@ -1394,18 +1266,18 @@
       <w:r>
         <w:t xml:space="preserve">Next, we eliminated participants that did not have a documented </w:t>
       </w:r>
-      <w:commentRangeStart w:id="23"/>
+      <w:commentRangeStart w:id="5"/>
       <w:r>
         <w:t>treatment</w:t>
       </w:r>
-      <w:commentRangeEnd w:id="23"/>
+      <w:commentRangeEnd w:id="5"/>
       <w:r>
         <w:rPr>
           <w:rStyle w:val="CommentReference"/>
           <w:sz w:val="24"/>
           <w:szCs w:val="24"/>
         </w:rPr>
-        <w:commentReference w:id="23"/>
+        <w:commentReference w:id="5"/>
       </w:r>
       <w:r>
         <w:t xml:space="preserve"> date after their diagnosis, giving us 476 participants. We then removed participants that did not have any</w:t>
@@ -1434,11 +1306,6 @@
       <w:r>
         <w:t xml:space="preserve">these 365 participants, </w:t>
       </w:r>
-      <w:del w:id="24" w:author="עירית הוכברג" w:date="2026-01-18T15:56:00Z">
-        <w:r>
-          <w:delText xml:space="preserve">we were </w:delText>
-        </w:r>
-      </w:del>
       <w:r>
         <w:t>there were documented</w:t>
       </w:r>
@@ -1537,15 +1404,7 @@
     </w:p>
     <w:p>
       <w:r>
-        <w:t xml:space="preserve">We performed outcome-specific propensity matching to identify appropriate controls, starting </w:t>
-      </w:r>
-      <w:del w:id="25" w:author="עירית הוכברג" w:date="2026-01-18T15:57:00Z">
-        <w:r>
-          <w:delText xml:space="preserve">from those </w:delText>
-        </w:r>
-      </w:del>
-      <w:r>
-        <w:t xml:space="preserve">with generating exact matches for gender, race and ethnicity.  We then algorithmically matched for age, generating 10 controls for each case.  Matching was </w:t>
+        <w:t xml:space="preserve">We performed outcome-specific propensity matching to identify appropriate controls, starting with generating exact matches for gender, race and ethnicity.  We then algorithmically matched for age, generating 10 controls for each case.  Matching was </w:t>
       </w:r>
       <w:r>
         <w:t>effective with</w:t>
@@ -2100,11 +1959,6 @@
       <w:r>
         <w:t xml:space="preserve"> </w:t>
       </w:r>
-      <w:del w:id="26" w:author="עירית הוכברג" w:date="2026-01-22T14:52:00Z">
-        <w:r>
-          <w:delText>will be</w:delText>
-        </w:r>
-      </w:del>
       <w:r>
         <w:rPr>
           <w:lang w:bidi="he-IL"/>
@@ -2360,202 +2214,63 @@
       <w:r>
         <w:t xml:space="preserve"> </w:t>
       </w:r>
-      <w:del w:id="27" w:author="עירית הוכברג" w:date="2026-01-22T15:03:00Z">
-        <w:r>
-          <w:delText xml:space="preserve">The </w:delText>
-        </w:r>
-        <w:r>
-          <w:delText xml:space="preserve">patients with </w:delText>
-        </w:r>
-      </w:del>
-      <w:ins w:id="28" w:author="עירית הוכברג" w:date="2026-01-22T15:03:00Z">
-        <w:r>
-          <w:t>When comparing glucose value</w:t>
-        </w:r>
-      </w:ins>
-      <w:ins w:id="29" w:author="עירית הוכברג" w:date="2026-01-22T15:04:00Z">
-        <w:r>
-          <w:t xml:space="preserve">s of </w:t>
-        </w:r>
-      </w:ins>
-      <w:ins w:id="30" w:author="עירית הוכברג" w:date="2026-01-22T15:03:00Z">
-        <w:r>
-          <w:t xml:space="preserve">patients with </w:t>
-        </w:r>
-      </w:ins>
-      <w:ins w:id="31" w:author="עירית הוכברג" w:date="2026-01-22T15:01:00Z">
-        <w:r>
-          <w:t>BMI over 30 kg/m2</w:t>
-        </w:r>
-      </w:ins>
-      <w:del w:id="32" w:author="עירית הוכברג" w:date="2026-01-22T15:01:00Z">
-        <w:r>
-          <w:delText>obesity</w:delText>
-        </w:r>
-      </w:del>
+      <w:r>
+        <w:t xml:space="preserve">When comparing glucose values of patients with </w:t>
+      </w:r>
+      <w:r>
+        <w:t>BMI over 30 kg/m2</w:t>
+      </w:r>
       <w:r>
         <w:t xml:space="preserve"> </w:t>
       </w:r>
-      <w:del w:id="33" w:author="עירית הוכברג" w:date="2026-01-22T14:56:00Z">
-        <w:r>
-          <w:delText xml:space="preserve">population </w:delText>
-        </w:r>
-      </w:del>
-      <w:r>
-        <w:t xml:space="preserve">had a </w:t>
-      </w:r>
-      <w:del w:id="34" w:author="עירית הוכברג" w:date="2026-01-22T15:02:00Z">
-        <w:r>
-          <w:delText>slightly larger increase</w:delText>
-        </w:r>
-      </w:del>
-      <w:ins w:id="35" w:author="עירית הוכברג" w:date="2026-01-22T15:03:00Z">
-        <w:r>
-          <w:t xml:space="preserve">compared </w:t>
-        </w:r>
-      </w:ins>
+      <w:r>
+        <w:t>to</w:t>
+      </w:r>
       <w:r>
         <w:t xml:space="preserve"> </w:t>
       </w:r>
-      <w:del w:id="36" w:author="עירית הוכברג" w:date="2026-01-22T15:03:00Z">
-        <w:r>
-          <w:delText xml:space="preserve">(26.9 vs. </w:delText>
-        </w:r>
-        <w:r>
-          <w:delText>24.6</w:delText>
-        </w:r>
-        <w:r>
-          <w:delText xml:space="preserve"> mg/</w:delText>
-        </w:r>
-        <w:commentRangeStart w:id="37"/>
-        <w:r>
-          <w:delText>dL</w:delText>
-        </w:r>
-        <w:commentRangeEnd w:id="37"/>
-        <w:r>
-          <w:rPr>
-            <w:rStyle w:val="CommentReference"/>
-            <w:sz w:val="24"/>
-            <w:szCs w:val="24"/>
-          </w:rPr>
-          <w:commentReference w:id="37"/>
-        </w:r>
-        <w:r>
-          <w:delText>) than</w:delText>
-        </w:r>
-      </w:del>
-      <w:ins w:id="38" w:author="עירית הוכברג" w:date="2026-01-22T15:03:00Z">
-        <w:r>
-          <w:t>to</w:t>
-        </w:r>
-      </w:ins>
+      <w:r>
+        <w:t>those with a BMI under 30 kg/m</w:t>
+      </w:r>
+      <w:r>
+        <w:rPr>
+          <w:vertAlign w:val="superscript"/>
+        </w:rPr>
+        <w:t>2</w:t>
+      </w:r>
+      <w:r>
+        <w:t xml:space="preserve">, </w:t>
+      </w:r>
+      <w:r>
+        <w:t>Cushing's disease patients and control patients had a similar glucose</w:t>
+      </w:r>
+      <w:r>
+        <w:t xml:space="preserve"> difference</w:t>
+      </w:r>
+      <w:r>
+        <w:t>, suggesting that there is no</w:t>
+      </w:r>
       <w:r>
         <w:t xml:space="preserve"> </w:t>
       </w:r>
       <w:r>
-        <w:t>those with a BMI under 30 kg/m</w:t>
-      </w:r>
-      <w:r>
-        <w:rPr>
-          <w:vertAlign w:val="superscript"/>
-        </w:rPr>
-        <w:t>2</w:t>
-      </w:r>
-      <w:r>
-        <w:t xml:space="preserve">, </w:t>
-      </w:r>
-      <w:ins w:id="39" w:author="עירית הוכברג" w:date="2026-01-22T15:04:00Z">
-        <w:r>
-          <w:t xml:space="preserve">Cushing's disease patients and control patients had a similar </w:t>
-        </w:r>
-      </w:ins>
-      <w:ins w:id="40" w:author="עירית הוכברג" w:date="2026-01-22T15:05:00Z">
-        <w:r>
-          <w:t>glucose</w:t>
-        </w:r>
-      </w:ins>
-      <w:del w:id="41" w:author="עירית הוכברג" w:date="2026-01-22T15:04:00Z">
-        <w:r>
-          <w:delText>but this was not a large enough</w:delText>
-        </w:r>
-      </w:del>
-      <w:r>
-        <w:t xml:space="preserve"> difference</w:t>
-      </w:r>
-      <w:ins w:id="42" w:author="עירית הוכברג" w:date="2026-01-22T15:05:00Z">
-        <w:r>
-          <w:t xml:space="preserve">, suggesting that there is </w:t>
-        </w:r>
-        <w:proofErr w:type="spellStart"/>
-        <w:r>
-          <w:t>no</w:t>
-        </w:r>
-      </w:ins>
-      <w:del w:id="43" w:author="עירית הוכברג" w:date="2026-01-22T15:05:00Z">
-        <w:r>
-          <w:delText xml:space="preserve"> to provide any significant evidence of an </w:delText>
-        </w:r>
-      </w:del>
-      <w:r>
-        <w:t>effect</w:t>
-      </w:r>
-      <w:proofErr w:type="spellEnd"/>
-      <w:r>
-        <w:t xml:space="preserve"> modification </w:t>
-      </w:r>
-      <w:ins w:id="44" w:author="עירית הוכברג" w:date="2026-01-22T15:05:00Z">
-        <w:r>
-          <w:t xml:space="preserve">of the excess glucocorticoids </w:t>
-        </w:r>
-      </w:ins>
-      <w:ins w:id="45" w:author="עירית הוכברג" w:date="2026-01-22T15:06:00Z">
-        <w:r>
-          <w:t xml:space="preserve">on the effect of obesity on glucose </w:t>
-        </w:r>
-      </w:ins>
-      <w:del w:id="46" w:author="עירית הוכברג" w:date="2026-01-22T15:06:00Z">
-        <w:r>
-          <w:delText>for obesity</w:delText>
-        </w:r>
-      </w:del>
-      <w:r>
-        <w:t xml:space="preserve"> (p=0.51; Table 3B)</w:t>
+        <w:t xml:space="preserve">effect modification </w:t>
+      </w:r>
+      <w:r>
+        <w:t xml:space="preserve">of the excess glucocorticoids on the effect of obesity on </w:t>
+      </w:r>
+      <w:r>
+        <w:t>glucose (</w:t>
+      </w:r>
+      <w:r>
+        <w:t>p=0.51; Table 3B)</w:t>
       </w:r>
       <w:r>
         <w:t xml:space="preserve">. </w:t>
       </w:r>
-      <w:del w:id="47" w:author="עירית הוכברג" w:date="2026-01-22T15:06:00Z">
-        <w:r>
-          <w:delText>Similarly</w:delText>
-        </w:r>
-        <w:r>
-          <w:delText>,</w:delText>
-        </w:r>
-        <w:r>
-          <w:delText xml:space="preserve"> in </w:delText>
-        </w:r>
-      </w:del>
-      <w:del w:id="48" w:author="עירית הוכברג" w:date="2026-01-22T15:07:00Z">
-        <w:r>
-          <w:delText>Table 3</w:delText>
-        </w:r>
-        <w:r>
-          <w:delText>A</w:delText>
-        </w:r>
-        <w:r>
-          <w:delText xml:space="preserve"> </w:delText>
-        </w:r>
-      </w:del>
-      <w:del w:id="49" w:author="עירית הוכברג" w:date="2026-01-22T15:06:00Z">
-        <w:r>
-          <w:delText xml:space="preserve">among </w:delText>
-        </w:r>
-      </w:del>
-      <w:ins w:id="50" w:author="עירית הוכברג" w:date="2026-01-22T15:06:00Z">
-        <w:r>
-          <w:t xml:space="preserve">Among </w:t>
-        </w:r>
-      </w:ins>
+      <w:r>
+        <w:t xml:space="preserve">Among </w:t>
+      </w:r>
       <w:r>
         <w:t>the small number of patients with</w:t>
       </w:r>
@@ -2583,15 +2298,13 @@
       <w:r>
         <w:t xml:space="preserve"> patients</w:t>
       </w:r>
-      <w:ins w:id="51" w:author="עירית הוכברג" w:date="2026-01-22T15:14:00Z">
-        <w:r>
-          <w:t xml:space="preserve"> </w:t>
-        </w:r>
-        <w:r>
-          <w:t>with Cushing's disease compared to controls</w:t>
-        </w:r>
-      </w:ins>
-      <w:ins w:id="52" w:author="Irit Hochberg" w:date="2026-01-22T09:36:00Z" w16du:dateUtc="2026-01-22T14:36:00Z">
+      <w:r>
+        <w:t xml:space="preserve"> </w:t>
+      </w:r>
+      <w:r>
+        <w:t>with Cushing's disease compared to controls</w:t>
+      </w:r>
+      <w:ins w:id="6" w:author="Irit Hochberg" w:date="2026-01-22T09:36:00Z" w16du:dateUtc="2026-01-22T14:36:00Z">
         <w:r>
           <w:t xml:space="preserve"> </w:t>
         </w:r>
@@ -2608,20 +2321,13 @@
       <w:r>
         <w:t>in patients with obesity</w:t>
       </w:r>
-      <w:ins w:id="53" w:author="עירית הוכברג" w:date="2026-01-22T15:14:00Z">
-        <w:r>
-          <w:t xml:space="preserve"> </w:t>
-        </w:r>
-        <w:r>
-          <w:t>and C</w:t>
-        </w:r>
-      </w:ins>
-      <w:ins w:id="54" w:author="עירית הוכברג" w:date="2026-01-22T15:15:00Z">
-        <w:r>
-          <w:t>ushing's disease compared to controls</w:t>
-        </w:r>
-      </w:ins>
-      <w:ins w:id="55" w:author="Irit Hochberg" w:date="2026-01-22T09:36:00Z" w16du:dateUtc="2026-01-22T14:36:00Z">
+      <w:r>
+        <w:t xml:space="preserve"> </w:t>
+      </w:r>
+      <w:r>
+        <w:t>and Cushing's disease compared to controls</w:t>
+      </w:r>
+      <w:ins w:id="7" w:author="Irit Hochberg" w:date="2026-01-22T09:36:00Z" w16du:dateUtc="2026-01-22T14:36:00Z">
         <w:r>
           <w:t xml:space="preserve"> </w:t>
         </w:r>
@@ -2638,19 +2344,15 @@
       <w:r>
         <w:t>&lt;0.01</w:t>
       </w:r>
-      <w:ins w:id="56" w:author="Irit Hochberg" w:date="2026-01-22T09:36:00Z" w16du:dateUtc="2026-01-22T14:36:00Z">
-        <w:r>
-          <w:t>)</w:t>
-        </w:r>
-      </w:ins>
-      <w:ins w:id="57" w:author="עירית הוכברג" w:date="2026-01-22T15:07:00Z">
-        <w:r>
-          <w:t xml:space="preserve"> (Table 3A</w:t>
-        </w:r>
-        <w:r>
-          <w:t>)</w:t>
-        </w:r>
-      </w:ins>
+      <w:r>
+        <w:t>)</w:t>
+      </w:r>
+      <w:r>
+        <w:t xml:space="preserve"> (Table 3A</w:t>
+      </w:r>
+      <w:r>
+        <w:t>)</w:t>
+      </w:r>
       <w:r>
         <w:t>.</w:t>
       </w:r>
@@ -2669,34 +2371,34 @@
       <w:r>
         <w:t xml:space="preserve">.  </w:t>
       </w:r>
-      <w:commentRangeStart w:id="58"/>
+      <w:commentRangeStart w:id="8"/>
       <w:r>
         <w:t>This</w:t>
       </w:r>
-      <w:commentRangeEnd w:id="58"/>
+      <w:commentRangeEnd w:id="8"/>
       <w:r>
         <w:rPr>
           <w:rStyle w:val="CommentReference"/>
           <w:sz w:val="24"/>
           <w:szCs w:val="24"/>
         </w:rPr>
-        <w:commentReference w:id="58"/>
+        <w:commentReference w:id="8"/>
       </w:r>
       <w:r>
         <w:t xml:space="preserve"> suggests that blood glucose increases with Cushing’s disease are largely </w:t>
       </w:r>
-      <w:commentRangeStart w:id="59"/>
+      <w:commentRangeStart w:id="9"/>
       <w:r>
         <w:t>additive</w:t>
       </w:r>
-      <w:commentRangeEnd w:id="59"/>
+      <w:commentRangeEnd w:id="9"/>
       <w:r>
         <w:rPr>
           <w:rStyle w:val="CommentReference"/>
           <w:sz w:val="24"/>
           <w:szCs w:val="24"/>
         </w:rPr>
-        <w:commentReference w:id="59"/>
+        <w:commentReference w:id="9"/>
       </w:r>
       <w:r>
         <w:t>.</w:t>
@@ -2729,27 +2431,11 @@
       <w:r>
         <w:t xml:space="preserve">and AST levels </w:t>
       </w:r>
-      <w:del w:id="60" w:author="עירית הוכברג" w:date="2026-01-22T15:15:00Z">
-        <w:r>
-          <w:delText>as indicators of liver damage</w:delText>
-        </w:r>
-        <w:r>
-          <w:delText xml:space="preserve"> </w:delText>
-        </w:r>
-      </w:del>
       <w:r>
         <w:t>(Figure 2 and Table 3A)</w:t>
       </w:r>
       <w:r>
-        <w:t>. In both our obese</w:t>
-      </w:r>
-      <w:del w:id="61" w:author="עירית הוכברג" w:date="2026-01-22T15:16:00Z">
-        <w:r>
-          <w:delText>,</w:delText>
-        </w:r>
-      </w:del>
-      <w:r>
-        <w:t xml:space="preserve"> and non-obese populations, we saw an increase in ALT </w:t>
+        <w:t xml:space="preserve">. In both our obese and non-obese populations, we saw an increase in ALT </w:t>
       </w:r>
       <w:r>
         <w:t>and AST</w:t>
@@ -2851,14 +2537,6 @@
       <w:r>
         <w:t>disease.</w:t>
       </w:r>
-      <w:del w:id="62" w:author="עירית הוכברג" w:date="2026-01-22T15:16:00Z">
-        <w:r>
-          <w:delText>associated liver damage</w:delText>
-        </w:r>
-      </w:del>
-      <w:r>
-        <w:t>.</w:t>
-      </w:r>
     </w:p>
     <w:p>
       <w:pPr>
@@ -2930,53 +2608,50 @@
         <w:t>without obesity</w:t>
       </w:r>
       <w:r>
+        <w:t xml:space="preserve"> (p=</w:t>
+      </w:r>
+      <w:r>
+        <w:t>&lt;0.01</w:t>
+      </w:r>
+      <w:r>
+        <w:t xml:space="preserve">). We did not, however, </w:t>
+      </w:r>
+      <w:r>
+        <w:t>observe</w:t>
+      </w:r>
+      <w:r>
+        <w:t xml:space="preserve"> this same significant </w:t>
+      </w:r>
+      <w:r>
+        <w:t xml:space="preserve">magnitude of </w:t>
+      </w:r>
+      <w:r>
+        <w:t>increase</w:t>
+      </w:r>
+      <w:r>
+        <w:t>s in blood pressure</w:t>
+      </w:r>
+      <w:r>
+        <w:t xml:space="preserve"> in </w:t>
+      </w:r>
+      <w:r>
+        <w:t>Cushing’s patients with obesity</w:t>
+      </w:r>
+      <w:r>
         <w:t xml:space="preserve"> </w:t>
       </w:r>
-      <w:r>
-        <w:t>(p=</w:t>
-      </w:r>
-      <w:r>
-        <w:t>&lt;0.01</w:t>
-      </w:r>
-      <w:r>
-        <w:t xml:space="preserve">). We did not, however, </w:t>
-      </w:r>
-      <w:r>
-        <w:t>observe</w:t>
-      </w:r>
-      <w:r>
-        <w:t xml:space="preserve"> this same significant </w:t>
-      </w:r>
-      <w:r>
-        <w:t xml:space="preserve">magnitude of </w:t>
-      </w:r>
-      <w:r>
-        <w:t>increase</w:t>
-      </w:r>
-      <w:r>
-        <w:t>s in blood pressure</w:t>
-      </w:r>
-      <w:r>
-        <w:t xml:space="preserve"> in </w:t>
-      </w:r>
-      <w:r>
-        <w:t>Cushing’s patients with obesity</w:t>
-      </w:r>
-      <w:r>
-        <w:t xml:space="preserve"> </w:t>
-      </w:r>
-      <w:commentRangeStart w:id="63"/>
+      <w:commentRangeStart w:id="10"/>
       <w:r>
         <w:t>population</w:t>
       </w:r>
-      <w:commentRangeEnd w:id="63"/>
+      <w:commentRangeEnd w:id="10"/>
       <w:r>
         <w:rPr>
           <w:rStyle w:val="CommentReference"/>
           <w:sz w:val="24"/>
           <w:szCs w:val="24"/>
         </w:rPr>
-        <w:commentReference w:id="63"/>
+        <w:commentReference w:id="10"/>
       </w:r>
       <w:r>
         <w:t>.  For example, in terms of systolic blood pressure, Cushing’s disease was associated with an increase of 11.97 mm Hg in patients without obesity but 3.08 mm Hg</w:t>
@@ -3068,22 +2743,12 @@
       <w:r>
         <w:t xml:space="preserve"> including BMI as a covariate did not attenuate these effects.  Within subgroups, we did notice some suggestive trends.  For example, the synergistic (and antagonistic) effects of obesity</w:t>
       </w:r>
-      <w:ins w:id="64" w:author="עירית הוכברג" w:date="2026-01-22T15:39:00Z">
-        <w:r>
-          <w:t xml:space="preserve"> </w:t>
-        </w:r>
-        <w:r>
-          <w:t>were larger</w:t>
-        </w:r>
-      </w:ins>
-      <w:del w:id="65" w:author="עירית הוכברג" w:date="2026-01-22T15:39:00Z">
-        <w:r>
-          <w:delText xml:space="preserve"> </w:delText>
-        </w:r>
-        <w:r>
-          <w:delText>increased</w:delText>
-        </w:r>
-      </w:del>
+      <w:r>
+        <w:t xml:space="preserve"> </w:t>
+      </w:r>
+      <w:r>
+        <w:t>were larger</w:t>
+      </w:r>
       <w:r>
         <w:t xml:space="preserve"> as obesity increased.  For example, the interaction between Class I obesity and Cushing’s disease on ALT levels was -12.8 mg/dL but increased to </w:t>
       </w:r>
@@ -3093,31 +2758,14 @@
       <w:r>
         <w:t xml:space="preserve">30.3 for Class II obesity and 80.7 for class III obesity.  Since this analysis already accounted for a main effect of obesity status, this </w:t>
       </w:r>
-      <w:ins w:id="66" w:author="Irit Hochberg" w:date="2026-01-22T09:36:00Z" w16du:dateUtc="2026-01-22T14:36:00Z">
-        <w:r>
-          <w:t>suggest</w:t>
-        </w:r>
-      </w:ins>
-      <w:ins w:id="67" w:author="עירית הוכברג" w:date="2026-01-22T15:40:00Z">
-        <w:r>
-          <w:t>s</w:t>
-        </w:r>
-      </w:ins>
-      <w:del w:id="68" w:author="Irit Hochberg" w:date="2026-01-22T09:36:00Z" w16du:dateUtc="2026-01-22T14:36:00Z">
-        <w:r>
-          <w:delText>suggest</w:delText>
-        </w:r>
-      </w:del>
-      <w:r>
-        <w:t xml:space="preserve"> that as obesity increases, the negative effect of Cushing’s disease on liver enzymes increased, while the protective effect on blood pressure was also trended to increase in magnitude.  Stratifying by gender, we noticed that female patients generally had worse</w:t>
-      </w:r>
-      <w:del w:id="69" w:author="עירית הוכברג" w:date="2026-01-22T15:40:00Z">
-        <w:r>
-          <w:delText>ned</w:delText>
-        </w:r>
-      </w:del>
-      <w:r>
-        <w:t xml:space="preserve"> but more variable effect estimates.  In the case of AST, the interaction between obesity and </w:t>
+      <w:r>
+        <w:t>suggest</w:t>
+      </w:r>
+      <w:r>
+        <w:t>s</w:t>
+      </w:r>
+      <w:r>
+        <w:t xml:space="preserve"> that as obesity increases, the negative effect of Cushing’s disease on liver enzymes increased, while the protective effect on blood pressure was also trended to increase in magnitude.  Stratifying by gender, we noticed that female patients generally had worse but more variable effect estimates.  In the case of AST, the interaction between obesity and </w:t>
       </w:r>
       <w:r>
         <w:t>Cushing’s</w:t>
@@ -3131,18 +2779,18 @@
       <w:r>
         <w:t>was estimated at 41.9 [-3.7-87.5] mg/dL but for males it was 25.8 [11.4-40.1] mg/</w:t>
       </w:r>
-      <w:commentRangeStart w:id="70"/>
+      <w:commentRangeStart w:id="11"/>
       <w:r>
         <w:t>dL</w:t>
       </w:r>
-      <w:commentRangeEnd w:id="70"/>
+      <w:commentRangeEnd w:id="11"/>
       <w:r>
         <w:rPr>
           <w:rStyle w:val="CommentReference"/>
           <w:sz w:val="24"/>
           <w:szCs w:val="24"/>
         </w:rPr>
-        <w:commentReference w:id="70"/>
+        <w:commentReference w:id="11"/>
       </w:r>
       <w:r>
         <w:t xml:space="preserve">.  </w:t>
@@ -3170,64 +2818,43 @@
         <w:lastRenderedPageBreak/>
         <w:t xml:space="preserve">This analysis of the effects of obesity and Cushing’s disease </w:t>
       </w:r>
-      <w:ins w:id="71" w:author="עירית הוכברג" w:date="2026-01-22T15:40:00Z">
-        <w:r>
-          <w:t xml:space="preserve">on </w:t>
-        </w:r>
-      </w:ins>
-      <w:ins w:id="72" w:author="עירית הוכברג" w:date="2026-01-22T15:41:00Z">
-        <w:r>
-          <w:t xml:space="preserve">metabolic complications </w:t>
-        </w:r>
-      </w:ins>
-      <w:ins w:id="73" w:author="Irit Hochberg" w:date="2026-01-22T09:36:00Z" w16du:dateUtc="2026-01-22T14:36:00Z">
-        <w:r>
-          <w:t>demonstrate</w:t>
-        </w:r>
-      </w:ins>
-      <w:ins w:id="74" w:author="עירית הוכברג" w:date="2026-01-22T15:41:00Z">
-        <w:r>
-          <w:t>s</w:t>
-        </w:r>
-      </w:ins>
-      <w:del w:id="75" w:author="Irit Hochberg" w:date="2026-01-22T09:36:00Z" w16du:dateUtc="2026-01-22T14:36:00Z">
-        <w:r>
-          <w:delText>demonstrate</w:delText>
-        </w:r>
-      </w:del>
+      <w:r>
+        <w:t xml:space="preserve">on metabolic complications </w:t>
+      </w:r>
+      <w:r>
+        <w:t>demonstrate</w:t>
+      </w:r>
+      <w:r>
+        <w:t>s</w:t>
+      </w:r>
       <w:r>
         <w:t xml:space="preserve"> a complex set of interactions between the presence of obesity on Cushing’s disease- and obesity-related pathophysiology.  We report that liver enzymes are enhanced relative to what we would predict from the additive effects of Cushing’s disease and obesity together, while in the case of blood pressure, obesity appears to reduce the effects of Cushing’s disease.  Glucose homeostasis appears to be explained well by an additive model</w:t>
       </w:r>
       <w:r>
         <w:t xml:space="preserve"> in our primary </w:t>
       </w:r>
-      <w:commentRangeStart w:id="76"/>
+      <w:commentRangeStart w:id="12"/>
       <w:r>
         <w:t>analysis</w:t>
       </w:r>
-      <w:commentRangeEnd w:id="76"/>
+      <w:commentRangeEnd w:id="12"/>
       <w:r>
         <w:rPr>
           <w:rStyle w:val="CommentReference"/>
           <w:sz w:val="24"/>
           <w:szCs w:val="24"/>
         </w:rPr>
-        <w:commentReference w:id="76"/>
+        <w:commentReference w:id="12"/>
       </w:r>
       <w:r>
         <w:t>.</w:t>
       </w:r>
       <w:r>
-        <w:t xml:space="preserve">  </w:t>
-      </w:r>
-      <w:r>
-        <w:t xml:space="preserve">Broadly, </w:t>
-      </w:r>
-      <w:proofErr w:type="gramStart"/>
-      <w:r>
-        <w:t>in spite of</w:t>
-      </w:r>
-      <w:proofErr w:type="gramEnd"/>
+        <w:t xml:space="preserve">  Broadly, </w:t>
+      </w:r>
+      <w:r>
+        <w:t>despite</w:t>
+      </w:r>
       <w:r>
         <w:t xml:space="preserve"> similar BMI levels between groups, metabolic dysfunction is dramatically worsened in patients with Cushing’s disease, so clearly there is substantial dysmetabolism beyond excessive weight gain.</w:t>
       </w:r>
@@ -3291,24 +2918,14 @@
       <w:r>
         <w:t>function, but</w:t>
       </w:r>
-      <w:ins w:id="77" w:author="Dave Bridges" w:date="2026-01-22T09:39:00Z" w16du:dateUtc="2026-01-22T14:39:00Z">
+      <w:ins w:id="13" w:author="Dave Bridges" w:date="2026-01-22T09:39:00Z" w16du:dateUtc="2026-01-22T14:39:00Z">
         <w:r>
           <w:t xml:space="preserve"> </w:t>
         </w:r>
       </w:ins>
-      <w:del w:id="78" w:author="עירית הוכברג" w:date="2026-01-22T15:43:00Z">
-        <w:r>
-          <w:delText xml:space="preserve"> did not</w:delText>
-        </w:r>
-      </w:del>
       <w:r>
         <w:t>there are</w:t>
       </w:r>
-      <w:del w:id="79" w:author="עירית הוכברג" w:date="2026-01-22T15:43:00Z">
-        <w:r>
-          <w:delText xml:space="preserve"> have</w:delText>
-        </w:r>
-      </w:del>
       <w:r>
         <w:t xml:space="preserve"> </w:t>
       </w:r>
@@ -3316,15 +2933,7 @@
         <w:t>in</w:t>
       </w:r>
       <w:r>
-        <w:t>sufficient</w:t>
-      </w:r>
-      <w:del w:id="80" w:author="Irit Hochberg" w:date="2026-01-22T09:36:00Z" w16du:dateUtc="2026-01-22T14:36:00Z">
-        <w:r>
-          <w:delText>sufficient</w:delText>
-        </w:r>
-      </w:del>
-      <w:r>
-        <w:t xml:space="preserve"> laboratory results in these participants to make reliable conclusions.</w:t>
+        <w:t>sufficient laboratory results in these participants to make reliable conclusions.</w:t>
       </w:r>
     </w:p>
     <w:p>
@@ -3350,29 +2959,17 @@
       <w:r>
         <w:t>cortisol</w:t>
       </w:r>
-      <w:del w:id="81" w:author="עירית הוכברג" w:date="2026-01-22T15:43:00Z">
-        <w:r>
-          <w:delText xml:space="preserve">’s direct effects </w:delText>
-        </w:r>
-      </w:del>
-      <w:ins w:id="82" w:author="עירית הוכברג" w:date="2026-01-22T15:43:00Z">
-        <w:r>
-          <w:t xml:space="preserve"> </w:t>
-        </w:r>
-      </w:ins>
+      <w:r>
+        <w:t xml:space="preserve"> </w:t>
+      </w:r>
       <w:r>
         <w:t xml:space="preserve">on adipocytes, as well as </w:t>
       </w:r>
       <w:r>
-        <w:t xml:space="preserve">the </w:t>
-      </w:r>
-      <w:del w:id="83" w:author="עירית הוכברג" w:date="2026-01-22T15:43:00Z">
-        <w:r>
-          <w:delText>its</w:delText>
-        </w:r>
-      </w:del>
-      <w:r>
-        <w:t xml:space="preserve"> indirect effects </w:t>
+        <w:t>the indirect</w:t>
+      </w:r>
+      <w:r>
+        <w:t xml:space="preserve"> effects </w:t>
       </w:r>
       <w:r>
         <w:t xml:space="preserve">of cortisol </w:t>
@@ -3380,11 +2977,9 @@
       <w:r>
         <w:t>on insulin signaling in adipocytes</w:t>
       </w:r>
-      <w:ins w:id="84" w:author="עירית הוכברג" w:date="2026-01-22T15:44:00Z">
-        <w:r>
-          <w:t>,</w:t>
-        </w:r>
-      </w:ins>
+      <w:r>
+        <w:t>,</w:t>
+      </w:r>
       <w:r>
         <w:t xml:space="preserve"> may explain increased liver disease in patients with obesity and Cushing’s disease.  This could be due to a confluence of increased triglyceride stores available for release, increased signaling, and decreased hepatic triglyceride export due to hepatic insulin resistance.  </w:t>
       </w:r>
@@ -3476,43 +3071,28 @@
         <w:ind w:left="0"/>
       </w:pPr>
       <w:r>
-        <w:t xml:space="preserve">We also report several interesting gender differences in how obesity and Cushing’s disease interact.  We find, as others have before, that Cushing’s disease affects women at a higher </w:t>
-      </w:r>
-      <w:r>
-        <w:lastRenderedPageBreak/>
-        <w:t xml:space="preserve">rate.  We also find that </w:t>
-      </w:r>
-      <w:del w:id="85" w:author="עירית הוכברג" w:date="2026-01-22T15:45:00Z">
-        <w:r>
-          <w:delText>among the pool of</w:delText>
-        </w:r>
-      </w:del>
+        <w:t xml:space="preserve">We also report several interesting gender differences in how obesity and Cushing’s disease interact.  We find, as others have before, that Cushing’s disease affects women at a higher rate.  We also find that </w:t>
+      </w:r>
       <w:r>
         <w:t>women with</w:t>
       </w:r>
       <w:r>
         <w:t xml:space="preserve"> Cushing’s disease </w:t>
       </w:r>
-      <w:del w:id="86" w:author="עירית הוכברג" w:date="2026-01-22T15:45:00Z">
-        <w:r>
-          <w:delText>patients with obesity, that is also more likely to be female</w:delText>
-        </w:r>
-      </w:del>
       <w:r>
         <w:t>are more likely to be obese</w:t>
       </w:r>
-      <w:ins w:id="87" w:author="Irit Hochberg" w:date="2026-01-22T09:36:00Z" w16du:dateUtc="2026-01-22T14:36:00Z">
+      <w:ins w:id="14" w:author="Irit Hochberg" w:date="2026-01-22T09:36:00Z" w16du:dateUtc="2026-01-22T14:36:00Z">
         <w:r>
           <w:t>.</w:t>
         </w:r>
       </w:ins>
-      <w:del w:id="88" w:author="Irit Hochberg" w:date="2026-01-22T09:36:00Z" w16du:dateUtc="2026-01-22T14:36:00Z">
-        <w:r>
-          <w:delText>.</w:delText>
-        </w:r>
-      </w:del>
-      <w:r>
-        <w:t xml:space="preserve">  Women in this group, on average, tend to have worsened and more heterogeneous responses to these dual co-morbidities than males</w:t>
+      <w:r>
+        <w:t xml:space="preserve">  Women </w:t>
+      </w:r>
+      <w:r>
+        <w:lastRenderedPageBreak/>
+        <w:t>in this group, on average, tend to have worsened and more heterogeneous responses to these dual co-morbidities than males</w:t>
       </w:r>
       <w:r>
         <w:t xml:space="preserve"> (Table 4)</w:t>
@@ -3533,15 +3113,7 @@
         <w:t xml:space="preserve">g's disease and control </w:t>
       </w:r>
       <w:r>
-        <w:t xml:space="preserve">groups, patients with Cushing’s disease had </w:t>
-      </w:r>
-      <w:del w:id="89" w:author="עירית הוכברג" w:date="2026-01-22T15:46:00Z">
-        <w:r>
-          <w:delText xml:space="preserve">much </w:delText>
-        </w:r>
-      </w:del>
-      <w:r>
-        <w:t>more severe hyperglycemia, blood pressure and liver enzymes than those with just obesity.</w:t>
+        <w:t>groups, patients with Cushing’s disease had more severe hyperglycemia, blood pressure and liver enzymes than those with just obesity.</w:t>
       </w:r>
     </w:p>
     <w:p>
@@ -3591,275 +3163,273 @@
       <w:r>
         <w:t xml:space="preserve"> </w:t>
       </w:r>
-      <w:ins w:id="90" w:author="Dave Bridges" w:date="2026-01-22T09:36:00Z" w16du:dateUtc="2026-01-22T14:36:00Z">
-        <w:r>
-          <w:t>Underdiagnosis of nonwhite Cushing’s disease patients</w:t>
-        </w:r>
-        <w:r>
-          <w:t xml:space="preserve"> </w:t>
-        </w:r>
-        <w:r>
-          <w:t>has been previously reported</w:t>
-        </w:r>
-        <w:r>
-          <w:t xml:space="preserve"> and remains plausible </w:t>
-        </w:r>
-        <w:r>
-          <w:fldChar w:fldCharType="begin"/>
-        </w:r>
-        <w:r>
-          <w:instrText xml:space="preserve"> ADDIN ZOTERO_ITEM CSL_CITATION {"citationID":"oiVXcg68","properties":{"formattedCitation":"(Ioachimescu et al., 2022)","plainCitation":"(Ioachimescu et al., 2022)","noteIndex":0},"citationItems":[{"id":27032,"uris":["http://zotero.org/users/7317906/items/EVS87VVY"],"itemData":{"id":27032,"type":"article-journal","abstract":"Acromegaly (ACM) and Cushing’s disease (CD) are caused by functioning pituitary adenomas secreting growth hormone and ACTH respectively.To determine the impact of race on presentation and postoperative outcomes in adults with ACM and CD, which has not yet been evaluated.This is a retrospective study of consecutive patients operated at a large-volume pituitary center. We evaluated (1) racial distribution of patients residing in the metropolitan area (Metro, N</w:instrText>
-        </w:r>
-        <w:r>
-          <w:rPr>
-            <w:rFonts w:ascii="Arial" w:hAnsi="Arial" w:cs="Arial"/>
-          </w:rPr>
-          <w:instrText> </w:instrText>
-        </w:r>
-        <w:r>
-          <w:instrText>=</w:instrText>
-        </w:r>
-        <w:r>
-          <w:rPr>
-            <w:rFonts w:ascii="Arial" w:hAnsi="Arial" w:cs="Arial"/>
-          </w:rPr>
-          <w:instrText> </w:instrText>
-        </w:r>
-        <w:r>
-          <w:instrText>124) vs 2010 US census data, and(2) presentation and postoperative outcomes in Black vs White for patients from the entire catchment area (N</w:instrText>
-        </w:r>
-        <w:r>
-          <w:rPr>
-            <w:rFonts w:ascii="Arial" w:hAnsi="Arial" w:cs="Arial"/>
-          </w:rPr>
-          <w:instrText> </w:instrText>
-        </w:r>
-        <w:r>
-          <w:instrText>=</w:instrText>
-        </w:r>
-        <w:r>
-          <w:rPr>
-            <w:rFonts w:ascii="Arial" w:hAnsi="Arial" w:cs="Arial"/>
-          </w:rPr>
-          <w:instrText> </w:instrText>
-        </w:r>
-        <w:r>
-          <w:instrText>241).For Metro area (32.4% Black population), Black patients represented 16.75% ACM (P</w:instrText>
-        </w:r>
-        <w:r>
-          <w:rPr>
-            <w:rFonts w:ascii="Arial" w:hAnsi="Arial" w:cs="Arial"/>
-          </w:rPr>
-          <w:instrText> </w:instrText>
-        </w:r>
-        <w:r>
-          <w:instrText>=</w:instrText>
-        </w:r>
-        <w:r>
-          <w:rPr>
-            <w:rFonts w:ascii="Arial" w:hAnsi="Arial" w:cs="Arial"/>
-          </w:rPr>
-          <w:instrText> </w:instrText>
-        </w:r>
-        <w:r>
-          <w:instrText>.006) and 29.2% CD (P</w:instrText>
-        </w:r>
-        <w:r>
-          <w:rPr>
-            <w:rFonts w:ascii="Arial" w:hAnsi="Arial" w:cs="Arial"/>
-          </w:rPr>
-          <w:instrText> </w:instrText>
-        </w:r>
-        <w:r>
-          <w:instrText>=</w:instrText>
-        </w:r>
-        <w:r>
-          <w:rPr>
-            <w:rFonts w:ascii="Arial" w:hAnsi="Arial" w:cs="Arial"/>
-          </w:rPr>
-          <w:instrText> </w:instrText>
-        </w:r>
-        <w:r>
-          <w:instrText>.56). Among the total 112 patients with ACM, presentations with headaches or incidentaloma were more common in Black patients (76.9% vs 31% White, P</w:instrText>
-        </w:r>
-        <w:r>
-          <w:rPr>
-            <w:rFonts w:ascii="Arial" w:hAnsi="Arial" w:cs="Arial"/>
-          </w:rPr>
-          <w:instrText> </w:instrText>
-        </w:r>
-        <w:r>
-          <w:instrText>=</w:instrText>
-        </w:r>
-        <w:r>
-          <w:rPr>
-            <w:rFonts w:ascii="Arial" w:hAnsi="Arial" w:cs="Arial"/>
-          </w:rPr>
-          <w:instrText> </w:instrText>
-        </w:r>
-        <w:r>
-          <w:instrText>.01). Black patients had a higher prevalence of diabetes (54% vs 16% White, P</w:instrText>
-        </w:r>
-        <w:r>
-          <w:rPr>
-            <w:rFonts w:ascii="Arial" w:hAnsi="Arial" w:cs="Arial"/>
-          </w:rPr>
-          <w:instrText> </w:instrText>
-        </w:r>
-        <w:r>
-          <w:instrText>=</w:instrText>
-        </w:r>
-        <w:r>
-          <w:rPr>
-            <w:rFonts w:ascii="Arial" w:hAnsi="Arial" w:cs="Arial"/>
-          </w:rPr>
-          <w:instrText> </w:instrText>
-        </w:r>
-        <w:r>
-          <w:instrText>.005), significantly lower insulin-like growth factor (IGF)-1 deviation from normal (P</w:instrText>
-        </w:r>
-        <w:r>
-          <w:rPr>
-            <w:rFonts w:ascii="Arial" w:hAnsi="Arial" w:cs="Arial"/>
-          </w:rPr>
-          <w:instrText> </w:instrText>
-        </w:r>
-        <w:r>
-          <w:instrText>=</w:instrText>
-        </w:r>
-        <w:r>
-          <w:rPr>
-            <w:rFonts w:ascii="Arial" w:hAnsi="Arial" w:cs="Arial"/>
-          </w:rPr>
-          <w:instrText> </w:instrText>
-        </w:r>
-        <w:r>
-          <w:instrText>.03) and borderline lower median growth hormone levels (P</w:instrText>
-        </w:r>
-        <w:r>
-          <w:rPr>
-            <w:rFonts w:ascii="Arial" w:hAnsi="Arial" w:cs="Arial"/>
-          </w:rPr>
-          <w:instrText> </w:instrText>
-        </w:r>
-        <w:r>
-          <w:instrText>=</w:instrText>
-        </w:r>
-        <w:r>
-          <w:rPr>
-            <w:rFonts w:ascii="Arial" w:hAnsi="Arial" w:cs="Arial"/>
-          </w:rPr>
-          <w:instrText> </w:instrText>
-        </w:r>
-        <w:r>
-          <w:instrText>.09). Mean tumor diameter and proportion of tumors with cavernous sinus invasion were similar. Three-month biochemical remission (46% Black, 55% White, P</w:instrText>
-        </w:r>
-        <w:r>
-          <w:rPr>
-            <w:rFonts w:ascii="Arial" w:hAnsi="Arial" w:cs="Arial"/>
-          </w:rPr>
-          <w:instrText> </w:instrText>
-        </w:r>
-        <w:r>
-          <w:instrText>=</w:instrText>
-        </w:r>
-        <w:r>
-          <w:rPr>
-            <w:rFonts w:ascii="Arial" w:hAnsi="Arial" w:cs="Arial"/>
-          </w:rPr>
-          <w:instrText> </w:instrText>
-        </w:r>
-        <w:r>
-          <w:instrText>.76) and long-term IGF-1 control by multimodality therapy (92.3% Black, 80.5% White, P</w:instrText>
-        </w:r>
-        <w:r>
-          <w:rPr>
-            <w:rFonts w:ascii="Arial" w:hAnsi="Arial" w:cs="Arial"/>
-          </w:rPr>
-          <w:instrText> </w:instrText>
-        </w:r>
-        <w:r>
-          <w:instrText>=</w:instrText>
-        </w:r>
-        <w:r>
-          <w:rPr>
-            <w:rFonts w:ascii="Arial" w:hAnsi="Arial" w:cs="Arial"/>
-          </w:rPr>
-          <w:instrText> </w:instrText>
-        </w:r>
-        <w:r>
-          <w:instrText>.45) were similar. Among the total 129 patients with CD, Black patients had more hypopituitarism (69% vs 45% White, P</w:instrText>
-        </w:r>
-        <w:r>
-          <w:rPr>
-            <w:rFonts w:ascii="Arial" w:hAnsi="Arial" w:cs="Arial"/>
-          </w:rPr>
-          <w:instrText> </w:instrText>
-        </w:r>
-        <w:r>
-          <w:instrText>=</w:instrText>
-        </w:r>
-        <w:r>
-          <w:rPr>
-            <w:rFonts w:ascii="Arial" w:hAnsi="Arial" w:cs="Arial"/>
-          </w:rPr>
-          <w:instrText> </w:instrText>
-        </w:r>
-        <w:r>
-          <w:instrText>.04) and macroadenomas (33% vs 15% White, P</w:instrText>
-        </w:r>
-        <w:r>
-          <w:rPr>
-            <w:rFonts w:ascii="Arial" w:hAnsi="Arial" w:cs="Arial"/>
-          </w:rPr>
-          <w:instrText> </w:instrText>
-        </w:r>
-        <w:r>
-          <w:instrText>=</w:instrText>
-        </w:r>
-        <w:r>
-          <w:rPr>
-            <w:rFonts w:ascii="Arial" w:hAnsi="Arial" w:cs="Arial"/>
-          </w:rPr>
-          <w:instrText> </w:instrText>
-        </w:r>
-        <w:r>
-          <w:instrText>.05). At 3 months, remission rate was borderline higher in White (92% vs 78% Black, P</w:instrText>
-        </w:r>
-        <w:r>
-          <w:rPr>
-            <w:rFonts w:ascii="Arial" w:hAnsi="Arial" w:cs="Arial"/>
-          </w:rPr>
-          <w:instrText> </w:instrText>
-        </w:r>
-        <w:r>
-          <w:instrText>=</w:instrText>
-        </w:r>
-        <w:r>
-          <w:rPr>
-            <w:rFonts w:ascii="Arial" w:hAnsi="Arial" w:cs="Arial"/>
-          </w:rPr>
-          <w:instrText> </w:instrText>
-        </w:r>
-        <w:r>
-          <w:instrText xml:space="preserve">0.08), which was attributed to macroadenomas by logistic regression.We identified disparities regarding racial distribution, and clinical and biochemical characteristics in ACM, suggesting late or missed diagnosis in Black patients. Large nationwide studies are necessary to confirm our findings.","container-title":"Journal of the Endocrine Society","DOI":"10.1210/jendso/bvab176","ISSN":"2472-1972","issue":"1","journalAbbreviation":"J. Endocr. Soc.","page":"bvab176","source":"Silverchair","title":"Racial Disparities in Acromegaly and Cushing’s Disease: A Referral Center Study in 241 Patients","title-short":"Racial Disparities in Acromegaly and Cushing’s Disease","volume":"6","author":[{"family":"Ioachimescu","given":"Adriana G"},{"family":"Goswami","given":"Neevedita"},{"family":"Handa","given":"Talin"},{"family":"Pappy","given":"Adlai"},{"family":"Veledar","given":"Emir"},{"family":"Oyesiku","given":"Nelson M"}],"issued":{"date-parts":[["2022",1,1]]},"citation-key":"ioachimescuRacialDisparitiesAcromegaly2022"}}],"schema":"https://github.com/citation-style-language/schema/raw/master/csl-citation.json"} </w:instrText>
-        </w:r>
-        <w:r>
-          <w:fldChar w:fldCharType="separate"/>
-        </w:r>
-        <w:r>
-          <w:rPr>
-            <w:noProof/>
-          </w:rPr>
-          <w:t>(Ioachimescu et al., 2022)</w:t>
-        </w:r>
-        <w:r>
-          <w:fldChar w:fldCharType="end"/>
-        </w:r>
-        <w:r>
-          <w:t>.</w:t>
-        </w:r>
-      </w:ins>
+      <w:r>
+        <w:t>Underdiagnosis of nonwhite Cushing’s disease patients</w:t>
+      </w:r>
+      <w:r>
+        <w:t xml:space="preserve"> </w:t>
+      </w:r>
+      <w:r>
+        <w:t>has been previously reported</w:t>
+      </w:r>
+      <w:r>
+        <w:t xml:space="preserve"> and remains plausible </w:t>
+      </w:r>
+      <w:r>
+        <w:fldChar w:fldCharType="begin"/>
+      </w:r>
+      <w:r>
+        <w:instrText xml:space="preserve"> ADDIN ZOTERO_ITEM CSL_CITATION {"citationID":"oiVXcg68","properties":{"formattedCitation":"(Ioachimescu et al., 2022)","plainCitation":"(Ioachimescu et al., 2022)","noteIndex":0},"citationItems":[{"id":27032,"uris":["http://zotero.org/users/7317906/items/EVS87VVY"],"itemData":{"id":27032,"type":"article-journal","abstract":"Acromegaly (ACM) and Cushing’s disease (CD) are caused by functioning pituitary adenomas secreting growth hormone and ACTH respectively.To determine the impact of race on presentation and postoperative outcomes in adults with ACM and CD, which has not yet been evaluated.This is a retrospective study of consecutive patients operated at a large-volume pituitary center. We evaluated (1) racial distribution of patients residing in the metropolitan area (Metro, N</w:instrText>
+      </w:r>
+      <w:r>
+        <w:rPr>
+          <w:rFonts w:ascii="Arial" w:hAnsi="Arial" w:cs="Arial"/>
+        </w:rPr>
+        <w:instrText> </w:instrText>
+      </w:r>
+      <w:r>
+        <w:instrText>=</w:instrText>
+      </w:r>
+      <w:r>
+        <w:rPr>
+          <w:rFonts w:ascii="Arial" w:hAnsi="Arial" w:cs="Arial"/>
+        </w:rPr>
+        <w:instrText> </w:instrText>
+      </w:r>
+      <w:r>
+        <w:instrText>124) vs 2010 US census data, and(2) presentation and postoperative outcomes in Black vs White for patients from the entire catchment area (N</w:instrText>
+      </w:r>
+      <w:r>
+        <w:rPr>
+          <w:rFonts w:ascii="Arial" w:hAnsi="Arial" w:cs="Arial"/>
+        </w:rPr>
+        <w:instrText> </w:instrText>
+      </w:r>
+      <w:r>
+        <w:instrText>=</w:instrText>
+      </w:r>
+      <w:r>
+        <w:rPr>
+          <w:rFonts w:ascii="Arial" w:hAnsi="Arial" w:cs="Arial"/>
+        </w:rPr>
+        <w:instrText> </w:instrText>
+      </w:r>
+      <w:r>
+        <w:instrText>241).For Metro area (32.4% Black population), Black patients represented 16.75% ACM (P</w:instrText>
+      </w:r>
+      <w:r>
+        <w:rPr>
+          <w:rFonts w:ascii="Arial" w:hAnsi="Arial" w:cs="Arial"/>
+        </w:rPr>
+        <w:instrText> </w:instrText>
+      </w:r>
+      <w:r>
+        <w:instrText>=</w:instrText>
+      </w:r>
+      <w:r>
+        <w:rPr>
+          <w:rFonts w:ascii="Arial" w:hAnsi="Arial" w:cs="Arial"/>
+        </w:rPr>
+        <w:instrText> </w:instrText>
+      </w:r>
+      <w:r>
+        <w:instrText>.006) and 29.2% CD (P</w:instrText>
+      </w:r>
+      <w:r>
+        <w:rPr>
+          <w:rFonts w:ascii="Arial" w:hAnsi="Arial" w:cs="Arial"/>
+        </w:rPr>
+        <w:instrText> </w:instrText>
+      </w:r>
+      <w:r>
+        <w:instrText>=</w:instrText>
+      </w:r>
+      <w:r>
+        <w:rPr>
+          <w:rFonts w:ascii="Arial" w:hAnsi="Arial" w:cs="Arial"/>
+        </w:rPr>
+        <w:instrText> </w:instrText>
+      </w:r>
+      <w:r>
+        <w:instrText>.56). Among the total 112 patients with ACM, presentations with headaches or incidentaloma were more common in Black patients (76.9% vs 31% White, P</w:instrText>
+      </w:r>
+      <w:r>
+        <w:rPr>
+          <w:rFonts w:ascii="Arial" w:hAnsi="Arial" w:cs="Arial"/>
+        </w:rPr>
+        <w:instrText> </w:instrText>
+      </w:r>
+      <w:r>
+        <w:instrText>=</w:instrText>
+      </w:r>
+      <w:r>
+        <w:rPr>
+          <w:rFonts w:ascii="Arial" w:hAnsi="Arial" w:cs="Arial"/>
+        </w:rPr>
+        <w:instrText> </w:instrText>
+      </w:r>
+      <w:r>
+        <w:instrText>.01). Black patients had a higher prevalence of diabetes (54% vs 16% White, P</w:instrText>
+      </w:r>
+      <w:r>
+        <w:rPr>
+          <w:rFonts w:ascii="Arial" w:hAnsi="Arial" w:cs="Arial"/>
+        </w:rPr>
+        <w:instrText> </w:instrText>
+      </w:r>
+      <w:r>
+        <w:instrText>=</w:instrText>
+      </w:r>
+      <w:r>
+        <w:rPr>
+          <w:rFonts w:ascii="Arial" w:hAnsi="Arial" w:cs="Arial"/>
+        </w:rPr>
+        <w:instrText> </w:instrText>
+      </w:r>
+      <w:r>
+        <w:instrText>.005), significantly lower insulin-like growth factor (IGF)-1 deviation from normal (P</w:instrText>
+      </w:r>
+      <w:r>
+        <w:rPr>
+          <w:rFonts w:ascii="Arial" w:hAnsi="Arial" w:cs="Arial"/>
+        </w:rPr>
+        <w:instrText> </w:instrText>
+      </w:r>
+      <w:r>
+        <w:instrText>=</w:instrText>
+      </w:r>
+      <w:r>
+        <w:rPr>
+          <w:rFonts w:ascii="Arial" w:hAnsi="Arial" w:cs="Arial"/>
+        </w:rPr>
+        <w:instrText> </w:instrText>
+      </w:r>
+      <w:r>
+        <w:instrText>.03) and borderline lower median growth hormone levels (P</w:instrText>
+      </w:r>
+      <w:r>
+        <w:rPr>
+          <w:rFonts w:ascii="Arial" w:hAnsi="Arial" w:cs="Arial"/>
+        </w:rPr>
+        <w:instrText> </w:instrText>
+      </w:r>
+      <w:r>
+        <w:instrText>=</w:instrText>
+      </w:r>
+      <w:r>
+        <w:rPr>
+          <w:rFonts w:ascii="Arial" w:hAnsi="Arial" w:cs="Arial"/>
+        </w:rPr>
+        <w:instrText> </w:instrText>
+      </w:r>
+      <w:r>
+        <w:instrText>.09). Mean tumor diameter and proportion of tumors with cavernous sinus invasion were similar. Three-month biochemical remission (46% Black, 55% White, P</w:instrText>
+      </w:r>
+      <w:r>
+        <w:rPr>
+          <w:rFonts w:ascii="Arial" w:hAnsi="Arial" w:cs="Arial"/>
+        </w:rPr>
+        <w:instrText> </w:instrText>
+      </w:r>
+      <w:r>
+        <w:instrText>=</w:instrText>
+      </w:r>
+      <w:r>
+        <w:rPr>
+          <w:rFonts w:ascii="Arial" w:hAnsi="Arial" w:cs="Arial"/>
+        </w:rPr>
+        <w:instrText> </w:instrText>
+      </w:r>
+      <w:r>
+        <w:instrText>.76) and long-term IGF-1 control by multimodality therapy (92.3% Black, 80.5% White, P</w:instrText>
+      </w:r>
+      <w:r>
+        <w:rPr>
+          <w:rFonts w:ascii="Arial" w:hAnsi="Arial" w:cs="Arial"/>
+        </w:rPr>
+        <w:instrText> </w:instrText>
+      </w:r>
+      <w:r>
+        <w:instrText>=</w:instrText>
+      </w:r>
+      <w:r>
+        <w:rPr>
+          <w:rFonts w:ascii="Arial" w:hAnsi="Arial" w:cs="Arial"/>
+        </w:rPr>
+        <w:instrText> </w:instrText>
+      </w:r>
+      <w:r>
+        <w:instrText>.45) were similar. Among the total 129 patients with CD, Black patients had more hypopituitarism (69% vs 45% White, P</w:instrText>
+      </w:r>
+      <w:r>
+        <w:rPr>
+          <w:rFonts w:ascii="Arial" w:hAnsi="Arial" w:cs="Arial"/>
+        </w:rPr>
+        <w:instrText> </w:instrText>
+      </w:r>
+      <w:r>
+        <w:instrText>=</w:instrText>
+      </w:r>
+      <w:r>
+        <w:rPr>
+          <w:rFonts w:ascii="Arial" w:hAnsi="Arial" w:cs="Arial"/>
+        </w:rPr>
+        <w:instrText> </w:instrText>
+      </w:r>
+      <w:r>
+        <w:instrText>.04) and macroadenomas (33% vs 15% White, P</w:instrText>
+      </w:r>
+      <w:r>
+        <w:rPr>
+          <w:rFonts w:ascii="Arial" w:hAnsi="Arial" w:cs="Arial"/>
+        </w:rPr>
+        <w:instrText> </w:instrText>
+      </w:r>
+      <w:r>
+        <w:instrText>=</w:instrText>
+      </w:r>
+      <w:r>
+        <w:rPr>
+          <w:rFonts w:ascii="Arial" w:hAnsi="Arial" w:cs="Arial"/>
+        </w:rPr>
+        <w:instrText> </w:instrText>
+      </w:r>
+      <w:r>
+        <w:instrText>.05). At 3 months, remission rate was borderline higher in White (92% vs 78% Black, P</w:instrText>
+      </w:r>
+      <w:r>
+        <w:rPr>
+          <w:rFonts w:ascii="Arial" w:hAnsi="Arial" w:cs="Arial"/>
+        </w:rPr>
+        <w:instrText> </w:instrText>
+      </w:r>
+      <w:r>
+        <w:instrText>=</w:instrText>
+      </w:r>
+      <w:r>
+        <w:rPr>
+          <w:rFonts w:ascii="Arial" w:hAnsi="Arial" w:cs="Arial"/>
+        </w:rPr>
+        <w:instrText> </w:instrText>
+      </w:r>
+      <w:r>
+        <w:instrText xml:space="preserve">0.08), which was attributed to macroadenomas by logistic regression.We identified disparities regarding racial distribution, and clinical and biochemical characteristics in ACM, suggesting late or missed diagnosis in Black patients. Large nationwide studies are necessary to confirm our findings.","container-title":"Journal of the Endocrine Society","DOI":"10.1210/jendso/bvab176","ISSN":"2472-1972","issue":"1","journalAbbreviation":"J. Endocr. Soc.","page":"bvab176","source":"Silverchair","title":"Racial Disparities in Acromegaly and Cushing’s Disease: A Referral Center Study in 241 Patients","title-short":"Racial Disparities in Acromegaly and Cushing’s Disease","volume":"6","author":[{"family":"Ioachimescu","given":"Adriana G"},{"family":"Goswami","given":"Neevedita"},{"family":"Handa","given":"Talin"},{"family":"Pappy","given":"Adlai"},{"family":"Veledar","given":"Emir"},{"family":"Oyesiku","given":"Nelson M"}],"issued":{"date-parts":[["2022",1,1]]},"citation-key":"ioachimescuRacialDisparitiesAcromegaly2022"}}],"schema":"https://github.com/citation-style-language/schema/raw/master/csl-citation.json"} </w:instrText>
+      </w:r>
+      <w:r>
+        <w:fldChar w:fldCharType="separate"/>
+      </w:r>
+      <w:r>
+        <w:rPr>
+          <w:noProof/>
+        </w:rPr>
+        <w:t>(Ioachimescu et al., 2022)</w:t>
+      </w:r>
+      <w:r>
+        <w:fldChar w:fldCharType="end"/>
+      </w:r>
+      <w:r>
+        <w:t>.</w:t>
+      </w:r>
       <w:r>
         <w:t xml:space="preserve"> </w:t>
       </w:r>
@@ -3876,35 +3446,24 @@
       <w:r>
         <w:t xml:space="preserve"> HbA1c) and unable to perform others (triglyceride levels, LDL levels, bone density) that were of interest.  </w:t>
       </w:r>
-      <w:ins w:id="91" w:author="Dave Bridges" w:date="2026-01-22T09:36:00Z" w16du:dateUtc="2026-01-22T14:36:00Z">
-        <w:r>
-          <w:t xml:space="preserve">We appreciate that there also may be some surveillance bias in whom specific lab tests were reported, though these are </w:t>
-        </w:r>
-        <w:proofErr w:type="gramStart"/>
-        <w:r>
-          <w:t>fairly routine</w:t>
-        </w:r>
-        <w:proofErr w:type="gramEnd"/>
-        <w:r>
-          <w:t xml:space="preserve"> tests.  </w:t>
-        </w:r>
-      </w:ins>
+      <w:r>
+        <w:t xml:space="preserve">We appreciate that there also may be some surveillance bias in whom specific lab tests were reported, though these are </w:t>
+      </w:r>
+      <w:r>
+        <w:t>relative</w:t>
+      </w:r>
+      <w:r>
+        <w:t xml:space="preserve">ly routine tests.  </w:t>
+      </w:r>
       <w:r>
         <w:t>In most cases, only one laboratory value was available prior to treatment</w:t>
       </w:r>
-      <w:del w:id="92" w:author="Dave Bridges" w:date="2026-01-22T09:36:00Z" w16du:dateUtc="2026-01-22T14:36:00Z">
-        <w:r>
-          <w:delText>.</w:delText>
-        </w:r>
-      </w:del>
-      <w:ins w:id="93" w:author="Dave Bridges" w:date="2026-01-22T09:36:00Z" w16du:dateUtc="2026-01-22T14:36:00Z">
-        <w:r>
-          <w:t>, with the most recent value being used, but this precludes detailed time courses leading up to treatments</w:t>
-        </w:r>
-        <w:r>
-          <w:t>.</w:t>
-        </w:r>
-      </w:ins>
+      <w:r>
+        <w:t>, with the most recent value being used, but this precludes detailed time courses leading up to treatments</w:t>
+      </w:r>
+      <w:r>
+        <w:t>.</w:t>
+      </w:r>
       <w:r>
         <w:t xml:space="preserve">  The long-term consequences of Cushing’s disease, with or without obesity are also highly important as patients may live decades after their treatment and we look forward to future studies to investigate these effects.</w:t>
       </w:r>
@@ -3930,19 +3489,11 @@
         <w:t>’</w:t>
       </w:r>
       <w:r>
-        <w:t xml:space="preserve">s </w:t>
+        <w:t xml:space="preserve">s dependent impacts on these co-morbidities and revealed a surprising and complex picture </w:t>
       </w:r>
       <w:r>
         <w:lastRenderedPageBreak/>
-        <w:t xml:space="preserve">dependent impacts on these co-morbidities and revealed a surprising and complex picture of integrated pathophysiology.  This study provides novel data that obesity and Cushing’s disease interact, suggesting that obesity and Cushing’s disease may result in worsened liver damage, but that the augmented effects on hypertension are lower than expected.  These results may be valuable for the accurate monitoring and treatment of </w:t>
-      </w:r>
-      <w:proofErr w:type="gramStart"/>
-      <w:r>
-        <w:t>the majority of</w:t>
-      </w:r>
-      <w:proofErr w:type="gramEnd"/>
-      <w:r>
-        <w:t xml:space="preserve"> Cushing’s patients who also have elevated adiposity.</w:t>
+        <w:t>of integrated pathophysiology.  This study provides novel data that obesity and Cushing’s disease interact, suggesting that obesity and Cushing’s disease may result in worsened liver damage, but that the augmented effects on hypertension are lower than expected.  These results may be valuable for the accurate monitoring and treatment of the majority of Cushing’s patients who also have elevated adiposity.</w:t>
       </w:r>
     </w:p>
     <w:p>
@@ -3957,11 +3508,6 @@
       </w:r>
     </w:p>
     <w:p>
-      <w:pPr>
-        <w:rPr>
-          <w:del w:id="94" w:author="Dave Bridges" w:date="2026-01-22T09:36:00Z" w16du:dateUtc="2026-01-22T14:36:00Z"/>
-        </w:rPr>
-      </w:pPr>
       <w:r>
         <w:t xml:space="preserve">This work was supported by a pilot and feasibility grant from the Michigan Diabetes Research Center (NIH </w:t>
       </w:r>
@@ -3998,11 +3544,716 @@
       <w:r>
         <w:t xml:space="preserve"> we would like to thank the other members of the Bridges and Hochberg laboratories for valuable discussions regarding these analyses and their interpretation.</w:t>
       </w:r>
-    </w:p>
-    <w:p>
-      <w:pPr>
-        <w:rPr>
-          <w:rPrChange w:id="95" w:author="Dave Bridges" w:date="2026-01-22T09:36:00Z" w16du:dateUtc="2026-01-22T14:36:00Z">
+      <w:r>
+        <w:br w:type="page"/>
+      </w:r>
+    </w:p>
+    <w:p>
+      <w:pPr>
+        <w:pStyle w:val="Heading1"/>
+      </w:pPr>
+      <w:r>
+        <w:lastRenderedPageBreak/>
+        <w:t>References</w:t>
+      </w:r>
+    </w:p>
+    <w:p>
+      <w:pPr>
+        <w:pStyle w:val="Bibliography"/>
+      </w:pPr>
+      <w:r>
+        <w:fldChar w:fldCharType="begin"/>
+      </w:r>
+      <w:r>
+        <w:instrText xml:space="preserve"> ADDIN ZOTERO_BIBL {"uncited":[],"omitted":[],"custom":[]} CSL_BIBLIOGRAPHY </w:instrText>
+      </w:r>
+      <w:r>
+        <w:fldChar w:fldCharType="separate"/>
+      </w:r>
+      <w:r>
+        <w:t xml:space="preserve">Alqeeq, B. F., Ayyad, M., Almadhoun, W. J., Aboabdo, M., Aldahdouh, M. S., Al-Tawil, M., &amp; Al-Ghazali, A. M. (2024). Sex-related differences in Cushing’s disease: A systematic review and meta-analysis. </w:t>
+      </w:r>
+      <w:r>
+        <w:rPr>
+          <w:i/>
+          <w:iCs/>
+        </w:rPr>
+        <w:t>Annals of Saudi Medicine</w:t>
+      </w:r>
+      <w:r>
+        <w:t xml:space="preserve">, </w:t>
+      </w:r>
+      <w:r>
+        <w:rPr>
+          <w:i/>
+          <w:iCs/>
+        </w:rPr>
+        <w:t>44</w:t>
+      </w:r>
+      <w:r>
+        <w:t>(1), 55–65. https://doi.org/10.5144/0256-4947.2024.55</w:t>
+      </w:r>
+    </w:p>
+    <w:p>
+      <w:pPr>
+        <w:pStyle w:val="Bibliography"/>
+      </w:pPr>
+      <w:r>
+        <w:t xml:space="preserve">Braun, L. T., Riester, A., Oßwald-Kopp, A., Fazel, J., Rubinstein, G., Bidlingmaier, M., Beuschlein, F., &amp; Reincke, M. (2019). Toward a Diagnostic Score in Cushing’s Syndrome. </w:t>
+      </w:r>
+      <w:r>
+        <w:rPr>
+          <w:i/>
+          <w:iCs/>
+        </w:rPr>
+        <w:t>Frontiers in Endocrinology</w:t>
+      </w:r>
+      <w:r>
+        <w:t xml:space="preserve">, </w:t>
+      </w:r>
+      <w:r>
+        <w:rPr>
+          <w:i/>
+          <w:iCs/>
+        </w:rPr>
+        <w:t>10</w:t>
+      </w:r>
+      <w:r>
+        <w:t>, 766. https://doi.org/10.3389/fendo.2019.00766</w:t>
+      </w:r>
+    </w:p>
+    <w:p>
+      <w:pPr>
+        <w:pStyle w:val="Bibliography"/>
+      </w:pPr>
+      <w:r>
+        <w:t xml:space="preserve">Broder, M. S., Neary, M. P., Chang, E., Cherepanov, D., &amp; Ludlam, W. H. (2015). Incidence of Cushing’s syndrome and Cushing’s disease in commercially-insured patients &lt;65 years old in the United States. </w:t>
+      </w:r>
+      <w:r>
+        <w:rPr>
+          <w:i/>
+          <w:iCs/>
+        </w:rPr>
+        <w:t>Pituitary</w:t>
+      </w:r>
+      <w:r>
+        <w:t xml:space="preserve">, </w:t>
+      </w:r>
+      <w:r>
+        <w:rPr>
+          <w:i/>
+          <w:iCs/>
+        </w:rPr>
+        <w:t>18</w:t>
+      </w:r>
+      <w:r>
+        <w:t>(3), 283–289. https://doi.org/10.1007/s11102-014-0569-6</w:t>
+      </w:r>
+    </w:p>
+    <w:p>
+      <w:pPr>
+        <w:pStyle w:val="Bibliography"/>
+      </w:pPr>
+      <w:r>
+        <w:t xml:space="preserve">DeFronzo, R. A., &amp; Auchus, R. J. (2025). Cushing Syndrome, Hypercortisolism, and Glucose Homeostasis: A Review. </w:t>
+      </w:r>
+      <w:r>
+        <w:rPr>
+          <w:i/>
+          <w:iCs/>
+        </w:rPr>
+        <w:t>Diabetes</w:t>
+      </w:r>
+      <w:r>
+        <w:t xml:space="preserve">, </w:t>
+      </w:r>
+      <w:r>
+        <w:rPr>
+          <w:i/>
+          <w:iCs/>
+        </w:rPr>
+        <w:t>74</w:t>
+      </w:r>
+      <w:r>
+        <w:t>(12), 2168–2178. https://doi.org/10.2337/db25-0120</w:t>
+      </w:r>
+    </w:p>
+    <w:p>
+      <w:pPr>
+        <w:pStyle w:val="Bibliography"/>
+      </w:pPr>
+      <w:r>
+        <w:t xml:space="preserve">Etxabe, J., &amp; Vazquez, J. A. (1994). Morbidity and mortality in Cushing’s disease: An epidemiological approach. </w:t>
+      </w:r>
+      <w:r>
+        <w:rPr>
+          <w:i/>
+          <w:iCs/>
+        </w:rPr>
+        <w:t>Clin Endocrinol (Oxf)</w:t>
+      </w:r>
+      <w:r>
+        <w:t xml:space="preserve">, </w:t>
+      </w:r>
+      <w:r>
+        <w:rPr>
+          <w:i/>
+          <w:iCs/>
+        </w:rPr>
+        <w:t>40</w:t>
+      </w:r>
+      <w:r>
+        <w:t>(4), 479–484. https://doi.org/10.1111/j.1365-2265.1994.tb02486.x</w:t>
+      </w:r>
+    </w:p>
+    <w:p>
+      <w:pPr>
+        <w:pStyle w:val="Bibliography"/>
+      </w:pPr>
+      <w:r>
+        <w:t xml:space="preserve">Fleseriu, M., Auchus, R., Bancos, I., Ben-Shlomo, A., Bertherat, J., Biermasz, N. R., Boguszewski, C. L., Bronstein, M. D., Buchfelder, M., Carmichael, J. D., Casanueva, F. F., Castinetti, F., Chanson, P., Findling, J., Gadelha, M., Geer, E. B., Giustina, A., </w:t>
+      </w:r>
+      <w:r>
+        <w:lastRenderedPageBreak/>
+        <w:t xml:space="preserve">Grossman, A., Gurnell, M., … Biller, B. M. K. (2021). Consensus on Diagnosis and Management of Cushing’s Disease: A Guideline Update. </w:t>
+      </w:r>
+      <w:r>
+        <w:rPr>
+          <w:i/>
+          <w:iCs/>
+        </w:rPr>
+        <w:t>The Lancet. Diabetes &amp; Endocrinology</w:t>
+      </w:r>
+      <w:r>
+        <w:t xml:space="preserve">, </w:t>
+      </w:r>
+      <w:r>
+        <w:rPr>
+          <w:i/>
+          <w:iCs/>
+        </w:rPr>
+        <w:t>9</w:t>
+      </w:r>
+      <w:r>
+        <w:t>(12), 847–875. https://doi.org/10.1016/S2213-8587(21)00235-7</w:t>
+      </w:r>
+    </w:p>
+    <w:p>
+      <w:pPr>
+        <w:pStyle w:val="Bibliography"/>
+      </w:pPr>
+      <w:r>
+        <w:t xml:space="preserve">Gadelha, M., Gatto, F., Wildemberg, L. E., &amp; Fleseriu, M. (2023). Cushing’s syndrome. </w:t>
+      </w:r>
+      <w:r>
+        <w:rPr>
+          <w:i/>
+          <w:iCs/>
+        </w:rPr>
+        <w:t>The Lancet</w:t>
+      </w:r>
+      <w:r>
+        <w:t xml:space="preserve">, </w:t>
+      </w:r>
+      <w:r>
+        <w:rPr>
+          <w:i/>
+          <w:iCs/>
+        </w:rPr>
+        <w:t>402</w:t>
+      </w:r>
+      <w:r>
+        <w:t>(10418), 2237–2252. https://doi.org/10.1016/S0140-6736(23)01961-X</w:t>
+      </w:r>
+    </w:p>
+    <w:p>
+      <w:pPr>
+        <w:pStyle w:val="Bibliography"/>
+      </w:pPr>
+      <w:r>
+        <w:t xml:space="preserve">Giordano, R., Picu, A., Marinazzo, E., D’Angelo, V., Berardelli, R., Karamouzis, I., Forno, D., Zinnà, D., Maccario, M., Ghigo, E., &amp; Arvat, E. (2011). Metabolic and cardiovascular outcomes in patients with Cushing’s syndrome of different aetiologies during active disease and 1 year after remission. </w:t>
+      </w:r>
+      <w:r>
+        <w:rPr>
+          <w:i/>
+          <w:iCs/>
+        </w:rPr>
+        <w:t>Clinical Endocrinology</w:t>
+      </w:r>
+      <w:r>
+        <w:t xml:space="preserve">, </w:t>
+      </w:r>
+      <w:r>
+        <w:rPr>
+          <w:i/>
+          <w:iCs/>
+        </w:rPr>
+        <w:t>75</w:t>
+      </w:r>
+      <w:r>
+        <w:t>(3), 354–360. https://doi.org/10.1111/j.1365-2265.2011.04055.x</w:t>
+      </w:r>
+    </w:p>
+    <w:p>
+      <w:pPr>
+        <w:pStyle w:val="Bibliography"/>
+      </w:pPr>
+      <w:r>
+        <w:t xml:space="preserve">Gunder, L. C., Harvey, I., Redd, J. R., Davis, C. S., Al-Tamimi, A., Brooks, S. V., &amp; Bridges, D. (2020). Obesity augments glucocorticoid-dependent muscle atrophy in male c57bl/6j mice. </w:t>
+      </w:r>
+      <w:r>
+        <w:rPr>
+          <w:i/>
+          <w:iCs/>
+        </w:rPr>
+        <w:t>Biomedicines</w:t>
+      </w:r>
+      <w:r>
+        <w:t xml:space="preserve">, </w:t>
+      </w:r>
+      <w:r>
+        <w:rPr>
+          <w:i/>
+          <w:iCs/>
+        </w:rPr>
+        <w:t>8</w:t>
+      </w:r>
+      <w:r>
+        <w:t>(10). https://doi.org/10.3390/biomedicines8100420</w:t>
+      </w:r>
+    </w:p>
+    <w:p>
+      <w:pPr>
+        <w:pStyle w:val="Bibliography"/>
+      </w:pPr>
+      <w:r>
+        <w:t xml:space="preserve">Harvey, I., Stephenson, E. J., Redd, J. R., Tran, Q. T., Hochberg, I., Qi, N., &amp; Bridges, D. (2018). Glucocorticoid-Induced Metabolic Disturbances Are Exacerbated in Obese Male Mice. </w:t>
+      </w:r>
+      <w:r>
+        <w:rPr>
+          <w:i/>
+          <w:iCs/>
+        </w:rPr>
+        <w:t>Endocrinology</w:t>
+      </w:r>
+      <w:r>
+        <w:t xml:space="preserve">, </w:t>
+      </w:r>
+      <w:r>
+        <w:rPr>
+          <w:i/>
+          <w:iCs/>
+        </w:rPr>
+        <w:t>159</w:t>
+      </w:r>
+      <w:r>
+        <w:t>(6). https://doi.org/10.1210/en.2018-00147</w:t>
+      </w:r>
+    </w:p>
+    <w:p>
+      <w:pPr>
+        <w:pStyle w:val="Bibliography"/>
+      </w:pPr>
+      <w:r>
+        <w:t xml:space="preserve">Ho, D., Imai, K., King, G., &amp; Stuart, E. A. (2011). MatchIt: Nonparametric Preprocessing for Parametric Causal Inference. </w:t>
+      </w:r>
+      <w:r>
+        <w:rPr>
+          <w:i/>
+          <w:iCs/>
+        </w:rPr>
+        <w:t>Journal of Statistical Software</w:t>
+      </w:r>
+      <w:r>
+        <w:t xml:space="preserve">, </w:t>
+      </w:r>
+      <w:r>
+        <w:rPr>
+          <w:i/>
+          <w:iCs/>
+        </w:rPr>
+        <w:t>42</w:t>
+      </w:r>
+      <w:r>
+        <w:t>, 1–28. https://doi.org/10.18637/jss.v042.i08</w:t>
+      </w:r>
+    </w:p>
+    <w:p>
+      <w:pPr>
+        <w:pStyle w:val="Bibliography"/>
+      </w:pPr>
+      <w:r>
+        <w:t xml:space="preserve">Hochberg, I., Harvey, I., Tran, Q. T., Stephenson, E. J., Barkan, A. L., Saltiel, A. R., Chandler, W. F., &amp; Bridges, D. (2015). Gene expression changes in subcutaneous adipose </w:t>
+      </w:r>
+      <w:r>
+        <w:lastRenderedPageBreak/>
+        <w:t xml:space="preserve">tissue due to Cushing’s disease. </w:t>
+      </w:r>
+      <w:r>
+        <w:rPr>
+          <w:i/>
+          <w:iCs/>
+        </w:rPr>
+        <w:t>Journal of Molecular Endocrinology</w:t>
+      </w:r>
+      <w:r>
+        <w:t xml:space="preserve">, </w:t>
+      </w:r>
+      <w:r>
+        <w:rPr>
+          <w:i/>
+          <w:iCs/>
+        </w:rPr>
+        <w:t>55</w:t>
+      </w:r>
+      <w:r>
+        <w:t>(2), 81–94. https://doi.org/10.1530/JME-15-0119</w:t>
+      </w:r>
+    </w:p>
+    <w:p>
+      <w:pPr>
+        <w:pStyle w:val="Bibliography"/>
+      </w:pPr>
+      <w:r>
+        <w:t xml:space="preserve">Ioachimescu, A. G., Goswami, N., Handa, T., Pappy, A., Veledar, E., &amp; Oyesiku, N. M. (2022). Racial Disparities in Acromegaly and Cushing’s Disease: A Referral Center Study in 241 Patients. </w:t>
+      </w:r>
+      <w:r>
+        <w:rPr>
+          <w:i/>
+          <w:iCs/>
+        </w:rPr>
+        <w:t>Journal of the Endocrine Society</w:t>
+      </w:r>
+      <w:r>
+        <w:t xml:space="preserve">, </w:t>
+      </w:r>
+      <w:r>
+        <w:rPr>
+          <w:i/>
+          <w:iCs/>
+        </w:rPr>
+        <w:t>6</w:t>
+      </w:r>
+      <w:r>
+        <w:t>(1), bvab176. https://doi.org/10.1210/jendso/bvab176</w:t>
+      </w:r>
+    </w:p>
+    <w:p>
+      <w:pPr>
+        <w:pStyle w:val="Bibliography"/>
+      </w:pPr>
+      <w:r>
+        <w:t>Isidori, A. M., Graziadio, C., Paragliola, R. M., Cozzolino, A., Ambrogio, A. G., Colao, A., Corsello, S. M., Pivonello, R., &amp; Group,  on behalf of the A. S. (2015). The hypertension of Cushing’s syndrome: Controversies in...</w:t>
+      </w:r>
+      <w:r>
+        <w:rPr>
+          <w:rFonts w:ascii="Arial" w:hAnsi="Arial" w:cs="Arial"/>
+        </w:rPr>
+        <w:t> </w:t>
+      </w:r>
+      <w:r>
+        <w:t xml:space="preserve">: Journal of Hypertension. </w:t>
+      </w:r>
+      <w:r>
+        <w:rPr>
+          <w:i/>
+          <w:iCs/>
+        </w:rPr>
+        <w:t>Journal of Hypertension</w:t>
+      </w:r>
+      <w:r>
+        <w:t xml:space="preserve">, </w:t>
+      </w:r>
+      <w:r>
+        <w:rPr>
+          <w:i/>
+          <w:iCs/>
+        </w:rPr>
+        <w:t>33</w:t>
+      </w:r>
+      <w:r>
+        <w:t>(1), 44–60. https://doi.org/10.1097/HJH.0000000000000415</w:t>
+      </w:r>
+    </w:p>
+    <w:p>
+      <w:pPr>
+        <w:pStyle w:val="Bibliography"/>
+      </w:pPr>
+      <w:r>
+        <w:t xml:space="preserve">Magiakou, M. A., Smyrnaki, P., &amp; Chrousos, G. P. (2006). Hypertension in Cushing’s syndrome. </w:t>
+      </w:r>
+      <w:r>
+        <w:rPr>
+          <w:i/>
+          <w:iCs/>
+        </w:rPr>
+        <w:t>Best Practice &amp; Research Clinical Endocrinology &amp; Metabolism</w:t>
+      </w:r>
+      <w:r>
+        <w:t xml:space="preserve">, </w:t>
+      </w:r>
+      <w:r>
+        <w:rPr>
+          <w:i/>
+          <w:iCs/>
+        </w:rPr>
+        <w:t>20</w:t>
+      </w:r>
+      <w:r>
+        <w:t>(3), 467–482. https://doi.org/10.1016/j.beem.2006.07.006</w:t>
+      </w:r>
+    </w:p>
+    <w:p>
+      <w:pPr>
+        <w:pStyle w:val="Bibliography"/>
+      </w:pPr>
+      <w:r>
+        <w:t xml:space="preserve">Matthiasdottir, A. M., Hardarson, T. O., Arnardottir, S., &amp; Sigurjonsdottir, H. A. (2024). Cushing’s Disease May Have Higher Incidence than Previously Thought: A Nationwide Study in Iceland 2010–2019. </w:t>
+      </w:r>
+      <w:r>
+        <w:rPr>
+          <w:i/>
+          <w:iCs/>
+        </w:rPr>
+        <w:t>Neuroendocrinology</w:t>
+      </w:r>
+      <w:r>
+        <w:t xml:space="preserve">, </w:t>
+      </w:r>
+      <w:r>
+        <w:rPr>
+          <w:i/>
+          <w:iCs/>
+        </w:rPr>
+        <w:t>114</w:t>
+      </w:r>
+      <w:r>
+        <w:t>(10), 950–957. https://doi.org/10.1159/000540205</w:t>
+      </w:r>
+    </w:p>
+    <w:p>
+      <w:pPr>
+        <w:pStyle w:val="Bibliography"/>
+      </w:pPr>
+      <w:r>
+        <w:t xml:space="preserve">Nieman, L. K. (2002). Diagnostic Tests for Cushing’s Syndrome. </w:t>
+      </w:r>
+      <w:r>
+        <w:rPr>
+          <w:i/>
+          <w:iCs/>
+        </w:rPr>
+        <w:t>Annals of the New York Academy of Sciences</w:t>
+      </w:r>
+      <w:r>
+        <w:t xml:space="preserve">, </w:t>
+      </w:r>
+      <w:r>
+        <w:rPr>
+          <w:i/>
+          <w:iCs/>
+        </w:rPr>
+        <w:t>970</w:t>
+      </w:r>
+      <w:r>
+        <w:t>(1), 112–118. https://doi.org/10.1111/j.1749-6632.2002.tb04417.x</w:t>
+      </w:r>
+    </w:p>
+    <w:p>
+      <w:pPr>
+        <w:pStyle w:val="Bibliography"/>
+      </w:pPr>
+      <w:r>
+        <w:lastRenderedPageBreak/>
+        <w:t xml:space="preserve">Omotosho, Y. B., McGlotten, R., Chittiboina, P., &amp; Nieman, L. (2024). MON-113 Racial Disparity in the Time to Diagnosis of Cushing’s Disease. </w:t>
+      </w:r>
+      <w:r>
+        <w:rPr>
+          <w:i/>
+          <w:iCs/>
+        </w:rPr>
+        <w:t>Journal of the Endocrine Society</w:t>
+      </w:r>
+      <w:r>
+        <w:t xml:space="preserve">, </w:t>
+      </w:r>
+      <w:r>
+        <w:rPr>
+          <w:i/>
+          <w:iCs/>
+        </w:rPr>
+        <w:t>8</w:t>
+      </w:r>
+      <w:r>
+        <w:t>(Supplement_1), bvae163.2408. https://doi.org/10.1210/jendso/bvae163.2408</w:t>
+      </w:r>
+    </w:p>
+    <w:p>
+      <w:pPr>
+        <w:pStyle w:val="Bibliography"/>
+      </w:pPr>
+      <w:r>
+        <w:t xml:space="preserve">Parvanova, A., Reseghetti, E., Abbate, M., &amp; Ruggenenti, P. (2024). Mechanisms and treatment of obesity-related hypertension—Part 1: Mechanisms. </w:t>
+      </w:r>
+      <w:r>
+        <w:rPr>
+          <w:i/>
+          <w:iCs/>
+        </w:rPr>
+        <w:t>Clinical Kidney Journal</w:t>
+      </w:r>
+      <w:r>
+        <w:t xml:space="preserve">, </w:t>
+      </w:r>
+      <w:r>
+        <w:rPr>
+          <w:i/>
+          <w:iCs/>
+        </w:rPr>
+        <w:t>17</w:t>
+      </w:r>
+      <w:r>
+        <w:t>(1), sfad282. https://doi.org/10.1093/ckj/sfad282</w:t>
+      </w:r>
+    </w:p>
+    <w:p>
+      <w:pPr>
+        <w:pStyle w:val="Bibliography"/>
+      </w:pPr>
+      <w:r>
+        <w:t xml:space="preserve">R Core Team. (2019). </w:t>
+      </w:r>
+      <w:r>
+        <w:rPr>
+          <w:i/>
+          <w:iCs/>
+        </w:rPr>
+        <w:t>R: A Language and Environment for Statistical Computing</w:t>
+      </w:r>
+      <w:r>
+        <w:t>. R Foundation for Statistical Computing. http://www.r-project.org/</w:t>
+      </w:r>
+    </w:p>
+    <w:p>
+      <w:pPr>
+        <w:pStyle w:val="Bibliography"/>
+      </w:pPr>
+      <w:r>
+        <w:t xml:space="preserve">Sharma, S. T., Nieman, L. K., &amp; Feelders, R. A. (2015). Cushing’s syndrome: Epidemiology and developments in disease management. </w:t>
+      </w:r>
+      <w:r>
+        <w:rPr>
+          <w:i/>
+          <w:iCs/>
+        </w:rPr>
+        <w:t>Clinical Epidemiology</w:t>
+      </w:r>
+      <w:r>
+        <w:t>, 281–293.</w:t>
+      </w:r>
+    </w:p>
+    <w:p>
+      <w:pPr>
+        <w:pStyle w:val="Bibliography"/>
+      </w:pPr>
+      <w:r>
+        <w:t xml:space="preserve">Steffensen, C., Bak, A. M., Zøylner Rubeck, K., &amp; Jørgensen, J. O. L. (2010). Epidemiology of Cushing’s Syndrome. </w:t>
+      </w:r>
+      <w:r>
+        <w:rPr>
+          <w:i/>
+          <w:iCs/>
+        </w:rPr>
+        <w:t>Neuroendocrinology</w:t>
+      </w:r>
+      <w:r>
+        <w:t xml:space="preserve">, </w:t>
+      </w:r>
+      <w:r>
+        <w:rPr>
+          <w:i/>
+          <w:iCs/>
+        </w:rPr>
+        <w:t>92</w:t>
+      </w:r>
+      <w:r>
+        <w:t>(Suppl. 1), 1–5. https://doi.org/10.1159/000314297</w:t>
+      </w:r>
+    </w:p>
+    <w:p>
+      <w:pPr>
+        <w:pStyle w:val="Bibliography"/>
+      </w:pPr>
+      <w:r>
+        <w:t xml:space="preserve">Zhou, J., Zhang, M., Lu, L., Guo, X., Gao, L., Yan, W., Pang, H., Wang, Y., &amp; Xing, B. (2019). Validity of discharge ICD-10 codes in detecting the etiologies of endogenous Cushing’s syndrome. </w:t>
+      </w:r>
+      <w:r>
+        <w:rPr>
+          <w:i/>
+          <w:iCs/>
+        </w:rPr>
+        <w:t>Endocrine Connections</w:t>
+      </w:r>
+      <w:r>
+        <w:t xml:space="preserve">, </w:t>
+      </w:r>
+      <w:r>
+        <w:rPr>
+          <w:i/>
+          <w:iCs/>
+        </w:rPr>
+        <w:t>8</w:t>
+      </w:r>
+      <w:r>
+        <w:t>(8), 1186–1194. https://doi.org/10.1530/EC-19-0312</w:t>
+      </w:r>
+    </w:p>
+    <w:p>
+      <w:pPr>
+        <w:pStyle w:val="Bibliography"/>
+      </w:pPr>
+      <w:r>
+        <w:t xml:space="preserve">Zillo, M., Barbot, M., Ceccato, F., Camozzi, C., Bilora, F., Casonato, A., Frigo, A., Albiger, N., Daidone, V., Mazzai, M., Mantero, F., &amp; Scaroni, C. (2014). Diagnosis and complications of Cushing’s disease: Gender-related differences. </w:t>
+      </w:r>
+      <w:r>
+        <w:rPr>
+          <w:i/>
+          <w:iCs/>
+        </w:rPr>
+        <w:t>Clinical Endocrinology</w:t>
+      </w:r>
+      <w:r>
+        <w:t xml:space="preserve">, </w:t>
+      </w:r>
+      <w:r>
+        <w:rPr>
+          <w:i/>
+          <w:iCs/>
+        </w:rPr>
+        <w:t>80</w:t>
+      </w:r>
+      <w:r>
+        <w:t>(3), 403–410.</w:t>
+      </w:r>
+    </w:p>
+    <w:p>
+      <w:pPr>
+        <w:pStyle w:val="Bibliography"/>
+        <w:rPr>
+          <w:del w:id="15" w:author="Dave Bridges" w:date="2026-01-22T09:36:00Z" w16du:dateUtc="2026-01-22T14:36:00Z"/>
+        </w:rPr>
+      </w:pPr>
+      <w:r>
+        <w:lastRenderedPageBreak/>
+        <w:fldChar w:fldCharType="end"/>
+      </w:r>
+    </w:p>
+    <w:p>
+      <w:pPr>
+        <w:pStyle w:val="Bibliography"/>
+        <w:ind w:left="0" w:firstLine="0"/>
+        <w:rPr>
+          <w:rPrChange w:id="16" w:author="Dave Bridges" w:date="2026-01-22T09:36:00Z" w16du:dateUtc="2026-01-22T14:36:00Z">
             <w:rPr>
               <w:rFonts w:asciiTheme="majorHAnsi" w:hAnsiTheme="majorHAnsi"/>
               <w:color w:val="000000" w:themeColor="text1"/>
@@ -4010,725 +4261,7 @@
             </w:rPr>
           </w:rPrChange>
         </w:rPr>
-      </w:pPr>
-      <w:r>
-        <w:br w:type="page"/>
-      </w:r>
-    </w:p>
-    <w:p>
-      <w:pPr>
-        <w:pStyle w:val="Heading1"/>
-      </w:pPr>
-      <w:r>
-        <w:lastRenderedPageBreak/>
-        <w:t>References</w:t>
-      </w:r>
-    </w:p>
-    <w:p>
-      <w:pPr>
-        <w:pStyle w:val="Bibliography"/>
-      </w:pPr>
-      <w:r>
-        <w:fldChar w:fldCharType="begin"/>
-      </w:r>
-      <w:r>
-        <w:instrText xml:space="preserve"> ADDIN ZOTERO_BIBL {"uncited":[],"omitted":[],"custom":[]} CSL_BIBLIOGRAPHY </w:instrText>
-      </w:r>
-      <w:r>
-        <w:fldChar w:fldCharType="separate"/>
-      </w:r>
-      <w:r>
-        <w:t xml:space="preserve">Alqeeq, B. F., Ayyad, M., Almadhoun, W. J., Aboabdo, M., Aldahdouh, M. S., Al-Tawil, M., &amp; Al-Ghazali, A. M. (2024). Sex-related differences in Cushing’s disease: A systematic review and meta-analysis. </w:t>
-      </w:r>
-      <w:r>
-        <w:rPr>
-          <w:i/>
-          <w:iCs/>
-        </w:rPr>
-        <w:t>Annals of Saudi Medicine</w:t>
-      </w:r>
-      <w:r>
-        <w:t xml:space="preserve">, </w:t>
-      </w:r>
-      <w:r>
-        <w:rPr>
-          <w:i/>
-          <w:iCs/>
-        </w:rPr>
-        <w:t>44</w:t>
-      </w:r>
-      <w:r>
-        <w:t>(1), 55–65. https://doi.org/10.5144/0256-4947.2024.55</w:t>
-      </w:r>
-    </w:p>
-    <w:p>
-      <w:pPr>
-        <w:pStyle w:val="Bibliography"/>
-      </w:pPr>
-      <w:r>
-        <w:t xml:space="preserve">Braun, L. T., Riester, A., Oßwald-Kopp, A., Fazel, J., Rubinstein, G., Bidlingmaier, M., Beuschlein, F., &amp; Reincke, M. (2019). Toward a Diagnostic Score in Cushing’s Syndrome. </w:t>
-      </w:r>
-      <w:r>
-        <w:rPr>
-          <w:i/>
-          <w:iCs/>
-        </w:rPr>
-        <w:t>Frontiers in Endocrinology</w:t>
-      </w:r>
-      <w:r>
-        <w:t xml:space="preserve">, </w:t>
-      </w:r>
-      <w:r>
-        <w:rPr>
-          <w:i/>
-          <w:iCs/>
-        </w:rPr>
-        <w:t>10</w:t>
-      </w:r>
-      <w:r>
-        <w:t>, 766. https://doi.org/10.3389/fendo.2019.00766</w:t>
-      </w:r>
-    </w:p>
-    <w:p>
-      <w:pPr>
-        <w:pStyle w:val="Bibliography"/>
-      </w:pPr>
-      <w:r>
-        <w:t xml:space="preserve">Broder, M. S., Neary, M. P., Chang, E., Cherepanov, D., &amp; Ludlam, W. H. (2015). Incidence of Cushing’s syndrome and Cushing’s disease in commercially-insured patients &lt;65 years old in the United States. </w:t>
-      </w:r>
-      <w:r>
-        <w:rPr>
-          <w:i/>
-          <w:iCs/>
-        </w:rPr>
-        <w:t>Pituitary</w:t>
-      </w:r>
-      <w:r>
-        <w:t xml:space="preserve">, </w:t>
-      </w:r>
-      <w:r>
-        <w:rPr>
-          <w:i/>
-          <w:iCs/>
-        </w:rPr>
-        <w:t>18</w:t>
-      </w:r>
-      <w:r>
-        <w:t>(3), 283–289. https://doi.org/10.1007/s11102-014-0569-6</w:t>
-      </w:r>
-    </w:p>
-    <w:p>
-      <w:pPr>
-        <w:pStyle w:val="Bibliography"/>
-      </w:pPr>
-      <w:r>
-        <w:t xml:space="preserve">DeFronzo, R. A., &amp; Auchus, R. J. (2025). Cushing Syndrome, Hypercortisolism, and Glucose Homeostasis: A Review. </w:t>
-      </w:r>
-      <w:r>
-        <w:rPr>
-          <w:i/>
-          <w:iCs/>
-        </w:rPr>
-        <w:t>Diabetes</w:t>
-      </w:r>
-      <w:r>
-        <w:t xml:space="preserve">, </w:t>
-      </w:r>
-      <w:r>
-        <w:rPr>
-          <w:i/>
-          <w:iCs/>
-        </w:rPr>
-        <w:t>74</w:t>
-      </w:r>
-      <w:r>
-        <w:t>(12), 2168–2178. https://doi.org/10.2337/db25-0120</w:t>
-      </w:r>
-    </w:p>
-    <w:p>
-      <w:pPr>
-        <w:pStyle w:val="Bibliography"/>
-      </w:pPr>
-      <w:r>
-        <w:t xml:space="preserve">Etxabe, J., &amp; Vazquez, J. A. (1994). Morbidity and mortality in Cushing’s disease: An epidemiological approach. </w:t>
-      </w:r>
-      <w:r>
-        <w:rPr>
-          <w:i/>
-          <w:iCs/>
-        </w:rPr>
-        <w:t>Clin Endocrinol (Oxf)</w:t>
-      </w:r>
-      <w:r>
-        <w:t xml:space="preserve">, </w:t>
-      </w:r>
-      <w:r>
-        <w:rPr>
-          <w:i/>
-          <w:iCs/>
-        </w:rPr>
-        <w:t>40</w:t>
-      </w:r>
-      <w:r>
-        <w:t>(4), 479–484. https://doi.org/10.1111/j.1365-2265.1994.tb02486.x</w:t>
-      </w:r>
-    </w:p>
-    <w:p>
-      <w:pPr>
-        <w:pStyle w:val="Bibliography"/>
-      </w:pPr>
-      <w:r>
-        <w:t xml:space="preserve">Fleseriu, M., Auchus, R., Bancos, I., Ben-Shlomo, A., Bertherat, J., Biermasz, N. R., Boguszewski, C. L., Bronstein, M. D., Buchfelder, M., Carmichael, J. D., Casanueva, F. F., Castinetti, F., Chanson, P., Findling, J., Gadelha, M., Geer, E. B., Giustina, A., </w:t>
-      </w:r>
-      <w:r>
-        <w:lastRenderedPageBreak/>
-        <w:t xml:space="preserve">Grossman, A., Gurnell, M., … Biller, B. M. K. (2021). Consensus on Diagnosis and Management of Cushing’s Disease: A Guideline Update. </w:t>
-      </w:r>
-      <w:r>
-        <w:rPr>
-          <w:i/>
-          <w:iCs/>
-        </w:rPr>
-        <w:t>The Lancet. Diabetes &amp; Endocrinology</w:t>
-      </w:r>
-      <w:r>
-        <w:t xml:space="preserve">, </w:t>
-      </w:r>
-      <w:r>
-        <w:rPr>
-          <w:i/>
-          <w:iCs/>
-        </w:rPr>
-        <w:t>9</w:t>
-      </w:r>
-      <w:r>
-        <w:t>(12), 847–875. https://doi.org/10.1016/S2213-8587(21)00235-7</w:t>
-      </w:r>
-    </w:p>
-    <w:p>
-      <w:pPr>
-        <w:pStyle w:val="Bibliography"/>
-      </w:pPr>
-      <w:r>
-        <w:t xml:space="preserve">Gadelha, M., Gatto, F., Wildemberg, L. E., &amp; Fleseriu, M. (2023). Cushing’s syndrome. </w:t>
-      </w:r>
-      <w:r>
-        <w:rPr>
-          <w:i/>
-          <w:iCs/>
-        </w:rPr>
-        <w:t>The Lancet</w:t>
-      </w:r>
-      <w:r>
-        <w:t xml:space="preserve">, </w:t>
-      </w:r>
-      <w:r>
-        <w:rPr>
-          <w:i/>
-          <w:iCs/>
-        </w:rPr>
-        <w:t>402</w:t>
-      </w:r>
-      <w:r>
-        <w:t>(10418), 2237–2252. https://doi.org/10.1016/S0140-6736(23)01961-X</w:t>
-      </w:r>
-    </w:p>
-    <w:p>
-      <w:pPr>
-        <w:pStyle w:val="Bibliography"/>
-      </w:pPr>
-      <w:r>
-        <w:t xml:space="preserve">Giordano, R., Picu, A., Marinazzo, E., D’Angelo, V., Berardelli, R., Karamouzis, I., Forno, D., Zinnà, D., Maccario, M., Ghigo, E., &amp; Arvat, E. (2011). Metabolic and cardiovascular outcomes in patients with Cushing’s syndrome of different aetiologies during active disease and 1 year after remission. </w:t>
-      </w:r>
-      <w:r>
-        <w:rPr>
-          <w:i/>
-          <w:iCs/>
-        </w:rPr>
-        <w:t>Clinical Endocrinology</w:t>
-      </w:r>
-      <w:r>
-        <w:t xml:space="preserve">, </w:t>
-      </w:r>
-      <w:r>
-        <w:rPr>
-          <w:i/>
-          <w:iCs/>
-        </w:rPr>
-        <w:t>75</w:t>
-      </w:r>
-      <w:r>
-        <w:t>(3), 354–360. https://doi.org/10.1111/j.1365-2265.2011.04055.x</w:t>
-      </w:r>
-    </w:p>
-    <w:p>
-      <w:pPr>
-        <w:pStyle w:val="Bibliography"/>
-      </w:pPr>
-      <w:r>
-        <w:t xml:space="preserve">Gunder, L. C., Harvey, I., Redd, J. R., Davis, C. S., Al-Tamimi, A., Brooks, S. V., &amp; Bridges, D. (2020). Obesity augments glucocorticoid-dependent muscle atrophy in male c57bl/6j mice. </w:t>
-      </w:r>
-      <w:r>
-        <w:rPr>
-          <w:i/>
-          <w:iCs/>
-        </w:rPr>
-        <w:t>Biomedicines</w:t>
-      </w:r>
-      <w:r>
-        <w:t xml:space="preserve">, </w:t>
-      </w:r>
-      <w:r>
-        <w:rPr>
-          <w:i/>
-          <w:iCs/>
-        </w:rPr>
-        <w:t>8</w:t>
-      </w:r>
-      <w:r>
-        <w:t>(10). https://doi.org/10.3390/biomedicines8100420</w:t>
-      </w:r>
-    </w:p>
-    <w:p>
-      <w:pPr>
-        <w:pStyle w:val="Bibliography"/>
-      </w:pPr>
-      <w:r>
-        <w:t xml:space="preserve">Harvey, I., Stephenson, E. J., Redd, J. R., Tran, Q. T., Hochberg, I., Qi, N., &amp; Bridges, D. (2018). Glucocorticoid-Induced Metabolic Disturbances Are Exacerbated in Obese Male Mice. </w:t>
-      </w:r>
-      <w:r>
-        <w:rPr>
-          <w:i/>
-          <w:iCs/>
-        </w:rPr>
-        <w:t>Endocrinology</w:t>
-      </w:r>
-      <w:r>
-        <w:t xml:space="preserve">, </w:t>
-      </w:r>
-      <w:r>
-        <w:rPr>
-          <w:i/>
-          <w:iCs/>
-        </w:rPr>
-        <w:t>159</w:t>
-      </w:r>
-      <w:r>
-        <w:t>(6). https://doi.org/10.1210/en.2018-00147</w:t>
-      </w:r>
-    </w:p>
-    <w:p>
-      <w:pPr>
-        <w:pStyle w:val="Bibliography"/>
-      </w:pPr>
-      <w:r>
-        <w:t xml:space="preserve">Ho, D., Imai, K., King, G., &amp; Stuart, E. A. (2011). MatchIt: Nonparametric Preprocessing for Parametric Causal Inference. </w:t>
-      </w:r>
-      <w:r>
-        <w:rPr>
-          <w:i/>
-          <w:iCs/>
-        </w:rPr>
-        <w:t>Journal of Statistical Software</w:t>
-      </w:r>
-      <w:r>
-        <w:t xml:space="preserve">, </w:t>
-      </w:r>
-      <w:r>
-        <w:rPr>
-          <w:i/>
-          <w:iCs/>
-        </w:rPr>
-        <w:t>42</w:t>
-      </w:r>
-      <w:r>
-        <w:t>, 1–28. https://doi.org/10.18637/jss.v042.i08</w:t>
-      </w:r>
-    </w:p>
-    <w:p>
-      <w:pPr>
-        <w:pStyle w:val="Bibliography"/>
-      </w:pPr>
-      <w:r>
-        <w:t xml:space="preserve">Hochberg, I., Harvey, I., Tran, Q. T., Stephenson, E. J., Barkan, A. L., Saltiel, A. R., Chandler, W. F., &amp; Bridges, D. (2015). Gene expression changes in subcutaneous adipose </w:t>
-      </w:r>
-      <w:r>
-        <w:lastRenderedPageBreak/>
-        <w:t xml:space="preserve">tissue due to Cushing’s disease. </w:t>
-      </w:r>
-      <w:r>
-        <w:rPr>
-          <w:i/>
-          <w:iCs/>
-        </w:rPr>
-        <w:t>Journal of Molecular Endocrinology</w:t>
-      </w:r>
-      <w:r>
-        <w:t xml:space="preserve">, </w:t>
-      </w:r>
-      <w:r>
-        <w:rPr>
-          <w:i/>
-          <w:iCs/>
-        </w:rPr>
-        <w:t>55</w:t>
-      </w:r>
-      <w:r>
-        <w:t>(2), 81–94. https://doi.org/10.1530/JME-15-0119</w:t>
-      </w:r>
-    </w:p>
-    <w:p>
-      <w:pPr>
-        <w:pStyle w:val="Bibliography"/>
-      </w:pPr>
-      <w:r>
-        <w:t xml:space="preserve">Ioachimescu, A. G., Goswami, N., Handa, T., Pappy, A., Veledar, E., &amp; Oyesiku, N. M. (2022). Racial Disparities in Acromegaly and Cushing’s Disease: A Referral Center Study in 241 Patients. </w:t>
-      </w:r>
-      <w:r>
-        <w:rPr>
-          <w:i/>
-          <w:iCs/>
-        </w:rPr>
-        <w:t>Journal of the Endocrine Society</w:t>
-      </w:r>
-      <w:r>
-        <w:t xml:space="preserve">, </w:t>
-      </w:r>
-      <w:r>
-        <w:rPr>
-          <w:i/>
-          <w:iCs/>
-        </w:rPr>
-        <w:t>6</w:t>
-      </w:r>
-      <w:r>
-        <w:t>(1), bvab176. https://doi.org/10.1210/jendso/bvab176</w:t>
-      </w:r>
-    </w:p>
-    <w:p>
-      <w:pPr>
-        <w:pStyle w:val="Bibliography"/>
-      </w:pPr>
-      <w:r>
-        <w:t>Isidori, A. M., Graziadio, C., Paragliola, R. M., Cozzolino, A., Ambrogio, A. G., Colao, A., Corsello, S. M., Pivonello, R., &amp; Group,  on behalf of the A. S. (2015). The hypertension of Cushing’s syndrome: Controversies in...</w:t>
-      </w:r>
-      <w:r>
-        <w:rPr>
-          <w:rFonts w:ascii="Arial" w:hAnsi="Arial" w:cs="Arial"/>
-        </w:rPr>
-        <w:t> </w:t>
-      </w:r>
-      <w:r>
-        <w:t xml:space="preserve">: Journal of Hypertension. </w:t>
-      </w:r>
-      <w:r>
-        <w:rPr>
-          <w:i/>
-          <w:iCs/>
-        </w:rPr>
-        <w:t>Journal of Hypertension</w:t>
-      </w:r>
-      <w:r>
-        <w:t xml:space="preserve">, </w:t>
-      </w:r>
-      <w:r>
-        <w:rPr>
-          <w:i/>
-          <w:iCs/>
-        </w:rPr>
-        <w:t>33</w:t>
-      </w:r>
-      <w:r>
-        <w:t>(1), 44–60. https://doi.org/10.1097/HJH.0000000000000415</w:t>
-      </w:r>
-    </w:p>
-    <w:p>
-      <w:pPr>
-        <w:pStyle w:val="Bibliography"/>
-      </w:pPr>
-      <w:r>
-        <w:t xml:space="preserve">Magiakou, M. A., Smyrnaki, P., &amp; Chrousos, G. P. (2006). Hypertension in Cushing’s syndrome. </w:t>
-      </w:r>
-      <w:r>
-        <w:rPr>
-          <w:i/>
-          <w:iCs/>
-        </w:rPr>
-        <w:t>Best Practice &amp; Research Clinical Endocrinology &amp; Metabolism</w:t>
-      </w:r>
-      <w:r>
-        <w:t xml:space="preserve">, </w:t>
-      </w:r>
-      <w:r>
-        <w:rPr>
-          <w:i/>
-          <w:iCs/>
-        </w:rPr>
-        <w:t>20</w:t>
-      </w:r>
-      <w:r>
-        <w:t>(3), 467–482. https://doi.org/10.1016/j.beem.2006.07.006</w:t>
-      </w:r>
-    </w:p>
-    <w:p>
-      <w:pPr>
-        <w:pStyle w:val="Bibliography"/>
-      </w:pPr>
-      <w:r>
-        <w:t xml:space="preserve">Matthiasdottir, A. M., Hardarson, T. O., Arnardottir, S., &amp; Sigurjonsdottir, H. A. (2024). Cushing’s Disease May Have Higher Incidence than Previously Thought: A Nationwide Study in Iceland 2010–2019. </w:t>
-      </w:r>
-      <w:r>
-        <w:rPr>
-          <w:i/>
-          <w:iCs/>
-        </w:rPr>
-        <w:t>Neuroendocrinology</w:t>
-      </w:r>
-      <w:r>
-        <w:t xml:space="preserve">, </w:t>
-      </w:r>
-      <w:r>
-        <w:rPr>
-          <w:i/>
-          <w:iCs/>
-        </w:rPr>
-        <w:t>114</w:t>
-      </w:r>
-      <w:r>
-        <w:t>(10), 950–957. https://doi.org/10.1159/000540205</w:t>
-      </w:r>
-    </w:p>
-    <w:p>
-      <w:pPr>
-        <w:pStyle w:val="Bibliography"/>
-      </w:pPr>
-      <w:r>
-        <w:t xml:space="preserve">Nieman, L. K. (2002). Diagnostic Tests for Cushing’s Syndrome. </w:t>
-      </w:r>
-      <w:r>
-        <w:rPr>
-          <w:i/>
-          <w:iCs/>
-        </w:rPr>
-        <w:t>Annals of the New York Academy of Sciences</w:t>
-      </w:r>
-      <w:r>
-        <w:t xml:space="preserve">, </w:t>
-      </w:r>
-      <w:r>
-        <w:rPr>
-          <w:i/>
-          <w:iCs/>
-        </w:rPr>
-        <w:t>970</w:t>
-      </w:r>
-      <w:r>
-        <w:t>(1), 112–118. https://doi.org/10.1111/j.1749-6632.2002.tb04417.x</w:t>
-      </w:r>
-    </w:p>
-    <w:p>
-      <w:pPr>
-        <w:pStyle w:val="Bibliography"/>
-      </w:pPr>
-      <w:r>
-        <w:lastRenderedPageBreak/>
-        <w:t xml:space="preserve">Omotosho, Y. B., McGlotten, R., Chittiboina, P., &amp; Nieman, L. (2024). MON-113 Racial Disparity in the Time to Diagnosis of Cushing’s Disease. </w:t>
-      </w:r>
-      <w:r>
-        <w:rPr>
-          <w:i/>
-          <w:iCs/>
-        </w:rPr>
-        <w:t>Journal of the Endocrine Society</w:t>
-      </w:r>
-      <w:r>
-        <w:t xml:space="preserve">, </w:t>
-      </w:r>
-      <w:r>
-        <w:rPr>
-          <w:i/>
-          <w:iCs/>
-        </w:rPr>
-        <w:t>8</w:t>
-      </w:r>
-      <w:r>
-        <w:t>(Supplement_1), bvae163.2408. https://doi.org/10.1210/jendso/bvae163.2408</w:t>
-      </w:r>
-    </w:p>
-    <w:p>
-      <w:pPr>
-        <w:pStyle w:val="Bibliography"/>
-      </w:pPr>
-      <w:r>
-        <w:t xml:space="preserve">Parvanova, A., Reseghetti, E., Abbate, M., &amp; Ruggenenti, P. (2024). Mechanisms and treatment of obesity-related hypertension—Part 1: Mechanisms. </w:t>
-      </w:r>
-      <w:r>
-        <w:rPr>
-          <w:i/>
-          <w:iCs/>
-        </w:rPr>
-        <w:t>Clinical Kidney Journal</w:t>
-      </w:r>
-      <w:r>
-        <w:t xml:space="preserve">, </w:t>
-      </w:r>
-      <w:r>
-        <w:rPr>
-          <w:i/>
-          <w:iCs/>
-        </w:rPr>
-        <w:t>17</w:t>
-      </w:r>
-      <w:r>
-        <w:t>(1), sfad282. https://doi.org/10.1093/ckj/sfad282</w:t>
-      </w:r>
-    </w:p>
-    <w:p>
-      <w:pPr>
-        <w:pStyle w:val="Bibliography"/>
-      </w:pPr>
-      <w:r>
-        <w:t xml:space="preserve">R Core Team. (2019). </w:t>
-      </w:r>
-      <w:r>
-        <w:rPr>
-          <w:i/>
-          <w:iCs/>
-        </w:rPr>
-        <w:t>R: A Language and Environment for Statistical Computing</w:t>
-      </w:r>
-      <w:r>
-        <w:t>. R Foundation for Statistical Computing. http://www.r-project.org/</w:t>
-      </w:r>
-    </w:p>
-    <w:p>
-      <w:pPr>
-        <w:pStyle w:val="Bibliography"/>
-      </w:pPr>
-      <w:r>
-        <w:t xml:space="preserve">Sharma, S. T., Nieman, L. K., &amp; Feelders, R. A. (2015). Cushing’s syndrome: Epidemiology and developments in disease management. </w:t>
-      </w:r>
-      <w:r>
-        <w:rPr>
-          <w:i/>
-          <w:iCs/>
-        </w:rPr>
-        <w:t>Clinical Epidemiology</w:t>
-      </w:r>
-      <w:r>
-        <w:t>, 281–293.</w:t>
-      </w:r>
-    </w:p>
-    <w:p>
-      <w:pPr>
-        <w:pStyle w:val="Bibliography"/>
-      </w:pPr>
-      <w:r>
-        <w:t xml:space="preserve">Steffensen, C., Bak, A. M., Zøylner Rubeck, K., &amp; Jørgensen, J. O. L. (2010). Epidemiology of Cushing’s Syndrome. </w:t>
-      </w:r>
-      <w:r>
-        <w:rPr>
-          <w:i/>
-          <w:iCs/>
-        </w:rPr>
-        <w:t>Neuroendocrinology</w:t>
-      </w:r>
-      <w:r>
-        <w:t xml:space="preserve">, </w:t>
-      </w:r>
-      <w:r>
-        <w:rPr>
-          <w:i/>
-          <w:iCs/>
-        </w:rPr>
-        <w:t>92</w:t>
-      </w:r>
-      <w:r>
-        <w:t>(Suppl. 1), 1–5. https://doi.org/10.1159/000314297</w:t>
-      </w:r>
-    </w:p>
-    <w:p>
-      <w:pPr>
-        <w:pStyle w:val="Bibliography"/>
-      </w:pPr>
-      <w:r>
-        <w:t xml:space="preserve">Zhou, J., Zhang, M., Lu, L., Guo, X., Gao, L., Yan, W., Pang, H., Wang, Y., &amp; Xing, B. (2019). Validity of discharge ICD-10 codes in detecting the etiologies of endogenous Cushing’s syndrome. </w:t>
-      </w:r>
-      <w:r>
-        <w:rPr>
-          <w:i/>
-          <w:iCs/>
-        </w:rPr>
-        <w:t>Endocrine Connections</w:t>
-      </w:r>
-      <w:r>
-        <w:t xml:space="preserve">, </w:t>
-      </w:r>
-      <w:r>
-        <w:rPr>
-          <w:i/>
-          <w:iCs/>
-        </w:rPr>
-        <w:t>8</w:t>
-      </w:r>
-      <w:r>
-        <w:t>(8), 1186–1194. https://doi.org/10.1530/EC-19-0312</w:t>
-      </w:r>
-    </w:p>
-    <w:p>
-      <w:pPr>
-        <w:pStyle w:val="Bibliography"/>
-      </w:pPr>
-      <w:r>
-        <w:t xml:space="preserve">Zillo, M., Barbot, M., Ceccato, F., Camozzi, C., Bilora, F., Casonato, A., Frigo, A., Albiger, N., Daidone, V., Mazzai, M., Mantero, F., &amp; Scaroni, C. (2014). Diagnosis and complications of Cushing’s disease: Gender-related differences. </w:t>
-      </w:r>
-      <w:r>
-        <w:rPr>
-          <w:i/>
-          <w:iCs/>
-        </w:rPr>
-        <w:t>Clinical Endocrinology</w:t>
-      </w:r>
-      <w:r>
-        <w:t xml:space="preserve">, </w:t>
-      </w:r>
-      <w:r>
-        <w:rPr>
-          <w:i/>
-          <w:iCs/>
-        </w:rPr>
-        <w:t>80</w:t>
-      </w:r>
-      <w:r>
-        <w:t>(3), 403–410.</w:t>
-      </w:r>
-    </w:p>
-    <w:p>
-      <w:pPr>
-        <w:pStyle w:val="Bibliography"/>
-        <w:rPr>
-          <w:del w:id="96" w:author="Dave Bridges" w:date="2026-01-22T09:36:00Z" w16du:dateUtc="2026-01-22T14:36:00Z"/>
-        </w:rPr>
-      </w:pPr>
-      <w:r>
-        <w:lastRenderedPageBreak/>
-        <w:fldChar w:fldCharType="end"/>
-      </w:r>
-    </w:p>
-    <w:p>
-      <w:pPr>
-        <w:pStyle w:val="Bibliography"/>
-        <w:ind w:left="0" w:firstLine="0"/>
-        <w:rPr>
-          <w:rPrChange w:id="97" w:author="Dave Bridges" w:date="2026-01-22T09:36:00Z" w16du:dateUtc="2026-01-22T14:36:00Z">
-            <w:rPr>
-              <w:rFonts w:asciiTheme="majorHAnsi" w:hAnsiTheme="majorHAnsi"/>
-              <w:color w:val="000000" w:themeColor="text1"/>
-              <w:sz w:val="40"/>
-            </w:rPr>
-          </w:rPrChange>
-        </w:rPr>
-        <w:pPrChange w:id="98" w:author="Dave Bridges" w:date="2026-01-22T09:36:00Z" w16du:dateUtc="2026-01-22T14:36:00Z">
+        <w:pPrChange w:id="17" w:author="Dave Bridges" w:date="2026-01-22T09:36:00Z" w16du:dateUtc="2026-01-22T14:36:00Z">
           <w:pPr/>
         </w:pPrChange>
       </w:pPr>
@@ -5294,7 +4827,7 @@
       </w:r>
     </w:p>
   </w:comment>
-  <w:comment w:id="19" w:author="עירית הוכברג" w:date="2026-01-18T15:42:00Z" w:initials="עה">
+  <w:comment w:id="2" w:author="עירית הוכברג" w:date="2026-01-18T15:42:00Z" w:initials="עה">
     <w:p>
       <w:pPr>
         <w:pStyle w:val="CommentText"/>
@@ -5314,7 +4847,7 @@
       </w:r>
     </w:p>
   </w:comment>
-  <w:comment w:id="20" w:author="עירית הוכברג" w:date="2026-01-18T15:50:00Z" w:initials="עה">
+  <w:comment w:id="3" w:author="עירית הוכברג" w:date="2026-01-18T15:50:00Z" w:initials="עה">
     <w:p>
       <w:pPr>
         <w:pStyle w:val="CommentText"/>
@@ -5336,7 +4869,7 @@
       </w:r>
     </w:p>
   </w:comment>
-  <w:comment w:id="23" w:author="עירית הוכברג" w:date="2026-01-18T15:55:00Z" w:initials="עה">
+  <w:comment w:id="5" w:author="עירית הוכברג" w:date="2026-01-18T15:55:00Z" w:initials="עה">
     <w:p>
       <w:pPr>
         <w:pStyle w:val="CommentText"/>
@@ -5364,7 +4897,7 @@
       </w:r>
     </w:p>
   </w:comment>
-  <w:comment w:id="37" w:author="עירית הוכברג" w:date="2026-01-22T14:56:00Z" w:initials="עה">
+  <w:comment w:id="8" w:author="עירית הוכברג" w:date="2026-01-22T15:15:00Z" w:initials="עה">
     <w:p>
       <w:pPr>
         <w:pStyle w:val="CommentText"/>
@@ -5376,11 +4909,11 @@
         <w:annotationRef/>
       </w:r>
       <w:r>
-        <w:t>Do you have a record of diabetes medications for these patients? Can you exclude that they are getting more treatment?</w:t>
+        <w:t>This sentence is not clear</w:t>
       </w:r>
     </w:p>
   </w:comment>
-  <w:comment w:id="58" w:author="עירית הוכברג" w:date="2026-01-22T15:15:00Z" w:initials="עה">
+  <w:comment w:id="9" w:author="עירית הוכברג" w:date="2026-01-22T15:47:00Z" w:initials="עה">
     <w:p>
       <w:pPr>
         <w:pStyle w:val="CommentText"/>
@@ -5392,59 +4925,43 @@
         <w:annotationRef/>
       </w:r>
       <w:r>
+        <w:t xml:space="preserve">I'd add an analysis of </w:t>
+      </w:r>
+    </w:p>
+  </w:comment>
+  <w:comment w:id="10" w:author="עירית הוכברג" w:date="2026-01-22T15:17:00Z" w:initials="עה">
+    <w:p>
+      <w:pPr>
+        <w:pStyle w:val="CommentText"/>
+      </w:pPr>
+      <w:r>
+        <w:rPr>
+          <w:rStyle w:val="CommentReference"/>
+        </w:rPr>
+        <w:annotationRef/>
+      </w:r>
+      <w:r>
+        <w:t>Do you have a record of antihypertensive medications for these patients? Can you exclude that they are getting more treatment?</w:t>
+      </w:r>
+    </w:p>
+  </w:comment>
+  <w:comment w:id="11" w:author="עירית הוכברג" w:date="2026-01-22T15:40:00Z" w:initials="עה">
+    <w:p>
+      <w:pPr>
+        <w:pStyle w:val="CommentText"/>
+      </w:pPr>
+      <w:r>
+        <w:rPr>
+          <w:rStyle w:val="CommentReference"/>
+        </w:rPr>
+        <w:annotationRef/>
+      </w:r>
+      <w:r>
         <w:t>This sentence is not clear</w:t>
       </w:r>
     </w:p>
   </w:comment>
-  <w:comment w:id="59" w:author="עירית הוכברג" w:date="2026-01-22T15:47:00Z" w:initials="עה">
-    <w:p>
-      <w:pPr>
-        <w:pStyle w:val="CommentText"/>
-      </w:pPr>
-      <w:r>
-        <w:rPr>
-          <w:rStyle w:val="CommentReference"/>
-        </w:rPr>
-        <w:annotationRef/>
-      </w:r>
-      <w:r>
-        <w:t xml:space="preserve">I'd add an analysis of </w:t>
-      </w:r>
-    </w:p>
-  </w:comment>
-  <w:comment w:id="63" w:author="עירית הוכברג" w:date="2026-01-22T15:17:00Z" w:initials="עה">
-    <w:p>
-      <w:pPr>
-        <w:pStyle w:val="CommentText"/>
-      </w:pPr>
-      <w:r>
-        <w:rPr>
-          <w:rStyle w:val="CommentReference"/>
-        </w:rPr>
-        <w:annotationRef/>
-      </w:r>
-      <w:r>
-        <w:t>Do you have a record of antihypertensive medications for these patients? Can you exclude that they are getting more treatment?</w:t>
-      </w:r>
-    </w:p>
-  </w:comment>
-  <w:comment w:id="70" w:author="עירית הוכברג" w:date="2026-01-22T15:40:00Z" w:initials="עה">
-    <w:p>
-      <w:pPr>
-        <w:pStyle w:val="CommentText"/>
-      </w:pPr>
-      <w:r>
-        <w:rPr>
-          <w:rStyle w:val="CommentReference"/>
-        </w:rPr>
-        <w:annotationRef/>
-      </w:r>
-      <w:r>
-        <w:t>This sentence is not clear</w:t>
-      </w:r>
-    </w:p>
-  </w:comment>
-  <w:comment w:id="76" w:author="עירית הוכברג" w:date="2026-01-22T15:41:00Z" w:initials="עה">
+  <w:comment w:id="12" w:author="עירית הוכברג" w:date="2026-01-22T15:41:00Z" w:initials="עה">
     <w:p>
       <w:pPr>
         <w:pStyle w:val="CommentText"/>
@@ -5470,7 +4987,6 @@
   <w15:commentEx w15:paraId="4D989FD8" w15:done="1"/>
   <w15:commentEx w15:paraId="121C35DD" w15:done="1"/>
   <w15:commentEx w15:paraId="5AB7D093" w15:done="0"/>
-  <w15:commentEx w15:paraId="1F6A3FB1" w15:done="0"/>
   <w15:commentEx w15:paraId="22980CB0" w15:done="0"/>
   <w15:commentEx w15:paraId="0A825E73" w15:done="0"/>
   <w15:commentEx w15:paraId="61F5E9D2" w15:done="0"/>
@@ -5492,7 +5008,6 @@
   <w16cid:commentId w16cid:paraId="4D989FD8" w16cid:durableId="4D989FD8"/>
   <w16cid:commentId w16cid:paraId="121C35DD" w16cid:durableId="121C35DD"/>
   <w16cid:commentId w16cid:paraId="5AB7D093" w16cid:durableId="5AB7D093"/>
-  <w16cid:commentId w16cid:paraId="1F6A3FB1" w16cid:durableId="1F6A3FB1"/>
   <w16cid:commentId w16cid:paraId="22980CB0" w16cid:durableId="22980CB0"/>
   <w16cid:commentId w16cid:paraId="0A825E73" w16cid:durableId="0A825E73"/>
   <w16cid:commentId w16cid:paraId="61F5E9D2" w16cid:durableId="61F5E9D2"/>

</xml_diff>

<commit_message>
Minor changes in formatting
</commit_message>
<xml_diff>
--- a/manuscript/Cushings-Obesity/manuscript.docx
+++ b/manuscript/Cushings-Obesity/manuscript.docx
@@ -14,6 +14,22 @@
       </w:r>
       <w:r>
         <w:t xml:space="preserve"> </w:t>
+      </w:r>
+    </w:p>
+    <w:p/>
+    <w:p>
+      <w:pPr>
+        <w:rPr>
+          <w:b/>
+          <w:bCs/>
+        </w:rPr>
+      </w:pPr>
+      <w:r>
+        <w:rPr>
+          <w:b/>
+          <w:bCs/>
+        </w:rPr>
+        <w:t xml:space="preserve">Short Title: </w:t>
       </w:r>
     </w:p>
     <w:p/>
@@ -841,7 +857,13 @@
         <w:t>did not have a Cushing’s disease diagnosis, treatment date, lab history, or relevant demographic data documented.</w:t>
       </w:r>
       <w:r>
-        <w:t xml:space="preserve"> Race and ethnicity were self-reported, with groups of &lt;10 aggregated into the other</w:t>
+        <w:t xml:space="preserve"> </w:t>
+      </w:r>
+      <w:r>
+        <w:t xml:space="preserve">Patients without a treatment date were excluded to ensure lab results were measured prior to and not after treatments.  </w:t>
+      </w:r>
+      <w:r>
+        <w:t>Race and ethnicity were self-reported, with groups of &lt;10 aggregated into the other</w:t>
       </w:r>
       <w:r>
         <w:t xml:space="preserve"> reported</w:t>
@@ -988,6 +1010,7 @@
         <w:t xml:space="preserve">) with age in the </w:t>
       </w:r>
       <w:r>
+        <w:lastRenderedPageBreak/>
         <w:t>propensity score</w:t>
       </w:r>
       <w:r>
@@ -997,7 +1020,6 @@
         <w:t xml:space="preserve"> from a pool of </w:t>
       </w:r>
       <w:r>
-        <w:lastRenderedPageBreak/>
         <w:t>98,436</w:t>
       </w:r>
       <w:r>
@@ -1202,7 +1224,18 @@
         <w:t>.</w:t>
       </w:r>
       <w:r>
-        <w:t xml:space="preserve"> All code used for this analysis is available at https://github.com/BridgesLab/CushingAcromegalyStudy.</w:t>
+        <w:t xml:space="preserve"> All code used for this analysis is available at </w:t>
+      </w:r>
+      <w:hyperlink r:id="rId10" w:history="1">
+        <w:r>
+          <w:rPr>
+            <w:rStyle w:val="Hyperlink"/>
+          </w:rPr>
+          <w:t>https://github.com/BridgesLab/CushingAcromegalyStudy</w:t>
+        </w:r>
+      </w:hyperlink>
+      <w:r>
+        <w:t>.</w:t>
       </w:r>
       <w:r>
         <w:rPr>
@@ -1275,6 +1308,7 @@
         <w:t xml:space="preserve">Next, we eliminated participants that did not have a documented </w:t>
       </w:r>
       <w:commentRangeStart w:id="5"/>
+      <w:commentRangeStart w:id="6"/>
       <w:r>
         <w:t>treatment</w:t>
       </w:r>
@@ -1287,6 +1321,15 @@
         </w:rPr>
         <w:commentReference w:id="5"/>
       </w:r>
+      <w:commentRangeEnd w:id="6"/>
+      <w:r>
+        <w:rPr>
+          <w:rStyle w:val="CommentReference"/>
+          <w:sz w:val="24"/>
+          <w:szCs w:val="24"/>
+        </w:rPr>
+        <w:commentReference w:id="6"/>
+      </w:r>
       <w:r>
         <w:t xml:space="preserve"> date after their diagnosis, giving us 476 participants. We then removed participants that did not have any</w:t>
       </w:r>
@@ -2315,26 +2358,6 @@
       </w:r>
       <w:r>
         <w:t>with Cushing's disease compared to controls</w:t>
-      </w:r>
-      <w:ins w:id="6" w:author="Irit Hochberg" w:date="2026-01-22T09:36:00Z" w16du:dateUtc="2026-01-22T14:36:00Z">
-        <w:r>
-          <w:t xml:space="preserve"> </w:t>
-        </w:r>
-      </w:ins>
-      <w:r>
-        <w:t>(</w:t>
-      </w:r>
-      <w:r>
-        <w:t xml:space="preserve">0.91%; </w:t>
-      </w:r>
-      <w:r>
-        <w:t xml:space="preserve">p=0.056). However, there was evidence of a significant increase in HbA1c levels </w:t>
-      </w:r>
-      <w:r>
-        <w:t xml:space="preserve">in patients with obesity </w:t>
-      </w:r>
-      <w:r>
-        <w:t>and Cushing's disease compared to controls</w:t>
       </w:r>
       <w:ins w:id="7" w:author="Irit Hochberg" w:date="2026-01-22T09:36:00Z" w16du:dateUtc="2026-01-22T14:36:00Z">
         <w:r>
@@ -2345,690 +2368,631 @@
         <w:t>(</w:t>
       </w:r>
       <w:r>
-        <w:t xml:space="preserve">1.38% </w:t>
-      </w:r>
-      <w:r>
-        <w:t>p</w:t>
-      </w:r>
-      <w:r>
-        <w:t>&lt;0.01</w:t>
-      </w:r>
-      <w:r>
-        <w:t>)</w:t>
-      </w:r>
-      <w:r>
-        <w:t xml:space="preserve"> (Table 3A</w:t>
-      </w:r>
-      <w:r>
-        <w:t>).</w:t>
-      </w:r>
-      <w:r>
-        <w:t xml:space="preserve"> </w:t>
-      </w:r>
-      <w:r>
-        <w:t>Again</w:t>
-      </w:r>
-      <w:r>
-        <w:t>,</w:t>
-      </w:r>
-      <w:r>
-        <w:t xml:space="preserve"> there was no evidence of effect modification by obesity (p=0.41)</w:t>
-      </w:r>
-      <w:r>
-        <w:t xml:space="preserve">.  </w:t>
-      </w:r>
-      <w:commentRangeStart w:id="8"/>
-      <w:r>
-        <w:t>This</w:t>
-      </w:r>
-      <w:commentRangeEnd w:id="8"/>
-      <w:r>
-        <w:rPr>
-          <w:rStyle w:val="CommentReference"/>
-          <w:sz w:val="24"/>
-          <w:szCs w:val="24"/>
-        </w:rPr>
-        <w:commentReference w:id="8"/>
-      </w:r>
-      <w:r>
-        <w:t xml:space="preserve"> suggests that blood glucose increases with Cushing’s disease are largely </w:t>
-      </w:r>
-      <w:commentRangeStart w:id="9"/>
-      <w:r>
-        <w:t>additive</w:t>
-      </w:r>
-      <w:commentRangeEnd w:id="9"/>
-      <w:r>
-        <w:rPr>
-          <w:rStyle w:val="CommentReference"/>
-          <w:sz w:val="24"/>
-          <w:szCs w:val="24"/>
-        </w:rPr>
-        <w:commentReference w:id="9"/>
-      </w:r>
-      <w:r>
-        <w:t>.</w:t>
-      </w:r>
-    </w:p>
-    <w:p>
-      <w:pPr>
-        <w:pStyle w:val="Heading3"/>
-      </w:pPr>
-      <w:r>
-        <w:t>MASLD and liver enzymes</w:t>
-      </w:r>
-    </w:p>
-    <w:p>
-      <w:r>
-        <w:t xml:space="preserve">To </w:t>
-      </w:r>
-      <w:r>
-        <w:t>assess</w:t>
-      </w:r>
-      <w:r>
-        <w:t xml:space="preserve"> </w:t>
-      </w:r>
-      <w:r>
-        <w:t>MASLD</w:t>
-      </w:r>
-      <w:r>
-        <w:t xml:space="preserve"> we looked at ALT </w:t>
-      </w:r>
-      <w:r>
-        <w:t xml:space="preserve">and AST levels </w:t>
-      </w:r>
-      <w:r>
-        <w:t>(Figure 2 and Table 3A)</w:t>
-      </w:r>
-      <w:r>
-        <w:t xml:space="preserve">. In both our obese and non-obese populations, we saw an increase in ALT </w:t>
-      </w:r>
-      <w:r>
-        <w:t>and AST</w:t>
-      </w:r>
-      <w:r>
-        <w:t xml:space="preserve"> </w:t>
-      </w:r>
-      <w:r>
-        <w:t>levels regardless of Cushing’s disease status</w:t>
-      </w:r>
-      <w:r>
-        <w:t xml:space="preserve"> </w:t>
-      </w:r>
-      <w:r>
-        <w:t>(p</w:t>
-      </w:r>
-      <w:r>
-        <w:t>&lt;0.0</w:t>
-      </w:r>
-      <w:r>
-        <w:t>1 for both groups</w:t>
-      </w:r>
-      <w:r>
-        <w:t xml:space="preserve">). </w:t>
-      </w:r>
-      <w:r>
-        <w:t xml:space="preserve">In </w:t>
-      </w:r>
-      <w:r>
-        <w:t>the</w:t>
-      </w:r>
-      <w:r>
-        <w:t xml:space="preserve"> case</w:t>
-      </w:r>
-      <w:r>
-        <w:t xml:space="preserve"> of ALT levels</w:t>
-      </w:r>
-      <w:r>
-        <w:t>, the</w:t>
-      </w:r>
-      <w:r>
-        <w:t xml:space="preserve"> increase </w:t>
-      </w:r>
-      <w:r>
-        <w:t xml:space="preserve">due to Cushing’s disease was much greater in the patients with obesity </w:t>
-      </w:r>
-      <w:r>
-        <w:t>(</w:t>
-      </w:r>
-      <w:r>
-        <w:t>73.4 vs 35.1 mg/dL, p</w:t>
-      </w:r>
-      <w:r>
-        <w:rPr>
-          <w:vertAlign w:val="subscript"/>
-        </w:rPr>
-        <w:t>interaction</w:t>
-      </w:r>
-      <w:r>
-        <w:t>&lt;0.01</w:t>
-      </w:r>
-      <w:r>
-        <w:t>).</w:t>
-      </w:r>
-      <w:r>
-        <w:t xml:space="preserve">  This was also true for AST levels (increase by 56.3 mg/dL in patients </w:t>
-      </w:r>
-      <w:r>
-        <w:lastRenderedPageBreak/>
-        <w:t>with obesity and 16.9 for patients without obesity,</w:t>
-      </w:r>
-      <w:r>
-        <w:t xml:space="preserve"> </w:t>
-      </w:r>
-      <w:r>
-        <w:t>p</w:t>
-      </w:r>
-      <w:r>
-        <w:rPr>
-          <w:vertAlign w:val="subscript"/>
-        </w:rPr>
-        <w:t>interaction</w:t>
-      </w:r>
-      <w:r>
-        <w:t>=0.034).  These data support the hypothesis</w:t>
-      </w:r>
-      <w:r>
-        <w:t xml:space="preserve"> that obesity </w:t>
-      </w:r>
-      <w:r>
-        <w:t xml:space="preserve">enhances </w:t>
-      </w:r>
-      <w:r>
-        <w:t xml:space="preserve">liver damage associated with </w:t>
-      </w:r>
-      <w:r>
-        <w:t xml:space="preserve">Cushing’s </w:t>
-      </w:r>
-      <w:r>
-        <w:t>disease.</w:t>
-      </w:r>
-    </w:p>
-    <w:p>
-      <w:pPr>
-        <w:pStyle w:val="Heading3"/>
-      </w:pPr>
-      <w:r>
-        <w:t>Blood Pressure</w:t>
-      </w:r>
-    </w:p>
-    <w:p>
-      <w:r>
-        <w:t xml:space="preserve">We </w:t>
-      </w:r>
-      <w:r>
-        <w:t>evaluated</w:t>
-      </w:r>
-      <w:r>
-        <w:t xml:space="preserve"> blood pressure readings as systolic, diastolic and mean arterial </w:t>
-      </w:r>
-      <w:r>
-        <w:t>pressures (</w:t>
-      </w:r>
-      <w:r>
-        <w:t xml:space="preserve">Figure 2 and </w:t>
-      </w:r>
-      <w:r>
-        <w:t xml:space="preserve">Table 3A). </w:t>
-      </w:r>
-      <w:r>
-        <w:t>We</w:t>
-      </w:r>
-      <w:r>
-        <w:t xml:space="preserve"> </w:t>
-      </w:r>
-      <w:r>
-        <w:t>observed</w:t>
-      </w:r>
-      <w:r>
-        <w:t xml:space="preserve"> significant increase</w:t>
-      </w:r>
-      <w:r>
-        <w:t>s for all measures</w:t>
-      </w:r>
-      <w:r>
-        <w:t xml:space="preserve"> in </w:t>
-      </w:r>
-      <w:r>
-        <w:t xml:space="preserve">patients </w:t>
-      </w:r>
-      <w:r>
-        <w:t xml:space="preserve">with Cushing's disease </w:t>
-      </w:r>
-      <w:r>
-        <w:t>without obesity</w:t>
-      </w:r>
-      <w:r>
-        <w:t xml:space="preserve"> </w:t>
-      </w:r>
-      <w:r>
-        <w:t>compa</w:t>
-      </w:r>
-      <w:r>
-        <w:t>r</w:t>
-      </w:r>
-      <w:r>
-        <w:t xml:space="preserve">ed to controls </w:t>
-      </w:r>
-      <w:r>
-        <w:t>without obesity</w:t>
-      </w:r>
-      <w:r>
-        <w:t xml:space="preserve"> (p=</w:t>
-      </w:r>
-      <w:r>
-        <w:t>&lt;0.01</w:t>
-      </w:r>
-      <w:r>
-        <w:t xml:space="preserve">). We did not, however, </w:t>
-      </w:r>
-      <w:r>
-        <w:t>observe</w:t>
-      </w:r>
-      <w:r>
-        <w:t xml:space="preserve"> this same significant </w:t>
-      </w:r>
-      <w:r>
-        <w:t xml:space="preserve">magnitude of </w:t>
-      </w:r>
-      <w:r>
-        <w:t>increase</w:t>
-      </w:r>
-      <w:r>
-        <w:t>s in blood pressure</w:t>
-      </w:r>
-      <w:r>
-        <w:t xml:space="preserve"> in </w:t>
-      </w:r>
-      <w:r>
-        <w:t>Cushing’s patients with obesity</w:t>
-      </w:r>
-      <w:r>
-        <w:t xml:space="preserve"> </w:t>
-      </w:r>
-      <w:commentRangeStart w:id="10"/>
-      <w:r>
-        <w:t>population</w:t>
-      </w:r>
-      <w:commentRangeEnd w:id="10"/>
-      <w:r>
-        <w:rPr>
-          <w:rStyle w:val="CommentReference"/>
-          <w:sz w:val="24"/>
-          <w:szCs w:val="24"/>
-        </w:rPr>
-        <w:commentReference w:id="10"/>
-      </w:r>
-      <w:r>
-        <w:t>.  For example, in terms of systolic blood pressure, Cushing’s disease was associated with an increase of 11.97 mm Hg in patients without obesity but 3.08 mm Hg</w:t>
-      </w:r>
-      <w:r>
-        <w:t xml:space="preserve"> in those with a BMI over 30 kg/m</w:t>
-      </w:r>
-      <w:r>
-        <w:rPr>
-          <w:vertAlign w:val="superscript"/>
-        </w:rPr>
-        <w:t>2</w:t>
-      </w:r>
-      <w:r>
-        <w:t xml:space="preserve">.  </w:t>
-      </w:r>
-      <w:r>
-        <w:t>The</w:t>
-      </w:r>
-      <w:r>
-        <w:t xml:space="preserve"> attenuation of the </w:t>
-      </w:r>
-      <w:r>
-        <w:t>effect</w:t>
-      </w:r>
-      <w:r>
-        <w:t xml:space="preserve"> of Cushing’s disease </w:t>
-      </w:r>
-      <w:r>
-        <w:t>in patients</w:t>
-      </w:r>
-      <w:r>
-        <w:t xml:space="preserve">’ </w:t>
-      </w:r>
-      <w:r>
-        <w:t xml:space="preserve">obesity was significant </w:t>
-      </w:r>
-      <w:r>
-        <w:t xml:space="preserve">for mean, systolic, and diastolic </w:t>
-      </w:r>
-      <w:r>
-        <w:t>blood</w:t>
-      </w:r>
-      <w:r>
-        <w:t xml:space="preserve"> pressure (p</w:t>
-      </w:r>
-      <w:r>
-        <w:rPr>
-          <w:vertAlign w:val="subscript"/>
-        </w:rPr>
-        <w:t>interaction</w:t>
-      </w:r>
-      <w:r>
-        <w:t xml:space="preserve">&lt;0.01 for each).  </w:t>
-      </w:r>
-      <w:r>
-        <w:t xml:space="preserve">This </w:t>
-      </w:r>
-      <w:r>
-        <w:t>suggests that obesity may have a protective effect on Cushing’s induced hypertension.</w:t>
-      </w:r>
-    </w:p>
-    <w:p>
-      <w:pPr>
-        <w:pStyle w:val="NormalWeb"/>
-        <w:rPr>
-          <w:rStyle w:val="Heading2Char"/>
-        </w:rPr>
-      </w:pPr>
-      <w:r>
-        <w:rPr>
-          <w:rStyle w:val="Heading2Char"/>
-        </w:rPr>
-        <w:t>Sensitivity and secondary analyses</w:t>
-      </w:r>
-    </w:p>
-    <w:p>
-      <w:r>
-        <w:t>We performed a variety of sensitivity analyses to test the assumptions used in evaluating these effects, summarized in Table 4.</w:t>
-      </w:r>
-      <w:r>
-        <w:t xml:space="preserve">  By and large, these analyses show that the effects described above are robust to different analytical methods.  For example, the synergistic effects of obesity and Cushing’s disease on liver enzymes was similar and significant across different demographic adjustments.  We also found that propensity matching cases for BMI, or including BMI as a covariate did not attenuate these effects.  Within subgroups, we did notice some suggestive trends.  For example, the synergistic (and antagonistic) effects of obesity </w:t>
-      </w:r>
-      <w:r>
-        <w:t>were larger</w:t>
-      </w:r>
-      <w:r>
-        <w:t xml:space="preserve"> as obesity increased.  For example, the interaction between Class I obesity and Cushing’s disease on ALT levels was -12.8 mg/dL but increased to </w:t>
-      </w:r>
-      <w:r>
-        <w:t>+</w:t>
-      </w:r>
-      <w:r>
-        <w:t>30.3 for Class II obesity and 80.7 for class III obesity.  Since this analysis already accounted for a main effect of obesity status, this suggest</w:t>
-      </w:r>
-      <w:r>
-        <w:t>s</w:t>
-      </w:r>
-      <w:r>
-        <w:t xml:space="preserve"> that as obesity increases, the negative effect of Cushing’s disease on liver enzymes increased, while the protective effect on blood pressure was also trended to increase in magnitude.  Stratifying by gender, we noticed that female patients generally had worse but more variable effect estimates.  In the case of AST, the interaction between obesity and </w:t>
-      </w:r>
-      <w:r>
-        <w:t>Cushing’s</w:t>
-      </w:r>
-      <w:r>
-        <w:t xml:space="preserve"> </w:t>
-      </w:r>
-      <w:r>
-        <w:t xml:space="preserve">disease </w:t>
-      </w:r>
-      <w:r>
-        <w:t>was estimated at 41.9 [-3.7-87.5] mg/dL but for males it was 25.8 [11.4-40.1] mg/</w:t>
-      </w:r>
-      <w:commentRangeStart w:id="11"/>
-      <w:r>
-        <w:t>dL</w:t>
-      </w:r>
-      <w:commentRangeEnd w:id="11"/>
-      <w:r>
-        <w:rPr>
-          <w:rStyle w:val="CommentReference"/>
-          <w:sz w:val="24"/>
-          <w:szCs w:val="24"/>
-        </w:rPr>
-        <w:commentReference w:id="11"/>
-      </w:r>
-      <w:r>
-        <w:t xml:space="preserve">.  </w:t>
-      </w:r>
-    </w:p>
-    <w:p>
-      <w:pPr>
-        <w:pStyle w:val="Heading1"/>
-      </w:pPr>
-      <w:r>
-        <w:t>Discussion</w:t>
-      </w:r>
-    </w:p>
-    <w:p>
-      <w:pPr>
-        <w:pStyle w:val="ListParagraph"/>
-      </w:pPr>
-    </w:p>
-    <w:p>
-      <w:pPr>
-        <w:pStyle w:val="ListParagraph"/>
-        <w:ind w:left="0"/>
-      </w:pPr>
-      <w:r>
-        <w:lastRenderedPageBreak/>
-        <w:t xml:space="preserve">This analysis of the effects of obesity and Cushing’s disease </w:t>
-      </w:r>
-      <w:r>
-        <w:t xml:space="preserve">on metabolic complications </w:t>
-      </w:r>
-      <w:r>
-        <w:t>demonstrate</w:t>
-      </w:r>
-      <w:r>
-        <w:t>s</w:t>
-      </w:r>
-      <w:r>
-        <w:t xml:space="preserve"> a complex set of interactions between the presence of obesity on Cushing’s disease- and obesity-related pathophysiology.  We report that liver enzymes are enhanced relative to what we would predict from the additive effects of Cushing’s disease and obesity together, while in the case of blood pressure, obesity appears to reduce the effects of Cushing’s disease.  Glucose homeostasis appears to be explained well by an additive model</w:t>
-      </w:r>
-      <w:r>
-        <w:t xml:space="preserve"> in our primary </w:t>
-      </w:r>
-      <w:commentRangeStart w:id="12"/>
-      <w:r>
-        <w:t>analysis</w:t>
-      </w:r>
-      <w:commentRangeEnd w:id="12"/>
-      <w:r>
-        <w:rPr>
-          <w:rStyle w:val="CommentReference"/>
-          <w:sz w:val="24"/>
-          <w:szCs w:val="24"/>
-        </w:rPr>
-        <w:commentReference w:id="12"/>
-      </w:r>
-      <w:r>
-        <w:t>.</w:t>
-      </w:r>
-      <w:r>
-        <w:t xml:space="preserve">  Broadly, </w:t>
-      </w:r>
-      <w:r>
-        <w:t>despite</w:t>
-      </w:r>
-      <w:r>
-        <w:t xml:space="preserve"> similar BMI levels between groups, metabolic dysfunction is dramatically worsened in patients with Cushing’s disease, so clearly there is substantial dysmetabolism beyond excessive weight gain.</w:t>
-      </w:r>
-    </w:p>
-    <w:p>
-      <w:pPr>
-        <w:pStyle w:val="ListParagraph"/>
-        <w:ind w:left="0"/>
-      </w:pPr>
-    </w:p>
-    <w:p>
-      <w:pPr>
-        <w:pStyle w:val="ListParagraph"/>
-        <w:ind w:left="0"/>
-      </w:pPr>
-      <w:r>
-        <w:t xml:space="preserve">These data are in part consistent with experimental animal studies in our group where pre-existing obesity aggravated liver steatosis and muscle function loss </w:t>
-      </w:r>
-      <w:r>
-        <w:fldChar w:fldCharType="begin"/>
-      </w:r>
-      <w:r>
-        <w:instrText xml:space="preserve"> ADDIN ZOTERO_ITEM CSL_CITATION {"citationID":"LH1T8aA8","properties":{"formattedCitation":"\\super 19,20\\nosupersub{}","plainCitation":"19,20","noteIndex":0},"citationItems":[{"id":9070,"uris":["http://zotero.org/users/7317906/items/UINYBGJP"],"itemData":{"id":9070,"type":"article-journal","abstract":"© 2020 by the authors. Licensee MDPI, Basel, Switzerland. Glucocorticoids promote muscle atrophy by inducing a class of proteins called atrogenes, resulting in reductions in muscle size and strength. In this work, we evaluated whether a mouse model with pre-existing diet-induced obesity had altered glucocorticoid responsiveness. We observed that all animals treated with the synthetic glucocorticoid dexamethasone had reduced strength, but that obesity exacerbated this effect. These changes were concordant with more pronounced reductions in muscle size, particularly in Type II muscle fibers, and potentiated induction of atrogene expression in the obese mice relative to lean mice. Furthermore, we show that the reductions in lean mass do not fully account for the dexamethasone-induced insulin resistance observed in these mice. Together, these data suggest that obesity potentiates glucocorticoid-induced muscle atrophy.","citation-key":"Gunder2020","container-title":"Biomedicines","DOI":"10.3390/biomedicines8100420","ISSN":"22279059","issue":"10","title":"Obesity augments glucocorticoid-dependent muscle atrophy in male c57bl/6j mice","volume":"8","author":[{"family":"Gunder","given":"Laura C"},{"family":"Harvey","given":"I."},{"family":"Redd","given":"J.R."},{"family":"Davis","given":"C.S."},{"family":"Al-Tamimi","given":"A."},{"family":"Brooks","given":"S.V."},{"family":"Bridges","given":"Dave"}],"issued":{"date-parts":[["2020"]]}}},{"id":9074,"uris":["http://zotero.org/users/7317906/items/TX7KAVZ2"],"itemData":{"id":9074,"type":"article-journal","abstract":"© 2018 Endocrine Society. The purpose of this study was to determine the effects of glucocorticoid-induced metabolic dysfunction in the presence of diet-induced obesity. C57BL/6J adult male lean and diet-induced obese mice were given dexamethasone, and levels of hepatic steatosis, insulin resistance, and lipolysis were determined. Obese mice given dexamethasone had significant, synergistic effects on fasting glucose, insulin resistance, and markers of lipolysis, as well as hepatic steatosis. This was associated with synergistic transactivation of the lipolytic enzyme adipose triglyceride lipase. The combination of chronically elevated glucocorticoids and obesity leads to exacerbations in metabolic dysfunction. Our findings suggest lipolysis may be a key player in glucocorticoid-induced insulin resistance and fatty liver in individuals with obesity.","citation-key":"harveyGlucocorticoidInducedMetabolicDisturbances2018","container-title":"Endocrinology","DOI":"10.1210/en.2018-00147","ISSN":"19457170","issue":"6","title":"Glucocorticoid-Induced Metabolic Disturbances Are Exacerbated in Obese Male Mice","volume":"159","author":[{"family":"Harvey","given":"Innocence"},{"family":"Stephenson","given":"Erin J."},{"family":"Redd","given":"J.R."},{"family":"Tran","given":"Quynh T."},{"family":"Hochberg","given":"I."},{"family":"Qi","given":"N."},{"family":"Bridges","given":"Dave"}],"issued":{"date-parts":[["2018"]]}}}],"schema":"https://github.com/citation-style-language/schema/raw/master/csl-citation.json"} </w:instrText>
-      </w:r>
-      <w:r>
-        <w:fldChar w:fldCharType="separate"/>
-      </w:r>
-      <w:r>
-        <w:rPr>
-          <w:rFonts w:ascii="Aptos" w:cs="Times New Roman"/>
-          <w:kern w:val="0"/>
-          <w:vertAlign w:val="superscript"/>
-        </w:rPr>
-        <w:t>19,20</w:t>
-      </w:r>
-      <w:r>
-        <w:fldChar w:fldCharType="end"/>
-      </w:r>
-      <w:r>
-        <w:t xml:space="preserve">.  These data are also consistent with our previous report demonstrating that obesity modifies Cushing’s-induced transcriptional changes in adipose tissue </w:t>
-      </w:r>
-      <w:r>
-        <w:fldChar w:fldCharType="begin"/>
-      </w:r>
-      <w:r>
-        <w:instrText xml:space="preserve"> ADDIN ZOTERO_ITEM CSL_CITATION {"citationID":"JkUdYYW8","properties":{"formattedCitation":"\\super 21\\nosupersub{}","plainCitation":"21","noteIndex":0},"citationItems":[{"id":4127,"uris":["http://zotero.org/users/7317906/items/2YQBFJRJ"],"itemData":{"id":4127,"type":"article-journal","abstract":"Glucocorticoids have major effects on adipose tissue metabolism. To study tissue mRNA expression changes induced by chronic elevated endogenous glucocorticoids, we performed RNA sequencing on subcutaneous adipose tissue from patients with Cushing's disease (n=5) compared to patients with non-functioning pituitary adenomas (n=11). We found higher expression of transcripts involved in several metabolic pathways, including lipogenesis, proteolysis and glucose oxidation as well as decreased expression of transcripts involved in inflammation and protein synthesis. To further study this in a model system, we subjected mice to dexamethasone treatment for 12 weeks and analyzed their inguinal (subcutaneous) fat pads, which led to similar findings. Additionally, mice treated with dexamethasone showed drastic decreases in lean body mass as well as increased fat mass, further supporting the human transcriptomic data. These data provide insight to transcriptional changes that may be responsible for the co-morbidities associated with chronic elevations of glucocorticoids.","citation-key":"Hochberg2015a","container-title":"Journal of Molecular Endocrinology","DOI":"10.1530/JME-15-0119","ISSN":"0952-5041","issue":"2","page":"81-94","PMID":"26150553","title":"Gene expression changes in subcutaneous adipose tissue due to Cushing's disease","URL":"http://www.ncbi.nlm.nih.gov/pubmed/26150553","volume":"55","author":[{"family":"Hochberg","given":"Irit"},{"family":"Harvey","given":"Innocence"},{"family":"Tran","given":"Quynh T."},{"family":"Stephenson","given":"Erin J."},{"family":"Barkan","given":"Ariel L"},{"family":"Saltiel","given":"Alan R."},{"family":"Chandler","given":"William F."},{"family":"Bridges","given":"Dave"}],"issued":{"date-parts":[["2015",10]]}}}],"schema":"https://github.com/citation-style-language/schema/raw/master/csl-citation.json"} </w:instrText>
-      </w:r>
-      <w:r>
-        <w:fldChar w:fldCharType="separate"/>
-      </w:r>
-      <w:r>
-        <w:rPr>
-          <w:rFonts w:ascii="Aptos" w:cs="Times New Roman"/>
-          <w:kern w:val="0"/>
-          <w:vertAlign w:val="superscript"/>
-        </w:rPr>
-        <w:t>21</w:t>
-      </w:r>
-      <w:r>
-        <w:fldChar w:fldCharType="end"/>
-      </w:r>
-      <w:r>
-        <w:t xml:space="preserve">.  We remain interested in Cushing’s induced bone and muscle loss, as well as the effect of obesity and Cushing’s disease on blood lipids and kidney </w:t>
-      </w:r>
-      <w:r>
-        <w:t>function, but</w:t>
-      </w:r>
-      <w:ins w:id="13" w:author="Dave Bridges" w:date="2026-01-22T09:39:00Z" w16du:dateUtc="2026-01-22T14:39:00Z">
+        <w:t xml:space="preserve">0.91%; </w:t>
+      </w:r>
+      <w:r>
+        <w:t xml:space="preserve">p=0.056). However, there was evidence of a significant increase in HbA1c levels </w:t>
+      </w:r>
+      <w:r>
+        <w:t xml:space="preserve">in patients with obesity </w:t>
+      </w:r>
+      <w:r>
+        <w:t>and Cushing's disease compared to controls</w:t>
+      </w:r>
+      <w:ins w:id="8" w:author="Irit Hochberg" w:date="2026-01-22T09:36:00Z" w16du:dateUtc="2026-01-22T14:36:00Z">
         <w:r>
           <w:t xml:space="preserve"> </w:t>
         </w:r>
       </w:ins>
       <w:r>
-        <w:t>there are</w:t>
+        <w:t>(</w:t>
+      </w:r>
+      <w:r>
+        <w:t xml:space="preserve">1.38% </w:t>
+      </w:r>
+      <w:r>
+        <w:t>p</w:t>
+      </w:r>
+      <w:r>
+        <w:t>&lt;0.01</w:t>
+      </w:r>
+      <w:r>
+        <w:t>)</w:t>
+      </w:r>
+      <w:r>
+        <w:t xml:space="preserve"> (Table 3A</w:t>
+      </w:r>
+      <w:r>
+        <w:t>).</w:t>
       </w:r>
       <w:r>
         <w:t xml:space="preserve"> </w:t>
       </w:r>
       <w:r>
-        <w:t>in</w:t>
-      </w:r>
-      <w:r>
-        <w:t>sufficient laboratory results in these participants to make reliable conclusions.</w:t>
-      </w:r>
+        <w:t>Again</w:t>
+      </w:r>
+      <w:r>
+        <w:t>,</w:t>
+      </w:r>
+      <w:r>
+        <w:t xml:space="preserve"> there was no evidence of effect modification by obesity (p=0.41)</w:t>
+      </w:r>
+      <w:r>
+        <w:t xml:space="preserve">.  </w:t>
+      </w:r>
+      <w:commentRangeStart w:id="9"/>
+      <w:commentRangeStart w:id="10"/>
+      <w:r>
+        <w:t>This</w:t>
+      </w:r>
+      <w:commentRangeEnd w:id="9"/>
+      <w:r>
+        <w:rPr>
+          <w:rStyle w:val="CommentReference"/>
+          <w:sz w:val="24"/>
+          <w:szCs w:val="24"/>
+        </w:rPr>
+        <w:commentReference w:id="9"/>
+      </w:r>
+      <w:commentRangeEnd w:id="10"/>
+      <w:r>
+        <w:rPr>
+          <w:rStyle w:val="CommentReference"/>
+          <w:sz w:val="24"/>
+          <w:szCs w:val="24"/>
+        </w:rPr>
+        <w:commentReference w:id="10"/>
+      </w:r>
+      <w:r>
+        <w:t xml:space="preserve"> suggests that blood glucose increases with </w:t>
+      </w:r>
+      <w:r>
+        <w:t xml:space="preserve">obesity and </w:t>
+      </w:r>
+      <w:r>
+        <w:t xml:space="preserve">Cushing’s disease are largely </w:t>
+      </w:r>
+      <w:commentRangeStart w:id="11"/>
+      <w:commentRangeStart w:id="12"/>
+      <w:r>
+        <w:t>additive</w:t>
+      </w:r>
+      <w:commentRangeEnd w:id="11"/>
+      <w:r>
+        <w:rPr>
+          <w:rStyle w:val="CommentReference"/>
+          <w:sz w:val="24"/>
+          <w:szCs w:val="24"/>
+        </w:rPr>
+        <w:commentReference w:id="11"/>
+      </w:r>
+      <w:commentRangeEnd w:id="12"/>
+      <w:r>
+        <w:rPr>
+          <w:rStyle w:val="CommentReference"/>
+          <w:sz w:val="24"/>
+          <w:szCs w:val="24"/>
+        </w:rPr>
+        <w:commentReference w:id="12"/>
+      </w:r>
+      <w:r>
+        <w:t>.</w:t>
+      </w:r>
+    </w:p>
+    <w:p>
+      <w:pPr>
+        <w:pStyle w:val="Heading3"/>
+      </w:pPr>
+      <w:r>
+        <w:t>MASLD and liver enzymes</w:t>
+      </w:r>
+    </w:p>
+    <w:p>
+      <w:r>
+        <w:t xml:space="preserve">To </w:t>
+      </w:r>
+      <w:r>
+        <w:t>assess</w:t>
+      </w:r>
+      <w:r>
+        <w:t xml:space="preserve"> </w:t>
+      </w:r>
+      <w:r>
+        <w:t>MASLD</w:t>
+      </w:r>
+      <w:r>
+        <w:t xml:space="preserve"> we looked at ALT </w:t>
+      </w:r>
+      <w:r>
+        <w:t xml:space="preserve">and AST levels </w:t>
+      </w:r>
+      <w:r>
+        <w:t>(Figure 2 and Table 3A)</w:t>
+      </w:r>
+      <w:r>
+        <w:t xml:space="preserve">. In both our obese and non-obese populations, we saw an increase in ALT </w:t>
+      </w:r>
+      <w:r>
+        <w:t>and AST</w:t>
+      </w:r>
+      <w:r>
+        <w:t xml:space="preserve"> </w:t>
+      </w:r>
+      <w:r>
+        <w:t>levels regardless of Cushing’s disease status</w:t>
+      </w:r>
+      <w:r>
+        <w:t xml:space="preserve"> </w:t>
+      </w:r>
+      <w:r>
+        <w:t>(p</w:t>
+      </w:r>
+      <w:r>
+        <w:t>&lt;0.0</w:t>
+      </w:r>
+      <w:r>
+        <w:t>1 for both groups</w:t>
+      </w:r>
+      <w:r>
+        <w:t xml:space="preserve">). </w:t>
+      </w:r>
+      <w:r>
+        <w:t xml:space="preserve">In </w:t>
+      </w:r>
+      <w:r>
+        <w:t>the</w:t>
+      </w:r>
+      <w:r>
+        <w:t xml:space="preserve"> case</w:t>
+      </w:r>
+      <w:r>
+        <w:t xml:space="preserve"> of ALT levels</w:t>
+      </w:r>
+      <w:r>
+        <w:t>, the</w:t>
+      </w:r>
+      <w:r>
+        <w:t xml:space="preserve"> increase </w:t>
+      </w:r>
+      <w:r>
+        <w:t xml:space="preserve">due to Cushing’s disease was much greater in the patients with obesity </w:t>
+      </w:r>
+      <w:r>
+        <w:t>(</w:t>
+      </w:r>
+      <w:r>
+        <w:t>73.4 vs 35.1 mg/dL, p</w:t>
+      </w:r>
+      <w:r>
+        <w:rPr>
+          <w:vertAlign w:val="subscript"/>
+        </w:rPr>
+        <w:t>interaction</w:t>
+      </w:r>
+      <w:r>
+        <w:t>&lt;0.01</w:t>
+      </w:r>
+      <w:r>
+        <w:t>).</w:t>
+      </w:r>
+      <w:r>
+        <w:t xml:space="preserve">  This was also true for AST levels (increase by 56.3 mg/dL in patients </w:t>
+      </w:r>
+      <w:r>
+        <w:lastRenderedPageBreak/>
+        <w:t>with obesity and 16.9 for patients without obesity,</w:t>
+      </w:r>
+      <w:r>
+        <w:t xml:space="preserve"> </w:t>
+      </w:r>
+      <w:r>
+        <w:t>p</w:t>
+      </w:r>
+      <w:r>
+        <w:rPr>
+          <w:vertAlign w:val="subscript"/>
+        </w:rPr>
+        <w:t>interaction</w:t>
+      </w:r>
+      <w:r>
+        <w:t>=0.034).  These data support the hypothesis</w:t>
+      </w:r>
+      <w:r>
+        <w:t xml:space="preserve"> that obesity </w:t>
+      </w:r>
+      <w:r>
+        <w:t xml:space="preserve">enhances </w:t>
+      </w:r>
+      <w:r>
+        <w:t xml:space="preserve">liver damage associated with </w:t>
+      </w:r>
+      <w:r>
+        <w:t xml:space="preserve">Cushing’s </w:t>
+      </w:r>
+      <w:r>
+        <w:t>disease.</w:t>
+      </w:r>
+    </w:p>
+    <w:p>
+      <w:pPr>
+        <w:pStyle w:val="Heading3"/>
+      </w:pPr>
+      <w:r>
+        <w:t>Blood Pressure</w:t>
+      </w:r>
+    </w:p>
+    <w:p>
+      <w:r>
+        <w:t xml:space="preserve">We </w:t>
+      </w:r>
+      <w:r>
+        <w:t>evaluated</w:t>
+      </w:r>
+      <w:r>
+        <w:t xml:space="preserve"> blood pressure readings as systolic, diastolic and mean arterial </w:t>
+      </w:r>
+      <w:r>
+        <w:t>pressures (</w:t>
+      </w:r>
+      <w:r>
+        <w:t xml:space="preserve">Figure 2 and </w:t>
+      </w:r>
+      <w:r>
+        <w:t xml:space="preserve">Table 3A). </w:t>
+      </w:r>
+      <w:r>
+        <w:t>We</w:t>
+      </w:r>
+      <w:r>
+        <w:t xml:space="preserve"> </w:t>
+      </w:r>
+      <w:r>
+        <w:t>observed</w:t>
+      </w:r>
+      <w:r>
+        <w:t xml:space="preserve"> significant increase</w:t>
+      </w:r>
+      <w:r>
+        <w:t>s for all measures</w:t>
+      </w:r>
+      <w:r>
+        <w:t xml:space="preserve"> in </w:t>
+      </w:r>
+      <w:r>
+        <w:t xml:space="preserve">patients </w:t>
+      </w:r>
+      <w:r>
+        <w:t xml:space="preserve">with Cushing's disease </w:t>
+      </w:r>
+      <w:r>
+        <w:t>without obesity</w:t>
+      </w:r>
+      <w:r>
+        <w:t xml:space="preserve"> </w:t>
+      </w:r>
+      <w:r>
+        <w:t>compa</w:t>
+      </w:r>
+      <w:r>
+        <w:t>r</w:t>
+      </w:r>
+      <w:r>
+        <w:t xml:space="preserve">ed to controls </w:t>
+      </w:r>
+      <w:r>
+        <w:t>without obesity</w:t>
+      </w:r>
+      <w:r>
+        <w:t xml:space="preserve"> (p=</w:t>
+      </w:r>
+      <w:r>
+        <w:t>&lt;0.01</w:t>
+      </w:r>
+      <w:r>
+        <w:t xml:space="preserve">). We did not, however, </w:t>
+      </w:r>
+      <w:r>
+        <w:t>observe</w:t>
+      </w:r>
+      <w:r>
+        <w:t xml:space="preserve"> this same significant </w:t>
+      </w:r>
+      <w:r>
+        <w:t xml:space="preserve">magnitude of </w:t>
+      </w:r>
+      <w:r>
+        <w:t>increase</w:t>
+      </w:r>
+      <w:r>
+        <w:t>s in blood pressure</w:t>
+      </w:r>
+      <w:r>
+        <w:t xml:space="preserve"> in </w:t>
+      </w:r>
+      <w:r>
+        <w:t>Cushing’s patients with obesity</w:t>
+      </w:r>
+      <w:r>
+        <w:t xml:space="preserve"> </w:t>
+      </w:r>
+      <w:commentRangeStart w:id="13"/>
+      <w:commentRangeStart w:id="14"/>
+      <w:r>
+        <w:t>population</w:t>
+      </w:r>
+      <w:commentRangeEnd w:id="13"/>
+      <w:r>
+        <w:rPr>
+          <w:rStyle w:val="CommentReference"/>
+          <w:sz w:val="24"/>
+          <w:szCs w:val="24"/>
+        </w:rPr>
+        <w:commentReference w:id="13"/>
+      </w:r>
+      <w:commentRangeEnd w:id="14"/>
+      <w:r>
+        <w:rPr>
+          <w:rStyle w:val="CommentReference"/>
+          <w:sz w:val="24"/>
+          <w:szCs w:val="24"/>
+        </w:rPr>
+        <w:commentReference w:id="14"/>
+      </w:r>
+      <w:r>
+        <w:t>.  For example, in terms of systolic blood pressure, Cushing’s disease was associated with an increase of 11.97 mm Hg in patients without obesity but 3.08 mm Hg</w:t>
+      </w:r>
+      <w:r>
+        <w:t xml:space="preserve"> in those with a BMI over 30 kg/m</w:t>
+      </w:r>
+      <w:r>
+        <w:rPr>
+          <w:vertAlign w:val="superscript"/>
+        </w:rPr>
+        <w:t>2</w:t>
+      </w:r>
+      <w:r>
+        <w:t xml:space="preserve">.  </w:t>
+      </w:r>
+      <w:r>
+        <w:t>The</w:t>
+      </w:r>
+      <w:r>
+        <w:t xml:space="preserve"> attenuation of the </w:t>
+      </w:r>
+      <w:r>
+        <w:t>effect</w:t>
+      </w:r>
+      <w:r>
+        <w:t xml:space="preserve"> of Cushing’s disease </w:t>
+      </w:r>
+      <w:r>
+        <w:t>in patients</w:t>
+      </w:r>
+      <w:r>
+        <w:t xml:space="preserve">’ </w:t>
+      </w:r>
+      <w:r>
+        <w:t xml:space="preserve">obesity was significant </w:t>
+      </w:r>
+      <w:r>
+        <w:t xml:space="preserve">for mean, systolic, and diastolic </w:t>
+      </w:r>
+      <w:r>
+        <w:t>blood</w:t>
+      </w:r>
+      <w:r>
+        <w:t xml:space="preserve"> pressure (p</w:t>
+      </w:r>
+      <w:r>
+        <w:rPr>
+          <w:vertAlign w:val="subscript"/>
+        </w:rPr>
+        <w:t>interaction</w:t>
+      </w:r>
+      <w:r>
+        <w:t xml:space="preserve">&lt;0.01 for each).  </w:t>
+      </w:r>
+      <w:r>
+        <w:t xml:space="preserve">This </w:t>
+      </w:r>
+      <w:r>
+        <w:t>suggests that obesity may have a protective effect on Cushing’s induced hypertension.</w:t>
+      </w:r>
+    </w:p>
+    <w:p>
+      <w:pPr>
+        <w:pStyle w:val="NormalWeb"/>
+        <w:rPr>
+          <w:rStyle w:val="Heading2Char"/>
+        </w:rPr>
+      </w:pPr>
+      <w:r>
+        <w:rPr>
+          <w:rStyle w:val="Heading2Char"/>
+        </w:rPr>
+        <w:t>Sensitivity and secondary analyses</w:t>
+      </w:r>
+    </w:p>
+    <w:p>
+      <w:r>
+        <w:t>We performed a variety of sensitivity analyses to test the assumptions used in evaluating these effects, summarized in Table 4.</w:t>
+      </w:r>
+      <w:r>
+        <w:t xml:space="preserve">  By and large, these analyses show that the effects described above are robust to different analytical methods.  For example, the synergistic effects of obesity and Cushing’s disease on liver enzymes was similar and significant across different demographic adjustments.  We also found that propensity matching cases for BMI, or including BMI as a covariate did not attenuate these effects.  Within subgroups, we did notice some suggestive trends.  For example, the synergistic (and antagonistic) effects of obesity </w:t>
+      </w:r>
+      <w:r>
+        <w:t>were larger</w:t>
+      </w:r>
+      <w:r>
+        <w:t xml:space="preserve"> as obesity increased.  For example, the interaction between Class I obesity and Cushing’s disease on ALT levels was -12.8 mg/dL but increased to </w:t>
+      </w:r>
+      <w:r>
+        <w:t>+</w:t>
+      </w:r>
+      <w:r>
+        <w:t>30.3 for Class II obesity and 80.7 for class III obesity.  Since this analysis already accounted for a main effect of obesity status, this suggest</w:t>
+      </w:r>
+      <w:r>
+        <w:t>s</w:t>
+      </w:r>
+      <w:r>
+        <w:t xml:space="preserve"> that as obesity increases, the negative effect of Cushing’s disease on liver enzymes increased, while the protective effect on blood pressure was also trended to increase in magnitude.  Stratifying by gender, we noticed that female patients generally had worse but more variable effect estimates.  In the case of AST, the interaction between obesity and </w:t>
+      </w:r>
+      <w:r>
+        <w:t>Cushing’s</w:t>
+      </w:r>
+      <w:r>
+        <w:t xml:space="preserve"> </w:t>
+      </w:r>
+      <w:r>
+        <w:t xml:space="preserve">disease </w:t>
+      </w:r>
+      <w:r>
+        <w:t xml:space="preserve">was estimated at </w:t>
+      </w:r>
+      <w:r>
+        <w:t xml:space="preserve">an increase of </w:t>
+      </w:r>
+      <w:r>
+        <w:t xml:space="preserve">41.9 [-3.7-87.5] mg/dL </w:t>
+      </w:r>
+      <w:r>
+        <w:t xml:space="preserve">beyond Cushing’s disease or obesity additively, </w:t>
+      </w:r>
+      <w:r>
+        <w:t>but for males it was 25.8 [11.4-40.1] mg/</w:t>
+      </w:r>
+      <w:commentRangeStart w:id="15"/>
+      <w:commentRangeStart w:id="16"/>
+      <w:r>
+        <w:t>dL</w:t>
+      </w:r>
+      <w:commentRangeEnd w:id="15"/>
+      <w:r>
+        <w:rPr>
+          <w:rStyle w:val="CommentReference"/>
+          <w:sz w:val="24"/>
+          <w:szCs w:val="24"/>
+        </w:rPr>
+        <w:commentReference w:id="15"/>
+      </w:r>
+      <w:commentRangeEnd w:id="16"/>
+      <w:r>
+        <w:rPr>
+          <w:rStyle w:val="CommentReference"/>
+          <w:sz w:val="24"/>
+          <w:szCs w:val="24"/>
+        </w:rPr>
+        <w:commentReference w:id="16"/>
+      </w:r>
+      <w:r>
+        <w:t xml:space="preserve">.  </w:t>
+      </w:r>
+    </w:p>
+    <w:p>
+      <w:pPr>
+        <w:pStyle w:val="Heading1"/>
+      </w:pPr>
+      <w:r>
+        <w:t>Discussion</w:t>
+      </w:r>
+    </w:p>
+    <w:p>
+      <w:pPr>
+        <w:pStyle w:val="ListParagraph"/>
+      </w:pPr>
     </w:p>
     <w:p>
       <w:pPr>
         <w:pStyle w:val="ListParagraph"/>
         <w:ind w:left="0"/>
       </w:pPr>
+      <w:r>
+        <w:lastRenderedPageBreak/>
+        <w:t xml:space="preserve">This analysis of the effects of obesity and Cushing’s disease </w:t>
+      </w:r>
+      <w:r>
+        <w:t xml:space="preserve">on metabolic complications </w:t>
+      </w:r>
+      <w:r>
+        <w:t>demonstrate</w:t>
+      </w:r>
+      <w:r>
+        <w:t>s</w:t>
+      </w:r>
+      <w:r>
+        <w:t xml:space="preserve"> a complex set of interactions between the presence of obesity on Cushing’s disease- and obesity-related pathophysiology.  We report that liver enzymes are enhanced relative to what we would predict from the additive effects of Cushing’s disease and obesity together, while in the case of blood pressure, obesity appears to reduce the effects of Cushing’s disease.  Glucose homeostasis appears to be explained well by an additive model</w:t>
+      </w:r>
+      <w:r>
+        <w:t xml:space="preserve"> in our primary </w:t>
+      </w:r>
+      <w:commentRangeStart w:id="17"/>
+      <w:commentRangeStart w:id="18"/>
+      <w:r>
+        <w:t>analysis</w:t>
+      </w:r>
+      <w:commentRangeEnd w:id="17"/>
+      <w:r>
+        <w:rPr>
+          <w:rStyle w:val="CommentReference"/>
+          <w:sz w:val="24"/>
+          <w:szCs w:val="24"/>
+        </w:rPr>
+        <w:commentReference w:id="17"/>
+      </w:r>
+      <w:commentRangeEnd w:id="18"/>
+      <w:r>
+        <w:rPr>
+          <w:rStyle w:val="CommentReference"/>
+          <w:sz w:val="24"/>
+          <w:szCs w:val="24"/>
+        </w:rPr>
+        <w:commentReference w:id="18"/>
+      </w:r>
+      <w:r>
+        <w:t xml:space="preserve"> where obesity and Cushing’s disease have </w:t>
+      </w:r>
+      <w:r>
+        <w:t>non-synergistic effects</w:t>
+      </w:r>
+      <w:r>
+        <w:t>.</w:t>
+      </w:r>
+      <w:r>
+        <w:t xml:space="preserve">  </w:t>
+      </w:r>
+      <w:r>
+        <w:t xml:space="preserve">We see effects of both obesity and Cushing’s disease to increase blood glucose.  </w:t>
+      </w:r>
+      <w:r>
+        <w:t xml:space="preserve">Broadly, </w:t>
+      </w:r>
+      <w:r>
+        <w:t>despite</w:t>
+      </w:r>
+      <w:r>
+        <w:t xml:space="preserve"> similar BMI levels between groups, metabolic dysfunction is dramatically worsened in patients with Cushing’s disease, so clearly there is substantial dysmetabolism beyond excessive weight gain.</w:t>
+      </w:r>
     </w:p>
     <w:p>
       <w:pPr>
         <w:pStyle w:val="ListParagraph"/>
         <w:ind w:left="0"/>
       </w:pPr>
-      <w:r>
-        <w:t>Pathophysiologically</w:t>
-      </w:r>
-      <w:r>
-        <w:t xml:space="preserve">, the induction of adipocyte lipolysis by </w:t>
-      </w:r>
-      <w:r>
-        <w:t xml:space="preserve">the direct effect of </w:t>
-      </w:r>
-      <w:r>
-        <w:t>cortisol</w:t>
-      </w:r>
-      <w:r>
-        <w:t xml:space="preserve"> </w:t>
-      </w:r>
-      <w:r>
-        <w:t xml:space="preserve">on adipocytes, as well as </w:t>
-      </w:r>
-      <w:r>
-        <w:t>the indirect</w:t>
-      </w:r>
-      <w:r>
-        <w:t xml:space="preserve"> effects </w:t>
-      </w:r>
-      <w:r>
-        <w:t xml:space="preserve">of cortisol </w:t>
-      </w:r>
-      <w:r>
-        <w:t>on insulin signaling in adipocytes</w:t>
-      </w:r>
-      <w:r>
-        <w:t>,</w:t>
-      </w:r>
-      <w:r>
-        <w:t xml:space="preserve"> may explain increased liver disease in patients with obesity and Cushing’s disease.  This could be due to a confluence of increased triglyceride stores available for release, increased signaling, and decreased hepatic triglyceride export due to hepatic insulin resistance.  </w:t>
-      </w:r>
     </w:p>
     <w:p>
       <w:pPr>
         <w:pStyle w:val="ListParagraph"/>
         <w:ind w:left="0"/>
       </w:pPr>
-    </w:p>
-    <w:p>
-      <w:pPr>
-        <w:pStyle w:val="ListParagraph"/>
-        <w:ind w:left="0"/>
-      </w:pPr>
-      <w:r>
-        <w:t xml:space="preserve">It is less clear to us why blood pressure is </w:t>
-      </w:r>
-      <w:r>
-        <w:t>attenuated somewhat in patients with Cushing’s disease and obesity</w:t>
-      </w:r>
-      <w:r>
-        <w:t xml:space="preserve">.  </w:t>
-      </w:r>
-      <w:r>
-        <w:t>O</w:t>
-      </w:r>
-      <w:r>
-        <w:t>besity and Cushing’s disease</w:t>
-      </w:r>
-      <w:r>
-        <w:t xml:space="preserve"> both</w:t>
-      </w:r>
-      <w:r>
-        <w:t xml:space="preserve"> increase systolic, diastolic and mean arterial pressure, but when both are combined</w:t>
-      </w:r>
-      <w:r>
-        <w:t>,</w:t>
-      </w:r>
-      <w:r>
-        <w:t xml:space="preserve"> the effect is </w:t>
-      </w:r>
-      <w:r>
-        <w:t>significantly</w:t>
-      </w:r>
-      <w:r>
-        <w:t xml:space="preserve"> attenuated (Figure 2 and Table 3).  Obesity is a well-known risk factor for hypertension </w:t>
+      <w:r>
+        <w:t xml:space="preserve">These data are in part consistent with experimental animal studies in our group where pre-existing obesity aggravated liver steatosis and muscle function loss </w:t>
       </w:r>
       <w:r>
         <w:fldChar w:fldCharType="begin"/>
       </w:r>
       <w:r>
-        <w:instrText xml:space="preserve"> ADDIN ZOTERO_ITEM CSL_CITATION {"citationID":"X8xCSypB","properties":{"formattedCitation":"\\super 22\\uc0\\u8211{}24\\nosupersub{}","plainCitation":"22–24","noteIndex":0},"citationItems":[{"id":27435,"uris":["http://zotero.org/users/7317906/items/DH8UG89Y"],"itemData":{"id":27435,"type":"article-journal","abstract":"Cushing's syndrome is associated with increased mortality, mainly due to cardiovascular complications, which are sustained by the common development of systemic arterial hypertension and metabolic syndrome, which partially persist after the disease remission. Cardiovascular diseases and hypertension associated with endogenous hypercortisolism reveal underexplored peculiarities. The use of exogenous corticosteroids also impacts on hypertension and cardiovascular system, especially after prolonged treatment. The mechanisms involved in the development of hypertension differ, whether glucocorticoid excess is acute or chronic, and the source endogenous or exogenous, introducing inconsistencies among published studies. The pleiotropic effects of glucocorticoids and the overlap of the several regulatory mechanisms controlling blood pressure suggest that a rigorous comparison of in-vivo and in-vitro studies is necessary to draw reliable conclusions. This review, developed during the first ‘Altogether to Beat Cushing's syndrome’ workshop held in Capri in 2012, evaluates the most important peculiarities of hypertension associated with CS, with a particular focus on its pathophysiology. A critical appraisal of most significant animal and human studies is compared with a systematic review of the few available clinical trials. A special attention is dedicated to the description of the clinical features and cardiovascular damage secondary to glucocorticoid excess. On the basis of the consensus reached during the workshop, a pathophysiology-oriented therapeutic algorithm has been developed and it could serve as a first attempt to rationalize the treatment of hypertension in Cushing's syndrome.","citation-key":"isidoriHypertensionCushingsSyndrome2015","container-title":"Journal of Hypertension","DOI":"10.1097/HJH.0000000000000415","issue":"1","language":"en-US","page":"44-60","source":"journals.lww.com","title":"The hypertension of Cushing's syndrome: controversies in... : Journal of Hypertension","title-short":"The hypertension of Cushing's syndrome","URL":"https://journals.lww.com/jhypertension/fulltext/2015/01000/The_hypertension_of_Cushing_s_syndrome_.6.aspxTest?casa_token=I--E6UkhUMMAAAAA:fkOVLRfHbzyQJsb_kVC-mIAOKPBO3pq533Lx7ct_fg3PYPwvP2wgsSC3t0mdLqPrs3mzyZOWtyeTGZyaYz1R8120QW8IXjI","volume":"33","author":[{"family":"Isidori","given":"Andrea M."},{"family":"Graziadio","given":"Chiara"},{"family":"Paragliola","given":"Rosa Maria"},{"family":"Cozzolino","given":"Alessia"},{"family":"Ambrogio","given":"Alberto G."},{"family":"Colao","given":"Annamaria"},{"family":"Corsello","given":"Salvatore M."},{"family":"Pivonello","given":"Rosario"},{"family":"Group","given":"on behalf of the ABC Study"}],"accessed":{"date-parts":[["2026",1,7]]},"issued":{"date-parts":[["2015"]]}}},{"id":27432,"uris":["http://zotero.org/users/7317906/items/6RZCY37T"],"itemData":{"id":27432,"type":"article-journal","abstract":"Cushing's syndrome can be exogenous, resulting from the administration of glucocorticoids or adrenocorticotrophic hormone (ACTH), or endogenous, secondary to increased secretion of cortisol or ACTH. Hypertension is one of the most distinguishing features of endogenous Cushing's syndrome, as it is present in about 80% of adult patients and in almost half of children and adolescents patients. Hypertension results from the interplay of several pathophysiological mechanisms regulating plasma volume, peripheral vascular resistance and cardiac output, all of which may be increased. The therapeutic goal is to find and remove the cause of excess glucocorticoids, which, in most cases of endogenous Cushing's syndrome, is achieved surgically. Treatment of Cushing's syndrome usually results in resolution or amelioration of hypertension. However, some patients may not achieve normotension or may require a prolonged period of time for the correction of hypercortisolism. Therefore, therapeutic strategies for Cushing's-specific hypertension (to normalise blood pressure and decrease the duration of hypertension) are necessary to decrease the morbidity and mortality associated with this disorder. The various pathogenetic mechanisms that have been proposed for the development of glucocorticoid-induced hypertension in Cushing's syndrome and its management are discussed.","citation-key":"magiakouHypertensionCushingsSyndrome2006","collection-title":"Endocrine Hypertension","container-title":"Best Practice &amp; Research Clinical Endocrinology &amp; Metabolism","DOI":"10.1016/j.beem.2006.07.006","ISSN":"1521-690X","issue":"3","journalAbbreviation":"Best Practice &amp; Research Clinical Endocrinology &amp; Metabolism","page":"467-482","source":"ScienceDirect","title":"Hypertension in Cushing's syndrome","URL":"https://www.sciencedirect.com/science/article/pii/S1521690X06000522","volume":"20","author":[{"family":"Magiakou","given":"Maria Alexandra"},{"family":"Smyrnaki","given":"Penelope"},{"family":"Chrousos","given":"George P."}],"accessed":{"date-parts":[["2026",1,7]]},"issued":{"date-parts":[["2006",9,1]]}}},{"id":27415,"uris":["http://zotero.org/users/7317906/items/CJNPIB38"],"itemData":{"id":27415,"type":"article-journal","abstract":"The prevalence of obesity has tripled over the past five decades. Obesity, especially visceral obesity, is closely related to hypertension, increasing the risk of primary (essential) hypertension by 65%–75%. Hypertension is a major risk factor for cardiovascular disease, the leading cause of death worldwide, and its prevalence is rapidly increasing following the pandemic rise in obesity. Although the causal relationship between obesity and high blood pressure (BP) is well established, the detailed mechanisms for such association are still under research. For more than 30 years sympathetic nervous system (SNS) and kidney sodium reabsorption activation, secondary to insulin resistance and compensatory hyperinsulinemia, have been considered as primary mediators of elevated BP in obesity. However, experimental and clinical data show that severe insulin resistance and hyperinsulinemia can occur in the absence of elevated BP, challenging the causal relationship between insulin resistance and hyperinsulinemia as the key factor linking obesity to hypertension. The purpose of Part 1 of this review is to summarize the available data on recently emerging mechanisms believed to contribute to obesity-related hypertension through increased sodium reabsorption and volume expansion, such as: physical compression of the kidney by perirenal/intrarenal fat and overactivation of the systemic/renal SNS and the renin–angiotensin–aldosterone system. The role of hyperleptinemia, impaired chemoreceptor and baroreceptor reflexes, and increased perivascular fat is also discussed. Specifically targeting these mechanisms may pave the way for a new therapeutic intervention in the treatment of obesity-related hypertension in the context of ‘precision medicine’ principles, which will be discussed in Part 2.","citation-key":"parvanovaMechanismsTreatmentObesityrelated2024","container-title":"Clinical Kidney Journal","DOI":"10.1093/ckj/sfad282","ISSN":"2048-8505","issue":"1","journalAbbreviation":"Clin Kidney J","page":"sfad282","source":"Silverchair","title":"Mechanisms and treatment of obesity-related hypertension—Part 1: Mechanisms","title-short":"Mechanisms and treatment of obesity-related hypertension—Part 1","URL":"https://doi.org/10.1093/ckj/sfad282","volume":"17","author":[{"family":"Parvanova","given":"Aneliya"},{"family":"Reseghetti","given":"Elia"},{"family":"Abbate","given":"Manuela"},{"family":"Ruggenenti","given":"Piero"}],"accessed":{"date-parts":[["2025",12,13]]},"issued":{"date-parts":[["2024",1,1]]}}}],"schema":"https://github.com/citation-style-language/schema/raw/master/csl-citation.json"} </w:instrText>
+        <w:instrText xml:space="preserve"> ADDIN ZOTERO_ITEM CSL_CITATION {"citationID":"LH1T8aA8","properties":{"formattedCitation":"\\super 19,20\\nosupersub{}","plainCitation":"19,20","noteIndex":0},"citationItems":[{"id":9070,"uris":["http://zotero.org/users/7317906/items/UINYBGJP"],"itemData":{"id":9070,"type":"article-journal","abstract":"© 2020 by the authors. Licensee MDPI, Basel, Switzerland. Glucocorticoids promote muscle atrophy by inducing a class of proteins called atrogenes, resulting in reductions in muscle size and strength. In this work, we evaluated whether a mouse model with pre-existing diet-induced obesity had altered glucocorticoid responsiveness. We observed that all animals treated with the synthetic glucocorticoid dexamethasone had reduced strength, but that obesity exacerbated this effect. These changes were concordant with more pronounced reductions in muscle size, particularly in Type II muscle fibers, and potentiated induction of atrogene expression in the obese mice relative to lean mice. Furthermore, we show that the reductions in lean mass do not fully account for the dexamethasone-induced insulin resistance observed in these mice. Together, these data suggest that obesity potentiates glucocorticoid-induced muscle atrophy.","citation-key":"Gunder2020","container-title":"Biomedicines","DOI":"10.3390/biomedicines8100420","ISSN":"22279059","issue":"10","title":"Obesity augments glucocorticoid-dependent muscle atrophy in male c57bl/6j mice","volume":"8","author":[{"family":"Gunder","given":"Laura C"},{"family":"Harvey","given":"I."},{"family":"Redd","given":"J.R."},{"family":"Davis","given":"C.S."},{"family":"Al-Tamimi","given":"A."},{"family":"Brooks","given":"S.V."},{"family":"Bridges","given":"Dave"}],"issued":{"date-parts":[["2020"]]}}},{"id":9074,"uris":["http://zotero.org/users/7317906/items/TX7KAVZ2"],"itemData":{"id":9074,"type":"article-journal","abstract":"© 2018 Endocrine Society. The purpose of this study was to determine the effects of glucocorticoid-induced metabolic dysfunction in the presence of diet-induced obesity. C57BL/6J adult male lean and diet-induced obese mice were given dexamethasone, and levels of hepatic steatosis, insulin resistance, and lipolysis were determined. Obese mice given dexamethasone had significant, synergistic effects on fasting glucose, insulin resistance, and markers of lipolysis, as well as hepatic steatosis. This was associated with synergistic transactivation of the lipolytic enzyme adipose triglyceride lipase. The combination of chronically elevated glucocorticoids and obesity leads to exacerbations in metabolic dysfunction. Our findings suggest lipolysis may be a key player in glucocorticoid-induced insulin resistance and fatty liver in individuals with obesity.","citation-key":"harveyGlucocorticoidInducedMetabolicDisturbances2018","container-title":"Endocrinology","DOI":"10.1210/en.2018-00147","ISSN":"19457170","issue":"6","title":"Glucocorticoid-Induced Metabolic Disturbances Are Exacerbated in Obese Male Mice","volume":"159","author":[{"family":"Harvey","given":"Innocence"},{"family":"Stephenson","given":"Erin J."},{"family":"Redd","given":"J.R."},{"family":"Tran","given":"Quynh T."},{"family":"Hochberg","given":"I."},{"family":"Qi","given":"N."},{"family":"Bridges","given":"Dave"}],"issued":{"date-parts":[["2018"]]}}}],"schema":"https://github.com/citation-style-language/schema/raw/master/csl-citation.json"} </w:instrText>
       </w:r>
       <w:r>
         <w:fldChar w:fldCharType="separate"/>
@@ -3039,22 +3003,56 @@
           <w:kern w:val="0"/>
           <w:vertAlign w:val="superscript"/>
         </w:rPr>
-        <w:t>22–24</w:t>
+        <w:t>19,20</w:t>
       </w:r>
       <w:r>
         <w:fldChar w:fldCharType="end"/>
       </w:r>
       <w:r>
-        <w:t xml:space="preserve">.  Prior studies have shown </w:t>
-      </w:r>
-      <w:r>
-        <w:t>70-85% of Cushing’s disease patients suffer from hypertension in addition to the disease</w:t>
-      </w:r>
-      <w:r>
-        <w:t xml:space="preserve">.  One possibility is that patients with obesity and Cushing’s disease are already medicated to control their hypertension levels.  </w:t>
-      </w:r>
-      <w:r>
-        <w:t xml:space="preserve">Another possibility is there is already a ceiling effect as counter-regulatory mechanisms for blood pressure are already maximally engaged.  </w:t>
+        <w:t xml:space="preserve">.  These data are also consistent with our previous report demonstrating that obesity modifies Cushing’s-induced transcriptional changes in adipose tissue </w:t>
+      </w:r>
+      <w:r>
+        <w:fldChar w:fldCharType="begin"/>
+      </w:r>
+      <w:r>
+        <w:instrText xml:space="preserve"> ADDIN ZOTERO_ITEM CSL_CITATION {"citationID":"JkUdYYW8","properties":{"formattedCitation":"\\super 21\\nosupersub{}","plainCitation":"21","noteIndex":0},"citationItems":[{"id":4127,"uris":["http://zotero.org/users/7317906/items/2YQBFJRJ"],"itemData":{"id":4127,"type":"article-journal","abstract":"Glucocorticoids have major effects on adipose tissue metabolism. To study tissue mRNA expression changes induced by chronic elevated endogenous glucocorticoids, we performed RNA sequencing on subcutaneous adipose tissue from patients with Cushing's disease (n=5) compared to patients with non-functioning pituitary adenomas (n=11). We found higher expression of transcripts involved in several metabolic pathways, including lipogenesis, proteolysis and glucose oxidation as well as decreased expression of transcripts involved in inflammation and protein synthesis. To further study this in a model system, we subjected mice to dexamethasone treatment for 12 weeks and analyzed their inguinal (subcutaneous) fat pads, which led to similar findings. Additionally, mice treated with dexamethasone showed drastic decreases in lean body mass as well as increased fat mass, further supporting the human transcriptomic data. These data provide insight to transcriptional changes that may be responsible for the co-morbidities associated with chronic elevations of glucocorticoids.","citation-key":"Hochberg2015a","container-title":"Journal of Molecular Endocrinology","DOI":"10.1530/JME-15-0119","ISSN":"0952-5041","issue":"2","page":"81-94","PMID":"26150553","title":"Gene expression changes in subcutaneous adipose tissue due to Cushing's disease","URL":"http://www.ncbi.nlm.nih.gov/pubmed/26150553","volume":"55","author":[{"family":"Hochberg","given":"Irit"},{"family":"Harvey","given":"Innocence"},{"family":"Tran","given":"Quynh T."},{"family":"Stephenson","given":"Erin J."},{"family":"Barkan","given":"Ariel L"},{"family":"Saltiel","given":"Alan R."},{"family":"Chandler","given":"William F."},{"family":"Bridges","given":"Dave"}],"issued":{"date-parts":[["2015",10]]}}}],"schema":"https://github.com/citation-style-language/schema/raw/master/csl-citation.json"} </w:instrText>
+      </w:r>
+      <w:r>
+        <w:fldChar w:fldCharType="separate"/>
+      </w:r>
+      <w:r>
+        <w:rPr>
+          <w:rFonts w:ascii="Aptos" w:cs="Times New Roman"/>
+          <w:kern w:val="0"/>
+          <w:vertAlign w:val="superscript"/>
+        </w:rPr>
+        <w:t>21</w:t>
+      </w:r>
+      <w:r>
+        <w:fldChar w:fldCharType="end"/>
+      </w:r>
+      <w:r>
+        <w:t xml:space="preserve">.  We remain interested in Cushing’s induced bone and muscle loss, as well as the effect of obesity and Cushing’s disease on blood lipids and kidney </w:t>
+      </w:r>
+      <w:r>
+        <w:t>function, but</w:t>
+      </w:r>
+      <w:ins w:id="19" w:author="Dave Bridges" w:date="2026-01-22T09:39:00Z" w16du:dateUtc="2026-01-22T14:39:00Z">
+        <w:r>
+          <w:t xml:space="preserve"> </w:t>
+        </w:r>
+      </w:ins>
+      <w:r>
+        <w:t>there are</w:t>
+      </w:r>
+      <w:r>
+        <w:t xml:space="preserve"> </w:t>
+      </w:r>
+      <w:r>
+        <w:t>in</w:t>
+      </w:r>
+      <w:r>
+        <w:t>sufficient laboratory results in these participants to make reliable conclusions.</w:t>
       </w:r>
     </w:p>
     <w:p>
@@ -3069,7 +3067,136 @@
         <w:ind w:left="0"/>
       </w:pPr>
       <w:r>
-        <w:t xml:space="preserve">We also report several interesting gender differences in how obesity and Cushing’s disease interact.  We find, as others have before, that Cushing’s disease affects women at a higher rate.  We also find that </w:t>
+        <w:t>Pathophysiologically</w:t>
+      </w:r>
+      <w:r>
+        <w:t xml:space="preserve">, the induction of adipocyte lipolysis by </w:t>
+      </w:r>
+      <w:r>
+        <w:t xml:space="preserve">the direct effect of </w:t>
+      </w:r>
+      <w:r>
+        <w:t>cortisol</w:t>
+      </w:r>
+      <w:r>
+        <w:t xml:space="preserve"> </w:t>
+      </w:r>
+      <w:r>
+        <w:t xml:space="preserve">on adipocytes, as well as </w:t>
+      </w:r>
+      <w:r>
+        <w:t>the indirect</w:t>
+      </w:r>
+      <w:r>
+        <w:t xml:space="preserve"> effects </w:t>
+      </w:r>
+      <w:r>
+        <w:t xml:space="preserve">of cortisol </w:t>
+      </w:r>
+      <w:r>
+        <w:t>on insulin signaling in adipocytes</w:t>
+      </w:r>
+      <w:r>
+        <w:t>,</w:t>
+      </w:r>
+      <w:r>
+        <w:t xml:space="preserve"> may explain increased liver disease in patients with obesity and Cushing’s disease.  This could be due to a confluence of increased triglyceride stores available for release, increased signaling, and decreased hepatic triglyceride export due to hepatic insulin resistance.  </w:t>
+      </w:r>
+    </w:p>
+    <w:p>
+      <w:pPr>
+        <w:pStyle w:val="ListParagraph"/>
+        <w:ind w:left="0"/>
+      </w:pPr>
+    </w:p>
+    <w:p>
+      <w:pPr>
+        <w:pStyle w:val="ListParagraph"/>
+        <w:ind w:left="0"/>
+      </w:pPr>
+      <w:r>
+        <w:t xml:space="preserve">It is less clear to us why blood pressure is </w:t>
+      </w:r>
+      <w:r>
+        <w:t>attenuated somewhat in patients with Cushing’s disease and obesity</w:t>
+      </w:r>
+      <w:r>
+        <w:t xml:space="preserve">.  </w:t>
+      </w:r>
+      <w:r>
+        <w:t>O</w:t>
+      </w:r>
+      <w:r>
+        <w:t>besity and Cushing’s disease</w:t>
+      </w:r>
+      <w:r>
+        <w:t xml:space="preserve"> both</w:t>
+      </w:r>
+      <w:r>
+        <w:t xml:space="preserve"> increase systolic, diastolic and mean arterial pressure, but when both are combined</w:t>
+      </w:r>
+      <w:r>
+        <w:t>,</w:t>
+      </w:r>
+      <w:r>
+        <w:t xml:space="preserve"> the effect is </w:t>
+      </w:r>
+      <w:r>
+        <w:t>significantly</w:t>
+      </w:r>
+      <w:r>
+        <w:t xml:space="preserve"> attenuated (Figure 2 and Table 3).  Obesity is a well-known risk factor for hypertension </w:t>
+      </w:r>
+      <w:r>
+        <w:fldChar w:fldCharType="begin"/>
+      </w:r>
+      <w:r>
+        <w:instrText xml:space="preserve"> ADDIN ZOTERO_ITEM CSL_CITATION {"citationID":"X8xCSypB","properties":{"formattedCitation":"\\super 22\\uc0\\u8211{}24\\nosupersub{}","plainCitation":"22–24","noteIndex":0},"citationItems":[{"id":27435,"uris":["http://zotero.org/users/7317906/items/DH8UG89Y"],"itemData":{"id":27435,"type":"article-journal","abstract":"Cushing's syndrome is associated with increased mortality, mainly due to cardiovascular complications, which are sustained by the common development of systemic arterial hypertension and metabolic syndrome, which partially persist after the disease remission. Cardiovascular diseases and hypertension associated with endogenous hypercortisolism reveal underexplored peculiarities. The use of exogenous corticosteroids also impacts on hypertension and cardiovascular system, especially after prolonged treatment. The mechanisms involved in the development of hypertension differ, whether glucocorticoid excess is acute or chronic, and the source endogenous or exogenous, introducing inconsistencies among published studies. The pleiotropic effects of glucocorticoids and the overlap of the several regulatory mechanisms controlling blood pressure suggest that a rigorous comparison of in-vivo and in-vitro studies is necessary to draw reliable conclusions. This review, developed during the first ‘Altogether to Beat Cushing's syndrome’ workshop held in Capri in 2012, evaluates the most important peculiarities of hypertension associated with CS, with a particular focus on its pathophysiology. A critical appraisal of most significant animal and human studies is compared with a systematic review of the few available clinical trials. A special attention is dedicated to the description of the clinical features and cardiovascular damage secondary to glucocorticoid excess. On the basis of the consensus reached during the workshop, a pathophysiology-oriented therapeutic algorithm has been developed and it could serve as a first attempt to rationalize the treatment of hypertension in Cushing's syndrome.","citation-key":"isidoriHypertensionCushingsSyndrome2015","container-title":"Journal of Hypertension","DOI":"10.1097/HJH.0000000000000415","issue":"1","language":"en-US","page":"44-60","source":"journals.lww.com","title":"The hypertension of Cushing's syndrome: controversies in... : Journal of Hypertension","title-short":"The hypertension of Cushing's syndrome","URL":"https://journals.lww.com/jhypertension/fulltext/2015/01000/The_hypertension_of_Cushing_s_syndrome_.6.aspxTest?casa_token=I--E6UkhUMMAAAAA:fkOVLRfHbzyQJsb_kVC-mIAOKPBO3pq533Lx7ct_fg3PYPwvP2wgsSC3t0mdLqPrs3mzyZOWtyeTGZyaYz1R8120QW8IXjI","volume":"33","author":[{"family":"Isidori","given":"Andrea M."},{"family":"Graziadio","given":"Chiara"},{"family":"Paragliola","given":"Rosa Maria"},{"family":"Cozzolino","given":"Alessia"},{"family":"Ambrogio","given":"Alberto G."},{"family":"Colao","given":"Annamaria"},{"family":"Corsello","given":"Salvatore M."},{"family":"Pivonello","given":"Rosario"},{"family":"Group","given":"on behalf of the ABC Study"}],"accessed":{"date-parts":[["2026",1,7]]},"issued":{"date-parts":[["2015"]]}}},{"id":27432,"uris":["http://zotero.org/users/7317906/items/6RZCY37T"],"itemData":{"id":27432,"type":"article-journal","abstract":"Cushing's syndrome can be exogenous, resulting from the administration of glucocorticoids or adrenocorticotrophic hormone (ACTH), or endogenous, secondary to increased secretion of cortisol or ACTH. Hypertension is one of the most distinguishing features of endogenous Cushing's syndrome, as it is present in about 80% of adult patients and in almost half of children and adolescents patients. Hypertension results from the interplay of several pathophysiological mechanisms regulating plasma volume, peripheral vascular resistance and cardiac output, all of which may be increased. The therapeutic goal is to find and remove the cause of excess glucocorticoids, which, in most cases of endogenous Cushing's syndrome, is achieved surgically. Treatment of Cushing's syndrome usually results in resolution or amelioration of hypertension. However, some patients may not achieve normotension or may require a prolonged period of time for the correction of hypercortisolism. Therefore, therapeutic strategies for Cushing's-specific hypertension (to normalise blood pressure and decrease the duration of hypertension) are necessary to decrease the morbidity and mortality associated with this disorder. The various pathogenetic mechanisms that have been proposed for the development of glucocorticoid-induced hypertension in Cushing's syndrome and its management are discussed.","citation-key":"magiakouHypertensionCushingsSyndrome2006","collection-title":"Endocrine Hypertension","container-title":"Best Practice &amp; Research Clinical Endocrinology &amp; Metabolism","DOI":"10.1016/j.beem.2006.07.006","ISSN":"1521-690X","issue":"3","journalAbbreviation":"Best Practice &amp; Research Clinical Endocrinology &amp; Metabolism","page":"467-482","source":"ScienceDirect","title":"Hypertension in Cushing's syndrome","URL":"https://www.sciencedirect.com/science/article/pii/S1521690X06000522","volume":"20","author":[{"family":"Magiakou","given":"Maria Alexandra"},{"family":"Smyrnaki","given":"Penelope"},{"family":"Chrousos","given":"George P."}],"accessed":{"date-parts":[["2026",1,7]]},"issued":{"date-parts":[["2006",9,1]]}}},{"id":27415,"uris":["http://zotero.org/users/7317906/items/CJNPIB38"],"itemData":{"id":27415,"type":"article-journal","abstract":"The prevalence of obesity has tripled over the past five decades. Obesity, especially visceral obesity, is closely related to hypertension, increasing the risk of primary (essential) hypertension by 65%–75%. Hypertension is a major risk factor for cardiovascular disease, the leading cause of death worldwide, and its prevalence is rapidly increasing following the pandemic rise in obesity. Although the causal relationship between obesity and high blood pressure (BP) is well established, the detailed mechanisms for such association are still under research. For more than 30 years sympathetic nervous system (SNS) and kidney sodium reabsorption activation, secondary to insulin resistance and compensatory hyperinsulinemia, have been considered as primary mediators of elevated BP in obesity. However, experimental and clinical data show that severe insulin resistance and hyperinsulinemia can occur in the absence of elevated BP, challenging the causal relationship between insulin resistance and hyperinsulinemia as the key factor linking obesity to hypertension. The purpose of Part 1 of this review is to summarize the available data on recently emerging mechanisms believed to contribute to obesity-related hypertension through increased sodium reabsorption and volume expansion, such as: physical compression of the kidney by perirenal/intrarenal fat and overactivation of the systemic/renal SNS and the renin–angiotensin–aldosterone system. The role of hyperleptinemia, impaired chemoreceptor and baroreceptor reflexes, and increased perivascular fat is also discussed. Specifically targeting these mechanisms may pave the way for a new therapeutic intervention in the treatment of obesity-related hypertension in the context of ‘precision medicine’ principles, which will be discussed in Part 2.","citation-key":"parvanovaMechanismsTreatmentObesityrelated2024","container-title":"Clinical Kidney Journal","DOI":"10.1093/ckj/sfad282","ISSN":"2048-8505","issue":"1","journalAbbreviation":"Clin Kidney J","page":"sfad282","source":"Silverchair","title":"Mechanisms and treatment of obesity-related hypertension—Part 1: Mechanisms","title-short":"Mechanisms and treatment of obesity-related hypertension—Part 1","URL":"https://doi.org/10.1093/ckj/sfad282","volume":"17","author":[{"family":"Parvanova","given":"Aneliya"},{"family":"Reseghetti","given":"Elia"},{"family":"Abbate","given":"Manuela"},{"family":"Ruggenenti","given":"Piero"}],"accessed":{"date-parts":[["2025",12,13]]},"issued":{"date-parts":[["2024",1,1]]}}}],"schema":"https://github.com/citation-style-language/schema/raw/master/csl-citation.json"} </w:instrText>
+      </w:r>
+      <w:r>
+        <w:fldChar w:fldCharType="separate"/>
+      </w:r>
+      <w:r>
+        <w:rPr>
+          <w:rFonts w:ascii="Aptos" w:cs="Times New Roman"/>
+          <w:kern w:val="0"/>
+          <w:vertAlign w:val="superscript"/>
+        </w:rPr>
+        <w:t>22–24</w:t>
+      </w:r>
+      <w:r>
+        <w:fldChar w:fldCharType="end"/>
+      </w:r>
+      <w:r>
+        <w:t xml:space="preserve">.  Prior studies have shown </w:t>
+      </w:r>
+      <w:r>
+        <w:t>70-85% of Cushing’s disease patients suffer from hypertension in addition to the disease</w:t>
+      </w:r>
+      <w:r>
+        <w:t xml:space="preserve">.  One possibility is that patients with obesity and Cushing’s disease are already medicated to control their hypertension levels.  </w:t>
+      </w:r>
+      <w:r>
+        <w:t xml:space="preserve">Another possibility is there is already a ceiling effect as counter-regulatory mechanisms for blood pressure are already maximally engaged.  </w:t>
+      </w:r>
+    </w:p>
+    <w:p>
+      <w:pPr>
+        <w:pStyle w:val="ListParagraph"/>
+        <w:ind w:left="0"/>
+      </w:pPr>
+    </w:p>
+    <w:p>
+      <w:pPr>
+        <w:pStyle w:val="ListParagraph"/>
+        <w:ind w:left="0"/>
+      </w:pPr>
+      <w:r>
+        <w:t xml:space="preserve">We also report several interesting gender differences in how obesity and Cushing’s disease interact.  We find, as others have before, that Cushing’s disease affects women at a higher </w:t>
+      </w:r>
+      <w:r>
+        <w:lastRenderedPageBreak/>
+        <w:t xml:space="preserve">rate.  We also find that </w:t>
       </w:r>
       <w:r>
         <w:t>women with</w:t>
@@ -3080,17 +3207,13 @@
       <w:r>
         <w:t>are more likely to be obese</w:t>
       </w:r>
-      <w:ins w:id="14" w:author="Irit Hochberg" w:date="2026-01-22T09:36:00Z" w16du:dateUtc="2026-01-22T14:36:00Z">
+      <w:ins w:id="20" w:author="Irit Hochberg" w:date="2026-01-22T09:36:00Z" w16du:dateUtc="2026-01-22T14:36:00Z">
         <w:r>
           <w:t>.</w:t>
         </w:r>
       </w:ins>
       <w:r>
-        <w:t xml:space="preserve">  Women in this group, on average, tend to have worsened and more heterogeneous responses to </w:t>
-      </w:r>
-      <w:r>
-        <w:lastRenderedPageBreak/>
-        <w:t>these dual co-morbidities than males</w:t>
+        <w:t xml:space="preserve">  Women in this group, on average, tend to have worsened and more heterogeneous responses to these dual co-morbidities than males</w:t>
       </w:r>
       <w:r>
         <w:t xml:space="preserve"> (Table 4)</w:t>
@@ -3480,11 +3603,11 @@
         <w:t>’</w:t>
       </w:r>
       <w:r>
-        <w:t xml:space="preserve">s dependent impacts on these co-morbidities and revealed a surprising and complex picture of integrated pathophysiology.  This study provides novel data that obesity and Cushing’s </w:t>
+        <w:t xml:space="preserve">s </w:t>
       </w:r>
       <w:r>
         <w:lastRenderedPageBreak/>
-        <w:t>disease interact, suggesting that obesity and Cushing’s disease may result in worsened liver damage, but that the augmented effects on hypertension are lower than expected.  These results may be valuable for the accurate monitoring and treatment of the majority of Cushing’s patients who also have elevated adiposity.</w:t>
+        <w:t>dependent impacts on these co-morbidities and revealed a surprising and complex picture of integrated pathophysiology.  This study provides novel data that obesity and Cushing’s disease interact, suggesting that obesity and Cushing’s disease may result in worsened liver damage, but that the augmented effects on hypertension are lower than expected.  These results may be valuable for the accurate monitoring and treatment of the majority of Cushing’s patients who also have elevated adiposity.</w:t>
       </w:r>
     </w:p>
     <w:p>
@@ -4090,7 +4213,7 @@
       <w:pPr>
         <w:pStyle w:val="Bibliography"/>
         <w:rPr>
-          <w:del w:id="15" w:author="Dave Bridges" w:date="2026-01-22T09:36:00Z" w16du:dateUtc="2026-01-22T14:36:00Z"/>
+          <w:del w:id="21" w:author="Dave Bridges" w:date="2026-01-22T09:36:00Z" w16du:dateUtc="2026-01-22T14:36:00Z"/>
         </w:rPr>
       </w:pPr>
       <w:r>
@@ -4102,7 +4225,7 @@
         <w:pStyle w:val="Bibliography"/>
         <w:ind w:left="0" w:firstLine="0"/>
         <w:rPr>
-          <w:rPrChange w:id="16" w:author="Dave Bridges" w:date="2026-01-22T09:36:00Z" w16du:dateUtc="2026-01-22T14:36:00Z">
+          <w:rPrChange w:id="22" w:author="Dave Bridges" w:date="2026-01-22T09:36:00Z" w16du:dateUtc="2026-01-22T14:36:00Z">
             <w:rPr>
               <w:rFonts w:asciiTheme="majorHAnsi" w:hAnsiTheme="majorHAnsi"/>
               <w:color w:val="000000" w:themeColor="text1"/>
@@ -4110,7 +4233,7 @@
             </w:rPr>
           </w:rPrChange>
         </w:rPr>
-        <w:pPrChange w:id="17" w:author="Dave Bridges" w:date="2026-01-22T09:36:00Z" w16du:dateUtc="2026-01-22T14:36:00Z">
+        <w:pPrChange w:id="23" w:author="Dave Bridges" w:date="2026-01-22T09:36:00Z" w16du:dateUtc="2026-01-22T14:36:00Z">
           <w:pPr/>
         </w:pPrChange>
       </w:pPr>
@@ -4730,7 +4853,24 @@
       </w:r>
     </w:p>
   </w:comment>
-  <w:comment w:id="8" w:author="עירית הוכברג" w:date="2026-01-22T15:15:00Z" w:initials="עה">
+  <w:comment w:id="6" w:author="Dave Bridges" w:date="2026-02-10T11:05:00Z" w:initials="DB">
+    <w:p>
+      <w:r>
+        <w:rPr>
+          <w:rStyle w:val="CommentReference"/>
+        </w:rPr>
+        <w:annotationRef/>
+      </w:r>
+      <w:r>
+        <w:rPr>
+          <w:sz w:val="20"/>
+          <w:szCs w:val="20"/>
+        </w:rPr>
+        <w:t>I added this to the methods, it was to make sure all lab results were pre-treatement</w:t>
+      </w:r>
+    </w:p>
+  </w:comment>
+  <w:comment w:id="9" w:author="עירית הוכברג" w:date="2026-01-22T15:15:00Z" w:initials="עה">
     <w:p>
       <w:pPr>
         <w:pStyle w:val="CommentText"/>
@@ -4746,7 +4886,24 @@
       </w:r>
     </w:p>
   </w:comment>
-  <w:comment w:id="9" w:author="עירית הוכברג" w:date="2026-01-22T15:47:00Z" w:initials="עה">
+  <w:comment w:id="10" w:author="Dave Bridges" w:date="2026-02-10T11:06:00Z" w:initials="DB">
+    <w:p>
+      <w:r>
+        <w:rPr>
+          <w:rStyle w:val="CommentReference"/>
+        </w:rPr>
+        <w:annotationRef/>
+      </w:r>
+      <w:r>
+        <w:rPr>
+          <w:sz w:val="20"/>
+          <w:szCs w:val="20"/>
+        </w:rPr>
+        <w:t>Tried to clarify that the additive effect is obesity + cushings</w:t>
+      </w:r>
+    </w:p>
+  </w:comment>
+  <w:comment w:id="11" w:author="עירית הוכברג" w:date="2026-01-22T15:47:00Z" w:initials="עה">
     <w:p>
       <w:pPr>
         <w:pStyle w:val="CommentText"/>
@@ -4762,7 +4919,24 @@
       </w:r>
     </w:p>
   </w:comment>
-  <w:comment w:id="10" w:author="עירית הוכברג" w:date="2026-01-22T15:17:00Z" w:initials="עה">
+  <w:comment w:id="12" w:author="Dave Bridges" w:date="2026-02-10T11:07:00Z" w:initials="DB">
+    <w:p>
+      <w:r>
+        <w:rPr>
+          <w:rStyle w:val="CommentReference"/>
+        </w:rPr>
+        <w:annotationRef/>
+      </w:r>
+      <w:r>
+        <w:rPr>
+          <w:sz w:val="20"/>
+          <w:szCs w:val="20"/>
+        </w:rPr>
+        <w:t>This is the p-value from the prior sentence (non-significant interaction)</w:t>
+      </w:r>
+    </w:p>
+  </w:comment>
+  <w:comment w:id="13" w:author="עירית הוכברג" w:date="2026-01-22T15:17:00Z" w:initials="עה">
     <w:p>
       <w:pPr>
         <w:pStyle w:val="CommentText"/>
@@ -4778,7 +4952,24 @@
       </w:r>
     </w:p>
   </w:comment>
-  <w:comment w:id="11" w:author="עירית הוכברג" w:date="2026-01-22T15:40:00Z" w:initials="עה">
+  <w:comment w:id="14" w:author="Dave Bridges" w:date="2026-02-10T11:07:00Z" w:initials="DB">
+    <w:p>
+      <w:r>
+        <w:rPr>
+          <w:rStyle w:val="CommentReference"/>
+        </w:rPr>
+        <w:annotationRef/>
+      </w:r>
+      <w:r>
+        <w:rPr>
+          <w:sz w:val="20"/>
+          <w:szCs w:val="20"/>
+        </w:rPr>
+        <w:t>No, these data are quite messy, we mention this as a limitation in the discussion, we could try to do this but would take a long time to do.</w:t>
+      </w:r>
+    </w:p>
+  </w:comment>
+  <w:comment w:id="15" w:author="עירית הוכברג" w:date="2026-01-22T15:40:00Z" w:initials="עה">
     <w:p>
       <w:pPr>
         <w:pStyle w:val="CommentText"/>
@@ -4794,7 +4985,24 @@
       </w:r>
     </w:p>
   </w:comment>
-  <w:comment w:id="12" w:author="עירית הוכברג" w:date="2026-01-22T15:41:00Z" w:initials="עה">
+  <w:comment w:id="16" w:author="Dave Bridges" w:date="2026-02-10T11:09:00Z" w:initials="DB">
+    <w:p>
+      <w:r>
+        <w:rPr>
+          <w:rStyle w:val="CommentReference"/>
+        </w:rPr>
+        <w:annotationRef/>
+      </w:r>
+      <w:r>
+        <w:rPr>
+          <w:sz w:val="20"/>
+          <w:szCs w:val="20"/>
+        </w:rPr>
+        <w:t>Added in that this was more than additive for obesity + cushings alone</w:t>
+      </w:r>
+    </w:p>
+  </w:comment>
+  <w:comment w:id="17" w:author="עירית הוכברג" w:date="2026-01-22T15:41:00Z" w:initials="עה">
     <w:p>
       <w:pPr>
         <w:pStyle w:val="CommentText"/>
@@ -4807,6 +5015,23 @@
       </w:r>
       <w:r>
         <w:t>It is additive or does obesity alone explain glucose levels?</w:t>
+      </w:r>
+    </w:p>
+  </w:comment>
+  <w:comment w:id="18" w:author="Dave Bridges" w:date="2026-02-10T11:10:00Z" w:initials="DB">
+    <w:p>
+      <w:r>
+        <w:rPr>
+          <w:rStyle w:val="CommentReference"/>
+        </w:rPr>
+        <w:annotationRef/>
+      </w:r>
+      <w:r>
+        <w:rPr>
+          <w:sz w:val="20"/>
+          <w:szCs w:val="20"/>
+        </w:rPr>
+        <w:t>No added a sentence to clarify that these are independent effects</w:t>
       </w:r>
     </w:p>
   </w:comment>
@@ -4820,17 +5045,29 @@
   <w15:commentEx w15:paraId="4D989FD8" w15:done="1"/>
   <w15:commentEx w15:paraId="121C35DD" w15:done="1"/>
   <w15:commentEx w15:paraId="5AB7D093" w15:done="0"/>
+  <w15:commentEx w15:paraId="59D2E84B" w15:paraIdParent="5AB7D093" w15:done="0"/>
   <w15:commentEx w15:paraId="22980CB0" w15:done="0"/>
+  <w15:commentEx w15:paraId="1EE5C456" w15:paraIdParent="22980CB0" w15:done="0"/>
   <w15:commentEx w15:paraId="0A825E73" w15:done="0"/>
+  <w15:commentEx w15:paraId="29BF4ABA" w15:paraIdParent="0A825E73" w15:done="0"/>
   <w15:commentEx w15:paraId="61F5E9D2" w15:done="0"/>
+  <w15:commentEx w15:paraId="626FB9FF" w15:paraIdParent="61F5E9D2" w15:done="0"/>
   <w15:commentEx w15:paraId="45C41725" w15:done="0"/>
+  <w15:commentEx w15:paraId="62CEBE28" w15:paraIdParent="45C41725" w15:done="0"/>
   <w15:commentEx w15:paraId="470798BD" w15:done="0"/>
+  <w15:commentEx w15:paraId="49CE2F37" w15:paraIdParent="470798BD" w15:done="0"/>
 </w15:commentsEx>
 </file>
 
 <file path=word/commentsExtensible.xml><?xml version="1.0" encoding="utf-8"?>
 <w16cex:commentsExtensible xmlns:wpc="http://schemas.microsoft.com/office/word/2010/wordprocessingCanvas" xmlns:cx="http://schemas.microsoft.com/office/drawing/2014/chartex" xmlns:cx1="http://schemas.microsoft.com/office/drawing/2015/9/8/chartex" xmlns:cx2="http://schemas.microsoft.com/office/drawing/2015/10/21/chartex" xmlns:cx3="http://schemas.microsoft.com/office/drawing/2016/5/9/chartex" xmlns:cx4="http://schemas.microsoft.com/office/drawing/2016/5/10/chartex" xmlns:cx5="http://schemas.microsoft.com/office/drawing/2016/5/11/chartex" xmlns:cx6="http://schemas.microsoft.com/office/drawing/2016/5/12/chartex" xmlns:cx7="http://schemas.microsoft.com/office/drawing/2016/5/13/chartex" xmlns:cx8="http://schemas.microsoft.com/office/drawing/2016/5/14/chartex" xmlns:cr="http://schemas.microsoft.com/office/comments/2020/reactions" xmlns:mc="http://schemas.openxmlformats.org/markup-compatibility/2006" xmlns:aink="http://schemas.microsoft.com/office/drawing/2016/ink" xmlns:am3d="http://schemas.microsoft.com/office/drawing/2017/model3d" xmlns:o="urn:schemas-microsoft-com:office:office" xmlns:oel="http://schemas.microsoft.com/office/2019/extlst" xmlns:r="http://schemas.openxmlformats.org/officeDocument/2006/relationships" xmlns:m="http://schemas.openxmlformats.org/officeDocument/2006/math" xmlns:v="urn:schemas-microsoft-com:vml" xmlns:wp14="http://schemas.microsoft.com/office/word/2010/wordprocessingDrawing" xmlns:wp="http://schemas.openxmlformats.org/drawingml/2006/wordprocessingDrawing" xmlns:w10="urn:schemas-microsoft-com:office:word" xmlns:w="http://schemas.openxmlformats.org/wordprocessingml/2006/main" xmlns:w14="http://schemas.microsoft.com/office/word/2010/wordml" xmlns:w15="http://schemas.microsoft.com/office/word/2012/wordml" xmlns:w16cex="http://schemas.microsoft.com/office/word/2018/wordml/cex" xmlns:w16cid="http://schemas.microsoft.com/office/word/2016/wordml/cid" xmlns:w16="http://schemas.microsoft.com/office/word/2018/wordml" xmlns:w16du="http://schemas.microsoft.com/office/word/2023/wordml/word16du" xmlns:w16sdtdh="http://schemas.microsoft.com/office/word/2020/wordml/sdtdatahash" xmlns:w16sdtfl="http://schemas.microsoft.com/office/word/2024/wordml/sdtformatlock" xmlns:w16se="http://schemas.microsoft.com/office/word/2015/wordml/symex" xmlns:wpg="http://schemas.microsoft.com/office/word/2010/wordprocessingGroup" xmlns:wpi="http://schemas.microsoft.com/office/word/2010/wordprocessingInk" xmlns:wne="http://schemas.microsoft.com/office/word/2006/wordml" xmlns:wps="http://schemas.microsoft.com/office/word/2010/wordprocessingShape" mc:Ignorable="w14 w15 w16se w16cid w16 w16cex w16sdtdh w16sdtfl cr w16du wp14">
   <w16cex:commentExtensible w16cex:durableId="1C53BD37" w16cex:dateUtc="2026-02-02T01:11:00Z"/>
+  <w16cex:commentExtensible w16cex:durableId="76696F6B" w16cex:dateUtc="2026-02-10T16:05:00Z"/>
+  <w16cex:commentExtensible w16cex:durableId="0FFCA280" w16cex:dateUtc="2026-02-10T16:06:00Z"/>
+  <w16cex:commentExtensible w16cex:durableId="12D96409" w16cex:dateUtc="2026-02-10T16:07:00Z"/>
+  <w16cex:commentExtensible w16cex:durableId="174603DA" w16cex:dateUtc="2026-02-10T16:07:00Z"/>
+  <w16cex:commentExtensible w16cex:durableId="12A8F400" w16cex:dateUtc="2026-02-10T16:09:00Z"/>
+  <w16cex:commentExtensible w16cex:durableId="22CBC358" w16cex:dateUtc="2026-02-10T16:10:00Z"/>
 </w16cex:commentsExtensible>
 </file>
 
@@ -4841,11 +5078,17 @@
   <w16cid:commentId w16cid:paraId="4D989FD8" w16cid:durableId="4D989FD8"/>
   <w16cid:commentId w16cid:paraId="121C35DD" w16cid:durableId="121C35DD"/>
   <w16cid:commentId w16cid:paraId="5AB7D093" w16cid:durableId="5AB7D093"/>
+  <w16cid:commentId w16cid:paraId="59D2E84B" w16cid:durableId="76696F6B"/>
   <w16cid:commentId w16cid:paraId="22980CB0" w16cid:durableId="22980CB0"/>
+  <w16cid:commentId w16cid:paraId="1EE5C456" w16cid:durableId="0FFCA280"/>
   <w16cid:commentId w16cid:paraId="0A825E73" w16cid:durableId="0A825E73"/>
+  <w16cid:commentId w16cid:paraId="29BF4ABA" w16cid:durableId="12D96409"/>
   <w16cid:commentId w16cid:paraId="61F5E9D2" w16cid:durableId="61F5E9D2"/>
+  <w16cid:commentId w16cid:paraId="626FB9FF" w16cid:durableId="174603DA"/>
   <w16cid:commentId w16cid:paraId="45C41725" w16cid:durableId="45C41725"/>
+  <w16cid:commentId w16cid:paraId="62CEBE28" w16cid:durableId="12A8F400"/>
   <w16cid:commentId w16cid:paraId="470798BD" w16cid:durableId="470798BD"/>
+  <w16cid:commentId w16cid:paraId="49CE2F37" w16cid:durableId="22CBC358"/>
 </w16cid:commentsIds>
 </file>
 

</xml_diff>